<commit_message>
Updated documentation (planning sites)
</commit_message>
<xml_diff>
--- a/documentation.docx
+++ b/documentation.docx
@@ -1,6 +1,6 @@
 
 <file path=word/document.xml><?xml version="1.0" encoding="utf-8"?>
-<w:document xmlns:wpc="http://schemas.microsoft.com/office/word/2010/wordprocessingCanvas" xmlns:cx="http://schemas.microsoft.com/office/drawing/2014/chartex" xmlns:cx1="http://schemas.microsoft.com/office/drawing/2015/9/8/chartex" xmlns:cx2="http://schemas.microsoft.com/office/drawing/2015/10/21/chartex" xmlns:cx3="http://schemas.microsoft.com/office/drawing/2016/5/9/chartex" xmlns:cx4="http://schemas.microsoft.com/office/drawing/2016/5/10/chartex" xmlns:cx5="http://schemas.microsoft.com/office/drawing/2016/5/11/chartex" xmlns:cx6="http://schemas.microsoft.com/office/drawing/2016/5/12/chartex" xmlns:cx7="http://schemas.microsoft.com/office/drawing/2016/5/13/chartex" xmlns:cx8="http://schemas.microsoft.com/office/drawing/2016/5/14/chartex" xmlns:mc="http://schemas.openxmlformats.org/markup-compatibility/2006" xmlns:aink="http://schemas.microsoft.com/office/drawing/2016/ink" xmlns:am3d="http://schemas.microsoft.com/office/drawing/2017/model3d" xmlns:o="urn:schemas-microsoft-com:office:office" xmlns:oel="http://schemas.microsoft.com/office/2019/extlst" xmlns:r="http://schemas.openxmlformats.org/officeDocument/2006/relationships" xmlns:m="http://schemas.openxmlformats.org/officeDocument/2006/math" xmlns:v="urn:schemas-microsoft-com:vml" xmlns:wp14="http://schemas.microsoft.com/office/word/2010/wordprocessingDrawing" xmlns:wp="http://schemas.openxmlformats.org/drawingml/2006/wordprocessingDrawing" xmlns:w10="urn:schemas-microsoft-com:office:word" xmlns:w="http://schemas.openxmlformats.org/wordprocessingml/2006/main" xmlns:w14="http://schemas.microsoft.com/office/word/2010/wordml" xmlns:w15="http://schemas.microsoft.com/office/word/2012/wordml" xmlns:w16cex="http://schemas.microsoft.com/office/word/2018/wordml/cex" xmlns:w16cid="http://schemas.microsoft.com/office/word/2016/wordml/cid" xmlns:w16="http://schemas.microsoft.com/office/word/2018/wordml" xmlns:w16du="http://schemas.microsoft.com/office/word/2023/wordml/word16du" xmlns:w16sdtdh="http://schemas.microsoft.com/office/word/2020/wordml/sdtdatahash" xmlns:w16sdtfl="http://schemas.microsoft.com/office/word/2024/wordml/sdtformatlock" xmlns:w16se="http://schemas.microsoft.com/office/word/2015/wordml/symex" xmlns:wpg="http://schemas.microsoft.com/office/word/2010/wordprocessingGroup" xmlns:wpi="http://schemas.microsoft.com/office/word/2010/wordprocessingInk" xmlns:wne="http://schemas.microsoft.com/office/word/2006/wordml" xmlns:wps="http://schemas.microsoft.com/office/word/2010/wordprocessingShape" xmlns:a="http://schemas.openxmlformats.org/drawingml/2006/main" xmlns:pic="http://schemas.openxmlformats.org/drawingml/2006/picture" xmlns:a14="http://schemas.microsoft.com/office/drawing/2010/main" mc:Ignorable="w14 w15 w16se w16cid w16 w16cex w16sdtdh w16sdtfl w16du wp14">
+<w:document xmlns:wpc="http://schemas.microsoft.com/office/word/2010/wordprocessingCanvas" xmlns:cx="http://schemas.microsoft.com/office/drawing/2014/chartex" xmlns:cx1="http://schemas.microsoft.com/office/drawing/2015/9/8/chartex" xmlns:cx2="http://schemas.microsoft.com/office/drawing/2015/10/21/chartex" xmlns:cx3="http://schemas.microsoft.com/office/drawing/2016/5/9/chartex" xmlns:cx4="http://schemas.microsoft.com/office/drawing/2016/5/10/chartex" xmlns:cx5="http://schemas.microsoft.com/office/drawing/2016/5/11/chartex" xmlns:cx6="http://schemas.microsoft.com/office/drawing/2016/5/12/chartex" xmlns:cx7="http://schemas.microsoft.com/office/drawing/2016/5/13/chartex" xmlns:cx8="http://schemas.microsoft.com/office/drawing/2016/5/14/chartex" xmlns:mc="http://schemas.openxmlformats.org/markup-compatibility/2006" xmlns:aink="http://schemas.microsoft.com/office/drawing/2016/ink" xmlns:am3d="http://schemas.microsoft.com/office/drawing/2017/model3d" xmlns:o="urn:schemas-microsoft-com:office:office" xmlns:r="http://schemas.openxmlformats.org/officeDocument/2006/relationships" xmlns:m="http://schemas.openxmlformats.org/officeDocument/2006/math" xmlns:v="urn:schemas-microsoft-com:vml" xmlns:wp14="http://schemas.microsoft.com/office/word/2010/wordprocessingDrawing" xmlns:wp="http://schemas.openxmlformats.org/drawingml/2006/wordprocessingDrawing" xmlns:w10="urn:schemas-microsoft-com:office:word" xmlns:w="http://schemas.openxmlformats.org/wordprocessingml/2006/main" xmlns:w14="http://schemas.microsoft.com/office/word/2010/wordml" xmlns:w15="http://schemas.microsoft.com/office/word/2012/wordml" xmlns:w16cid="http://schemas.microsoft.com/office/word/2016/wordml/cid" xmlns:w16se="http://schemas.microsoft.com/office/word/2015/wordml/symex" xmlns:wpg="http://schemas.microsoft.com/office/word/2010/wordprocessingGroup" xmlns:wpi="http://schemas.microsoft.com/office/word/2010/wordprocessingInk" xmlns:wne="http://schemas.microsoft.com/office/word/2006/wordml" xmlns:wps="http://schemas.microsoft.com/office/word/2010/wordprocessingShape" mc:Ignorable="w14 w15 w16se w16cid wp14">
   <w:body>
     <w:p>
       <w:pPr>
@@ -85,13 +85,23 @@
           <w:szCs w:val="36"/>
         </w:rPr>
       </w:pPr>
-      <w:r>
-        <w:rPr>
-          <w:rFonts w:ascii="Times New Roman" w:hAnsi="Times New Roman" w:cs="Times New Roman"/>
-          <w:sz w:val="36"/>
-          <w:szCs w:val="36"/>
-        </w:rPr>
-        <w:t>főképernyő és ütemező képernyők megtervezése</w:t>
+      <w:proofErr w:type="spellStart"/>
+      <w:r>
+        <w:rPr>
+          <w:rFonts w:ascii="Times New Roman" w:hAnsi="Times New Roman" w:cs="Times New Roman"/>
+          <w:sz w:val="36"/>
+          <w:szCs w:val="36"/>
+        </w:rPr>
+        <w:t>főképernyő</w:t>
+      </w:r>
+      <w:proofErr w:type="spellEnd"/>
+      <w:r>
+        <w:rPr>
+          <w:rFonts w:ascii="Times New Roman" w:hAnsi="Times New Roman" w:cs="Times New Roman"/>
+          <w:sz w:val="36"/>
+          <w:szCs w:val="36"/>
+        </w:rPr>
+        <w:t xml:space="preserve"> és ütemező képernyők megtervezése</w:t>
       </w:r>
     </w:p>
     <w:p>
@@ -496,8 +506,8 @@
       <w:r>
         <w:rPr>
           <w:rFonts w:ascii="Times New Roman" w:hAnsi="Times New Roman" w:cs="Times New Roman"/>
-          <w:b w:val="1"/>
-          <w:bCs w:val="1"/>
+          <w:b/>
+          <w:bCs/>
           <w:sz w:val="40"/>
           <w:szCs w:val="40"/>
         </w:rPr>
@@ -514,6 +524,7 @@
         </w:rPr>
         <w:t xml:space="preserve">Az alkalmazás fejlesztését tartalmazó dokumentáció elkezdése, vizsgafeltételek tanulmányozása, a projektet tároló </w:t>
       </w:r>
+      <w:proofErr w:type="spellStart"/>
       <w:r>
         <w:rPr>
           <w:rFonts w:ascii="Times New Roman" w:hAnsi="Times New Roman" w:cs="Times New Roman"/>
@@ -522,6 +533,7 @@
         </w:rPr>
         <w:t>repository</w:t>
       </w:r>
+      <w:proofErr w:type="spellEnd"/>
       <w:r>
         <w:rPr>
           <w:rFonts w:ascii="Times New Roman" w:hAnsi="Times New Roman" w:cs="Times New Roman"/>
@@ -529,94 +541,75 @@
           <w:szCs w:val="36"/>
         </w:rPr>
         <w:t xml:space="preserve"> létrehozása, teszteknek külön dokumentáció létrehozása.</w:t>
+      </w:r>
+    </w:p>
+    <w:p/>
+    <w:p>
+      <w:pPr>
+        <w:rPr>
+          <w:rFonts w:ascii="Times New Roman" w:hAnsi="Times New Roman" w:cs="Times New Roman"/>
+          <w:b/>
+          <w:bCs/>
+          <w:sz w:val="40"/>
+          <w:szCs w:val="40"/>
+        </w:rPr>
+      </w:pPr>
+      <w:r>
+        <w:rPr>
+          <w:rFonts w:ascii="Times New Roman" w:hAnsi="Times New Roman" w:cs="Times New Roman"/>
+          <w:b/>
+          <w:bCs/>
+          <w:sz w:val="40"/>
+          <w:szCs w:val="40"/>
+        </w:rPr>
+        <w:t>2026-02-11 9:30-11:20</w:t>
       </w:r>
     </w:p>
     <w:p>
-      <w:pPr>
-        <w:pStyle w:val="Norml"/>
-      </w:pPr>
+      <w:r>
+        <w:rPr>
+          <w:rFonts w:ascii="Times New Roman" w:hAnsi="Times New Roman" w:cs="Times New Roman"/>
+          <w:sz w:val="36"/>
+          <w:szCs w:val="36"/>
+        </w:rPr>
+        <w:t>Az ER-diagram anyagának megértése, utána megtervezése és kidolgozása</w:t>
+      </w:r>
     </w:p>
     <w:p>
       <w:pPr>
         <w:rPr>
           <w:rFonts w:ascii="Times New Roman" w:hAnsi="Times New Roman" w:cs="Times New Roman"/>
-          <w:b w:val="1"/>
-          <w:bCs w:val="1"/>
-          <w:sz w:val="40"/>
-          <w:szCs w:val="40"/>
-        </w:rPr>
-      </w:pPr>
-      <w:r>
-        <w:rPr>
-          <w:rFonts w:ascii="Times New Roman" w:hAnsi="Times New Roman" w:cs="Times New Roman"/>
-          <w:b w:val="1"/>
-          <w:bCs w:val="1"/>
-          <w:sz w:val="40"/>
-          <w:szCs w:val="40"/>
-        </w:rPr>
-        <w:t>2026-02-11 9:30-11:20</w:t>
-      </w:r>
+          <w:sz w:val="36"/>
+          <w:szCs w:val="36"/>
+        </w:rPr>
+      </w:pPr>
     </w:p>
     <w:p>
       <w:pPr>
-        <w:pStyle w:val="Norml"/>
-        <w:suppressLineNumbers w:val="0"/>
-        <w:bidi w:val="0"/>
-        <w:spacing w:before="0" w:beforeAutospacing="off" w:after="160" w:afterAutospacing="off" w:line="278" w:lineRule="auto"/>
-        <w:ind w:left="0" w:right="0"/>
-        <w:jc w:val="left"/>
-      </w:pPr>
-      <w:r>
-        <w:rPr>
-          <w:rFonts w:ascii="Times New Roman" w:hAnsi="Times New Roman" w:cs="Times New Roman"/>
-          <w:b w:val="0"/>
-          <w:bCs w:val="0"/>
-          <w:sz w:val="36"/>
-          <w:szCs w:val="36"/>
-        </w:rPr>
-        <w:t>Az ER-diagram anyagának megértése, utána megtervezése és kidolgozása</w:t>
-      </w:r>
-    </w:p>
-    <w:p>
-      <w:pPr>
-        <w:pStyle w:val="Norml"/>
-        <w:suppressLineNumbers w:val="0"/>
-        <w:bidi w:val="0"/>
-        <w:spacing w:before="0" w:beforeAutospacing="off" w:after="160" w:afterAutospacing="off" w:line="278" w:lineRule="auto"/>
-        <w:ind w:left="0" w:right="0"/>
-        <w:jc w:val="left"/>
-        <w:rPr>
-          <w:rFonts w:ascii="Times New Roman" w:hAnsi="Times New Roman" w:cs="Times New Roman"/>
-          <w:b w:val="0"/>
-          <w:bCs w:val="0"/>
-          <w:sz w:val="36"/>
-          <w:szCs w:val="36"/>
-        </w:rPr>
-      </w:pPr>
-    </w:p>
-    <w:p>
-      <w:pPr>
-        <w:pStyle w:val="Norml"/>
         <w:ind w:left="567"/>
       </w:pPr>
       <w:r>
+        <w:rPr>
+          <w:noProof/>
+        </w:rPr>
+        <w:lastRenderedPageBreak/>
         <w:drawing>
-          <wp:inline wp14:editId="2BC3944E" wp14:anchorId="2E600196">
+          <wp:inline distT="0" distB="0" distL="0" distR="0" wp14:anchorId="2E600196" wp14:editId="2BC3944E">
             <wp:extent cx="2428875" cy="1652107"/>
             <wp:effectExtent l="0" t="0" r="0" b="0"/>
             <wp:docPr id="1728743104" name="drawing"/>
             <wp:cNvGraphicFramePr>
-              <a:graphicFrameLocks noChangeAspect="1"/>
+              <a:graphicFrameLocks xmlns:a="http://schemas.openxmlformats.org/drawingml/2006/main" noChangeAspect="1"/>
             </wp:cNvGraphicFramePr>
-            <a:graphic>
-              <a:graphicData xmlns:a="http://schemas.openxmlformats.org/drawingml/2006/main" uri="http://schemas.openxmlformats.org/drawingml/2006/picture">
+            <a:graphic xmlns:a="http://schemas.openxmlformats.org/drawingml/2006/main">
+              <a:graphicData uri="http://schemas.openxmlformats.org/drawingml/2006/picture">
                 <pic:pic xmlns:pic="http://schemas.openxmlformats.org/drawingml/2006/picture">
                   <pic:nvPicPr>
                     <pic:cNvPr id="1728743104" name="Picture 1728743104"/>
                     <pic:cNvPicPr/>
                   </pic:nvPicPr>
                   <pic:blipFill>
-                    <a:blip xmlns:r="http://schemas.openxmlformats.org/officeDocument/2006/relationships" r:embed="rId1628763183">
+                    <a:blip r:embed="rId10">
                       <a:extLst>
                         <a:ext uri="{28A0092B-C50C-407E-A947-70E740481C1C}">
                           <a14:useLocalDpi xmlns:a14="http://schemas.microsoft.com/office/drawing/2010/main"/>
@@ -628,7 +621,7 @@
                     </a:stretch>
                   </pic:blipFill>
                   <pic:spPr>
-                    <a:xfrm rot="0">
+                    <a:xfrm>
                       <a:off x="0" y="0"/>
                       <a:ext cx="2428875" cy="1652107"/>
                     </a:xfrm>
@@ -645,27 +638,29 @@
     </w:p>
     <w:p>
       <w:pPr>
-        <w:pStyle w:val="Norml"/>
         <w:ind w:left="1134"/>
       </w:pPr>
       <w:r>
+        <w:rPr>
+          <w:noProof/>
+        </w:rPr>
         <w:drawing>
-          <wp:inline wp14:editId="23A81BAA" wp14:anchorId="78A5E34F">
+          <wp:inline distT="0" distB="0" distL="0" distR="0" wp14:anchorId="78A5E34F" wp14:editId="23A81BAA">
             <wp:extent cx="4457700" cy="2424105"/>
             <wp:effectExtent l="0" t="0" r="0" b="0"/>
             <wp:docPr id="370634946" name="drawing"/>
             <wp:cNvGraphicFramePr>
-              <a:graphicFrameLocks noChangeAspect="1"/>
+              <a:graphicFrameLocks xmlns:a="http://schemas.openxmlformats.org/drawingml/2006/main" noChangeAspect="1"/>
             </wp:cNvGraphicFramePr>
-            <a:graphic>
-              <a:graphicData xmlns:a="http://schemas.openxmlformats.org/drawingml/2006/main" uri="http://schemas.openxmlformats.org/drawingml/2006/picture">
+            <a:graphic xmlns:a="http://schemas.openxmlformats.org/drawingml/2006/main">
+              <a:graphicData uri="http://schemas.openxmlformats.org/drawingml/2006/picture">
                 <pic:pic xmlns:pic="http://schemas.openxmlformats.org/drawingml/2006/picture">
                   <pic:nvPicPr>
                     <pic:cNvPr id="370634946" name="Picture 370634946"/>
                     <pic:cNvPicPr/>
                   </pic:nvPicPr>
                   <pic:blipFill>
-                    <a:blip xmlns:r="http://schemas.openxmlformats.org/officeDocument/2006/relationships" r:embed="rId59972684">
+                    <a:blip r:embed="rId11">
                       <a:extLst>
                         <a:ext uri="{28A0092B-C50C-407E-A947-70E740481C1C}">
                           <a14:useLocalDpi xmlns:a14="http://schemas.microsoft.com/office/drawing/2010/main"/>
@@ -677,7 +672,7 @@
                     </a:stretch>
                   </pic:blipFill>
                   <pic:spPr>
-                    <a:xfrm rot="0">
+                    <a:xfrm>
                       <a:off x="0" y="0"/>
                       <a:ext cx="4457700" cy="2424105"/>
                     </a:xfrm>
@@ -694,27 +689,29 @@
     </w:p>
     <w:p>
       <w:pPr>
-        <w:pStyle w:val="Norml"/>
         <w:ind w:left="1134"/>
       </w:pPr>
       <w:r>
+        <w:rPr>
+          <w:noProof/>
+        </w:rPr>
         <w:drawing>
-          <wp:inline wp14:editId="5FAFACD9" wp14:anchorId="702AE4FB">
+          <wp:inline distT="0" distB="0" distL="0" distR="0" wp14:anchorId="702AE4FB" wp14:editId="5FAFACD9">
             <wp:extent cx="5791200" cy="2494286"/>
             <wp:effectExtent l="0" t="0" r="0" b="0"/>
             <wp:docPr id="587315289" name="drawing"/>
             <wp:cNvGraphicFramePr>
-              <a:graphicFrameLocks noChangeAspect="1"/>
+              <a:graphicFrameLocks xmlns:a="http://schemas.openxmlformats.org/drawingml/2006/main" noChangeAspect="1"/>
             </wp:cNvGraphicFramePr>
-            <a:graphic>
-              <a:graphicData xmlns:a="http://schemas.openxmlformats.org/drawingml/2006/main" uri="http://schemas.openxmlformats.org/drawingml/2006/picture">
+            <a:graphic xmlns:a="http://schemas.openxmlformats.org/drawingml/2006/main">
+              <a:graphicData uri="http://schemas.openxmlformats.org/drawingml/2006/picture">
                 <pic:pic xmlns:pic="http://schemas.openxmlformats.org/drawingml/2006/picture">
                   <pic:nvPicPr>
                     <pic:cNvPr id="587315289" name="Picture 587315289"/>
                     <pic:cNvPicPr/>
                   </pic:nvPicPr>
                   <pic:blipFill>
-                    <a:blip xmlns:r="http://schemas.openxmlformats.org/officeDocument/2006/relationships" r:embed="rId296299547">
+                    <a:blip r:embed="rId12">
                       <a:extLst>
                         <a:ext uri="{28A0092B-C50C-407E-A947-70E740481C1C}">
                           <a14:useLocalDpi xmlns:a14="http://schemas.microsoft.com/office/drawing/2010/main"/>
@@ -726,7 +723,7 @@
                     </a:stretch>
                   </pic:blipFill>
                   <pic:spPr>
-                    <a:xfrm rot="0">
+                    <a:xfrm>
                       <a:off x="0" y="0"/>
                       <a:ext cx="5791200" cy="2494286"/>
                     </a:xfrm>
@@ -742,27 +739,27 @@
       </w:r>
     </w:p>
     <w:p>
-      <w:pPr>
-        <w:pStyle w:val="Norml"/>
-      </w:pPr>
-      <w:r>
+      <w:r>
+        <w:rPr>
+          <w:noProof/>
+        </w:rPr>
         <w:drawing>
-          <wp:inline wp14:editId="24D29575" wp14:anchorId="1D89EC37">
+          <wp:inline distT="0" distB="0" distL="0" distR="0" wp14:anchorId="1D89EC37" wp14:editId="24D29575">
             <wp:extent cx="2281702" cy="1395434"/>
             <wp:effectExtent l="0" t="0" r="0" b="0"/>
             <wp:docPr id="991157093" name="drawing"/>
             <wp:cNvGraphicFramePr>
-              <a:graphicFrameLocks noChangeAspect="1"/>
+              <a:graphicFrameLocks xmlns:a="http://schemas.openxmlformats.org/drawingml/2006/main" noChangeAspect="1"/>
             </wp:cNvGraphicFramePr>
-            <a:graphic>
-              <a:graphicData xmlns:a="http://schemas.openxmlformats.org/drawingml/2006/main" uri="http://schemas.openxmlformats.org/drawingml/2006/picture">
+            <a:graphic xmlns:a="http://schemas.openxmlformats.org/drawingml/2006/main">
+              <a:graphicData uri="http://schemas.openxmlformats.org/drawingml/2006/picture">
                 <pic:pic xmlns:pic="http://schemas.openxmlformats.org/drawingml/2006/picture">
                   <pic:nvPicPr>
                     <pic:cNvPr id="1942899284" name="Picture 1942899284"/>
                     <pic:cNvPicPr/>
                   </pic:nvPicPr>
                   <pic:blipFill>
-                    <a:blip xmlns:r="http://schemas.openxmlformats.org/officeDocument/2006/relationships" r:embed="rId1630489266">
+                    <a:blip r:embed="rId13">
                       <a:extLst>
                         <a:ext uri="{28A0092B-C50C-407E-A947-70E740481C1C}">
                           <a14:useLocalDpi xmlns:a14="http://schemas.microsoft.com/office/drawing/2010/main"/>
@@ -774,7 +771,7 @@
                     </a:stretch>
                   </pic:blipFill>
                   <pic:spPr>
-                    <a:xfrm rot="0">
+                    <a:xfrm>
                       <a:off x="0" y="0"/>
                       <a:ext cx="2281702" cy="1395434"/>
                     </a:xfrm>
@@ -791,26 +788,26 @@
     </w:p>
     <w:p>
       <w:pPr>
-        <w:pStyle w:val="Norml"/>
-        <w:rPr>
-          <w:rFonts w:ascii="Times New Roman" w:hAnsi="Times New Roman" w:eastAsia="Times New Roman" w:cs="Times New Roman"/>
-          <w:sz w:val="36"/>
-          <w:szCs w:val="36"/>
-        </w:rPr>
-      </w:pPr>
-      <w:r>
-        <w:rPr>
-          <w:rFonts w:ascii="Times New Roman" w:hAnsi="Times New Roman" w:eastAsia="Times New Roman" w:cs="Times New Roman"/>
-          <w:sz w:val="36"/>
-          <w:szCs w:val="36"/>
-        </w:rPr>
+        <w:rPr>
+          <w:rFonts w:ascii="Times New Roman" w:hAnsi="Times New Roman" w:cs="Times New Roman"/>
+          <w:sz w:val="36"/>
+          <w:szCs w:val="36"/>
+        </w:rPr>
+      </w:pPr>
+      <w:r>
+        <w:rPr>
+          <w:rFonts w:ascii="Times New Roman" w:eastAsia="Times New Roman" w:hAnsi="Times New Roman" w:cs="Times New Roman"/>
+          <w:sz w:val="36"/>
+          <w:szCs w:val="36"/>
+        </w:rPr>
+        <w:lastRenderedPageBreak/>
         <w:t>A Dia program (</w:t>
       </w:r>
-      <w:hyperlink r:id="R218c5ce895d344fb">
+      <w:hyperlink r:id="rId14">
         <w:r>
           <w:rPr>
-            <w:rStyle w:val="Hyperlink"/>
-            <w:rFonts w:ascii="Times New Roman" w:hAnsi="Times New Roman" w:eastAsia="Times New Roman" w:cs="Times New Roman"/>
+            <w:rStyle w:val="Hiperhivatkozs"/>
+            <w:rFonts w:ascii="Times New Roman" w:eastAsia="Times New Roman" w:hAnsi="Times New Roman" w:cs="Times New Roman"/>
             <w:sz w:val="36"/>
             <w:szCs w:val="36"/>
           </w:rPr>
@@ -819,15 +816,197 @@
       </w:hyperlink>
       <w:r>
         <w:rPr>
-          <w:rFonts w:ascii="Times New Roman" w:hAnsi="Times New Roman" w:eastAsia="Times New Roman" w:cs="Times New Roman"/>
+          <w:rFonts w:ascii="Times New Roman" w:eastAsia="Times New Roman" w:hAnsi="Times New Roman" w:cs="Times New Roman"/>
           <w:sz w:val="36"/>
           <w:szCs w:val="36"/>
         </w:rPr>
         <w:t>) segítségével megtekinthető a folyamatábra minden részlete.</w:t>
       </w:r>
+      <w:r>
+        <w:rPr>
+          <w:rFonts w:ascii="Times New Roman" w:hAnsi="Times New Roman" w:cs="Times New Roman"/>
+          <w:sz w:val="36"/>
+          <w:szCs w:val="36"/>
+        </w:rPr>
+        <w:t xml:space="preserve"> </w:t>
+      </w:r>
+    </w:p>
+    <w:p/>
+    <w:p>
+      <w:pPr>
+        <w:rPr>
+          <w:rFonts w:ascii="Times New Roman" w:hAnsi="Times New Roman" w:cs="Times New Roman"/>
+          <w:b/>
+          <w:bCs/>
+          <w:sz w:val="40"/>
+          <w:szCs w:val="40"/>
+        </w:rPr>
+      </w:pPr>
+      <w:r>
+        <w:rPr>
+          <w:rFonts w:ascii="Times New Roman" w:hAnsi="Times New Roman" w:cs="Times New Roman"/>
+          <w:b/>
+          <w:bCs/>
+          <w:sz w:val="40"/>
+          <w:szCs w:val="40"/>
+        </w:rPr>
+        <w:t>2026-02-1</w:t>
+      </w:r>
+      <w:r>
+        <w:rPr>
+          <w:rFonts w:ascii="Times New Roman" w:hAnsi="Times New Roman" w:cs="Times New Roman"/>
+          <w:b/>
+          <w:bCs/>
+          <w:sz w:val="40"/>
+          <w:szCs w:val="40"/>
+        </w:rPr>
+        <w:t>2</w:t>
+      </w:r>
+      <w:r>
+        <w:rPr>
+          <w:rFonts w:ascii="Times New Roman" w:hAnsi="Times New Roman" w:cs="Times New Roman"/>
+          <w:b/>
+          <w:bCs/>
+          <w:sz w:val="40"/>
+          <w:szCs w:val="40"/>
+        </w:rPr>
+        <w:t xml:space="preserve"> </w:t>
+      </w:r>
+      <w:r>
+        <w:rPr>
+          <w:rFonts w:ascii="Times New Roman" w:hAnsi="Times New Roman" w:cs="Times New Roman"/>
+          <w:b/>
+          <w:bCs/>
+          <w:sz w:val="40"/>
+          <w:szCs w:val="40"/>
+        </w:rPr>
+        <w:t>11</w:t>
+      </w:r>
+      <w:r>
+        <w:rPr>
+          <w:rFonts w:ascii="Times New Roman" w:hAnsi="Times New Roman" w:cs="Times New Roman"/>
+          <w:b/>
+          <w:bCs/>
+          <w:sz w:val="40"/>
+          <w:szCs w:val="40"/>
+        </w:rPr>
+        <w:t>:</w:t>
+      </w:r>
+      <w:r>
+        <w:rPr>
+          <w:rFonts w:ascii="Times New Roman" w:hAnsi="Times New Roman" w:cs="Times New Roman"/>
+          <w:b/>
+          <w:bCs/>
+          <w:sz w:val="40"/>
+          <w:szCs w:val="40"/>
+        </w:rPr>
+        <w:t>1</w:t>
+      </w:r>
+      <w:r>
+        <w:rPr>
+          <w:rFonts w:ascii="Times New Roman" w:hAnsi="Times New Roman" w:cs="Times New Roman"/>
+          <w:b/>
+          <w:bCs/>
+          <w:sz w:val="40"/>
+          <w:szCs w:val="40"/>
+        </w:rPr>
+        <w:t>0-</w:t>
+      </w:r>
+      <w:r>
+        <w:rPr>
+          <w:rFonts w:ascii="Times New Roman" w:hAnsi="Times New Roman" w:cs="Times New Roman"/>
+          <w:b/>
+          <w:bCs/>
+          <w:sz w:val="40"/>
+          <w:szCs w:val="40"/>
+        </w:rPr>
+        <w:t>35</w:t>
+      </w:r>
+    </w:p>
+    <w:p>
+      <w:r>
+        <w:rPr>
+          <w:rFonts w:ascii="Times New Roman" w:hAnsi="Times New Roman" w:cs="Times New Roman"/>
+          <w:sz w:val="36"/>
+          <w:szCs w:val="36"/>
+        </w:rPr>
+        <w:t>Frontend oldalak funkcióinak tisztázása</w:t>
+      </w:r>
+      <w:r>
+        <w:rPr>
+          <w:rFonts w:ascii="Times New Roman" w:hAnsi="Times New Roman" w:cs="Times New Roman"/>
+          <w:sz w:val="36"/>
+          <w:szCs w:val="36"/>
+        </w:rPr>
+        <w:t>, első digitális kép</w:t>
+      </w:r>
+    </w:p>
+    <w:p>
+      <w:pPr>
+        <w:rPr>
+          <w:rFonts w:ascii="Times New Roman" w:eastAsia="Times New Roman" w:hAnsi="Times New Roman" w:cs="Times New Roman"/>
+          <w:sz w:val="36"/>
+          <w:szCs w:val="36"/>
+        </w:rPr>
+      </w:pPr>
+      <w:r>
+        <w:rPr>
+          <w:noProof/>
+        </w:rPr>
+        <w:drawing>
+          <wp:inline distT="0" distB="0" distL="0" distR="0" wp14:anchorId="250A4BFF" wp14:editId="667387A7">
+            <wp:extent cx="5760720" cy="3240405"/>
+            <wp:effectExtent l="0" t="0" r="0" b="0"/>
+            <wp:docPr id="1" name="Kép 1"/>
+            <wp:cNvGraphicFramePr>
+              <a:graphicFrameLocks xmlns:a="http://schemas.openxmlformats.org/drawingml/2006/main" noChangeAspect="1"/>
+            </wp:cNvGraphicFramePr>
+            <a:graphic xmlns:a="http://schemas.openxmlformats.org/drawingml/2006/main">
+              <a:graphicData uri="http://schemas.openxmlformats.org/drawingml/2006/picture">
+                <pic:pic xmlns:pic="http://schemas.openxmlformats.org/drawingml/2006/picture">
+                  <pic:nvPicPr>
+                    <pic:cNvPr id="0" name="Picture 1"/>
+                    <pic:cNvPicPr>
+                      <a:picLocks noChangeAspect="1" noChangeArrowheads="1"/>
+                    </pic:cNvPicPr>
+                  </pic:nvPicPr>
+                  <pic:blipFill>
+                    <a:blip r:embed="rId15">
+                      <a:extLst>
+                        <a:ext uri="{28A0092B-C50C-407E-A947-70E740481C1C}">
+                          <a14:useLocalDpi xmlns:a14="http://schemas.microsoft.com/office/drawing/2010/main" val="0"/>
+                        </a:ext>
+                      </a:extLst>
+                    </a:blip>
+                    <a:srcRect/>
+                    <a:stretch>
+                      <a:fillRect/>
+                    </a:stretch>
+                  </pic:blipFill>
+                  <pic:spPr bwMode="auto">
+                    <a:xfrm>
+                      <a:off x="0" y="0"/>
+                      <a:ext cx="5760720" cy="3240405"/>
+                    </a:xfrm>
+                    <a:prstGeom prst="rect">
+                      <a:avLst/>
+                    </a:prstGeom>
+                    <a:noFill/>
+                    <a:ln>
+                      <a:noFill/>
+                    </a:ln>
+                  </pic:spPr>
+                </pic:pic>
+              </a:graphicData>
+            </a:graphic>
+          </wp:inline>
+        </w:drawing>
+      </w:r>
+      <w:bookmarkStart w:id="0" w:name="_GoBack"/>
+      <w:bookmarkEnd w:id="0"/>
     </w:p>
     <w:sectPr>
-      <w:pgSz w:w="11906" w:h="16838" w:orient="portrait"/>
+      <w:pgSz w:w="11906" w:h="16838"/>
       <w:pgMar w:top="1417" w:right="1417" w:bottom="1417" w:left="1417" w:header="708" w:footer="708" w:gutter="0"/>
       <w:cols w:space="708"/>
       <w:docGrid w:linePitch="360"/>
@@ -837,7 +1016,7 @@
 </file>
 
 <file path=word/numbering.xml><?xml version="1.0" encoding="utf-8"?>
-<w:numbering xmlns:wpc="http://schemas.microsoft.com/office/word/2010/wordprocessingCanvas" xmlns:cx="http://schemas.microsoft.com/office/drawing/2014/chartex" xmlns:cx1="http://schemas.microsoft.com/office/drawing/2015/9/8/chartex" xmlns:cx2="http://schemas.microsoft.com/office/drawing/2015/10/21/chartex" xmlns:cx3="http://schemas.microsoft.com/office/drawing/2016/5/9/chartex" xmlns:cx4="http://schemas.microsoft.com/office/drawing/2016/5/10/chartex" xmlns:cx5="http://schemas.microsoft.com/office/drawing/2016/5/11/chartex" xmlns:cx6="http://schemas.microsoft.com/office/drawing/2016/5/12/chartex" xmlns:cx7="http://schemas.microsoft.com/office/drawing/2016/5/13/chartex" xmlns:cx8="http://schemas.microsoft.com/office/drawing/2016/5/14/chartex" xmlns:mc="http://schemas.openxmlformats.org/markup-compatibility/2006" xmlns:aink="http://schemas.microsoft.com/office/drawing/2016/ink" xmlns:am3d="http://schemas.microsoft.com/office/drawing/2017/model3d" xmlns:o="urn:schemas-microsoft-com:office:office" xmlns:oel="http://schemas.microsoft.com/office/2019/extlst" xmlns:r="http://schemas.openxmlformats.org/officeDocument/2006/relationships" xmlns:m="http://schemas.openxmlformats.org/officeDocument/2006/math" xmlns:v="urn:schemas-microsoft-com:vml" xmlns:wp14="http://schemas.microsoft.com/office/word/2010/wordprocessingDrawing" xmlns:wp="http://schemas.openxmlformats.org/drawingml/2006/wordprocessingDrawing" xmlns:w10="urn:schemas-microsoft-com:office:word" xmlns:w="http://schemas.openxmlformats.org/wordprocessingml/2006/main" xmlns:w14="http://schemas.microsoft.com/office/word/2010/wordml" xmlns:w15="http://schemas.microsoft.com/office/word/2012/wordml" xmlns:w16cex="http://schemas.microsoft.com/office/word/2018/wordml/cex" xmlns:w16cid="http://schemas.microsoft.com/office/word/2016/wordml/cid" xmlns:w16="http://schemas.microsoft.com/office/word/2018/wordml" xmlns:w16du="http://schemas.microsoft.com/office/word/2023/wordml/word16du" xmlns:w16sdtdh="http://schemas.microsoft.com/office/word/2020/wordml/sdtdatahash" xmlns:w16sdtfl="http://schemas.microsoft.com/office/word/2024/wordml/sdtformatlock" xmlns:w16se="http://schemas.microsoft.com/office/word/2015/wordml/symex" xmlns:wpg="http://schemas.microsoft.com/office/word/2010/wordprocessingGroup" xmlns:wpi="http://schemas.microsoft.com/office/word/2010/wordprocessingInk" xmlns:wne="http://schemas.microsoft.com/office/word/2006/wordml" xmlns:wps="http://schemas.microsoft.com/office/word/2010/wordprocessingShape" mc:Ignorable="w14 w15 w16se w16cid w16 w16cex w16sdtdh w16sdtfl w16du wp14">
+<w:numbering xmlns:wpc="http://schemas.microsoft.com/office/word/2010/wordprocessingCanvas" xmlns:cx="http://schemas.microsoft.com/office/drawing/2014/chartex" xmlns:cx1="http://schemas.microsoft.com/office/drawing/2015/9/8/chartex" xmlns:cx2="http://schemas.microsoft.com/office/drawing/2015/10/21/chartex" xmlns:cx3="http://schemas.microsoft.com/office/drawing/2016/5/9/chartex" xmlns:cx4="http://schemas.microsoft.com/office/drawing/2016/5/10/chartex" xmlns:cx5="http://schemas.microsoft.com/office/drawing/2016/5/11/chartex" xmlns:cx6="http://schemas.microsoft.com/office/drawing/2016/5/12/chartex" xmlns:cx7="http://schemas.microsoft.com/office/drawing/2016/5/13/chartex" xmlns:cx8="http://schemas.microsoft.com/office/drawing/2016/5/14/chartex" xmlns:mc="http://schemas.openxmlformats.org/markup-compatibility/2006" xmlns:aink="http://schemas.microsoft.com/office/drawing/2016/ink" xmlns:am3d="http://schemas.microsoft.com/office/drawing/2017/model3d" xmlns:o="urn:schemas-microsoft-com:office:office" xmlns:r="http://schemas.openxmlformats.org/officeDocument/2006/relationships" xmlns:m="http://schemas.openxmlformats.org/officeDocument/2006/math" xmlns:v="urn:schemas-microsoft-com:vml" xmlns:wp14="http://schemas.microsoft.com/office/word/2010/wordprocessingDrawing" xmlns:wp="http://schemas.openxmlformats.org/drawingml/2006/wordprocessingDrawing" xmlns:w10="urn:schemas-microsoft-com:office:word" xmlns:w="http://schemas.openxmlformats.org/wordprocessingml/2006/main" xmlns:w14="http://schemas.microsoft.com/office/word/2010/wordml" xmlns:w15="http://schemas.microsoft.com/office/word/2012/wordml" xmlns:w16cid="http://schemas.microsoft.com/office/word/2016/wordml/cid" xmlns:w16se="http://schemas.microsoft.com/office/word/2015/wordml/symex" xmlns:wpg="http://schemas.microsoft.com/office/word/2010/wordprocessingGroup" xmlns:wpi="http://schemas.microsoft.com/office/word/2010/wordprocessingInk" xmlns:wne="http://schemas.microsoft.com/office/word/2006/wordml" xmlns:wps="http://schemas.microsoft.com/office/word/2010/wordprocessingShape" mc:Ignorable="w14 w15 w16se w16cid wp14">
   <w:abstractNum w:abstractNumId="0" w15:restartNumberingAfterBreak="0">
     <w:nsid w:val="7EB672F7"/>
     <w:multiLevelType w:val="hybridMultilevel"/>
@@ -851,7 +1030,7 @@
         <w:ind w:left="720" w:hanging="360"/>
       </w:pPr>
       <w:rPr>
-        <w:rFonts w:hint="default" w:ascii="Symbol" w:hAnsi="Symbol"/>
+        <w:rFonts w:ascii="Symbol" w:hAnsi="Symbol" w:hint="default"/>
       </w:rPr>
     </w:lvl>
     <w:lvl w:ilvl="1" w:tplc="040E0003" w:tentative="1">
@@ -863,7 +1042,7 @@
         <w:ind w:left="1440" w:hanging="360"/>
       </w:pPr>
       <w:rPr>
-        <w:rFonts w:hint="default" w:ascii="Courier New" w:hAnsi="Courier New" w:cs="Courier New"/>
+        <w:rFonts w:ascii="Courier New" w:hAnsi="Courier New" w:cs="Courier New" w:hint="default"/>
       </w:rPr>
     </w:lvl>
     <w:lvl w:ilvl="2" w:tplc="040E0005" w:tentative="1">
@@ -875,7 +1054,7 @@
         <w:ind w:left="2160" w:hanging="360"/>
       </w:pPr>
       <w:rPr>
-        <w:rFonts w:hint="default" w:ascii="Wingdings" w:hAnsi="Wingdings"/>
+        <w:rFonts w:ascii="Wingdings" w:hAnsi="Wingdings" w:hint="default"/>
       </w:rPr>
     </w:lvl>
     <w:lvl w:ilvl="3" w:tplc="040E0001" w:tentative="1">
@@ -887,7 +1066,7 @@
         <w:ind w:left="2880" w:hanging="360"/>
       </w:pPr>
       <w:rPr>
-        <w:rFonts w:hint="default" w:ascii="Symbol" w:hAnsi="Symbol"/>
+        <w:rFonts w:ascii="Symbol" w:hAnsi="Symbol" w:hint="default"/>
       </w:rPr>
     </w:lvl>
     <w:lvl w:ilvl="4" w:tplc="040E0003" w:tentative="1">
@@ -899,7 +1078,7 @@
         <w:ind w:left="3600" w:hanging="360"/>
       </w:pPr>
       <w:rPr>
-        <w:rFonts w:hint="default" w:ascii="Courier New" w:hAnsi="Courier New" w:cs="Courier New"/>
+        <w:rFonts w:ascii="Courier New" w:hAnsi="Courier New" w:cs="Courier New" w:hint="default"/>
       </w:rPr>
     </w:lvl>
     <w:lvl w:ilvl="5" w:tplc="040E0005" w:tentative="1">
@@ -911,7 +1090,7 @@
         <w:ind w:left="4320" w:hanging="360"/>
       </w:pPr>
       <w:rPr>
-        <w:rFonts w:hint="default" w:ascii="Wingdings" w:hAnsi="Wingdings"/>
+        <w:rFonts w:ascii="Wingdings" w:hAnsi="Wingdings" w:hint="default"/>
       </w:rPr>
     </w:lvl>
     <w:lvl w:ilvl="6" w:tplc="040E0001" w:tentative="1">
@@ -923,7 +1102,7 @@
         <w:ind w:left="5040" w:hanging="360"/>
       </w:pPr>
       <w:rPr>
-        <w:rFonts w:hint="default" w:ascii="Symbol" w:hAnsi="Symbol"/>
+        <w:rFonts w:ascii="Symbol" w:hAnsi="Symbol" w:hint="default"/>
       </w:rPr>
     </w:lvl>
     <w:lvl w:ilvl="7" w:tplc="040E0003" w:tentative="1">
@@ -935,7 +1114,7 @@
         <w:ind w:left="5760" w:hanging="360"/>
       </w:pPr>
       <w:rPr>
-        <w:rFonts w:hint="default" w:ascii="Courier New" w:hAnsi="Courier New" w:cs="Courier New"/>
+        <w:rFonts w:ascii="Courier New" w:hAnsi="Courier New" w:cs="Courier New" w:hint="default"/>
       </w:rPr>
     </w:lvl>
     <w:lvl w:ilvl="8" w:tplc="040E0005" w:tentative="1">
@@ -947,22 +1126,22 @@
         <w:ind w:left="6480" w:hanging="360"/>
       </w:pPr>
       <w:rPr>
-        <w:rFonts w:hint="default" w:ascii="Wingdings" w:hAnsi="Wingdings"/>
+        <w:rFonts w:ascii="Wingdings" w:hAnsi="Wingdings" w:hint="default"/>
       </w:rPr>
     </w:lvl>
   </w:abstractNum>
-  <w:num w:numId="1" w16cid:durableId="927620565">
+  <w:num w:numId="1">
     <w:abstractNumId w:val="0"/>
   </w:num>
 </w:numbering>
 </file>
 
 <file path=word/styles.xml><?xml version="1.0" encoding="utf-8"?>
-<w:styles xmlns:mc="http://schemas.openxmlformats.org/markup-compatibility/2006" xmlns:r="http://schemas.openxmlformats.org/officeDocument/2006/relationships" xmlns:w="http://schemas.openxmlformats.org/wordprocessingml/2006/main" xmlns:w14="http://schemas.microsoft.com/office/word/2010/wordml" xmlns:w15="http://schemas.microsoft.com/office/word/2012/wordml" xmlns:w16cex="http://schemas.microsoft.com/office/word/2018/wordml/cex" xmlns:w16cid="http://schemas.microsoft.com/office/word/2016/wordml/cid" xmlns:w16="http://schemas.microsoft.com/office/word/2018/wordml" xmlns:w16du="http://schemas.microsoft.com/office/word/2023/wordml/word16du" xmlns:w16sdtdh="http://schemas.microsoft.com/office/word/2020/wordml/sdtdatahash" xmlns:w16sdtfl="http://schemas.microsoft.com/office/word/2024/wordml/sdtformatlock" xmlns:w16se="http://schemas.microsoft.com/office/word/2015/wordml/symex" mc:Ignorable="w14 w15 w16se w16cid w16 w16cex w16sdtdh w16sdtfl w16du">
+<w:styles xmlns:mc="http://schemas.openxmlformats.org/markup-compatibility/2006" xmlns:r="http://schemas.openxmlformats.org/officeDocument/2006/relationships" xmlns:w="http://schemas.openxmlformats.org/wordprocessingml/2006/main" xmlns:w14="http://schemas.microsoft.com/office/word/2010/wordml" xmlns:w15="http://schemas.microsoft.com/office/word/2012/wordml" xmlns:w16cid="http://schemas.microsoft.com/office/word/2016/wordml/cid" xmlns:w16se="http://schemas.microsoft.com/office/word/2015/wordml/symex" mc:Ignorable="w14 w15 w16se w16cid">
   <w:docDefaults>
     <w:rPrDefault>
       <w:rPr>
-        <w:rFonts w:asciiTheme="minorHAnsi" w:hAnsiTheme="minorHAnsi" w:eastAsiaTheme="minorHAnsi" w:cstheme="minorBidi"/>
+        <w:rFonts w:asciiTheme="minorHAnsi" w:eastAsiaTheme="minorHAnsi" w:hAnsiTheme="minorHAnsi" w:cstheme="minorBidi"/>
         <w:kern w:val="2"/>
         <w:sz w:val="24"/>
         <w:szCs w:val="24"/>
@@ -976,17 +1155,17 @@
       </w:pPr>
     </w:pPrDefault>
   </w:docDefaults>
-  <w:latentStyles w:defLockedState="0" w:defUIPriority="99" w:defSemiHidden="0" w:defUnhideWhenUsed="0" w:defQFormat="0" w:count="376">
+  <w:latentStyles w:defLockedState="0" w:defUIPriority="99" w:defSemiHidden="0" w:defUnhideWhenUsed="0" w:defQFormat="0" w:count="375">
     <w:lsdException w:name="Normal" w:uiPriority="0" w:qFormat="1"/>
     <w:lsdException w:name="heading 1" w:uiPriority="9" w:qFormat="1"/>
-    <w:lsdException w:name="heading 2" w:uiPriority="9" w:semiHidden="1" w:unhideWhenUsed="1" w:qFormat="1"/>
-    <w:lsdException w:name="heading 3" w:uiPriority="9" w:semiHidden="1" w:unhideWhenUsed="1" w:qFormat="1"/>
-    <w:lsdException w:name="heading 4" w:uiPriority="9" w:semiHidden="1" w:unhideWhenUsed="1" w:qFormat="1"/>
-    <w:lsdException w:name="heading 5" w:uiPriority="9" w:semiHidden="1" w:unhideWhenUsed="1" w:qFormat="1"/>
-    <w:lsdException w:name="heading 6" w:uiPriority="9" w:semiHidden="1" w:unhideWhenUsed="1" w:qFormat="1"/>
-    <w:lsdException w:name="heading 7" w:uiPriority="9" w:semiHidden="1" w:unhideWhenUsed="1" w:qFormat="1"/>
-    <w:lsdException w:name="heading 8" w:uiPriority="9" w:semiHidden="1" w:unhideWhenUsed="1" w:qFormat="1"/>
-    <w:lsdException w:name="heading 9" w:uiPriority="9" w:semiHidden="1" w:unhideWhenUsed="1" w:qFormat="1"/>
+    <w:lsdException w:name="heading 2" w:semiHidden="1" w:uiPriority="9" w:unhideWhenUsed="1" w:qFormat="1"/>
+    <w:lsdException w:name="heading 3" w:semiHidden="1" w:uiPriority="9" w:unhideWhenUsed="1" w:qFormat="1"/>
+    <w:lsdException w:name="heading 4" w:semiHidden="1" w:uiPriority="9" w:unhideWhenUsed="1" w:qFormat="1"/>
+    <w:lsdException w:name="heading 5" w:semiHidden="1" w:uiPriority="9" w:unhideWhenUsed="1" w:qFormat="1"/>
+    <w:lsdException w:name="heading 6" w:semiHidden="1" w:uiPriority="9" w:unhideWhenUsed="1" w:qFormat="1"/>
+    <w:lsdException w:name="heading 7" w:semiHidden="1" w:uiPriority="9" w:unhideWhenUsed="1" w:qFormat="1"/>
+    <w:lsdException w:name="heading 8" w:semiHidden="1" w:uiPriority="9" w:unhideWhenUsed="1" w:qFormat="1"/>
+    <w:lsdException w:name="heading 9" w:semiHidden="1" w:uiPriority="9" w:unhideWhenUsed="1" w:qFormat="1"/>
     <w:lsdException w:name="index 1" w:semiHidden="1" w:unhideWhenUsed="1"/>
     <w:lsdException w:name="index 2" w:semiHidden="1" w:unhideWhenUsed="1"/>
     <w:lsdException w:name="index 3" w:semiHidden="1" w:unhideWhenUsed="1"/>
@@ -996,22 +1175,22 @@
     <w:lsdException w:name="index 7" w:semiHidden="1" w:unhideWhenUsed="1"/>
     <w:lsdException w:name="index 8" w:semiHidden="1" w:unhideWhenUsed="1"/>
     <w:lsdException w:name="index 9" w:semiHidden="1" w:unhideWhenUsed="1"/>
-    <w:lsdException w:name="toc 1" w:uiPriority="39" w:semiHidden="1" w:unhideWhenUsed="1"/>
-    <w:lsdException w:name="toc 2" w:uiPriority="39" w:semiHidden="1" w:unhideWhenUsed="1"/>
-    <w:lsdException w:name="toc 3" w:uiPriority="39" w:semiHidden="1" w:unhideWhenUsed="1"/>
-    <w:lsdException w:name="toc 4" w:uiPriority="39" w:semiHidden="1" w:unhideWhenUsed="1"/>
-    <w:lsdException w:name="toc 5" w:uiPriority="39" w:semiHidden="1" w:unhideWhenUsed="1"/>
-    <w:lsdException w:name="toc 6" w:uiPriority="39" w:semiHidden="1" w:unhideWhenUsed="1"/>
-    <w:lsdException w:name="toc 7" w:uiPriority="39" w:semiHidden="1" w:unhideWhenUsed="1"/>
-    <w:lsdException w:name="toc 8" w:uiPriority="39" w:semiHidden="1" w:unhideWhenUsed="1"/>
-    <w:lsdException w:name="toc 9" w:uiPriority="39" w:semiHidden="1" w:unhideWhenUsed="1"/>
+    <w:lsdException w:name="toc 1" w:semiHidden="1" w:uiPriority="39" w:unhideWhenUsed="1"/>
+    <w:lsdException w:name="toc 2" w:semiHidden="1" w:uiPriority="39" w:unhideWhenUsed="1"/>
+    <w:lsdException w:name="toc 3" w:semiHidden="1" w:uiPriority="39" w:unhideWhenUsed="1"/>
+    <w:lsdException w:name="toc 4" w:semiHidden="1" w:uiPriority="39" w:unhideWhenUsed="1"/>
+    <w:lsdException w:name="toc 5" w:semiHidden="1" w:uiPriority="39" w:unhideWhenUsed="1"/>
+    <w:lsdException w:name="toc 6" w:semiHidden="1" w:uiPriority="39" w:unhideWhenUsed="1"/>
+    <w:lsdException w:name="toc 7" w:semiHidden="1" w:uiPriority="39" w:unhideWhenUsed="1"/>
+    <w:lsdException w:name="toc 8" w:semiHidden="1" w:uiPriority="39" w:unhideWhenUsed="1"/>
+    <w:lsdException w:name="toc 9" w:semiHidden="1" w:uiPriority="39" w:unhideWhenUsed="1"/>
     <w:lsdException w:name="Normal Indent" w:semiHidden="1" w:unhideWhenUsed="1"/>
     <w:lsdException w:name="footnote text" w:semiHidden="1" w:unhideWhenUsed="1"/>
     <w:lsdException w:name="annotation text" w:semiHidden="1" w:unhideWhenUsed="1"/>
     <w:lsdException w:name="header" w:semiHidden="1" w:unhideWhenUsed="1"/>
     <w:lsdException w:name="footer" w:semiHidden="1" w:unhideWhenUsed="1"/>
     <w:lsdException w:name="index heading" w:semiHidden="1" w:unhideWhenUsed="1"/>
-    <w:lsdException w:name="caption" w:uiPriority="35" w:semiHidden="1" w:unhideWhenUsed="1" w:qFormat="1"/>
+    <w:lsdException w:name="caption" w:semiHidden="1" w:uiPriority="35" w:unhideWhenUsed="1" w:qFormat="1"/>
     <w:lsdException w:name="table of figures" w:semiHidden="1" w:unhideWhenUsed="1"/>
     <w:lsdException w:name="envelope address" w:semiHidden="1" w:unhideWhenUsed="1"/>
     <w:lsdException w:name="envelope return" w:semiHidden="1" w:unhideWhenUsed="1"/>
@@ -1042,7 +1221,7 @@
     <w:lsdException w:name="Title" w:uiPriority="10" w:qFormat="1"/>
     <w:lsdException w:name="Closing" w:semiHidden="1" w:unhideWhenUsed="1"/>
     <w:lsdException w:name="Signature" w:semiHidden="1" w:unhideWhenUsed="1"/>
-    <w:lsdException w:name="Default Paragraph Font" w:uiPriority="1" w:semiHidden="1" w:unhideWhenUsed="1"/>
+    <w:lsdException w:name="Default Paragraph Font" w:semiHidden="1" w:uiPriority="1" w:unhideWhenUsed="1"/>
     <w:lsdException w:name="Body Text" w:semiHidden="1" w:unhideWhenUsed="1"/>
     <w:lsdException w:name="Body Text Indent" w:semiHidden="1" w:unhideWhenUsed="1"/>
     <w:lsdException w:name="List Continue" w:semiHidden="1" w:unhideWhenUsed="1"/>
@@ -1242,8 +1421,8 @@
     <w:lsdException w:name="Subtle Reference" w:uiPriority="31" w:qFormat="1"/>
     <w:lsdException w:name="Intense Reference" w:uiPriority="32" w:qFormat="1"/>
     <w:lsdException w:name="Book Title" w:uiPriority="33" w:qFormat="1"/>
-    <w:lsdException w:name="Bibliography" w:uiPriority="37" w:semiHidden="1" w:unhideWhenUsed="1"/>
-    <w:lsdException w:name="TOC Heading" w:uiPriority="39" w:semiHidden="1" w:unhideWhenUsed="1" w:qFormat="1"/>
+    <w:lsdException w:name="Bibliography" w:semiHidden="1" w:uiPriority="37" w:unhideWhenUsed="1"/>
+    <w:lsdException w:name="TOC Heading" w:semiHidden="1" w:uiPriority="39" w:unhideWhenUsed="1" w:qFormat="1"/>
     <w:lsdException w:name="Plain Table 1" w:uiPriority="41"/>
     <w:lsdException w:name="Plain Table 2" w:uiPriority="42"/>
     <w:lsdException w:name="Plain Table 3" w:uiPriority="43"/>
@@ -1352,9 +1531,8 @@
     <w:lsdException w:name="Smart Hyperlink" w:semiHidden="1" w:unhideWhenUsed="1"/>
     <w:lsdException w:name="Hashtag" w:semiHidden="1" w:unhideWhenUsed="1"/>
     <w:lsdException w:name="Unresolved Mention" w:semiHidden="1" w:unhideWhenUsed="1"/>
-    <w:lsdException w:name="Smart Link" w:semiHidden="1" w:unhideWhenUsed="1"/>
   </w:latentStyles>
-  <w:style w:type="paragraph" w:styleId="Norml" w:default="1">
+  <w:style w:type="paragraph" w:default="1" w:styleId="Norml">
     <w:name w:val="Normal"/>
     <w:qFormat/>
   </w:style>
@@ -1373,7 +1551,7 @@
       <w:outlineLvl w:val="0"/>
     </w:pPr>
     <w:rPr>
-      <w:rFonts w:asciiTheme="majorHAnsi" w:hAnsiTheme="majorHAnsi" w:eastAsiaTheme="majorEastAsia" w:cstheme="majorBidi"/>
+      <w:rFonts w:asciiTheme="majorHAnsi" w:eastAsiaTheme="majorEastAsia" w:hAnsiTheme="majorHAnsi" w:cstheme="majorBidi"/>
       <w:color w:val="0F4761" w:themeColor="accent1" w:themeShade="BF"/>
       <w:sz w:val="40"/>
       <w:szCs w:val="40"/>
@@ -1396,7 +1574,7 @@
       <w:outlineLvl w:val="1"/>
     </w:pPr>
     <w:rPr>
-      <w:rFonts w:asciiTheme="majorHAnsi" w:hAnsiTheme="majorHAnsi" w:eastAsiaTheme="majorEastAsia" w:cstheme="majorBidi"/>
+      <w:rFonts w:asciiTheme="majorHAnsi" w:eastAsiaTheme="majorEastAsia" w:hAnsiTheme="majorHAnsi" w:cstheme="majorBidi"/>
       <w:color w:val="0F4761" w:themeColor="accent1" w:themeShade="BF"/>
       <w:sz w:val="32"/>
       <w:szCs w:val="32"/>
@@ -1557,13 +1735,13 @@
       <w:color w:val="272727" w:themeColor="text1" w:themeTint="D8"/>
     </w:rPr>
   </w:style>
-  <w:style w:type="character" w:styleId="Bekezdsalapbettpusa" w:default="1">
+  <w:style w:type="character" w:default="1" w:styleId="Bekezdsalapbettpusa">
     <w:name w:val="Default Paragraph Font"/>
     <w:uiPriority w:val="1"/>
     <w:semiHidden/>
     <w:unhideWhenUsed/>
   </w:style>
-  <w:style w:type="table" w:styleId="Normltblzat" w:default="1">
+  <w:style w:type="table" w:default="1" w:styleId="Normltblzat">
     <w:name w:val="Normal Table"/>
     <w:uiPriority w:val="99"/>
     <w:semiHidden/>
@@ -1578,128 +1756,119 @@
       </w:tblCellMar>
     </w:tblPr>
   </w:style>
-  <w:style w:type="numbering" w:styleId="Nemlista" w:default="1">
+  <w:style w:type="numbering" w:default="1" w:styleId="Nemlista">
     <w:name w:val="No List"/>
     <w:uiPriority w:val="99"/>
     <w:semiHidden/>
     <w:unhideWhenUsed/>
   </w:style>
-  <w:style w:type="character" w:styleId="Cmsor1Char" w:customStyle="true">
+  <w:style w:type="character" w:customStyle="1" w:styleId="Cmsor1Char">
+    <w:name w:val="Címsor 1 Char"/>
+    <w:link w:val="Cmsor1"/>
     <w:uiPriority w:val="9"/>
-    <w:name w:val="Címsor 1 Char"/>
-    <w:basedOn w:val="DefaultParagraphFont"/>
-    <w:link w:val="Cmsor1"/>
     <w:rsid w:val="38171242"/>
     <w:rPr>
-      <w:rFonts w:ascii="Aptos Display" w:hAnsi="Aptos Display" w:eastAsia="" w:cs="" w:asciiTheme="majorAscii" w:hAnsiTheme="majorAscii" w:eastAsiaTheme="majorEastAsia" w:cstheme="majorBidi"/>
-      <w:color w:val="0F4761" w:themeColor="accent1" w:themeTint="FF" w:themeShade="BF"/>
+      <w:rFonts w:asciiTheme="majorHAnsi" w:eastAsiaTheme="majorEastAsia" w:hAnsiTheme="majorHAnsi" w:cstheme="majorBidi"/>
+      <w:color w:val="0F4761" w:themeColor="accent1" w:themeShade="BF"/>
       <w:sz w:val="40"/>
       <w:szCs w:val="40"/>
     </w:rPr>
   </w:style>
-  <w:style w:type="character" w:styleId="Cmsor2Char" w:customStyle="true">
+  <w:style w:type="character" w:customStyle="1" w:styleId="Cmsor2Char">
+    <w:name w:val="Címsor 2 Char"/>
+    <w:link w:val="Cmsor2"/>
     <w:uiPriority w:val="9"/>
-    <w:name w:val="Címsor 2 Char"/>
-    <w:basedOn w:val="DefaultParagraphFont"/>
     <w:semiHidden/>
-    <w:link w:val="Cmsor2"/>
     <w:rsid w:val="38171242"/>
     <w:rPr>
-      <w:rFonts w:ascii="Aptos Display" w:hAnsi="Aptos Display" w:eastAsia="" w:cs="" w:asciiTheme="majorAscii" w:hAnsiTheme="majorAscii" w:eastAsiaTheme="majorEastAsia" w:cstheme="majorBidi"/>
-      <w:color w:val="0F4761" w:themeColor="accent1" w:themeTint="FF" w:themeShade="BF"/>
+      <w:rFonts w:asciiTheme="majorHAnsi" w:eastAsiaTheme="majorEastAsia" w:hAnsiTheme="majorHAnsi" w:cstheme="majorBidi"/>
+      <w:color w:val="0F4761" w:themeColor="accent1" w:themeShade="BF"/>
       <w:sz w:val="32"/>
       <w:szCs w:val="32"/>
     </w:rPr>
   </w:style>
-  <w:style w:type="character" w:styleId="Cmsor3Char" w:customStyle="true">
+  <w:style w:type="character" w:customStyle="1" w:styleId="Cmsor3Char">
+    <w:name w:val="Címsor 3 Char"/>
+    <w:link w:val="Cmsor3"/>
     <w:uiPriority w:val="9"/>
-    <w:name w:val="Címsor 3 Char"/>
-    <w:basedOn w:val="DefaultParagraphFont"/>
     <w:semiHidden/>
-    <w:link w:val="Cmsor3"/>
     <w:rsid w:val="38171242"/>
     <w:rPr>
-      <w:rFonts w:eastAsia="" w:cs="" w:eastAsiaTheme="majorEastAsia" w:cstheme="majorBidi"/>
-      <w:color w:val="0F4761" w:themeColor="accent1" w:themeTint="FF" w:themeShade="BF"/>
+      <w:rFonts w:eastAsiaTheme="majorEastAsia" w:cstheme="majorBidi"/>
+      <w:color w:val="0F4761" w:themeColor="accent1" w:themeShade="BF"/>
       <w:sz w:val="28"/>
       <w:szCs w:val="28"/>
     </w:rPr>
   </w:style>
-  <w:style w:type="character" w:styleId="Cmsor4Char" w:customStyle="true">
+  <w:style w:type="character" w:customStyle="1" w:styleId="Cmsor4Char">
+    <w:name w:val="Címsor 4 Char"/>
+    <w:link w:val="Cmsor4"/>
     <w:uiPriority w:val="9"/>
-    <w:name w:val="Címsor 4 Char"/>
-    <w:basedOn w:val="DefaultParagraphFont"/>
     <w:semiHidden/>
-    <w:link w:val="Cmsor4"/>
     <w:rsid w:val="38171242"/>
     <w:rPr>
-      <w:rFonts w:eastAsia="" w:cs="" w:eastAsiaTheme="majorEastAsia" w:cstheme="majorBidi"/>
-      <w:i w:val="1"/>
-      <w:iCs w:val="1"/>
-      <w:color w:val="0F4761" w:themeColor="accent1" w:themeTint="FF" w:themeShade="BF"/>
-    </w:rPr>
-  </w:style>
-  <w:style w:type="character" w:styleId="Cmsor5Char" w:customStyle="true">
+      <w:rFonts w:eastAsiaTheme="majorEastAsia" w:cstheme="majorBidi"/>
+      <w:i/>
+      <w:iCs/>
+      <w:color w:val="0F4761" w:themeColor="accent1" w:themeShade="BF"/>
+    </w:rPr>
+  </w:style>
+  <w:style w:type="character" w:customStyle="1" w:styleId="Cmsor5Char">
+    <w:name w:val="Címsor 5 Char"/>
+    <w:link w:val="Cmsor5"/>
     <w:uiPriority w:val="9"/>
-    <w:name w:val="Címsor 5 Char"/>
-    <w:basedOn w:val="DefaultParagraphFont"/>
     <w:semiHidden/>
-    <w:link w:val="Cmsor5"/>
     <w:rsid w:val="38171242"/>
     <w:rPr>
-      <w:rFonts w:eastAsia="" w:cs="" w:eastAsiaTheme="majorEastAsia" w:cstheme="majorBidi"/>
-      <w:color w:val="0F4761" w:themeColor="accent1" w:themeTint="FF" w:themeShade="BF"/>
-    </w:rPr>
-  </w:style>
-  <w:style w:type="character" w:styleId="Cmsor6Char" w:customStyle="true">
+      <w:rFonts w:eastAsiaTheme="majorEastAsia" w:cstheme="majorBidi"/>
+      <w:color w:val="0F4761" w:themeColor="accent1" w:themeShade="BF"/>
+    </w:rPr>
+  </w:style>
+  <w:style w:type="character" w:customStyle="1" w:styleId="Cmsor6Char">
+    <w:name w:val="Címsor 6 Char"/>
+    <w:link w:val="Cmsor6"/>
     <w:uiPriority w:val="9"/>
-    <w:name w:val="Címsor 6 Char"/>
-    <w:basedOn w:val="DefaultParagraphFont"/>
     <w:semiHidden/>
-    <w:link w:val="Cmsor6"/>
     <w:rsid w:val="38171242"/>
     <w:rPr>
-      <w:rFonts w:eastAsia="" w:cs="" w:eastAsiaTheme="majorEastAsia" w:cstheme="majorBidi"/>
-      <w:i w:val="1"/>
-      <w:iCs w:val="1"/>
-      <w:color w:val="595959" w:themeColor="text1" w:themeTint="A6" w:themeShade="FF"/>
-    </w:rPr>
-  </w:style>
-  <w:style w:type="character" w:styleId="Cmsor7Char" w:customStyle="true">
+      <w:rFonts w:eastAsiaTheme="majorEastAsia" w:cstheme="majorBidi"/>
+      <w:i/>
+      <w:iCs/>
+      <w:color w:val="595959" w:themeColor="text1" w:themeTint="A6"/>
+    </w:rPr>
+  </w:style>
+  <w:style w:type="character" w:customStyle="1" w:styleId="Cmsor7Char">
+    <w:name w:val="Címsor 7 Char"/>
+    <w:link w:val="Cmsor7"/>
     <w:uiPriority w:val="9"/>
-    <w:name w:val="Címsor 7 Char"/>
-    <w:basedOn w:val="DefaultParagraphFont"/>
     <w:semiHidden/>
-    <w:link w:val="Cmsor7"/>
     <w:rsid w:val="38171242"/>
     <w:rPr>
-      <w:rFonts w:eastAsia="" w:cs="" w:eastAsiaTheme="majorEastAsia" w:cstheme="majorBidi"/>
-      <w:color w:val="595959" w:themeColor="text1" w:themeTint="A6" w:themeShade="FF"/>
-    </w:rPr>
-  </w:style>
-  <w:style w:type="character" w:styleId="Cmsor8Char" w:customStyle="true">
+      <w:rFonts w:eastAsiaTheme="majorEastAsia" w:cstheme="majorBidi"/>
+      <w:color w:val="595959" w:themeColor="text1" w:themeTint="A6"/>
+    </w:rPr>
+  </w:style>
+  <w:style w:type="character" w:customStyle="1" w:styleId="Cmsor8Char">
+    <w:name w:val="Címsor 8 Char"/>
+    <w:link w:val="Cmsor8"/>
     <w:uiPriority w:val="9"/>
-    <w:name w:val="Címsor 8 Char"/>
-    <w:basedOn w:val="DefaultParagraphFont"/>
     <w:semiHidden/>
-    <w:link w:val="Cmsor8"/>
     <w:rsid w:val="38171242"/>
     <w:rPr>
-      <w:rFonts w:eastAsia="" w:cs="" w:eastAsiaTheme="majorEastAsia" w:cstheme="majorBidi"/>
-      <w:i w:val="1"/>
-      <w:iCs w:val="1"/>
+      <w:rFonts w:eastAsiaTheme="majorEastAsia" w:cstheme="majorBidi"/>
+      <w:i/>
+      <w:iCs/>
       <w:color w:val="272727"/>
     </w:rPr>
   </w:style>
-  <w:style w:type="character" w:styleId="Cmsor9Char" w:customStyle="true">
+  <w:style w:type="character" w:customStyle="1" w:styleId="Cmsor9Char">
+    <w:name w:val="Címsor 9 Char"/>
+    <w:link w:val="Cmsor9"/>
     <w:uiPriority w:val="9"/>
-    <w:name w:val="Címsor 9 Char"/>
-    <w:basedOn w:val="DefaultParagraphFont"/>
     <w:semiHidden/>
-    <w:link w:val="Cmsor9"/>
     <w:rsid w:val="38171242"/>
     <w:rPr>
-      <w:rFonts w:eastAsia="" w:cs="" w:eastAsiaTheme="majorEastAsia" w:cstheme="majorBidi"/>
+      <w:rFonts w:eastAsiaTheme="majorEastAsia" w:cstheme="majorBidi"/>
       <w:color w:val="272727"/>
     </w:rPr>
   </w:style>
@@ -1716,21 +1885,20 @@
       <w:contextualSpacing/>
     </w:pPr>
     <w:rPr>
-      <w:rFonts w:asciiTheme="majorHAnsi" w:hAnsiTheme="majorHAnsi" w:eastAsiaTheme="majorEastAsia" w:cstheme="majorBidi"/>
+      <w:rFonts w:asciiTheme="majorHAnsi" w:eastAsiaTheme="majorEastAsia" w:hAnsiTheme="majorHAnsi" w:cstheme="majorBidi"/>
       <w:spacing w:val="-10"/>
       <w:kern w:val="28"/>
       <w:sz w:val="56"/>
       <w:szCs w:val="56"/>
     </w:rPr>
   </w:style>
-  <w:style w:type="character" w:styleId="CmChar" w:customStyle="true">
+  <w:style w:type="character" w:customStyle="1" w:styleId="CmChar">
+    <w:name w:val="Cím Char"/>
+    <w:link w:val="Cm"/>
     <w:uiPriority w:val="10"/>
-    <w:name w:val="Cím Char"/>
-    <w:basedOn w:val="DefaultParagraphFont"/>
-    <w:link w:val="Cm"/>
     <w:rsid w:val="38171242"/>
     <w:rPr>
-      <w:rFonts w:ascii="Aptos Display" w:hAnsi="Aptos Display" w:eastAsia="" w:cs="" w:asciiTheme="majorAscii" w:hAnsiTheme="majorAscii" w:eastAsiaTheme="majorEastAsia" w:cstheme="majorBidi"/>
+      <w:rFonts w:asciiTheme="majorHAnsi" w:eastAsiaTheme="majorEastAsia" w:hAnsiTheme="majorHAnsi" w:cstheme="majorBidi"/>
       <w:sz w:val="56"/>
       <w:szCs w:val="56"/>
     </w:rPr>
@@ -1756,15 +1924,14 @@
       <w:szCs w:val="28"/>
     </w:rPr>
   </w:style>
-  <w:style w:type="character" w:styleId="AlcmChar" w:customStyle="true">
+  <w:style w:type="character" w:customStyle="1" w:styleId="AlcmChar">
+    <w:name w:val="Alcím Char"/>
+    <w:link w:val="Alcm"/>
     <w:uiPriority w:val="11"/>
-    <w:name w:val="Alcím Char"/>
-    <w:basedOn w:val="DefaultParagraphFont"/>
-    <w:link w:val="Alcm"/>
     <w:rsid w:val="38171242"/>
     <w:rPr>
-      <w:rFonts w:eastAsia="" w:cs="" w:eastAsiaTheme="majorEastAsia" w:cstheme="majorBidi"/>
-      <w:color w:val="595959" w:themeColor="text1" w:themeTint="A6" w:themeShade="FF"/>
+      <w:rFonts w:eastAsiaTheme="majorEastAsia" w:cstheme="majorBidi"/>
+      <w:color w:val="595959" w:themeColor="text1" w:themeTint="A6"/>
       <w:sz w:val="28"/>
       <w:szCs w:val="28"/>
     </w:rPr>
@@ -1787,16 +1954,15 @@
       <w:color w:val="404040" w:themeColor="text1" w:themeTint="BF"/>
     </w:rPr>
   </w:style>
-  <w:style w:type="character" w:styleId="IdzetChar" w:customStyle="true">
+  <w:style w:type="character" w:customStyle="1" w:styleId="IdzetChar">
+    <w:name w:val="Idézet Char"/>
+    <w:link w:val="Idzet"/>
     <w:uiPriority w:val="29"/>
-    <w:name w:val="Idézet Char"/>
-    <w:basedOn w:val="DefaultParagraphFont"/>
-    <w:link w:val="Idzet"/>
     <w:rsid w:val="38171242"/>
     <w:rPr>
-      <w:i w:val="1"/>
-      <w:iCs w:val="1"/>
-      <w:color w:val="404040" w:themeColor="text1" w:themeTint="BF" w:themeShade="FF"/>
+      <w:i/>
+      <w:iCs/>
+      <w:color w:val="404040" w:themeColor="text1" w:themeTint="BF"/>
     </w:rPr>
   </w:style>
   <w:style w:type="paragraph" w:styleId="Listaszerbekezds">
@@ -1811,15 +1977,14 @@
     </w:pPr>
   </w:style>
   <w:style w:type="character" w:styleId="Erskiemels">
+    <w:name w:val="Intense Emphasis"/>
     <w:uiPriority w:val="21"/>
-    <w:name w:val="Intense Emphasis"/>
-    <w:basedOn w:val="DefaultParagraphFont"/>
     <w:qFormat/>
     <w:rsid w:val="38171242"/>
     <w:rPr>
-      <w:i w:val="1"/>
-      <w:iCs w:val="1"/>
-      <w:color w:val="0F4761" w:themeColor="accent1" w:themeTint="FF" w:themeShade="BF"/>
+      <w:i/>
+      <w:iCs/>
+      <w:color w:val="0F4761" w:themeColor="accent1" w:themeShade="BF"/>
     </w:rPr>
   </w:style>
   <w:style w:type="paragraph" w:styleId="Kiemeltidzet">
@@ -1832,8 +1997,8 @@
     <w:rsid w:val="0005104C"/>
     <w:pPr>
       <w:pBdr>
-        <w:top w:val="single" w:color="0F4761" w:themeColor="accent1" w:themeShade="BF" w:sz="4" w:space="10"/>
-        <w:bottom w:val="single" w:color="0F4761" w:themeColor="accent1" w:themeShade="BF" w:sz="4" w:space="10"/>
+        <w:top w:val="single" w:sz="4" w:space="10" w:color="0F4761" w:themeColor="accent1" w:themeShade="BF"/>
+        <w:bottom w:val="single" w:sz="4" w:space="10" w:color="0F4761" w:themeColor="accent1" w:themeShade="BF"/>
       </w:pBdr>
       <w:spacing w:before="360" w:after="360"/>
       <w:ind w:left="864" w:right="864"/>
@@ -1845,35 +2010,32 @@
       <w:color w:val="0F4761" w:themeColor="accent1" w:themeShade="BF"/>
     </w:rPr>
   </w:style>
-  <w:style w:type="character" w:styleId="KiemeltidzetChar" w:customStyle="true">
+  <w:style w:type="character" w:customStyle="1" w:styleId="KiemeltidzetChar">
+    <w:name w:val="Kiemelt idézet Char"/>
+    <w:link w:val="Kiemeltidzet"/>
     <w:uiPriority w:val="30"/>
-    <w:name w:val="Kiemelt idézet Char"/>
-    <w:basedOn w:val="DefaultParagraphFont"/>
-    <w:link w:val="Kiemeltidzet"/>
     <w:rsid w:val="38171242"/>
     <w:rPr>
-      <w:i w:val="1"/>
-      <w:iCs w:val="1"/>
-      <w:color w:val="0F4761" w:themeColor="accent1" w:themeTint="FF" w:themeShade="BF"/>
+      <w:i/>
+      <w:iCs/>
+      <w:color w:val="0F4761" w:themeColor="accent1" w:themeShade="BF"/>
     </w:rPr>
   </w:style>
   <w:style w:type="character" w:styleId="Ershivatkozs">
+    <w:name w:val="Intense Reference"/>
     <w:uiPriority w:val="32"/>
-    <w:name w:val="Intense Reference"/>
-    <w:basedOn w:val="DefaultParagraphFont"/>
     <w:qFormat/>
     <w:rsid w:val="38171242"/>
     <w:rPr>
-      <w:b w:val="1"/>
-      <w:bCs w:val="1"/>
-      <w:smallCaps w:val="1"/>
-      <w:color w:val="0F4761" w:themeColor="accent1" w:themeTint="FF" w:themeShade="BF"/>
-    </w:rPr>
-  </w:style>
-  <w:style w:type="character" w:styleId="Hyperlink">
+      <w:b/>
+      <w:bCs/>
+      <w:smallCaps/>
+      <w:color w:val="0F4761" w:themeColor="accent1" w:themeShade="BF"/>
+    </w:rPr>
+  </w:style>
+  <w:style w:type="character" w:styleId="Hiperhivatkozs">
+    <w:name w:val="Hyperlink"/>
     <w:uiPriority w:val="99"/>
-    <w:name w:val="Hyperlink"/>
-    <w:basedOn w:val="DefaultParagraphFont"/>
     <w:unhideWhenUsed/>
     <w:rsid w:val="38171242"/>
     <w:rPr>
@@ -1885,7 +2047,7 @@
 </file>
 
 <file path=word/theme/theme1.xml><?xml version="1.0" encoding="utf-8"?>
-<a:theme xmlns:a="http://schemas.openxmlformats.org/drawingml/2006/main" xmlns:thm15="http://schemas.microsoft.com/office/thememl/2012/main" name="Office-téma">
+<a:theme xmlns:a="http://schemas.openxmlformats.org/drawingml/2006/main" name="Office-téma">
   <a:themeElements>
     <a:clrScheme name="Office">
       <a:dk1>

</xml_diff>

<commit_message>
Updated documentation: added the app's and the tags' name
</commit_message>
<xml_diff>
--- a/documentation.docx
+++ b/documentation.docx
@@ -22,6 +22,84 @@
           <w:szCs w:val="40"/>
         </w:rPr>
         <w:t>DOKUMENTÁCIÓ</w:t>
+      </w:r>
+    </w:p>
+    <w:p>
+      <w:pPr>
+        <w:rPr>
+          <w:rFonts w:ascii="Times New Roman" w:hAnsi="Times New Roman" w:cs="Times New Roman"/>
+          <w:bCs/>
+          <w:sz w:val="40"/>
+          <w:szCs w:val="40"/>
+        </w:rPr>
+      </w:pPr>
+      <w:r>
+        <w:rPr>
+          <w:rFonts w:ascii="Times New Roman" w:hAnsi="Times New Roman" w:cs="Times New Roman"/>
+          <w:bCs/>
+          <w:sz w:val="40"/>
+          <w:szCs w:val="40"/>
+        </w:rPr>
+        <w:t xml:space="preserve">Alkalmazás neve: </w:t>
+      </w:r>
+      <w:proofErr w:type="spellStart"/>
+      <w:r>
+        <w:rPr>
+          <w:rFonts w:ascii="Times New Roman" w:hAnsi="Times New Roman" w:cs="Times New Roman"/>
+          <w:bCs/>
+          <w:sz w:val="40"/>
+          <w:szCs w:val="40"/>
+        </w:rPr>
+        <w:t>BláthyFM</w:t>
+      </w:r>
+      <w:proofErr w:type="spellEnd"/>
+    </w:p>
+    <w:p>
+      <w:pPr>
+        <w:rPr>
+          <w:rFonts w:ascii="Times New Roman" w:hAnsi="Times New Roman" w:cs="Times New Roman"/>
+          <w:bCs/>
+          <w:sz w:val="40"/>
+          <w:szCs w:val="40"/>
+        </w:rPr>
+      </w:pPr>
+      <w:r>
+        <w:rPr>
+          <w:rFonts w:ascii="Times New Roman" w:hAnsi="Times New Roman" w:cs="Times New Roman"/>
+          <w:bCs/>
+          <w:sz w:val="40"/>
+          <w:szCs w:val="40"/>
+        </w:rPr>
+        <w:t>Tagok:</w:t>
+      </w:r>
+      <w:r>
+        <w:rPr>
+          <w:rFonts w:ascii="Times New Roman" w:hAnsi="Times New Roman" w:cs="Times New Roman"/>
+          <w:bCs/>
+          <w:sz w:val="40"/>
+          <w:szCs w:val="40"/>
+        </w:rPr>
+        <w:t xml:space="preserve"> Susán Csongor, El-</w:t>
+      </w:r>
+      <w:proofErr w:type="spellStart"/>
+      <w:r>
+        <w:rPr>
+          <w:rFonts w:ascii="Times New Roman" w:hAnsi="Times New Roman" w:cs="Times New Roman"/>
+          <w:bCs/>
+          <w:sz w:val="40"/>
+          <w:szCs w:val="40"/>
+        </w:rPr>
+        <w:t>Nabulsy</w:t>
+      </w:r>
+      <w:proofErr w:type="spellEnd"/>
+      <w:r>
+        <w:rPr>
+          <w:rFonts w:ascii="Times New Roman" w:hAnsi="Times New Roman" w:cs="Times New Roman"/>
+          <w:bCs/>
+          <w:sz w:val="40"/>
+          <w:szCs w:val="40"/>
+        </w:rPr>
+        <w:t xml:space="preserve"> Csongor Alan</w:t>
       </w:r>
     </w:p>
     <w:p>
@@ -440,7 +518,6 @@
           <w:sz w:val="36"/>
           <w:szCs w:val="36"/>
         </w:rPr>
-        <w:lastRenderedPageBreak/>
         <w:drawing>
           <wp:inline distT="0" distB="0" distL="0" distR="0" wp14:anchorId="1FF1E0EB" wp14:editId="6209113C">
             <wp:extent cx="5760720" cy="3253105"/>
@@ -1001,6 +1078,49 @@
             </a:graphic>
           </wp:inline>
         </w:drawing>
+      </w:r>
+    </w:p>
+    <w:p>
+      <w:pPr>
+        <w:rPr>
+          <w:rFonts w:ascii="Times New Roman" w:eastAsia="Times New Roman" w:hAnsi="Times New Roman" w:cs="Times New Roman"/>
+          <w:sz w:val="36"/>
+          <w:szCs w:val="36"/>
+        </w:rPr>
+      </w:pPr>
+    </w:p>
+    <w:p>
+      <w:pPr>
+        <w:rPr>
+          <w:rFonts w:ascii="Times New Roman" w:eastAsia="Times New Roman" w:hAnsi="Times New Roman" w:cs="Times New Roman"/>
+          <w:sz w:val="36"/>
+          <w:szCs w:val="36"/>
+        </w:rPr>
+      </w:pPr>
+      <w:r>
+        <w:rPr>
+          <w:rFonts w:ascii="Times New Roman" w:eastAsia="Times New Roman" w:hAnsi="Times New Roman" w:cs="Times New Roman"/>
+          <w:b/>
+          <w:sz w:val="40"/>
+          <w:szCs w:val="36"/>
+        </w:rPr>
+        <w:t>2026-02-17 11:10-</w:t>
+      </w:r>
+      <w:r>
+        <w:rPr>
+          <w:rFonts w:ascii="Times New Roman" w:eastAsia="Times New Roman" w:hAnsi="Times New Roman" w:cs="Times New Roman"/>
+          <w:sz w:val="40"/>
+          <w:szCs w:val="36"/>
+        </w:rPr>
+        <w:br/>
+      </w:r>
+      <w:r>
+        <w:rPr>
+          <w:rFonts w:ascii="Times New Roman" w:eastAsia="Times New Roman" w:hAnsi="Times New Roman" w:cs="Times New Roman"/>
+          <w:sz w:val="36"/>
+          <w:szCs w:val="36"/>
+        </w:rPr>
+        <w:t>A dokumentáció elejére alkalmazás neve és tagok felírása,</w:t>
       </w:r>
       <w:bookmarkStart w:id="0" w:name="_GoBack"/>
       <w:bookmarkEnd w:id="0"/>

</xml_diff>

<commit_message>
Merge documentation copy with the original
</commit_message>
<xml_diff>
--- a/documentation.docx
+++ b/documentation.docx
@@ -79,27 +79,7 @@
           <w:sz w:val="40"/>
           <w:szCs w:val="40"/>
         </w:rPr>
-        <w:t xml:space="preserve"> Susán Csongor, El-</w:t>
-      </w:r>
-      <w:proofErr w:type="spellStart"/>
-      <w:r>
-        <w:rPr>
-          <w:rFonts w:ascii="Times New Roman" w:hAnsi="Times New Roman" w:cs="Times New Roman"/>
-          <w:bCs/>
-          <w:sz w:val="40"/>
-          <w:szCs w:val="40"/>
-        </w:rPr>
-        <w:t>Nabulsy</w:t>
-      </w:r>
-      <w:proofErr w:type="spellEnd"/>
-      <w:r>
-        <w:rPr>
-          <w:rFonts w:ascii="Times New Roman" w:hAnsi="Times New Roman" w:cs="Times New Roman"/>
-          <w:bCs/>
-          <w:sz w:val="40"/>
-          <w:szCs w:val="40"/>
-        </w:rPr>
-        <w:t xml:space="preserve"> Csongor Alan</w:t>
+        <w:t xml:space="preserve"> Susán Csongor, El-Nabulsy Csongor Alan</w:t>
       </w:r>
     </w:p>
     <w:p>
@@ -1109,21 +1089,947 @@
       <w:r>
         <w:rPr>
           <w:rFonts w:ascii="Times New Roman" w:eastAsia="Times New Roman" w:hAnsi="Times New Roman" w:cs="Times New Roman"/>
+          <w:b/>
           <w:sz w:val="40"/>
           <w:szCs w:val="36"/>
         </w:rPr>
-        <w:br/>
-      </w:r>
-      <w:r>
-        <w:rPr>
-          <w:rFonts w:ascii="Times New Roman" w:eastAsia="Times New Roman" w:hAnsi="Times New Roman" w:cs="Times New Roman"/>
-          <w:sz w:val="36"/>
-          <w:szCs w:val="36"/>
-        </w:rPr>
-        <w:t>A dokumentáció elejére alkalmazás neve és tagok felírása,</w:t>
+        <w:t>13:40</w:t>
       </w:r>
       <w:bookmarkStart w:id="0" w:name="_GoBack"/>
       <w:bookmarkEnd w:id="0"/>
+      <w:r>
+        <w:rPr>
+          <w:rFonts w:ascii="Times New Roman" w:eastAsia="Times New Roman" w:hAnsi="Times New Roman" w:cs="Times New Roman"/>
+          <w:sz w:val="40"/>
+          <w:szCs w:val="36"/>
+        </w:rPr>
+        <w:br/>
+      </w:r>
+      <w:r>
+        <w:rPr>
+          <w:rFonts w:ascii="Times New Roman" w:eastAsia="Times New Roman" w:hAnsi="Times New Roman" w:cs="Times New Roman"/>
+          <w:sz w:val="36"/>
+          <w:szCs w:val="36"/>
+        </w:rPr>
+        <w:t>A dokumentáció elejére alkalmazás neve és tagok felírása</w:t>
+      </w:r>
+      <w:r>
+        <w:rPr>
+          <w:rFonts w:ascii="Times New Roman" w:eastAsia="Times New Roman" w:hAnsi="Times New Roman" w:cs="Times New Roman"/>
+          <w:sz w:val="36"/>
+          <w:szCs w:val="36"/>
+        </w:rPr>
+        <w:t xml:space="preserve">, frontend oldal </w:t>
+      </w:r>
+      <w:r>
+        <w:rPr>
+          <w:rFonts w:ascii="Times New Roman" w:eastAsia="Times New Roman" w:hAnsi="Times New Roman" w:cs="Times New Roman"/>
+          <w:sz w:val="36"/>
+          <w:szCs w:val="36"/>
+        </w:rPr>
+        <w:t>bejelentkezés</w:t>
+      </w:r>
+      <w:r>
+        <w:rPr>
+          <w:rFonts w:ascii="Times New Roman" w:eastAsia="Times New Roman" w:hAnsi="Times New Roman" w:cs="Times New Roman"/>
+          <w:sz w:val="36"/>
+          <w:szCs w:val="36"/>
+        </w:rPr>
+        <w:t xml:space="preserve"> é</w:t>
+      </w:r>
+      <w:r>
+        <w:rPr>
+          <w:rFonts w:ascii="Times New Roman" w:eastAsia="Times New Roman" w:hAnsi="Times New Roman" w:cs="Times New Roman"/>
+          <w:sz w:val="36"/>
+          <w:szCs w:val="36"/>
+        </w:rPr>
+        <w:t>s</w:t>
+      </w:r>
+      <w:r>
+        <w:rPr>
+          <w:rFonts w:ascii="Times New Roman" w:eastAsia="Times New Roman" w:hAnsi="Times New Roman" w:cs="Times New Roman"/>
+          <w:sz w:val="36"/>
+          <w:szCs w:val="36"/>
+        </w:rPr>
+        <w:t xml:space="preserve"> a </w:t>
+      </w:r>
+      <w:proofErr w:type="spellStart"/>
+      <w:r>
+        <w:rPr>
+          <w:rFonts w:ascii="Times New Roman" w:eastAsia="Times New Roman" w:hAnsi="Times New Roman" w:cs="Times New Roman"/>
+          <w:sz w:val="36"/>
+          <w:szCs w:val="36"/>
+        </w:rPr>
+        <w:t>főképernyő</w:t>
+      </w:r>
+      <w:proofErr w:type="spellEnd"/>
+      <w:r>
+        <w:rPr>
+          <w:rFonts w:ascii="Times New Roman" w:eastAsia="Times New Roman" w:hAnsi="Times New Roman" w:cs="Times New Roman"/>
+          <w:sz w:val="36"/>
+          <w:szCs w:val="36"/>
+        </w:rPr>
+        <w:t xml:space="preserve"> </w:t>
+      </w:r>
+      <w:r>
+        <w:rPr>
+          <w:rFonts w:ascii="Times New Roman" w:eastAsia="Times New Roman" w:hAnsi="Times New Roman" w:cs="Times New Roman"/>
+          <w:sz w:val="36"/>
+          <w:szCs w:val="36"/>
+        </w:rPr>
+        <w:t xml:space="preserve">oldalának </w:t>
+      </w:r>
+      <w:r>
+        <w:rPr>
+          <w:rFonts w:ascii="Times New Roman" w:eastAsia="Times New Roman" w:hAnsi="Times New Roman" w:cs="Times New Roman"/>
+          <w:sz w:val="36"/>
+          <w:szCs w:val="36"/>
+        </w:rPr>
+        <w:t>digitális</w:t>
+      </w:r>
+      <w:r>
+        <w:rPr>
+          <w:rFonts w:ascii="Times New Roman" w:eastAsia="Times New Roman" w:hAnsi="Times New Roman" w:cs="Times New Roman"/>
+          <w:sz w:val="36"/>
+          <w:szCs w:val="36"/>
+        </w:rPr>
+        <w:t xml:space="preserve"> elkészítése felhasználói rang alapján.</w:t>
+      </w:r>
+      <w:r>
+        <w:rPr>
+          <w:rFonts w:ascii="Times New Roman" w:eastAsia="Times New Roman" w:hAnsi="Times New Roman" w:cs="Times New Roman"/>
+          <w:sz w:val="36"/>
+          <w:szCs w:val="36"/>
+        </w:rPr>
+        <w:t xml:space="preserve"> Továbbá a struktúra</w:t>
+      </w:r>
+      <w:r>
+        <w:rPr>
+          <w:rFonts w:ascii="Times New Roman" w:eastAsia="Times New Roman" w:hAnsi="Times New Roman" w:cs="Times New Roman"/>
+          <w:sz w:val="36"/>
+          <w:szCs w:val="36"/>
+        </w:rPr>
+        <w:t xml:space="preserve">, a </w:t>
+      </w:r>
+      <w:r>
+        <w:rPr>
+          <w:rFonts w:ascii="Times New Roman" w:eastAsia="Times New Roman" w:hAnsi="Times New Roman" w:cs="Times New Roman"/>
+          <w:sz w:val="36"/>
+          <w:szCs w:val="36"/>
+        </w:rPr>
+        <w:t>login</w:t>
+      </w:r>
+      <w:r>
+        <w:rPr>
+          <w:rFonts w:ascii="Times New Roman" w:eastAsia="Times New Roman" w:hAnsi="Times New Roman" w:cs="Times New Roman"/>
+          <w:sz w:val="36"/>
+          <w:szCs w:val="36"/>
+        </w:rPr>
+        <w:t xml:space="preserve"> </w:t>
+      </w:r>
+      <w:r>
+        <w:rPr>
+          <w:rFonts w:ascii="Times New Roman" w:eastAsia="Times New Roman" w:hAnsi="Times New Roman" w:cs="Times New Roman"/>
+          <w:sz w:val="36"/>
+          <w:szCs w:val="36"/>
+        </w:rPr>
+        <w:t>a rendezői</w:t>
+      </w:r>
+      <w:r>
+        <w:rPr>
+          <w:rFonts w:ascii="Times New Roman" w:eastAsia="Times New Roman" w:hAnsi="Times New Roman" w:cs="Times New Roman"/>
+          <w:sz w:val="36"/>
+          <w:szCs w:val="36"/>
+        </w:rPr>
+        <w:t xml:space="preserve"> és a bekérési</w:t>
+      </w:r>
+      <w:r>
+        <w:rPr>
+          <w:rFonts w:ascii="Times New Roman" w:eastAsia="Times New Roman" w:hAnsi="Times New Roman" w:cs="Times New Roman"/>
+          <w:sz w:val="36"/>
+          <w:szCs w:val="36"/>
+        </w:rPr>
+        <w:t xml:space="preserve"> UI </w:t>
+      </w:r>
+      <w:r>
+        <w:rPr>
+          <w:rFonts w:ascii="Times New Roman" w:eastAsia="Times New Roman" w:hAnsi="Times New Roman" w:cs="Times New Roman"/>
+          <w:sz w:val="36"/>
+          <w:szCs w:val="36"/>
+        </w:rPr>
+        <w:t>elkészítése</w:t>
+      </w:r>
+      <w:r>
+        <w:rPr>
+          <w:rFonts w:ascii="Times New Roman" w:eastAsia="Times New Roman" w:hAnsi="Times New Roman" w:cs="Times New Roman"/>
+          <w:sz w:val="36"/>
+          <w:szCs w:val="36"/>
+        </w:rPr>
+        <w:t xml:space="preserve">. </w:t>
+      </w:r>
+    </w:p>
+    <w:p>
+      <w:pPr>
+        <w:spacing w:before="2760" w:after="0"/>
+        <w:rPr>
+          <w:rFonts w:ascii="Times New Roman" w:eastAsia="Times New Roman" w:hAnsi="Times New Roman" w:cs="Times New Roman"/>
+          <w:sz w:val="36"/>
+          <w:szCs w:val="36"/>
+        </w:rPr>
+      </w:pPr>
+      <w:proofErr w:type="spellStart"/>
+      <w:r>
+        <w:rPr>
+          <w:rFonts w:ascii="Times New Roman" w:eastAsia="Times New Roman" w:hAnsi="Times New Roman" w:cs="Times New Roman"/>
+          <w:sz w:val="36"/>
+          <w:szCs w:val="36"/>
+        </w:rPr>
+        <w:lastRenderedPageBreak/>
+        <w:t>Főképernyő</w:t>
+      </w:r>
+      <w:proofErr w:type="spellEnd"/>
+      <w:r>
+        <w:rPr>
+          <w:rFonts w:ascii="Times New Roman" w:eastAsia="Times New Roman" w:hAnsi="Times New Roman" w:cs="Times New Roman"/>
+          <w:sz w:val="36"/>
+          <w:szCs w:val="36"/>
+        </w:rPr>
+        <w:t xml:space="preserve">: </w:t>
+      </w:r>
+    </w:p>
+    <w:p>
+      <w:pPr>
+        <w:spacing w:after="360"/>
+        <w:rPr>
+          <w:rFonts w:ascii="Times New Roman" w:eastAsia="Times New Roman" w:hAnsi="Times New Roman" w:cs="Times New Roman"/>
+          <w:sz w:val="36"/>
+          <w:szCs w:val="36"/>
+        </w:rPr>
+      </w:pPr>
+      <w:r>
+        <w:rPr>
+          <w:noProof/>
+          <w:sz w:val="36"/>
+          <w:szCs w:val="36"/>
+        </w:rPr>
+        <w:drawing>
+          <wp:inline distT="0" distB="0" distL="0" distR="0" wp14:anchorId="78A43544" wp14:editId="33D830EA">
+            <wp:extent cx="3166535" cy="1781175"/>
+            <wp:effectExtent l="0" t="0" r="0" b="0"/>
+            <wp:docPr id="3" name="Kép 3" descr="C:\Users\elnabulsy.csongor\AppData\Local\Microsoft\Windows\INetCache\Content.MSO\F75754B3.tmp"/>
+            <wp:cNvGraphicFramePr>
+              <a:graphicFrameLocks xmlns:a="http://schemas.openxmlformats.org/drawingml/2006/main" noChangeAspect="1"/>
+            </wp:cNvGraphicFramePr>
+            <a:graphic xmlns:a="http://schemas.openxmlformats.org/drawingml/2006/main">
+              <a:graphicData uri="http://schemas.openxmlformats.org/drawingml/2006/picture">
+                <pic:pic xmlns:pic="http://schemas.openxmlformats.org/drawingml/2006/picture">
+                  <pic:nvPicPr>
+                    <pic:cNvPr id="0" name="Picture 2" descr="C:\Users\elnabulsy.csongor\AppData\Local\Microsoft\Windows\INetCache\Content.MSO\F75754B3.tmp"/>
+                    <pic:cNvPicPr>
+                      <a:picLocks noChangeAspect="1" noChangeArrowheads="1"/>
+                    </pic:cNvPicPr>
+                  </pic:nvPicPr>
+                  <pic:blipFill>
+                    <a:blip r:embed="rId16" cstate="print">
+                      <a:extLst>
+                        <a:ext uri="{28A0092B-C50C-407E-A947-70E740481C1C}">
+                          <a14:useLocalDpi xmlns:a14="http://schemas.microsoft.com/office/drawing/2010/main" val="0"/>
+                        </a:ext>
+                      </a:extLst>
+                    </a:blip>
+                    <a:srcRect/>
+                    <a:stretch>
+                      <a:fillRect/>
+                    </a:stretch>
+                  </pic:blipFill>
+                  <pic:spPr bwMode="auto">
+                    <a:xfrm>
+                      <a:off x="0" y="0"/>
+                      <a:ext cx="3394213" cy="1909244"/>
+                    </a:xfrm>
+                    <a:prstGeom prst="rect">
+                      <a:avLst/>
+                    </a:prstGeom>
+                    <a:noFill/>
+                    <a:ln>
+                      <a:noFill/>
+                    </a:ln>
+                  </pic:spPr>
+                </pic:pic>
+              </a:graphicData>
+            </a:graphic>
+          </wp:inline>
+        </w:drawing>
+      </w:r>
+    </w:p>
+    <w:p>
+      <w:pPr>
+        <w:rPr>
+          <w:rFonts w:ascii="Times New Roman" w:eastAsia="Times New Roman" w:hAnsi="Times New Roman" w:cs="Times New Roman"/>
+          <w:kern w:val="0"/>
+          <w:lang w:eastAsia="hu-HU"/>
+          <w14:ligatures w14:val="none"/>
+        </w:rPr>
+      </w:pPr>
+      <w:proofErr w:type="spellStart"/>
+      <w:r>
+        <w:rPr>
+          <w:rFonts w:ascii="Times New Roman" w:eastAsia="Times New Roman" w:hAnsi="Times New Roman" w:cs="Times New Roman"/>
+          <w:sz w:val="36"/>
+          <w:szCs w:val="36"/>
+        </w:rPr>
+        <w:t>Főképernyő</w:t>
+      </w:r>
+      <w:proofErr w:type="spellEnd"/>
+      <w:r>
+        <w:rPr>
+          <w:rFonts w:ascii="Times New Roman" w:eastAsia="Times New Roman" w:hAnsi="Times New Roman" w:cs="Times New Roman"/>
+          <w:sz w:val="36"/>
+          <w:szCs w:val="36"/>
+        </w:rPr>
+        <w:t xml:space="preserve"> diák ranggal:</w:t>
+      </w:r>
+      <w:r>
+        <w:rPr>
+          <w:rFonts w:ascii="Times New Roman" w:eastAsia="Times New Roman" w:hAnsi="Times New Roman" w:cs="Times New Roman"/>
+          <w:kern w:val="0"/>
+          <w:lang w:eastAsia="hu-HU"/>
+          <w14:ligatures w14:val="none"/>
+        </w:rPr>
+        <w:t xml:space="preserve"> </w:t>
+      </w:r>
+    </w:p>
+    <w:p>
+      <w:pPr>
+        <w:rPr>
+          <w:rFonts w:eastAsia="Times New Roman"/>
+          <w:sz w:val="36"/>
+          <w:szCs w:val="36"/>
+        </w:rPr>
+      </w:pPr>
+      <w:r>
+        <w:rPr>
+          <w:rFonts w:eastAsia="Times New Roman"/>
+          <w:sz w:val="36"/>
+          <w:szCs w:val="36"/>
+        </w:rPr>
+        <w:drawing>
+          <wp:inline distT="0" distB="0" distL="0" distR="0" wp14:anchorId="4E211814" wp14:editId="6BCC3A01">
+            <wp:extent cx="3133725" cy="1762720"/>
+            <wp:effectExtent l="0" t="0" r="0" b="9525"/>
+            <wp:docPr id="4" name="Kép 4" descr="C:\Users\elnabulsy.csongor\Downloads\ui_main_student.png"/>
+            <wp:cNvGraphicFramePr>
+              <a:graphicFrameLocks xmlns:a="http://schemas.openxmlformats.org/drawingml/2006/main" noChangeAspect="1"/>
+            </wp:cNvGraphicFramePr>
+            <a:graphic xmlns:a="http://schemas.openxmlformats.org/drawingml/2006/main">
+              <a:graphicData uri="http://schemas.openxmlformats.org/drawingml/2006/picture">
+                <pic:pic xmlns:pic="http://schemas.openxmlformats.org/drawingml/2006/picture">
+                  <pic:nvPicPr>
+                    <pic:cNvPr id="0" name="Picture 4" descr="C:\Users\elnabulsy.csongor\Downloads\ui_main_student.png"/>
+                    <pic:cNvPicPr>
+                      <a:picLocks noChangeAspect="1" noChangeArrowheads="1"/>
+                    </pic:cNvPicPr>
+                  </pic:nvPicPr>
+                  <pic:blipFill>
+                    <a:blip r:embed="rId17" cstate="print">
+                      <a:extLst>
+                        <a:ext uri="{28A0092B-C50C-407E-A947-70E740481C1C}">
+                          <a14:useLocalDpi xmlns:a14="http://schemas.microsoft.com/office/drawing/2010/main" val="0"/>
+                        </a:ext>
+                      </a:extLst>
+                    </a:blip>
+                    <a:srcRect/>
+                    <a:stretch>
+                      <a:fillRect/>
+                    </a:stretch>
+                  </pic:blipFill>
+                  <pic:spPr bwMode="auto">
+                    <a:xfrm>
+                      <a:off x="0" y="0"/>
+                      <a:ext cx="3201398" cy="1800786"/>
+                    </a:xfrm>
+                    <a:prstGeom prst="rect">
+                      <a:avLst/>
+                    </a:prstGeom>
+                    <a:noFill/>
+                    <a:ln>
+                      <a:noFill/>
+                    </a:ln>
+                  </pic:spPr>
+                </pic:pic>
+              </a:graphicData>
+            </a:graphic>
+          </wp:inline>
+        </w:drawing>
+      </w:r>
+    </w:p>
+    <w:p>
+      <w:pPr>
+        <w:rPr>
+          <w:rFonts w:eastAsia="Times New Roman"/>
+          <w:sz w:val="36"/>
+          <w:szCs w:val="36"/>
+        </w:rPr>
+      </w:pPr>
+      <w:proofErr w:type="spellStart"/>
+      <w:r>
+        <w:rPr>
+          <w:rFonts w:eastAsia="Times New Roman"/>
+          <w:sz w:val="36"/>
+          <w:szCs w:val="36"/>
+        </w:rPr>
+        <w:t>Főképernyő</w:t>
+      </w:r>
+      <w:proofErr w:type="spellEnd"/>
+      <w:r>
+        <w:rPr>
+          <w:rFonts w:eastAsia="Times New Roman"/>
+          <w:sz w:val="36"/>
+          <w:szCs w:val="36"/>
+        </w:rPr>
+        <w:t xml:space="preserve"> rendezői ranggal:</w:t>
+      </w:r>
+      <w:r>
+        <w:rPr>
+          <w:rFonts w:ascii="Times New Roman" w:eastAsia="Times New Roman" w:hAnsi="Times New Roman" w:cs="Times New Roman"/>
+          <w:kern w:val="0"/>
+          <w:lang w:eastAsia="hu-HU"/>
+          <w14:ligatures w14:val="none"/>
+        </w:rPr>
+        <w:t xml:space="preserve"> </w:t>
+      </w:r>
+      <w:r>
+        <w:rPr>
+          <w:rFonts w:eastAsia="Times New Roman"/>
+          <w:sz w:val="36"/>
+          <w:szCs w:val="36"/>
+        </w:rPr>
+        <w:drawing>
+          <wp:inline distT="0" distB="0" distL="0" distR="0" wp14:anchorId="5137FB78" wp14:editId="37C1D4C6">
+            <wp:extent cx="3166110" cy="1780938"/>
+            <wp:effectExtent l="0" t="0" r="0" b="0"/>
+            <wp:docPr id="5" name="Kép 5" descr="C:\Users\elnabulsy.csongor\Downloads\ui_main_scheduler.png"/>
+            <wp:cNvGraphicFramePr>
+              <a:graphicFrameLocks xmlns:a="http://schemas.openxmlformats.org/drawingml/2006/main" noChangeAspect="1"/>
+            </wp:cNvGraphicFramePr>
+            <a:graphic xmlns:a="http://schemas.openxmlformats.org/drawingml/2006/main">
+              <a:graphicData uri="http://schemas.openxmlformats.org/drawingml/2006/picture">
+                <pic:pic xmlns:pic="http://schemas.openxmlformats.org/drawingml/2006/picture">
+                  <pic:nvPicPr>
+                    <pic:cNvPr id="0" name="Picture 6" descr="C:\Users\elnabulsy.csongor\Downloads\ui_main_scheduler.png"/>
+                    <pic:cNvPicPr>
+                      <a:picLocks noChangeAspect="1" noChangeArrowheads="1"/>
+                    </pic:cNvPicPr>
+                  </pic:nvPicPr>
+                  <pic:blipFill>
+                    <a:blip r:embed="rId18" cstate="print">
+                      <a:extLst>
+                        <a:ext uri="{28A0092B-C50C-407E-A947-70E740481C1C}">
+                          <a14:useLocalDpi xmlns:a14="http://schemas.microsoft.com/office/drawing/2010/main" val="0"/>
+                        </a:ext>
+                      </a:extLst>
+                    </a:blip>
+                    <a:srcRect/>
+                    <a:stretch>
+                      <a:fillRect/>
+                    </a:stretch>
+                  </pic:blipFill>
+                  <pic:spPr bwMode="auto">
+                    <a:xfrm>
+                      <a:off x="0" y="0"/>
+                      <a:ext cx="3214688" cy="1808263"/>
+                    </a:xfrm>
+                    <a:prstGeom prst="rect">
+                      <a:avLst/>
+                    </a:prstGeom>
+                    <a:noFill/>
+                    <a:ln>
+                      <a:noFill/>
+                    </a:ln>
+                  </pic:spPr>
+                </pic:pic>
+              </a:graphicData>
+            </a:graphic>
+          </wp:inline>
+        </w:drawing>
+      </w:r>
+    </w:p>
+    <w:p>
+      <w:pPr>
+        <w:rPr>
+          <w:rFonts w:ascii="Times New Roman" w:eastAsia="Times New Roman" w:hAnsi="Times New Roman" w:cs="Times New Roman"/>
+          <w:kern w:val="0"/>
+          <w:lang w:eastAsia="hu-HU"/>
+          <w14:ligatures w14:val="none"/>
+        </w:rPr>
+      </w:pPr>
+      <w:proofErr w:type="spellStart"/>
+      <w:r>
+        <w:rPr>
+          <w:rFonts w:eastAsia="Times New Roman"/>
+          <w:sz w:val="36"/>
+          <w:szCs w:val="36"/>
+        </w:rPr>
+        <w:lastRenderedPageBreak/>
+        <w:t>Főképernyő</w:t>
+      </w:r>
+      <w:proofErr w:type="spellEnd"/>
+      <w:r>
+        <w:rPr>
+          <w:rFonts w:eastAsia="Times New Roman"/>
+          <w:sz w:val="36"/>
+          <w:szCs w:val="36"/>
+        </w:rPr>
+        <w:t xml:space="preserve"> </w:t>
+      </w:r>
+      <w:proofErr w:type="spellStart"/>
+      <w:r>
+        <w:rPr>
+          <w:rFonts w:eastAsia="Times New Roman"/>
+          <w:sz w:val="36"/>
+          <w:szCs w:val="36"/>
+        </w:rPr>
+        <w:t>admin</w:t>
+      </w:r>
+      <w:proofErr w:type="spellEnd"/>
+      <w:r>
+        <w:rPr>
+          <w:rFonts w:eastAsia="Times New Roman"/>
+          <w:sz w:val="36"/>
+          <w:szCs w:val="36"/>
+        </w:rPr>
+        <w:t xml:space="preserve"> ranggal:</w:t>
+      </w:r>
+      <w:r>
+        <w:rPr>
+          <w:rFonts w:ascii="Times New Roman" w:eastAsia="Times New Roman" w:hAnsi="Times New Roman" w:cs="Times New Roman"/>
+          <w:kern w:val="0"/>
+          <w:lang w:eastAsia="hu-HU"/>
+          <w14:ligatures w14:val="none"/>
+        </w:rPr>
+        <w:t xml:space="preserve"> </w:t>
+      </w:r>
+      <w:r>
+        <w:rPr>
+          <w:rFonts w:eastAsia="Times New Roman"/>
+          <w:sz w:val="36"/>
+          <w:szCs w:val="36"/>
+        </w:rPr>
+        <w:drawing>
+          <wp:inline distT="0" distB="0" distL="0" distR="0" wp14:anchorId="27EC1C67" wp14:editId="3BF2A804">
+            <wp:extent cx="3251200" cy="1828800"/>
+            <wp:effectExtent l="0" t="0" r="6350" b="0"/>
+            <wp:docPr id="6" name="Kép 6" descr="C:\Users\elnabulsy.csongor\Downloads\ui_main_admin.png"/>
+            <wp:cNvGraphicFramePr>
+              <a:graphicFrameLocks xmlns:a="http://schemas.openxmlformats.org/drawingml/2006/main" noChangeAspect="1"/>
+            </wp:cNvGraphicFramePr>
+            <a:graphic xmlns:a="http://schemas.openxmlformats.org/drawingml/2006/main">
+              <a:graphicData uri="http://schemas.openxmlformats.org/drawingml/2006/picture">
+                <pic:pic xmlns:pic="http://schemas.openxmlformats.org/drawingml/2006/picture">
+                  <pic:nvPicPr>
+                    <pic:cNvPr id="0" name="Picture 8" descr="C:\Users\elnabulsy.csongor\Downloads\ui_main_admin.png"/>
+                    <pic:cNvPicPr>
+                      <a:picLocks noChangeAspect="1" noChangeArrowheads="1"/>
+                    </pic:cNvPicPr>
+                  </pic:nvPicPr>
+                  <pic:blipFill>
+                    <a:blip r:embed="rId19" cstate="print">
+                      <a:extLst>
+                        <a:ext uri="{28A0092B-C50C-407E-A947-70E740481C1C}">
+                          <a14:useLocalDpi xmlns:a14="http://schemas.microsoft.com/office/drawing/2010/main" val="0"/>
+                        </a:ext>
+                      </a:extLst>
+                    </a:blip>
+                    <a:srcRect/>
+                    <a:stretch>
+                      <a:fillRect/>
+                    </a:stretch>
+                  </pic:blipFill>
+                  <pic:spPr bwMode="auto">
+                    <a:xfrm>
+                      <a:off x="0" y="0"/>
+                      <a:ext cx="3289769" cy="1850495"/>
+                    </a:xfrm>
+                    <a:prstGeom prst="rect">
+                      <a:avLst/>
+                    </a:prstGeom>
+                    <a:noFill/>
+                    <a:ln>
+                      <a:noFill/>
+                    </a:ln>
+                  </pic:spPr>
+                </pic:pic>
+              </a:graphicData>
+            </a:graphic>
+          </wp:inline>
+        </w:drawing>
+      </w:r>
+    </w:p>
+    <w:p>
+      <w:pPr>
+        <w:rPr>
+          <w:rFonts w:eastAsia="Times New Roman"/>
+          <w:sz w:val="36"/>
+          <w:szCs w:val="36"/>
+        </w:rPr>
+      </w:pPr>
+      <w:r>
+        <w:rPr>
+          <w:rFonts w:eastAsia="Times New Roman"/>
+          <w:sz w:val="36"/>
+          <w:szCs w:val="36"/>
+        </w:rPr>
+        <w:t>Struktúra:</w:t>
+      </w:r>
+    </w:p>
+    <w:p>
+      <w:pPr>
+        <w:rPr>
+          <w:rFonts w:eastAsia="Times New Roman"/>
+          <w:sz w:val="36"/>
+          <w:szCs w:val="36"/>
+        </w:rPr>
+      </w:pPr>
+      <w:r>
+        <w:rPr>
+          <w:rFonts w:eastAsia="Times New Roman"/>
+          <w:sz w:val="36"/>
+          <w:szCs w:val="36"/>
+        </w:rPr>
+        <w:drawing>
+          <wp:inline distT="0" distB="0" distL="0" distR="0" wp14:anchorId="08225B4F" wp14:editId="7412D19B">
+            <wp:extent cx="3251200" cy="2152650"/>
+            <wp:effectExtent l="0" t="0" r="6350" b="0"/>
+            <wp:docPr id="7" name="Kép 7" descr="C:\Users\elnabulsy.csongor\Downloads\ui_structure.png"/>
+            <wp:cNvGraphicFramePr>
+              <a:graphicFrameLocks xmlns:a="http://schemas.openxmlformats.org/drawingml/2006/main" noChangeAspect="1"/>
+            </wp:cNvGraphicFramePr>
+            <a:graphic xmlns:a="http://schemas.openxmlformats.org/drawingml/2006/main">
+              <a:graphicData uri="http://schemas.openxmlformats.org/drawingml/2006/picture">
+                <pic:pic xmlns:pic="http://schemas.openxmlformats.org/drawingml/2006/picture">
+                  <pic:nvPicPr>
+                    <pic:cNvPr id="0" name="Picture 10" descr="C:\Users\elnabulsy.csongor\Downloads\ui_structure.png"/>
+                    <pic:cNvPicPr>
+                      <a:picLocks noChangeAspect="1" noChangeArrowheads="1"/>
+                    </pic:cNvPicPr>
+                  </pic:nvPicPr>
+                  <pic:blipFill>
+                    <a:blip r:embed="rId20" cstate="print">
+                      <a:extLst>
+                        <a:ext uri="{28A0092B-C50C-407E-A947-70E740481C1C}">
+                          <a14:useLocalDpi xmlns:a14="http://schemas.microsoft.com/office/drawing/2010/main" val="0"/>
+                        </a:ext>
+                      </a:extLst>
+                    </a:blip>
+                    <a:srcRect/>
+                    <a:stretch>
+                      <a:fillRect/>
+                    </a:stretch>
+                  </pic:blipFill>
+                  <pic:spPr bwMode="auto">
+                    <a:xfrm>
+                      <a:off x="0" y="0"/>
+                      <a:ext cx="3341768" cy="2212616"/>
+                    </a:xfrm>
+                    <a:prstGeom prst="rect">
+                      <a:avLst/>
+                    </a:prstGeom>
+                    <a:noFill/>
+                    <a:ln>
+                      <a:noFill/>
+                    </a:ln>
+                  </pic:spPr>
+                </pic:pic>
+              </a:graphicData>
+            </a:graphic>
+          </wp:inline>
+        </w:drawing>
+      </w:r>
+    </w:p>
+    <w:p>
+      <w:pPr>
+        <w:rPr>
+          <w:rFonts w:eastAsia="Times New Roman"/>
+          <w:sz w:val="36"/>
+          <w:szCs w:val="36"/>
+        </w:rPr>
+      </w:pPr>
+      <w:r>
+        <w:rPr>
+          <w:rFonts w:eastAsia="Times New Roman"/>
+          <w:sz w:val="36"/>
+          <w:szCs w:val="36"/>
+        </w:rPr>
+        <w:t>Bejelentkezési képernyő</w:t>
+      </w:r>
+      <w:r>
+        <w:rPr>
+          <w:rFonts w:eastAsia="Times New Roman"/>
+          <w:sz w:val="36"/>
+          <w:szCs w:val="36"/>
+        </w:rPr>
+        <w:t>:</w:t>
+      </w:r>
+    </w:p>
+    <w:p>
+      <w:pPr>
+        <w:rPr>
+          <w:rFonts w:eastAsia="Times New Roman"/>
+          <w:sz w:val="36"/>
+          <w:szCs w:val="36"/>
+        </w:rPr>
+      </w:pPr>
+      <w:r>
+        <w:rPr>
+          <w:rFonts w:eastAsia="Times New Roman"/>
+          <w:sz w:val="36"/>
+          <w:szCs w:val="36"/>
+        </w:rPr>
+        <w:drawing>
+          <wp:inline distT="0" distB="0" distL="0" distR="0" wp14:anchorId="4F93ECF7" wp14:editId="31173C35">
+            <wp:extent cx="3284855" cy="1781175"/>
+            <wp:effectExtent l="0" t="0" r="0" b="9525"/>
+            <wp:docPr id="8" name="Kép 8" descr="C:\Users\elnabulsy.csongor\Downloads\ui_login.png"/>
+            <wp:cNvGraphicFramePr>
+              <a:graphicFrameLocks xmlns:a="http://schemas.openxmlformats.org/drawingml/2006/main" noChangeAspect="1"/>
+            </wp:cNvGraphicFramePr>
+            <a:graphic xmlns:a="http://schemas.openxmlformats.org/drawingml/2006/main">
+              <a:graphicData uri="http://schemas.openxmlformats.org/drawingml/2006/picture">
+                <pic:pic xmlns:pic="http://schemas.openxmlformats.org/drawingml/2006/picture">
+                  <pic:nvPicPr>
+                    <pic:cNvPr id="0" name="Picture 12" descr="C:\Users\elnabulsy.csongor\Downloads\ui_login.png"/>
+                    <pic:cNvPicPr>
+                      <a:picLocks noChangeAspect="1" noChangeArrowheads="1"/>
+                    </pic:cNvPicPr>
+                  </pic:nvPicPr>
+                  <pic:blipFill>
+                    <a:blip r:embed="rId21" cstate="print">
+                      <a:extLst>
+                        <a:ext uri="{28A0092B-C50C-407E-A947-70E740481C1C}">
+                          <a14:useLocalDpi xmlns:a14="http://schemas.microsoft.com/office/drawing/2010/main" val="0"/>
+                        </a:ext>
+                      </a:extLst>
+                    </a:blip>
+                    <a:srcRect/>
+                    <a:stretch>
+                      <a:fillRect/>
+                    </a:stretch>
+                  </pic:blipFill>
+                  <pic:spPr bwMode="auto">
+                    <a:xfrm>
+                      <a:off x="0" y="0"/>
+                      <a:ext cx="3309412" cy="1794491"/>
+                    </a:xfrm>
+                    <a:prstGeom prst="rect">
+                      <a:avLst/>
+                    </a:prstGeom>
+                    <a:noFill/>
+                    <a:ln>
+                      <a:noFill/>
+                    </a:ln>
+                  </pic:spPr>
+                </pic:pic>
+              </a:graphicData>
+            </a:graphic>
+          </wp:inline>
+        </w:drawing>
+      </w:r>
+    </w:p>
+    <w:p>
+      <w:pPr>
+        <w:spacing w:before="2160" w:after="0"/>
+        <w:rPr>
+          <w:rFonts w:eastAsia="Times New Roman"/>
+          <w:sz w:val="36"/>
+          <w:szCs w:val="36"/>
+        </w:rPr>
+      </w:pPr>
+      <w:r>
+        <w:rPr>
+          <w:rFonts w:eastAsia="Times New Roman"/>
+          <w:sz w:val="36"/>
+          <w:szCs w:val="36"/>
+        </w:rPr>
+        <w:lastRenderedPageBreak/>
+        <w:t>Rendezői felület:</w:t>
+      </w:r>
+    </w:p>
+    <w:p>
+      <w:pPr>
+        <w:rPr>
+          <w:rFonts w:eastAsia="Times New Roman"/>
+          <w:sz w:val="36"/>
+          <w:szCs w:val="36"/>
+        </w:rPr>
+      </w:pPr>
+      <w:r>
+        <w:rPr>
+          <w:rFonts w:eastAsia="Times New Roman"/>
+          <w:noProof/>
+          <w:sz w:val="36"/>
+          <w:szCs w:val="36"/>
+        </w:rPr>
+        <w:drawing>
+          <wp:inline distT="0" distB="0" distL="0" distR="0" wp14:anchorId="2C256DB5" wp14:editId="55C7E1D6">
+            <wp:extent cx="5399599" cy="2457450"/>
+            <wp:effectExtent l="0" t="0" r="0" b="0"/>
+            <wp:docPr id="9" name="Kép 9"/>
+            <wp:cNvGraphicFramePr>
+              <a:graphicFrameLocks xmlns:a="http://schemas.openxmlformats.org/drawingml/2006/main" noChangeAspect="1"/>
+            </wp:cNvGraphicFramePr>
+            <a:graphic xmlns:a="http://schemas.openxmlformats.org/drawingml/2006/main">
+              <a:graphicData uri="http://schemas.openxmlformats.org/drawingml/2006/picture">
+                <pic:pic xmlns:pic="http://schemas.openxmlformats.org/drawingml/2006/picture">
+                  <pic:nvPicPr>
+                    <pic:cNvPr id="0" name="Picture 3"/>
+                    <pic:cNvPicPr>
+                      <a:picLocks noChangeAspect="1" noChangeArrowheads="1"/>
+                    </pic:cNvPicPr>
+                  </pic:nvPicPr>
+                  <pic:blipFill>
+                    <a:blip r:embed="rId22">
+                      <a:extLst>
+                        <a:ext uri="{28A0092B-C50C-407E-A947-70E740481C1C}">
+                          <a14:useLocalDpi xmlns:a14="http://schemas.microsoft.com/office/drawing/2010/main" val="0"/>
+                        </a:ext>
+                      </a:extLst>
+                    </a:blip>
+                    <a:srcRect/>
+                    <a:stretch>
+                      <a:fillRect/>
+                    </a:stretch>
+                  </pic:blipFill>
+                  <pic:spPr bwMode="auto">
+                    <a:xfrm>
+                      <a:off x="0" y="0"/>
+                      <a:ext cx="5664898" cy="2578192"/>
+                    </a:xfrm>
+                    <a:prstGeom prst="rect">
+                      <a:avLst/>
+                    </a:prstGeom>
+                    <a:noFill/>
+                  </pic:spPr>
+                </pic:pic>
+              </a:graphicData>
+            </a:graphic>
+          </wp:inline>
+        </w:drawing>
+      </w:r>
+    </w:p>
+    <w:p>
+      <w:pPr>
+        <w:rPr>
+          <w:rFonts w:eastAsia="Times New Roman"/>
+          <w:sz w:val="36"/>
+          <w:szCs w:val="36"/>
+        </w:rPr>
+      </w:pPr>
+      <w:r>
+        <w:rPr>
+          <w:rFonts w:eastAsia="Times New Roman"/>
+          <w:sz w:val="36"/>
+          <w:szCs w:val="36"/>
+        </w:rPr>
+        <w:t>Bekérési oldal:</w:t>
+      </w:r>
+    </w:p>
+    <w:p>
+      <w:pPr>
+        <w:rPr>
+          <w:rFonts w:eastAsia="Times New Roman"/>
+          <w:sz w:val="36"/>
+          <w:szCs w:val="36"/>
+        </w:rPr>
+      </w:pPr>
+      <w:r>
+        <w:rPr>
+          <w:rFonts w:eastAsia="Times New Roman"/>
+          <w:noProof/>
+          <w:sz w:val="36"/>
+          <w:szCs w:val="36"/>
+        </w:rPr>
+        <w:drawing>
+          <wp:inline distT="0" distB="0" distL="0" distR="0" wp14:anchorId="1AE3B40F" wp14:editId="1858F344">
+            <wp:extent cx="5350933" cy="3009900"/>
+            <wp:effectExtent l="0" t="0" r="2540" b="0"/>
+            <wp:docPr id="10" name="Kép 10"/>
+            <wp:cNvGraphicFramePr>
+              <a:graphicFrameLocks xmlns:a="http://schemas.openxmlformats.org/drawingml/2006/main" noChangeAspect="1"/>
+            </wp:cNvGraphicFramePr>
+            <a:graphic xmlns:a="http://schemas.openxmlformats.org/drawingml/2006/main">
+              <a:graphicData uri="http://schemas.openxmlformats.org/drawingml/2006/picture">
+                <pic:pic xmlns:pic="http://schemas.openxmlformats.org/drawingml/2006/picture">
+                  <pic:nvPicPr>
+                    <pic:cNvPr id="0" name="Picture 4"/>
+                    <pic:cNvPicPr>
+                      <a:picLocks noChangeAspect="1" noChangeArrowheads="1"/>
+                    </pic:cNvPicPr>
+                  </pic:nvPicPr>
+                  <pic:blipFill>
+                    <a:blip r:embed="rId23">
+                      <a:extLst>
+                        <a:ext uri="{28A0092B-C50C-407E-A947-70E740481C1C}">
+                          <a14:useLocalDpi xmlns:a14="http://schemas.microsoft.com/office/drawing/2010/main" val="0"/>
+                        </a:ext>
+                      </a:extLst>
+                    </a:blip>
+                    <a:srcRect/>
+                    <a:stretch>
+                      <a:fillRect/>
+                    </a:stretch>
+                  </pic:blipFill>
+                  <pic:spPr bwMode="auto">
+                    <a:xfrm>
+                      <a:off x="0" y="0"/>
+                      <a:ext cx="5363730" cy="3017098"/>
+                    </a:xfrm>
+                    <a:prstGeom prst="rect">
+                      <a:avLst/>
+                    </a:prstGeom>
+                    <a:noFill/>
+                  </pic:spPr>
+                </pic:pic>
+              </a:graphicData>
+            </a:graphic>
+          </wp:inline>
+        </w:drawing>
+      </w:r>
+    </w:p>
+    <w:p>
+      <w:pPr>
+        <w:rPr>
+          <w:rFonts w:eastAsia="Times New Roman"/>
+          <w:sz w:val="36"/>
+          <w:szCs w:val="36"/>
+        </w:rPr>
+      </w:pPr>
+    </w:p>
+    <w:p>
+      <w:pPr>
+        <w:rPr>
+          <w:rFonts w:eastAsia="Times New Roman"/>
+          <w:sz w:val="36"/>
+          <w:szCs w:val="36"/>
+        </w:rPr>
+      </w:pPr>
+    </w:p>
+    <w:p>
+      <w:pPr>
+        <w:rPr>
+          <w:rFonts w:ascii="Times New Roman" w:eastAsia="Times New Roman" w:hAnsi="Times New Roman" w:cs="Times New Roman"/>
+          <w:sz w:val="36"/>
+          <w:szCs w:val="36"/>
+        </w:rPr>
+      </w:pPr>
+    </w:p>
+    <w:p>
+      <w:pPr>
+        <w:rPr>
+          <w:rFonts w:ascii="Times New Roman" w:eastAsia="Times New Roman" w:hAnsi="Times New Roman" w:cs="Times New Roman"/>
+          <w:sz w:val="36"/>
+          <w:szCs w:val="36"/>
+        </w:rPr>
+      </w:pPr>
     </w:p>
     <w:sectPr>
       <w:pgSz w:w="11906" w:h="16838"/>
@@ -1858,7 +2764,6 @@
   <w:style w:type="character" w:default="1" w:styleId="Bekezdsalapbettpusa">
     <w:name w:val="Default Paragraph Font"/>
     <w:uiPriority w:val="1"/>
-    <w:semiHidden/>
     <w:unhideWhenUsed/>
   </w:style>
   <w:style w:type="table" w:default="1" w:styleId="Normltblzat">
@@ -2161,6 +3066,17 @@
     <w:rPr>
       <w:color w:val="467886"/>
       <w:u w:val="single"/>
+    </w:rPr>
+  </w:style>
+  <w:style w:type="paragraph" w:styleId="NormlWeb">
+    <w:name w:val="Normal (Web)"/>
+    <w:basedOn w:val="Norml"/>
+    <w:uiPriority w:val="99"/>
+    <w:semiHidden/>
+    <w:unhideWhenUsed/>
+    <w:rsid w:val="00B701F2"/>
+    <w:rPr>
+      <w:rFonts w:ascii="Times New Roman" w:hAnsi="Times New Roman" w:cs="Times New Roman"/>
     </w:rPr>
   </w:style>
 </w:styles>

</xml_diff>

<commit_message>
Updated documentation (finishing UI plans)
</commit_message>
<xml_diff>
--- a/documentation.docx
+++ b/documentation.docx
@@ -1,6 +1,6 @@
 
 <file path=word/document.xml><?xml version="1.0" encoding="utf-8"?>
-<w:document xmlns:wpc="http://schemas.microsoft.com/office/word/2010/wordprocessingCanvas" xmlns:cx="http://schemas.microsoft.com/office/drawing/2014/chartex" xmlns:cx1="http://schemas.microsoft.com/office/drawing/2015/9/8/chartex" xmlns:cx2="http://schemas.microsoft.com/office/drawing/2015/10/21/chartex" xmlns:cx3="http://schemas.microsoft.com/office/drawing/2016/5/9/chartex" xmlns:cx4="http://schemas.microsoft.com/office/drawing/2016/5/10/chartex" xmlns:cx5="http://schemas.microsoft.com/office/drawing/2016/5/11/chartex" xmlns:cx6="http://schemas.microsoft.com/office/drawing/2016/5/12/chartex" xmlns:cx7="http://schemas.microsoft.com/office/drawing/2016/5/13/chartex" xmlns:cx8="http://schemas.microsoft.com/office/drawing/2016/5/14/chartex" xmlns:mc="http://schemas.openxmlformats.org/markup-compatibility/2006" xmlns:aink="http://schemas.microsoft.com/office/drawing/2016/ink" xmlns:am3d="http://schemas.microsoft.com/office/drawing/2017/model3d" xmlns:o="urn:schemas-microsoft-com:office:office" xmlns:r="http://schemas.openxmlformats.org/officeDocument/2006/relationships" xmlns:m="http://schemas.openxmlformats.org/officeDocument/2006/math" xmlns:v="urn:schemas-microsoft-com:vml" xmlns:wp14="http://schemas.microsoft.com/office/word/2010/wordprocessingDrawing" xmlns:wp="http://schemas.openxmlformats.org/drawingml/2006/wordprocessingDrawing" xmlns:w10="urn:schemas-microsoft-com:office:word" xmlns:w="http://schemas.openxmlformats.org/wordprocessingml/2006/main" xmlns:w14="http://schemas.microsoft.com/office/word/2010/wordml" xmlns:w15="http://schemas.microsoft.com/office/word/2012/wordml" xmlns:w16cid="http://schemas.microsoft.com/office/word/2016/wordml/cid" xmlns:w16se="http://schemas.microsoft.com/office/word/2015/wordml/symex" xmlns:wpg="http://schemas.microsoft.com/office/word/2010/wordprocessingGroup" xmlns:wpi="http://schemas.microsoft.com/office/word/2010/wordprocessingInk" xmlns:wne="http://schemas.microsoft.com/office/word/2006/wordml" xmlns:wps="http://schemas.microsoft.com/office/word/2010/wordprocessingShape" mc:Ignorable="w14 w15 w16se w16cid wp14">
+<w:document xmlns:wpc="http://schemas.microsoft.com/office/word/2010/wordprocessingCanvas" xmlns:cx="http://schemas.microsoft.com/office/drawing/2014/chartex" xmlns:cx1="http://schemas.microsoft.com/office/drawing/2015/9/8/chartex" xmlns:cx2="http://schemas.microsoft.com/office/drawing/2015/10/21/chartex" xmlns:cx3="http://schemas.microsoft.com/office/drawing/2016/5/9/chartex" xmlns:cx4="http://schemas.microsoft.com/office/drawing/2016/5/10/chartex" xmlns:cx5="http://schemas.microsoft.com/office/drawing/2016/5/11/chartex" xmlns:cx6="http://schemas.microsoft.com/office/drawing/2016/5/12/chartex" xmlns:cx7="http://schemas.microsoft.com/office/drawing/2016/5/13/chartex" xmlns:cx8="http://schemas.microsoft.com/office/drawing/2016/5/14/chartex" xmlns:mc="http://schemas.openxmlformats.org/markup-compatibility/2006" xmlns:aink="http://schemas.microsoft.com/office/drawing/2016/ink" xmlns:am3d="http://schemas.microsoft.com/office/drawing/2017/model3d" xmlns:o="urn:schemas-microsoft-com:office:office" xmlns:oel="http://schemas.microsoft.com/office/2019/extlst" xmlns:r="http://schemas.openxmlformats.org/officeDocument/2006/relationships" xmlns:m="http://schemas.openxmlformats.org/officeDocument/2006/math" xmlns:v="urn:schemas-microsoft-com:vml" xmlns:wp14="http://schemas.microsoft.com/office/word/2010/wordprocessingDrawing" xmlns:wp="http://schemas.openxmlformats.org/drawingml/2006/wordprocessingDrawing" xmlns:w10="urn:schemas-microsoft-com:office:word" xmlns:w="http://schemas.openxmlformats.org/wordprocessingml/2006/main" xmlns:w14="http://schemas.microsoft.com/office/word/2010/wordml" xmlns:w15="http://schemas.microsoft.com/office/word/2012/wordml" xmlns:w16cex="http://schemas.microsoft.com/office/word/2018/wordml/cex" xmlns:w16cid="http://schemas.microsoft.com/office/word/2016/wordml/cid" xmlns:w16="http://schemas.microsoft.com/office/word/2018/wordml" xmlns:w16du="http://schemas.microsoft.com/office/word/2023/wordml/word16du" xmlns:w16sdtdh="http://schemas.microsoft.com/office/word/2020/wordml/sdtdatahash" xmlns:w16sdtfl="http://schemas.microsoft.com/office/word/2024/wordml/sdtformatlock" xmlns:w16se="http://schemas.microsoft.com/office/word/2015/wordml/symex" xmlns:wpg="http://schemas.microsoft.com/office/word/2010/wordprocessingGroup" xmlns:wpi="http://schemas.microsoft.com/office/word/2010/wordprocessingInk" xmlns:wne="http://schemas.microsoft.com/office/word/2006/wordml" xmlns:wps="http://schemas.microsoft.com/office/word/2010/wordprocessingShape" mc:Ignorable="w14 w15 w16se w16cid w16 w16cex w16sdtdh w16sdtfl w16du wp14">
   <w:body>
     <w:p>
       <w:pPr>
@@ -143,23 +143,13 @@
           <w:szCs w:val="36"/>
         </w:rPr>
       </w:pPr>
-      <w:proofErr w:type="spellStart"/>
-      <w:r>
-        <w:rPr>
-          <w:rFonts w:ascii="Times New Roman" w:hAnsi="Times New Roman" w:cs="Times New Roman"/>
-          <w:sz w:val="36"/>
-          <w:szCs w:val="36"/>
-        </w:rPr>
-        <w:t>főképernyő</w:t>
-      </w:r>
-      <w:proofErr w:type="spellEnd"/>
-      <w:r>
-        <w:rPr>
-          <w:rFonts w:ascii="Times New Roman" w:hAnsi="Times New Roman" w:cs="Times New Roman"/>
-          <w:sz w:val="36"/>
-          <w:szCs w:val="36"/>
-        </w:rPr>
-        <w:t xml:space="preserve"> és ütemező képernyők megtervezése</w:t>
+      <w:r>
+        <w:rPr>
+          <w:rFonts w:ascii="Times New Roman" w:hAnsi="Times New Roman" w:cs="Times New Roman"/>
+          <w:sz w:val="36"/>
+          <w:szCs w:val="36"/>
+        </w:rPr>
+        <w:t>főképernyő és ütemező képernyők megtervezése</w:t>
       </w:r>
     </w:p>
     <w:p>
@@ -385,7 +375,7 @@
           <w:szCs w:val="36"/>
         </w:rPr>
         <w:drawing>
-          <wp:inline distT="0" distB="0" distL="0" distR="0" wp14:anchorId="32D48373" wp14:editId="20A30649">
+          <wp:inline distT="0" distB="0" distL="0" distR="0" wp14:anchorId="32D48373" wp14:editId="1BE5211E">
             <wp:extent cx="3289702" cy="2355850"/>
             <wp:effectExtent l="0" t="0" r="6350" b="6350"/>
             <wp:docPr id="322479566" name="Kép 8" descr="A képen szöveg, Papíráru, papír, kézírás látható&#10;&#10;Előfordulhat, hogy az AI által létrehozott tartalom helytelen."/>
@@ -1011,9 +1001,9 @@
           <w:noProof/>
         </w:rPr>
         <w:drawing>
-          <wp:inline distT="0" distB="0" distL="0" distR="0" wp14:anchorId="250A4BFF" wp14:editId="667387A7">
-            <wp:extent cx="5760720" cy="3240405"/>
-            <wp:effectExtent l="0" t="0" r="0" b="0"/>
+          <wp:inline distT="0" distB="0" distL="0" distR="0" wp14:anchorId="250A4BFF" wp14:editId="169534A9">
+            <wp:extent cx="3177540" cy="1787366"/>
+            <wp:effectExtent l="0" t="0" r="3810" b="3810"/>
             <wp:docPr id="1" name="Kép 1"/>
             <wp:cNvGraphicFramePr>
               <a:graphicFrameLocks xmlns:a="http://schemas.openxmlformats.org/drawingml/2006/main" noChangeAspect="1"/>
@@ -1028,7 +1018,7 @@
                     </pic:cNvPicPr>
                   </pic:nvPicPr>
                   <pic:blipFill>
-                    <a:blip r:embed="rId15">
+                    <a:blip r:embed="rId15" cstate="print">
                       <a:extLst>
                         <a:ext uri="{28A0092B-C50C-407E-A947-70E740481C1C}">
                           <a14:useLocalDpi xmlns:a14="http://schemas.microsoft.com/office/drawing/2010/main" val="0"/>
@@ -1043,7 +1033,7 @@
                   <pic:spPr bwMode="auto">
                     <a:xfrm>
                       <a:off x="0" y="0"/>
-                      <a:ext cx="5760720" cy="3240405"/>
+                      <a:ext cx="3182709" cy="1790274"/>
                     </a:xfrm>
                     <a:prstGeom prst="rect">
                       <a:avLst/>
@@ -1095,8 +1085,6 @@
         </w:rPr>
         <w:t>13:40</w:t>
       </w:r>
-      <w:bookmarkStart w:id="0" w:name="_GoBack"/>
-      <w:bookmarkEnd w:id="0"/>
       <w:r>
         <w:rPr>
           <w:rFonts w:ascii="Times New Roman" w:eastAsia="Times New Roman" w:hAnsi="Times New Roman" w:cs="Times New Roman"/>
@@ -1151,18 +1139,40 @@
           <w:sz w:val="36"/>
           <w:szCs w:val="36"/>
         </w:rPr>
-        <w:t xml:space="preserve"> a </w:t>
-      </w:r>
-      <w:proofErr w:type="spellStart"/>
-      <w:r>
-        <w:rPr>
-          <w:rFonts w:ascii="Times New Roman" w:eastAsia="Times New Roman" w:hAnsi="Times New Roman" w:cs="Times New Roman"/>
-          <w:sz w:val="36"/>
-          <w:szCs w:val="36"/>
-        </w:rPr>
-        <w:t>főképernyő</w:t>
-      </w:r>
-      <w:proofErr w:type="spellEnd"/>
+        <w:t xml:space="preserve"> a főképernyő </w:t>
+      </w:r>
+      <w:r>
+        <w:rPr>
+          <w:rFonts w:ascii="Times New Roman" w:eastAsia="Times New Roman" w:hAnsi="Times New Roman" w:cs="Times New Roman"/>
+          <w:sz w:val="36"/>
+          <w:szCs w:val="36"/>
+        </w:rPr>
+        <w:t>oldalának digitális elkészítése felhasználói rang alapján.</w:t>
+      </w:r>
+      <w:r>
+        <w:rPr>
+          <w:rFonts w:ascii="Times New Roman" w:eastAsia="Times New Roman" w:hAnsi="Times New Roman" w:cs="Times New Roman"/>
+          <w:sz w:val="36"/>
+          <w:szCs w:val="36"/>
+        </w:rPr>
+        <w:t xml:space="preserve"> Továbbá a struktúra</w:t>
+      </w:r>
+      <w:r>
+        <w:rPr>
+          <w:rFonts w:ascii="Times New Roman" w:eastAsia="Times New Roman" w:hAnsi="Times New Roman" w:cs="Times New Roman"/>
+          <w:sz w:val="36"/>
+          <w:szCs w:val="36"/>
+        </w:rPr>
+        <w:t xml:space="preserve">, a </w:t>
+      </w:r>
+      <w:r>
+        <w:rPr>
+          <w:rFonts w:ascii="Times New Roman" w:eastAsia="Times New Roman" w:hAnsi="Times New Roman" w:cs="Times New Roman"/>
+          <w:sz w:val="36"/>
+          <w:szCs w:val="36"/>
+        </w:rPr>
+        <w:t>login</w:t>
+      </w:r>
       <w:r>
         <w:rPr>
           <w:rFonts w:ascii="Times New Roman" w:eastAsia="Times New Roman" w:hAnsi="Times New Roman" w:cs="Times New Roman"/>
@@ -1177,62 +1187,6 @@
           <w:sz w:val="36"/>
           <w:szCs w:val="36"/>
         </w:rPr>
-        <w:t xml:space="preserve">oldalának </w:t>
-      </w:r>
-      <w:r>
-        <w:rPr>
-          <w:rFonts w:ascii="Times New Roman" w:eastAsia="Times New Roman" w:hAnsi="Times New Roman" w:cs="Times New Roman"/>
-          <w:sz w:val="36"/>
-          <w:szCs w:val="36"/>
-        </w:rPr>
-        <w:t>digitális</w:t>
-      </w:r>
-      <w:r>
-        <w:rPr>
-          <w:rFonts w:ascii="Times New Roman" w:eastAsia="Times New Roman" w:hAnsi="Times New Roman" w:cs="Times New Roman"/>
-          <w:sz w:val="36"/>
-          <w:szCs w:val="36"/>
-        </w:rPr>
-        <w:t xml:space="preserve"> elkészítése felhasználói rang alapján.</w:t>
-      </w:r>
-      <w:r>
-        <w:rPr>
-          <w:rFonts w:ascii="Times New Roman" w:eastAsia="Times New Roman" w:hAnsi="Times New Roman" w:cs="Times New Roman"/>
-          <w:sz w:val="36"/>
-          <w:szCs w:val="36"/>
-        </w:rPr>
-        <w:t xml:space="preserve"> Továbbá a struktúra</w:t>
-      </w:r>
-      <w:r>
-        <w:rPr>
-          <w:rFonts w:ascii="Times New Roman" w:eastAsia="Times New Roman" w:hAnsi="Times New Roman" w:cs="Times New Roman"/>
-          <w:sz w:val="36"/>
-          <w:szCs w:val="36"/>
-        </w:rPr>
-        <w:t xml:space="preserve">, a </w:t>
-      </w:r>
-      <w:r>
-        <w:rPr>
-          <w:rFonts w:ascii="Times New Roman" w:eastAsia="Times New Roman" w:hAnsi="Times New Roman" w:cs="Times New Roman"/>
-          <w:sz w:val="36"/>
-          <w:szCs w:val="36"/>
-        </w:rPr>
-        <w:t>login</w:t>
-      </w:r>
-      <w:r>
-        <w:rPr>
-          <w:rFonts w:ascii="Times New Roman" w:eastAsia="Times New Roman" w:hAnsi="Times New Roman" w:cs="Times New Roman"/>
-          <w:sz w:val="36"/>
-          <w:szCs w:val="36"/>
-        </w:rPr>
-        <w:t xml:space="preserve"> </w:t>
-      </w:r>
-      <w:r>
-        <w:rPr>
-          <w:rFonts w:ascii="Times New Roman" w:eastAsia="Times New Roman" w:hAnsi="Times New Roman" w:cs="Times New Roman"/>
-          <w:sz w:val="36"/>
-          <w:szCs w:val="36"/>
-        </w:rPr>
         <w:t>a rendezői</w:t>
       </w:r>
       <w:r>
@@ -1270,31 +1224,20 @@
     </w:p>
     <w:p>
       <w:pPr>
-        <w:spacing w:before="2760" w:after="0"/>
-        <w:rPr>
-          <w:rFonts w:ascii="Times New Roman" w:eastAsia="Times New Roman" w:hAnsi="Times New Roman" w:cs="Times New Roman"/>
-          <w:sz w:val="36"/>
-          <w:szCs w:val="36"/>
-        </w:rPr>
-      </w:pPr>
-      <w:proofErr w:type="spellStart"/>
-      <w:r>
-        <w:rPr>
-          <w:rFonts w:ascii="Times New Roman" w:eastAsia="Times New Roman" w:hAnsi="Times New Roman" w:cs="Times New Roman"/>
-          <w:sz w:val="36"/>
-          <w:szCs w:val="36"/>
-        </w:rPr>
-        <w:lastRenderedPageBreak/>
-        <w:t>Főképernyő</w:t>
-      </w:r>
-      <w:proofErr w:type="spellEnd"/>
-      <w:r>
-        <w:rPr>
-          <w:rFonts w:ascii="Times New Roman" w:eastAsia="Times New Roman" w:hAnsi="Times New Roman" w:cs="Times New Roman"/>
-          <w:sz w:val="36"/>
-          <w:szCs w:val="36"/>
-        </w:rPr>
-        <w:t xml:space="preserve">: </w:t>
+        <w:spacing w:after="0"/>
+        <w:rPr>
+          <w:rFonts w:ascii="Times New Roman" w:eastAsia="Times New Roman" w:hAnsi="Times New Roman" w:cs="Times New Roman"/>
+          <w:sz w:val="36"/>
+          <w:szCs w:val="36"/>
+        </w:rPr>
+      </w:pPr>
+      <w:r>
+        <w:rPr>
+          <w:rFonts w:ascii="Times New Roman" w:eastAsia="Times New Roman" w:hAnsi="Times New Roman" w:cs="Times New Roman"/>
+          <w:sz w:val="36"/>
+          <w:szCs w:val="36"/>
+        </w:rPr>
+        <w:t xml:space="preserve">Főképernyő: </w:t>
       </w:r>
     </w:p>
     <w:p>
@@ -1313,7 +1256,7 @@
           <w:szCs w:val="36"/>
         </w:rPr>
         <w:drawing>
-          <wp:inline distT="0" distB="0" distL="0" distR="0" wp14:anchorId="78A43544" wp14:editId="33D830EA">
+          <wp:inline distT="0" distB="0" distL="0" distR="0" wp14:anchorId="78A43544" wp14:editId="73E46434">
             <wp:extent cx="3166535" cy="1781175"/>
             <wp:effectExtent l="0" t="0" r="0" b="0"/>
             <wp:docPr id="3" name="Kép 3" descr="C:\Users\elnabulsy.csongor\AppData\Local\Microsoft\Windows\INetCache\Content.MSO\F75754B3.tmp"/>
@@ -1371,23 +1314,13 @@
           <w14:ligatures w14:val="none"/>
         </w:rPr>
       </w:pPr>
-      <w:proofErr w:type="spellStart"/>
-      <w:r>
-        <w:rPr>
-          <w:rFonts w:ascii="Times New Roman" w:eastAsia="Times New Roman" w:hAnsi="Times New Roman" w:cs="Times New Roman"/>
-          <w:sz w:val="36"/>
-          <w:szCs w:val="36"/>
-        </w:rPr>
-        <w:t>Főképernyő</w:t>
-      </w:r>
-      <w:proofErr w:type="spellEnd"/>
-      <w:r>
-        <w:rPr>
-          <w:rFonts w:ascii="Times New Roman" w:eastAsia="Times New Roman" w:hAnsi="Times New Roman" w:cs="Times New Roman"/>
-          <w:sz w:val="36"/>
-          <w:szCs w:val="36"/>
-        </w:rPr>
-        <w:t xml:space="preserve"> diák ranggal:</w:t>
+      <w:r>
+        <w:rPr>
+          <w:rFonts w:ascii="Times New Roman" w:eastAsia="Times New Roman" w:hAnsi="Times New Roman" w:cs="Times New Roman"/>
+          <w:sz w:val="36"/>
+          <w:szCs w:val="36"/>
+        </w:rPr>
+        <w:t>Főképernyő diák ranggal:</w:t>
       </w:r>
       <w:r>
         <w:rPr>
@@ -1410,11 +1343,13 @@
       <w:r>
         <w:rPr>
           <w:rFonts w:eastAsia="Times New Roman"/>
-          <w:sz w:val="36"/>
-          <w:szCs w:val="36"/>
-        </w:rPr>
+          <w:noProof/>
+          <w:sz w:val="36"/>
+          <w:szCs w:val="36"/>
+        </w:rPr>
+        <w:lastRenderedPageBreak/>
         <w:drawing>
-          <wp:inline distT="0" distB="0" distL="0" distR="0" wp14:anchorId="4E211814" wp14:editId="6BCC3A01">
+          <wp:inline distT="0" distB="0" distL="0" distR="0" wp14:anchorId="4E211814" wp14:editId="5DA090EB">
             <wp:extent cx="3133725" cy="1762720"/>
             <wp:effectExtent l="0" t="0" r="0" b="9525"/>
             <wp:docPr id="4" name="Kép 4" descr="C:\Users\elnabulsy.csongor\Downloads\ui_main_student.png"/>
@@ -1471,23 +1406,13 @@
           <w:szCs w:val="36"/>
         </w:rPr>
       </w:pPr>
-      <w:proofErr w:type="spellStart"/>
-      <w:r>
-        <w:rPr>
-          <w:rFonts w:eastAsia="Times New Roman"/>
-          <w:sz w:val="36"/>
-          <w:szCs w:val="36"/>
-        </w:rPr>
-        <w:t>Főképernyő</w:t>
-      </w:r>
-      <w:proofErr w:type="spellEnd"/>
-      <w:r>
-        <w:rPr>
-          <w:rFonts w:eastAsia="Times New Roman"/>
-          <w:sz w:val="36"/>
-          <w:szCs w:val="36"/>
-        </w:rPr>
-        <w:t xml:space="preserve"> rendezői ranggal:</w:t>
+      <w:r>
+        <w:rPr>
+          <w:rFonts w:ascii="Times New Roman" w:eastAsia="Times New Roman" w:hAnsi="Times New Roman" w:cs="Times New Roman"/>
+          <w:sz w:val="36"/>
+          <w:szCs w:val="36"/>
+        </w:rPr>
+        <w:t>Főképernyő rendezői ranggal:</w:t>
       </w:r>
       <w:r>
         <w:rPr>
@@ -1501,11 +1426,12 @@
       <w:r>
         <w:rPr>
           <w:rFonts w:eastAsia="Times New Roman"/>
+          <w:noProof/>
           <w:sz w:val="36"/>
           <w:szCs w:val="36"/>
         </w:rPr>
         <w:drawing>
-          <wp:inline distT="0" distB="0" distL="0" distR="0" wp14:anchorId="5137FB78" wp14:editId="37C1D4C6">
+          <wp:inline distT="0" distB="0" distL="0" distR="0" wp14:anchorId="5137FB78" wp14:editId="753DC44C">
             <wp:extent cx="3166110" cy="1780938"/>
             <wp:effectExtent l="0" t="0" r="0" b="0"/>
             <wp:docPr id="5" name="Kép 5" descr="C:\Users\elnabulsy.csongor\Downloads\ui_main_scheduler.png"/>
@@ -1558,48 +1484,46 @@
       <w:pPr>
         <w:rPr>
           <w:rFonts w:ascii="Times New Roman" w:eastAsia="Times New Roman" w:hAnsi="Times New Roman" w:cs="Times New Roman"/>
+          <w:sz w:val="36"/>
+          <w:szCs w:val="36"/>
+        </w:rPr>
+      </w:pPr>
+      <w:r>
+        <w:rPr>
+          <w:rFonts w:ascii="Times New Roman" w:eastAsia="Times New Roman" w:hAnsi="Times New Roman" w:cs="Times New Roman"/>
+          <w:sz w:val="36"/>
+          <w:szCs w:val="36"/>
+        </w:rPr>
+        <w:t xml:space="preserve">Főképernyő </w:t>
+      </w:r>
+      <w:proofErr w:type="spellStart"/>
+      <w:r>
+        <w:rPr>
+          <w:rFonts w:ascii="Times New Roman" w:eastAsia="Times New Roman" w:hAnsi="Times New Roman" w:cs="Times New Roman"/>
+          <w:sz w:val="36"/>
+          <w:szCs w:val="36"/>
+        </w:rPr>
+        <w:t>admin</w:t>
+      </w:r>
+      <w:proofErr w:type="spellEnd"/>
+      <w:r>
+        <w:rPr>
+          <w:rFonts w:ascii="Times New Roman" w:eastAsia="Times New Roman" w:hAnsi="Times New Roman" w:cs="Times New Roman"/>
+          <w:sz w:val="36"/>
+          <w:szCs w:val="36"/>
+        </w:rPr>
+        <w:t xml:space="preserve"> ranggal:</w:t>
+      </w:r>
+    </w:p>
+    <w:p>
+      <w:pPr>
+        <w:rPr>
+          <w:rFonts w:ascii="Times New Roman" w:eastAsia="Times New Roman" w:hAnsi="Times New Roman" w:cs="Times New Roman"/>
           <w:kern w:val="0"/>
           <w:lang w:eastAsia="hu-HU"/>
           <w14:ligatures w14:val="none"/>
         </w:rPr>
       </w:pPr>
-      <w:proofErr w:type="spellStart"/>
-      <w:r>
-        <w:rPr>
-          <w:rFonts w:eastAsia="Times New Roman"/>
-          <w:sz w:val="36"/>
-          <w:szCs w:val="36"/>
-        </w:rPr>
-        <w:lastRenderedPageBreak/>
-        <w:t>Főképernyő</w:t>
-      </w:r>
-      <w:proofErr w:type="spellEnd"/>
-      <w:r>
-        <w:rPr>
-          <w:rFonts w:eastAsia="Times New Roman"/>
-          <w:sz w:val="36"/>
-          <w:szCs w:val="36"/>
-        </w:rPr>
-        <w:t xml:space="preserve"> </w:t>
-      </w:r>
-      <w:proofErr w:type="spellStart"/>
-      <w:r>
-        <w:rPr>
-          <w:rFonts w:eastAsia="Times New Roman"/>
-          <w:sz w:val="36"/>
-          <w:szCs w:val="36"/>
-        </w:rPr>
-        <w:t>admin</w:t>
-      </w:r>
-      <w:proofErr w:type="spellEnd"/>
-      <w:r>
-        <w:rPr>
-          <w:rFonts w:eastAsia="Times New Roman"/>
-          <w:sz w:val="36"/>
-          <w:szCs w:val="36"/>
-        </w:rPr>
-        <w:t xml:space="preserve"> ranggal:</w:t>
-      </w:r>
       <w:r>
         <w:rPr>
           <w:rFonts w:ascii="Times New Roman" w:eastAsia="Times New Roman" w:hAnsi="Times New Roman" w:cs="Times New Roman"/>
@@ -1612,13 +1536,14 @@
       <w:r>
         <w:rPr>
           <w:rFonts w:eastAsia="Times New Roman"/>
+          <w:noProof/>
           <w:sz w:val="36"/>
           <w:szCs w:val="36"/>
         </w:rPr>
         <w:drawing>
-          <wp:inline distT="0" distB="0" distL="0" distR="0" wp14:anchorId="27EC1C67" wp14:editId="3BF2A804">
-            <wp:extent cx="3251200" cy="1828800"/>
-            <wp:effectExtent l="0" t="0" r="6350" b="0"/>
+          <wp:inline distT="0" distB="0" distL="0" distR="0" wp14:anchorId="27EC1C67" wp14:editId="35C30B4C">
+            <wp:extent cx="3055620" cy="1718786"/>
+            <wp:effectExtent l="0" t="0" r="0" b="0"/>
             <wp:docPr id="6" name="Kép 6" descr="C:\Users\elnabulsy.csongor\Downloads\ui_main_admin.png"/>
             <wp:cNvGraphicFramePr>
               <a:graphicFrameLocks xmlns:a="http://schemas.openxmlformats.org/drawingml/2006/main" noChangeAspect="1"/>
@@ -1648,7 +1573,7 @@
                   <pic:spPr bwMode="auto">
                     <a:xfrm>
                       <a:off x="0" y="0"/>
-                      <a:ext cx="3289769" cy="1850495"/>
+                      <a:ext cx="3105442" cy="1746811"/>
                     </a:xfrm>
                     <a:prstGeom prst="rect">
                       <a:avLst/>
@@ -1668,6 +1593,23 @@
     <w:p>
       <w:pPr>
         <w:rPr>
+          <w:rFonts w:ascii="Times New Roman" w:eastAsia="Times New Roman" w:hAnsi="Times New Roman" w:cs="Times New Roman"/>
+          <w:sz w:val="36"/>
+          <w:szCs w:val="36"/>
+        </w:rPr>
+      </w:pPr>
+      <w:r>
+        <w:rPr>
+          <w:rFonts w:ascii="Times New Roman" w:eastAsia="Times New Roman" w:hAnsi="Times New Roman" w:cs="Times New Roman"/>
+          <w:sz w:val="36"/>
+          <w:szCs w:val="36"/>
+        </w:rPr>
+        <w:t>Struktúra:</w:t>
+      </w:r>
+    </w:p>
+    <w:p>
+      <w:pPr>
+        <w:rPr>
           <w:rFonts w:eastAsia="Times New Roman"/>
           <w:sz w:val="36"/>
           <w:szCs w:val="36"/>
@@ -1676,30 +1618,14 @@
       <w:r>
         <w:rPr>
           <w:rFonts w:eastAsia="Times New Roman"/>
-          <w:sz w:val="36"/>
-          <w:szCs w:val="36"/>
-        </w:rPr>
-        <w:t>Struktúra:</w:t>
-      </w:r>
-    </w:p>
-    <w:p>
-      <w:pPr>
-        <w:rPr>
-          <w:rFonts w:eastAsia="Times New Roman"/>
-          <w:sz w:val="36"/>
-          <w:szCs w:val="36"/>
-        </w:rPr>
-      </w:pPr>
-      <w:r>
-        <w:rPr>
-          <w:rFonts w:eastAsia="Times New Roman"/>
+          <w:noProof/>
           <w:sz w:val="36"/>
           <w:szCs w:val="36"/>
         </w:rPr>
         <w:drawing>
-          <wp:inline distT="0" distB="0" distL="0" distR="0" wp14:anchorId="08225B4F" wp14:editId="7412D19B">
-            <wp:extent cx="3251200" cy="2152650"/>
-            <wp:effectExtent l="0" t="0" r="6350" b="0"/>
+          <wp:inline distT="0" distB="0" distL="0" distR="0" wp14:anchorId="08225B4F" wp14:editId="6FB60AA3">
+            <wp:extent cx="2933700" cy="1942430"/>
+            <wp:effectExtent l="0" t="0" r="0" b="1270"/>
             <wp:docPr id="7" name="Kép 7" descr="C:\Users\elnabulsy.csongor\Downloads\ui_structure.png"/>
             <wp:cNvGraphicFramePr>
               <a:graphicFrameLocks xmlns:a="http://schemas.openxmlformats.org/drawingml/2006/main" noChangeAspect="1"/>
@@ -1729,7 +1655,7 @@
                   <pic:spPr bwMode="auto">
                     <a:xfrm>
                       <a:off x="0" y="0"/>
-                      <a:ext cx="3341768" cy="2212616"/>
+                      <a:ext cx="3019075" cy="1998957"/>
                     </a:xfrm>
                     <a:prstGeom prst="rect">
                       <a:avLst/>
@@ -1749,6 +1675,32 @@
     <w:p>
       <w:pPr>
         <w:rPr>
+          <w:rFonts w:ascii="Times New Roman" w:eastAsia="Times New Roman" w:hAnsi="Times New Roman" w:cs="Times New Roman"/>
+          <w:sz w:val="36"/>
+          <w:szCs w:val="36"/>
+        </w:rPr>
+      </w:pPr>
+      <w:r>
+        <w:rPr>
+          <w:rFonts w:ascii="Times New Roman" w:eastAsia="Times New Roman" w:hAnsi="Times New Roman" w:cs="Times New Roman"/>
+          <w:sz w:val="36"/>
+          <w:szCs w:val="36"/>
+        </w:rPr>
+        <w:lastRenderedPageBreak/>
+        <w:t>Bejelentkezési képernyő</w:t>
+      </w:r>
+      <w:r>
+        <w:rPr>
+          <w:rFonts w:ascii="Times New Roman" w:eastAsia="Times New Roman" w:hAnsi="Times New Roman" w:cs="Times New Roman"/>
+          <w:sz w:val="36"/>
+          <w:szCs w:val="36"/>
+        </w:rPr>
+        <w:t>:</w:t>
+      </w:r>
+    </w:p>
+    <w:p>
+      <w:pPr>
+        <w:rPr>
           <w:rFonts w:eastAsia="Times New Roman"/>
           <w:sz w:val="36"/>
           <w:szCs w:val="36"/>
@@ -1757,38 +1709,14 @@
       <w:r>
         <w:rPr>
           <w:rFonts w:eastAsia="Times New Roman"/>
-          <w:sz w:val="36"/>
-          <w:szCs w:val="36"/>
-        </w:rPr>
-        <w:t>Bejelentkezési képernyő</w:t>
-      </w:r>
-      <w:r>
-        <w:rPr>
-          <w:rFonts w:eastAsia="Times New Roman"/>
-          <w:sz w:val="36"/>
-          <w:szCs w:val="36"/>
-        </w:rPr>
-        <w:t>:</w:t>
-      </w:r>
-    </w:p>
-    <w:p>
-      <w:pPr>
-        <w:rPr>
-          <w:rFonts w:eastAsia="Times New Roman"/>
-          <w:sz w:val="36"/>
-          <w:szCs w:val="36"/>
-        </w:rPr>
-      </w:pPr>
-      <w:r>
-        <w:rPr>
-          <w:rFonts w:eastAsia="Times New Roman"/>
+          <w:noProof/>
           <w:sz w:val="36"/>
           <w:szCs w:val="36"/>
         </w:rPr>
         <w:drawing>
-          <wp:inline distT="0" distB="0" distL="0" distR="0" wp14:anchorId="4F93ECF7" wp14:editId="31173C35">
-            <wp:extent cx="3284855" cy="1781175"/>
-            <wp:effectExtent l="0" t="0" r="0" b="9525"/>
+          <wp:inline distT="0" distB="0" distL="0" distR="0" wp14:anchorId="4F93ECF7" wp14:editId="5B127F9A">
+            <wp:extent cx="3169920" cy="1718853"/>
+            <wp:effectExtent l="0" t="0" r="0" b="0"/>
             <wp:docPr id="8" name="Kép 8" descr="C:\Users\elnabulsy.csongor\Downloads\ui_login.png"/>
             <wp:cNvGraphicFramePr>
               <a:graphicFrameLocks xmlns:a="http://schemas.openxmlformats.org/drawingml/2006/main" noChangeAspect="1"/>
@@ -1818,7 +1746,7 @@
                   <pic:spPr bwMode="auto">
                     <a:xfrm>
                       <a:off x="0" y="0"/>
-                      <a:ext cx="3309412" cy="1794491"/>
+                      <a:ext cx="3207995" cy="1739499"/>
                     </a:xfrm>
                     <a:prstGeom prst="rect">
                       <a:avLst/>
@@ -1837,20 +1765,19 @@
     </w:p>
     <w:p>
       <w:pPr>
-        <w:spacing w:before="2160" w:after="0"/>
-        <w:rPr>
-          <w:rFonts w:eastAsia="Times New Roman"/>
-          <w:sz w:val="36"/>
-          <w:szCs w:val="36"/>
-        </w:rPr>
-      </w:pPr>
-      <w:r>
-        <w:rPr>
-          <w:rFonts w:eastAsia="Times New Roman"/>
-          <w:sz w:val="36"/>
-          <w:szCs w:val="36"/>
-        </w:rPr>
-        <w:lastRenderedPageBreak/>
+        <w:spacing w:after="0"/>
+        <w:rPr>
+          <w:rFonts w:ascii="Times New Roman" w:eastAsia="Times New Roman" w:hAnsi="Times New Roman" w:cs="Times New Roman"/>
+          <w:sz w:val="36"/>
+          <w:szCs w:val="36"/>
+        </w:rPr>
+      </w:pPr>
+      <w:r>
+        <w:rPr>
+          <w:rFonts w:ascii="Times New Roman" w:eastAsia="Times New Roman" w:hAnsi="Times New Roman" w:cs="Times New Roman"/>
+          <w:sz w:val="36"/>
+          <w:szCs w:val="36"/>
+        </w:rPr>
         <w:t>Rendezői felület:</w:t>
       </w:r>
     </w:p>
@@ -1870,9 +1797,9 @@
           <w:szCs w:val="36"/>
         </w:rPr>
         <w:drawing>
-          <wp:inline distT="0" distB="0" distL="0" distR="0" wp14:anchorId="2C256DB5" wp14:editId="55C7E1D6">
-            <wp:extent cx="5399599" cy="2457450"/>
-            <wp:effectExtent l="0" t="0" r="0" b="0"/>
+          <wp:inline distT="0" distB="0" distL="0" distR="0" wp14:anchorId="2C256DB5" wp14:editId="445063D3">
+            <wp:extent cx="3329940" cy="1752493"/>
+            <wp:effectExtent l="0" t="0" r="3810" b="635"/>
             <wp:docPr id="9" name="Kép 9"/>
             <wp:cNvGraphicFramePr>
               <a:graphicFrameLocks xmlns:a="http://schemas.openxmlformats.org/drawingml/2006/main" noChangeAspect="1"/>
@@ -1887,7 +1814,7 @@
                     </pic:cNvPicPr>
                   </pic:nvPicPr>
                   <pic:blipFill>
-                    <a:blip r:embed="rId22">
+                    <a:blip r:embed="rId22" cstate="print">
                       <a:extLst>
                         <a:ext uri="{28A0092B-C50C-407E-A947-70E740481C1C}">
                           <a14:useLocalDpi xmlns:a14="http://schemas.microsoft.com/office/drawing/2010/main" val="0"/>
@@ -1902,7 +1829,7 @@
                   <pic:spPr bwMode="auto">
                     <a:xfrm>
                       <a:off x="0" y="0"/>
-                      <a:ext cx="5664898" cy="2578192"/>
+                      <a:ext cx="3528015" cy="1856736"/>
                     </a:xfrm>
                     <a:prstGeom prst="rect">
                       <a:avLst/>
@@ -1919,14 +1846,14 @@
     <w:p>
       <w:pPr>
         <w:rPr>
-          <w:rFonts w:eastAsia="Times New Roman"/>
-          <w:sz w:val="36"/>
-          <w:szCs w:val="36"/>
-        </w:rPr>
-      </w:pPr>
-      <w:r>
-        <w:rPr>
-          <w:rFonts w:eastAsia="Times New Roman"/>
+          <w:rFonts w:ascii="Times New Roman" w:eastAsia="Times New Roman" w:hAnsi="Times New Roman" w:cs="Times New Roman"/>
+          <w:sz w:val="36"/>
+          <w:szCs w:val="36"/>
+        </w:rPr>
+      </w:pPr>
+      <w:r>
+        <w:rPr>
+          <w:rFonts w:ascii="Times New Roman" w:eastAsia="Times New Roman" w:hAnsi="Times New Roman" w:cs="Times New Roman"/>
           <w:sz w:val="36"/>
           <w:szCs w:val="36"/>
         </w:rPr>
@@ -1949,9 +1876,9 @@
           <w:szCs w:val="36"/>
         </w:rPr>
         <w:drawing>
-          <wp:inline distT="0" distB="0" distL="0" distR="0" wp14:anchorId="1AE3B40F" wp14:editId="1858F344">
-            <wp:extent cx="5350933" cy="3009900"/>
-            <wp:effectExtent l="0" t="0" r="2540" b="0"/>
+          <wp:inline distT="0" distB="0" distL="0" distR="0" wp14:anchorId="1AE3B40F" wp14:editId="475288A1">
+            <wp:extent cx="3291840" cy="1851660"/>
+            <wp:effectExtent l="0" t="0" r="3810" b="0"/>
             <wp:docPr id="10" name="Kép 10"/>
             <wp:cNvGraphicFramePr>
               <a:graphicFrameLocks xmlns:a="http://schemas.openxmlformats.org/drawingml/2006/main" noChangeAspect="1"/>
@@ -1966,7 +1893,7 @@
                     </pic:cNvPicPr>
                   </pic:nvPicPr>
                   <pic:blipFill>
-                    <a:blip r:embed="rId23">
+                    <a:blip r:embed="rId23" cstate="print">
                       <a:extLst>
                         <a:ext uri="{28A0092B-C50C-407E-A947-70E740481C1C}">
                           <a14:useLocalDpi xmlns:a14="http://schemas.microsoft.com/office/drawing/2010/main" val="0"/>
@@ -1981,7 +1908,7 @@
                   <pic:spPr bwMode="auto">
                     <a:xfrm>
                       <a:off x="0" y="0"/>
-                      <a:ext cx="5363730" cy="3017098"/>
+                      <a:ext cx="3305343" cy="1859255"/>
                     </a:xfrm>
                     <a:prstGeom prst="rect">
                       <a:avLst/>
@@ -1998,34 +1925,265 @@
     <w:p>
       <w:pPr>
         <w:rPr>
+          <w:rFonts w:ascii="Times New Roman" w:eastAsia="Times New Roman" w:hAnsi="Times New Roman" w:cs="Times New Roman"/>
+          <w:b/>
+          <w:bCs/>
+          <w:sz w:val="40"/>
+          <w:szCs w:val="40"/>
+        </w:rPr>
+      </w:pPr>
+      <w:r>
+        <w:rPr>
+          <w:rFonts w:ascii="Times New Roman" w:eastAsia="Times New Roman" w:hAnsi="Times New Roman" w:cs="Times New Roman"/>
+          <w:b/>
+          <w:bCs/>
+          <w:sz w:val="40"/>
+          <w:szCs w:val="40"/>
+        </w:rPr>
+        <w:t>2026-02-18 9:20-</w:t>
+      </w:r>
+    </w:p>
+    <w:p>
+      <w:pPr>
+        <w:rPr>
+          <w:rFonts w:ascii="Times New Roman" w:eastAsia="Times New Roman" w:hAnsi="Times New Roman" w:cs="Times New Roman"/>
+          <w:sz w:val="36"/>
+          <w:szCs w:val="36"/>
+        </w:rPr>
+      </w:pPr>
+      <w:r>
+        <w:rPr>
+          <w:rFonts w:ascii="Times New Roman" w:eastAsia="Times New Roman" w:hAnsi="Times New Roman" w:cs="Times New Roman"/>
+          <w:sz w:val="36"/>
+          <w:szCs w:val="36"/>
+        </w:rPr>
+        <w:t xml:space="preserve">Az </w:t>
+      </w:r>
+      <w:proofErr w:type="spellStart"/>
+      <w:r>
+        <w:rPr>
+          <w:rFonts w:ascii="Times New Roman" w:eastAsia="Times New Roman" w:hAnsi="Times New Roman" w:cs="Times New Roman"/>
+          <w:sz w:val="36"/>
+          <w:szCs w:val="36"/>
+        </w:rPr>
+        <w:t>admin</w:t>
+      </w:r>
+      <w:proofErr w:type="spellEnd"/>
+      <w:r>
+        <w:rPr>
+          <w:rFonts w:ascii="Times New Roman" w:eastAsia="Times New Roman" w:hAnsi="Times New Roman" w:cs="Times New Roman"/>
+          <w:sz w:val="36"/>
+          <w:szCs w:val="36"/>
+        </w:rPr>
+        <w:t xml:space="preserve"> UI oldal megtervezése digitális úton</w:t>
+      </w:r>
+      <w:r>
+        <w:rPr>
+          <w:rFonts w:ascii="Times New Roman" w:eastAsia="Times New Roman" w:hAnsi="Times New Roman" w:cs="Times New Roman"/>
+          <w:sz w:val="36"/>
+          <w:szCs w:val="36"/>
+        </w:rPr>
+        <w:t xml:space="preserve">, </w:t>
+      </w:r>
+    </w:p>
+    <w:p>
+      <w:pPr>
+        <w:rPr>
+          <w:rFonts w:ascii="Times New Roman" w:eastAsia="Times New Roman" w:hAnsi="Times New Roman" w:cs="Times New Roman"/>
+          <w:sz w:val="36"/>
+          <w:szCs w:val="36"/>
+        </w:rPr>
+      </w:pPr>
+    </w:p>
+    <w:p>
+      <w:pPr>
+        <w:rPr>
+          <w:rFonts w:ascii="Times New Roman" w:eastAsia="Times New Roman" w:hAnsi="Times New Roman" w:cs="Times New Roman"/>
+          <w:sz w:val="36"/>
+          <w:szCs w:val="36"/>
+        </w:rPr>
+      </w:pPr>
+    </w:p>
+    <w:p>
+      <w:pPr>
+        <w:rPr>
+          <w:rFonts w:ascii="Times New Roman" w:eastAsia="Times New Roman" w:hAnsi="Times New Roman" w:cs="Times New Roman"/>
+          <w:sz w:val="36"/>
+          <w:szCs w:val="36"/>
+        </w:rPr>
+      </w:pPr>
+    </w:p>
+    <w:p>
+      <w:pPr>
+        <w:rPr>
+          <w:rFonts w:ascii="Times New Roman" w:eastAsia="Times New Roman" w:hAnsi="Times New Roman" w:cs="Times New Roman"/>
+          <w:sz w:val="36"/>
+          <w:szCs w:val="36"/>
+        </w:rPr>
+      </w:pPr>
+    </w:p>
+    <w:p>
+      <w:pPr>
+        <w:rPr>
+          <w:rFonts w:ascii="Times New Roman" w:eastAsia="Times New Roman" w:hAnsi="Times New Roman" w:cs="Times New Roman"/>
+          <w:sz w:val="36"/>
+          <w:szCs w:val="36"/>
+        </w:rPr>
+      </w:pPr>
+      <w:proofErr w:type="spellStart"/>
+      <w:r>
+        <w:rPr>
+          <w:rFonts w:ascii="Times New Roman" w:eastAsia="Times New Roman" w:hAnsi="Times New Roman" w:cs="Times New Roman"/>
+          <w:sz w:val="36"/>
+          <w:szCs w:val="36"/>
+        </w:rPr>
+        <w:t>Admin</w:t>
+      </w:r>
+      <w:proofErr w:type="spellEnd"/>
+      <w:r>
+        <w:rPr>
+          <w:rFonts w:ascii="Times New Roman" w:eastAsia="Times New Roman" w:hAnsi="Times New Roman" w:cs="Times New Roman"/>
+          <w:sz w:val="36"/>
+          <w:szCs w:val="36"/>
+        </w:rPr>
+        <w:t xml:space="preserve"> oldal:</w:t>
+      </w:r>
+    </w:p>
+    <w:p>
+      <w:pPr>
+        <w:rPr>
+          <w:rFonts w:ascii="Times New Roman" w:eastAsia="Times New Roman" w:hAnsi="Times New Roman" w:cs="Times New Roman"/>
+          <w:sz w:val="36"/>
+          <w:szCs w:val="36"/>
+        </w:rPr>
+      </w:pPr>
+      <w:r>
+        <w:rPr>
+          <w:rFonts w:ascii="Times New Roman" w:eastAsia="Times New Roman" w:hAnsi="Times New Roman" w:cs="Times New Roman"/>
+          <w:noProof/>
+          <w:sz w:val="36"/>
+          <w:szCs w:val="36"/>
+        </w:rPr>
+        <w:drawing>
+          <wp:inline distT="0" distB="0" distL="0" distR="0" wp14:anchorId="3BC34039" wp14:editId="75CC79DE">
+            <wp:extent cx="5760720" cy="3240405"/>
+            <wp:effectExtent l="0" t="0" r="5080" b="0"/>
+            <wp:docPr id="1280314791" name="Picture 1" descr="A screenshot of a computer&#10;&#10;AI-generated content may be incorrect."/>
+            <wp:cNvGraphicFramePr>
+              <a:graphicFrameLocks xmlns:a="http://schemas.openxmlformats.org/drawingml/2006/main" noChangeAspect="1"/>
+            </wp:cNvGraphicFramePr>
+            <a:graphic xmlns:a="http://schemas.openxmlformats.org/drawingml/2006/main">
+              <a:graphicData uri="http://schemas.openxmlformats.org/drawingml/2006/picture">
+                <pic:pic xmlns:pic="http://schemas.openxmlformats.org/drawingml/2006/picture">
+                  <pic:nvPicPr>
+                    <pic:cNvPr id="1280314791" name="Picture 1" descr="A screenshot of a computer&#10;&#10;AI-generated content may be incorrect."/>
+                    <pic:cNvPicPr/>
+                  </pic:nvPicPr>
+                  <pic:blipFill>
+                    <a:blip r:embed="rId24"/>
+                    <a:stretch>
+                      <a:fillRect/>
+                    </a:stretch>
+                  </pic:blipFill>
+                  <pic:spPr>
+                    <a:xfrm>
+                      <a:off x="0" y="0"/>
+                      <a:ext cx="5760720" cy="3240405"/>
+                    </a:xfrm>
+                    <a:prstGeom prst="rect">
+                      <a:avLst/>
+                    </a:prstGeom>
+                  </pic:spPr>
+                </pic:pic>
+              </a:graphicData>
+            </a:graphic>
+          </wp:inline>
+        </w:drawing>
+      </w:r>
+    </w:p>
+    <w:p>
+      <w:pPr>
+        <w:rPr>
+          <w:rFonts w:ascii="Times New Roman" w:eastAsia="Times New Roman" w:hAnsi="Times New Roman" w:cs="Times New Roman"/>
+          <w:sz w:val="36"/>
+          <w:szCs w:val="36"/>
+        </w:rPr>
+      </w:pPr>
+      <w:r>
+        <w:rPr>
+          <w:rFonts w:ascii="Times New Roman" w:eastAsia="Times New Roman" w:hAnsi="Times New Roman" w:cs="Times New Roman"/>
+          <w:sz w:val="36"/>
+          <w:szCs w:val="36"/>
+        </w:rPr>
+        <w:t>Zene beküldésének oldala:</w:t>
+      </w:r>
+    </w:p>
+    <w:p>
+      <w:pPr>
+        <w:rPr>
           <w:rFonts w:eastAsia="Times New Roman"/>
           <w:sz w:val="36"/>
           <w:szCs w:val="36"/>
         </w:rPr>
       </w:pPr>
+      <w:r>
+        <w:rPr>
+          <w:noProof/>
+        </w:rPr>
+        <w:drawing>
+          <wp:inline distT="0" distB="0" distL="0" distR="0" wp14:anchorId="57E727B3" wp14:editId="039E63B2">
+            <wp:extent cx="5760720" cy="3240405"/>
+            <wp:effectExtent l="0" t="0" r="0" b="0"/>
+            <wp:docPr id="1982280319" name="Kép 1" descr="A képen szöveg, képernyőkép, képernyő, szoftver látható&#10;&#10;Előfordulhat, hogy az AI által létrehozott tartalom helytelen."/>
+            <wp:cNvGraphicFramePr>
+              <a:graphicFrameLocks xmlns:a="http://schemas.openxmlformats.org/drawingml/2006/main" noChangeAspect="1"/>
+            </wp:cNvGraphicFramePr>
+            <a:graphic xmlns:a="http://schemas.openxmlformats.org/drawingml/2006/main">
+              <a:graphicData uri="http://schemas.openxmlformats.org/drawingml/2006/picture">
+                <pic:pic xmlns:pic="http://schemas.openxmlformats.org/drawingml/2006/picture">
+                  <pic:nvPicPr>
+                    <pic:cNvPr id="1982280319" name="Kép 1" descr="A képen szöveg, képernyőkép, képernyő, szoftver látható&#10;&#10;Előfordulhat, hogy az AI által létrehozott tartalom helytelen."/>
+                    <pic:cNvPicPr>
+                      <a:picLocks noChangeAspect="1" noChangeArrowheads="1"/>
+                    </pic:cNvPicPr>
+                  </pic:nvPicPr>
+                  <pic:blipFill>
+                    <a:blip r:embed="rId25">
+                      <a:extLst>
+                        <a:ext uri="{28A0092B-C50C-407E-A947-70E740481C1C}">
+                          <a14:useLocalDpi xmlns:a14="http://schemas.microsoft.com/office/drawing/2010/main" val="0"/>
+                        </a:ext>
+                      </a:extLst>
+                    </a:blip>
+                    <a:srcRect/>
+                    <a:stretch>
+                      <a:fillRect/>
+                    </a:stretch>
+                  </pic:blipFill>
+                  <pic:spPr bwMode="auto">
+                    <a:xfrm>
+                      <a:off x="0" y="0"/>
+                      <a:ext cx="5760720" cy="3240405"/>
+                    </a:xfrm>
+                    <a:prstGeom prst="rect">
+                      <a:avLst/>
+                    </a:prstGeom>
+                    <a:noFill/>
+                    <a:ln>
+                      <a:noFill/>
+                    </a:ln>
+                  </pic:spPr>
+                </pic:pic>
+              </a:graphicData>
+            </a:graphic>
+          </wp:inline>
+        </w:drawing>
+      </w:r>
     </w:p>
     <w:p>
       <w:pPr>
         <w:rPr>
           <w:rFonts w:eastAsia="Times New Roman"/>
-          <w:sz w:val="36"/>
-          <w:szCs w:val="36"/>
-        </w:rPr>
-      </w:pPr>
-    </w:p>
-    <w:p>
-      <w:pPr>
-        <w:rPr>
-          <w:rFonts w:ascii="Times New Roman" w:eastAsia="Times New Roman" w:hAnsi="Times New Roman" w:cs="Times New Roman"/>
-          <w:sz w:val="36"/>
-          <w:szCs w:val="36"/>
-        </w:rPr>
-      </w:pPr>
-    </w:p>
-    <w:p>
-      <w:pPr>
-        <w:rPr>
-          <w:rFonts w:ascii="Times New Roman" w:eastAsia="Times New Roman" w:hAnsi="Times New Roman" w:cs="Times New Roman"/>
           <w:sz w:val="36"/>
           <w:szCs w:val="36"/>
         </w:rPr>
@@ -2042,7 +2200,7 @@
 </file>
 
 <file path=word/numbering.xml><?xml version="1.0" encoding="utf-8"?>
-<w:numbering xmlns:wpc="http://schemas.microsoft.com/office/word/2010/wordprocessingCanvas" xmlns:cx="http://schemas.microsoft.com/office/drawing/2014/chartex" xmlns:cx1="http://schemas.microsoft.com/office/drawing/2015/9/8/chartex" xmlns:cx2="http://schemas.microsoft.com/office/drawing/2015/10/21/chartex" xmlns:cx3="http://schemas.microsoft.com/office/drawing/2016/5/9/chartex" xmlns:cx4="http://schemas.microsoft.com/office/drawing/2016/5/10/chartex" xmlns:cx5="http://schemas.microsoft.com/office/drawing/2016/5/11/chartex" xmlns:cx6="http://schemas.microsoft.com/office/drawing/2016/5/12/chartex" xmlns:cx7="http://schemas.microsoft.com/office/drawing/2016/5/13/chartex" xmlns:cx8="http://schemas.microsoft.com/office/drawing/2016/5/14/chartex" xmlns:mc="http://schemas.openxmlformats.org/markup-compatibility/2006" xmlns:aink="http://schemas.microsoft.com/office/drawing/2016/ink" xmlns:am3d="http://schemas.microsoft.com/office/drawing/2017/model3d" xmlns:o="urn:schemas-microsoft-com:office:office" xmlns:r="http://schemas.openxmlformats.org/officeDocument/2006/relationships" xmlns:m="http://schemas.openxmlformats.org/officeDocument/2006/math" xmlns:v="urn:schemas-microsoft-com:vml" xmlns:wp14="http://schemas.microsoft.com/office/word/2010/wordprocessingDrawing" xmlns:wp="http://schemas.openxmlformats.org/drawingml/2006/wordprocessingDrawing" xmlns:w10="urn:schemas-microsoft-com:office:word" xmlns:w="http://schemas.openxmlformats.org/wordprocessingml/2006/main" xmlns:w14="http://schemas.microsoft.com/office/word/2010/wordml" xmlns:w15="http://schemas.microsoft.com/office/word/2012/wordml" xmlns:w16cid="http://schemas.microsoft.com/office/word/2016/wordml/cid" xmlns:w16se="http://schemas.microsoft.com/office/word/2015/wordml/symex" xmlns:wpg="http://schemas.microsoft.com/office/word/2010/wordprocessingGroup" xmlns:wpi="http://schemas.microsoft.com/office/word/2010/wordprocessingInk" xmlns:wne="http://schemas.microsoft.com/office/word/2006/wordml" xmlns:wps="http://schemas.microsoft.com/office/word/2010/wordprocessingShape" mc:Ignorable="w14 w15 w16se w16cid wp14">
+<w:numbering xmlns:wpc="http://schemas.microsoft.com/office/word/2010/wordprocessingCanvas" xmlns:cx="http://schemas.microsoft.com/office/drawing/2014/chartex" xmlns:cx1="http://schemas.microsoft.com/office/drawing/2015/9/8/chartex" xmlns:cx2="http://schemas.microsoft.com/office/drawing/2015/10/21/chartex" xmlns:cx3="http://schemas.microsoft.com/office/drawing/2016/5/9/chartex" xmlns:cx4="http://schemas.microsoft.com/office/drawing/2016/5/10/chartex" xmlns:cx5="http://schemas.microsoft.com/office/drawing/2016/5/11/chartex" xmlns:cx6="http://schemas.microsoft.com/office/drawing/2016/5/12/chartex" xmlns:cx7="http://schemas.microsoft.com/office/drawing/2016/5/13/chartex" xmlns:cx8="http://schemas.microsoft.com/office/drawing/2016/5/14/chartex" xmlns:mc="http://schemas.openxmlformats.org/markup-compatibility/2006" xmlns:aink="http://schemas.microsoft.com/office/drawing/2016/ink" xmlns:am3d="http://schemas.microsoft.com/office/drawing/2017/model3d" xmlns:o="urn:schemas-microsoft-com:office:office" xmlns:oel="http://schemas.microsoft.com/office/2019/extlst" xmlns:r="http://schemas.openxmlformats.org/officeDocument/2006/relationships" xmlns:m="http://schemas.openxmlformats.org/officeDocument/2006/math" xmlns:v="urn:schemas-microsoft-com:vml" xmlns:wp14="http://schemas.microsoft.com/office/word/2010/wordprocessingDrawing" xmlns:wp="http://schemas.openxmlformats.org/drawingml/2006/wordprocessingDrawing" xmlns:w10="urn:schemas-microsoft-com:office:word" xmlns:w="http://schemas.openxmlformats.org/wordprocessingml/2006/main" xmlns:w14="http://schemas.microsoft.com/office/word/2010/wordml" xmlns:w15="http://schemas.microsoft.com/office/word/2012/wordml" xmlns:w16cex="http://schemas.microsoft.com/office/word/2018/wordml/cex" xmlns:w16cid="http://schemas.microsoft.com/office/word/2016/wordml/cid" xmlns:w16="http://schemas.microsoft.com/office/word/2018/wordml" xmlns:w16du="http://schemas.microsoft.com/office/word/2023/wordml/word16du" xmlns:w16sdtdh="http://schemas.microsoft.com/office/word/2020/wordml/sdtdatahash" xmlns:w16sdtfl="http://schemas.microsoft.com/office/word/2024/wordml/sdtformatlock" xmlns:w16se="http://schemas.microsoft.com/office/word/2015/wordml/symex" xmlns:wpg="http://schemas.microsoft.com/office/word/2010/wordprocessingGroup" xmlns:wpi="http://schemas.microsoft.com/office/word/2010/wordprocessingInk" xmlns:wne="http://schemas.microsoft.com/office/word/2006/wordml" xmlns:wps="http://schemas.microsoft.com/office/word/2010/wordprocessingShape" mc:Ignorable="w14 w15 w16se w16cid w16 w16cex w16sdtdh w16sdtfl w16du wp14">
   <w:abstractNum w:abstractNumId="0" w15:restartNumberingAfterBreak="0">
     <w:nsid w:val="7EB672F7"/>
     <w:multiLevelType w:val="hybridMultilevel"/>
@@ -2156,14 +2314,14 @@
       </w:rPr>
     </w:lvl>
   </w:abstractNum>
-  <w:num w:numId="1">
+  <w:num w:numId="1" w16cid:durableId="33770327">
     <w:abstractNumId w:val="0"/>
   </w:num>
 </w:numbering>
 </file>
 
 <file path=word/styles.xml><?xml version="1.0" encoding="utf-8"?>
-<w:styles xmlns:mc="http://schemas.openxmlformats.org/markup-compatibility/2006" xmlns:r="http://schemas.openxmlformats.org/officeDocument/2006/relationships" xmlns:w="http://schemas.openxmlformats.org/wordprocessingml/2006/main" xmlns:w14="http://schemas.microsoft.com/office/word/2010/wordml" xmlns:w15="http://schemas.microsoft.com/office/word/2012/wordml" xmlns:w16cid="http://schemas.microsoft.com/office/word/2016/wordml/cid" xmlns:w16se="http://schemas.microsoft.com/office/word/2015/wordml/symex" mc:Ignorable="w14 w15 w16se w16cid">
+<w:styles xmlns:mc="http://schemas.openxmlformats.org/markup-compatibility/2006" xmlns:r="http://schemas.openxmlformats.org/officeDocument/2006/relationships" xmlns:w="http://schemas.openxmlformats.org/wordprocessingml/2006/main" xmlns:w14="http://schemas.microsoft.com/office/word/2010/wordml" xmlns:w15="http://schemas.microsoft.com/office/word/2012/wordml" xmlns:w16cex="http://schemas.microsoft.com/office/word/2018/wordml/cex" xmlns:w16cid="http://schemas.microsoft.com/office/word/2016/wordml/cid" xmlns:w16="http://schemas.microsoft.com/office/word/2018/wordml" xmlns:w16du="http://schemas.microsoft.com/office/word/2023/wordml/word16du" xmlns:w16sdtdh="http://schemas.microsoft.com/office/word/2020/wordml/sdtdatahash" xmlns:w16sdtfl="http://schemas.microsoft.com/office/word/2024/wordml/sdtformatlock" xmlns:w16se="http://schemas.microsoft.com/office/word/2015/wordml/symex" mc:Ignorable="w14 w15 w16se w16cid w16 w16cex w16sdtdh w16sdtfl w16du">
   <w:docDefaults>
     <w:rPrDefault>
       <w:rPr>
@@ -2181,7 +2339,7 @@
       </w:pPr>
     </w:pPrDefault>
   </w:docDefaults>
-  <w:latentStyles w:defLockedState="0" w:defUIPriority="99" w:defSemiHidden="0" w:defUnhideWhenUsed="0" w:defQFormat="0" w:count="375">
+  <w:latentStyles w:defLockedState="0" w:defUIPriority="99" w:defSemiHidden="0" w:defUnhideWhenUsed="0" w:defQFormat="0" w:count="376">
     <w:lsdException w:name="Normal" w:uiPriority="0" w:qFormat="1"/>
     <w:lsdException w:name="heading 1" w:uiPriority="9" w:qFormat="1"/>
     <w:lsdException w:name="heading 2" w:semiHidden="1" w:uiPriority="9" w:unhideWhenUsed="1" w:qFormat="1"/>
@@ -2557,6 +2715,7 @@
     <w:lsdException w:name="Smart Hyperlink" w:semiHidden="1" w:unhideWhenUsed="1"/>
     <w:lsdException w:name="Hashtag" w:semiHidden="1" w:unhideWhenUsed="1"/>
     <w:lsdException w:name="Unresolved Mention" w:semiHidden="1" w:unhideWhenUsed="1"/>
+    <w:lsdException w:name="Smart Link" w:semiHidden="1" w:unhideWhenUsed="1"/>
   </w:latentStyles>
   <w:style w:type="paragraph" w:default="1" w:styleId="Norml">
     <w:name w:val="Normal"/>
@@ -2764,6 +2923,7 @@
   <w:style w:type="character" w:default="1" w:styleId="Bekezdsalapbettpusa">
     <w:name w:val="Default Paragraph Font"/>
     <w:uiPriority w:val="1"/>
+    <w:semiHidden/>
     <w:unhideWhenUsed/>
   </w:style>
   <w:style w:type="table" w:default="1" w:styleId="Normltblzat">

</xml_diff>

<commit_message>
Update documentation: initialization of the project's frontend part
</commit_message>
<xml_diff>
--- a/documentation.docx
+++ b/documentation.docx
@@ -40,19 +40,8 @@
           <w:sz w:val="40"/>
           <w:szCs w:val="40"/>
         </w:rPr>
-        <w:t xml:space="preserve">Alkalmazás neve: </w:t>
-      </w:r>
-      <w:proofErr w:type="spellStart"/>
-      <w:r>
-        <w:rPr>
-          <w:rFonts w:ascii="Times New Roman" w:hAnsi="Times New Roman" w:cs="Times New Roman"/>
-          <w:bCs/>
-          <w:sz w:val="40"/>
-          <w:szCs w:val="40"/>
-        </w:rPr>
-        <w:t>BláthyFM</w:t>
-      </w:r>
-      <w:proofErr w:type="spellEnd"/>
+        <w:t>Alkalmazás neve: BláthyFM</w:t>
+      </w:r>
     </w:p>
     <w:p>
       <w:pPr>
@@ -375,7 +364,7 @@
           <w:szCs w:val="36"/>
         </w:rPr>
         <w:drawing>
-          <wp:inline distT="0" distB="0" distL="0" distR="0" wp14:anchorId="32D48373" wp14:editId="1BE5211E">
+          <wp:inline distT="0" distB="0" distL="0" distR="0" wp14:anchorId="32D48373" wp14:editId="1658D8FE">
             <wp:extent cx="3289702" cy="2355850"/>
             <wp:effectExtent l="0" t="0" r="6350" b="6350"/>
             <wp:docPr id="322479566" name="Kép 8" descr="A képen szöveg, Papíráru, papír, kézírás látható&#10;&#10;Előfordulhat, hogy az AI által létrehozott tartalom helytelen."/>
@@ -569,25 +558,7 @@
           <w:sz w:val="36"/>
           <w:szCs w:val="36"/>
         </w:rPr>
-        <w:t xml:space="preserve">Az alkalmazás fejlesztését tartalmazó dokumentáció elkezdése, vizsgafeltételek tanulmányozása, a projektet tároló </w:t>
-      </w:r>
-      <w:proofErr w:type="spellStart"/>
-      <w:r>
-        <w:rPr>
-          <w:rFonts w:ascii="Times New Roman" w:hAnsi="Times New Roman" w:cs="Times New Roman"/>
-          <w:sz w:val="36"/>
-          <w:szCs w:val="36"/>
-        </w:rPr>
-        <w:t>repository</w:t>
-      </w:r>
-      <w:proofErr w:type="spellEnd"/>
-      <w:r>
-        <w:rPr>
-          <w:rFonts w:ascii="Times New Roman" w:hAnsi="Times New Roman" w:cs="Times New Roman"/>
-          <w:sz w:val="36"/>
-          <w:szCs w:val="36"/>
-        </w:rPr>
-        <w:t xml:space="preserve"> létrehozása, teszteknek külön dokumentáció létrehozása.</w:t>
+        <w:t>Az alkalmazás fejlesztését tartalmazó dokumentáció elkezdése, vizsgafeltételek tanulmányozása, a projektet tároló repository létrehozása, teszteknek külön dokumentáció létrehozása.</w:t>
       </w:r>
     </w:p>
     <w:p/>
@@ -1256,7 +1227,7 @@
           <w:szCs w:val="36"/>
         </w:rPr>
         <w:drawing>
-          <wp:inline distT="0" distB="0" distL="0" distR="0" wp14:anchorId="78A43544" wp14:editId="73E46434">
+          <wp:inline distT="0" distB="0" distL="0" distR="0" wp14:anchorId="78A43544" wp14:editId="76578366">
             <wp:extent cx="3166535" cy="1781175"/>
             <wp:effectExtent l="0" t="0" r="0" b="0"/>
             <wp:docPr id="3" name="Kép 3" descr="C:\Users\elnabulsy.csongor\AppData\Local\Microsoft\Windows\INetCache\Content.MSO\F75754B3.tmp"/>
@@ -1349,7 +1320,7 @@
         </w:rPr>
         <w:lastRenderedPageBreak/>
         <w:drawing>
-          <wp:inline distT="0" distB="0" distL="0" distR="0" wp14:anchorId="4E211814" wp14:editId="5DA090EB">
+          <wp:inline distT="0" distB="0" distL="0" distR="0" wp14:anchorId="4E211814" wp14:editId="305CE204">
             <wp:extent cx="3133725" cy="1762720"/>
             <wp:effectExtent l="0" t="0" r="0" b="9525"/>
             <wp:docPr id="4" name="Kép 4" descr="C:\Users\elnabulsy.csongor\Downloads\ui_main_student.png"/>
@@ -1431,7 +1402,7 @@
           <w:szCs w:val="36"/>
         </w:rPr>
         <w:drawing>
-          <wp:inline distT="0" distB="0" distL="0" distR="0" wp14:anchorId="5137FB78" wp14:editId="753DC44C">
+          <wp:inline distT="0" distB="0" distL="0" distR="0" wp14:anchorId="5137FB78" wp14:editId="774515A9">
             <wp:extent cx="3166110" cy="1780938"/>
             <wp:effectExtent l="0" t="0" r="0" b="0"/>
             <wp:docPr id="5" name="Kép 5" descr="C:\Users\elnabulsy.csongor\Downloads\ui_main_scheduler.png"/>
@@ -1494,25 +1465,7 @@
           <w:sz w:val="36"/>
           <w:szCs w:val="36"/>
         </w:rPr>
-        <w:t xml:space="preserve">Főképernyő </w:t>
-      </w:r>
-      <w:proofErr w:type="spellStart"/>
-      <w:r>
-        <w:rPr>
-          <w:rFonts w:ascii="Times New Roman" w:eastAsia="Times New Roman" w:hAnsi="Times New Roman" w:cs="Times New Roman"/>
-          <w:sz w:val="36"/>
-          <w:szCs w:val="36"/>
-        </w:rPr>
-        <w:t>admin</w:t>
-      </w:r>
-      <w:proofErr w:type="spellEnd"/>
-      <w:r>
-        <w:rPr>
-          <w:rFonts w:ascii="Times New Roman" w:eastAsia="Times New Roman" w:hAnsi="Times New Roman" w:cs="Times New Roman"/>
-          <w:sz w:val="36"/>
-          <w:szCs w:val="36"/>
-        </w:rPr>
-        <w:t xml:space="preserve"> ranggal:</w:t>
+        <w:t>Főképernyő admin ranggal:</w:t>
       </w:r>
     </w:p>
     <w:p>
@@ -1541,7 +1494,7 @@
           <w:szCs w:val="36"/>
         </w:rPr>
         <w:drawing>
-          <wp:inline distT="0" distB="0" distL="0" distR="0" wp14:anchorId="27EC1C67" wp14:editId="35C30B4C">
+          <wp:inline distT="0" distB="0" distL="0" distR="0" wp14:anchorId="27EC1C67" wp14:editId="7E64ACC6">
             <wp:extent cx="3055620" cy="1718786"/>
             <wp:effectExtent l="0" t="0" r="0" b="0"/>
             <wp:docPr id="6" name="Kép 6" descr="C:\Users\elnabulsy.csongor\Downloads\ui_main_admin.png"/>
@@ -1623,7 +1576,7 @@
           <w:szCs w:val="36"/>
         </w:rPr>
         <w:drawing>
-          <wp:inline distT="0" distB="0" distL="0" distR="0" wp14:anchorId="08225B4F" wp14:editId="6FB60AA3">
+          <wp:inline distT="0" distB="0" distL="0" distR="0" wp14:anchorId="08225B4F" wp14:editId="2069300A">
             <wp:extent cx="2933700" cy="1942430"/>
             <wp:effectExtent l="0" t="0" r="0" b="1270"/>
             <wp:docPr id="7" name="Kép 7" descr="C:\Users\elnabulsy.csongor\Downloads\ui_structure.png"/>
@@ -1797,7 +1750,7 @@
           <w:szCs w:val="36"/>
         </w:rPr>
         <w:drawing>
-          <wp:inline distT="0" distB="0" distL="0" distR="0" wp14:anchorId="2C256DB5" wp14:editId="445063D3">
+          <wp:inline distT="0" distB="0" distL="0" distR="0" wp14:anchorId="2C256DB5" wp14:editId="00B7A608">
             <wp:extent cx="3329940" cy="1752493"/>
             <wp:effectExtent l="0" t="0" r="3810" b="635"/>
             <wp:docPr id="9" name="Kép 9"/>
@@ -1942,40 +1895,32 @@
         </w:rPr>
         <w:t>2026-02-18 9:20-</w:t>
       </w:r>
-    </w:p>
-    <w:p>
-      <w:pPr>
-        <w:rPr>
-          <w:rFonts w:ascii="Times New Roman" w:eastAsia="Times New Roman" w:hAnsi="Times New Roman" w:cs="Times New Roman"/>
-          <w:sz w:val="36"/>
-          <w:szCs w:val="36"/>
-        </w:rPr>
-      </w:pPr>
-      <w:r>
-        <w:rPr>
-          <w:rFonts w:ascii="Times New Roman" w:eastAsia="Times New Roman" w:hAnsi="Times New Roman" w:cs="Times New Roman"/>
-          <w:sz w:val="36"/>
-          <w:szCs w:val="36"/>
-        </w:rPr>
-        <w:t xml:space="preserve">Az </w:t>
-      </w:r>
-      <w:proofErr w:type="spellStart"/>
-      <w:r>
-        <w:rPr>
-          <w:rFonts w:ascii="Times New Roman" w:eastAsia="Times New Roman" w:hAnsi="Times New Roman" w:cs="Times New Roman"/>
-          <w:sz w:val="36"/>
-          <w:szCs w:val="36"/>
-        </w:rPr>
-        <w:t>admin</w:t>
-      </w:r>
-      <w:proofErr w:type="spellEnd"/>
-      <w:r>
-        <w:rPr>
-          <w:rFonts w:ascii="Times New Roman" w:eastAsia="Times New Roman" w:hAnsi="Times New Roman" w:cs="Times New Roman"/>
-          <w:sz w:val="36"/>
-          <w:szCs w:val="36"/>
-        </w:rPr>
-        <w:t xml:space="preserve"> UI oldal megtervezése digitális úton</w:t>
+      <w:r>
+        <w:rPr>
+          <w:rFonts w:ascii="Times New Roman" w:eastAsia="Times New Roman" w:hAnsi="Times New Roman" w:cs="Times New Roman"/>
+          <w:b/>
+          <w:bCs/>
+          <w:sz w:val="40"/>
+          <w:szCs w:val="40"/>
+        </w:rPr>
+        <w:t>10:10</w:t>
+      </w:r>
+    </w:p>
+    <w:p>
+      <w:pPr>
+        <w:rPr>
+          <w:rFonts w:ascii="Times New Roman" w:eastAsia="Times New Roman" w:hAnsi="Times New Roman" w:cs="Times New Roman"/>
+          <w:sz w:val="36"/>
+          <w:szCs w:val="36"/>
+        </w:rPr>
+      </w:pPr>
+      <w:r>
+        <w:rPr>
+          <w:rFonts w:ascii="Times New Roman" w:eastAsia="Times New Roman" w:hAnsi="Times New Roman" w:cs="Times New Roman"/>
+          <w:sz w:val="36"/>
+          <w:szCs w:val="36"/>
+        </w:rPr>
+        <w:t>Az admin UI oldal megtervezése digitális úton</w:t>
       </w:r>
       <w:r>
         <w:rPr>
@@ -2030,23 +1975,13 @@
           <w:szCs w:val="36"/>
         </w:rPr>
       </w:pPr>
-      <w:proofErr w:type="spellStart"/>
-      <w:r>
-        <w:rPr>
-          <w:rFonts w:ascii="Times New Roman" w:eastAsia="Times New Roman" w:hAnsi="Times New Roman" w:cs="Times New Roman"/>
-          <w:sz w:val="36"/>
-          <w:szCs w:val="36"/>
-        </w:rPr>
-        <w:t>Admin</w:t>
-      </w:r>
-      <w:proofErr w:type="spellEnd"/>
-      <w:r>
-        <w:rPr>
-          <w:rFonts w:ascii="Times New Roman" w:eastAsia="Times New Roman" w:hAnsi="Times New Roman" w:cs="Times New Roman"/>
-          <w:sz w:val="36"/>
-          <w:szCs w:val="36"/>
-        </w:rPr>
-        <w:t xml:space="preserve"> oldal:</w:t>
+      <w:r>
+        <w:rPr>
+          <w:rFonts w:ascii="Times New Roman" w:eastAsia="Times New Roman" w:hAnsi="Times New Roman" w:cs="Times New Roman"/>
+          <w:sz w:val="36"/>
+          <w:szCs w:val="36"/>
+        </w:rPr>
+        <w:t>Admin oldal:</w:t>
       </w:r>
     </w:p>
     <w:p>
@@ -2109,13 +2044,60 @@
           <w:szCs w:val="36"/>
         </w:rPr>
       </w:pPr>
-      <w:r>
-        <w:rPr>
-          <w:rFonts w:ascii="Times New Roman" w:eastAsia="Times New Roman" w:hAnsi="Times New Roman" w:cs="Times New Roman"/>
-          <w:sz w:val="36"/>
-          <w:szCs w:val="36"/>
-        </w:rPr>
-        <w:t>Zene beküldésének oldala:</w:t>
+    </w:p>
+    <w:p>
+      <w:pPr>
+        <w:rPr>
+          <w:rFonts w:ascii="Times New Roman" w:eastAsia="Times New Roman" w:hAnsi="Times New Roman" w:cs="Times New Roman"/>
+          <w:b/>
+          <w:bCs/>
+          <w:sz w:val="40"/>
+          <w:szCs w:val="40"/>
+        </w:rPr>
+      </w:pPr>
+      <w:r>
+        <w:rPr>
+          <w:rFonts w:ascii="Times New Roman" w:eastAsia="Times New Roman" w:hAnsi="Times New Roman" w:cs="Times New Roman"/>
+          <w:b/>
+          <w:bCs/>
+          <w:sz w:val="40"/>
+          <w:szCs w:val="40"/>
+        </w:rPr>
+        <w:t>2026-02-18 10:00-10:10</w:t>
+      </w:r>
+      <w:r>
+        <w:rPr>
+          <w:rFonts w:ascii="Times New Roman" w:eastAsia="Times New Roman" w:hAnsi="Times New Roman" w:cs="Times New Roman"/>
+          <w:b/>
+          <w:bCs/>
+          <w:sz w:val="40"/>
+          <w:szCs w:val="40"/>
+        </w:rPr>
+        <w:br/>
+      </w:r>
+      <w:r>
+        <w:rPr>
+          <w:rFonts w:ascii="Times New Roman" w:eastAsia="Times New Roman" w:hAnsi="Times New Roman" w:cs="Times New Roman"/>
+          <w:sz w:val="36"/>
+          <w:szCs w:val="36"/>
+        </w:rPr>
+        <w:t>A z</w:t>
+      </w:r>
+      <w:r>
+        <w:rPr>
+          <w:rFonts w:ascii="Times New Roman" w:eastAsia="Times New Roman" w:hAnsi="Times New Roman" w:cs="Times New Roman"/>
+          <w:sz w:val="36"/>
+          <w:szCs w:val="36"/>
+        </w:rPr>
+        <w:t>ene beküldésének oldal</w:t>
+      </w:r>
+      <w:r>
+        <w:rPr>
+          <w:rFonts w:ascii="Times New Roman" w:eastAsia="Times New Roman" w:hAnsi="Times New Roman" w:cs="Times New Roman"/>
+          <w:sz w:val="36"/>
+          <w:szCs w:val="36"/>
+        </w:rPr>
+        <w:t>ának megtervezése.</w:t>
       </w:r>
     </w:p>
     <w:p>
@@ -2189,6 +2171,252 @@
         </w:rPr>
       </w:pPr>
     </w:p>
+    <w:p>
+      <w:pPr>
+        <w:rPr>
+          <w:rFonts w:ascii="Times New Roman" w:eastAsia="Times New Roman" w:hAnsi="Times New Roman" w:cs="Times New Roman"/>
+          <w:sz w:val="36"/>
+          <w:szCs w:val="36"/>
+        </w:rPr>
+      </w:pPr>
+      <w:r>
+        <w:rPr>
+          <w:rFonts w:ascii="Times New Roman" w:eastAsia="Times New Roman" w:hAnsi="Times New Roman" w:cs="Times New Roman"/>
+          <w:b/>
+          <w:bCs/>
+          <w:sz w:val="40"/>
+          <w:szCs w:val="40"/>
+        </w:rPr>
+        <w:t>2026-02-18 11:15-</w:t>
+      </w:r>
+      <w:r>
+        <w:rPr>
+          <w:rFonts w:ascii="Times New Roman" w:eastAsia="Times New Roman" w:hAnsi="Times New Roman" w:cs="Times New Roman"/>
+          <w:b/>
+          <w:bCs/>
+          <w:sz w:val="40"/>
+          <w:szCs w:val="40"/>
+        </w:rPr>
+        <w:t>12:35</w:t>
+      </w:r>
+      <w:r>
+        <w:rPr>
+          <w:rFonts w:ascii="Times New Roman" w:eastAsia="Times New Roman" w:hAnsi="Times New Roman" w:cs="Times New Roman"/>
+          <w:b/>
+          <w:bCs/>
+          <w:sz w:val="40"/>
+          <w:szCs w:val="40"/>
+        </w:rPr>
+        <w:br/>
+      </w:r>
+      <w:r>
+        <w:rPr>
+          <w:rFonts w:ascii="Times New Roman" w:eastAsia="Times New Roman" w:hAnsi="Times New Roman" w:cs="Times New Roman"/>
+          <w:sz w:val="36"/>
+          <w:szCs w:val="36"/>
+        </w:rPr>
+        <w:t>A projekt frontend részének (Vue.js</w:t>
+      </w:r>
+      <w:r>
+        <w:rPr>
+          <w:rFonts w:ascii="Times New Roman" w:eastAsia="Times New Roman" w:hAnsi="Times New Roman" w:cs="Times New Roman"/>
+          <w:sz w:val="36"/>
+          <w:szCs w:val="36"/>
+        </w:rPr>
+        <w:t>, Vue router</w:t>
+      </w:r>
+      <w:r>
+        <w:rPr>
+          <w:rFonts w:ascii="Times New Roman" w:eastAsia="Times New Roman" w:hAnsi="Times New Roman" w:cs="Times New Roman"/>
+          <w:sz w:val="36"/>
+          <w:szCs w:val="36"/>
+        </w:rPr>
+        <w:t>) létrehozása frontend</w:t>
+      </w:r>
+      <w:r>
+        <w:rPr>
+          <w:rFonts w:ascii="Times New Roman" w:eastAsia="Times New Roman" w:hAnsi="Times New Roman" w:cs="Times New Roman"/>
+          <w:sz w:val="36"/>
+          <w:szCs w:val="36"/>
+        </w:rPr>
+        <w:t>Part</w:t>
+      </w:r>
+      <w:r>
+        <w:rPr>
+          <w:rFonts w:ascii="Times New Roman" w:eastAsia="Times New Roman" w:hAnsi="Times New Roman" w:cs="Times New Roman"/>
+          <w:sz w:val="36"/>
+          <w:szCs w:val="36"/>
+        </w:rPr>
+        <w:t xml:space="preserve"> néven</w:t>
+      </w:r>
+      <w:r>
+        <w:rPr>
+          <w:rFonts w:ascii="Times New Roman" w:eastAsia="Times New Roman" w:hAnsi="Times New Roman" w:cs="Times New Roman"/>
+          <w:sz w:val="36"/>
+          <w:szCs w:val="36"/>
+        </w:rPr>
+        <w:t>:</w:t>
+      </w:r>
+    </w:p>
+    <w:p>
+      <w:pPr>
+        <w:pStyle w:val="Listaszerbekezds"/>
+        <w:numPr>
+          <w:ilvl w:val="0"/>
+          <w:numId w:val="2"/>
+        </w:numPr>
+        <w:rPr>
+          <w:rFonts w:ascii="Times New Roman" w:eastAsia="Times New Roman" w:hAnsi="Times New Roman" w:cs="Times New Roman"/>
+          <w:sz w:val="36"/>
+          <w:szCs w:val="36"/>
+        </w:rPr>
+      </w:pPr>
+      <w:r>
+        <w:rPr>
+          <w:rFonts w:ascii="Times New Roman" w:eastAsia="Times New Roman" w:hAnsi="Times New Roman" w:cs="Times New Roman"/>
+          <w:sz w:val="36"/>
+          <w:szCs w:val="36"/>
+        </w:rPr>
+        <w:t>nézetek fájljainak létrehozása</w:t>
+      </w:r>
+    </w:p>
+    <w:p>
+      <w:pPr>
+        <w:pStyle w:val="Listaszerbekezds"/>
+        <w:numPr>
+          <w:ilvl w:val="0"/>
+          <w:numId w:val="2"/>
+        </w:numPr>
+        <w:rPr>
+          <w:rFonts w:ascii="Times New Roman" w:eastAsia="Times New Roman" w:hAnsi="Times New Roman" w:cs="Times New Roman"/>
+          <w:sz w:val="36"/>
+          <w:szCs w:val="36"/>
+        </w:rPr>
+      </w:pPr>
+      <w:r>
+        <w:rPr>
+          <w:rFonts w:ascii="Times New Roman" w:eastAsia="Times New Roman" w:hAnsi="Times New Roman" w:cs="Times New Roman"/>
+          <w:sz w:val="36"/>
+          <w:szCs w:val="36"/>
+        </w:rPr>
+        <w:t>route-ok definiálása</w:t>
+      </w:r>
+    </w:p>
+    <w:p>
+      <w:pPr>
+        <w:pStyle w:val="Listaszerbekezds"/>
+        <w:numPr>
+          <w:ilvl w:val="0"/>
+          <w:numId w:val="2"/>
+        </w:numPr>
+        <w:rPr>
+          <w:rFonts w:ascii="Times New Roman" w:eastAsia="Times New Roman" w:hAnsi="Times New Roman" w:cs="Times New Roman"/>
+          <w:sz w:val="36"/>
+          <w:szCs w:val="36"/>
+        </w:rPr>
+      </w:pPr>
+      <w:r>
+        <w:rPr>
+          <w:rFonts w:ascii="Times New Roman" w:eastAsia="Times New Roman" w:hAnsi="Times New Roman" w:cs="Times New Roman"/>
+          <w:sz w:val="36"/>
+          <w:szCs w:val="36"/>
+        </w:rPr>
+        <w:t>header és footer</w:t>
+      </w:r>
+      <w:r>
+        <w:rPr>
+          <w:rFonts w:ascii="Times New Roman" w:eastAsia="Times New Roman" w:hAnsi="Times New Roman" w:cs="Times New Roman"/>
+          <w:sz w:val="36"/>
+          <w:szCs w:val="36"/>
+        </w:rPr>
+        <w:t xml:space="preserve"> komponensek</w:t>
+      </w:r>
+      <w:r>
+        <w:rPr>
+          <w:rFonts w:ascii="Times New Roman" w:eastAsia="Times New Roman" w:hAnsi="Times New Roman" w:cs="Times New Roman"/>
+          <w:sz w:val="36"/>
+          <w:szCs w:val="36"/>
+        </w:rPr>
+        <w:t xml:space="preserve"> létrehozása</w:t>
+      </w:r>
+    </w:p>
+    <w:p>
+      <w:pPr>
+        <w:pStyle w:val="Listaszerbekezds"/>
+        <w:numPr>
+          <w:ilvl w:val="0"/>
+          <w:numId w:val="2"/>
+        </w:numPr>
+        <w:rPr>
+          <w:rFonts w:ascii="Times New Roman" w:eastAsia="Times New Roman" w:hAnsi="Times New Roman" w:cs="Times New Roman"/>
+          <w:sz w:val="36"/>
+          <w:szCs w:val="36"/>
+        </w:rPr>
+      </w:pPr>
+      <w:r>
+        <w:rPr>
+          <w:rFonts w:ascii="Times New Roman" w:eastAsia="Times New Roman" w:hAnsi="Times New Roman" w:cs="Times New Roman"/>
+          <w:sz w:val="36"/>
+          <w:szCs w:val="36"/>
+        </w:rPr>
+        <w:t>header-main-footer-struktúra létrehozása</w:t>
+      </w:r>
+    </w:p>
+    <w:p>
+      <w:pPr>
+        <w:pStyle w:val="Listaszerbekezds"/>
+        <w:numPr>
+          <w:ilvl w:val="0"/>
+          <w:numId w:val="2"/>
+        </w:numPr>
+        <w:rPr>
+          <w:rFonts w:ascii="Times New Roman" w:eastAsia="Times New Roman" w:hAnsi="Times New Roman" w:cs="Times New Roman"/>
+          <w:sz w:val="36"/>
+          <w:szCs w:val="36"/>
+        </w:rPr>
+      </w:pPr>
+      <w:r>
+        <w:rPr>
+          <w:rFonts w:ascii="Times New Roman" w:eastAsia="Times New Roman" w:hAnsi="Times New Roman" w:cs="Times New Roman"/>
+          <w:sz w:val="36"/>
+          <w:szCs w:val="36"/>
+        </w:rPr>
+        <w:t>bejelentkezési képernyő létrehozása</w:t>
+      </w:r>
+    </w:p>
+    <w:p>
+      <w:pPr>
+        <w:rPr>
+          <w:rFonts w:ascii="Times New Roman" w:eastAsia="Times New Roman" w:hAnsi="Times New Roman" w:cs="Times New Roman"/>
+          <w:sz w:val="36"/>
+          <w:szCs w:val="36"/>
+        </w:rPr>
+      </w:pPr>
+      <w:r>
+        <w:rPr>
+          <w:rFonts w:ascii="Times New Roman" w:eastAsia="Times New Roman" w:hAnsi="Times New Roman" w:cs="Times New Roman"/>
+          <w:sz w:val="36"/>
+          <w:szCs w:val="36"/>
+        </w:rPr>
+        <w:t>A projektet El-Nabulsy Csongor hozta létre és írta meg a kódját, a működéshez szükséges folyamatábrákat, az adatbázis ER-diagramját</w:t>
+      </w:r>
+      <w:r>
+        <w:rPr>
+          <w:rFonts w:ascii="Times New Roman" w:eastAsia="Times New Roman" w:hAnsi="Times New Roman" w:cs="Times New Roman"/>
+          <w:sz w:val="36"/>
+          <w:szCs w:val="36"/>
+        </w:rPr>
+        <w:t xml:space="preserve">, </w:t>
+      </w:r>
+      <w:r>
+        <w:rPr>
+          <w:rFonts w:ascii="Times New Roman" w:eastAsia="Times New Roman" w:hAnsi="Times New Roman" w:cs="Times New Roman"/>
+          <w:sz w:val="36"/>
+          <w:szCs w:val="36"/>
+        </w:rPr>
+        <w:t>nézetek tervét Susán Csongor hozta létre.</w:t>
+      </w:r>
+    </w:p>
     <w:sectPr>
       <w:pgSz w:w="11906" w:h="16838"/>
       <w:pgMar w:top="1417" w:right="1417" w:bottom="1417" w:left="1417" w:header="708" w:footer="708" w:gutter="0"/>
@@ -2202,16 +2430,16 @@
 <file path=word/numbering.xml><?xml version="1.0" encoding="utf-8"?>
 <w:numbering xmlns:wpc="http://schemas.microsoft.com/office/word/2010/wordprocessingCanvas" xmlns:cx="http://schemas.microsoft.com/office/drawing/2014/chartex" xmlns:cx1="http://schemas.microsoft.com/office/drawing/2015/9/8/chartex" xmlns:cx2="http://schemas.microsoft.com/office/drawing/2015/10/21/chartex" xmlns:cx3="http://schemas.microsoft.com/office/drawing/2016/5/9/chartex" xmlns:cx4="http://schemas.microsoft.com/office/drawing/2016/5/10/chartex" xmlns:cx5="http://schemas.microsoft.com/office/drawing/2016/5/11/chartex" xmlns:cx6="http://schemas.microsoft.com/office/drawing/2016/5/12/chartex" xmlns:cx7="http://schemas.microsoft.com/office/drawing/2016/5/13/chartex" xmlns:cx8="http://schemas.microsoft.com/office/drawing/2016/5/14/chartex" xmlns:mc="http://schemas.openxmlformats.org/markup-compatibility/2006" xmlns:aink="http://schemas.microsoft.com/office/drawing/2016/ink" xmlns:am3d="http://schemas.microsoft.com/office/drawing/2017/model3d" xmlns:o="urn:schemas-microsoft-com:office:office" xmlns:oel="http://schemas.microsoft.com/office/2019/extlst" xmlns:r="http://schemas.openxmlformats.org/officeDocument/2006/relationships" xmlns:m="http://schemas.openxmlformats.org/officeDocument/2006/math" xmlns:v="urn:schemas-microsoft-com:vml" xmlns:wp14="http://schemas.microsoft.com/office/word/2010/wordprocessingDrawing" xmlns:wp="http://schemas.openxmlformats.org/drawingml/2006/wordprocessingDrawing" xmlns:w10="urn:schemas-microsoft-com:office:word" xmlns:w="http://schemas.openxmlformats.org/wordprocessingml/2006/main" xmlns:w14="http://schemas.microsoft.com/office/word/2010/wordml" xmlns:w15="http://schemas.microsoft.com/office/word/2012/wordml" xmlns:w16cex="http://schemas.microsoft.com/office/word/2018/wordml/cex" xmlns:w16cid="http://schemas.microsoft.com/office/word/2016/wordml/cid" xmlns:w16="http://schemas.microsoft.com/office/word/2018/wordml" xmlns:w16du="http://schemas.microsoft.com/office/word/2023/wordml/word16du" xmlns:w16sdtdh="http://schemas.microsoft.com/office/word/2020/wordml/sdtdatahash" xmlns:w16sdtfl="http://schemas.microsoft.com/office/word/2024/wordml/sdtformatlock" xmlns:w16se="http://schemas.microsoft.com/office/word/2015/wordml/symex" xmlns:wpg="http://schemas.microsoft.com/office/word/2010/wordprocessingGroup" xmlns:wpi="http://schemas.microsoft.com/office/word/2010/wordprocessingInk" xmlns:wne="http://schemas.microsoft.com/office/word/2006/wordml" xmlns:wps="http://schemas.microsoft.com/office/word/2010/wordprocessingShape" mc:Ignorable="w14 w15 w16se w16cid w16 w16cex w16sdtdh w16sdtfl w16du wp14">
   <w:abstractNum w:abstractNumId="0" w15:restartNumberingAfterBreak="0">
-    <w:nsid w:val="7EB672F7"/>
+    <w:nsid w:val="6E7312B6"/>
     <w:multiLevelType w:val="hybridMultilevel"/>
-    <w:tmpl w:val="A6F0C99C"/>
+    <w:tmpl w:val="FD80BAFC"/>
     <w:lvl w:ilvl="0" w:tplc="040E0001">
       <w:start w:val="1"/>
       <w:numFmt w:val="bullet"/>
       <w:lvlText w:val=""/>
       <w:lvlJc w:val="left"/>
       <w:pPr>
-        <w:ind w:left="720" w:hanging="360"/>
+        <w:ind w:left="816" w:hanging="360"/>
       </w:pPr>
       <w:rPr>
         <w:rFonts w:ascii="Symbol" w:hAnsi="Symbol" w:hint="default"/>
@@ -2223,7 +2451,7 @@
       <w:lvlText w:val="o"/>
       <w:lvlJc w:val="left"/>
       <w:pPr>
-        <w:ind w:left="1440" w:hanging="360"/>
+        <w:ind w:left="1536" w:hanging="360"/>
       </w:pPr>
       <w:rPr>
         <w:rFonts w:ascii="Courier New" w:hAnsi="Courier New" w:cs="Courier New" w:hint="default"/>
@@ -2235,7 +2463,7 @@
       <w:lvlText w:val=""/>
       <w:lvlJc w:val="left"/>
       <w:pPr>
-        <w:ind w:left="2160" w:hanging="360"/>
+        <w:ind w:left="2256" w:hanging="360"/>
       </w:pPr>
       <w:rPr>
         <w:rFonts w:ascii="Wingdings" w:hAnsi="Wingdings" w:hint="default"/>
@@ -2247,7 +2475,7 @@
       <w:lvlText w:val=""/>
       <w:lvlJc w:val="left"/>
       <w:pPr>
-        <w:ind w:left="2880" w:hanging="360"/>
+        <w:ind w:left="2976" w:hanging="360"/>
       </w:pPr>
       <w:rPr>
         <w:rFonts w:ascii="Symbol" w:hAnsi="Symbol" w:hint="default"/>
@@ -2259,7 +2487,7 @@
       <w:lvlText w:val="o"/>
       <w:lvlJc w:val="left"/>
       <w:pPr>
-        <w:ind w:left="3600" w:hanging="360"/>
+        <w:ind w:left="3696" w:hanging="360"/>
       </w:pPr>
       <w:rPr>
         <w:rFonts w:ascii="Courier New" w:hAnsi="Courier New" w:cs="Courier New" w:hint="default"/>
@@ -2271,7 +2499,7 @@
       <w:lvlText w:val=""/>
       <w:lvlJc w:val="left"/>
       <w:pPr>
-        <w:ind w:left="4320" w:hanging="360"/>
+        <w:ind w:left="4416" w:hanging="360"/>
       </w:pPr>
       <w:rPr>
         <w:rFonts w:ascii="Wingdings" w:hAnsi="Wingdings" w:hint="default"/>
@@ -2283,7 +2511,7 @@
       <w:lvlText w:val=""/>
       <w:lvlJc w:val="left"/>
       <w:pPr>
-        <w:ind w:left="5040" w:hanging="360"/>
+        <w:ind w:left="5136" w:hanging="360"/>
       </w:pPr>
       <w:rPr>
         <w:rFonts w:ascii="Symbol" w:hAnsi="Symbol" w:hint="default"/>
@@ -2295,7 +2523,7 @@
       <w:lvlText w:val="o"/>
       <w:lvlJc w:val="left"/>
       <w:pPr>
-        <w:ind w:left="5760" w:hanging="360"/>
+        <w:ind w:left="5856" w:hanging="360"/>
       </w:pPr>
       <w:rPr>
         <w:rFonts w:ascii="Courier New" w:hAnsi="Courier New" w:cs="Courier New" w:hint="default"/>
@@ -2307,6 +2535,119 @@
       <w:lvlText w:val=""/>
       <w:lvlJc w:val="left"/>
       <w:pPr>
+        <w:ind w:left="6576" w:hanging="360"/>
+      </w:pPr>
+      <w:rPr>
+        <w:rFonts w:ascii="Wingdings" w:hAnsi="Wingdings" w:hint="default"/>
+      </w:rPr>
+    </w:lvl>
+  </w:abstractNum>
+  <w:abstractNum w:abstractNumId="1" w15:restartNumberingAfterBreak="0">
+    <w:nsid w:val="7EB672F7"/>
+    <w:multiLevelType w:val="hybridMultilevel"/>
+    <w:tmpl w:val="A6F0C99C"/>
+    <w:lvl w:ilvl="0" w:tplc="040E0001">
+      <w:start w:val="1"/>
+      <w:numFmt w:val="bullet"/>
+      <w:lvlText w:val=""/>
+      <w:lvlJc w:val="left"/>
+      <w:pPr>
+        <w:ind w:left="720" w:hanging="360"/>
+      </w:pPr>
+      <w:rPr>
+        <w:rFonts w:ascii="Symbol" w:hAnsi="Symbol" w:hint="default"/>
+      </w:rPr>
+    </w:lvl>
+    <w:lvl w:ilvl="1" w:tplc="040E0003" w:tentative="1">
+      <w:start w:val="1"/>
+      <w:numFmt w:val="bullet"/>
+      <w:lvlText w:val="o"/>
+      <w:lvlJc w:val="left"/>
+      <w:pPr>
+        <w:ind w:left="1440" w:hanging="360"/>
+      </w:pPr>
+      <w:rPr>
+        <w:rFonts w:ascii="Courier New" w:hAnsi="Courier New" w:cs="Courier New" w:hint="default"/>
+      </w:rPr>
+    </w:lvl>
+    <w:lvl w:ilvl="2" w:tplc="040E0005" w:tentative="1">
+      <w:start w:val="1"/>
+      <w:numFmt w:val="bullet"/>
+      <w:lvlText w:val=""/>
+      <w:lvlJc w:val="left"/>
+      <w:pPr>
+        <w:ind w:left="2160" w:hanging="360"/>
+      </w:pPr>
+      <w:rPr>
+        <w:rFonts w:ascii="Wingdings" w:hAnsi="Wingdings" w:hint="default"/>
+      </w:rPr>
+    </w:lvl>
+    <w:lvl w:ilvl="3" w:tplc="040E0001" w:tentative="1">
+      <w:start w:val="1"/>
+      <w:numFmt w:val="bullet"/>
+      <w:lvlText w:val=""/>
+      <w:lvlJc w:val="left"/>
+      <w:pPr>
+        <w:ind w:left="2880" w:hanging="360"/>
+      </w:pPr>
+      <w:rPr>
+        <w:rFonts w:ascii="Symbol" w:hAnsi="Symbol" w:hint="default"/>
+      </w:rPr>
+    </w:lvl>
+    <w:lvl w:ilvl="4" w:tplc="040E0003" w:tentative="1">
+      <w:start w:val="1"/>
+      <w:numFmt w:val="bullet"/>
+      <w:lvlText w:val="o"/>
+      <w:lvlJc w:val="left"/>
+      <w:pPr>
+        <w:ind w:left="3600" w:hanging="360"/>
+      </w:pPr>
+      <w:rPr>
+        <w:rFonts w:ascii="Courier New" w:hAnsi="Courier New" w:cs="Courier New" w:hint="default"/>
+      </w:rPr>
+    </w:lvl>
+    <w:lvl w:ilvl="5" w:tplc="040E0005" w:tentative="1">
+      <w:start w:val="1"/>
+      <w:numFmt w:val="bullet"/>
+      <w:lvlText w:val=""/>
+      <w:lvlJc w:val="left"/>
+      <w:pPr>
+        <w:ind w:left="4320" w:hanging="360"/>
+      </w:pPr>
+      <w:rPr>
+        <w:rFonts w:ascii="Wingdings" w:hAnsi="Wingdings" w:hint="default"/>
+      </w:rPr>
+    </w:lvl>
+    <w:lvl w:ilvl="6" w:tplc="040E0001" w:tentative="1">
+      <w:start w:val="1"/>
+      <w:numFmt w:val="bullet"/>
+      <w:lvlText w:val=""/>
+      <w:lvlJc w:val="left"/>
+      <w:pPr>
+        <w:ind w:left="5040" w:hanging="360"/>
+      </w:pPr>
+      <w:rPr>
+        <w:rFonts w:ascii="Symbol" w:hAnsi="Symbol" w:hint="default"/>
+      </w:rPr>
+    </w:lvl>
+    <w:lvl w:ilvl="7" w:tplc="040E0003" w:tentative="1">
+      <w:start w:val="1"/>
+      <w:numFmt w:val="bullet"/>
+      <w:lvlText w:val="o"/>
+      <w:lvlJc w:val="left"/>
+      <w:pPr>
+        <w:ind w:left="5760" w:hanging="360"/>
+      </w:pPr>
+      <w:rPr>
+        <w:rFonts w:ascii="Courier New" w:hAnsi="Courier New" w:cs="Courier New" w:hint="default"/>
+      </w:rPr>
+    </w:lvl>
+    <w:lvl w:ilvl="8" w:tplc="040E0005" w:tentative="1">
+      <w:start w:val="1"/>
+      <w:numFmt w:val="bullet"/>
+      <w:lvlText w:val=""/>
+      <w:lvlJc w:val="left"/>
+      <w:pPr>
         <w:ind w:left="6480" w:hanging="360"/>
       </w:pPr>
       <w:rPr>
@@ -2315,6 +2656,9 @@
     </w:lvl>
   </w:abstractNum>
   <w:num w:numId="1" w16cid:durableId="33770327">
+    <w:abstractNumId w:val="1"/>
+  </w:num>
+  <w:num w:numId="2" w16cid:durableId="565265875">
     <w:abstractNumId w:val="0"/>
   </w:num>
 </w:numbering>

</xml_diff>

<commit_message>
Updated documentation: making a view in the code of frontendPart
</commit_message>
<xml_diff>
--- a/documentation.docx
+++ b/documentation.docx
@@ -364,7 +364,7 @@
           <w:szCs w:val="36"/>
         </w:rPr>
         <w:drawing>
-          <wp:inline distT="0" distB="0" distL="0" distR="0" wp14:anchorId="32D48373" wp14:editId="1658D8FE">
+          <wp:inline distT="0" distB="0" distL="0" distR="0" wp14:anchorId="32D48373" wp14:editId="31A7DB75">
             <wp:extent cx="3289702" cy="2355850"/>
             <wp:effectExtent l="0" t="0" r="6350" b="6350"/>
             <wp:docPr id="322479566" name="Kép 8" descr="A képen szöveg, Papíráru, papír, kézírás látható&#10;&#10;Előfordulhat, hogy az AI által létrehozott tartalom helytelen."/>
@@ -1227,7 +1227,7 @@
           <w:szCs w:val="36"/>
         </w:rPr>
         <w:drawing>
-          <wp:inline distT="0" distB="0" distL="0" distR="0" wp14:anchorId="78A43544" wp14:editId="76578366">
+          <wp:inline distT="0" distB="0" distL="0" distR="0" wp14:anchorId="78A43544" wp14:editId="090F7929">
             <wp:extent cx="3166535" cy="1781175"/>
             <wp:effectExtent l="0" t="0" r="0" b="0"/>
             <wp:docPr id="3" name="Kép 3" descr="C:\Users\elnabulsy.csongor\AppData\Local\Microsoft\Windows\INetCache\Content.MSO\F75754B3.tmp"/>
@@ -1320,7 +1320,7 @@
         </w:rPr>
         <w:lastRenderedPageBreak/>
         <w:drawing>
-          <wp:inline distT="0" distB="0" distL="0" distR="0" wp14:anchorId="4E211814" wp14:editId="305CE204">
+          <wp:inline distT="0" distB="0" distL="0" distR="0" wp14:anchorId="4E211814" wp14:editId="20E4EAC6">
             <wp:extent cx="3133725" cy="1762720"/>
             <wp:effectExtent l="0" t="0" r="0" b="9525"/>
             <wp:docPr id="4" name="Kép 4" descr="C:\Users\elnabulsy.csongor\Downloads\ui_main_student.png"/>
@@ -1402,7 +1402,7 @@
           <w:szCs w:val="36"/>
         </w:rPr>
         <w:drawing>
-          <wp:inline distT="0" distB="0" distL="0" distR="0" wp14:anchorId="5137FB78" wp14:editId="774515A9">
+          <wp:inline distT="0" distB="0" distL="0" distR="0" wp14:anchorId="5137FB78" wp14:editId="2D5E9773">
             <wp:extent cx="3166110" cy="1780938"/>
             <wp:effectExtent l="0" t="0" r="0" b="0"/>
             <wp:docPr id="5" name="Kép 5" descr="C:\Users\elnabulsy.csongor\Downloads\ui_main_scheduler.png"/>
@@ -1494,7 +1494,7 @@
           <w:szCs w:val="36"/>
         </w:rPr>
         <w:drawing>
-          <wp:inline distT="0" distB="0" distL="0" distR="0" wp14:anchorId="27EC1C67" wp14:editId="7E64ACC6">
+          <wp:inline distT="0" distB="0" distL="0" distR="0" wp14:anchorId="27EC1C67" wp14:editId="71F05E4D">
             <wp:extent cx="3055620" cy="1718786"/>
             <wp:effectExtent l="0" t="0" r="0" b="0"/>
             <wp:docPr id="6" name="Kép 6" descr="C:\Users\elnabulsy.csongor\Downloads\ui_main_admin.png"/>
@@ -1576,7 +1576,7 @@
           <w:szCs w:val="36"/>
         </w:rPr>
         <w:drawing>
-          <wp:inline distT="0" distB="0" distL="0" distR="0" wp14:anchorId="08225B4F" wp14:editId="2069300A">
+          <wp:inline distT="0" distB="0" distL="0" distR="0" wp14:anchorId="08225B4F" wp14:editId="377A8295">
             <wp:extent cx="2933700" cy="1942430"/>
             <wp:effectExtent l="0" t="0" r="0" b="1270"/>
             <wp:docPr id="7" name="Kép 7" descr="C:\Users\elnabulsy.csongor\Downloads\ui_structure.png"/>
@@ -1750,7 +1750,7 @@
           <w:szCs w:val="36"/>
         </w:rPr>
         <w:drawing>
-          <wp:inline distT="0" distB="0" distL="0" distR="0" wp14:anchorId="2C256DB5" wp14:editId="00B7A608">
+          <wp:inline distT="0" distB="0" distL="0" distR="0" wp14:anchorId="2C256DB5" wp14:editId="0955B12B">
             <wp:extent cx="3329940" cy="1752493"/>
             <wp:effectExtent l="0" t="0" r="3810" b="635"/>
             <wp:docPr id="9" name="Kép 9"/>
@@ -2415,6 +2415,106 @@
           <w:szCs w:val="36"/>
         </w:rPr>
         <w:t>nézetek tervét Susán Csongor hozta létre.</w:t>
+      </w:r>
+    </w:p>
+    <w:p>
+      <w:pPr>
+        <w:rPr>
+          <w:rFonts w:ascii="Times New Roman" w:eastAsia="Times New Roman" w:hAnsi="Times New Roman" w:cs="Times New Roman"/>
+          <w:sz w:val="36"/>
+          <w:szCs w:val="36"/>
+        </w:rPr>
+      </w:pPr>
+    </w:p>
+    <w:p>
+      <w:pPr>
+        <w:rPr>
+          <w:rFonts w:ascii="Times New Roman" w:eastAsia="Times New Roman" w:hAnsi="Times New Roman" w:cs="Times New Roman"/>
+          <w:sz w:val="36"/>
+          <w:szCs w:val="36"/>
+        </w:rPr>
+      </w:pPr>
+      <w:r>
+        <w:rPr>
+          <w:rFonts w:ascii="Times New Roman" w:eastAsia="Times New Roman" w:hAnsi="Times New Roman" w:cs="Times New Roman"/>
+          <w:b/>
+          <w:bCs/>
+          <w:sz w:val="40"/>
+          <w:szCs w:val="40"/>
+        </w:rPr>
+        <w:t>2026-02-22 16:2</w:t>
+      </w:r>
+      <w:r>
+        <w:rPr>
+          <w:rFonts w:ascii="Times New Roman" w:eastAsia="Times New Roman" w:hAnsi="Times New Roman" w:cs="Times New Roman"/>
+          <w:b/>
+          <w:bCs/>
+          <w:sz w:val="40"/>
+          <w:szCs w:val="40"/>
+        </w:rPr>
+        <w:t>0</w:t>
+      </w:r>
+      <w:r>
+        <w:rPr>
+          <w:rFonts w:ascii="Times New Roman" w:eastAsia="Times New Roman" w:hAnsi="Times New Roman" w:cs="Times New Roman"/>
+          <w:b/>
+          <w:bCs/>
+          <w:sz w:val="40"/>
+          <w:szCs w:val="40"/>
+        </w:rPr>
+        <w:t>-</w:t>
+      </w:r>
+      <w:r>
+        <w:rPr>
+          <w:rFonts w:ascii="Times New Roman" w:eastAsia="Times New Roman" w:hAnsi="Times New Roman" w:cs="Times New Roman"/>
+          <w:b/>
+          <w:bCs/>
+          <w:sz w:val="40"/>
+          <w:szCs w:val="40"/>
+        </w:rPr>
+        <w:t>17:25</w:t>
+      </w:r>
+      <w:r>
+        <w:rPr>
+          <w:rFonts w:ascii="Times New Roman" w:eastAsia="Times New Roman" w:hAnsi="Times New Roman" w:cs="Times New Roman"/>
+          <w:b/>
+          <w:bCs/>
+          <w:sz w:val="40"/>
+          <w:szCs w:val="40"/>
+        </w:rPr>
+        <w:br/>
+      </w:r>
+      <w:r>
+        <w:rPr>
+          <w:rFonts w:ascii="Times New Roman" w:eastAsia="Times New Roman" w:hAnsi="Times New Roman" w:cs="Times New Roman"/>
+          <w:sz w:val="36"/>
+          <w:szCs w:val="36"/>
+        </w:rPr>
+        <w:t>(Susán Csongor) A frontendPart projekt átnézése, stílus hi</w:t>
+      </w:r>
+      <w:r>
+        <w:rPr>
+          <w:rFonts w:ascii="Times New Roman" w:eastAsia="Times New Roman" w:hAnsi="Times New Roman" w:cs="Times New Roman"/>
+          <w:sz w:val="36"/>
+          <w:szCs w:val="36"/>
+        </w:rPr>
+        <w:t>b</w:t>
+      </w:r>
+      <w:r>
+        <w:rPr>
+          <w:rFonts w:ascii="Times New Roman" w:eastAsia="Times New Roman" w:hAnsi="Times New Roman" w:cs="Times New Roman"/>
+          <w:sz w:val="36"/>
+          <w:szCs w:val="36"/>
+        </w:rPr>
+        <w:t>áinak kijavítása</w:t>
+      </w:r>
+      <w:r>
+        <w:rPr>
+          <w:rFonts w:ascii="Times New Roman" w:eastAsia="Times New Roman" w:hAnsi="Times New Roman" w:cs="Times New Roman"/>
+          <w:sz w:val="36"/>
+          <w:szCs w:val="36"/>
+        </w:rPr>
+        <w:t>, bejelentkezési képernyő a terv szerint való kialakításának megkezdése</w:t>
       </w:r>
     </w:p>
     <w:sectPr>

</xml_diff>

<commit_message>
Updated documentation: Writing prolouge for the application's purpose
</commit_message>
<xml_diff>
--- a/documentation.docx
+++ b/documentation.docx
@@ -68,7 +68,66 @@
           <w:sz w:val="40"/>
           <w:szCs w:val="40"/>
         </w:rPr>
-        <w:t xml:space="preserve"> Susán Csongor, El-Nabulsy Csongor Alan</w:t>
+        <w:t xml:space="preserve"> Susán Csongor, El-</w:t>
+      </w:r>
+      <w:proofErr w:type="spellStart"/>
+      <w:r>
+        <w:rPr>
+          <w:rFonts w:ascii="Times New Roman" w:hAnsi="Times New Roman" w:cs="Times New Roman"/>
+          <w:bCs/>
+          <w:sz w:val="40"/>
+          <w:szCs w:val="40"/>
+        </w:rPr>
+        <w:t>Nabulsy</w:t>
+      </w:r>
+      <w:proofErr w:type="spellEnd"/>
+      <w:r>
+        <w:rPr>
+          <w:rFonts w:ascii="Times New Roman" w:hAnsi="Times New Roman" w:cs="Times New Roman"/>
+          <w:bCs/>
+          <w:sz w:val="40"/>
+          <w:szCs w:val="40"/>
+        </w:rPr>
+        <w:t xml:space="preserve"> Csongor Alan</w:t>
+      </w:r>
+    </w:p>
+    <w:p>
+      <w:pPr>
+        <w:rPr>
+          <w:rFonts w:ascii="Times New Roman" w:hAnsi="Times New Roman" w:cs="Times New Roman"/>
+          <w:bCs/>
+          <w:sz w:val="40"/>
+          <w:szCs w:val="40"/>
+        </w:rPr>
+      </w:pPr>
+      <w:r>
+        <w:rPr>
+          <w:rFonts w:ascii="Times New Roman" w:hAnsi="Times New Roman" w:cs="Times New Roman"/>
+          <w:bCs/>
+          <w:sz w:val="40"/>
+          <w:szCs w:val="40"/>
+        </w:rPr>
+        <w:t>Az alkalmazás célja az, hogy a Bláthy-</w:t>
+      </w:r>
+      <w:proofErr w:type="spellStart"/>
+      <w:r>
+        <w:rPr>
+          <w:rFonts w:ascii="Times New Roman" w:hAnsi="Times New Roman" w:cs="Times New Roman"/>
+          <w:bCs/>
+          <w:sz w:val="40"/>
+          <w:szCs w:val="40"/>
+        </w:rPr>
+        <w:t>ba</w:t>
+      </w:r>
+      <w:proofErr w:type="spellEnd"/>
+      <w:r>
+        <w:rPr>
+          <w:rFonts w:ascii="Times New Roman" w:hAnsi="Times New Roman" w:cs="Times New Roman"/>
+          <w:bCs/>
+          <w:sz w:val="40"/>
+          <w:szCs w:val="40"/>
+        </w:rPr>
+        <w:t xml:space="preserve"> járó diákok előre meghatározott szünetekben kedvenc zenéjüket tudják majd hallgatni anélkül, hogy nekik kelljen azt maguknak vagy másoknak lejátszani. Ráadásul az, hogy az iskola az ő zenéjüket játssza, akár egy általuk kijelölt időpontban (ezt üzenetben írhatják le), még több élményt ad, és azt az érzést, hogy a zenéjük – és ezzel együtt önmaguk is – meg van becsülve.</w:t>
       </w:r>
     </w:p>
     <w:p>
@@ -166,16 +225,7 @@
     <w:p>
       <w:pPr>
         <w:pStyle w:val="Listaszerbekezds"/>
-        <w:rPr>
-          <w:rFonts w:ascii="Times New Roman" w:hAnsi="Times New Roman" w:cs="Times New Roman"/>
-          <w:sz w:val="36"/>
-          <w:szCs w:val="36"/>
-        </w:rPr>
-      </w:pPr>
-    </w:p>
-    <w:p>
-      <w:pPr>
-        <w:pStyle w:val="Listaszerbekezds"/>
+        <w:ind w:left="0"/>
         <w:rPr>
           <w:rFonts w:ascii="Times New Roman" w:hAnsi="Times New Roman" w:cs="Times New Roman"/>
           <w:sz w:val="36"/>
@@ -189,11 +239,12 @@
           <w:sz w:val="36"/>
           <w:szCs w:val="36"/>
         </w:rPr>
+        <w:lastRenderedPageBreak/>
         <w:drawing>
-          <wp:inline distT="0" distB="0" distL="0" distR="0" wp14:anchorId="241330C6" wp14:editId="6714E71C">
-            <wp:extent cx="1816100" cy="2464708"/>
-            <wp:effectExtent l="0" t="0" r="0" b="0"/>
-            <wp:docPr id="812525968" name="Kép 5" descr="A képen szöveg, rajz, kézírás, vázlat látható&#10;&#10;Előfordulhat, hogy az AI által létrehozott tartalom helytelen."/>
+          <wp:inline distT="0" distB="0" distL="0" distR="0" wp14:anchorId="5873D9FB" wp14:editId="19B12310">
+            <wp:extent cx="3021914" cy="2164080"/>
+            <wp:effectExtent l="0" t="0" r="7620" b="7620"/>
+            <wp:docPr id="322479566" name="Kép 8" descr="A képen szöveg, Papíráru, papír, kézírás látható&#10;&#10;Előfordulhat, hogy az AI által létrehozott tartalom helytelen."/>
             <wp:cNvGraphicFramePr>
               <a:graphicFrameLocks xmlns:a="http://schemas.openxmlformats.org/drawingml/2006/main" noChangeAspect="1"/>
             </wp:cNvGraphicFramePr>
@@ -201,7 +252,7 @@
               <a:graphicData uri="http://schemas.openxmlformats.org/drawingml/2006/picture">
                 <pic:pic xmlns:pic="http://schemas.openxmlformats.org/drawingml/2006/picture">
                   <pic:nvPicPr>
-                    <pic:cNvPr id="812525968" name="Kép 5" descr="A képen szöveg, rajz, kézírás, vázlat látható&#10;&#10;Előfordulhat, hogy az AI által létrehozott tartalom helytelen."/>
+                    <pic:cNvPr id="322479566" name="Kép 8" descr="A képen szöveg, Papíráru, papír, kézírás látható&#10;&#10;Előfordulhat, hogy az AI által létrehozott tartalom helytelen."/>
                     <pic:cNvPicPr/>
                   </pic:nvPicPr>
                   <pic:blipFill rotWithShape="1">
@@ -212,7 +263,7 @@
                         </a:ext>
                       </a:extLst>
                     </a:blip>
-                    <a:srcRect l="3528" t="6945" r="10053" b="5092"/>
+                    <a:srcRect l="6278" t="4709" r="2473" b="8163"/>
                     <a:stretch>
                       <a:fillRect/>
                     </a:stretch>
@@ -220,7 +271,7 @@
                   <pic:spPr bwMode="auto">
                     <a:xfrm>
                       <a:off x="0" y="0"/>
-                      <a:ext cx="1880190" cy="2551688"/>
+                      <a:ext cx="3121311" cy="2235261"/>
                     </a:xfrm>
                     <a:prstGeom prst="rect">
                       <a:avLst/>
@@ -248,9 +299,9 @@
           <w:szCs w:val="36"/>
         </w:rPr>
         <w:drawing>
-          <wp:inline distT="0" distB="0" distL="0" distR="0" wp14:anchorId="6E9F40C8" wp14:editId="05AD5EA7">
-            <wp:extent cx="2462902" cy="1903724"/>
-            <wp:effectExtent l="0" t="6033" r="7938" b="7937"/>
+          <wp:inline distT="0" distB="0" distL="0" distR="0" wp14:anchorId="6E9F40C8" wp14:editId="5323A656">
+            <wp:extent cx="1641919" cy="1269137"/>
+            <wp:effectExtent l="0" t="4127" r="0" b="0"/>
             <wp:docPr id="593948241" name="Kép 7" descr="A képen szöveg, vázlat, Papíráru, papír látható&#10;&#10;Előfordulhat, hogy az AI által létrehozott tartalom helytelen."/>
             <wp:cNvGraphicFramePr>
               <a:graphicFrameLocks xmlns:a="http://schemas.openxmlformats.org/drawingml/2006/main" noChangeAspect="1"/>
@@ -278,7 +329,7 @@
                   <pic:spPr bwMode="auto">
                     <a:xfrm rot="16200000">
                       <a:off x="0" y="0"/>
-                      <a:ext cx="2489798" cy="1924514"/>
+                      <a:ext cx="1667469" cy="1288886"/>
                     </a:xfrm>
                     <a:prstGeom prst="rect">
                       <a:avLst/>
@@ -364,10 +415,10 @@
           <w:szCs w:val="36"/>
         </w:rPr>
         <w:drawing>
-          <wp:inline distT="0" distB="0" distL="0" distR="0" wp14:anchorId="32D48373" wp14:editId="31A7DB75">
-            <wp:extent cx="3289702" cy="2355850"/>
-            <wp:effectExtent l="0" t="0" r="6350" b="6350"/>
-            <wp:docPr id="322479566" name="Kép 8" descr="A képen szöveg, Papíráru, papír, kézírás látható&#10;&#10;Előfordulhat, hogy az AI által létrehozott tartalom helytelen."/>
+          <wp:inline distT="0" distB="0" distL="0" distR="0" wp14:anchorId="6A5E5284" wp14:editId="452549E0">
+            <wp:extent cx="1653540" cy="2244091"/>
+            <wp:effectExtent l="0" t="0" r="3810" b="3810"/>
+            <wp:docPr id="812525968" name="Kép 5" descr="A képen szöveg, rajz, kézírás, vázlat látható&#10;&#10;Előfordulhat, hogy az AI által létrehozott tartalom helytelen."/>
             <wp:cNvGraphicFramePr>
               <a:graphicFrameLocks xmlns:a="http://schemas.openxmlformats.org/drawingml/2006/main" noChangeAspect="1"/>
             </wp:cNvGraphicFramePr>
@@ -375,7 +426,7 @@
               <a:graphicData uri="http://schemas.openxmlformats.org/drawingml/2006/picture">
                 <pic:pic xmlns:pic="http://schemas.openxmlformats.org/drawingml/2006/picture">
                   <pic:nvPicPr>
-                    <pic:cNvPr id="322479566" name="Kép 8" descr="A képen szöveg, Papíráru, papír, kézírás látható&#10;&#10;Előfordulhat, hogy az AI által létrehozott tartalom helytelen."/>
+                    <pic:cNvPr id="812525968" name="Kép 5" descr="A képen szöveg, rajz, kézírás, vázlat látható&#10;&#10;Előfordulhat, hogy az AI által létrehozott tartalom helytelen."/>
                     <pic:cNvPicPr/>
                   </pic:nvPicPr>
                   <pic:blipFill rotWithShape="1">
@@ -386,7 +437,7 @@
                         </a:ext>
                       </a:extLst>
                     </a:blip>
-                    <a:srcRect l="6278" t="4709" r="2473" b="8163"/>
+                    <a:srcRect l="3528" t="6945" r="10053" b="5092"/>
                     <a:stretch>
                       <a:fillRect/>
                     </a:stretch>
@@ -394,7 +445,7 @@
                   <pic:spPr bwMode="auto">
                     <a:xfrm>
                       <a:off x="0" y="0"/>
-                      <a:ext cx="3372080" cy="2414843"/>
+                      <a:ext cx="1719033" cy="2332974"/>
                     </a:xfrm>
                     <a:prstGeom prst="rect">
                       <a:avLst/>
@@ -478,9 +529,9 @@
           <w:szCs w:val="36"/>
         </w:rPr>
         <w:drawing>
-          <wp:inline distT="0" distB="0" distL="0" distR="0" wp14:anchorId="1FF1E0EB" wp14:editId="6209113C">
-            <wp:extent cx="5760720" cy="3253105"/>
-            <wp:effectExtent l="0" t="0" r="0" b="4445"/>
+          <wp:inline distT="0" distB="0" distL="0" distR="0" wp14:anchorId="1FF1E0EB" wp14:editId="55D41B39">
+            <wp:extent cx="4506923" cy="2545080"/>
+            <wp:effectExtent l="0" t="0" r="8255" b="7620"/>
             <wp:docPr id="1649091314" name="Kép 9" descr="A képen diagram, szöveg, sor, Tervrajz látható&#10;&#10;Előfordulhat, hogy az AI által létrehozott tartalom helytelen."/>
             <wp:cNvGraphicFramePr>
               <a:graphicFrameLocks xmlns:a="http://schemas.openxmlformats.org/drawingml/2006/main" noChangeAspect="1"/>
@@ -493,7 +544,7 @@
                     <pic:cNvPicPr/>
                   </pic:nvPicPr>
                   <pic:blipFill>
-                    <a:blip r:embed="rId9">
+                    <a:blip r:embed="rId9" cstate="print">
                       <a:extLst>
                         <a:ext uri="{28A0092B-C50C-407E-A947-70E740481C1C}">
                           <a14:useLocalDpi xmlns:a14="http://schemas.microsoft.com/office/drawing/2010/main" val="0"/>
@@ -507,7 +558,7 @@
                   <pic:spPr>
                     <a:xfrm>
                       <a:off x="0" y="0"/>
-                      <a:ext cx="5760720" cy="3253105"/>
+                      <a:ext cx="4509484" cy="2546526"/>
                     </a:xfrm>
                     <a:prstGeom prst="rect">
                       <a:avLst/>
@@ -547,6 +598,7 @@
           <w:sz w:val="40"/>
           <w:szCs w:val="40"/>
         </w:rPr>
+        <w:lastRenderedPageBreak/>
         <w:t>2026-02-04 10:50-12:35</w:t>
       </w:r>
       <w:r>
@@ -610,7 +662,6 @@
         <w:rPr>
           <w:noProof/>
         </w:rPr>
-        <w:lastRenderedPageBreak/>
         <w:drawing>
           <wp:inline distT="0" distB="0" distL="0" distR="0" wp14:anchorId="2E600196" wp14:editId="2BC3944E">
             <wp:extent cx="2428875" cy="1652107"/>
@@ -713,6 +764,7 @@
         <w:rPr>
           <w:noProof/>
         </w:rPr>
+        <w:lastRenderedPageBreak/>
         <w:drawing>
           <wp:inline distT="0" distB="0" distL="0" distR="0" wp14:anchorId="702AE4FB" wp14:editId="5FAFACD9">
             <wp:extent cx="5791200" cy="2494286"/>
@@ -818,7 +870,6 @@
           <w:sz w:val="36"/>
           <w:szCs w:val="36"/>
         </w:rPr>
-        <w:lastRenderedPageBreak/>
         <w:t>A Dia program (</w:t>
       </w:r>
       <w:hyperlink r:id="rId14">
@@ -1045,6 +1096,7 @@
           <w:sz w:val="40"/>
           <w:szCs w:val="36"/>
         </w:rPr>
+        <w:lastRenderedPageBreak/>
         <w:t>2026-02-17 11:10-</w:t>
       </w:r>
       <w:r>
@@ -1227,7 +1279,7 @@
           <w:szCs w:val="36"/>
         </w:rPr>
         <w:drawing>
-          <wp:inline distT="0" distB="0" distL="0" distR="0" wp14:anchorId="78A43544" wp14:editId="090F7929">
+          <wp:inline distT="0" distB="0" distL="0" distR="0" wp14:anchorId="78A43544" wp14:editId="2C213B54">
             <wp:extent cx="3166535" cy="1781175"/>
             <wp:effectExtent l="0" t="0" r="0" b="0"/>
             <wp:docPr id="3" name="Kép 3" descr="C:\Users\elnabulsy.csongor\AppData\Local\Microsoft\Windows\INetCache\Content.MSO\F75754B3.tmp"/>
@@ -1318,9 +1370,8 @@
           <w:sz w:val="36"/>
           <w:szCs w:val="36"/>
         </w:rPr>
-        <w:lastRenderedPageBreak/>
         <w:drawing>
-          <wp:inline distT="0" distB="0" distL="0" distR="0" wp14:anchorId="4E211814" wp14:editId="20E4EAC6">
+          <wp:inline distT="0" distB="0" distL="0" distR="0" wp14:anchorId="4E211814" wp14:editId="076E4387">
             <wp:extent cx="3133725" cy="1762720"/>
             <wp:effectExtent l="0" t="0" r="0" b="9525"/>
             <wp:docPr id="4" name="Kép 4" descr="C:\Users\elnabulsy.csongor\Downloads\ui_main_student.png"/>
@@ -1402,7 +1453,7 @@
           <w:szCs w:val="36"/>
         </w:rPr>
         <w:drawing>
-          <wp:inline distT="0" distB="0" distL="0" distR="0" wp14:anchorId="5137FB78" wp14:editId="2D5E9773">
+          <wp:inline distT="0" distB="0" distL="0" distR="0" wp14:anchorId="5137FB78" wp14:editId="7584EC68">
             <wp:extent cx="3166110" cy="1780938"/>
             <wp:effectExtent l="0" t="0" r="0" b="0"/>
             <wp:docPr id="5" name="Kép 5" descr="C:\Users\elnabulsy.csongor\Downloads\ui_main_scheduler.png"/>
@@ -1484,6 +1535,7 @@
           <w:lang w:eastAsia="hu-HU"/>
           <w14:ligatures w14:val="none"/>
         </w:rPr>
+        <w:lastRenderedPageBreak/>
         <w:t xml:space="preserve"> </w:t>
       </w:r>
       <w:r>
@@ -1494,7 +1546,7 @@
           <w:szCs w:val="36"/>
         </w:rPr>
         <w:drawing>
-          <wp:inline distT="0" distB="0" distL="0" distR="0" wp14:anchorId="27EC1C67" wp14:editId="71F05E4D">
+          <wp:inline distT="0" distB="0" distL="0" distR="0" wp14:anchorId="27EC1C67" wp14:editId="5B80C14F">
             <wp:extent cx="3055620" cy="1718786"/>
             <wp:effectExtent l="0" t="0" r="0" b="0"/>
             <wp:docPr id="6" name="Kép 6" descr="C:\Users\elnabulsy.csongor\Downloads\ui_main_admin.png"/>
@@ -1576,7 +1628,7 @@
           <w:szCs w:val="36"/>
         </w:rPr>
         <w:drawing>
-          <wp:inline distT="0" distB="0" distL="0" distR="0" wp14:anchorId="08225B4F" wp14:editId="377A8295">
+          <wp:inline distT="0" distB="0" distL="0" distR="0" wp14:anchorId="08225B4F" wp14:editId="26927434">
             <wp:extent cx="2933700" cy="1942430"/>
             <wp:effectExtent l="0" t="0" r="0" b="1270"/>
             <wp:docPr id="7" name="Kép 7" descr="C:\Users\elnabulsy.csongor\Downloads\ui_structure.png"/>
@@ -1639,7 +1691,6 @@
           <w:sz w:val="36"/>
           <w:szCs w:val="36"/>
         </w:rPr>
-        <w:lastRenderedPageBreak/>
         <w:t>Bejelentkezési képernyő</w:t>
       </w:r>
       <w:r>
@@ -1750,7 +1801,7 @@
           <w:szCs w:val="36"/>
         </w:rPr>
         <w:drawing>
-          <wp:inline distT="0" distB="0" distL="0" distR="0" wp14:anchorId="2C256DB5" wp14:editId="0955B12B">
+          <wp:inline distT="0" distB="0" distL="0" distR="0" wp14:anchorId="2C256DB5" wp14:editId="0F7F6D58">
             <wp:extent cx="3329940" cy="1752493"/>
             <wp:effectExtent l="0" t="0" r="3810" b="635"/>
             <wp:docPr id="9" name="Kép 9"/>
@@ -1810,6 +1861,7 @@
           <w:sz w:val="36"/>
           <w:szCs w:val="36"/>
         </w:rPr>
+        <w:lastRenderedPageBreak/>
         <w:t>Bekérési oldal:</w:t>
       </w:r>
     </w:p>
@@ -1920,15 +1972,15 @@
           <w:sz w:val="36"/>
           <w:szCs w:val="36"/>
         </w:rPr>
-        <w:t>Az admin UI oldal megtervezése digitális úton</w:t>
-      </w:r>
-      <w:r>
-        <w:rPr>
-          <w:rFonts w:ascii="Times New Roman" w:eastAsia="Times New Roman" w:hAnsi="Times New Roman" w:cs="Times New Roman"/>
-          <w:sz w:val="36"/>
-          <w:szCs w:val="36"/>
-        </w:rPr>
-        <w:t xml:space="preserve">, </w:t>
+        <w:t xml:space="preserve">Az admin UI oldal megtervezése digitális </w:t>
+      </w:r>
+      <w:r>
+        <w:rPr>
+          <w:rFonts w:ascii="Times New Roman" w:eastAsia="Times New Roman" w:hAnsi="Times New Roman" w:cs="Times New Roman"/>
+          <w:sz w:val="36"/>
+          <w:szCs w:val="36"/>
+        </w:rPr>
+        <w:t>úton,</w:t>
       </w:r>
     </w:p>
     <w:p>
@@ -2165,15 +2217,6 @@
     <w:p>
       <w:pPr>
         <w:rPr>
-          <w:rFonts w:eastAsia="Times New Roman"/>
-          <w:sz w:val="36"/>
-          <w:szCs w:val="36"/>
-        </w:rPr>
-      </w:pPr>
-    </w:p>
-    <w:p>
-      <w:pPr>
-        <w:rPr>
           <w:rFonts w:ascii="Times New Roman" w:eastAsia="Times New Roman" w:hAnsi="Times New Roman" w:cs="Times New Roman"/>
           <w:sz w:val="36"/>
           <w:szCs w:val="36"/>
@@ -2442,6 +2485,7 @@
           <w:sz w:val="40"/>
           <w:szCs w:val="40"/>
         </w:rPr>
+        <w:lastRenderedPageBreak/>
         <w:t>2026-02-22 16:2</w:t>
       </w:r>
       <w:r>
@@ -2515,6 +2559,52 @@
           <w:szCs w:val="36"/>
         </w:rPr>
         <w:t>, bejelentkezési képernyő a terv szerint való kialakításának megkezdése</w:t>
+      </w:r>
+    </w:p>
+    <w:p>
+      <w:pPr>
+        <w:rPr>
+          <w:rFonts w:ascii="Times New Roman" w:eastAsia="Times New Roman" w:hAnsi="Times New Roman" w:cs="Times New Roman"/>
+          <w:sz w:val="36"/>
+          <w:szCs w:val="36"/>
+        </w:rPr>
+      </w:pPr>
+    </w:p>
+    <w:p>
+      <w:pPr>
+        <w:rPr>
+          <w:rFonts w:ascii="Times New Roman" w:eastAsia="Times New Roman" w:hAnsi="Times New Roman" w:cs="Times New Roman"/>
+          <w:sz w:val="36"/>
+          <w:szCs w:val="36"/>
+        </w:rPr>
+      </w:pPr>
+      <w:r>
+        <w:rPr>
+          <w:rFonts w:ascii="Times New Roman" w:eastAsia="Times New Roman" w:hAnsi="Times New Roman" w:cs="Times New Roman"/>
+          <w:b/>
+          <w:bCs/>
+          <w:sz w:val="40"/>
+          <w:szCs w:val="40"/>
+        </w:rPr>
+        <w:t>2026-02-25 11:55-13:00</w:t>
+      </w:r>
+      <w:r>
+        <w:rPr>
+          <w:rFonts w:ascii="Times New Roman" w:eastAsia="Times New Roman" w:hAnsi="Times New Roman" w:cs="Times New Roman"/>
+          <w:b/>
+          <w:bCs/>
+          <w:sz w:val="40"/>
+          <w:szCs w:val="40"/>
+        </w:rPr>
+        <w:br/>
+      </w:r>
+      <w:r>
+        <w:rPr>
+          <w:rFonts w:ascii="Times New Roman" w:eastAsia="Times New Roman" w:hAnsi="Times New Roman" w:cs="Times New Roman"/>
+          <w:sz w:val="36"/>
+          <w:szCs w:val="36"/>
+        </w:rPr>
+        <w:t>(Susán Csongor) A dokumentáció elejére az alkalmazás céljának leírása.</w:t>
       </w:r>
     </w:p>
     <w:sectPr>

</xml_diff>

<commit_message>
Making views (login, home, admin) and writing this to documentation
</commit_message>
<xml_diff>
--- a/documentation.docx
+++ b/documentation.docx
@@ -68,66 +68,26 @@
           <w:sz w:val="40"/>
           <w:szCs w:val="40"/>
         </w:rPr>
-        <w:t xml:space="preserve"> Susán Csongor, El-</w:t>
-      </w:r>
-      <w:proofErr w:type="spellStart"/>
-      <w:r>
-        <w:rPr>
-          <w:rFonts w:ascii="Times New Roman" w:hAnsi="Times New Roman" w:cs="Times New Roman"/>
-          <w:bCs/>
-          <w:sz w:val="40"/>
-          <w:szCs w:val="40"/>
-        </w:rPr>
-        <w:t>Nabulsy</w:t>
-      </w:r>
-      <w:proofErr w:type="spellEnd"/>
-      <w:r>
-        <w:rPr>
-          <w:rFonts w:ascii="Times New Roman" w:hAnsi="Times New Roman" w:cs="Times New Roman"/>
-          <w:bCs/>
-          <w:sz w:val="40"/>
-          <w:szCs w:val="40"/>
-        </w:rPr>
-        <w:t xml:space="preserve"> Csongor Alan</w:t>
-      </w:r>
-    </w:p>
-    <w:p>
-      <w:pPr>
-        <w:rPr>
-          <w:rFonts w:ascii="Times New Roman" w:hAnsi="Times New Roman" w:cs="Times New Roman"/>
-          <w:bCs/>
-          <w:sz w:val="40"/>
-          <w:szCs w:val="40"/>
-        </w:rPr>
-      </w:pPr>
-      <w:r>
-        <w:rPr>
-          <w:rFonts w:ascii="Times New Roman" w:hAnsi="Times New Roman" w:cs="Times New Roman"/>
-          <w:bCs/>
-          <w:sz w:val="40"/>
-          <w:szCs w:val="40"/>
-        </w:rPr>
-        <w:t>Az alkalmazás célja az, hogy a Bláthy-</w:t>
-      </w:r>
-      <w:proofErr w:type="spellStart"/>
-      <w:r>
-        <w:rPr>
-          <w:rFonts w:ascii="Times New Roman" w:hAnsi="Times New Roman" w:cs="Times New Roman"/>
-          <w:bCs/>
-          <w:sz w:val="40"/>
-          <w:szCs w:val="40"/>
-        </w:rPr>
-        <w:t>ba</w:t>
-      </w:r>
-      <w:proofErr w:type="spellEnd"/>
-      <w:r>
-        <w:rPr>
-          <w:rFonts w:ascii="Times New Roman" w:hAnsi="Times New Roman" w:cs="Times New Roman"/>
-          <w:bCs/>
-          <w:sz w:val="40"/>
-          <w:szCs w:val="40"/>
-        </w:rPr>
-        <w:t xml:space="preserve"> járó diákok előre meghatározott szünetekben kedvenc zenéjüket tudják majd hallgatni anélkül, hogy nekik kelljen azt maguknak vagy másoknak lejátszani. Ráadásul az, hogy az iskola az ő zenéjüket játssza, akár egy általuk kijelölt időpontban (ezt üzenetben írhatják le), még több élményt ad, és azt az érzést, hogy a zenéjük – és ezzel együtt önmaguk is – meg van becsülve.</w:t>
+        <w:t xml:space="preserve"> Susán Csongor, El-Nabulsy Csongor Alan</w:t>
+      </w:r>
+    </w:p>
+    <w:p>
+      <w:pPr>
+        <w:rPr>
+          <w:rFonts w:ascii="Times New Roman" w:hAnsi="Times New Roman" w:cs="Times New Roman"/>
+          <w:bCs/>
+          <w:sz w:val="40"/>
+          <w:szCs w:val="40"/>
+        </w:rPr>
+      </w:pPr>
+      <w:r>
+        <w:rPr>
+          <w:rFonts w:ascii="Times New Roman" w:hAnsi="Times New Roman" w:cs="Times New Roman"/>
+          <w:bCs/>
+          <w:sz w:val="40"/>
+          <w:szCs w:val="40"/>
+        </w:rPr>
+        <w:t>Az alkalmazás célja az, hogy a Bláthy-ba járó diákok előre meghatározott szünetekben kedvenc zenéjüket tudják majd hallgatni anélkül, hogy nekik kelljen azt maguknak vagy másoknak lejátszani. Ráadásul az, hogy az iskola az ő zenéjüket játssza, akár egy általuk kijelölt időpontban (ezt üzenetben írhatják le), még több élményt ad, és azt az érzést, hogy a zenéjük – és ezzel együtt önmaguk is – meg van becsülve.</w:t>
       </w:r>
     </w:p>
     <w:p>
@@ -299,7 +259,7 @@
           <w:szCs w:val="36"/>
         </w:rPr>
         <w:drawing>
-          <wp:inline distT="0" distB="0" distL="0" distR="0" wp14:anchorId="6E9F40C8" wp14:editId="5323A656">
+          <wp:inline distT="0" distB="0" distL="0" distR="0" wp14:anchorId="6E9F40C8" wp14:editId="01A1B2C2">
             <wp:extent cx="1641919" cy="1269137"/>
             <wp:effectExtent l="0" t="4127" r="0" b="0"/>
             <wp:docPr id="593948241" name="Kép 7" descr="A képen szöveg, vázlat, Papíráru, papír látható&#10;&#10;Előfordulhat, hogy az AI által létrehozott tartalom helytelen."/>
@@ -1279,7 +1239,7 @@
           <w:szCs w:val="36"/>
         </w:rPr>
         <w:drawing>
-          <wp:inline distT="0" distB="0" distL="0" distR="0" wp14:anchorId="78A43544" wp14:editId="2C213B54">
+          <wp:inline distT="0" distB="0" distL="0" distR="0" wp14:anchorId="78A43544" wp14:editId="18975B99">
             <wp:extent cx="3166535" cy="1781175"/>
             <wp:effectExtent l="0" t="0" r="0" b="0"/>
             <wp:docPr id="3" name="Kép 3" descr="C:\Users\elnabulsy.csongor\AppData\Local\Microsoft\Windows\INetCache\Content.MSO\F75754B3.tmp"/>
@@ -1371,7 +1331,7 @@
           <w:szCs w:val="36"/>
         </w:rPr>
         <w:drawing>
-          <wp:inline distT="0" distB="0" distL="0" distR="0" wp14:anchorId="4E211814" wp14:editId="076E4387">
+          <wp:inline distT="0" distB="0" distL="0" distR="0" wp14:anchorId="4E211814" wp14:editId="79A06032">
             <wp:extent cx="3133725" cy="1762720"/>
             <wp:effectExtent l="0" t="0" r="0" b="9525"/>
             <wp:docPr id="4" name="Kép 4" descr="C:\Users\elnabulsy.csongor\Downloads\ui_main_student.png"/>
@@ -1453,7 +1413,7 @@
           <w:szCs w:val="36"/>
         </w:rPr>
         <w:drawing>
-          <wp:inline distT="0" distB="0" distL="0" distR="0" wp14:anchorId="5137FB78" wp14:editId="7584EC68">
+          <wp:inline distT="0" distB="0" distL="0" distR="0" wp14:anchorId="5137FB78" wp14:editId="2CD4C543">
             <wp:extent cx="3166110" cy="1780938"/>
             <wp:effectExtent l="0" t="0" r="0" b="0"/>
             <wp:docPr id="5" name="Kép 5" descr="C:\Users\elnabulsy.csongor\Downloads\ui_main_scheduler.png"/>
@@ -1546,7 +1506,7 @@
           <w:szCs w:val="36"/>
         </w:rPr>
         <w:drawing>
-          <wp:inline distT="0" distB="0" distL="0" distR="0" wp14:anchorId="27EC1C67" wp14:editId="5B80C14F">
+          <wp:inline distT="0" distB="0" distL="0" distR="0" wp14:anchorId="27EC1C67" wp14:editId="0B789ABC">
             <wp:extent cx="3055620" cy="1718786"/>
             <wp:effectExtent l="0" t="0" r="0" b="0"/>
             <wp:docPr id="6" name="Kép 6" descr="C:\Users\elnabulsy.csongor\Downloads\ui_main_admin.png"/>
@@ -1628,7 +1588,7 @@
           <w:szCs w:val="36"/>
         </w:rPr>
         <w:drawing>
-          <wp:inline distT="0" distB="0" distL="0" distR="0" wp14:anchorId="08225B4F" wp14:editId="26927434">
+          <wp:inline distT="0" distB="0" distL="0" distR="0" wp14:anchorId="08225B4F" wp14:editId="1987D810">
             <wp:extent cx="2933700" cy="1942430"/>
             <wp:effectExtent l="0" t="0" r="0" b="1270"/>
             <wp:docPr id="7" name="Kép 7" descr="C:\Users\elnabulsy.csongor\Downloads\ui_structure.png"/>
@@ -1801,7 +1761,7 @@
           <w:szCs w:val="36"/>
         </w:rPr>
         <w:drawing>
-          <wp:inline distT="0" distB="0" distL="0" distR="0" wp14:anchorId="2C256DB5" wp14:editId="0F7F6D58">
+          <wp:inline distT="0" distB="0" distL="0" distR="0" wp14:anchorId="2C256DB5" wp14:editId="17E3CEF9">
             <wp:extent cx="3329940" cy="1752493"/>
             <wp:effectExtent l="0" t="0" r="3810" b="635"/>
             <wp:docPr id="9" name="Kép 9"/>
@@ -2605,6 +2565,94 @@
           <w:szCs w:val="36"/>
         </w:rPr>
         <w:t>(Susán Csongor) A dokumentáció elejére az alkalmazás céljának leírása.</w:t>
+      </w:r>
+    </w:p>
+    <w:p>
+      <w:pPr>
+        <w:rPr>
+          <w:rFonts w:ascii="Times New Roman" w:eastAsia="Times New Roman" w:hAnsi="Times New Roman" w:cs="Times New Roman"/>
+          <w:sz w:val="36"/>
+          <w:szCs w:val="36"/>
+        </w:rPr>
+      </w:pPr>
+    </w:p>
+    <w:p>
+      <w:pPr>
+        <w:rPr>
+          <w:rFonts w:ascii="Times New Roman" w:eastAsia="Times New Roman" w:hAnsi="Times New Roman" w:cs="Times New Roman"/>
+          <w:sz w:val="36"/>
+          <w:szCs w:val="36"/>
+        </w:rPr>
+      </w:pPr>
+      <w:r>
+        <w:rPr>
+          <w:rFonts w:ascii="Times New Roman" w:eastAsia="Times New Roman" w:hAnsi="Times New Roman" w:cs="Times New Roman"/>
+          <w:b/>
+          <w:bCs/>
+          <w:sz w:val="40"/>
+          <w:szCs w:val="40"/>
+        </w:rPr>
+        <w:t>2026-03-02 11:55-</w:t>
+      </w:r>
+      <w:r>
+        <w:rPr>
+          <w:rFonts w:ascii="Times New Roman" w:eastAsia="Times New Roman" w:hAnsi="Times New Roman" w:cs="Times New Roman"/>
+          <w:b/>
+          <w:bCs/>
+          <w:sz w:val="40"/>
+          <w:szCs w:val="40"/>
+        </w:rPr>
+        <w:t>15:25</w:t>
+      </w:r>
+      <w:r>
+        <w:rPr>
+          <w:rFonts w:ascii="Times New Roman" w:eastAsia="Times New Roman" w:hAnsi="Times New Roman" w:cs="Times New Roman"/>
+          <w:b/>
+          <w:bCs/>
+          <w:sz w:val="40"/>
+          <w:szCs w:val="40"/>
+        </w:rPr>
+        <w:br/>
+      </w:r>
+      <w:r>
+        <w:rPr>
+          <w:rFonts w:ascii="Times New Roman" w:eastAsia="Times New Roman" w:hAnsi="Times New Roman" w:cs="Times New Roman"/>
+          <w:sz w:val="36"/>
+          <w:szCs w:val="36"/>
+        </w:rPr>
+        <w:t>(El-Nabulsy Csongor Alan</w:t>
+      </w:r>
+      <w:r>
+        <w:rPr>
+          <w:rFonts w:ascii="Times New Roman" w:eastAsia="Times New Roman" w:hAnsi="Times New Roman" w:cs="Times New Roman"/>
+          <w:sz w:val="36"/>
+          <w:szCs w:val="36"/>
+        </w:rPr>
+        <w:t>, Susán Csongor György</w:t>
+      </w:r>
+      <w:r>
+        <w:rPr>
+          <w:rFonts w:ascii="Times New Roman" w:eastAsia="Times New Roman" w:hAnsi="Times New Roman" w:cs="Times New Roman"/>
+          <w:sz w:val="36"/>
+          <w:szCs w:val="36"/>
+        </w:rPr>
+        <w:t>) Nézetek kidolgozása</w:t>
+      </w:r>
+      <w:r>
+        <w:rPr>
+          <w:rFonts w:ascii="Times New Roman" w:eastAsia="Times New Roman" w:hAnsi="Times New Roman" w:cs="Times New Roman"/>
+          <w:sz w:val="36"/>
+          <w:szCs w:val="36"/>
+        </w:rPr>
+        <w:t xml:space="preserve"> (El-Nabulsy: főoldal és annak variánsai, Susán: login befejezése és admin elkezdése, valamint a logika kidolgozásának megkezdése</w:t>
+      </w:r>
+      <w:r>
+        <w:rPr>
+          <w:rFonts w:ascii="Times New Roman" w:eastAsia="Times New Roman" w:hAnsi="Times New Roman" w:cs="Times New Roman"/>
+          <w:sz w:val="36"/>
+          <w:szCs w:val="36"/>
+        </w:rPr>
+        <w:t xml:space="preserve"> + jegyzetek)</w:t>
       </w:r>
     </w:p>
     <w:sectPr>

</xml_diff>

<commit_message>
Updating documentation with the latest action
</commit_message>
<xml_diff>
--- a/documentation.docx
+++ b/documentation.docx
@@ -1239,7 +1239,7 @@
           <w:szCs w:val="36"/>
         </w:rPr>
         <w:drawing>
-          <wp:inline distT="0" distB="0" distL="0" distR="0" wp14:anchorId="78A43544" wp14:editId="18975B99">
+          <wp:inline distT="0" distB="0" distL="0" distR="0" wp14:anchorId="78A43544" wp14:editId="6821D794">
             <wp:extent cx="3166535" cy="1781175"/>
             <wp:effectExtent l="0" t="0" r="0" b="0"/>
             <wp:docPr id="3" name="Kép 3" descr="C:\Users\elnabulsy.csongor\AppData\Local\Microsoft\Windows\INetCache\Content.MSO\F75754B3.tmp"/>
@@ -1331,7 +1331,7 @@
           <w:szCs w:val="36"/>
         </w:rPr>
         <w:drawing>
-          <wp:inline distT="0" distB="0" distL="0" distR="0" wp14:anchorId="4E211814" wp14:editId="79A06032">
+          <wp:inline distT="0" distB="0" distL="0" distR="0" wp14:anchorId="4E211814" wp14:editId="051A970F">
             <wp:extent cx="3133725" cy="1762720"/>
             <wp:effectExtent l="0" t="0" r="0" b="9525"/>
             <wp:docPr id="4" name="Kép 4" descr="C:\Users\elnabulsy.csongor\Downloads\ui_main_student.png"/>
@@ -1413,7 +1413,7 @@
           <w:szCs w:val="36"/>
         </w:rPr>
         <w:drawing>
-          <wp:inline distT="0" distB="0" distL="0" distR="0" wp14:anchorId="5137FB78" wp14:editId="2CD4C543">
+          <wp:inline distT="0" distB="0" distL="0" distR="0" wp14:anchorId="5137FB78" wp14:editId="0387A03B">
             <wp:extent cx="3166110" cy="1780938"/>
             <wp:effectExtent l="0" t="0" r="0" b="0"/>
             <wp:docPr id="5" name="Kép 5" descr="C:\Users\elnabulsy.csongor\Downloads\ui_main_scheduler.png"/>
@@ -1506,7 +1506,7 @@
           <w:szCs w:val="36"/>
         </w:rPr>
         <w:drawing>
-          <wp:inline distT="0" distB="0" distL="0" distR="0" wp14:anchorId="27EC1C67" wp14:editId="0B789ABC">
+          <wp:inline distT="0" distB="0" distL="0" distR="0" wp14:anchorId="27EC1C67" wp14:editId="0337821F">
             <wp:extent cx="3055620" cy="1718786"/>
             <wp:effectExtent l="0" t="0" r="0" b="0"/>
             <wp:docPr id="6" name="Kép 6" descr="C:\Users\elnabulsy.csongor\Downloads\ui_main_admin.png"/>
@@ -1588,7 +1588,7 @@
           <w:szCs w:val="36"/>
         </w:rPr>
         <w:drawing>
-          <wp:inline distT="0" distB="0" distL="0" distR="0" wp14:anchorId="08225B4F" wp14:editId="1987D810">
+          <wp:inline distT="0" distB="0" distL="0" distR="0" wp14:anchorId="08225B4F" wp14:editId="21D854BC">
             <wp:extent cx="2933700" cy="1942430"/>
             <wp:effectExtent l="0" t="0" r="0" b="1270"/>
             <wp:docPr id="7" name="Kép 7" descr="C:\Users\elnabulsy.csongor\Downloads\ui_structure.png"/>
@@ -1761,7 +1761,7 @@
           <w:szCs w:val="36"/>
         </w:rPr>
         <w:drawing>
-          <wp:inline distT="0" distB="0" distL="0" distR="0" wp14:anchorId="2C256DB5" wp14:editId="17E3CEF9">
+          <wp:inline distT="0" distB="0" distL="0" distR="0" wp14:anchorId="2C256DB5" wp14:editId="326D3007">
             <wp:extent cx="3329940" cy="1752493"/>
             <wp:effectExtent l="0" t="0" r="3810" b="635"/>
             <wp:docPr id="9" name="Kép 9"/>
@@ -2644,7 +2644,23 @@
           <w:sz w:val="36"/>
           <w:szCs w:val="36"/>
         </w:rPr>
-        <w:t xml:space="preserve"> (El-Nabulsy: főoldal és annak variánsai, Susán: login befejezése és admin elkezdése, valamint a logika kidolgozásának megkezdése</w:t>
+        <w:t xml:space="preserve"> (El-Nabulsy: főoldal és annak </w:t>
+      </w:r>
+      <w:r>
+        <w:rPr>
+          <w:rFonts w:ascii="Times New Roman" w:eastAsia="Times New Roman" w:hAnsi="Times New Roman" w:cs="Times New Roman"/>
+          <w:sz w:val="36"/>
+          <w:szCs w:val="36"/>
+        </w:rPr>
+        <w:t xml:space="preserve">tanulói </w:t>
+      </w:r>
+      <w:r>
+        <w:rPr>
+          <w:rFonts w:ascii="Times New Roman" w:eastAsia="Times New Roman" w:hAnsi="Times New Roman" w:cs="Times New Roman"/>
+          <w:sz w:val="36"/>
+          <w:szCs w:val="36"/>
+        </w:rPr>
+        <w:t>variánsa, Susán: login befejezése és admin elkezdése, valamint a logika kidolgozásának megkezdése</w:t>
       </w:r>
       <w:r>
         <w:rPr>
@@ -2653,6 +2669,78 @@
           <w:szCs w:val="36"/>
         </w:rPr>
         <w:t xml:space="preserve"> + jegyzetek)</w:t>
+      </w:r>
+    </w:p>
+    <w:p>
+      <w:pPr>
+        <w:rPr>
+          <w:rFonts w:ascii="Times New Roman" w:eastAsia="Times New Roman" w:hAnsi="Times New Roman" w:cs="Times New Roman"/>
+          <w:sz w:val="36"/>
+          <w:szCs w:val="36"/>
+        </w:rPr>
+      </w:pPr>
+    </w:p>
+    <w:p>
+      <w:pPr>
+        <w:rPr>
+          <w:rFonts w:ascii="Times New Roman" w:eastAsia="Times New Roman" w:hAnsi="Times New Roman" w:cs="Times New Roman"/>
+          <w:sz w:val="36"/>
+          <w:szCs w:val="36"/>
+        </w:rPr>
+      </w:pPr>
+      <w:r>
+        <w:rPr>
+          <w:rFonts w:ascii="Times New Roman" w:eastAsia="Times New Roman" w:hAnsi="Times New Roman" w:cs="Times New Roman"/>
+          <w:b/>
+          <w:bCs/>
+          <w:sz w:val="40"/>
+          <w:szCs w:val="40"/>
+        </w:rPr>
+        <w:t>2026-03-04 10:45-</w:t>
+      </w:r>
+      <w:r>
+        <w:rPr>
+          <w:rFonts w:ascii="Times New Roman" w:eastAsia="Times New Roman" w:hAnsi="Times New Roman" w:cs="Times New Roman"/>
+          <w:b/>
+          <w:bCs/>
+          <w:sz w:val="40"/>
+          <w:szCs w:val="40"/>
+        </w:rPr>
+        <w:t>12:00</w:t>
+      </w:r>
+      <w:r>
+        <w:rPr>
+          <w:rFonts w:ascii="Times New Roman" w:eastAsia="Times New Roman" w:hAnsi="Times New Roman" w:cs="Times New Roman"/>
+          <w:b/>
+          <w:bCs/>
+          <w:sz w:val="40"/>
+          <w:szCs w:val="40"/>
+        </w:rPr>
+        <w:br/>
+      </w:r>
+      <w:r>
+        <w:rPr>
+          <w:rFonts w:ascii="Times New Roman" w:eastAsia="Times New Roman" w:hAnsi="Times New Roman" w:cs="Times New Roman"/>
+          <w:sz w:val="36"/>
+          <w:szCs w:val="36"/>
+        </w:rPr>
+        <w:t xml:space="preserve">(El-Nabulsy Csongor Alan) A zenebekérő oldal </w:t>
+      </w:r>
+      <w:r>
+        <w:rPr>
+          <w:rFonts w:ascii="Times New Roman" w:eastAsia="Times New Roman" w:hAnsi="Times New Roman" w:cs="Times New Roman"/>
+          <w:sz w:val="36"/>
+          <w:szCs w:val="36"/>
+        </w:rPr>
+        <w:t>részben elkészítése</w:t>
+      </w:r>
+      <w:r>
+        <w:rPr>
+          <w:rFonts w:ascii="Times New Roman" w:eastAsia="Times New Roman" w:hAnsi="Times New Roman" w:cs="Times New Roman"/>
+          <w:sz w:val="36"/>
+          <w:szCs w:val="36"/>
+        </w:rPr>
+        <w:t>.</w:t>
       </w:r>
     </w:p>
     <w:sectPr>

</xml_diff>

<commit_message>
Making child routes and views to the home view (+updating documentation about it)
</commit_message>
<xml_diff>
--- a/documentation.docx
+++ b/documentation.docx
@@ -1239,7 +1239,7 @@
           <w:szCs w:val="36"/>
         </w:rPr>
         <w:drawing>
-          <wp:inline distT="0" distB="0" distL="0" distR="0" wp14:anchorId="78A43544" wp14:editId="6821D794">
+          <wp:inline distT="0" distB="0" distL="0" distR="0" wp14:anchorId="78A43544" wp14:editId="102998F9">
             <wp:extent cx="3166535" cy="1781175"/>
             <wp:effectExtent l="0" t="0" r="0" b="0"/>
             <wp:docPr id="3" name="Kép 3" descr="C:\Users\elnabulsy.csongor\AppData\Local\Microsoft\Windows\INetCache\Content.MSO\F75754B3.tmp"/>
@@ -1331,7 +1331,7 @@
           <w:szCs w:val="36"/>
         </w:rPr>
         <w:drawing>
-          <wp:inline distT="0" distB="0" distL="0" distR="0" wp14:anchorId="4E211814" wp14:editId="051A970F">
+          <wp:inline distT="0" distB="0" distL="0" distR="0" wp14:anchorId="4E211814" wp14:editId="605AA2EF">
             <wp:extent cx="3133725" cy="1762720"/>
             <wp:effectExtent l="0" t="0" r="0" b="9525"/>
             <wp:docPr id="4" name="Kép 4" descr="C:\Users\elnabulsy.csongor\Downloads\ui_main_student.png"/>
@@ -1413,7 +1413,7 @@
           <w:szCs w:val="36"/>
         </w:rPr>
         <w:drawing>
-          <wp:inline distT="0" distB="0" distL="0" distR="0" wp14:anchorId="5137FB78" wp14:editId="0387A03B">
+          <wp:inline distT="0" distB="0" distL="0" distR="0" wp14:anchorId="5137FB78" wp14:editId="3264CEB4">
             <wp:extent cx="3166110" cy="1780938"/>
             <wp:effectExtent l="0" t="0" r="0" b="0"/>
             <wp:docPr id="5" name="Kép 5" descr="C:\Users\elnabulsy.csongor\Downloads\ui_main_scheduler.png"/>
@@ -1506,7 +1506,7 @@
           <w:szCs w:val="36"/>
         </w:rPr>
         <w:drawing>
-          <wp:inline distT="0" distB="0" distL="0" distR="0" wp14:anchorId="27EC1C67" wp14:editId="0337821F">
+          <wp:inline distT="0" distB="0" distL="0" distR="0" wp14:anchorId="27EC1C67" wp14:editId="6EBBB6E8">
             <wp:extent cx="3055620" cy="1718786"/>
             <wp:effectExtent l="0" t="0" r="0" b="0"/>
             <wp:docPr id="6" name="Kép 6" descr="C:\Users\elnabulsy.csongor\Downloads\ui_main_admin.png"/>
@@ -1588,7 +1588,7 @@
           <w:szCs w:val="36"/>
         </w:rPr>
         <w:drawing>
-          <wp:inline distT="0" distB="0" distL="0" distR="0" wp14:anchorId="08225B4F" wp14:editId="21D854BC">
+          <wp:inline distT="0" distB="0" distL="0" distR="0" wp14:anchorId="08225B4F" wp14:editId="639F3B88">
             <wp:extent cx="2933700" cy="1942430"/>
             <wp:effectExtent l="0" t="0" r="0" b="1270"/>
             <wp:docPr id="7" name="Kép 7" descr="C:\Users\elnabulsy.csongor\Downloads\ui_structure.png"/>
@@ -1761,7 +1761,7 @@
           <w:szCs w:val="36"/>
         </w:rPr>
         <w:drawing>
-          <wp:inline distT="0" distB="0" distL="0" distR="0" wp14:anchorId="2C256DB5" wp14:editId="326D3007">
+          <wp:inline distT="0" distB="0" distL="0" distR="0" wp14:anchorId="2C256DB5" wp14:editId="4189EEE9">
             <wp:extent cx="3329940" cy="1752493"/>
             <wp:effectExtent l="0" t="0" r="3810" b="635"/>
             <wp:docPr id="9" name="Kép 9"/>
@@ -2741,6 +2741,184 @@
           <w:szCs w:val="36"/>
         </w:rPr>
         <w:t>.</w:t>
+      </w:r>
+    </w:p>
+    <w:p>
+      <w:pPr>
+        <w:rPr>
+          <w:rFonts w:ascii="Times New Roman" w:eastAsia="Times New Roman" w:hAnsi="Times New Roman" w:cs="Times New Roman"/>
+          <w:sz w:val="36"/>
+          <w:szCs w:val="36"/>
+        </w:rPr>
+      </w:pPr>
+    </w:p>
+    <w:p>
+      <w:pPr>
+        <w:rPr>
+          <w:rFonts w:ascii="Times New Roman" w:eastAsia="Times New Roman" w:hAnsi="Times New Roman" w:cs="Times New Roman"/>
+          <w:sz w:val="36"/>
+          <w:szCs w:val="36"/>
+        </w:rPr>
+      </w:pPr>
+      <w:r>
+        <w:rPr>
+          <w:rFonts w:ascii="Times New Roman" w:eastAsia="Times New Roman" w:hAnsi="Times New Roman" w:cs="Times New Roman"/>
+          <w:b/>
+          <w:bCs/>
+          <w:sz w:val="40"/>
+          <w:szCs w:val="40"/>
+        </w:rPr>
+        <w:t>2026-03-08 17:10-</w:t>
+      </w:r>
+      <w:r>
+        <w:rPr>
+          <w:rFonts w:ascii="Times New Roman" w:eastAsia="Times New Roman" w:hAnsi="Times New Roman" w:cs="Times New Roman"/>
+          <w:b/>
+          <w:bCs/>
+          <w:sz w:val="40"/>
+          <w:szCs w:val="40"/>
+        </w:rPr>
+        <w:t>18:15, 19:</w:t>
+      </w:r>
+      <w:r>
+        <w:rPr>
+          <w:rFonts w:ascii="Times New Roman" w:eastAsia="Times New Roman" w:hAnsi="Times New Roman" w:cs="Times New Roman"/>
+          <w:b/>
+          <w:bCs/>
+          <w:sz w:val="40"/>
+          <w:szCs w:val="40"/>
+        </w:rPr>
+        <w:t>30-</w:t>
+      </w:r>
+      <w:r>
+        <w:rPr>
+          <w:rFonts w:ascii="Times New Roman" w:eastAsia="Times New Roman" w:hAnsi="Times New Roman" w:cs="Times New Roman"/>
+          <w:b/>
+          <w:bCs/>
+          <w:sz w:val="40"/>
+          <w:szCs w:val="40"/>
+        </w:rPr>
+        <w:t>20:</w:t>
+      </w:r>
+      <w:r>
+        <w:rPr>
+          <w:rFonts w:ascii="Times New Roman" w:eastAsia="Times New Roman" w:hAnsi="Times New Roman" w:cs="Times New Roman"/>
+          <w:b/>
+          <w:bCs/>
+          <w:sz w:val="40"/>
+          <w:szCs w:val="40"/>
+        </w:rPr>
+        <w:t>40</w:t>
+      </w:r>
+      <w:r>
+        <w:rPr>
+          <w:rFonts w:ascii="Times New Roman" w:eastAsia="Times New Roman" w:hAnsi="Times New Roman" w:cs="Times New Roman"/>
+          <w:b/>
+          <w:bCs/>
+          <w:sz w:val="40"/>
+          <w:szCs w:val="40"/>
+        </w:rPr>
+        <w:br/>
+      </w:r>
+      <w:r>
+        <w:rPr>
+          <w:rFonts w:ascii="Times New Roman" w:eastAsia="Times New Roman" w:hAnsi="Times New Roman" w:cs="Times New Roman"/>
+          <w:sz w:val="36"/>
+          <w:szCs w:val="36"/>
+        </w:rPr>
+        <w:t>(Susán Csongor György) A bejelentkezési nézet kijavítása</w:t>
+      </w:r>
+      <w:r>
+        <w:rPr>
+          <w:rFonts w:ascii="Times New Roman" w:eastAsia="Times New Roman" w:hAnsi="Times New Roman" w:cs="Times New Roman"/>
+          <w:sz w:val="36"/>
+          <w:szCs w:val="36"/>
+        </w:rPr>
+        <w:t>, a routerben a főoldalak variánsainak gyerek route-okba szervezése</w:t>
+      </w:r>
+      <w:r>
+        <w:rPr>
+          <w:rFonts w:ascii="Times New Roman" w:eastAsia="Times New Roman" w:hAnsi="Times New Roman" w:cs="Times New Roman"/>
+          <w:sz w:val="36"/>
+          <w:szCs w:val="36"/>
+        </w:rPr>
+        <w:t xml:space="preserve"> (és éppen ezért már létrehozott nézetek annak megfelelő szétvágása)</w:t>
+      </w:r>
+      <w:r>
+        <w:rPr>
+          <w:rFonts w:ascii="Times New Roman" w:eastAsia="Times New Roman" w:hAnsi="Times New Roman" w:cs="Times New Roman"/>
+          <w:sz w:val="36"/>
+          <w:szCs w:val="36"/>
+        </w:rPr>
+        <w:t>, az új szabvány mintájára az admin nézet (gombok és rövid leírás azok alá) létrehozása</w:t>
+      </w:r>
+      <w:r>
+        <w:rPr>
+          <w:rFonts w:ascii="Times New Roman" w:eastAsia="Times New Roman" w:hAnsi="Times New Roman" w:cs="Times New Roman"/>
+          <w:sz w:val="36"/>
+          <w:szCs w:val="36"/>
+        </w:rPr>
+        <w:t>, felesleges import mezők kiszedése az App.vue fájlból</w:t>
+      </w:r>
+    </w:p>
+    <w:p>
+      <w:pPr>
+        <w:jc w:val="center"/>
+        <w:rPr>
+          <w:rFonts w:ascii="Times New Roman" w:eastAsia="Times New Roman" w:hAnsi="Times New Roman" w:cs="Times New Roman"/>
+          <w:sz w:val="36"/>
+          <w:szCs w:val="36"/>
+        </w:rPr>
+      </w:pPr>
+      <w:r>
+        <w:rPr>
+          <w:rFonts w:ascii="Times New Roman" w:eastAsia="Times New Roman" w:hAnsi="Times New Roman" w:cs="Times New Roman"/>
+          <w:noProof/>
+          <w:sz w:val="36"/>
+          <w:szCs w:val="36"/>
+        </w:rPr>
+        <w:lastRenderedPageBreak/>
+        <w:drawing>
+          <wp:inline distT="0" distB="0" distL="0" distR="0" wp14:anchorId="5DFC9D37" wp14:editId="209634C9">
+            <wp:extent cx="5379983" cy="2476500"/>
+            <wp:effectExtent l="0" t="0" r="0" b="0"/>
+            <wp:docPr id="1901079405" name="Kép 1"/>
+            <wp:cNvGraphicFramePr>
+              <a:graphicFrameLocks xmlns:a="http://schemas.openxmlformats.org/drawingml/2006/main" noChangeAspect="1"/>
+            </wp:cNvGraphicFramePr>
+            <a:graphic xmlns:a="http://schemas.openxmlformats.org/drawingml/2006/main">
+              <a:graphicData uri="http://schemas.openxmlformats.org/drawingml/2006/picture">
+                <pic:pic xmlns:pic="http://schemas.openxmlformats.org/drawingml/2006/picture">
+                  <pic:nvPicPr>
+                    <pic:cNvPr id="1901079405" name="Kép 1901079405"/>
+                    <pic:cNvPicPr/>
+                  </pic:nvPicPr>
+                  <pic:blipFill>
+                    <a:blip r:embed="rId26" cstate="print">
+                      <a:extLst>
+                        <a:ext uri="{28A0092B-C50C-407E-A947-70E740481C1C}">
+                          <a14:useLocalDpi xmlns:a14="http://schemas.microsoft.com/office/drawing/2010/main" val="0"/>
+                        </a:ext>
+                      </a:extLst>
+                    </a:blip>
+                    <a:stretch>
+                      <a:fillRect/>
+                    </a:stretch>
+                  </pic:blipFill>
+                  <pic:spPr>
+                    <a:xfrm>
+                      <a:off x="0" y="0"/>
+                      <a:ext cx="5388813" cy="2480565"/>
+                    </a:xfrm>
+                    <a:prstGeom prst="rect">
+                      <a:avLst/>
+                    </a:prstGeom>
+                  </pic:spPr>
+                </pic:pic>
+              </a:graphicData>
+            </a:graphic>
+          </wp:inline>
+        </w:drawing>
       </w:r>
     </w:p>
     <w:sectPr>

</xml_diff>

<commit_message>
Making the website's view look like the plan, working on views and first testings (+documentation update, tests' documentation start)
</commit_message>
<xml_diff>
--- a/documentation.docx
+++ b/documentation.docx
@@ -79,7 +79,27 @@
           <w:sz w:val="40"/>
           <w:szCs w:val="40"/>
         </w:rPr>
-        <w:t xml:space="preserve"> Susán Csongor, El-Nabulsy Csongor Alan</w:t>
+        <w:t xml:space="preserve"> Susán Csongor, El-</w:t>
+      </w:r>
+      <w:proofErr w:type="spellStart"/>
+      <w:r>
+        <w:rPr>
+          <w:rFonts w:ascii="Times New Roman" w:hAnsi="Times New Roman" w:cs="Times New Roman"/>
+          <w:bCs/>
+          <w:sz w:val="40"/>
+          <w:szCs w:val="40"/>
+        </w:rPr>
+        <w:t>Nabulsy</w:t>
+      </w:r>
+      <w:proofErr w:type="spellEnd"/>
+      <w:r>
+        <w:rPr>
+          <w:rFonts w:ascii="Times New Roman" w:hAnsi="Times New Roman" w:cs="Times New Roman"/>
+          <w:bCs/>
+          <w:sz w:val="40"/>
+          <w:szCs w:val="40"/>
+        </w:rPr>
+        <w:t xml:space="preserve"> Csongor Alan</w:t>
       </w:r>
     </w:p>
     <w:p>
@@ -171,7 +191,7 @@
     </w:p>
     <w:p>
       <w:pPr>
-        <w:pStyle w:val="ListParagraph"/>
+        <w:pStyle w:val="Listaszerbekezds"/>
         <w:numPr>
           <w:ilvl w:val="0"/>
           <w:numId w:val="1"/>
@@ -193,7 +213,7 @@
     </w:p>
     <w:p>
       <w:pPr>
-        <w:pStyle w:val="ListParagraph"/>
+        <w:pStyle w:val="Listaszerbekezds"/>
         <w:numPr>
           <w:ilvl w:val="0"/>
           <w:numId w:val="1"/>
@@ -215,7 +235,7 @@
     </w:p>
     <w:p>
       <w:pPr>
-        <w:pStyle w:val="ListParagraph"/>
+        <w:pStyle w:val="Listaszerbekezds"/>
         <w:ind w:left="0"/>
         <w:rPr>
           <w:rFonts w:ascii="Times New Roman" w:hAnsi="Times New Roman" w:cs="Times New Roman"/>
@@ -459,7 +479,7 @@
     </w:p>
     <w:p>
       <w:pPr>
-        <w:pStyle w:val="ListParagraph"/>
+        <w:pStyle w:val="Listaszerbekezds"/>
         <w:rPr>
           <w:rFonts w:ascii="Times New Roman" w:hAnsi="Times New Roman" w:cs="Times New Roman"/>
           <w:sz w:val="36"/>
@@ -884,7 +904,7 @@
       <w:hyperlink r:id="rId14">
         <w:r>
           <w:rPr>
-            <w:rStyle w:val="Hyperlink"/>
+            <w:rStyle w:val="Hiperhivatkozs"/>
             <w:rFonts w:ascii="Times New Roman" w:eastAsia="Times New Roman" w:hAnsi="Times New Roman" w:cs="Times New Roman"/>
             <w:sz w:val="36"/>
             <w:szCs w:val="36"/>
@@ -1288,7 +1308,7 @@
           <w:szCs w:val="36"/>
         </w:rPr>
         <w:drawing>
-          <wp:inline distT="0" distB="0" distL="0" distR="0" wp14:anchorId="78A43544" wp14:editId="33012297">
+          <wp:inline distT="0" distB="0" distL="0" distR="0" wp14:anchorId="78A43544" wp14:editId="5279A085">
             <wp:extent cx="3166535" cy="1781175"/>
             <wp:effectExtent l="0" t="0" r="0" b="0"/>
             <wp:docPr id="3" name="Kép 3" descr="C:\Users\elnabulsy.csongor\AppData\Local\Microsoft\Windows\INetCache\Content.MSO\F75754B3.tmp"/>
@@ -1380,7 +1400,7 @@
           <w:szCs w:val="36"/>
         </w:rPr>
         <w:drawing>
-          <wp:inline distT="0" distB="0" distL="0" distR="0" wp14:anchorId="4E211814" wp14:editId="613E6DA4">
+          <wp:inline distT="0" distB="0" distL="0" distR="0" wp14:anchorId="4E211814" wp14:editId="477AF0ED">
             <wp:extent cx="3133725" cy="1762720"/>
             <wp:effectExtent l="0" t="0" r="0" b="9525"/>
             <wp:docPr id="4" name="Kép 4" descr="C:\Users\elnabulsy.csongor\Downloads\ui_main_student.png"/>
@@ -1462,7 +1482,7 @@
           <w:szCs w:val="36"/>
         </w:rPr>
         <w:drawing>
-          <wp:inline distT="0" distB="0" distL="0" distR="0" wp14:anchorId="5137FB78" wp14:editId="76ACE0F1">
+          <wp:inline distT="0" distB="0" distL="0" distR="0" wp14:anchorId="5137FB78" wp14:editId="051D1352">
             <wp:extent cx="3166110" cy="1780938"/>
             <wp:effectExtent l="0" t="0" r="0" b="0"/>
             <wp:docPr id="5" name="Kép 5" descr="C:\Users\elnabulsy.csongor\Downloads\ui_main_scheduler.png"/>
@@ -1573,7 +1593,7 @@
           <w:szCs w:val="36"/>
         </w:rPr>
         <w:drawing>
-          <wp:inline distT="0" distB="0" distL="0" distR="0" wp14:anchorId="27EC1C67" wp14:editId="46A658E3">
+          <wp:inline distT="0" distB="0" distL="0" distR="0" wp14:anchorId="27EC1C67" wp14:editId="44EAF746">
             <wp:extent cx="3055620" cy="1718786"/>
             <wp:effectExtent l="0" t="0" r="0" b="0"/>
             <wp:docPr id="6" name="Kép 6" descr="C:\Users\elnabulsy.csongor\Downloads\ui_main_admin.png"/>
@@ -1655,7 +1675,7 @@
           <w:szCs w:val="36"/>
         </w:rPr>
         <w:drawing>
-          <wp:inline distT="0" distB="0" distL="0" distR="0" wp14:anchorId="08225B4F" wp14:editId="443F2CCC">
+          <wp:inline distT="0" distB="0" distL="0" distR="0" wp14:anchorId="08225B4F" wp14:editId="11B0C10E">
             <wp:extent cx="2933700" cy="1942430"/>
             <wp:effectExtent l="0" t="0" r="0" b="1270"/>
             <wp:docPr id="7" name="Kép 7" descr="C:\Users\elnabulsy.csongor\Downloads\ui_structure.png"/>
@@ -1828,7 +1848,7 @@
           <w:szCs w:val="36"/>
         </w:rPr>
         <w:drawing>
-          <wp:inline distT="0" distB="0" distL="0" distR="0" wp14:anchorId="2C256DB5" wp14:editId="14094F98">
+          <wp:inline distT="0" distB="0" distL="0" distR="0" wp14:anchorId="2C256DB5" wp14:editId="5DC2B543">
             <wp:extent cx="3329940" cy="1752493"/>
             <wp:effectExtent l="0" t="0" r="3810" b="635"/>
             <wp:docPr id="9" name="Kép 9"/>
@@ -2386,7 +2406,7 @@
     </w:p>
     <w:p>
       <w:pPr>
-        <w:pStyle w:val="ListParagraph"/>
+        <w:pStyle w:val="Listaszerbekezds"/>
         <w:numPr>
           <w:ilvl w:val="0"/>
           <w:numId w:val="2"/>
@@ -2408,7 +2428,7 @@
     </w:p>
     <w:p>
       <w:pPr>
-        <w:pStyle w:val="ListParagraph"/>
+        <w:pStyle w:val="Listaszerbekezds"/>
         <w:numPr>
           <w:ilvl w:val="0"/>
           <w:numId w:val="2"/>
@@ -2440,7 +2460,7 @@
     </w:p>
     <w:p>
       <w:pPr>
-        <w:pStyle w:val="ListParagraph"/>
+        <w:pStyle w:val="Listaszerbekezds"/>
         <w:numPr>
           <w:ilvl w:val="0"/>
           <w:numId w:val="2"/>
@@ -2498,7 +2518,7 @@
     </w:p>
     <w:p>
       <w:pPr>
-        <w:pStyle w:val="ListParagraph"/>
+        <w:pStyle w:val="Listaszerbekezds"/>
         <w:numPr>
           <w:ilvl w:val="0"/>
           <w:numId w:val="2"/>
@@ -2548,7 +2568,7 @@
     </w:p>
     <w:p>
       <w:pPr>
-        <w:pStyle w:val="ListParagraph"/>
+        <w:pStyle w:val="Listaszerbekezds"/>
         <w:numPr>
           <w:ilvl w:val="0"/>
           <w:numId w:val="2"/>
@@ -2582,7 +2602,25 @@
           <w:sz w:val="36"/>
           <w:szCs w:val="36"/>
         </w:rPr>
-        <w:t>A projektet El-Nabulsy Csongor hozta létre és írta meg a kódját, a működéshez szükséges folyamatábrákat, az adatbázis ER-diagramját</w:t>
+        <w:t>A projektet El-</w:t>
+      </w:r>
+      <w:proofErr w:type="spellStart"/>
+      <w:r>
+        <w:rPr>
+          <w:rFonts w:ascii="Times New Roman" w:eastAsia="Times New Roman" w:hAnsi="Times New Roman" w:cs="Times New Roman"/>
+          <w:sz w:val="36"/>
+          <w:szCs w:val="36"/>
+        </w:rPr>
+        <w:t>Nabulsy</w:t>
+      </w:r>
+      <w:proofErr w:type="spellEnd"/>
+      <w:r>
+        <w:rPr>
+          <w:rFonts w:ascii="Times New Roman" w:eastAsia="Times New Roman" w:hAnsi="Times New Roman" w:cs="Times New Roman"/>
+          <w:sz w:val="36"/>
+          <w:szCs w:val="36"/>
+        </w:rPr>
+        <w:t xml:space="preserve"> Csongor hozta létre és írta meg a kódját, a működéshez szükséges folyamatábrákat, az adatbázis ER-diagramját</w:t>
       </w:r>
       <w:r>
         <w:rPr>
@@ -2819,7 +2857,25 @@
           <w:sz w:val="36"/>
           <w:szCs w:val="36"/>
         </w:rPr>
-        <w:t>(El-Nabulsy Csongor Alan</w:t>
+        <w:t>(El-</w:t>
+      </w:r>
+      <w:proofErr w:type="spellStart"/>
+      <w:r>
+        <w:rPr>
+          <w:rFonts w:ascii="Times New Roman" w:eastAsia="Times New Roman" w:hAnsi="Times New Roman" w:cs="Times New Roman"/>
+          <w:sz w:val="36"/>
+          <w:szCs w:val="36"/>
+        </w:rPr>
+        <w:t>Nabulsy</w:t>
+      </w:r>
+      <w:proofErr w:type="spellEnd"/>
+      <w:r>
+        <w:rPr>
+          <w:rFonts w:ascii="Times New Roman" w:eastAsia="Times New Roman" w:hAnsi="Times New Roman" w:cs="Times New Roman"/>
+          <w:sz w:val="36"/>
+          <w:szCs w:val="36"/>
+        </w:rPr>
+        <w:t xml:space="preserve"> Csongor Alan</w:t>
       </w:r>
       <w:r>
         <w:rPr>
@@ -2843,7 +2899,25 @@
           <w:sz w:val="36"/>
           <w:szCs w:val="36"/>
         </w:rPr>
-        <w:t xml:space="preserve"> (El-Nabulsy: főoldal és annak </w:t>
+        <w:t xml:space="preserve"> (El-</w:t>
+      </w:r>
+      <w:proofErr w:type="spellStart"/>
+      <w:r>
+        <w:rPr>
+          <w:rFonts w:ascii="Times New Roman" w:eastAsia="Times New Roman" w:hAnsi="Times New Roman" w:cs="Times New Roman"/>
+          <w:sz w:val="36"/>
+          <w:szCs w:val="36"/>
+        </w:rPr>
+        <w:t>Nabulsy</w:t>
+      </w:r>
+      <w:proofErr w:type="spellEnd"/>
+      <w:r>
+        <w:rPr>
+          <w:rFonts w:ascii="Times New Roman" w:eastAsia="Times New Roman" w:hAnsi="Times New Roman" w:cs="Times New Roman"/>
+          <w:sz w:val="36"/>
+          <w:szCs w:val="36"/>
+        </w:rPr>
+        <w:t xml:space="preserve">: főoldal és annak </w:t>
       </w:r>
       <w:r>
         <w:rPr>
@@ -2941,7 +3015,25 @@
           <w:sz w:val="36"/>
           <w:szCs w:val="36"/>
         </w:rPr>
-        <w:t xml:space="preserve">(El-Nabulsy Csongor Alan) A zenebekérő oldal </w:t>
+        <w:t>(El-</w:t>
+      </w:r>
+      <w:proofErr w:type="spellStart"/>
+      <w:r>
+        <w:rPr>
+          <w:rFonts w:ascii="Times New Roman" w:eastAsia="Times New Roman" w:hAnsi="Times New Roman" w:cs="Times New Roman"/>
+          <w:sz w:val="36"/>
+          <w:szCs w:val="36"/>
+        </w:rPr>
+        <w:t>Nabulsy</w:t>
+      </w:r>
+      <w:proofErr w:type="spellEnd"/>
+      <w:r>
+        <w:rPr>
+          <w:rFonts w:ascii="Times New Roman" w:eastAsia="Times New Roman" w:hAnsi="Times New Roman" w:cs="Times New Roman"/>
+          <w:sz w:val="36"/>
+          <w:szCs w:val="36"/>
+        </w:rPr>
+        <w:t xml:space="preserve"> Csongor Alan) A zenebekérő oldal </w:t>
       </w:r>
       <w:r>
         <w:rPr>
@@ -2973,18 +3065,137 @@
       <w:pPr>
         <w:rPr>
           <w:rFonts w:ascii="Times New Roman" w:eastAsia="Times New Roman" w:hAnsi="Times New Roman" w:cs="Times New Roman"/>
-          <w:sz w:val="36"/>
-          <w:szCs w:val="36"/>
-        </w:rPr>
-      </w:pPr>
-      <w:r>
-        <w:rPr>
-          <w:rFonts w:ascii="Times New Roman" w:eastAsia="Times New Roman" w:hAnsi="Times New Roman" w:cs="Times New Roman"/>
           <w:b/>
           <w:bCs/>
           <w:sz w:val="40"/>
           <w:szCs w:val="40"/>
         </w:rPr>
+      </w:pPr>
+      <w:r>
+        <w:rPr>
+          <w:rFonts w:ascii="Times New Roman" w:eastAsia="Times New Roman" w:hAnsi="Times New Roman" w:cs="Times New Roman"/>
+          <w:b/>
+          <w:bCs/>
+          <w:sz w:val="40"/>
+          <w:szCs w:val="40"/>
+        </w:rPr>
+        <w:t>2026-03-08 15:30-17:15</w:t>
+      </w:r>
+    </w:p>
+    <w:p>
+      <w:pPr>
+        <w:rPr>
+          <w:rFonts w:ascii="Times New Roman" w:eastAsia="Times New Roman" w:hAnsi="Times New Roman" w:cs="Times New Roman"/>
+          <w:sz w:val="36"/>
+          <w:szCs w:val="36"/>
+        </w:rPr>
+      </w:pPr>
+      <w:r>
+        <w:rPr>
+          <w:rFonts w:ascii="Times New Roman" w:eastAsia="Times New Roman" w:hAnsi="Times New Roman" w:cs="Times New Roman"/>
+          <w:sz w:val="36"/>
+          <w:szCs w:val="36"/>
+        </w:rPr>
+        <w:t>(El-</w:t>
+      </w:r>
+      <w:proofErr w:type="spellStart"/>
+      <w:r>
+        <w:rPr>
+          <w:rFonts w:ascii="Times New Roman" w:eastAsia="Times New Roman" w:hAnsi="Times New Roman" w:cs="Times New Roman"/>
+          <w:sz w:val="36"/>
+          <w:szCs w:val="36"/>
+        </w:rPr>
+        <w:t>Nabulsy</w:t>
+      </w:r>
+      <w:proofErr w:type="spellEnd"/>
+      <w:r>
+        <w:rPr>
+          <w:rFonts w:ascii="Times New Roman" w:eastAsia="Times New Roman" w:hAnsi="Times New Roman" w:cs="Times New Roman"/>
+          <w:sz w:val="36"/>
+          <w:szCs w:val="36"/>
+        </w:rPr>
+        <w:t xml:space="preserve"> Csongor Alan) Főbb nézetek(</w:t>
+      </w:r>
+      <w:proofErr w:type="spellStart"/>
+      <w:r>
+        <w:rPr>
+          <w:rFonts w:ascii="Times New Roman" w:eastAsia="Times New Roman" w:hAnsi="Times New Roman" w:cs="Times New Roman"/>
+          <w:sz w:val="36"/>
+          <w:szCs w:val="36"/>
+        </w:rPr>
+        <w:t>HomeView</w:t>
+      </w:r>
+      <w:proofErr w:type="spellEnd"/>
+      <w:r>
+        <w:rPr>
+          <w:rFonts w:ascii="Times New Roman" w:eastAsia="Times New Roman" w:hAnsi="Times New Roman" w:cs="Times New Roman"/>
+          <w:sz w:val="36"/>
+          <w:szCs w:val="36"/>
+        </w:rPr>
+        <w:t xml:space="preserve">, </w:t>
+      </w:r>
+      <w:proofErr w:type="spellStart"/>
+      <w:r>
+        <w:rPr>
+          <w:rFonts w:ascii="Times New Roman" w:eastAsia="Times New Roman" w:hAnsi="Times New Roman" w:cs="Times New Roman"/>
+          <w:sz w:val="36"/>
+          <w:szCs w:val="36"/>
+        </w:rPr>
+        <w:t>StudentHomePage</w:t>
+      </w:r>
+      <w:proofErr w:type="spellEnd"/>
+      <w:r>
+        <w:rPr>
+          <w:rFonts w:ascii="Times New Roman" w:eastAsia="Times New Roman" w:hAnsi="Times New Roman" w:cs="Times New Roman"/>
+          <w:sz w:val="36"/>
+          <w:szCs w:val="36"/>
+        </w:rPr>
+        <w:t xml:space="preserve">, </w:t>
+      </w:r>
+      <w:proofErr w:type="spellStart"/>
+      <w:r>
+        <w:rPr>
+          <w:rFonts w:ascii="Times New Roman" w:eastAsia="Times New Roman" w:hAnsi="Times New Roman" w:cs="Times New Roman"/>
+          <w:sz w:val="36"/>
+          <w:szCs w:val="36"/>
+        </w:rPr>
+        <w:t>SchedulerView</w:t>
+      </w:r>
+      <w:proofErr w:type="spellEnd"/>
+      <w:r>
+        <w:rPr>
+          <w:rFonts w:ascii="Times New Roman" w:eastAsia="Times New Roman" w:hAnsi="Times New Roman" w:cs="Times New Roman"/>
+          <w:sz w:val="36"/>
+          <w:szCs w:val="36"/>
+        </w:rPr>
+        <w:t>) szerkezetének kialakítása és a komponensek működésének ellenőrzése, a felhasználói felület stílusának kialakítása, hogy az oldal elrendezése megfeleljen a megtervezett UI-terveknek.</w:t>
+      </w:r>
+    </w:p>
+    <w:p>
+      <w:pPr>
+        <w:rPr>
+          <w:rFonts w:ascii="Times New Roman" w:eastAsia="Times New Roman" w:hAnsi="Times New Roman" w:cs="Times New Roman"/>
+          <w:sz w:val="36"/>
+          <w:szCs w:val="36"/>
+        </w:rPr>
+      </w:pPr>
+    </w:p>
+    <w:p>
+      <w:pPr>
+        <w:rPr>
+          <w:rFonts w:ascii="Times New Roman" w:eastAsia="Times New Roman" w:hAnsi="Times New Roman" w:cs="Times New Roman"/>
+          <w:sz w:val="36"/>
+          <w:szCs w:val="36"/>
+        </w:rPr>
+      </w:pPr>
+      <w:r>
+        <w:rPr>
+          <w:rFonts w:ascii="Times New Roman" w:eastAsia="Times New Roman" w:hAnsi="Times New Roman" w:cs="Times New Roman"/>
+          <w:b/>
+          <w:bCs/>
+          <w:sz w:val="40"/>
+          <w:szCs w:val="40"/>
+        </w:rPr>
         <w:t>2026-03-08 17:10-</w:t>
       </w:r>
       <w:r>
@@ -3148,7 +3359,6 @@
           <w:sz w:val="36"/>
           <w:szCs w:val="36"/>
         </w:rPr>
-        <w:lastRenderedPageBreak/>
         <w:drawing>
           <wp:inline distT="0" distB="0" distL="0" distR="0" wp14:anchorId="5DFC9D37" wp14:editId="209634C9">
             <wp:extent cx="5379983" cy="2476500"/>
@@ -3194,6 +3404,24 @@
     </w:p>
     <w:p>
       <w:pPr>
+        <w:jc w:val="both"/>
+        <w:rPr>
+          <w:rFonts w:ascii="Times New Roman" w:eastAsia="Times New Roman" w:hAnsi="Times New Roman" w:cs="Times New Roman"/>
+          <w:sz w:val="36"/>
+          <w:szCs w:val="36"/>
+        </w:rPr>
+      </w:pPr>
+    </w:p>
+    <w:p>
+      <w:pPr>
+        <w:jc w:val="both"/>
+        <w:rPr>
+          <w:rFonts w:ascii="Times New Roman" w:eastAsia="Times New Roman" w:hAnsi="Times New Roman" w:cs="Times New Roman"/>
+          <w:sz w:val="36"/>
+          <w:szCs w:val="36"/>
+        </w:rPr>
+      </w:pPr>
+      <w:r>
         <w:rPr>
           <w:rFonts w:ascii="Times New Roman" w:eastAsia="Times New Roman" w:hAnsi="Times New Roman" w:cs="Times New Roman"/>
           <w:b/>
@@ -3201,65 +3429,71 @@
           <w:sz w:val="40"/>
           <w:szCs w:val="40"/>
         </w:rPr>
-      </w:pPr>
-      <w:r>
-        <w:rPr>
-          <w:rFonts w:ascii="Times New Roman" w:eastAsia="Times New Roman" w:hAnsi="Times New Roman" w:cs="Times New Roman"/>
-          <w:b/>
-          <w:bCs/>
-          <w:sz w:val="40"/>
-          <w:szCs w:val="40"/>
-        </w:rPr>
-        <w:t xml:space="preserve">2026-03-08 </w:t>
-      </w:r>
-      <w:r>
-        <w:rPr>
-          <w:rFonts w:ascii="Times New Roman" w:eastAsia="Times New Roman" w:hAnsi="Times New Roman" w:cs="Times New Roman"/>
-          <w:b/>
-          <w:bCs/>
-          <w:sz w:val="40"/>
-          <w:szCs w:val="40"/>
-        </w:rPr>
-        <w:t>15:30</w:t>
-      </w:r>
-      <w:r>
-        <w:rPr>
-          <w:rFonts w:ascii="Times New Roman" w:eastAsia="Times New Roman" w:hAnsi="Times New Roman" w:cs="Times New Roman"/>
-          <w:b/>
-          <w:bCs/>
-          <w:sz w:val="40"/>
-          <w:szCs w:val="40"/>
-        </w:rPr>
-        <w:t>-17:15</w:t>
-      </w:r>
-    </w:p>
-    <w:p>
-      <w:pPr>
-        <w:rPr>
-          <w:rFonts w:ascii="Times New Roman" w:eastAsia="Times New Roman" w:hAnsi="Times New Roman" w:cs="Times New Roman"/>
-          <w:sz w:val="36"/>
-          <w:szCs w:val="36"/>
-        </w:rPr>
-      </w:pPr>
-      <w:r>
-        <w:rPr>
-          <w:rFonts w:ascii="Times New Roman" w:eastAsia="Times New Roman" w:hAnsi="Times New Roman" w:cs="Times New Roman"/>
-          <w:sz w:val="36"/>
-          <w:szCs w:val="36"/>
-        </w:rPr>
-        <w:t xml:space="preserve">(El-Nabulsy Csongor Alan) Főbb </w:t>
-      </w:r>
-      <w:proofErr w:type="gramStart"/>
-      <w:r>
-        <w:rPr>
-          <w:rFonts w:ascii="Times New Roman" w:eastAsia="Times New Roman" w:hAnsi="Times New Roman" w:cs="Times New Roman"/>
-          <w:sz w:val="36"/>
-          <w:szCs w:val="36"/>
-        </w:rPr>
-        <w:t>nézetek(</w:t>
+        <w:t>2026-03-09 8:55-</w:t>
+      </w:r>
+    </w:p>
+    <w:p>
+      <w:pPr>
+        <w:jc w:val="both"/>
+        <w:rPr>
+          <w:rFonts w:ascii="Times New Roman" w:eastAsia="Times New Roman" w:hAnsi="Times New Roman" w:cs="Times New Roman"/>
+          <w:sz w:val="36"/>
+          <w:szCs w:val="36"/>
+        </w:rPr>
+      </w:pPr>
+      <w:r>
+        <w:rPr>
+          <w:rFonts w:ascii="Times New Roman" w:eastAsia="Times New Roman" w:hAnsi="Times New Roman" w:cs="Times New Roman"/>
+          <w:sz w:val="36"/>
+          <w:szCs w:val="36"/>
+        </w:rPr>
+        <w:t>(Susán Csongor György, El-</w:t>
       </w:r>
       <w:proofErr w:type="spellStart"/>
-      <w:proofErr w:type="gramEnd"/>
+      <w:r>
+        <w:rPr>
+          <w:rFonts w:ascii="Times New Roman" w:eastAsia="Times New Roman" w:hAnsi="Times New Roman" w:cs="Times New Roman"/>
+          <w:sz w:val="36"/>
+          <w:szCs w:val="36"/>
+        </w:rPr>
+        <w:t>Nabulsy</w:t>
+      </w:r>
+      <w:proofErr w:type="spellEnd"/>
+      <w:r>
+        <w:rPr>
+          <w:rFonts w:ascii="Times New Roman" w:eastAsia="Times New Roman" w:hAnsi="Times New Roman" w:cs="Times New Roman"/>
+          <w:sz w:val="36"/>
+          <w:szCs w:val="36"/>
+        </w:rPr>
+        <w:t xml:space="preserve"> Csongor Alan)</w:t>
+      </w:r>
+      <w:r>
+        <w:rPr>
+          <w:rFonts w:ascii="Times New Roman" w:eastAsia="Times New Roman" w:hAnsi="Times New Roman" w:cs="Times New Roman"/>
+          <w:sz w:val="36"/>
+          <w:szCs w:val="36"/>
+        </w:rPr>
+        <w:t xml:space="preserve"> Nézetek végleges kialakítása (El-</w:t>
+      </w:r>
+      <w:proofErr w:type="spellStart"/>
+      <w:r>
+        <w:rPr>
+          <w:rFonts w:ascii="Times New Roman" w:eastAsia="Times New Roman" w:hAnsi="Times New Roman" w:cs="Times New Roman"/>
+          <w:sz w:val="36"/>
+          <w:szCs w:val="36"/>
+        </w:rPr>
+        <w:t>Nabulsy</w:t>
+      </w:r>
+      <w:proofErr w:type="spellEnd"/>
+      <w:r>
+        <w:rPr>
+          <w:rFonts w:ascii="Times New Roman" w:eastAsia="Times New Roman" w:hAnsi="Times New Roman" w:cs="Times New Roman"/>
+          <w:sz w:val="36"/>
+          <w:szCs w:val="36"/>
+        </w:rPr>
+        <w:t xml:space="preserve">: </w:t>
+      </w:r>
+      <w:proofErr w:type="spellStart"/>
       <w:r>
         <w:rPr>
           <w:rFonts w:ascii="Times New Roman" w:eastAsia="Times New Roman" w:hAnsi="Times New Roman" w:cs="Times New Roman"/>
@@ -3284,7 +3518,7 @@
           <w:sz w:val="36"/>
           <w:szCs w:val="36"/>
         </w:rPr>
-        <w:t>StudentHomePage</w:t>
+        <w:t>RequestView</w:t>
       </w:r>
       <w:proofErr w:type="spellEnd"/>
       <w:r>
@@ -3302,7 +3536,7 @@
           <w:sz w:val="36"/>
           <w:szCs w:val="36"/>
         </w:rPr>
-        <w:t>SchedulerView</w:t>
+        <w:t>SendView</w:t>
       </w:r>
       <w:proofErr w:type="spellEnd"/>
       <w:r>
@@ -3311,7 +3545,328 @@
           <w:sz w:val="36"/>
           <w:szCs w:val="36"/>
         </w:rPr>
-        <w:t>) szerkezetének kialakítása és a komponensek működésének ellenőrzése, a felhasználói felület stílusának kialakítása, hogy az oldal elrendezése megfeleljen a megtervezett UI-terveknek.</w:t>
+        <w:t xml:space="preserve">; Susán: főoldalak integrálása a </w:t>
+      </w:r>
+      <w:proofErr w:type="spellStart"/>
+      <w:r>
+        <w:rPr>
+          <w:rFonts w:ascii="Times New Roman" w:eastAsia="Times New Roman" w:hAnsi="Times New Roman" w:cs="Times New Roman"/>
+          <w:sz w:val="36"/>
+          <w:szCs w:val="36"/>
+        </w:rPr>
+        <w:t>HomeLayout</w:t>
+      </w:r>
+      <w:r>
+        <w:rPr>
+          <w:rFonts w:ascii="Times New Roman" w:eastAsia="Times New Roman" w:hAnsi="Times New Roman" w:cs="Times New Roman"/>
+          <w:sz w:val="36"/>
+          <w:szCs w:val="36"/>
+        </w:rPr>
+        <w:t>-</w:t>
+      </w:r>
+      <w:r>
+        <w:rPr>
+          <w:rFonts w:ascii="Times New Roman" w:eastAsia="Times New Roman" w:hAnsi="Times New Roman" w:cs="Times New Roman"/>
+          <w:sz w:val="36"/>
+          <w:szCs w:val="36"/>
+        </w:rPr>
+        <w:t>ba</w:t>
+      </w:r>
+      <w:proofErr w:type="spellEnd"/>
+      <w:r>
+        <w:rPr>
+          <w:rFonts w:ascii="Times New Roman" w:eastAsia="Times New Roman" w:hAnsi="Times New Roman" w:cs="Times New Roman"/>
+          <w:sz w:val="36"/>
+          <w:szCs w:val="36"/>
+        </w:rPr>
+        <w:t>)</w:t>
+      </w:r>
+      <w:r>
+        <w:rPr>
+          <w:rFonts w:ascii="Times New Roman" w:eastAsia="Times New Roman" w:hAnsi="Times New Roman" w:cs="Times New Roman"/>
+          <w:sz w:val="36"/>
+          <w:szCs w:val="36"/>
+        </w:rPr>
+        <w:t>.</w:t>
+      </w:r>
+    </w:p>
+    <w:p>
+      <w:pPr>
+        <w:jc w:val="both"/>
+        <w:rPr>
+          <w:rFonts w:ascii="Times New Roman" w:eastAsia="Times New Roman" w:hAnsi="Times New Roman" w:cs="Times New Roman"/>
+          <w:sz w:val="36"/>
+          <w:szCs w:val="36"/>
+        </w:rPr>
+      </w:pPr>
+      <w:r>
+        <w:rPr>
+          <w:rFonts w:ascii="Times New Roman" w:eastAsia="Times New Roman" w:hAnsi="Times New Roman" w:cs="Times New Roman"/>
+          <w:sz w:val="36"/>
+          <w:szCs w:val="36"/>
+        </w:rPr>
+        <w:t xml:space="preserve">(Susán Csongor György) </w:t>
+      </w:r>
+    </w:p>
+    <w:p>
+      <w:pPr>
+        <w:pStyle w:val="Listaszerbekezds"/>
+        <w:numPr>
+          <w:ilvl w:val="0"/>
+          <w:numId w:val="4"/>
+        </w:numPr>
+        <w:jc w:val="both"/>
+        <w:rPr>
+          <w:rFonts w:ascii="Times New Roman" w:eastAsia="Times New Roman" w:hAnsi="Times New Roman" w:cs="Times New Roman"/>
+          <w:sz w:val="36"/>
+          <w:szCs w:val="36"/>
+        </w:rPr>
+      </w:pPr>
+      <w:r>
+        <w:rPr>
+          <w:rFonts w:ascii="Times New Roman" w:eastAsia="Times New Roman" w:hAnsi="Times New Roman" w:cs="Times New Roman"/>
+          <w:sz w:val="36"/>
+          <w:szCs w:val="36"/>
+        </w:rPr>
+        <w:t xml:space="preserve">Példa adatok felvétele a </w:t>
+      </w:r>
+      <w:proofErr w:type="spellStart"/>
+      <w:r>
+        <w:rPr>
+          <w:rFonts w:ascii="Times New Roman" w:eastAsia="Times New Roman" w:hAnsi="Times New Roman" w:cs="Times New Roman"/>
+          <w:sz w:val="36"/>
+          <w:szCs w:val="36"/>
+        </w:rPr>
+        <w:t>HomeLayout-ba</w:t>
+      </w:r>
+      <w:proofErr w:type="spellEnd"/>
+      <w:r>
+        <w:rPr>
+          <w:rFonts w:ascii="Times New Roman" w:eastAsia="Times New Roman" w:hAnsi="Times New Roman" w:cs="Times New Roman"/>
+          <w:sz w:val="36"/>
+          <w:szCs w:val="36"/>
+        </w:rPr>
+        <w:t xml:space="preserve"> a helyes működés tesztelésének érdekében</w:t>
+      </w:r>
+    </w:p>
+    <w:p>
+      <w:pPr>
+        <w:pStyle w:val="Listaszerbekezds"/>
+        <w:numPr>
+          <w:ilvl w:val="0"/>
+          <w:numId w:val="4"/>
+        </w:numPr>
+        <w:jc w:val="both"/>
+        <w:rPr>
+          <w:rFonts w:ascii="Times New Roman" w:eastAsia="Times New Roman" w:hAnsi="Times New Roman" w:cs="Times New Roman"/>
+          <w:sz w:val="36"/>
+          <w:szCs w:val="36"/>
+        </w:rPr>
+      </w:pPr>
+      <w:r>
+        <w:rPr>
+          <w:rFonts w:ascii="Times New Roman" w:eastAsia="Times New Roman" w:hAnsi="Times New Roman" w:cs="Times New Roman"/>
+          <w:sz w:val="36"/>
+          <w:szCs w:val="36"/>
+        </w:rPr>
+        <w:t>Azon belül</w:t>
+      </w:r>
+      <w:r>
+        <w:rPr>
+          <w:rFonts w:ascii="Times New Roman" w:eastAsia="Times New Roman" w:hAnsi="Times New Roman" w:cs="Times New Roman"/>
+          <w:sz w:val="36"/>
+          <w:szCs w:val="36"/>
+        </w:rPr>
+        <w:t xml:space="preserve"> a kinézet a terveknek megfelelőre igazítása</w:t>
+      </w:r>
+    </w:p>
+    <w:p>
+      <w:pPr>
+        <w:pStyle w:val="Listaszerbekezds"/>
+        <w:numPr>
+          <w:ilvl w:val="0"/>
+          <w:numId w:val="4"/>
+        </w:numPr>
+        <w:jc w:val="both"/>
+        <w:rPr>
+          <w:rFonts w:ascii="Times New Roman" w:eastAsia="Times New Roman" w:hAnsi="Times New Roman" w:cs="Times New Roman"/>
+          <w:sz w:val="36"/>
+          <w:szCs w:val="36"/>
+        </w:rPr>
+      </w:pPr>
+      <w:proofErr w:type="spellStart"/>
+      <w:r>
+        <w:rPr>
+          <w:rFonts w:ascii="Times New Roman" w:eastAsia="Times New Roman" w:hAnsi="Times New Roman" w:cs="Times New Roman"/>
+          <w:sz w:val="36"/>
+          <w:szCs w:val="36"/>
+        </w:rPr>
+        <w:lastRenderedPageBreak/>
+        <w:t>meta.title-ekben</w:t>
+      </w:r>
+      <w:proofErr w:type="spellEnd"/>
+      <w:r>
+        <w:rPr>
+          <w:rFonts w:ascii="Times New Roman" w:eastAsia="Times New Roman" w:hAnsi="Times New Roman" w:cs="Times New Roman"/>
+          <w:sz w:val="36"/>
+          <w:szCs w:val="36"/>
+        </w:rPr>
+        <w:t xml:space="preserve"> és a </w:t>
+      </w:r>
+      <w:proofErr w:type="spellStart"/>
+      <w:r>
+        <w:rPr>
+          <w:rFonts w:ascii="Times New Roman" w:eastAsia="Times New Roman" w:hAnsi="Times New Roman" w:cs="Times New Roman"/>
+          <w:sz w:val="36"/>
+          <w:szCs w:val="36"/>
+        </w:rPr>
+        <w:t>beforeEach</w:t>
+      </w:r>
+      <w:proofErr w:type="spellEnd"/>
+      <w:r>
+        <w:rPr>
+          <w:rFonts w:ascii="Times New Roman" w:eastAsia="Times New Roman" w:hAnsi="Times New Roman" w:cs="Times New Roman"/>
+          <w:sz w:val="36"/>
+          <w:szCs w:val="36"/>
+        </w:rPr>
+        <w:t>-ben oldalcímek meghatározása</w:t>
+      </w:r>
+    </w:p>
+    <w:p>
+      <w:pPr>
+        <w:pStyle w:val="Listaszerbekezds"/>
+        <w:numPr>
+          <w:ilvl w:val="0"/>
+          <w:numId w:val="4"/>
+        </w:numPr>
+        <w:jc w:val="both"/>
+        <w:rPr>
+          <w:rFonts w:ascii="Times New Roman" w:eastAsia="Times New Roman" w:hAnsi="Times New Roman" w:cs="Times New Roman"/>
+          <w:sz w:val="36"/>
+          <w:szCs w:val="36"/>
+        </w:rPr>
+      </w:pPr>
+      <w:r>
+        <w:rPr>
+          <w:rFonts w:ascii="Times New Roman" w:eastAsia="Times New Roman" w:hAnsi="Times New Roman" w:cs="Times New Roman"/>
+          <w:sz w:val="36"/>
+          <w:szCs w:val="36"/>
+        </w:rPr>
+        <w:t xml:space="preserve">Megkezdődött az oldalak elérhetőségének tesztelése is, éppen ezért a teszteknek szánt dokumentáció </w:t>
+      </w:r>
+      <w:r>
+        <w:rPr>
+          <w:rFonts w:ascii="Times New Roman" w:eastAsia="Times New Roman" w:hAnsi="Times New Roman" w:cs="Times New Roman"/>
+          <w:sz w:val="36"/>
+          <w:szCs w:val="36"/>
+        </w:rPr>
+        <w:t>í</w:t>
+      </w:r>
+      <w:r>
+        <w:rPr>
+          <w:rFonts w:ascii="Times New Roman" w:eastAsia="Times New Roman" w:hAnsi="Times New Roman" w:cs="Times New Roman"/>
+          <w:sz w:val="36"/>
+          <w:szCs w:val="36"/>
+        </w:rPr>
+        <w:t>rása is elkezdődik.</w:t>
+      </w:r>
+    </w:p>
+    <w:p>
+      <w:pPr>
+        <w:pStyle w:val="Listaszerbekezds"/>
+        <w:numPr>
+          <w:ilvl w:val="0"/>
+          <w:numId w:val="4"/>
+        </w:numPr>
+        <w:jc w:val="both"/>
+        <w:rPr>
+          <w:rFonts w:ascii="Times New Roman" w:eastAsia="Times New Roman" w:hAnsi="Times New Roman" w:cs="Times New Roman"/>
+          <w:sz w:val="36"/>
+          <w:szCs w:val="36"/>
+        </w:rPr>
+      </w:pPr>
+      <w:proofErr w:type="spellStart"/>
+      <w:r>
+        <w:rPr>
+          <w:rFonts w:ascii="Times New Roman" w:eastAsia="Times New Roman" w:hAnsi="Times New Roman" w:cs="Times New Roman"/>
+          <w:sz w:val="36"/>
+          <w:szCs w:val="36"/>
+        </w:rPr>
+        <w:t>auth</w:t>
+      </w:r>
+      <w:proofErr w:type="spellEnd"/>
+      <w:r>
+        <w:rPr>
+          <w:rFonts w:ascii="Times New Roman" w:eastAsia="Times New Roman" w:hAnsi="Times New Roman" w:cs="Times New Roman"/>
+          <w:sz w:val="36"/>
+          <w:szCs w:val="36"/>
+        </w:rPr>
+        <w:t xml:space="preserve"> függvény hozzáadása a bejelentkezési képernyőhöz (</w:t>
+      </w:r>
+      <w:proofErr w:type="spellStart"/>
+      <w:r>
+        <w:rPr>
+          <w:rFonts w:ascii="Times New Roman" w:eastAsia="Times New Roman" w:hAnsi="Times New Roman" w:cs="Times New Roman"/>
+          <w:sz w:val="36"/>
+          <w:szCs w:val="36"/>
+        </w:rPr>
+        <w:t>LoginView</w:t>
+      </w:r>
+      <w:proofErr w:type="spellEnd"/>
+      <w:r>
+        <w:rPr>
+          <w:rFonts w:ascii="Times New Roman" w:eastAsia="Times New Roman" w:hAnsi="Times New Roman" w:cs="Times New Roman"/>
+          <w:sz w:val="36"/>
+          <w:szCs w:val="36"/>
+        </w:rPr>
+        <w:t>), ami egyelőre üres, egy komment jelzi annak célját</w:t>
+      </w:r>
+    </w:p>
+    <w:p>
+      <w:pPr>
+        <w:pStyle w:val="Listaszerbekezds"/>
+        <w:numPr>
+          <w:ilvl w:val="0"/>
+          <w:numId w:val="4"/>
+        </w:numPr>
+        <w:jc w:val="both"/>
+        <w:rPr>
+          <w:rFonts w:ascii="Times New Roman" w:eastAsia="Times New Roman" w:hAnsi="Times New Roman" w:cs="Times New Roman"/>
+          <w:sz w:val="36"/>
+          <w:szCs w:val="36"/>
+        </w:rPr>
+      </w:pPr>
+      <w:r>
+        <w:rPr>
+          <w:rFonts w:ascii="Times New Roman" w:eastAsia="Times New Roman" w:hAnsi="Times New Roman" w:cs="Times New Roman"/>
+          <w:sz w:val="36"/>
+          <w:szCs w:val="36"/>
+        </w:rPr>
+        <w:t>A</w:t>
+      </w:r>
+      <w:r>
+        <w:rPr>
+          <w:rFonts w:ascii="Times New Roman" w:eastAsia="Times New Roman" w:hAnsi="Times New Roman" w:cs="Times New Roman"/>
+          <w:sz w:val="36"/>
+          <w:szCs w:val="36"/>
+        </w:rPr>
+        <w:t>z index.ht</w:t>
+      </w:r>
+      <w:r>
+        <w:rPr>
+          <w:rFonts w:ascii="Times New Roman" w:eastAsia="Times New Roman" w:hAnsi="Times New Roman" w:cs="Times New Roman"/>
+          <w:sz w:val="36"/>
+          <w:szCs w:val="36"/>
+        </w:rPr>
+        <w:t>m</w:t>
+      </w:r>
+      <w:r>
+        <w:rPr>
+          <w:rFonts w:ascii="Times New Roman" w:eastAsia="Times New Roman" w:hAnsi="Times New Roman" w:cs="Times New Roman"/>
+          <w:sz w:val="36"/>
+          <w:szCs w:val="36"/>
+        </w:rPr>
+        <w:t>l-be bekerül az oldal neve is (hu, azaz magyar)</w:t>
       </w:r>
     </w:p>
     <w:sectPr>
@@ -3327,16 +3882,16 @@
 <file path=word/numbering.xml><?xml version="1.0" encoding="utf-8"?>
 <w:numbering xmlns:wpc="http://schemas.microsoft.com/office/word/2010/wordprocessingCanvas" xmlns:cx="http://schemas.microsoft.com/office/drawing/2014/chartex" xmlns:cx1="http://schemas.microsoft.com/office/drawing/2015/9/8/chartex" xmlns:cx2="http://schemas.microsoft.com/office/drawing/2015/10/21/chartex" xmlns:cx3="http://schemas.microsoft.com/office/drawing/2016/5/9/chartex" xmlns:cx4="http://schemas.microsoft.com/office/drawing/2016/5/10/chartex" xmlns:cx5="http://schemas.microsoft.com/office/drawing/2016/5/11/chartex" xmlns:cx6="http://schemas.microsoft.com/office/drawing/2016/5/12/chartex" xmlns:cx7="http://schemas.microsoft.com/office/drawing/2016/5/13/chartex" xmlns:cx8="http://schemas.microsoft.com/office/drawing/2016/5/14/chartex" xmlns:mc="http://schemas.openxmlformats.org/markup-compatibility/2006" xmlns:aink="http://schemas.microsoft.com/office/drawing/2016/ink" xmlns:am3d="http://schemas.microsoft.com/office/drawing/2017/model3d" xmlns:o="urn:schemas-microsoft-com:office:office" xmlns:oel="http://schemas.microsoft.com/office/2019/extlst" xmlns:r="http://schemas.openxmlformats.org/officeDocument/2006/relationships" xmlns:m="http://schemas.openxmlformats.org/officeDocument/2006/math" xmlns:v="urn:schemas-microsoft-com:vml" xmlns:wp14="http://schemas.microsoft.com/office/word/2010/wordprocessingDrawing" xmlns:wp="http://schemas.openxmlformats.org/drawingml/2006/wordprocessingDrawing" xmlns:w10="urn:schemas-microsoft-com:office:word" xmlns:w="http://schemas.openxmlformats.org/wordprocessingml/2006/main" xmlns:w14="http://schemas.microsoft.com/office/word/2010/wordml" xmlns:w15="http://schemas.microsoft.com/office/word/2012/wordml" xmlns:w16cex="http://schemas.microsoft.com/office/word/2018/wordml/cex" xmlns:w16cid="http://schemas.microsoft.com/office/word/2016/wordml/cid" xmlns:w16="http://schemas.microsoft.com/office/word/2018/wordml" xmlns:w16du="http://schemas.microsoft.com/office/word/2023/wordml/word16du" xmlns:w16sdtdh="http://schemas.microsoft.com/office/word/2020/wordml/sdtdatahash" xmlns:w16sdtfl="http://schemas.microsoft.com/office/word/2024/wordml/sdtformatlock" xmlns:w16se="http://schemas.microsoft.com/office/word/2015/wordml/symex" xmlns:wpg="http://schemas.microsoft.com/office/word/2010/wordprocessingGroup" xmlns:wpi="http://schemas.microsoft.com/office/word/2010/wordprocessingInk" xmlns:wne="http://schemas.microsoft.com/office/word/2006/wordml" xmlns:wps="http://schemas.microsoft.com/office/word/2010/wordprocessingShape" mc:Ignorable="w14 w15 w16se w16cid w16 w16cex w16sdtdh w16sdtfl w16du wp14">
   <w:abstractNum w:abstractNumId="0" w15:restartNumberingAfterBreak="0">
-    <w:nsid w:val="6E7312B6"/>
+    <w:nsid w:val="3C1938F6"/>
     <w:multiLevelType w:val="hybridMultilevel"/>
-    <w:tmpl w:val="FD80BAFC"/>
+    <w:tmpl w:val="0816ACA8"/>
     <w:lvl w:ilvl="0" w:tplc="040E0001">
       <w:start w:val="1"/>
       <w:numFmt w:val="bullet"/>
       <w:lvlText w:val=""/>
       <w:lvlJc w:val="left"/>
       <w:pPr>
-        <w:ind w:left="816" w:hanging="360"/>
+        <w:ind w:left="720" w:hanging="360"/>
       </w:pPr>
       <w:rPr>
         <w:rFonts w:ascii="Symbol" w:hAnsi="Symbol" w:hint="default"/>
@@ -3348,7 +3903,7 @@
       <w:lvlText w:val="o"/>
       <w:lvlJc w:val="left"/>
       <w:pPr>
-        <w:ind w:left="1536" w:hanging="360"/>
+        <w:ind w:left="1440" w:hanging="360"/>
       </w:pPr>
       <w:rPr>
         <w:rFonts w:ascii="Courier New" w:hAnsi="Courier New" w:cs="Courier New" w:hint="default"/>
@@ -3360,7 +3915,7 @@
       <w:lvlText w:val=""/>
       <w:lvlJc w:val="left"/>
       <w:pPr>
-        <w:ind w:left="2256" w:hanging="360"/>
+        <w:ind w:left="2160" w:hanging="360"/>
       </w:pPr>
       <w:rPr>
         <w:rFonts w:ascii="Wingdings" w:hAnsi="Wingdings" w:hint="default"/>
@@ -3372,7 +3927,7 @@
       <w:lvlText w:val=""/>
       <w:lvlJc w:val="left"/>
       <w:pPr>
-        <w:ind w:left="2976" w:hanging="360"/>
+        <w:ind w:left="2880" w:hanging="360"/>
       </w:pPr>
       <w:rPr>
         <w:rFonts w:ascii="Symbol" w:hAnsi="Symbol" w:hint="default"/>
@@ -3384,7 +3939,7 @@
       <w:lvlText w:val="o"/>
       <w:lvlJc w:val="left"/>
       <w:pPr>
-        <w:ind w:left="3696" w:hanging="360"/>
+        <w:ind w:left="3600" w:hanging="360"/>
       </w:pPr>
       <w:rPr>
         <w:rFonts w:ascii="Courier New" w:hAnsi="Courier New" w:cs="Courier New" w:hint="default"/>
@@ -3396,7 +3951,7 @@
       <w:lvlText w:val=""/>
       <w:lvlJc w:val="left"/>
       <w:pPr>
-        <w:ind w:left="4416" w:hanging="360"/>
+        <w:ind w:left="4320" w:hanging="360"/>
       </w:pPr>
       <w:rPr>
         <w:rFonts w:ascii="Wingdings" w:hAnsi="Wingdings" w:hint="default"/>
@@ -3408,7 +3963,7 @@
       <w:lvlText w:val=""/>
       <w:lvlJc w:val="left"/>
       <w:pPr>
-        <w:ind w:left="5136" w:hanging="360"/>
+        <w:ind w:left="5040" w:hanging="360"/>
       </w:pPr>
       <w:rPr>
         <w:rFonts w:ascii="Symbol" w:hAnsi="Symbol" w:hint="default"/>
@@ -3420,7 +3975,7 @@
       <w:lvlText w:val="o"/>
       <w:lvlJc w:val="left"/>
       <w:pPr>
-        <w:ind w:left="5856" w:hanging="360"/>
+        <w:ind w:left="5760" w:hanging="360"/>
       </w:pPr>
       <w:rPr>
         <w:rFonts w:ascii="Courier New" w:hAnsi="Courier New" w:cs="Courier New" w:hint="default"/>
@@ -3432,7 +3987,7 @@
       <w:lvlText w:val=""/>
       <w:lvlJc w:val="left"/>
       <w:pPr>
-        <w:ind w:left="6576" w:hanging="360"/>
+        <w:ind w:left="6480" w:hanging="360"/>
       </w:pPr>
       <w:rPr>
         <w:rFonts w:ascii="Wingdings" w:hAnsi="Wingdings" w:hint="default"/>
@@ -3440,16 +3995,16 @@
     </w:lvl>
   </w:abstractNum>
   <w:abstractNum w:abstractNumId="1" w15:restartNumberingAfterBreak="0">
-    <w:nsid w:val="7EB672F7"/>
+    <w:nsid w:val="6E7312B6"/>
     <w:multiLevelType w:val="hybridMultilevel"/>
-    <w:tmpl w:val="A6F0C99C"/>
+    <w:tmpl w:val="FD80BAFC"/>
     <w:lvl w:ilvl="0" w:tplc="040E0001">
       <w:start w:val="1"/>
       <w:numFmt w:val="bullet"/>
       <w:lvlText w:val=""/>
       <w:lvlJc w:val="left"/>
       <w:pPr>
-        <w:ind w:left="720" w:hanging="360"/>
+        <w:ind w:left="816" w:hanging="360"/>
       </w:pPr>
       <w:rPr>
         <w:rFonts w:ascii="Symbol" w:hAnsi="Symbol" w:hint="default"/>
@@ -3461,7 +4016,7 @@
       <w:lvlText w:val="o"/>
       <w:lvlJc w:val="left"/>
       <w:pPr>
-        <w:ind w:left="1440" w:hanging="360"/>
+        <w:ind w:left="1536" w:hanging="360"/>
       </w:pPr>
       <w:rPr>
         <w:rFonts w:ascii="Courier New" w:hAnsi="Courier New" w:cs="Courier New" w:hint="default"/>
@@ -3473,7 +4028,7 @@
       <w:lvlText w:val=""/>
       <w:lvlJc w:val="left"/>
       <w:pPr>
-        <w:ind w:left="2160" w:hanging="360"/>
+        <w:ind w:left="2256" w:hanging="360"/>
       </w:pPr>
       <w:rPr>
         <w:rFonts w:ascii="Wingdings" w:hAnsi="Wingdings" w:hint="default"/>
@@ -3485,7 +4040,7 @@
       <w:lvlText w:val=""/>
       <w:lvlJc w:val="left"/>
       <w:pPr>
-        <w:ind w:left="2880" w:hanging="360"/>
+        <w:ind w:left="2976" w:hanging="360"/>
       </w:pPr>
       <w:rPr>
         <w:rFonts w:ascii="Symbol" w:hAnsi="Symbol" w:hint="default"/>
@@ -3497,7 +4052,7 @@
       <w:lvlText w:val="o"/>
       <w:lvlJc w:val="left"/>
       <w:pPr>
-        <w:ind w:left="3600" w:hanging="360"/>
+        <w:ind w:left="3696" w:hanging="360"/>
       </w:pPr>
       <w:rPr>
         <w:rFonts w:ascii="Courier New" w:hAnsi="Courier New" w:cs="Courier New" w:hint="default"/>
@@ -3509,7 +4064,7 @@
       <w:lvlText w:val=""/>
       <w:lvlJc w:val="left"/>
       <w:pPr>
-        <w:ind w:left="4320" w:hanging="360"/>
+        <w:ind w:left="4416" w:hanging="360"/>
       </w:pPr>
       <w:rPr>
         <w:rFonts w:ascii="Wingdings" w:hAnsi="Wingdings" w:hint="default"/>
@@ -3521,7 +4076,7 @@
       <w:lvlText w:val=""/>
       <w:lvlJc w:val="left"/>
       <w:pPr>
-        <w:ind w:left="5040" w:hanging="360"/>
+        <w:ind w:left="5136" w:hanging="360"/>
       </w:pPr>
       <w:rPr>
         <w:rFonts w:ascii="Symbol" w:hAnsi="Symbol" w:hint="default"/>
@@ -3533,7 +4088,7 @@
       <w:lvlText w:val="o"/>
       <w:lvlJc w:val="left"/>
       <w:pPr>
-        <w:ind w:left="5760" w:hanging="360"/>
+        <w:ind w:left="5856" w:hanging="360"/>
       </w:pPr>
       <w:rPr>
         <w:rFonts w:ascii="Courier New" w:hAnsi="Courier New" w:cs="Courier New" w:hint="default"/>
@@ -3545,6 +4100,232 @@
       <w:lvlText w:val=""/>
       <w:lvlJc w:val="left"/>
       <w:pPr>
+        <w:ind w:left="6576" w:hanging="360"/>
+      </w:pPr>
+      <w:rPr>
+        <w:rFonts w:ascii="Wingdings" w:hAnsi="Wingdings" w:hint="default"/>
+      </w:rPr>
+    </w:lvl>
+  </w:abstractNum>
+  <w:abstractNum w:abstractNumId="2" w15:restartNumberingAfterBreak="0">
+    <w:nsid w:val="76FA296F"/>
+    <w:multiLevelType w:val="hybridMultilevel"/>
+    <w:tmpl w:val="6DAE32EA"/>
+    <w:lvl w:ilvl="0" w:tplc="040E0001">
+      <w:start w:val="1"/>
+      <w:numFmt w:val="bullet"/>
+      <w:lvlText w:val=""/>
+      <w:lvlJc w:val="left"/>
+      <w:pPr>
+        <w:ind w:left="720" w:hanging="360"/>
+      </w:pPr>
+      <w:rPr>
+        <w:rFonts w:ascii="Symbol" w:hAnsi="Symbol" w:hint="default"/>
+      </w:rPr>
+    </w:lvl>
+    <w:lvl w:ilvl="1" w:tplc="040E0003" w:tentative="1">
+      <w:start w:val="1"/>
+      <w:numFmt w:val="bullet"/>
+      <w:lvlText w:val="o"/>
+      <w:lvlJc w:val="left"/>
+      <w:pPr>
+        <w:ind w:left="1440" w:hanging="360"/>
+      </w:pPr>
+      <w:rPr>
+        <w:rFonts w:ascii="Courier New" w:hAnsi="Courier New" w:cs="Courier New" w:hint="default"/>
+      </w:rPr>
+    </w:lvl>
+    <w:lvl w:ilvl="2" w:tplc="040E0005" w:tentative="1">
+      <w:start w:val="1"/>
+      <w:numFmt w:val="bullet"/>
+      <w:lvlText w:val=""/>
+      <w:lvlJc w:val="left"/>
+      <w:pPr>
+        <w:ind w:left="2160" w:hanging="360"/>
+      </w:pPr>
+      <w:rPr>
+        <w:rFonts w:ascii="Wingdings" w:hAnsi="Wingdings" w:hint="default"/>
+      </w:rPr>
+    </w:lvl>
+    <w:lvl w:ilvl="3" w:tplc="040E0001" w:tentative="1">
+      <w:start w:val="1"/>
+      <w:numFmt w:val="bullet"/>
+      <w:lvlText w:val=""/>
+      <w:lvlJc w:val="left"/>
+      <w:pPr>
+        <w:ind w:left="2880" w:hanging="360"/>
+      </w:pPr>
+      <w:rPr>
+        <w:rFonts w:ascii="Symbol" w:hAnsi="Symbol" w:hint="default"/>
+      </w:rPr>
+    </w:lvl>
+    <w:lvl w:ilvl="4" w:tplc="040E0003" w:tentative="1">
+      <w:start w:val="1"/>
+      <w:numFmt w:val="bullet"/>
+      <w:lvlText w:val="o"/>
+      <w:lvlJc w:val="left"/>
+      <w:pPr>
+        <w:ind w:left="3600" w:hanging="360"/>
+      </w:pPr>
+      <w:rPr>
+        <w:rFonts w:ascii="Courier New" w:hAnsi="Courier New" w:cs="Courier New" w:hint="default"/>
+      </w:rPr>
+    </w:lvl>
+    <w:lvl w:ilvl="5" w:tplc="040E0005" w:tentative="1">
+      <w:start w:val="1"/>
+      <w:numFmt w:val="bullet"/>
+      <w:lvlText w:val=""/>
+      <w:lvlJc w:val="left"/>
+      <w:pPr>
+        <w:ind w:left="4320" w:hanging="360"/>
+      </w:pPr>
+      <w:rPr>
+        <w:rFonts w:ascii="Wingdings" w:hAnsi="Wingdings" w:hint="default"/>
+      </w:rPr>
+    </w:lvl>
+    <w:lvl w:ilvl="6" w:tplc="040E0001" w:tentative="1">
+      <w:start w:val="1"/>
+      <w:numFmt w:val="bullet"/>
+      <w:lvlText w:val=""/>
+      <w:lvlJc w:val="left"/>
+      <w:pPr>
+        <w:ind w:left="5040" w:hanging="360"/>
+      </w:pPr>
+      <w:rPr>
+        <w:rFonts w:ascii="Symbol" w:hAnsi="Symbol" w:hint="default"/>
+      </w:rPr>
+    </w:lvl>
+    <w:lvl w:ilvl="7" w:tplc="040E0003" w:tentative="1">
+      <w:start w:val="1"/>
+      <w:numFmt w:val="bullet"/>
+      <w:lvlText w:val="o"/>
+      <w:lvlJc w:val="left"/>
+      <w:pPr>
+        <w:ind w:left="5760" w:hanging="360"/>
+      </w:pPr>
+      <w:rPr>
+        <w:rFonts w:ascii="Courier New" w:hAnsi="Courier New" w:cs="Courier New" w:hint="default"/>
+      </w:rPr>
+    </w:lvl>
+    <w:lvl w:ilvl="8" w:tplc="040E0005" w:tentative="1">
+      <w:start w:val="1"/>
+      <w:numFmt w:val="bullet"/>
+      <w:lvlText w:val=""/>
+      <w:lvlJc w:val="left"/>
+      <w:pPr>
+        <w:ind w:left="6480" w:hanging="360"/>
+      </w:pPr>
+      <w:rPr>
+        <w:rFonts w:ascii="Wingdings" w:hAnsi="Wingdings" w:hint="default"/>
+      </w:rPr>
+    </w:lvl>
+  </w:abstractNum>
+  <w:abstractNum w:abstractNumId="3" w15:restartNumberingAfterBreak="0">
+    <w:nsid w:val="7EB672F7"/>
+    <w:multiLevelType w:val="hybridMultilevel"/>
+    <w:tmpl w:val="A6F0C99C"/>
+    <w:lvl w:ilvl="0" w:tplc="040E0001">
+      <w:start w:val="1"/>
+      <w:numFmt w:val="bullet"/>
+      <w:lvlText w:val=""/>
+      <w:lvlJc w:val="left"/>
+      <w:pPr>
+        <w:ind w:left="720" w:hanging="360"/>
+      </w:pPr>
+      <w:rPr>
+        <w:rFonts w:ascii="Symbol" w:hAnsi="Symbol" w:hint="default"/>
+      </w:rPr>
+    </w:lvl>
+    <w:lvl w:ilvl="1" w:tplc="040E0003" w:tentative="1">
+      <w:start w:val="1"/>
+      <w:numFmt w:val="bullet"/>
+      <w:lvlText w:val="o"/>
+      <w:lvlJc w:val="left"/>
+      <w:pPr>
+        <w:ind w:left="1440" w:hanging="360"/>
+      </w:pPr>
+      <w:rPr>
+        <w:rFonts w:ascii="Courier New" w:hAnsi="Courier New" w:cs="Courier New" w:hint="default"/>
+      </w:rPr>
+    </w:lvl>
+    <w:lvl w:ilvl="2" w:tplc="040E0005" w:tentative="1">
+      <w:start w:val="1"/>
+      <w:numFmt w:val="bullet"/>
+      <w:lvlText w:val=""/>
+      <w:lvlJc w:val="left"/>
+      <w:pPr>
+        <w:ind w:left="2160" w:hanging="360"/>
+      </w:pPr>
+      <w:rPr>
+        <w:rFonts w:ascii="Wingdings" w:hAnsi="Wingdings" w:hint="default"/>
+      </w:rPr>
+    </w:lvl>
+    <w:lvl w:ilvl="3" w:tplc="040E0001" w:tentative="1">
+      <w:start w:val="1"/>
+      <w:numFmt w:val="bullet"/>
+      <w:lvlText w:val=""/>
+      <w:lvlJc w:val="left"/>
+      <w:pPr>
+        <w:ind w:left="2880" w:hanging="360"/>
+      </w:pPr>
+      <w:rPr>
+        <w:rFonts w:ascii="Symbol" w:hAnsi="Symbol" w:hint="default"/>
+      </w:rPr>
+    </w:lvl>
+    <w:lvl w:ilvl="4" w:tplc="040E0003" w:tentative="1">
+      <w:start w:val="1"/>
+      <w:numFmt w:val="bullet"/>
+      <w:lvlText w:val="o"/>
+      <w:lvlJc w:val="left"/>
+      <w:pPr>
+        <w:ind w:left="3600" w:hanging="360"/>
+      </w:pPr>
+      <w:rPr>
+        <w:rFonts w:ascii="Courier New" w:hAnsi="Courier New" w:cs="Courier New" w:hint="default"/>
+      </w:rPr>
+    </w:lvl>
+    <w:lvl w:ilvl="5" w:tplc="040E0005" w:tentative="1">
+      <w:start w:val="1"/>
+      <w:numFmt w:val="bullet"/>
+      <w:lvlText w:val=""/>
+      <w:lvlJc w:val="left"/>
+      <w:pPr>
+        <w:ind w:left="4320" w:hanging="360"/>
+      </w:pPr>
+      <w:rPr>
+        <w:rFonts w:ascii="Wingdings" w:hAnsi="Wingdings" w:hint="default"/>
+      </w:rPr>
+    </w:lvl>
+    <w:lvl w:ilvl="6" w:tplc="040E0001" w:tentative="1">
+      <w:start w:val="1"/>
+      <w:numFmt w:val="bullet"/>
+      <w:lvlText w:val=""/>
+      <w:lvlJc w:val="left"/>
+      <w:pPr>
+        <w:ind w:left="5040" w:hanging="360"/>
+      </w:pPr>
+      <w:rPr>
+        <w:rFonts w:ascii="Symbol" w:hAnsi="Symbol" w:hint="default"/>
+      </w:rPr>
+    </w:lvl>
+    <w:lvl w:ilvl="7" w:tplc="040E0003" w:tentative="1">
+      <w:start w:val="1"/>
+      <w:numFmt w:val="bullet"/>
+      <w:lvlText w:val="o"/>
+      <w:lvlJc w:val="left"/>
+      <w:pPr>
+        <w:ind w:left="5760" w:hanging="360"/>
+      </w:pPr>
+      <w:rPr>
+        <w:rFonts w:ascii="Courier New" w:hAnsi="Courier New" w:cs="Courier New" w:hint="default"/>
+      </w:rPr>
+    </w:lvl>
+    <w:lvl w:ilvl="8" w:tplc="040E0005" w:tentative="1">
+      <w:start w:val="1"/>
+      <w:numFmt w:val="bullet"/>
+      <w:lvlText w:val=""/>
+      <w:lvlJc w:val="left"/>
+      <w:pPr>
         <w:ind w:left="6480" w:hanging="360"/>
       </w:pPr>
       <w:rPr>
@@ -3553,9 +4334,15 @@
     </w:lvl>
   </w:abstractNum>
   <w:num w:numId="1" w16cid:durableId="33770327">
+    <w:abstractNumId w:val="3"/>
+  </w:num>
+  <w:num w:numId="2" w16cid:durableId="565265875">
     <w:abstractNumId w:val="1"/>
   </w:num>
-  <w:num w:numId="2" w16cid:durableId="565265875">
+  <w:num w:numId="3" w16cid:durableId="1458177206">
+    <w:abstractNumId w:val="2"/>
+  </w:num>
+  <w:num w:numId="4" w16cid:durableId="1687830723">
     <w:abstractNumId w:val="0"/>
   </w:num>
 </w:numbering>
@@ -3958,15 +4745,15 @@
     <w:lsdException w:name="Unresolved Mention" w:semiHidden="1" w:unhideWhenUsed="1"/>
     <w:lsdException w:name="Smart Link" w:semiHidden="1" w:unhideWhenUsed="1"/>
   </w:latentStyles>
-  <w:style w:type="paragraph" w:default="1" w:styleId="Normal">
+  <w:style w:type="paragraph" w:default="1" w:styleId="Norml">
     <w:name w:val="Normal"/>
     <w:qFormat/>
   </w:style>
-  <w:style w:type="paragraph" w:styleId="Heading1">
+  <w:style w:type="paragraph" w:styleId="Cmsor1">
     <w:name w:val="heading 1"/>
-    <w:basedOn w:val="Normal"/>
-    <w:next w:val="Normal"/>
-    <w:link w:val="Heading1Char"/>
+    <w:basedOn w:val="Norml"/>
+    <w:next w:val="Norml"/>
+    <w:link w:val="Cmsor1Char"/>
     <w:uiPriority w:val="9"/>
     <w:qFormat/>
     <w:rsid w:val="0005104C"/>
@@ -3983,11 +4770,11 @@
       <w:szCs w:val="40"/>
     </w:rPr>
   </w:style>
-  <w:style w:type="paragraph" w:styleId="Heading2">
+  <w:style w:type="paragraph" w:styleId="Cmsor2">
     <w:name w:val="heading 2"/>
-    <w:basedOn w:val="Normal"/>
-    <w:next w:val="Normal"/>
-    <w:link w:val="Heading2Char"/>
+    <w:basedOn w:val="Norml"/>
+    <w:next w:val="Norml"/>
+    <w:link w:val="Cmsor2Char"/>
     <w:uiPriority w:val="9"/>
     <w:semiHidden/>
     <w:unhideWhenUsed/>
@@ -4006,11 +4793,11 @@
       <w:szCs w:val="32"/>
     </w:rPr>
   </w:style>
-  <w:style w:type="paragraph" w:styleId="Heading3">
+  <w:style w:type="paragraph" w:styleId="Cmsor3">
     <w:name w:val="heading 3"/>
-    <w:basedOn w:val="Normal"/>
-    <w:next w:val="Normal"/>
-    <w:link w:val="Heading3Char"/>
+    <w:basedOn w:val="Norml"/>
+    <w:next w:val="Norml"/>
+    <w:link w:val="Cmsor3Char"/>
     <w:uiPriority w:val="9"/>
     <w:semiHidden/>
     <w:unhideWhenUsed/>
@@ -4029,11 +4816,11 @@
       <w:szCs w:val="28"/>
     </w:rPr>
   </w:style>
-  <w:style w:type="paragraph" w:styleId="Heading4">
+  <w:style w:type="paragraph" w:styleId="Cmsor4">
     <w:name w:val="heading 4"/>
-    <w:basedOn w:val="Normal"/>
-    <w:next w:val="Normal"/>
-    <w:link w:val="Heading4Char"/>
+    <w:basedOn w:val="Norml"/>
+    <w:next w:val="Norml"/>
+    <w:link w:val="Cmsor4Char"/>
     <w:uiPriority w:val="9"/>
     <w:semiHidden/>
     <w:unhideWhenUsed/>
@@ -4052,11 +4839,11 @@
       <w:color w:val="0F4761" w:themeColor="accent1" w:themeShade="BF"/>
     </w:rPr>
   </w:style>
-  <w:style w:type="paragraph" w:styleId="Heading5">
+  <w:style w:type="paragraph" w:styleId="Cmsor5">
     <w:name w:val="heading 5"/>
-    <w:basedOn w:val="Normal"/>
-    <w:next w:val="Normal"/>
-    <w:link w:val="Heading5Char"/>
+    <w:basedOn w:val="Norml"/>
+    <w:next w:val="Norml"/>
+    <w:link w:val="Cmsor5Char"/>
     <w:uiPriority w:val="9"/>
     <w:semiHidden/>
     <w:unhideWhenUsed/>
@@ -4073,11 +4860,11 @@
       <w:color w:val="0F4761" w:themeColor="accent1" w:themeShade="BF"/>
     </w:rPr>
   </w:style>
-  <w:style w:type="paragraph" w:styleId="Heading6">
+  <w:style w:type="paragraph" w:styleId="Cmsor6">
     <w:name w:val="heading 6"/>
-    <w:basedOn w:val="Normal"/>
-    <w:next w:val="Normal"/>
-    <w:link w:val="Heading6Char"/>
+    <w:basedOn w:val="Norml"/>
+    <w:next w:val="Norml"/>
+    <w:link w:val="Cmsor6Char"/>
     <w:uiPriority w:val="9"/>
     <w:semiHidden/>
     <w:unhideWhenUsed/>
@@ -4096,11 +4883,11 @@
       <w:color w:val="595959" w:themeColor="text1" w:themeTint="A6"/>
     </w:rPr>
   </w:style>
-  <w:style w:type="paragraph" w:styleId="Heading7">
+  <w:style w:type="paragraph" w:styleId="Cmsor7">
     <w:name w:val="heading 7"/>
-    <w:basedOn w:val="Normal"/>
-    <w:next w:val="Normal"/>
-    <w:link w:val="Heading7Char"/>
+    <w:basedOn w:val="Norml"/>
+    <w:next w:val="Norml"/>
+    <w:link w:val="Cmsor7Char"/>
     <w:uiPriority w:val="9"/>
     <w:semiHidden/>
     <w:unhideWhenUsed/>
@@ -4117,11 +4904,11 @@
       <w:color w:val="595959" w:themeColor="text1" w:themeTint="A6"/>
     </w:rPr>
   </w:style>
-  <w:style w:type="paragraph" w:styleId="Heading8">
+  <w:style w:type="paragraph" w:styleId="Cmsor8">
     <w:name w:val="heading 8"/>
-    <w:basedOn w:val="Normal"/>
-    <w:next w:val="Normal"/>
-    <w:link w:val="Heading8Char"/>
+    <w:basedOn w:val="Norml"/>
+    <w:next w:val="Norml"/>
+    <w:link w:val="Cmsor8Char"/>
     <w:uiPriority w:val="9"/>
     <w:semiHidden/>
     <w:unhideWhenUsed/>
@@ -4140,11 +4927,11 @@
       <w:color w:val="272727" w:themeColor="text1" w:themeTint="D8"/>
     </w:rPr>
   </w:style>
-  <w:style w:type="paragraph" w:styleId="Heading9">
+  <w:style w:type="paragraph" w:styleId="Cmsor9">
     <w:name w:val="heading 9"/>
-    <w:basedOn w:val="Normal"/>
-    <w:next w:val="Normal"/>
-    <w:link w:val="Heading9Char"/>
+    <w:basedOn w:val="Norml"/>
+    <w:next w:val="Norml"/>
+    <w:link w:val="Cmsor9Char"/>
     <w:uiPriority w:val="9"/>
     <w:semiHidden/>
     <w:unhideWhenUsed/>
@@ -4161,13 +4948,13 @@
       <w:color w:val="272727" w:themeColor="text1" w:themeTint="D8"/>
     </w:rPr>
   </w:style>
-  <w:style w:type="character" w:default="1" w:styleId="DefaultParagraphFont">
+  <w:style w:type="character" w:default="1" w:styleId="Bekezdsalapbettpusa">
     <w:name w:val="Default Paragraph Font"/>
     <w:uiPriority w:val="1"/>
     <w:semiHidden/>
     <w:unhideWhenUsed/>
   </w:style>
-  <w:style w:type="table" w:default="1" w:styleId="TableNormal">
+  <w:style w:type="table" w:default="1" w:styleId="Normltblzat">
     <w:name w:val="Normal Table"/>
     <w:uiPriority w:val="99"/>
     <w:semiHidden/>
@@ -4182,15 +4969,15 @@
       </w:tblCellMar>
     </w:tblPr>
   </w:style>
-  <w:style w:type="numbering" w:default="1" w:styleId="NoList">
+  <w:style w:type="numbering" w:default="1" w:styleId="Nemlista">
     <w:name w:val="No List"/>
     <w:uiPriority w:val="99"/>
     <w:semiHidden/>
     <w:unhideWhenUsed/>
   </w:style>
-  <w:style w:type="character" w:customStyle="1" w:styleId="Heading1Char">
-    <w:name w:val="Heading 1 Char"/>
-    <w:link w:val="Heading1"/>
+  <w:style w:type="character" w:customStyle="1" w:styleId="Cmsor1Char">
+    <w:name w:val="Címsor 1 Char"/>
+    <w:link w:val="Cmsor1"/>
     <w:uiPriority w:val="9"/>
     <w:rsid w:val="38171242"/>
     <w:rPr>
@@ -4200,9 +4987,9 @@
       <w:szCs w:val="40"/>
     </w:rPr>
   </w:style>
-  <w:style w:type="character" w:customStyle="1" w:styleId="Heading2Char">
-    <w:name w:val="Heading 2 Char"/>
-    <w:link w:val="Heading2"/>
+  <w:style w:type="character" w:customStyle="1" w:styleId="Cmsor2Char">
+    <w:name w:val="Címsor 2 Char"/>
+    <w:link w:val="Cmsor2"/>
     <w:uiPriority w:val="9"/>
     <w:semiHidden/>
     <w:rsid w:val="38171242"/>
@@ -4213,9 +5000,9 @@
       <w:szCs w:val="32"/>
     </w:rPr>
   </w:style>
-  <w:style w:type="character" w:customStyle="1" w:styleId="Heading3Char">
-    <w:name w:val="Heading 3 Char"/>
-    <w:link w:val="Heading3"/>
+  <w:style w:type="character" w:customStyle="1" w:styleId="Cmsor3Char">
+    <w:name w:val="Címsor 3 Char"/>
+    <w:link w:val="Cmsor3"/>
     <w:uiPriority w:val="9"/>
     <w:semiHidden/>
     <w:rsid w:val="38171242"/>
@@ -4226,9 +5013,9 @@
       <w:szCs w:val="28"/>
     </w:rPr>
   </w:style>
-  <w:style w:type="character" w:customStyle="1" w:styleId="Heading4Char">
-    <w:name w:val="Heading 4 Char"/>
-    <w:link w:val="Heading4"/>
+  <w:style w:type="character" w:customStyle="1" w:styleId="Cmsor4Char">
+    <w:name w:val="Címsor 4 Char"/>
+    <w:link w:val="Cmsor4"/>
     <w:uiPriority w:val="9"/>
     <w:semiHidden/>
     <w:rsid w:val="38171242"/>
@@ -4239,9 +5026,9 @@
       <w:color w:val="0F4761" w:themeColor="accent1" w:themeShade="BF"/>
     </w:rPr>
   </w:style>
-  <w:style w:type="character" w:customStyle="1" w:styleId="Heading5Char">
-    <w:name w:val="Heading 5 Char"/>
-    <w:link w:val="Heading5"/>
+  <w:style w:type="character" w:customStyle="1" w:styleId="Cmsor5Char">
+    <w:name w:val="Címsor 5 Char"/>
+    <w:link w:val="Cmsor5"/>
     <w:uiPriority w:val="9"/>
     <w:semiHidden/>
     <w:rsid w:val="38171242"/>
@@ -4250,9 +5037,9 @@
       <w:color w:val="0F4761" w:themeColor="accent1" w:themeShade="BF"/>
     </w:rPr>
   </w:style>
-  <w:style w:type="character" w:customStyle="1" w:styleId="Heading6Char">
-    <w:name w:val="Heading 6 Char"/>
-    <w:link w:val="Heading6"/>
+  <w:style w:type="character" w:customStyle="1" w:styleId="Cmsor6Char">
+    <w:name w:val="Címsor 6 Char"/>
+    <w:link w:val="Cmsor6"/>
     <w:uiPriority w:val="9"/>
     <w:semiHidden/>
     <w:rsid w:val="38171242"/>
@@ -4263,9 +5050,9 @@
       <w:color w:val="595959" w:themeColor="text1" w:themeTint="A6"/>
     </w:rPr>
   </w:style>
-  <w:style w:type="character" w:customStyle="1" w:styleId="Heading7Char">
-    <w:name w:val="Heading 7 Char"/>
-    <w:link w:val="Heading7"/>
+  <w:style w:type="character" w:customStyle="1" w:styleId="Cmsor7Char">
+    <w:name w:val="Címsor 7 Char"/>
+    <w:link w:val="Cmsor7"/>
     <w:uiPriority w:val="9"/>
     <w:semiHidden/>
     <w:rsid w:val="38171242"/>
@@ -4274,9 +5061,9 @@
       <w:color w:val="595959" w:themeColor="text1" w:themeTint="A6"/>
     </w:rPr>
   </w:style>
-  <w:style w:type="character" w:customStyle="1" w:styleId="Heading8Char">
-    <w:name w:val="Heading 8 Char"/>
-    <w:link w:val="Heading8"/>
+  <w:style w:type="character" w:customStyle="1" w:styleId="Cmsor8Char">
+    <w:name w:val="Címsor 8 Char"/>
+    <w:link w:val="Cmsor8"/>
     <w:uiPriority w:val="9"/>
     <w:semiHidden/>
     <w:rsid w:val="38171242"/>
@@ -4287,9 +5074,9 @@
       <w:color w:val="272727"/>
     </w:rPr>
   </w:style>
-  <w:style w:type="character" w:customStyle="1" w:styleId="Heading9Char">
-    <w:name w:val="Heading 9 Char"/>
-    <w:link w:val="Heading9"/>
+  <w:style w:type="character" w:customStyle="1" w:styleId="Cmsor9Char">
+    <w:name w:val="Címsor 9 Char"/>
+    <w:link w:val="Cmsor9"/>
     <w:uiPriority w:val="9"/>
     <w:semiHidden/>
     <w:rsid w:val="38171242"/>
@@ -4298,11 +5085,11 @@
       <w:color w:val="272727"/>
     </w:rPr>
   </w:style>
-  <w:style w:type="paragraph" w:styleId="Title">
+  <w:style w:type="paragraph" w:styleId="Cm">
     <w:name w:val="Title"/>
-    <w:basedOn w:val="Normal"/>
-    <w:next w:val="Normal"/>
-    <w:link w:val="TitleChar"/>
+    <w:basedOn w:val="Norml"/>
+    <w:next w:val="Norml"/>
+    <w:link w:val="CmChar"/>
     <w:uiPriority w:val="10"/>
     <w:qFormat/>
     <w:rsid w:val="0005104C"/>
@@ -4318,9 +5105,9 @@
       <w:szCs w:val="56"/>
     </w:rPr>
   </w:style>
-  <w:style w:type="character" w:customStyle="1" w:styleId="TitleChar">
-    <w:name w:val="Title Char"/>
-    <w:link w:val="Title"/>
+  <w:style w:type="character" w:customStyle="1" w:styleId="CmChar">
+    <w:name w:val="Cím Char"/>
+    <w:link w:val="Cm"/>
     <w:uiPriority w:val="10"/>
     <w:rsid w:val="38171242"/>
     <w:rPr>
@@ -4329,11 +5116,11 @@
       <w:szCs w:val="56"/>
     </w:rPr>
   </w:style>
-  <w:style w:type="paragraph" w:styleId="Subtitle">
+  <w:style w:type="paragraph" w:styleId="Alcm">
     <w:name w:val="Subtitle"/>
-    <w:basedOn w:val="Normal"/>
-    <w:next w:val="Normal"/>
-    <w:link w:val="SubtitleChar"/>
+    <w:basedOn w:val="Norml"/>
+    <w:next w:val="Norml"/>
+    <w:link w:val="AlcmChar"/>
     <w:uiPriority w:val="11"/>
     <w:qFormat/>
     <w:rsid w:val="0005104C"/>
@@ -4350,9 +5137,9 @@
       <w:szCs w:val="28"/>
     </w:rPr>
   </w:style>
-  <w:style w:type="character" w:customStyle="1" w:styleId="SubtitleChar">
-    <w:name w:val="Subtitle Char"/>
-    <w:link w:val="Subtitle"/>
+  <w:style w:type="character" w:customStyle="1" w:styleId="AlcmChar">
+    <w:name w:val="Alcím Char"/>
+    <w:link w:val="Alcm"/>
     <w:uiPriority w:val="11"/>
     <w:rsid w:val="38171242"/>
     <w:rPr>
@@ -4362,11 +5149,11 @@
       <w:szCs w:val="28"/>
     </w:rPr>
   </w:style>
-  <w:style w:type="paragraph" w:styleId="Quote">
+  <w:style w:type="paragraph" w:styleId="Idzet">
     <w:name w:val="Quote"/>
-    <w:basedOn w:val="Normal"/>
-    <w:next w:val="Normal"/>
-    <w:link w:val="QuoteChar"/>
+    <w:basedOn w:val="Norml"/>
+    <w:next w:val="Norml"/>
+    <w:link w:val="IdzetChar"/>
     <w:uiPriority w:val="29"/>
     <w:qFormat/>
     <w:rsid w:val="0005104C"/>
@@ -4380,9 +5167,9 @@
       <w:color w:val="404040" w:themeColor="text1" w:themeTint="BF"/>
     </w:rPr>
   </w:style>
-  <w:style w:type="character" w:customStyle="1" w:styleId="QuoteChar">
-    <w:name w:val="Quote Char"/>
-    <w:link w:val="Quote"/>
+  <w:style w:type="character" w:customStyle="1" w:styleId="IdzetChar">
+    <w:name w:val="Idézet Char"/>
+    <w:link w:val="Idzet"/>
     <w:uiPriority w:val="29"/>
     <w:rsid w:val="38171242"/>
     <w:rPr>
@@ -4391,9 +5178,9 @@
       <w:color w:val="404040" w:themeColor="text1" w:themeTint="BF"/>
     </w:rPr>
   </w:style>
-  <w:style w:type="paragraph" w:styleId="ListParagraph">
+  <w:style w:type="paragraph" w:styleId="Listaszerbekezds">
     <w:name w:val="List Paragraph"/>
-    <w:basedOn w:val="Normal"/>
+    <w:basedOn w:val="Norml"/>
     <w:uiPriority w:val="34"/>
     <w:qFormat/>
     <w:rsid w:val="0005104C"/>
@@ -4402,7 +5189,7 @@
       <w:contextualSpacing/>
     </w:pPr>
   </w:style>
-  <w:style w:type="character" w:styleId="IntenseEmphasis">
+  <w:style w:type="character" w:styleId="Erskiemels">
     <w:name w:val="Intense Emphasis"/>
     <w:uiPriority w:val="21"/>
     <w:qFormat/>
@@ -4413,11 +5200,11 @@
       <w:color w:val="0F4761" w:themeColor="accent1" w:themeShade="BF"/>
     </w:rPr>
   </w:style>
-  <w:style w:type="paragraph" w:styleId="IntenseQuote">
+  <w:style w:type="paragraph" w:styleId="Kiemeltidzet">
     <w:name w:val="Intense Quote"/>
-    <w:basedOn w:val="Normal"/>
-    <w:next w:val="Normal"/>
-    <w:link w:val="IntenseQuoteChar"/>
+    <w:basedOn w:val="Norml"/>
+    <w:next w:val="Norml"/>
+    <w:link w:val="KiemeltidzetChar"/>
     <w:uiPriority w:val="30"/>
     <w:qFormat/>
     <w:rsid w:val="0005104C"/>
@@ -4436,9 +5223,9 @@
       <w:color w:val="0F4761" w:themeColor="accent1" w:themeShade="BF"/>
     </w:rPr>
   </w:style>
-  <w:style w:type="character" w:customStyle="1" w:styleId="IntenseQuoteChar">
-    <w:name w:val="Intense Quote Char"/>
-    <w:link w:val="IntenseQuote"/>
+  <w:style w:type="character" w:customStyle="1" w:styleId="KiemeltidzetChar">
+    <w:name w:val="Kiemelt idézet Char"/>
+    <w:link w:val="Kiemeltidzet"/>
     <w:uiPriority w:val="30"/>
     <w:rsid w:val="38171242"/>
     <w:rPr>
@@ -4447,7 +5234,7 @@
       <w:color w:val="0F4761" w:themeColor="accent1" w:themeShade="BF"/>
     </w:rPr>
   </w:style>
-  <w:style w:type="character" w:styleId="IntenseReference">
+  <w:style w:type="character" w:styleId="Ershivatkozs">
     <w:name w:val="Intense Reference"/>
     <w:uiPriority w:val="32"/>
     <w:qFormat/>
@@ -4459,7 +5246,7 @@
       <w:color w:val="0F4761" w:themeColor="accent1" w:themeShade="BF"/>
     </w:rPr>
   </w:style>
-  <w:style w:type="character" w:styleId="Hyperlink">
+  <w:style w:type="character" w:styleId="Hiperhivatkozs">
     <w:name w:val="Hyperlink"/>
     <w:uiPriority w:val="99"/>
     <w:unhideWhenUsed/>
@@ -4469,9 +5256,9 @@
       <w:u w:val="single"/>
     </w:rPr>
   </w:style>
-  <w:style w:type="paragraph" w:styleId="NormalWeb">
+  <w:style w:type="paragraph" w:styleId="NormlWeb">
     <w:name w:val="Normal (Web)"/>
-    <w:basedOn w:val="Normal"/>
+    <w:basedOn w:val="Norml"/>
     <w:uiPriority w:val="99"/>
     <w:semiHidden/>
     <w:unhideWhenUsed/>

</xml_diff>

<commit_message>
Revert "Making the website's view look like the plan, working on views and first testings (+documentation update, tests' documentation start)"
This reverts commit 0f5ee2199eb16793f4f5cf4a9e217dcc04effc90.

Reverting to the previous commit because the latest one screwed up the project
</commit_message>
<xml_diff>
--- a/documentation.docx
+++ b/documentation.docx
@@ -79,7 +79,26 @@
           <w:sz w:val="40"/>
           <w:szCs w:val="40"/>
         </w:rPr>
-        <w:t xml:space="preserve"> Susán Csongor, El-</w:t>
+        <w:t xml:space="preserve"> Susán Csongor, El-Nabulsy Csongor Alan</w:t>
+      </w:r>
+    </w:p>
+    <w:p>
+      <w:pPr>
+        <w:rPr>
+          <w:rFonts w:ascii="Times New Roman" w:hAnsi="Times New Roman" w:cs="Times New Roman"/>
+          <w:bCs/>
+          <w:sz w:val="40"/>
+          <w:szCs w:val="40"/>
+        </w:rPr>
+      </w:pPr>
+      <w:r>
+        <w:rPr>
+          <w:rFonts w:ascii="Times New Roman" w:hAnsi="Times New Roman" w:cs="Times New Roman"/>
+          <w:bCs/>
+          <w:sz w:val="40"/>
+          <w:szCs w:val="40"/>
+        </w:rPr>
+        <w:t>Az alkalmazás célja az, hogy a Bláthy-</w:t>
       </w:r>
       <w:proofErr w:type="spellStart"/>
       <w:r>
@@ -89,7 +108,7 @@
           <w:sz w:val="40"/>
           <w:szCs w:val="40"/>
         </w:rPr>
-        <w:t>Nabulsy</w:t>
+        <w:t>ba</w:t>
       </w:r>
       <w:proofErr w:type="spellEnd"/>
       <w:r>
@@ -99,45 +118,6 @@
           <w:sz w:val="40"/>
           <w:szCs w:val="40"/>
         </w:rPr>
-        <w:t xml:space="preserve"> Csongor Alan</w:t>
-      </w:r>
-    </w:p>
-    <w:p>
-      <w:pPr>
-        <w:rPr>
-          <w:rFonts w:ascii="Times New Roman" w:hAnsi="Times New Roman" w:cs="Times New Roman"/>
-          <w:bCs/>
-          <w:sz w:val="40"/>
-          <w:szCs w:val="40"/>
-        </w:rPr>
-      </w:pPr>
-      <w:r>
-        <w:rPr>
-          <w:rFonts w:ascii="Times New Roman" w:hAnsi="Times New Roman" w:cs="Times New Roman"/>
-          <w:bCs/>
-          <w:sz w:val="40"/>
-          <w:szCs w:val="40"/>
-        </w:rPr>
-        <w:t>Az alkalmazás célja az, hogy a Bláthy-</w:t>
-      </w:r>
-      <w:proofErr w:type="spellStart"/>
-      <w:r>
-        <w:rPr>
-          <w:rFonts w:ascii="Times New Roman" w:hAnsi="Times New Roman" w:cs="Times New Roman"/>
-          <w:bCs/>
-          <w:sz w:val="40"/>
-          <w:szCs w:val="40"/>
-        </w:rPr>
-        <w:t>ba</w:t>
-      </w:r>
-      <w:proofErr w:type="spellEnd"/>
-      <w:r>
-        <w:rPr>
-          <w:rFonts w:ascii="Times New Roman" w:hAnsi="Times New Roman" w:cs="Times New Roman"/>
-          <w:bCs/>
-          <w:sz w:val="40"/>
-          <w:szCs w:val="40"/>
-        </w:rPr>
         <w:t xml:space="preserve"> járó diákok előre meghatározott szünetekben kedvenc zenéjüket tudják majd hallgatni anélkül, hogy nekik kelljen azt maguknak vagy másoknak lejátszani. Ráadásul az, hogy az iskola az ő zenéjüket játssza, akár egy általuk kijelölt időpontban (ezt üzenetben írhatják le), még több élményt ad, és azt az érzést, hogy a zenéjük – és ezzel együtt önmaguk is – meg van becsülve.</w:t>
       </w:r>
     </w:p>
@@ -191,7 +171,7 @@
     </w:p>
     <w:p>
       <w:pPr>
-        <w:pStyle w:val="Listaszerbekezds"/>
+        <w:pStyle w:val="ListParagraph"/>
         <w:numPr>
           <w:ilvl w:val="0"/>
           <w:numId w:val="1"/>
@@ -213,7 +193,7 @@
     </w:p>
     <w:p>
       <w:pPr>
-        <w:pStyle w:val="Listaszerbekezds"/>
+        <w:pStyle w:val="ListParagraph"/>
         <w:numPr>
           <w:ilvl w:val="0"/>
           <w:numId w:val="1"/>
@@ -235,7 +215,7 @@
     </w:p>
     <w:p>
       <w:pPr>
-        <w:pStyle w:val="Listaszerbekezds"/>
+        <w:pStyle w:val="ListParagraph"/>
         <w:ind w:left="0"/>
         <w:rPr>
           <w:rFonts w:ascii="Times New Roman" w:hAnsi="Times New Roman" w:cs="Times New Roman"/>
@@ -479,7 +459,7 @@
     </w:p>
     <w:p>
       <w:pPr>
-        <w:pStyle w:val="Listaszerbekezds"/>
+        <w:pStyle w:val="ListParagraph"/>
         <w:rPr>
           <w:rFonts w:ascii="Times New Roman" w:hAnsi="Times New Roman" w:cs="Times New Roman"/>
           <w:sz w:val="36"/>
@@ -904,7 +884,7 @@
       <w:hyperlink r:id="rId14">
         <w:r>
           <w:rPr>
-            <w:rStyle w:val="Hiperhivatkozs"/>
+            <w:rStyle w:val="Hyperlink"/>
             <w:rFonts w:ascii="Times New Roman" w:eastAsia="Times New Roman" w:hAnsi="Times New Roman" w:cs="Times New Roman"/>
             <w:sz w:val="36"/>
             <w:szCs w:val="36"/>
@@ -1308,7 +1288,7 @@
           <w:szCs w:val="36"/>
         </w:rPr>
         <w:drawing>
-          <wp:inline distT="0" distB="0" distL="0" distR="0" wp14:anchorId="78A43544" wp14:editId="5279A085">
+          <wp:inline distT="0" distB="0" distL="0" distR="0" wp14:anchorId="78A43544" wp14:editId="33012297">
             <wp:extent cx="3166535" cy="1781175"/>
             <wp:effectExtent l="0" t="0" r="0" b="0"/>
             <wp:docPr id="3" name="Kép 3" descr="C:\Users\elnabulsy.csongor\AppData\Local\Microsoft\Windows\INetCache\Content.MSO\F75754B3.tmp"/>
@@ -1400,7 +1380,7 @@
           <w:szCs w:val="36"/>
         </w:rPr>
         <w:drawing>
-          <wp:inline distT="0" distB="0" distL="0" distR="0" wp14:anchorId="4E211814" wp14:editId="477AF0ED">
+          <wp:inline distT="0" distB="0" distL="0" distR="0" wp14:anchorId="4E211814" wp14:editId="613E6DA4">
             <wp:extent cx="3133725" cy="1762720"/>
             <wp:effectExtent l="0" t="0" r="0" b="9525"/>
             <wp:docPr id="4" name="Kép 4" descr="C:\Users\elnabulsy.csongor\Downloads\ui_main_student.png"/>
@@ -1482,7 +1462,7 @@
           <w:szCs w:val="36"/>
         </w:rPr>
         <w:drawing>
-          <wp:inline distT="0" distB="0" distL="0" distR="0" wp14:anchorId="5137FB78" wp14:editId="051D1352">
+          <wp:inline distT="0" distB="0" distL="0" distR="0" wp14:anchorId="5137FB78" wp14:editId="76ACE0F1">
             <wp:extent cx="3166110" cy="1780938"/>
             <wp:effectExtent l="0" t="0" r="0" b="0"/>
             <wp:docPr id="5" name="Kép 5" descr="C:\Users\elnabulsy.csongor\Downloads\ui_main_scheduler.png"/>
@@ -1593,7 +1573,7 @@
           <w:szCs w:val="36"/>
         </w:rPr>
         <w:drawing>
-          <wp:inline distT="0" distB="0" distL="0" distR="0" wp14:anchorId="27EC1C67" wp14:editId="44EAF746">
+          <wp:inline distT="0" distB="0" distL="0" distR="0" wp14:anchorId="27EC1C67" wp14:editId="46A658E3">
             <wp:extent cx="3055620" cy="1718786"/>
             <wp:effectExtent l="0" t="0" r="0" b="0"/>
             <wp:docPr id="6" name="Kép 6" descr="C:\Users\elnabulsy.csongor\Downloads\ui_main_admin.png"/>
@@ -1675,7 +1655,7 @@
           <w:szCs w:val="36"/>
         </w:rPr>
         <w:drawing>
-          <wp:inline distT="0" distB="0" distL="0" distR="0" wp14:anchorId="08225B4F" wp14:editId="11B0C10E">
+          <wp:inline distT="0" distB="0" distL="0" distR="0" wp14:anchorId="08225B4F" wp14:editId="443F2CCC">
             <wp:extent cx="2933700" cy="1942430"/>
             <wp:effectExtent l="0" t="0" r="0" b="1270"/>
             <wp:docPr id="7" name="Kép 7" descr="C:\Users\elnabulsy.csongor\Downloads\ui_structure.png"/>
@@ -1848,7 +1828,7 @@
           <w:szCs w:val="36"/>
         </w:rPr>
         <w:drawing>
-          <wp:inline distT="0" distB="0" distL="0" distR="0" wp14:anchorId="2C256DB5" wp14:editId="5DC2B543">
+          <wp:inline distT="0" distB="0" distL="0" distR="0" wp14:anchorId="2C256DB5" wp14:editId="14094F98">
             <wp:extent cx="3329940" cy="1752493"/>
             <wp:effectExtent l="0" t="0" r="3810" b="635"/>
             <wp:docPr id="9" name="Kép 9"/>
@@ -2406,7 +2386,7 @@
     </w:p>
     <w:p>
       <w:pPr>
-        <w:pStyle w:val="Listaszerbekezds"/>
+        <w:pStyle w:val="ListParagraph"/>
         <w:numPr>
           <w:ilvl w:val="0"/>
           <w:numId w:val="2"/>
@@ -2428,7 +2408,7 @@
     </w:p>
     <w:p>
       <w:pPr>
-        <w:pStyle w:val="Listaszerbekezds"/>
+        <w:pStyle w:val="ListParagraph"/>
         <w:numPr>
           <w:ilvl w:val="0"/>
           <w:numId w:val="2"/>
@@ -2460,7 +2440,7 @@
     </w:p>
     <w:p>
       <w:pPr>
-        <w:pStyle w:val="Listaszerbekezds"/>
+        <w:pStyle w:val="ListParagraph"/>
         <w:numPr>
           <w:ilvl w:val="0"/>
           <w:numId w:val="2"/>
@@ -2518,7 +2498,7 @@
     </w:p>
     <w:p>
       <w:pPr>
-        <w:pStyle w:val="Listaszerbekezds"/>
+        <w:pStyle w:val="ListParagraph"/>
         <w:numPr>
           <w:ilvl w:val="0"/>
           <w:numId w:val="2"/>
@@ -2568,7 +2548,7 @@
     </w:p>
     <w:p>
       <w:pPr>
-        <w:pStyle w:val="Listaszerbekezds"/>
+        <w:pStyle w:val="ListParagraph"/>
         <w:numPr>
           <w:ilvl w:val="0"/>
           <w:numId w:val="2"/>
@@ -2602,25 +2582,7 @@
           <w:sz w:val="36"/>
           <w:szCs w:val="36"/>
         </w:rPr>
-        <w:t>A projektet El-</w:t>
-      </w:r>
-      <w:proofErr w:type="spellStart"/>
-      <w:r>
-        <w:rPr>
-          <w:rFonts w:ascii="Times New Roman" w:eastAsia="Times New Roman" w:hAnsi="Times New Roman" w:cs="Times New Roman"/>
-          <w:sz w:val="36"/>
-          <w:szCs w:val="36"/>
-        </w:rPr>
-        <w:t>Nabulsy</w:t>
-      </w:r>
-      <w:proofErr w:type="spellEnd"/>
-      <w:r>
-        <w:rPr>
-          <w:rFonts w:ascii="Times New Roman" w:eastAsia="Times New Roman" w:hAnsi="Times New Roman" w:cs="Times New Roman"/>
-          <w:sz w:val="36"/>
-          <w:szCs w:val="36"/>
-        </w:rPr>
-        <w:t xml:space="preserve"> Csongor hozta létre és írta meg a kódját, a működéshez szükséges folyamatábrákat, az adatbázis ER-diagramját</w:t>
+        <w:t>A projektet El-Nabulsy Csongor hozta létre és írta meg a kódját, a működéshez szükséges folyamatábrákat, az adatbázis ER-diagramját</w:t>
       </w:r>
       <w:r>
         <w:rPr>
@@ -2857,7 +2819,47 @@
           <w:sz w:val="36"/>
           <w:szCs w:val="36"/>
         </w:rPr>
-        <w:t>(El-</w:t>
+        <w:t>(El-Nabulsy Csongor Alan</w:t>
+      </w:r>
+      <w:r>
+        <w:rPr>
+          <w:rFonts w:ascii="Times New Roman" w:eastAsia="Times New Roman" w:hAnsi="Times New Roman" w:cs="Times New Roman"/>
+          <w:sz w:val="36"/>
+          <w:szCs w:val="36"/>
+        </w:rPr>
+        <w:t>, Susán Csongor György</w:t>
+      </w:r>
+      <w:r>
+        <w:rPr>
+          <w:rFonts w:ascii="Times New Roman" w:eastAsia="Times New Roman" w:hAnsi="Times New Roman" w:cs="Times New Roman"/>
+          <w:sz w:val="36"/>
+          <w:szCs w:val="36"/>
+        </w:rPr>
+        <w:t>) Nézetek kidolgozása</w:t>
+      </w:r>
+      <w:r>
+        <w:rPr>
+          <w:rFonts w:ascii="Times New Roman" w:eastAsia="Times New Roman" w:hAnsi="Times New Roman" w:cs="Times New Roman"/>
+          <w:sz w:val="36"/>
+          <w:szCs w:val="36"/>
+        </w:rPr>
+        <w:t xml:space="preserve"> (El-Nabulsy: főoldal és annak </w:t>
+      </w:r>
+      <w:r>
+        <w:rPr>
+          <w:rFonts w:ascii="Times New Roman" w:eastAsia="Times New Roman" w:hAnsi="Times New Roman" w:cs="Times New Roman"/>
+          <w:sz w:val="36"/>
+          <w:szCs w:val="36"/>
+        </w:rPr>
+        <w:t xml:space="preserve">tanulói </w:t>
+      </w:r>
+      <w:r>
+        <w:rPr>
+          <w:rFonts w:ascii="Times New Roman" w:eastAsia="Times New Roman" w:hAnsi="Times New Roman" w:cs="Times New Roman"/>
+          <w:sz w:val="36"/>
+          <w:szCs w:val="36"/>
+        </w:rPr>
+        <w:t xml:space="preserve">variánsa, Susán: login befejezése és </w:t>
       </w:r>
       <w:proofErr w:type="spellStart"/>
       <w:r>
@@ -2866,7 +2868,7 @@
           <w:sz w:val="36"/>
           <w:szCs w:val="36"/>
         </w:rPr>
-        <w:t>Nabulsy</w:t>
+        <w:t>admin</w:t>
       </w:r>
       <w:proofErr w:type="spellEnd"/>
       <w:r>
@@ -2875,31 +2877,181 @@
           <w:sz w:val="36"/>
           <w:szCs w:val="36"/>
         </w:rPr>
-        <w:t xml:space="preserve"> Csongor Alan</w:t>
-      </w:r>
-      <w:r>
-        <w:rPr>
-          <w:rFonts w:ascii="Times New Roman" w:eastAsia="Times New Roman" w:hAnsi="Times New Roman" w:cs="Times New Roman"/>
-          <w:sz w:val="36"/>
-          <w:szCs w:val="36"/>
-        </w:rPr>
-        <w:t>, Susán Csongor György</w:t>
-      </w:r>
-      <w:r>
-        <w:rPr>
-          <w:rFonts w:ascii="Times New Roman" w:eastAsia="Times New Roman" w:hAnsi="Times New Roman" w:cs="Times New Roman"/>
-          <w:sz w:val="36"/>
-          <w:szCs w:val="36"/>
-        </w:rPr>
-        <w:t>) Nézetek kidolgozása</w:t>
-      </w:r>
-      <w:r>
-        <w:rPr>
-          <w:rFonts w:ascii="Times New Roman" w:eastAsia="Times New Roman" w:hAnsi="Times New Roman" w:cs="Times New Roman"/>
-          <w:sz w:val="36"/>
-          <w:szCs w:val="36"/>
-        </w:rPr>
-        <w:t xml:space="preserve"> (El-</w:t>
+        <w:t xml:space="preserve"> elkezdése, valamint a logika kidolgozásának megkezdése</w:t>
+      </w:r>
+      <w:r>
+        <w:rPr>
+          <w:rFonts w:ascii="Times New Roman" w:eastAsia="Times New Roman" w:hAnsi="Times New Roman" w:cs="Times New Roman"/>
+          <w:sz w:val="36"/>
+          <w:szCs w:val="36"/>
+        </w:rPr>
+        <w:t xml:space="preserve"> + jegyzetek)</w:t>
+      </w:r>
+    </w:p>
+    <w:p>
+      <w:pPr>
+        <w:rPr>
+          <w:rFonts w:ascii="Times New Roman" w:eastAsia="Times New Roman" w:hAnsi="Times New Roman" w:cs="Times New Roman"/>
+          <w:sz w:val="36"/>
+          <w:szCs w:val="36"/>
+        </w:rPr>
+      </w:pPr>
+    </w:p>
+    <w:p>
+      <w:pPr>
+        <w:rPr>
+          <w:rFonts w:ascii="Times New Roman" w:eastAsia="Times New Roman" w:hAnsi="Times New Roman" w:cs="Times New Roman"/>
+          <w:sz w:val="36"/>
+          <w:szCs w:val="36"/>
+        </w:rPr>
+      </w:pPr>
+      <w:r>
+        <w:rPr>
+          <w:rFonts w:ascii="Times New Roman" w:eastAsia="Times New Roman" w:hAnsi="Times New Roman" w:cs="Times New Roman"/>
+          <w:b/>
+          <w:bCs/>
+          <w:sz w:val="40"/>
+          <w:szCs w:val="40"/>
+        </w:rPr>
+        <w:t>2026-03-04 10:45-</w:t>
+      </w:r>
+      <w:r>
+        <w:rPr>
+          <w:rFonts w:ascii="Times New Roman" w:eastAsia="Times New Roman" w:hAnsi="Times New Roman" w:cs="Times New Roman"/>
+          <w:b/>
+          <w:bCs/>
+          <w:sz w:val="40"/>
+          <w:szCs w:val="40"/>
+        </w:rPr>
+        <w:t>12:00</w:t>
+      </w:r>
+      <w:r>
+        <w:rPr>
+          <w:rFonts w:ascii="Times New Roman" w:eastAsia="Times New Roman" w:hAnsi="Times New Roman" w:cs="Times New Roman"/>
+          <w:b/>
+          <w:bCs/>
+          <w:sz w:val="40"/>
+          <w:szCs w:val="40"/>
+        </w:rPr>
+        <w:br/>
+      </w:r>
+      <w:r>
+        <w:rPr>
+          <w:rFonts w:ascii="Times New Roman" w:eastAsia="Times New Roman" w:hAnsi="Times New Roman" w:cs="Times New Roman"/>
+          <w:sz w:val="36"/>
+          <w:szCs w:val="36"/>
+        </w:rPr>
+        <w:t xml:space="preserve">(El-Nabulsy Csongor Alan) A zenebekérő oldal </w:t>
+      </w:r>
+      <w:r>
+        <w:rPr>
+          <w:rFonts w:ascii="Times New Roman" w:eastAsia="Times New Roman" w:hAnsi="Times New Roman" w:cs="Times New Roman"/>
+          <w:sz w:val="36"/>
+          <w:szCs w:val="36"/>
+        </w:rPr>
+        <w:t>részben elkészítése</w:t>
+      </w:r>
+      <w:r>
+        <w:rPr>
+          <w:rFonts w:ascii="Times New Roman" w:eastAsia="Times New Roman" w:hAnsi="Times New Roman" w:cs="Times New Roman"/>
+          <w:sz w:val="36"/>
+          <w:szCs w:val="36"/>
+        </w:rPr>
+        <w:t>.</w:t>
+      </w:r>
+    </w:p>
+    <w:p>
+      <w:pPr>
+        <w:rPr>
+          <w:rFonts w:ascii="Times New Roman" w:eastAsia="Times New Roman" w:hAnsi="Times New Roman" w:cs="Times New Roman"/>
+          <w:sz w:val="36"/>
+          <w:szCs w:val="36"/>
+        </w:rPr>
+      </w:pPr>
+    </w:p>
+    <w:p>
+      <w:pPr>
+        <w:rPr>
+          <w:rFonts w:ascii="Times New Roman" w:eastAsia="Times New Roman" w:hAnsi="Times New Roman" w:cs="Times New Roman"/>
+          <w:sz w:val="36"/>
+          <w:szCs w:val="36"/>
+        </w:rPr>
+      </w:pPr>
+      <w:r>
+        <w:rPr>
+          <w:rFonts w:ascii="Times New Roman" w:eastAsia="Times New Roman" w:hAnsi="Times New Roman" w:cs="Times New Roman"/>
+          <w:b/>
+          <w:bCs/>
+          <w:sz w:val="40"/>
+          <w:szCs w:val="40"/>
+        </w:rPr>
+        <w:t>2026-03-08 17:10-</w:t>
+      </w:r>
+      <w:r>
+        <w:rPr>
+          <w:rFonts w:ascii="Times New Roman" w:eastAsia="Times New Roman" w:hAnsi="Times New Roman" w:cs="Times New Roman"/>
+          <w:b/>
+          <w:bCs/>
+          <w:sz w:val="40"/>
+          <w:szCs w:val="40"/>
+        </w:rPr>
+        <w:t>18:15, 19:</w:t>
+      </w:r>
+      <w:r>
+        <w:rPr>
+          <w:rFonts w:ascii="Times New Roman" w:eastAsia="Times New Roman" w:hAnsi="Times New Roman" w:cs="Times New Roman"/>
+          <w:b/>
+          <w:bCs/>
+          <w:sz w:val="40"/>
+          <w:szCs w:val="40"/>
+        </w:rPr>
+        <w:t>30-</w:t>
+      </w:r>
+      <w:r>
+        <w:rPr>
+          <w:rFonts w:ascii="Times New Roman" w:eastAsia="Times New Roman" w:hAnsi="Times New Roman" w:cs="Times New Roman"/>
+          <w:b/>
+          <w:bCs/>
+          <w:sz w:val="40"/>
+          <w:szCs w:val="40"/>
+        </w:rPr>
+        <w:t>20:</w:t>
+      </w:r>
+      <w:r>
+        <w:rPr>
+          <w:rFonts w:ascii="Times New Roman" w:eastAsia="Times New Roman" w:hAnsi="Times New Roman" w:cs="Times New Roman"/>
+          <w:b/>
+          <w:bCs/>
+          <w:sz w:val="40"/>
+          <w:szCs w:val="40"/>
+        </w:rPr>
+        <w:t>40</w:t>
+      </w:r>
+      <w:r>
+        <w:rPr>
+          <w:rFonts w:ascii="Times New Roman" w:eastAsia="Times New Roman" w:hAnsi="Times New Roman" w:cs="Times New Roman"/>
+          <w:b/>
+          <w:bCs/>
+          <w:sz w:val="40"/>
+          <w:szCs w:val="40"/>
+        </w:rPr>
+        <w:br/>
+      </w:r>
+      <w:r>
+        <w:rPr>
+          <w:rFonts w:ascii="Times New Roman" w:eastAsia="Times New Roman" w:hAnsi="Times New Roman" w:cs="Times New Roman"/>
+          <w:sz w:val="36"/>
+          <w:szCs w:val="36"/>
+        </w:rPr>
+        <w:t>(Susán Csongor György) A bejelentkezési nézet kijavítása</w:t>
+      </w:r>
+      <w:r>
+        <w:rPr>
+          <w:rFonts w:ascii="Times New Roman" w:eastAsia="Times New Roman" w:hAnsi="Times New Roman" w:cs="Times New Roman"/>
+          <w:sz w:val="36"/>
+          <w:szCs w:val="36"/>
+        </w:rPr>
+        <w:t xml:space="preserve">, a routerben a főoldalak variánsainak gyerek </w:t>
       </w:r>
       <w:proofErr w:type="spellStart"/>
       <w:r>
@@ -2908,7 +3060,7 @@
           <w:sz w:val="36"/>
           <w:szCs w:val="36"/>
         </w:rPr>
-        <w:t>Nabulsy</w:t>
+        <w:t>route</w:t>
       </w:r>
       <w:proofErr w:type="spellEnd"/>
       <w:r>
@@ -2917,23 +3069,23 @@
           <w:sz w:val="36"/>
           <w:szCs w:val="36"/>
         </w:rPr>
-        <w:t xml:space="preserve">: főoldal és annak </w:t>
-      </w:r>
-      <w:r>
-        <w:rPr>
-          <w:rFonts w:ascii="Times New Roman" w:eastAsia="Times New Roman" w:hAnsi="Times New Roman" w:cs="Times New Roman"/>
-          <w:sz w:val="36"/>
-          <w:szCs w:val="36"/>
-        </w:rPr>
-        <w:t xml:space="preserve">tanulói </w:t>
-      </w:r>
-      <w:r>
-        <w:rPr>
-          <w:rFonts w:ascii="Times New Roman" w:eastAsia="Times New Roman" w:hAnsi="Times New Roman" w:cs="Times New Roman"/>
-          <w:sz w:val="36"/>
-          <w:szCs w:val="36"/>
-        </w:rPr>
-        <w:t xml:space="preserve">variánsa, Susán: login befejezése és </w:t>
+        <w:t>-okba szervezése</w:t>
+      </w:r>
+      <w:r>
+        <w:rPr>
+          <w:rFonts w:ascii="Times New Roman" w:eastAsia="Times New Roman" w:hAnsi="Times New Roman" w:cs="Times New Roman"/>
+          <w:sz w:val="36"/>
+          <w:szCs w:val="36"/>
+        </w:rPr>
+        <w:t xml:space="preserve"> (és éppen ezért már létrehozott nézetek annak megfelelő szétvágása)</w:t>
+      </w:r>
+      <w:r>
+        <w:rPr>
+          <w:rFonts w:ascii="Times New Roman" w:eastAsia="Times New Roman" w:hAnsi="Times New Roman" w:cs="Times New Roman"/>
+          <w:sz w:val="36"/>
+          <w:szCs w:val="36"/>
+        </w:rPr>
+        <w:t xml:space="preserve">, az új szabvány mintájára az </w:t>
       </w:r>
       <w:proofErr w:type="spellStart"/>
       <w:r>
@@ -2951,71 +3103,15 @@
           <w:sz w:val="36"/>
           <w:szCs w:val="36"/>
         </w:rPr>
-        <w:t xml:space="preserve"> elkezdése, valamint a logika kidolgozásának megkezdése</w:t>
-      </w:r>
-      <w:r>
-        <w:rPr>
-          <w:rFonts w:ascii="Times New Roman" w:eastAsia="Times New Roman" w:hAnsi="Times New Roman" w:cs="Times New Roman"/>
-          <w:sz w:val="36"/>
-          <w:szCs w:val="36"/>
-        </w:rPr>
-        <w:t xml:space="preserve"> + jegyzetek)</w:t>
-      </w:r>
-    </w:p>
-    <w:p>
-      <w:pPr>
-        <w:rPr>
-          <w:rFonts w:ascii="Times New Roman" w:eastAsia="Times New Roman" w:hAnsi="Times New Roman" w:cs="Times New Roman"/>
-          <w:sz w:val="36"/>
-          <w:szCs w:val="36"/>
-        </w:rPr>
-      </w:pPr>
-    </w:p>
-    <w:p>
-      <w:pPr>
-        <w:rPr>
-          <w:rFonts w:ascii="Times New Roman" w:eastAsia="Times New Roman" w:hAnsi="Times New Roman" w:cs="Times New Roman"/>
-          <w:sz w:val="36"/>
-          <w:szCs w:val="36"/>
-        </w:rPr>
-      </w:pPr>
-      <w:r>
-        <w:rPr>
-          <w:rFonts w:ascii="Times New Roman" w:eastAsia="Times New Roman" w:hAnsi="Times New Roman" w:cs="Times New Roman"/>
-          <w:b/>
-          <w:bCs/>
-          <w:sz w:val="40"/>
-          <w:szCs w:val="40"/>
-        </w:rPr>
-        <w:t>2026-03-04 10:45-</w:t>
-      </w:r>
-      <w:r>
-        <w:rPr>
-          <w:rFonts w:ascii="Times New Roman" w:eastAsia="Times New Roman" w:hAnsi="Times New Roman" w:cs="Times New Roman"/>
-          <w:b/>
-          <w:bCs/>
-          <w:sz w:val="40"/>
-          <w:szCs w:val="40"/>
-        </w:rPr>
-        <w:t>12:00</w:t>
-      </w:r>
-      <w:r>
-        <w:rPr>
-          <w:rFonts w:ascii="Times New Roman" w:eastAsia="Times New Roman" w:hAnsi="Times New Roman" w:cs="Times New Roman"/>
-          <w:b/>
-          <w:bCs/>
-          <w:sz w:val="40"/>
-          <w:szCs w:val="40"/>
-        </w:rPr>
-        <w:br/>
-      </w:r>
-      <w:r>
-        <w:rPr>
-          <w:rFonts w:ascii="Times New Roman" w:eastAsia="Times New Roman" w:hAnsi="Times New Roman" w:cs="Times New Roman"/>
-          <w:sz w:val="36"/>
-          <w:szCs w:val="36"/>
-        </w:rPr>
-        <w:t>(El-</w:t>
+        <w:t xml:space="preserve"> nézet (gombok és rövid leírás azok alá) létrehozása</w:t>
+      </w:r>
+      <w:r>
+        <w:rPr>
+          <w:rFonts w:ascii="Times New Roman" w:eastAsia="Times New Roman" w:hAnsi="Times New Roman" w:cs="Times New Roman"/>
+          <w:sz w:val="36"/>
+          <w:szCs w:val="36"/>
+        </w:rPr>
+        <w:t xml:space="preserve">, felesleges import mezők kiszedése az </w:t>
       </w:r>
       <w:proofErr w:type="spellStart"/>
       <w:r>
@@ -3024,7 +3120,7 @@
           <w:sz w:val="36"/>
           <w:szCs w:val="36"/>
         </w:rPr>
-        <w:t>Nabulsy</w:t>
+        <w:t>App.vue</w:t>
       </w:r>
       <w:proofErr w:type="spellEnd"/>
       <w:r>
@@ -3033,313 +3129,6 @@
           <w:sz w:val="36"/>
           <w:szCs w:val="36"/>
         </w:rPr>
-        <w:t xml:space="preserve"> Csongor Alan) A zenebekérő oldal </w:t>
-      </w:r>
-      <w:r>
-        <w:rPr>
-          <w:rFonts w:ascii="Times New Roman" w:eastAsia="Times New Roman" w:hAnsi="Times New Roman" w:cs="Times New Roman"/>
-          <w:sz w:val="36"/>
-          <w:szCs w:val="36"/>
-        </w:rPr>
-        <w:t>részben elkészítése</w:t>
-      </w:r>
-      <w:r>
-        <w:rPr>
-          <w:rFonts w:ascii="Times New Roman" w:eastAsia="Times New Roman" w:hAnsi="Times New Roman" w:cs="Times New Roman"/>
-          <w:sz w:val="36"/>
-          <w:szCs w:val="36"/>
-        </w:rPr>
-        <w:t>.</w:t>
-      </w:r>
-    </w:p>
-    <w:p>
-      <w:pPr>
-        <w:rPr>
-          <w:rFonts w:ascii="Times New Roman" w:eastAsia="Times New Roman" w:hAnsi="Times New Roman" w:cs="Times New Roman"/>
-          <w:sz w:val="36"/>
-          <w:szCs w:val="36"/>
-        </w:rPr>
-      </w:pPr>
-    </w:p>
-    <w:p>
-      <w:pPr>
-        <w:rPr>
-          <w:rFonts w:ascii="Times New Roman" w:eastAsia="Times New Roman" w:hAnsi="Times New Roman" w:cs="Times New Roman"/>
-          <w:b/>
-          <w:bCs/>
-          <w:sz w:val="40"/>
-          <w:szCs w:val="40"/>
-        </w:rPr>
-      </w:pPr>
-      <w:r>
-        <w:rPr>
-          <w:rFonts w:ascii="Times New Roman" w:eastAsia="Times New Roman" w:hAnsi="Times New Roman" w:cs="Times New Roman"/>
-          <w:b/>
-          <w:bCs/>
-          <w:sz w:val="40"/>
-          <w:szCs w:val="40"/>
-        </w:rPr>
-        <w:t>2026-03-08 15:30-17:15</w:t>
-      </w:r>
-    </w:p>
-    <w:p>
-      <w:pPr>
-        <w:rPr>
-          <w:rFonts w:ascii="Times New Roman" w:eastAsia="Times New Roman" w:hAnsi="Times New Roman" w:cs="Times New Roman"/>
-          <w:sz w:val="36"/>
-          <w:szCs w:val="36"/>
-        </w:rPr>
-      </w:pPr>
-      <w:r>
-        <w:rPr>
-          <w:rFonts w:ascii="Times New Roman" w:eastAsia="Times New Roman" w:hAnsi="Times New Roman" w:cs="Times New Roman"/>
-          <w:sz w:val="36"/>
-          <w:szCs w:val="36"/>
-        </w:rPr>
-        <w:t>(El-</w:t>
-      </w:r>
-      <w:proofErr w:type="spellStart"/>
-      <w:r>
-        <w:rPr>
-          <w:rFonts w:ascii="Times New Roman" w:eastAsia="Times New Roman" w:hAnsi="Times New Roman" w:cs="Times New Roman"/>
-          <w:sz w:val="36"/>
-          <w:szCs w:val="36"/>
-        </w:rPr>
-        <w:t>Nabulsy</w:t>
-      </w:r>
-      <w:proofErr w:type="spellEnd"/>
-      <w:r>
-        <w:rPr>
-          <w:rFonts w:ascii="Times New Roman" w:eastAsia="Times New Roman" w:hAnsi="Times New Roman" w:cs="Times New Roman"/>
-          <w:sz w:val="36"/>
-          <w:szCs w:val="36"/>
-        </w:rPr>
-        <w:t xml:space="preserve"> Csongor Alan) Főbb nézetek(</w:t>
-      </w:r>
-      <w:proofErr w:type="spellStart"/>
-      <w:r>
-        <w:rPr>
-          <w:rFonts w:ascii="Times New Roman" w:eastAsia="Times New Roman" w:hAnsi="Times New Roman" w:cs="Times New Roman"/>
-          <w:sz w:val="36"/>
-          <w:szCs w:val="36"/>
-        </w:rPr>
-        <w:t>HomeView</w:t>
-      </w:r>
-      <w:proofErr w:type="spellEnd"/>
-      <w:r>
-        <w:rPr>
-          <w:rFonts w:ascii="Times New Roman" w:eastAsia="Times New Roman" w:hAnsi="Times New Roman" w:cs="Times New Roman"/>
-          <w:sz w:val="36"/>
-          <w:szCs w:val="36"/>
-        </w:rPr>
-        <w:t xml:space="preserve">, </w:t>
-      </w:r>
-      <w:proofErr w:type="spellStart"/>
-      <w:r>
-        <w:rPr>
-          <w:rFonts w:ascii="Times New Roman" w:eastAsia="Times New Roman" w:hAnsi="Times New Roman" w:cs="Times New Roman"/>
-          <w:sz w:val="36"/>
-          <w:szCs w:val="36"/>
-        </w:rPr>
-        <w:t>StudentHomePage</w:t>
-      </w:r>
-      <w:proofErr w:type="spellEnd"/>
-      <w:r>
-        <w:rPr>
-          <w:rFonts w:ascii="Times New Roman" w:eastAsia="Times New Roman" w:hAnsi="Times New Roman" w:cs="Times New Roman"/>
-          <w:sz w:val="36"/>
-          <w:szCs w:val="36"/>
-        </w:rPr>
-        <w:t xml:space="preserve">, </w:t>
-      </w:r>
-      <w:proofErr w:type="spellStart"/>
-      <w:r>
-        <w:rPr>
-          <w:rFonts w:ascii="Times New Roman" w:eastAsia="Times New Roman" w:hAnsi="Times New Roman" w:cs="Times New Roman"/>
-          <w:sz w:val="36"/>
-          <w:szCs w:val="36"/>
-        </w:rPr>
-        <w:t>SchedulerView</w:t>
-      </w:r>
-      <w:proofErr w:type="spellEnd"/>
-      <w:r>
-        <w:rPr>
-          <w:rFonts w:ascii="Times New Roman" w:eastAsia="Times New Roman" w:hAnsi="Times New Roman" w:cs="Times New Roman"/>
-          <w:sz w:val="36"/>
-          <w:szCs w:val="36"/>
-        </w:rPr>
-        <w:t>) szerkezetének kialakítása és a komponensek működésének ellenőrzése, a felhasználói felület stílusának kialakítása, hogy az oldal elrendezése megfeleljen a megtervezett UI-terveknek.</w:t>
-      </w:r>
-    </w:p>
-    <w:p>
-      <w:pPr>
-        <w:rPr>
-          <w:rFonts w:ascii="Times New Roman" w:eastAsia="Times New Roman" w:hAnsi="Times New Roman" w:cs="Times New Roman"/>
-          <w:sz w:val="36"/>
-          <w:szCs w:val="36"/>
-        </w:rPr>
-      </w:pPr>
-    </w:p>
-    <w:p>
-      <w:pPr>
-        <w:rPr>
-          <w:rFonts w:ascii="Times New Roman" w:eastAsia="Times New Roman" w:hAnsi="Times New Roman" w:cs="Times New Roman"/>
-          <w:sz w:val="36"/>
-          <w:szCs w:val="36"/>
-        </w:rPr>
-      </w:pPr>
-      <w:r>
-        <w:rPr>
-          <w:rFonts w:ascii="Times New Roman" w:eastAsia="Times New Roman" w:hAnsi="Times New Roman" w:cs="Times New Roman"/>
-          <w:b/>
-          <w:bCs/>
-          <w:sz w:val="40"/>
-          <w:szCs w:val="40"/>
-        </w:rPr>
-        <w:t>2026-03-08 17:10-</w:t>
-      </w:r>
-      <w:r>
-        <w:rPr>
-          <w:rFonts w:ascii="Times New Roman" w:eastAsia="Times New Roman" w:hAnsi="Times New Roman" w:cs="Times New Roman"/>
-          <w:b/>
-          <w:bCs/>
-          <w:sz w:val="40"/>
-          <w:szCs w:val="40"/>
-        </w:rPr>
-        <w:t>18:15, 19:</w:t>
-      </w:r>
-      <w:r>
-        <w:rPr>
-          <w:rFonts w:ascii="Times New Roman" w:eastAsia="Times New Roman" w:hAnsi="Times New Roman" w:cs="Times New Roman"/>
-          <w:b/>
-          <w:bCs/>
-          <w:sz w:val="40"/>
-          <w:szCs w:val="40"/>
-        </w:rPr>
-        <w:t>30-</w:t>
-      </w:r>
-      <w:r>
-        <w:rPr>
-          <w:rFonts w:ascii="Times New Roman" w:eastAsia="Times New Roman" w:hAnsi="Times New Roman" w:cs="Times New Roman"/>
-          <w:b/>
-          <w:bCs/>
-          <w:sz w:val="40"/>
-          <w:szCs w:val="40"/>
-        </w:rPr>
-        <w:t>20:</w:t>
-      </w:r>
-      <w:r>
-        <w:rPr>
-          <w:rFonts w:ascii="Times New Roman" w:eastAsia="Times New Roman" w:hAnsi="Times New Roman" w:cs="Times New Roman"/>
-          <w:b/>
-          <w:bCs/>
-          <w:sz w:val="40"/>
-          <w:szCs w:val="40"/>
-        </w:rPr>
-        <w:t>40</w:t>
-      </w:r>
-      <w:r>
-        <w:rPr>
-          <w:rFonts w:ascii="Times New Roman" w:eastAsia="Times New Roman" w:hAnsi="Times New Roman" w:cs="Times New Roman"/>
-          <w:b/>
-          <w:bCs/>
-          <w:sz w:val="40"/>
-          <w:szCs w:val="40"/>
-        </w:rPr>
-        <w:br/>
-      </w:r>
-      <w:r>
-        <w:rPr>
-          <w:rFonts w:ascii="Times New Roman" w:eastAsia="Times New Roman" w:hAnsi="Times New Roman" w:cs="Times New Roman"/>
-          <w:sz w:val="36"/>
-          <w:szCs w:val="36"/>
-        </w:rPr>
-        <w:t>(Susán Csongor György) A bejelentkezési nézet kijavítása</w:t>
-      </w:r>
-      <w:r>
-        <w:rPr>
-          <w:rFonts w:ascii="Times New Roman" w:eastAsia="Times New Roman" w:hAnsi="Times New Roman" w:cs="Times New Roman"/>
-          <w:sz w:val="36"/>
-          <w:szCs w:val="36"/>
-        </w:rPr>
-        <w:t xml:space="preserve">, a routerben a főoldalak variánsainak gyerek </w:t>
-      </w:r>
-      <w:proofErr w:type="spellStart"/>
-      <w:r>
-        <w:rPr>
-          <w:rFonts w:ascii="Times New Roman" w:eastAsia="Times New Roman" w:hAnsi="Times New Roman" w:cs="Times New Roman"/>
-          <w:sz w:val="36"/>
-          <w:szCs w:val="36"/>
-        </w:rPr>
-        <w:t>route</w:t>
-      </w:r>
-      <w:proofErr w:type="spellEnd"/>
-      <w:r>
-        <w:rPr>
-          <w:rFonts w:ascii="Times New Roman" w:eastAsia="Times New Roman" w:hAnsi="Times New Roman" w:cs="Times New Roman"/>
-          <w:sz w:val="36"/>
-          <w:szCs w:val="36"/>
-        </w:rPr>
-        <w:t>-okba szervezése</w:t>
-      </w:r>
-      <w:r>
-        <w:rPr>
-          <w:rFonts w:ascii="Times New Roman" w:eastAsia="Times New Roman" w:hAnsi="Times New Roman" w:cs="Times New Roman"/>
-          <w:sz w:val="36"/>
-          <w:szCs w:val="36"/>
-        </w:rPr>
-        <w:t xml:space="preserve"> (és éppen ezért már létrehozott nézetek annak megfelelő szétvágása)</w:t>
-      </w:r>
-      <w:r>
-        <w:rPr>
-          <w:rFonts w:ascii="Times New Roman" w:eastAsia="Times New Roman" w:hAnsi="Times New Roman" w:cs="Times New Roman"/>
-          <w:sz w:val="36"/>
-          <w:szCs w:val="36"/>
-        </w:rPr>
-        <w:t xml:space="preserve">, az új szabvány mintájára az </w:t>
-      </w:r>
-      <w:proofErr w:type="spellStart"/>
-      <w:r>
-        <w:rPr>
-          <w:rFonts w:ascii="Times New Roman" w:eastAsia="Times New Roman" w:hAnsi="Times New Roman" w:cs="Times New Roman"/>
-          <w:sz w:val="36"/>
-          <w:szCs w:val="36"/>
-        </w:rPr>
-        <w:t>admin</w:t>
-      </w:r>
-      <w:proofErr w:type="spellEnd"/>
-      <w:r>
-        <w:rPr>
-          <w:rFonts w:ascii="Times New Roman" w:eastAsia="Times New Roman" w:hAnsi="Times New Roman" w:cs="Times New Roman"/>
-          <w:sz w:val="36"/>
-          <w:szCs w:val="36"/>
-        </w:rPr>
-        <w:t xml:space="preserve"> nézet (gombok és rövid leírás azok alá) létrehozása</w:t>
-      </w:r>
-      <w:r>
-        <w:rPr>
-          <w:rFonts w:ascii="Times New Roman" w:eastAsia="Times New Roman" w:hAnsi="Times New Roman" w:cs="Times New Roman"/>
-          <w:sz w:val="36"/>
-          <w:szCs w:val="36"/>
-        </w:rPr>
-        <w:t xml:space="preserve">, felesleges import mezők kiszedése az </w:t>
-      </w:r>
-      <w:proofErr w:type="spellStart"/>
-      <w:r>
-        <w:rPr>
-          <w:rFonts w:ascii="Times New Roman" w:eastAsia="Times New Roman" w:hAnsi="Times New Roman" w:cs="Times New Roman"/>
-          <w:sz w:val="36"/>
-          <w:szCs w:val="36"/>
-        </w:rPr>
-        <w:t>App.vue</w:t>
-      </w:r>
-      <w:proofErr w:type="spellEnd"/>
-      <w:r>
-        <w:rPr>
-          <w:rFonts w:ascii="Times New Roman" w:eastAsia="Times New Roman" w:hAnsi="Times New Roman" w:cs="Times New Roman"/>
-          <w:sz w:val="36"/>
-          <w:szCs w:val="36"/>
-        </w:rPr>
         <w:t xml:space="preserve"> fájlból</w:t>
       </w:r>
     </w:p>
@@ -3359,6 +3148,7 @@
           <w:sz w:val="36"/>
           <w:szCs w:val="36"/>
         </w:rPr>
+        <w:lastRenderedPageBreak/>
         <w:drawing>
           <wp:inline distT="0" distB="0" distL="0" distR="0" wp14:anchorId="5DFC9D37" wp14:editId="209634C9">
             <wp:extent cx="5379983" cy="2476500"/>
@@ -3404,59 +3194,79 @@
     </w:p>
     <w:p>
       <w:pPr>
-        <w:jc w:val="both"/>
-        <w:rPr>
-          <w:rFonts w:ascii="Times New Roman" w:eastAsia="Times New Roman" w:hAnsi="Times New Roman" w:cs="Times New Roman"/>
-          <w:sz w:val="36"/>
-          <w:szCs w:val="36"/>
-        </w:rPr>
-      </w:pPr>
-    </w:p>
-    <w:p>
-      <w:pPr>
-        <w:jc w:val="both"/>
-        <w:rPr>
-          <w:rFonts w:ascii="Times New Roman" w:eastAsia="Times New Roman" w:hAnsi="Times New Roman" w:cs="Times New Roman"/>
-          <w:sz w:val="36"/>
-          <w:szCs w:val="36"/>
-        </w:rPr>
-      </w:pPr>
-      <w:r>
-        <w:rPr>
-          <w:rFonts w:ascii="Times New Roman" w:eastAsia="Times New Roman" w:hAnsi="Times New Roman" w:cs="Times New Roman"/>
-          <w:b/>
-          <w:bCs/>
-          <w:sz w:val="40"/>
-          <w:szCs w:val="40"/>
-        </w:rPr>
-        <w:t>2026-03-09 8:55-</w:t>
-      </w:r>
-    </w:p>
-    <w:p>
-      <w:pPr>
-        <w:jc w:val="both"/>
-        <w:rPr>
-          <w:rFonts w:ascii="Times New Roman" w:eastAsia="Times New Roman" w:hAnsi="Times New Roman" w:cs="Times New Roman"/>
-          <w:sz w:val="36"/>
-          <w:szCs w:val="36"/>
-        </w:rPr>
-      </w:pPr>
-      <w:r>
-        <w:rPr>
-          <w:rFonts w:ascii="Times New Roman" w:eastAsia="Times New Roman" w:hAnsi="Times New Roman" w:cs="Times New Roman"/>
-          <w:sz w:val="36"/>
-          <w:szCs w:val="36"/>
-        </w:rPr>
-        <w:t>(Susán Csongor György, El-</w:t>
+        <w:rPr>
+          <w:rFonts w:ascii="Times New Roman" w:eastAsia="Times New Roman" w:hAnsi="Times New Roman" w:cs="Times New Roman"/>
+          <w:b/>
+          <w:bCs/>
+          <w:sz w:val="40"/>
+          <w:szCs w:val="40"/>
+        </w:rPr>
+      </w:pPr>
+      <w:r>
+        <w:rPr>
+          <w:rFonts w:ascii="Times New Roman" w:eastAsia="Times New Roman" w:hAnsi="Times New Roman" w:cs="Times New Roman"/>
+          <w:b/>
+          <w:bCs/>
+          <w:sz w:val="40"/>
+          <w:szCs w:val="40"/>
+        </w:rPr>
+        <w:t xml:space="preserve">2026-03-08 </w:t>
+      </w:r>
+      <w:r>
+        <w:rPr>
+          <w:rFonts w:ascii="Times New Roman" w:eastAsia="Times New Roman" w:hAnsi="Times New Roman" w:cs="Times New Roman"/>
+          <w:b/>
+          <w:bCs/>
+          <w:sz w:val="40"/>
+          <w:szCs w:val="40"/>
+        </w:rPr>
+        <w:t>15:30</w:t>
+      </w:r>
+      <w:r>
+        <w:rPr>
+          <w:rFonts w:ascii="Times New Roman" w:eastAsia="Times New Roman" w:hAnsi="Times New Roman" w:cs="Times New Roman"/>
+          <w:b/>
+          <w:bCs/>
+          <w:sz w:val="40"/>
+          <w:szCs w:val="40"/>
+        </w:rPr>
+        <w:t>-17:15</w:t>
+      </w:r>
+    </w:p>
+    <w:p>
+      <w:pPr>
+        <w:rPr>
+          <w:rFonts w:ascii="Times New Roman" w:eastAsia="Times New Roman" w:hAnsi="Times New Roman" w:cs="Times New Roman"/>
+          <w:sz w:val="36"/>
+          <w:szCs w:val="36"/>
+        </w:rPr>
+      </w:pPr>
+      <w:r>
+        <w:rPr>
+          <w:rFonts w:ascii="Times New Roman" w:eastAsia="Times New Roman" w:hAnsi="Times New Roman" w:cs="Times New Roman"/>
+          <w:sz w:val="36"/>
+          <w:szCs w:val="36"/>
+        </w:rPr>
+        <w:t xml:space="preserve">(El-Nabulsy Csongor Alan) Főbb </w:t>
+      </w:r>
+      <w:proofErr w:type="gramStart"/>
+      <w:r>
+        <w:rPr>
+          <w:rFonts w:ascii="Times New Roman" w:eastAsia="Times New Roman" w:hAnsi="Times New Roman" w:cs="Times New Roman"/>
+          <w:sz w:val="36"/>
+          <w:szCs w:val="36"/>
+        </w:rPr>
+        <w:t>nézetek(</w:t>
       </w:r>
       <w:proofErr w:type="spellStart"/>
-      <w:r>
-        <w:rPr>
-          <w:rFonts w:ascii="Times New Roman" w:eastAsia="Times New Roman" w:hAnsi="Times New Roman" w:cs="Times New Roman"/>
-          <w:sz w:val="36"/>
-          <w:szCs w:val="36"/>
-        </w:rPr>
-        <w:t>Nabulsy</w:t>
+      <w:proofErr w:type="gramEnd"/>
+      <w:r>
+        <w:rPr>
+          <w:rFonts w:ascii="Times New Roman" w:eastAsia="Times New Roman" w:hAnsi="Times New Roman" w:cs="Times New Roman"/>
+          <w:sz w:val="36"/>
+          <w:szCs w:val="36"/>
+        </w:rPr>
+        <w:t>HomeView</w:t>
       </w:r>
       <w:proofErr w:type="spellEnd"/>
       <w:r>
@@ -3465,15 +3275,7 @@
           <w:sz w:val="36"/>
           <w:szCs w:val="36"/>
         </w:rPr>
-        <w:t xml:space="preserve"> Csongor Alan)</w:t>
-      </w:r>
-      <w:r>
-        <w:rPr>
-          <w:rFonts w:ascii="Times New Roman" w:eastAsia="Times New Roman" w:hAnsi="Times New Roman" w:cs="Times New Roman"/>
-          <w:sz w:val="36"/>
-          <w:szCs w:val="36"/>
-        </w:rPr>
-        <w:t xml:space="preserve"> Nézetek végleges kialakítása (El-</w:t>
+        <w:t xml:space="preserve">, </w:t>
       </w:r>
       <w:proofErr w:type="spellStart"/>
       <w:r>
@@ -3482,7 +3284,7 @@
           <w:sz w:val="36"/>
           <w:szCs w:val="36"/>
         </w:rPr>
-        <w:t>Nabulsy</w:t>
+        <w:t>StudentHomePage</w:t>
       </w:r>
       <w:proofErr w:type="spellEnd"/>
       <w:r>
@@ -3491,7 +3293,7 @@
           <w:sz w:val="36"/>
           <w:szCs w:val="36"/>
         </w:rPr>
-        <w:t xml:space="preserve">: </w:t>
+        <w:t xml:space="preserve">, </w:t>
       </w:r>
       <w:proofErr w:type="spellStart"/>
       <w:r>
@@ -3500,7 +3302,7 @@
           <w:sz w:val="36"/>
           <w:szCs w:val="36"/>
         </w:rPr>
-        <w:t>HomeView</w:t>
+        <w:t>SchedulerView</w:t>
       </w:r>
       <w:proofErr w:type="spellEnd"/>
       <w:r>
@@ -3509,364 +3311,7 @@
           <w:sz w:val="36"/>
           <w:szCs w:val="36"/>
         </w:rPr>
-        <w:t xml:space="preserve">, </w:t>
-      </w:r>
-      <w:proofErr w:type="spellStart"/>
-      <w:r>
-        <w:rPr>
-          <w:rFonts w:ascii="Times New Roman" w:eastAsia="Times New Roman" w:hAnsi="Times New Roman" w:cs="Times New Roman"/>
-          <w:sz w:val="36"/>
-          <w:szCs w:val="36"/>
-        </w:rPr>
-        <w:t>RequestView</w:t>
-      </w:r>
-      <w:proofErr w:type="spellEnd"/>
-      <w:r>
-        <w:rPr>
-          <w:rFonts w:ascii="Times New Roman" w:eastAsia="Times New Roman" w:hAnsi="Times New Roman" w:cs="Times New Roman"/>
-          <w:sz w:val="36"/>
-          <w:szCs w:val="36"/>
-        </w:rPr>
-        <w:t xml:space="preserve">, </w:t>
-      </w:r>
-      <w:proofErr w:type="spellStart"/>
-      <w:r>
-        <w:rPr>
-          <w:rFonts w:ascii="Times New Roman" w:eastAsia="Times New Roman" w:hAnsi="Times New Roman" w:cs="Times New Roman"/>
-          <w:sz w:val="36"/>
-          <w:szCs w:val="36"/>
-        </w:rPr>
-        <w:t>SendView</w:t>
-      </w:r>
-      <w:proofErr w:type="spellEnd"/>
-      <w:r>
-        <w:rPr>
-          <w:rFonts w:ascii="Times New Roman" w:eastAsia="Times New Roman" w:hAnsi="Times New Roman" w:cs="Times New Roman"/>
-          <w:sz w:val="36"/>
-          <w:szCs w:val="36"/>
-        </w:rPr>
-        <w:t xml:space="preserve">; Susán: főoldalak integrálása a </w:t>
-      </w:r>
-      <w:proofErr w:type="spellStart"/>
-      <w:r>
-        <w:rPr>
-          <w:rFonts w:ascii="Times New Roman" w:eastAsia="Times New Roman" w:hAnsi="Times New Roman" w:cs="Times New Roman"/>
-          <w:sz w:val="36"/>
-          <w:szCs w:val="36"/>
-        </w:rPr>
-        <w:t>HomeLayout</w:t>
-      </w:r>
-      <w:r>
-        <w:rPr>
-          <w:rFonts w:ascii="Times New Roman" w:eastAsia="Times New Roman" w:hAnsi="Times New Roman" w:cs="Times New Roman"/>
-          <w:sz w:val="36"/>
-          <w:szCs w:val="36"/>
-        </w:rPr>
-        <w:t>-</w:t>
-      </w:r>
-      <w:r>
-        <w:rPr>
-          <w:rFonts w:ascii="Times New Roman" w:eastAsia="Times New Roman" w:hAnsi="Times New Roman" w:cs="Times New Roman"/>
-          <w:sz w:val="36"/>
-          <w:szCs w:val="36"/>
-        </w:rPr>
-        <w:t>ba</w:t>
-      </w:r>
-      <w:proofErr w:type="spellEnd"/>
-      <w:r>
-        <w:rPr>
-          <w:rFonts w:ascii="Times New Roman" w:eastAsia="Times New Roman" w:hAnsi="Times New Roman" w:cs="Times New Roman"/>
-          <w:sz w:val="36"/>
-          <w:szCs w:val="36"/>
-        </w:rPr>
-        <w:t>)</w:t>
-      </w:r>
-      <w:r>
-        <w:rPr>
-          <w:rFonts w:ascii="Times New Roman" w:eastAsia="Times New Roman" w:hAnsi="Times New Roman" w:cs="Times New Roman"/>
-          <w:sz w:val="36"/>
-          <w:szCs w:val="36"/>
-        </w:rPr>
-        <w:t>.</w:t>
-      </w:r>
-    </w:p>
-    <w:p>
-      <w:pPr>
-        <w:jc w:val="both"/>
-        <w:rPr>
-          <w:rFonts w:ascii="Times New Roman" w:eastAsia="Times New Roman" w:hAnsi="Times New Roman" w:cs="Times New Roman"/>
-          <w:sz w:val="36"/>
-          <w:szCs w:val="36"/>
-        </w:rPr>
-      </w:pPr>
-      <w:r>
-        <w:rPr>
-          <w:rFonts w:ascii="Times New Roman" w:eastAsia="Times New Roman" w:hAnsi="Times New Roman" w:cs="Times New Roman"/>
-          <w:sz w:val="36"/>
-          <w:szCs w:val="36"/>
-        </w:rPr>
-        <w:t xml:space="preserve">(Susán Csongor György) </w:t>
-      </w:r>
-    </w:p>
-    <w:p>
-      <w:pPr>
-        <w:pStyle w:val="Listaszerbekezds"/>
-        <w:numPr>
-          <w:ilvl w:val="0"/>
-          <w:numId w:val="4"/>
-        </w:numPr>
-        <w:jc w:val="both"/>
-        <w:rPr>
-          <w:rFonts w:ascii="Times New Roman" w:eastAsia="Times New Roman" w:hAnsi="Times New Roman" w:cs="Times New Roman"/>
-          <w:sz w:val="36"/>
-          <w:szCs w:val="36"/>
-        </w:rPr>
-      </w:pPr>
-      <w:r>
-        <w:rPr>
-          <w:rFonts w:ascii="Times New Roman" w:eastAsia="Times New Roman" w:hAnsi="Times New Roman" w:cs="Times New Roman"/>
-          <w:sz w:val="36"/>
-          <w:szCs w:val="36"/>
-        </w:rPr>
-        <w:t xml:space="preserve">Példa adatok felvétele a </w:t>
-      </w:r>
-      <w:proofErr w:type="spellStart"/>
-      <w:r>
-        <w:rPr>
-          <w:rFonts w:ascii="Times New Roman" w:eastAsia="Times New Roman" w:hAnsi="Times New Roman" w:cs="Times New Roman"/>
-          <w:sz w:val="36"/>
-          <w:szCs w:val="36"/>
-        </w:rPr>
-        <w:t>HomeLayout-ba</w:t>
-      </w:r>
-      <w:proofErr w:type="spellEnd"/>
-      <w:r>
-        <w:rPr>
-          <w:rFonts w:ascii="Times New Roman" w:eastAsia="Times New Roman" w:hAnsi="Times New Roman" w:cs="Times New Roman"/>
-          <w:sz w:val="36"/>
-          <w:szCs w:val="36"/>
-        </w:rPr>
-        <w:t xml:space="preserve"> a helyes működés tesztelésének érdekében</w:t>
-      </w:r>
-    </w:p>
-    <w:p>
-      <w:pPr>
-        <w:pStyle w:val="Listaszerbekezds"/>
-        <w:numPr>
-          <w:ilvl w:val="0"/>
-          <w:numId w:val="4"/>
-        </w:numPr>
-        <w:jc w:val="both"/>
-        <w:rPr>
-          <w:rFonts w:ascii="Times New Roman" w:eastAsia="Times New Roman" w:hAnsi="Times New Roman" w:cs="Times New Roman"/>
-          <w:sz w:val="36"/>
-          <w:szCs w:val="36"/>
-        </w:rPr>
-      </w:pPr>
-      <w:r>
-        <w:rPr>
-          <w:rFonts w:ascii="Times New Roman" w:eastAsia="Times New Roman" w:hAnsi="Times New Roman" w:cs="Times New Roman"/>
-          <w:sz w:val="36"/>
-          <w:szCs w:val="36"/>
-        </w:rPr>
-        <w:t>Azon belül</w:t>
-      </w:r>
-      <w:r>
-        <w:rPr>
-          <w:rFonts w:ascii="Times New Roman" w:eastAsia="Times New Roman" w:hAnsi="Times New Roman" w:cs="Times New Roman"/>
-          <w:sz w:val="36"/>
-          <w:szCs w:val="36"/>
-        </w:rPr>
-        <w:t xml:space="preserve"> a kinézet a terveknek megfelelőre igazítása</w:t>
-      </w:r>
-    </w:p>
-    <w:p>
-      <w:pPr>
-        <w:pStyle w:val="Listaszerbekezds"/>
-        <w:numPr>
-          <w:ilvl w:val="0"/>
-          <w:numId w:val="4"/>
-        </w:numPr>
-        <w:jc w:val="both"/>
-        <w:rPr>
-          <w:rFonts w:ascii="Times New Roman" w:eastAsia="Times New Roman" w:hAnsi="Times New Roman" w:cs="Times New Roman"/>
-          <w:sz w:val="36"/>
-          <w:szCs w:val="36"/>
-        </w:rPr>
-      </w:pPr>
-      <w:proofErr w:type="spellStart"/>
-      <w:r>
-        <w:rPr>
-          <w:rFonts w:ascii="Times New Roman" w:eastAsia="Times New Roman" w:hAnsi="Times New Roman" w:cs="Times New Roman"/>
-          <w:sz w:val="36"/>
-          <w:szCs w:val="36"/>
-        </w:rPr>
-        <w:lastRenderedPageBreak/>
-        <w:t>meta.title-ekben</w:t>
-      </w:r>
-      <w:proofErr w:type="spellEnd"/>
-      <w:r>
-        <w:rPr>
-          <w:rFonts w:ascii="Times New Roman" w:eastAsia="Times New Roman" w:hAnsi="Times New Roman" w:cs="Times New Roman"/>
-          <w:sz w:val="36"/>
-          <w:szCs w:val="36"/>
-        </w:rPr>
-        <w:t xml:space="preserve"> és a </w:t>
-      </w:r>
-      <w:proofErr w:type="spellStart"/>
-      <w:r>
-        <w:rPr>
-          <w:rFonts w:ascii="Times New Roman" w:eastAsia="Times New Roman" w:hAnsi="Times New Roman" w:cs="Times New Roman"/>
-          <w:sz w:val="36"/>
-          <w:szCs w:val="36"/>
-        </w:rPr>
-        <w:t>beforeEach</w:t>
-      </w:r>
-      <w:proofErr w:type="spellEnd"/>
-      <w:r>
-        <w:rPr>
-          <w:rFonts w:ascii="Times New Roman" w:eastAsia="Times New Roman" w:hAnsi="Times New Roman" w:cs="Times New Roman"/>
-          <w:sz w:val="36"/>
-          <w:szCs w:val="36"/>
-        </w:rPr>
-        <w:t>-ben oldalcímek meghatározása</w:t>
-      </w:r>
-    </w:p>
-    <w:p>
-      <w:pPr>
-        <w:pStyle w:val="Listaszerbekezds"/>
-        <w:numPr>
-          <w:ilvl w:val="0"/>
-          <w:numId w:val="4"/>
-        </w:numPr>
-        <w:jc w:val="both"/>
-        <w:rPr>
-          <w:rFonts w:ascii="Times New Roman" w:eastAsia="Times New Roman" w:hAnsi="Times New Roman" w:cs="Times New Roman"/>
-          <w:sz w:val="36"/>
-          <w:szCs w:val="36"/>
-        </w:rPr>
-      </w:pPr>
-      <w:r>
-        <w:rPr>
-          <w:rFonts w:ascii="Times New Roman" w:eastAsia="Times New Roman" w:hAnsi="Times New Roman" w:cs="Times New Roman"/>
-          <w:sz w:val="36"/>
-          <w:szCs w:val="36"/>
-        </w:rPr>
-        <w:t xml:space="preserve">Megkezdődött az oldalak elérhetőségének tesztelése is, éppen ezért a teszteknek szánt dokumentáció </w:t>
-      </w:r>
-      <w:r>
-        <w:rPr>
-          <w:rFonts w:ascii="Times New Roman" w:eastAsia="Times New Roman" w:hAnsi="Times New Roman" w:cs="Times New Roman"/>
-          <w:sz w:val="36"/>
-          <w:szCs w:val="36"/>
-        </w:rPr>
-        <w:t>í</w:t>
-      </w:r>
-      <w:r>
-        <w:rPr>
-          <w:rFonts w:ascii="Times New Roman" w:eastAsia="Times New Roman" w:hAnsi="Times New Roman" w:cs="Times New Roman"/>
-          <w:sz w:val="36"/>
-          <w:szCs w:val="36"/>
-        </w:rPr>
-        <w:t>rása is elkezdődik.</w:t>
-      </w:r>
-    </w:p>
-    <w:p>
-      <w:pPr>
-        <w:pStyle w:val="Listaszerbekezds"/>
-        <w:numPr>
-          <w:ilvl w:val="0"/>
-          <w:numId w:val="4"/>
-        </w:numPr>
-        <w:jc w:val="both"/>
-        <w:rPr>
-          <w:rFonts w:ascii="Times New Roman" w:eastAsia="Times New Roman" w:hAnsi="Times New Roman" w:cs="Times New Roman"/>
-          <w:sz w:val="36"/>
-          <w:szCs w:val="36"/>
-        </w:rPr>
-      </w:pPr>
-      <w:proofErr w:type="spellStart"/>
-      <w:r>
-        <w:rPr>
-          <w:rFonts w:ascii="Times New Roman" w:eastAsia="Times New Roman" w:hAnsi="Times New Roman" w:cs="Times New Roman"/>
-          <w:sz w:val="36"/>
-          <w:szCs w:val="36"/>
-        </w:rPr>
-        <w:t>auth</w:t>
-      </w:r>
-      <w:proofErr w:type="spellEnd"/>
-      <w:r>
-        <w:rPr>
-          <w:rFonts w:ascii="Times New Roman" w:eastAsia="Times New Roman" w:hAnsi="Times New Roman" w:cs="Times New Roman"/>
-          <w:sz w:val="36"/>
-          <w:szCs w:val="36"/>
-        </w:rPr>
-        <w:t xml:space="preserve"> függvény hozzáadása a bejelentkezési képernyőhöz (</w:t>
-      </w:r>
-      <w:proofErr w:type="spellStart"/>
-      <w:r>
-        <w:rPr>
-          <w:rFonts w:ascii="Times New Roman" w:eastAsia="Times New Roman" w:hAnsi="Times New Roman" w:cs="Times New Roman"/>
-          <w:sz w:val="36"/>
-          <w:szCs w:val="36"/>
-        </w:rPr>
-        <w:t>LoginView</w:t>
-      </w:r>
-      <w:proofErr w:type="spellEnd"/>
-      <w:r>
-        <w:rPr>
-          <w:rFonts w:ascii="Times New Roman" w:eastAsia="Times New Roman" w:hAnsi="Times New Roman" w:cs="Times New Roman"/>
-          <w:sz w:val="36"/>
-          <w:szCs w:val="36"/>
-        </w:rPr>
-        <w:t>), ami egyelőre üres, egy komment jelzi annak célját</w:t>
-      </w:r>
-    </w:p>
-    <w:p>
-      <w:pPr>
-        <w:pStyle w:val="Listaszerbekezds"/>
-        <w:numPr>
-          <w:ilvl w:val="0"/>
-          <w:numId w:val="4"/>
-        </w:numPr>
-        <w:jc w:val="both"/>
-        <w:rPr>
-          <w:rFonts w:ascii="Times New Roman" w:eastAsia="Times New Roman" w:hAnsi="Times New Roman" w:cs="Times New Roman"/>
-          <w:sz w:val="36"/>
-          <w:szCs w:val="36"/>
-        </w:rPr>
-      </w:pPr>
-      <w:r>
-        <w:rPr>
-          <w:rFonts w:ascii="Times New Roman" w:eastAsia="Times New Roman" w:hAnsi="Times New Roman" w:cs="Times New Roman"/>
-          <w:sz w:val="36"/>
-          <w:szCs w:val="36"/>
-        </w:rPr>
-        <w:t>A</w:t>
-      </w:r>
-      <w:r>
-        <w:rPr>
-          <w:rFonts w:ascii="Times New Roman" w:eastAsia="Times New Roman" w:hAnsi="Times New Roman" w:cs="Times New Roman"/>
-          <w:sz w:val="36"/>
-          <w:szCs w:val="36"/>
-        </w:rPr>
-        <w:t>z index.ht</w:t>
-      </w:r>
-      <w:r>
-        <w:rPr>
-          <w:rFonts w:ascii="Times New Roman" w:eastAsia="Times New Roman" w:hAnsi="Times New Roman" w:cs="Times New Roman"/>
-          <w:sz w:val="36"/>
-          <w:szCs w:val="36"/>
-        </w:rPr>
-        <w:t>m</w:t>
-      </w:r>
-      <w:r>
-        <w:rPr>
-          <w:rFonts w:ascii="Times New Roman" w:eastAsia="Times New Roman" w:hAnsi="Times New Roman" w:cs="Times New Roman"/>
-          <w:sz w:val="36"/>
-          <w:szCs w:val="36"/>
-        </w:rPr>
-        <w:t>l-be bekerül az oldal neve is (hu, azaz magyar)</w:t>
+        <w:t>) szerkezetének kialakítása és a komponensek működésének ellenőrzése, a felhasználói felület stílusának kialakítása, hogy az oldal elrendezése megfeleljen a megtervezett UI-terveknek.</w:t>
       </w:r>
     </w:p>
     <w:sectPr>
@@ -3882,16 +3327,16 @@
 <file path=word/numbering.xml><?xml version="1.0" encoding="utf-8"?>
 <w:numbering xmlns:wpc="http://schemas.microsoft.com/office/word/2010/wordprocessingCanvas" xmlns:cx="http://schemas.microsoft.com/office/drawing/2014/chartex" xmlns:cx1="http://schemas.microsoft.com/office/drawing/2015/9/8/chartex" xmlns:cx2="http://schemas.microsoft.com/office/drawing/2015/10/21/chartex" xmlns:cx3="http://schemas.microsoft.com/office/drawing/2016/5/9/chartex" xmlns:cx4="http://schemas.microsoft.com/office/drawing/2016/5/10/chartex" xmlns:cx5="http://schemas.microsoft.com/office/drawing/2016/5/11/chartex" xmlns:cx6="http://schemas.microsoft.com/office/drawing/2016/5/12/chartex" xmlns:cx7="http://schemas.microsoft.com/office/drawing/2016/5/13/chartex" xmlns:cx8="http://schemas.microsoft.com/office/drawing/2016/5/14/chartex" xmlns:mc="http://schemas.openxmlformats.org/markup-compatibility/2006" xmlns:aink="http://schemas.microsoft.com/office/drawing/2016/ink" xmlns:am3d="http://schemas.microsoft.com/office/drawing/2017/model3d" xmlns:o="urn:schemas-microsoft-com:office:office" xmlns:oel="http://schemas.microsoft.com/office/2019/extlst" xmlns:r="http://schemas.openxmlformats.org/officeDocument/2006/relationships" xmlns:m="http://schemas.openxmlformats.org/officeDocument/2006/math" xmlns:v="urn:schemas-microsoft-com:vml" xmlns:wp14="http://schemas.microsoft.com/office/word/2010/wordprocessingDrawing" xmlns:wp="http://schemas.openxmlformats.org/drawingml/2006/wordprocessingDrawing" xmlns:w10="urn:schemas-microsoft-com:office:word" xmlns:w="http://schemas.openxmlformats.org/wordprocessingml/2006/main" xmlns:w14="http://schemas.microsoft.com/office/word/2010/wordml" xmlns:w15="http://schemas.microsoft.com/office/word/2012/wordml" xmlns:w16cex="http://schemas.microsoft.com/office/word/2018/wordml/cex" xmlns:w16cid="http://schemas.microsoft.com/office/word/2016/wordml/cid" xmlns:w16="http://schemas.microsoft.com/office/word/2018/wordml" xmlns:w16du="http://schemas.microsoft.com/office/word/2023/wordml/word16du" xmlns:w16sdtdh="http://schemas.microsoft.com/office/word/2020/wordml/sdtdatahash" xmlns:w16sdtfl="http://schemas.microsoft.com/office/word/2024/wordml/sdtformatlock" xmlns:w16se="http://schemas.microsoft.com/office/word/2015/wordml/symex" xmlns:wpg="http://schemas.microsoft.com/office/word/2010/wordprocessingGroup" xmlns:wpi="http://schemas.microsoft.com/office/word/2010/wordprocessingInk" xmlns:wne="http://schemas.microsoft.com/office/word/2006/wordml" xmlns:wps="http://schemas.microsoft.com/office/word/2010/wordprocessingShape" mc:Ignorable="w14 w15 w16se w16cid w16 w16cex w16sdtdh w16sdtfl w16du wp14">
   <w:abstractNum w:abstractNumId="0" w15:restartNumberingAfterBreak="0">
-    <w:nsid w:val="3C1938F6"/>
+    <w:nsid w:val="6E7312B6"/>
     <w:multiLevelType w:val="hybridMultilevel"/>
-    <w:tmpl w:val="0816ACA8"/>
+    <w:tmpl w:val="FD80BAFC"/>
     <w:lvl w:ilvl="0" w:tplc="040E0001">
       <w:start w:val="1"/>
       <w:numFmt w:val="bullet"/>
       <w:lvlText w:val=""/>
       <w:lvlJc w:val="left"/>
       <w:pPr>
-        <w:ind w:left="720" w:hanging="360"/>
+        <w:ind w:left="816" w:hanging="360"/>
       </w:pPr>
       <w:rPr>
         <w:rFonts w:ascii="Symbol" w:hAnsi="Symbol" w:hint="default"/>
@@ -3903,7 +3348,7 @@
       <w:lvlText w:val="o"/>
       <w:lvlJc w:val="left"/>
       <w:pPr>
-        <w:ind w:left="1440" w:hanging="360"/>
+        <w:ind w:left="1536" w:hanging="360"/>
       </w:pPr>
       <w:rPr>
         <w:rFonts w:ascii="Courier New" w:hAnsi="Courier New" w:cs="Courier New" w:hint="default"/>
@@ -3915,7 +3360,7 @@
       <w:lvlText w:val=""/>
       <w:lvlJc w:val="left"/>
       <w:pPr>
-        <w:ind w:left="2160" w:hanging="360"/>
+        <w:ind w:left="2256" w:hanging="360"/>
       </w:pPr>
       <w:rPr>
         <w:rFonts w:ascii="Wingdings" w:hAnsi="Wingdings" w:hint="default"/>
@@ -3927,7 +3372,7 @@
       <w:lvlText w:val=""/>
       <w:lvlJc w:val="left"/>
       <w:pPr>
-        <w:ind w:left="2880" w:hanging="360"/>
+        <w:ind w:left="2976" w:hanging="360"/>
       </w:pPr>
       <w:rPr>
         <w:rFonts w:ascii="Symbol" w:hAnsi="Symbol" w:hint="default"/>
@@ -3939,7 +3384,7 @@
       <w:lvlText w:val="o"/>
       <w:lvlJc w:val="left"/>
       <w:pPr>
-        <w:ind w:left="3600" w:hanging="360"/>
+        <w:ind w:left="3696" w:hanging="360"/>
       </w:pPr>
       <w:rPr>
         <w:rFonts w:ascii="Courier New" w:hAnsi="Courier New" w:cs="Courier New" w:hint="default"/>
@@ -3951,7 +3396,7 @@
       <w:lvlText w:val=""/>
       <w:lvlJc w:val="left"/>
       <w:pPr>
-        <w:ind w:left="4320" w:hanging="360"/>
+        <w:ind w:left="4416" w:hanging="360"/>
       </w:pPr>
       <w:rPr>
         <w:rFonts w:ascii="Wingdings" w:hAnsi="Wingdings" w:hint="default"/>
@@ -3963,7 +3408,7 @@
       <w:lvlText w:val=""/>
       <w:lvlJc w:val="left"/>
       <w:pPr>
-        <w:ind w:left="5040" w:hanging="360"/>
+        <w:ind w:left="5136" w:hanging="360"/>
       </w:pPr>
       <w:rPr>
         <w:rFonts w:ascii="Symbol" w:hAnsi="Symbol" w:hint="default"/>
@@ -3975,7 +3420,7 @@
       <w:lvlText w:val="o"/>
       <w:lvlJc w:val="left"/>
       <w:pPr>
-        <w:ind w:left="5760" w:hanging="360"/>
+        <w:ind w:left="5856" w:hanging="360"/>
       </w:pPr>
       <w:rPr>
         <w:rFonts w:ascii="Courier New" w:hAnsi="Courier New" w:cs="Courier New" w:hint="default"/>
@@ -3987,7 +3432,7 @@
       <w:lvlText w:val=""/>
       <w:lvlJc w:val="left"/>
       <w:pPr>
-        <w:ind w:left="6480" w:hanging="360"/>
+        <w:ind w:left="6576" w:hanging="360"/>
       </w:pPr>
       <w:rPr>
         <w:rFonts w:ascii="Wingdings" w:hAnsi="Wingdings" w:hint="default"/>
@@ -3995,16 +3440,16 @@
     </w:lvl>
   </w:abstractNum>
   <w:abstractNum w:abstractNumId="1" w15:restartNumberingAfterBreak="0">
-    <w:nsid w:val="6E7312B6"/>
+    <w:nsid w:val="7EB672F7"/>
     <w:multiLevelType w:val="hybridMultilevel"/>
-    <w:tmpl w:val="FD80BAFC"/>
+    <w:tmpl w:val="A6F0C99C"/>
     <w:lvl w:ilvl="0" w:tplc="040E0001">
       <w:start w:val="1"/>
       <w:numFmt w:val="bullet"/>
       <w:lvlText w:val=""/>
       <w:lvlJc w:val="left"/>
       <w:pPr>
-        <w:ind w:left="816" w:hanging="360"/>
+        <w:ind w:left="720" w:hanging="360"/>
       </w:pPr>
       <w:rPr>
         <w:rFonts w:ascii="Symbol" w:hAnsi="Symbol" w:hint="default"/>
@@ -4016,7 +3461,7 @@
       <w:lvlText w:val="o"/>
       <w:lvlJc w:val="left"/>
       <w:pPr>
-        <w:ind w:left="1536" w:hanging="360"/>
+        <w:ind w:left="1440" w:hanging="360"/>
       </w:pPr>
       <w:rPr>
         <w:rFonts w:ascii="Courier New" w:hAnsi="Courier New" w:cs="Courier New" w:hint="default"/>
@@ -4028,7 +3473,7 @@
       <w:lvlText w:val=""/>
       <w:lvlJc w:val="left"/>
       <w:pPr>
-        <w:ind w:left="2256" w:hanging="360"/>
+        <w:ind w:left="2160" w:hanging="360"/>
       </w:pPr>
       <w:rPr>
         <w:rFonts w:ascii="Wingdings" w:hAnsi="Wingdings" w:hint="default"/>
@@ -4040,7 +3485,7 @@
       <w:lvlText w:val=""/>
       <w:lvlJc w:val="left"/>
       <w:pPr>
-        <w:ind w:left="2976" w:hanging="360"/>
+        <w:ind w:left="2880" w:hanging="360"/>
       </w:pPr>
       <w:rPr>
         <w:rFonts w:ascii="Symbol" w:hAnsi="Symbol" w:hint="default"/>
@@ -4052,7 +3497,7 @@
       <w:lvlText w:val="o"/>
       <w:lvlJc w:val="left"/>
       <w:pPr>
-        <w:ind w:left="3696" w:hanging="360"/>
+        <w:ind w:left="3600" w:hanging="360"/>
       </w:pPr>
       <w:rPr>
         <w:rFonts w:ascii="Courier New" w:hAnsi="Courier New" w:cs="Courier New" w:hint="default"/>
@@ -4064,7 +3509,7 @@
       <w:lvlText w:val=""/>
       <w:lvlJc w:val="left"/>
       <w:pPr>
-        <w:ind w:left="4416" w:hanging="360"/>
+        <w:ind w:left="4320" w:hanging="360"/>
       </w:pPr>
       <w:rPr>
         <w:rFonts w:ascii="Wingdings" w:hAnsi="Wingdings" w:hint="default"/>
@@ -4076,7 +3521,7 @@
       <w:lvlText w:val=""/>
       <w:lvlJc w:val="left"/>
       <w:pPr>
-        <w:ind w:left="5136" w:hanging="360"/>
+        <w:ind w:left="5040" w:hanging="360"/>
       </w:pPr>
       <w:rPr>
         <w:rFonts w:ascii="Symbol" w:hAnsi="Symbol" w:hint="default"/>
@@ -4088,7 +3533,7 @@
       <w:lvlText w:val="o"/>
       <w:lvlJc w:val="left"/>
       <w:pPr>
-        <w:ind w:left="5856" w:hanging="360"/>
+        <w:ind w:left="5760" w:hanging="360"/>
       </w:pPr>
       <w:rPr>
         <w:rFonts w:ascii="Courier New" w:hAnsi="Courier New" w:cs="Courier New" w:hint="default"/>
@@ -4100,232 +3545,6 @@
       <w:lvlText w:val=""/>
       <w:lvlJc w:val="left"/>
       <w:pPr>
-        <w:ind w:left="6576" w:hanging="360"/>
-      </w:pPr>
-      <w:rPr>
-        <w:rFonts w:ascii="Wingdings" w:hAnsi="Wingdings" w:hint="default"/>
-      </w:rPr>
-    </w:lvl>
-  </w:abstractNum>
-  <w:abstractNum w:abstractNumId="2" w15:restartNumberingAfterBreak="0">
-    <w:nsid w:val="76FA296F"/>
-    <w:multiLevelType w:val="hybridMultilevel"/>
-    <w:tmpl w:val="6DAE32EA"/>
-    <w:lvl w:ilvl="0" w:tplc="040E0001">
-      <w:start w:val="1"/>
-      <w:numFmt w:val="bullet"/>
-      <w:lvlText w:val=""/>
-      <w:lvlJc w:val="left"/>
-      <w:pPr>
-        <w:ind w:left="720" w:hanging="360"/>
-      </w:pPr>
-      <w:rPr>
-        <w:rFonts w:ascii="Symbol" w:hAnsi="Symbol" w:hint="default"/>
-      </w:rPr>
-    </w:lvl>
-    <w:lvl w:ilvl="1" w:tplc="040E0003" w:tentative="1">
-      <w:start w:val="1"/>
-      <w:numFmt w:val="bullet"/>
-      <w:lvlText w:val="o"/>
-      <w:lvlJc w:val="left"/>
-      <w:pPr>
-        <w:ind w:left="1440" w:hanging="360"/>
-      </w:pPr>
-      <w:rPr>
-        <w:rFonts w:ascii="Courier New" w:hAnsi="Courier New" w:cs="Courier New" w:hint="default"/>
-      </w:rPr>
-    </w:lvl>
-    <w:lvl w:ilvl="2" w:tplc="040E0005" w:tentative="1">
-      <w:start w:val="1"/>
-      <w:numFmt w:val="bullet"/>
-      <w:lvlText w:val=""/>
-      <w:lvlJc w:val="left"/>
-      <w:pPr>
-        <w:ind w:left="2160" w:hanging="360"/>
-      </w:pPr>
-      <w:rPr>
-        <w:rFonts w:ascii="Wingdings" w:hAnsi="Wingdings" w:hint="default"/>
-      </w:rPr>
-    </w:lvl>
-    <w:lvl w:ilvl="3" w:tplc="040E0001" w:tentative="1">
-      <w:start w:val="1"/>
-      <w:numFmt w:val="bullet"/>
-      <w:lvlText w:val=""/>
-      <w:lvlJc w:val="left"/>
-      <w:pPr>
-        <w:ind w:left="2880" w:hanging="360"/>
-      </w:pPr>
-      <w:rPr>
-        <w:rFonts w:ascii="Symbol" w:hAnsi="Symbol" w:hint="default"/>
-      </w:rPr>
-    </w:lvl>
-    <w:lvl w:ilvl="4" w:tplc="040E0003" w:tentative="1">
-      <w:start w:val="1"/>
-      <w:numFmt w:val="bullet"/>
-      <w:lvlText w:val="o"/>
-      <w:lvlJc w:val="left"/>
-      <w:pPr>
-        <w:ind w:left="3600" w:hanging="360"/>
-      </w:pPr>
-      <w:rPr>
-        <w:rFonts w:ascii="Courier New" w:hAnsi="Courier New" w:cs="Courier New" w:hint="default"/>
-      </w:rPr>
-    </w:lvl>
-    <w:lvl w:ilvl="5" w:tplc="040E0005" w:tentative="1">
-      <w:start w:val="1"/>
-      <w:numFmt w:val="bullet"/>
-      <w:lvlText w:val=""/>
-      <w:lvlJc w:val="left"/>
-      <w:pPr>
-        <w:ind w:left="4320" w:hanging="360"/>
-      </w:pPr>
-      <w:rPr>
-        <w:rFonts w:ascii="Wingdings" w:hAnsi="Wingdings" w:hint="default"/>
-      </w:rPr>
-    </w:lvl>
-    <w:lvl w:ilvl="6" w:tplc="040E0001" w:tentative="1">
-      <w:start w:val="1"/>
-      <w:numFmt w:val="bullet"/>
-      <w:lvlText w:val=""/>
-      <w:lvlJc w:val="left"/>
-      <w:pPr>
-        <w:ind w:left="5040" w:hanging="360"/>
-      </w:pPr>
-      <w:rPr>
-        <w:rFonts w:ascii="Symbol" w:hAnsi="Symbol" w:hint="default"/>
-      </w:rPr>
-    </w:lvl>
-    <w:lvl w:ilvl="7" w:tplc="040E0003" w:tentative="1">
-      <w:start w:val="1"/>
-      <w:numFmt w:val="bullet"/>
-      <w:lvlText w:val="o"/>
-      <w:lvlJc w:val="left"/>
-      <w:pPr>
-        <w:ind w:left="5760" w:hanging="360"/>
-      </w:pPr>
-      <w:rPr>
-        <w:rFonts w:ascii="Courier New" w:hAnsi="Courier New" w:cs="Courier New" w:hint="default"/>
-      </w:rPr>
-    </w:lvl>
-    <w:lvl w:ilvl="8" w:tplc="040E0005" w:tentative="1">
-      <w:start w:val="1"/>
-      <w:numFmt w:val="bullet"/>
-      <w:lvlText w:val=""/>
-      <w:lvlJc w:val="left"/>
-      <w:pPr>
-        <w:ind w:left="6480" w:hanging="360"/>
-      </w:pPr>
-      <w:rPr>
-        <w:rFonts w:ascii="Wingdings" w:hAnsi="Wingdings" w:hint="default"/>
-      </w:rPr>
-    </w:lvl>
-  </w:abstractNum>
-  <w:abstractNum w:abstractNumId="3" w15:restartNumberingAfterBreak="0">
-    <w:nsid w:val="7EB672F7"/>
-    <w:multiLevelType w:val="hybridMultilevel"/>
-    <w:tmpl w:val="A6F0C99C"/>
-    <w:lvl w:ilvl="0" w:tplc="040E0001">
-      <w:start w:val="1"/>
-      <w:numFmt w:val="bullet"/>
-      <w:lvlText w:val=""/>
-      <w:lvlJc w:val="left"/>
-      <w:pPr>
-        <w:ind w:left="720" w:hanging="360"/>
-      </w:pPr>
-      <w:rPr>
-        <w:rFonts w:ascii="Symbol" w:hAnsi="Symbol" w:hint="default"/>
-      </w:rPr>
-    </w:lvl>
-    <w:lvl w:ilvl="1" w:tplc="040E0003" w:tentative="1">
-      <w:start w:val="1"/>
-      <w:numFmt w:val="bullet"/>
-      <w:lvlText w:val="o"/>
-      <w:lvlJc w:val="left"/>
-      <w:pPr>
-        <w:ind w:left="1440" w:hanging="360"/>
-      </w:pPr>
-      <w:rPr>
-        <w:rFonts w:ascii="Courier New" w:hAnsi="Courier New" w:cs="Courier New" w:hint="default"/>
-      </w:rPr>
-    </w:lvl>
-    <w:lvl w:ilvl="2" w:tplc="040E0005" w:tentative="1">
-      <w:start w:val="1"/>
-      <w:numFmt w:val="bullet"/>
-      <w:lvlText w:val=""/>
-      <w:lvlJc w:val="left"/>
-      <w:pPr>
-        <w:ind w:left="2160" w:hanging="360"/>
-      </w:pPr>
-      <w:rPr>
-        <w:rFonts w:ascii="Wingdings" w:hAnsi="Wingdings" w:hint="default"/>
-      </w:rPr>
-    </w:lvl>
-    <w:lvl w:ilvl="3" w:tplc="040E0001" w:tentative="1">
-      <w:start w:val="1"/>
-      <w:numFmt w:val="bullet"/>
-      <w:lvlText w:val=""/>
-      <w:lvlJc w:val="left"/>
-      <w:pPr>
-        <w:ind w:left="2880" w:hanging="360"/>
-      </w:pPr>
-      <w:rPr>
-        <w:rFonts w:ascii="Symbol" w:hAnsi="Symbol" w:hint="default"/>
-      </w:rPr>
-    </w:lvl>
-    <w:lvl w:ilvl="4" w:tplc="040E0003" w:tentative="1">
-      <w:start w:val="1"/>
-      <w:numFmt w:val="bullet"/>
-      <w:lvlText w:val="o"/>
-      <w:lvlJc w:val="left"/>
-      <w:pPr>
-        <w:ind w:left="3600" w:hanging="360"/>
-      </w:pPr>
-      <w:rPr>
-        <w:rFonts w:ascii="Courier New" w:hAnsi="Courier New" w:cs="Courier New" w:hint="default"/>
-      </w:rPr>
-    </w:lvl>
-    <w:lvl w:ilvl="5" w:tplc="040E0005" w:tentative="1">
-      <w:start w:val="1"/>
-      <w:numFmt w:val="bullet"/>
-      <w:lvlText w:val=""/>
-      <w:lvlJc w:val="left"/>
-      <w:pPr>
-        <w:ind w:left="4320" w:hanging="360"/>
-      </w:pPr>
-      <w:rPr>
-        <w:rFonts w:ascii="Wingdings" w:hAnsi="Wingdings" w:hint="default"/>
-      </w:rPr>
-    </w:lvl>
-    <w:lvl w:ilvl="6" w:tplc="040E0001" w:tentative="1">
-      <w:start w:val="1"/>
-      <w:numFmt w:val="bullet"/>
-      <w:lvlText w:val=""/>
-      <w:lvlJc w:val="left"/>
-      <w:pPr>
-        <w:ind w:left="5040" w:hanging="360"/>
-      </w:pPr>
-      <w:rPr>
-        <w:rFonts w:ascii="Symbol" w:hAnsi="Symbol" w:hint="default"/>
-      </w:rPr>
-    </w:lvl>
-    <w:lvl w:ilvl="7" w:tplc="040E0003" w:tentative="1">
-      <w:start w:val="1"/>
-      <w:numFmt w:val="bullet"/>
-      <w:lvlText w:val="o"/>
-      <w:lvlJc w:val="left"/>
-      <w:pPr>
-        <w:ind w:left="5760" w:hanging="360"/>
-      </w:pPr>
-      <w:rPr>
-        <w:rFonts w:ascii="Courier New" w:hAnsi="Courier New" w:cs="Courier New" w:hint="default"/>
-      </w:rPr>
-    </w:lvl>
-    <w:lvl w:ilvl="8" w:tplc="040E0005" w:tentative="1">
-      <w:start w:val="1"/>
-      <w:numFmt w:val="bullet"/>
-      <w:lvlText w:val=""/>
-      <w:lvlJc w:val="left"/>
-      <w:pPr>
         <w:ind w:left="6480" w:hanging="360"/>
       </w:pPr>
       <w:rPr>
@@ -4334,15 +3553,9 @@
     </w:lvl>
   </w:abstractNum>
   <w:num w:numId="1" w16cid:durableId="33770327">
-    <w:abstractNumId w:val="3"/>
+    <w:abstractNumId w:val="1"/>
   </w:num>
   <w:num w:numId="2" w16cid:durableId="565265875">
-    <w:abstractNumId w:val="1"/>
-  </w:num>
-  <w:num w:numId="3" w16cid:durableId="1458177206">
-    <w:abstractNumId w:val="2"/>
-  </w:num>
-  <w:num w:numId="4" w16cid:durableId="1687830723">
     <w:abstractNumId w:val="0"/>
   </w:num>
 </w:numbering>
@@ -4745,15 +3958,15 @@
     <w:lsdException w:name="Unresolved Mention" w:semiHidden="1" w:unhideWhenUsed="1"/>
     <w:lsdException w:name="Smart Link" w:semiHidden="1" w:unhideWhenUsed="1"/>
   </w:latentStyles>
-  <w:style w:type="paragraph" w:default="1" w:styleId="Norml">
+  <w:style w:type="paragraph" w:default="1" w:styleId="Normal">
     <w:name w:val="Normal"/>
     <w:qFormat/>
   </w:style>
-  <w:style w:type="paragraph" w:styleId="Cmsor1">
+  <w:style w:type="paragraph" w:styleId="Heading1">
     <w:name w:val="heading 1"/>
-    <w:basedOn w:val="Norml"/>
-    <w:next w:val="Norml"/>
-    <w:link w:val="Cmsor1Char"/>
+    <w:basedOn w:val="Normal"/>
+    <w:next w:val="Normal"/>
+    <w:link w:val="Heading1Char"/>
     <w:uiPriority w:val="9"/>
     <w:qFormat/>
     <w:rsid w:val="0005104C"/>
@@ -4770,11 +3983,11 @@
       <w:szCs w:val="40"/>
     </w:rPr>
   </w:style>
-  <w:style w:type="paragraph" w:styleId="Cmsor2">
+  <w:style w:type="paragraph" w:styleId="Heading2">
     <w:name w:val="heading 2"/>
-    <w:basedOn w:val="Norml"/>
-    <w:next w:val="Norml"/>
-    <w:link w:val="Cmsor2Char"/>
+    <w:basedOn w:val="Normal"/>
+    <w:next w:val="Normal"/>
+    <w:link w:val="Heading2Char"/>
     <w:uiPriority w:val="9"/>
     <w:semiHidden/>
     <w:unhideWhenUsed/>
@@ -4793,11 +4006,11 @@
       <w:szCs w:val="32"/>
     </w:rPr>
   </w:style>
-  <w:style w:type="paragraph" w:styleId="Cmsor3">
+  <w:style w:type="paragraph" w:styleId="Heading3">
     <w:name w:val="heading 3"/>
-    <w:basedOn w:val="Norml"/>
-    <w:next w:val="Norml"/>
-    <w:link w:val="Cmsor3Char"/>
+    <w:basedOn w:val="Normal"/>
+    <w:next w:val="Normal"/>
+    <w:link w:val="Heading3Char"/>
     <w:uiPriority w:val="9"/>
     <w:semiHidden/>
     <w:unhideWhenUsed/>
@@ -4816,11 +4029,11 @@
       <w:szCs w:val="28"/>
     </w:rPr>
   </w:style>
-  <w:style w:type="paragraph" w:styleId="Cmsor4">
+  <w:style w:type="paragraph" w:styleId="Heading4">
     <w:name w:val="heading 4"/>
-    <w:basedOn w:val="Norml"/>
-    <w:next w:val="Norml"/>
-    <w:link w:val="Cmsor4Char"/>
+    <w:basedOn w:val="Normal"/>
+    <w:next w:val="Normal"/>
+    <w:link w:val="Heading4Char"/>
     <w:uiPriority w:val="9"/>
     <w:semiHidden/>
     <w:unhideWhenUsed/>
@@ -4839,11 +4052,11 @@
       <w:color w:val="0F4761" w:themeColor="accent1" w:themeShade="BF"/>
     </w:rPr>
   </w:style>
-  <w:style w:type="paragraph" w:styleId="Cmsor5">
+  <w:style w:type="paragraph" w:styleId="Heading5">
     <w:name w:val="heading 5"/>
-    <w:basedOn w:val="Norml"/>
-    <w:next w:val="Norml"/>
-    <w:link w:val="Cmsor5Char"/>
+    <w:basedOn w:val="Normal"/>
+    <w:next w:val="Normal"/>
+    <w:link w:val="Heading5Char"/>
     <w:uiPriority w:val="9"/>
     <w:semiHidden/>
     <w:unhideWhenUsed/>
@@ -4860,11 +4073,11 @@
       <w:color w:val="0F4761" w:themeColor="accent1" w:themeShade="BF"/>
     </w:rPr>
   </w:style>
-  <w:style w:type="paragraph" w:styleId="Cmsor6">
+  <w:style w:type="paragraph" w:styleId="Heading6">
     <w:name w:val="heading 6"/>
-    <w:basedOn w:val="Norml"/>
-    <w:next w:val="Norml"/>
-    <w:link w:val="Cmsor6Char"/>
+    <w:basedOn w:val="Normal"/>
+    <w:next w:val="Normal"/>
+    <w:link w:val="Heading6Char"/>
     <w:uiPriority w:val="9"/>
     <w:semiHidden/>
     <w:unhideWhenUsed/>
@@ -4883,11 +4096,11 @@
       <w:color w:val="595959" w:themeColor="text1" w:themeTint="A6"/>
     </w:rPr>
   </w:style>
-  <w:style w:type="paragraph" w:styleId="Cmsor7">
+  <w:style w:type="paragraph" w:styleId="Heading7">
     <w:name w:val="heading 7"/>
-    <w:basedOn w:val="Norml"/>
-    <w:next w:val="Norml"/>
-    <w:link w:val="Cmsor7Char"/>
+    <w:basedOn w:val="Normal"/>
+    <w:next w:val="Normal"/>
+    <w:link w:val="Heading7Char"/>
     <w:uiPriority w:val="9"/>
     <w:semiHidden/>
     <w:unhideWhenUsed/>
@@ -4904,11 +4117,11 @@
       <w:color w:val="595959" w:themeColor="text1" w:themeTint="A6"/>
     </w:rPr>
   </w:style>
-  <w:style w:type="paragraph" w:styleId="Cmsor8">
+  <w:style w:type="paragraph" w:styleId="Heading8">
     <w:name w:val="heading 8"/>
-    <w:basedOn w:val="Norml"/>
-    <w:next w:val="Norml"/>
-    <w:link w:val="Cmsor8Char"/>
+    <w:basedOn w:val="Normal"/>
+    <w:next w:val="Normal"/>
+    <w:link w:val="Heading8Char"/>
     <w:uiPriority w:val="9"/>
     <w:semiHidden/>
     <w:unhideWhenUsed/>
@@ -4927,11 +4140,11 @@
       <w:color w:val="272727" w:themeColor="text1" w:themeTint="D8"/>
     </w:rPr>
   </w:style>
-  <w:style w:type="paragraph" w:styleId="Cmsor9">
+  <w:style w:type="paragraph" w:styleId="Heading9">
     <w:name w:val="heading 9"/>
-    <w:basedOn w:val="Norml"/>
-    <w:next w:val="Norml"/>
-    <w:link w:val="Cmsor9Char"/>
+    <w:basedOn w:val="Normal"/>
+    <w:next w:val="Normal"/>
+    <w:link w:val="Heading9Char"/>
     <w:uiPriority w:val="9"/>
     <w:semiHidden/>
     <w:unhideWhenUsed/>
@@ -4948,13 +4161,13 @@
       <w:color w:val="272727" w:themeColor="text1" w:themeTint="D8"/>
     </w:rPr>
   </w:style>
-  <w:style w:type="character" w:default="1" w:styleId="Bekezdsalapbettpusa">
+  <w:style w:type="character" w:default="1" w:styleId="DefaultParagraphFont">
     <w:name w:val="Default Paragraph Font"/>
     <w:uiPriority w:val="1"/>
     <w:semiHidden/>
     <w:unhideWhenUsed/>
   </w:style>
-  <w:style w:type="table" w:default="1" w:styleId="Normltblzat">
+  <w:style w:type="table" w:default="1" w:styleId="TableNormal">
     <w:name w:val="Normal Table"/>
     <w:uiPriority w:val="99"/>
     <w:semiHidden/>
@@ -4969,15 +4182,15 @@
       </w:tblCellMar>
     </w:tblPr>
   </w:style>
-  <w:style w:type="numbering" w:default="1" w:styleId="Nemlista">
+  <w:style w:type="numbering" w:default="1" w:styleId="NoList">
     <w:name w:val="No List"/>
     <w:uiPriority w:val="99"/>
     <w:semiHidden/>
     <w:unhideWhenUsed/>
   </w:style>
-  <w:style w:type="character" w:customStyle="1" w:styleId="Cmsor1Char">
-    <w:name w:val="Címsor 1 Char"/>
-    <w:link w:val="Cmsor1"/>
+  <w:style w:type="character" w:customStyle="1" w:styleId="Heading1Char">
+    <w:name w:val="Heading 1 Char"/>
+    <w:link w:val="Heading1"/>
     <w:uiPriority w:val="9"/>
     <w:rsid w:val="38171242"/>
     <w:rPr>
@@ -4987,9 +4200,9 @@
       <w:szCs w:val="40"/>
     </w:rPr>
   </w:style>
-  <w:style w:type="character" w:customStyle="1" w:styleId="Cmsor2Char">
-    <w:name w:val="Címsor 2 Char"/>
-    <w:link w:val="Cmsor2"/>
+  <w:style w:type="character" w:customStyle="1" w:styleId="Heading2Char">
+    <w:name w:val="Heading 2 Char"/>
+    <w:link w:val="Heading2"/>
     <w:uiPriority w:val="9"/>
     <w:semiHidden/>
     <w:rsid w:val="38171242"/>
@@ -5000,9 +4213,9 @@
       <w:szCs w:val="32"/>
     </w:rPr>
   </w:style>
-  <w:style w:type="character" w:customStyle="1" w:styleId="Cmsor3Char">
-    <w:name w:val="Címsor 3 Char"/>
-    <w:link w:val="Cmsor3"/>
+  <w:style w:type="character" w:customStyle="1" w:styleId="Heading3Char">
+    <w:name w:val="Heading 3 Char"/>
+    <w:link w:val="Heading3"/>
     <w:uiPriority w:val="9"/>
     <w:semiHidden/>
     <w:rsid w:val="38171242"/>
@@ -5013,9 +4226,9 @@
       <w:szCs w:val="28"/>
     </w:rPr>
   </w:style>
-  <w:style w:type="character" w:customStyle="1" w:styleId="Cmsor4Char">
-    <w:name w:val="Címsor 4 Char"/>
-    <w:link w:val="Cmsor4"/>
+  <w:style w:type="character" w:customStyle="1" w:styleId="Heading4Char">
+    <w:name w:val="Heading 4 Char"/>
+    <w:link w:val="Heading4"/>
     <w:uiPriority w:val="9"/>
     <w:semiHidden/>
     <w:rsid w:val="38171242"/>
@@ -5026,9 +4239,9 @@
       <w:color w:val="0F4761" w:themeColor="accent1" w:themeShade="BF"/>
     </w:rPr>
   </w:style>
-  <w:style w:type="character" w:customStyle="1" w:styleId="Cmsor5Char">
-    <w:name w:val="Címsor 5 Char"/>
-    <w:link w:val="Cmsor5"/>
+  <w:style w:type="character" w:customStyle="1" w:styleId="Heading5Char">
+    <w:name w:val="Heading 5 Char"/>
+    <w:link w:val="Heading5"/>
     <w:uiPriority w:val="9"/>
     <w:semiHidden/>
     <w:rsid w:val="38171242"/>
@@ -5037,9 +4250,9 @@
       <w:color w:val="0F4761" w:themeColor="accent1" w:themeShade="BF"/>
     </w:rPr>
   </w:style>
-  <w:style w:type="character" w:customStyle="1" w:styleId="Cmsor6Char">
-    <w:name w:val="Címsor 6 Char"/>
-    <w:link w:val="Cmsor6"/>
+  <w:style w:type="character" w:customStyle="1" w:styleId="Heading6Char">
+    <w:name w:val="Heading 6 Char"/>
+    <w:link w:val="Heading6"/>
     <w:uiPriority w:val="9"/>
     <w:semiHidden/>
     <w:rsid w:val="38171242"/>
@@ -5050,9 +4263,9 @@
       <w:color w:val="595959" w:themeColor="text1" w:themeTint="A6"/>
     </w:rPr>
   </w:style>
-  <w:style w:type="character" w:customStyle="1" w:styleId="Cmsor7Char">
-    <w:name w:val="Címsor 7 Char"/>
-    <w:link w:val="Cmsor7"/>
+  <w:style w:type="character" w:customStyle="1" w:styleId="Heading7Char">
+    <w:name w:val="Heading 7 Char"/>
+    <w:link w:val="Heading7"/>
     <w:uiPriority w:val="9"/>
     <w:semiHidden/>
     <w:rsid w:val="38171242"/>
@@ -5061,9 +4274,9 @@
       <w:color w:val="595959" w:themeColor="text1" w:themeTint="A6"/>
     </w:rPr>
   </w:style>
-  <w:style w:type="character" w:customStyle="1" w:styleId="Cmsor8Char">
-    <w:name w:val="Címsor 8 Char"/>
-    <w:link w:val="Cmsor8"/>
+  <w:style w:type="character" w:customStyle="1" w:styleId="Heading8Char">
+    <w:name w:val="Heading 8 Char"/>
+    <w:link w:val="Heading8"/>
     <w:uiPriority w:val="9"/>
     <w:semiHidden/>
     <w:rsid w:val="38171242"/>
@@ -5074,9 +4287,9 @@
       <w:color w:val="272727"/>
     </w:rPr>
   </w:style>
-  <w:style w:type="character" w:customStyle="1" w:styleId="Cmsor9Char">
-    <w:name w:val="Címsor 9 Char"/>
-    <w:link w:val="Cmsor9"/>
+  <w:style w:type="character" w:customStyle="1" w:styleId="Heading9Char">
+    <w:name w:val="Heading 9 Char"/>
+    <w:link w:val="Heading9"/>
     <w:uiPriority w:val="9"/>
     <w:semiHidden/>
     <w:rsid w:val="38171242"/>
@@ -5085,11 +4298,11 @@
       <w:color w:val="272727"/>
     </w:rPr>
   </w:style>
-  <w:style w:type="paragraph" w:styleId="Cm">
+  <w:style w:type="paragraph" w:styleId="Title">
     <w:name w:val="Title"/>
-    <w:basedOn w:val="Norml"/>
-    <w:next w:val="Norml"/>
-    <w:link w:val="CmChar"/>
+    <w:basedOn w:val="Normal"/>
+    <w:next w:val="Normal"/>
+    <w:link w:val="TitleChar"/>
     <w:uiPriority w:val="10"/>
     <w:qFormat/>
     <w:rsid w:val="0005104C"/>
@@ -5105,9 +4318,9 @@
       <w:szCs w:val="56"/>
     </w:rPr>
   </w:style>
-  <w:style w:type="character" w:customStyle="1" w:styleId="CmChar">
-    <w:name w:val="Cím Char"/>
-    <w:link w:val="Cm"/>
+  <w:style w:type="character" w:customStyle="1" w:styleId="TitleChar">
+    <w:name w:val="Title Char"/>
+    <w:link w:val="Title"/>
     <w:uiPriority w:val="10"/>
     <w:rsid w:val="38171242"/>
     <w:rPr>
@@ -5116,11 +4329,11 @@
       <w:szCs w:val="56"/>
     </w:rPr>
   </w:style>
-  <w:style w:type="paragraph" w:styleId="Alcm">
+  <w:style w:type="paragraph" w:styleId="Subtitle">
     <w:name w:val="Subtitle"/>
-    <w:basedOn w:val="Norml"/>
-    <w:next w:val="Norml"/>
-    <w:link w:val="AlcmChar"/>
+    <w:basedOn w:val="Normal"/>
+    <w:next w:val="Normal"/>
+    <w:link w:val="SubtitleChar"/>
     <w:uiPriority w:val="11"/>
     <w:qFormat/>
     <w:rsid w:val="0005104C"/>
@@ -5137,9 +4350,9 @@
       <w:szCs w:val="28"/>
     </w:rPr>
   </w:style>
-  <w:style w:type="character" w:customStyle="1" w:styleId="AlcmChar">
-    <w:name w:val="Alcím Char"/>
-    <w:link w:val="Alcm"/>
+  <w:style w:type="character" w:customStyle="1" w:styleId="SubtitleChar">
+    <w:name w:val="Subtitle Char"/>
+    <w:link w:val="Subtitle"/>
     <w:uiPriority w:val="11"/>
     <w:rsid w:val="38171242"/>
     <w:rPr>
@@ -5149,11 +4362,11 @@
       <w:szCs w:val="28"/>
     </w:rPr>
   </w:style>
-  <w:style w:type="paragraph" w:styleId="Idzet">
+  <w:style w:type="paragraph" w:styleId="Quote">
     <w:name w:val="Quote"/>
-    <w:basedOn w:val="Norml"/>
-    <w:next w:val="Norml"/>
-    <w:link w:val="IdzetChar"/>
+    <w:basedOn w:val="Normal"/>
+    <w:next w:val="Normal"/>
+    <w:link w:val="QuoteChar"/>
     <w:uiPriority w:val="29"/>
     <w:qFormat/>
     <w:rsid w:val="0005104C"/>
@@ -5167,9 +4380,9 @@
       <w:color w:val="404040" w:themeColor="text1" w:themeTint="BF"/>
     </w:rPr>
   </w:style>
-  <w:style w:type="character" w:customStyle="1" w:styleId="IdzetChar">
-    <w:name w:val="Idézet Char"/>
-    <w:link w:val="Idzet"/>
+  <w:style w:type="character" w:customStyle="1" w:styleId="QuoteChar">
+    <w:name w:val="Quote Char"/>
+    <w:link w:val="Quote"/>
     <w:uiPriority w:val="29"/>
     <w:rsid w:val="38171242"/>
     <w:rPr>
@@ -5178,9 +4391,9 @@
       <w:color w:val="404040" w:themeColor="text1" w:themeTint="BF"/>
     </w:rPr>
   </w:style>
-  <w:style w:type="paragraph" w:styleId="Listaszerbekezds">
+  <w:style w:type="paragraph" w:styleId="ListParagraph">
     <w:name w:val="List Paragraph"/>
-    <w:basedOn w:val="Norml"/>
+    <w:basedOn w:val="Normal"/>
     <w:uiPriority w:val="34"/>
     <w:qFormat/>
     <w:rsid w:val="0005104C"/>
@@ -5189,7 +4402,7 @@
       <w:contextualSpacing/>
     </w:pPr>
   </w:style>
-  <w:style w:type="character" w:styleId="Erskiemels">
+  <w:style w:type="character" w:styleId="IntenseEmphasis">
     <w:name w:val="Intense Emphasis"/>
     <w:uiPriority w:val="21"/>
     <w:qFormat/>
@@ -5200,11 +4413,11 @@
       <w:color w:val="0F4761" w:themeColor="accent1" w:themeShade="BF"/>
     </w:rPr>
   </w:style>
-  <w:style w:type="paragraph" w:styleId="Kiemeltidzet">
+  <w:style w:type="paragraph" w:styleId="IntenseQuote">
     <w:name w:val="Intense Quote"/>
-    <w:basedOn w:val="Norml"/>
-    <w:next w:val="Norml"/>
-    <w:link w:val="KiemeltidzetChar"/>
+    <w:basedOn w:val="Normal"/>
+    <w:next w:val="Normal"/>
+    <w:link w:val="IntenseQuoteChar"/>
     <w:uiPriority w:val="30"/>
     <w:qFormat/>
     <w:rsid w:val="0005104C"/>
@@ -5223,9 +4436,9 @@
       <w:color w:val="0F4761" w:themeColor="accent1" w:themeShade="BF"/>
     </w:rPr>
   </w:style>
-  <w:style w:type="character" w:customStyle="1" w:styleId="KiemeltidzetChar">
-    <w:name w:val="Kiemelt idézet Char"/>
-    <w:link w:val="Kiemeltidzet"/>
+  <w:style w:type="character" w:customStyle="1" w:styleId="IntenseQuoteChar">
+    <w:name w:val="Intense Quote Char"/>
+    <w:link w:val="IntenseQuote"/>
     <w:uiPriority w:val="30"/>
     <w:rsid w:val="38171242"/>
     <w:rPr>
@@ -5234,7 +4447,7 @@
       <w:color w:val="0F4761" w:themeColor="accent1" w:themeShade="BF"/>
     </w:rPr>
   </w:style>
-  <w:style w:type="character" w:styleId="Ershivatkozs">
+  <w:style w:type="character" w:styleId="IntenseReference">
     <w:name w:val="Intense Reference"/>
     <w:uiPriority w:val="32"/>
     <w:qFormat/>
@@ -5246,7 +4459,7 @@
       <w:color w:val="0F4761" w:themeColor="accent1" w:themeShade="BF"/>
     </w:rPr>
   </w:style>
-  <w:style w:type="character" w:styleId="Hiperhivatkozs">
+  <w:style w:type="character" w:styleId="Hyperlink">
     <w:name w:val="Hyperlink"/>
     <w:uiPriority w:val="99"/>
     <w:unhideWhenUsed/>
@@ -5256,9 +4469,9 @@
       <w:u w:val="single"/>
     </w:rPr>
   </w:style>
-  <w:style w:type="paragraph" w:styleId="NormlWeb">
+  <w:style w:type="paragraph" w:styleId="NormalWeb">
     <w:name w:val="Normal (Web)"/>
-    <w:basedOn w:val="Norml"/>
+    <w:basedOn w:val="Normal"/>
     <w:uiPriority w:val="99"/>
     <w:semiHidden/>
     <w:unhideWhenUsed/>

</xml_diff>

<commit_message>
Recovering repository because the router were changed back to it's older one (which hasn't have the children structure)
</commit_message>
<xml_diff>
--- a/documentation.docx
+++ b/documentation.docx
@@ -79,7 +79,27 @@
           <w:sz w:val="40"/>
           <w:szCs w:val="40"/>
         </w:rPr>
-        <w:t xml:space="preserve"> Susán Csongor, El-Nabulsy Csongor Alan</w:t>
+        <w:t xml:space="preserve"> Susán Csongor, El-</w:t>
+      </w:r>
+      <w:proofErr w:type="spellStart"/>
+      <w:r>
+        <w:rPr>
+          <w:rFonts w:ascii="Times New Roman" w:hAnsi="Times New Roman" w:cs="Times New Roman"/>
+          <w:bCs/>
+          <w:sz w:val="40"/>
+          <w:szCs w:val="40"/>
+        </w:rPr>
+        <w:t>Nabulsy</w:t>
+      </w:r>
+      <w:proofErr w:type="spellEnd"/>
+      <w:r>
+        <w:rPr>
+          <w:rFonts w:ascii="Times New Roman" w:hAnsi="Times New Roman" w:cs="Times New Roman"/>
+          <w:bCs/>
+          <w:sz w:val="40"/>
+          <w:szCs w:val="40"/>
+        </w:rPr>
+        <w:t xml:space="preserve"> Csongor Alan</w:t>
       </w:r>
     </w:p>
     <w:p>
@@ -171,7 +191,7 @@
     </w:p>
     <w:p>
       <w:pPr>
-        <w:pStyle w:val="ListParagraph"/>
+        <w:pStyle w:val="Listaszerbekezds"/>
         <w:numPr>
           <w:ilvl w:val="0"/>
           <w:numId w:val="1"/>
@@ -193,7 +213,7 @@
     </w:p>
     <w:p>
       <w:pPr>
-        <w:pStyle w:val="ListParagraph"/>
+        <w:pStyle w:val="Listaszerbekezds"/>
         <w:numPr>
           <w:ilvl w:val="0"/>
           <w:numId w:val="1"/>
@@ -215,7 +235,7 @@
     </w:p>
     <w:p>
       <w:pPr>
-        <w:pStyle w:val="ListParagraph"/>
+        <w:pStyle w:val="Listaszerbekezds"/>
         <w:ind w:left="0"/>
         <w:rPr>
           <w:rFonts w:ascii="Times New Roman" w:hAnsi="Times New Roman" w:cs="Times New Roman"/>
@@ -459,7 +479,7 @@
     </w:p>
     <w:p>
       <w:pPr>
-        <w:pStyle w:val="ListParagraph"/>
+        <w:pStyle w:val="Listaszerbekezds"/>
         <w:rPr>
           <w:rFonts w:ascii="Times New Roman" w:hAnsi="Times New Roman" w:cs="Times New Roman"/>
           <w:sz w:val="36"/>
@@ -884,7 +904,7 @@
       <w:hyperlink r:id="rId14">
         <w:r>
           <w:rPr>
-            <w:rStyle w:val="Hyperlink"/>
+            <w:rStyle w:val="Hiperhivatkozs"/>
             <w:rFonts w:ascii="Times New Roman" w:eastAsia="Times New Roman" w:hAnsi="Times New Roman" w:cs="Times New Roman"/>
             <w:sz w:val="36"/>
             <w:szCs w:val="36"/>
@@ -1288,7 +1308,7 @@
           <w:szCs w:val="36"/>
         </w:rPr>
         <w:drawing>
-          <wp:inline distT="0" distB="0" distL="0" distR="0" wp14:anchorId="78A43544" wp14:editId="33012297">
+          <wp:inline distT="0" distB="0" distL="0" distR="0" wp14:anchorId="78A43544" wp14:editId="5279A085">
             <wp:extent cx="3166535" cy="1781175"/>
             <wp:effectExtent l="0" t="0" r="0" b="0"/>
             <wp:docPr id="3" name="Kép 3" descr="C:\Users\elnabulsy.csongor\AppData\Local\Microsoft\Windows\INetCache\Content.MSO\F75754B3.tmp"/>
@@ -1380,7 +1400,7 @@
           <w:szCs w:val="36"/>
         </w:rPr>
         <w:drawing>
-          <wp:inline distT="0" distB="0" distL="0" distR="0" wp14:anchorId="4E211814" wp14:editId="613E6DA4">
+          <wp:inline distT="0" distB="0" distL="0" distR="0" wp14:anchorId="4E211814" wp14:editId="477AF0ED">
             <wp:extent cx="3133725" cy="1762720"/>
             <wp:effectExtent l="0" t="0" r="0" b="9525"/>
             <wp:docPr id="4" name="Kép 4" descr="C:\Users\elnabulsy.csongor\Downloads\ui_main_student.png"/>
@@ -1462,7 +1482,7 @@
           <w:szCs w:val="36"/>
         </w:rPr>
         <w:drawing>
-          <wp:inline distT="0" distB="0" distL="0" distR="0" wp14:anchorId="5137FB78" wp14:editId="76ACE0F1">
+          <wp:inline distT="0" distB="0" distL="0" distR="0" wp14:anchorId="5137FB78" wp14:editId="051D1352">
             <wp:extent cx="3166110" cy="1780938"/>
             <wp:effectExtent l="0" t="0" r="0" b="0"/>
             <wp:docPr id="5" name="Kép 5" descr="C:\Users\elnabulsy.csongor\Downloads\ui_main_scheduler.png"/>
@@ -1573,7 +1593,7 @@
           <w:szCs w:val="36"/>
         </w:rPr>
         <w:drawing>
-          <wp:inline distT="0" distB="0" distL="0" distR="0" wp14:anchorId="27EC1C67" wp14:editId="46A658E3">
+          <wp:inline distT="0" distB="0" distL="0" distR="0" wp14:anchorId="27EC1C67" wp14:editId="44EAF746">
             <wp:extent cx="3055620" cy="1718786"/>
             <wp:effectExtent l="0" t="0" r="0" b="0"/>
             <wp:docPr id="6" name="Kép 6" descr="C:\Users\elnabulsy.csongor\Downloads\ui_main_admin.png"/>
@@ -1655,7 +1675,7 @@
           <w:szCs w:val="36"/>
         </w:rPr>
         <w:drawing>
-          <wp:inline distT="0" distB="0" distL="0" distR="0" wp14:anchorId="08225B4F" wp14:editId="443F2CCC">
+          <wp:inline distT="0" distB="0" distL="0" distR="0" wp14:anchorId="08225B4F" wp14:editId="11B0C10E">
             <wp:extent cx="2933700" cy="1942430"/>
             <wp:effectExtent l="0" t="0" r="0" b="1270"/>
             <wp:docPr id="7" name="Kép 7" descr="C:\Users\elnabulsy.csongor\Downloads\ui_structure.png"/>
@@ -1828,7 +1848,7 @@
           <w:szCs w:val="36"/>
         </w:rPr>
         <w:drawing>
-          <wp:inline distT="0" distB="0" distL="0" distR="0" wp14:anchorId="2C256DB5" wp14:editId="14094F98">
+          <wp:inline distT="0" distB="0" distL="0" distR="0" wp14:anchorId="2C256DB5" wp14:editId="5DC2B543">
             <wp:extent cx="3329940" cy="1752493"/>
             <wp:effectExtent l="0" t="0" r="3810" b="635"/>
             <wp:docPr id="9" name="Kép 9"/>
@@ -2386,7 +2406,7 @@
     </w:p>
     <w:p>
       <w:pPr>
-        <w:pStyle w:val="ListParagraph"/>
+        <w:pStyle w:val="Listaszerbekezds"/>
         <w:numPr>
           <w:ilvl w:val="0"/>
           <w:numId w:val="2"/>
@@ -2408,7 +2428,7 @@
     </w:p>
     <w:p>
       <w:pPr>
-        <w:pStyle w:val="ListParagraph"/>
+        <w:pStyle w:val="Listaszerbekezds"/>
         <w:numPr>
           <w:ilvl w:val="0"/>
           <w:numId w:val="2"/>
@@ -2440,7 +2460,7 @@
     </w:p>
     <w:p>
       <w:pPr>
-        <w:pStyle w:val="ListParagraph"/>
+        <w:pStyle w:val="Listaszerbekezds"/>
         <w:numPr>
           <w:ilvl w:val="0"/>
           <w:numId w:val="2"/>
@@ -2498,7 +2518,7 @@
     </w:p>
     <w:p>
       <w:pPr>
-        <w:pStyle w:val="ListParagraph"/>
+        <w:pStyle w:val="Listaszerbekezds"/>
         <w:numPr>
           <w:ilvl w:val="0"/>
           <w:numId w:val="2"/>
@@ -2548,7 +2568,7 @@
     </w:p>
     <w:p>
       <w:pPr>
-        <w:pStyle w:val="ListParagraph"/>
+        <w:pStyle w:val="Listaszerbekezds"/>
         <w:numPr>
           <w:ilvl w:val="0"/>
           <w:numId w:val="2"/>
@@ -2582,7 +2602,25 @@
           <w:sz w:val="36"/>
           <w:szCs w:val="36"/>
         </w:rPr>
-        <w:t>A projektet El-Nabulsy Csongor hozta létre és írta meg a kódját, a működéshez szükséges folyamatábrákat, az adatbázis ER-diagramját</w:t>
+        <w:t>A projektet El-</w:t>
+      </w:r>
+      <w:proofErr w:type="spellStart"/>
+      <w:r>
+        <w:rPr>
+          <w:rFonts w:ascii="Times New Roman" w:eastAsia="Times New Roman" w:hAnsi="Times New Roman" w:cs="Times New Roman"/>
+          <w:sz w:val="36"/>
+          <w:szCs w:val="36"/>
+        </w:rPr>
+        <w:t>Nabulsy</w:t>
+      </w:r>
+      <w:proofErr w:type="spellEnd"/>
+      <w:r>
+        <w:rPr>
+          <w:rFonts w:ascii="Times New Roman" w:eastAsia="Times New Roman" w:hAnsi="Times New Roman" w:cs="Times New Roman"/>
+          <w:sz w:val="36"/>
+          <w:szCs w:val="36"/>
+        </w:rPr>
+        <w:t xml:space="preserve"> Csongor hozta létre és írta meg a kódját, a működéshez szükséges folyamatábrákat, az adatbázis ER-diagramját</w:t>
       </w:r>
       <w:r>
         <w:rPr>
@@ -2819,7 +2857,25 @@
           <w:sz w:val="36"/>
           <w:szCs w:val="36"/>
         </w:rPr>
-        <w:t>(El-Nabulsy Csongor Alan</w:t>
+        <w:t>(El-</w:t>
+      </w:r>
+      <w:proofErr w:type="spellStart"/>
+      <w:r>
+        <w:rPr>
+          <w:rFonts w:ascii="Times New Roman" w:eastAsia="Times New Roman" w:hAnsi="Times New Roman" w:cs="Times New Roman"/>
+          <w:sz w:val="36"/>
+          <w:szCs w:val="36"/>
+        </w:rPr>
+        <w:t>Nabulsy</w:t>
+      </w:r>
+      <w:proofErr w:type="spellEnd"/>
+      <w:r>
+        <w:rPr>
+          <w:rFonts w:ascii="Times New Roman" w:eastAsia="Times New Roman" w:hAnsi="Times New Roman" w:cs="Times New Roman"/>
+          <w:sz w:val="36"/>
+          <w:szCs w:val="36"/>
+        </w:rPr>
+        <w:t xml:space="preserve"> Csongor Alan</w:t>
       </w:r>
       <w:r>
         <w:rPr>
@@ -2843,7 +2899,25 @@
           <w:sz w:val="36"/>
           <w:szCs w:val="36"/>
         </w:rPr>
-        <w:t xml:space="preserve"> (El-Nabulsy: főoldal és annak </w:t>
+        <w:t xml:space="preserve"> (El-</w:t>
+      </w:r>
+      <w:proofErr w:type="spellStart"/>
+      <w:r>
+        <w:rPr>
+          <w:rFonts w:ascii="Times New Roman" w:eastAsia="Times New Roman" w:hAnsi="Times New Roman" w:cs="Times New Roman"/>
+          <w:sz w:val="36"/>
+          <w:szCs w:val="36"/>
+        </w:rPr>
+        <w:t>Nabulsy</w:t>
+      </w:r>
+      <w:proofErr w:type="spellEnd"/>
+      <w:r>
+        <w:rPr>
+          <w:rFonts w:ascii="Times New Roman" w:eastAsia="Times New Roman" w:hAnsi="Times New Roman" w:cs="Times New Roman"/>
+          <w:sz w:val="36"/>
+          <w:szCs w:val="36"/>
+        </w:rPr>
+        <w:t xml:space="preserve">: főoldal és annak </w:t>
       </w:r>
       <w:r>
         <w:rPr>
@@ -2941,7 +3015,25 @@
           <w:sz w:val="36"/>
           <w:szCs w:val="36"/>
         </w:rPr>
-        <w:t xml:space="preserve">(El-Nabulsy Csongor Alan) A zenebekérő oldal </w:t>
+        <w:t>(El-</w:t>
+      </w:r>
+      <w:proofErr w:type="spellStart"/>
+      <w:r>
+        <w:rPr>
+          <w:rFonts w:ascii="Times New Roman" w:eastAsia="Times New Roman" w:hAnsi="Times New Roman" w:cs="Times New Roman"/>
+          <w:sz w:val="36"/>
+          <w:szCs w:val="36"/>
+        </w:rPr>
+        <w:t>Nabulsy</w:t>
+      </w:r>
+      <w:proofErr w:type="spellEnd"/>
+      <w:r>
+        <w:rPr>
+          <w:rFonts w:ascii="Times New Roman" w:eastAsia="Times New Roman" w:hAnsi="Times New Roman" w:cs="Times New Roman"/>
+          <w:sz w:val="36"/>
+          <w:szCs w:val="36"/>
+        </w:rPr>
+        <w:t xml:space="preserve"> Csongor Alan) A zenebekérő oldal </w:t>
       </w:r>
       <w:r>
         <w:rPr>
@@ -2973,18 +3065,137 @@
       <w:pPr>
         <w:rPr>
           <w:rFonts w:ascii="Times New Roman" w:eastAsia="Times New Roman" w:hAnsi="Times New Roman" w:cs="Times New Roman"/>
-          <w:sz w:val="36"/>
-          <w:szCs w:val="36"/>
-        </w:rPr>
-      </w:pPr>
-      <w:r>
-        <w:rPr>
-          <w:rFonts w:ascii="Times New Roman" w:eastAsia="Times New Roman" w:hAnsi="Times New Roman" w:cs="Times New Roman"/>
           <w:b/>
           <w:bCs/>
           <w:sz w:val="40"/>
           <w:szCs w:val="40"/>
         </w:rPr>
+      </w:pPr>
+      <w:r>
+        <w:rPr>
+          <w:rFonts w:ascii="Times New Roman" w:eastAsia="Times New Roman" w:hAnsi="Times New Roman" w:cs="Times New Roman"/>
+          <w:b/>
+          <w:bCs/>
+          <w:sz w:val="40"/>
+          <w:szCs w:val="40"/>
+        </w:rPr>
+        <w:t>2026-03-08 15:30-17:15</w:t>
+      </w:r>
+    </w:p>
+    <w:p>
+      <w:pPr>
+        <w:rPr>
+          <w:rFonts w:ascii="Times New Roman" w:eastAsia="Times New Roman" w:hAnsi="Times New Roman" w:cs="Times New Roman"/>
+          <w:sz w:val="36"/>
+          <w:szCs w:val="36"/>
+        </w:rPr>
+      </w:pPr>
+      <w:r>
+        <w:rPr>
+          <w:rFonts w:ascii="Times New Roman" w:eastAsia="Times New Roman" w:hAnsi="Times New Roman" w:cs="Times New Roman"/>
+          <w:sz w:val="36"/>
+          <w:szCs w:val="36"/>
+        </w:rPr>
+        <w:t>(El-</w:t>
+      </w:r>
+      <w:proofErr w:type="spellStart"/>
+      <w:r>
+        <w:rPr>
+          <w:rFonts w:ascii="Times New Roman" w:eastAsia="Times New Roman" w:hAnsi="Times New Roman" w:cs="Times New Roman"/>
+          <w:sz w:val="36"/>
+          <w:szCs w:val="36"/>
+        </w:rPr>
+        <w:t>Nabulsy</w:t>
+      </w:r>
+      <w:proofErr w:type="spellEnd"/>
+      <w:r>
+        <w:rPr>
+          <w:rFonts w:ascii="Times New Roman" w:eastAsia="Times New Roman" w:hAnsi="Times New Roman" w:cs="Times New Roman"/>
+          <w:sz w:val="36"/>
+          <w:szCs w:val="36"/>
+        </w:rPr>
+        <w:t xml:space="preserve"> Csongor Alan) Főbb nézetek(</w:t>
+      </w:r>
+      <w:proofErr w:type="spellStart"/>
+      <w:r>
+        <w:rPr>
+          <w:rFonts w:ascii="Times New Roman" w:eastAsia="Times New Roman" w:hAnsi="Times New Roman" w:cs="Times New Roman"/>
+          <w:sz w:val="36"/>
+          <w:szCs w:val="36"/>
+        </w:rPr>
+        <w:t>HomeView</w:t>
+      </w:r>
+      <w:proofErr w:type="spellEnd"/>
+      <w:r>
+        <w:rPr>
+          <w:rFonts w:ascii="Times New Roman" w:eastAsia="Times New Roman" w:hAnsi="Times New Roman" w:cs="Times New Roman"/>
+          <w:sz w:val="36"/>
+          <w:szCs w:val="36"/>
+        </w:rPr>
+        <w:t xml:space="preserve">, </w:t>
+      </w:r>
+      <w:proofErr w:type="spellStart"/>
+      <w:r>
+        <w:rPr>
+          <w:rFonts w:ascii="Times New Roman" w:eastAsia="Times New Roman" w:hAnsi="Times New Roman" w:cs="Times New Roman"/>
+          <w:sz w:val="36"/>
+          <w:szCs w:val="36"/>
+        </w:rPr>
+        <w:t>StudentHomePage</w:t>
+      </w:r>
+      <w:proofErr w:type="spellEnd"/>
+      <w:r>
+        <w:rPr>
+          <w:rFonts w:ascii="Times New Roman" w:eastAsia="Times New Roman" w:hAnsi="Times New Roman" w:cs="Times New Roman"/>
+          <w:sz w:val="36"/>
+          <w:szCs w:val="36"/>
+        </w:rPr>
+        <w:t xml:space="preserve">, </w:t>
+      </w:r>
+      <w:proofErr w:type="spellStart"/>
+      <w:r>
+        <w:rPr>
+          <w:rFonts w:ascii="Times New Roman" w:eastAsia="Times New Roman" w:hAnsi="Times New Roman" w:cs="Times New Roman"/>
+          <w:sz w:val="36"/>
+          <w:szCs w:val="36"/>
+        </w:rPr>
+        <w:t>SchedulerView</w:t>
+      </w:r>
+      <w:proofErr w:type="spellEnd"/>
+      <w:r>
+        <w:rPr>
+          <w:rFonts w:ascii="Times New Roman" w:eastAsia="Times New Roman" w:hAnsi="Times New Roman" w:cs="Times New Roman"/>
+          <w:sz w:val="36"/>
+          <w:szCs w:val="36"/>
+        </w:rPr>
+        <w:t>) szerkezetének kialakítása és a komponensek működésének ellenőrzése, a felhasználói felület stílusának kialakítása, hogy az oldal elrendezése megfeleljen a megtervezett UI-terveknek.</w:t>
+      </w:r>
+    </w:p>
+    <w:p>
+      <w:pPr>
+        <w:rPr>
+          <w:rFonts w:ascii="Times New Roman" w:eastAsia="Times New Roman" w:hAnsi="Times New Roman" w:cs="Times New Roman"/>
+          <w:sz w:val="36"/>
+          <w:szCs w:val="36"/>
+        </w:rPr>
+      </w:pPr>
+    </w:p>
+    <w:p>
+      <w:pPr>
+        <w:rPr>
+          <w:rFonts w:ascii="Times New Roman" w:eastAsia="Times New Roman" w:hAnsi="Times New Roman" w:cs="Times New Roman"/>
+          <w:sz w:val="36"/>
+          <w:szCs w:val="36"/>
+        </w:rPr>
+      </w:pPr>
+      <w:r>
+        <w:rPr>
+          <w:rFonts w:ascii="Times New Roman" w:eastAsia="Times New Roman" w:hAnsi="Times New Roman" w:cs="Times New Roman"/>
+          <w:b/>
+          <w:bCs/>
+          <w:sz w:val="40"/>
+          <w:szCs w:val="40"/>
+        </w:rPr>
         <w:t>2026-03-08 17:10-</w:t>
       </w:r>
       <w:r>
@@ -3148,7 +3359,6 @@
           <w:sz w:val="36"/>
           <w:szCs w:val="36"/>
         </w:rPr>
-        <w:lastRenderedPageBreak/>
         <w:drawing>
           <wp:inline distT="0" distB="0" distL="0" distR="0" wp14:anchorId="5DFC9D37" wp14:editId="209634C9">
             <wp:extent cx="5379983" cy="2476500"/>
@@ -3194,6 +3404,24 @@
     </w:p>
     <w:p>
       <w:pPr>
+        <w:jc w:val="both"/>
+        <w:rPr>
+          <w:rFonts w:ascii="Times New Roman" w:eastAsia="Times New Roman" w:hAnsi="Times New Roman" w:cs="Times New Roman"/>
+          <w:sz w:val="36"/>
+          <w:szCs w:val="36"/>
+        </w:rPr>
+      </w:pPr>
+    </w:p>
+    <w:p>
+      <w:pPr>
+        <w:jc w:val="both"/>
+        <w:rPr>
+          <w:rFonts w:ascii="Times New Roman" w:eastAsia="Times New Roman" w:hAnsi="Times New Roman" w:cs="Times New Roman"/>
+          <w:sz w:val="36"/>
+          <w:szCs w:val="36"/>
+        </w:rPr>
+      </w:pPr>
+      <w:r>
         <w:rPr>
           <w:rFonts w:ascii="Times New Roman" w:eastAsia="Times New Roman" w:hAnsi="Times New Roman" w:cs="Times New Roman"/>
           <w:b/>
@@ -3201,65 +3429,71 @@
           <w:sz w:val="40"/>
           <w:szCs w:val="40"/>
         </w:rPr>
-      </w:pPr>
-      <w:r>
-        <w:rPr>
-          <w:rFonts w:ascii="Times New Roman" w:eastAsia="Times New Roman" w:hAnsi="Times New Roman" w:cs="Times New Roman"/>
-          <w:b/>
-          <w:bCs/>
-          <w:sz w:val="40"/>
-          <w:szCs w:val="40"/>
-        </w:rPr>
-        <w:t xml:space="preserve">2026-03-08 </w:t>
-      </w:r>
-      <w:r>
-        <w:rPr>
-          <w:rFonts w:ascii="Times New Roman" w:eastAsia="Times New Roman" w:hAnsi="Times New Roman" w:cs="Times New Roman"/>
-          <w:b/>
-          <w:bCs/>
-          <w:sz w:val="40"/>
-          <w:szCs w:val="40"/>
-        </w:rPr>
-        <w:t>15:30</w:t>
-      </w:r>
-      <w:r>
-        <w:rPr>
-          <w:rFonts w:ascii="Times New Roman" w:eastAsia="Times New Roman" w:hAnsi="Times New Roman" w:cs="Times New Roman"/>
-          <w:b/>
-          <w:bCs/>
-          <w:sz w:val="40"/>
-          <w:szCs w:val="40"/>
-        </w:rPr>
-        <w:t>-17:15</w:t>
-      </w:r>
-    </w:p>
-    <w:p>
-      <w:pPr>
-        <w:rPr>
-          <w:rFonts w:ascii="Times New Roman" w:eastAsia="Times New Roman" w:hAnsi="Times New Roman" w:cs="Times New Roman"/>
-          <w:sz w:val="36"/>
-          <w:szCs w:val="36"/>
-        </w:rPr>
-      </w:pPr>
-      <w:r>
-        <w:rPr>
-          <w:rFonts w:ascii="Times New Roman" w:eastAsia="Times New Roman" w:hAnsi="Times New Roman" w:cs="Times New Roman"/>
-          <w:sz w:val="36"/>
-          <w:szCs w:val="36"/>
-        </w:rPr>
-        <w:t xml:space="preserve">(El-Nabulsy Csongor Alan) Főbb </w:t>
-      </w:r>
-      <w:proofErr w:type="gramStart"/>
-      <w:r>
-        <w:rPr>
-          <w:rFonts w:ascii="Times New Roman" w:eastAsia="Times New Roman" w:hAnsi="Times New Roman" w:cs="Times New Roman"/>
-          <w:sz w:val="36"/>
-          <w:szCs w:val="36"/>
-        </w:rPr>
-        <w:t>nézetek(</w:t>
+        <w:t>2026-03-09 8:55-</w:t>
+      </w:r>
+    </w:p>
+    <w:p>
+      <w:pPr>
+        <w:jc w:val="both"/>
+        <w:rPr>
+          <w:rFonts w:ascii="Times New Roman" w:eastAsia="Times New Roman" w:hAnsi="Times New Roman" w:cs="Times New Roman"/>
+          <w:sz w:val="36"/>
+          <w:szCs w:val="36"/>
+        </w:rPr>
+      </w:pPr>
+      <w:r>
+        <w:rPr>
+          <w:rFonts w:ascii="Times New Roman" w:eastAsia="Times New Roman" w:hAnsi="Times New Roman" w:cs="Times New Roman"/>
+          <w:sz w:val="36"/>
+          <w:szCs w:val="36"/>
+        </w:rPr>
+        <w:t>(Susán Csongor György, El-</w:t>
       </w:r>
       <w:proofErr w:type="spellStart"/>
-      <w:proofErr w:type="gramEnd"/>
+      <w:r>
+        <w:rPr>
+          <w:rFonts w:ascii="Times New Roman" w:eastAsia="Times New Roman" w:hAnsi="Times New Roman" w:cs="Times New Roman"/>
+          <w:sz w:val="36"/>
+          <w:szCs w:val="36"/>
+        </w:rPr>
+        <w:t>Nabulsy</w:t>
+      </w:r>
+      <w:proofErr w:type="spellEnd"/>
+      <w:r>
+        <w:rPr>
+          <w:rFonts w:ascii="Times New Roman" w:eastAsia="Times New Roman" w:hAnsi="Times New Roman" w:cs="Times New Roman"/>
+          <w:sz w:val="36"/>
+          <w:szCs w:val="36"/>
+        </w:rPr>
+        <w:t xml:space="preserve"> Csongor Alan)</w:t>
+      </w:r>
+      <w:r>
+        <w:rPr>
+          <w:rFonts w:ascii="Times New Roman" w:eastAsia="Times New Roman" w:hAnsi="Times New Roman" w:cs="Times New Roman"/>
+          <w:sz w:val="36"/>
+          <w:szCs w:val="36"/>
+        </w:rPr>
+        <w:t xml:space="preserve"> Nézetek végleges kialakítása (El-</w:t>
+      </w:r>
+      <w:proofErr w:type="spellStart"/>
+      <w:r>
+        <w:rPr>
+          <w:rFonts w:ascii="Times New Roman" w:eastAsia="Times New Roman" w:hAnsi="Times New Roman" w:cs="Times New Roman"/>
+          <w:sz w:val="36"/>
+          <w:szCs w:val="36"/>
+        </w:rPr>
+        <w:t>Nabulsy</w:t>
+      </w:r>
+      <w:proofErr w:type="spellEnd"/>
+      <w:r>
+        <w:rPr>
+          <w:rFonts w:ascii="Times New Roman" w:eastAsia="Times New Roman" w:hAnsi="Times New Roman" w:cs="Times New Roman"/>
+          <w:sz w:val="36"/>
+          <w:szCs w:val="36"/>
+        </w:rPr>
+        <w:t xml:space="preserve">: </w:t>
+      </w:r>
+      <w:proofErr w:type="spellStart"/>
       <w:r>
         <w:rPr>
           <w:rFonts w:ascii="Times New Roman" w:eastAsia="Times New Roman" w:hAnsi="Times New Roman" w:cs="Times New Roman"/>
@@ -3284,7 +3518,7 @@
           <w:sz w:val="36"/>
           <w:szCs w:val="36"/>
         </w:rPr>
-        <w:t>StudentHomePage</w:t>
+        <w:t>RequestView</w:t>
       </w:r>
       <w:proofErr w:type="spellEnd"/>
       <w:r>
@@ -3302,7 +3536,7 @@
           <w:sz w:val="36"/>
           <w:szCs w:val="36"/>
         </w:rPr>
-        <w:t>SchedulerView</w:t>
+        <w:t>SendView</w:t>
       </w:r>
       <w:proofErr w:type="spellEnd"/>
       <w:r>
@@ -3311,7 +3545,328 @@
           <w:sz w:val="36"/>
           <w:szCs w:val="36"/>
         </w:rPr>
-        <w:t>) szerkezetének kialakítása és a komponensek működésének ellenőrzése, a felhasználói felület stílusának kialakítása, hogy az oldal elrendezése megfeleljen a megtervezett UI-terveknek.</w:t>
+        <w:t xml:space="preserve">; Susán: főoldalak integrálása a </w:t>
+      </w:r>
+      <w:proofErr w:type="spellStart"/>
+      <w:r>
+        <w:rPr>
+          <w:rFonts w:ascii="Times New Roman" w:eastAsia="Times New Roman" w:hAnsi="Times New Roman" w:cs="Times New Roman"/>
+          <w:sz w:val="36"/>
+          <w:szCs w:val="36"/>
+        </w:rPr>
+        <w:t>HomeLayout</w:t>
+      </w:r>
+      <w:r>
+        <w:rPr>
+          <w:rFonts w:ascii="Times New Roman" w:eastAsia="Times New Roman" w:hAnsi="Times New Roman" w:cs="Times New Roman"/>
+          <w:sz w:val="36"/>
+          <w:szCs w:val="36"/>
+        </w:rPr>
+        <w:t>-</w:t>
+      </w:r>
+      <w:r>
+        <w:rPr>
+          <w:rFonts w:ascii="Times New Roman" w:eastAsia="Times New Roman" w:hAnsi="Times New Roman" w:cs="Times New Roman"/>
+          <w:sz w:val="36"/>
+          <w:szCs w:val="36"/>
+        </w:rPr>
+        <w:t>ba</w:t>
+      </w:r>
+      <w:proofErr w:type="spellEnd"/>
+      <w:r>
+        <w:rPr>
+          <w:rFonts w:ascii="Times New Roman" w:eastAsia="Times New Roman" w:hAnsi="Times New Roman" w:cs="Times New Roman"/>
+          <w:sz w:val="36"/>
+          <w:szCs w:val="36"/>
+        </w:rPr>
+        <w:t>)</w:t>
+      </w:r>
+      <w:r>
+        <w:rPr>
+          <w:rFonts w:ascii="Times New Roman" w:eastAsia="Times New Roman" w:hAnsi="Times New Roman" w:cs="Times New Roman"/>
+          <w:sz w:val="36"/>
+          <w:szCs w:val="36"/>
+        </w:rPr>
+        <w:t>.</w:t>
+      </w:r>
+    </w:p>
+    <w:p>
+      <w:pPr>
+        <w:jc w:val="both"/>
+        <w:rPr>
+          <w:rFonts w:ascii="Times New Roman" w:eastAsia="Times New Roman" w:hAnsi="Times New Roman" w:cs="Times New Roman"/>
+          <w:sz w:val="36"/>
+          <w:szCs w:val="36"/>
+        </w:rPr>
+      </w:pPr>
+      <w:r>
+        <w:rPr>
+          <w:rFonts w:ascii="Times New Roman" w:eastAsia="Times New Roman" w:hAnsi="Times New Roman" w:cs="Times New Roman"/>
+          <w:sz w:val="36"/>
+          <w:szCs w:val="36"/>
+        </w:rPr>
+        <w:t xml:space="preserve">(Susán Csongor György) </w:t>
+      </w:r>
+    </w:p>
+    <w:p>
+      <w:pPr>
+        <w:pStyle w:val="Listaszerbekezds"/>
+        <w:numPr>
+          <w:ilvl w:val="0"/>
+          <w:numId w:val="4"/>
+        </w:numPr>
+        <w:jc w:val="both"/>
+        <w:rPr>
+          <w:rFonts w:ascii="Times New Roman" w:eastAsia="Times New Roman" w:hAnsi="Times New Roman" w:cs="Times New Roman"/>
+          <w:sz w:val="36"/>
+          <w:szCs w:val="36"/>
+        </w:rPr>
+      </w:pPr>
+      <w:r>
+        <w:rPr>
+          <w:rFonts w:ascii="Times New Roman" w:eastAsia="Times New Roman" w:hAnsi="Times New Roman" w:cs="Times New Roman"/>
+          <w:sz w:val="36"/>
+          <w:szCs w:val="36"/>
+        </w:rPr>
+        <w:t xml:space="preserve">Példa adatok felvétele a </w:t>
+      </w:r>
+      <w:proofErr w:type="spellStart"/>
+      <w:r>
+        <w:rPr>
+          <w:rFonts w:ascii="Times New Roman" w:eastAsia="Times New Roman" w:hAnsi="Times New Roman" w:cs="Times New Roman"/>
+          <w:sz w:val="36"/>
+          <w:szCs w:val="36"/>
+        </w:rPr>
+        <w:t>HomeLayout-ba</w:t>
+      </w:r>
+      <w:proofErr w:type="spellEnd"/>
+      <w:r>
+        <w:rPr>
+          <w:rFonts w:ascii="Times New Roman" w:eastAsia="Times New Roman" w:hAnsi="Times New Roman" w:cs="Times New Roman"/>
+          <w:sz w:val="36"/>
+          <w:szCs w:val="36"/>
+        </w:rPr>
+        <w:t xml:space="preserve"> a helyes működés tesztelésének érdekében</w:t>
+      </w:r>
+    </w:p>
+    <w:p>
+      <w:pPr>
+        <w:pStyle w:val="Listaszerbekezds"/>
+        <w:numPr>
+          <w:ilvl w:val="0"/>
+          <w:numId w:val="4"/>
+        </w:numPr>
+        <w:jc w:val="both"/>
+        <w:rPr>
+          <w:rFonts w:ascii="Times New Roman" w:eastAsia="Times New Roman" w:hAnsi="Times New Roman" w:cs="Times New Roman"/>
+          <w:sz w:val="36"/>
+          <w:szCs w:val="36"/>
+        </w:rPr>
+      </w:pPr>
+      <w:r>
+        <w:rPr>
+          <w:rFonts w:ascii="Times New Roman" w:eastAsia="Times New Roman" w:hAnsi="Times New Roman" w:cs="Times New Roman"/>
+          <w:sz w:val="36"/>
+          <w:szCs w:val="36"/>
+        </w:rPr>
+        <w:t>Azon belül</w:t>
+      </w:r>
+      <w:r>
+        <w:rPr>
+          <w:rFonts w:ascii="Times New Roman" w:eastAsia="Times New Roman" w:hAnsi="Times New Roman" w:cs="Times New Roman"/>
+          <w:sz w:val="36"/>
+          <w:szCs w:val="36"/>
+        </w:rPr>
+        <w:t xml:space="preserve"> a kinézet a terveknek megfelelőre igazítása</w:t>
+      </w:r>
+    </w:p>
+    <w:p>
+      <w:pPr>
+        <w:pStyle w:val="Listaszerbekezds"/>
+        <w:numPr>
+          <w:ilvl w:val="0"/>
+          <w:numId w:val="4"/>
+        </w:numPr>
+        <w:jc w:val="both"/>
+        <w:rPr>
+          <w:rFonts w:ascii="Times New Roman" w:eastAsia="Times New Roman" w:hAnsi="Times New Roman" w:cs="Times New Roman"/>
+          <w:sz w:val="36"/>
+          <w:szCs w:val="36"/>
+        </w:rPr>
+      </w:pPr>
+      <w:proofErr w:type="spellStart"/>
+      <w:r>
+        <w:rPr>
+          <w:rFonts w:ascii="Times New Roman" w:eastAsia="Times New Roman" w:hAnsi="Times New Roman" w:cs="Times New Roman"/>
+          <w:sz w:val="36"/>
+          <w:szCs w:val="36"/>
+        </w:rPr>
+        <w:lastRenderedPageBreak/>
+        <w:t>meta.title-ekben</w:t>
+      </w:r>
+      <w:proofErr w:type="spellEnd"/>
+      <w:r>
+        <w:rPr>
+          <w:rFonts w:ascii="Times New Roman" w:eastAsia="Times New Roman" w:hAnsi="Times New Roman" w:cs="Times New Roman"/>
+          <w:sz w:val="36"/>
+          <w:szCs w:val="36"/>
+        </w:rPr>
+        <w:t xml:space="preserve"> és a </w:t>
+      </w:r>
+      <w:proofErr w:type="spellStart"/>
+      <w:r>
+        <w:rPr>
+          <w:rFonts w:ascii="Times New Roman" w:eastAsia="Times New Roman" w:hAnsi="Times New Roman" w:cs="Times New Roman"/>
+          <w:sz w:val="36"/>
+          <w:szCs w:val="36"/>
+        </w:rPr>
+        <w:t>beforeEach</w:t>
+      </w:r>
+      <w:proofErr w:type="spellEnd"/>
+      <w:r>
+        <w:rPr>
+          <w:rFonts w:ascii="Times New Roman" w:eastAsia="Times New Roman" w:hAnsi="Times New Roman" w:cs="Times New Roman"/>
+          <w:sz w:val="36"/>
+          <w:szCs w:val="36"/>
+        </w:rPr>
+        <w:t>-ben oldalcímek meghatározása</w:t>
+      </w:r>
+    </w:p>
+    <w:p>
+      <w:pPr>
+        <w:pStyle w:val="Listaszerbekezds"/>
+        <w:numPr>
+          <w:ilvl w:val="0"/>
+          <w:numId w:val="4"/>
+        </w:numPr>
+        <w:jc w:val="both"/>
+        <w:rPr>
+          <w:rFonts w:ascii="Times New Roman" w:eastAsia="Times New Roman" w:hAnsi="Times New Roman" w:cs="Times New Roman"/>
+          <w:sz w:val="36"/>
+          <w:szCs w:val="36"/>
+        </w:rPr>
+      </w:pPr>
+      <w:r>
+        <w:rPr>
+          <w:rFonts w:ascii="Times New Roman" w:eastAsia="Times New Roman" w:hAnsi="Times New Roman" w:cs="Times New Roman"/>
+          <w:sz w:val="36"/>
+          <w:szCs w:val="36"/>
+        </w:rPr>
+        <w:t xml:space="preserve">Megkezdődött az oldalak elérhetőségének tesztelése is, éppen ezért a teszteknek szánt dokumentáció </w:t>
+      </w:r>
+      <w:r>
+        <w:rPr>
+          <w:rFonts w:ascii="Times New Roman" w:eastAsia="Times New Roman" w:hAnsi="Times New Roman" w:cs="Times New Roman"/>
+          <w:sz w:val="36"/>
+          <w:szCs w:val="36"/>
+        </w:rPr>
+        <w:t>í</w:t>
+      </w:r>
+      <w:r>
+        <w:rPr>
+          <w:rFonts w:ascii="Times New Roman" w:eastAsia="Times New Roman" w:hAnsi="Times New Roman" w:cs="Times New Roman"/>
+          <w:sz w:val="36"/>
+          <w:szCs w:val="36"/>
+        </w:rPr>
+        <w:t>rása is elkezdődik.</w:t>
+      </w:r>
+    </w:p>
+    <w:p>
+      <w:pPr>
+        <w:pStyle w:val="Listaszerbekezds"/>
+        <w:numPr>
+          <w:ilvl w:val="0"/>
+          <w:numId w:val="4"/>
+        </w:numPr>
+        <w:jc w:val="both"/>
+        <w:rPr>
+          <w:rFonts w:ascii="Times New Roman" w:eastAsia="Times New Roman" w:hAnsi="Times New Roman" w:cs="Times New Roman"/>
+          <w:sz w:val="36"/>
+          <w:szCs w:val="36"/>
+        </w:rPr>
+      </w:pPr>
+      <w:proofErr w:type="spellStart"/>
+      <w:r>
+        <w:rPr>
+          <w:rFonts w:ascii="Times New Roman" w:eastAsia="Times New Roman" w:hAnsi="Times New Roman" w:cs="Times New Roman"/>
+          <w:sz w:val="36"/>
+          <w:szCs w:val="36"/>
+        </w:rPr>
+        <w:t>auth</w:t>
+      </w:r>
+      <w:proofErr w:type="spellEnd"/>
+      <w:r>
+        <w:rPr>
+          <w:rFonts w:ascii="Times New Roman" w:eastAsia="Times New Roman" w:hAnsi="Times New Roman" w:cs="Times New Roman"/>
+          <w:sz w:val="36"/>
+          <w:szCs w:val="36"/>
+        </w:rPr>
+        <w:t xml:space="preserve"> függvény hozzáadása a bejelentkezési képernyőhöz (</w:t>
+      </w:r>
+      <w:proofErr w:type="spellStart"/>
+      <w:r>
+        <w:rPr>
+          <w:rFonts w:ascii="Times New Roman" w:eastAsia="Times New Roman" w:hAnsi="Times New Roman" w:cs="Times New Roman"/>
+          <w:sz w:val="36"/>
+          <w:szCs w:val="36"/>
+        </w:rPr>
+        <w:t>LoginView</w:t>
+      </w:r>
+      <w:proofErr w:type="spellEnd"/>
+      <w:r>
+        <w:rPr>
+          <w:rFonts w:ascii="Times New Roman" w:eastAsia="Times New Roman" w:hAnsi="Times New Roman" w:cs="Times New Roman"/>
+          <w:sz w:val="36"/>
+          <w:szCs w:val="36"/>
+        </w:rPr>
+        <w:t>), ami egyelőre üres, egy komment jelzi annak célját</w:t>
+      </w:r>
+    </w:p>
+    <w:p>
+      <w:pPr>
+        <w:pStyle w:val="Listaszerbekezds"/>
+        <w:numPr>
+          <w:ilvl w:val="0"/>
+          <w:numId w:val="4"/>
+        </w:numPr>
+        <w:jc w:val="both"/>
+        <w:rPr>
+          <w:rFonts w:ascii="Times New Roman" w:eastAsia="Times New Roman" w:hAnsi="Times New Roman" w:cs="Times New Roman"/>
+          <w:sz w:val="36"/>
+          <w:szCs w:val="36"/>
+        </w:rPr>
+      </w:pPr>
+      <w:r>
+        <w:rPr>
+          <w:rFonts w:ascii="Times New Roman" w:eastAsia="Times New Roman" w:hAnsi="Times New Roman" w:cs="Times New Roman"/>
+          <w:sz w:val="36"/>
+          <w:szCs w:val="36"/>
+        </w:rPr>
+        <w:t>A</w:t>
+      </w:r>
+      <w:r>
+        <w:rPr>
+          <w:rFonts w:ascii="Times New Roman" w:eastAsia="Times New Roman" w:hAnsi="Times New Roman" w:cs="Times New Roman"/>
+          <w:sz w:val="36"/>
+          <w:szCs w:val="36"/>
+        </w:rPr>
+        <w:t>z index.ht</w:t>
+      </w:r>
+      <w:r>
+        <w:rPr>
+          <w:rFonts w:ascii="Times New Roman" w:eastAsia="Times New Roman" w:hAnsi="Times New Roman" w:cs="Times New Roman"/>
+          <w:sz w:val="36"/>
+          <w:szCs w:val="36"/>
+        </w:rPr>
+        <w:t>m</w:t>
+      </w:r>
+      <w:r>
+        <w:rPr>
+          <w:rFonts w:ascii="Times New Roman" w:eastAsia="Times New Roman" w:hAnsi="Times New Roman" w:cs="Times New Roman"/>
+          <w:sz w:val="36"/>
+          <w:szCs w:val="36"/>
+        </w:rPr>
+        <w:t>l-be bekerül az oldal neve is (hu, azaz magyar)</w:t>
       </w:r>
     </w:p>
     <w:sectPr>
@@ -3327,16 +3882,16 @@
 <file path=word/numbering.xml><?xml version="1.0" encoding="utf-8"?>
 <w:numbering xmlns:wpc="http://schemas.microsoft.com/office/word/2010/wordprocessingCanvas" xmlns:cx="http://schemas.microsoft.com/office/drawing/2014/chartex" xmlns:cx1="http://schemas.microsoft.com/office/drawing/2015/9/8/chartex" xmlns:cx2="http://schemas.microsoft.com/office/drawing/2015/10/21/chartex" xmlns:cx3="http://schemas.microsoft.com/office/drawing/2016/5/9/chartex" xmlns:cx4="http://schemas.microsoft.com/office/drawing/2016/5/10/chartex" xmlns:cx5="http://schemas.microsoft.com/office/drawing/2016/5/11/chartex" xmlns:cx6="http://schemas.microsoft.com/office/drawing/2016/5/12/chartex" xmlns:cx7="http://schemas.microsoft.com/office/drawing/2016/5/13/chartex" xmlns:cx8="http://schemas.microsoft.com/office/drawing/2016/5/14/chartex" xmlns:mc="http://schemas.openxmlformats.org/markup-compatibility/2006" xmlns:aink="http://schemas.microsoft.com/office/drawing/2016/ink" xmlns:am3d="http://schemas.microsoft.com/office/drawing/2017/model3d" xmlns:o="urn:schemas-microsoft-com:office:office" xmlns:oel="http://schemas.microsoft.com/office/2019/extlst" xmlns:r="http://schemas.openxmlformats.org/officeDocument/2006/relationships" xmlns:m="http://schemas.openxmlformats.org/officeDocument/2006/math" xmlns:v="urn:schemas-microsoft-com:vml" xmlns:wp14="http://schemas.microsoft.com/office/word/2010/wordprocessingDrawing" xmlns:wp="http://schemas.openxmlformats.org/drawingml/2006/wordprocessingDrawing" xmlns:w10="urn:schemas-microsoft-com:office:word" xmlns:w="http://schemas.openxmlformats.org/wordprocessingml/2006/main" xmlns:w14="http://schemas.microsoft.com/office/word/2010/wordml" xmlns:w15="http://schemas.microsoft.com/office/word/2012/wordml" xmlns:w16cex="http://schemas.microsoft.com/office/word/2018/wordml/cex" xmlns:w16cid="http://schemas.microsoft.com/office/word/2016/wordml/cid" xmlns:w16="http://schemas.microsoft.com/office/word/2018/wordml" xmlns:w16du="http://schemas.microsoft.com/office/word/2023/wordml/word16du" xmlns:w16sdtdh="http://schemas.microsoft.com/office/word/2020/wordml/sdtdatahash" xmlns:w16sdtfl="http://schemas.microsoft.com/office/word/2024/wordml/sdtformatlock" xmlns:w16se="http://schemas.microsoft.com/office/word/2015/wordml/symex" xmlns:wpg="http://schemas.microsoft.com/office/word/2010/wordprocessingGroup" xmlns:wpi="http://schemas.microsoft.com/office/word/2010/wordprocessingInk" xmlns:wne="http://schemas.microsoft.com/office/word/2006/wordml" xmlns:wps="http://schemas.microsoft.com/office/word/2010/wordprocessingShape" mc:Ignorable="w14 w15 w16se w16cid w16 w16cex w16sdtdh w16sdtfl w16du wp14">
   <w:abstractNum w:abstractNumId="0" w15:restartNumberingAfterBreak="0">
-    <w:nsid w:val="6E7312B6"/>
+    <w:nsid w:val="3C1938F6"/>
     <w:multiLevelType w:val="hybridMultilevel"/>
-    <w:tmpl w:val="FD80BAFC"/>
+    <w:tmpl w:val="0816ACA8"/>
     <w:lvl w:ilvl="0" w:tplc="040E0001">
       <w:start w:val="1"/>
       <w:numFmt w:val="bullet"/>
       <w:lvlText w:val=""/>
       <w:lvlJc w:val="left"/>
       <w:pPr>
-        <w:ind w:left="816" w:hanging="360"/>
+        <w:ind w:left="720" w:hanging="360"/>
       </w:pPr>
       <w:rPr>
         <w:rFonts w:ascii="Symbol" w:hAnsi="Symbol" w:hint="default"/>
@@ -3348,7 +3903,7 @@
       <w:lvlText w:val="o"/>
       <w:lvlJc w:val="left"/>
       <w:pPr>
-        <w:ind w:left="1536" w:hanging="360"/>
+        <w:ind w:left="1440" w:hanging="360"/>
       </w:pPr>
       <w:rPr>
         <w:rFonts w:ascii="Courier New" w:hAnsi="Courier New" w:cs="Courier New" w:hint="default"/>
@@ -3360,7 +3915,7 @@
       <w:lvlText w:val=""/>
       <w:lvlJc w:val="left"/>
       <w:pPr>
-        <w:ind w:left="2256" w:hanging="360"/>
+        <w:ind w:left="2160" w:hanging="360"/>
       </w:pPr>
       <w:rPr>
         <w:rFonts w:ascii="Wingdings" w:hAnsi="Wingdings" w:hint="default"/>
@@ -3372,7 +3927,7 @@
       <w:lvlText w:val=""/>
       <w:lvlJc w:val="left"/>
       <w:pPr>
-        <w:ind w:left="2976" w:hanging="360"/>
+        <w:ind w:left="2880" w:hanging="360"/>
       </w:pPr>
       <w:rPr>
         <w:rFonts w:ascii="Symbol" w:hAnsi="Symbol" w:hint="default"/>
@@ -3384,7 +3939,7 @@
       <w:lvlText w:val="o"/>
       <w:lvlJc w:val="left"/>
       <w:pPr>
-        <w:ind w:left="3696" w:hanging="360"/>
+        <w:ind w:left="3600" w:hanging="360"/>
       </w:pPr>
       <w:rPr>
         <w:rFonts w:ascii="Courier New" w:hAnsi="Courier New" w:cs="Courier New" w:hint="default"/>
@@ -3396,7 +3951,7 @@
       <w:lvlText w:val=""/>
       <w:lvlJc w:val="left"/>
       <w:pPr>
-        <w:ind w:left="4416" w:hanging="360"/>
+        <w:ind w:left="4320" w:hanging="360"/>
       </w:pPr>
       <w:rPr>
         <w:rFonts w:ascii="Wingdings" w:hAnsi="Wingdings" w:hint="default"/>
@@ -3408,7 +3963,7 @@
       <w:lvlText w:val=""/>
       <w:lvlJc w:val="left"/>
       <w:pPr>
-        <w:ind w:left="5136" w:hanging="360"/>
+        <w:ind w:left="5040" w:hanging="360"/>
       </w:pPr>
       <w:rPr>
         <w:rFonts w:ascii="Symbol" w:hAnsi="Symbol" w:hint="default"/>
@@ -3420,7 +3975,7 @@
       <w:lvlText w:val="o"/>
       <w:lvlJc w:val="left"/>
       <w:pPr>
-        <w:ind w:left="5856" w:hanging="360"/>
+        <w:ind w:left="5760" w:hanging="360"/>
       </w:pPr>
       <w:rPr>
         <w:rFonts w:ascii="Courier New" w:hAnsi="Courier New" w:cs="Courier New" w:hint="default"/>
@@ -3432,7 +3987,7 @@
       <w:lvlText w:val=""/>
       <w:lvlJc w:val="left"/>
       <w:pPr>
-        <w:ind w:left="6576" w:hanging="360"/>
+        <w:ind w:left="6480" w:hanging="360"/>
       </w:pPr>
       <w:rPr>
         <w:rFonts w:ascii="Wingdings" w:hAnsi="Wingdings" w:hint="default"/>
@@ -3440,16 +3995,16 @@
     </w:lvl>
   </w:abstractNum>
   <w:abstractNum w:abstractNumId="1" w15:restartNumberingAfterBreak="0">
-    <w:nsid w:val="7EB672F7"/>
+    <w:nsid w:val="6E7312B6"/>
     <w:multiLevelType w:val="hybridMultilevel"/>
-    <w:tmpl w:val="A6F0C99C"/>
+    <w:tmpl w:val="FD80BAFC"/>
     <w:lvl w:ilvl="0" w:tplc="040E0001">
       <w:start w:val="1"/>
       <w:numFmt w:val="bullet"/>
       <w:lvlText w:val=""/>
       <w:lvlJc w:val="left"/>
       <w:pPr>
-        <w:ind w:left="720" w:hanging="360"/>
+        <w:ind w:left="816" w:hanging="360"/>
       </w:pPr>
       <w:rPr>
         <w:rFonts w:ascii="Symbol" w:hAnsi="Symbol" w:hint="default"/>
@@ -3461,7 +4016,7 @@
       <w:lvlText w:val="o"/>
       <w:lvlJc w:val="left"/>
       <w:pPr>
-        <w:ind w:left="1440" w:hanging="360"/>
+        <w:ind w:left="1536" w:hanging="360"/>
       </w:pPr>
       <w:rPr>
         <w:rFonts w:ascii="Courier New" w:hAnsi="Courier New" w:cs="Courier New" w:hint="default"/>
@@ -3473,7 +4028,7 @@
       <w:lvlText w:val=""/>
       <w:lvlJc w:val="left"/>
       <w:pPr>
-        <w:ind w:left="2160" w:hanging="360"/>
+        <w:ind w:left="2256" w:hanging="360"/>
       </w:pPr>
       <w:rPr>
         <w:rFonts w:ascii="Wingdings" w:hAnsi="Wingdings" w:hint="default"/>
@@ -3485,7 +4040,7 @@
       <w:lvlText w:val=""/>
       <w:lvlJc w:val="left"/>
       <w:pPr>
-        <w:ind w:left="2880" w:hanging="360"/>
+        <w:ind w:left="2976" w:hanging="360"/>
       </w:pPr>
       <w:rPr>
         <w:rFonts w:ascii="Symbol" w:hAnsi="Symbol" w:hint="default"/>
@@ -3497,7 +4052,7 @@
       <w:lvlText w:val="o"/>
       <w:lvlJc w:val="left"/>
       <w:pPr>
-        <w:ind w:left="3600" w:hanging="360"/>
+        <w:ind w:left="3696" w:hanging="360"/>
       </w:pPr>
       <w:rPr>
         <w:rFonts w:ascii="Courier New" w:hAnsi="Courier New" w:cs="Courier New" w:hint="default"/>
@@ -3509,7 +4064,7 @@
       <w:lvlText w:val=""/>
       <w:lvlJc w:val="left"/>
       <w:pPr>
-        <w:ind w:left="4320" w:hanging="360"/>
+        <w:ind w:left="4416" w:hanging="360"/>
       </w:pPr>
       <w:rPr>
         <w:rFonts w:ascii="Wingdings" w:hAnsi="Wingdings" w:hint="default"/>
@@ -3521,7 +4076,7 @@
       <w:lvlText w:val=""/>
       <w:lvlJc w:val="left"/>
       <w:pPr>
-        <w:ind w:left="5040" w:hanging="360"/>
+        <w:ind w:left="5136" w:hanging="360"/>
       </w:pPr>
       <w:rPr>
         <w:rFonts w:ascii="Symbol" w:hAnsi="Symbol" w:hint="default"/>
@@ -3533,7 +4088,7 @@
       <w:lvlText w:val="o"/>
       <w:lvlJc w:val="left"/>
       <w:pPr>
-        <w:ind w:left="5760" w:hanging="360"/>
+        <w:ind w:left="5856" w:hanging="360"/>
       </w:pPr>
       <w:rPr>
         <w:rFonts w:ascii="Courier New" w:hAnsi="Courier New" w:cs="Courier New" w:hint="default"/>
@@ -3545,6 +4100,232 @@
       <w:lvlText w:val=""/>
       <w:lvlJc w:val="left"/>
       <w:pPr>
+        <w:ind w:left="6576" w:hanging="360"/>
+      </w:pPr>
+      <w:rPr>
+        <w:rFonts w:ascii="Wingdings" w:hAnsi="Wingdings" w:hint="default"/>
+      </w:rPr>
+    </w:lvl>
+  </w:abstractNum>
+  <w:abstractNum w:abstractNumId="2" w15:restartNumberingAfterBreak="0">
+    <w:nsid w:val="76FA296F"/>
+    <w:multiLevelType w:val="hybridMultilevel"/>
+    <w:tmpl w:val="6DAE32EA"/>
+    <w:lvl w:ilvl="0" w:tplc="040E0001">
+      <w:start w:val="1"/>
+      <w:numFmt w:val="bullet"/>
+      <w:lvlText w:val=""/>
+      <w:lvlJc w:val="left"/>
+      <w:pPr>
+        <w:ind w:left="720" w:hanging="360"/>
+      </w:pPr>
+      <w:rPr>
+        <w:rFonts w:ascii="Symbol" w:hAnsi="Symbol" w:hint="default"/>
+      </w:rPr>
+    </w:lvl>
+    <w:lvl w:ilvl="1" w:tplc="040E0003" w:tentative="1">
+      <w:start w:val="1"/>
+      <w:numFmt w:val="bullet"/>
+      <w:lvlText w:val="o"/>
+      <w:lvlJc w:val="left"/>
+      <w:pPr>
+        <w:ind w:left="1440" w:hanging="360"/>
+      </w:pPr>
+      <w:rPr>
+        <w:rFonts w:ascii="Courier New" w:hAnsi="Courier New" w:cs="Courier New" w:hint="default"/>
+      </w:rPr>
+    </w:lvl>
+    <w:lvl w:ilvl="2" w:tplc="040E0005" w:tentative="1">
+      <w:start w:val="1"/>
+      <w:numFmt w:val="bullet"/>
+      <w:lvlText w:val=""/>
+      <w:lvlJc w:val="left"/>
+      <w:pPr>
+        <w:ind w:left="2160" w:hanging="360"/>
+      </w:pPr>
+      <w:rPr>
+        <w:rFonts w:ascii="Wingdings" w:hAnsi="Wingdings" w:hint="default"/>
+      </w:rPr>
+    </w:lvl>
+    <w:lvl w:ilvl="3" w:tplc="040E0001" w:tentative="1">
+      <w:start w:val="1"/>
+      <w:numFmt w:val="bullet"/>
+      <w:lvlText w:val=""/>
+      <w:lvlJc w:val="left"/>
+      <w:pPr>
+        <w:ind w:left="2880" w:hanging="360"/>
+      </w:pPr>
+      <w:rPr>
+        <w:rFonts w:ascii="Symbol" w:hAnsi="Symbol" w:hint="default"/>
+      </w:rPr>
+    </w:lvl>
+    <w:lvl w:ilvl="4" w:tplc="040E0003" w:tentative="1">
+      <w:start w:val="1"/>
+      <w:numFmt w:val="bullet"/>
+      <w:lvlText w:val="o"/>
+      <w:lvlJc w:val="left"/>
+      <w:pPr>
+        <w:ind w:left="3600" w:hanging="360"/>
+      </w:pPr>
+      <w:rPr>
+        <w:rFonts w:ascii="Courier New" w:hAnsi="Courier New" w:cs="Courier New" w:hint="default"/>
+      </w:rPr>
+    </w:lvl>
+    <w:lvl w:ilvl="5" w:tplc="040E0005" w:tentative="1">
+      <w:start w:val="1"/>
+      <w:numFmt w:val="bullet"/>
+      <w:lvlText w:val=""/>
+      <w:lvlJc w:val="left"/>
+      <w:pPr>
+        <w:ind w:left="4320" w:hanging="360"/>
+      </w:pPr>
+      <w:rPr>
+        <w:rFonts w:ascii="Wingdings" w:hAnsi="Wingdings" w:hint="default"/>
+      </w:rPr>
+    </w:lvl>
+    <w:lvl w:ilvl="6" w:tplc="040E0001" w:tentative="1">
+      <w:start w:val="1"/>
+      <w:numFmt w:val="bullet"/>
+      <w:lvlText w:val=""/>
+      <w:lvlJc w:val="left"/>
+      <w:pPr>
+        <w:ind w:left="5040" w:hanging="360"/>
+      </w:pPr>
+      <w:rPr>
+        <w:rFonts w:ascii="Symbol" w:hAnsi="Symbol" w:hint="default"/>
+      </w:rPr>
+    </w:lvl>
+    <w:lvl w:ilvl="7" w:tplc="040E0003" w:tentative="1">
+      <w:start w:val="1"/>
+      <w:numFmt w:val="bullet"/>
+      <w:lvlText w:val="o"/>
+      <w:lvlJc w:val="left"/>
+      <w:pPr>
+        <w:ind w:left="5760" w:hanging="360"/>
+      </w:pPr>
+      <w:rPr>
+        <w:rFonts w:ascii="Courier New" w:hAnsi="Courier New" w:cs="Courier New" w:hint="default"/>
+      </w:rPr>
+    </w:lvl>
+    <w:lvl w:ilvl="8" w:tplc="040E0005" w:tentative="1">
+      <w:start w:val="1"/>
+      <w:numFmt w:val="bullet"/>
+      <w:lvlText w:val=""/>
+      <w:lvlJc w:val="left"/>
+      <w:pPr>
+        <w:ind w:left="6480" w:hanging="360"/>
+      </w:pPr>
+      <w:rPr>
+        <w:rFonts w:ascii="Wingdings" w:hAnsi="Wingdings" w:hint="default"/>
+      </w:rPr>
+    </w:lvl>
+  </w:abstractNum>
+  <w:abstractNum w:abstractNumId="3" w15:restartNumberingAfterBreak="0">
+    <w:nsid w:val="7EB672F7"/>
+    <w:multiLevelType w:val="hybridMultilevel"/>
+    <w:tmpl w:val="A6F0C99C"/>
+    <w:lvl w:ilvl="0" w:tplc="040E0001">
+      <w:start w:val="1"/>
+      <w:numFmt w:val="bullet"/>
+      <w:lvlText w:val=""/>
+      <w:lvlJc w:val="left"/>
+      <w:pPr>
+        <w:ind w:left="720" w:hanging="360"/>
+      </w:pPr>
+      <w:rPr>
+        <w:rFonts w:ascii="Symbol" w:hAnsi="Symbol" w:hint="default"/>
+      </w:rPr>
+    </w:lvl>
+    <w:lvl w:ilvl="1" w:tplc="040E0003" w:tentative="1">
+      <w:start w:val="1"/>
+      <w:numFmt w:val="bullet"/>
+      <w:lvlText w:val="o"/>
+      <w:lvlJc w:val="left"/>
+      <w:pPr>
+        <w:ind w:left="1440" w:hanging="360"/>
+      </w:pPr>
+      <w:rPr>
+        <w:rFonts w:ascii="Courier New" w:hAnsi="Courier New" w:cs="Courier New" w:hint="default"/>
+      </w:rPr>
+    </w:lvl>
+    <w:lvl w:ilvl="2" w:tplc="040E0005" w:tentative="1">
+      <w:start w:val="1"/>
+      <w:numFmt w:val="bullet"/>
+      <w:lvlText w:val=""/>
+      <w:lvlJc w:val="left"/>
+      <w:pPr>
+        <w:ind w:left="2160" w:hanging="360"/>
+      </w:pPr>
+      <w:rPr>
+        <w:rFonts w:ascii="Wingdings" w:hAnsi="Wingdings" w:hint="default"/>
+      </w:rPr>
+    </w:lvl>
+    <w:lvl w:ilvl="3" w:tplc="040E0001" w:tentative="1">
+      <w:start w:val="1"/>
+      <w:numFmt w:val="bullet"/>
+      <w:lvlText w:val=""/>
+      <w:lvlJc w:val="left"/>
+      <w:pPr>
+        <w:ind w:left="2880" w:hanging="360"/>
+      </w:pPr>
+      <w:rPr>
+        <w:rFonts w:ascii="Symbol" w:hAnsi="Symbol" w:hint="default"/>
+      </w:rPr>
+    </w:lvl>
+    <w:lvl w:ilvl="4" w:tplc="040E0003" w:tentative="1">
+      <w:start w:val="1"/>
+      <w:numFmt w:val="bullet"/>
+      <w:lvlText w:val="o"/>
+      <w:lvlJc w:val="left"/>
+      <w:pPr>
+        <w:ind w:left="3600" w:hanging="360"/>
+      </w:pPr>
+      <w:rPr>
+        <w:rFonts w:ascii="Courier New" w:hAnsi="Courier New" w:cs="Courier New" w:hint="default"/>
+      </w:rPr>
+    </w:lvl>
+    <w:lvl w:ilvl="5" w:tplc="040E0005" w:tentative="1">
+      <w:start w:val="1"/>
+      <w:numFmt w:val="bullet"/>
+      <w:lvlText w:val=""/>
+      <w:lvlJc w:val="left"/>
+      <w:pPr>
+        <w:ind w:left="4320" w:hanging="360"/>
+      </w:pPr>
+      <w:rPr>
+        <w:rFonts w:ascii="Wingdings" w:hAnsi="Wingdings" w:hint="default"/>
+      </w:rPr>
+    </w:lvl>
+    <w:lvl w:ilvl="6" w:tplc="040E0001" w:tentative="1">
+      <w:start w:val="1"/>
+      <w:numFmt w:val="bullet"/>
+      <w:lvlText w:val=""/>
+      <w:lvlJc w:val="left"/>
+      <w:pPr>
+        <w:ind w:left="5040" w:hanging="360"/>
+      </w:pPr>
+      <w:rPr>
+        <w:rFonts w:ascii="Symbol" w:hAnsi="Symbol" w:hint="default"/>
+      </w:rPr>
+    </w:lvl>
+    <w:lvl w:ilvl="7" w:tplc="040E0003" w:tentative="1">
+      <w:start w:val="1"/>
+      <w:numFmt w:val="bullet"/>
+      <w:lvlText w:val="o"/>
+      <w:lvlJc w:val="left"/>
+      <w:pPr>
+        <w:ind w:left="5760" w:hanging="360"/>
+      </w:pPr>
+      <w:rPr>
+        <w:rFonts w:ascii="Courier New" w:hAnsi="Courier New" w:cs="Courier New" w:hint="default"/>
+      </w:rPr>
+    </w:lvl>
+    <w:lvl w:ilvl="8" w:tplc="040E0005" w:tentative="1">
+      <w:start w:val="1"/>
+      <w:numFmt w:val="bullet"/>
+      <w:lvlText w:val=""/>
+      <w:lvlJc w:val="left"/>
+      <w:pPr>
         <w:ind w:left="6480" w:hanging="360"/>
       </w:pPr>
       <w:rPr>
@@ -3553,9 +4334,15 @@
     </w:lvl>
   </w:abstractNum>
   <w:num w:numId="1" w16cid:durableId="33770327">
+    <w:abstractNumId w:val="3"/>
+  </w:num>
+  <w:num w:numId="2" w16cid:durableId="565265875">
     <w:abstractNumId w:val="1"/>
   </w:num>
-  <w:num w:numId="2" w16cid:durableId="565265875">
+  <w:num w:numId="3" w16cid:durableId="1458177206">
+    <w:abstractNumId w:val="2"/>
+  </w:num>
+  <w:num w:numId="4" w16cid:durableId="1687830723">
     <w:abstractNumId w:val="0"/>
   </w:num>
 </w:numbering>
@@ -3958,15 +4745,15 @@
     <w:lsdException w:name="Unresolved Mention" w:semiHidden="1" w:unhideWhenUsed="1"/>
     <w:lsdException w:name="Smart Link" w:semiHidden="1" w:unhideWhenUsed="1"/>
   </w:latentStyles>
-  <w:style w:type="paragraph" w:default="1" w:styleId="Normal">
+  <w:style w:type="paragraph" w:default="1" w:styleId="Norml">
     <w:name w:val="Normal"/>
     <w:qFormat/>
   </w:style>
-  <w:style w:type="paragraph" w:styleId="Heading1">
+  <w:style w:type="paragraph" w:styleId="Cmsor1">
     <w:name w:val="heading 1"/>
-    <w:basedOn w:val="Normal"/>
-    <w:next w:val="Normal"/>
-    <w:link w:val="Heading1Char"/>
+    <w:basedOn w:val="Norml"/>
+    <w:next w:val="Norml"/>
+    <w:link w:val="Cmsor1Char"/>
     <w:uiPriority w:val="9"/>
     <w:qFormat/>
     <w:rsid w:val="0005104C"/>
@@ -3983,11 +4770,11 @@
       <w:szCs w:val="40"/>
     </w:rPr>
   </w:style>
-  <w:style w:type="paragraph" w:styleId="Heading2">
+  <w:style w:type="paragraph" w:styleId="Cmsor2">
     <w:name w:val="heading 2"/>
-    <w:basedOn w:val="Normal"/>
-    <w:next w:val="Normal"/>
-    <w:link w:val="Heading2Char"/>
+    <w:basedOn w:val="Norml"/>
+    <w:next w:val="Norml"/>
+    <w:link w:val="Cmsor2Char"/>
     <w:uiPriority w:val="9"/>
     <w:semiHidden/>
     <w:unhideWhenUsed/>
@@ -4006,11 +4793,11 @@
       <w:szCs w:val="32"/>
     </w:rPr>
   </w:style>
-  <w:style w:type="paragraph" w:styleId="Heading3">
+  <w:style w:type="paragraph" w:styleId="Cmsor3">
     <w:name w:val="heading 3"/>
-    <w:basedOn w:val="Normal"/>
-    <w:next w:val="Normal"/>
-    <w:link w:val="Heading3Char"/>
+    <w:basedOn w:val="Norml"/>
+    <w:next w:val="Norml"/>
+    <w:link w:val="Cmsor3Char"/>
     <w:uiPriority w:val="9"/>
     <w:semiHidden/>
     <w:unhideWhenUsed/>
@@ -4029,11 +4816,11 @@
       <w:szCs w:val="28"/>
     </w:rPr>
   </w:style>
-  <w:style w:type="paragraph" w:styleId="Heading4">
+  <w:style w:type="paragraph" w:styleId="Cmsor4">
     <w:name w:val="heading 4"/>
-    <w:basedOn w:val="Normal"/>
-    <w:next w:val="Normal"/>
-    <w:link w:val="Heading4Char"/>
+    <w:basedOn w:val="Norml"/>
+    <w:next w:val="Norml"/>
+    <w:link w:val="Cmsor4Char"/>
     <w:uiPriority w:val="9"/>
     <w:semiHidden/>
     <w:unhideWhenUsed/>
@@ -4052,11 +4839,11 @@
       <w:color w:val="0F4761" w:themeColor="accent1" w:themeShade="BF"/>
     </w:rPr>
   </w:style>
-  <w:style w:type="paragraph" w:styleId="Heading5">
+  <w:style w:type="paragraph" w:styleId="Cmsor5">
     <w:name w:val="heading 5"/>
-    <w:basedOn w:val="Normal"/>
-    <w:next w:val="Normal"/>
-    <w:link w:val="Heading5Char"/>
+    <w:basedOn w:val="Norml"/>
+    <w:next w:val="Norml"/>
+    <w:link w:val="Cmsor5Char"/>
     <w:uiPriority w:val="9"/>
     <w:semiHidden/>
     <w:unhideWhenUsed/>
@@ -4073,11 +4860,11 @@
       <w:color w:val="0F4761" w:themeColor="accent1" w:themeShade="BF"/>
     </w:rPr>
   </w:style>
-  <w:style w:type="paragraph" w:styleId="Heading6">
+  <w:style w:type="paragraph" w:styleId="Cmsor6">
     <w:name w:val="heading 6"/>
-    <w:basedOn w:val="Normal"/>
-    <w:next w:val="Normal"/>
-    <w:link w:val="Heading6Char"/>
+    <w:basedOn w:val="Norml"/>
+    <w:next w:val="Norml"/>
+    <w:link w:val="Cmsor6Char"/>
     <w:uiPriority w:val="9"/>
     <w:semiHidden/>
     <w:unhideWhenUsed/>
@@ -4096,11 +4883,11 @@
       <w:color w:val="595959" w:themeColor="text1" w:themeTint="A6"/>
     </w:rPr>
   </w:style>
-  <w:style w:type="paragraph" w:styleId="Heading7">
+  <w:style w:type="paragraph" w:styleId="Cmsor7">
     <w:name w:val="heading 7"/>
-    <w:basedOn w:val="Normal"/>
-    <w:next w:val="Normal"/>
-    <w:link w:val="Heading7Char"/>
+    <w:basedOn w:val="Norml"/>
+    <w:next w:val="Norml"/>
+    <w:link w:val="Cmsor7Char"/>
     <w:uiPriority w:val="9"/>
     <w:semiHidden/>
     <w:unhideWhenUsed/>
@@ -4117,11 +4904,11 @@
       <w:color w:val="595959" w:themeColor="text1" w:themeTint="A6"/>
     </w:rPr>
   </w:style>
-  <w:style w:type="paragraph" w:styleId="Heading8">
+  <w:style w:type="paragraph" w:styleId="Cmsor8">
     <w:name w:val="heading 8"/>
-    <w:basedOn w:val="Normal"/>
-    <w:next w:val="Normal"/>
-    <w:link w:val="Heading8Char"/>
+    <w:basedOn w:val="Norml"/>
+    <w:next w:val="Norml"/>
+    <w:link w:val="Cmsor8Char"/>
     <w:uiPriority w:val="9"/>
     <w:semiHidden/>
     <w:unhideWhenUsed/>
@@ -4140,11 +4927,11 @@
       <w:color w:val="272727" w:themeColor="text1" w:themeTint="D8"/>
     </w:rPr>
   </w:style>
-  <w:style w:type="paragraph" w:styleId="Heading9">
+  <w:style w:type="paragraph" w:styleId="Cmsor9">
     <w:name w:val="heading 9"/>
-    <w:basedOn w:val="Normal"/>
-    <w:next w:val="Normal"/>
-    <w:link w:val="Heading9Char"/>
+    <w:basedOn w:val="Norml"/>
+    <w:next w:val="Norml"/>
+    <w:link w:val="Cmsor9Char"/>
     <w:uiPriority w:val="9"/>
     <w:semiHidden/>
     <w:unhideWhenUsed/>
@@ -4161,13 +4948,13 @@
       <w:color w:val="272727" w:themeColor="text1" w:themeTint="D8"/>
     </w:rPr>
   </w:style>
-  <w:style w:type="character" w:default="1" w:styleId="DefaultParagraphFont">
+  <w:style w:type="character" w:default="1" w:styleId="Bekezdsalapbettpusa">
     <w:name w:val="Default Paragraph Font"/>
     <w:uiPriority w:val="1"/>
     <w:semiHidden/>
     <w:unhideWhenUsed/>
   </w:style>
-  <w:style w:type="table" w:default="1" w:styleId="TableNormal">
+  <w:style w:type="table" w:default="1" w:styleId="Normltblzat">
     <w:name w:val="Normal Table"/>
     <w:uiPriority w:val="99"/>
     <w:semiHidden/>
@@ -4182,15 +4969,15 @@
       </w:tblCellMar>
     </w:tblPr>
   </w:style>
-  <w:style w:type="numbering" w:default="1" w:styleId="NoList">
+  <w:style w:type="numbering" w:default="1" w:styleId="Nemlista">
     <w:name w:val="No List"/>
     <w:uiPriority w:val="99"/>
     <w:semiHidden/>
     <w:unhideWhenUsed/>
   </w:style>
-  <w:style w:type="character" w:customStyle="1" w:styleId="Heading1Char">
-    <w:name w:val="Heading 1 Char"/>
-    <w:link w:val="Heading1"/>
+  <w:style w:type="character" w:customStyle="1" w:styleId="Cmsor1Char">
+    <w:name w:val="Címsor 1 Char"/>
+    <w:link w:val="Cmsor1"/>
     <w:uiPriority w:val="9"/>
     <w:rsid w:val="38171242"/>
     <w:rPr>
@@ -4200,9 +4987,9 @@
       <w:szCs w:val="40"/>
     </w:rPr>
   </w:style>
-  <w:style w:type="character" w:customStyle="1" w:styleId="Heading2Char">
-    <w:name w:val="Heading 2 Char"/>
-    <w:link w:val="Heading2"/>
+  <w:style w:type="character" w:customStyle="1" w:styleId="Cmsor2Char">
+    <w:name w:val="Címsor 2 Char"/>
+    <w:link w:val="Cmsor2"/>
     <w:uiPriority w:val="9"/>
     <w:semiHidden/>
     <w:rsid w:val="38171242"/>
@@ -4213,9 +5000,9 @@
       <w:szCs w:val="32"/>
     </w:rPr>
   </w:style>
-  <w:style w:type="character" w:customStyle="1" w:styleId="Heading3Char">
-    <w:name w:val="Heading 3 Char"/>
-    <w:link w:val="Heading3"/>
+  <w:style w:type="character" w:customStyle="1" w:styleId="Cmsor3Char">
+    <w:name w:val="Címsor 3 Char"/>
+    <w:link w:val="Cmsor3"/>
     <w:uiPriority w:val="9"/>
     <w:semiHidden/>
     <w:rsid w:val="38171242"/>
@@ -4226,9 +5013,9 @@
       <w:szCs w:val="28"/>
     </w:rPr>
   </w:style>
-  <w:style w:type="character" w:customStyle="1" w:styleId="Heading4Char">
-    <w:name w:val="Heading 4 Char"/>
-    <w:link w:val="Heading4"/>
+  <w:style w:type="character" w:customStyle="1" w:styleId="Cmsor4Char">
+    <w:name w:val="Címsor 4 Char"/>
+    <w:link w:val="Cmsor4"/>
     <w:uiPriority w:val="9"/>
     <w:semiHidden/>
     <w:rsid w:val="38171242"/>
@@ -4239,9 +5026,9 @@
       <w:color w:val="0F4761" w:themeColor="accent1" w:themeShade="BF"/>
     </w:rPr>
   </w:style>
-  <w:style w:type="character" w:customStyle="1" w:styleId="Heading5Char">
-    <w:name w:val="Heading 5 Char"/>
-    <w:link w:val="Heading5"/>
+  <w:style w:type="character" w:customStyle="1" w:styleId="Cmsor5Char">
+    <w:name w:val="Címsor 5 Char"/>
+    <w:link w:val="Cmsor5"/>
     <w:uiPriority w:val="9"/>
     <w:semiHidden/>
     <w:rsid w:val="38171242"/>
@@ -4250,9 +5037,9 @@
       <w:color w:val="0F4761" w:themeColor="accent1" w:themeShade="BF"/>
     </w:rPr>
   </w:style>
-  <w:style w:type="character" w:customStyle="1" w:styleId="Heading6Char">
-    <w:name w:val="Heading 6 Char"/>
-    <w:link w:val="Heading6"/>
+  <w:style w:type="character" w:customStyle="1" w:styleId="Cmsor6Char">
+    <w:name w:val="Címsor 6 Char"/>
+    <w:link w:val="Cmsor6"/>
     <w:uiPriority w:val="9"/>
     <w:semiHidden/>
     <w:rsid w:val="38171242"/>
@@ -4263,9 +5050,9 @@
       <w:color w:val="595959" w:themeColor="text1" w:themeTint="A6"/>
     </w:rPr>
   </w:style>
-  <w:style w:type="character" w:customStyle="1" w:styleId="Heading7Char">
-    <w:name w:val="Heading 7 Char"/>
-    <w:link w:val="Heading7"/>
+  <w:style w:type="character" w:customStyle="1" w:styleId="Cmsor7Char">
+    <w:name w:val="Címsor 7 Char"/>
+    <w:link w:val="Cmsor7"/>
     <w:uiPriority w:val="9"/>
     <w:semiHidden/>
     <w:rsid w:val="38171242"/>
@@ -4274,9 +5061,9 @@
       <w:color w:val="595959" w:themeColor="text1" w:themeTint="A6"/>
     </w:rPr>
   </w:style>
-  <w:style w:type="character" w:customStyle="1" w:styleId="Heading8Char">
-    <w:name w:val="Heading 8 Char"/>
-    <w:link w:val="Heading8"/>
+  <w:style w:type="character" w:customStyle="1" w:styleId="Cmsor8Char">
+    <w:name w:val="Címsor 8 Char"/>
+    <w:link w:val="Cmsor8"/>
     <w:uiPriority w:val="9"/>
     <w:semiHidden/>
     <w:rsid w:val="38171242"/>
@@ -4287,9 +5074,9 @@
       <w:color w:val="272727"/>
     </w:rPr>
   </w:style>
-  <w:style w:type="character" w:customStyle="1" w:styleId="Heading9Char">
-    <w:name w:val="Heading 9 Char"/>
-    <w:link w:val="Heading9"/>
+  <w:style w:type="character" w:customStyle="1" w:styleId="Cmsor9Char">
+    <w:name w:val="Címsor 9 Char"/>
+    <w:link w:val="Cmsor9"/>
     <w:uiPriority w:val="9"/>
     <w:semiHidden/>
     <w:rsid w:val="38171242"/>
@@ -4298,11 +5085,11 @@
       <w:color w:val="272727"/>
     </w:rPr>
   </w:style>
-  <w:style w:type="paragraph" w:styleId="Title">
+  <w:style w:type="paragraph" w:styleId="Cm">
     <w:name w:val="Title"/>
-    <w:basedOn w:val="Normal"/>
-    <w:next w:val="Normal"/>
-    <w:link w:val="TitleChar"/>
+    <w:basedOn w:val="Norml"/>
+    <w:next w:val="Norml"/>
+    <w:link w:val="CmChar"/>
     <w:uiPriority w:val="10"/>
     <w:qFormat/>
     <w:rsid w:val="0005104C"/>
@@ -4318,9 +5105,9 @@
       <w:szCs w:val="56"/>
     </w:rPr>
   </w:style>
-  <w:style w:type="character" w:customStyle="1" w:styleId="TitleChar">
-    <w:name w:val="Title Char"/>
-    <w:link w:val="Title"/>
+  <w:style w:type="character" w:customStyle="1" w:styleId="CmChar">
+    <w:name w:val="Cím Char"/>
+    <w:link w:val="Cm"/>
     <w:uiPriority w:val="10"/>
     <w:rsid w:val="38171242"/>
     <w:rPr>
@@ -4329,11 +5116,11 @@
       <w:szCs w:val="56"/>
     </w:rPr>
   </w:style>
-  <w:style w:type="paragraph" w:styleId="Subtitle">
+  <w:style w:type="paragraph" w:styleId="Alcm">
     <w:name w:val="Subtitle"/>
-    <w:basedOn w:val="Normal"/>
-    <w:next w:val="Normal"/>
-    <w:link w:val="SubtitleChar"/>
+    <w:basedOn w:val="Norml"/>
+    <w:next w:val="Norml"/>
+    <w:link w:val="AlcmChar"/>
     <w:uiPriority w:val="11"/>
     <w:qFormat/>
     <w:rsid w:val="0005104C"/>
@@ -4350,9 +5137,9 @@
       <w:szCs w:val="28"/>
     </w:rPr>
   </w:style>
-  <w:style w:type="character" w:customStyle="1" w:styleId="SubtitleChar">
-    <w:name w:val="Subtitle Char"/>
-    <w:link w:val="Subtitle"/>
+  <w:style w:type="character" w:customStyle="1" w:styleId="AlcmChar">
+    <w:name w:val="Alcím Char"/>
+    <w:link w:val="Alcm"/>
     <w:uiPriority w:val="11"/>
     <w:rsid w:val="38171242"/>
     <w:rPr>
@@ -4362,11 +5149,11 @@
       <w:szCs w:val="28"/>
     </w:rPr>
   </w:style>
-  <w:style w:type="paragraph" w:styleId="Quote">
+  <w:style w:type="paragraph" w:styleId="Idzet">
     <w:name w:val="Quote"/>
-    <w:basedOn w:val="Normal"/>
-    <w:next w:val="Normal"/>
-    <w:link w:val="QuoteChar"/>
+    <w:basedOn w:val="Norml"/>
+    <w:next w:val="Norml"/>
+    <w:link w:val="IdzetChar"/>
     <w:uiPriority w:val="29"/>
     <w:qFormat/>
     <w:rsid w:val="0005104C"/>
@@ -4380,9 +5167,9 @@
       <w:color w:val="404040" w:themeColor="text1" w:themeTint="BF"/>
     </w:rPr>
   </w:style>
-  <w:style w:type="character" w:customStyle="1" w:styleId="QuoteChar">
-    <w:name w:val="Quote Char"/>
-    <w:link w:val="Quote"/>
+  <w:style w:type="character" w:customStyle="1" w:styleId="IdzetChar">
+    <w:name w:val="Idézet Char"/>
+    <w:link w:val="Idzet"/>
     <w:uiPriority w:val="29"/>
     <w:rsid w:val="38171242"/>
     <w:rPr>
@@ -4391,9 +5178,9 @@
       <w:color w:val="404040" w:themeColor="text1" w:themeTint="BF"/>
     </w:rPr>
   </w:style>
-  <w:style w:type="paragraph" w:styleId="ListParagraph">
+  <w:style w:type="paragraph" w:styleId="Listaszerbekezds">
     <w:name w:val="List Paragraph"/>
-    <w:basedOn w:val="Normal"/>
+    <w:basedOn w:val="Norml"/>
     <w:uiPriority w:val="34"/>
     <w:qFormat/>
     <w:rsid w:val="0005104C"/>
@@ -4402,7 +5189,7 @@
       <w:contextualSpacing/>
     </w:pPr>
   </w:style>
-  <w:style w:type="character" w:styleId="IntenseEmphasis">
+  <w:style w:type="character" w:styleId="Erskiemels">
     <w:name w:val="Intense Emphasis"/>
     <w:uiPriority w:val="21"/>
     <w:qFormat/>
@@ -4413,11 +5200,11 @@
       <w:color w:val="0F4761" w:themeColor="accent1" w:themeShade="BF"/>
     </w:rPr>
   </w:style>
-  <w:style w:type="paragraph" w:styleId="IntenseQuote">
+  <w:style w:type="paragraph" w:styleId="Kiemeltidzet">
     <w:name w:val="Intense Quote"/>
-    <w:basedOn w:val="Normal"/>
-    <w:next w:val="Normal"/>
-    <w:link w:val="IntenseQuoteChar"/>
+    <w:basedOn w:val="Norml"/>
+    <w:next w:val="Norml"/>
+    <w:link w:val="KiemeltidzetChar"/>
     <w:uiPriority w:val="30"/>
     <w:qFormat/>
     <w:rsid w:val="0005104C"/>
@@ -4436,9 +5223,9 @@
       <w:color w:val="0F4761" w:themeColor="accent1" w:themeShade="BF"/>
     </w:rPr>
   </w:style>
-  <w:style w:type="character" w:customStyle="1" w:styleId="IntenseQuoteChar">
-    <w:name w:val="Intense Quote Char"/>
-    <w:link w:val="IntenseQuote"/>
+  <w:style w:type="character" w:customStyle="1" w:styleId="KiemeltidzetChar">
+    <w:name w:val="Kiemelt idézet Char"/>
+    <w:link w:val="Kiemeltidzet"/>
     <w:uiPriority w:val="30"/>
     <w:rsid w:val="38171242"/>
     <w:rPr>
@@ -4447,7 +5234,7 @@
       <w:color w:val="0F4761" w:themeColor="accent1" w:themeShade="BF"/>
     </w:rPr>
   </w:style>
-  <w:style w:type="character" w:styleId="IntenseReference">
+  <w:style w:type="character" w:styleId="Ershivatkozs">
     <w:name w:val="Intense Reference"/>
     <w:uiPriority w:val="32"/>
     <w:qFormat/>
@@ -4459,7 +5246,7 @@
       <w:color w:val="0F4761" w:themeColor="accent1" w:themeShade="BF"/>
     </w:rPr>
   </w:style>
-  <w:style w:type="character" w:styleId="Hyperlink">
+  <w:style w:type="character" w:styleId="Hiperhivatkozs">
     <w:name w:val="Hyperlink"/>
     <w:uiPriority w:val="99"/>
     <w:unhideWhenUsed/>
@@ -4469,9 +5256,9 @@
       <w:u w:val="single"/>
     </w:rPr>
   </w:style>
-  <w:style w:type="paragraph" w:styleId="NormalWeb">
+  <w:style w:type="paragraph" w:styleId="NormlWeb">
     <w:name w:val="Normal (Web)"/>
-    <w:basedOn w:val="Normal"/>
+    <w:basedOn w:val="Norml"/>
     <w:uiPriority w:val="99"/>
     <w:semiHidden/>
     <w:unhideWhenUsed/>

</xml_diff>

<commit_message>
Recovering the repository because the router (index.js) was reverted to an older one (without children structure)
</commit_message>
<xml_diff>
--- a/documentation.docx
+++ b/documentation.docx
@@ -79,7 +79,27 @@
           <w:sz w:val="40"/>
           <w:szCs w:val="40"/>
         </w:rPr>
-        <w:t xml:space="preserve"> Susán Csongor, El-Nabulsy Csongor Alan</w:t>
+        <w:t xml:space="preserve"> Susán Csongor, El-</w:t>
+      </w:r>
+      <w:proofErr w:type="spellStart"/>
+      <w:r>
+        <w:rPr>
+          <w:rFonts w:ascii="Times New Roman" w:hAnsi="Times New Roman" w:cs="Times New Roman"/>
+          <w:bCs/>
+          <w:sz w:val="40"/>
+          <w:szCs w:val="40"/>
+        </w:rPr>
+        <w:t>Nabulsy</w:t>
+      </w:r>
+      <w:proofErr w:type="spellEnd"/>
+      <w:r>
+        <w:rPr>
+          <w:rFonts w:ascii="Times New Roman" w:hAnsi="Times New Roman" w:cs="Times New Roman"/>
+          <w:bCs/>
+          <w:sz w:val="40"/>
+          <w:szCs w:val="40"/>
+        </w:rPr>
+        <w:t xml:space="preserve"> Csongor Alan</w:t>
       </w:r>
     </w:p>
     <w:p>
@@ -171,7 +191,7 @@
     </w:p>
     <w:p>
       <w:pPr>
-        <w:pStyle w:val="ListParagraph"/>
+        <w:pStyle w:val="Listaszerbekezds"/>
         <w:numPr>
           <w:ilvl w:val="0"/>
           <w:numId w:val="1"/>
@@ -193,7 +213,7 @@
     </w:p>
     <w:p>
       <w:pPr>
-        <w:pStyle w:val="ListParagraph"/>
+        <w:pStyle w:val="Listaszerbekezds"/>
         <w:numPr>
           <w:ilvl w:val="0"/>
           <w:numId w:val="1"/>
@@ -215,7 +235,7 @@
     </w:p>
     <w:p>
       <w:pPr>
-        <w:pStyle w:val="ListParagraph"/>
+        <w:pStyle w:val="Listaszerbekezds"/>
         <w:ind w:left="0"/>
         <w:rPr>
           <w:rFonts w:ascii="Times New Roman" w:hAnsi="Times New Roman" w:cs="Times New Roman"/>
@@ -459,7 +479,7 @@
     </w:p>
     <w:p>
       <w:pPr>
-        <w:pStyle w:val="ListParagraph"/>
+        <w:pStyle w:val="Listaszerbekezds"/>
         <w:rPr>
           <w:rFonts w:ascii="Times New Roman" w:hAnsi="Times New Roman" w:cs="Times New Roman"/>
           <w:sz w:val="36"/>
@@ -884,7 +904,7 @@
       <w:hyperlink r:id="rId14">
         <w:r>
           <w:rPr>
-            <w:rStyle w:val="Hyperlink"/>
+            <w:rStyle w:val="Hiperhivatkozs"/>
             <w:rFonts w:ascii="Times New Roman" w:eastAsia="Times New Roman" w:hAnsi="Times New Roman" w:cs="Times New Roman"/>
             <w:sz w:val="36"/>
             <w:szCs w:val="36"/>
@@ -1288,7 +1308,7 @@
           <w:szCs w:val="36"/>
         </w:rPr>
         <w:drawing>
-          <wp:inline distT="0" distB="0" distL="0" distR="0" wp14:anchorId="78A43544" wp14:editId="6CE6A705">
+          <wp:inline distT="0" distB="0" distL="0" distR="0" wp14:anchorId="78A43544" wp14:editId="5279A085">
             <wp:extent cx="3166535" cy="1781175"/>
             <wp:effectExtent l="0" t="0" r="0" b="0"/>
             <wp:docPr id="3" name="Kép 3" descr="C:\Users\elnabulsy.csongor\AppData\Local\Microsoft\Windows\INetCache\Content.MSO\F75754B3.tmp"/>
@@ -1380,7 +1400,7 @@
           <w:szCs w:val="36"/>
         </w:rPr>
         <w:drawing>
-          <wp:inline distT="0" distB="0" distL="0" distR="0" wp14:anchorId="4E211814" wp14:editId="3C42E20B">
+          <wp:inline distT="0" distB="0" distL="0" distR="0" wp14:anchorId="4E211814" wp14:editId="477AF0ED">
             <wp:extent cx="3133725" cy="1762720"/>
             <wp:effectExtent l="0" t="0" r="0" b="9525"/>
             <wp:docPr id="4" name="Kép 4" descr="C:\Users\elnabulsy.csongor\Downloads\ui_main_student.png"/>
@@ -1462,7 +1482,7 @@
           <w:szCs w:val="36"/>
         </w:rPr>
         <w:drawing>
-          <wp:inline distT="0" distB="0" distL="0" distR="0" wp14:anchorId="5137FB78" wp14:editId="252FF7D1">
+          <wp:inline distT="0" distB="0" distL="0" distR="0" wp14:anchorId="5137FB78" wp14:editId="051D1352">
             <wp:extent cx="3166110" cy="1780938"/>
             <wp:effectExtent l="0" t="0" r="0" b="0"/>
             <wp:docPr id="5" name="Kép 5" descr="C:\Users\elnabulsy.csongor\Downloads\ui_main_scheduler.png"/>
@@ -1573,7 +1593,7 @@
           <w:szCs w:val="36"/>
         </w:rPr>
         <w:drawing>
-          <wp:inline distT="0" distB="0" distL="0" distR="0" wp14:anchorId="27EC1C67" wp14:editId="3CBFCD33">
+          <wp:inline distT="0" distB="0" distL="0" distR="0" wp14:anchorId="27EC1C67" wp14:editId="44EAF746">
             <wp:extent cx="3055620" cy="1718786"/>
             <wp:effectExtent l="0" t="0" r="0" b="0"/>
             <wp:docPr id="6" name="Kép 6" descr="C:\Users\elnabulsy.csongor\Downloads\ui_main_admin.png"/>
@@ -1655,7 +1675,7 @@
           <w:szCs w:val="36"/>
         </w:rPr>
         <w:drawing>
-          <wp:inline distT="0" distB="0" distL="0" distR="0" wp14:anchorId="08225B4F" wp14:editId="400C8E67">
+          <wp:inline distT="0" distB="0" distL="0" distR="0" wp14:anchorId="08225B4F" wp14:editId="11B0C10E">
             <wp:extent cx="2933700" cy="1942430"/>
             <wp:effectExtent l="0" t="0" r="0" b="1270"/>
             <wp:docPr id="7" name="Kép 7" descr="C:\Users\elnabulsy.csongor\Downloads\ui_structure.png"/>
@@ -1828,7 +1848,7 @@
           <w:szCs w:val="36"/>
         </w:rPr>
         <w:drawing>
-          <wp:inline distT="0" distB="0" distL="0" distR="0" wp14:anchorId="2C256DB5" wp14:editId="6887E296">
+          <wp:inline distT="0" distB="0" distL="0" distR="0" wp14:anchorId="2C256DB5" wp14:editId="5DC2B543">
             <wp:extent cx="3329940" cy="1752493"/>
             <wp:effectExtent l="0" t="0" r="3810" b="635"/>
             <wp:docPr id="9" name="Kép 9"/>
@@ -2386,7 +2406,7 @@
     </w:p>
     <w:p>
       <w:pPr>
-        <w:pStyle w:val="ListParagraph"/>
+        <w:pStyle w:val="Listaszerbekezds"/>
         <w:numPr>
           <w:ilvl w:val="0"/>
           <w:numId w:val="2"/>
@@ -2408,7 +2428,7 @@
     </w:p>
     <w:p>
       <w:pPr>
-        <w:pStyle w:val="ListParagraph"/>
+        <w:pStyle w:val="Listaszerbekezds"/>
         <w:numPr>
           <w:ilvl w:val="0"/>
           <w:numId w:val="2"/>
@@ -2440,7 +2460,7 @@
     </w:p>
     <w:p>
       <w:pPr>
-        <w:pStyle w:val="ListParagraph"/>
+        <w:pStyle w:val="Listaszerbekezds"/>
         <w:numPr>
           <w:ilvl w:val="0"/>
           <w:numId w:val="2"/>
@@ -2498,7 +2518,7 @@
     </w:p>
     <w:p>
       <w:pPr>
-        <w:pStyle w:val="ListParagraph"/>
+        <w:pStyle w:val="Listaszerbekezds"/>
         <w:numPr>
           <w:ilvl w:val="0"/>
           <w:numId w:val="2"/>
@@ -2548,7 +2568,7 @@
     </w:p>
     <w:p>
       <w:pPr>
-        <w:pStyle w:val="ListParagraph"/>
+        <w:pStyle w:val="Listaszerbekezds"/>
         <w:numPr>
           <w:ilvl w:val="0"/>
           <w:numId w:val="2"/>
@@ -2582,7 +2602,25 @@
           <w:sz w:val="36"/>
           <w:szCs w:val="36"/>
         </w:rPr>
-        <w:t>A projektet El-Nabulsy Csongor hozta létre és írta meg a kódját, a működéshez szükséges folyamatábrákat, az adatbázis ER-diagramját</w:t>
+        <w:t>A projektet El-</w:t>
+      </w:r>
+      <w:proofErr w:type="spellStart"/>
+      <w:r>
+        <w:rPr>
+          <w:rFonts w:ascii="Times New Roman" w:eastAsia="Times New Roman" w:hAnsi="Times New Roman" w:cs="Times New Roman"/>
+          <w:sz w:val="36"/>
+          <w:szCs w:val="36"/>
+        </w:rPr>
+        <w:t>Nabulsy</w:t>
+      </w:r>
+      <w:proofErr w:type="spellEnd"/>
+      <w:r>
+        <w:rPr>
+          <w:rFonts w:ascii="Times New Roman" w:eastAsia="Times New Roman" w:hAnsi="Times New Roman" w:cs="Times New Roman"/>
+          <w:sz w:val="36"/>
+          <w:szCs w:val="36"/>
+        </w:rPr>
+        <w:t xml:space="preserve"> Csongor hozta létre és írta meg a kódját, a működéshez szükséges folyamatábrákat, az adatbázis ER-diagramját</w:t>
       </w:r>
       <w:r>
         <w:rPr>
@@ -2819,7 +2857,25 @@
           <w:sz w:val="36"/>
           <w:szCs w:val="36"/>
         </w:rPr>
-        <w:t>(El-Nabulsy Csongor Alan</w:t>
+        <w:t>(El-</w:t>
+      </w:r>
+      <w:proofErr w:type="spellStart"/>
+      <w:r>
+        <w:rPr>
+          <w:rFonts w:ascii="Times New Roman" w:eastAsia="Times New Roman" w:hAnsi="Times New Roman" w:cs="Times New Roman"/>
+          <w:sz w:val="36"/>
+          <w:szCs w:val="36"/>
+        </w:rPr>
+        <w:t>Nabulsy</w:t>
+      </w:r>
+      <w:proofErr w:type="spellEnd"/>
+      <w:r>
+        <w:rPr>
+          <w:rFonts w:ascii="Times New Roman" w:eastAsia="Times New Roman" w:hAnsi="Times New Roman" w:cs="Times New Roman"/>
+          <w:sz w:val="36"/>
+          <w:szCs w:val="36"/>
+        </w:rPr>
+        <w:t xml:space="preserve"> Csongor Alan</w:t>
       </w:r>
       <w:r>
         <w:rPr>
@@ -2843,7 +2899,25 @@
           <w:sz w:val="36"/>
           <w:szCs w:val="36"/>
         </w:rPr>
-        <w:t xml:space="preserve"> (El-Nabulsy: főoldal és annak </w:t>
+        <w:t xml:space="preserve"> (El-</w:t>
+      </w:r>
+      <w:proofErr w:type="spellStart"/>
+      <w:r>
+        <w:rPr>
+          <w:rFonts w:ascii="Times New Roman" w:eastAsia="Times New Roman" w:hAnsi="Times New Roman" w:cs="Times New Roman"/>
+          <w:sz w:val="36"/>
+          <w:szCs w:val="36"/>
+        </w:rPr>
+        <w:t>Nabulsy</w:t>
+      </w:r>
+      <w:proofErr w:type="spellEnd"/>
+      <w:r>
+        <w:rPr>
+          <w:rFonts w:ascii="Times New Roman" w:eastAsia="Times New Roman" w:hAnsi="Times New Roman" w:cs="Times New Roman"/>
+          <w:sz w:val="36"/>
+          <w:szCs w:val="36"/>
+        </w:rPr>
+        <w:t xml:space="preserve">: főoldal és annak </w:t>
       </w:r>
       <w:r>
         <w:rPr>
@@ -2941,7 +3015,25 @@
           <w:sz w:val="36"/>
           <w:szCs w:val="36"/>
         </w:rPr>
-        <w:t xml:space="preserve">(El-Nabulsy Csongor Alan) A zenebekérő oldal </w:t>
+        <w:t>(El-</w:t>
+      </w:r>
+      <w:proofErr w:type="spellStart"/>
+      <w:r>
+        <w:rPr>
+          <w:rFonts w:ascii="Times New Roman" w:eastAsia="Times New Roman" w:hAnsi="Times New Roman" w:cs="Times New Roman"/>
+          <w:sz w:val="36"/>
+          <w:szCs w:val="36"/>
+        </w:rPr>
+        <w:t>Nabulsy</w:t>
+      </w:r>
+      <w:proofErr w:type="spellEnd"/>
+      <w:r>
+        <w:rPr>
+          <w:rFonts w:ascii="Times New Roman" w:eastAsia="Times New Roman" w:hAnsi="Times New Roman" w:cs="Times New Roman"/>
+          <w:sz w:val="36"/>
+          <w:szCs w:val="36"/>
+        </w:rPr>
+        <w:t xml:space="preserve"> Csongor Alan) A zenebekérő oldal </w:t>
       </w:r>
       <w:r>
         <w:rPr>
@@ -3004,19 +3096,27 @@
           <w:sz w:val="36"/>
           <w:szCs w:val="36"/>
         </w:rPr>
-        <w:t xml:space="preserve">(El-Nabulsy Csongor Alan) Főbb </w:t>
-      </w:r>
-      <w:proofErr w:type="gramStart"/>
-      <w:r>
-        <w:rPr>
-          <w:rFonts w:ascii="Times New Roman" w:eastAsia="Times New Roman" w:hAnsi="Times New Roman" w:cs="Times New Roman"/>
-          <w:sz w:val="36"/>
-          <w:szCs w:val="36"/>
-        </w:rPr>
-        <w:t>nézetek(</w:t>
+        <w:t>(El-</w:t>
       </w:r>
       <w:proofErr w:type="spellStart"/>
-      <w:proofErr w:type="gramEnd"/>
+      <w:r>
+        <w:rPr>
+          <w:rFonts w:ascii="Times New Roman" w:eastAsia="Times New Roman" w:hAnsi="Times New Roman" w:cs="Times New Roman"/>
+          <w:sz w:val="36"/>
+          <w:szCs w:val="36"/>
+        </w:rPr>
+        <w:t>Nabulsy</w:t>
+      </w:r>
+      <w:proofErr w:type="spellEnd"/>
+      <w:r>
+        <w:rPr>
+          <w:rFonts w:ascii="Times New Roman" w:eastAsia="Times New Roman" w:hAnsi="Times New Roman" w:cs="Times New Roman"/>
+          <w:sz w:val="36"/>
+          <w:szCs w:val="36"/>
+        </w:rPr>
+        <w:t xml:space="preserve"> Csongor Alan) Főbb nézetek(</w:t>
+      </w:r>
+      <w:proofErr w:type="spellStart"/>
       <w:r>
         <w:rPr>
           <w:rFonts w:ascii="Times New Roman" w:eastAsia="Times New Roman" w:hAnsi="Times New Roman" w:cs="Times New Roman"/>
@@ -3347,15 +3447,7 @@
           <w:sz w:val="36"/>
           <w:szCs w:val="36"/>
         </w:rPr>
-        <w:t>(Susán Csongor György, El-Nabulsy Csongor Alan)</w:t>
-      </w:r>
-      <w:r>
-        <w:rPr>
-          <w:rFonts w:ascii="Times New Roman" w:eastAsia="Times New Roman" w:hAnsi="Times New Roman" w:cs="Times New Roman"/>
-          <w:sz w:val="36"/>
-          <w:szCs w:val="36"/>
-        </w:rPr>
-        <w:t xml:space="preserve"> Nézetek végleges kialakítása (El-Nabulsy: </w:t>
+        <w:t>(Susán Csongor György, El-</w:t>
       </w:r>
       <w:proofErr w:type="spellStart"/>
       <w:r>
@@ -3364,6 +3456,50 @@
           <w:sz w:val="36"/>
           <w:szCs w:val="36"/>
         </w:rPr>
+        <w:t>Nabulsy</w:t>
+      </w:r>
+      <w:proofErr w:type="spellEnd"/>
+      <w:r>
+        <w:rPr>
+          <w:rFonts w:ascii="Times New Roman" w:eastAsia="Times New Roman" w:hAnsi="Times New Roman" w:cs="Times New Roman"/>
+          <w:sz w:val="36"/>
+          <w:szCs w:val="36"/>
+        </w:rPr>
+        <w:t xml:space="preserve"> Csongor Alan)</w:t>
+      </w:r>
+      <w:r>
+        <w:rPr>
+          <w:rFonts w:ascii="Times New Roman" w:eastAsia="Times New Roman" w:hAnsi="Times New Roman" w:cs="Times New Roman"/>
+          <w:sz w:val="36"/>
+          <w:szCs w:val="36"/>
+        </w:rPr>
+        <w:t xml:space="preserve"> Nézetek végleges kialakítása (El-</w:t>
+      </w:r>
+      <w:proofErr w:type="spellStart"/>
+      <w:r>
+        <w:rPr>
+          <w:rFonts w:ascii="Times New Roman" w:eastAsia="Times New Roman" w:hAnsi="Times New Roman" w:cs="Times New Roman"/>
+          <w:sz w:val="36"/>
+          <w:szCs w:val="36"/>
+        </w:rPr>
+        <w:t>Nabulsy</w:t>
+      </w:r>
+      <w:proofErr w:type="spellEnd"/>
+      <w:r>
+        <w:rPr>
+          <w:rFonts w:ascii="Times New Roman" w:eastAsia="Times New Roman" w:hAnsi="Times New Roman" w:cs="Times New Roman"/>
+          <w:sz w:val="36"/>
+          <w:szCs w:val="36"/>
+        </w:rPr>
+        <w:t xml:space="preserve">: </w:t>
+      </w:r>
+      <w:proofErr w:type="spellStart"/>
+      <w:r>
+        <w:rPr>
+          <w:rFonts w:ascii="Times New Roman" w:eastAsia="Times New Roman" w:hAnsi="Times New Roman" w:cs="Times New Roman"/>
+          <w:sz w:val="36"/>
+          <w:szCs w:val="36"/>
+        </w:rPr>
         <w:t>HomeView</w:t>
       </w:r>
       <w:proofErr w:type="spellEnd"/>
@@ -3474,7 +3610,7 @@
     </w:p>
     <w:p>
       <w:pPr>
-        <w:pStyle w:val="ListParagraph"/>
+        <w:pStyle w:val="Listaszerbekezds"/>
         <w:numPr>
           <w:ilvl w:val="0"/>
           <w:numId w:val="4"/>
@@ -3515,7 +3651,7 @@
     </w:p>
     <w:p>
       <w:pPr>
-        <w:pStyle w:val="ListParagraph"/>
+        <w:pStyle w:val="Listaszerbekezds"/>
         <w:numPr>
           <w:ilvl w:val="0"/>
           <w:numId w:val="4"/>
@@ -3546,7 +3682,7 @@
     </w:p>
     <w:p>
       <w:pPr>
-        <w:pStyle w:val="ListParagraph"/>
+        <w:pStyle w:val="Listaszerbekezds"/>
         <w:numPr>
           <w:ilvl w:val="0"/>
           <w:numId w:val="4"/>
@@ -3559,7 +3695,6 @@
         </w:rPr>
       </w:pPr>
       <w:proofErr w:type="spellStart"/>
-      <w:proofErr w:type="gramStart"/>
       <w:r>
         <w:rPr>
           <w:rFonts w:ascii="Times New Roman" w:eastAsia="Times New Roman" w:hAnsi="Times New Roman" w:cs="Times New Roman"/>
@@ -3567,16 +3702,7 @@
           <w:szCs w:val="36"/>
         </w:rPr>
         <w:lastRenderedPageBreak/>
-        <w:t>meta.title</w:t>
-      </w:r>
-      <w:proofErr w:type="gramEnd"/>
-      <w:r>
-        <w:rPr>
-          <w:rFonts w:ascii="Times New Roman" w:eastAsia="Times New Roman" w:hAnsi="Times New Roman" w:cs="Times New Roman"/>
-          <w:sz w:val="36"/>
-          <w:szCs w:val="36"/>
-        </w:rPr>
-        <w:t>-ekben</w:t>
+        <w:t>meta.title-ekben</w:t>
       </w:r>
       <w:proofErr w:type="spellEnd"/>
       <w:r>
@@ -3608,7 +3734,7 @@
     </w:p>
     <w:p>
       <w:pPr>
-        <w:pStyle w:val="ListParagraph"/>
+        <w:pStyle w:val="Listaszerbekezds"/>
         <w:numPr>
           <w:ilvl w:val="0"/>
           <w:numId w:val="4"/>
@@ -3647,7 +3773,7 @@
     </w:p>
     <w:p>
       <w:pPr>
-        <w:pStyle w:val="ListParagraph"/>
+        <w:pStyle w:val="Listaszerbekezds"/>
         <w:numPr>
           <w:ilvl w:val="0"/>
           <w:numId w:val="4"/>
@@ -3698,7 +3824,7 @@
     </w:p>
     <w:p>
       <w:pPr>
-        <w:pStyle w:val="ListParagraph"/>
+        <w:pStyle w:val="Listaszerbekezds"/>
         <w:numPr>
           <w:ilvl w:val="0"/>
           <w:numId w:val="4"/>
@@ -3741,142 +3867,6 @@
           <w:szCs w:val="36"/>
         </w:rPr>
         <w:t>l-be bekerül az oldal neve is (hu, azaz magyar)</w:t>
-      </w:r>
-    </w:p>
-    <w:p>
-      <w:pPr>
-        <w:jc w:val="both"/>
-        <w:rPr>
-          <w:rFonts w:ascii="Times New Roman" w:eastAsia="Times New Roman" w:hAnsi="Times New Roman" w:cs="Times New Roman"/>
-          <w:sz w:val="36"/>
-          <w:szCs w:val="36"/>
-        </w:rPr>
-      </w:pPr>
-      <w:r>
-        <w:rPr>
-          <w:rFonts w:ascii="Times New Roman" w:eastAsia="Times New Roman" w:hAnsi="Times New Roman" w:cs="Times New Roman"/>
-          <w:sz w:val="36"/>
-          <w:szCs w:val="36"/>
-        </w:rPr>
-        <w:t>(El-Nabulsy Csongor)</w:t>
-      </w:r>
-    </w:p>
-    <w:p>
-      <w:pPr>
-        <w:pStyle w:val="ListParagraph"/>
-        <w:numPr>
-          <w:ilvl w:val="0"/>
-          <w:numId w:val="5"/>
-        </w:numPr>
-        <w:jc w:val="both"/>
-        <w:rPr>
-          <w:rFonts w:ascii="Times New Roman" w:eastAsia="Times New Roman" w:hAnsi="Times New Roman" w:cs="Times New Roman"/>
-          <w:sz w:val="36"/>
-          <w:szCs w:val="36"/>
-        </w:rPr>
-      </w:pPr>
-      <w:r>
-        <w:rPr>
-          <w:rFonts w:ascii="Times New Roman" w:eastAsia="Times New Roman" w:hAnsi="Times New Roman" w:cs="Times New Roman"/>
-          <w:sz w:val="36"/>
-          <w:szCs w:val="36"/>
-        </w:rPr>
-        <w:t xml:space="preserve">A </w:t>
-      </w:r>
-      <w:proofErr w:type="spellStart"/>
-      <w:r>
-        <w:rPr>
-          <w:rFonts w:ascii="Times New Roman" w:eastAsia="Times New Roman" w:hAnsi="Times New Roman" w:cs="Times New Roman"/>
-          <w:sz w:val="36"/>
-          <w:szCs w:val="36"/>
-        </w:rPr>
-        <w:t>ReuqestView</w:t>
-      </w:r>
-      <w:proofErr w:type="spellEnd"/>
-      <w:r>
-        <w:rPr>
-          <w:rFonts w:ascii="Times New Roman" w:eastAsia="Times New Roman" w:hAnsi="Times New Roman" w:cs="Times New Roman"/>
-          <w:sz w:val="36"/>
-          <w:szCs w:val="36"/>
-        </w:rPr>
-        <w:t xml:space="preserve"> oldal kialakításának </w:t>
-      </w:r>
-      <w:proofErr w:type="gramStart"/>
-      <w:r>
-        <w:rPr>
-          <w:rFonts w:ascii="Times New Roman" w:eastAsia="Times New Roman" w:hAnsi="Times New Roman" w:cs="Times New Roman"/>
-          <w:sz w:val="36"/>
-          <w:szCs w:val="36"/>
-        </w:rPr>
-        <w:t>elvégzése</w:t>
-      </w:r>
-      <w:proofErr w:type="gramEnd"/>
-      <w:r>
-        <w:rPr>
-          <w:rFonts w:ascii="Times New Roman" w:eastAsia="Times New Roman" w:hAnsi="Times New Roman" w:cs="Times New Roman"/>
-          <w:sz w:val="36"/>
-          <w:szCs w:val="36"/>
-        </w:rPr>
-        <w:t xml:space="preserve"> aminek </w:t>
-      </w:r>
-      <w:proofErr w:type="gramStart"/>
-      <w:r>
-        <w:rPr>
-          <w:rFonts w:ascii="Times New Roman" w:eastAsia="Times New Roman" w:hAnsi="Times New Roman" w:cs="Times New Roman"/>
-          <w:sz w:val="36"/>
-          <w:szCs w:val="36"/>
-        </w:rPr>
-        <w:t>célja</w:t>
-      </w:r>
-      <w:proofErr w:type="gramEnd"/>
-      <w:r>
-        <w:rPr>
-          <w:rFonts w:ascii="Times New Roman" w:eastAsia="Times New Roman" w:hAnsi="Times New Roman" w:cs="Times New Roman"/>
-          <w:sz w:val="36"/>
-          <w:szCs w:val="36"/>
-        </w:rPr>
-        <w:t xml:space="preserve"> hogy a felhasználók a már meglévő zenék közül választhassanak, és azokat bekérhessék.</w:t>
-      </w:r>
-    </w:p>
-    <w:p>
-      <w:pPr>
-        <w:pStyle w:val="ListParagraph"/>
-        <w:numPr>
-          <w:ilvl w:val="0"/>
-          <w:numId w:val="5"/>
-        </w:numPr>
-        <w:jc w:val="both"/>
-        <w:rPr>
-          <w:rFonts w:ascii="Times New Roman" w:eastAsia="Times New Roman" w:hAnsi="Times New Roman" w:cs="Times New Roman"/>
-          <w:sz w:val="36"/>
-          <w:szCs w:val="36"/>
-        </w:rPr>
-      </w:pPr>
-      <w:r>
-        <w:rPr>
-          <w:rFonts w:ascii="Times New Roman" w:eastAsia="Times New Roman" w:hAnsi="Times New Roman" w:cs="Times New Roman"/>
-          <w:sz w:val="36"/>
-          <w:szCs w:val="36"/>
-        </w:rPr>
-        <w:t xml:space="preserve">A </w:t>
-      </w:r>
-      <w:proofErr w:type="spellStart"/>
-      <w:r>
-        <w:rPr>
-          <w:rFonts w:ascii="Times New Roman" w:eastAsia="Times New Roman" w:hAnsi="Times New Roman" w:cs="Times New Roman"/>
-          <w:sz w:val="36"/>
-          <w:szCs w:val="36"/>
-        </w:rPr>
-        <w:t>SendView</w:t>
-      </w:r>
-      <w:proofErr w:type="spellEnd"/>
-      <w:r>
-        <w:rPr>
-          <w:rFonts w:ascii="Times New Roman" w:eastAsia="Times New Roman" w:hAnsi="Times New Roman" w:cs="Times New Roman"/>
-          <w:sz w:val="36"/>
-          <w:szCs w:val="36"/>
-        </w:rPr>
-        <w:t xml:space="preserve"> oldal befejezése, amivel a felhasználók új zenéket tudnak beküldeni, amik még nem voltak bekérve.</w:t>
       </w:r>
     </w:p>
     <w:sectPr>
@@ -3892,119 +3882,6 @@
 <file path=word/numbering.xml><?xml version="1.0" encoding="utf-8"?>
 <w:numbering xmlns:wpc="http://schemas.microsoft.com/office/word/2010/wordprocessingCanvas" xmlns:cx="http://schemas.microsoft.com/office/drawing/2014/chartex" xmlns:cx1="http://schemas.microsoft.com/office/drawing/2015/9/8/chartex" xmlns:cx2="http://schemas.microsoft.com/office/drawing/2015/10/21/chartex" xmlns:cx3="http://schemas.microsoft.com/office/drawing/2016/5/9/chartex" xmlns:cx4="http://schemas.microsoft.com/office/drawing/2016/5/10/chartex" xmlns:cx5="http://schemas.microsoft.com/office/drawing/2016/5/11/chartex" xmlns:cx6="http://schemas.microsoft.com/office/drawing/2016/5/12/chartex" xmlns:cx7="http://schemas.microsoft.com/office/drawing/2016/5/13/chartex" xmlns:cx8="http://schemas.microsoft.com/office/drawing/2016/5/14/chartex" xmlns:mc="http://schemas.openxmlformats.org/markup-compatibility/2006" xmlns:aink="http://schemas.microsoft.com/office/drawing/2016/ink" xmlns:am3d="http://schemas.microsoft.com/office/drawing/2017/model3d" xmlns:o="urn:schemas-microsoft-com:office:office" xmlns:oel="http://schemas.microsoft.com/office/2019/extlst" xmlns:r="http://schemas.openxmlformats.org/officeDocument/2006/relationships" xmlns:m="http://schemas.openxmlformats.org/officeDocument/2006/math" xmlns:v="urn:schemas-microsoft-com:vml" xmlns:wp14="http://schemas.microsoft.com/office/word/2010/wordprocessingDrawing" xmlns:wp="http://schemas.openxmlformats.org/drawingml/2006/wordprocessingDrawing" xmlns:w10="urn:schemas-microsoft-com:office:word" xmlns:w="http://schemas.openxmlformats.org/wordprocessingml/2006/main" xmlns:w14="http://schemas.microsoft.com/office/word/2010/wordml" xmlns:w15="http://schemas.microsoft.com/office/word/2012/wordml" xmlns:w16cex="http://schemas.microsoft.com/office/word/2018/wordml/cex" xmlns:w16cid="http://schemas.microsoft.com/office/word/2016/wordml/cid" xmlns:w16="http://schemas.microsoft.com/office/word/2018/wordml" xmlns:w16du="http://schemas.microsoft.com/office/word/2023/wordml/word16du" xmlns:w16sdtdh="http://schemas.microsoft.com/office/word/2020/wordml/sdtdatahash" xmlns:w16sdtfl="http://schemas.microsoft.com/office/word/2024/wordml/sdtformatlock" xmlns:w16se="http://schemas.microsoft.com/office/word/2015/wordml/symex" xmlns:wpg="http://schemas.microsoft.com/office/word/2010/wordprocessingGroup" xmlns:wpi="http://schemas.microsoft.com/office/word/2010/wordprocessingInk" xmlns:wne="http://schemas.microsoft.com/office/word/2006/wordml" xmlns:wps="http://schemas.microsoft.com/office/word/2010/wordprocessingShape" mc:Ignorable="w14 w15 w16se w16cid w16 w16cex w16sdtdh w16sdtfl w16du wp14">
   <w:abstractNum w:abstractNumId="0" w15:restartNumberingAfterBreak="0">
-    <w:nsid w:val="0A5E6439"/>
-    <w:multiLevelType w:val="hybridMultilevel"/>
-    <w:tmpl w:val="7E701CFA"/>
-    <w:lvl w:ilvl="0" w:tplc="0218C5BE">
-      <w:start w:val="2026"/>
-      <w:numFmt w:val="bullet"/>
-      <w:lvlText w:val="-"/>
-      <w:lvlJc w:val="left"/>
-      <w:pPr>
-        <w:ind w:left="720" w:hanging="360"/>
-      </w:pPr>
-      <w:rPr>
-        <w:rFonts w:ascii="Times New Roman" w:eastAsia="Times New Roman" w:hAnsi="Times New Roman" w:cs="Times New Roman" w:hint="default"/>
-      </w:rPr>
-    </w:lvl>
-    <w:lvl w:ilvl="1" w:tplc="04090003" w:tentative="1">
-      <w:start w:val="1"/>
-      <w:numFmt w:val="bullet"/>
-      <w:lvlText w:val="o"/>
-      <w:lvlJc w:val="left"/>
-      <w:pPr>
-        <w:ind w:left="1440" w:hanging="360"/>
-      </w:pPr>
-      <w:rPr>
-        <w:rFonts w:ascii="Courier New" w:hAnsi="Courier New" w:cs="Courier New" w:hint="default"/>
-      </w:rPr>
-    </w:lvl>
-    <w:lvl w:ilvl="2" w:tplc="04090005" w:tentative="1">
-      <w:start w:val="1"/>
-      <w:numFmt w:val="bullet"/>
-      <w:lvlText w:val=""/>
-      <w:lvlJc w:val="left"/>
-      <w:pPr>
-        <w:ind w:left="2160" w:hanging="360"/>
-      </w:pPr>
-      <w:rPr>
-        <w:rFonts w:ascii="Wingdings" w:hAnsi="Wingdings" w:hint="default"/>
-      </w:rPr>
-    </w:lvl>
-    <w:lvl w:ilvl="3" w:tplc="04090001" w:tentative="1">
-      <w:start w:val="1"/>
-      <w:numFmt w:val="bullet"/>
-      <w:lvlText w:val=""/>
-      <w:lvlJc w:val="left"/>
-      <w:pPr>
-        <w:ind w:left="2880" w:hanging="360"/>
-      </w:pPr>
-      <w:rPr>
-        <w:rFonts w:ascii="Symbol" w:hAnsi="Symbol" w:hint="default"/>
-      </w:rPr>
-    </w:lvl>
-    <w:lvl w:ilvl="4" w:tplc="04090003" w:tentative="1">
-      <w:start w:val="1"/>
-      <w:numFmt w:val="bullet"/>
-      <w:lvlText w:val="o"/>
-      <w:lvlJc w:val="left"/>
-      <w:pPr>
-        <w:ind w:left="3600" w:hanging="360"/>
-      </w:pPr>
-      <w:rPr>
-        <w:rFonts w:ascii="Courier New" w:hAnsi="Courier New" w:cs="Courier New" w:hint="default"/>
-      </w:rPr>
-    </w:lvl>
-    <w:lvl w:ilvl="5" w:tplc="04090005" w:tentative="1">
-      <w:start w:val="1"/>
-      <w:numFmt w:val="bullet"/>
-      <w:lvlText w:val=""/>
-      <w:lvlJc w:val="left"/>
-      <w:pPr>
-        <w:ind w:left="4320" w:hanging="360"/>
-      </w:pPr>
-      <w:rPr>
-        <w:rFonts w:ascii="Wingdings" w:hAnsi="Wingdings" w:hint="default"/>
-      </w:rPr>
-    </w:lvl>
-    <w:lvl w:ilvl="6" w:tplc="04090001" w:tentative="1">
-      <w:start w:val="1"/>
-      <w:numFmt w:val="bullet"/>
-      <w:lvlText w:val=""/>
-      <w:lvlJc w:val="left"/>
-      <w:pPr>
-        <w:ind w:left="5040" w:hanging="360"/>
-      </w:pPr>
-      <w:rPr>
-        <w:rFonts w:ascii="Symbol" w:hAnsi="Symbol" w:hint="default"/>
-      </w:rPr>
-    </w:lvl>
-    <w:lvl w:ilvl="7" w:tplc="04090003" w:tentative="1">
-      <w:start w:val="1"/>
-      <w:numFmt w:val="bullet"/>
-      <w:lvlText w:val="o"/>
-      <w:lvlJc w:val="left"/>
-      <w:pPr>
-        <w:ind w:left="5760" w:hanging="360"/>
-      </w:pPr>
-      <w:rPr>
-        <w:rFonts w:ascii="Courier New" w:hAnsi="Courier New" w:cs="Courier New" w:hint="default"/>
-      </w:rPr>
-    </w:lvl>
-    <w:lvl w:ilvl="8" w:tplc="04090005" w:tentative="1">
-      <w:start w:val="1"/>
-      <w:numFmt w:val="bullet"/>
-      <w:lvlText w:val=""/>
-      <w:lvlJc w:val="left"/>
-      <w:pPr>
-        <w:ind w:left="6480" w:hanging="360"/>
-      </w:pPr>
-      <w:rPr>
-        <w:rFonts w:ascii="Wingdings" w:hAnsi="Wingdings" w:hint="default"/>
-      </w:rPr>
-    </w:lvl>
-  </w:abstractNum>
-  <w:abstractNum w:abstractNumId="1" w15:restartNumberingAfterBreak="0">
     <w:nsid w:val="3C1938F6"/>
     <w:multiLevelType w:val="hybridMultilevel"/>
     <w:tmpl w:val="0816ACA8"/>
@@ -4117,7 +3994,7 @@
       </w:rPr>
     </w:lvl>
   </w:abstractNum>
-  <w:abstractNum w:abstractNumId="2" w15:restartNumberingAfterBreak="0">
+  <w:abstractNum w:abstractNumId="1" w15:restartNumberingAfterBreak="0">
     <w:nsid w:val="6E7312B6"/>
     <w:multiLevelType w:val="hybridMultilevel"/>
     <w:tmpl w:val="FD80BAFC"/>
@@ -4230,7 +4107,7 @@
       </w:rPr>
     </w:lvl>
   </w:abstractNum>
-  <w:abstractNum w:abstractNumId="3" w15:restartNumberingAfterBreak="0">
+  <w:abstractNum w:abstractNumId="2" w15:restartNumberingAfterBreak="0">
     <w:nsid w:val="76FA296F"/>
     <w:multiLevelType w:val="hybridMultilevel"/>
     <w:tmpl w:val="6DAE32EA"/>
@@ -4343,7 +4220,7 @@
       </w:rPr>
     </w:lvl>
   </w:abstractNum>
-  <w:abstractNum w:abstractNumId="4" w15:restartNumberingAfterBreak="0">
+  <w:abstractNum w:abstractNumId="3" w15:restartNumberingAfterBreak="0">
     <w:nsid w:val="7EB672F7"/>
     <w:multiLevelType w:val="hybridMultilevel"/>
     <w:tmpl w:val="A6F0C99C"/>
@@ -4457,18 +4334,15 @@
     </w:lvl>
   </w:abstractNum>
   <w:num w:numId="1" w16cid:durableId="33770327">
-    <w:abstractNumId w:val="4"/>
+    <w:abstractNumId w:val="3"/>
   </w:num>
   <w:num w:numId="2" w16cid:durableId="565265875">
+    <w:abstractNumId w:val="1"/>
+  </w:num>
+  <w:num w:numId="3" w16cid:durableId="1458177206">
     <w:abstractNumId w:val="2"/>
   </w:num>
-  <w:num w:numId="3" w16cid:durableId="1458177206">
-    <w:abstractNumId w:val="3"/>
-  </w:num>
   <w:num w:numId="4" w16cid:durableId="1687830723">
-    <w:abstractNumId w:val="1"/>
-  </w:num>
-  <w:num w:numId="5" w16cid:durableId="654145176">
     <w:abstractNumId w:val="0"/>
   </w:num>
 </w:numbering>
@@ -4871,15 +4745,15 @@
     <w:lsdException w:name="Unresolved Mention" w:semiHidden="1" w:unhideWhenUsed="1"/>
     <w:lsdException w:name="Smart Link" w:semiHidden="1" w:unhideWhenUsed="1"/>
   </w:latentStyles>
-  <w:style w:type="paragraph" w:default="1" w:styleId="Normal">
+  <w:style w:type="paragraph" w:default="1" w:styleId="Norml">
     <w:name w:val="Normal"/>
     <w:qFormat/>
   </w:style>
-  <w:style w:type="paragraph" w:styleId="Heading1">
+  <w:style w:type="paragraph" w:styleId="Cmsor1">
     <w:name w:val="heading 1"/>
-    <w:basedOn w:val="Normal"/>
-    <w:next w:val="Normal"/>
-    <w:link w:val="Heading1Char"/>
+    <w:basedOn w:val="Norml"/>
+    <w:next w:val="Norml"/>
+    <w:link w:val="Cmsor1Char"/>
     <w:uiPriority w:val="9"/>
     <w:qFormat/>
     <w:rsid w:val="0005104C"/>
@@ -4896,11 +4770,11 @@
       <w:szCs w:val="40"/>
     </w:rPr>
   </w:style>
-  <w:style w:type="paragraph" w:styleId="Heading2">
+  <w:style w:type="paragraph" w:styleId="Cmsor2">
     <w:name w:val="heading 2"/>
-    <w:basedOn w:val="Normal"/>
-    <w:next w:val="Normal"/>
-    <w:link w:val="Heading2Char"/>
+    <w:basedOn w:val="Norml"/>
+    <w:next w:val="Norml"/>
+    <w:link w:val="Cmsor2Char"/>
     <w:uiPriority w:val="9"/>
     <w:semiHidden/>
     <w:unhideWhenUsed/>
@@ -4919,11 +4793,11 @@
       <w:szCs w:val="32"/>
     </w:rPr>
   </w:style>
-  <w:style w:type="paragraph" w:styleId="Heading3">
+  <w:style w:type="paragraph" w:styleId="Cmsor3">
     <w:name w:val="heading 3"/>
-    <w:basedOn w:val="Normal"/>
-    <w:next w:val="Normal"/>
-    <w:link w:val="Heading3Char"/>
+    <w:basedOn w:val="Norml"/>
+    <w:next w:val="Norml"/>
+    <w:link w:val="Cmsor3Char"/>
     <w:uiPriority w:val="9"/>
     <w:semiHidden/>
     <w:unhideWhenUsed/>
@@ -4942,11 +4816,11 @@
       <w:szCs w:val="28"/>
     </w:rPr>
   </w:style>
-  <w:style w:type="paragraph" w:styleId="Heading4">
+  <w:style w:type="paragraph" w:styleId="Cmsor4">
     <w:name w:val="heading 4"/>
-    <w:basedOn w:val="Normal"/>
-    <w:next w:val="Normal"/>
-    <w:link w:val="Heading4Char"/>
+    <w:basedOn w:val="Norml"/>
+    <w:next w:val="Norml"/>
+    <w:link w:val="Cmsor4Char"/>
     <w:uiPriority w:val="9"/>
     <w:semiHidden/>
     <w:unhideWhenUsed/>
@@ -4965,11 +4839,11 @@
       <w:color w:val="0F4761" w:themeColor="accent1" w:themeShade="BF"/>
     </w:rPr>
   </w:style>
-  <w:style w:type="paragraph" w:styleId="Heading5">
+  <w:style w:type="paragraph" w:styleId="Cmsor5">
     <w:name w:val="heading 5"/>
-    <w:basedOn w:val="Normal"/>
-    <w:next w:val="Normal"/>
-    <w:link w:val="Heading5Char"/>
+    <w:basedOn w:val="Norml"/>
+    <w:next w:val="Norml"/>
+    <w:link w:val="Cmsor5Char"/>
     <w:uiPriority w:val="9"/>
     <w:semiHidden/>
     <w:unhideWhenUsed/>
@@ -4986,11 +4860,11 @@
       <w:color w:val="0F4761" w:themeColor="accent1" w:themeShade="BF"/>
     </w:rPr>
   </w:style>
-  <w:style w:type="paragraph" w:styleId="Heading6">
+  <w:style w:type="paragraph" w:styleId="Cmsor6">
     <w:name w:val="heading 6"/>
-    <w:basedOn w:val="Normal"/>
-    <w:next w:val="Normal"/>
-    <w:link w:val="Heading6Char"/>
+    <w:basedOn w:val="Norml"/>
+    <w:next w:val="Norml"/>
+    <w:link w:val="Cmsor6Char"/>
     <w:uiPriority w:val="9"/>
     <w:semiHidden/>
     <w:unhideWhenUsed/>
@@ -5009,11 +4883,11 @@
       <w:color w:val="595959" w:themeColor="text1" w:themeTint="A6"/>
     </w:rPr>
   </w:style>
-  <w:style w:type="paragraph" w:styleId="Heading7">
+  <w:style w:type="paragraph" w:styleId="Cmsor7">
     <w:name w:val="heading 7"/>
-    <w:basedOn w:val="Normal"/>
-    <w:next w:val="Normal"/>
-    <w:link w:val="Heading7Char"/>
+    <w:basedOn w:val="Norml"/>
+    <w:next w:val="Norml"/>
+    <w:link w:val="Cmsor7Char"/>
     <w:uiPriority w:val="9"/>
     <w:semiHidden/>
     <w:unhideWhenUsed/>
@@ -5030,11 +4904,11 @@
       <w:color w:val="595959" w:themeColor="text1" w:themeTint="A6"/>
     </w:rPr>
   </w:style>
-  <w:style w:type="paragraph" w:styleId="Heading8">
+  <w:style w:type="paragraph" w:styleId="Cmsor8">
     <w:name w:val="heading 8"/>
-    <w:basedOn w:val="Normal"/>
-    <w:next w:val="Normal"/>
-    <w:link w:val="Heading8Char"/>
+    <w:basedOn w:val="Norml"/>
+    <w:next w:val="Norml"/>
+    <w:link w:val="Cmsor8Char"/>
     <w:uiPriority w:val="9"/>
     <w:semiHidden/>
     <w:unhideWhenUsed/>
@@ -5053,11 +4927,11 @@
       <w:color w:val="272727" w:themeColor="text1" w:themeTint="D8"/>
     </w:rPr>
   </w:style>
-  <w:style w:type="paragraph" w:styleId="Heading9">
+  <w:style w:type="paragraph" w:styleId="Cmsor9">
     <w:name w:val="heading 9"/>
-    <w:basedOn w:val="Normal"/>
-    <w:next w:val="Normal"/>
-    <w:link w:val="Heading9Char"/>
+    <w:basedOn w:val="Norml"/>
+    <w:next w:val="Norml"/>
+    <w:link w:val="Cmsor9Char"/>
     <w:uiPriority w:val="9"/>
     <w:semiHidden/>
     <w:unhideWhenUsed/>
@@ -5074,13 +4948,13 @@
       <w:color w:val="272727" w:themeColor="text1" w:themeTint="D8"/>
     </w:rPr>
   </w:style>
-  <w:style w:type="character" w:default="1" w:styleId="DefaultParagraphFont">
+  <w:style w:type="character" w:default="1" w:styleId="Bekezdsalapbettpusa">
     <w:name w:val="Default Paragraph Font"/>
     <w:uiPriority w:val="1"/>
     <w:semiHidden/>
     <w:unhideWhenUsed/>
   </w:style>
-  <w:style w:type="table" w:default="1" w:styleId="TableNormal">
+  <w:style w:type="table" w:default="1" w:styleId="Normltblzat">
     <w:name w:val="Normal Table"/>
     <w:uiPriority w:val="99"/>
     <w:semiHidden/>
@@ -5095,15 +4969,15 @@
       </w:tblCellMar>
     </w:tblPr>
   </w:style>
-  <w:style w:type="numbering" w:default="1" w:styleId="NoList">
+  <w:style w:type="numbering" w:default="1" w:styleId="Nemlista">
     <w:name w:val="No List"/>
     <w:uiPriority w:val="99"/>
     <w:semiHidden/>
     <w:unhideWhenUsed/>
   </w:style>
-  <w:style w:type="character" w:customStyle="1" w:styleId="Heading1Char">
-    <w:name w:val="Heading 1 Char"/>
-    <w:link w:val="Heading1"/>
+  <w:style w:type="character" w:customStyle="1" w:styleId="Cmsor1Char">
+    <w:name w:val="Címsor 1 Char"/>
+    <w:link w:val="Cmsor1"/>
     <w:uiPriority w:val="9"/>
     <w:rsid w:val="38171242"/>
     <w:rPr>
@@ -5113,9 +4987,9 @@
       <w:szCs w:val="40"/>
     </w:rPr>
   </w:style>
-  <w:style w:type="character" w:customStyle="1" w:styleId="Heading2Char">
-    <w:name w:val="Heading 2 Char"/>
-    <w:link w:val="Heading2"/>
+  <w:style w:type="character" w:customStyle="1" w:styleId="Cmsor2Char">
+    <w:name w:val="Címsor 2 Char"/>
+    <w:link w:val="Cmsor2"/>
     <w:uiPriority w:val="9"/>
     <w:semiHidden/>
     <w:rsid w:val="38171242"/>
@@ -5126,9 +5000,9 @@
       <w:szCs w:val="32"/>
     </w:rPr>
   </w:style>
-  <w:style w:type="character" w:customStyle="1" w:styleId="Heading3Char">
-    <w:name w:val="Heading 3 Char"/>
-    <w:link w:val="Heading3"/>
+  <w:style w:type="character" w:customStyle="1" w:styleId="Cmsor3Char">
+    <w:name w:val="Címsor 3 Char"/>
+    <w:link w:val="Cmsor3"/>
     <w:uiPriority w:val="9"/>
     <w:semiHidden/>
     <w:rsid w:val="38171242"/>
@@ -5139,9 +5013,9 @@
       <w:szCs w:val="28"/>
     </w:rPr>
   </w:style>
-  <w:style w:type="character" w:customStyle="1" w:styleId="Heading4Char">
-    <w:name w:val="Heading 4 Char"/>
-    <w:link w:val="Heading4"/>
+  <w:style w:type="character" w:customStyle="1" w:styleId="Cmsor4Char">
+    <w:name w:val="Címsor 4 Char"/>
+    <w:link w:val="Cmsor4"/>
     <w:uiPriority w:val="9"/>
     <w:semiHidden/>
     <w:rsid w:val="38171242"/>
@@ -5152,9 +5026,9 @@
       <w:color w:val="0F4761" w:themeColor="accent1" w:themeShade="BF"/>
     </w:rPr>
   </w:style>
-  <w:style w:type="character" w:customStyle="1" w:styleId="Heading5Char">
-    <w:name w:val="Heading 5 Char"/>
-    <w:link w:val="Heading5"/>
+  <w:style w:type="character" w:customStyle="1" w:styleId="Cmsor5Char">
+    <w:name w:val="Címsor 5 Char"/>
+    <w:link w:val="Cmsor5"/>
     <w:uiPriority w:val="9"/>
     <w:semiHidden/>
     <w:rsid w:val="38171242"/>
@@ -5163,9 +5037,9 @@
       <w:color w:val="0F4761" w:themeColor="accent1" w:themeShade="BF"/>
     </w:rPr>
   </w:style>
-  <w:style w:type="character" w:customStyle="1" w:styleId="Heading6Char">
-    <w:name w:val="Heading 6 Char"/>
-    <w:link w:val="Heading6"/>
+  <w:style w:type="character" w:customStyle="1" w:styleId="Cmsor6Char">
+    <w:name w:val="Címsor 6 Char"/>
+    <w:link w:val="Cmsor6"/>
     <w:uiPriority w:val="9"/>
     <w:semiHidden/>
     <w:rsid w:val="38171242"/>
@@ -5176,9 +5050,9 @@
       <w:color w:val="595959" w:themeColor="text1" w:themeTint="A6"/>
     </w:rPr>
   </w:style>
-  <w:style w:type="character" w:customStyle="1" w:styleId="Heading7Char">
-    <w:name w:val="Heading 7 Char"/>
-    <w:link w:val="Heading7"/>
+  <w:style w:type="character" w:customStyle="1" w:styleId="Cmsor7Char">
+    <w:name w:val="Címsor 7 Char"/>
+    <w:link w:val="Cmsor7"/>
     <w:uiPriority w:val="9"/>
     <w:semiHidden/>
     <w:rsid w:val="38171242"/>
@@ -5187,9 +5061,9 @@
       <w:color w:val="595959" w:themeColor="text1" w:themeTint="A6"/>
     </w:rPr>
   </w:style>
-  <w:style w:type="character" w:customStyle="1" w:styleId="Heading8Char">
-    <w:name w:val="Heading 8 Char"/>
-    <w:link w:val="Heading8"/>
+  <w:style w:type="character" w:customStyle="1" w:styleId="Cmsor8Char">
+    <w:name w:val="Címsor 8 Char"/>
+    <w:link w:val="Cmsor8"/>
     <w:uiPriority w:val="9"/>
     <w:semiHidden/>
     <w:rsid w:val="38171242"/>
@@ -5200,9 +5074,9 @@
       <w:color w:val="272727"/>
     </w:rPr>
   </w:style>
-  <w:style w:type="character" w:customStyle="1" w:styleId="Heading9Char">
-    <w:name w:val="Heading 9 Char"/>
-    <w:link w:val="Heading9"/>
+  <w:style w:type="character" w:customStyle="1" w:styleId="Cmsor9Char">
+    <w:name w:val="Címsor 9 Char"/>
+    <w:link w:val="Cmsor9"/>
     <w:uiPriority w:val="9"/>
     <w:semiHidden/>
     <w:rsid w:val="38171242"/>
@@ -5211,11 +5085,11 @@
       <w:color w:val="272727"/>
     </w:rPr>
   </w:style>
-  <w:style w:type="paragraph" w:styleId="Title">
+  <w:style w:type="paragraph" w:styleId="Cm">
     <w:name w:val="Title"/>
-    <w:basedOn w:val="Normal"/>
-    <w:next w:val="Normal"/>
-    <w:link w:val="TitleChar"/>
+    <w:basedOn w:val="Norml"/>
+    <w:next w:val="Norml"/>
+    <w:link w:val="CmChar"/>
     <w:uiPriority w:val="10"/>
     <w:qFormat/>
     <w:rsid w:val="0005104C"/>
@@ -5231,9 +5105,9 @@
       <w:szCs w:val="56"/>
     </w:rPr>
   </w:style>
-  <w:style w:type="character" w:customStyle="1" w:styleId="TitleChar">
-    <w:name w:val="Title Char"/>
-    <w:link w:val="Title"/>
+  <w:style w:type="character" w:customStyle="1" w:styleId="CmChar">
+    <w:name w:val="Cím Char"/>
+    <w:link w:val="Cm"/>
     <w:uiPriority w:val="10"/>
     <w:rsid w:val="38171242"/>
     <w:rPr>
@@ -5242,11 +5116,11 @@
       <w:szCs w:val="56"/>
     </w:rPr>
   </w:style>
-  <w:style w:type="paragraph" w:styleId="Subtitle">
+  <w:style w:type="paragraph" w:styleId="Alcm">
     <w:name w:val="Subtitle"/>
-    <w:basedOn w:val="Normal"/>
-    <w:next w:val="Normal"/>
-    <w:link w:val="SubtitleChar"/>
+    <w:basedOn w:val="Norml"/>
+    <w:next w:val="Norml"/>
+    <w:link w:val="AlcmChar"/>
     <w:uiPriority w:val="11"/>
     <w:qFormat/>
     <w:rsid w:val="0005104C"/>
@@ -5263,9 +5137,9 @@
       <w:szCs w:val="28"/>
     </w:rPr>
   </w:style>
-  <w:style w:type="character" w:customStyle="1" w:styleId="SubtitleChar">
-    <w:name w:val="Subtitle Char"/>
-    <w:link w:val="Subtitle"/>
+  <w:style w:type="character" w:customStyle="1" w:styleId="AlcmChar">
+    <w:name w:val="Alcím Char"/>
+    <w:link w:val="Alcm"/>
     <w:uiPriority w:val="11"/>
     <w:rsid w:val="38171242"/>
     <w:rPr>
@@ -5275,11 +5149,11 @@
       <w:szCs w:val="28"/>
     </w:rPr>
   </w:style>
-  <w:style w:type="paragraph" w:styleId="Quote">
+  <w:style w:type="paragraph" w:styleId="Idzet">
     <w:name w:val="Quote"/>
-    <w:basedOn w:val="Normal"/>
-    <w:next w:val="Normal"/>
-    <w:link w:val="QuoteChar"/>
+    <w:basedOn w:val="Norml"/>
+    <w:next w:val="Norml"/>
+    <w:link w:val="IdzetChar"/>
     <w:uiPriority w:val="29"/>
     <w:qFormat/>
     <w:rsid w:val="0005104C"/>
@@ -5293,9 +5167,9 @@
       <w:color w:val="404040" w:themeColor="text1" w:themeTint="BF"/>
     </w:rPr>
   </w:style>
-  <w:style w:type="character" w:customStyle="1" w:styleId="QuoteChar">
-    <w:name w:val="Quote Char"/>
-    <w:link w:val="Quote"/>
+  <w:style w:type="character" w:customStyle="1" w:styleId="IdzetChar">
+    <w:name w:val="Idézet Char"/>
+    <w:link w:val="Idzet"/>
     <w:uiPriority w:val="29"/>
     <w:rsid w:val="38171242"/>
     <w:rPr>
@@ -5304,9 +5178,9 @@
       <w:color w:val="404040" w:themeColor="text1" w:themeTint="BF"/>
     </w:rPr>
   </w:style>
-  <w:style w:type="paragraph" w:styleId="ListParagraph">
+  <w:style w:type="paragraph" w:styleId="Listaszerbekezds">
     <w:name w:val="List Paragraph"/>
-    <w:basedOn w:val="Normal"/>
+    <w:basedOn w:val="Norml"/>
     <w:uiPriority w:val="34"/>
     <w:qFormat/>
     <w:rsid w:val="0005104C"/>
@@ -5315,7 +5189,7 @@
       <w:contextualSpacing/>
     </w:pPr>
   </w:style>
-  <w:style w:type="character" w:styleId="IntenseEmphasis">
+  <w:style w:type="character" w:styleId="Erskiemels">
     <w:name w:val="Intense Emphasis"/>
     <w:uiPriority w:val="21"/>
     <w:qFormat/>
@@ -5326,11 +5200,11 @@
       <w:color w:val="0F4761" w:themeColor="accent1" w:themeShade="BF"/>
     </w:rPr>
   </w:style>
-  <w:style w:type="paragraph" w:styleId="IntenseQuote">
+  <w:style w:type="paragraph" w:styleId="Kiemeltidzet">
     <w:name w:val="Intense Quote"/>
-    <w:basedOn w:val="Normal"/>
-    <w:next w:val="Normal"/>
-    <w:link w:val="IntenseQuoteChar"/>
+    <w:basedOn w:val="Norml"/>
+    <w:next w:val="Norml"/>
+    <w:link w:val="KiemeltidzetChar"/>
     <w:uiPriority w:val="30"/>
     <w:qFormat/>
     <w:rsid w:val="0005104C"/>
@@ -5349,9 +5223,9 @@
       <w:color w:val="0F4761" w:themeColor="accent1" w:themeShade="BF"/>
     </w:rPr>
   </w:style>
-  <w:style w:type="character" w:customStyle="1" w:styleId="IntenseQuoteChar">
-    <w:name w:val="Intense Quote Char"/>
-    <w:link w:val="IntenseQuote"/>
+  <w:style w:type="character" w:customStyle="1" w:styleId="KiemeltidzetChar">
+    <w:name w:val="Kiemelt idézet Char"/>
+    <w:link w:val="Kiemeltidzet"/>
     <w:uiPriority w:val="30"/>
     <w:rsid w:val="38171242"/>
     <w:rPr>
@@ -5360,7 +5234,7 @@
       <w:color w:val="0F4761" w:themeColor="accent1" w:themeShade="BF"/>
     </w:rPr>
   </w:style>
-  <w:style w:type="character" w:styleId="IntenseReference">
+  <w:style w:type="character" w:styleId="Ershivatkozs">
     <w:name w:val="Intense Reference"/>
     <w:uiPriority w:val="32"/>
     <w:qFormat/>
@@ -5372,7 +5246,7 @@
       <w:color w:val="0F4761" w:themeColor="accent1" w:themeShade="BF"/>
     </w:rPr>
   </w:style>
-  <w:style w:type="character" w:styleId="Hyperlink">
+  <w:style w:type="character" w:styleId="Hiperhivatkozs">
     <w:name w:val="Hyperlink"/>
     <w:uiPriority w:val="99"/>
     <w:unhideWhenUsed/>
@@ -5382,9 +5256,9 @@
       <w:u w:val="single"/>
     </w:rPr>
   </w:style>
-  <w:style w:type="paragraph" w:styleId="NormalWeb">
+  <w:style w:type="paragraph" w:styleId="NormlWeb">
     <w:name w:val="Normal (Web)"/>
-    <w:basedOn w:val="Normal"/>
+    <w:basedOn w:val="Norml"/>
     <w:uiPriority w:val="99"/>
     <w:semiHidden/>
     <w:unhideWhenUsed/>

</xml_diff>

<commit_message>
Making the logo off the application (+documentatopn update)
</commit_message>
<xml_diff>
--- a/documentation.docx
+++ b/documentation.docx
@@ -40,29 +40,27 @@
           <w:sz w:val="40"/>
           <w:szCs w:val="40"/>
         </w:rPr>
-        <w:t xml:space="preserve">Alkalmazás neve: </w:t>
-      </w:r>
-      <w:proofErr w:type="spellStart"/>
-      <w:r>
+        <w:t>Alkalmazás neve: BláthyFM</w:t>
+      </w:r>
+    </w:p>
+    <w:p>
+      <w:pPr>
         <w:rPr>
           <w:rFonts w:ascii="Times New Roman" w:hAnsi="Times New Roman" w:cs="Times New Roman"/>
           <w:bCs/>
           <w:sz w:val="40"/>
           <w:szCs w:val="40"/>
         </w:rPr>
-        <w:t>BláthyFM</w:t>
-      </w:r>
-      <w:proofErr w:type="spellEnd"/>
-    </w:p>
-    <w:p>
-      <w:pPr>
+      </w:pPr>
+      <w:r>
         <w:rPr>
           <w:rFonts w:ascii="Times New Roman" w:hAnsi="Times New Roman" w:cs="Times New Roman"/>
           <w:bCs/>
           <w:sz w:val="40"/>
           <w:szCs w:val="40"/>
         </w:rPr>
-      </w:pPr>
+        <w:t>Tagok:</w:t>
+      </w:r>
       <w:r>
         <w:rPr>
           <w:rFonts w:ascii="Times New Roman" w:hAnsi="Times New Roman" w:cs="Times New Roman"/>
@@ -70,18 +68,18 @@
           <w:sz w:val="40"/>
           <w:szCs w:val="40"/>
         </w:rPr>
-        <w:t>Tagok:</w:t>
-      </w:r>
-      <w:r>
+        <w:t xml:space="preserve"> Susán Csongor, El-Nabulsy Csongor Alan</w:t>
+      </w:r>
+    </w:p>
+    <w:p>
+      <w:pPr>
         <w:rPr>
           <w:rFonts w:ascii="Times New Roman" w:hAnsi="Times New Roman" w:cs="Times New Roman"/>
           <w:bCs/>
           <w:sz w:val="40"/>
           <w:szCs w:val="40"/>
         </w:rPr>
-        <w:t xml:space="preserve"> Susán Csongor, El-</w:t>
-      </w:r>
-      <w:proofErr w:type="spellStart"/>
+      </w:pPr>
       <w:r>
         <w:rPr>
           <w:rFonts w:ascii="Times New Roman" w:hAnsi="Times New Roman" w:cs="Times New Roman"/>
@@ -89,56 +87,7 @@
           <w:sz w:val="40"/>
           <w:szCs w:val="40"/>
         </w:rPr>
-        <w:t>Nabulsy</w:t>
-      </w:r>
-      <w:proofErr w:type="spellEnd"/>
-      <w:r>
-        <w:rPr>
-          <w:rFonts w:ascii="Times New Roman" w:hAnsi="Times New Roman" w:cs="Times New Roman"/>
-          <w:bCs/>
-          <w:sz w:val="40"/>
-          <w:szCs w:val="40"/>
-        </w:rPr>
-        <w:t xml:space="preserve"> Csongor Alan</w:t>
-      </w:r>
-    </w:p>
-    <w:p>
-      <w:pPr>
-        <w:rPr>
-          <w:rFonts w:ascii="Times New Roman" w:hAnsi="Times New Roman" w:cs="Times New Roman"/>
-          <w:bCs/>
-          <w:sz w:val="40"/>
-          <w:szCs w:val="40"/>
-        </w:rPr>
-      </w:pPr>
-      <w:r>
-        <w:rPr>
-          <w:rFonts w:ascii="Times New Roman" w:hAnsi="Times New Roman" w:cs="Times New Roman"/>
-          <w:bCs/>
-          <w:sz w:val="40"/>
-          <w:szCs w:val="40"/>
-        </w:rPr>
-        <w:t>Az alkalmazás célja az, hogy a Bláthy-</w:t>
-      </w:r>
-      <w:proofErr w:type="spellStart"/>
-      <w:r>
-        <w:rPr>
-          <w:rFonts w:ascii="Times New Roman" w:hAnsi="Times New Roman" w:cs="Times New Roman"/>
-          <w:bCs/>
-          <w:sz w:val="40"/>
-          <w:szCs w:val="40"/>
-        </w:rPr>
-        <w:t>ba</w:t>
-      </w:r>
-      <w:proofErr w:type="spellEnd"/>
-      <w:r>
-        <w:rPr>
-          <w:rFonts w:ascii="Times New Roman" w:hAnsi="Times New Roman" w:cs="Times New Roman"/>
-          <w:bCs/>
-          <w:sz w:val="40"/>
-          <w:szCs w:val="40"/>
-        </w:rPr>
-        <w:t xml:space="preserve"> járó diákok előre meghatározott szünetekben kedvenc zenéjüket tudják majd hallgatni anélkül, hogy nekik kelljen azt maguknak vagy másoknak lejátszani. Ráadásul az, hogy az iskola az ő zenéjüket játssza, akár egy általuk kijelölt időpontban (ezt üzenetben írhatják le), még több élményt ad, és azt az érzést, hogy a zenéjük – és ezzel együtt önmaguk is – meg van becsülve.</w:t>
+        <w:t>Az alkalmazás célja az, hogy a Bláthy-ba járó diákok előre meghatározott szünetekben kedvenc zenéjüket tudják majd hallgatni anélkül, hogy nekik kelljen azt maguknak vagy másoknak lejátszani. Ráadásul az, hogy az iskola az ő zenéjüket játssza, akár egy általuk kijelölt időpontban (ezt üzenetben írhatják le), még több élményt ad, és azt az érzést, hogy a zenéjük – és ezzel együtt önmaguk is – meg van becsülve.</w:t>
       </w:r>
     </w:p>
     <w:p>
@@ -621,25 +570,7 @@
           <w:sz w:val="36"/>
           <w:szCs w:val="36"/>
         </w:rPr>
-        <w:t xml:space="preserve">Az alkalmazás fejlesztését tartalmazó dokumentáció elkezdése, vizsgafeltételek tanulmányozása, a projektet tároló </w:t>
-      </w:r>
-      <w:proofErr w:type="spellStart"/>
-      <w:r>
-        <w:rPr>
-          <w:rFonts w:ascii="Times New Roman" w:hAnsi="Times New Roman" w:cs="Times New Roman"/>
-          <w:sz w:val="36"/>
-          <w:szCs w:val="36"/>
-        </w:rPr>
-        <w:t>repository</w:t>
-      </w:r>
-      <w:proofErr w:type="spellEnd"/>
-      <w:r>
-        <w:rPr>
-          <w:rFonts w:ascii="Times New Roman" w:hAnsi="Times New Roman" w:cs="Times New Roman"/>
-          <w:sz w:val="36"/>
-          <w:szCs w:val="36"/>
-        </w:rPr>
-        <w:t xml:space="preserve"> létrehozása, teszteknek külön dokumentáció létrehozása.</w:t>
+        <w:t>Az alkalmazás fejlesztését tartalmazó dokumentáció elkezdése, vizsgafeltételek tanulmányozása, a projektet tároló repository létrehozása, teszteknek külön dokumentáció létrehozása.</w:t>
       </w:r>
     </w:p>
     <w:p/>
@@ -1308,7 +1239,7 @@
           <w:szCs w:val="36"/>
         </w:rPr>
         <w:drawing>
-          <wp:inline distT="0" distB="0" distL="0" distR="0" wp14:anchorId="78A43544" wp14:editId="5279A085">
+          <wp:inline distT="0" distB="0" distL="0" distR="0" wp14:anchorId="78A43544" wp14:editId="22211031">
             <wp:extent cx="3166535" cy="1781175"/>
             <wp:effectExtent l="0" t="0" r="0" b="0"/>
             <wp:docPr id="3" name="Kép 3" descr="C:\Users\elnabulsy.csongor\AppData\Local\Microsoft\Windows\INetCache\Content.MSO\F75754B3.tmp"/>
@@ -1400,7 +1331,7 @@
           <w:szCs w:val="36"/>
         </w:rPr>
         <w:drawing>
-          <wp:inline distT="0" distB="0" distL="0" distR="0" wp14:anchorId="4E211814" wp14:editId="477AF0ED">
+          <wp:inline distT="0" distB="0" distL="0" distR="0" wp14:anchorId="4E211814" wp14:editId="51576DED">
             <wp:extent cx="3133725" cy="1762720"/>
             <wp:effectExtent l="0" t="0" r="0" b="9525"/>
             <wp:docPr id="4" name="Kép 4" descr="C:\Users\elnabulsy.csongor\Downloads\ui_main_student.png"/>
@@ -1482,7 +1413,7 @@
           <w:szCs w:val="36"/>
         </w:rPr>
         <w:drawing>
-          <wp:inline distT="0" distB="0" distL="0" distR="0" wp14:anchorId="5137FB78" wp14:editId="051D1352">
+          <wp:inline distT="0" distB="0" distL="0" distR="0" wp14:anchorId="5137FB78" wp14:editId="639E7766">
             <wp:extent cx="3166110" cy="1780938"/>
             <wp:effectExtent l="0" t="0" r="0" b="0"/>
             <wp:docPr id="5" name="Kép 5" descr="C:\Users\elnabulsy.csongor\Downloads\ui_main_scheduler.png"/>
@@ -1545,25 +1476,7 @@
           <w:sz w:val="36"/>
           <w:szCs w:val="36"/>
         </w:rPr>
-        <w:t xml:space="preserve">Főképernyő </w:t>
-      </w:r>
-      <w:proofErr w:type="spellStart"/>
-      <w:r>
-        <w:rPr>
-          <w:rFonts w:ascii="Times New Roman" w:eastAsia="Times New Roman" w:hAnsi="Times New Roman" w:cs="Times New Roman"/>
-          <w:sz w:val="36"/>
-          <w:szCs w:val="36"/>
-        </w:rPr>
-        <w:t>admin</w:t>
-      </w:r>
-      <w:proofErr w:type="spellEnd"/>
-      <w:r>
-        <w:rPr>
-          <w:rFonts w:ascii="Times New Roman" w:eastAsia="Times New Roman" w:hAnsi="Times New Roman" w:cs="Times New Roman"/>
-          <w:sz w:val="36"/>
-          <w:szCs w:val="36"/>
-        </w:rPr>
-        <w:t xml:space="preserve"> ranggal:</w:t>
+        <w:t>Főképernyő admin ranggal:</w:t>
       </w:r>
     </w:p>
     <w:p>
@@ -1593,7 +1506,7 @@
           <w:szCs w:val="36"/>
         </w:rPr>
         <w:drawing>
-          <wp:inline distT="0" distB="0" distL="0" distR="0" wp14:anchorId="27EC1C67" wp14:editId="44EAF746">
+          <wp:inline distT="0" distB="0" distL="0" distR="0" wp14:anchorId="27EC1C67" wp14:editId="5DFA3A61">
             <wp:extent cx="3055620" cy="1718786"/>
             <wp:effectExtent l="0" t="0" r="0" b="0"/>
             <wp:docPr id="6" name="Kép 6" descr="C:\Users\elnabulsy.csongor\Downloads\ui_main_admin.png"/>
@@ -1675,7 +1588,7 @@
           <w:szCs w:val="36"/>
         </w:rPr>
         <w:drawing>
-          <wp:inline distT="0" distB="0" distL="0" distR="0" wp14:anchorId="08225B4F" wp14:editId="11B0C10E">
+          <wp:inline distT="0" distB="0" distL="0" distR="0" wp14:anchorId="08225B4F" wp14:editId="4BBE48C3">
             <wp:extent cx="2933700" cy="1942430"/>
             <wp:effectExtent l="0" t="0" r="0" b="1270"/>
             <wp:docPr id="7" name="Kép 7" descr="C:\Users\elnabulsy.csongor\Downloads\ui_structure.png"/>
@@ -1848,7 +1761,7 @@
           <w:szCs w:val="36"/>
         </w:rPr>
         <w:drawing>
-          <wp:inline distT="0" distB="0" distL="0" distR="0" wp14:anchorId="2C256DB5" wp14:editId="5DC2B543">
+          <wp:inline distT="0" distB="0" distL="0" distR="0" wp14:anchorId="2C256DB5" wp14:editId="3430B5E1">
             <wp:extent cx="3329940" cy="1752493"/>
             <wp:effectExtent l="0" t="0" r="3810" b="635"/>
             <wp:docPr id="9" name="Kép 9"/>
@@ -2019,25 +1932,7 @@
           <w:sz w:val="36"/>
           <w:szCs w:val="36"/>
         </w:rPr>
-        <w:t xml:space="preserve">Az </w:t>
-      </w:r>
-      <w:proofErr w:type="spellStart"/>
-      <w:r>
-        <w:rPr>
-          <w:rFonts w:ascii="Times New Roman" w:eastAsia="Times New Roman" w:hAnsi="Times New Roman" w:cs="Times New Roman"/>
-          <w:sz w:val="36"/>
-          <w:szCs w:val="36"/>
-        </w:rPr>
-        <w:t>admin</w:t>
-      </w:r>
-      <w:proofErr w:type="spellEnd"/>
-      <w:r>
-        <w:rPr>
-          <w:rFonts w:ascii="Times New Roman" w:eastAsia="Times New Roman" w:hAnsi="Times New Roman" w:cs="Times New Roman"/>
-          <w:sz w:val="36"/>
-          <w:szCs w:val="36"/>
-        </w:rPr>
-        <w:t xml:space="preserve"> UI oldal megtervezése digitális </w:t>
+        <w:t xml:space="preserve">Az admin UI oldal megtervezése digitális </w:t>
       </w:r>
       <w:r>
         <w:rPr>
@@ -2092,23 +1987,13 @@
           <w:szCs w:val="36"/>
         </w:rPr>
       </w:pPr>
-      <w:proofErr w:type="spellStart"/>
-      <w:r>
-        <w:rPr>
-          <w:rFonts w:ascii="Times New Roman" w:eastAsia="Times New Roman" w:hAnsi="Times New Roman" w:cs="Times New Roman"/>
-          <w:sz w:val="36"/>
-          <w:szCs w:val="36"/>
-        </w:rPr>
-        <w:t>Admin</w:t>
-      </w:r>
-      <w:proofErr w:type="spellEnd"/>
-      <w:r>
-        <w:rPr>
-          <w:rFonts w:ascii="Times New Roman" w:eastAsia="Times New Roman" w:hAnsi="Times New Roman" w:cs="Times New Roman"/>
-          <w:sz w:val="36"/>
-          <w:szCs w:val="36"/>
-        </w:rPr>
-        <w:t xml:space="preserve"> oldal:</w:t>
+      <w:r>
+        <w:rPr>
+          <w:rFonts w:ascii="Times New Roman" w:eastAsia="Times New Roman" w:hAnsi="Times New Roman" w:cs="Times New Roman"/>
+          <w:sz w:val="36"/>
+          <w:szCs w:val="36"/>
+        </w:rPr>
+        <w:t>Admin oldal:</w:t>
       </w:r>
     </w:p>
     <w:p>
@@ -2341,42 +2226,15 @@
           <w:sz w:val="36"/>
           <w:szCs w:val="36"/>
         </w:rPr>
-        <w:t xml:space="preserve">, </w:t>
-      </w:r>
-      <w:proofErr w:type="spellStart"/>
-      <w:r>
-        <w:rPr>
-          <w:rFonts w:ascii="Times New Roman" w:eastAsia="Times New Roman" w:hAnsi="Times New Roman" w:cs="Times New Roman"/>
-          <w:sz w:val="36"/>
-          <w:szCs w:val="36"/>
-        </w:rPr>
-        <w:t>Vue</w:t>
-      </w:r>
-      <w:proofErr w:type="spellEnd"/>
-      <w:r>
-        <w:rPr>
-          <w:rFonts w:ascii="Times New Roman" w:eastAsia="Times New Roman" w:hAnsi="Times New Roman" w:cs="Times New Roman"/>
-          <w:sz w:val="36"/>
-          <w:szCs w:val="36"/>
-        </w:rPr>
-        <w:t xml:space="preserve"> router</w:t>
-      </w:r>
-      <w:r>
-        <w:rPr>
-          <w:rFonts w:ascii="Times New Roman" w:eastAsia="Times New Roman" w:hAnsi="Times New Roman" w:cs="Times New Roman"/>
-          <w:sz w:val="36"/>
-          <w:szCs w:val="36"/>
-        </w:rPr>
-        <w:t xml:space="preserve">) létrehozása </w:t>
-      </w:r>
-      <w:proofErr w:type="spellStart"/>
-      <w:r>
-        <w:rPr>
-          <w:rFonts w:ascii="Times New Roman" w:eastAsia="Times New Roman" w:hAnsi="Times New Roman" w:cs="Times New Roman"/>
-          <w:sz w:val="36"/>
-          <w:szCs w:val="36"/>
-        </w:rPr>
-        <w:t>frontend</w:t>
+        <w:t>, Vue router</w:t>
+      </w:r>
+      <w:r>
+        <w:rPr>
+          <w:rFonts w:ascii="Times New Roman" w:eastAsia="Times New Roman" w:hAnsi="Times New Roman" w:cs="Times New Roman"/>
+          <w:sz w:val="36"/>
+          <w:szCs w:val="36"/>
+        </w:rPr>
+        <w:t>) létrehozása frontend</w:t>
       </w:r>
       <w:r>
         <w:rPr>
@@ -2386,7 +2244,6 @@
         </w:rPr>
         <w:t>Part</w:t>
       </w:r>
-      <w:proofErr w:type="spellEnd"/>
       <w:r>
         <w:rPr>
           <w:rFonts w:ascii="Times New Roman" w:eastAsia="Times New Roman" w:hAnsi="Times New Roman" w:cs="Times New Roman"/>
@@ -2439,23 +2296,13 @@
           <w:szCs w:val="36"/>
         </w:rPr>
       </w:pPr>
-      <w:proofErr w:type="spellStart"/>
-      <w:r>
-        <w:rPr>
-          <w:rFonts w:ascii="Times New Roman" w:eastAsia="Times New Roman" w:hAnsi="Times New Roman" w:cs="Times New Roman"/>
-          <w:sz w:val="36"/>
-          <w:szCs w:val="36"/>
-        </w:rPr>
-        <w:t>route</w:t>
-      </w:r>
-      <w:proofErr w:type="spellEnd"/>
-      <w:r>
-        <w:rPr>
-          <w:rFonts w:ascii="Times New Roman" w:eastAsia="Times New Roman" w:hAnsi="Times New Roman" w:cs="Times New Roman"/>
-          <w:sz w:val="36"/>
-          <w:szCs w:val="36"/>
-        </w:rPr>
-        <w:t>-ok definiálása</w:t>
+      <w:r>
+        <w:rPr>
+          <w:rFonts w:ascii="Times New Roman" w:eastAsia="Times New Roman" w:hAnsi="Times New Roman" w:cs="Times New Roman"/>
+          <w:sz w:val="36"/>
+          <w:szCs w:val="36"/>
+        </w:rPr>
+        <w:t>route-ok definiálása</w:t>
       </w:r>
     </w:p>
     <w:p>
@@ -2471,34 +2318,14 @@
           <w:szCs w:val="36"/>
         </w:rPr>
       </w:pPr>
-      <w:proofErr w:type="spellStart"/>
-      <w:r>
-        <w:rPr>
-          <w:rFonts w:ascii="Times New Roman" w:eastAsia="Times New Roman" w:hAnsi="Times New Roman" w:cs="Times New Roman"/>
-          <w:sz w:val="36"/>
-          <w:szCs w:val="36"/>
-        </w:rPr>
-        <w:t>header</w:t>
-      </w:r>
-      <w:proofErr w:type="spellEnd"/>
-      <w:r>
-        <w:rPr>
-          <w:rFonts w:ascii="Times New Roman" w:eastAsia="Times New Roman" w:hAnsi="Times New Roman" w:cs="Times New Roman"/>
-          <w:sz w:val="36"/>
-          <w:szCs w:val="36"/>
-        </w:rPr>
-        <w:t xml:space="preserve"> és </w:t>
-      </w:r>
-      <w:proofErr w:type="spellStart"/>
-      <w:r>
-        <w:rPr>
-          <w:rFonts w:ascii="Times New Roman" w:eastAsia="Times New Roman" w:hAnsi="Times New Roman" w:cs="Times New Roman"/>
-          <w:sz w:val="36"/>
-          <w:szCs w:val="36"/>
-        </w:rPr>
-        <w:t>footer</w:t>
-      </w:r>
-      <w:proofErr w:type="spellEnd"/>
+      <w:r>
+        <w:rPr>
+          <w:rFonts w:ascii="Times New Roman" w:eastAsia="Times New Roman" w:hAnsi="Times New Roman" w:cs="Times New Roman"/>
+          <w:sz w:val="36"/>
+          <w:szCs w:val="36"/>
+        </w:rPr>
+        <w:t>header és footer</w:t>
+      </w:r>
       <w:r>
         <w:rPr>
           <w:rFonts w:ascii="Times New Roman" w:eastAsia="Times New Roman" w:hAnsi="Times New Roman" w:cs="Times New Roman"/>
@@ -2529,41 +2356,13 @@
           <w:szCs w:val="36"/>
         </w:rPr>
       </w:pPr>
-      <w:proofErr w:type="spellStart"/>
-      <w:r>
-        <w:rPr>
-          <w:rFonts w:ascii="Times New Roman" w:eastAsia="Times New Roman" w:hAnsi="Times New Roman" w:cs="Times New Roman"/>
-          <w:sz w:val="36"/>
-          <w:szCs w:val="36"/>
-        </w:rPr>
-        <w:t>header</w:t>
-      </w:r>
-      <w:proofErr w:type="spellEnd"/>
-      <w:r>
-        <w:rPr>
-          <w:rFonts w:ascii="Times New Roman" w:eastAsia="Times New Roman" w:hAnsi="Times New Roman" w:cs="Times New Roman"/>
-          <w:sz w:val="36"/>
-          <w:szCs w:val="36"/>
-        </w:rPr>
-        <w:t>-main-</w:t>
-      </w:r>
-      <w:proofErr w:type="spellStart"/>
-      <w:r>
-        <w:rPr>
-          <w:rFonts w:ascii="Times New Roman" w:eastAsia="Times New Roman" w:hAnsi="Times New Roman" w:cs="Times New Roman"/>
-          <w:sz w:val="36"/>
-          <w:szCs w:val="36"/>
-        </w:rPr>
-        <w:t>footer</w:t>
-      </w:r>
-      <w:proofErr w:type="spellEnd"/>
-      <w:r>
-        <w:rPr>
-          <w:rFonts w:ascii="Times New Roman" w:eastAsia="Times New Roman" w:hAnsi="Times New Roman" w:cs="Times New Roman"/>
-          <w:sz w:val="36"/>
-          <w:szCs w:val="36"/>
-        </w:rPr>
-        <w:t>-struktúra létrehozása</w:t>
+      <w:r>
+        <w:rPr>
+          <w:rFonts w:ascii="Times New Roman" w:eastAsia="Times New Roman" w:hAnsi="Times New Roman" w:cs="Times New Roman"/>
+          <w:sz w:val="36"/>
+          <w:szCs w:val="36"/>
+        </w:rPr>
+        <w:t>header-main-footer-struktúra létrehozása</w:t>
       </w:r>
     </w:p>
     <w:p>
@@ -2602,25 +2401,7 @@
           <w:sz w:val="36"/>
           <w:szCs w:val="36"/>
         </w:rPr>
-        <w:t>A projektet El-</w:t>
-      </w:r>
-      <w:proofErr w:type="spellStart"/>
-      <w:r>
-        <w:rPr>
-          <w:rFonts w:ascii="Times New Roman" w:eastAsia="Times New Roman" w:hAnsi="Times New Roman" w:cs="Times New Roman"/>
-          <w:sz w:val="36"/>
-          <w:szCs w:val="36"/>
-        </w:rPr>
-        <w:t>Nabulsy</w:t>
-      </w:r>
-      <w:proofErr w:type="spellEnd"/>
-      <w:r>
-        <w:rPr>
-          <w:rFonts w:ascii="Times New Roman" w:eastAsia="Times New Roman" w:hAnsi="Times New Roman" w:cs="Times New Roman"/>
-          <w:sz w:val="36"/>
-          <w:szCs w:val="36"/>
-        </w:rPr>
-        <w:t xml:space="preserve"> Csongor hozta létre és írta meg a kódját, a működéshez szükséges folyamatábrákat, az adatbázis ER-diagramját</w:t>
+        <w:t>A projektet El-Nabulsy Csongor hozta létre és írta meg a kódját, a működéshez szükséges folyamatábrákat, az adatbázis ER-diagramját</w:t>
       </w:r>
       <w:r>
         <w:rPr>
@@ -2713,25 +2494,7 @@
           <w:sz w:val="36"/>
           <w:szCs w:val="36"/>
         </w:rPr>
-        <w:t xml:space="preserve">(Susán Csongor) A </w:t>
-      </w:r>
-      <w:proofErr w:type="spellStart"/>
-      <w:r>
-        <w:rPr>
-          <w:rFonts w:ascii="Times New Roman" w:eastAsia="Times New Roman" w:hAnsi="Times New Roman" w:cs="Times New Roman"/>
-          <w:sz w:val="36"/>
-          <w:szCs w:val="36"/>
-        </w:rPr>
-        <w:t>frontendPart</w:t>
-      </w:r>
-      <w:proofErr w:type="spellEnd"/>
-      <w:r>
-        <w:rPr>
-          <w:rFonts w:ascii="Times New Roman" w:eastAsia="Times New Roman" w:hAnsi="Times New Roman" w:cs="Times New Roman"/>
-          <w:sz w:val="36"/>
-          <w:szCs w:val="36"/>
-        </w:rPr>
-        <w:t xml:space="preserve"> projekt átnézése, stílus hi</w:t>
+        <w:t>(Susán Csongor) A frontendPart projekt átnézése, stílus hi</w:t>
       </w:r>
       <w:r>
         <w:rPr>
@@ -2857,25 +2620,7 @@
           <w:sz w:val="36"/>
           <w:szCs w:val="36"/>
         </w:rPr>
-        <w:t>(El-</w:t>
-      </w:r>
-      <w:proofErr w:type="spellStart"/>
-      <w:r>
-        <w:rPr>
-          <w:rFonts w:ascii="Times New Roman" w:eastAsia="Times New Roman" w:hAnsi="Times New Roman" w:cs="Times New Roman"/>
-          <w:sz w:val="36"/>
-          <w:szCs w:val="36"/>
-        </w:rPr>
-        <w:t>Nabulsy</w:t>
-      </w:r>
-      <w:proofErr w:type="spellEnd"/>
-      <w:r>
-        <w:rPr>
-          <w:rFonts w:ascii="Times New Roman" w:eastAsia="Times New Roman" w:hAnsi="Times New Roman" w:cs="Times New Roman"/>
-          <w:sz w:val="36"/>
-          <w:szCs w:val="36"/>
-        </w:rPr>
-        <w:t xml:space="preserve"> Csongor Alan</w:t>
+        <w:t>(El-Nabulsy Csongor Alan</w:t>
       </w:r>
       <w:r>
         <w:rPr>
@@ -2899,25 +2644,7 @@
           <w:sz w:val="36"/>
           <w:szCs w:val="36"/>
         </w:rPr>
-        <w:t xml:space="preserve"> (El-</w:t>
-      </w:r>
-      <w:proofErr w:type="spellStart"/>
-      <w:r>
-        <w:rPr>
-          <w:rFonts w:ascii="Times New Roman" w:eastAsia="Times New Roman" w:hAnsi="Times New Roman" w:cs="Times New Roman"/>
-          <w:sz w:val="36"/>
-          <w:szCs w:val="36"/>
-        </w:rPr>
-        <w:t>Nabulsy</w:t>
-      </w:r>
-      <w:proofErr w:type="spellEnd"/>
-      <w:r>
-        <w:rPr>
-          <w:rFonts w:ascii="Times New Roman" w:eastAsia="Times New Roman" w:hAnsi="Times New Roman" w:cs="Times New Roman"/>
-          <w:sz w:val="36"/>
-          <w:szCs w:val="36"/>
-        </w:rPr>
-        <w:t xml:space="preserve">: főoldal és annak </w:t>
+        <w:t xml:space="preserve"> (El-Nabulsy: főoldal és annak </w:t>
       </w:r>
       <w:r>
         <w:rPr>
@@ -2933,25 +2660,7 @@
           <w:sz w:val="36"/>
           <w:szCs w:val="36"/>
         </w:rPr>
-        <w:t xml:space="preserve">variánsa, Susán: login befejezése és </w:t>
-      </w:r>
-      <w:proofErr w:type="spellStart"/>
-      <w:r>
-        <w:rPr>
-          <w:rFonts w:ascii="Times New Roman" w:eastAsia="Times New Roman" w:hAnsi="Times New Roman" w:cs="Times New Roman"/>
-          <w:sz w:val="36"/>
-          <w:szCs w:val="36"/>
-        </w:rPr>
-        <w:t>admin</w:t>
-      </w:r>
-      <w:proofErr w:type="spellEnd"/>
-      <w:r>
-        <w:rPr>
-          <w:rFonts w:ascii="Times New Roman" w:eastAsia="Times New Roman" w:hAnsi="Times New Roman" w:cs="Times New Roman"/>
-          <w:sz w:val="36"/>
-          <w:szCs w:val="36"/>
-        </w:rPr>
-        <w:t xml:space="preserve"> elkezdése, valamint a logika kidolgozásának megkezdése</w:t>
+        <w:t>variánsa, Susán: login befejezése és admin elkezdése, valamint a logika kidolgozásának megkezdése</w:t>
       </w:r>
       <w:r>
         <w:rPr>
@@ -3015,25 +2724,7 @@
           <w:sz w:val="36"/>
           <w:szCs w:val="36"/>
         </w:rPr>
-        <w:t>(El-</w:t>
-      </w:r>
-      <w:proofErr w:type="spellStart"/>
-      <w:r>
-        <w:rPr>
-          <w:rFonts w:ascii="Times New Roman" w:eastAsia="Times New Roman" w:hAnsi="Times New Roman" w:cs="Times New Roman"/>
-          <w:sz w:val="36"/>
-          <w:szCs w:val="36"/>
-        </w:rPr>
-        <w:t>Nabulsy</w:t>
-      </w:r>
-      <w:proofErr w:type="spellEnd"/>
-      <w:r>
-        <w:rPr>
-          <w:rFonts w:ascii="Times New Roman" w:eastAsia="Times New Roman" w:hAnsi="Times New Roman" w:cs="Times New Roman"/>
-          <w:sz w:val="36"/>
-          <w:szCs w:val="36"/>
-        </w:rPr>
-        <w:t xml:space="preserve"> Csongor Alan) A zenebekérő oldal </w:t>
+        <w:t xml:space="preserve">(El-Nabulsy Csongor Alan) A zenebekérő oldal </w:t>
       </w:r>
       <w:r>
         <w:rPr>
@@ -3096,79 +2787,7 @@
           <w:sz w:val="36"/>
           <w:szCs w:val="36"/>
         </w:rPr>
-        <w:t>(El-</w:t>
-      </w:r>
-      <w:proofErr w:type="spellStart"/>
-      <w:r>
-        <w:rPr>
-          <w:rFonts w:ascii="Times New Roman" w:eastAsia="Times New Roman" w:hAnsi="Times New Roman" w:cs="Times New Roman"/>
-          <w:sz w:val="36"/>
-          <w:szCs w:val="36"/>
-        </w:rPr>
-        <w:t>Nabulsy</w:t>
-      </w:r>
-      <w:proofErr w:type="spellEnd"/>
-      <w:r>
-        <w:rPr>
-          <w:rFonts w:ascii="Times New Roman" w:eastAsia="Times New Roman" w:hAnsi="Times New Roman" w:cs="Times New Roman"/>
-          <w:sz w:val="36"/>
-          <w:szCs w:val="36"/>
-        </w:rPr>
-        <w:t xml:space="preserve"> Csongor Alan) Főbb nézetek(</w:t>
-      </w:r>
-      <w:proofErr w:type="spellStart"/>
-      <w:r>
-        <w:rPr>
-          <w:rFonts w:ascii="Times New Roman" w:eastAsia="Times New Roman" w:hAnsi="Times New Roman" w:cs="Times New Roman"/>
-          <w:sz w:val="36"/>
-          <w:szCs w:val="36"/>
-        </w:rPr>
-        <w:t>HomeView</w:t>
-      </w:r>
-      <w:proofErr w:type="spellEnd"/>
-      <w:r>
-        <w:rPr>
-          <w:rFonts w:ascii="Times New Roman" w:eastAsia="Times New Roman" w:hAnsi="Times New Roman" w:cs="Times New Roman"/>
-          <w:sz w:val="36"/>
-          <w:szCs w:val="36"/>
-        </w:rPr>
-        <w:t xml:space="preserve">, </w:t>
-      </w:r>
-      <w:proofErr w:type="spellStart"/>
-      <w:r>
-        <w:rPr>
-          <w:rFonts w:ascii="Times New Roman" w:eastAsia="Times New Roman" w:hAnsi="Times New Roman" w:cs="Times New Roman"/>
-          <w:sz w:val="36"/>
-          <w:szCs w:val="36"/>
-        </w:rPr>
-        <w:t>StudentHomePage</w:t>
-      </w:r>
-      <w:proofErr w:type="spellEnd"/>
-      <w:r>
-        <w:rPr>
-          <w:rFonts w:ascii="Times New Roman" w:eastAsia="Times New Roman" w:hAnsi="Times New Roman" w:cs="Times New Roman"/>
-          <w:sz w:val="36"/>
-          <w:szCs w:val="36"/>
-        </w:rPr>
-        <w:t xml:space="preserve">, </w:t>
-      </w:r>
-      <w:proofErr w:type="spellStart"/>
-      <w:r>
-        <w:rPr>
-          <w:rFonts w:ascii="Times New Roman" w:eastAsia="Times New Roman" w:hAnsi="Times New Roman" w:cs="Times New Roman"/>
-          <w:sz w:val="36"/>
-          <w:szCs w:val="36"/>
-        </w:rPr>
-        <w:t>SchedulerView</w:t>
-      </w:r>
-      <w:proofErr w:type="spellEnd"/>
-      <w:r>
-        <w:rPr>
-          <w:rFonts w:ascii="Times New Roman" w:eastAsia="Times New Roman" w:hAnsi="Times New Roman" w:cs="Times New Roman"/>
-          <w:sz w:val="36"/>
-          <w:szCs w:val="36"/>
-        </w:rPr>
-        <w:t>) szerkezetének kialakítása és a komponensek működésének ellenőrzése, a felhasználói felület stílusának kialakítása, hogy az oldal elrendezése megfeleljen a megtervezett UI-terveknek.</w:t>
+        <w:t>(El-Nabulsy Csongor Alan) Főbb nézetek(HomeView, StudentHomePage, SchedulerView) szerkezetének kialakítása és a komponensek működésének ellenőrzése, a felhasználói felület stílusának kialakítása, hogy az oldal elrendezése megfeleljen a megtervezett UI-terveknek.</w:t>
       </w:r>
     </w:p>
     <w:p>
@@ -3262,25 +2881,7 @@
           <w:sz w:val="36"/>
           <w:szCs w:val="36"/>
         </w:rPr>
-        <w:t xml:space="preserve">, a routerben a főoldalak variánsainak gyerek </w:t>
-      </w:r>
-      <w:proofErr w:type="spellStart"/>
-      <w:r>
-        <w:rPr>
-          <w:rFonts w:ascii="Times New Roman" w:eastAsia="Times New Roman" w:hAnsi="Times New Roman" w:cs="Times New Roman"/>
-          <w:sz w:val="36"/>
-          <w:szCs w:val="36"/>
-        </w:rPr>
-        <w:t>route</w:t>
-      </w:r>
-      <w:proofErr w:type="spellEnd"/>
-      <w:r>
-        <w:rPr>
-          <w:rFonts w:ascii="Times New Roman" w:eastAsia="Times New Roman" w:hAnsi="Times New Roman" w:cs="Times New Roman"/>
-          <w:sz w:val="36"/>
-          <w:szCs w:val="36"/>
-        </w:rPr>
-        <w:t>-okba szervezése</w:t>
+        <w:t>, a routerben a főoldalak variánsainak gyerek route-okba szervezése</w:t>
       </w:r>
       <w:r>
         <w:rPr>
@@ -3296,51 +2897,15 @@
           <w:sz w:val="36"/>
           <w:szCs w:val="36"/>
         </w:rPr>
-        <w:t xml:space="preserve">, az új szabvány mintájára az </w:t>
-      </w:r>
-      <w:proofErr w:type="spellStart"/>
-      <w:r>
-        <w:rPr>
-          <w:rFonts w:ascii="Times New Roman" w:eastAsia="Times New Roman" w:hAnsi="Times New Roman" w:cs="Times New Roman"/>
-          <w:sz w:val="36"/>
-          <w:szCs w:val="36"/>
-        </w:rPr>
-        <w:t>admin</w:t>
-      </w:r>
-      <w:proofErr w:type="spellEnd"/>
-      <w:r>
-        <w:rPr>
-          <w:rFonts w:ascii="Times New Roman" w:eastAsia="Times New Roman" w:hAnsi="Times New Roman" w:cs="Times New Roman"/>
-          <w:sz w:val="36"/>
-          <w:szCs w:val="36"/>
-        </w:rPr>
-        <w:t xml:space="preserve"> nézet (gombok és rövid leírás azok alá) létrehozása</w:t>
-      </w:r>
-      <w:r>
-        <w:rPr>
-          <w:rFonts w:ascii="Times New Roman" w:eastAsia="Times New Roman" w:hAnsi="Times New Roman" w:cs="Times New Roman"/>
-          <w:sz w:val="36"/>
-          <w:szCs w:val="36"/>
-        </w:rPr>
-        <w:t xml:space="preserve">, felesleges import mezők kiszedése az </w:t>
-      </w:r>
-      <w:proofErr w:type="spellStart"/>
-      <w:r>
-        <w:rPr>
-          <w:rFonts w:ascii="Times New Roman" w:eastAsia="Times New Roman" w:hAnsi="Times New Roman" w:cs="Times New Roman"/>
-          <w:sz w:val="36"/>
-          <w:szCs w:val="36"/>
-        </w:rPr>
-        <w:t>App.vue</w:t>
-      </w:r>
-      <w:proofErr w:type="spellEnd"/>
-      <w:r>
-        <w:rPr>
-          <w:rFonts w:ascii="Times New Roman" w:eastAsia="Times New Roman" w:hAnsi="Times New Roman" w:cs="Times New Roman"/>
-          <w:sz w:val="36"/>
-          <w:szCs w:val="36"/>
-        </w:rPr>
-        <w:t xml:space="preserve"> fájlból</w:t>
+        <w:t>, az új szabvány mintájára az admin nézet (gombok és rövid leírás azok alá) létrehozása</w:t>
+      </w:r>
+      <w:r>
+        <w:rPr>
+          <w:rFonts w:ascii="Times New Roman" w:eastAsia="Times New Roman" w:hAnsi="Times New Roman" w:cs="Times New Roman"/>
+          <w:sz w:val="36"/>
+          <w:szCs w:val="36"/>
+        </w:rPr>
+        <w:t>, felesleges import mezők kiszedése az App.vue fájlból</w:t>
       </w:r>
     </w:p>
     <w:p>
@@ -3447,114 +3012,15 @@
           <w:sz w:val="36"/>
           <w:szCs w:val="36"/>
         </w:rPr>
-        <w:t>(Susán Csongor György, El-</w:t>
-      </w:r>
-      <w:proofErr w:type="spellStart"/>
-      <w:r>
-        <w:rPr>
-          <w:rFonts w:ascii="Times New Roman" w:eastAsia="Times New Roman" w:hAnsi="Times New Roman" w:cs="Times New Roman"/>
-          <w:sz w:val="36"/>
-          <w:szCs w:val="36"/>
-        </w:rPr>
-        <w:t>Nabulsy</w:t>
-      </w:r>
-      <w:proofErr w:type="spellEnd"/>
-      <w:r>
-        <w:rPr>
-          <w:rFonts w:ascii="Times New Roman" w:eastAsia="Times New Roman" w:hAnsi="Times New Roman" w:cs="Times New Roman"/>
-          <w:sz w:val="36"/>
-          <w:szCs w:val="36"/>
-        </w:rPr>
-        <w:t xml:space="preserve"> Csongor Alan)</w:t>
-      </w:r>
-      <w:r>
-        <w:rPr>
-          <w:rFonts w:ascii="Times New Roman" w:eastAsia="Times New Roman" w:hAnsi="Times New Roman" w:cs="Times New Roman"/>
-          <w:sz w:val="36"/>
-          <w:szCs w:val="36"/>
-        </w:rPr>
-        <w:t xml:space="preserve"> Nézetek végleges kialakítása (El-</w:t>
-      </w:r>
-      <w:proofErr w:type="spellStart"/>
-      <w:r>
-        <w:rPr>
-          <w:rFonts w:ascii="Times New Roman" w:eastAsia="Times New Roman" w:hAnsi="Times New Roman" w:cs="Times New Roman"/>
-          <w:sz w:val="36"/>
-          <w:szCs w:val="36"/>
-        </w:rPr>
-        <w:t>Nabulsy</w:t>
-      </w:r>
-      <w:proofErr w:type="spellEnd"/>
-      <w:r>
-        <w:rPr>
-          <w:rFonts w:ascii="Times New Roman" w:eastAsia="Times New Roman" w:hAnsi="Times New Roman" w:cs="Times New Roman"/>
-          <w:sz w:val="36"/>
-          <w:szCs w:val="36"/>
-        </w:rPr>
-        <w:t xml:space="preserve">: </w:t>
-      </w:r>
-      <w:proofErr w:type="spellStart"/>
-      <w:r>
-        <w:rPr>
-          <w:rFonts w:ascii="Times New Roman" w:eastAsia="Times New Roman" w:hAnsi="Times New Roman" w:cs="Times New Roman"/>
-          <w:sz w:val="36"/>
-          <w:szCs w:val="36"/>
-        </w:rPr>
-        <w:t>HomeView</w:t>
-      </w:r>
-      <w:proofErr w:type="spellEnd"/>
-      <w:r>
-        <w:rPr>
-          <w:rFonts w:ascii="Times New Roman" w:eastAsia="Times New Roman" w:hAnsi="Times New Roman" w:cs="Times New Roman"/>
-          <w:sz w:val="36"/>
-          <w:szCs w:val="36"/>
-        </w:rPr>
-        <w:t xml:space="preserve">, </w:t>
-      </w:r>
-      <w:proofErr w:type="spellStart"/>
-      <w:r>
-        <w:rPr>
-          <w:rFonts w:ascii="Times New Roman" w:eastAsia="Times New Roman" w:hAnsi="Times New Roman" w:cs="Times New Roman"/>
-          <w:sz w:val="36"/>
-          <w:szCs w:val="36"/>
-        </w:rPr>
-        <w:t>RequestView</w:t>
-      </w:r>
-      <w:proofErr w:type="spellEnd"/>
-      <w:r>
-        <w:rPr>
-          <w:rFonts w:ascii="Times New Roman" w:eastAsia="Times New Roman" w:hAnsi="Times New Roman" w:cs="Times New Roman"/>
-          <w:sz w:val="36"/>
-          <w:szCs w:val="36"/>
-        </w:rPr>
-        <w:t xml:space="preserve">, </w:t>
-      </w:r>
-      <w:proofErr w:type="spellStart"/>
-      <w:r>
-        <w:rPr>
-          <w:rFonts w:ascii="Times New Roman" w:eastAsia="Times New Roman" w:hAnsi="Times New Roman" w:cs="Times New Roman"/>
-          <w:sz w:val="36"/>
-          <w:szCs w:val="36"/>
-        </w:rPr>
-        <w:t>SendView</w:t>
-      </w:r>
-      <w:proofErr w:type="spellEnd"/>
-      <w:r>
-        <w:rPr>
-          <w:rFonts w:ascii="Times New Roman" w:eastAsia="Times New Roman" w:hAnsi="Times New Roman" w:cs="Times New Roman"/>
-          <w:sz w:val="36"/>
-          <w:szCs w:val="36"/>
-        </w:rPr>
-        <w:t xml:space="preserve">; Susán: főoldalak integrálása a </w:t>
-      </w:r>
-      <w:proofErr w:type="spellStart"/>
-      <w:r>
-        <w:rPr>
-          <w:rFonts w:ascii="Times New Roman" w:eastAsia="Times New Roman" w:hAnsi="Times New Roman" w:cs="Times New Roman"/>
-          <w:sz w:val="36"/>
-          <w:szCs w:val="36"/>
-        </w:rPr>
-        <w:t>HomeLayout</w:t>
+        <w:t>(Susán Csongor György, El-Nabulsy Csongor Alan)</w:t>
+      </w:r>
+      <w:r>
+        <w:rPr>
+          <w:rFonts w:ascii="Times New Roman" w:eastAsia="Times New Roman" w:hAnsi="Times New Roman" w:cs="Times New Roman"/>
+          <w:sz w:val="36"/>
+          <w:szCs w:val="36"/>
+        </w:rPr>
+        <w:t xml:space="preserve"> Nézetek végleges kialakítása (El-Nabulsy: HomeView, RequestView, SendView; Susán: főoldalak integrálása a HomeLayout</w:t>
       </w:r>
       <w:r>
         <w:rPr>
@@ -3570,16 +3036,7 @@
           <w:sz w:val="36"/>
           <w:szCs w:val="36"/>
         </w:rPr>
-        <w:t>ba</w:t>
-      </w:r>
-      <w:proofErr w:type="spellEnd"/>
-      <w:r>
-        <w:rPr>
-          <w:rFonts w:ascii="Times New Roman" w:eastAsia="Times New Roman" w:hAnsi="Times New Roman" w:cs="Times New Roman"/>
-          <w:sz w:val="36"/>
-          <w:szCs w:val="36"/>
-        </w:rPr>
-        <w:t>)</w:t>
+        <w:t>ba)</w:t>
       </w:r>
       <w:r>
         <w:rPr>
@@ -3628,25 +3085,7 @@
           <w:sz w:val="36"/>
           <w:szCs w:val="36"/>
         </w:rPr>
-        <w:t xml:space="preserve">Példa adatok felvétele a </w:t>
-      </w:r>
-      <w:proofErr w:type="spellStart"/>
-      <w:r>
-        <w:rPr>
-          <w:rFonts w:ascii="Times New Roman" w:eastAsia="Times New Roman" w:hAnsi="Times New Roman" w:cs="Times New Roman"/>
-          <w:sz w:val="36"/>
-          <w:szCs w:val="36"/>
-        </w:rPr>
-        <w:t>HomeLayout-ba</w:t>
-      </w:r>
-      <w:proofErr w:type="spellEnd"/>
-      <w:r>
-        <w:rPr>
-          <w:rFonts w:ascii="Times New Roman" w:eastAsia="Times New Roman" w:hAnsi="Times New Roman" w:cs="Times New Roman"/>
-          <w:sz w:val="36"/>
-          <w:szCs w:val="36"/>
-        </w:rPr>
-        <w:t xml:space="preserve"> a helyes működés tesztelésének érdekében</w:t>
+        <w:t>Példa adatok felvétele a HomeLayout-ba a helyes működés tesztelésének érdekében</w:t>
       </w:r>
     </w:p>
     <w:p>
@@ -3694,7 +3133,6 @@
           <w:szCs w:val="36"/>
         </w:rPr>
       </w:pPr>
-      <w:proofErr w:type="spellStart"/>
       <w:r>
         <w:rPr>
           <w:rFonts w:ascii="Times New Roman" w:eastAsia="Times New Roman" w:hAnsi="Times New Roman" w:cs="Times New Roman"/>
@@ -3702,34 +3140,7 @@
           <w:szCs w:val="36"/>
         </w:rPr>
         <w:lastRenderedPageBreak/>
-        <w:t>meta.title-ekben</w:t>
-      </w:r>
-      <w:proofErr w:type="spellEnd"/>
-      <w:r>
-        <w:rPr>
-          <w:rFonts w:ascii="Times New Roman" w:eastAsia="Times New Roman" w:hAnsi="Times New Roman" w:cs="Times New Roman"/>
-          <w:sz w:val="36"/>
-          <w:szCs w:val="36"/>
-        </w:rPr>
-        <w:t xml:space="preserve"> és a </w:t>
-      </w:r>
-      <w:proofErr w:type="spellStart"/>
-      <w:r>
-        <w:rPr>
-          <w:rFonts w:ascii="Times New Roman" w:eastAsia="Times New Roman" w:hAnsi="Times New Roman" w:cs="Times New Roman"/>
-          <w:sz w:val="36"/>
-          <w:szCs w:val="36"/>
-        </w:rPr>
-        <w:t>beforeEach</w:t>
-      </w:r>
-      <w:proofErr w:type="spellEnd"/>
-      <w:r>
-        <w:rPr>
-          <w:rFonts w:ascii="Times New Roman" w:eastAsia="Times New Roman" w:hAnsi="Times New Roman" w:cs="Times New Roman"/>
-          <w:sz w:val="36"/>
-          <w:szCs w:val="36"/>
-        </w:rPr>
-        <w:t>-ben oldalcímek meghatározása</w:t>
+        <w:t>meta.title-ekben és a beforeEach-ben oldalcímek meghatározása</w:t>
       </w:r>
     </w:p>
     <w:p>
@@ -3785,41 +3196,13 @@
           <w:szCs w:val="36"/>
         </w:rPr>
       </w:pPr>
-      <w:proofErr w:type="spellStart"/>
-      <w:r>
-        <w:rPr>
-          <w:rFonts w:ascii="Times New Roman" w:eastAsia="Times New Roman" w:hAnsi="Times New Roman" w:cs="Times New Roman"/>
-          <w:sz w:val="36"/>
-          <w:szCs w:val="36"/>
-        </w:rPr>
-        <w:t>auth</w:t>
-      </w:r>
-      <w:proofErr w:type="spellEnd"/>
-      <w:r>
-        <w:rPr>
-          <w:rFonts w:ascii="Times New Roman" w:eastAsia="Times New Roman" w:hAnsi="Times New Roman" w:cs="Times New Roman"/>
-          <w:sz w:val="36"/>
-          <w:szCs w:val="36"/>
-        </w:rPr>
-        <w:t xml:space="preserve"> függvény hozzáadása a bejelentkezési képernyőhöz (</w:t>
-      </w:r>
-      <w:proofErr w:type="spellStart"/>
-      <w:r>
-        <w:rPr>
-          <w:rFonts w:ascii="Times New Roman" w:eastAsia="Times New Roman" w:hAnsi="Times New Roman" w:cs="Times New Roman"/>
-          <w:sz w:val="36"/>
-          <w:szCs w:val="36"/>
-        </w:rPr>
-        <w:t>LoginView</w:t>
-      </w:r>
-      <w:proofErr w:type="spellEnd"/>
-      <w:r>
-        <w:rPr>
-          <w:rFonts w:ascii="Times New Roman" w:eastAsia="Times New Roman" w:hAnsi="Times New Roman" w:cs="Times New Roman"/>
-          <w:sz w:val="36"/>
-          <w:szCs w:val="36"/>
-        </w:rPr>
-        <w:t>), ami egyelőre üres, egy komment jelzi annak célját</w:t>
+      <w:r>
+        <w:rPr>
+          <w:rFonts w:ascii="Times New Roman" w:eastAsia="Times New Roman" w:hAnsi="Times New Roman" w:cs="Times New Roman"/>
+          <w:sz w:val="36"/>
+          <w:szCs w:val="36"/>
+        </w:rPr>
+        <w:t>auth függvény hozzáadása a bejelentkezési képernyőhöz (LoginView), ami egyelőre üres, egy komment jelzi annak célját</w:t>
       </w:r>
     </w:p>
     <w:p>
@@ -3867,6 +3250,119 @@
           <w:szCs w:val="36"/>
         </w:rPr>
         <w:t>l-be bekerül az oldal neve is (hu, azaz magyar)</w:t>
+      </w:r>
+    </w:p>
+    <w:p>
+      <w:pPr>
+        <w:jc w:val="both"/>
+        <w:rPr>
+          <w:rFonts w:ascii="Times New Roman" w:eastAsia="Times New Roman" w:hAnsi="Times New Roman" w:cs="Times New Roman"/>
+          <w:sz w:val="36"/>
+          <w:szCs w:val="36"/>
+        </w:rPr>
+      </w:pPr>
+    </w:p>
+    <w:p>
+      <w:pPr>
+        <w:jc w:val="both"/>
+        <w:rPr>
+          <w:rFonts w:ascii="Times New Roman" w:eastAsia="Times New Roman" w:hAnsi="Times New Roman" w:cs="Times New Roman"/>
+          <w:b/>
+          <w:bCs/>
+          <w:sz w:val="40"/>
+          <w:szCs w:val="40"/>
+        </w:rPr>
+      </w:pPr>
+      <w:r>
+        <w:rPr>
+          <w:rFonts w:ascii="Times New Roman" w:eastAsia="Times New Roman" w:hAnsi="Times New Roman" w:cs="Times New Roman"/>
+          <w:b/>
+          <w:bCs/>
+          <w:sz w:val="40"/>
+          <w:szCs w:val="40"/>
+        </w:rPr>
+        <w:t>2026-03-11 17:45-50</w:t>
+      </w:r>
+    </w:p>
+    <w:p>
+      <w:pPr>
+        <w:jc w:val="both"/>
+        <w:rPr>
+          <w:rFonts w:ascii="Times New Roman" w:eastAsia="Times New Roman" w:hAnsi="Times New Roman" w:cs="Times New Roman"/>
+          <w:sz w:val="36"/>
+          <w:szCs w:val="36"/>
+        </w:rPr>
+      </w:pPr>
+      <w:r>
+        <w:rPr>
+          <w:rFonts w:ascii="Times New Roman" w:eastAsia="Times New Roman" w:hAnsi="Times New Roman" w:cs="Times New Roman"/>
+          <w:sz w:val="36"/>
+          <w:szCs w:val="36"/>
+        </w:rPr>
+        <w:t>(Susán Csongor György) Elkészül az alkalmazás logója.</w:t>
+      </w:r>
+    </w:p>
+    <w:p>
+      <w:pPr>
+        <w:jc w:val="both"/>
+        <w:rPr>
+          <w:rFonts w:ascii="Times New Roman" w:eastAsia="Times New Roman" w:hAnsi="Times New Roman" w:cs="Times New Roman"/>
+          <w:sz w:val="36"/>
+          <w:szCs w:val="36"/>
+        </w:rPr>
+      </w:pPr>
+      <w:r>
+        <w:rPr>
+          <w:noProof/>
+        </w:rPr>
+        <w:drawing>
+          <wp:inline distT="0" distB="0" distL="0" distR="0" wp14:anchorId="0697373A" wp14:editId="49CB908E">
+            <wp:extent cx="304800" cy="304800"/>
+            <wp:effectExtent l="0" t="0" r="0" b="0"/>
+            <wp:docPr id="2024739431" name="Kép 1"/>
+            <wp:cNvGraphicFramePr>
+              <a:graphicFrameLocks xmlns:a="http://schemas.openxmlformats.org/drawingml/2006/main" noChangeAspect="1"/>
+            </wp:cNvGraphicFramePr>
+            <a:graphic xmlns:a="http://schemas.openxmlformats.org/drawingml/2006/main">
+              <a:graphicData uri="http://schemas.openxmlformats.org/drawingml/2006/picture">
+                <pic:pic xmlns:pic="http://schemas.openxmlformats.org/drawingml/2006/picture">
+                  <pic:nvPicPr>
+                    <pic:cNvPr id="0" name="Picture 1"/>
+                    <pic:cNvPicPr>
+                      <a:picLocks noChangeAspect="1" noChangeArrowheads="1"/>
+                    </pic:cNvPicPr>
+                  </pic:nvPicPr>
+                  <pic:blipFill>
+                    <a:blip r:embed="rId27">
+                      <a:extLst>
+                        <a:ext uri="{28A0092B-C50C-407E-A947-70E740481C1C}">
+                          <a14:useLocalDpi xmlns:a14="http://schemas.microsoft.com/office/drawing/2010/main" val="0"/>
+                        </a:ext>
+                      </a:extLst>
+                    </a:blip>
+                    <a:srcRect/>
+                    <a:stretch>
+                      <a:fillRect/>
+                    </a:stretch>
+                  </pic:blipFill>
+                  <pic:spPr bwMode="auto">
+                    <a:xfrm>
+                      <a:off x="0" y="0"/>
+                      <a:ext cx="304800" cy="304800"/>
+                    </a:xfrm>
+                    <a:prstGeom prst="rect">
+                      <a:avLst/>
+                    </a:prstGeom>
+                    <a:noFill/>
+                    <a:ln>
+                      <a:noFill/>
+                    </a:ln>
+                  </pic:spPr>
+                </pic:pic>
+              </a:graphicData>
+            </a:graphic>
+          </wp:inline>
+        </w:drawing>
       </w:r>
     </w:p>
     <w:sectPr>

</xml_diff>

<commit_message>
Putting the project into the good place
</commit_message>
<xml_diff>
--- a/documentation.docx
+++ b/documentation.docx
@@ -40,29 +40,27 @@
           <w:sz w:val="40"/>
           <w:szCs w:val="40"/>
         </w:rPr>
-        <w:t xml:space="preserve">Alkalmazás neve: </w:t>
-      </w:r>
-      <w:proofErr w:type="spellStart"/>
-      <w:r>
+        <w:t>Alkalmazás neve: BláthyFM</w:t>
+      </w:r>
+    </w:p>
+    <w:p>
+      <w:pPr>
         <w:rPr>
           <w:rFonts w:ascii="Times New Roman" w:hAnsi="Times New Roman" w:cs="Times New Roman"/>
           <w:bCs/>
           <w:sz w:val="40"/>
           <w:szCs w:val="40"/>
         </w:rPr>
-        <w:t>BláthyFM</w:t>
-      </w:r>
-      <w:proofErr w:type="spellEnd"/>
-    </w:p>
-    <w:p>
-      <w:pPr>
+      </w:pPr>
+      <w:r>
         <w:rPr>
           <w:rFonts w:ascii="Times New Roman" w:hAnsi="Times New Roman" w:cs="Times New Roman"/>
           <w:bCs/>
           <w:sz w:val="40"/>
           <w:szCs w:val="40"/>
         </w:rPr>
-      </w:pPr>
+        <w:t>Tagok:</w:t>
+      </w:r>
       <w:r>
         <w:rPr>
           <w:rFonts w:ascii="Times New Roman" w:hAnsi="Times New Roman" w:cs="Times New Roman"/>
@@ -70,59 +68,58 @@
           <w:sz w:val="40"/>
           <w:szCs w:val="40"/>
         </w:rPr>
-        <w:t>Tagok:</w:t>
-      </w:r>
-      <w:r>
+        <w:t xml:space="preserve"> Susán Csongor, El-Nabulsy Csongor Alan</w:t>
+      </w:r>
+    </w:p>
+    <w:p>
+      <w:pPr>
         <w:rPr>
           <w:rFonts w:ascii="Times New Roman" w:hAnsi="Times New Roman" w:cs="Times New Roman"/>
           <w:bCs/>
           <w:sz w:val="40"/>
           <w:szCs w:val="40"/>
         </w:rPr>
-        <w:t xml:space="preserve"> Susán Csongor, El-Nabulsy Csongor Alan</w:t>
-      </w:r>
-    </w:p>
-    <w:p>
-      <w:pPr>
+      </w:pPr>
+      <w:r>
         <w:rPr>
           <w:rFonts w:ascii="Times New Roman" w:hAnsi="Times New Roman" w:cs="Times New Roman"/>
           <w:bCs/>
           <w:sz w:val="40"/>
           <w:szCs w:val="40"/>
         </w:rPr>
-      </w:pPr>
-      <w:r>
+        <w:t>Az alkalmazás célja az, hogy a Bláthy-ba járó diákok előre meghatározott szünetekben kedvenc zenéjüket tudják majd hallgatni anélkül, hogy nekik kelljen azt maguknak vagy másoknak lejátszani. Ráadásul az, hogy az iskola az ő zenéjüket játssza, akár egy általuk kijelölt időpontban (ezt üzenetben írhatják le), még több élményt ad, és azt az érzést, hogy a zenéjük – és ezzel együtt önmaguk is – meg van becsülve.</w:t>
+      </w:r>
+    </w:p>
+    <w:p>
+      <w:pPr>
         <w:rPr>
           <w:rFonts w:ascii="Times New Roman" w:hAnsi="Times New Roman" w:cs="Times New Roman"/>
-          <w:bCs/>
-          <w:sz w:val="40"/>
-          <w:szCs w:val="40"/>
-        </w:rPr>
-        <w:t>Az alkalmazás célja az, hogy a Bláthy-</w:t>
-      </w:r>
-      <w:proofErr w:type="spellStart"/>
-      <w:r>
+          <w:b/>
+          <w:bCs/>
+          <w:sz w:val="40"/>
+          <w:szCs w:val="40"/>
+        </w:rPr>
+      </w:pPr>
+    </w:p>
+    <w:p>
+      <w:pPr>
         <w:rPr>
           <w:rFonts w:ascii="Times New Roman" w:hAnsi="Times New Roman" w:cs="Times New Roman"/>
-          <w:bCs/>
-          <w:sz w:val="40"/>
-          <w:szCs w:val="40"/>
-        </w:rPr>
-        <w:t>ba</w:t>
-      </w:r>
-      <w:proofErr w:type="spellEnd"/>
+          <w:sz w:val="36"/>
+          <w:szCs w:val="36"/>
+        </w:rPr>
+      </w:pPr>
       <w:r>
         <w:rPr>
           <w:rFonts w:ascii="Times New Roman" w:hAnsi="Times New Roman" w:cs="Times New Roman"/>
-          <w:bCs/>
-          <w:sz w:val="40"/>
-          <w:szCs w:val="40"/>
-        </w:rPr>
-        <w:t xml:space="preserve"> járó diákok előre meghatározott szünetekben kedvenc zenéjüket tudják majd hallgatni anélkül, hogy nekik kelljen azt maguknak vagy másoknak lejátszani. Ráadásul az, hogy az iskola az ő zenéjüket játssza, akár egy általuk kijelölt időpontban (ezt üzenetben írhatják le), még több élményt ad, és azt az érzést, hogy a zenéjük – és ezzel együtt önmaguk is – meg van becsülve.</w:t>
-      </w:r>
-    </w:p>
-    <w:p>
-      <w:pPr>
+          <w:b/>
+          <w:bCs/>
+          <w:sz w:val="40"/>
+          <w:szCs w:val="40"/>
+        </w:rPr>
+        <w:t>2026-01-29 13:55-15:20</w:t>
+      </w:r>
+      <w:r>
         <w:rPr>
           <w:rFonts w:ascii="Times New Roman" w:hAnsi="Times New Roman" w:cs="Times New Roman"/>
           <w:b/>
@@ -130,48 +127,20 @@
           <w:sz w:val="40"/>
           <w:szCs w:val="40"/>
         </w:rPr>
-      </w:pPr>
-    </w:p>
-    <w:p>
-      <w:pPr>
+        <w:br/>
+      </w:r>
+      <w:r>
         <w:rPr>
           <w:rFonts w:ascii="Times New Roman" w:hAnsi="Times New Roman" w:cs="Times New Roman"/>
           <w:sz w:val="36"/>
           <w:szCs w:val="36"/>
         </w:rPr>
-      </w:pPr>
-      <w:r>
-        <w:rPr>
-          <w:rFonts w:ascii="Times New Roman" w:hAnsi="Times New Roman" w:cs="Times New Roman"/>
-          <w:b/>
-          <w:bCs/>
-          <w:sz w:val="40"/>
-          <w:szCs w:val="40"/>
-        </w:rPr>
-        <w:t>2026-01-29 13:55-15:20</w:t>
-      </w:r>
-      <w:r>
-        <w:rPr>
-          <w:rFonts w:ascii="Times New Roman" w:hAnsi="Times New Roman" w:cs="Times New Roman"/>
-          <w:b/>
-          <w:bCs/>
-          <w:sz w:val="40"/>
-          <w:szCs w:val="40"/>
-        </w:rPr>
-        <w:br/>
-      </w:r>
-      <w:r>
-        <w:rPr>
-          <w:rFonts w:ascii="Times New Roman" w:hAnsi="Times New Roman" w:cs="Times New Roman"/>
-          <w:sz w:val="36"/>
-          <w:szCs w:val="36"/>
-        </w:rPr>
         <w:t>A webalkalmazás tervezésének megkezdése:</w:t>
       </w:r>
     </w:p>
     <w:p>
       <w:pPr>
-        <w:pStyle w:val="ListParagraph"/>
+        <w:pStyle w:val="Listaszerbekezds"/>
         <w:numPr>
           <w:ilvl w:val="0"/>
           <w:numId w:val="1"/>
@@ -193,7 +162,7 @@
     </w:p>
     <w:p>
       <w:pPr>
-        <w:pStyle w:val="ListParagraph"/>
+        <w:pStyle w:val="Listaszerbekezds"/>
         <w:numPr>
           <w:ilvl w:val="0"/>
           <w:numId w:val="1"/>
@@ -215,7 +184,7 @@
     </w:p>
     <w:p>
       <w:pPr>
-        <w:pStyle w:val="ListParagraph"/>
+        <w:pStyle w:val="Listaszerbekezds"/>
         <w:ind w:left="0"/>
         <w:rPr>
           <w:rFonts w:ascii="Times New Roman" w:hAnsi="Times New Roman" w:cs="Times New Roman"/>
@@ -459,7 +428,7 @@
     </w:p>
     <w:p>
       <w:pPr>
-        <w:pStyle w:val="ListParagraph"/>
+        <w:pStyle w:val="Listaszerbekezds"/>
         <w:rPr>
           <w:rFonts w:ascii="Times New Roman" w:hAnsi="Times New Roman" w:cs="Times New Roman"/>
           <w:sz w:val="36"/>
@@ -601,25 +570,7 @@
           <w:sz w:val="36"/>
           <w:szCs w:val="36"/>
         </w:rPr>
-        <w:t xml:space="preserve">Az alkalmazás fejlesztését tartalmazó dokumentáció elkezdése, vizsgafeltételek tanulmányozása, a projektet tároló </w:t>
-      </w:r>
-      <w:proofErr w:type="spellStart"/>
-      <w:r>
-        <w:rPr>
-          <w:rFonts w:ascii="Times New Roman" w:hAnsi="Times New Roman" w:cs="Times New Roman"/>
-          <w:sz w:val="36"/>
-          <w:szCs w:val="36"/>
-        </w:rPr>
-        <w:t>repository</w:t>
-      </w:r>
-      <w:proofErr w:type="spellEnd"/>
-      <w:r>
-        <w:rPr>
-          <w:rFonts w:ascii="Times New Roman" w:hAnsi="Times New Roman" w:cs="Times New Roman"/>
-          <w:sz w:val="36"/>
-          <w:szCs w:val="36"/>
-        </w:rPr>
-        <w:t xml:space="preserve"> létrehozása, teszteknek külön dokumentáció létrehozása.</w:t>
+        <w:t>Az alkalmazás fejlesztését tartalmazó dokumentáció elkezdése, vizsgafeltételek tanulmányozása, a projektet tároló repository létrehozása, teszteknek külön dokumentáció létrehozása.</w:t>
       </w:r>
     </w:p>
     <w:p/>
@@ -884,7 +835,7 @@
       <w:hyperlink r:id="rId14">
         <w:r>
           <w:rPr>
-            <w:rStyle w:val="Hyperlink"/>
+            <w:rStyle w:val="Hiperhivatkozs"/>
             <w:rFonts w:ascii="Times New Roman" w:eastAsia="Times New Roman" w:hAnsi="Times New Roman" w:cs="Times New Roman"/>
             <w:sz w:val="36"/>
             <w:szCs w:val="36"/>
@@ -1288,7 +1239,7 @@
           <w:szCs w:val="36"/>
         </w:rPr>
         <w:drawing>
-          <wp:inline distT="0" distB="0" distL="0" distR="0" wp14:anchorId="78A43544" wp14:editId="6CE6A705">
+          <wp:inline distT="0" distB="0" distL="0" distR="0" wp14:anchorId="78A43544" wp14:editId="22211031">
             <wp:extent cx="3166535" cy="1781175"/>
             <wp:effectExtent l="0" t="0" r="0" b="0"/>
             <wp:docPr id="3" name="Kép 3" descr="C:\Users\elnabulsy.csongor\AppData\Local\Microsoft\Windows\INetCache\Content.MSO\F75754B3.tmp"/>
@@ -1380,7 +1331,7 @@
           <w:szCs w:val="36"/>
         </w:rPr>
         <w:drawing>
-          <wp:inline distT="0" distB="0" distL="0" distR="0" wp14:anchorId="4E211814" wp14:editId="3C42E20B">
+          <wp:inline distT="0" distB="0" distL="0" distR="0" wp14:anchorId="4E211814" wp14:editId="51576DED">
             <wp:extent cx="3133725" cy="1762720"/>
             <wp:effectExtent l="0" t="0" r="0" b="9525"/>
             <wp:docPr id="4" name="Kép 4" descr="C:\Users\elnabulsy.csongor\Downloads\ui_main_student.png"/>
@@ -1462,7 +1413,7 @@
           <w:szCs w:val="36"/>
         </w:rPr>
         <w:drawing>
-          <wp:inline distT="0" distB="0" distL="0" distR="0" wp14:anchorId="5137FB78" wp14:editId="252FF7D1">
+          <wp:inline distT="0" distB="0" distL="0" distR="0" wp14:anchorId="5137FB78" wp14:editId="639E7766">
             <wp:extent cx="3166110" cy="1780938"/>
             <wp:effectExtent l="0" t="0" r="0" b="0"/>
             <wp:docPr id="5" name="Kép 5" descr="C:\Users\elnabulsy.csongor\Downloads\ui_main_scheduler.png"/>
@@ -1525,25 +1476,7 @@
           <w:sz w:val="36"/>
           <w:szCs w:val="36"/>
         </w:rPr>
-        <w:t xml:space="preserve">Főképernyő </w:t>
-      </w:r>
-      <w:proofErr w:type="spellStart"/>
-      <w:r>
-        <w:rPr>
-          <w:rFonts w:ascii="Times New Roman" w:eastAsia="Times New Roman" w:hAnsi="Times New Roman" w:cs="Times New Roman"/>
-          <w:sz w:val="36"/>
-          <w:szCs w:val="36"/>
-        </w:rPr>
-        <w:t>admin</w:t>
-      </w:r>
-      <w:proofErr w:type="spellEnd"/>
-      <w:r>
-        <w:rPr>
-          <w:rFonts w:ascii="Times New Roman" w:eastAsia="Times New Roman" w:hAnsi="Times New Roman" w:cs="Times New Roman"/>
-          <w:sz w:val="36"/>
-          <w:szCs w:val="36"/>
-        </w:rPr>
-        <w:t xml:space="preserve"> ranggal:</w:t>
+        <w:t>Főképernyő admin ranggal:</w:t>
       </w:r>
     </w:p>
     <w:p>
@@ -1573,7 +1506,7 @@
           <w:szCs w:val="36"/>
         </w:rPr>
         <w:drawing>
-          <wp:inline distT="0" distB="0" distL="0" distR="0" wp14:anchorId="27EC1C67" wp14:editId="3CBFCD33">
+          <wp:inline distT="0" distB="0" distL="0" distR="0" wp14:anchorId="27EC1C67" wp14:editId="5DFA3A61">
             <wp:extent cx="3055620" cy="1718786"/>
             <wp:effectExtent l="0" t="0" r="0" b="0"/>
             <wp:docPr id="6" name="Kép 6" descr="C:\Users\elnabulsy.csongor\Downloads\ui_main_admin.png"/>
@@ -1655,7 +1588,7 @@
           <w:szCs w:val="36"/>
         </w:rPr>
         <w:drawing>
-          <wp:inline distT="0" distB="0" distL="0" distR="0" wp14:anchorId="08225B4F" wp14:editId="400C8E67">
+          <wp:inline distT="0" distB="0" distL="0" distR="0" wp14:anchorId="08225B4F" wp14:editId="4BBE48C3">
             <wp:extent cx="2933700" cy="1942430"/>
             <wp:effectExtent l="0" t="0" r="0" b="1270"/>
             <wp:docPr id="7" name="Kép 7" descr="C:\Users\elnabulsy.csongor\Downloads\ui_structure.png"/>
@@ -1828,7 +1761,7 @@
           <w:szCs w:val="36"/>
         </w:rPr>
         <w:drawing>
-          <wp:inline distT="0" distB="0" distL="0" distR="0" wp14:anchorId="2C256DB5" wp14:editId="6887E296">
+          <wp:inline distT="0" distB="0" distL="0" distR="0" wp14:anchorId="2C256DB5" wp14:editId="3430B5E1">
             <wp:extent cx="3329940" cy="1752493"/>
             <wp:effectExtent l="0" t="0" r="3810" b="635"/>
             <wp:docPr id="9" name="Kép 9"/>
@@ -1999,25 +1932,7 @@
           <w:sz w:val="36"/>
           <w:szCs w:val="36"/>
         </w:rPr>
-        <w:t xml:space="preserve">Az </w:t>
-      </w:r>
-      <w:proofErr w:type="spellStart"/>
-      <w:r>
-        <w:rPr>
-          <w:rFonts w:ascii="Times New Roman" w:eastAsia="Times New Roman" w:hAnsi="Times New Roman" w:cs="Times New Roman"/>
-          <w:sz w:val="36"/>
-          <w:szCs w:val="36"/>
-        </w:rPr>
-        <w:t>admin</w:t>
-      </w:r>
-      <w:proofErr w:type="spellEnd"/>
-      <w:r>
-        <w:rPr>
-          <w:rFonts w:ascii="Times New Roman" w:eastAsia="Times New Roman" w:hAnsi="Times New Roman" w:cs="Times New Roman"/>
-          <w:sz w:val="36"/>
-          <w:szCs w:val="36"/>
-        </w:rPr>
-        <w:t xml:space="preserve"> UI oldal megtervezése digitális </w:t>
+        <w:t xml:space="preserve">Az admin UI oldal megtervezése digitális </w:t>
       </w:r>
       <w:r>
         <w:rPr>
@@ -2072,23 +1987,13 @@
           <w:szCs w:val="36"/>
         </w:rPr>
       </w:pPr>
-      <w:proofErr w:type="spellStart"/>
-      <w:r>
-        <w:rPr>
-          <w:rFonts w:ascii="Times New Roman" w:eastAsia="Times New Roman" w:hAnsi="Times New Roman" w:cs="Times New Roman"/>
-          <w:sz w:val="36"/>
-          <w:szCs w:val="36"/>
-        </w:rPr>
-        <w:t>Admin</w:t>
-      </w:r>
-      <w:proofErr w:type="spellEnd"/>
-      <w:r>
-        <w:rPr>
-          <w:rFonts w:ascii="Times New Roman" w:eastAsia="Times New Roman" w:hAnsi="Times New Roman" w:cs="Times New Roman"/>
-          <w:sz w:val="36"/>
-          <w:szCs w:val="36"/>
-        </w:rPr>
-        <w:t xml:space="preserve"> oldal:</w:t>
+      <w:r>
+        <w:rPr>
+          <w:rFonts w:ascii="Times New Roman" w:eastAsia="Times New Roman" w:hAnsi="Times New Roman" w:cs="Times New Roman"/>
+          <w:sz w:val="36"/>
+          <w:szCs w:val="36"/>
+        </w:rPr>
+        <w:t>Admin oldal:</w:t>
       </w:r>
     </w:p>
     <w:p>
@@ -2321,42 +2226,15 @@
           <w:sz w:val="36"/>
           <w:szCs w:val="36"/>
         </w:rPr>
-        <w:t xml:space="preserve">, </w:t>
-      </w:r>
-      <w:proofErr w:type="spellStart"/>
-      <w:r>
-        <w:rPr>
-          <w:rFonts w:ascii="Times New Roman" w:eastAsia="Times New Roman" w:hAnsi="Times New Roman" w:cs="Times New Roman"/>
-          <w:sz w:val="36"/>
-          <w:szCs w:val="36"/>
-        </w:rPr>
-        <w:t>Vue</w:t>
-      </w:r>
-      <w:proofErr w:type="spellEnd"/>
-      <w:r>
-        <w:rPr>
-          <w:rFonts w:ascii="Times New Roman" w:eastAsia="Times New Roman" w:hAnsi="Times New Roman" w:cs="Times New Roman"/>
-          <w:sz w:val="36"/>
-          <w:szCs w:val="36"/>
-        </w:rPr>
-        <w:t xml:space="preserve"> router</w:t>
-      </w:r>
-      <w:r>
-        <w:rPr>
-          <w:rFonts w:ascii="Times New Roman" w:eastAsia="Times New Roman" w:hAnsi="Times New Roman" w:cs="Times New Roman"/>
-          <w:sz w:val="36"/>
-          <w:szCs w:val="36"/>
-        </w:rPr>
-        <w:t xml:space="preserve">) létrehozása </w:t>
-      </w:r>
-      <w:proofErr w:type="spellStart"/>
-      <w:r>
-        <w:rPr>
-          <w:rFonts w:ascii="Times New Roman" w:eastAsia="Times New Roman" w:hAnsi="Times New Roman" w:cs="Times New Roman"/>
-          <w:sz w:val="36"/>
-          <w:szCs w:val="36"/>
-        </w:rPr>
-        <w:t>frontend</w:t>
+        <w:t>, Vue router</w:t>
+      </w:r>
+      <w:r>
+        <w:rPr>
+          <w:rFonts w:ascii="Times New Roman" w:eastAsia="Times New Roman" w:hAnsi="Times New Roman" w:cs="Times New Roman"/>
+          <w:sz w:val="36"/>
+          <w:szCs w:val="36"/>
+        </w:rPr>
+        <w:t>) létrehozása frontend</w:t>
       </w:r>
       <w:r>
         <w:rPr>
@@ -2366,7 +2244,6 @@
         </w:rPr>
         <w:t>Part</w:t>
       </w:r>
-      <w:proofErr w:type="spellEnd"/>
       <w:r>
         <w:rPr>
           <w:rFonts w:ascii="Times New Roman" w:eastAsia="Times New Roman" w:hAnsi="Times New Roman" w:cs="Times New Roman"/>
@@ -2386,7 +2263,7 @@
     </w:p>
     <w:p>
       <w:pPr>
-        <w:pStyle w:val="ListParagraph"/>
+        <w:pStyle w:val="Listaszerbekezds"/>
         <w:numPr>
           <w:ilvl w:val="0"/>
           <w:numId w:val="2"/>
@@ -2408,7 +2285,7 @@
     </w:p>
     <w:p>
       <w:pPr>
-        <w:pStyle w:val="ListParagraph"/>
+        <w:pStyle w:val="Listaszerbekezds"/>
         <w:numPr>
           <w:ilvl w:val="0"/>
           <w:numId w:val="2"/>
@@ -2419,28 +2296,18 @@
           <w:szCs w:val="36"/>
         </w:rPr>
       </w:pPr>
-      <w:proofErr w:type="spellStart"/>
-      <w:r>
-        <w:rPr>
-          <w:rFonts w:ascii="Times New Roman" w:eastAsia="Times New Roman" w:hAnsi="Times New Roman" w:cs="Times New Roman"/>
-          <w:sz w:val="36"/>
-          <w:szCs w:val="36"/>
-        </w:rPr>
-        <w:t>route</w:t>
-      </w:r>
-      <w:proofErr w:type="spellEnd"/>
-      <w:r>
-        <w:rPr>
-          <w:rFonts w:ascii="Times New Roman" w:eastAsia="Times New Roman" w:hAnsi="Times New Roman" w:cs="Times New Roman"/>
-          <w:sz w:val="36"/>
-          <w:szCs w:val="36"/>
-        </w:rPr>
-        <w:t>-ok definiálása</w:t>
-      </w:r>
-    </w:p>
-    <w:p>
-      <w:pPr>
-        <w:pStyle w:val="ListParagraph"/>
+      <w:r>
+        <w:rPr>
+          <w:rFonts w:ascii="Times New Roman" w:eastAsia="Times New Roman" w:hAnsi="Times New Roman" w:cs="Times New Roman"/>
+          <w:sz w:val="36"/>
+          <w:szCs w:val="36"/>
+        </w:rPr>
+        <w:t>route-ok definiálása</w:t>
+      </w:r>
+    </w:p>
+    <w:p>
+      <w:pPr>
+        <w:pStyle w:val="Listaszerbekezds"/>
         <w:numPr>
           <w:ilvl w:val="0"/>
           <w:numId w:val="2"/>
@@ -2451,34 +2318,14 @@
           <w:szCs w:val="36"/>
         </w:rPr>
       </w:pPr>
-      <w:proofErr w:type="spellStart"/>
-      <w:r>
-        <w:rPr>
-          <w:rFonts w:ascii="Times New Roman" w:eastAsia="Times New Roman" w:hAnsi="Times New Roman" w:cs="Times New Roman"/>
-          <w:sz w:val="36"/>
-          <w:szCs w:val="36"/>
-        </w:rPr>
-        <w:t>header</w:t>
-      </w:r>
-      <w:proofErr w:type="spellEnd"/>
-      <w:r>
-        <w:rPr>
-          <w:rFonts w:ascii="Times New Roman" w:eastAsia="Times New Roman" w:hAnsi="Times New Roman" w:cs="Times New Roman"/>
-          <w:sz w:val="36"/>
-          <w:szCs w:val="36"/>
-        </w:rPr>
-        <w:t xml:space="preserve"> és </w:t>
-      </w:r>
-      <w:proofErr w:type="spellStart"/>
-      <w:r>
-        <w:rPr>
-          <w:rFonts w:ascii="Times New Roman" w:eastAsia="Times New Roman" w:hAnsi="Times New Roman" w:cs="Times New Roman"/>
-          <w:sz w:val="36"/>
-          <w:szCs w:val="36"/>
-        </w:rPr>
-        <w:t>footer</w:t>
-      </w:r>
-      <w:proofErr w:type="spellEnd"/>
+      <w:r>
+        <w:rPr>
+          <w:rFonts w:ascii="Times New Roman" w:eastAsia="Times New Roman" w:hAnsi="Times New Roman" w:cs="Times New Roman"/>
+          <w:sz w:val="36"/>
+          <w:szCs w:val="36"/>
+        </w:rPr>
+        <w:t>header és footer</w:t>
+      </w:r>
       <w:r>
         <w:rPr>
           <w:rFonts w:ascii="Times New Roman" w:eastAsia="Times New Roman" w:hAnsi="Times New Roman" w:cs="Times New Roman"/>
@@ -2498,7 +2345,7 @@
     </w:p>
     <w:p>
       <w:pPr>
-        <w:pStyle w:val="ListParagraph"/>
+        <w:pStyle w:val="Listaszerbekezds"/>
         <w:numPr>
           <w:ilvl w:val="0"/>
           <w:numId w:val="2"/>
@@ -2509,46 +2356,18 @@
           <w:szCs w:val="36"/>
         </w:rPr>
       </w:pPr>
-      <w:proofErr w:type="spellStart"/>
-      <w:r>
-        <w:rPr>
-          <w:rFonts w:ascii="Times New Roman" w:eastAsia="Times New Roman" w:hAnsi="Times New Roman" w:cs="Times New Roman"/>
-          <w:sz w:val="36"/>
-          <w:szCs w:val="36"/>
-        </w:rPr>
-        <w:t>header</w:t>
-      </w:r>
-      <w:proofErr w:type="spellEnd"/>
-      <w:r>
-        <w:rPr>
-          <w:rFonts w:ascii="Times New Roman" w:eastAsia="Times New Roman" w:hAnsi="Times New Roman" w:cs="Times New Roman"/>
-          <w:sz w:val="36"/>
-          <w:szCs w:val="36"/>
-        </w:rPr>
-        <w:t>-main-</w:t>
-      </w:r>
-      <w:proofErr w:type="spellStart"/>
-      <w:r>
-        <w:rPr>
-          <w:rFonts w:ascii="Times New Roman" w:eastAsia="Times New Roman" w:hAnsi="Times New Roman" w:cs="Times New Roman"/>
-          <w:sz w:val="36"/>
-          <w:szCs w:val="36"/>
-        </w:rPr>
-        <w:t>footer</w:t>
-      </w:r>
-      <w:proofErr w:type="spellEnd"/>
-      <w:r>
-        <w:rPr>
-          <w:rFonts w:ascii="Times New Roman" w:eastAsia="Times New Roman" w:hAnsi="Times New Roman" w:cs="Times New Roman"/>
-          <w:sz w:val="36"/>
-          <w:szCs w:val="36"/>
-        </w:rPr>
-        <w:t>-struktúra létrehozása</w:t>
-      </w:r>
-    </w:p>
-    <w:p>
-      <w:pPr>
-        <w:pStyle w:val="ListParagraph"/>
+      <w:r>
+        <w:rPr>
+          <w:rFonts w:ascii="Times New Roman" w:eastAsia="Times New Roman" w:hAnsi="Times New Roman" w:cs="Times New Roman"/>
+          <w:sz w:val="36"/>
+          <w:szCs w:val="36"/>
+        </w:rPr>
+        <w:t>header-main-footer-struktúra létrehozása</w:t>
+      </w:r>
+    </w:p>
+    <w:p>
+      <w:pPr>
+        <w:pStyle w:val="Listaszerbekezds"/>
         <w:numPr>
           <w:ilvl w:val="0"/>
           <w:numId w:val="2"/>
@@ -2675,25 +2494,7 @@
           <w:sz w:val="36"/>
           <w:szCs w:val="36"/>
         </w:rPr>
-        <w:t xml:space="preserve">(Susán Csongor) A </w:t>
-      </w:r>
-      <w:proofErr w:type="spellStart"/>
-      <w:r>
-        <w:rPr>
-          <w:rFonts w:ascii="Times New Roman" w:eastAsia="Times New Roman" w:hAnsi="Times New Roman" w:cs="Times New Roman"/>
-          <w:sz w:val="36"/>
-          <w:szCs w:val="36"/>
-        </w:rPr>
-        <w:t>frontendPart</w:t>
-      </w:r>
-      <w:proofErr w:type="spellEnd"/>
-      <w:r>
-        <w:rPr>
-          <w:rFonts w:ascii="Times New Roman" w:eastAsia="Times New Roman" w:hAnsi="Times New Roman" w:cs="Times New Roman"/>
-          <w:sz w:val="36"/>
-          <w:szCs w:val="36"/>
-        </w:rPr>
-        <w:t xml:space="preserve"> projekt átnézése, stílus hi</w:t>
+        <w:t>(Susán Csongor) A frontendPart projekt átnézése, stílus hi</w:t>
       </w:r>
       <w:r>
         <w:rPr>
@@ -2859,25 +2660,7 @@
           <w:sz w:val="36"/>
           <w:szCs w:val="36"/>
         </w:rPr>
-        <w:t xml:space="preserve">variánsa, Susán: login befejezése és </w:t>
-      </w:r>
-      <w:proofErr w:type="spellStart"/>
-      <w:r>
-        <w:rPr>
-          <w:rFonts w:ascii="Times New Roman" w:eastAsia="Times New Roman" w:hAnsi="Times New Roman" w:cs="Times New Roman"/>
-          <w:sz w:val="36"/>
-          <w:szCs w:val="36"/>
-        </w:rPr>
-        <w:t>admin</w:t>
-      </w:r>
-      <w:proofErr w:type="spellEnd"/>
-      <w:r>
-        <w:rPr>
-          <w:rFonts w:ascii="Times New Roman" w:eastAsia="Times New Roman" w:hAnsi="Times New Roman" w:cs="Times New Roman"/>
-          <w:sz w:val="36"/>
-          <w:szCs w:val="36"/>
-        </w:rPr>
-        <w:t xml:space="preserve"> elkezdése, valamint a logika kidolgozásának megkezdése</w:t>
+        <w:t>variánsa, Susán: login befejezése és admin elkezdése, valamint a logika kidolgozásának megkezdése</w:t>
       </w:r>
       <w:r>
         <w:rPr>
@@ -3004,71 +2787,7 @@
           <w:sz w:val="36"/>
           <w:szCs w:val="36"/>
         </w:rPr>
-        <w:t xml:space="preserve">(El-Nabulsy Csongor Alan) Főbb </w:t>
-      </w:r>
-      <w:proofErr w:type="gramStart"/>
-      <w:r>
-        <w:rPr>
-          <w:rFonts w:ascii="Times New Roman" w:eastAsia="Times New Roman" w:hAnsi="Times New Roman" w:cs="Times New Roman"/>
-          <w:sz w:val="36"/>
-          <w:szCs w:val="36"/>
-        </w:rPr>
-        <w:t>nézetek(</w:t>
-      </w:r>
-      <w:proofErr w:type="spellStart"/>
-      <w:proofErr w:type="gramEnd"/>
-      <w:r>
-        <w:rPr>
-          <w:rFonts w:ascii="Times New Roman" w:eastAsia="Times New Roman" w:hAnsi="Times New Roman" w:cs="Times New Roman"/>
-          <w:sz w:val="36"/>
-          <w:szCs w:val="36"/>
-        </w:rPr>
-        <w:t>HomeView</w:t>
-      </w:r>
-      <w:proofErr w:type="spellEnd"/>
-      <w:r>
-        <w:rPr>
-          <w:rFonts w:ascii="Times New Roman" w:eastAsia="Times New Roman" w:hAnsi="Times New Roman" w:cs="Times New Roman"/>
-          <w:sz w:val="36"/>
-          <w:szCs w:val="36"/>
-        </w:rPr>
-        <w:t xml:space="preserve">, </w:t>
-      </w:r>
-      <w:proofErr w:type="spellStart"/>
-      <w:r>
-        <w:rPr>
-          <w:rFonts w:ascii="Times New Roman" w:eastAsia="Times New Roman" w:hAnsi="Times New Roman" w:cs="Times New Roman"/>
-          <w:sz w:val="36"/>
-          <w:szCs w:val="36"/>
-        </w:rPr>
-        <w:t>StudentHomePage</w:t>
-      </w:r>
-      <w:proofErr w:type="spellEnd"/>
-      <w:r>
-        <w:rPr>
-          <w:rFonts w:ascii="Times New Roman" w:eastAsia="Times New Roman" w:hAnsi="Times New Roman" w:cs="Times New Roman"/>
-          <w:sz w:val="36"/>
-          <w:szCs w:val="36"/>
-        </w:rPr>
-        <w:t xml:space="preserve">, </w:t>
-      </w:r>
-      <w:proofErr w:type="spellStart"/>
-      <w:r>
-        <w:rPr>
-          <w:rFonts w:ascii="Times New Roman" w:eastAsia="Times New Roman" w:hAnsi="Times New Roman" w:cs="Times New Roman"/>
-          <w:sz w:val="36"/>
-          <w:szCs w:val="36"/>
-        </w:rPr>
-        <w:t>SchedulerView</w:t>
-      </w:r>
-      <w:proofErr w:type="spellEnd"/>
-      <w:r>
-        <w:rPr>
-          <w:rFonts w:ascii="Times New Roman" w:eastAsia="Times New Roman" w:hAnsi="Times New Roman" w:cs="Times New Roman"/>
-          <w:sz w:val="36"/>
-          <w:szCs w:val="36"/>
-        </w:rPr>
-        <w:t>) szerkezetének kialakítása és a komponensek működésének ellenőrzése, a felhasználói felület stílusának kialakítása, hogy az oldal elrendezése megfeleljen a megtervezett UI-terveknek.</w:t>
+        <w:t>(El-Nabulsy Csongor Alan) Főbb nézetek(HomeView, StudentHomePage, SchedulerView) szerkezetének kialakítása és a komponensek működésének ellenőrzése, a felhasználói felület stílusának kialakítása, hogy az oldal elrendezése megfeleljen a megtervezett UI-terveknek.</w:t>
       </w:r>
     </w:p>
     <w:p>
@@ -3162,25 +2881,7 @@
           <w:sz w:val="36"/>
           <w:szCs w:val="36"/>
         </w:rPr>
-        <w:t xml:space="preserve">, a routerben a főoldalak variánsainak gyerek </w:t>
-      </w:r>
-      <w:proofErr w:type="spellStart"/>
-      <w:r>
-        <w:rPr>
-          <w:rFonts w:ascii="Times New Roman" w:eastAsia="Times New Roman" w:hAnsi="Times New Roman" w:cs="Times New Roman"/>
-          <w:sz w:val="36"/>
-          <w:szCs w:val="36"/>
-        </w:rPr>
-        <w:t>route</w:t>
-      </w:r>
-      <w:proofErr w:type="spellEnd"/>
-      <w:r>
-        <w:rPr>
-          <w:rFonts w:ascii="Times New Roman" w:eastAsia="Times New Roman" w:hAnsi="Times New Roman" w:cs="Times New Roman"/>
-          <w:sz w:val="36"/>
-          <w:szCs w:val="36"/>
-        </w:rPr>
-        <w:t>-okba szervezése</w:t>
+        <w:t>, a routerben a főoldalak variánsainak gyerek route-okba szervezése</w:t>
       </w:r>
       <w:r>
         <w:rPr>
@@ -3196,51 +2897,15 @@
           <w:sz w:val="36"/>
           <w:szCs w:val="36"/>
         </w:rPr>
-        <w:t xml:space="preserve">, az új szabvány mintájára az </w:t>
-      </w:r>
-      <w:proofErr w:type="spellStart"/>
-      <w:r>
-        <w:rPr>
-          <w:rFonts w:ascii="Times New Roman" w:eastAsia="Times New Roman" w:hAnsi="Times New Roman" w:cs="Times New Roman"/>
-          <w:sz w:val="36"/>
-          <w:szCs w:val="36"/>
-        </w:rPr>
-        <w:t>admin</w:t>
-      </w:r>
-      <w:proofErr w:type="spellEnd"/>
-      <w:r>
-        <w:rPr>
-          <w:rFonts w:ascii="Times New Roman" w:eastAsia="Times New Roman" w:hAnsi="Times New Roman" w:cs="Times New Roman"/>
-          <w:sz w:val="36"/>
-          <w:szCs w:val="36"/>
-        </w:rPr>
-        <w:t xml:space="preserve"> nézet (gombok és rövid leírás azok alá) létrehozása</w:t>
-      </w:r>
-      <w:r>
-        <w:rPr>
-          <w:rFonts w:ascii="Times New Roman" w:eastAsia="Times New Roman" w:hAnsi="Times New Roman" w:cs="Times New Roman"/>
-          <w:sz w:val="36"/>
-          <w:szCs w:val="36"/>
-        </w:rPr>
-        <w:t xml:space="preserve">, felesleges import mezők kiszedése az </w:t>
-      </w:r>
-      <w:proofErr w:type="spellStart"/>
-      <w:r>
-        <w:rPr>
-          <w:rFonts w:ascii="Times New Roman" w:eastAsia="Times New Roman" w:hAnsi="Times New Roman" w:cs="Times New Roman"/>
-          <w:sz w:val="36"/>
-          <w:szCs w:val="36"/>
-        </w:rPr>
-        <w:t>App.vue</w:t>
-      </w:r>
-      <w:proofErr w:type="spellEnd"/>
-      <w:r>
-        <w:rPr>
-          <w:rFonts w:ascii="Times New Roman" w:eastAsia="Times New Roman" w:hAnsi="Times New Roman" w:cs="Times New Roman"/>
-          <w:sz w:val="36"/>
-          <w:szCs w:val="36"/>
-        </w:rPr>
-        <w:t xml:space="preserve"> fájlból</w:t>
+        <w:t>, az új szabvány mintájára az admin nézet (gombok és rövid leírás azok alá) létrehozása</w:t>
+      </w:r>
+      <w:r>
+        <w:rPr>
+          <w:rFonts w:ascii="Times New Roman" w:eastAsia="Times New Roman" w:hAnsi="Times New Roman" w:cs="Times New Roman"/>
+          <w:sz w:val="36"/>
+          <w:szCs w:val="36"/>
+        </w:rPr>
+        <w:t>, felesleges import mezők kiszedése az App.vue fájlból</w:t>
       </w:r>
     </w:p>
     <w:p>
@@ -3355,70 +3020,7 @@
           <w:sz w:val="36"/>
           <w:szCs w:val="36"/>
         </w:rPr>
-        <w:t xml:space="preserve"> Nézetek végleges kialakítása (El-Nabulsy: </w:t>
-      </w:r>
-      <w:proofErr w:type="spellStart"/>
-      <w:r>
-        <w:rPr>
-          <w:rFonts w:ascii="Times New Roman" w:eastAsia="Times New Roman" w:hAnsi="Times New Roman" w:cs="Times New Roman"/>
-          <w:sz w:val="36"/>
-          <w:szCs w:val="36"/>
-        </w:rPr>
-        <w:t>HomeView</w:t>
-      </w:r>
-      <w:proofErr w:type="spellEnd"/>
-      <w:r>
-        <w:rPr>
-          <w:rFonts w:ascii="Times New Roman" w:eastAsia="Times New Roman" w:hAnsi="Times New Roman" w:cs="Times New Roman"/>
-          <w:sz w:val="36"/>
-          <w:szCs w:val="36"/>
-        </w:rPr>
-        <w:t xml:space="preserve">, </w:t>
-      </w:r>
-      <w:proofErr w:type="spellStart"/>
-      <w:r>
-        <w:rPr>
-          <w:rFonts w:ascii="Times New Roman" w:eastAsia="Times New Roman" w:hAnsi="Times New Roman" w:cs="Times New Roman"/>
-          <w:sz w:val="36"/>
-          <w:szCs w:val="36"/>
-        </w:rPr>
-        <w:t>RequestView</w:t>
-      </w:r>
-      <w:proofErr w:type="spellEnd"/>
-      <w:r>
-        <w:rPr>
-          <w:rFonts w:ascii="Times New Roman" w:eastAsia="Times New Roman" w:hAnsi="Times New Roman" w:cs="Times New Roman"/>
-          <w:sz w:val="36"/>
-          <w:szCs w:val="36"/>
-        </w:rPr>
-        <w:t xml:space="preserve">, </w:t>
-      </w:r>
-      <w:proofErr w:type="spellStart"/>
-      <w:r>
-        <w:rPr>
-          <w:rFonts w:ascii="Times New Roman" w:eastAsia="Times New Roman" w:hAnsi="Times New Roman" w:cs="Times New Roman"/>
-          <w:sz w:val="36"/>
-          <w:szCs w:val="36"/>
-        </w:rPr>
-        <w:t>SendView</w:t>
-      </w:r>
-      <w:proofErr w:type="spellEnd"/>
-      <w:r>
-        <w:rPr>
-          <w:rFonts w:ascii="Times New Roman" w:eastAsia="Times New Roman" w:hAnsi="Times New Roman" w:cs="Times New Roman"/>
-          <w:sz w:val="36"/>
-          <w:szCs w:val="36"/>
-        </w:rPr>
-        <w:t xml:space="preserve">; Susán: főoldalak integrálása a </w:t>
-      </w:r>
-      <w:proofErr w:type="spellStart"/>
-      <w:r>
-        <w:rPr>
-          <w:rFonts w:ascii="Times New Roman" w:eastAsia="Times New Roman" w:hAnsi="Times New Roman" w:cs="Times New Roman"/>
-          <w:sz w:val="36"/>
-          <w:szCs w:val="36"/>
-        </w:rPr>
-        <w:t>HomeLayout</w:t>
+        <w:t xml:space="preserve"> Nézetek végleges kialakítása (El-Nabulsy: HomeView, RequestView, SendView; Susán: főoldalak integrálása a HomeLayout</w:t>
       </w:r>
       <w:r>
         <w:rPr>
@@ -3434,16 +3036,7 @@
           <w:sz w:val="36"/>
           <w:szCs w:val="36"/>
         </w:rPr>
-        <w:t>ba</w:t>
-      </w:r>
-      <w:proofErr w:type="spellEnd"/>
-      <w:r>
-        <w:rPr>
-          <w:rFonts w:ascii="Times New Roman" w:eastAsia="Times New Roman" w:hAnsi="Times New Roman" w:cs="Times New Roman"/>
-          <w:sz w:val="36"/>
-          <w:szCs w:val="36"/>
-        </w:rPr>
-        <w:t>)</w:t>
+        <w:t>ba)</w:t>
       </w:r>
       <w:r>
         <w:rPr>
@@ -3474,7 +3067,7 @@
     </w:p>
     <w:p>
       <w:pPr>
-        <w:pStyle w:val="ListParagraph"/>
+        <w:pStyle w:val="Listaszerbekezds"/>
         <w:numPr>
           <w:ilvl w:val="0"/>
           <w:numId w:val="4"/>
@@ -3492,30 +3085,12 @@
           <w:sz w:val="36"/>
           <w:szCs w:val="36"/>
         </w:rPr>
-        <w:t xml:space="preserve">Példa adatok felvétele a </w:t>
-      </w:r>
-      <w:proofErr w:type="spellStart"/>
-      <w:r>
-        <w:rPr>
-          <w:rFonts w:ascii="Times New Roman" w:eastAsia="Times New Roman" w:hAnsi="Times New Roman" w:cs="Times New Roman"/>
-          <w:sz w:val="36"/>
-          <w:szCs w:val="36"/>
-        </w:rPr>
-        <w:t>HomeLayout-ba</w:t>
-      </w:r>
-      <w:proofErr w:type="spellEnd"/>
-      <w:r>
-        <w:rPr>
-          <w:rFonts w:ascii="Times New Roman" w:eastAsia="Times New Roman" w:hAnsi="Times New Roman" w:cs="Times New Roman"/>
-          <w:sz w:val="36"/>
-          <w:szCs w:val="36"/>
-        </w:rPr>
-        <w:t xml:space="preserve"> a helyes működés tesztelésének érdekében</w:t>
-      </w:r>
-    </w:p>
-    <w:p>
-      <w:pPr>
-        <w:pStyle w:val="ListParagraph"/>
+        <w:t>Példa adatok felvétele a HomeLayout-ba a helyes működés tesztelésének érdekében</w:t>
+      </w:r>
+    </w:p>
+    <w:p>
+      <w:pPr>
+        <w:pStyle w:val="Listaszerbekezds"/>
         <w:numPr>
           <w:ilvl w:val="0"/>
           <w:numId w:val="4"/>
@@ -3546,7 +3121,7 @@
     </w:p>
     <w:p>
       <w:pPr>
-        <w:pStyle w:val="ListParagraph"/>
+        <w:pStyle w:val="Listaszerbekezds"/>
         <w:numPr>
           <w:ilvl w:val="0"/>
           <w:numId w:val="4"/>
@@ -3558,8 +3133,6 @@
           <w:szCs w:val="36"/>
         </w:rPr>
       </w:pPr>
-      <w:proofErr w:type="spellStart"/>
-      <w:proofErr w:type="gramStart"/>
       <w:r>
         <w:rPr>
           <w:rFonts w:ascii="Times New Roman" w:eastAsia="Times New Roman" w:hAnsi="Times New Roman" w:cs="Times New Roman"/>
@@ -3567,48 +3140,12 @@
           <w:szCs w:val="36"/>
         </w:rPr>
         <w:lastRenderedPageBreak/>
-        <w:t>meta.title</w:t>
-      </w:r>
-      <w:proofErr w:type="gramEnd"/>
-      <w:r>
-        <w:rPr>
-          <w:rFonts w:ascii="Times New Roman" w:eastAsia="Times New Roman" w:hAnsi="Times New Roman" w:cs="Times New Roman"/>
-          <w:sz w:val="36"/>
-          <w:szCs w:val="36"/>
-        </w:rPr>
-        <w:t>-ekben</w:t>
-      </w:r>
-      <w:proofErr w:type="spellEnd"/>
-      <w:r>
-        <w:rPr>
-          <w:rFonts w:ascii="Times New Roman" w:eastAsia="Times New Roman" w:hAnsi="Times New Roman" w:cs="Times New Roman"/>
-          <w:sz w:val="36"/>
-          <w:szCs w:val="36"/>
-        </w:rPr>
-        <w:t xml:space="preserve"> és a </w:t>
-      </w:r>
-      <w:proofErr w:type="spellStart"/>
-      <w:r>
-        <w:rPr>
-          <w:rFonts w:ascii="Times New Roman" w:eastAsia="Times New Roman" w:hAnsi="Times New Roman" w:cs="Times New Roman"/>
-          <w:sz w:val="36"/>
-          <w:szCs w:val="36"/>
-        </w:rPr>
-        <w:t>beforeEach</w:t>
-      </w:r>
-      <w:proofErr w:type="spellEnd"/>
-      <w:r>
-        <w:rPr>
-          <w:rFonts w:ascii="Times New Roman" w:eastAsia="Times New Roman" w:hAnsi="Times New Roman" w:cs="Times New Roman"/>
-          <w:sz w:val="36"/>
-          <w:szCs w:val="36"/>
-        </w:rPr>
-        <w:t>-ben oldalcímek meghatározása</w:t>
-      </w:r>
-    </w:p>
-    <w:p>
-      <w:pPr>
-        <w:pStyle w:val="ListParagraph"/>
+        <w:t>meta.title-ekben és a beforeEach-ben oldalcímek meghatározása</w:t>
+      </w:r>
+    </w:p>
+    <w:p>
+      <w:pPr>
+        <w:pStyle w:val="Listaszerbekezds"/>
         <w:numPr>
           <w:ilvl w:val="0"/>
           <w:numId w:val="4"/>
@@ -3647,7 +3184,7 @@
     </w:p>
     <w:p>
       <w:pPr>
-        <w:pStyle w:val="ListParagraph"/>
+        <w:pStyle w:val="Listaszerbekezds"/>
         <w:numPr>
           <w:ilvl w:val="0"/>
           <w:numId w:val="4"/>
@@ -3659,46 +3196,18 @@
           <w:szCs w:val="36"/>
         </w:rPr>
       </w:pPr>
-      <w:proofErr w:type="spellStart"/>
-      <w:r>
-        <w:rPr>
-          <w:rFonts w:ascii="Times New Roman" w:eastAsia="Times New Roman" w:hAnsi="Times New Roman" w:cs="Times New Roman"/>
-          <w:sz w:val="36"/>
-          <w:szCs w:val="36"/>
-        </w:rPr>
-        <w:t>auth</w:t>
-      </w:r>
-      <w:proofErr w:type="spellEnd"/>
-      <w:r>
-        <w:rPr>
-          <w:rFonts w:ascii="Times New Roman" w:eastAsia="Times New Roman" w:hAnsi="Times New Roman" w:cs="Times New Roman"/>
-          <w:sz w:val="36"/>
-          <w:szCs w:val="36"/>
-        </w:rPr>
-        <w:t xml:space="preserve"> függvény hozzáadása a bejelentkezési képernyőhöz (</w:t>
-      </w:r>
-      <w:proofErr w:type="spellStart"/>
-      <w:r>
-        <w:rPr>
-          <w:rFonts w:ascii="Times New Roman" w:eastAsia="Times New Roman" w:hAnsi="Times New Roman" w:cs="Times New Roman"/>
-          <w:sz w:val="36"/>
-          <w:szCs w:val="36"/>
-        </w:rPr>
-        <w:t>LoginView</w:t>
-      </w:r>
-      <w:proofErr w:type="spellEnd"/>
-      <w:r>
-        <w:rPr>
-          <w:rFonts w:ascii="Times New Roman" w:eastAsia="Times New Roman" w:hAnsi="Times New Roman" w:cs="Times New Roman"/>
-          <w:sz w:val="36"/>
-          <w:szCs w:val="36"/>
-        </w:rPr>
-        <w:t>), ami egyelőre üres, egy komment jelzi annak célját</w:t>
-      </w:r>
-    </w:p>
-    <w:p>
-      <w:pPr>
-        <w:pStyle w:val="ListParagraph"/>
+      <w:r>
+        <w:rPr>
+          <w:rFonts w:ascii="Times New Roman" w:eastAsia="Times New Roman" w:hAnsi="Times New Roman" w:cs="Times New Roman"/>
+          <w:sz w:val="36"/>
+          <w:szCs w:val="36"/>
+        </w:rPr>
+        <w:t>auth függvény hozzáadása a bejelentkezési képernyőhöz (LoginView), ami egyelőre üres, egy komment jelzi annak célját</w:t>
+      </w:r>
+    </w:p>
+    <w:p>
+      <w:pPr>
+        <w:pStyle w:val="Listaszerbekezds"/>
         <w:numPr>
           <w:ilvl w:val="0"/>
           <w:numId w:val="4"/>
@@ -3752,99 +3261,31 @@
           <w:szCs w:val="36"/>
         </w:rPr>
       </w:pPr>
-      <w:r>
-        <w:rPr>
-          <w:rFonts w:ascii="Times New Roman" w:eastAsia="Times New Roman" w:hAnsi="Times New Roman" w:cs="Times New Roman"/>
-          <w:sz w:val="36"/>
-          <w:szCs w:val="36"/>
-        </w:rPr>
-        <w:t>(El-Nabulsy Csongor)</w:t>
-      </w:r>
-    </w:p>
-    <w:p>
-      <w:pPr>
-        <w:pStyle w:val="ListParagraph"/>
-        <w:numPr>
-          <w:ilvl w:val="0"/>
-          <w:numId w:val="5"/>
-        </w:numPr>
+    </w:p>
+    <w:p>
+      <w:pPr>
         <w:jc w:val="both"/>
         <w:rPr>
           <w:rFonts w:ascii="Times New Roman" w:eastAsia="Times New Roman" w:hAnsi="Times New Roman" w:cs="Times New Roman"/>
-          <w:sz w:val="36"/>
-          <w:szCs w:val="36"/>
-        </w:rPr>
-      </w:pPr>
-      <w:r>
-        <w:rPr>
-          <w:rFonts w:ascii="Times New Roman" w:eastAsia="Times New Roman" w:hAnsi="Times New Roman" w:cs="Times New Roman"/>
-          <w:sz w:val="36"/>
-          <w:szCs w:val="36"/>
-        </w:rPr>
-        <w:t xml:space="preserve">A </w:t>
-      </w:r>
-      <w:proofErr w:type="spellStart"/>
-      <w:r>
-        <w:rPr>
-          <w:rFonts w:ascii="Times New Roman" w:eastAsia="Times New Roman" w:hAnsi="Times New Roman" w:cs="Times New Roman"/>
-          <w:sz w:val="36"/>
-          <w:szCs w:val="36"/>
-        </w:rPr>
-        <w:t>ReuqestView</w:t>
-      </w:r>
-      <w:proofErr w:type="spellEnd"/>
-      <w:r>
-        <w:rPr>
-          <w:rFonts w:ascii="Times New Roman" w:eastAsia="Times New Roman" w:hAnsi="Times New Roman" w:cs="Times New Roman"/>
-          <w:sz w:val="36"/>
-          <w:szCs w:val="36"/>
-        </w:rPr>
-        <w:t xml:space="preserve"> oldal kialakításának </w:t>
-      </w:r>
-      <w:proofErr w:type="gramStart"/>
-      <w:r>
-        <w:rPr>
-          <w:rFonts w:ascii="Times New Roman" w:eastAsia="Times New Roman" w:hAnsi="Times New Roman" w:cs="Times New Roman"/>
-          <w:sz w:val="36"/>
-          <w:szCs w:val="36"/>
-        </w:rPr>
-        <w:t>elvégzése</w:t>
-      </w:r>
-      <w:proofErr w:type="gramEnd"/>
-      <w:r>
-        <w:rPr>
-          <w:rFonts w:ascii="Times New Roman" w:eastAsia="Times New Roman" w:hAnsi="Times New Roman" w:cs="Times New Roman"/>
-          <w:sz w:val="36"/>
-          <w:szCs w:val="36"/>
-        </w:rPr>
-        <w:t xml:space="preserve"> aminek </w:t>
-      </w:r>
-      <w:proofErr w:type="gramStart"/>
-      <w:r>
-        <w:rPr>
-          <w:rFonts w:ascii="Times New Roman" w:eastAsia="Times New Roman" w:hAnsi="Times New Roman" w:cs="Times New Roman"/>
-          <w:sz w:val="36"/>
-          <w:szCs w:val="36"/>
-        </w:rPr>
-        <w:t>célja</w:t>
-      </w:r>
-      <w:proofErr w:type="gramEnd"/>
-      <w:r>
-        <w:rPr>
-          <w:rFonts w:ascii="Times New Roman" w:eastAsia="Times New Roman" w:hAnsi="Times New Roman" w:cs="Times New Roman"/>
-          <w:sz w:val="36"/>
-          <w:szCs w:val="36"/>
-        </w:rPr>
-        <w:t xml:space="preserve"> hogy a felhasználók a már meglévő zenék közül választhassanak, és azokat bekérhessék.</w:t>
-      </w:r>
-    </w:p>
-    <w:p>
-      <w:pPr>
-        <w:pStyle w:val="ListParagraph"/>
-        <w:numPr>
-          <w:ilvl w:val="0"/>
-          <w:numId w:val="5"/>
-        </w:numPr>
+          <w:b/>
+          <w:bCs/>
+          <w:sz w:val="40"/>
+          <w:szCs w:val="40"/>
+        </w:rPr>
+      </w:pPr>
+      <w:r>
+        <w:rPr>
+          <w:rFonts w:ascii="Times New Roman" w:eastAsia="Times New Roman" w:hAnsi="Times New Roman" w:cs="Times New Roman"/>
+          <w:b/>
+          <w:bCs/>
+          <w:sz w:val="40"/>
+          <w:szCs w:val="40"/>
+        </w:rPr>
+        <w:t>2026-03-11 17:45-50</w:t>
+      </w:r>
+    </w:p>
+    <w:p>
+      <w:pPr>
         <w:jc w:val="both"/>
         <w:rPr>
           <w:rFonts w:ascii="Times New Roman" w:eastAsia="Times New Roman" w:hAnsi="Times New Roman" w:cs="Times New Roman"/>
@@ -3858,25 +3299,70 @@
           <w:sz w:val="36"/>
           <w:szCs w:val="36"/>
         </w:rPr>
-        <w:t xml:space="preserve">A </w:t>
-      </w:r>
-      <w:proofErr w:type="spellStart"/>
-      <w:r>
-        <w:rPr>
-          <w:rFonts w:ascii="Times New Roman" w:eastAsia="Times New Roman" w:hAnsi="Times New Roman" w:cs="Times New Roman"/>
-          <w:sz w:val="36"/>
-          <w:szCs w:val="36"/>
-        </w:rPr>
-        <w:t>SendView</w:t>
-      </w:r>
-      <w:proofErr w:type="spellEnd"/>
-      <w:r>
-        <w:rPr>
-          <w:rFonts w:ascii="Times New Roman" w:eastAsia="Times New Roman" w:hAnsi="Times New Roman" w:cs="Times New Roman"/>
-          <w:sz w:val="36"/>
-          <w:szCs w:val="36"/>
-        </w:rPr>
-        <w:t xml:space="preserve"> oldal befejezése, amivel a felhasználók új zenéket tudnak beküldeni, amik még nem voltak bekérve.</w:t>
+        <w:t>(Susán Csongor György) Elkészül az alkalmazás logója.</w:t>
+      </w:r>
+    </w:p>
+    <w:p>
+      <w:pPr>
+        <w:jc w:val="both"/>
+        <w:rPr>
+          <w:rFonts w:ascii="Times New Roman" w:eastAsia="Times New Roman" w:hAnsi="Times New Roman" w:cs="Times New Roman"/>
+          <w:sz w:val="36"/>
+          <w:szCs w:val="36"/>
+        </w:rPr>
+      </w:pPr>
+      <w:r>
+        <w:rPr>
+          <w:noProof/>
+        </w:rPr>
+        <w:drawing>
+          <wp:inline distT="0" distB="0" distL="0" distR="0" wp14:anchorId="0697373A" wp14:editId="49CB908E">
+            <wp:extent cx="304800" cy="304800"/>
+            <wp:effectExtent l="0" t="0" r="0" b="0"/>
+            <wp:docPr id="2024739431" name="Kép 1"/>
+            <wp:cNvGraphicFramePr>
+              <a:graphicFrameLocks xmlns:a="http://schemas.openxmlformats.org/drawingml/2006/main" noChangeAspect="1"/>
+            </wp:cNvGraphicFramePr>
+            <a:graphic xmlns:a="http://schemas.openxmlformats.org/drawingml/2006/main">
+              <a:graphicData uri="http://schemas.openxmlformats.org/drawingml/2006/picture">
+                <pic:pic xmlns:pic="http://schemas.openxmlformats.org/drawingml/2006/picture">
+                  <pic:nvPicPr>
+                    <pic:cNvPr id="0" name="Picture 1"/>
+                    <pic:cNvPicPr>
+                      <a:picLocks noChangeAspect="1" noChangeArrowheads="1"/>
+                    </pic:cNvPicPr>
+                  </pic:nvPicPr>
+                  <pic:blipFill>
+                    <a:blip r:embed="rId27">
+                      <a:extLst>
+                        <a:ext uri="{28A0092B-C50C-407E-A947-70E740481C1C}">
+                          <a14:useLocalDpi xmlns:a14="http://schemas.microsoft.com/office/drawing/2010/main" val="0"/>
+                        </a:ext>
+                      </a:extLst>
+                    </a:blip>
+                    <a:srcRect/>
+                    <a:stretch>
+                      <a:fillRect/>
+                    </a:stretch>
+                  </pic:blipFill>
+                  <pic:spPr bwMode="auto">
+                    <a:xfrm>
+                      <a:off x="0" y="0"/>
+                      <a:ext cx="304800" cy="304800"/>
+                    </a:xfrm>
+                    <a:prstGeom prst="rect">
+                      <a:avLst/>
+                    </a:prstGeom>
+                    <a:noFill/>
+                    <a:ln>
+                      <a:noFill/>
+                    </a:ln>
+                  </pic:spPr>
+                </pic:pic>
+              </a:graphicData>
+            </a:graphic>
+          </wp:inline>
+        </w:drawing>
       </w:r>
     </w:p>
     <w:sectPr>
@@ -3892,119 +3378,6 @@
 <file path=word/numbering.xml><?xml version="1.0" encoding="utf-8"?>
 <w:numbering xmlns:wpc="http://schemas.microsoft.com/office/word/2010/wordprocessingCanvas" xmlns:cx="http://schemas.microsoft.com/office/drawing/2014/chartex" xmlns:cx1="http://schemas.microsoft.com/office/drawing/2015/9/8/chartex" xmlns:cx2="http://schemas.microsoft.com/office/drawing/2015/10/21/chartex" xmlns:cx3="http://schemas.microsoft.com/office/drawing/2016/5/9/chartex" xmlns:cx4="http://schemas.microsoft.com/office/drawing/2016/5/10/chartex" xmlns:cx5="http://schemas.microsoft.com/office/drawing/2016/5/11/chartex" xmlns:cx6="http://schemas.microsoft.com/office/drawing/2016/5/12/chartex" xmlns:cx7="http://schemas.microsoft.com/office/drawing/2016/5/13/chartex" xmlns:cx8="http://schemas.microsoft.com/office/drawing/2016/5/14/chartex" xmlns:mc="http://schemas.openxmlformats.org/markup-compatibility/2006" xmlns:aink="http://schemas.microsoft.com/office/drawing/2016/ink" xmlns:am3d="http://schemas.microsoft.com/office/drawing/2017/model3d" xmlns:o="urn:schemas-microsoft-com:office:office" xmlns:oel="http://schemas.microsoft.com/office/2019/extlst" xmlns:r="http://schemas.openxmlformats.org/officeDocument/2006/relationships" xmlns:m="http://schemas.openxmlformats.org/officeDocument/2006/math" xmlns:v="urn:schemas-microsoft-com:vml" xmlns:wp14="http://schemas.microsoft.com/office/word/2010/wordprocessingDrawing" xmlns:wp="http://schemas.openxmlformats.org/drawingml/2006/wordprocessingDrawing" xmlns:w10="urn:schemas-microsoft-com:office:word" xmlns:w="http://schemas.openxmlformats.org/wordprocessingml/2006/main" xmlns:w14="http://schemas.microsoft.com/office/word/2010/wordml" xmlns:w15="http://schemas.microsoft.com/office/word/2012/wordml" xmlns:w16cex="http://schemas.microsoft.com/office/word/2018/wordml/cex" xmlns:w16cid="http://schemas.microsoft.com/office/word/2016/wordml/cid" xmlns:w16="http://schemas.microsoft.com/office/word/2018/wordml" xmlns:w16du="http://schemas.microsoft.com/office/word/2023/wordml/word16du" xmlns:w16sdtdh="http://schemas.microsoft.com/office/word/2020/wordml/sdtdatahash" xmlns:w16sdtfl="http://schemas.microsoft.com/office/word/2024/wordml/sdtformatlock" xmlns:w16se="http://schemas.microsoft.com/office/word/2015/wordml/symex" xmlns:wpg="http://schemas.microsoft.com/office/word/2010/wordprocessingGroup" xmlns:wpi="http://schemas.microsoft.com/office/word/2010/wordprocessingInk" xmlns:wne="http://schemas.microsoft.com/office/word/2006/wordml" xmlns:wps="http://schemas.microsoft.com/office/word/2010/wordprocessingShape" mc:Ignorable="w14 w15 w16se w16cid w16 w16cex w16sdtdh w16sdtfl w16du wp14">
   <w:abstractNum w:abstractNumId="0" w15:restartNumberingAfterBreak="0">
-    <w:nsid w:val="0A5E6439"/>
-    <w:multiLevelType w:val="hybridMultilevel"/>
-    <w:tmpl w:val="7E701CFA"/>
-    <w:lvl w:ilvl="0" w:tplc="0218C5BE">
-      <w:start w:val="2026"/>
-      <w:numFmt w:val="bullet"/>
-      <w:lvlText w:val="-"/>
-      <w:lvlJc w:val="left"/>
-      <w:pPr>
-        <w:ind w:left="720" w:hanging="360"/>
-      </w:pPr>
-      <w:rPr>
-        <w:rFonts w:ascii="Times New Roman" w:eastAsia="Times New Roman" w:hAnsi="Times New Roman" w:cs="Times New Roman" w:hint="default"/>
-      </w:rPr>
-    </w:lvl>
-    <w:lvl w:ilvl="1" w:tplc="04090003" w:tentative="1">
-      <w:start w:val="1"/>
-      <w:numFmt w:val="bullet"/>
-      <w:lvlText w:val="o"/>
-      <w:lvlJc w:val="left"/>
-      <w:pPr>
-        <w:ind w:left="1440" w:hanging="360"/>
-      </w:pPr>
-      <w:rPr>
-        <w:rFonts w:ascii="Courier New" w:hAnsi="Courier New" w:cs="Courier New" w:hint="default"/>
-      </w:rPr>
-    </w:lvl>
-    <w:lvl w:ilvl="2" w:tplc="04090005" w:tentative="1">
-      <w:start w:val="1"/>
-      <w:numFmt w:val="bullet"/>
-      <w:lvlText w:val=""/>
-      <w:lvlJc w:val="left"/>
-      <w:pPr>
-        <w:ind w:left="2160" w:hanging="360"/>
-      </w:pPr>
-      <w:rPr>
-        <w:rFonts w:ascii="Wingdings" w:hAnsi="Wingdings" w:hint="default"/>
-      </w:rPr>
-    </w:lvl>
-    <w:lvl w:ilvl="3" w:tplc="04090001" w:tentative="1">
-      <w:start w:val="1"/>
-      <w:numFmt w:val="bullet"/>
-      <w:lvlText w:val=""/>
-      <w:lvlJc w:val="left"/>
-      <w:pPr>
-        <w:ind w:left="2880" w:hanging="360"/>
-      </w:pPr>
-      <w:rPr>
-        <w:rFonts w:ascii="Symbol" w:hAnsi="Symbol" w:hint="default"/>
-      </w:rPr>
-    </w:lvl>
-    <w:lvl w:ilvl="4" w:tplc="04090003" w:tentative="1">
-      <w:start w:val="1"/>
-      <w:numFmt w:val="bullet"/>
-      <w:lvlText w:val="o"/>
-      <w:lvlJc w:val="left"/>
-      <w:pPr>
-        <w:ind w:left="3600" w:hanging="360"/>
-      </w:pPr>
-      <w:rPr>
-        <w:rFonts w:ascii="Courier New" w:hAnsi="Courier New" w:cs="Courier New" w:hint="default"/>
-      </w:rPr>
-    </w:lvl>
-    <w:lvl w:ilvl="5" w:tplc="04090005" w:tentative="1">
-      <w:start w:val="1"/>
-      <w:numFmt w:val="bullet"/>
-      <w:lvlText w:val=""/>
-      <w:lvlJc w:val="left"/>
-      <w:pPr>
-        <w:ind w:left="4320" w:hanging="360"/>
-      </w:pPr>
-      <w:rPr>
-        <w:rFonts w:ascii="Wingdings" w:hAnsi="Wingdings" w:hint="default"/>
-      </w:rPr>
-    </w:lvl>
-    <w:lvl w:ilvl="6" w:tplc="04090001" w:tentative="1">
-      <w:start w:val="1"/>
-      <w:numFmt w:val="bullet"/>
-      <w:lvlText w:val=""/>
-      <w:lvlJc w:val="left"/>
-      <w:pPr>
-        <w:ind w:left="5040" w:hanging="360"/>
-      </w:pPr>
-      <w:rPr>
-        <w:rFonts w:ascii="Symbol" w:hAnsi="Symbol" w:hint="default"/>
-      </w:rPr>
-    </w:lvl>
-    <w:lvl w:ilvl="7" w:tplc="04090003" w:tentative="1">
-      <w:start w:val="1"/>
-      <w:numFmt w:val="bullet"/>
-      <w:lvlText w:val="o"/>
-      <w:lvlJc w:val="left"/>
-      <w:pPr>
-        <w:ind w:left="5760" w:hanging="360"/>
-      </w:pPr>
-      <w:rPr>
-        <w:rFonts w:ascii="Courier New" w:hAnsi="Courier New" w:cs="Courier New" w:hint="default"/>
-      </w:rPr>
-    </w:lvl>
-    <w:lvl w:ilvl="8" w:tplc="04090005" w:tentative="1">
-      <w:start w:val="1"/>
-      <w:numFmt w:val="bullet"/>
-      <w:lvlText w:val=""/>
-      <w:lvlJc w:val="left"/>
-      <w:pPr>
-        <w:ind w:left="6480" w:hanging="360"/>
-      </w:pPr>
-      <w:rPr>
-        <w:rFonts w:ascii="Wingdings" w:hAnsi="Wingdings" w:hint="default"/>
-      </w:rPr>
-    </w:lvl>
-  </w:abstractNum>
-  <w:abstractNum w:abstractNumId="1" w15:restartNumberingAfterBreak="0">
     <w:nsid w:val="3C1938F6"/>
     <w:multiLevelType w:val="hybridMultilevel"/>
     <w:tmpl w:val="0816ACA8"/>
@@ -4117,7 +3490,7 @@
       </w:rPr>
     </w:lvl>
   </w:abstractNum>
-  <w:abstractNum w:abstractNumId="2" w15:restartNumberingAfterBreak="0">
+  <w:abstractNum w:abstractNumId="1" w15:restartNumberingAfterBreak="0">
     <w:nsid w:val="6E7312B6"/>
     <w:multiLevelType w:val="hybridMultilevel"/>
     <w:tmpl w:val="FD80BAFC"/>
@@ -4230,7 +3603,7 @@
       </w:rPr>
     </w:lvl>
   </w:abstractNum>
-  <w:abstractNum w:abstractNumId="3" w15:restartNumberingAfterBreak="0">
+  <w:abstractNum w:abstractNumId="2" w15:restartNumberingAfterBreak="0">
     <w:nsid w:val="76FA296F"/>
     <w:multiLevelType w:val="hybridMultilevel"/>
     <w:tmpl w:val="6DAE32EA"/>
@@ -4343,7 +3716,7 @@
       </w:rPr>
     </w:lvl>
   </w:abstractNum>
-  <w:abstractNum w:abstractNumId="4" w15:restartNumberingAfterBreak="0">
+  <w:abstractNum w:abstractNumId="3" w15:restartNumberingAfterBreak="0">
     <w:nsid w:val="7EB672F7"/>
     <w:multiLevelType w:val="hybridMultilevel"/>
     <w:tmpl w:val="A6F0C99C"/>
@@ -4457,18 +3830,15 @@
     </w:lvl>
   </w:abstractNum>
   <w:num w:numId="1" w16cid:durableId="33770327">
-    <w:abstractNumId w:val="4"/>
+    <w:abstractNumId w:val="3"/>
   </w:num>
   <w:num w:numId="2" w16cid:durableId="565265875">
+    <w:abstractNumId w:val="1"/>
+  </w:num>
+  <w:num w:numId="3" w16cid:durableId="1458177206">
     <w:abstractNumId w:val="2"/>
   </w:num>
-  <w:num w:numId="3" w16cid:durableId="1458177206">
-    <w:abstractNumId w:val="3"/>
-  </w:num>
   <w:num w:numId="4" w16cid:durableId="1687830723">
-    <w:abstractNumId w:val="1"/>
-  </w:num>
-  <w:num w:numId="5" w16cid:durableId="654145176">
     <w:abstractNumId w:val="0"/>
   </w:num>
 </w:numbering>
@@ -4871,15 +4241,15 @@
     <w:lsdException w:name="Unresolved Mention" w:semiHidden="1" w:unhideWhenUsed="1"/>
     <w:lsdException w:name="Smart Link" w:semiHidden="1" w:unhideWhenUsed="1"/>
   </w:latentStyles>
-  <w:style w:type="paragraph" w:default="1" w:styleId="Normal">
+  <w:style w:type="paragraph" w:default="1" w:styleId="Norml">
     <w:name w:val="Normal"/>
     <w:qFormat/>
   </w:style>
-  <w:style w:type="paragraph" w:styleId="Heading1">
+  <w:style w:type="paragraph" w:styleId="Cmsor1">
     <w:name w:val="heading 1"/>
-    <w:basedOn w:val="Normal"/>
-    <w:next w:val="Normal"/>
-    <w:link w:val="Heading1Char"/>
+    <w:basedOn w:val="Norml"/>
+    <w:next w:val="Norml"/>
+    <w:link w:val="Cmsor1Char"/>
     <w:uiPriority w:val="9"/>
     <w:qFormat/>
     <w:rsid w:val="0005104C"/>
@@ -4896,11 +4266,11 @@
       <w:szCs w:val="40"/>
     </w:rPr>
   </w:style>
-  <w:style w:type="paragraph" w:styleId="Heading2">
+  <w:style w:type="paragraph" w:styleId="Cmsor2">
     <w:name w:val="heading 2"/>
-    <w:basedOn w:val="Normal"/>
-    <w:next w:val="Normal"/>
-    <w:link w:val="Heading2Char"/>
+    <w:basedOn w:val="Norml"/>
+    <w:next w:val="Norml"/>
+    <w:link w:val="Cmsor2Char"/>
     <w:uiPriority w:val="9"/>
     <w:semiHidden/>
     <w:unhideWhenUsed/>
@@ -4919,11 +4289,11 @@
       <w:szCs w:val="32"/>
     </w:rPr>
   </w:style>
-  <w:style w:type="paragraph" w:styleId="Heading3">
+  <w:style w:type="paragraph" w:styleId="Cmsor3">
     <w:name w:val="heading 3"/>
-    <w:basedOn w:val="Normal"/>
-    <w:next w:val="Normal"/>
-    <w:link w:val="Heading3Char"/>
+    <w:basedOn w:val="Norml"/>
+    <w:next w:val="Norml"/>
+    <w:link w:val="Cmsor3Char"/>
     <w:uiPriority w:val="9"/>
     <w:semiHidden/>
     <w:unhideWhenUsed/>
@@ -4942,11 +4312,11 @@
       <w:szCs w:val="28"/>
     </w:rPr>
   </w:style>
-  <w:style w:type="paragraph" w:styleId="Heading4">
+  <w:style w:type="paragraph" w:styleId="Cmsor4">
     <w:name w:val="heading 4"/>
-    <w:basedOn w:val="Normal"/>
-    <w:next w:val="Normal"/>
-    <w:link w:val="Heading4Char"/>
+    <w:basedOn w:val="Norml"/>
+    <w:next w:val="Norml"/>
+    <w:link w:val="Cmsor4Char"/>
     <w:uiPriority w:val="9"/>
     <w:semiHidden/>
     <w:unhideWhenUsed/>
@@ -4965,11 +4335,11 @@
       <w:color w:val="0F4761" w:themeColor="accent1" w:themeShade="BF"/>
     </w:rPr>
   </w:style>
-  <w:style w:type="paragraph" w:styleId="Heading5">
+  <w:style w:type="paragraph" w:styleId="Cmsor5">
     <w:name w:val="heading 5"/>
-    <w:basedOn w:val="Normal"/>
-    <w:next w:val="Normal"/>
-    <w:link w:val="Heading5Char"/>
+    <w:basedOn w:val="Norml"/>
+    <w:next w:val="Norml"/>
+    <w:link w:val="Cmsor5Char"/>
     <w:uiPriority w:val="9"/>
     <w:semiHidden/>
     <w:unhideWhenUsed/>
@@ -4986,11 +4356,11 @@
       <w:color w:val="0F4761" w:themeColor="accent1" w:themeShade="BF"/>
     </w:rPr>
   </w:style>
-  <w:style w:type="paragraph" w:styleId="Heading6">
+  <w:style w:type="paragraph" w:styleId="Cmsor6">
     <w:name w:val="heading 6"/>
-    <w:basedOn w:val="Normal"/>
-    <w:next w:val="Normal"/>
-    <w:link w:val="Heading6Char"/>
+    <w:basedOn w:val="Norml"/>
+    <w:next w:val="Norml"/>
+    <w:link w:val="Cmsor6Char"/>
     <w:uiPriority w:val="9"/>
     <w:semiHidden/>
     <w:unhideWhenUsed/>
@@ -5009,11 +4379,11 @@
       <w:color w:val="595959" w:themeColor="text1" w:themeTint="A6"/>
     </w:rPr>
   </w:style>
-  <w:style w:type="paragraph" w:styleId="Heading7">
+  <w:style w:type="paragraph" w:styleId="Cmsor7">
     <w:name w:val="heading 7"/>
-    <w:basedOn w:val="Normal"/>
-    <w:next w:val="Normal"/>
-    <w:link w:val="Heading7Char"/>
+    <w:basedOn w:val="Norml"/>
+    <w:next w:val="Norml"/>
+    <w:link w:val="Cmsor7Char"/>
     <w:uiPriority w:val="9"/>
     <w:semiHidden/>
     <w:unhideWhenUsed/>
@@ -5030,11 +4400,11 @@
       <w:color w:val="595959" w:themeColor="text1" w:themeTint="A6"/>
     </w:rPr>
   </w:style>
-  <w:style w:type="paragraph" w:styleId="Heading8">
+  <w:style w:type="paragraph" w:styleId="Cmsor8">
     <w:name w:val="heading 8"/>
-    <w:basedOn w:val="Normal"/>
-    <w:next w:val="Normal"/>
-    <w:link w:val="Heading8Char"/>
+    <w:basedOn w:val="Norml"/>
+    <w:next w:val="Norml"/>
+    <w:link w:val="Cmsor8Char"/>
     <w:uiPriority w:val="9"/>
     <w:semiHidden/>
     <w:unhideWhenUsed/>
@@ -5053,11 +4423,11 @@
       <w:color w:val="272727" w:themeColor="text1" w:themeTint="D8"/>
     </w:rPr>
   </w:style>
-  <w:style w:type="paragraph" w:styleId="Heading9">
+  <w:style w:type="paragraph" w:styleId="Cmsor9">
     <w:name w:val="heading 9"/>
-    <w:basedOn w:val="Normal"/>
-    <w:next w:val="Normal"/>
-    <w:link w:val="Heading9Char"/>
+    <w:basedOn w:val="Norml"/>
+    <w:next w:val="Norml"/>
+    <w:link w:val="Cmsor9Char"/>
     <w:uiPriority w:val="9"/>
     <w:semiHidden/>
     <w:unhideWhenUsed/>
@@ -5074,13 +4444,13 @@
       <w:color w:val="272727" w:themeColor="text1" w:themeTint="D8"/>
     </w:rPr>
   </w:style>
-  <w:style w:type="character" w:default="1" w:styleId="DefaultParagraphFont">
+  <w:style w:type="character" w:default="1" w:styleId="Bekezdsalapbettpusa">
     <w:name w:val="Default Paragraph Font"/>
     <w:uiPriority w:val="1"/>
     <w:semiHidden/>
     <w:unhideWhenUsed/>
   </w:style>
-  <w:style w:type="table" w:default="1" w:styleId="TableNormal">
+  <w:style w:type="table" w:default="1" w:styleId="Normltblzat">
     <w:name w:val="Normal Table"/>
     <w:uiPriority w:val="99"/>
     <w:semiHidden/>
@@ -5095,15 +4465,15 @@
       </w:tblCellMar>
     </w:tblPr>
   </w:style>
-  <w:style w:type="numbering" w:default="1" w:styleId="NoList">
+  <w:style w:type="numbering" w:default="1" w:styleId="Nemlista">
     <w:name w:val="No List"/>
     <w:uiPriority w:val="99"/>
     <w:semiHidden/>
     <w:unhideWhenUsed/>
   </w:style>
-  <w:style w:type="character" w:customStyle="1" w:styleId="Heading1Char">
-    <w:name w:val="Heading 1 Char"/>
-    <w:link w:val="Heading1"/>
+  <w:style w:type="character" w:customStyle="1" w:styleId="Cmsor1Char">
+    <w:name w:val="Címsor 1 Char"/>
+    <w:link w:val="Cmsor1"/>
     <w:uiPriority w:val="9"/>
     <w:rsid w:val="38171242"/>
     <w:rPr>
@@ -5113,9 +4483,9 @@
       <w:szCs w:val="40"/>
     </w:rPr>
   </w:style>
-  <w:style w:type="character" w:customStyle="1" w:styleId="Heading2Char">
-    <w:name w:val="Heading 2 Char"/>
-    <w:link w:val="Heading2"/>
+  <w:style w:type="character" w:customStyle="1" w:styleId="Cmsor2Char">
+    <w:name w:val="Címsor 2 Char"/>
+    <w:link w:val="Cmsor2"/>
     <w:uiPriority w:val="9"/>
     <w:semiHidden/>
     <w:rsid w:val="38171242"/>
@@ -5126,9 +4496,9 @@
       <w:szCs w:val="32"/>
     </w:rPr>
   </w:style>
-  <w:style w:type="character" w:customStyle="1" w:styleId="Heading3Char">
-    <w:name w:val="Heading 3 Char"/>
-    <w:link w:val="Heading3"/>
+  <w:style w:type="character" w:customStyle="1" w:styleId="Cmsor3Char">
+    <w:name w:val="Címsor 3 Char"/>
+    <w:link w:val="Cmsor3"/>
     <w:uiPriority w:val="9"/>
     <w:semiHidden/>
     <w:rsid w:val="38171242"/>
@@ -5139,9 +4509,9 @@
       <w:szCs w:val="28"/>
     </w:rPr>
   </w:style>
-  <w:style w:type="character" w:customStyle="1" w:styleId="Heading4Char">
-    <w:name w:val="Heading 4 Char"/>
-    <w:link w:val="Heading4"/>
+  <w:style w:type="character" w:customStyle="1" w:styleId="Cmsor4Char">
+    <w:name w:val="Címsor 4 Char"/>
+    <w:link w:val="Cmsor4"/>
     <w:uiPriority w:val="9"/>
     <w:semiHidden/>
     <w:rsid w:val="38171242"/>
@@ -5152,9 +4522,9 @@
       <w:color w:val="0F4761" w:themeColor="accent1" w:themeShade="BF"/>
     </w:rPr>
   </w:style>
-  <w:style w:type="character" w:customStyle="1" w:styleId="Heading5Char">
-    <w:name w:val="Heading 5 Char"/>
-    <w:link w:val="Heading5"/>
+  <w:style w:type="character" w:customStyle="1" w:styleId="Cmsor5Char">
+    <w:name w:val="Címsor 5 Char"/>
+    <w:link w:val="Cmsor5"/>
     <w:uiPriority w:val="9"/>
     <w:semiHidden/>
     <w:rsid w:val="38171242"/>
@@ -5163,9 +4533,9 @@
       <w:color w:val="0F4761" w:themeColor="accent1" w:themeShade="BF"/>
     </w:rPr>
   </w:style>
-  <w:style w:type="character" w:customStyle="1" w:styleId="Heading6Char">
-    <w:name w:val="Heading 6 Char"/>
-    <w:link w:val="Heading6"/>
+  <w:style w:type="character" w:customStyle="1" w:styleId="Cmsor6Char">
+    <w:name w:val="Címsor 6 Char"/>
+    <w:link w:val="Cmsor6"/>
     <w:uiPriority w:val="9"/>
     <w:semiHidden/>
     <w:rsid w:val="38171242"/>
@@ -5176,9 +4546,9 @@
       <w:color w:val="595959" w:themeColor="text1" w:themeTint="A6"/>
     </w:rPr>
   </w:style>
-  <w:style w:type="character" w:customStyle="1" w:styleId="Heading7Char">
-    <w:name w:val="Heading 7 Char"/>
-    <w:link w:val="Heading7"/>
+  <w:style w:type="character" w:customStyle="1" w:styleId="Cmsor7Char">
+    <w:name w:val="Címsor 7 Char"/>
+    <w:link w:val="Cmsor7"/>
     <w:uiPriority w:val="9"/>
     <w:semiHidden/>
     <w:rsid w:val="38171242"/>
@@ -5187,9 +4557,9 @@
       <w:color w:val="595959" w:themeColor="text1" w:themeTint="A6"/>
     </w:rPr>
   </w:style>
-  <w:style w:type="character" w:customStyle="1" w:styleId="Heading8Char">
-    <w:name w:val="Heading 8 Char"/>
-    <w:link w:val="Heading8"/>
+  <w:style w:type="character" w:customStyle="1" w:styleId="Cmsor8Char">
+    <w:name w:val="Címsor 8 Char"/>
+    <w:link w:val="Cmsor8"/>
     <w:uiPriority w:val="9"/>
     <w:semiHidden/>
     <w:rsid w:val="38171242"/>
@@ -5200,9 +4570,9 @@
       <w:color w:val="272727"/>
     </w:rPr>
   </w:style>
-  <w:style w:type="character" w:customStyle="1" w:styleId="Heading9Char">
-    <w:name w:val="Heading 9 Char"/>
-    <w:link w:val="Heading9"/>
+  <w:style w:type="character" w:customStyle="1" w:styleId="Cmsor9Char">
+    <w:name w:val="Címsor 9 Char"/>
+    <w:link w:val="Cmsor9"/>
     <w:uiPriority w:val="9"/>
     <w:semiHidden/>
     <w:rsid w:val="38171242"/>
@@ -5211,11 +4581,11 @@
       <w:color w:val="272727"/>
     </w:rPr>
   </w:style>
-  <w:style w:type="paragraph" w:styleId="Title">
+  <w:style w:type="paragraph" w:styleId="Cm">
     <w:name w:val="Title"/>
-    <w:basedOn w:val="Normal"/>
-    <w:next w:val="Normal"/>
-    <w:link w:val="TitleChar"/>
+    <w:basedOn w:val="Norml"/>
+    <w:next w:val="Norml"/>
+    <w:link w:val="CmChar"/>
     <w:uiPriority w:val="10"/>
     <w:qFormat/>
     <w:rsid w:val="0005104C"/>
@@ -5231,9 +4601,9 @@
       <w:szCs w:val="56"/>
     </w:rPr>
   </w:style>
-  <w:style w:type="character" w:customStyle="1" w:styleId="TitleChar">
-    <w:name w:val="Title Char"/>
-    <w:link w:val="Title"/>
+  <w:style w:type="character" w:customStyle="1" w:styleId="CmChar">
+    <w:name w:val="Cím Char"/>
+    <w:link w:val="Cm"/>
     <w:uiPriority w:val="10"/>
     <w:rsid w:val="38171242"/>
     <w:rPr>
@@ -5242,11 +4612,11 @@
       <w:szCs w:val="56"/>
     </w:rPr>
   </w:style>
-  <w:style w:type="paragraph" w:styleId="Subtitle">
+  <w:style w:type="paragraph" w:styleId="Alcm">
     <w:name w:val="Subtitle"/>
-    <w:basedOn w:val="Normal"/>
-    <w:next w:val="Normal"/>
-    <w:link w:val="SubtitleChar"/>
+    <w:basedOn w:val="Norml"/>
+    <w:next w:val="Norml"/>
+    <w:link w:val="AlcmChar"/>
     <w:uiPriority w:val="11"/>
     <w:qFormat/>
     <w:rsid w:val="0005104C"/>
@@ -5263,9 +4633,9 @@
       <w:szCs w:val="28"/>
     </w:rPr>
   </w:style>
-  <w:style w:type="character" w:customStyle="1" w:styleId="SubtitleChar">
-    <w:name w:val="Subtitle Char"/>
-    <w:link w:val="Subtitle"/>
+  <w:style w:type="character" w:customStyle="1" w:styleId="AlcmChar">
+    <w:name w:val="Alcím Char"/>
+    <w:link w:val="Alcm"/>
     <w:uiPriority w:val="11"/>
     <w:rsid w:val="38171242"/>
     <w:rPr>
@@ -5275,11 +4645,11 @@
       <w:szCs w:val="28"/>
     </w:rPr>
   </w:style>
-  <w:style w:type="paragraph" w:styleId="Quote">
+  <w:style w:type="paragraph" w:styleId="Idzet">
     <w:name w:val="Quote"/>
-    <w:basedOn w:val="Normal"/>
-    <w:next w:val="Normal"/>
-    <w:link w:val="QuoteChar"/>
+    <w:basedOn w:val="Norml"/>
+    <w:next w:val="Norml"/>
+    <w:link w:val="IdzetChar"/>
     <w:uiPriority w:val="29"/>
     <w:qFormat/>
     <w:rsid w:val="0005104C"/>
@@ -5293,9 +4663,9 @@
       <w:color w:val="404040" w:themeColor="text1" w:themeTint="BF"/>
     </w:rPr>
   </w:style>
-  <w:style w:type="character" w:customStyle="1" w:styleId="QuoteChar">
-    <w:name w:val="Quote Char"/>
-    <w:link w:val="Quote"/>
+  <w:style w:type="character" w:customStyle="1" w:styleId="IdzetChar">
+    <w:name w:val="Idézet Char"/>
+    <w:link w:val="Idzet"/>
     <w:uiPriority w:val="29"/>
     <w:rsid w:val="38171242"/>
     <w:rPr>
@@ -5304,9 +4674,9 @@
       <w:color w:val="404040" w:themeColor="text1" w:themeTint="BF"/>
     </w:rPr>
   </w:style>
-  <w:style w:type="paragraph" w:styleId="ListParagraph">
+  <w:style w:type="paragraph" w:styleId="Listaszerbekezds">
     <w:name w:val="List Paragraph"/>
-    <w:basedOn w:val="Normal"/>
+    <w:basedOn w:val="Norml"/>
     <w:uiPriority w:val="34"/>
     <w:qFormat/>
     <w:rsid w:val="0005104C"/>
@@ -5315,7 +4685,7 @@
       <w:contextualSpacing/>
     </w:pPr>
   </w:style>
-  <w:style w:type="character" w:styleId="IntenseEmphasis">
+  <w:style w:type="character" w:styleId="Erskiemels">
     <w:name w:val="Intense Emphasis"/>
     <w:uiPriority w:val="21"/>
     <w:qFormat/>
@@ -5326,11 +4696,11 @@
       <w:color w:val="0F4761" w:themeColor="accent1" w:themeShade="BF"/>
     </w:rPr>
   </w:style>
-  <w:style w:type="paragraph" w:styleId="IntenseQuote">
+  <w:style w:type="paragraph" w:styleId="Kiemeltidzet">
     <w:name w:val="Intense Quote"/>
-    <w:basedOn w:val="Normal"/>
-    <w:next w:val="Normal"/>
-    <w:link w:val="IntenseQuoteChar"/>
+    <w:basedOn w:val="Norml"/>
+    <w:next w:val="Norml"/>
+    <w:link w:val="KiemeltidzetChar"/>
     <w:uiPriority w:val="30"/>
     <w:qFormat/>
     <w:rsid w:val="0005104C"/>
@@ -5349,9 +4719,9 @@
       <w:color w:val="0F4761" w:themeColor="accent1" w:themeShade="BF"/>
     </w:rPr>
   </w:style>
-  <w:style w:type="character" w:customStyle="1" w:styleId="IntenseQuoteChar">
-    <w:name w:val="Intense Quote Char"/>
-    <w:link w:val="IntenseQuote"/>
+  <w:style w:type="character" w:customStyle="1" w:styleId="KiemeltidzetChar">
+    <w:name w:val="Kiemelt idézet Char"/>
+    <w:link w:val="Kiemeltidzet"/>
     <w:uiPriority w:val="30"/>
     <w:rsid w:val="38171242"/>
     <w:rPr>
@@ -5360,7 +4730,7 @@
       <w:color w:val="0F4761" w:themeColor="accent1" w:themeShade="BF"/>
     </w:rPr>
   </w:style>
-  <w:style w:type="character" w:styleId="IntenseReference">
+  <w:style w:type="character" w:styleId="Ershivatkozs">
     <w:name w:val="Intense Reference"/>
     <w:uiPriority w:val="32"/>
     <w:qFormat/>
@@ -5372,7 +4742,7 @@
       <w:color w:val="0F4761" w:themeColor="accent1" w:themeShade="BF"/>
     </w:rPr>
   </w:style>
-  <w:style w:type="character" w:styleId="Hyperlink">
+  <w:style w:type="character" w:styleId="Hiperhivatkozs">
     <w:name w:val="Hyperlink"/>
     <w:uiPriority w:val="99"/>
     <w:unhideWhenUsed/>
@@ -5382,9 +4752,9 @@
       <w:u w:val="single"/>
     </w:rPr>
   </w:style>
-  <w:style w:type="paragraph" w:styleId="NormalWeb">
+  <w:style w:type="paragraph" w:styleId="NormlWeb">
     <w:name w:val="Normal (Web)"/>
-    <w:basedOn w:val="Normal"/>
+    <w:basedOn w:val="Norml"/>
     <w:uiPriority w:val="99"/>
     <w:semiHidden/>
     <w:unhideWhenUsed/>

</xml_diff>

<commit_message>
Creating the project's backend level - changing the structure of the project
</commit_message>
<xml_diff>
--- a/documentation.docx
+++ b/documentation.docx
@@ -1239,7 +1239,7 @@
           <w:szCs w:val="36"/>
         </w:rPr>
         <w:drawing>
-          <wp:inline distT="0" distB="0" distL="0" distR="0" wp14:anchorId="78A43544" wp14:editId="22211031">
+          <wp:inline distT="0" distB="0" distL="0" distR="0" wp14:anchorId="78A43544" wp14:editId="01A747AD">
             <wp:extent cx="3166535" cy="1781175"/>
             <wp:effectExtent l="0" t="0" r="0" b="0"/>
             <wp:docPr id="3" name="Kép 3" descr="C:\Users\elnabulsy.csongor\AppData\Local\Microsoft\Windows\INetCache\Content.MSO\F75754B3.tmp"/>
@@ -1331,7 +1331,7 @@
           <w:szCs w:val="36"/>
         </w:rPr>
         <w:drawing>
-          <wp:inline distT="0" distB="0" distL="0" distR="0" wp14:anchorId="4E211814" wp14:editId="51576DED">
+          <wp:inline distT="0" distB="0" distL="0" distR="0" wp14:anchorId="4E211814" wp14:editId="1F830D70">
             <wp:extent cx="3133725" cy="1762720"/>
             <wp:effectExtent l="0" t="0" r="0" b="9525"/>
             <wp:docPr id="4" name="Kép 4" descr="C:\Users\elnabulsy.csongor\Downloads\ui_main_student.png"/>
@@ -1413,7 +1413,7 @@
           <w:szCs w:val="36"/>
         </w:rPr>
         <w:drawing>
-          <wp:inline distT="0" distB="0" distL="0" distR="0" wp14:anchorId="5137FB78" wp14:editId="639E7766">
+          <wp:inline distT="0" distB="0" distL="0" distR="0" wp14:anchorId="5137FB78" wp14:editId="5694A4CC">
             <wp:extent cx="3166110" cy="1780938"/>
             <wp:effectExtent l="0" t="0" r="0" b="0"/>
             <wp:docPr id="5" name="Kép 5" descr="C:\Users\elnabulsy.csongor\Downloads\ui_main_scheduler.png"/>
@@ -1506,7 +1506,7 @@
           <w:szCs w:val="36"/>
         </w:rPr>
         <w:drawing>
-          <wp:inline distT="0" distB="0" distL="0" distR="0" wp14:anchorId="27EC1C67" wp14:editId="5DFA3A61">
+          <wp:inline distT="0" distB="0" distL="0" distR="0" wp14:anchorId="27EC1C67" wp14:editId="6F84D963">
             <wp:extent cx="3055620" cy="1718786"/>
             <wp:effectExtent l="0" t="0" r="0" b="0"/>
             <wp:docPr id="6" name="Kép 6" descr="C:\Users\elnabulsy.csongor\Downloads\ui_main_admin.png"/>
@@ -1588,7 +1588,7 @@
           <w:szCs w:val="36"/>
         </w:rPr>
         <w:drawing>
-          <wp:inline distT="0" distB="0" distL="0" distR="0" wp14:anchorId="08225B4F" wp14:editId="4BBE48C3">
+          <wp:inline distT="0" distB="0" distL="0" distR="0" wp14:anchorId="08225B4F" wp14:editId="0C4FE159">
             <wp:extent cx="2933700" cy="1942430"/>
             <wp:effectExtent l="0" t="0" r="0" b="1270"/>
             <wp:docPr id="7" name="Kép 7" descr="C:\Users\elnabulsy.csongor\Downloads\ui_structure.png"/>
@@ -1761,7 +1761,7 @@
           <w:szCs w:val="36"/>
         </w:rPr>
         <w:drawing>
-          <wp:inline distT="0" distB="0" distL="0" distR="0" wp14:anchorId="2C256DB5" wp14:editId="3430B5E1">
+          <wp:inline distT="0" distB="0" distL="0" distR="0" wp14:anchorId="2C256DB5" wp14:editId="377E88B9">
             <wp:extent cx="3329940" cy="1752493"/>
             <wp:effectExtent l="0" t="0" r="3810" b="635"/>
             <wp:docPr id="9" name="Kép 9"/>
@@ -2996,6 +2996,16 @@
         </w:rPr>
         <w:t>2026-03-09 8:55-</w:t>
       </w:r>
+      <w:r>
+        <w:rPr>
+          <w:rFonts w:ascii="Times New Roman" w:eastAsia="Times New Roman" w:hAnsi="Times New Roman" w:cs="Times New Roman"/>
+          <w:b/>
+          <w:bCs/>
+          <w:sz w:val="40"/>
+          <w:szCs w:val="40"/>
+        </w:rPr>
+        <w:t>12:55</w:t>
+      </w:r>
     </w:p>
     <w:p>
       <w:pPr>
@@ -3312,57 +3322,283 @@
         </w:rPr>
       </w:pPr>
       <w:r>
-        <w:rPr>
-          <w:noProof/>
-        </w:rPr>
-        <w:drawing>
-          <wp:inline distT="0" distB="0" distL="0" distR="0" wp14:anchorId="0697373A" wp14:editId="49CB908E">
-            <wp:extent cx="304800" cy="304800"/>
-            <wp:effectExtent l="0" t="0" r="0" b="0"/>
-            <wp:docPr id="2024739431" name="Kép 1"/>
-            <wp:cNvGraphicFramePr>
-              <a:graphicFrameLocks xmlns:a="http://schemas.openxmlformats.org/drawingml/2006/main" noChangeAspect="1"/>
-            </wp:cNvGraphicFramePr>
-            <a:graphic xmlns:a="http://schemas.openxmlformats.org/drawingml/2006/main">
-              <a:graphicData uri="http://schemas.openxmlformats.org/drawingml/2006/picture">
-                <pic:pic xmlns:pic="http://schemas.openxmlformats.org/drawingml/2006/picture">
-                  <pic:nvPicPr>
-                    <pic:cNvPr id="0" name="Picture 1"/>
-                    <pic:cNvPicPr>
-                      <a:picLocks noChangeAspect="1" noChangeArrowheads="1"/>
-                    </pic:cNvPicPr>
-                  </pic:nvPicPr>
-                  <pic:blipFill>
-                    <a:blip r:embed="rId27">
-                      <a:extLst>
-                        <a:ext uri="{28A0092B-C50C-407E-A947-70E740481C1C}">
-                          <a14:useLocalDpi xmlns:a14="http://schemas.microsoft.com/office/drawing/2010/main" val="0"/>
-                        </a:ext>
-                      </a:extLst>
-                    </a:blip>
-                    <a:srcRect/>
-                    <a:stretch>
-                      <a:fillRect/>
-                    </a:stretch>
-                  </pic:blipFill>
-                  <pic:spPr bwMode="auto">
-                    <a:xfrm>
-                      <a:off x="0" y="0"/>
-                      <a:ext cx="304800" cy="304800"/>
-                    </a:xfrm>
-                    <a:prstGeom prst="rect">
-                      <a:avLst/>
-                    </a:prstGeom>
-                    <a:noFill/>
-                    <a:ln>
-                      <a:noFill/>
-                    </a:ln>
-                  </pic:spPr>
-                </pic:pic>
-              </a:graphicData>
-            </a:graphic>
-          </wp:inline>
-        </w:drawing>
+        <w:pict w14:anchorId="759CF75D">
+          <v:shape id="Kép 1" o:spid="_x0000_i1032" type="#_x0000_t75" style="width:24pt;height:24pt;visibility:visible;mso-wrap-style:square">
+            <v:imagedata r:id="rId27" o:title=""/>
+          </v:shape>
+        </w:pict>
+      </w:r>
+    </w:p>
+    <w:p>
+      <w:pPr>
+        <w:jc w:val="both"/>
+        <w:rPr>
+          <w:rFonts w:ascii="Times New Roman" w:eastAsia="Times New Roman" w:hAnsi="Times New Roman" w:cs="Times New Roman"/>
+          <w:sz w:val="36"/>
+          <w:szCs w:val="36"/>
+        </w:rPr>
+      </w:pPr>
+    </w:p>
+    <w:p>
+      <w:pPr>
+        <w:jc w:val="both"/>
+        <w:rPr>
+          <w:rFonts w:ascii="Times New Roman" w:eastAsia="Times New Roman" w:hAnsi="Times New Roman" w:cs="Times New Roman"/>
+          <w:b/>
+          <w:bCs/>
+          <w:sz w:val="40"/>
+          <w:szCs w:val="40"/>
+        </w:rPr>
+      </w:pPr>
+      <w:r>
+        <w:rPr>
+          <w:rFonts w:ascii="Times New Roman" w:eastAsia="Times New Roman" w:hAnsi="Times New Roman" w:cs="Times New Roman"/>
+          <w:b/>
+          <w:bCs/>
+          <w:sz w:val="40"/>
+          <w:szCs w:val="40"/>
+        </w:rPr>
+        <w:t>2026-03-12 14:15-15:10</w:t>
+      </w:r>
+    </w:p>
+    <w:p>
+      <w:pPr>
+        <w:jc w:val="both"/>
+        <w:rPr>
+          <w:rFonts w:ascii="Times New Roman" w:eastAsia="Times New Roman" w:hAnsi="Times New Roman" w:cs="Times New Roman"/>
+          <w:sz w:val="36"/>
+          <w:szCs w:val="36"/>
+        </w:rPr>
+      </w:pPr>
+      <w:r>
+        <w:rPr>
+          <w:rFonts w:ascii="Times New Roman" w:eastAsia="Times New Roman" w:hAnsi="Times New Roman" w:cs="Times New Roman"/>
+          <w:sz w:val="36"/>
+          <w:szCs w:val="36"/>
+        </w:rPr>
+        <w:t>(Susán Csongor György)</w:t>
+      </w:r>
+    </w:p>
+    <w:p>
+      <w:pPr>
+        <w:pStyle w:val="Listaszerbekezds"/>
+        <w:numPr>
+          <w:ilvl w:val="0"/>
+          <w:numId w:val="5"/>
+        </w:numPr>
+        <w:jc w:val="both"/>
+        <w:rPr>
+          <w:rFonts w:ascii="Times New Roman" w:eastAsia="Times New Roman" w:hAnsi="Times New Roman" w:cs="Times New Roman"/>
+          <w:sz w:val="36"/>
+          <w:szCs w:val="36"/>
+        </w:rPr>
+      </w:pPr>
+      <w:r>
+        <w:rPr>
+          <w:rFonts w:ascii="Times New Roman" w:eastAsia="Times New Roman" w:hAnsi="Times New Roman" w:cs="Times New Roman"/>
+          <w:sz w:val="36"/>
+          <w:szCs w:val="36"/>
+        </w:rPr>
+        <w:t>Hibaüzenetek hozzáadása (403, 404)</w:t>
+      </w:r>
+    </w:p>
+    <w:p>
+      <w:pPr>
+        <w:pStyle w:val="Listaszerbekezds"/>
+        <w:numPr>
+          <w:ilvl w:val="0"/>
+          <w:numId w:val="5"/>
+        </w:numPr>
+        <w:jc w:val="both"/>
+        <w:rPr>
+          <w:rFonts w:ascii="Times New Roman" w:eastAsia="Times New Roman" w:hAnsi="Times New Roman" w:cs="Times New Roman"/>
+          <w:sz w:val="36"/>
+          <w:szCs w:val="36"/>
+        </w:rPr>
+      </w:pPr>
+      <w:r>
+        <w:rPr>
+          <w:rFonts w:ascii="Times New Roman" w:eastAsia="Times New Roman" w:hAnsi="Times New Roman" w:cs="Times New Roman"/>
+          <w:sz w:val="36"/>
+          <w:szCs w:val="36"/>
+        </w:rPr>
+        <w:t>Szerepkörök (role) és requiresAuth hozzáadása a nézetekhez</w:t>
+      </w:r>
+    </w:p>
+    <w:p>
+      <w:pPr>
+        <w:pStyle w:val="Listaszerbekezds"/>
+        <w:numPr>
+          <w:ilvl w:val="0"/>
+          <w:numId w:val="5"/>
+        </w:numPr>
+        <w:jc w:val="both"/>
+        <w:rPr>
+          <w:rFonts w:ascii="Times New Roman" w:eastAsia="Times New Roman" w:hAnsi="Times New Roman" w:cs="Times New Roman"/>
+          <w:sz w:val="36"/>
+          <w:szCs w:val="36"/>
+        </w:rPr>
+      </w:pPr>
+      <w:r>
+        <w:rPr>
+          <w:rFonts w:ascii="Times New Roman" w:eastAsia="Times New Roman" w:hAnsi="Times New Roman" w:cs="Times New Roman"/>
+          <w:sz w:val="36"/>
+          <w:szCs w:val="36"/>
+        </w:rPr>
+        <w:t>Autentikációhoz szükséges alapváltozók felvétele az App.vue-ban</w:t>
+      </w:r>
+    </w:p>
+    <w:p>
+      <w:pPr>
+        <w:jc w:val="both"/>
+        <w:rPr>
+          <w:rFonts w:ascii="Times New Roman" w:eastAsia="Times New Roman" w:hAnsi="Times New Roman" w:cs="Times New Roman"/>
+          <w:sz w:val="36"/>
+          <w:szCs w:val="36"/>
+        </w:rPr>
+      </w:pPr>
+    </w:p>
+    <w:p>
+      <w:pPr>
+        <w:jc w:val="both"/>
+        <w:rPr>
+          <w:rFonts w:ascii="Times New Roman" w:eastAsia="Times New Roman" w:hAnsi="Times New Roman" w:cs="Times New Roman"/>
+          <w:sz w:val="36"/>
+          <w:szCs w:val="36"/>
+        </w:rPr>
+      </w:pPr>
+    </w:p>
+    <w:p>
+      <w:pPr>
+        <w:jc w:val="both"/>
+        <w:rPr>
+          <w:rFonts w:ascii="Times New Roman" w:eastAsia="Times New Roman" w:hAnsi="Times New Roman" w:cs="Times New Roman"/>
+          <w:b/>
+          <w:bCs/>
+          <w:sz w:val="40"/>
+          <w:szCs w:val="40"/>
+        </w:rPr>
+      </w:pPr>
+      <w:r>
+        <w:rPr>
+          <w:rFonts w:ascii="Times New Roman" w:eastAsia="Times New Roman" w:hAnsi="Times New Roman" w:cs="Times New Roman"/>
+          <w:b/>
+          <w:bCs/>
+          <w:sz w:val="40"/>
+          <w:szCs w:val="40"/>
+        </w:rPr>
+        <w:lastRenderedPageBreak/>
+        <w:t>2026-03-16 11:40-14:00, 15:20-45</w:t>
+      </w:r>
+    </w:p>
+    <w:p>
+      <w:pPr>
+        <w:jc w:val="both"/>
+        <w:rPr>
+          <w:rFonts w:ascii="Times New Roman" w:eastAsia="Times New Roman" w:hAnsi="Times New Roman" w:cs="Times New Roman"/>
+          <w:sz w:val="36"/>
+          <w:szCs w:val="36"/>
+        </w:rPr>
+      </w:pPr>
+      <w:r>
+        <w:rPr>
+          <w:rFonts w:ascii="Times New Roman" w:eastAsia="Times New Roman" w:hAnsi="Times New Roman" w:cs="Times New Roman"/>
+          <w:sz w:val="36"/>
+          <w:szCs w:val="36"/>
+        </w:rPr>
+        <w:t>(Susán Csongor György, El-Nabulsy Csongor Alan)</w:t>
+      </w:r>
+    </w:p>
+    <w:p>
+      <w:pPr>
+        <w:pStyle w:val="Listaszerbekezds"/>
+        <w:numPr>
+          <w:ilvl w:val="0"/>
+          <w:numId w:val="6"/>
+        </w:numPr>
+        <w:jc w:val="both"/>
+        <w:rPr>
+          <w:rFonts w:ascii="Times New Roman" w:eastAsia="Times New Roman" w:hAnsi="Times New Roman" w:cs="Times New Roman"/>
+          <w:sz w:val="36"/>
+          <w:szCs w:val="36"/>
+        </w:rPr>
+      </w:pPr>
+      <w:r>
+        <w:rPr>
+          <w:rFonts w:ascii="Times New Roman" w:eastAsia="Times New Roman" w:hAnsi="Times New Roman" w:cs="Times New Roman"/>
+          <w:sz w:val="36"/>
+          <w:szCs w:val="36"/>
+        </w:rPr>
+        <w:t>Backend projekt létrehozása (Susán)</w:t>
+      </w:r>
+    </w:p>
+    <w:p>
+      <w:pPr>
+        <w:pStyle w:val="Listaszerbekezds"/>
+        <w:numPr>
+          <w:ilvl w:val="0"/>
+          <w:numId w:val="6"/>
+        </w:numPr>
+        <w:jc w:val="both"/>
+        <w:rPr>
+          <w:rFonts w:ascii="Times New Roman" w:eastAsia="Times New Roman" w:hAnsi="Times New Roman" w:cs="Times New Roman"/>
+          <w:sz w:val="36"/>
+          <w:szCs w:val="36"/>
+        </w:rPr>
+      </w:pPr>
+      <w:r>
+        <w:rPr>
+          <w:rFonts w:ascii="Times New Roman" w:eastAsia="Times New Roman" w:hAnsi="Times New Roman" w:cs="Times New Roman"/>
+          <w:sz w:val="36"/>
+          <w:szCs w:val="36"/>
+        </w:rPr>
+        <w:t>Táblák SQL-tervezetének elkészítése (El-Nabulsy)</w:t>
+      </w:r>
+    </w:p>
+    <w:p>
+      <w:pPr>
+        <w:pStyle w:val="Listaszerbekezds"/>
+        <w:numPr>
+          <w:ilvl w:val="0"/>
+          <w:numId w:val="6"/>
+        </w:numPr>
+        <w:jc w:val="both"/>
+        <w:rPr>
+          <w:rFonts w:ascii="Times New Roman" w:eastAsia="Times New Roman" w:hAnsi="Times New Roman" w:cs="Times New Roman"/>
+          <w:sz w:val="36"/>
+          <w:szCs w:val="36"/>
+        </w:rPr>
+      </w:pPr>
+      <w:r>
+        <w:rPr>
+          <w:rFonts w:ascii="Times New Roman" w:eastAsia="Times New Roman" w:hAnsi="Times New Roman" w:cs="Times New Roman"/>
+          <w:sz w:val="36"/>
+          <w:szCs w:val="36"/>
+        </w:rPr>
+        <w:t>Táblázatok relációs tervvé írása és azok implementálása (model-lek, egyelőre üres seederek és migration-ök) a Backend (Laravel) projektbe (Susán)</w:t>
+      </w:r>
+    </w:p>
+    <w:p>
+      <w:pPr>
+        <w:pStyle w:val="Listaszerbekezds"/>
+        <w:numPr>
+          <w:ilvl w:val="0"/>
+          <w:numId w:val="6"/>
+        </w:numPr>
+        <w:jc w:val="both"/>
+        <w:rPr>
+          <w:rFonts w:ascii="Times New Roman" w:eastAsia="Times New Roman" w:hAnsi="Times New Roman" w:cs="Times New Roman"/>
+          <w:sz w:val="36"/>
+          <w:szCs w:val="36"/>
+        </w:rPr>
+      </w:pPr>
+      <w:r>
+        <w:rPr>
+          <w:rFonts w:ascii="Times New Roman" w:eastAsia="Times New Roman" w:hAnsi="Times New Roman" w:cs="Times New Roman"/>
+          <w:sz w:val="36"/>
+          <w:szCs w:val="36"/>
+        </w:rPr>
+        <w:t>Projekt struktúrájának végleges kialakítása (eddig frontendPart-blathyfm volt, viszont azóta a főmappa a BlathyFM mappát viseli, amiben két, az alkalmazás egy-egy szintjét képviselő projekt található (blathyfm_frontend – amiben az eddigi frontend-alkalmazás volt megtalálható – és blathyfm_backend, ami pedig az újonnan létrejött backend része a projektnek) (Susán)</w:t>
       </w:r>
     </w:p>
     <w:sectPr>
@@ -3377,6 +3613,32 @@
 
 <file path=word/numbering.xml><?xml version="1.0" encoding="utf-8"?>
 <w:numbering xmlns:wpc="http://schemas.microsoft.com/office/word/2010/wordprocessingCanvas" xmlns:cx="http://schemas.microsoft.com/office/drawing/2014/chartex" xmlns:cx1="http://schemas.microsoft.com/office/drawing/2015/9/8/chartex" xmlns:cx2="http://schemas.microsoft.com/office/drawing/2015/10/21/chartex" xmlns:cx3="http://schemas.microsoft.com/office/drawing/2016/5/9/chartex" xmlns:cx4="http://schemas.microsoft.com/office/drawing/2016/5/10/chartex" xmlns:cx5="http://schemas.microsoft.com/office/drawing/2016/5/11/chartex" xmlns:cx6="http://schemas.microsoft.com/office/drawing/2016/5/12/chartex" xmlns:cx7="http://schemas.microsoft.com/office/drawing/2016/5/13/chartex" xmlns:cx8="http://schemas.microsoft.com/office/drawing/2016/5/14/chartex" xmlns:mc="http://schemas.openxmlformats.org/markup-compatibility/2006" xmlns:aink="http://schemas.microsoft.com/office/drawing/2016/ink" xmlns:am3d="http://schemas.microsoft.com/office/drawing/2017/model3d" xmlns:o="urn:schemas-microsoft-com:office:office" xmlns:oel="http://schemas.microsoft.com/office/2019/extlst" xmlns:r="http://schemas.openxmlformats.org/officeDocument/2006/relationships" xmlns:m="http://schemas.openxmlformats.org/officeDocument/2006/math" xmlns:v="urn:schemas-microsoft-com:vml" xmlns:wp14="http://schemas.microsoft.com/office/word/2010/wordprocessingDrawing" xmlns:wp="http://schemas.openxmlformats.org/drawingml/2006/wordprocessingDrawing" xmlns:w10="urn:schemas-microsoft-com:office:word" xmlns:w="http://schemas.openxmlformats.org/wordprocessingml/2006/main" xmlns:w14="http://schemas.microsoft.com/office/word/2010/wordml" xmlns:w15="http://schemas.microsoft.com/office/word/2012/wordml" xmlns:w16cex="http://schemas.microsoft.com/office/word/2018/wordml/cex" xmlns:w16cid="http://schemas.microsoft.com/office/word/2016/wordml/cid" xmlns:w16="http://schemas.microsoft.com/office/word/2018/wordml" xmlns:w16du="http://schemas.microsoft.com/office/word/2023/wordml/word16du" xmlns:w16sdtdh="http://schemas.microsoft.com/office/word/2020/wordml/sdtdatahash" xmlns:w16sdtfl="http://schemas.microsoft.com/office/word/2024/wordml/sdtformatlock" xmlns:w16se="http://schemas.microsoft.com/office/word/2015/wordml/symex" xmlns:wpg="http://schemas.microsoft.com/office/word/2010/wordprocessingGroup" xmlns:wpi="http://schemas.microsoft.com/office/word/2010/wordprocessingInk" xmlns:wne="http://schemas.microsoft.com/office/word/2006/wordml" xmlns:wps="http://schemas.microsoft.com/office/word/2010/wordprocessingShape" mc:Ignorable="w14 w15 w16se w16cid w16 w16cex w16sdtdh w16sdtfl w16du wp14">
+  <w:numPicBullet w:numPicBulletId="0">
+    <w:pict>
+      <v:shapetype id="_x0000_t75" coordsize="21600,21600" o:spt="75" o:preferrelative="t" path="m@4@5l@4@11@9@11@9@5xe" filled="f" stroked="f">
+        <v:stroke joinstyle="miter"/>
+        <v:formulas>
+          <v:f eqn="if lineDrawn pixelLineWidth 0"/>
+          <v:f eqn="sum @0 1 0"/>
+          <v:f eqn="sum 0 0 @1"/>
+          <v:f eqn="prod @2 1 2"/>
+          <v:f eqn="prod @3 21600 pixelWidth"/>
+          <v:f eqn="prod @3 21600 pixelHeight"/>
+          <v:f eqn="sum @0 0 1"/>
+          <v:f eqn="prod @6 1 2"/>
+          <v:f eqn="prod @7 21600 pixelWidth"/>
+          <v:f eqn="sum @8 21600 0"/>
+          <v:f eqn="prod @7 21600 pixelHeight"/>
+          <v:f eqn="sum @10 21600 0"/>
+        </v:formulas>
+        <v:path o:extrusionok="f" gradientshapeok="t" o:connecttype="rect"/>
+        <o:lock v:ext="edit" aspectratio="t"/>
+      </v:shapetype>
+      <v:shape id="Kép 1" o:spid="_x0000_i1025" type="#_x0000_t75" style="width:24pt;height:24pt;visibility:visible;mso-wrap-style:square" o:bullet="t">
+        <v:imagedata r:id="rId1" o:title=""/>
+      </v:shape>
+    </w:pict>
+  </w:numPicBullet>
   <w:abstractNum w:abstractNumId="0" w15:restartNumberingAfterBreak="0">
     <w:nsid w:val="3C1938F6"/>
     <w:multiLevelType w:val="hybridMultilevel"/>
@@ -3491,16 +3753,16 @@
     </w:lvl>
   </w:abstractNum>
   <w:abstractNum w:abstractNumId="1" w15:restartNumberingAfterBreak="0">
-    <w:nsid w:val="6E7312B6"/>
+    <w:nsid w:val="47442E3E"/>
     <w:multiLevelType w:val="hybridMultilevel"/>
-    <w:tmpl w:val="FD80BAFC"/>
+    <w:tmpl w:val="64928C38"/>
     <w:lvl w:ilvl="0" w:tplc="040E0001">
       <w:start w:val="1"/>
       <w:numFmt w:val="bullet"/>
       <w:lvlText w:val=""/>
       <w:lvlJc w:val="left"/>
       <w:pPr>
-        <w:ind w:left="816" w:hanging="360"/>
+        <w:ind w:left="720" w:hanging="360"/>
       </w:pPr>
       <w:rPr>
         <w:rFonts w:ascii="Symbol" w:hAnsi="Symbol" w:hint="default"/>
@@ -3512,7 +3774,7 @@
       <w:lvlText w:val="o"/>
       <w:lvlJc w:val="left"/>
       <w:pPr>
-        <w:ind w:left="1536" w:hanging="360"/>
+        <w:ind w:left="1440" w:hanging="360"/>
       </w:pPr>
       <w:rPr>
         <w:rFonts w:ascii="Courier New" w:hAnsi="Courier New" w:cs="Courier New" w:hint="default"/>
@@ -3524,7 +3786,7 @@
       <w:lvlText w:val=""/>
       <w:lvlJc w:val="left"/>
       <w:pPr>
-        <w:ind w:left="2256" w:hanging="360"/>
+        <w:ind w:left="2160" w:hanging="360"/>
       </w:pPr>
       <w:rPr>
         <w:rFonts w:ascii="Wingdings" w:hAnsi="Wingdings" w:hint="default"/>
@@ -3536,7 +3798,7 @@
       <w:lvlText w:val=""/>
       <w:lvlJc w:val="left"/>
       <w:pPr>
-        <w:ind w:left="2976" w:hanging="360"/>
+        <w:ind w:left="2880" w:hanging="360"/>
       </w:pPr>
       <w:rPr>
         <w:rFonts w:ascii="Symbol" w:hAnsi="Symbol" w:hint="default"/>
@@ -3548,7 +3810,7 @@
       <w:lvlText w:val="o"/>
       <w:lvlJc w:val="left"/>
       <w:pPr>
-        <w:ind w:left="3696" w:hanging="360"/>
+        <w:ind w:left="3600" w:hanging="360"/>
       </w:pPr>
       <w:rPr>
         <w:rFonts w:ascii="Courier New" w:hAnsi="Courier New" w:cs="Courier New" w:hint="default"/>
@@ -3560,7 +3822,7 @@
       <w:lvlText w:val=""/>
       <w:lvlJc w:val="left"/>
       <w:pPr>
-        <w:ind w:left="4416" w:hanging="360"/>
+        <w:ind w:left="4320" w:hanging="360"/>
       </w:pPr>
       <w:rPr>
         <w:rFonts w:ascii="Wingdings" w:hAnsi="Wingdings" w:hint="default"/>
@@ -3572,7 +3834,7 @@
       <w:lvlText w:val=""/>
       <w:lvlJc w:val="left"/>
       <w:pPr>
-        <w:ind w:left="5136" w:hanging="360"/>
+        <w:ind w:left="5040" w:hanging="360"/>
       </w:pPr>
       <w:rPr>
         <w:rFonts w:ascii="Symbol" w:hAnsi="Symbol" w:hint="default"/>
@@ -3584,7 +3846,7 @@
       <w:lvlText w:val="o"/>
       <w:lvlJc w:val="left"/>
       <w:pPr>
-        <w:ind w:left="5856" w:hanging="360"/>
+        <w:ind w:left="5760" w:hanging="360"/>
       </w:pPr>
       <w:rPr>
         <w:rFonts w:ascii="Courier New" w:hAnsi="Courier New" w:cs="Courier New" w:hint="default"/>
@@ -3596,7 +3858,7 @@
       <w:lvlText w:val=""/>
       <w:lvlJc w:val="left"/>
       <w:pPr>
-        <w:ind w:left="6576" w:hanging="360"/>
+        <w:ind w:left="6480" w:hanging="360"/>
       </w:pPr>
       <w:rPr>
         <w:rFonts w:ascii="Wingdings" w:hAnsi="Wingdings" w:hint="default"/>
@@ -3604,9 +3866,9 @@
     </w:lvl>
   </w:abstractNum>
   <w:abstractNum w:abstractNumId="2" w15:restartNumberingAfterBreak="0">
-    <w:nsid w:val="76FA296F"/>
+    <w:nsid w:val="69FA5A50"/>
     <w:multiLevelType w:val="hybridMultilevel"/>
-    <w:tmpl w:val="6DAE32EA"/>
+    <w:tmpl w:val="D82A6326"/>
     <w:lvl w:ilvl="0" w:tplc="040E0001">
       <w:start w:val="1"/>
       <w:numFmt w:val="bullet"/>
@@ -3717,16 +3979,16 @@
     </w:lvl>
   </w:abstractNum>
   <w:abstractNum w:abstractNumId="3" w15:restartNumberingAfterBreak="0">
-    <w:nsid w:val="7EB672F7"/>
+    <w:nsid w:val="6E7312B6"/>
     <w:multiLevelType w:val="hybridMultilevel"/>
-    <w:tmpl w:val="A6F0C99C"/>
+    <w:tmpl w:val="FD80BAFC"/>
     <w:lvl w:ilvl="0" w:tplc="040E0001">
       <w:start w:val="1"/>
       <w:numFmt w:val="bullet"/>
       <w:lvlText w:val=""/>
       <w:lvlJc w:val="left"/>
       <w:pPr>
-        <w:ind w:left="720" w:hanging="360"/>
+        <w:ind w:left="816" w:hanging="360"/>
       </w:pPr>
       <w:rPr>
         <w:rFonts w:ascii="Symbol" w:hAnsi="Symbol" w:hint="default"/>
@@ -3738,7 +4000,7 @@
       <w:lvlText w:val="o"/>
       <w:lvlJc w:val="left"/>
       <w:pPr>
-        <w:ind w:left="1440" w:hanging="360"/>
+        <w:ind w:left="1536" w:hanging="360"/>
       </w:pPr>
       <w:rPr>
         <w:rFonts w:ascii="Courier New" w:hAnsi="Courier New" w:cs="Courier New" w:hint="default"/>
@@ -3750,7 +4012,7 @@
       <w:lvlText w:val=""/>
       <w:lvlJc w:val="left"/>
       <w:pPr>
-        <w:ind w:left="2160" w:hanging="360"/>
+        <w:ind w:left="2256" w:hanging="360"/>
       </w:pPr>
       <w:rPr>
         <w:rFonts w:ascii="Wingdings" w:hAnsi="Wingdings" w:hint="default"/>
@@ -3762,7 +4024,7 @@
       <w:lvlText w:val=""/>
       <w:lvlJc w:val="left"/>
       <w:pPr>
-        <w:ind w:left="2880" w:hanging="360"/>
+        <w:ind w:left="2976" w:hanging="360"/>
       </w:pPr>
       <w:rPr>
         <w:rFonts w:ascii="Symbol" w:hAnsi="Symbol" w:hint="default"/>
@@ -3774,7 +4036,7 @@
       <w:lvlText w:val="o"/>
       <w:lvlJc w:val="left"/>
       <w:pPr>
-        <w:ind w:left="3600" w:hanging="360"/>
+        <w:ind w:left="3696" w:hanging="360"/>
       </w:pPr>
       <w:rPr>
         <w:rFonts w:ascii="Courier New" w:hAnsi="Courier New" w:cs="Courier New" w:hint="default"/>
@@ -3786,7 +4048,7 @@
       <w:lvlText w:val=""/>
       <w:lvlJc w:val="left"/>
       <w:pPr>
-        <w:ind w:left="4320" w:hanging="360"/>
+        <w:ind w:left="4416" w:hanging="360"/>
       </w:pPr>
       <w:rPr>
         <w:rFonts w:ascii="Wingdings" w:hAnsi="Wingdings" w:hint="default"/>
@@ -3798,7 +4060,7 @@
       <w:lvlText w:val=""/>
       <w:lvlJc w:val="left"/>
       <w:pPr>
-        <w:ind w:left="5040" w:hanging="360"/>
+        <w:ind w:left="5136" w:hanging="360"/>
       </w:pPr>
       <w:rPr>
         <w:rFonts w:ascii="Symbol" w:hAnsi="Symbol" w:hint="default"/>
@@ -3810,7 +4072,7 @@
       <w:lvlText w:val="o"/>
       <w:lvlJc w:val="left"/>
       <w:pPr>
-        <w:ind w:left="5760" w:hanging="360"/>
+        <w:ind w:left="5856" w:hanging="360"/>
       </w:pPr>
       <w:rPr>
         <w:rFonts w:ascii="Courier New" w:hAnsi="Courier New" w:cs="Courier New" w:hint="default"/>
@@ -3822,6 +4084,232 @@
       <w:lvlText w:val=""/>
       <w:lvlJc w:val="left"/>
       <w:pPr>
+        <w:ind w:left="6576" w:hanging="360"/>
+      </w:pPr>
+      <w:rPr>
+        <w:rFonts w:ascii="Wingdings" w:hAnsi="Wingdings" w:hint="default"/>
+      </w:rPr>
+    </w:lvl>
+  </w:abstractNum>
+  <w:abstractNum w:abstractNumId="4" w15:restartNumberingAfterBreak="0">
+    <w:nsid w:val="76FA296F"/>
+    <w:multiLevelType w:val="hybridMultilevel"/>
+    <w:tmpl w:val="6DAE32EA"/>
+    <w:lvl w:ilvl="0" w:tplc="040E0001">
+      <w:start w:val="1"/>
+      <w:numFmt w:val="bullet"/>
+      <w:lvlText w:val=""/>
+      <w:lvlJc w:val="left"/>
+      <w:pPr>
+        <w:ind w:left="720" w:hanging="360"/>
+      </w:pPr>
+      <w:rPr>
+        <w:rFonts w:ascii="Symbol" w:hAnsi="Symbol" w:hint="default"/>
+      </w:rPr>
+    </w:lvl>
+    <w:lvl w:ilvl="1" w:tplc="040E0003" w:tentative="1">
+      <w:start w:val="1"/>
+      <w:numFmt w:val="bullet"/>
+      <w:lvlText w:val="o"/>
+      <w:lvlJc w:val="left"/>
+      <w:pPr>
+        <w:ind w:left="1440" w:hanging="360"/>
+      </w:pPr>
+      <w:rPr>
+        <w:rFonts w:ascii="Courier New" w:hAnsi="Courier New" w:cs="Courier New" w:hint="default"/>
+      </w:rPr>
+    </w:lvl>
+    <w:lvl w:ilvl="2" w:tplc="040E0005" w:tentative="1">
+      <w:start w:val="1"/>
+      <w:numFmt w:val="bullet"/>
+      <w:lvlText w:val=""/>
+      <w:lvlJc w:val="left"/>
+      <w:pPr>
+        <w:ind w:left="2160" w:hanging="360"/>
+      </w:pPr>
+      <w:rPr>
+        <w:rFonts w:ascii="Wingdings" w:hAnsi="Wingdings" w:hint="default"/>
+      </w:rPr>
+    </w:lvl>
+    <w:lvl w:ilvl="3" w:tplc="040E0001" w:tentative="1">
+      <w:start w:val="1"/>
+      <w:numFmt w:val="bullet"/>
+      <w:lvlText w:val=""/>
+      <w:lvlJc w:val="left"/>
+      <w:pPr>
+        <w:ind w:left="2880" w:hanging="360"/>
+      </w:pPr>
+      <w:rPr>
+        <w:rFonts w:ascii="Symbol" w:hAnsi="Symbol" w:hint="default"/>
+      </w:rPr>
+    </w:lvl>
+    <w:lvl w:ilvl="4" w:tplc="040E0003" w:tentative="1">
+      <w:start w:val="1"/>
+      <w:numFmt w:val="bullet"/>
+      <w:lvlText w:val="o"/>
+      <w:lvlJc w:val="left"/>
+      <w:pPr>
+        <w:ind w:left="3600" w:hanging="360"/>
+      </w:pPr>
+      <w:rPr>
+        <w:rFonts w:ascii="Courier New" w:hAnsi="Courier New" w:cs="Courier New" w:hint="default"/>
+      </w:rPr>
+    </w:lvl>
+    <w:lvl w:ilvl="5" w:tplc="040E0005" w:tentative="1">
+      <w:start w:val="1"/>
+      <w:numFmt w:val="bullet"/>
+      <w:lvlText w:val=""/>
+      <w:lvlJc w:val="left"/>
+      <w:pPr>
+        <w:ind w:left="4320" w:hanging="360"/>
+      </w:pPr>
+      <w:rPr>
+        <w:rFonts w:ascii="Wingdings" w:hAnsi="Wingdings" w:hint="default"/>
+      </w:rPr>
+    </w:lvl>
+    <w:lvl w:ilvl="6" w:tplc="040E0001" w:tentative="1">
+      <w:start w:val="1"/>
+      <w:numFmt w:val="bullet"/>
+      <w:lvlText w:val=""/>
+      <w:lvlJc w:val="left"/>
+      <w:pPr>
+        <w:ind w:left="5040" w:hanging="360"/>
+      </w:pPr>
+      <w:rPr>
+        <w:rFonts w:ascii="Symbol" w:hAnsi="Symbol" w:hint="default"/>
+      </w:rPr>
+    </w:lvl>
+    <w:lvl w:ilvl="7" w:tplc="040E0003" w:tentative="1">
+      <w:start w:val="1"/>
+      <w:numFmt w:val="bullet"/>
+      <w:lvlText w:val="o"/>
+      <w:lvlJc w:val="left"/>
+      <w:pPr>
+        <w:ind w:left="5760" w:hanging="360"/>
+      </w:pPr>
+      <w:rPr>
+        <w:rFonts w:ascii="Courier New" w:hAnsi="Courier New" w:cs="Courier New" w:hint="default"/>
+      </w:rPr>
+    </w:lvl>
+    <w:lvl w:ilvl="8" w:tplc="040E0005" w:tentative="1">
+      <w:start w:val="1"/>
+      <w:numFmt w:val="bullet"/>
+      <w:lvlText w:val=""/>
+      <w:lvlJc w:val="left"/>
+      <w:pPr>
+        <w:ind w:left="6480" w:hanging="360"/>
+      </w:pPr>
+      <w:rPr>
+        <w:rFonts w:ascii="Wingdings" w:hAnsi="Wingdings" w:hint="default"/>
+      </w:rPr>
+    </w:lvl>
+  </w:abstractNum>
+  <w:abstractNum w:abstractNumId="5" w15:restartNumberingAfterBreak="0">
+    <w:nsid w:val="7EB672F7"/>
+    <w:multiLevelType w:val="hybridMultilevel"/>
+    <w:tmpl w:val="A6F0C99C"/>
+    <w:lvl w:ilvl="0" w:tplc="040E0001">
+      <w:start w:val="1"/>
+      <w:numFmt w:val="bullet"/>
+      <w:lvlText w:val=""/>
+      <w:lvlJc w:val="left"/>
+      <w:pPr>
+        <w:ind w:left="720" w:hanging="360"/>
+      </w:pPr>
+      <w:rPr>
+        <w:rFonts w:ascii="Symbol" w:hAnsi="Symbol" w:hint="default"/>
+      </w:rPr>
+    </w:lvl>
+    <w:lvl w:ilvl="1" w:tplc="040E0003" w:tentative="1">
+      <w:start w:val="1"/>
+      <w:numFmt w:val="bullet"/>
+      <w:lvlText w:val="o"/>
+      <w:lvlJc w:val="left"/>
+      <w:pPr>
+        <w:ind w:left="1440" w:hanging="360"/>
+      </w:pPr>
+      <w:rPr>
+        <w:rFonts w:ascii="Courier New" w:hAnsi="Courier New" w:cs="Courier New" w:hint="default"/>
+      </w:rPr>
+    </w:lvl>
+    <w:lvl w:ilvl="2" w:tplc="040E0005" w:tentative="1">
+      <w:start w:val="1"/>
+      <w:numFmt w:val="bullet"/>
+      <w:lvlText w:val=""/>
+      <w:lvlJc w:val="left"/>
+      <w:pPr>
+        <w:ind w:left="2160" w:hanging="360"/>
+      </w:pPr>
+      <w:rPr>
+        <w:rFonts w:ascii="Wingdings" w:hAnsi="Wingdings" w:hint="default"/>
+      </w:rPr>
+    </w:lvl>
+    <w:lvl w:ilvl="3" w:tplc="040E0001" w:tentative="1">
+      <w:start w:val="1"/>
+      <w:numFmt w:val="bullet"/>
+      <w:lvlText w:val=""/>
+      <w:lvlJc w:val="left"/>
+      <w:pPr>
+        <w:ind w:left="2880" w:hanging="360"/>
+      </w:pPr>
+      <w:rPr>
+        <w:rFonts w:ascii="Symbol" w:hAnsi="Symbol" w:hint="default"/>
+      </w:rPr>
+    </w:lvl>
+    <w:lvl w:ilvl="4" w:tplc="040E0003" w:tentative="1">
+      <w:start w:val="1"/>
+      <w:numFmt w:val="bullet"/>
+      <w:lvlText w:val="o"/>
+      <w:lvlJc w:val="left"/>
+      <w:pPr>
+        <w:ind w:left="3600" w:hanging="360"/>
+      </w:pPr>
+      <w:rPr>
+        <w:rFonts w:ascii="Courier New" w:hAnsi="Courier New" w:cs="Courier New" w:hint="default"/>
+      </w:rPr>
+    </w:lvl>
+    <w:lvl w:ilvl="5" w:tplc="040E0005" w:tentative="1">
+      <w:start w:val="1"/>
+      <w:numFmt w:val="bullet"/>
+      <w:lvlText w:val=""/>
+      <w:lvlJc w:val="left"/>
+      <w:pPr>
+        <w:ind w:left="4320" w:hanging="360"/>
+      </w:pPr>
+      <w:rPr>
+        <w:rFonts w:ascii="Wingdings" w:hAnsi="Wingdings" w:hint="default"/>
+      </w:rPr>
+    </w:lvl>
+    <w:lvl w:ilvl="6" w:tplc="040E0001" w:tentative="1">
+      <w:start w:val="1"/>
+      <w:numFmt w:val="bullet"/>
+      <w:lvlText w:val=""/>
+      <w:lvlJc w:val="left"/>
+      <w:pPr>
+        <w:ind w:left="5040" w:hanging="360"/>
+      </w:pPr>
+      <w:rPr>
+        <w:rFonts w:ascii="Symbol" w:hAnsi="Symbol" w:hint="default"/>
+      </w:rPr>
+    </w:lvl>
+    <w:lvl w:ilvl="7" w:tplc="040E0003" w:tentative="1">
+      <w:start w:val="1"/>
+      <w:numFmt w:val="bullet"/>
+      <w:lvlText w:val="o"/>
+      <w:lvlJc w:val="left"/>
+      <w:pPr>
+        <w:ind w:left="5760" w:hanging="360"/>
+      </w:pPr>
+      <w:rPr>
+        <w:rFonts w:ascii="Courier New" w:hAnsi="Courier New" w:cs="Courier New" w:hint="default"/>
+      </w:rPr>
+    </w:lvl>
+    <w:lvl w:ilvl="8" w:tplc="040E0005" w:tentative="1">
+      <w:start w:val="1"/>
+      <w:numFmt w:val="bullet"/>
+      <w:lvlText w:val=""/>
+      <w:lvlJc w:val="left"/>
+      <w:pPr>
         <w:ind w:left="6480" w:hanging="360"/>
       </w:pPr>
       <w:rPr>
@@ -3830,16 +4318,22 @@
     </w:lvl>
   </w:abstractNum>
   <w:num w:numId="1" w16cid:durableId="33770327">
+    <w:abstractNumId w:val="5"/>
+  </w:num>
+  <w:num w:numId="2" w16cid:durableId="565265875">
     <w:abstractNumId w:val="3"/>
   </w:num>
-  <w:num w:numId="2" w16cid:durableId="565265875">
-    <w:abstractNumId w:val="1"/>
-  </w:num>
   <w:num w:numId="3" w16cid:durableId="1458177206">
-    <w:abstractNumId w:val="2"/>
+    <w:abstractNumId w:val="4"/>
   </w:num>
   <w:num w:numId="4" w16cid:durableId="1687830723">
     <w:abstractNumId w:val="0"/>
+  </w:num>
+  <w:num w:numId="5" w16cid:durableId="1595553410">
+    <w:abstractNumId w:val="2"/>
+  </w:num>
+  <w:num w:numId="6" w16cid:durableId="133304165">
+    <w:abstractNumId w:val="1"/>
   </w:num>
 </w:numbering>
 </file>

</xml_diff>

<commit_message>
Creating the project's backend level and changing the structure of the project (+documentated)
</commit_message>
<xml_diff>
--- a/documentation.docx
+++ b/documentation.docx
@@ -1239,7 +1239,7 @@
           <w:szCs w:val="36"/>
         </w:rPr>
         <w:drawing>
-          <wp:inline distT="0" distB="0" distL="0" distR="0" wp14:anchorId="78A43544" wp14:editId="22211031">
+          <wp:inline distT="0" distB="0" distL="0" distR="0" wp14:anchorId="78A43544" wp14:editId="01A747AD">
             <wp:extent cx="3166535" cy="1781175"/>
             <wp:effectExtent l="0" t="0" r="0" b="0"/>
             <wp:docPr id="3" name="Kép 3" descr="C:\Users\elnabulsy.csongor\AppData\Local\Microsoft\Windows\INetCache\Content.MSO\F75754B3.tmp"/>
@@ -1331,7 +1331,7 @@
           <w:szCs w:val="36"/>
         </w:rPr>
         <w:drawing>
-          <wp:inline distT="0" distB="0" distL="0" distR="0" wp14:anchorId="4E211814" wp14:editId="51576DED">
+          <wp:inline distT="0" distB="0" distL="0" distR="0" wp14:anchorId="4E211814" wp14:editId="1F830D70">
             <wp:extent cx="3133725" cy="1762720"/>
             <wp:effectExtent l="0" t="0" r="0" b="9525"/>
             <wp:docPr id="4" name="Kép 4" descr="C:\Users\elnabulsy.csongor\Downloads\ui_main_student.png"/>
@@ -1413,7 +1413,7 @@
           <w:szCs w:val="36"/>
         </w:rPr>
         <w:drawing>
-          <wp:inline distT="0" distB="0" distL="0" distR="0" wp14:anchorId="5137FB78" wp14:editId="639E7766">
+          <wp:inline distT="0" distB="0" distL="0" distR="0" wp14:anchorId="5137FB78" wp14:editId="5694A4CC">
             <wp:extent cx="3166110" cy="1780938"/>
             <wp:effectExtent l="0" t="0" r="0" b="0"/>
             <wp:docPr id="5" name="Kép 5" descr="C:\Users\elnabulsy.csongor\Downloads\ui_main_scheduler.png"/>
@@ -1506,7 +1506,7 @@
           <w:szCs w:val="36"/>
         </w:rPr>
         <w:drawing>
-          <wp:inline distT="0" distB="0" distL="0" distR="0" wp14:anchorId="27EC1C67" wp14:editId="5DFA3A61">
+          <wp:inline distT="0" distB="0" distL="0" distR="0" wp14:anchorId="27EC1C67" wp14:editId="6F84D963">
             <wp:extent cx="3055620" cy="1718786"/>
             <wp:effectExtent l="0" t="0" r="0" b="0"/>
             <wp:docPr id="6" name="Kép 6" descr="C:\Users\elnabulsy.csongor\Downloads\ui_main_admin.png"/>
@@ -1588,7 +1588,7 @@
           <w:szCs w:val="36"/>
         </w:rPr>
         <w:drawing>
-          <wp:inline distT="0" distB="0" distL="0" distR="0" wp14:anchorId="08225B4F" wp14:editId="4BBE48C3">
+          <wp:inline distT="0" distB="0" distL="0" distR="0" wp14:anchorId="08225B4F" wp14:editId="0C4FE159">
             <wp:extent cx="2933700" cy="1942430"/>
             <wp:effectExtent l="0" t="0" r="0" b="1270"/>
             <wp:docPr id="7" name="Kép 7" descr="C:\Users\elnabulsy.csongor\Downloads\ui_structure.png"/>
@@ -1761,7 +1761,7 @@
           <w:szCs w:val="36"/>
         </w:rPr>
         <w:drawing>
-          <wp:inline distT="0" distB="0" distL="0" distR="0" wp14:anchorId="2C256DB5" wp14:editId="3430B5E1">
+          <wp:inline distT="0" distB="0" distL="0" distR="0" wp14:anchorId="2C256DB5" wp14:editId="377E88B9">
             <wp:extent cx="3329940" cy="1752493"/>
             <wp:effectExtent l="0" t="0" r="3810" b="635"/>
             <wp:docPr id="9" name="Kép 9"/>
@@ -2996,6 +2996,16 @@
         </w:rPr>
         <w:t>2026-03-09 8:55-</w:t>
       </w:r>
+      <w:r>
+        <w:rPr>
+          <w:rFonts w:ascii="Times New Roman" w:eastAsia="Times New Roman" w:hAnsi="Times New Roman" w:cs="Times New Roman"/>
+          <w:b/>
+          <w:bCs/>
+          <w:sz w:val="40"/>
+          <w:szCs w:val="40"/>
+        </w:rPr>
+        <w:t>12:55</w:t>
+      </w:r>
     </w:p>
     <w:p>
       <w:pPr>
@@ -3312,57 +3322,283 @@
         </w:rPr>
       </w:pPr>
       <w:r>
-        <w:rPr>
-          <w:noProof/>
-        </w:rPr>
-        <w:drawing>
-          <wp:inline distT="0" distB="0" distL="0" distR="0" wp14:anchorId="0697373A" wp14:editId="49CB908E">
-            <wp:extent cx="304800" cy="304800"/>
-            <wp:effectExtent l="0" t="0" r="0" b="0"/>
-            <wp:docPr id="2024739431" name="Kép 1"/>
-            <wp:cNvGraphicFramePr>
-              <a:graphicFrameLocks xmlns:a="http://schemas.openxmlformats.org/drawingml/2006/main" noChangeAspect="1"/>
-            </wp:cNvGraphicFramePr>
-            <a:graphic xmlns:a="http://schemas.openxmlformats.org/drawingml/2006/main">
-              <a:graphicData uri="http://schemas.openxmlformats.org/drawingml/2006/picture">
-                <pic:pic xmlns:pic="http://schemas.openxmlformats.org/drawingml/2006/picture">
-                  <pic:nvPicPr>
-                    <pic:cNvPr id="0" name="Picture 1"/>
-                    <pic:cNvPicPr>
-                      <a:picLocks noChangeAspect="1" noChangeArrowheads="1"/>
-                    </pic:cNvPicPr>
-                  </pic:nvPicPr>
-                  <pic:blipFill>
-                    <a:blip r:embed="rId27">
-                      <a:extLst>
-                        <a:ext uri="{28A0092B-C50C-407E-A947-70E740481C1C}">
-                          <a14:useLocalDpi xmlns:a14="http://schemas.microsoft.com/office/drawing/2010/main" val="0"/>
-                        </a:ext>
-                      </a:extLst>
-                    </a:blip>
-                    <a:srcRect/>
-                    <a:stretch>
-                      <a:fillRect/>
-                    </a:stretch>
-                  </pic:blipFill>
-                  <pic:spPr bwMode="auto">
-                    <a:xfrm>
-                      <a:off x="0" y="0"/>
-                      <a:ext cx="304800" cy="304800"/>
-                    </a:xfrm>
-                    <a:prstGeom prst="rect">
-                      <a:avLst/>
-                    </a:prstGeom>
-                    <a:noFill/>
-                    <a:ln>
-                      <a:noFill/>
-                    </a:ln>
-                  </pic:spPr>
-                </pic:pic>
-              </a:graphicData>
-            </a:graphic>
-          </wp:inline>
-        </w:drawing>
+        <w:pict w14:anchorId="759CF75D">
+          <v:shape id="Kép 1" o:spid="_x0000_i1032" type="#_x0000_t75" style="width:24pt;height:24pt;visibility:visible;mso-wrap-style:square">
+            <v:imagedata r:id="rId27" o:title=""/>
+          </v:shape>
+        </w:pict>
+      </w:r>
+    </w:p>
+    <w:p>
+      <w:pPr>
+        <w:jc w:val="both"/>
+        <w:rPr>
+          <w:rFonts w:ascii="Times New Roman" w:eastAsia="Times New Roman" w:hAnsi="Times New Roman" w:cs="Times New Roman"/>
+          <w:sz w:val="36"/>
+          <w:szCs w:val="36"/>
+        </w:rPr>
+      </w:pPr>
+    </w:p>
+    <w:p>
+      <w:pPr>
+        <w:jc w:val="both"/>
+        <w:rPr>
+          <w:rFonts w:ascii="Times New Roman" w:eastAsia="Times New Roman" w:hAnsi="Times New Roman" w:cs="Times New Roman"/>
+          <w:b/>
+          <w:bCs/>
+          <w:sz w:val="40"/>
+          <w:szCs w:val="40"/>
+        </w:rPr>
+      </w:pPr>
+      <w:r>
+        <w:rPr>
+          <w:rFonts w:ascii="Times New Roman" w:eastAsia="Times New Roman" w:hAnsi="Times New Roman" w:cs="Times New Roman"/>
+          <w:b/>
+          <w:bCs/>
+          <w:sz w:val="40"/>
+          <w:szCs w:val="40"/>
+        </w:rPr>
+        <w:t>2026-03-12 14:15-15:10</w:t>
+      </w:r>
+    </w:p>
+    <w:p>
+      <w:pPr>
+        <w:jc w:val="both"/>
+        <w:rPr>
+          <w:rFonts w:ascii="Times New Roman" w:eastAsia="Times New Roman" w:hAnsi="Times New Roman" w:cs="Times New Roman"/>
+          <w:sz w:val="36"/>
+          <w:szCs w:val="36"/>
+        </w:rPr>
+      </w:pPr>
+      <w:r>
+        <w:rPr>
+          <w:rFonts w:ascii="Times New Roman" w:eastAsia="Times New Roman" w:hAnsi="Times New Roman" w:cs="Times New Roman"/>
+          <w:sz w:val="36"/>
+          <w:szCs w:val="36"/>
+        </w:rPr>
+        <w:t>(Susán Csongor György)</w:t>
+      </w:r>
+    </w:p>
+    <w:p>
+      <w:pPr>
+        <w:pStyle w:val="Listaszerbekezds"/>
+        <w:numPr>
+          <w:ilvl w:val="0"/>
+          <w:numId w:val="5"/>
+        </w:numPr>
+        <w:jc w:val="both"/>
+        <w:rPr>
+          <w:rFonts w:ascii="Times New Roman" w:eastAsia="Times New Roman" w:hAnsi="Times New Roman" w:cs="Times New Roman"/>
+          <w:sz w:val="36"/>
+          <w:szCs w:val="36"/>
+        </w:rPr>
+      </w:pPr>
+      <w:r>
+        <w:rPr>
+          <w:rFonts w:ascii="Times New Roman" w:eastAsia="Times New Roman" w:hAnsi="Times New Roman" w:cs="Times New Roman"/>
+          <w:sz w:val="36"/>
+          <w:szCs w:val="36"/>
+        </w:rPr>
+        <w:t>Hibaüzenetek hozzáadása (403, 404)</w:t>
+      </w:r>
+    </w:p>
+    <w:p>
+      <w:pPr>
+        <w:pStyle w:val="Listaszerbekezds"/>
+        <w:numPr>
+          <w:ilvl w:val="0"/>
+          <w:numId w:val="5"/>
+        </w:numPr>
+        <w:jc w:val="both"/>
+        <w:rPr>
+          <w:rFonts w:ascii="Times New Roman" w:eastAsia="Times New Roman" w:hAnsi="Times New Roman" w:cs="Times New Roman"/>
+          <w:sz w:val="36"/>
+          <w:szCs w:val="36"/>
+        </w:rPr>
+      </w:pPr>
+      <w:r>
+        <w:rPr>
+          <w:rFonts w:ascii="Times New Roman" w:eastAsia="Times New Roman" w:hAnsi="Times New Roman" w:cs="Times New Roman"/>
+          <w:sz w:val="36"/>
+          <w:szCs w:val="36"/>
+        </w:rPr>
+        <w:t>Szerepkörök (role) és requiresAuth hozzáadása a nézetekhez</w:t>
+      </w:r>
+    </w:p>
+    <w:p>
+      <w:pPr>
+        <w:pStyle w:val="Listaszerbekezds"/>
+        <w:numPr>
+          <w:ilvl w:val="0"/>
+          <w:numId w:val="5"/>
+        </w:numPr>
+        <w:jc w:val="both"/>
+        <w:rPr>
+          <w:rFonts w:ascii="Times New Roman" w:eastAsia="Times New Roman" w:hAnsi="Times New Roman" w:cs="Times New Roman"/>
+          <w:sz w:val="36"/>
+          <w:szCs w:val="36"/>
+        </w:rPr>
+      </w:pPr>
+      <w:r>
+        <w:rPr>
+          <w:rFonts w:ascii="Times New Roman" w:eastAsia="Times New Roman" w:hAnsi="Times New Roman" w:cs="Times New Roman"/>
+          <w:sz w:val="36"/>
+          <w:szCs w:val="36"/>
+        </w:rPr>
+        <w:t>Autentikációhoz szükséges alapváltozók felvétele az App.vue-ban</w:t>
+      </w:r>
+    </w:p>
+    <w:p>
+      <w:pPr>
+        <w:jc w:val="both"/>
+        <w:rPr>
+          <w:rFonts w:ascii="Times New Roman" w:eastAsia="Times New Roman" w:hAnsi="Times New Roman" w:cs="Times New Roman"/>
+          <w:sz w:val="36"/>
+          <w:szCs w:val="36"/>
+        </w:rPr>
+      </w:pPr>
+    </w:p>
+    <w:p>
+      <w:pPr>
+        <w:jc w:val="both"/>
+        <w:rPr>
+          <w:rFonts w:ascii="Times New Roman" w:eastAsia="Times New Roman" w:hAnsi="Times New Roman" w:cs="Times New Roman"/>
+          <w:sz w:val="36"/>
+          <w:szCs w:val="36"/>
+        </w:rPr>
+      </w:pPr>
+    </w:p>
+    <w:p>
+      <w:pPr>
+        <w:jc w:val="both"/>
+        <w:rPr>
+          <w:rFonts w:ascii="Times New Roman" w:eastAsia="Times New Roman" w:hAnsi="Times New Roman" w:cs="Times New Roman"/>
+          <w:b/>
+          <w:bCs/>
+          <w:sz w:val="40"/>
+          <w:szCs w:val="40"/>
+        </w:rPr>
+      </w:pPr>
+      <w:r>
+        <w:rPr>
+          <w:rFonts w:ascii="Times New Roman" w:eastAsia="Times New Roman" w:hAnsi="Times New Roman" w:cs="Times New Roman"/>
+          <w:b/>
+          <w:bCs/>
+          <w:sz w:val="40"/>
+          <w:szCs w:val="40"/>
+        </w:rPr>
+        <w:lastRenderedPageBreak/>
+        <w:t>2026-03-16 11:40-14:00, 15:20-45</w:t>
+      </w:r>
+    </w:p>
+    <w:p>
+      <w:pPr>
+        <w:jc w:val="both"/>
+        <w:rPr>
+          <w:rFonts w:ascii="Times New Roman" w:eastAsia="Times New Roman" w:hAnsi="Times New Roman" w:cs="Times New Roman"/>
+          <w:sz w:val="36"/>
+          <w:szCs w:val="36"/>
+        </w:rPr>
+      </w:pPr>
+      <w:r>
+        <w:rPr>
+          <w:rFonts w:ascii="Times New Roman" w:eastAsia="Times New Roman" w:hAnsi="Times New Roman" w:cs="Times New Roman"/>
+          <w:sz w:val="36"/>
+          <w:szCs w:val="36"/>
+        </w:rPr>
+        <w:t>(Susán Csongor György, El-Nabulsy Csongor Alan)</w:t>
+      </w:r>
+    </w:p>
+    <w:p>
+      <w:pPr>
+        <w:pStyle w:val="Listaszerbekezds"/>
+        <w:numPr>
+          <w:ilvl w:val="0"/>
+          <w:numId w:val="6"/>
+        </w:numPr>
+        <w:jc w:val="both"/>
+        <w:rPr>
+          <w:rFonts w:ascii="Times New Roman" w:eastAsia="Times New Roman" w:hAnsi="Times New Roman" w:cs="Times New Roman"/>
+          <w:sz w:val="36"/>
+          <w:szCs w:val="36"/>
+        </w:rPr>
+      </w:pPr>
+      <w:r>
+        <w:rPr>
+          <w:rFonts w:ascii="Times New Roman" w:eastAsia="Times New Roman" w:hAnsi="Times New Roman" w:cs="Times New Roman"/>
+          <w:sz w:val="36"/>
+          <w:szCs w:val="36"/>
+        </w:rPr>
+        <w:t>Backend projekt létrehozása (Susán)</w:t>
+      </w:r>
+    </w:p>
+    <w:p>
+      <w:pPr>
+        <w:pStyle w:val="Listaszerbekezds"/>
+        <w:numPr>
+          <w:ilvl w:val="0"/>
+          <w:numId w:val="6"/>
+        </w:numPr>
+        <w:jc w:val="both"/>
+        <w:rPr>
+          <w:rFonts w:ascii="Times New Roman" w:eastAsia="Times New Roman" w:hAnsi="Times New Roman" w:cs="Times New Roman"/>
+          <w:sz w:val="36"/>
+          <w:szCs w:val="36"/>
+        </w:rPr>
+      </w:pPr>
+      <w:r>
+        <w:rPr>
+          <w:rFonts w:ascii="Times New Roman" w:eastAsia="Times New Roman" w:hAnsi="Times New Roman" w:cs="Times New Roman"/>
+          <w:sz w:val="36"/>
+          <w:szCs w:val="36"/>
+        </w:rPr>
+        <w:t>Táblák SQL-tervezetének elkészítése (El-Nabulsy)</w:t>
+      </w:r>
+    </w:p>
+    <w:p>
+      <w:pPr>
+        <w:pStyle w:val="Listaszerbekezds"/>
+        <w:numPr>
+          <w:ilvl w:val="0"/>
+          <w:numId w:val="6"/>
+        </w:numPr>
+        <w:jc w:val="both"/>
+        <w:rPr>
+          <w:rFonts w:ascii="Times New Roman" w:eastAsia="Times New Roman" w:hAnsi="Times New Roman" w:cs="Times New Roman"/>
+          <w:sz w:val="36"/>
+          <w:szCs w:val="36"/>
+        </w:rPr>
+      </w:pPr>
+      <w:r>
+        <w:rPr>
+          <w:rFonts w:ascii="Times New Roman" w:eastAsia="Times New Roman" w:hAnsi="Times New Roman" w:cs="Times New Roman"/>
+          <w:sz w:val="36"/>
+          <w:szCs w:val="36"/>
+        </w:rPr>
+        <w:t>Táblázatok relációs tervvé írása és azok implementálása (model-lek, egyelőre üres seederek és migration-ök) a Backend (Laravel) projektbe (Susán)</w:t>
+      </w:r>
+    </w:p>
+    <w:p>
+      <w:pPr>
+        <w:pStyle w:val="Listaszerbekezds"/>
+        <w:numPr>
+          <w:ilvl w:val="0"/>
+          <w:numId w:val="6"/>
+        </w:numPr>
+        <w:jc w:val="both"/>
+        <w:rPr>
+          <w:rFonts w:ascii="Times New Roman" w:eastAsia="Times New Roman" w:hAnsi="Times New Roman" w:cs="Times New Roman"/>
+          <w:sz w:val="36"/>
+          <w:szCs w:val="36"/>
+        </w:rPr>
+      </w:pPr>
+      <w:r>
+        <w:rPr>
+          <w:rFonts w:ascii="Times New Roman" w:eastAsia="Times New Roman" w:hAnsi="Times New Roman" w:cs="Times New Roman"/>
+          <w:sz w:val="36"/>
+          <w:szCs w:val="36"/>
+        </w:rPr>
+        <w:t>Projekt struktúrájának végleges kialakítása (eddig frontendPart-blathyfm volt, viszont azóta a főmappa a BlathyFM mappát viseli, amiben két, az alkalmazás egy-egy szintjét képviselő projekt található (blathyfm_frontend – amiben az eddigi frontend-alkalmazás volt megtalálható – és blathyfm_backend, ami pedig az újonnan létrejött backend része a projektnek) (Susán)</w:t>
       </w:r>
     </w:p>
     <w:sectPr>
@@ -3377,6 +3613,32 @@
 
 <file path=word/numbering.xml><?xml version="1.0" encoding="utf-8"?>
 <w:numbering xmlns:wpc="http://schemas.microsoft.com/office/word/2010/wordprocessingCanvas" xmlns:cx="http://schemas.microsoft.com/office/drawing/2014/chartex" xmlns:cx1="http://schemas.microsoft.com/office/drawing/2015/9/8/chartex" xmlns:cx2="http://schemas.microsoft.com/office/drawing/2015/10/21/chartex" xmlns:cx3="http://schemas.microsoft.com/office/drawing/2016/5/9/chartex" xmlns:cx4="http://schemas.microsoft.com/office/drawing/2016/5/10/chartex" xmlns:cx5="http://schemas.microsoft.com/office/drawing/2016/5/11/chartex" xmlns:cx6="http://schemas.microsoft.com/office/drawing/2016/5/12/chartex" xmlns:cx7="http://schemas.microsoft.com/office/drawing/2016/5/13/chartex" xmlns:cx8="http://schemas.microsoft.com/office/drawing/2016/5/14/chartex" xmlns:mc="http://schemas.openxmlformats.org/markup-compatibility/2006" xmlns:aink="http://schemas.microsoft.com/office/drawing/2016/ink" xmlns:am3d="http://schemas.microsoft.com/office/drawing/2017/model3d" xmlns:o="urn:schemas-microsoft-com:office:office" xmlns:oel="http://schemas.microsoft.com/office/2019/extlst" xmlns:r="http://schemas.openxmlformats.org/officeDocument/2006/relationships" xmlns:m="http://schemas.openxmlformats.org/officeDocument/2006/math" xmlns:v="urn:schemas-microsoft-com:vml" xmlns:wp14="http://schemas.microsoft.com/office/word/2010/wordprocessingDrawing" xmlns:wp="http://schemas.openxmlformats.org/drawingml/2006/wordprocessingDrawing" xmlns:w10="urn:schemas-microsoft-com:office:word" xmlns:w="http://schemas.openxmlformats.org/wordprocessingml/2006/main" xmlns:w14="http://schemas.microsoft.com/office/word/2010/wordml" xmlns:w15="http://schemas.microsoft.com/office/word/2012/wordml" xmlns:w16cex="http://schemas.microsoft.com/office/word/2018/wordml/cex" xmlns:w16cid="http://schemas.microsoft.com/office/word/2016/wordml/cid" xmlns:w16="http://schemas.microsoft.com/office/word/2018/wordml" xmlns:w16du="http://schemas.microsoft.com/office/word/2023/wordml/word16du" xmlns:w16sdtdh="http://schemas.microsoft.com/office/word/2020/wordml/sdtdatahash" xmlns:w16sdtfl="http://schemas.microsoft.com/office/word/2024/wordml/sdtformatlock" xmlns:w16se="http://schemas.microsoft.com/office/word/2015/wordml/symex" xmlns:wpg="http://schemas.microsoft.com/office/word/2010/wordprocessingGroup" xmlns:wpi="http://schemas.microsoft.com/office/word/2010/wordprocessingInk" xmlns:wne="http://schemas.microsoft.com/office/word/2006/wordml" xmlns:wps="http://schemas.microsoft.com/office/word/2010/wordprocessingShape" mc:Ignorable="w14 w15 w16se w16cid w16 w16cex w16sdtdh w16sdtfl w16du wp14">
+  <w:numPicBullet w:numPicBulletId="0">
+    <w:pict>
+      <v:shapetype id="_x0000_t75" coordsize="21600,21600" o:spt="75" o:preferrelative="t" path="m@4@5l@4@11@9@11@9@5xe" filled="f" stroked="f">
+        <v:stroke joinstyle="miter"/>
+        <v:formulas>
+          <v:f eqn="if lineDrawn pixelLineWidth 0"/>
+          <v:f eqn="sum @0 1 0"/>
+          <v:f eqn="sum 0 0 @1"/>
+          <v:f eqn="prod @2 1 2"/>
+          <v:f eqn="prod @3 21600 pixelWidth"/>
+          <v:f eqn="prod @3 21600 pixelHeight"/>
+          <v:f eqn="sum @0 0 1"/>
+          <v:f eqn="prod @6 1 2"/>
+          <v:f eqn="prod @7 21600 pixelWidth"/>
+          <v:f eqn="sum @8 21600 0"/>
+          <v:f eqn="prod @7 21600 pixelHeight"/>
+          <v:f eqn="sum @10 21600 0"/>
+        </v:formulas>
+        <v:path o:extrusionok="f" gradientshapeok="t" o:connecttype="rect"/>
+        <o:lock v:ext="edit" aspectratio="t"/>
+      </v:shapetype>
+      <v:shape id="Kép 1" o:spid="_x0000_i1025" type="#_x0000_t75" style="width:24pt;height:24pt;visibility:visible;mso-wrap-style:square" o:bullet="t">
+        <v:imagedata r:id="rId1" o:title=""/>
+      </v:shape>
+    </w:pict>
+  </w:numPicBullet>
   <w:abstractNum w:abstractNumId="0" w15:restartNumberingAfterBreak="0">
     <w:nsid w:val="3C1938F6"/>
     <w:multiLevelType w:val="hybridMultilevel"/>
@@ -3491,16 +3753,16 @@
     </w:lvl>
   </w:abstractNum>
   <w:abstractNum w:abstractNumId="1" w15:restartNumberingAfterBreak="0">
-    <w:nsid w:val="6E7312B6"/>
+    <w:nsid w:val="47442E3E"/>
     <w:multiLevelType w:val="hybridMultilevel"/>
-    <w:tmpl w:val="FD80BAFC"/>
+    <w:tmpl w:val="64928C38"/>
     <w:lvl w:ilvl="0" w:tplc="040E0001">
       <w:start w:val="1"/>
       <w:numFmt w:val="bullet"/>
       <w:lvlText w:val=""/>
       <w:lvlJc w:val="left"/>
       <w:pPr>
-        <w:ind w:left="816" w:hanging="360"/>
+        <w:ind w:left="720" w:hanging="360"/>
       </w:pPr>
       <w:rPr>
         <w:rFonts w:ascii="Symbol" w:hAnsi="Symbol" w:hint="default"/>
@@ -3512,7 +3774,7 @@
       <w:lvlText w:val="o"/>
       <w:lvlJc w:val="left"/>
       <w:pPr>
-        <w:ind w:left="1536" w:hanging="360"/>
+        <w:ind w:left="1440" w:hanging="360"/>
       </w:pPr>
       <w:rPr>
         <w:rFonts w:ascii="Courier New" w:hAnsi="Courier New" w:cs="Courier New" w:hint="default"/>
@@ -3524,7 +3786,7 @@
       <w:lvlText w:val=""/>
       <w:lvlJc w:val="left"/>
       <w:pPr>
-        <w:ind w:left="2256" w:hanging="360"/>
+        <w:ind w:left="2160" w:hanging="360"/>
       </w:pPr>
       <w:rPr>
         <w:rFonts w:ascii="Wingdings" w:hAnsi="Wingdings" w:hint="default"/>
@@ -3536,7 +3798,7 @@
       <w:lvlText w:val=""/>
       <w:lvlJc w:val="left"/>
       <w:pPr>
-        <w:ind w:left="2976" w:hanging="360"/>
+        <w:ind w:left="2880" w:hanging="360"/>
       </w:pPr>
       <w:rPr>
         <w:rFonts w:ascii="Symbol" w:hAnsi="Symbol" w:hint="default"/>
@@ -3548,7 +3810,7 @@
       <w:lvlText w:val="o"/>
       <w:lvlJc w:val="left"/>
       <w:pPr>
-        <w:ind w:left="3696" w:hanging="360"/>
+        <w:ind w:left="3600" w:hanging="360"/>
       </w:pPr>
       <w:rPr>
         <w:rFonts w:ascii="Courier New" w:hAnsi="Courier New" w:cs="Courier New" w:hint="default"/>
@@ -3560,7 +3822,7 @@
       <w:lvlText w:val=""/>
       <w:lvlJc w:val="left"/>
       <w:pPr>
-        <w:ind w:left="4416" w:hanging="360"/>
+        <w:ind w:left="4320" w:hanging="360"/>
       </w:pPr>
       <w:rPr>
         <w:rFonts w:ascii="Wingdings" w:hAnsi="Wingdings" w:hint="default"/>
@@ -3572,7 +3834,7 @@
       <w:lvlText w:val=""/>
       <w:lvlJc w:val="left"/>
       <w:pPr>
-        <w:ind w:left="5136" w:hanging="360"/>
+        <w:ind w:left="5040" w:hanging="360"/>
       </w:pPr>
       <w:rPr>
         <w:rFonts w:ascii="Symbol" w:hAnsi="Symbol" w:hint="default"/>
@@ -3584,7 +3846,7 @@
       <w:lvlText w:val="o"/>
       <w:lvlJc w:val="left"/>
       <w:pPr>
-        <w:ind w:left="5856" w:hanging="360"/>
+        <w:ind w:left="5760" w:hanging="360"/>
       </w:pPr>
       <w:rPr>
         <w:rFonts w:ascii="Courier New" w:hAnsi="Courier New" w:cs="Courier New" w:hint="default"/>
@@ -3596,7 +3858,7 @@
       <w:lvlText w:val=""/>
       <w:lvlJc w:val="left"/>
       <w:pPr>
-        <w:ind w:left="6576" w:hanging="360"/>
+        <w:ind w:left="6480" w:hanging="360"/>
       </w:pPr>
       <w:rPr>
         <w:rFonts w:ascii="Wingdings" w:hAnsi="Wingdings" w:hint="default"/>
@@ -3604,9 +3866,9 @@
     </w:lvl>
   </w:abstractNum>
   <w:abstractNum w:abstractNumId="2" w15:restartNumberingAfterBreak="0">
-    <w:nsid w:val="76FA296F"/>
+    <w:nsid w:val="69FA5A50"/>
     <w:multiLevelType w:val="hybridMultilevel"/>
-    <w:tmpl w:val="6DAE32EA"/>
+    <w:tmpl w:val="D82A6326"/>
     <w:lvl w:ilvl="0" w:tplc="040E0001">
       <w:start w:val="1"/>
       <w:numFmt w:val="bullet"/>
@@ -3717,16 +3979,16 @@
     </w:lvl>
   </w:abstractNum>
   <w:abstractNum w:abstractNumId="3" w15:restartNumberingAfterBreak="0">
-    <w:nsid w:val="7EB672F7"/>
+    <w:nsid w:val="6E7312B6"/>
     <w:multiLevelType w:val="hybridMultilevel"/>
-    <w:tmpl w:val="A6F0C99C"/>
+    <w:tmpl w:val="FD80BAFC"/>
     <w:lvl w:ilvl="0" w:tplc="040E0001">
       <w:start w:val="1"/>
       <w:numFmt w:val="bullet"/>
       <w:lvlText w:val=""/>
       <w:lvlJc w:val="left"/>
       <w:pPr>
-        <w:ind w:left="720" w:hanging="360"/>
+        <w:ind w:left="816" w:hanging="360"/>
       </w:pPr>
       <w:rPr>
         <w:rFonts w:ascii="Symbol" w:hAnsi="Symbol" w:hint="default"/>
@@ -3738,7 +4000,7 @@
       <w:lvlText w:val="o"/>
       <w:lvlJc w:val="left"/>
       <w:pPr>
-        <w:ind w:left="1440" w:hanging="360"/>
+        <w:ind w:left="1536" w:hanging="360"/>
       </w:pPr>
       <w:rPr>
         <w:rFonts w:ascii="Courier New" w:hAnsi="Courier New" w:cs="Courier New" w:hint="default"/>
@@ -3750,7 +4012,7 @@
       <w:lvlText w:val=""/>
       <w:lvlJc w:val="left"/>
       <w:pPr>
-        <w:ind w:left="2160" w:hanging="360"/>
+        <w:ind w:left="2256" w:hanging="360"/>
       </w:pPr>
       <w:rPr>
         <w:rFonts w:ascii="Wingdings" w:hAnsi="Wingdings" w:hint="default"/>
@@ -3762,7 +4024,7 @@
       <w:lvlText w:val=""/>
       <w:lvlJc w:val="left"/>
       <w:pPr>
-        <w:ind w:left="2880" w:hanging="360"/>
+        <w:ind w:left="2976" w:hanging="360"/>
       </w:pPr>
       <w:rPr>
         <w:rFonts w:ascii="Symbol" w:hAnsi="Symbol" w:hint="default"/>
@@ -3774,7 +4036,7 @@
       <w:lvlText w:val="o"/>
       <w:lvlJc w:val="left"/>
       <w:pPr>
-        <w:ind w:left="3600" w:hanging="360"/>
+        <w:ind w:left="3696" w:hanging="360"/>
       </w:pPr>
       <w:rPr>
         <w:rFonts w:ascii="Courier New" w:hAnsi="Courier New" w:cs="Courier New" w:hint="default"/>
@@ -3786,7 +4048,7 @@
       <w:lvlText w:val=""/>
       <w:lvlJc w:val="left"/>
       <w:pPr>
-        <w:ind w:left="4320" w:hanging="360"/>
+        <w:ind w:left="4416" w:hanging="360"/>
       </w:pPr>
       <w:rPr>
         <w:rFonts w:ascii="Wingdings" w:hAnsi="Wingdings" w:hint="default"/>
@@ -3798,7 +4060,7 @@
       <w:lvlText w:val=""/>
       <w:lvlJc w:val="left"/>
       <w:pPr>
-        <w:ind w:left="5040" w:hanging="360"/>
+        <w:ind w:left="5136" w:hanging="360"/>
       </w:pPr>
       <w:rPr>
         <w:rFonts w:ascii="Symbol" w:hAnsi="Symbol" w:hint="default"/>
@@ -3810,7 +4072,7 @@
       <w:lvlText w:val="o"/>
       <w:lvlJc w:val="left"/>
       <w:pPr>
-        <w:ind w:left="5760" w:hanging="360"/>
+        <w:ind w:left="5856" w:hanging="360"/>
       </w:pPr>
       <w:rPr>
         <w:rFonts w:ascii="Courier New" w:hAnsi="Courier New" w:cs="Courier New" w:hint="default"/>
@@ -3822,6 +4084,232 @@
       <w:lvlText w:val=""/>
       <w:lvlJc w:val="left"/>
       <w:pPr>
+        <w:ind w:left="6576" w:hanging="360"/>
+      </w:pPr>
+      <w:rPr>
+        <w:rFonts w:ascii="Wingdings" w:hAnsi="Wingdings" w:hint="default"/>
+      </w:rPr>
+    </w:lvl>
+  </w:abstractNum>
+  <w:abstractNum w:abstractNumId="4" w15:restartNumberingAfterBreak="0">
+    <w:nsid w:val="76FA296F"/>
+    <w:multiLevelType w:val="hybridMultilevel"/>
+    <w:tmpl w:val="6DAE32EA"/>
+    <w:lvl w:ilvl="0" w:tplc="040E0001">
+      <w:start w:val="1"/>
+      <w:numFmt w:val="bullet"/>
+      <w:lvlText w:val=""/>
+      <w:lvlJc w:val="left"/>
+      <w:pPr>
+        <w:ind w:left="720" w:hanging="360"/>
+      </w:pPr>
+      <w:rPr>
+        <w:rFonts w:ascii="Symbol" w:hAnsi="Symbol" w:hint="default"/>
+      </w:rPr>
+    </w:lvl>
+    <w:lvl w:ilvl="1" w:tplc="040E0003" w:tentative="1">
+      <w:start w:val="1"/>
+      <w:numFmt w:val="bullet"/>
+      <w:lvlText w:val="o"/>
+      <w:lvlJc w:val="left"/>
+      <w:pPr>
+        <w:ind w:left="1440" w:hanging="360"/>
+      </w:pPr>
+      <w:rPr>
+        <w:rFonts w:ascii="Courier New" w:hAnsi="Courier New" w:cs="Courier New" w:hint="default"/>
+      </w:rPr>
+    </w:lvl>
+    <w:lvl w:ilvl="2" w:tplc="040E0005" w:tentative="1">
+      <w:start w:val="1"/>
+      <w:numFmt w:val="bullet"/>
+      <w:lvlText w:val=""/>
+      <w:lvlJc w:val="left"/>
+      <w:pPr>
+        <w:ind w:left="2160" w:hanging="360"/>
+      </w:pPr>
+      <w:rPr>
+        <w:rFonts w:ascii="Wingdings" w:hAnsi="Wingdings" w:hint="default"/>
+      </w:rPr>
+    </w:lvl>
+    <w:lvl w:ilvl="3" w:tplc="040E0001" w:tentative="1">
+      <w:start w:val="1"/>
+      <w:numFmt w:val="bullet"/>
+      <w:lvlText w:val=""/>
+      <w:lvlJc w:val="left"/>
+      <w:pPr>
+        <w:ind w:left="2880" w:hanging="360"/>
+      </w:pPr>
+      <w:rPr>
+        <w:rFonts w:ascii="Symbol" w:hAnsi="Symbol" w:hint="default"/>
+      </w:rPr>
+    </w:lvl>
+    <w:lvl w:ilvl="4" w:tplc="040E0003" w:tentative="1">
+      <w:start w:val="1"/>
+      <w:numFmt w:val="bullet"/>
+      <w:lvlText w:val="o"/>
+      <w:lvlJc w:val="left"/>
+      <w:pPr>
+        <w:ind w:left="3600" w:hanging="360"/>
+      </w:pPr>
+      <w:rPr>
+        <w:rFonts w:ascii="Courier New" w:hAnsi="Courier New" w:cs="Courier New" w:hint="default"/>
+      </w:rPr>
+    </w:lvl>
+    <w:lvl w:ilvl="5" w:tplc="040E0005" w:tentative="1">
+      <w:start w:val="1"/>
+      <w:numFmt w:val="bullet"/>
+      <w:lvlText w:val=""/>
+      <w:lvlJc w:val="left"/>
+      <w:pPr>
+        <w:ind w:left="4320" w:hanging="360"/>
+      </w:pPr>
+      <w:rPr>
+        <w:rFonts w:ascii="Wingdings" w:hAnsi="Wingdings" w:hint="default"/>
+      </w:rPr>
+    </w:lvl>
+    <w:lvl w:ilvl="6" w:tplc="040E0001" w:tentative="1">
+      <w:start w:val="1"/>
+      <w:numFmt w:val="bullet"/>
+      <w:lvlText w:val=""/>
+      <w:lvlJc w:val="left"/>
+      <w:pPr>
+        <w:ind w:left="5040" w:hanging="360"/>
+      </w:pPr>
+      <w:rPr>
+        <w:rFonts w:ascii="Symbol" w:hAnsi="Symbol" w:hint="default"/>
+      </w:rPr>
+    </w:lvl>
+    <w:lvl w:ilvl="7" w:tplc="040E0003" w:tentative="1">
+      <w:start w:val="1"/>
+      <w:numFmt w:val="bullet"/>
+      <w:lvlText w:val="o"/>
+      <w:lvlJc w:val="left"/>
+      <w:pPr>
+        <w:ind w:left="5760" w:hanging="360"/>
+      </w:pPr>
+      <w:rPr>
+        <w:rFonts w:ascii="Courier New" w:hAnsi="Courier New" w:cs="Courier New" w:hint="default"/>
+      </w:rPr>
+    </w:lvl>
+    <w:lvl w:ilvl="8" w:tplc="040E0005" w:tentative="1">
+      <w:start w:val="1"/>
+      <w:numFmt w:val="bullet"/>
+      <w:lvlText w:val=""/>
+      <w:lvlJc w:val="left"/>
+      <w:pPr>
+        <w:ind w:left="6480" w:hanging="360"/>
+      </w:pPr>
+      <w:rPr>
+        <w:rFonts w:ascii="Wingdings" w:hAnsi="Wingdings" w:hint="default"/>
+      </w:rPr>
+    </w:lvl>
+  </w:abstractNum>
+  <w:abstractNum w:abstractNumId="5" w15:restartNumberingAfterBreak="0">
+    <w:nsid w:val="7EB672F7"/>
+    <w:multiLevelType w:val="hybridMultilevel"/>
+    <w:tmpl w:val="A6F0C99C"/>
+    <w:lvl w:ilvl="0" w:tplc="040E0001">
+      <w:start w:val="1"/>
+      <w:numFmt w:val="bullet"/>
+      <w:lvlText w:val=""/>
+      <w:lvlJc w:val="left"/>
+      <w:pPr>
+        <w:ind w:left="720" w:hanging="360"/>
+      </w:pPr>
+      <w:rPr>
+        <w:rFonts w:ascii="Symbol" w:hAnsi="Symbol" w:hint="default"/>
+      </w:rPr>
+    </w:lvl>
+    <w:lvl w:ilvl="1" w:tplc="040E0003" w:tentative="1">
+      <w:start w:val="1"/>
+      <w:numFmt w:val="bullet"/>
+      <w:lvlText w:val="o"/>
+      <w:lvlJc w:val="left"/>
+      <w:pPr>
+        <w:ind w:left="1440" w:hanging="360"/>
+      </w:pPr>
+      <w:rPr>
+        <w:rFonts w:ascii="Courier New" w:hAnsi="Courier New" w:cs="Courier New" w:hint="default"/>
+      </w:rPr>
+    </w:lvl>
+    <w:lvl w:ilvl="2" w:tplc="040E0005" w:tentative="1">
+      <w:start w:val="1"/>
+      <w:numFmt w:val="bullet"/>
+      <w:lvlText w:val=""/>
+      <w:lvlJc w:val="left"/>
+      <w:pPr>
+        <w:ind w:left="2160" w:hanging="360"/>
+      </w:pPr>
+      <w:rPr>
+        <w:rFonts w:ascii="Wingdings" w:hAnsi="Wingdings" w:hint="default"/>
+      </w:rPr>
+    </w:lvl>
+    <w:lvl w:ilvl="3" w:tplc="040E0001" w:tentative="1">
+      <w:start w:val="1"/>
+      <w:numFmt w:val="bullet"/>
+      <w:lvlText w:val=""/>
+      <w:lvlJc w:val="left"/>
+      <w:pPr>
+        <w:ind w:left="2880" w:hanging="360"/>
+      </w:pPr>
+      <w:rPr>
+        <w:rFonts w:ascii="Symbol" w:hAnsi="Symbol" w:hint="default"/>
+      </w:rPr>
+    </w:lvl>
+    <w:lvl w:ilvl="4" w:tplc="040E0003" w:tentative="1">
+      <w:start w:val="1"/>
+      <w:numFmt w:val="bullet"/>
+      <w:lvlText w:val="o"/>
+      <w:lvlJc w:val="left"/>
+      <w:pPr>
+        <w:ind w:left="3600" w:hanging="360"/>
+      </w:pPr>
+      <w:rPr>
+        <w:rFonts w:ascii="Courier New" w:hAnsi="Courier New" w:cs="Courier New" w:hint="default"/>
+      </w:rPr>
+    </w:lvl>
+    <w:lvl w:ilvl="5" w:tplc="040E0005" w:tentative="1">
+      <w:start w:val="1"/>
+      <w:numFmt w:val="bullet"/>
+      <w:lvlText w:val=""/>
+      <w:lvlJc w:val="left"/>
+      <w:pPr>
+        <w:ind w:left="4320" w:hanging="360"/>
+      </w:pPr>
+      <w:rPr>
+        <w:rFonts w:ascii="Wingdings" w:hAnsi="Wingdings" w:hint="default"/>
+      </w:rPr>
+    </w:lvl>
+    <w:lvl w:ilvl="6" w:tplc="040E0001" w:tentative="1">
+      <w:start w:val="1"/>
+      <w:numFmt w:val="bullet"/>
+      <w:lvlText w:val=""/>
+      <w:lvlJc w:val="left"/>
+      <w:pPr>
+        <w:ind w:left="5040" w:hanging="360"/>
+      </w:pPr>
+      <w:rPr>
+        <w:rFonts w:ascii="Symbol" w:hAnsi="Symbol" w:hint="default"/>
+      </w:rPr>
+    </w:lvl>
+    <w:lvl w:ilvl="7" w:tplc="040E0003" w:tentative="1">
+      <w:start w:val="1"/>
+      <w:numFmt w:val="bullet"/>
+      <w:lvlText w:val="o"/>
+      <w:lvlJc w:val="left"/>
+      <w:pPr>
+        <w:ind w:left="5760" w:hanging="360"/>
+      </w:pPr>
+      <w:rPr>
+        <w:rFonts w:ascii="Courier New" w:hAnsi="Courier New" w:cs="Courier New" w:hint="default"/>
+      </w:rPr>
+    </w:lvl>
+    <w:lvl w:ilvl="8" w:tplc="040E0005" w:tentative="1">
+      <w:start w:val="1"/>
+      <w:numFmt w:val="bullet"/>
+      <w:lvlText w:val=""/>
+      <w:lvlJc w:val="left"/>
+      <w:pPr>
         <w:ind w:left="6480" w:hanging="360"/>
       </w:pPr>
       <w:rPr>
@@ -3830,16 +4318,22 @@
     </w:lvl>
   </w:abstractNum>
   <w:num w:numId="1" w16cid:durableId="33770327">
+    <w:abstractNumId w:val="5"/>
+  </w:num>
+  <w:num w:numId="2" w16cid:durableId="565265875">
     <w:abstractNumId w:val="3"/>
   </w:num>
-  <w:num w:numId="2" w16cid:durableId="565265875">
-    <w:abstractNumId w:val="1"/>
-  </w:num>
   <w:num w:numId="3" w16cid:durableId="1458177206">
-    <w:abstractNumId w:val="2"/>
+    <w:abstractNumId w:val="4"/>
   </w:num>
   <w:num w:numId="4" w16cid:durableId="1687830723">
     <w:abstractNumId w:val="0"/>
+  </w:num>
+  <w:num w:numId="5" w16cid:durableId="1595553410">
+    <w:abstractNumId w:val="2"/>
+  </w:num>
+  <w:num w:numId="6" w16cid:durableId="133304165">
+    <w:abstractNumId w:val="1"/>
   </w:num>
 </w:numbering>
 </file>

</xml_diff>

<commit_message>
Making two out of four footer views (+documentation update)
</commit_message>
<xml_diff>
--- a/documentation.docx
+++ b/documentation.docx
@@ -1239,7 +1239,7 @@
           <w:szCs w:val="36"/>
         </w:rPr>
         <w:drawing>
-          <wp:inline distT="0" distB="0" distL="0" distR="0" wp14:anchorId="78A43544" wp14:editId="01A747AD">
+          <wp:inline distT="0" distB="0" distL="0" distR="0" wp14:anchorId="78A43544" wp14:editId="529C3FB2">
             <wp:extent cx="3166535" cy="1781175"/>
             <wp:effectExtent l="0" t="0" r="0" b="0"/>
             <wp:docPr id="3" name="Kép 3" descr="C:\Users\elnabulsy.csongor\AppData\Local\Microsoft\Windows\INetCache\Content.MSO\F75754B3.tmp"/>
@@ -1331,7 +1331,7 @@
           <w:szCs w:val="36"/>
         </w:rPr>
         <w:drawing>
-          <wp:inline distT="0" distB="0" distL="0" distR="0" wp14:anchorId="4E211814" wp14:editId="1F830D70">
+          <wp:inline distT="0" distB="0" distL="0" distR="0" wp14:anchorId="4E211814" wp14:editId="4DD3D4EC">
             <wp:extent cx="3133725" cy="1762720"/>
             <wp:effectExtent l="0" t="0" r="0" b="9525"/>
             <wp:docPr id="4" name="Kép 4" descr="C:\Users\elnabulsy.csongor\Downloads\ui_main_student.png"/>
@@ -1413,7 +1413,7 @@
           <w:szCs w:val="36"/>
         </w:rPr>
         <w:drawing>
-          <wp:inline distT="0" distB="0" distL="0" distR="0" wp14:anchorId="5137FB78" wp14:editId="5694A4CC">
+          <wp:inline distT="0" distB="0" distL="0" distR="0" wp14:anchorId="5137FB78" wp14:editId="6282C531">
             <wp:extent cx="3166110" cy="1780938"/>
             <wp:effectExtent l="0" t="0" r="0" b="0"/>
             <wp:docPr id="5" name="Kép 5" descr="C:\Users\elnabulsy.csongor\Downloads\ui_main_scheduler.png"/>
@@ -1506,7 +1506,7 @@
           <w:szCs w:val="36"/>
         </w:rPr>
         <w:drawing>
-          <wp:inline distT="0" distB="0" distL="0" distR="0" wp14:anchorId="27EC1C67" wp14:editId="6F84D963">
+          <wp:inline distT="0" distB="0" distL="0" distR="0" wp14:anchorId="27EC1C67" wp14:editId="34F628AA">
             <wp:extent cx="3055620" cy="1718786"/>
             <wp:effectExtent l="0" t="0" r="0" b="0"/>
             <wp:docPr id="6" name="Kép 6" descr="C:\Users\elnabulsy.csongor\Downloads\ui_main_admin.png"/>
@@ -1588,7 +1588,7 @@
           <w:szCs w:val="36"/>
         </w:rPr>
         <w:drawing>
-          <wp:inline distT="0" distB="0" distL="0" distR="0" wp14:anchorId="08225B4F" wp14:editId="0C4FE159">
+          <wp:inline distT="0" distB="0" distL="0" distR="0" wp14:anchorId="08225B4F" wp14:editId="4CA6C591">
             <wp:extent cx="2933700" cy="1942430"/>
             <wp:effectExtent l="0" t="0" r="0" b="1270"/>
             <wp:docPr id="7" name="Kép 7" descr="C:\Users\elnabulsy.csongor\Downloads\ui_structure.png"/>
@@ -1761,7 +1761,7 @@
           <w:szCs w:val="36"/>
         </w:rPr>
         <w:drawing>
-          <wp:inline distT="0" distB="0" distL="0" distR="0" wp14:anchorId="2C256DB5" wp14:editId="377E88B9">
+          <wp:inline distT="0" distB="0" distL="0" distR="0" wp14:anchorId="2C256DB5" wp14:editId="130547F9">
             <wp:extent cx="3329940" cy="1752493"/>
             <wp:effectExtent l="0" t="0" r="3810" b="635"/>
             <wp:docPr id="9" name="Kép 9"/>
@@ -3323,7 +3323,7 @@
       </w:pPr>
       <w:r>
         <w:pict w14:anchorId="759CF75D">
-          <v:shape id="Kép 1" o:spid="_x0000_i1032" type="#_x0000_t75" style="width:24pt;height:24pt;visibility:visible;mso-wrap-style:square">
+          <v:shape id="Kép 1" o:spid="_x0000_i1026" type="#_x0000_t75" style="width:24pt;height:24pt;visibility:visible;mso-wrap-style:square">
             <v:imagedata r:id="rId27" o:title=""/>
           </v:shape>
         </w:pict>
@@ -3599,6 +3599,89 @@
           <w:szCs w:val="36"/>
         </w:rPr>
         <w:t>Projekt struktúrájának végleges kialakítása (eddig frontendPart-blathyfm volt, viszont azóta a főmappa a BlathyFM mappát viseli, amiben két, az alkalmazás egy-egy szintjét képviselő projekt található (blathyfm_frontend – amiben az eddigi frontend-alkalmazás volt megtalálható – és blathyfm_backend, ami pedig az újonnan létrejött backend része a projektnek) (Susán)</w:t>
+      </w:r>
+    </w:p>
+    <w:p>
+      <w:pPr>
+        <w:pStyle w:val="Listaszerbekezds"/>
+        <w:jc w:val="both"/>
+        <w:rPr>
+          <w:rFonts w:ascii="Times New Roman" w:eastAsia="Times New Roman" w:hAnsi="Times New Roman" w:cs="Times New Roman"/>
+          <w:sz w:val="36"/>
+          <w:szCs w:val="36"/>
+        </w:rPr>
+      </w:pPr>
+    </w:p>
+    <w:p>
+      <w:pPr>
+        <w:pStyle w:val="Listaszerbekezds"/>
+        <w:ind w:left="0"/>
+        <w:jc w:val="both"/>
+        <w:rPr>
+          <w:rFonts w:ascii="Times New Roman" w:eastAsia="Times New Roman" w:hAnsi="Times New Roman" w:cs="Times New Roman"/>
+          <w:b/>
+          <w:bCs/>
+          <w:sz w:val="40"/>
+          <w:szCs w:val="40"/>
+        </w:rPr>
+      </w:pPr>
+      <w:r>
+        <w:rPr>
+          <w:rFonts w:ascii="Times New Roman" w:eastAsia="Times New Roman" w:hAnsi="Times New Roman" w:cs="Times New Roman"/>
+          <w:b/>
+          <w:bCs/>
+          <w:sz w:val="40"/>
+          <w:szCs w:val="40"/>
+        </w:rPr>
+        <w:t>2026-03-23 15:10-17:00</w:t>
+      </w:r>
+    </w:p>
+    <w:p>
+      <w:pPr>
+        <w:pStyle w:val="Listaszerbekezds"/>
+        <w:ind w:left="0"/>
+        <w:jc w:val="both"/>
+        <w:rPr>
+          <w:rFonts w:ascii="Times New Roman" w:eastAsia="Times New Roman" w:hAnsi="Times New Roman" w:cs="Times New Roman"/>
+          <w:sz w:val="36"/>
+          <w:szCs w:val="36"/>
+        </w:rPr>
+      </w:pPr>
+      <w:r>
+        <w:rPr>
+          <w:rFonts w:ascii="Times New Roman" w:eastAsia="Times New Roman" w:hAnsi="Times New Roman" w:cs="Times New Roman"/>
+          <w:sz w:val="36"/>
+          <w:szCs w:val="36"/>
+        </w:rPr>
+        <w:t>(El-Nabulsy Csongor Alan) Az ütemezői nézet (SchedulerView) elkészítése</w:t>
+      </w:r>
+      <w:r>
+        <w:rPr>
+          <w:rFonts w:ascii="Times New Roman" w:eastAsia="Times New Roman" w:hAnsi="Times New Roman" w:cs="Times New Roman"/>
+          <w:sz w:val="36"/>
+          <w:szCs w:val="36"/>
+        </w:rPr>
+        <w:t>.</w:t>
+      </w:r>
+    </w:p>
+    <w:p>
+      <w:pPr>
+        <w:pStyle w:val="Listaszerbekezds"/>
+        <w:ind w:left="0"/>
+        <w:jc w:val="both"/>
+        <w:rPr>
+          <w:rFonts w:ascii="Times New Roman" w:eastAsia="Times New Roman" w:hAnsi="Times New Roman" w:cs="Times New Roman"/>
+          <w:sz w:val="36"/>
+          <w:szCs w:val="36"/>
+        </w:rPr>
+      </w:pPr>
+      <w:r>
+        <w:rPr>
+          <w:rFonts w:ascii="Times New Roman" w:eastAsia="Times New Roman" w:hAnsi="Times New Roman" w:cs="Times New Roman"/>
+          <w:sz w:val="36"/>
+          <w:szCs w:val="36"/>
+        </w:rPr>
+        <w:t>(Susán Csongor György) Az oldal aljáról elérhető oldalak közül az impresszum és szabályzat elkészítése.</w:t>
       </w:r>
     </w:p>
     <w:sectPr>

</xml_diff>

<commit_message>
Starting making data to backend and database side (+doc)
</commit_message>
<xml_diff>
--- a/documentation.docx
+++ b/documentation.docx
@@ -40,25 +40,36 @@
           <w:sz w:val="40"/>
           <w:szCs w:val="40"/>
         </w:rPr>
-        <w:t>Alkalmazás neve: BláthyFM</w:t>
-      </w:r>
-    </w:p>
-    <w:p>
-      <w:pPr>
+        <w:t xml:space="preserve">Alkalmazás neve: </w:t>
+      </w:r>
+      <w:proofErr w:type="spellStart"/>
+      <w:r>
         <w:rPr>
           <w:rFonts w:ascii="Times New Roman" w:hAnsi="Times New Roman" w:cs="Times New Roman"/>
           <w:bCs/>
           <w:sz w:val="40"/>
           <w:szCs w:val="40"/>
         </w:rPr>
-      </w:pPr>
-      <w:r>
+        <w:t>BláthyFM</w:t>
+      </w:r>
+      <w:proofErr w:type="spellEnd"/>
+    </w:p>
+    <w:p>
+      <w:pPr>
         <w:rPr>
           <w:rFonts w:ascii="Times New Roman" w:hAnsi="Times New Roman" w:cs="Times New Roman"/>
           <w:bCs/>
           <w:sz w:val="40"/>
           <w:szCs w:val="40"/>
         </w:rPr>
+      </w:pPr>
+      <w:r>
+        <w:rPr>
+          <w:rFonts w:ascii="Times New Roman" w:hAnsi="Times New Roman" w:cs="Times New Roman"/>
+          <w:bCs/>
+          <w:sz w:val="40"/>
+          <w:szCs w:val="40"/>
+        </w:rPr>
         <w:t>Tagok:</w:t>
       </w:r>
       <w:r>
@@ -68,18 +79,19 @@
           <w:sz w:val="40"/>
           <w:szCs w:val="40"/>
         </w:rPr>
-        <w:t xml:space="preserve"> Susán Csongor, El-Nabulsy Csongor Alan</w:t>
-      </w:r>
-    </w:p>
-    <w:p>
-      <w:pPr>
+        <w:t xml:space="preserve"> Susán Csongor, El-</w:t>
+      </w:r>
+      <w:proofErr w:type="spellStart"/>
+      <w:r>
         <w:rPr>
           <w:rFonts w:ascii="Times New Roman" w:hAnsi="Times New Roman" w:cs="Times New Roman"/>
           <w:bCs/>
           <w:sz w:val="40"/>
           <w:szCs w:val="40"/>
         </w:rPr>
-      </w:pPr>
+        <w:t>Nabulsy</w:t>
+      </w:r>
+      <w:proofErr w:type="spellEnd"/>
       <w:r>
         <w:rPr>
           <w:rFonts w:ascii="Times New Roman" w:hAnsi="Times New Roman" w:cs="Times New Roman"/>
@@ -87,7 +99,46 @@
           <w:sz w:val="40"/>
           <w:szCs w:val="40"/>
         </w:rPr>
-        <w:t>Az alkalmazás célja az, hogy a Bláthy-ba járó diákok előre meghatározott szünetekben kedvenc zenéjüket tudják majd hallgatni anélkül, hogy nekik kelljen azt maguknak vagy másoknak lejátszani. Ráadásul az, hogy az iskola az ő zenéjüket játssza, akár egy általuk kijelölt időpontban (ezt üzenetben írhatják le), még több élményt ad, és azt az érzést, hogy a zenéjük – és ezzel együtt önmaguk is – meg van becsülve.</w:t>
+        <w:t xml:space="preserve"> Csongor Alan</w:t>
+      </w:r>
+    </w:p>
+    <w:p>
+      <w:pPr>
+        <w:rPr>
+          <w:rFonts w:ascii="Times New Roman" w:hAnsi="Times New Roman" w:cs="Times New Roman"/>
+          <w:bCs/>
+          <w:sz w:val="40"/>
+          <w:szCs w:val="40"/>
+        </w:rPr>
+      </w:pPr>
+      <w:r>
+        <w:rPr>
+          <w:rFonts w:ascii="Times New Roman" w:hAnsi="Times New Roman" w:cs="Times New Roman"/>
+          <w:bCs/>
+          <w:sz w:val="40"/>
+          <w:szCs w:val="40"/>
+        </w:rPr>
+        <w:t>Az alkalmazás célja az, hogy a Bláthy-</w:t>
+      </w:r>
+      <w:proofErr w:type="spellStart"/>
+      <w:r>
+        <w:rPr>
+          <w:rFonts w:ascii="Times New Roman" w:hAnsi="Times New Roman" w:cs="Times New Roman"/>
+          <w:bCs/>
+          <w:sz w:val="40"/>
+          <w:szCs w:val="40"/>
+        </w:rPr>
+        <w:t>ba</w:t>
+      </w:r>
+      <w:proofErr w:type="spellEnd"/>
+      <w:r>
+        <w:rPr>
+          <w:rFonts w:ascii="Times New Roman" w:hAnsi="Times New Roman" w:cs="Times New Roman"/>
+          <w:bCs/>
+          <w:sz w:val="40"/>
+          <w:szCs w:val="40"/>
+        </w:rPr>
+        <w:t xml:space="preserve"> járó diákok előre meghatározott szünetekben kedvenc zenéjüket tudják majd hallgatni anélkül, hogy nekik kelljen azt maguknak vagy másoknak lejátszani. Ráadásul az, hogy az iskola az ő zenéjüket játssza, akár egy általuk kijelölt időpontban (ezt üzenetben írhatják le), még több élményt ad, és azt az érzést, hogy a zenéjük – és ezzel együtt önmaguk is – meg van becsülve.</w:t>
       </w:r>
     </w:p>
     <w:p>
@@ -570,7 +621,25 @@
           <w:sz w:val="36"/>
           <w:szCs w:val="36"/>
         </w:rPr>
-        <w:t>Az alkalmazás fejlesztését tartalmazó dokumentáció elkezdése, vizsgafeltételek tanulmányozása, a projektet tároló repository létrehozása, teszteknek külön dokumentáció létrehozása.</w:t>
+        <w:t xml:space="preserve">Az alkalmazás fejlesztését tartalmazó dokumentáció elkezdése, vizsgafeltételek tanulmányozása, a projektet tároló </w:t>
+      </w:r>
+      <w:proofErr w:type="spellStart"/>
+      <w:r>
+        <w:rPr>
+          <w:rFonts w:ascii="Times New Roman" w:hAnsi="Times New Roman" w:cs="Times New Roman"/>
+          <w:sz w:val="36"/>
+          <w:szCs w:val="36"/>
+        </w:rPr>
+        <w:t>repository</w:t>
+      </w:r>
+      <w:proofErr w:type="spellEnd"/>
+      <w:r>
+        <w:rPr>
+          <w:rFonts w:ascii="Times New Roman" w:hAnsi="Times New Roman" w:cs="Times New Roman"/>
+          <w:sz w:val="36"/>
+          <w:szCs w:val="36"/>
+        </w:rPr>
+        <w:t xml:space="preserve"> létrehozása, teszteknek külön dokumentáció létrehozása.</w:t>
       </w:r>
     </w:p>
     <w:p/>
@@ -1239,7 +1308,7 @@
           <w:szCs w:val="36"/>
         </w:rPr>
         <w:drawing>
-          <wp:inline distT="0" distB="0" distL="0" distR="0" wp14:anchorId="78A43544" wp14:editId="4EF60566">
+          <wp:inline distT="0" distB="0" distL="0" distR="0" wp14:anchorId="78A43544" wp14:editId="49D07696">
             <wp:extent cx="3166535" cy="1781175"/>
             <wp:effectExtent l="0" t="0" r="0" b="0"/>
             <wp:docPr id="3" name="Kép 3" descr="C:\Users\elnabulsy.csongor\AppData\Local\Microsoft\Windows\INetCache\Content.MSO\F75754B3.tmp"/>
@@ -1331,7 +1400,7 @@
           <w:szCs w:val="36"/>
         </w:rPr>
         <w:drawing>
-          <wp:inline distT="0" distB="0" distL="0" distR="0" wp14:anchorId="4E211814" wp14:editId="6A014D0E">
+          <wp:inline distT="0" distB="0" distL="0" distR="0" wp14:anchorId="4E211814" wp14:editId="0B3D4D70">
             <wp:extent cx="3133725" cy="1762720"/>
             <wp:effectExtent l="0" t="0" r="0" b="9525"/>
             <wp:docPr id="4" name="Kép 4" descr="C:\Users\elnabulsy.csongor\Downloads\ui_main_student.png"/>
@@ -1413,7 +1482,7 @@
           <w:szCs w:val="36"/>
         </w:rPr>
         <w:drawing>
-          <wp:inline distT="0" distB="0" distL="0" distR="0" wp14:anchorId="5137FB78" wp14:editId="5C4F51C8">
+          <wp:inline distT="0" distB="0" distL="0" distR="0" wp14:anchorId="5137FB78" wp14:editId="27B94FF6">
             <wp:extent cx="3166110" cy="1780938"/>
             <wp:effectExtent l="0" t="0" r="0" b="0"/>
             <wp:docPr id="5" name="Kép 5" descr="C:\Users\elnabulsy.csongor\Downloads\ui_main_scheduler.png"/>
@@ -1476,7 +1545,25 @@
           <w:sz w:val="36"/>
           <w:szCs w:val="36"/>
         </w:rPr>
-        <w:t>Főképernyő admin ranggal:</w:t>
+        <w:t xml:space="preserve">Főképernyő </w:t>
+      </w:r>
+      <w:proofErr w:type="spellStart"/>
+      <w:r>
+        <w:rPr>
+          <w:rFonts w:ascii="Times New Roman" w:eastAsia="Times New Roman" w:hAnsi="Times New Roman" w:cs="Times New Roman"/>
+          <w:sz w:val="36"/>
+          <w:szCs w:val="36"/>
+        </w:rPr>
+        <w:t>admin</w:t>
+      </w:r>
+      <w:proofErr w:type="spellEnd"/>
+      <w:r>
+        <w:rPr>
+          <w:rFonts w:ascii="Times New Roman" w:eastAsia="Times New Roman" w:hAnsi="Times New Roman" w:cs="Times New Roman"/>
+          <w:sz w:val="36"/>
+          <w:szCs w:val="36"/>
+        </w:rPr>
+        <w:t xml:space="preserve"> ranggal:</w:t>
       </w:r>
     </w:p>
     <w:p>
@@ -1506,7 +1593,7 @@
           <w:szCs w:val="36"/>
         </w:rPr>
         <w:drawing>
-          <wp:inline distT="0" distB="0" distL="0" distR="0" wp14:anchorId="27EC1C67" wp14:editId="397BC55D">
+          <wp:inline distT="0" distB="0" distL="0" distR="0" wp14:anchorId="27EC1C67" wp14:editId="780D0D04">
             <wp:extent cx="3055620" cy="1718786"/>
             <wp:effectExtent l="0" t="0" r="0" b="0"/>
             <wp:docPr id="6" name="Kép 6" descr="C:\Users\elnabulsy.csongor\Downloads\ui_main_admin.png"/>
@@ -1588,7 +1675,7 @@
           <w:szCs w:val="36"/>
         </w:rPr>
         <w:drawing>
-          <wp:inline distT="0" distB="0" distL="0" distR="0" wp14:anchorId="08225B4F" wp14:editId="749CABE7">
+          <wp:inline distT="0" distB="0" distL="0" distR="0" wp14:anchorId="08225B4F" wp14:editId="7699743C">
             <wp:extent cx="2933700" cy="1942430"/>
             <wp:effectExtent l="0" t="0" r="0" b="1270"/>
             <wp:docPr id="7" name="Kép 7" descr="C:\Users\elnabulsy.csongor\Downloads\ui_structure.png"/>
@@ -1761,7 +1848,7 @@
           <w:szCs w:val="36"/>
         </w:rPr>
         <w:drawing>
-          <wp:inline distT="0" distB="0" distL="0" distR="0" wp14:anchorId="2C256DB5" wp14:editId="17CED3B6">
+          <wp:inline distT="0" distB="0" distL="0" distR="0" wp14:anchorId="2C256DB5" wp14:editId="477BE1FD">
             <wp:extent cx="3329940" cy="1752493"/>
             <wp:effectExtent l="0" t="0" r="3810" b="635"/>
             <wp:docPr id="9" name="Kép 9"/>
@@ -1932,7 +2019,25 @@
           <w:sz w:val="36"/>
           <w:szCs w:val="36"/>
         </w:rPr>
-        <w:t xml:space="preserve">Az admin UI oldal megtervezése digitális </w:t>
+        <w:t xml:space="preserve">Az </w:t>
+      </w:r>
+      <w:proofErr w:type="spellStart"/>
+      <w:r>
+        <w:rPr>
+          <w:rFonts w:ascii="Times New Roman" w:eastAsia="Times New Roman" w:hAnsi="Times New Roman" w:cs="Times New Roman"/>
+          <w:sz w:val="36"/>
+          <w:szCs w:val="36"/>
+        </w:rPr>
+        <w:t>admin</w:t>
+      </w:r>
+      <w:proofErr w:type="spellEnd"/>
+      <w:r>
+        <w:rPr>
+          <w:rFonts w:ascii="Times New Roman" w:eastAsia="Times New Roman" w:hAnsi="Times New Roman" w:cs="Times New Roman"/>
+          <w:sz w:val="36"/>
+          <w:szCs w:val="36"/>
+        </w:rPr>
+        <w:t xml:space="preserve"> UI oldal megtervezése digitális </w:t>
       </w:r>
       <w:r>
         <w:rPr>
@@ -1987,13 +2092,23 @@
           <w:szCs w:val="36"/>
         </w:rPr>
       </w:pPr>
-      <w:r>
-        <w:rPr>
-          <w:rFonts w:ascii="Times New Roman" w:eastAsia="Times New Roman" w:hAnsi="Times New Roman" w:cs="Times New Roman"/>
-          <w:sz w:val="36"/>
-          <w:szCs w:val="36"/>
-        </w:rPr>
-        <w:t>Admin oldal:</w:t>
+      <w:proofErr w:type="spellStart"/>
+      <w:r>
+        <w:rPr>
+          <w:rFonts w:ascii="Times New Roman" w:eastAsia="Times New Roman" w:hAnsi="Times New Roman" w:cs="Times New Roman"/>
+          <w:sz w:val="36"/>
+          <w:szCs w:val="36"/>
+        </w:rPr>
+        <w:t>Admin</w:t>
+      </w:r>
+      <w:proofErr w:type="spellEnd"/>
+      <w:r>
+        <w:rPr>
+          <w:rFonts w:ascii="Times New Roman" w:eastAsia="Times New Roman" w:hAnsi="Times New Roman" w:cs="Times New Roman"/>
+          <w:sz w:val="36"/>
+          <w:szCs w:val="36"/>
+        </w:rPr>
+        <w:t xml:space="preserve"> oldal:</w:t>
       </w:r>
     </w:p>
     <w:p>
@@ -2226,15 +2341,42 @@
           <w:sz w:val="36"/>
           <w:szCs w:val="36"/>
         </w:rPr>
-        <w:t>, Vue router</w:t>
-      </w:r>
-      <w:r>
-        <w:rPr>
-          <w:rFonts w:ascii="Times New Roman" w:eastAsia="Times New Roman" w:hAnsi="Times New Roman" w:cs="Times New Roman"/>
-          <w:sz w:val="36"/>
-          <w:szCs w:val="36"/>
-        </w:rPr>
-        <w:t>) létrehozása frontend</w:t>
+        <w:t xml:space="preserve">, </w:t>
+      </w:r>
+      <w:proofErr w:type="spellStart"/>
+      <w:r>
+        <w:rPr>
+          <w:rFonts w:ascii="Times New Roman" w:eastAsia="Times New Roman" w:hAnsi="Times New Roman" w:cs="Times New Roman"/>
+          <w:sz w:val="36"/>
+          <w:szCs w:val="36"/>
+        </w:rPr>
+        <w:t>Vue</w:t>
+      </w:r>
+      <w:proofErr w:type="spellEnd"/>
+      <w:r>
+        <w:rPr>
+          <w:rFonts w:ascii="Times New Roman" w:eastAsia="Times New Roman" w:hAnsi="Times New Roman" w:cs="Times New Roman"/>
+          <w:sz w:val="36"/>
+          <w:szCs w:val="36"/>
+        </w:rPr>
+        <w:t xml:space="preserve"> router</w:t>
+      </w:r>
+      <w:r>
+        <w:rPr>
+          <w:rFonts w:ascii="Times New Roman" w:eastAsia="Times New Roman" w:hAnsi="Times New Roman" w:cs="Times New Roman"/>
+          <w:sz w:val="36"/>
+          <w:szCs w:val="36"/>
+        </w:rPr>
+        <w:t xml:space="preserve">) létrehozása </w:t>
+      </w:r>
+      <w:proofErr w:type="spellStart"/>
+      <w:r>
+        <w:rPr>
+          <w:rFonts w:ascii="Times New Roman" w:eastAsia="Times New Roman" w:hAnsi="Times New Roman" w:cs="Times New Roman"/>
+          <w:sz w:val="36"/>
+          <w:szCs w:val="36"/>
+        </w:rPr>
+        <w:t>frontend</w:t>
       </w:r>
       <w:r>
         <w:rPr>
@@ -2244,6 +2386,7 @@
         </w:rPr>
         <w:t>Part</w:t>
       </w:r>
+      <w:proofErr w:type="spellEnd"/>
       <w:r>
         <w:rPr>
           <w:rFonts w:ascii="Times New Roman" w:eastAsia="Times New Roman" w:hAnsi="Times New Roman" w:cs="Times New Roman"/>
@@ -2296,13 +2439,23 @@
           <w:szCs w:val="36"/>
         </w:rPr>
       </w:pPr>
-      <w:r>
-        <w:rPr>
-          <w:rFonts w:ascii="Times New Roman" w:eastAsia="Times New Roman" w:hAnsi="Times New Roman" w:cs="Times New Roman"/>
-          <w:sz w:val="36"/>
-          <w:szCs w:val="36"/>
-        </w:rPr>
-        <w:t>route-ok definiálása</w:t>
+      <w:proofErr w:type="spellStart"/>
+      <w:r>
+        <w:rPr>
+          <w:rFonts w:ascii="Times New Roman" w:eastAsia="Times New Roman" w:hAnsi="Times New Roman" w:cs="Times New Roman"/>
+          <w:sz w:val="36"/>
+          <w:szCs w:val="36"/>
+        </w:rPr>
+        <w:t>route</w:t>
+      </w:r>
+      <w:proofErr w:type="spellEnd"/>
+      <w:r>
+        <w:rPr>
+          <w:rFonts w:ascii="Times New Roman" w:eastAsia="Times New Roman" w:hAnsi="Times New Roman" w:cs="Times New Roman"/>
+          <w:sz w:val="36"/>
+          <w:szCs w:val="36"/>
+        </w:rPr>
+        <w:t>-ok definiálása</w:t>
       </w:r>
     </w:p>
     <w:p>
@@ -2318,14 +2471,34 @@
           <w:szCs w:val="36"/>
         </w:rPr>
       </w:pPr>
-      <w:r>
-        <w:rPr>
-          <w:rFonts w:ascii="Times New Roman" w:eastAsia="Times New Roman" w:hAnsi="Times New Roman" w:cs="Times New Roman"/>
-          <w:sz w:val="36"/>
-          <w:szCs w:val="36"/>
-        </w:rPr>
-        <w:t>header és footer</w:t>
-      </w:r>
+      <w:proofErr w:type="spellStart"/>
+      <w:r>
+        <w:rPr>
+          <w:rFonts w:ascii="Times New Roman" w:eastAsia="Times New Roman" w:hAnsi="Times New Roman" w:cs="Times New Roman"/>
+          <w:sz w:val="36"/>
+          <w:szCs w:val="36"/>
+        </w:rPr>
+        <w:t>header</w:t>
+      </w:r>
+      <w:proofErr w:type="spellEnd"/>
+      <w:r>
+        <w:rPr>
+          <w:rFonts w:ascii="Times New Roman" w:eastAsia="Times New Roman" w:hAnsi="Times New Roman" w:cs="Times New Roman"/>
+          <w:sz w:val="36"/>
+          <w:szCs w:val="36"/>
+        </w:rPr>
+        <w:t xml:space="preserve"> és </w:t>
+      </w:r>
+      <w:proofErr w:type="spellStart"/>
+      <w:r>
+        <w:rPr>
+          <w:rFonts w:ascii="Times New Roman" w:eastAsia="Times New Roman" w:hAnsi="Times New Roman" w:cs="Times New Roman"/>
+          <w:sz w:val="36"/>
+          <w:szCs w:val="36"/>
+        </w:rPr>
+        <w:t>footer</w:t>
+      </w:r>
+      <w:proofErr w:type="spellEnd"/>
       <w:r>
         <w:rPr>
           <w:rFonts w:ascii="Times New Roman" w:eastAsia="Times New Roman" w:hAnsi="Times New Roman" w:cs="Times New Roman"/>
@@ -2356,13 +2529,41 @@
           <w:szCs w:val="36"/>
         </w:rPr>
       </w:pPr>
-      <w:r>
-        <w:rPr>
-          <w:rFonts w:ascii="Times New Roman" w:eastAsia="Times New Roman" w:hAnsi="Times New Roman" w:cs="Times New Roman"/>
-          <w:sz w:val="36"/>
-          <w:szCs w:val="36"/>
-        </w:rPr>
-        <w:t>header-main-footer-struktúra létrehozása</w:t>
+      <w:proofErr w:type="spellStart"/>
+      <w:r>
+        <w:rPr>
+          <w:rFonts w:ascii="Times New Roman" w:eastAsia="Times New Roman" w:hAnsi="Times New Roman" w:cs="Times New Roman"/>
+          <w:sz w:val="36"/>
+          <w:szCs w:val="36"/>
+        </w:rPr>
+        <w:t>header</w:t>
+      </w:r>
+      <w:proofErr w:type="spellEnd"/>
+      <w:r>
+        <w:rPr>
+          <w:rFonts w:ascii="Times New Roman" w:eastAsia="Times New Roman" w:hAnsi="Times New Roman" w:cs="Times New Roman"/>
+          <w:sz w:val="36"/>
+          <w:szCs w:val="36"/>
+        </w:rPr>
+        <w:t>-main-</w:t>
+      </w:r>
+      <w:proofErr w:type="spellStart"/>
+      <w:r>
+        <w:rPr>
+          <w:rFonts w:ascii="Times New Roman" w:eastAsia="Times New Roman" w:hAnsi="Times New Roman" w:cs="Times New Roman"/>
+          <w:sz w:val="36"/>
+          <w:szCs w:val="36"/>
+        </w:rPr>
+        <w:t>footer</w:t>
+      </w:r>
+      <w:proofErr w:type="spellEnd"/>
+      <w:r>
+        <w:rPr>
+          <w:rFonts w:ascii="Times New Roman" w:eastAsia="Times New Roman" w:hAnsi="Times New Roman" w:cs="Times New Roman"/>
+          <w:sz w:val="36"/>
+          <w:szCs w:val="36"/>
+        </w:rPr>
+        <w:t>-struktúra létrehozása</w:t>
       </w:r>
     </w:p>
     <w:p>
@@ -2401,7 +2602,25 @@
           <w:sz w:val="36"/>
           <w:szCs w:val="36"/>
         </w:rPr>
-        <w:t>A projektet El-Nabulsy Csongor hozta létre és írta meg a kódját, a működéshez szükséges folyamatábrákat, az adatbázis ER-diagramját</w:t>
+        <w:t>A projektet El-</w:t>
+      </w:r>
+      <w:proofErr w:type="spellStart"/>
+      <w:r>
+        <w:rPr>
+          <w:rFonts w:ascii="Times New Roman" w:eastAsia="Times New Roman" w:hAnsi="Times New Roman" w:cs="Times New Roman"/>
+          <w:sz w:val="36"/>
+          <w:szCs w:val="36"/>
+        </w:rPr>
+        <w:t>Nabulsy</w:t>
+      </w:r>
+      <w:proofErr w:type="spellEnd"/>
+      <w:r>
+        <w:rPr>
+          <w:rFonts w:ascii="Times New Roman" w:eastAsia="Times New Roman" w:hAnsi="Times New Roman" w:cs="Times New Roman"/>
+          <w:sz w:val="36"/>
+          <w:szCs w:val="36"/>
+        </w:rPr>
+        <w:t xml:space="preserve"> Csongor hozta létre és írta meg a kódját, a működéshez szükséges folyamatábrákat, az adatbázis ER-diagramját</w:t>
       </w:r>
       <w:r>
         <w:rPr>
@@ -2494,7 +2713,25 @@
           <w:sz w:val="36"/>
           <w:szCs w:val="36"/>
         </w:rPr>
-        <w:t>(Susán Csongor) A frontendPart projekt átnézése, stílus hi</w:t>
+        <w:t xml:space="preserve">(Susán Csongor) A </w:t>
+      </w:r>
+      <w:proofErr w:type="spellStart"/>
+      <w:r>
+        <w:rPr>
+          <w:rFonts w:ascii="Times New Roman" w:eastAsia="Times New Roman" w:hAnsi="Times New Roman" w:cs="Times New Roman"/>
+          <w:sz w:val="36"/>
+          <w:szCs w:val="36"/>
+        </w:rPr>
+        <w:t>frontendPart</w:t>
+      </w:r>
+      <w:proofErr w:type="spellEnd"/>
+      <w:r>
+        <w:rPr>
+          <w:rFonts w:ascii="Times New Roman" w:eastAsia="Times New Roman" w:hAnsi="Times New Roman" w:cs="Times New Roman"/>
+          <w:sz w:val="36"/>
+          <w:szCs w:val="36"/>
+        </w:rPr>
+        <w:t xml:space="preserve"> projekt átnézése, stílus hi</w:t>
       </w:r>
       <w:r>
         <w:rPr>
@@ -2620,7 +2857,25 @@
           <w:sz w:val="36"/>
           <w:szCs w:val="36"/>
         </w:rPr>
-        <w:t>(El-Nabulsy Csongor Alan</w:t>
+        <w:t>(El-</w:t>
+      </w:r>
+      <w:proofErr w:type="spellStart"/>
+      <w:r>
+        <w:rPr>
+          <w:rFonts w:ascii="Times New Roman" w:eastAsia="Times New Roman" w:hAnsi="Times New Roman" w:cs="Times New Roman"/>
+          <w:sz w:val="36"/>
+          <w:szCs w:val="36"/>
+        </w:rPr>
+        <w:t>Nabulsy</w:t>
+      </w:r>
+      <w:proofErr w:type="spellEnd"/>
+      <w:r>
+        <w:rPr>
+          <w:rFonts w:ascii="Times New Roman" w:eastAsia="Times New Roman" w:hAnsi="Times New Roman" w:cs="Times New Roman"/>
+          <w:sz w:val="36"/>
+          <w:szCs w:val="36"/>
+        </w:rPr>
+        <w:t xml:space="preserve"> Csongor Alan</w:t>
       </w:r>
       <w:r>
         <w:rPr>
@@ -2644,7 +2899,25 @@
           <w:sz w:val="36"/>
           <w:szCs w:val="36"/>
         </w:rPr>
-        <w:t xml:space="preserve"> (El-Nabulsy: főoldal és annak </w:t>
+        <w:t xml:space="preserve"> (El-</w:t>
+      </w:r>
+      <w:proofErr w:type="spellStart"/>
+      <w:r>
+        <w:rPr>
+          <w:rFonts w:ascii="Times New Roman" w:eastAsia="Times New Roman" w:hAnsi="Times New Roman" w:cs="Times New Roman"/>
+          <w:sz w:val="36"/>
+          <w:szCs w:val="36"/>
+        </w:rPr>
+        <w:t>Nabulsy</w:t>
+      </w:r>
+      <w:proofErr w:type="spellEnd"/>
+      <w:r>
+        <w:rPr>
+          <w:rFonts w:ascii="Times New Roman" w:eastAsia="Times New Roman" w:hAnsi="Times New Roman" w:cs="Times New Roman"/>
+          <w:sz w:val="36"/>
+          <w:szCs w:val="36"/>
+        </w:rPr>
+        <w:t xml:space="preserve">: főoldal és annak </w:t>
       </w:r>
       <w:r>
         <w:rPr>
@@ -2660,7 +2933,25 @@
           <w:sz w:val="36"/>
           <w:szCs w:val="36"/>
         </w:rPr>
-        <w:t>variánsa, Susán: login befejezése és admin elkezdése, valamint a logika kidolgozásának megkezdése</w:t>
+        <w:t xml:space="preserve">variánsa, Susán: login befejezése és </w:t>
+      </w:r>
+      <w:proofErr w:type="spellStart"/>
+      <w:r>
+        <w:rPr>
+          <w:rFonts w:ascii="Times New Roman" w:eastAsia="Times New Roman" w:hAnsi="Times New Roman" w:cs="Times New Roman"/>
+          <w:sz w:val="36"/>
+          <w:szCs w:val="36"/>
+        </w:rPr>
+        <w:t>admin</w:t>
+      </w:r>
+      <w:proofErr w:type="spellEnd"/>
+      <w:r>
+        <w:rPr>
+          <w:rFonts w:ascii="Times New Roman" w:eastAsia="Times New Roman" w:hAnsi="Times New Roman" w:cs="Times New Roman"/>
+          <w:sz w:val="36"/>
+          <w:szCs w:val="36"/>
+        </w:rPr>
+        <w:t xml:space="preserve"> elkezdése, valamint a logika kidolgozásának megkezdése</w:t>
       </w:r>
       <w:r>
         <w:rPr>
@@ -2724,7 +3015,25 @@
           <w:sz w:val="36"/>
           <w:szCs w:val="36"/>
         </w:rPr>
-        <w:t xml:space="preserve">(El-Nabulsy Csongor Alan) A zenebekérő oldal </w:t>
+        <w:t>(El-</w:t>
+      </w:r>
+      <w:proofErr w:type="spellStart"/>
+      <w:r>
+        <w:rPr>
+          <w:rFonts w:ascii="Times New Roman" w:eastAsia="Times New Roman" w:hAnsi="Times New Roman" w:cs="Times New Roman"/>
+          <w:sz w:val="36"/>
+          <w:szCs w:val="36"/>
+        </w:rPr>
+        <w:t>Nabulsy</w:t>
+      </w:r>
+      <w:proofErr w:type="spellEnd"/>
+      <w:r>
+        <w:rPr>
+          <w:rFonts w:ascii="Times New Roman" w:eastAsia="Times New Roman" w:hAnsi="Times New Roman" w:cs="Times New Roman"/>
+          <w:sz w:val="36"/>
+          <w:szCs w:val="36"/>
+        </w:rPr>
+        <w:t xml:space="preserve"> Csongor Alan) A zenebekérő oldal </w:t>
       </w:r>
       <w:r>
         <w:rPr>
@@ -2787,7 +3096,79 @@
           <w:sz w:val="36"/>
           <w:szCs w:val="36"/>
         </w:rPr>
-        <w:t>(El-Nabulsy Csongor Alan) Főbb nézetek(HomeView, StudentHomePage, SchedulerView) szerkezetének kialakítása és a komponensek működésének ellenőrzése, a felhasználói felület stílusának kialakítása, hogy az oldal elrendezése megfeleljen a megtervezett UI-terveknek.</w:t>
+        <w:t>(El-</w:t>
+      </w:r>
+      <w:proofErr w:type="spellStart"/>
+      <w:r>
+        <w:rPr>
+          <w:rFonts w:ascii="Times New Roman" w:eastAsia="Times New Roman" w:hAnsi="Times New Roman" w:cs="Times New Roman"/>
+          <w:sz w:val="36"/>
+          <w:szCs w:val="36"/>
+        </w:rPr>
+        <w:t>Nabulsy</w:t>
+      </w:r>
+      <w:proofErr w:type="spellEnd"/>
+      <w:r>
+        <w:rPr>
+          <w:rFonts w:ascii="Times New Roman" w:eastAsia="Times New Roman" w:hAnsi="Times New Roman" w:cs="Times New Roman"/>
+          <w:sz w:val="36"/>
+          <w:szCs w:val="36"/>
+        </w:rPr>
+        <w:t xml:space="preserve"> Csongor Alan) Főbb nézetek(</w:t>
+      </w:r>
+      <w:proofErr w:type="spellStart"/>
+      <w:r>
+        <w:rPr>
+          <w:rFonts w:ascii="Times New Roman" w:eastAsia="Times New Roman" w:hAnsi="Times New Roman" w:cs="Times New Roman"/>
+          <w:sz w:val="36"/>
+          <w:szCs w:val="36"/>
+        </w:rPr>
+        <w:t>HomeView</w:t>
+      </w:r>
+      <w:proofErr w:type="spellEnd"/>
+      <w:r>
+        <w:rPr>
+          <w:rFonts w:ascii="Times New Roman" w:eastAsia="Times New Roman" w:hAnsi="Times New Roman" w:cs="Times New Roman"/>
+          <w:sz w:val="36"/>
+          <w:szCs w:val="36"/>
+        </w:rPr>
+        <w:t xml:space="preserve">, </w:t>
+      </w:r>
+      <w:proofErr w:type="spellStart"/>
+      <w:r>
+        <w:rPr>
+          <w:rFonts w:ascii="Times New Roman" w:eastAsia="Times New Roman" w:hAnsi="Times New Roman" w:cs="Times New Roman"/>
+          <w:sz w:val="36"/>
+          <w:szCs w:val="36"/>
+        </w:rPr>
+        <w:t>StudentHomePage</w:t>
+      </w:r>
+      <w:proofErr w:type="spellEnd"/>
+      <w:r>
+        <w:rPr>
+          <w:rFonts w:ascii="Times New Roman" w:eastAsia="Times New Roman" w:hAnsi="Times New Roman" w:cs="Times New Roman"/>
+          <w:sz w:val="36"/>
+          <w:szCs w:val="36"/>
+        </w:rPr>
+        <w:t xml:space="preserve">, </w:t>
+      </w:r>
+      <w:proofErr w:type="spellStart"/>
+      <w:r>
+        <w:rPr>
+          <w:rFonts w:ascii="Times New Roman" w:eastAsia="Times New Roman" w:hAnsi="Times New Roman" w:cs="Times New Roman"/>
+          <w:sz w:val="36"/>
+          <w:szCs w:val="36"/>
+        </w:rPr>
+        <w:t>SchedulerView</w:t>
+      </w:r>
+      <w:proofErr w:type="spellEnd"/>
+      <w:r>
+        <w:rPr>
+          <w:rFonts w:ascii="Times New Roman" w:eastAsia="Times New Roman" w:hAnsi="Times New Roman" w:cs="Times New Roman"/>
+          <w:sz w:val="36"/>
+          <w:szCs w:val="36"/>
+        </w:rPr>
+        <w:t>) szerkezetének kialakítása és a komponensek működésének ellenőrzése, a felhasználói felület stílusának kialakítása, hogy az oldal elrendezése megfeleljen a megtervezett UI-terveknek.</w:t>
       </w:r>
     </w:p>
     <w:p>
@@ -2881,7 +3262,25 @@
           <w:sz w:val="36"/>
           <w:szCs w:val="36"/>
         </w:rPr>
-        <w:t>, a routerben a főoldalak variánsainak gyerek route-okba szervezése</w:t>
+        <w:t xml:space="preserve">, a routerben a főoldalak variánsainak gyerek </w:t>
+      </w:r>
+      <w:proofErr w:type="spellStart"/>
+      <w:r>
+        <w:rPr>
+          <w:rFonts w:ascii="Times New Roman" w:eastAsia="Times New Roman" w:hAnsi="Times New Roman" w:cs="Times New Roman"/>
+          <w:sz w:val="36"/>
+          <w:szCs w:val="36"/>
+        </w:rPr>
+        <w:t>route</w:t>
+      </w:r>
+      <w:proofErr w:type="spellEnd"/>
+      <w:r>
+        <w:rPr>
+          <w:rFonts w:ascii="Times New Roman" w:eastAsia="Times New Roman" w:hAnsi="Times New Roman" w:cs="Times New Roman"/>
+          <w:sz w:val="36"/>
+          <w:szCs w:val="36"/>
+        </w:rPr>
+        <w:t>-okba szervezése</w:t>
       </w:r>
       <w:r>
         <w:rPr>
@@ -2897,15 +3296,51 @@
           <w:sz w:val="36"/>
           <w:szCs w:val="36"/>
         </w:rPr>
-        <w:t>, az új szabvány mintájára az admin nézet (gombok és rövid leírás azok alá) létrehozása</w:t>
-      </w:r>
-      <w:r>
-        <w:rPr>
-          <w:rFonts w:ascii="Times New Roman" w:eastAsia="Times New Roman" w:hAnsi="Times New Roman" w:cs="Times New Roman"/>
-          <w:sz w:val="36"/>
-          <w:szCs w:val="36"/>
-        </w:rPr>
-        <w:t>, felesleges import mezők kiszedése az App.vue fájlból</w:t>
+        <w:t xml:space="preserve">, az új szabvány mintájára az </w:t>
+      </w:r>
+      <w:proofErr w:type="spellStart"/>
+      <w:r>
+        <w:rPr>
+          <w:rFonts w:ascii="Times New Roman" w:eastAsia="Times New Roman" w:hAnsi="Times New Roman" w:cs="Times New Roman"/>
+          <w:sz w:val="36"/>
+          <w:szCs w:val="36"/>
+        </w:rPr>
+        <w:t>admin</w:t>
+      </w:r>
+      <w:proofErr w:type="spellEnd"/>
+      <w:r>
+        <w:rPr>
+          <w:rFonts w:ascii="Times New Roman" w:eastAsia="Times New Roman" w:hAnsi="Times New Roman" w:cs="Times New Roman"/>
+          <w:sz w:val="36"/>
+          <w:szCs w:val="36"/>
+        </w:rPr>
+        <w:t xml:space="preserve"> nézet (gombok és rövid leírás azok alá) létrehozása</w:t>
+      </w:r>
+      <w:r>
+        <w:rPr>
+          <w:rFonts w:ascii="Times New Roman" w:eastAsia="Times New Roman" w:hAnsi="Times New Roman" w:cs="Times New Roman"/>
+          <w:sz w:val="36"/>
+          <w:szCs w:val="36"/>
+        </w:rPr>
+        <w:t xml:space="preserve">, felesleges import mezők kiszedése az </w:t>
+      </w:r>
+      <w:proofErr w:type="spellStart"/>
+      <w:r>
+        <w:rPr>
+          <w:rFonts w:ascii="Times New Roman" w:eastAsia="Times New Roman" w:hAnsi="Times New Roman" w:cs="Times New Roman"/>
+          <w:sz w:val="36"/>
+          <w:szCs w:val="36"/>
+        </w:rPr>
+        <w:t>App.vue</w:t>
+      </w:r>
+      <w:proofErr w:type="spellEnd"/>
+      <w:r>
+        <w:rPr>
+          <w:rFonts w:ascii="Times New Roman" w:eastAsia="Times New Roman" w:hAnsi="Times New Roman" w:cs="Times New Roman"/>
+          <w:sz w:val="36"/>
+          <w:szCs w:val="36"/>
+        </w:rPr>
+        <w:t xml:space="preserve"> fájlból</w:t>
       </w:r>
     </w:p>
     <w:p>
@@ -3022,15 +3457,114 @@
           <w:sz w:val="36"/>
           <w:szCs w:val="36"/>
         </w:rPr>
-        <w:t>(Susán Csongor György, El-Nabulsy Csongor Alan)</w:t>
-      </w:r>
-      <w:r>
-        <w:rPr>
-          <w:rFonts w:ascii="Times New Roman" w:eastAsia="Times New Roman" w:hAnsi="Times New Roman" w:cs="Times New Roman"/>
-          <w:sz w:val="36"/>
-          <w:szCs w:val="36"/>
-        </w:rPr>
-        <w:t xml:space="preserve"> Nézetek végleges kialakítása (El-Nabulsy: HomeView, RequestView, SendView; Susán: főoldalak integrálása a HomeLayout</w:t>
+        <w:t>(Susán Csongor György, El-</w:t>
+      </w:r>
+      <w:proofErr w:type="spellStart"/>
+      <w:r>
+        <w:rPr>
+          <w:rFonts w:ascii="Times New Roman" w:eastAsia="Times New Roman" w:hAnsi="Times New Roman" w:cs="Times New Roman"/>
+          <w:sz w:val="36"/>
+          <w:szCs w:val="36"/>
+        </w:rPr>
+        <w:t>Nabulsy</w:t>
+      </w:r>
+      <w:proofErr w:type="spellEnd"/>
+      <w:r>
+        <w:rPr>
+          <w:rFonts w:ascii="Times New Roman" w:eastAsia="Times New Roman" w:hAnsi="Times New Roman" w:cs="Times New Roman"/>
+          <w:sz w:val="36"/>
+          <w:szCs w:val="36"/>
+        </w:rPr>
+        <w:t xml:space="preserve"> Csongor Alan)</w:t>
+      </w:r>
+      <w:r>
+        <w:rPr>
+          <w:rFonts w:ascii="Times New Roman" w:eastAsia="Times New Roman" w:hAnsi="Times New Roman" w:cs="Times New Roman"/>
+          <w:sz w:val="36"/>
+          <w:szCs w:val="36"/>
+        </w:rPr>
+        <w:t xml:space="preserve"> Nézetek végleges kialakítása (El-</w:t>
+      </w:r>
+      <w:proofErr w:type="spellStart"/>
+      <w:r>
+        <w:rPr>
+          <w:rFonts w:ascii="Times New Roman" w:eastAsia="Times New Roman" w:hAnsi="Times New Roman" w:cs="Times New Roman"/>
+          <w:sz w:val="36"/>
+          <w:szCs w:val="36"/>
+        </w:rPr>
+        <w:t>Nabulsy</w:t>
+      </w:r>
+      <w:proofErr w:type="spellEnd"/>
+      <w:r>
+        <w:rPr>
+          <w:rFonts w:ascii="Times New Roman" w:eastAsia="Times New Roman" w:hAnsi="Times New Roman" w:cs="Times New Roman"/>
+          <w:sz w:val="36"/>
+          <w:szCs w:val="36"/>
+        </w:rPr>
+        <w:t xml:space="preserve">: </w:t>
+      </w:r>
+      <w:proofErr w:type="spellStart"/>
+      <w:r>
+        <w:rPr>
+          <w:rFonts w:ascii="Times New Roman" w:eastAsia="Times New Roman" w:hAnsi="Times New Roman" w:cs="Times New Roman"/>
+          <w:sz w:val="36"/>
+          <w:szCs w:val="36"/>
+        </w:rPr>
+        <w:t>HomeView</w:t>
+      </w:r>
+      <w:proofErr w:type="spellEnd"/>
+      <w:r>
+        <w:rPr>
+          <w:rFonts w:ascii="Times New Roman" w:eastAsia="Times New Roman" w:hAnsi="Times New Roman" w:cs="Times New Roman"/>
+          <w:sz w:val="36"/>
+          <w:szCs w:val="36"/>
+        </w:rPr>
+        <w:t xml:space="preserve">, </w:t>
+      </w:r>
+      <w:proofErr w:type="spellStart"/>
+      <w:r>
+        <w:rPr>
+          <w:rFonts w:ascii="Times New Roman" w:eastAsia="Times New Roman" w:hAnsi="Times New Roman" w:cs="Times New Roman"/>
+          <w:sz w:val="36"/>
+          <w:szCs w:val="36"/>
+        </w:rPr>
+        <w:t>RequestView</w:t>
+      </w:r>
+      <w:proofErr w:type="spellEnd"/>
+      <w:r>
+        <w:rPr>
+          <w:rFonts w:ascii="Times New Roman" w:eastAsia="Times New Roman" w:hAnsi="Times New Roman" w:cs="Times New Roman"/>
+          <w:sz w:val="36"/>
+          <w:szCs w:val="36"/>
+        </w:rPr>
+        <w:t xml:space="preserve">, </w:t>
+      </w:r>
+      <w:proofErr w:type="spellStart"/>
+      <w:r>
+        <w:rPr>
+          <w:rFonts w:ascii="Times New Roman" w:eastAsia="Times New Roman" w:hAnsi="Times New Roman" w:cs="Times New Roman"/>
+          <w:sz w:val="36"/>
+          <w:szCs w:val="36"/>
+        </w:rPr>
+        <w:t>SendView</w:t>
+      </w:r>
+      <w:proofErr w:type="spellEnd"/>
+      <w:r>
+        <w:rPr>
+          <w:rFonts w:ascii="Times New Roman" w:eastAsia="Times New Roman" w:hAnsi="Times New Roman" w:cs="Times New Roman"/>
+          <w:sz w:val="36"/>
+          <w:szCs w:val="36"/>
+        </w:rPr>
+        <w:t xml:space="preserve">; Susán: főoldalak integrálása a </w:t>
+      </w:r>
+      <w:proofErr w:type="spellStart"/>
+      <w:r>
+        <w:rPr>
+          <w:rFonts w:ascii="Times New Roman" w:eastAsia="Times New Roman" w:hAnsi="Times New Roman" w:cs="Times New Roman"/>
+          <w:sz w:val="36"/>
+          <w:szCs w:val="36"/>
+        </w:rPr>
+        <w:t>HomeLayout</w:t>
       </w:r>
       <w:r>
         <w:rPr>
@@ -3046,7 +3580,16 @@
           <w:sz w:val="36"/>
           <w:szCs w:val="36"/>
         </w:rPr>
-        <w:t>ba)</w:t>
+        <w:t>ba</w:t>
+      </w:r>
+      <w:proofErr w:type="spellEnd"/>
+      <w:r>
+        <w:rPr>
+          <w:rFonts w:ascii="Times New Roman" w:eastAsia="Times New Roman" w:hAnsi="Times New Roman" w:cs="Times New Roman"/>
+          <w:sz w:val="36"/>
+          <w:szCs w:val="36"/>
+        </w:rPr>
+        <w:t>)</w:t>
       </w:r>
       <w:r>
         <w:rPr>
@@ -3095,7 +3638,25 @@
           <w:sz w:val="36"/>
           <w:szCs w:val="36"/>
         </w:rPr>
-        <w:t>Példa adatok felvétele a HomeLayout-ba a helyes működés tesztelésének érdekében</w:t>
+        <w:t xml:space="preserve">Példa adatok felvétele a </w:t>
+      </w:r>
+      <w:proofErr w:type="spellStart"/>
+      <w:r>
+        <w:rPr>
+          <w:rFonts w:ascii="Times New Roman" w:eastAsia="Times New Roman" w:hAnsi="Times New Roman" w:cs="Times New Roman"/>
+          <w:sz w:val="36"/>
+          <w:szCs w:val="36"/>
+        </w:rPr>
+        <w:t>HomeLayout-ba</w:t>
+      </w:r>
+      <w:proofErr w:type="spellEnd"/>
+      <w:r>
+        <w:rPr>
+          <w:rFonts w:ascii="Times New Roman" w:eastAsia="Times New Roman" w:hAnsi="Times New Roman" w:cs="Times New Roman"/>
+          <w:sz w:val="36"/>
+          <w:szCs w:val="36"/>
+        </w:rPr>
+        <w:t xml:space="preserve"> a helyes működés tesztelésének érdekében</w:t>
       </w:r>
     </w:p>
     <w:p>
@@ -3143,6 +3704,7 @@
           <w:szCs w:val="36"/>
         </w:rPr>
       </w:pPr>
+      <w:proofErr w:type="spellStart"/>
       <w:r>
         <w:rPr>
           <w:rFonts w:ascii="Times New Roman" w:eastAsia="Times New Roman" w:hAnsi="Times New Roman" w:cs="Times New Roman"/>
@@ -3150,7 +3712,34 @@
           <w:szCs w:val="36"/>
         </w:rPr>
         <w:lastRenderedPageBreak/>
-        <w:t>meta.title-ekben és a beforeEach-ben oldalcímek meghatározása</w:t>
+        <w:t>meta.title-ekben</w:t>
+      </w:r>
+      <w:proofErr w:type="spellEnd"/>
+      <w:r>
+        <w:rPr>
+          <w:rFonts w:ascii="Times New Roman" w:eastAsia="Times New Roman" w:hAnsi="Times New Roman" w:cs="Times New Roman"/>
+          <w:sz w:val="36"/>
+          <w:szCs w:val="36"/>
+        </w:rPr>
+        <w:t xml:space="preserve"> és a </w:t>
+      </w:r>
+      <w:proofErr w:type="spellStart"/>
+      <w:r>
+        <w:rPr>
+          <w:rFonts w:ascii="Times New Roman" w:eastAsia="Times New Roman" w:hAnsi="Times New Roman" w:cs="Times New Roman"/>
+          <w:sz w:val="36"/>
+          <w:szCs w:val="36"/>
+        </w:rPr>
+        <w:t>beforeEach</w:t>
+      </w:r>
+      <w:proofErr w:type="spellEnd"/>
+      <w:r>
+        <w:rPr>
+          <w:rFonts w:ascii="Times New Roman" w:eastAsia="Times New Roman" w:hAnsi="Times New Roman" w:cs="Times New Roman"/>
+          <w:sz w:val="36"/>
+          <w:szCs w:val="36"/>
+        </w:rPr>
+        <w:t>-ben oldalcímek meghatározása</w:t>
       </w:r>
     </w:p>
     <w:p>
@@ -3206,13 +3795,41 @@
           <w:szCs w:val="36"/>
         </w:rPr>
       </w:pPr>
-      <w:r>
-        <w:rPr>
-          <w:rFonts w:ascii="Times New Roman" w:eastAsia="Times New Roman" w:hAnsi="Times New Roman" w:cs="Times New Roman"/>
-          <w:sz w:val="36"/>
-          <w:szCs w:val="36"/>
-        </w:rPr>
-        <w:t>auth függvény hozzáadása a bejelentkezési képernyőhöz (LoginView), ami egyelőre üres, egy komment jelzi annak célját</w:t>
+      <w:proofErr w:type="spellStart"/>
+      <w:r>
+        <w:rPr>
+          <w:rFonts w:ascii="Times New Roman" w:eastAsia="Times New Roman" w:hAnsi="Times New Roman" w:cs="Times New Roman"/>
+          <w:sz w:val="36"/>
+          <w:szCs w:val="36"/>
+        </w:rPr>
+        <w:t>auth</w:t>
+      </w:r>
+      <w:proofErr w:type="spellEnd"/>
+      <w:r>
+        <w:rPr>
+          <w:rFonts w:ascii="Times New Roman" w:eastAsia="Times New Roman" w:hAnsi="Times New Roman" w:cs="Times New Roman"/>
+          <w:sz w:val="36"/>
+          <w:szCs w:val="36"/>
+        </w:rPr>
+        <w:t xml:space="preserve"> függvény hozzáadása a bejelentkezési képernyőhöz (</w:t>
+      </w:r>
+      <w:proofErr w:type="spellStart"/>
+      <w:r>
+        <w:rPr>
+          <w:rFonts w:ascii="Times New Roman" w:eastAsia="Times New Roman" w:hAnsi="Times New Roman" w:cs="Times New Roman"/>
+          <w:sz w:val="36"/>
+          <w:szCs w:val="36"/>
+        </w:rPr>
+        <w:t>LoginView</w:t>
+      </w:r>
+      <w:proofErr w:type="spellEnd"/>
+      <w:r>
+        <w:rPr>
+          <w:rFonts w:ascii="Times New Roman" w:eastAsia="Times New Roman" w:hAnsi="Times New Roman" w:cs="Times New Roman"/>
+          <w:sz w:val="36"/>
+          <w:szCs w:val="36"/>
+        </w:rPr>
+        <w:t>), ami egyelőre üres, egy komment jelzi annak célját</w:t>
       </w:r>
     </w:p>
     <w:p>
@@ -3422,7 +4039,43 @@
           <w:sz w:val="36"/>
           <w:szCs w:val="36"/>
         </w:rPr>
-        <w:t>Szerepkörök (role) és requiresAuth hozzáadása a nézetekhez</w:t>
+        <w:t>Szerepkörök (</w:t>
+      </w:r>
+      <w:proofErr w:type="spellStart"/>
+      <w:r>
+        <w:rPr>
+          <w:rFonts w:ascii="Times New Roman" w:eastAsia="Times New Roman" w:hAnsi="Times New Roman" w:cs="Times New Roman"/>
+          <w:sz w:val="36"/>
+          <w:szCs w:val="36"/>
+        </w:rPr>
+        <w:t>role</w:t>
+      </w:r>
+      <w:proofErr w:type="spellEnd"/>
+      <w:r>
+        <w:rPr>
+          <w:rFonts w:ascii="Times New Roman" w:eastAsia="Times New Roman" w:hAnsi="Times New Roman" w:cs="Times New Roman"/>
+          <w:sz w:val="36"/>
+          <w:szCs w:val="36"/>
+        </w:rPr>
+        <w:t xml:space="preserve">) és </w:t>
+      </w:r>
+      <w:proofErr w:type="spellStart"/>
+      <w:r>
+        <w:rPr>
+          <w:rFonts w:ascii="Times New Roman" w:eastAsia="Times New Roman" w:hAnsi="Times New Roman" w:cs="Times New Roman"/>
+          <w:sz w:val="36"/>
+          <w:szCs w:val="36"/>
+        </w:rPr>
+        <w:t>requiresAuth</w:t>
+      </w:r>
+      <w:proofErr w:type="spellEnd"/>
+      <w:r>
+        <w:rPr>
+          <w:rFonts w:ascii="Times New Roman" w:eastAsia="Times New Roman" w:hAnsi="Times New Roman" w:cs="Times New Roman"/>
+          <w:sz w:val="36"/>
+          <w:szCs w:val="36"/>
+        </w:rPr>
+        <w:t xml:space="preserve"> hozzáadása a nézetekhez</w:t>
       </w:r>
     </w:p>
     <w:p>
@@ -3439,13 +4092,41 @@
           <w:szCs w:val="36"/>
         </w:rPr>
       </w:pPr>
-      <w:r>
-        <w:rPr>
-          <w:rFonts w:ascii="Times New Roman" w:eastAsia="Times New Roman" w:hAnsi="Times New Roman" w:cs="Times New Roman"/>
-          <w:sz w:val="36"/>
-          <w:szCs w:val="36"/>
-        </w:rPr>
-        <w:t>Autentikációhoz szükséges alapváltozók felvétele az App.vue-ban</w:t>
+      <w:proofErr w:type="spellStart"/>
+      <w:r>
+        <w:rPr>
+          <w:rFonts w:ascii="Times New Roman" w:eastAsia="Times New Roman" w:hAnsi="Times New Roman" w:cs="Times New Roman"/>
+          <w:sz w:val="36"/>
+          <w:szCs w:val="36"/>
+        </w:rPr>
+        <w:t>Autentikációhoz</w:t>
+      </w:r>
+      <w:proofErr w:type="spellEnd"/>
+      <w:r>
+        <w:rPr>
+          <w:rFonts w:ascii="Times New Roman" w:eastAsia="Times New Roman" w:hAnsi="Times New Roman" w:cs="Times New Roman"/>
+          <w:sz w:val="36"/>
+          <w:szCs w:val="36"/>
+        </w:rPr>
+        <w:t xml:space="preserve"> szükséges alapváltozók felvétele az </w:t>
+      </w:r>
+      <w:proofErr w:type="spellStart"/>
+      <w:r>
+        <w:rPr>
+          <w:rFonts w:ascii="Times New Roman" w:eastAsia="Times New Roman" w:hAnsi="Times New Roman" w:cs="Times New Roman"/>
+          <w:sz w:val="36"/>
+          <w:szCs w:val="36"/>
+        </w:rPr>
+        <w:t>App.vue</w:t>
+      </w:r>
+      <w:proofErr w:type="spellEnd"/>
+      <w:r>
+        <w:rPr>
+          <w:rFonts w:ascii="Times New Roman" w:eastAsia="Times New Roman" w:hAnsi="Times New Roman" w:cs="Times New Roman"/>
+          <w:sz w:val="36"/>
+          <w:szCs w:val="36"/>
+        </w:rPr>
+        <w:t>-ban</w:t>
       </w:r>
     </w:p>
     <w:p>
@@ -3506,7 +4187,25 @@
           <w:sz w:val="36"/>
           <w:szCs w:val="36"/>
         </w:rPr>
-        <w:t>(Susán Csongor György, El-Nabulsy Csongor Alan)</w:t>
+        <w:t>(Susán Csongor György, El-</w:t>
+      </w:r>
+      <w:proofErr w:type="spellStart"/>
+      <w:r>
+        <w:rPr>
+          <w:rFonts w:ascii="Times New Roman" w:eastAsia="Times New Roman" w:hAnsi="Times New Roman" w:cs="Times New Roman"/>
+          <w:sz w:val="36"/>
+          <w:szCs w:val="36"/>
+        </w:rPr>
+        <w:t>Nabulsy</w:t>
+      </w:r>
+      <w:proofErr w:type="spellEnd"/>
+      <w:r>
+        <w:rPr>
+          <w:rFonts w:ascii="Times New Roman" w:eastAsia="Times New Roman" w:hAnsi="Times New Roman" w:cs="Times New Roman"/>
+          <w:sz w:val="36"/>
+          <w:szCs w:val="36"/>
+        </w:rPr>
+        <w:t xml:space="preserve"> Csongor Alan)</w:t>
       </w:r>
     </w:p>
     <w:p>
@@ -3552,7 +4251,25 @@
           <w:sz w:val="36"/>
           <w:szCs w:val="36"/>
         </w:rPr>
-        <w:t>Táblák SQL-tervezetének elkészítése (El-Nabulsy)</w:t>
+        <w:t>Táblák SQL-tervezetének elkészítése (El-</w:t>
+      </w:r>
+      <w:proofErr w:type="spellStart"/>
+      <w:r>
+        <w:rPr>
+          <w:rFonts w:ascii="Times New Roman" w:eastAsia="Times New Roman" w:hAnsi="Times New Roman" w:cs="Times New Roman"/>
+          <w:sz w:val="36"/>
+          <w:szCs w:val="36"/>
+        </w:rPr>
+        <w:t>Nabulsy</w:t>
+      </w:r>
+      <w:proofErr w:type="spellEnd"/>
+      <w:r>
+        <w:rPr>
+          <w:rFonts w:ascii="Times New Roman" w:eastAsia="Times New Roman" w:hAnsi="Times New Roman" w:cs="Times New Roman"/>
+          <w:sz w:val="36"/>
+          <w:szCs w:val="36"/>
+        </w:rPr>
+        <w:t>)</w:t>
       </w:r>
     </w:p>
     <w:p>
@@ -3575,7 +4292,79 @@
           <w:sz w:val="36"/>
           <w:szCs w:val="36"/>
         </w:rPr>
-        <w:t>Táblázatok relációs tervvé írása és azok implementálása (model-lek, egyelőre üres seederek és migration-ök) a Backend (Laravel) projektbe (Susán)</w:t>
+        <w:t>Táblázatok relációs tervvé írása és azok implementálása (</w:t>
+      </w:r>
+      <w:proofErr w:type="spellStart"/>
+      <w:r>
+        <w:rPr>
+          <w:rFonts w:ascii="Times New Roman" w:eastAsia="Times New Roman" w:hAnsi="Times New Roman" w:cs="Times New Roman"/>
+          <w:sz w:val="36"/>
+          <w:szCs w:val="36"/>
+        </w:rPr>
+        <w:t>model-lek</w:t>
+      </w:r>
+      <w:proofErr w:type="spellEnd"/>
+      <w:r>
+        <w:rPr>
+          <w:rFonts w:ascii="Times New Roman" w:eastAsia="Times New Roman" w:hAnsi="Times New Roman" w:cs="Times New Roman"/>
+          <w:sz w:val="36"/>
+          <w:szCs w:val="36"/>
+        </w:rPr>
+        <w:t xml:space="preserve">, egyelőre üres </w:t>
+      </w:r>
+      <w:proofErr w:type="spellStart"/>
+      <w:r>
+        <w:rPr>
+          <w:rFonts w:ascii="Times New Roman" w:eastAsia="Times New Roman" w:hAnsi="Times New Roman" w:cs="Times New Roman"/>
+          <w:sz w:val="36"/>
+          <w:szCs w:val="36"/>
+        </w:rPr>
+        <w:t>seederek</w:t>
+      </w:r>
+      <w:proofErr w:type="spellEnd"/>
+      <w:r>
+        <w:rPr>
+          <w:rFonts w:ascii="Times New Roman" w:eastAsia="Times New Roman" w:hAnsi="Times New Roman" w:cs="Times New Roman"/>
+          <w:sz w:val="36"/>
+          <w:szCs w:val="36"/>
+        </w:rPr>
+        <w:t xml:space="preserve"> és </w:t>
+      </w:r>
+      <w:proofErr w:type="spellStart"/>
+      <w:r>
+        <w:rPr>
+          <w:rFonts w:ascii="Times New Roman" w:eastAsia="Times New Roman" w:hAnsi="Times New Roman" w:cs="Times New Roman"/>
+          <w:sz w:val="36"/>
+          <w:szCs w:val="36"/>
+        </w:rPr>
+        <w:t>migration-ök</w:t>
+      </w:r>
+      <w:proofErr w:type="spellEnd"/>
+      <w:r>
+        <w:rPr>
+          <w:rFonts w:ascii="Times New Roman" w:eastAsia="Times New Roman" w:hAnsi="Times New Roman" w:cs="Times New Roman"/>
+          <w:sz w:val="36"/>
+          <w:szCs w:val="36"/>
+        </w:rPr>
+        <w:t>) a Backend (</w:t>
+      </w:r>
+      <w:proofErr w:type="spellStart"/>
+      <w:r>
+        <w:rPr>
+          <w:rFonts w:ascii="Times New Roman" w:eastAsia="Times New Roman" w:hAnsi="Times New Roman" w:cs="Times New Roman"/>
+          <w:sz w:val="36"/>
+          <w:szCs w:val="36"/>
+        </w:rPr>
+        <w:t>Laravel</w:t>
+      </w:r>
+      <w:proofErr w:type="spellEnd"/>
+      <w:r>
+        <w:rPr>
+          <w:rFonts w:ascii="Times New Roman" w:eastAsia="Times New Roman" w:hAnsi="Times New Roman" w:cs="Times New Roman"/>
+          <w:sz w:val="36"/>
+          <w:szCs w:val="36"/>
+        </w:rPr>
+        <w:t>) projektbe (Susán)</w:t>
       </w:r>
     </w:p>
     <w:p>
@@ -3598,7 +4387,79 @@
           <w:sz w:val="36"/>
           <w:szCs w:val="36"/>
         </w:rPr>
-        <w:t>Projekt struktúrájának végleges kialakítása (eddig frontendPart-blathyfm volt, viszont azóta a főmappa a BlathyFM mappát viseli, amiben két, az alkalmazás egy-egy szintjét képviselő projekt található (blathyfm_frontend – amiben az eddigi frontend-alkalmazás volt megtalálható – és blathyfm_backend, ami pedig az újonnan létrejött backend része a projektnek) (Susán)</w:t>
+        <w:t xml:space="preserve">Projekt struktúrájának végleges kialakítása (eddig </w:t>
+      </w:r>
+      <w:proofErr w:type="spellStart"/>
+      <w:r>
+        <w:rPr>
+          <w:rFonts w:ascii="Times New Roman" w:eastAsia="Times New Roman" w:hAnsi="Times New Roman" w:cs="Times New Roman"/>
+          <w:sz w:val="36"/>
+          <w:szCs w:val="36"/>
+        </w:rPr>
+        <w:t>frontendPart-blathyfm</w:t>
+      </w:r>
+      <w:proofErr w:type="spellEnd"/>
+      <w:r>
+        <w:rPr>
+          <w:rFonts w:ascii="Times New Roman" w:eastAsia="Times New Roman" w:hAnsi="Times New Roman" w:cs="Times New Roman"/>
+          <w:sz w:val="36"/>
+          <w:szCs w:val="36"/>
+        </w:rPr>
+        <w:t xml:space="preserve"> volt, viszont azóta a főmappa a </w:t>
+      </w:r>
+      <w:proofErr w:type="spellStart"/>
+      <w:r>
+        <w:rPr>
+          <w:rFonts w:ascii="Times New Roman" w:eastAsia="Times New Roman" w:hAnsi="Times New Roman" w:cs="Times New Roman"/>
+          <w:sz w:val="36"/>
+          <w:szCs w:val="36"/>
+        </w:rPr>
+        <w:t>BlathyFM</w:t>
+      </w:r>
+      <w:proofErr w:type="spellEnd"/>
+      <w:r>
+        <w:rPr>
+          <w:rFonts w:ascii="Times New Roman" w:eastAsia="Times New Roman" w:hAnsi="Times New Roman" w:cs="Times New Roman"/>
+          <w:sz w:val="36"/>
+          <w:szCs w:val="36"/>
+        </w:rPr>
+        <w:t xml:space="preserve"> mappát viseli, amiben két, az alkalmazás egy-egy szintjét képviselő projekt található (</w:t>
+      </w:r>
+      <w:proofErr w:type="spellStart"/>
+      <w:r>
+        <w:rPr>
+          <w:rFonts w:ascii="Times New Roman" w:eastAsia="Times New Roman" w:hAnsi="Times New Roman" w:cs="Times New Roman"/>
+          <w:sz w:val="36"/>
+          <w:szCs w:val="36"/>
+        </w:rPr>
+        <w:t>blathyfm_frontend</w:t>
+      </w:r>
+      <w:proofErr w:type="spellEnd"/>
+      <w:r>
+        <w:rPr>
+          <w:rFonts w:ascii="Times New Roman" w:eastAsia="Times New Roman" w:hAnsi="Times New Roman" w:cs="Times New Roman"/>
+          <w:sz w:val="36"/>
+          <w:szCs w:val="36"/>
+        </w:rPr>
+        <w:t xml:space="preserve"> – amiben az eddigi frontend-alkalmazás volt megtalálható – és </w:t>
+      </w:r>
+      <w:proofErr w:type="spellStart"/>
+      <w:r>
+        <w:rPr>
+          <w:rFonts w:ascii="Times New Roman" w:eastAsia="Times New Roman" w:hAnsi="Times New Roman" w:cs="Times New Roman"/>
+          <w:sz w:val="36"/>
+          <w:szCs w:val="36"/>
+        </w:rPr>
+        <w:t>blathyfm_backend</w:t>
+      </w:r>
+      <w:proofErr w:type="spellEnd"/>
+      <w:r>
+        <w:rPr>
+          <w:rFonts w:ascii="Times New Roman" w:eastAsia="Times New Roman" w:hAnsi="Times New Roman" w:cs="Times New Roman"/>
+          <w:sz w:val="36"/>
+          <w:szCs w:val="36"/>
+        </w:rPr>
+        <w:t>, ami pedig az újonnan létrejött backend része a projektnek) (Susán)</w:t>
       </w:r>
     </w:p>
     <w:p>
@@ -3683,7 +4544,43 @@
           <w:sz w:val="36"/>
           <w:szCs w:val="36"/>
         </w:rPr>
-        <w:t>(El-Nabulsy Csongor Alan) Az ütemezői nézet (SchedulerView) elkészítése</w:t>
+        <w:t>(El-</w:t>
+      </w:r>
+      <w:proofErr w:type="spellStart"/>
+      <w:r>
+        <w:rPr>
+          <w:rFonts w:ascii="Times New Roman" w:eastAsia="Times New Roman" w:hAnsi="Times New Roman" w:cs="Times New Roman"/>
+          <w:sz w:val="36"/>
+          <w:szCs w:val="36"/>
+        </w:rPr>
+        <w:t>Nabulsy</w:t>
+      </w:r>
+      <w:proofErr w:type="spellEnd"/>
+      <w:r>
+        <w:rPr>
+          <w:rFonts w:ascii="Times New Roman" w:eastAsia="Times New Roman" w:hAnsi="Times New Roman" w:cs="Times New Roman"/>
+          <w:sz w:val="36"/>
+          <w:szCs w:val="36"/>
+        </w:rPr>
+        <w:t xml:space="preserve"> Csongor Alan) Az ütemezői nézet (</w:t>
+      </w:r>
+      <w:proofErr w:type="spellStart"/>
+      <w:r>
+        <w:rPr>
+          <w:rFonts w:ascii="Times New Roman" w:eastAsia="Times New Roman" w:hAnsi="Times New Roman" w:cs="Times New Roman"/>
+          <w:sz w:val="36"/>
+          <w:szCs w:val="36"/>
+        </w:rPr>
+        <w:t>SchedulerView</w:t>
+      </w:r>
+      <w:proofErr w:type="spellEnd"/>
+      <w:r>
+        <w:rPr>
+          <w:rFonts w:ascii="Times New Roman" w:eastAsia="Times New Roman" w:hAnsi="Times New Roman" w:cs="Times New Roman"/>
+          <w:sz w:val="36"/>
+          <w:szCs w:val="36"/>
+        </w:rPr>
+        <w:t>) elkészítése</w:t>
       </w:r>
       <w:r>
         <w:rPr>
@@ -3719,7 +4616,25 @@
           <w:sz w:val="36"/>
           <w:szCs w:val="36"/>
         </w:rPr>
-        <w:t>Tervezéssel kapcsolatos dokumentumok áthelyezése egy „plans” mappába, a</w:t>
+        <w:t>Tervezéssel kapcsolatos dokumentumok áthelyezése egy „</w:t>
+      </w:r>
+      <w:proofErr w:type="spellStart"/>
+      <w:r>
+        <w:rPr>
+          <w:rFonts w:ascii="Times New Roman" w:eastAsia="Times New Roman" w:hAnsi="Times New Roman" w:cs="Times New Roman"/>
+          <w:sz w:val="36"/>
+          <w:szCs w:val="36"/>
+        </w:rPr>
+        <w:t>plans</w:t>
+      </w:r>
+      <w:proofErr w:type="spellEnd"/>
+      <w:r>
+        <w:rPr>
+          <w:rFonts w:ascii="Times New Roman" w:eastAsia="Times New Roman" w:hAnsi="Times New Roman" w:cs="Times New Roman"/>
+          <w:sz w:val="36"/>
+          <w:szCs w:val="36"/>
+        </w:rPr>
+        <w:t>” mappába, a</w:t>
       </w:r>
       <w:r>
         <w:rPr>
@@ -3728,6 +4643,249 @@
           <w:szCs w:val="36"/>
         </w:rPr>
         <w:t>z oldal aljáról elérhető oldalak közül az impresszum és szabályzat elkészítése.</w:t>
+      </w:r>
+    </w:p>
+    <w:p>
+      <w:pPr>
+        <w:pStyle w:val="Listaszerbekezds"/>
+        <w:ind w:left="0"/>
+        <w:jc w:val="both"/>
+        <w:rPr>
+          <w:rFonts w:ascii="Times New Roman" w:eastAsia="Times New Roman" w:hAnsi="Times New Roman" w:cs="Times New Roman"/>
+          <w:sz w:val="36"/>
+          <w:szCs w:val="36"/>
+        </w:rPr>
+      </w:pPr>
+    </w:p>
+    <w:p>
+      <w:pPr>
+        <w:pStyle w:val="Listaszerbekezds"/>
+        <w:ind w:left="0"/>
+        <w:jc w:val="both"/>
+        <w:rPr>
+          <w:rFonts w:ascii="Times New Roman" w:eastAsia="Times New Roman" w:hAnsi="Times New Roman" w:cs="Times New Roman"/>
+          <w:b/>
+          <w:bCs/>
+          <w:sz w:val="40"/>
+          <w:szCs w:val="40"/>
+        </w:rPr>
+      </w:pPr>
+      <w:r>
+        <w:rPr>
+          <w:rFonts w:ascii="Times New Roman" w:eastAsia="Times New Roman" w:hAnsi="Times New Roman" w:cs="Times New Roman"/>
+          <w:b/>
+          <w:bCs/>
+          <w:sz w:val="40"/>
+          <w:szCs w:val="40"/>
+        </w:rPr>
+        <w:t>2026-03-25 10:00-14:30</w:t>
+      </w:r>
+    </w:p>
+    <w:p>
+      <w:pPr>
+        <w:pStyle w:val="Listaszerbekezds"/>
+        <w:ind w:left="0"/>
+        <w:jc w:val="both"/>
+        <w:rPr>
+          <w:rFonts w:ascii="Times New Roman" w:eastAsia="Times New Roman" w:hAnsi="Times New Roman" w:cs="Times New Roman"/>
+          <w:sz w:val="36"/>
+          <w:szCs w:val="36"/>
+        </w:rPr>
+      </w:pPr>
+      <w:r>
+        <w:rPr>
+          <w:rFonts w:ascii="Times New Roman" w:eastAsia="Times New Roman" w:hAnsi="Times New Roman" w:cs="Times New Roman"/>
+          <w:sz w:val="36"/>
+          <w:szCs w:val="36"/>
+        </w:rPr>
+        <w:t>(</w:t>
+      </w:r>
+      <w:r>
+        <w:rPr>
+          <w:rFonts w:ascii="Times New Roman" w:eastAsia="Times New Roman" w:hAnsi="Times New Roman" w:cs="Times New Roman"/>
+          <w:sz w:val="36"/>
+          <w:szCs w:val="36"/>
+        </w:rPr>
+        <w:t>El-</w:t>
+      </w:r>
+      <w:proofErr w:type="spellStart"/>
+      <w:r>
+        <w:rPr>
+          <w:rFonts w:ascii="Times New Roman" w:eastAsia="Times New Roman" w:hAnsi="Times New Roman" w:cs="Times New Roman"/>
+          <w:sz w:val="36"/>
+          <w:szCs w:val="36"/>
+        </w:rPr>
+        <w:t>Nabulsy</w:t>
+      </w:r>
+      <w:proofErr w:type="spellEnd"/>
+      <w:r>
+        <w:rPr>
+          <w:rFonts w:ascii="Times New Roman" w:eastAsia="Times New Roman" w:hAnsi="Times New Roman" w:cs="Times New Roman"/>
+          <w:sz w:val="36"/>
+          <w:szCs w:val="36"/>
+        </w:rPr>
+        <w:t xml:space="preserve"> Csongor Alan</w:t>
+      </w:r>
+      <w:r>
+        <w:rPr>
+          <w:rFonts w:ascii="Times New Roman" w:eastAsia="Times New Roman" w:hAnsi="Times New Roman" w:cs="Times New Roman"/>
+          <w:sz w:val="36"/>
+          <w:szCs w:val="36"/>
+        </w:rPr>
+        <w:t>)</w:t>
+      </w:r>
+      <w:r>
+        <w:rPr>
+          <w:rFonts w:ascii="Times New Roman" w:eastAsia="Times New Roman" w:hAnsi="Times New Roman" w:cs="Times New Roman"/>
+          <w:sz w:val="36"/>
+          <w:szCs w:val="36"/>
+        </w:rPr>
+        <w:t xml:space="preserve"> </w:t>
+      </w:r>
+      <w:proofErr w:type="spellStart"/>
+      <w:r>
+        <w:rPr>
+          <w:rFonts w:ascii="Times New Roman" w:eastAsia="Times New Roman" w:hAnsi="Times New Roman" w:cs="Times New Roman"/>
+          <w:sz w:val="36"/>
+          <w:szCs w:val="36"/>
+        </w:rPr>
+        <w:t>RequestView</w:t>
+      </w:r>
+      <w:proofErr w:type="spellEnd"/>
+      <w:r>
+        <w:rPr>
+          <w:rFonts w:ascii="Times New Roman" w:eastAsia="Times New Roman" w:hAnsi="Times New Roman" w:cs="Times New Roman"/>
+          <w:sz w:val="36"/>
+          <w:szCs w:val="36"/>
+        </w:rPr>
+        <w:t xml:space="preserve"> és </w:t>
+      </w:r>
+      <w:proofErr w:type="spellStart"/>
+      <w:r>
+        <w:rPr>
+          <w:rFonts w:ascii="Times New Roman" w:eastAsia="Times New Roman" w:hAnsi="Times New Roman" w:cs="Times New Roman"/>
+          <w:sz w:val="36"/>
+          <w:szCs w:val="36"/>
+        </w:rPr>
+        <w:t>SchedulerView</w:t>
+      </w:r>
+      <w:proofErr w:type="spellEnd"/>
+      <w:r>
+        <w:rPr>
+          <w:rFonts w:ascii="Times New Roman" w:eastAsia="Times New Roman" w:hAnsi="Times New Roman" w:cs="Times New Roman"/>
+          <w:sz w:val="36"/>
+          <w:szCs w:val="36"/>
+        </w:rPr>
+        <w:t xml:space="preserve"> továbbfejlesztése</w:t>
+      </w:r>
+    </w:p>
+    <w:p>
+      <w:pPr>
+        <w:pStyle w:val="Listaszerbekezds"/>
+        <w:ind w:left="0"/>
+        <w:jc w:val="both"/>
+        <w:rPr>
+          <w:rFonts w:ascii="Times New Roman" w:eastAsia="Times New Roman" w:hAnsi="Times New Roman" w:cs="Times New Roman"/>
+          <w:sz w:val="36"/>
+          <w:szCs w:val="36"/>
+        </w:rPr>
+      </w:pPr>
+      <w:r>
+        <w:rPr>
+          <w:rFonts w:ascii="Times New Roman" w:eastAsia="Times New Roman" w:hAnsi="Times New Roman" w:cs="Times New Roman"/>
+          <w:sz w:val="36"/>
+          <w:szCs w:val="36"/>
+        </w:rPr>
+        <w:t>(Susán Csongor György)</w:t>
+      </w:r>
+    </w:p>
+    <w:p>
+      <w:pPr>
+        <w:pStyle w:val="Listaszerbekezds"/>
+        <w:numPr>
+          <w:ilvl w:val="0"/>
+          <w:numId w:val="7"/>
+        </w:numPr>
+        <w:jc w:val="both"/>
+        <w:rPr>
+          <w:rFonts w:ascii="Times New Roman" w:eastAsia="Times New Roman" w:hAnsi="Times New Roman" w:cs="Times New Roman"/>
+          <w:sz w:val="36"/>
+          <w:szCs w:val="36"/>
+        </w:rPr>
+      </w:pPr>
+      <w:r>
+        <w:rPr>
+          <w:rFonts w:ascii="Times New Roman" w:eastAsia="Times New Roman" w:hAnsi="Times New Roman" w:cs="Times New Roman"/>
+          <w:sz w:val="36"/>
+          <w:szCs w:val="36"/>
+        </w:rPr>
+        <w:lastRenderedPageBreak/>
+        <w:t>Táblák celláinak (mezőinek) véglegesítése</w:t>
+      </w:r>
+    </w:p>
+    <w:p>
+      <w:pPr>
+        <w:pStyle w:val="Listaszerbekezds"/>
+        <w:numPr>
+          <w:ilvl w:val="0"/>
+          <w:numId w:val="7"/>
+        </w:numPr>
+        <w:jc w:val="both"/>
+        <w:rPr>
+          <w:rFonts w:ascii="Times New Roman" w:eastAsia="Times New Roman" w:hAnsi="Times New Roman" w:cs="Times New Roman"/>
+          <w:sz w:val="36"/>
+          <w:szCs w:val="36"/>
+        </w:rPr>
+      </w:pPr>
+      <w:r>
+        <w:rPr>
+          <w:rFonts w:ascii="Times New Roman" w:eastAsia="Times New Roman" w:hAnsi="Times New Roman" w:cs="Times New Roman"/>
+          <w:sz w:val="36"/>
+          <w:szCs w:val="36"/>
+        </w:rPr>
+        <w:t>P</w:t>
+      </w:r>
+      <w:r>
+        <w:rPr>
+          <w:rFonts w:ascii="Times New Roman" w:eastAsia="Times New Roman" w:hAnsi="Times New Roman" w:cs="Times New Roman"/>
+          <w:sz w:val="36"/>
+          <w:szCs w:val="36"/>
+        </w:rPr>
+        <w:t>éldaadatok felvétel</w:t>
+      </w:r>
+      <w:r>
+        <w:rPr>
+          <w:rFonts w:ascii="Times New Roman" w:eastAsia="Times New Roman" w:hAnsi="Times New Roman" w:cs="Times New Roman"/>
+          <w:sz w:val="36"/>
+          <w:szCs w:val="36"/>
+        </w:rPr>
+        <w:t>ének megkezdése</w:t>
+      </w:r>
+      <w:r>
+        <w:rPr>
+          <w:rFonts w:ascii="Times New Roman" w:eastAsia="Times New Roman" w:hAnsi="Times New Roman" w:cs="Times New Roman"/>
+          <w:sz w:val="36"/>
+          <w:szCs w:val="36"/>
+        </w:rPr>
+        <w:t xml:space="preserve"> az adatbázisba </w:t>
+      </w:r>
+      <w:proofErr w:type="spellStart"/>
+      <w:r>
+        <w:rPr>
+          <w:rFonts w:ascii="Times New Roman" w:eastAsia="Times New Roman" w:hAnsi="Times New Roman" w:cs="Times New Roman"/>
+          <w:sz w:val="36"/>
+          <w:szCs w:val="36"/>
+        </w:rPr>
+        <w:t>seederek</w:t>
+      </w:r>
+      <w:proofErr w:type="spellEnd"/>
+      <w:r>
+        <w:rPr>
+          <w:rFonts w:ascii="Times New Roman" w:eastAsia="Times New Roman" w:hAnsi="Times New Roman" w:cs="Times New Roman"/>
+          <w:sz w:val="36"/>
+          <w:szCs w:val="36"/>
+        </w:rPr>
+        <w:t xml:space="preserve"> segítségével</w:t>
       </w:r>
     </w:p>
     <w:sectPr>
@@ -4334,9 +5492,9 @@
     </w:lvl>
   </w:abstractNum>
   <w:abstractNum w:abstractNumId="5" w15:restartNumberingAfterBreak="0">
-    <w:nsid w:val="7EB672F7"/>
+    <w:nsid w:val="788C73B2"/>
     <w:multiLevelType w:val="hybridMultilevel"/>
-    <w:tmpl w:val="A6F0C99C"/>
+    <w:tmpl w:val="6D6C60B0"/>
     <w:lvl w:ilvl="0" w:tplc="040E0001">
       <w:start w:val="1"/>
       <w:numFmt w:val="bullet"/>
@@ -4446,8 +5604,121 @@
       </w:rPr>
     </w:lvl>
   </w:abstractNum>
+  <w:abstractNum w:abstractNumId="6" w15:restartNumberingAfterBreak="0">
+    <w:nsid w:val="7EB672F7"/>
+    <w:multiLevelType w:val="hybridMultilevel"/>
+    <w:tmpl w:val="A6F0C99C"/>
+    <w:lvl w:ilvl="0" w:tplc="040E0001">
+      <w:start w:val="1"/>
+      <w:numFmt w:val="bullet"/>
+      <w:lvlText w:val=""/>
+      <w:lvlJc w:val="left"/>
+      <w:pPr>
+        <w:ind w:left="720" w:hanging="360"/>
+      </w:pPr>
+      <w:rPr>
+        <w:rFonts w:ascii="Symbol" w:hAnsi="Symbol" w:hint="default"/>
+      </w:rPr>
+    </w:lvl>
+    <w:lvl w:ilvl="1" w:tplc="040E0003" w:tentative="1">
+      <w:start w:val="1"/>
+      <w:numFmt w:val="bullet"/>
+      <w:lvlText w:val="o"/>
+      <w:lvlJc w:val="left"/>
+      <w:pPr>
+        <w:ind w:left="1440" w:hanging="360"/>
+      </w:pPr>
+      <w:rPr>
+        <w:rFonts w:ascii="Courier New" w:hAnsi="Courier New" w:cs="Courier New" w:hint="default"/>
+      </w:rPr>
+    </w:lvl>
+    <w:lvl w:ilvl="2" w:tplc="040E0005" w:tentative="1">
+      <w:start w:val="1"/>
+      <w:numFmt w:val="bullet"/>
+      <w:lvlText w:val=""/>
+      <w:lvlJc w:val="left"/>
+      <w:pPr>
+        <w:ind w:left="2160" w:hanging="360"/>
+      </w:pPr>
+      <w:rPr>
+        <w:rFonts w:ascii="Wingdings" w:hAnsi="Wingdings" w:hint="default"/>
+      </w:rPr>
+    </w:lvl>
+    <w:lvl w:ilvl="3" w:tplc="040E0001" w:tentative="1">
+      <w:start w:val="1"/>
+      <w:numFmt w:val="bullet"/>
+      <w:lvlText w:val=""/>
+      <w:lvlJc w:val="left"/>
+      <w:pPr>
+        <w:ind w:left="2880" w:hanging="360"/>
+      </w:pPr>
+      <w:rPr>
+        <w:rFonts w:ascii="Symbol" w:hAnsi="Symbol" w:hint="default"/>
+      </w:rPr>
+    </w:lvl>
+    <w:lvl w:ilvl="4" w:tplc="040E0003" w:tentative="1">
+      <w:start w:val="1"/>
+      <w:numFmt w:val="bullet"/>
+      <w:lvlText w:val="o"/>
+      <w:lvlJc w:val="left"/>
+      <w:pPr>
+        <w:ind w:left="3600" w:hanging="360"/>
+      </w:pPr>
+      <w:rPr>
+        <w:rFonts w:ascii="Courier New" w:hAnsi="Courier New" w:cs="Courier New" w:hint="default"/>
+      </w:rPr>
+    </w:lvl>
+    <w:lvl w:ilvl="5" w:tplc="040E0005" w:tentative="1">
+      <w:start w:val="1"/>
+      <w:numFmt w:val="bullet"/>
+      <w:lvlText w:val=""/>
+      <w:lvlJc w:val="left"/>
+      <w:pPr>
+        <w:ind w:left="4320" w:hanging="360"/>
+      </w:pPr>
+      <w:rPr>
+        <w:rFonts w:ascii="Wingdings" w:hAnsi="Wingdings" w:hint="default"/>
+      </w:rPr>
+    </w:lvl>
+    <w:lvl w:ilvl="6" w:tplc="040E0001" w:tentative="1">
+      <w:start w:val="1"/>
+      <w:numFmt w:val="bullet"/>
+      <w:lvlText w:val=""/>
+      <w:lvlJc w:val="left"/>
+      <w:pPr>
+        <w:ind w:left="5040" w:hanging="360"/>
+      </w:pPr>
+      <w:rPr>
+        <w:rFonts w:ascii="Symbol" w:hAnsi="Symbol" w:hint="default"/>
+      </w:rPr>
+    </w:lvl>
+    <w:lvl w:ilvl="7" w:tplc="040E0003" w:tentative="1">
+      <w:start w:val="1"/>
+      <w:numFmt w:val="bullet"/>
+      <w:lvlText w:val="o"/>
+      <w:lvlJc w:val="left"/>
+      <w:pPr>
+        <w:ind w:left="5760" w:hanging="360"/>
+      </w:pPr>
+      <w:rPr>
+        <w:rFonts w:ascii="Courier New" w:hAnsi="Courier New" w:cs="Courier New" w:hint="default"/>
+      </w:rPr>
+    </w:lvl>
+    <w:lvl w:ilvl="8" w:tplc="040E0005" w:tentative="1">
+      <w:start w:val="1"/>
+      <w:numFmt w:val="bullet"/>
+      <w:lvlText w:val=""/>
+      <w:lvlJc w:val="left"/>
+      <w:pPr>
+        <w:ind w:left="6480" w:hanging="360"/>
+      </w:pPr>
+      <w:rPr>
+        <w:rFonts w:ascii="Wingdings" w:hAnsi="Wingdings" w:hint="default"/>
+      </w:rPr>
+    </w:lvl>
+  </w:abstractNum>
   <w:num w:numId="1" w16cid:durableId="33770327">
-    <w:abstractNumId w:val="5"/>
+    <w:abstractNumId w:val="6"/>
   </w:num>
   <w:num w:numId="2" w16cid:durableId="565265875">
     <w:abstractNumId w:val="3"/>
@@ -4463,6 +5734,9 @@
   </w:num>
   <w:num w:numId="6" w16cid:durableId="133304165">
     <w:abstractNumId w:val="1"/>
+  </w:num>
+  <w:num w:numId="7" w16cid:durableId="1880243670">
+    <w:abstractNumId w:val="5"/>
   </w:num>
 </w:numbering>
 </file>

</xml_diff>

<commit_message>
More examples for the music database (others e. g. requested or playlist are not included!)
</commit_message>
<xml_diff>
--- a/documentation.docx
+++ b/documentation.docx
@@ -1,6 +1,6 @@
 
 <file path=word/document.xml><?xml version="1.0" encoding="utf-8"?>
-<w:document xmlns:wpc="http://schemas.microsoft.com/office/word/2010/wordprocessingCanvas" xmlns:cx="http://schemas.microsoft.com/office/drawing/2014/chartex" xmlns:cx1="http://schemas.microsoft.com/office/drawing/2015/9/8/chartex" xmlns:cx2="http://schemas.microsoft.com/office/drawing/2015/10/21/chartex" xmlns:cx3="http://schemas.microsoft.com/office/drawing/2016/5/9/chartex" xmlns:cx4="http://schemas.microsoft.com/office/drawing/2016/5/10/chartex" xmlns:cx5="http://schemas.microsoft.com/office/drawing/2016/5/11/chartex" xmlns:cx6="http://schemas.microsoft.com/office/drawing/2016/5/12/chartex" xmlns:cx7="http://schemas.microsoft.com/office/drawing/2016/5/13/chartex" xmlns:cx8="http://schemas.microsoft.com/office/drawing/2016/5/14/chartex" xmlns:mc="http://schemas.openxmlformats.org/markup-compatibility/2006" xmlns:aink="http://schemas.microsoft.com/office/drawing/2016/ink" xmlns:am3d="http://schemas.microsoft.com/office/drawing/2017/model3d" xmlns:o="urn:schemas-microsoft-com:office:office" xmlns:r="http://schemas.openxmlformats.org/officeDocument/2006/relationships" xmlns:m="http://schemas.openxmlformats.org/officeDocument/2006/math" xmlns:v="urn:schemas-microsoft-com:vml" xmlns:wp14="http://schemas.microsoft.com/office/word/2010/wordprocessingDrawing" xmlns:wp="http://schemas.openxmlformats.org/drawingml/2006/wordprocessingDrawing" xmlns:w10="urn:schemas-microsoft-com:office:word" xmlns:w="http://schemas.openxmlformats.org/wordprocessingml/2006/main" xmlns:w14="http://schemas.microsoft.com/office/word/2010/wordml" xmlns:w15="http://schemas.microsoft.com/office/word/2012/wordml" xmlns:w16cid="http://schemas.microsoft.com/office/word/2016/wordml/cid" xmlns:w16se="http://schemas.microsoft.com/office/word/2015/wordml/symex" xmlns:wpg="http://schemas.microsoft.com/office/word/2010/wordprocessingGroup" xmlns:wpi="http://schemas.microsoft.com/office/word/2010/wordprocessingInk" xmlns:wne="http://schemas.microsoft.com/office/word/2006/wordml" xmlns:wps="http://schemas.microsoft.com/office/word/2010/wordprocessingShape" mc:Ignorable="w14 w15 w16se w16cid wp14">
+<w:document xmlns:wpc="http://schemas.microsoft.com/office/word/2010/wordprocessingCanvas" xmlns:cx="http://schemas.microsoft.com/office/drawing/2014/chartex" xmlns:cx1="http://schemas.microsoft.com/office/drawing/2015/9/8/chartex" xmlns:cx2="http://schemas.microsoft.com/office/drawing/2015/10/21/chartex" xmlns:cx3="http://schemas.microsoft.com/office/drawing/2016/5/9/chartex" xmlns:cx4="http://schemas.microsoft.com/office/drawing/2016/5/10/chartex" xmlns:cx5="http://schemas.microsoft.com/office/drawing/2016/5/11/chartex" xmlns:cx6="http://schemas.microsoft.com/office/drawing/2016/5/12/chartex" xmlns:cx7="http://schemas.microsoft.com/office/drawing/2016/5/13/chartex" xmlns:cx8="http://schemas.microsoft.com/office/drawing/2016/5/14/chartex" xmlns:mc="http://schemas.openxmlformats.org/markup-compatibility/2006" xmlns:aink="http://schemas.microsoft.com/office/drawing/2016/ink" xmlns:am3d="http://schemas.microsoft.com/office/drawing/2017/model3d" xmlns:o="urn:schemas-microsoft-com:office:office" xmlns:oel="http://schemas.microsoft.com/office/2019/extlst" xmlns:r="http://schemas.openxmlformats.org/officeDocument/2006/relationships" xmlns:m="http://schemas.openxmlformats.org/officeDocument/2006/math" xmlns:v="urn:schemas-microsoft-com:vml" xmlns:wp14="http://schemas.microsoft.com/office/word/2010/wordprocessingDrawing" xmlns:wp="http://schemas.openxmlformats.org/drawingml/2006/wordprocessingDrawing" xmlns:w10="urn:schemas-microsoft-com:office:word" xmlns:w="http://schemas.openxmlformats.org/wordprocessingml/2006/main" xmlns:w14="http://schemas.microsoft.com/office/word/2010/wordml" xmlns:w15="http://schemas.microsoft.com/office/word/2012/wordml" xmlns:w16cex="http://schemas.microsoft.com/office/word/2018/wordml/cex" xmlns:w16cid="http://schemas.microsoft.com/office/word/2016/wordml/cid" xmlns:w16="http://schemas.microsoft.com/office/word/2018/wordml" xmlns:w16du="http://schemas.microsoft.com/office/word/2023/wordml/word16du" xmlns:w16sdtdh="http://schemas.microsoft.com/office/word/2020/wordml/sdtdatahash" xmlns:w16sdtfl="http://schemas.microsoft.com/office/word/2024/wordml/sdtformatlock" xmlns:w16se="http://schemas.microsoft.com/office/word/2015/wordml/symex" xmlns:wpg="http://schemas.microsoft.com/office/word/2010/wordprocessingGroup" xmlns:wpi="http://schemas.microsoft.com/office/word/2010/wordprocessingInk" xmlns:wne="http://schemas.microsoft.com/office/word/2006/wordml" xmlns:wps="http://schemas.microsoft.com/office/word/2010/wordprocessingShape" mc:Ignorable="w14 w15 w16se w16cid w16 w16cex w16sdtdh w16sdtfl w16du wp14">
   <w:body>
     <w:p>
       <w:pPr>
@@ -1298,7 +1298,7 @@
           <w:szCs w:val="36"/>
         </w:rPr>
         <w:drawing>
-          <wp:inline distT="0" distB="0" distL="0" distR="0" wp14:anchorId="78A43544" wp14:editId="49D07696">
+          <wp:inline distT="0" distB="0" distL="0" distR="0" wp14:anchorId="78A43544" wp14:editId="66A813C4">
             <wp:extent cx="3166535" cy="1781175"/>
             <wp:effectExtent l="0" t="0" r="0" b="0"/>
             <wp:docPr id="3" name="Kép 3" descr="C:\Users\elnabulsy.csongor\AppData\Local\Microsoft\Windows\INetCache\Content.MSO\F75754B3.tmp"/>
@@ -1390,7 +1390,7 @@
           <w:szCs w:val="36"/>
         </w:rPr>
         <w:drawing>
-          <wp:inline distT="0" distB="0" distL="0" distR="0" wp14:anchorId="4E211814" wp14:editId="0B3D4D70">
+          <wp:inline distT="0" distB="0" distL="0" distR="0" wp14:anchorId="4E211814" wp14:editId="7219E661">
             <wp:extent cx="3133725" cy="1762720"/>
             <wp:effectExtent l="0" t="0" r="0" b="9525"/>
             <wp:docPr id="4" name="Kép 4" descr="C:\Users\elnabulsy.csongor\Downloads\ui_main_student.png"/>
@@ -1472,7 +1472,7 @@
           <w:szCs w:val="36"/>
         </w:rPr>
         <w:drawing>
-          <wp:inline distT="0" distB="0" distL="0" distR="0" wp14:anchorId="5137FB78" wp14:editId="27B94FF6">
+          <wp:inline distT="0" distB="0" distL="0" distR="0" wp14:anchorId="5137FB78" wp14:editId="68507809">
             <wp:extent cx="3166110" cy="1780938"/>
             <wp:effectExtent l="0" t="0" r="0" b="0"/>
             <wp:docPr id="5" name="Kép 5" descr="C:\Users\elnabulsy.csongor\Downloads\ui_main_scheduler.png"/>
@@ -1529,23 +1529,13 @@
           <w:szCs w:val="36"/>
         </w:rPr>
       </w:pPr>
-      <w:proofErr w:type="spellStart"/>
-      <w:r>
-        <w:rPr>
-          <w:rFonts w:ascii="Times New Roman" w:eastAsia="Times New Roman" w:hAnsi="Times New Roman" w:cs="Times New Roman"/>
-          <w:sz w:val="36"/>
-          <w:szCs w:val="36"/>
-        </w:rPr>
-        <w:t>Főképernyő</w:t>
-      </w:r>
-      <w:proofErr w:type="spellEnd"/>
-      <w:r>
-        <w:rPr>
-          <w:rFonts w:ascii="Times New Roman" w:eastAsia="Times New Roman" w:hAnsi="Times New Roman" w:cs="Times New Roman"/>
-          <w:sz w:val="36"/>
-          <w:szCs w:val="36"/>
-        </w:rPr>
-        <w:t xml:space="preserve"> </w:t>
+      <w:r>
+        <w:rPr>
+          <w:rFonts w:ascii="Times New Roman" w:eastAsia="Times New Roman" w:hAnsi="Times New Roman" w:cs="Times New Roman"/>
+          <w:sz w:val="36"/>
+          <w:szCs w:val="36"/>
+        </w:rPr>
+        <w:t xml:space="preserve">Főképernyő </w:t>
       </w:r>
       <w:proofErr w:type="spellStart"/>
       <w:r>
@@ -1593,7 +1583,7 @@
           <w:szCs w:val="36"/>
         </w:rPr>
         <w:drawing>
-          <wp:inline distT="0" distB="0" distL="0" distR="0" wp14:anchorId="27EC1C67" wp14:editId="780D0D04">
+          <wp:inline distT="0" distB="0" distL="0" distR="0" wp14:anchorId="27EC1C67" wp14:editId="09B7B968">
             <wp:extent cx="3055620" cy="1718786"/>
             <wp:effectExtent l="0" t="0" r="0" b="0"/>
             <wp:docPr id="6" name="Kép 6" descr="C:\Users\elnabulsy.csongor\Downloads\ui_main_admin.png"/>
@@ -1675,7 +1665,7 @@
           <w:szCs w:val="36"/>
         </w:rPr>
         <w:drawing>
-          <wp:inline distT="0" distB="0" distL="0" distR="0" wp14:anchorId="08225B4F" wp14:editId="7699743C">
+          <wp:inline distT="0" distB="0" distL="0" distR="0" wp14:anchorId="08225B4F" wp14:editId="2C59BD16">
             <wp:extent cx="2933700" cy="1942430"/>
             <wp:effectExtent l="0" t="0" r="0" b="1270"/>
             <wp:docPr id="7" name="Kép 7" descr="C:\Users\elnabulsy.csongor\Downloads\ui_structure.png"/>
@@ -1848,7 +1838,7 @@
           <w:szCs w:val="36"/>
         </w:rPr>
         <w:drawing>
-          <wp:inline distT="0" distB="0" distL="0" distR="0" wp14:anchorId="2C256DB5" wp14:editId="477BE1FD">
+          <wp:inline distT="0" distB="0" distL="0" distR="0" wp14:anchorId="2C256DB5" wp14:editId="46224910">
             <wp:extent cx="3329940" cy="1752493"/>
             <wp:effectExtent l="0" t="0" r="3810" b="635"/>
             <wp:docPr id="9" name="Kép 9"/>
@@ -3047,9 +3037,19 @@
           <w:sz w:val="36"/>
           <w:szCs w:val="36"/>
         </w:rPr>
-        <w:t xml:space="preserve"> Csongor Alan) Főbb nézetek(</w:t>
+        <w:t xml:space="preserve"> Csongor Alan) Főbb </w:t>
+      </w:r>
+      <w:proofErr w:type="gramStart"/>
+      <w:r>
+        <w:rPr>
+          <w:rFonts w:ascii="Times New Roman" w:eastAsia="Times New Roman" w:hAnsi="Times New Roman" w:cs="Times New Roman"/>
+          <w:sz w:val="36"/>
+          <w:szCs w:val="36"/>
+        </w:rPr>
+        <w:t>nézetek(</w:t>
       </w:r>
       <w:proofErr w:type="spellStart"/>
+      <w:proofErr w:type="gramEnd"/>
       <w:r>
         <w:rPr>
           <w:rFonts w:ascii="Times New Roman" w:eastAsia="Times New Roman" w:hAnsi="Times New Roman" w:cs="Times New Roman"/>
@@ -3638,13 +3638,23 @@
         </w:rPr>
       </w:pPr>
       <w:proofErr w:type="spellStart"/>
-      <w:r>
-        <w:rPr>
-          <w:rFonts w:ascii="Times New Roman" w:eastAsia="Times New Roman" w:hAnsi="Times New Roman" w:cs="Times New Roman"/>
-          <w:sz w:val="36"/>
-          <w:szCs w:val="36"/>
-        </w:rPr>
-        <w:t>meta.title-ekben</w:t>
+      <w:proofErr w:type="gramStart"/>
+      <w:r>
+        <w:rPr>
+          <w:rFonts w:ascii="Times New Roman" w:eastAsia="Times New Roman" w:hAnsi="Times New Roman" w:cs="Times New Roman"/>
+          <w:sz w:val="36"/>
+          <w:szCs w:val="36"/>
+        </w:rPr>
+        <w:t>meta.title</w:t>
+      </w:r>
+      <w:proofErr w:type="gramEnd"/>
+      <w:r>
+        <w:rPr>
+          <w:rFonts w:ascii="Times New Roman" w:eastAsia="Times New Roman" w:hAnsi="Times New Roman" w:cs="Times New Roman"/>
+          <w:sz w:val="36"/>
+          <w:szCs w:val="36"/>
+        </w:rPr>
+        <w:t>-ekben</w:t>
       </w:r>
       <w:proofErr w:type="spellEnd"/>
       <w:r>
@@ -4310,25 +4320,7 @@
           <w:sz w:val="36"/>
           <w:szCs w:val="36"/>
         </w:rPr>
-        <w:t xml:space="preserve"> volt, viszont azóta a </w:t>
-      </w:r>
-      <w:proofErr w:type="spellStart"/>
-      <w:r>
-        <w:rPr>
-          <w:rFonts w:ascii="Times New Roman" w:eastAsia="Times New Roman" w:hAnsi="Times New Roman" w:cs="Times New Roman"/>
-          <w:sz w:val="36"/>
-          <w:szCs w:val="36"/>
-        </w:rPr>
-        <w:t>főmappa</w:t>
-      </w:r>
-      <w:proofErr w:type="spellEnd"/>
-      <w:r>
-        <w:rPr>
-          <w:rFonts w:ascii="Times New Roman" w:eastAsia="Times New Roman" w:hAnsi="Times New Roman" w:cs="Times New Roman"/>
-          <w:sz w:val="36"/>
-          <w:szCs w:val="36"/>
-        </w:rPr>
-        <w:t xml:space="preserve"> a </w:t>
+        <w:t xml:space="preserve"> volt, viszont azóta a főmappa a </w:t>
       </w:r>
       <w:proofErr w:type="spellStart"/>
       <w:r>
@@ -5057,8 +5049,6 @@
         </w:rPr>
         <w:t>Hibakeresés</w:t>
       </w:r>
-      <w:bookmarkStart w:id="0" w:name="_GoBack"/>
-      <w:bookmarkEnd w:id="0"/>
     </w:p>
     <w:sectPr>
       <w:pgSz w:w="11906" w:h="16838"/>
@@ -5071,7 +5061,7 @@
 </file>
 
 <file path=word/numbering.xml><?xml version="1.0" encoding="utf-8"?>
-<w:numbering xmlns:wpc="http://schemas.microsoft.com/office/word/2010/wordprocessingCanvas" xmlns:cx="http://schemas.microsoft.com/office/drawing/2014/chartex" xmlns:cx1="http://schemas.microsoft.com/office/drawing/2015/9/8/chartex" xmlns:cx2="http://schemas.microsoft.com/office/drawing/2015/10/21/chartex" xmlns:cx3="http://schemas.microsoft.com/office/drawing/2016/5/9/chartex" xmlns:cx4="http://schemas.microsoft.com/office/drawing/2016/5/10/chartex" xmlns:cx5="http://schemas.microsoft.com/office/drawing/2016/5/11/chartex" xmlns:cx6="http://schemas.microsoft.com/office/drawing/2016/5/12/chartex" xmlns:cx7="http://schemas.microsoft.com/office/drawing/2016/5/13/chartex" xmlns:cx8="http://schemas.microsoft.com/office/drawing/2016/5/14/chartex" xmlns:mc="http://schemas.openxmlformats.org/markup-compatibility/2006" xmlns:aink="http://schemas.microsoft.com/office/drawing/2016/ink" xmlns:am3d="http://schemas.microsoft.com/office/drawing/2017/model3d" xmlns:o="urn:schemas-microsoft-com:office:office" xmlns:r="http://schemas.openxmlformats.org/officeDocument/2006/relationships" xmlns:m="http://schemas.openxmlformats.org/officeDocument/2006/math" xmlns:v="urn:schemas-microsoft-com:vml" xmlns:wp14="http://schemas.microsoft.com/office/word/2010/wordprocessingDrawing" xmlns:wp="http://schemas.openxmlformats.org/drawingml/2006/wordprocessingDrawing" xmlns:w10="urn:schemas-microsoft-com:office:word" xmlns:w="http://schemas.openxmlformats.org/wordprocessingml/2006/main" xmlns:w14="http://schemas.microsoft.com/office/word/2010/wordml" xmlns:w15="http://schemas.microsoft.com/office/word/2012/wordml" xmlns:w16cid="http://schemas.microsoft.com/office/word/2016/wordml/cid" xmlns:w16se="http://schemas.microsoft.com/office/word/2015/wordml/symex" xmlns:wpg="http://schemas.microsoft.com/office/word/2010/wordprocessingGroup" xmlns:wpi="http://schemas.microsoft.com/office/word/2010/wordprocessingInk" xmlns:wne="http://schemas.microsoft.com/office/word/2006/wordml" xmlns:wps="http://schemas.microsoft.com/office/word/2010/wordprocessingShape" mc:Ignorable="w14 w15 w16se w16cid wp14">
+<w:numbering xmlns:wpc="http://schemas.microsoft.com/office/word/2010/wordprocessingCanvas" xmlns:cx="http://schemas.microsoft.com/office/drawing/2014/chartex" xmlns:cx1="http://schemas.microsoft.com/office/drawing/2015/9/8/chartex" xmlns:cx2="http://schemas.microsoft.com/office/drawing/2015/10/21/chartex" xmlns:cx3="http://schemas.microsoft.com/office/drawing/2016/5/9/chartex" xmlns:cx4="http://schemas.microsoft.com/office/drawing/2016/5/10/chartex" xmlns:cx5="http://schemas.microsoft.com/office/drawing/2016/5/11/chartex" xmlns:cx6="http://schemas.microsoft.com/office/drawing/2016/5/12/chartex" xmlns:cx7="http://schemas.microsoft.com/office/drawing/2016/5/13/chartex" xmlns:cx8="http://schemas.microsoft.com/office/drawing/2016/5/14/chartex" xmlns:mc="http://schemas.openxmlformats.org/markup-compatibility/2006" xmlns:aink="http://schemas.microsoft.com/office/drawing/2016/ink" xmlns:am3d="http://schemas.microsoft.com/office/drawing/2017/model3d" xmlns:o="urn:schemas-microsoft-com:office:office" xmlns:oel="http://schemas.microsoft.com/office/2019/extlst" xmlns:r="http://schemas.openxmlformats.org/officeDocument/2006/relationships" xmlns:m="http://schemas.openxmlformats.org/officeDocument/2006/math" xmlns:v="urn:schemas-microsoft-com:vml" xmlns:wp14="http://schemas.microsoft.com/office/word/2010/wordprocessingDrawing" xmlns:wp="http://schemas.openxmlformats.org/drawingml/2006/wordprocessingDrawing" xmlns:w10="urn:schemas-microsoft-com:office:word" xmlns:w="http://schemas.openxmlformats.org/wordprocessingml/2006/main" xmlns:w14="http://schemas.microsoft.com/office/word/2010/wordml" xmlns:w15="http://schemas.microsoft.com/office/word/2012/wordml" xmlns:w16cex="http://schemas.microsoft.com/office/word/2018/wordml/cex" xmlns:w16cid="http://schemas.microsoft.com/office/word/2016/wordml/cid" xmlns:w16="http://schemas.microsoft.com/office/word/2018/wordml" xmlns:w16du="http://schemas.microsoft.com/office/word/2023/wordml/word16du" xmlns:w16sdtdh="http://schemas.microsoft.com/office/word/2020/wordml/sdtdatahash" xmlns:w16sdtfl="http://schemas.microsoft.com/office/word/2024/wordml/sdtformatlock" xmlns:w16se="http://schemas.microsoft.com/office/word/2015/wordml/symex" xmlns:wpg="http://schemas.microsoft.com/office/word/2010/wordprocessingGroup" xmlns:wpi="http://schemas.microsoft.com/office/word/2010/wordprocessingInk" xmlns:wne="http://schemas.microsoft.com/office/word/2006/wordml" xmlns:wps="http://schemas.microsoft.com/office/word/2010/wordprocessingShape" mc:Ignorable="w14 w15 w16se w16cid w16 w16cex w16sdtdh w16sdtfl w16du wp14">
   <w:numPicBullet w:numPicBulletId="0">
     <w:pict>
       <v:shapetype id="_x0000_t75" coordsize="21600,21600" o:spt="75" o:preferrelative="t" path="m@4@5l@4@11@9@11@9@5xe" filled="f" stroked="f">
@@ -5093,7 +5083,7 @@
         <v:path o:extrusionok="f" gradientshapeok="t" o:connecttype="rect"/>
         <o:lock v:ext="edit" aspectratio="t"/>
       </v:shapetype>
-      <v:shape id="_x0000_i1038" type="#_x0000_t75" style="width:24pt;height:24pt;visibility:visible;mso-wrap-style:square" o:bullet="t">
+      <v:shape id="_x0000_i1025" type="#_x0000_t75" style="width:24pt;height:24pt;visibility:visible;mso-wrap-style:square" o:bullet="t">
         <v:imagedata r:id="rId1" o:title=""/>
       </v:shape>
     </w:pict>
@@ -6002,35 +5992,35 @@
       </w:rPr>
     </w:lvl>
   </w:abstractNum>
-  <w:num w:numId="1">
+  <w:num w:numId="1" w16cid:durableId="1237017102">
     <w:abstractNumId w:val="7"/>
   </w:num>
-  <w:num w:numId="2">
+  <w:num w:numId="2" w16cid:durableId="23093752">
     <w:abstractNumId w:val="4"/>
   </w:num>
-  <w:num w:numId="3">
+  <w:num w:numId="3" w16cid:durableId="211231034">
     <w:abstractNumId w:val="5"/>
   </w:num>
-  <w:num w:numId="4">
+  <w:num w:numId="4" w16cid:durableId="285432383">
     <w:abstractNumId w:val="0"/>
   </w:num>
-  <w:num w:numId="5">
+  <w:num w:numId="5" w16cid:durableId="382339222">
     <w:abstractNumId w:val="3"/>
   </w:num>
-  <w:num w:numId="6">
+  <w:num w:numId="6" w16cid:durableId="1929121998">
     <w:abstractNumId w:val="1"/>
   </w:num>
-  <w:num w:numId="7">
+  <w:num w:numId="7" w16cid:durableId="989595552">
     <w:abstractNumId w:val="6"/>
   </w:num>
-  <w:num w:numId="8">
+  <w:num w:numId="8" w16cid:durableId="844437476">
     <w:abstractNumId w:val="2"/>
   </w:num>
 </w:numbering>
 </file>
 
 <file path=word/styles.xml><?xml version="1.0" encoding="utf-8"?>
-<w:styles xmlns:mc="http://schemas.openxmlformats.org/markup-compatibility/2006" xmlns:r="http://schemas.openxmlformats.org/officeDocument/2006/relationships" xmlns:w="http://schemas.openxmlformats.org/wordprocessingml/2006/main" xmlns:w14="http://schemas.microsoft.com/office/word/2010/wordml" xmlns:w15="http://schemas.microsoft.com/office/word/2012/wordml" xmlns:w16cid="http://schemas.microsoft.com/office/word/2016/wordml/cid" xmlns:w16se="http://schemas.microsoft.com/office/word/2015/wordml/symex" mc:Ignorable="w14 w15 w16se w16cid">
+<w:styles xmlns:mc="http://schemas.openxmlformats.org/markup-compatibility/2006" xmlns:r="http://schemas.openxmlformats.org/officeDocument/2006/relationships" xmlns:w="http://schemas.openxmlformats.org/wordprocessingml/2006/main" xmlns:w14="http://schemas.microsoft.com/office/word/2010/wordml" xmlns:w15="http://schemas.microsoft.com/office/word/2012/wordml" xmlns:w16cex="http://schemas.microsoft.com/office/word/2018/wordml/cex" xmlns:w16cid="http://schemas.microsoft.com/office/word/2016/wordml/cid" xmlns:w16="http://schemas.microsoft.com/office/word/2018/wordml" xmlns:w16du="http://schemas.microsoft.com/office/word/2023/wordml/word16du" xmlns:w16sdtdh="http://schemas.microsoft.com/office/word/2020/wordml/sdtdatahash" xmlns:w16sdtfl="http://schemas.microsoft.com/office/word/2024/wordml/sdtformatlock" xmlns:w16se="http://schemas.microsoft.com/office/word/2015/wordml/symex" mc:Ignorable="w14 w15 w16se w16cid w16 w16cex w16sdtdh w16sdtfl w16du">
   <w:docDefaults>
     <w:rPrDefault>
       <w:rPr>
@@ -6048,7 +6038,7 @@
       </w:pPr>
     </w:pPrDefault>
   </w:docDefaults>
-  <w:latentStyles w:defLockedState="0" w:defUIPriority="99" w:defSemiHidden="0" w:defUnhideWhenUsed="0" w:defQFormat="0" w:count="375">
+  <w:latentStyles w:defLockedState="0" w:defUIPriority="99" w:defSemiHidden="0" w:defUnhideWhenUsed="0" w:defQFormat="0" w:count="376">
     <w:lsdException w:name="Normal" w:uiPriority="0" w:qFormat="1"/>
     <w:lsdException w:name="heading 1" w:uiPriority="9" w:qFormat="1"/>
     <w:lsdException w:name="heading 2" w:semiHidden="1" w:uiPriority="9" w:unhideWhenUsed="1" w:qFormat="1"/>
@@ -6424,6 +6414,7 @@
     <w:lsdException w:name="Smart Hyperlink" w:semiHidden="1" w:unhideWhenUsed="1"/>
     <w:lsdException w:name="Hashtag" w:semiHidden="1" w:unhideWhenUsed="1"/>
     <w:lsdException w:name="Unresolved Mention" w:semiHidden="1" w:unhideWhenUsed="1"/>
+    <w:lsdException w:name="Smart Link" w:semiHidden="1" w:unhideWhenUsed="1"/>
   </w:latentStyles>
   <w:style w:type="paragraph" w:default="1" w:styleId="Norml">
     <w:name w:val="Normal"/>

</xml_diff>

<commit_message>
Updated documentation about this
</commit_message>
<xml_diff>
--- a/documentation.docx
+++ b/documentation.docx
@@ -40,29 +40,27 @@
           <w:sz w:val="40"/>
           <w:szCs w:val="40"/>
         </w:rPr>
-        <w:t xml:space="preserve">Alkalmazás neve: </w:t>
-      </w:r>
-      <w:proofErr w:type="spellStart"/>
-      <w:r>
+        <w:t>Alkalmazás neve: BláthyFM</w:t>
+      </w:r>
+    </w:p>
+    <w:p>
+      <w:pPr>
         <w:rPr>
           <w:rFonts w:ascii="Times New Roman" w:hAnsi="Times New Roman" w:cs="Times New Roman"/>
           <w:bCs/>
           <w:sz w:val="40"/>
           <w:szCs w:val="40"/>
         </w:rPr>
-        <w:t>BláthyFM</w:t>
-      </w:r>
-      <w:proofErr w:type="spellEnd"/>
-    </w:p>
-    <w:p>
-      <w:pPr>
+      </w:pPr>
+      <w:r>
         <w:rPr>
           <w:rFonts w:ascii="Times New Roman" w:hAnsi="Times New Roman" w:cs="Times New Roman"/>
           <w:bCs/>
           <w:sz w:val="40"/>
           <w:szCs w:val="40"/>
         </w:rPr>
-      </w:pPr>
+        <w:t>Tagok:</w:t>
+      </w:r>
       <w:r>
         <w:rPr>
           <w:rFonts w:ascii="Times New Roman" w:hAnsi="Times New Roman" w:cs="Times New Roman"/>
@@ -70,18 +68,19 @@
           <w:sz w:val="40"/>
           <w:szCs w:val="40"/>
         </w:rPr>
-        <w:t>Tagok:</w:t>
-      </w:r>
-      <w:r>
+        <w:t xml:space="preserve"> Susán Csongor, El-Nabulsy Csongor Alan</w:t>
+      </w:r>
+    </w:p>
+    <w:p>
+      <w:pPr>
+        <w:spacing w:after="960"/>
         <w:rPr>
           <w:rFonts w:ascii="Times New Roman" w:hAnsi="Times New Roman" w:cs="Times New Roman"/>
           <w:bCs/>
           <w:sz w:val="40"/>
           <w:szCs w:val="40"/>
         </w:rPr>
-        <w:t xml:space="preserve"> Susán Csongor, El-</w:t>
-      </w:r>
-      <w:proofErr w:type="spellStart"/>
+      </w:pPr>
       <w:r>
         <w:rPr>
           <w:rFonts w:ascii="Times New Roman" w:hAnsi="Times New Roman" w:cs="Times New Roman"/>
@@ -89,57 +88,7 @@
           <w:sz w:val="40"/>
           <w:szCs w:val="40"/>
         </w:rPr>
-        <w:t>Nabulsy</w:t>
-      </w:r>
-      <w:proofErr w:type="spellEnd"/>
-      <w:r>
-        <w:rPr>
-          <w:rFonts w:ascii="Times New Roman" w:hAnsi="Times New Roman" w:cs="Times New Roman"/>
-          <w:bCs/>
-          <w:sz w:val="40"/>
-          <w:szCs w:val="40"/>
-        </w:rPr>
-        <w:t xml:space="preserve"> Csongor Alan</w:t>
-      </w:r>
-    </w:p>
-    <w:p>
-      <w:pPr>
-        <w:spacing w:after="960"/>
-        <w:rPr>
-          <w:rFonts w:ascii="Times New Roman" w:hAnsi="Times New Roman" w:cs="Times New Roman"/>
-          <w:bCs/>
-          <w:sz w:val="40"/>
-          <w:szCs w:val="40"/>
-        </w:rPr>
-      </w:pPr>
-      <w:r>
-        <w:rPr>
-          <w:rFonts w:ascii="Times New Roman" w:hAnsi="Times New Roman" w:cs="Times New Roman"/>
-          <w:bCs/>
-          <w:sz w:val="40"/>
-          <w:szCs w:val="40"/>
-        </w:rPr>
-        <w:t>Az alkalmazás célja az, hogy a Bláthy-</w:t>
-      </w:r>
-      <w:proofErr w:type="spellStart"/>
-      <w:r>
-        <w:rPr>
-          <w:rFonts w:ascii="Times New Roman" w:hAnsi="Times New Roman" w:cs="Times New Roman"/>
-          <w:bCs/>
-          <w:sz w:val="40"/>
-          <w:szCs w:val="40"/>
-        </w:rPr>
-        <w:t>ba</w:t>
-      </w:r>
-      <w:proofErr w:type="spellEnd"/>
-      <w:r>
-        <w:rPr>
-          <w:rFonts w:ascii="Times New Roman" w:hAnsi="Times New Roman" w:cs="Times New Roman"/>
-          <w:bCs/>
-          <w:sz w:val="40"/>
-          <w:szCs w:val="40"/>
-        </w:rPr>
-        <w:t xml:space="preserve"> járó diákok előre meghatározott szünetekben kedvenc zenéjüket tudják majd hallgatni anélkül, hogy nekik kelljen azt maguknak vagy másoknak lejátszani. Ráadásul az, hogy az iskola az ő zenéjüket játssza, akár egy általuk kijelölt időpontban (ezt üzenetben írhatják le), még több élményt ad, és azt az érzést, hogy a zenéjük – és ezzel együtt önmaguk is – meg van becsülve.</w:t>
+        <w:t>Az alkalmazás célja az, hogy a Bláthy-ba járó diákok előre meghatározott szünetekben kedvenc zenéjüket tudják majd hallgatni anélkül, hogy nekik kelljen azt maguknak vagy másoknak lejátszani. Ráadásul az, hogy az iskola az ő zenéjüket játssza, akár egy általuk kijelölt időpontban (ezt üzenetben írhatják le), még több élményt ad, és azt az érzést, hogy a zenéjük – és ezzel együtt önmaguk is – meg van becsülve.</w:t>
       </w:r>
     </w:p>
     <w:p>
@@ -612,25 +561,7 @@
           <w:sz w:val="36"/>
           <w:szCs w:val="36"/>
         </w:rPr>
-        <w:t xml:space="preserve">Az alkalmazás fejlesztését tartalmazó dokumentáció elkezdése, vizsgafeltételek tanulmányozása, a projektet tároló </w:t>
-      </w:r>
-      <w:proofErr w:type="spellStart"/>
-      <w:r>
-        <w:rPr>
-          <w:rFonts w:ascii="Times New Roman" w:hAnsi="Times New Roman" w:cs="Times New Roman"/>
-          <w:sz w:val="36"/>
-          <w:szCs w:val="36"/>
-        </w:rPr>
-        <w:t>repository</w:t>
-      </w:r>
-      <w:proofErr w:type="spellEnd"/>
-      <w:r>
-        <w:rPr>
-          <w:rFonts w:ascii="Times New Roman" w:hAnsi="Times New Roman" w:cs="Times New Roman"/>
-          <w:sz w:val="36"/>
-          <w:szCs w:val="36"/>
-        </w:rPr>
-        <w:t xml:space="preserve"> létrehozása, teszteknek külön dokumentáció létrehozása.</w:t>
+        <w:t>Az alkalmazás fejlesztését tartalmazó dokumentáció elkezdése, vizsgafeltételek tanulmányozása, a projektet tároló repository létrehozása, teszteknek külön dokumentáció létrehozása.</w:t>
       </w:r>
     </w:p>
     <w:p>
@@ -1298,7 +1229,7 @@
           <w:szCs w:val="36"/>
         </w:rPr>
         <w:drawing>
-          <wp:inline distT="0" distB="0" distL="0" distR="0" wp14:anchorId="78A43544" wp14:editId="66A813C4">
+          <wp:inline distT="0" distB="0" distL="0" distR="0" wp14:anchorId="78A43544" wp14:editId="3D4EC1E0">
             <wp:extent cx="3166535" cy="1781175"/>
             <wp:effectExtent l="0" t="0" r="0" b="0"/>
             <wp:docPr id="3" name="Kép 3" descr="C:\Users\elnabulsy.csongor\AppData\Local\Microsoft\Windows\INetCache\Content.MSO\F75754B3.tmp"/>
@@ -1390,7 +1321,7 @@
           <w:szCs w:val="36"/>
         </w:rPr>
         <w:drawing>
-          <wp:inline distT="0" distB="0" distL="0" distR="0" wp14:anchorId="4E211814" wp14:editId="7219E661">
+          <wp:inline distT="0" distB="0" distL="0" distR="0" wp14:anchorId="4E211814" wp14:editId="777E2498">
             <wp:extent cx="3133725" cy="1762720"/>
             <wp:effectExtent l="0" t="0" r="0" b="9525"/>
             <wp:docPr id="4" name="Kép 4" descr="C:\Users\elnabulsy.csongor\Downloads\ui_main_student.png"/>
@@ -1472,7 +1403,7 @@
           <w:szCs w:val="36"/>
         </w:rPr>
         <w:drawing>
-          <wp:inline distT="0" distB="0" distL="0" distR="0" wp14:anchorId="5137FB78" wp14:editId="68507809">
+          <wp:inline distT="0" distB="0" distL="0" distR="0" wp14:anchorId="5137FB78" wp14:editId="0275AD18">
             <wp:extent cx="3166110" cy="1780938"/>
             <wp:effectExtent l="0" t="0" r="0" b="0"/>
             <wp:docPr id="5" name="Kép 5" descr="C:\Users\elnabulsy.csongor\Downloads\ui_main_scheduler.png"/>
@@ -1535,25 +1466,7 @@
           <w:sz w:val="36"/>
           <w:szCs w:val="36"/>
         </w:rPr>
-        <w:t xml:space="preserve">Főképernyő </w:t>
-      </w:r>
-      <w:proofErr w:type="spellStart"/>
-      <w:r>
-        <w:rPr>
-          <w:rFonts w:ascii="Times New Roman" w:eastAsia="Times New Roman" w:hAnsi="Times New Roman" w:cs="Times New Roman"/>
-          <w:sz w:val="36"/>
-          <w:szCs w:val="36"/>
-        </w:rPr>
-        <w:t>admin</w:t>
-      </w:r>
-      <w:proofErr w:type="spellEnd"/>
-      <w:r>
-        <w:rPr>
-          <w:rFonts w:ascii="Times New Roman" w:eastAsia="Times New Roman" w:hAnsi="Times New Roman" w:cs="Times New Roman"/>
-          <w:sz w:val="36"/>
-          <w:szCs w:val="36"/>
-        </w:rPr>
-        <w:t xml:space="preserve"> ranggal:</w:t>
+        <w:t>Főképernyő admin ranggal:</w:t>
       </w:r>
     </w:p>
     <w:p>
@@ -1583,7 +1496,7 @@
           <w:szCs w:val="36"/>
         </w:rPr>
         <w:drawing>
-          <wp:inline distT="0" distB="0" distL="0" distR="0" wp14:anchorId="27EC1C67" wp14:editId="09B7B968">
+          <wp:inline distT="0" distB="0" distL="0" distR="0" wp14:anchorId="27EC1C67" wp14:editId="407C7A89">
             <wp:extent cx="3055620" cy="1718786"/>
             <wp:effectExtent l="0" t="0" r="0" b="0"/>
             <wp:docPr id="6" name="Kép 6" descr="C:\Users\elnabulsy.csongor\Downloads\ui_main_admin.png"/>
@@ -1665,7 +1578,7 @@
           <w:szCs w:val="36"/>
         </w:rPr>
         <w:drawing>
-          <wp:inline distT="0" distB="0" distL="0" distR="0" wp14:anchorId="08225B4F" wp14:editId="2C59BD16">
+          <wp:inline distT="0" distB="0" distL="0" distR="0" wp14:anchorId="08225B4F" wp14:editId="299B28E4">
             <wp:extent cx="2933700" cy="1942430"/>
             <wp:effectExtent l="0" t="0" r="0" b="1270"/>
             <wp:docPr id="7" name="Kép 7" descr="C:\Users\elnabulsy.csongor\Downloads\ui_structure.png"/>
@@ -1838,7 +1751,7 @@
           <w:szCs w:val="36"/>
         </w:rPr>
         <w:drawing>
-          <wp:inline distT="0" distB="0" distL="0" distR="0" wp14:anchorId="2C256DB5" wp14:editId="46224910">
+          <wp:inline distT="0" distB="0" distL="0" distR="0" wp14:anchorId="2C256DB5" wp14:editId="3512B449">
             <wp:extent cx="3329940" cy="1752493"/>
             <wp:effectExtent l="0" t="0" r="3810" b="635"/>
             <wp:docPr id="9" name="Kép 9"/>
@@ -2009,25 +1922,7 @@
           <w:sz w:val="36"/>
           <w:szCs w:val="36"/>
         </w:rPr>
-        <w:t xml:space="preserve">Az </w:t>
-      </w:r>
-      <w:proofErr w:type="spellStart"/>
-      <w:r>
-        <w:rPr>
-          <w:rFonts w:ascii="Times New Roman" w:eastAsia="Times New Roman" w:hAnsi="Times New Roman" w:cs="Times New Roman"/>
-          <w:sz w:val="36"/>
-          <w:szCs w:val="36"/>
-        </w:rPr>
-        <w:t>admin</w:t>
-      </w:r>
-      <w:proofErr w:type="spellEnd"/>
-      <w:r>
-        <w:rPr>
-          <w:rFonts w:ascii="Times New Roman" w:eastAsia="Times New Roman" w:hAnsi="Times New Roman" w:cs="Times New Roman"/>
-          <w:sz w:val="36"/>
-          <w:szCs w:val="36"/>
-        </w:rPr>
-        <w:t xml:space="preserve"> UI oldal megtervezése digitális </w:t>
+        <w:t xml:space="preserve">Az admin UI oldal megtervezése digitális </w:t>
       </w:r>
       <w:r>
         <w:rPr>
@@ -2046,23 +1941,13 @@
           <w:szCs w:val="36"/>
         </w:rPr>
       </w:pPr>
-      <w:proofErr w:type="spellStart"/>
-      <w:r>
-        <w:rPr>
-          <w:rFonts w:ascii="Times New Roman" w:eastAsia="Times New Roman" w:hAnsi="Times New Roman" w:cs="Times New Roman"/>
-          <w:sz w:val="36"/>
-          <w:szCs w:val="36"/>
-        </w:rPr>
-        <w:t>Admin</w:t>
-      </w:r>
-      <w:proofErr w:type="spellEnd"/>
-      <w:r>
-        <w:rPr>
-          <w:rFonts w:ascii="Times New Roman" w:eastAsia="Times New Roman" w:hAnsi="Times New Roman" w:cs="Times New Roman"/>
-          <w:sz w:val="36"/>
-          <w:szCs w:val="36"/>
-        </w:rPr>
-        <w:t xml:space="preserve"> oldal:</w:t>
+      <w:r>
+        <w:rPr>
+          <w:rFonts w:ascii="Times New Roman" w:eastAsia="Times New Roman" w:hAnsi="Times New Roman" w:cs="Times New Roman"/>
+          <w:sz w:val="36"/>
+          <w:szCs w:val="36"/>
+        </w:rPr>
+        <w:t>Admin oldal:</w:t>
       </w:r>
     </w:p>
     <w:p>
@@ -2296,42 +2181,15 @@
           <w:sz w:val="36"/>
           <w:szCs w:val="36"/>
         </w:rPr>
-        <w:t xml:space="preserve">, </w:t>
-      </w:r>
-      <w:proofErr w:type="spellStart"/>
-      <w:r>
-        <w:rPr>
-          <w:rFonts w:ascii="Times New Roman" w:eastAsia="Times New Roman" w:hAnsi="Times New Roman" w:cs="Times New Roman"/>
-          <w:sz w:val="36"/>
-          <w:szCs w:val="36"/>
-        </w:rPr>
-        <w:t>Vue</w:t>
-      </w:r>
-      <w:proofErr w:type="spellEnd"/>
-      <w:r>
-        <w:rPr>
-          <w:rFonts w:ascii="Times New Roman" w:eastAsia="Times New Roman" w:hAnsi="Times New Roman" w:cs="Times New Roman"/>
-          <w:sz w:val="36"/>
-          <w:szCs w:val="36"/>
-        </w:rPr>
-        <w:t xml:space="preserve"> router</w:t>
-      </w:r>
-      <w:r>
-        <w:rPr>
-          <w:rFonts w:ascii="Times New Roman" w:eastAsia="Times New Roman" w:hAnsi="Times New Roman" w:cs="Times New Roman"/>
-          <w:sz w:val="36"/>
-          <w:szCs w:val="36"/>
-        </w:rPr>
-        <w:t xml:space="preserve">) létrehozása </w:t>
-      </w:r>
-      <w:proofErr w:type="spellStart"/>
-      <w:r>
-        <w:rPr>
-          <w:rFonts w:ascii="Times New Roman" w:eastAsia="Times New Roman" w:hAnsi="Times New Roman" w:cs="Times New Roman"/>
-          <w:sz w:val="36"/>
-          <w:szCs w:val="36"/>
-        </w:rPr>
-        <w:t>frontend</w:t>
+        <w:t>, Vue router</w:t>
+      </w:r>
+      <w:r>
+        <w:rPr>
+          <w:rFonts w:ascii="Times New Roman" w:eastAsia="Times New Roman" w:hAnsi="Times New Roman" w:cs="Times New Roman"/>
+          <w:sz w:val="36"/>
+          <w:szCs w:val="36"/>
+        </w:rPr>
+        <w:t>) létrehozása frontend</w:t>
       </w:r>
       <w:r>
         <w:rPr>
@@ -2341,7 +2199,6 @@
         </w:rPr>
         <w:t>Part</w:t>
       </w:r>
-      <w:proofErr w:type="spellEnd"/>
       <w:r>
         <w:rPr>
           <w:rFonts w:ascii="Times New Roman" w:eastAsia="Times New Roman" w:hAnsi="Times New Roman" w:cs="Times New Roman"/>
@@ -2394,23 +2251,13 @@
           <w:szCs w:val="36"/>
         </w:rPr>
       </w:pPr>
-      <w:proofErr w:type="spellStart"/>
-      <w:r>
-        <w:rPr>
-          <w:rFonts w:ascii="Times New Roman" w:eastAsia="Times New Roman" w:hAnsi="Times New Roman" w:cs="Times New Roman"/>
-          <w:sz w:val="36"/>
-          <w:szCs w:val="36"/>
-        </w:rPr>
-        <w:t>route</w:t>
-      </w:r>
-      <w:proofErr w:type="spellEnd"/>
-      <w:r>
-        <w:rPr>
-          <w:rFonts w:ascii="Times New Roman" w:eastAsia="Times New Roman" w:hAnsi="Times New Roman" w:cs="Times New Roman"/>
-          <w:sz w:val="36"/>
-          <w:szCs w:val="36"/>
-        </w:rPr>
-        <w:t>-ok definiálása</w:t>
+      <w:r>
+        <w:rPr>
+          <w:rFonts w:ascii="Times New Roman" w:eastAsia="Times New Roman" w:hAnsi="Times New Roman" w:cs="Times New Roman"/>
+          <w:sz w:val="36"/>
+          <w:szCs w:val="36"/>
+        </w:rPr>
+        <w:t>route-ok definiálása</w:t>
       </w:r>
     </w:p>
     <w:p>
@@ -2426,34 +2273,14 @@
           <w:szCs w:val="36"/>
         </w:rPr>
       </w:pPr>
-      <w:proofErr w:type="spellStart"/>
-      <w:r>
-        <w:rPr>
-          <w:rFonts w:ascii="Times New Roman" w:eastAsia="Times New Roman" w:hAnsi="Times New Roman" w:cs="Times New Roman"/>
-          <w:sz w:val="36"/>
-          <w:szCs w:val="36"/>
-        </w:rPr>
-        <w:t>header</w:t>
-      </w:r>
-      <w:proofErr w:type="spellEnd"/>
-      <w:r>
-        <w:rPr>
-          <w:rFonts w:ascii="Times New Roman" w:eastAsia="Times New Roman" w:hAnsi="Times New Roman" w:cs="Times New Roman"/>
-          <w:sz w:val="36"/>
-          <w:szCs w:val="36"/>
-        </w:rPr>
-        <w:t xml:space="preserve"> és </w:t>
-      </w:r>
-      <w:proofErr w:type="spellStart"/>
-      <w:r>
-        <w:rPr>
-          <w:rFonts w:ascii="Times New Roman" w:eastAsia="Times New Roman" w:hAnsi="Times New Roman" w:cs="Times New Roman"/>
-          <w:sz w:val="36"/>
-          <w:szCs w:val="36"/>
-        </w:rPr>
-        <w:t>footer</w:t>
-      </w:r>
-      <w:proofErr w:type="spellEnd"/>
+      <w:r>
+        <w:rPr>
+          <w:rFonts w:ascii="Times New Roman" w:eastAsia="Times New Roman" w:hAnsi="Times New Roman" w:cs="Times New Roman"/>
+          <w:sz w:val="36"/>
+          <w:szCs w:val="36"/>
+        </w:rPr>
+        <w:t>header és footer</w:t>
+      </w:r>
       <w:r>
         <w:rPr>
           <w:rFonts w:ascii="Times New Roman" w:eastAsia="Times New Roman" w:hAnsi="Times New Roman" w:cs="Times New Roman"/>
@@ -2484,41 +2311,13 @@
           <w:szCs w:val="36"/>
         </w:rPr>
       </w:pPr>
-      <w:proofErr w:type="spellStart"/>
-      <w:r>
-        <w:rPr>
-          <w:rFonts w:ascii="Times New Roman" w:eastAsia="Times New Roman" w:hAnsi="Times New Roman" w:cs="Times New Roman"/>
-          <w:sz w:val="36"/>
-          <w:szCs w:val="36"/>
-        </w:rPr>
-        <w:t>header</w:t>
-      </w:r>
-      <w:proofErr w:type="spellEnd"/>
-      <w:r>
-        <w:rPr>
-          <w:rFonts w:ascii="Times New Roman" w:eastAsia="Times New Roman" w:hAnsi="Times New Roman" w:cs="Times New Roman"/>
-          <w:sz w:val="36"/>
-          <w:szCs w:val="36"/>
-        </w:rPr>
-        <w:t>-main-</w:t>
-      </w:r>
-      <w:proofErr w:type="spellStart"/>
-      <w:r>
-        <w:rPr>
-          <w:rFonts w:ascii="Times New Roman" w:eastAsia="Times New Roman" w:hAnsi="Times New Roman" w:cs="Times New Roman"/>
-          <w:sz w:val="36"/>
-          <w:szCs w:val="36"/>
-        </w:rPr>
-        <w:t>footer</w:t>
-      </w:r>
-      <w:proofErr w:type="spellEnd"/>
-      <w:r>
-        <w:rPr>
-          <w:rFonts w:ascii="Times New Roman" w:eastAsia="Times New Roman" w:hAnsi="Times New Roman" w:cs="Times New Roman"/>
-          <w:sz w:val="36"/>
-          <w:szCs w:val="36"/>
-        </w:rPr>
-        <w:t>-struktúra létrehozása</w:t>
+      <w:r>
+        <w:rPr>
+          <w:rFonts w:ascii="Times New Roman" w:eastAsia="Times New Roman" w:hAnsi="Times New Roman" w:cs="Times New Roman"/>
+          <w:sz w:val="36"/>
+          <w:szCs w:val="36"/>
+        </w:rPr>
+        <w:t>header-main-footer-struktúra létrehozása</w:t>
       </w:r>
     </w:p>
     <w:p>
@@ -2558,25 +2357,7 @@
           <w:sz w:val="36"/>
           <w:szCs w:val="36"/>
         </w:rPr>
-        <w:t>A projektet El-</w:t>
-      </w:r>
-      <w:proofErr w:type="spellStart"/>
-      <w:r>
-        <w:rPr>
-          <w:rFonts w:ascii="Times New Roman" w:eastAsia="Times New Roman" w:hAnsi="Times New Roman" w:cs="Times New Roman"/>
-          <w:sz w:val="36"/>
-          <w:szCs w:val="36"/>
-        </w:rPr>
-        <w:t>Nabulsy</w:t>
-      </w:r>
-      <w:proofErr w:type="spellEnd"/>
-      <w:r>
-        <w:rPr>
-          <w:rFonts w:ascii="Times New Roman" w:eastAsia="Times New Roman" w:hAnsi="Times New Roman" w:cs="Times New Roman"/>
-          <w:sz w:val="36"/>
-          <w:szCs w:val="36"/>
-        </w:rPr>
-        <w:t xml:space="preserve"> Csongor hozta létre és írta meg a kódját, a működéshez szükséges folyamatábrákat, az adatbázis ER-diagramját</w:t>
+        <w:t>A projektet El-Nabulsy Csongor hozta létre és írta meg a kódját, a működéshez szükséges folyamatábrákat, az adatbázis ER-diagramját</w:t>
       </w:r>
       <w:r>
         <w:rPr>
@@ -2659,25 +2440,7 @@
           <w:sz w:val="36"/>
           <w:szCs w:val="36"/>
         </w:rPr>
-        <w:t xml:space="preserve">(Susán Csongor) A </w:t>
-      </w:r>
-      <w:proofErr w:type="spellStart"/>
-      <w:r>
-        <w:rPr>
-          <w:rFonts w:ascii="Times New Roman" w:eastAsia="Times New Roman" w:hAnsi="Times New Roman" w:cs="Times New Roman"/>
-          <w:sz w:val="36"/>
-          <w:szCs w:val="36"/>
-        </w:rPr>
-        <w:t>frontendPart</w:t>
-      </w:r>
-      <w:proofErr w:type="spellEnd"/>
-      <w:r>
-        <w:rPr>
-          <w:rFonts w:ascii="Times New Roman" w:eastAsia="Times New Roman" w:hAnsi="Times New Roman" w:cs="Times New Roman"/>
-          <w:sz w:val="36"/>
-          <w:szCs w:val="36"/>
-        </w:rPr>
-        <w:t xml:space="preserve"> projekt átnézése, stílus hi</w:t>
+        <w:t>(Susán Csongor) A frontendPart projekt átnézése, stílus hi</w:t>
       </w:r>
       <w:r>
         <w:rPr>
@@ -2788,25 +2551,7 @@
           <w:sz w:val="36"/>
           <w:szCs w:val="36"/>
         </w:rPr>
-        <w:t>(El-</w:t>
-      </w:r>
-      <w:proofErr w:type="spellStart"/>
-      <w:r>
-        <w:rPr>
-          <w:rFonts w:ascii="Times New Roman" w:eastAsia="Times New Roman" w:hAnsi="Times New Roman" w:cs="Times New Roman"/>
-          <w:sz w:val="36"/>
-          <w:szCs w:val="36"/>
-        </w:rPr>
-        <w:t>Nabulsy</w:t>
-      </w:r>
-      <w:proofErr w:type="spellEnd"/>
-      <w:r>
-        <w:rPr>
-          <w:rFonts w:ascii="Times New Roman" w:eastAsia="Times New Roman" w:hAnsi="Times New Roman" w:cs="Times New Roman"/>
-          <w:sz w:val="36"/>
-          <w:szCs w:val="36"/>
-        </w:rPr>
-        <w:t xml:space="preserve"> Csongor Alan</w:t>
+        <w:t>(El-Nabulsy Csongor Alan</w:t>
       </w:r>
       <w:r>
         <w:rPr>
@@ -2830,25 +2575,7 @@
           <w:sz w:val="36"/>
           <w:szCs w:val="36"/>
         </w:rPr>
-        <w:t xml:space="preserve"> (El-</w:t>
-      </w:r>
-      <w:proofErr w:type="spellStart"/>
-      <w:r>
-        <w:rPr>
-          <w:rFonts w:ascii="Times New Roman" w:eastAsia="Times New Roman" w:hAnsi="Times New Roman" w:cs="Times New Roman"/>
-          <w:sz w:val="36"/>
-          <w:szCs w:val="36"/>
-        </w:rPr>
-        <w:t>Nabulsy</w:t>
-      </w:r>
-      <w:proofErr w:type="spellEnd"/>
-      <w:r>
-        <w:rPr>
-          <w:rFonts w:ascii="Times New Roman" w:eastAsia="Times New Roman" w:hAnsi="Times New Roman" w:cs="Times New Roman"/>
-          <w:sz w:val="36"/>
-          <w:szCs w:val="36"/>
-        </w:rPr>
-        <w:t xml:space="preserve">: főoldal és annak </w:t>
+        <w:t xml:space="preserve"> (El-Nabulsy: főoldal és annak </w:t>
       </w:r>
       <w:r>
         <w:rPr>
@@ -2864,25 +2591,7 @@
           <w:sz w:val="36"/>
           <w:szCs w:val="36"/>
         </w:rPr>
-        <w:t xml:space="preserve">variánsa, Susán: login befejezése és </w:t>
-      </w:r>
-      <w:proofErr w:type="spellStart"/>
-      <w:r>
-        <w:rPr>
-          <w:rFonts w:ascii="Times New Roman" w:eastAsia="Times New Roman" w:hAnsi="Times New Roman" w:cs="Times New Roman"/>
-          <w:sz w:val="36"/>
-          <w:szCs w:val="36"/>
-        </w:rPr>
-        <w:t>admin</w:t>
-      </w:r>
-      <w:proofErr w:type="spellEnd"/>
-      <w:r>
-        <w:rPr>
-          <w:rFonts w:ascii="Times New Roman" w:eastAsia="Times New Roman" w:hAnsi="Times New Roman" w:cs="Times New Roman"/>
-          <w:sz w:val="36"/>
-          <w:szCs w:val="36"/>
-        </w:rPr>
-        <w:t xml:space="preserve"> elkezdése, valamint a logika kidolgozásának megkezdése</w:t>
+        <w:t>variánsa, Susán: login befejezése és admin elkezdése, valamint a logika kidolgozásának megkezdése</w:t>
       </w:r>
       <w:r>
         <w:rPr>
@@ -2946,25 +2655,7 @@
           <w:sz w:val="36"/>
           <w:szCs w:val="36"/>
         </w:rPr>
-        <w:t>(El-</w:t>
-      </w:r>
-      <w:proofErr w:type="spellStart"/>
-      <w:r>
-        <w:rPr>
-          <w:rFonts w:ascii="Times New Roman" w:eastAsia="Times New Roman" w:hAnsi="Times New Roman" w:cs="Times New Roman"/>
-          <w:sz w:val="36"/>
-          <w:szCs w:val="36"/>
-        </w:rPr>
-        <w:t>Nabulsy</w:t>
-      </w:r>
-      <w:proofErr w:type="spellEnd"/>
-      <w:r>
-        <w:rPr>
-          <w:rFonts w:ascii="Times New Roman" w:eastAsia="Times New Roman" w:hAnsi="Times New Roman" w:cs="Times New Roman"/>
-          <w:sz w:val="36"/>
-          <w:szCs w:val="36"/>
-        </w:rPr>
-        <w:t xml:space="preserve"> Csongor Alan) A zenebekérő oldal </w:t>
+        <w:t xml:space="preserve">(El-Nabulsy Csongor Alan) A zenebekérő oldal </w:t>
       </w:r>
       <w:r>
         <w:rPr>
@@ -3019,89 +2710,7 @@
           <w:sz w:val="36"/>
           <w:szCs w:val="36"/>
         </w:rPr>
-        <w:t>(El-</w:t>
-      </w:r>
-      <w:proofErr w:type="spellStart"/>
-      <w:r>
-        <w:rPr>
-          <w:rFonts w:ascii="Times New Roman" w:eastAsia="Times New Roman" w:hAnsi="Times New Roman" w:cs="Times New Roman"/>
-          <w:sz w:val="36"/>
-          <w:szCs w:val="36"/>
-        </w:rPr>
-        <w:t>Nabulsy</w:t>
-      </w:r>
-      <w:proofErr w:type="spellEnd"/>
-      <w:r>
-        <w:rPr>
-          <w:rFonts w:ascii="Times New Roman" w:eastAsia="Times New Roman" w:hAnsi="Times New Roman" w:cs="Times New Roman"/>
-          <w:sz w:val="36"/>
-          <w:szCs w:val="36"/>
-        </w:rPr>
-        <w:t xml:space="preserve"> Csongor Alan) Főbb </w:t>
-      </w:r>
-      <w:proofErr w:type="gramStart"/>
-      <w:r>
-        <w:rPr>
-          <w:rFonts w:ascii="Times New Roman" w:eastAsia="Times New Roman" w:hAnsi="Times New Roman" w:cs="Times New Roman"/>
-          <w:sz w:val="36"/>
-          <w:szCs w:val="36"/>
-        </w:rPr>
-        <w:t>nézetek(</w:t>
-      </w:r>
-      <w:proofErr w:type="spellStart"/>
-      <w:proofErr w:type="gramEnd"/>
-      <w:r>
-        <w:rPr>
-          <w:rFonts w:ascii="Times New Roman" w:eastAsia="Times New Roman" w:hAnsi="Times New Roman" w:cs="Times New Roman"/>
-          <w:sz w:val="36"/>
-          <w:szCs w:val="36"/>
-        </w:rPr>
-        <w:t>HomeView</w:t>
-      </w:r>
-      <w:proofErr w:type="spellEnd"/>
-      <w:r>
-        <w:rPr>
-          <w:rFonts w:ascii="Times New Roman" w:eastAsia="Times New Roman" w:hAnsi="Times New Roman" w:cs="Times New Roman"/>
-          <w:sz w:val="36"/>
-          <w:szCs w:val="36"/>
-        </w:rPr>
-        <w:t xml:space="preserve">, </w:t>
-      </w:r>
-      <w:proofErr w:type="spellStart"/>
-      <w:r>
-        <w:rPr>
-          <w:rFonts w:ascii="Times New Roman" w:eastAsia="Times New Roman" w:hAnsi="Times New Roman" w:cs="Times New Roman"/>
-          <w:sz w:val="36"/>
-          <w:szCs w:val="36"/>
-        </w:rPr>
-        <w:t>StudentHomePage</w:t>
-      </w:r>
-      <w:proofErr w:type="spellEnd"/>
-      <w:r>
-        <w:rPr>
-          <w:rFonts w:ascii="Times New Roman" w:eastAsia="Times New Roman" w:hAnsi="Times New Roman" w:cs="Times New Roman"/>
-          <w:sz w:val="36"/>
-          <w:szCs w:val="36"/>
-        </w:rPr>
-        <w:t xml:space="preserve">, </w:t>
-      </w:r>
-      <w:proofErr w:type="spellStart"/>
-      <w:r>
-        <w:rPr>
-          <w:rFonts w:ascii="Times New Roman" w:eastAsia="Times New Roman" w:hAnsi="Times New Roman" w:cs="Times New Roman"/>
-          <w:sz w:val="36"/>
-          <w:szCs w:val="36"/>
-        </w:rPr>
-        <w:t>SchedulerView</w:t>
-      </w:r>
-      <w:proofErr w:type="spellEnd"/>
-      <w:r>
-        <w:rPr>
-          <w:rFonts w:ascii="Times New Roman" w:eastAsia="Times New Roman" w:hAnsi="Times New Roman" w:cs="Times New Roman"/>
-          <w:sz w:val="36"/>
-          <w:szCs w:val="36"/>
-        </w:rPr>
-        <w:t>) szerkezetének kialakítása és a komponensek működésének ellenőrzése, a felhasználói felület stílusának kialakítása, hogy az oldal elrendezése megfeleljen a megtervezett UI-terveknek.</w:t>
+        <w:t>(El-Nabulsy Csongor Alan) Főbb nézetek(HomeView, StudentHomePage, SchedulerView) szerkezetének kialakítása és a komponensek működésének ellenőrzése, a felhasználói felület stílusának kialakítása, hogy az oldal elrendezése megfeleljen a megtervezett UI-terveknek.</w:t>
       </w:r>
     </w:p>
     <w:p>
@@ -3186,25 +2795,7 @@
           <w:sz w:val="36"/>
           <w:szCs w:val="36"/>
         </w:rPr>
-        <w:t xml:space="preserve">, a routerben a főoldalak variánsainak gyerek </w:t>
-      </w:r>
-      <w:proofErr w:type="spellStart"/>
-      <w:r>
-        <w:rPr>
-          <w:rFonts w:ascii="Times New Roman" w:eastAsia="Times New Roman" w:hAnsi="Times New Roman" w:cs="Times New Roman"/>
-          <w:sz w:val="36"/>
-          <w:szCs w:val="36"/>
-        </w:rPr>
-        <w:t>route</w:t>
-      </w:r>
-      <w:proofErr w:type="spellEnd"/>
-      <w:r>
-        <w:rPr>
-          <w:rFonts w:ascii="Times New Roman" w:eastAsia="Times New Roman" w:hAnsi="Times New Roman" w:cs="Times New Roman"/>
-          <w:sz w:val="36"/>
-          <w:szCs w:val="36"/>
-        </w:rPr>
-        <w:t xml:space="preserve">-okba </w:t>
+        <w:t xml:space="preserve">, a routerben a főoldalak variánsainak gyerek route-okba </w:t>
       </w:r>
       <w:r>
         <w:rPr>
@@ -3229,51 +2820,15 @@
           <w:sz w:val="36"/>
           <w:szCs w:val="36"/>
         </w:rPr>
-        <w:t xml:space="preserve">, az új szabvány mintájára az </w:t>
-      </w:r>
-      <w:proofErr w:type="spellStart"/>
-      <w:r>
-        <w:rPr>
-          <w:rFonts w:ascii="Times New Roman" w:eastAsia="Times New Roman" w:hAnsi="Times New Roman" w:cs="Times New Roman"/>
-          <w:sz w:val="36"/>
-          <w:szCs w:val="36"/>
-        </w:rPr>
-        <w:t>admin</w:t>
-      </w:r>
-      <w:proofErr w:type="spellEnd"/>
-      <w:r>
-        <w:rPr>
-          <w:rFonts w:ascii="Times New Roman" w:eastAsia="Times New Roman" w:hAnsi="Times New Roman" w:cs="Times New Roman"/>
-          <w:sz w:val="36"/>
-          <w:szCs w:val="36"/>
-        </w:rPr>
-        <w:t xml:space="preserve"> nézet (gombok és rövid leírás azok alá) létrehozása</w:t>
-      </w:r>
-      <w:r>
-        <w:rPr>
-          <w:rFonts w:ascii="Times New Roman" w:eastAsia="Times New Roman" w:hAnsi="Times New Roman" w:cs="Times New Roman"/>
-          <w:sz w:val="36"/>
-          <w:szCs w:val="36"/>
-        </w:rPr>
-        <w:t xml:space="preserve">, felesleges import mezők kiszedése az </w:t>
-      </w:r>
-      <w:proofErr w:type="spellStart"/>
-      <w:r>
-        <w:rPr>
-          <w:rFonts w:ascii="Times New Roman" w:eastAsia="Times New Roman" w:hAnsi="Times New Roman" w:cs="Times New Roman"/>
-          <w:sz w:val="36"/>
-          <w:szCs w:val="36"/>
-        </w:rPr>
-        <w:t>App.vue</w:t>
-      </w:r>
-      <w:proofErr w:type="spellEnd"/>
-      <w:r>
-        <w:rPr>
-          <w:rFonts w:ascii="Times New Roman" w:eastAsia="Times New Roman" w:hAnsi="Times New Roman" w:cs="Times New Roman"/>
-          <w:sz w:val="36"/>
-          <w:szCs w:val="36"/>
-        </w:rPr>
-        <w:t xml:space="preserve"> fájlból</w:t>
+        <w:t>, az új szabvány mintájára az admin nézet (gombok és rövid leírás azok alá) létrehozása</w:t>
+      </w:r>
+      <w:r>
+        <w:rPr>
+          <w:rFonts w:ascii="Times New Roman" w:eastAsia="Times New Roman" w:hAnsi="Times New Roman" w:cs="Times New Roman"/>
+          <w:sz w:val="36"/>
+          <w:szCs w:val="36"/>
+        </w:rPr>
+        <w:t>, felesleges import mezők kiszedése az App.vue fájlból</w:t>
       </w:r>
     </w:p>
     <w:p>
@@ -3390,114 +2945,15 @@
           <w:sz w:val="36"/>
           <w:szCs w:val="36"/>
         </w:rPr>
-        <w:t>(Susán Csongor György, El-</w:t>
-      </w:r>
-      <w:proofErr w:type="spellStart"/>
-      <w:r>
-        <w:rPr>
-          <w:rFonts w:ascii="Times New Roman" w:eastAsia="Times New Roman" w:hAnsi="Times New Roman" w:cs="Times New Roman"/>
-          <w:sz w:val="36"/>
-          <w:szCs w:val="36"/>
-        </w:rPr>
-        <w:t>Nabulsy</w:t>
-      </w:r>
-      <w:proofErr w:type="spellEnd"/>
-      <w:r>
-        <w:rPr>
-          <w:rFonts w:ascii="Times New Roman" w:eastAsia="Times New Roman" w:hAnsi="Times New Roman" w:cs="Times New Roman"/>
-          <w:sz w:val="36"/>
-          <w:szCs w:val="36"/>
-        </w:rPr>
-        <w:t xml:space="preserve"> Csongor Alan)</w:t>
-      </w:r>
-      <w:r>
-        <w:rPr>
-          <w:rFonts w:ascii="Times New Roman" w:eastAsia="Times New Roman" w:hAnsi="Times New Roman" w:cs="Times New Roman"/>
-          <w:sz w:val="36"/>
-          <w:szCs w:val="36"/>
-        </w:rPr>
-        <w:t xml:space="preserve"> Nézetek végleges kialakítása (El-</w:t>
-      </w:r>
-      <w:proofErr w:type="spellStart"/>
-      <w:r>
-        <w:rPr>
-          <w:rFonts w:ascii="Times New Roman" w:eastAsia="Times New Roman" w:hAnsi="Times New Roman" w:cs="Times New Roman"/>
-          <w:sz w:val="36"/>
-          <w:szCs w:val="36"/>
-        </w:rPr>
-        <w:t>Nabulsy</w:t>
-      </w:r>
-      <w:proofErr w:type="spellEnd"/>
-      <w:r>
-        <w:rPr>
-          <w:rFonts w:ascii="Times New Roman" w:eastAsia="Times New Roman" w:hAnsi="Times New Roman" w:cs="Times New Roman"/>
-          <w:sz w:val="36"/>
-          <w:szCs w:val="36"/>
-        </w:rPr>
-        <w:t xml:space="preserve">: </w:t>
-      </w:r>
-      <w:proofErr w:type="spellStart"/>
-      <w:r>
-        <w:rPr>
-          <w:rFonts w:ascii="Times New Roman" w:eastAsia="Times New Roman" w:hAnsi="Times New Roman" w:cs="Times New Roman"/>
-          <w:sz w:val="36"/>
-          <w:szCs w:val="36"/>
-        </w:rPr>
-        <w:t>HomeView</w:t>
-      </w:r>
-      <w:proofErr w:type="spellEnd"/>
-      <w:r>
-        <w:rPr>
-          <w:rFonts w:ascii="Times New Roman" w:eastAsia="Times New Roman" w:hAnsi="Times New Roman" w:cs="Times New Roman"/>
-          <w:sz w:val="36"/>
-          <w:szCs w:val="36"/>
-        </w:rPr>
-        <w:t xml:space="preserve">, </w:t>
-      </w:r>
-      <w:proofErr w:type="spellStart"/>
-      <w:r>
-        <w:rPr>
-          <w:rFonts w:ascii="Times New Roman" w:eastAsia="Times New Roman" w:hAnsi="Times New Roman" w:cs="Times New Roman"/>
-          <w:sz w:val="36"/>
-          <w:szCs w:val="36"/>
-        </w:rPr>
-        <w:t>RequestView</w:t>
-      </w:r>
-      <w:proofErr w:type="spellEnd"/>
-      <w:r>
-        <w:rPr>
-          <w:rFonts w:ascii="Times New Roman" w:eastAsia="Times New Roman" w:hAnsi="Times New Roman" w:cs="Times New Roman"/>
-          <w:sz w:val="36"/>
-          <w:szCs w:val="36"/>
-        </w:rPr>
-        <w:t xml:space="preserve">, </w:t>
-      </w:r>
-      <w:proofErr w:type="spellStart"/>
-      <w:r>
-        <w:rPr>
-          <w:rFonts w:ascii="Times New Roman" w:eastAsia="Times New Roman" w:hAnsi="Times New Roman" w:cs="Times New Roman"/>
-          <w:sz w:val="36"/>
-          <w:szCs w:val="36"/>
-        </w:rPr>
-        <w:t>SendView</w:t>
-      </w:r>
-      <w:proofErr w:type="spellEnd"/>
-      <w:r>
-        <w:rPr>
-          <w:rFonts w:ascii="Times New Roman" w:eastAsia="Times New Roman" w:hAnsi="Times New Roman" w:cs="Times New Roman"/>
-          <w:sz w:val="36"/>
-          <w:szCs w:val="36"/>
-        </w:rPr>
-        <w:t xml:space="preserve">; Susán: főoldalak integrálása a </w:t>
-      </w:r>
-      <w:proofErr w:type="spellStart"/>
-      <w:r>
-        <w:rPr>
-          <w:rFonts w:ascii="Times New Roman" w:eastAsia="Times New Roman" w:hAnsi="Times New Roman" w:cs="Times New Roman"/>
-          <w:sz w:val="36"/>
-          <w:szCs w:val="36"/>
-        </w:rPr>
-        <w:t>HomeLayout</w:t>
+        <w:t>(Susán Csongor György, El-Nabulsy Csongor Alan)</w:t>
+      </w:r>
+      <w:r>
+        <w:rPr>
+          <w:rFonts w:ascii="Times New Roman" w:eastAsia="Times New Roman" w:hAnsi="Times New Roman" w:cs="Times New Roman"/>
+          <w:sz w:val="36"/>
+          <w:szCs w:val="36"/>
+        </w:rPr>
+        <w:t xml:space="preserve"> Nézetek végleges kialakítása (El-Nabulsy: HomeView, RequestView, SendView; Susán: főoldalak integrálása a HomeLayout</w:t>
       </w:r>
       <w:r>
         <w:rPr>
@@ -3513,16 +2969,7 @@
           <w:sz w:val="36"/>
           <w:szCs w:val="36"/>
         </w:rPr>
-        <w:t>ba</w:t>
-      </w:r>
-      <w:proofErr w:type="spellEnd"/>
-      <w:r>
-        <w:rPr>
-          <w:rFonts w:ascii="Times New Roman" w:eastAsia="Times New Roman" w:hAnsi="Times New Roman" w:cs="Times New Roman"/>
-          <w:sz w:val="36"/>
-          <w:szCs w:val="36"/>
-        </w:rPr>
-        <w:t>)</w:t>
+        <w:t>ba)</w:t>
       </w:r>
       <w:r>
         <w:rPr>
@@ -3571,25 +3018,7 @@
           <w:sz w:val="36"/>
           <w:szCs w:val="36"/>
         </w:rPr>
-        <w:t xml:space="preserve">Példa adatok felvétele a </w:t>
-      </w:r>
-      <w:proofErr w:type="spellStart"/>
-      <w:r>
-        <w:rPr>
-          <w:rFonts w:ascii="Times New Roman" w:eastAsia="Times New Roman" w:hAnsi="Times New Roman" w:cs="Times New Roman"/>
-          <w:sz w:val="36"/>
-          <w:szCs w:val="36"/>
-        </w:rPr>
-        <w:t>HomeLayout-ba</w:t>
-      </w:r>
-      <w:proofErr w:type="spellEnd"/>
-      <w:r>
-        <w:rPr>
-          <w:rFonts w:ascii="Times New Roman" w:eastAsia="Times New Roman" w:hAnsi="Times New Roman" w:cs="Times New Roman"/>
-          <w:sz w:val="36"/>
-          <w:szCs w:val="36"/>
-        </w:rPr>
-        <w:t xml:space="preserve"> a helyes működés tesztelésének érdekében</w:t>
+        <w:t>Példa adatok felvétele a HomeLayout-ba a helyes működés tesztelésének érdekében</w:t>
       </w:r>
     </w:p>
     <w:p>
@@ -3637,51 +3066,13 @@
           <w:szCs w:val="36"/>
         </w:rPr>
       </w:pPr>
-      <w:proofErr w:type="spellStart"/>
-      <w:proofErr w:type="gramStart"/>
-      <w:r>
-        <w:rPr>
-          <w:rFonts w:ascii="Times New Roman" w:eastAsia="Times New Roman" w:hAnsi="Times New Roman" w:cs="Times New Roman"/>
-          <w:sz w:val="36"/>
-          <w:szCs w:val="36"/>
-        </w:rPr>
-        <w:t>meta.title</w:t>
-      </w:r>
-      <w:proofErr w:type="gramEnd"/>
-      <w:r>
-        <w:rPr>
-          <w:rFonts w:ascii="Times New Roman" w:eastAsia="Times New Roman" w:hAnsi="Times New Roman" w:cs="Times New Roman"/>
-          <w:sz w:val="36"/>
-          <w:szCs w:val="36"/>
-        </w:rPr>
-        <w:t>-ekben</w:t>
-      </w:r>
-      <w:proofErr w:type="spellEnd"/>
-      <w:r>
-        <w:rPr>
-          <w:rFonts w:ascii="Times New Roman" w:eastAsia="Times New Roman" w:hAnsi="Times New Roman" w:cs="Times New Roman"/>
-          <w:sz w:val="36"/>
-          <w:szCs w:val="36"/>
-        </w:rPr>
-        <w:t xml:space="preserve"> és a </w:t>
-      </w:r>
-      <w:proofErr w:type="spellStart"/>
-      <w:r>
-        <w:rPr>
-          <w:rFonts w:ascii="Times New Roman" w:eastAsia="Times New Roman" w:hAnsi="Times New Roman" w:cs="Times New Roman"/>
-          <w:sz w:val="36"/>
-          <w:szCs w:val="36"/>
-        </w:rPr>
-        <w:t>beforeEach</w:t>
-      </w:r>
-      <w:proofErr w:type="spellEnd"/>
-      <w:r>
-        <w:rPr>
-          <w:rFonts w:ascii="Times New Roman" w:eastAsia="Times New Roman" w:hAnsi="Times New Roman" w:cs="Times New Roman"/>
-          <w:sz w:val="36"/>
-          <w:szCs w:val="36"/>
-        </w:rPr>
-        <w:t>-ben oldalcímek meghatározása</w:t>
+      <w:r>
+        <w:rPr>
+          <w:rFonts w:ascii="Times New Roman" w:eastAsia="Times New Roman" w:hAnsi="Times New Roman" w:cs="Times New Roman"/>
+          <w:sz w:val="36"/>
+          <w:szCs w:val="36"/>
+        </w:rPr>
+        <w:t>meta.title-ekben és a beforeEach-ben oldalcímek meghatározása</w:t>
       </w:r>
     </w:p>
     <w:p>
@@ -3737,7 +3128,6 @@
           <w:szCs w:val="36"/>
         </w:rPr>
       </w:pPr>
-      <w:proofErr w:type="spellStart"/>
       <w:r>
         <w:rPr>
           <w:rFonts w:ascii="Times New Roman" w:eastAsia="Times New Roman" w:hAnsi="Times New Roman" w:cs="Times New Roman"/>
@@ -3745,34 +3135,7 @@
           <w:szCs w:val="36"/>
         </w:rPr>
         <w:lastRenderedPageBreak/>
-        <w:t>auth</w:t>
-      </w:r>
-      <w:proofErr w:type="spellEnd"/>
-      <w:r>
-        <w:rPr>
-          <w:rFonts w:ascii="Times New Roman" w:eastAsia="Times New Roman" w:hAnsi="Times New Roman" w:cs="Times New Roman"/>
-          <w:sz w:val="36"/>
-          <w:szCs w:val="36"/>
-        </w:rPr>
-        <w:t xml:space="preserve"> függvény hozzáadása a bejelentkezési képernyőhöz (</w:t>
-      </w:r>
-      <w:proofErr w:type="spellStart"/>
-      <w:r>
-        <w:rPr>
-          <w:rFonts w:ascii="Times New Roman" w:eastAsia="Times New Roman" w:hAnsi="Times New Roman" w:cs="Times New Roman"/>
-          <w:sz w:val="36"/>
-          <w:szCs w:val="36"/>
-        </w:rPr>
-        <w:t>LoginView</w:t>
-      </w:r>
-      <w:proofErr w:type="spellEnd"/>
-      <w:r>
-        <w:rPr>
-          <w:rFonts w:ascii="Times New Roman" w:eastAsia="Times New Roman" w:hAnsi="Times New Roman" w:cs="Times New Roman"/>
-          <w:sz w:val="36"/>
-          <w:szCs w:val="36"/>
-        </w:rPr>
-        <w:t>), ami egyelőre üres, egy komment jelzi annak célját</w:t>
+        <w:t>auth függvény hozzáadása a bejelentkezési képernyőhöz (LoginView), ami egyelőre üres, egy komment jelzi annak célját</w:t>
       </w:r>
     </w:p>
     <w:p>
@@ -3973,43 +3336,7 @@
           <w:sz w:val="36"/>
           <w:szCs w:val="36"/>
         </w:rPr>
-        <w:t>Szerepkörök (</w:t>
-      </w:r>
-      <w:proofErr w:type="spellStart"/>
-      <w:r>
-        <w:rPr>
-          <w:rFonts w:ascii="Times New Roman" w:eastAsia="Times New Roman" w:hAnsi="Times New Roman" w:cs="Times New Roman"/>
-          <w:sz w:val="36"/>
-          <w:szCs w:val="36"/>
-        </w:rPr>
-        <w:t>role</w:t>
-      </w:r>
-      <w:proofErr w:type="spellEnd"/>
-      <w:r>
-        <w:rPr>
-          <w:rFonts w:ascii="Times New Roman" w:eastAsia="Times New Roman" w:hAnsi="Times New Roman" w:cs="Times New Roman"/>
-          <w:sz w:val="36"/>
-          <w:szCs w:val="36"/>
-        </w:rPr>
-        <w:t xml:space="preserve">) és </w:t>
-      </w:r>
-      <w:proofErr w:type="spellStart"/>
-      <w:r>
-        <w:rPr>
-          <w:rFonts w:ascii="Times New Roman" w:eastAsia="Times New Roman" w:hAnsi="Times New Roman" w:cs="Times New Roman"/>
-          <w:sz w:val="36"/>
-          <w:szCs w:val="36"/>
-        </w:rPr>
-        <w:t>requiresAuth</w:t>
-      </w:r>
-      <w:proofErr w:type="spellEnd"/>
-      <w:r>
-        <w:rPr>
-          <w:rFonts w:ascii="Times New Roman" w:eastAsia="Times New Roman" w:hAnsi="Times New Roman" w:cs="Times New Roman"/>
-          <w:sz w:val="36"/>
-          <w:szCs w:val="36"/>
-        </w:rPr>
-        <w:t xml:space="preserve"> hozzáadása a nézetekhez</w:t>
+        <w:t>Szerepkörök (role) és requiresAuth hozzáadása a nézetekhez</w:t>
       </w:r>
     </w:p>
     <w:p>
@@ -4027,41 +3354,13 @@
           <w:szCs w:val="36"/>
         </w:rPr>
       </w:pPr>
-      <w:proofErr w:type="spellStart"/>
-      <w:r>
-        <w:rPr>
-          <w:rFonts w:ascii="Times New Roman" w:eastAsia="Times New Roman" w:hAnsi="Times New Roman" w:cs="Times New Roman"/>
-          <w:sz w:val="36"/>
-          <w:szCs w:val="36"/>
-        </w:rPr>
-        <w:t>Autentikációhoz</w:t>
-      </w:r>
-      <w:proofErr w:type="spellEnd"/>
-      <w:r>
-        <w:rPr>
-          <w:rFonts w:ascii="Times New Roman" w:eastAsia="Times New Roman" w:hAnsi="Times New Roman" w:cs="Times New Roman"/>
-          <w:sz w:val="36"/>
-          <w:szCs w:val="36"/>
-        </w:rPr>
-        <w:t xml:space="preserve"> szükséges alapváltozók felvétele az </w:t>
-      </w:r>
-      <w:proofErr w:type="spellStart"/>
-      <w:r>
-        <w:rPr>
-          <w:rFonts w:ascii="Times New Roman" w:eastAsia="Times New Roman" w:hAnsi="Times New Roman" w:cs="Times New Roman"/>
-          <w:sz w:val="36"/>
-          <w:szCs w:val="36"/>
-        </w:rPr>
-        <w:t>App.vue</w:t>
-      </w:r>
-      <w:proofErr w:type="spellEnd"/>
-      <w:r>
-        <w:rPr>
-          <w:rFonts w:ascii="Times New Roman" w:eastAsia="Times New Roman" w:hAnsi="Times New Roman" w:cs="Times New Roman"/>
-          <w:sz w:val="36"/>
-          <w:szCs w:val="36"/>
-        </w:rPr>
-        <w:t>-ban</w:t>
+      <w:r>
+        <w:rPr>
+          <w:rFonts w:ascii="Times New Roman" w:eastAsia="Times New Roman" w:hAnsi="Times New Roman" w:cs="Times New Roman"/>
+          <w:sz w:val="36"/>
+          <w:szCs w:val="36"/>
+        </w:rPr>
+        <w:t>Autentikációhoz szükséges alapváltozók felvétele az App.vue-ban</w:t>
       </w:r>
     </w:p>
     <w:p>
@@ -4101,25 +3400,7 @@
           <w:sz w:val="36"/>
           <w:szCs w:val="36"/>
         </w:rPr>
-        <w:t>(Susán Csongor György, El-</w:t>
-      </w:r>
-      <w:proofErr w:type="spellStart"/>
-      <w:r>
-        <w:rPr>
-          <w:rFonts w:ascii="Times New Roman" w:eastAsia="Times New Roman" w:hAnsi="Times New Roman" w:cs="Times New Roman"/>
-          <w:sz w:val="36"/>
-          <w:szCs w:val="36"/>
-        </w:rPr>
-        <w:t>Nabulsy</w:t>
-      </w:r>
-      <w:proofErr w:type="spellEnd"/>
-      <w:r>
-        <w:rPr>
-          <w:rFonts w:ascii="Times New Roman" w:eastAsia="Times New Roman" w:hAnsi="Times New Roman" w:cs="Times New Roman"/>
-          <w:sz w:val="36"/>
-          <w:szCs w:val="36"/>
-        </w:rPr>
-        <w:t xml:space="preserve"> Csongor Alan)</w:t>
+        <w:t>(Susán Csongor György, El-Nabulsy Csongor Alan)</w:t>
       </w:r>
     </w:p>
     <w:p>
@@ -4165,25 +3446,7 @@
           <w:sz w:val="36"/>
           <w:szCs w:val="36"/>
         </w:rPr>
-        <w:t>Táblák SQL-tervezetének elkészítése (El-</w:t>
-      </w:r>
-      <w:proofErr w:type="spellStart"/>
-      <w:r>
-        <w:rPr>
-          <w:rFonts w:ascii="Times New Roman" w:eastAsia="Times New Roman" w:hAnsi="Times New Roman" w:cs="Times New Roman"/>
-          <w:sz w:val="36"/>
-          <w:szCs w:val="36"/>
-        </w:rPr>
-        <w:t>Nabulsy</w:t>
-      </w:r>
-      <w:proofErr w:type="spellEnd"/>
-      <w:r>
-        <w:rPr>
-          <w:rFonts w:ascii="Times New Roman" w:eastAsia="Times New Roman" w:hAnsi="Times New Roman" w:cs="Times New Roman"/>
-          <w:sz w:val="36"/>
-          <w:szCs w:val="36"/>
-        </w:rPr>
-        <w:t>)</w:t>
+        <w:t>Táblák SQL-tervezetének elkészítése (El-Nabulsy)</w:t>
       </w:r>
     </w:p>
     <w:p>
@@ -4207,79 +3470,7 @@
           <w:szCs w:val="36"/>
         </w:rPr>
         <w:lastRenderedPageBreak/>
-        <w:t>Táblázatok relációs tervvé írása és azok implementálása (</w:t>
-      </w:r>
-      <w:proofErr w:type="spellStart"/>
-      <w:r>
-        <w:rPr>
-          <w:rFonts w:ascii="Times New Roman" w:eastAsia="Times New Roman" w:hAnsi="Times New Roman" w:cs="Times New Roman"/>
-          <w:sz w:val="36"/>
-          <w:szCs w:val="36"/>
-        </w:rPr>
-        <w:t>model-lek</w:t>
-      </w:r>
-      <w:proofErr w:type="spellEnd"/>
-      <w:r>
-        <w:rPr>
-          <w:rFonts w:ascii="Times New Roman" w:eastAsia="Times New Roman" w:hAnsi="Times New Roman" w:cs="Times New Roman"/>
-          <w:sz w:val="36"/>
-          <w:szCs w:val="36"/>
-        </w:rPr>
-        <w:t xml:space="preserve">, egyelőre üres </w:t>
-      </w:r>
-      <w:proofErr w:type="spellStart"/>
-      <w:r>
-        <w:rPr>
-          <w:rFonts w:ascii="Times New Roman" w:eastAsia="Times New Roman" w:hAnsi="Times New Roman" w:cs="Times New Roman"/>
-          <w:sz w:val="36"/>
-          <w:szCs w:val="36"/>
-        </w:rPr>
-        <w:t>seederek</w:t>
-      </w:r>
-      <w:proofErr w:type="spellEnd"/>
-      <w:r>
-        <w:rPr>
-          <w:rFonts w:ascii="Times New Roman" w:eastAsia="Times New Roman" w:hAnsi="Times New Roman" w:cs="Times New Roman"/>
-          <w:sz w:val="36"/>
-          <w:szCs w:val="36"/>
-        </w:rPr>
-        <w:t xml:space="preserve"> és </w:t>
-      </w:r>
-      <w:proofErr w:type="spellStart"/>
-      <w:r>
-        <w:rPr>
-          <w:rFonts w:ascii="Times New Roman" w:eastAsia="Times New Roman" w:hAnsi="Times New Roman" w:cs="Times New Roman"/>
-          <w:sz w:val="36"/>
-          <w:szCs w:val="36"/>
-        </w:rPr>
-        <w:t>migration-ök</w:t>
-      </w:r>
-      <w:proofErr w:type="spellEnd"/>
-      <w:r>
-        <w:rPr>
-          <w:rFonts w:ascii="Times New Roman" w:eastAsia="Times New Roman" w:hAnsi="Times New Roman" w:cs="Times New Roman"/>
-          <w:sz w:val="36"/>
-          <w:szCs w:val="36"/>
-        </w:rPr>
-        <w:t>) a Backend (</w:t>
-      </w:r>
-      <w:proofErr w:type="spellStart"/>
-      <w:r>
-        <w:rPr>
-          <w:rFonts w:ascii="Times New Roman" w:eastAsia="Times New Roman" w:hAnsi="Times New Roman" w:cs="Times New Roman"/>
-          <w:sz w:val="36"/>
-          <w:szCs w:val="36"/>
-        </w:rPr>
-        <w:t>Laravel</w:t>
-      </w:r>
-      <w:proofErr w:type="spellEnd"/>
-      <w:r>
-        <w:rPr>
-          <w:rFonts w:ascii="Times New Roman" w:eastAsia="Times New Roman" w:hAnsi="Times New Roman" w:cs="Times New Roman"/>
-          <w:sz w:val="36"/>
-          <w:szCs w:val="36"/>
-        </w:rPr>
-        <w:t>) projektbe (Susán)</w:t>
+        <w:t>Táblázatok relációs tervvé írása és azok implementálása (model-lek, egyelőre üres seederek és migration-ök) a Backend (Laravel) projektbe (Susán)</w:t>
       </w:r>
     </w:p>
     <w:p>
@@ -4302,79 +3493,7 @@
           <w:sz w:val="36"/>
           <w:szCs w:val="36"/>
         </w:rPr>
-        <w:t xml:space="preserve">Projekt struktúrájának végleges kialakítása (eddig </w:t>
-      </w:r>
-      <w:proofErr w:type="spellStart"/>
-      <w:r>
-        <w:rPr>
-          <w:rFonts w:ascii="Times New Roman" w:eastAsia="Times New Roman" w:hAnsi="Times New Roman" w:cs="Times New Roman"/>
-          <w:sz w:val="36"/>
-          <w:szCs w:val="36"/>
-        </w:rPr>
-        <w:t>frontendPart-blathyfm</w:t>
-      </w:r>
-      <w:proofErr w:type="spellEnd"/>
-      <w:r>
-        <w:rPr>
-          <w:rFonts w:ascii="Times New Roman" w:eastAsia="Times New Roman" w:hAnsi="Times New Roman" w:cs="Times New Roman"/>
-          <w:sz w:val="36"/>
-          <w:szCs w:val="36"/>
-        </w:rPr>
-        <w:t xml:space="preserve"> volt, viszont azóta a főmappa a </w:t>
-      </w:r>
-      <w:proofErr w:type="spellStart"/>
-      <w:r>
-        <w:rPr>
-          <w:rFonts w:ascii="Times New Roman" w:eastAsia="Times New Roman" w:hAnsi="Times New Roman" w:cs="Times New Roman"/>
-          <w:sz w:val="36"/>
-          <w:szCs w:val="36"/>
-        </w:rPr>
-        <w:t>BlathyFM</w:t>
-      </w:r>
-      <w:proofErr w:type="spellEnd"/>
-      <w:r>
-        <w:rPr>
-          <w:rFonts w:ascii="Times New Roman" w:eastAsia="Times New Roman" w:hAnsi="Times New Roman" w:cs="Times New Roman"/>
-          <w:sz w:val="36"/>
-          <w:szCs w:val="36"/>
-        </w:rPr>
-        <w:t xml:space="preserve"> mappát viseli, amiben két, az alkalmazás egy-egy szintjét képviselő projekt található (</w:t>
-      </w:r>
-      <w:proofErr w:type="spellStart"/>
-      <w:r>
-        <w:rPr>
-          <w:rFonts w:ascii="Times New Roman" w:eastAsia="Times New Roman" w:hAnsi="Times New Roman" w:cs="Times New Roman"/>
-          <w:sz w:val="36"/>
-          <w:szCs w:val="36"/>
-        </w:rPr>
-        <w:t>blathyfm_frontend</w:t>
-      </w:r>
-      <w:proofErr w:type="spellEnd"/>
-      <w:r>
-        <w:rPr>
-          <w:rFonts w:ascii="Times New Roman" w:eastAsia="Times New Roman" w:hAnsi="Times New Roman" w:cs="Times New Roman"/>
-          <w:sz w:val="36"/>
-          <w:szCs w:val="36"/>
-        </w:rPr>
-        <w:t xml:space="preserve"> – amiben az eddigi frontend-alkalmazás volt megtalálható – és </w:t>
-      </w:r>
-      <w:proofErr w:type="spellStart"/>
-      <w:r>
-        <w:rPr>
-          <w:rFonts w:ascii="Times New Roman" w:eastAsia="Times New Roman" w:hAnsi="Times New Roman" w:cs="Times New Roman"/>
-          <w:sz w:val="36"/>
-          <w:szCs w:val="36"/>
-        </w:rPr>
-        <w:t>blathyfm_backend</w:t>
-      </w:r>
-      <w:proofErr w:type="spellEnd"/>
-      <w:r>
-        <w:rPr>
-          <w:rFonts w:ascii="Times New Roman" w:eastAsia="Times New Roman" w:hAnsi="Times New Roman" w:cs="Times New Roman"/>
-          <w:sz w:val="36"/>
-          <w:szCs w:val="36"/>
-        </w:rPr>
-        <w:t>, ami pedig az újonnan létrejött backend része a projektnek) (Susán)</w:t>
+        <w:t>Projekt struktúrájának végleges kialakítása (eddig frontendPart-blathyfm volt, viszont azóta a főmappa a BlathyFM mappát viseli, amiben két, az alkalmazás egy-egy szintjét képviselő projekt található (blathyfm_frontend – amiben az eddigi frontend-alkalmazás volt megtalálható – és blathyfm_backend, ami pedig az újonnan létrejött backend része a projektnek) (Susán)</w:t>
       </w:r>
     </w:p>
     <w:p>
@@ -4459,43 +3578,7 @@
           <w:sz w:val="36"/>
           <w:szCs w:val="36"/>
         </w:rPr>
-        <w:t>(El-</w:t>
-      </w:r>
-      <w:proofErr w:type="spellStart"/>
-      <w:r>
-        <w:rPr>
-          <w:rFonts w:ascii="Times New Roman" w:eastAsia="Times New Roman" w:hAnsi="Times New Roman" w:cs="Times New Roman"/>
-          <w:sz w:val="36"/>
-          <w:szCs w:val="36"/>
-        </w:rPr>
-        <w:t>Nabulsy</w:t>
-      </w:r>
-      <w:proofErr w:type="spellEnd"/>
-      <w:r>
-        <w:rPr>
-          <w:rFonts w:ascii="Times New Roman" w:eastAsia="Times New Roman" w:hAnsi="Times New Roman" w:cs="Times New Roman"/>
-          <w:sz w:val="36"/>
-          <w:szCs w:val="36"/>
-        </w:rPr>
-        <w:t xml:space="preserve"> Csongor Alan) Az ütemezői nézet (</w:t>
-      </w:r>
-      <w:proofErr w:type="spellStart"/>
-      <w:r>
-        <w:rPr>
-          <w:rFonts w:ascii="Times New Roman" w:eastAsia="Times New Roman" w:hAnsi="Times New Roman" w:cs="Times New Roman"/>
-          <w:sz w:val="36"/>
-          <w:szCs w:val="36"/>
-        </w:rPr>
-        <w:t>SchedulerView</w:t>
-      </w:r>
-      <w:proofErr w:type="spellEnd"/>
-      <w:r>
-        <w:rPr>
-          <w:rFonts w:ascii="Times New Roman" w:eastAsia="Times New Roman" w:hAnsi="Times New Roman" w:cs="Times New Roman"/>
-          <w:sz w:val="36"/>
-          <w:szCs w:val="36"/>
-        </w:rPr>
-        <w:t>) elkészítése</w:t>
+        <w:t>(El-Nabulsy Csongor Alan) Az ütemezői nézet (SchedulerView) elkészítése</w:t>
       </w:r>
       <w:r>
         <w:rPr>
@@ -4532,25 +3615,7 @@
           <w:sz w:val="36"/>
           <w:szCs w:val="36"/>
         </w:rPr>
-        <w:t>Tervezéssel kapcsolatos dokumentumok áthelyezése egy „</w:t>
-      </w:r>
-      <w:proofErr w:type="spellStart"/>
-      <w:r>
-        <w:rPr>
-          <w:rFonts w:ascii="Times New Roman" w:eastAsia="Times New Roman" w:hAnsi="Times New Roman" w:cs="Times New Roman"/>
-          <w:sz w:val="36"/>
-          <w:szCs w:val="36"/>
-        </w:rPr>
-        <w:t>plans</w:t>
-      </w:r>
-      <w:proofErr w:type="spellEnd"/>
-      <w:r>
-        <w:rPr>
-          <w:rFonts w:ascii="Times New Roman" w:eastAsia="Times New Roman" w:hAnsi="Times New Roman" w:cs="Times New Roman"/>
-          <w:sz w:val="36"/>
-          <w:szCs w:val="36"/>
-        </w:rPr>
-        <w:t>” mappába, a</w:t>
+        <w:t>Tervezéssel kapcsolatos dokumentumok áthelyezése egy „plans” mappába, a</w:t>
       </w:r>
       <w:r>
         <w:rPr>
@@ -4611,25 +3676,7 @@
           <w:sz w:val="36"/>
           <w:szCs w:val="36"/>
         </w:rPr>
-        <w:t>El-</w:t>
-      </w:r>
-      <w:proofErr w:type="spellStart"/>
-      <w:r>
-        <w:rPr>
-          <w:rFonts w:ascii="Times New Roman" w:eastAsia="Times New Roman" w:hAnsi="Times New Roman" w:cs="Times New Roman"/>
-          <w:sz w:val="36"/>
-          <w:szCs w:val="36"/>
-        </w:rPr>
-        <w:t>Nabulsy</w:t>
-      </w:r>
-      <w:proofErr w:type="spellEnd"/>
-      <w:r>
-        <w:rPr>
-          <w:rFonts w:ascii="Times New Roman" w:eastAsia="Times New Roman" w:hAnsi="Times New Roman" w:cs="Times New Roman"/>
-          <w:sz w:val="36"/>
-          <w:szCs w:val="36"/>
-        </w:rPr>
-        <w:t xml:space="preserve"> Csongor Alan</w:t>
+        <w:t>El-Nabulsy Csongor Alan</w:t>
       </w:r>
       <w:r>
         <w:rPr>
@@ -4645,43 +3692,7 @@
           <w:sz w:val="36"/>
           <w:szCs w:val="36"/>
         </w:rPr>
-        <w:t xml:space="preserve"> </w:t>
-      </w:r>
-      <w:proofErr w:type="spellStart"/>
-      <w:r>
-        <w:rPr>
-          <w:rFonts w:ascii="Times New Roman" w:eastAsia="Times New Roman" w:hAnsi="Times New Roman" w:cs="Times New Roman"/>
-          <w:sz w:val="36"/>
-          <w:szCs w:val="36"/>
-        </w:rPr>
-        <w:t>RequestView</w:t>
-      </w:r>
-      <w:proofErr w:type="spellEnd"/>
-      <w:r>
-        <w:rPr>
-          <w:rFonts w:ascii="Times New Roman" w:eastAsia="Times New Roman" w:hAnsi="Times New Roman" w:cs="Times New Roman"/>
-          <w:sz w:val="36"/>
-          <w:szCs w:val="36"/>
-        </w:rPr>
-        <w:t xml:space="preserve"> és </w:t>
-      </w:r>
-      <w:proofErr w:type="spellStart"/>
-      <w:r>
-        <w:rPr>
-          <w:rFonts w:ascii="Times New Roman" w:eastAsia="Times New Roman" w:hAnsi="Times New Roman" w:cs="Times New Roman"/>
-          <w:sz w:val="36"/>
-          <w:szCs w:val="36"/>
-        </w:rPr>
-        <w:t>SchedulerView</w:t>
-      </w:r>
-      <w:proofErr w:type="spellEnd"/>
-      <w:r>
-        <w:rPr>
-          <w:rFonts w:ascii="Times New Roman" w:eastAsia="Times New Roman" w:hAnsi="Times New Roman" w:cs="Times New Roman"/>
-          <w:sz w:val="36"/>
-          <w:szCs w:val="36"/>
-        </w:rPr>
-        <w:t xml:space="preserve"> továbbfejlesztése</w:t>
+        <w:t xml:space="preserve"> RequestView és SchedulerView továbbfejlesztése</w:t>
       </w:r>
     </w:p>
     <w:p>
@@ -4794,25 +3805,7 @@
           <w:sz w:val="36"/>
           <w:szCs w:val="36"/>
         </w:rPr>
-        <w:t xml:space="preserve"> az adatbázisba </w:t>
-      </w:r>
-      <w:proofErr w:type="spellStart"/>
-      <w:r>
-        <w:rPr>
-          <w:rFonts w:ascii="Times New Roman" w:eastAsia="Times New Roman" w:hAnsi="Times New Roman" w:cs="Times New Roman"/>
-          <w:sz w:val="36"/>
-          <w:szCs w:val="36"/>
-        </w:rPr>
-        <w:t>seederek</w:t>
-      </w:r>
-      <w:proofErr w:type="spellEnd"/>
-      <w:r>
-        <w:rPr>
-          <w:rFonts w:ascii="Times New Roman" w:eastAsia="Times New Roman" w:hAnsi="Times New Roman" w:cs="Times New Roman"/>
-          <w:sz w:val="36"/>
-          <w:szCs w:val="36"/>
-        </w:rPr>
-        <w:t xml:space="preserve"> segítségével</w:t>
+        <w:t xml:space="preserve"> az adatbázisba seederek segítségével</w:t>
       </w:r>
     </w:p>
     <w:p>
@@ -4961,7 +3954,6 @@
           <w:szCs w:val="36"/>
         </w:rPr>
       </w:pPr>
-      <w:proofErr w:type="spellStart"/>
       <w:r>
         <w:rPr>
           <w:rFonts w:ascii="Times New Roman" w:eastAsia="Times New Roman" w:hAnsi="Times New Roman" w:cs="Times New Roman"/>
@@ -4970,7 +3962,6 @@
         </w:rPr>
         <w:t>Genre</w:t>
       </w:r>
-      <w:proofErr w:type="spellEnd"/>
       <w:r>
         <w:rPr>
           <w:rFonts w:ascii="Times New Roman" w:eastAsia="Times New Roman" w:hAnsi="Times New Roman" w:cs="Times New Roman"/>
@@ -5048,6 +4039,102 @@
           <w:szCs w:val="36"/>
         </w:rPr>
         <w:t>Hibakeresés</w:t>
+      </w:r>
+    </w:p>
+    <w:p>
+      <w:pPr>
+        <w:jc w:val="both"/>
+        <w:rPr>
+          <w:rFonts w:ascii="Times New Roman" w:eastAsia="Times New Roman" w:hAnsi="Times New Roman" w:cs="Times New Roman"/>
+          <w:sz w:val="36"/>
+          <w:szCs w:val="36"/>
+        </w:rPr>
+      </w:pPr>
+    </w:p>
+    <w:p>
+      <w:pPr>
+        <w:jc w:val="both"/>
+        <w:rPr>
+          <w:rFonts w:ascii="Times New Roman" w:eastAsia="Times New Roman" w:hAnsi="Times New Roman" w:cs="Times New Roman"/>
+          <w:b/>
+          <w:bCs/>
+          <w:sz w:val="40"/>
+          <w:szCs w:val="40"/>
+        </w:rPr>
+      </w:pPr>
+      <w:r>
+        <w:rPr>
+          <w:rFonts w:ascii="Times New Roman" w:eastAsia="Times New Roman" w:hAnsi="Times New Roman" w:cs="Times New Roman"/>
+          <w:b/>
+          <w:bCs/>
+          <w:sz w:val="40"/>
+          <w:szCs w:val="40"/>
+        </w:rPr>
+        <w:t>2026-04-05 12:30-14:35</w:t>
+      </w:r>
+    </w:p>
+    <w:p>
+      <w:pPr>
+        <w:jc w:val="both"/>
+        <w:rPr>
+          <w:rFonts w:ascii="Times New Roman" w:eastAsia="Times New Roman" w:hAnsi="Times New Roman" w:cs="Times New Roman"/>
+          <w:sz w:val="36"/>
+          <w:szCs w:val="36"/>
+        </w:rPr>
+      </w:pPr>
+      <w:r>
+        <w:rPr>
+          <w:rFonts w:ascii="Times New Roman" w:eastAsia="Times New Roman" w:hAnsi="Times New Roman" w:cs="Times New Roman"/>
+          <w:sz w:val="36"/>
+          <w:szCs w:val="36"/>
+        </w:rPr>
+        <w:t>(Susán Csongor György)</w:t>
+      </w:r>
+    </w:p>
+    <w:p>
+      <w:pPr>
+        <w:pStyle w:val="Listaszerbekezds"/>
+        <w:numPr>
+          <w:ilvl w:val="0"/>
+          <w:numId w:val="9"/>
+        </w:numPr>
+        <w:jc w:val="both"/>
+        <w:rPr>
+          <w:rFonts w:ascii="Times New Roman" w:eastAsia="Times New Roman" w:hAnsi="Times New Roman" w:cs="Times New Roman"/>
+          <w:sz w:val="36"/>
+          <w:szCs w:val="36"/>
+        </w:rPr>
+      </w:pPr>
+      <w:r>
+        <w:rPr>
+          <w:rFonts w:ascii="Times New Roman" w:eastAsia="Times New Roman" w:hAnsi="Times New Roman" w:cs="Times New Roman"/>
+          <w:sz w:val="36"/>
+          <w:szCs w:val="36"/>
+        </w:rPr>
+        <w:t>Backend oldali migrationök és seederek debuggolása, hibamentesítése.</w:t>
+      </w:r>
+    </w:p>
+    <w:p>
+      <w:pPr>
+        <w:pStyle w:val="Listaszerbekezds"/>
+        <w:numPr>
+          <w:ilvl w:val="0"/>
+          <w:numId w:val="9"/>
+        </w:numPr>
+        <w:jc w:val="both"/>
+        <w:rPr>
+          <w:rFonts w:ascii="Times New Roman" w:eastAsia="Times New Roman" w:hAnsi="Times New Roman" w:cs="Times New Roman"/>
+          <w:sz w:val="36"/>
+          <w:szCs w:val="36"/>
+        </w:rPr>
+      </w:pPr>
+      <w:r>
+        <w:rPr>
+          <w:rFonts w:ascii="Times New Roman" w:eastAsia="Times New Roman" w:hAnsi="Times New Roman" w:cs="Times New Roman"/>
+          <w:sz w:val="36"/>
+          <w:szCs w:val="36"/>
+        </w:rPr>
+        <w:t>Példaadatok hozzáadása a zenékhez</w:t>
       </w:r>
     </w:p>
     <w:sectPr>
@@ -5089,6 +4176,119 @@
     </w:pict>
   </w:numPicBullet>
   <w:abstractNum w:abstractNumId="0" w15:restartNumberingAfterBreak="0">
+    <w:nsid w:val="2D6C3100"/>
+    <w:multiLevelType w:val="hybridMultilevel"/>
+    <w:tmpl w:val="240AE6E2"/>
+    <w:lvl w:ilvl="0" w:tplc="040E0001">
+      <w:start w:val="1"/>
+      <w:numFmt w:val="bullet"/>
+      <w:lvlText w:val=""/>
+      <w:lvlJc w:val="left"/>
+      <w:pPr>
+        <w:ind w:left="720" w:hanging="360"/>
+      </w:pPr>
+      <w:rPr>
+        <w:rFonts w:ascii="Symbol" w:hAnsi="Symbol" w:hint="default"/>
+      </w:rPr>
+    </w:lvl>
+    <w:lvl w:ilvl="1" w:tplc="040E0003" w:tentative="1">
+      <w:start w:val="1"/>
+      <w:numFmt w:val="bullet"/>
+      <w:lvlText w:val="o"/>
+      <w:lvlJc w:val="left"/>
+      <w:pPr>
+        <w:ind w:left="1440" w:hanging="360"/>
+      </w:pPr>
+      <w:rPr>
+        <w:rFonts w:ascii="Courier New" w:hAnsi="Courier New" w:cs="Courier New" w:hint="default"/>
+      </w:rPr>
+    </w:lvl>
+    <w:lvl w:ilvl="2" w:tplc="040E0005" w:tentative="1">
+      <w:start w:val="1"/>
+      <w:numFmt w:val="bullet"/>
+      <w:lvlText w:val=""/>
+      <w:lvlJc w:val="left"/>
+      <w:pPr>
+        <w:ind w:left="2160" w:hanging="360"/>
+      </w:pPr>
+      <w:rPr>
+        <w:rFonts w:ascii="Wingdings" w:hAnsi="Wingdings" w:hint="default"/>
+      </w:rPr>
+    </w:lvl>
+    <w:lvl w:ilvl="3" w:tplc="040E0001" w:tentative="1">
+      <w:start w:val="1"/>
+      <w:numFmt w:val="bullet"/>
+      <w:lvlText w:val=""/>
+      <w:lvlJc w:val="left"/>
+      <w:pPr>
+        <w:ind w:left="2880" w:hanging="360"/>
+      </w:pPr>
+      <w:rPr>
+        <w:rFonts w:ascii="Symbol" w:hAnsi="Symbol" w:hint="default"/>
+      </w:rPr>
+    </w:lvl>
+    <w:lvl w:ilvl="4" w:tplc="040E0003" w:tentative="1">
+      <w:start w:val="1"/>
+      <w:numFmt w:val="bullet"/>
+      <w:lvlText w:val="o"/>
+      <w:lvlJc w:val="left"/>
+      <w:pPr>
+        <w:ind w:left="3600" w:hanging="360"/>
+      </w:pPr>
+      <w:rPr>
+        <w:rFonts w:ascii="Courier New" w:hAnsi="Courier New" w:cs="Courier New" w:hint="default"/>
+      </w:rPr>
+    </w:lvl>
+    <w:lvl w:ilvl="5" w:tplc="040E0005" w:tentative="1">
+      <w:start w:val="1"/>
+      <w:numFmt w:val="bullet"/>
+      <w:lvlText w:val=""/>
+      <w:lvlJc w:val="left"/>
+      <w:pPr>
+        <w:ind w:left="4320" w:hanging="360"/>
+      </w:pPr>
+      <w:rPr>
+        <w:rFonts w:ascii="Wingdings" w:hAnsi="Wingdings" w:hint="default"/>
+      </w:rPr>
+    </w:lvl>
+    <w:lvl w:ilvl="6" w:tplc="040E0001" w:tentative="1">
+      <w:start w:val="1"/>
+      <w:numFmt w:val="bullet"/>
+      <w:lvlText w:val=""/>
+      <w:lvlJc w:val="left"/>
+      <w:pPr>
+        <w:ind w:left="5040" w:hanging="360"/>
+      </w:pPr>
+      <w:rPr>
+        <w:rFonts w:ascii="Symbol" w:hAnsi="Symbol" w:hint="default"/>
+      </w:rPr>
+    </w:lvl>
+    <w:lvl w:ilvl="7" w:tplc="040E0003" w:tentative="1">
+      <w:start w:val="1"/>
+      <w:numFmt w:val="bullet"/>
+      <w:lvlText w:val="o"/>
+      <w:lvlJc w:val="left"/>
+      <w:pPr>
+        <w:ind w:left="5760" w:hanging="360"/>
+      </w:pPr>
+      <w:rPr>
+        <w:rFonts w:ascii="Courier New" w:hAnsi="Courier New" w:cs="Courier New" w:hint="default"/>
+      </w:rPr>
+    </w:lvl>
+    <w:lvl w:ilvl="8" w:tplc="040E0005" w:tentative="1">
+      <w:start w:val="1"/>
+      <w:numFmt w:val="bullet"/>
+      <w:lvlText w:val=""/>
+      <w:lvlJc w:val="left"/>
+      <w:pPr>
+        <w:ind w:left="6480" w:hanging="360"/>
+      </w:pPr>
+      <w:rPr>
+        <w:rFonts w:ascii="Wingdings" w:hAnsi="Wingdings" w:hint="default"/>
+      </w:rPr>
+    </w:lvl>
+  </w:abstractNum>
+  <w:abstractNum w:abstractNumId="1" w15:restartNumberingAfterBreak="0">
     <w:nsid w:val="3C1938F6"/>
     <w:multiLevelType w:val="hybridMultilevel"/>
     <w:tmpl w:val="0816ACA8"/>
@@ -5201,7 +4401,7 @@
       </w:rPr>
     </w:lvl>
   </w:abstractNum>
-  <w:abstractNum w:abstractNumId="1" w15:restartNumberingAfterBreak="0">
+  <w:abstractNum w:abstractNumId="2" w15:restartNumberingAfterBreak="0">
     <w:nsid w:val="47442E3E"/>
     <w:multiLevelType w:val="hybridMultilevel"/>
     <w:tmpl w:val="64928C38"/>
@@ -5314,7 +4514,7 @@
       </w:rPr>
     </w:lvl>
   </w:abstractNum>
-  <w:abstractNum w:abstractNumId="2" w15:restartNumberingAfterBreak="0">
+  <w:abstractNum w:abstractNumId="3" w15:restartNumberingAfterBreak="0">
     <w:nsid w:val="69361338"/>
     <w:multiLevelType w:val="hybridMultilevel"/>
     <w:tmpl w:val="6CF0B772"/>
@@ -5427,7 +4627,7 @@
       </w:rPr>
     </w:lvl>
   </w:abstractNum>
-  <w:abstractNum w:abstractNumId="3" w15:restartNumberingAfterBreak="0">
+  <w:abstractNum w:abstractNumId="4" w15:restartNumberingAfterBreak="0">
     <w:nsid w:val="69FA5A50"/>
     <w:multiLevelType w:val="hybridMultilevel"/>
     <w:tmpl w:val="D82A6326"/>
@@ -5540,7 +4740,7 @@
       </w:rPr>
     </w:lvl>
   </w:abstractNum>
-  <w:abstractNum w:abstractNumId="4" w15:restartNumberingAfterBreak="0">
+  <w:abstractNum w:abstractNumId="5" w15:restartNumberingAfterBreak="0">
     <w:nsid w:val="6E7312B6"/>
     <w:multiLevelType w:val="hybridMultilevel"/>
     <w:tmpl w:val="FD80BAFC"/>
@@ -5653,7 +4853,7 @@
       </w:rPr>
     </w:lvl>
   </w:abstractNum>
-  <w:abstractNum w:abstractNumId="5" w15:restartNumberingAfterBreak="0">
+  <w:abstractNum w:abstractNumId="6" w15:restartNumberingAfterBreak="0">
     <w:nsid w:val="76FA296F"/>
     <w:multiLevelType w:val="hybridMultilevel"/>
     <w:tmpl w:val="6DAE32EA"/>
@@ -5766,7 +4966,7 @@
       </w:rPr>
     </w:lvl>
   </w:abstractNum>
-  <w:abstractNum w:abstractNumId="6" w15:restartNumberingAfterBreak="0">
+  <w:abstractNum w:abstractNumId="7" w15:restartNumberingAfterBreak="0">
     <w:nsid w:val="788C73B2"/>
     <w:multiLevelType w:val="hybridMultilevel"/>
     <w:tmpl w:val="6D6C60B0"/>
@@ -5879,7 +5079,7 @@
       </w:rPr>
     </w:lvl>
   </w:abstractNum>
-  <w:abstractNum w:abstractNumId="7" w15:restartNumberingAfterBreak="0">
+  <w:abstractNum w:abstractNumId="8" w15:restartNumberingAfterBreak="0">
     <w:nsid w:val="7EB672F7"/>
     <w:multiLevelType w:val="hybridMultilevel"/>
     <w:tmpl w:val="A6F0C99C"/>
@@ -5993,28 +5193,31 @@
     </w:lvl>
   </w:abstractNum>
   <w:num w:numId="1" w16cid:durableId="1237017102">
+    <w:abstractNumId w:val="8"/>
+  </w:num>
+  <w:num w:numId="2" w16cid:durableId="23093752">
+    <w:abstractNumId w:val="5"/>
+  </w:num>
+  <w:num w:numId="3" w16cid:durableId="211231034">
+    <w:abstractNumId w:val="6"/>
+  </w:num>
+  <w:num w:numId="4" w16cid:durableId="285432383">
+    <w:abstractNumId w:val="1"/>
+  </w:num>
+  <w:num w:numId="5" w16cid:durableId="382339222">
+    <w:abstractNumId w:val="4"/>
+  </w:num>
+  <w:num w:numId="6" w16cid:durableId="1929121998">
+    <w:abstractNumId w:val="2"/>
+  </w:num>
+  <w:num w:numId="7" w16cid:durableId="989595552">
     <w:abstractNumId w:val="7"/>
   </w:num>
-  <w:num w:numId="2" w16cid:durableId="23093752">
-    <w:abstractNumId w:val="4"/>
-  </w:num>
-  <w:num w:numId="3" w16cid:durableId="211231034">
-    <w:abstractNumId w:val="5"/>
-  </w:num>
-  <w:num w:numId="4" w16cid:durableId="285432383">
-    <w:abstractNumId w:val="0"/>
-  </w:num>
-  <w:num w:numId="5" w16cid:durableId="382339222">
+  <w:num w:numId="8" w16cid:durableId="844437476">
     <w:abstractNumId w:val="3"/>
   </w:num>
-  <w:num w:numId="6" w16cid:durableId="1929121998">
-    <w:abstractNumId w:val="1"/>
-  </w:num>
-  <w:num w:numId="7" w16cid:durableId="989595552">
-    <w:abstractNumId w:val="6"/>
-  </w:num>
-  <w:num w:numId="8" w16cid:durableId="844437476">
-    <w:abstractNumId w:val="2"/>
+  <w:num w:numId="9" w16cid:durableId="1725445077">
+    <w:abstractNumId w:val="0"/>
   </w:num>
 </w:numbering>
 </file>

</xml_diff>

<commit_message>
Updating documentation with El-Nabulsy's notes
</commit_message>
<xml_diff>
--- a/documentation.docx
+++ b/documentation.docx
@@ -1229,7 +1229,7 @@
           <w:szCs w:val="36"/>
         </w:rPr>
         <w:drawing>
-          <wp:inline distT="0" distB="0" distL="0" distR="0" wp14:anchorId="78A43544" wp14:editId="3D4EC1E0">
+          <wp:inline distT="0" distB="0" distL="0" distR="0" wp14:anchorId="78A43544" wp14:editId="0A896120">
             <wp:extent cx="3166535" cy="1781175"/>
             <wp:effectExtent l="0" t="0" r="0" b="0"/>
             <wp:docPr id="3" name="Kép 3" descr="C:\Users\elnabulsy.csongor\AppData\Local\Microsoft\Windows\INetCache\Content.MSO\F75754B3.tmp"/>
@@ -1321,7 +1321,7 @@
           <w:szCs w:val="36"/>
         </w:rPr>
         <w:drawing>
-          <wp:inline distT="0" distB="0" distL="0" distR="0" wp14:anchorId="4E211814" wp14:editId="777E2498">
+          <wp:inline distT="0" distB="0" distL="0" distR="0" wp14:anchorId="4E211814" wp14:editId="54DBAD04">
             <wp:extent cx="3133725" cy="1762720"/>
             <wp:effectExtent l="0" t="0" r="0" b="9525"/>
             <wp:docPr id="4" name="Kép 4" descr="C:\Users\elnabulsy.csongor\Downloads\ui_main_student.png"/>
@@ -1403,7 +1403,7 @@
           <w:szCs w:val="36"/>
         </w:rPr>
         <w:drawing>
-          <wp:inline distT="0" distB="0" distL="0" distR="0" wp14:anchorId="5137FB78" wp14:editId="0275AD18">
+          <wp:inline distT="0" distB="0" distL="0" distR="0" wp14:anchorId="5137FB78" wp14:editId="39322C56">
             <wp:extent cx="3166110" cy="1780938"/>
             <wp:effectExtent l="0" t="0" r="0" b="0"/>
             <wp:docPr id="5" name="Kép 5" descr="C:\Users\elnabulsy.csongor\Downloads\ui_main_scheduler.png"/>
@@ -1496,7 +1496,7 @@
           <w:szCs w:val="36"/>
         </w:rPr>
         <w:drawing>
-          <wp:inline distT="0" distB="0" distL="0" distR="0" wp14:anchorId="27EC1C67" wp14:editId="407C7A89">
+          <wp:inline distT="0" distB="0" distL="0" distR="0" wp14:anchorId="27EC1C67" wp14:editId="1C09A601">
             <wp:extent cx="3055620" cy="1718786"/>
             <wp:effectExtent l="0" t="0" r="0" b="0"/>
             <wp:docPr id="6" name="Kép 6" descr="C:\Users\elnabulsy.csongor\Downloads\ui_main_admin.png"/>
@@ -1578,7 +1578,7 @@
           <w:szCs w:val="36"/>
         </w:rPr>
         <w:drawing>
-          <wp:inline distT="0" distB="0" distL="0" distR="0" wp14:anchorId="08225B4F" wp14:editId="299B28E4">
+          <wp:inline distT="0" distB="0" distL="0" distR="0" wp14:anchorId="08225B4F" wp14:editId="1FE7D601">
             <wp:extent cx="2933700" cy="1942430"/>
             <wp:effectExtent l="0" t="0" r="0" b="1270"/>
             <wp:docPr id="7" name="Kép 7" descr="C:\Users\elnabulsy.csongor\Downloads\ui_structure.png"/>
@@ -1751,7 +1751,7 @@
           <w:szCs w:val="36"/>
         </w:rPr>
         <w:drawing>
-          <wp:inline distT="0" distB="0" distL="0" distR="0" wp14:anchorId="2C256DB5" wp14:editId="3512B449">
+          <wp:inline distT="0" distB="0" distL="0" distR="0" wp14:anchorId="2C256DB5" wp14:editId="0B1E2E6E">
             <wp:extent cx="3329940" cy="1752493"/>
             <wp:effectExtent l="0" t="0" r="3810" b="635"/>
             <wp:docPr id="9" name="Kép 9"/>
@@ -4137,6 +4137,665 @@
         <w:t>Példaadatok hozzáadása a zenékhez</w:t>
       </w:r>
     </w:p>
+    <w:p>
+      <w:pPr>
+        <w:jc w:val="both"/>
+        <w:rPr>
+          <w:rFonts w:ascii="Times New Roman" w:eastAsia="Times New Roman" w:hAnsi="Times New Roman" w:cs="Times New Roman"/>
+          <w:sz w:val="36"/>
+          <w:szCs w:val="36"/>
+        </w:rPr>
+      </w:pPr>
+    </w:p>
+    <w:p>
+      <w:pPr>
+        <w:jc w:val="both"/>
+        <w:rPr>
+          <w:rFonts w:ascii="Times New Roman" w:eastAsia="Times New Roman" w:hAnsi="Times New Roman" w:cs="Times New Roman"/>
+          <w:b/>
+          <w:bCs/>
+          <w:sz w:val="40"/>
+          <w:szCs w:val="40"/>
+        </w:rPr>
+      </w:pPr>
+      <w:r>
+        <w:rPr>
+          <w:rFonts w:ascii="Times New Roman" w:eastAsia="Times New Roman" w:hAnsi="Times New Roman" w:cs="Times New Roman"/>
+          <w:b/>
+          <w:bCs/>
+          <w:sz w:val="40"/>
+          <w:szCs w:val="40"/>
+        </w:rPr>
+        <w:t>2026-04-13 9:25-11:50</w:t>
+      </w:r>
+      <w:r>
+        <w:rPr>
+          <w:rFonts w:ascii="Times New Roman" w:eastAsia="Times New Roman" w:hAnsi="Times New Roman" w:cs="Times New Roman"/>
+          <w:b/>
+          <w:bCs/>
+          <w:sz w:val="40"/>
+          <w:szCs w:val="40"/>
+        </w:rPr>
+        <w:t>, 12:30-50</w:t>
+      </w:r>
+    </w:p>
+    <w:p>
+      <w:pPr>
+        <w:jc w:val="both"/>
+        <w:rPr>
+          <w:rFonts w:ascii="Times New Roman" w:eastAsia="Times New Roman" w:hAnsi="Times New Roman" w:cs="Times New Roman"/>
+          <w:sz w:val="36"/>
+          <w:szCs w:val="36"/>
+        </w:rPr>
+      </w:pPr>
+      <w:r>
+        <w:rPr>
+          <w:rFonts w:ascii="Times New Roman" w:eastAsia="Times New Roman" w:hAnsi="Times New Roman" w:cs="Times New Roman"/>
+          <w:sz w:val="36"/>
+          <w:szCs w:val="36"/>
+        </w:rPr>
+        <w:t xml:space="preserve">(Susán Csongor György) </w:t>
+      </w:r>
+    </w:p>
+    <w:p>
+      <w:pPr>
+        <w:pStyle w:val="Listaszerbekezds"/>
+        <w:numPr>
+          <w:ilvl w:val="0"/>
+          <w:numId w:val="10"/>
+        </w:numPr>
+        <w:jc w:val="both"/>
+        <w:rPr>
+          <w:rFonts w:ascii="Times New Roman" w:eastAsia="Times New Roman" w:hAnsi="Times New Roman" w:cs="Times New Roman"/>
+          <w:sz w:val="36"/>
+          <w:szCs w:val="36"/>
+        </w:rPr>
+      </w:pPr>
+      <w:r>
+        <w:rPr>
+          <w:rFonts w:ascii="Times New Roman" w:eastAsia="Times New Roman" w:hAnsi="Times New Roman" w:cs="Times New Roman"/>
+          <w:sz w:val="36"/>
+          <w:szCs w:val="36"/>
+        </w:rPr>
+        <w:t>Regisztrációs képernyő és gomb hozzáadása, mivel ez szükséges a vizsgaremek követelményeinek teljesítéséhez</w:t>
+      </w:r>
+      <w:r>
+        <w:rPr>
+          <w:rFonts w:ascii="Times New Roman" w:eastAsia="Times New Roman" w:hAnsi="Times New Roman" w:cs="Times New Roman"/>
+          <w:sz w:val="36"/>
+          <w:szCs w:val="36"/>
+        </w:rPr>
+        <w:t xml:space="preserve"> (az eddigi logika alapján egy, az iskola által menedzselt </w:t>
+      </w:r>
+      <w:r>
+        <w:rPr>
+          <w:rFonts w:ascii="Times New Roman" w:eastAsia="Times New Roman" w:hAnsi="Times New Roman" w:cs="Times New Roman"/>
+          <w:sz w:val="36"/>
+          <w:szCs w:val="36"/>
+        </w:rPr>
+        <w:lastRenderedPageBreak/>
+        <w:t>„központi adatbázisból” kérte volna be az alkalmazás a diákokat)</w:t>
+      </w:r>
+      <w:r>
+        <w:rPr>
+          <w:rFonts w:ascii="Times New Roman" w:eastAsia="Times New Roman" w:hAnsi="Times New Roman" w:cs="Times New Roman"/>
+          <w:sz w:val="36"/>
+          <w:szCs w:val="36"/>
+        </w:rPr>
+        <w:t>.</w:t>
+      </w:r>
+    </w:p>
+    <w:p>
+      <w:pPr>
+        <w:pStyle w:val="Listaszerbekezds"/>
+        <w:numPr>
+          <w:ilvl w:val="0"/>
+          <w:numId w:val="10"/>
+        </w:numPr>
+        <w:jc w:val="both"/>
+        <w:rPr>
+          <w:rFonts w:ascii="Times New Roman" w:eastAsia="Times New Roman" w:hAnsi="Times New Roman" w:cs="Times New Roman"/>
+          <w:sz w:val="36"/>
+          <w:szCs w:val="36"/>
+        </w:rPr>
+      </w:pPr>
+      <w:r>
+        <w:rPr>
+          <w:rFonts w:ascii="Times New Roman" w:eastAsia="Times New Roman" w:hAnsi="Times New Roman" w:cs="Times New Roman"/>
+          <w:sz w:val="36"/>
+          <w:szCs w:val="36"/>
+        </w:rPr>
+        <w:t>Felvétel előtt álló felhasználók (PendingUser) táblájának hozzáadása az adatbázisba</w:t>
+      </w:r>
+      <w:r>
+        <w:rPr>
+          <w:rFonts w:ascii="Times New Roman" w:eastAsia="Times New Roman" w:hAnsi="Times New Roman" w:cs="Times New Roman"/>
+          <w:sz w:val="36"/>
+          <w:szCs w:val="36"/>
+        </w:rPr>
+        <w:t>, illetve a regisztráció kódjának megírása.</w:t>
+      </w:r>
+    </w:p>
+    <w:p>
+      <w:pPr>
+        <w:pStyle w:val="Listaszerbekezds"/>
+        <w:numPr>
+          <w:ilvl w:val="0"/>
+          <w:numId w:val="10"/>
+        </w:numPr>
+        <w:jc w:val="both"/>
+        <w:rPr>
+          <w:rFonts w:ascii="Times New Roman" w:eastAsia="Times New Roman" w:hAnsi="Times New Roman" w:cs="Times New Roman"/>
+          <w:sz w:val="36"/>
+          <w:szCs w:val="36"/>
+        </w:rPr>
+      </w:pPr>
+      <w:r>
+        <w:rPr>
+          <w:rFonts w:ascii="Times New Roman" w:eastAsia="Times New Roman" w:hAnsi="Times New Roman" w:cs="Times New Roman"/>
+          <w:sz w:val="36"/>
+          <w:szCs w:val="36"/>
+        </w:rPr>
+        <w:t>Regisztráció debuggolása</w:t>
+      </w:r>
+    </w:p>
+    <w:p>
+      <w:pPr>
+        <w:jc w:val="both"/>
+        <w:rPr>
+          <w:rFonts w:ascii="Times New Roman" w:eastAsia="Times New Roman" w:hAnsi="Times New Roman" w:cs="Times New Roman"/>
+          <w:sz w:val="36"/>
+          <w:szCs w:val="36"/>
+        </w:rPr>
+      </w:pPr>
+      <w:r>
+        <w:rPr>
+          <w:rFonts w:ascii="Times New Roman" w:eastAsia="Times New Roman" w:hAnsi="Times New Roman" w:cs="Times New Roman"/>
+          <w:sz w:val="36"/>
+          <w:szCs w:val="36"/>
+        </w:rPr>
+        <w:t>(El-Nabulsy Csongor Alan) WaitingView (ahova regisztráció után navigál az oldal) létrehozása.</w:t>
+      </w:r>
+    </w:p>
+    <w:p>
+      <w:pPr>
+        <w:jc w:val="both"/>
+        <w:rPr>
+          <w:rFonts w:ascii="Times New Roman" w:eastAsia="Times New Roman" w:hAnsi="Times New Roman" w:cs="Times New Roman"/>
+          <w:sz w:val="36"/>
+          <w:szCs w:val="36"/>
+        </w:rPr>
+      </w:pPr>
+    </w:p>
+    <w:p>
+      <w:pPr>
+        <w:jc w:val="both"/>
+        <w:rPr>
+          <w:rFonts w:ascii="Times New Roman" w:eastAsia="Times New Roman" w:hAnsi="Times New Roman" w:cs="Times New Roman"/>
+          <w:sz w:val="36"/>
+          <w:szCs w:val="36"/>
+        </w:rPr>
+      </w:pPr>
+      <w:r>
+        <w:rPr>
+          <w:rFonts w:ascii="Times New Roman" w:eastAsia="Times New Roman" w:hAnsi="Times New Roman" w:cs="Times New Roman"/>
+          <w:sz w:val="36"/>
+          <w:szCs w:val="36"/>
+        </w:rPr>
+        <w:t>Elkezdtük tervezni az oldal regisztrációs részének működését, és megterveztem az admin és a guest közötti kapcsolat működését, így készítettem egy WaitingView oldalt ahova a regisztráció után átdobja a user-t és vár amieddig az admin vissza nem igazolja elfogadással, vagy elutasítással. </w:t>
+      </w:r>
+    </w:p>
+    <w:p>
+      <w:pPr>
+        <w:jc w:val="both"/>
+        <w:rPr>
+          <w:rFonts w:ascii="Times New Roman" w:eastAsia="Times New Roman" w:hAnsi="Times New Roman" w:cs="Times New Roman"/>
+          <w:sz w:val="36"/>
+          <w:szCs w:val="36"/>
+        </w:rPr>
+      </w:pPr>
+    </w:p>
+    <w:p>
+      <w:pPr>
+        <w:jc w:val="both"/>
+        <w:rPr>
+          <w:rFonts w:ascii="Times New Roman" w:eastAsia="Times New Roman" w:hAnsi="Times New Roman" w:cs="Times New Roman"/>
+          <w:sz w:val="36"/>
+          <w:szCs w:val="36"/>
+        </w:rPr>
+      </w:pPr>
+      <w:r>
+        <w:rPr>
+          <w:rFonts w:ascii="Times New Roman" w:eastAsia="Times New Roman" w:hAnsi="Times New Roman" w:cs="Times New Roman"/>
+          <w:sz w:val="36"/>
+          <w:szCs w:val="36"/>
+        </w:rPr>
+        <w:t>Admin mode szerkesztések</w:t>
+      </w:r>
+    </w:p>
+    <w:p>
+      <w:pPr>
+        <w:jc w:val="both"/>
+        <w:rPr>
+          <w:rFonts w:ascii="Times New Roman" w:eastAsia="Times New Roman" w:hAnsi="Times New Roman" w:cs="Times New Roman"/>
+          <w:sz w:val="36"/>
+          <w:szCs w:val="36"/>
+        </w:rPr>
+      </w:pPr>
+      <w:r>
+        <w:rPr>
+          <w:rFonts w:ascii="Times New Roman" w:eastAsia="Times New Roman" w:hAnsi="Times New Roman" w:cs="Times New Roman"/>
+          <w:sz w:val="36"/>
+          <w:szCs w:val="36"/>
+        </w:rPr>
+        <w:t>- Admin kezeli azokat akik regisztrálnak</w:t>
+      </w:r>
+    </w:p>
+    <w:p>
+      <w:pPr>
+        <w:jc w:val="both"/>
+        <w:rPr>
+          <w:rFonts w:ascii="Times New Roman" w:eastAsia="Times New Roman" w:hAnsi="Times New Roman" w:cs="Times New Roman"/>
+          <w:sz w:val="36"/>
+          <w:szCs w:val="36"/>
+        </w:rPr>
+      </w:pPr>
+      <w:r>
+        <w:rPr>
+          <w:rFonts w:ascii="Times New Roman" w:eastAsia="Times New Roman" w:hAnsi="Times New Roman" w:cs="Times New Roman"/>
+          <w:sz w:val="36"/>
+          <w:szCs w:val="36"/>
+        </w:rPr>
+        <w:t>- Admin elfogadja vagy elutasítja a regisztráló user-eket</w:t>
+      </w:r>
+    </w:p>
+    <w:p>
+      <w:pPr>
+        <w:jc w:val="both"/>
+        <w:rPr>
+          <w:rFonts w:ascii="Times New Roman" w:eastAsia="Times New Roman" w:hAnsi="Times New Roman" w:cs="Times New Roman"/>
+          <w:sz w:val="36"/>
+          <w:szCs w:val="36"/>
+        </w:rPr>
+      </w:pPr>
+      <w:r>
+        <w:rPr>
+          <w:rFonts w:ascii="Times New Roman" w:eastAsia="Times New Roman" w:hAnsi="Times New Roman" w:cs="Times New Roman"/>
+          <w:sz w:val="36"/>
+          <w:szCs w:val="36"/>
+        </w:rPr>
+        <w:t>- Ha elfogadja akkor e-mail c</w:t>
+      </w:r>
+      <w:r>
+        <w:rPr>
+          <w:rFonts w:ascii="Times New Roman" w:eastAsia="Times New Roman" w:hAnsi="Times New Roman" w:cs="Times New Roman"/>
+          <w:sz w:val="36"/>
+          <w:szCs w:val="36"/>
+        </w:rPr>
+        <w:t>í</w:t>
+      </w:r>
+      <w:r>
+        <w:rPr>
+          <w:rFonts w:ascii="Times New Roman" w:eastAsia="Times New Roman" w:hAnsi="Times New Roman" w:cs="Times New Roman"/>
+          <w:sz w:val="36"/>
+          <w:szCs w:val="36"/>
+        </w:rPr>
+        <w:t>m alapján elhelyezi őket hogy Bláthy-s diák vagy máshonnan</w:t>
+      </w:r>
+      <w:r>
+        <w:rPr>
+          <w:rFonts w:ascii="Times New Roman" w:eastAsia="Times New Roman" w:hAnsi="Times New Roman" w:cs="Times New Roman"/>
+          <w:sz w:val="36"/>
+          <w:szCs w:val="36"/>
+        </w:rPr>
+        <w:t xml:space="preserve"> van</w:t>
+      </w:r>
+      <w:r>
+        <w:rPr>
+          <w:rFonts w:ascii="Times New Roman" w:eastAsia="Times New Roman" w:hAnsi="Times New Roman" w:cs="Times New Roman"/>
+          <w:sz w:val="36"/>
+          <w:szCs w:val="36"/>
+        </w:rPr>
+        <w:t xml:space="preserve"> </w:t>
+      </w:r>
+      <w:r>
+        <w:rPr>
+          <w:rFonts w:ascii="Times New Roman" w:eastAsia="Times New Roman" w:hAnsi="Times New Roman" w:cs="Times New Roman"/>
+          <w:sz w:val="36"/>
+          <w:szCs w:val="36"/>
+        </w:rPr>
+        <w:t>(@blathy v. más)</w:t>
+      </w:r>
+    </w:p>
+    <w:p>
+      <w:pPr>
+        <w:jc w:val="both"/>
+        <w:rPr>
+          <w:rFonts w:ascii="Times New Roman" w:eastAsia="Times New Roman" w:hAnsi="Times New Roman" w:cs="Times New Roman"/>
+          <w:sz w:val="36"/>
+          <w:szCs w:val="36"/>
+        </w:rPr>
+      </w:pPr>
+      <w:r>
+        <w:rPr>
+          <w:rFonts w:ascii="Times New Roman" w:eastAsia="Times New Roman" w:hAnsi="Times New Roman" w:cs="Times New Roman"/>
+          <w:sz w:val="36"/>
+          <w:szCs w:val="36"/>
+        </w:rPr>
+        <w:t>- Ha elutasítja akkor törölve lesz a regisztráció</w:t>
+      </w:r>
+    </w:p>
+    <w:p>
+      <w:pPr>
+        <w:jc w:val="both"/>
+        <w:rPr>
+          <w:rFonts w:ascii="Times New Roman" w:eastAsia="Times New Roman" w:hAnsi="Times New Roman" w:cs="Times New Roman"/>
+          <w:sz w:val="36"/>
+          <w:szCs w:val="36"/>
+        </w:rPr>
+      </w:pPr>
+      <w:r>
+        <w:rPr>
+          <w:rFonts w:ascii="Times New Roman" w:eastAsia="Times New Roman" w:hAnsi="Times New Roman" w:cs="Times New Roman"/>
+          <w:sz w:val="36"/>
+          <w:szCs w:val="36"/>
+        </w:rPr>
+        <w:t>- A user regisztráció után átkerül egy oldalra (köszönjük hogy regisztrált stb.)</w:t>
+      </w:r>
+    </w:p>
+    <w:p>
+      <w:pPr>
+        <w:jc w:val="both"/>
+        <w:rPr>
+          <w:rFonts w:ascii="Times New Roman" w:eastAsia="Times New Roman" w:hAnsi="Times New Roman" w:cs="Times New Roman"/>
+          <w:sz w:val="36"/>
+          <w:szCs w:val="36"/>
+        </w:rPr>
+      </w:pPr>
+      <w:r>
+        <w:rPr>
+          <w:rFonts w:ascii="Times New Roman" w:eastAsia="Times New Roman" w:hAnsi="Times New Roman" w:cs="Times New Roman"/>
+          <w:sz w:val="36"/>
+          <w:szCs w:val="36"/>
+        </w:rPr>
+        <w:t>- Update: status a usereknek</w:t>
+      </w:r>
+      <w:r>
+        <w:rPr>
+          <w:rFonts w:ascii="Times New Roman" w:eastAsia="Times New Roman" w:hAnsi="Times New Roman" w:cs="Times New Roman"/>
+          <w:sz w:val="36"/>
+          <w:szCs w:val="36"/>
+        </w:rPr>
+        <w:t xml:space="preserve"> </w:t>
+      </w:r>
+      <w:r>
+        <w:rPr>
+          <w:rFonts w:ascii="Times New Roman" w:eastAsia="Times New Roman" w:hAnsi="Times New Roman" w:cs="Times New Roman"/>
+          <w:sz w:val="36"/>
+          <w:szCs w:val="36"/>
+        </w:rPr>
+        <w:t xml:space="preserve">(pending, </w:t>
+      </w:r>
+      <w:r>
+        <w:rPr>
+          <w:rFonts w:ascii="Times New Roman" w:eastAsia="Times New Roman" w:hAnsi="Times New Roman" w:cs="Times New Roman"/>
+          <w:sz w:val="36"/>
+          <w:szCs w:val="36"/>
+        </w:rPr>
+        <w:t>accepted</w:t>
+      </w:r>
+      <w:r>
+        <w:rPr>
+          <w:rFonts w:ascii="Times New Roman" w:eastAsia="Times New Roman" w:hAnsi="Times New Roman" w:cs="Times New Roman"/>
+          <w:sz w:val="36"/>
+          <w:szCs w:val="36"/>
+        </w:rPr>
+        <w:t>, rejected)</w:t>
+      </w:r>
+    </w:p>
+    <w:p>
+      <w:pPr>
+        <w:jc w:val="both"/>
+        <w:rPr>
+          <w:rFonts w:ascii="Times New Roman" w:eastAsia="Times New Roman" w:hAnsi="Times New Roman" w:cs="Times New Roman"/>
+          <w:sz w:val="36"/>
+          <w:szCs w:val="36"/>
+        </w:rPr>
+      </w:pPr>
+      <w:r>
+        <w:rPr>
+          <w:rFonts w:ascii="Times New Roman" w:eastAsia="Times New Roman" w:hAnsi="Times New Roman" w:cs="Times New Roman"/>
+          <w:sz w:val="36"/>
+          <w:szCs w:val="36"/>
+        </w:rPr>
+        <w:lastRenderedPageBreak/>
+        <w:t xml:space="preserve">- </w:t>
+      </w:r>
+      <w:r>
+        <w:rPr>
+          <w:rFonts w:ascii="Times New Roman" w:eastAsia="Times New Roman" w:hAnsi="Times New Roman" w:cs="Times New Roman"/>
+          <w:sz w:val="36"/>
+          <w:szCs w:val="36"/>
+        </w:rPr>
+        <w:t>V</w:t>
+      </w:r>
+      <w:r>
+        <w:rPr>
+          <w:rFonts w:ascii="Times New Roman" w:eastAsia="Times New Roman" w:hAnsi="Times New Roman" w:cs="Times New Roman"/>
+          <w:sz w:val="36"/>
+          <w:szCs w:val="36"/>
+        </w:rPr>
+        <w:t xml:space="preserve">ue figyeli </w:t>
+      </w:r>
+      <w:r>
+        <w:rPr>
+          <w:rFonts w:ascii="Times New Roman" w:eastAsia="Times New Roman" w:hAnsi="Times New Roman" w:cs="Times New Roman"/>
+          <w:sz w:val="36"/>
+          <w:szCs w:val="36"/>
+        </w:rPr>
+        <w:t>L</w:t>
+      </w:r>
+      <w:r>
+        <w:rPr>
+          <w:rFonts w:ascii="Times New Roman" w:eastAsia="Times New Roman" w:hAnsi="Times New Roman" w:cs="Times New Roman"/>
+          <w:sz w:val="36"/>
+          <w:szCs w:val="36"/>
+        </w:rPr>
+        <w:t>ocal</w:t>
+      </w:r>
+      <w:r>
+        <w:rPr>
+          <w:rFonts w:ascii="Times New Roman" w:eastAsia="Times New Roman" w:hAnsi="Times New Roman" w:cs="Times New Roman"/>
+          <w:sz w:val="36"/>
+          <w:szCs w:val="36"/>
+        </w:rPr>
+        <w:t>S</w:t>
+      </w:r>
+      <w:r>
+        <w:rPr>
+          <w:rFonts w:ascii="Times New Roman" w:eastAsia="Times New Roman" w:hAnsi="Times New Roman" w:cs="Times New Roman"/>
+          <w:sz w:val="36"/>
+          <w:szCs w:val="36"/>
+        </w:rPr>
+        <w:t>torage</w:t>
+      </w:r>
+      <w:r>
+        <w:rPr>
+          <w:rFonts w:ascii="Times New Roman" w:eastAsia="Times New Roman" w:hAnsi="Times New Roman" w:cs="Times New Roman"/>
+          <w:sz w:val="36"/>
+          <w:szCs w:val="36"/>
+        </w:rPr>
+        <w:t>-</w:t>
+      </w:r>
+      <w:r>
+        <w:rPr>
+          <w:rFonts w:ascii="Times New Roman" w:eastAsia="Times New Roman" w:hAnsi="Times New Roman" w:cs="Times New Roman"/>
+          <w:sz w:val="36"/>
+          <w:szCs w:val="36"/>
+        </w:rPr>
+        <w:t>b</w:t>
+      </w:r>
+      <w:r>
+        <w:rPr>
+          <w:rFonts w:ascii="Times New Roman" w:eastAsia="Times New Roman" w:hAnsi="Times New Roman" w:cs="Times New Roman"/>
+          <w:sz w:val="36"/>
+          <w:szCs w:val="36"/>
+        </w:rPr>
+        <w:t>e</w:t>
+      </w:r>
+      <w:r>
+        <w:rPr>
+          <w:rFonts w:ascii="Times New Roman" w:eastAsia="Times New Roman" w:hAnsi="Times New Roman" w:cs="Times New Roman"/>
+          <w:sz w:val="36"/>
+          <w:szCs w:val="36"/>
+        </w:rPr>
+        <w:t>n token alapján hogy ki van bejelentkezve és milyen státusza van</w:t>
+      </w:r>
+    </w:p>
+    <w:p>
+      <w:pPr>
+        <w:jc w:val="both"/>
+        <w:rPr>
+          <w:rFonts w:ascii="Times New Roman" w:eastAsia="Times New Roman" w:hAnsi="Times New Roman" w:cs="Times New Roman"/>
+          <w:sz w:val="36"/>
+          <w:szCs w:val="36"/>
+        </w:rPr>
+      </w:pPr>
+      <w:r>
+        <w:rPr>
+          <w:rFonts w:ascii="Times New Roman" w:eastAsia="Times New Roman" w:hAnsi="Times New Roman" w:cs="Times New Roman"/>
+          <w:sz w:val="36"/>
+          <w:szCs w:val="36"/>
+        </w:rPr>
+        <w:t>- Kell egy waiting oldal ahol a user vár a válaszra</w:t>
+      </w:r>
+    </w:p>
+    <w:p>
+      <w:pPr>
+        <w:jc w:val="both"/>
+        <w:rPr>
+          <w:rFonts w:ascii="Times New Roman" w:eastAsia="Times New Roman" w:hAnsi="Times New Roman" w:cs="Times New Roman"/>
+          <w:sz w:val="36"/>
+          <w:szCs w:val="36"/>
+        </w:rPr>
+      </w:pPr>
+      <w:r>
+        <w:rPr>
+          <w:rFonts w:ascii="Times New Roman" w:eastAsia="Times New Roman" w:hAnsi="Times New Roman" w:cs="Times New Roman"/>
+          <w:sz w:val="36"/>
+          <w:szCs w:val="36"/>
+        </w:rPr>
+        <w:t xml:space="preserve">- </w:t>
+      </w:r>
+      <w:r>
+        <w:rPr>
+          <w:rFonts w:ascii="Times New Roman" w:eastAsia="Times New Roman" w:hAnsi="Times New Roman" w:cs="Times New Roman"/>
+          <w:sz w:val="36"/>
+          <w:szCs w:val="36"/>
+        </w:rPr>
+        <w:t xml:space="preserve">Admin oldalon a </w:t>
+      </w:r>
+      <w:r>
+        <w:rPr>
+          <w:rFonts w:ascii="Times New Roman" w:eastAsia="Times New Roman" w:hAnsi="Times New Roman" w:cs="Times New Roman"/>
+          <w:sz w:val="36"/>
+          <w:szCs w:val="36"/>
+        </w:rPr>
+        <w:t>szűrés</w:t>
+      </w:r>
+      <w:r>
+        <w:rPr>
+          <w:rFonts w:ascii="Times New Roman" w:eastAsia="Times New Roman" w:hAnsi="Times New Roman" w:cs="Times New Roman"/>
+          <w:sz w:val="36"/>
+          <w:szCs w:val="36"/>
+        </w:rPr>
+        <w:t xml:space="preserve"> pending alapján és megnézi hogy kinek az email </w:t>
+      </w:r>
+      <w:r>
+        <w:rPr>
+          <w:rFonts w:ascii="Times New Roman" w:eastAsia="Times New Roman" w:hAnsi="Times New Roman" w:cs="Times New Roman"/>
+          <w:sz w:val="36"/>
+          <w:szCs w:val="36"/>
+        </w:rPr>
+        <w:t>cím</w:t>
+      </w:r>
+      <w:r>
+        <w:rPr>
+          <w:rFonts w:ascii="Times New Roman" w:eastAsia="Times New Roman" w:hAnsi="Times New Roman" w:cs="Times New Roman"/>
+          <w:sz w:val="36"/>
+          <w:szCs w:val="36"/>
+        </w:rPr>
+        <w:t>ének a</w:t>
+      </w:r>
+      <w:r>
+        <w:rPr>
+          <w:rFonts w:ascii="Times New Roman" w:eastAsia="Times New Roman" w:hAnsi="Times New Roman" w:cs="Times New Roman"/>
+          <w:sz w:val="36"/>
+          <w:szCs w:val="36"/>
+        </w:rPr>
+        <w:t xml:space="preserve"> vége blathy.info vagy más</w:t>
+      </w:r>
+    </w:p>
+    <w:p>
+      <w:pPr>
+        <w:jc w:val="both"/>
+        <w:rPr>
+          <w:rFonts w:ascii="Times New Roman" w:eastAsia="Times New Roman" w:hAnsi="Times New Roman" w:cs="Times New Roman"/>
+          <w:sz w:val="36"/>
+          <w:szCs w:val="36"/>
+        </w:rPr>
+      </w:pPr>
+      <w:r>
+        <w:rPr>
+          <w:rFonts w:ascii="Times New Roman" w:eastAsia="Times New Roman" w:hAnsi="Times New Roman" w:cs="Times New Roman"/>
+          <w:sz w:val="36"/>
+          <w:szCs w:val="36"/>
+        </w:rPr>
+        <w:t xml:space="preserve">- Itt történik hogy az admin </w:t>
+      </w:r>
+      <w:r>
+        <w:rPr>
+          <w:rFonts w:ascii="Times New Roman" w:eastAsia="Times New Roman" w:hAnsi="Times New Roman" w:cs="Times New Roman"/>
+          <w:sz w:val="36"/>
+          <w:szCs w:val="36"/>
+        </w:rPr>
+        <w:t>manuális</w:t>
+      </w:r>
+      <w:r>
+        <w:rPr>
+          <w:rFonts w:ascii="Times New Roman" w:eastAsia="Times New Roman" w:hAnsi="Times New Roman" w:cs="Times New Roman"/>
+          <w:sz w:val="36"/>
+          <w:szCs w:val="36"/>
+        </w:rPr>
+        <w:t>an</w:t>
+      </w:r>
+      <w:r>
+        <w:rPr>
+          <w:rFonts w:ascii="Times New Roman" w:eastAsia="Times New Roman" w:hAnsi="Times New Roman" w:cs="Times New Roman"/>
+          <w:sz w:val="36"/>
+          <w:szCs w:val="36"/>
+        </w:rPr>
+        <w:t xml:space="preserve"> elfogadja vagy elutasítja</w:t>
+      </w:r>
+    </w:p>
+    <w:p>
+      <w:pPr>
+        <w:jc w:val="both"/>
+        <w:rPr>
+          <w:rFonts w:ascii="Times New Roman" w:eastAsia="Times New Roman" w:hAnsi="Times New Roman" w:cs="Times New Roman"/>
+          <w:sz w:val="36"/>
+          <w:szCs w:val="36"/>
+        </w:rPr>
+      </w:pPr>
+      <w:r>
+        <w:rPr>
+          <w:rFonts w:ascii="Times New Roman" w:eastAsia="Times New Roman" w:hAnsi="Times New Roman" w:cs="Times New Roman"/>
+          <w:sz w:val="36"/>
+          <w:szCs w:val="36"/>
+        </w:rPr>
+        <w:t>- Az admin változtathat egy másik user role-ján</w:t>
+      </w:r>
+    </w:p>
     <w:sectPr>
       <w:pgSz w:w="11906" w:h="16838"/>
       <w:pgMar w:top="1417" w:right="1417" w:bottom="1417" w:left="1417" w:header="708" w:footer="708" w:gutter="0"/>
@@ -4289,6 +4948,119 @@
     </w:lvl>
   </w:abstractNum>
   <w:abstractNum w:abstractNumId="1" w15:restartNumberingAfterBreak="0">
+    <w:nsid w:val="2FAB7B65"/>
+    <w:multiLevelType w:val="hybridMultilevel"/>
+    <w:tmpl w:val="2F64555A"/>
+    <w:lvl w:ilvl="0" w:tplc="040E0001">
+      <w:start w:val="1"/>
+      <w:numFmt w:val="bullet"/>
+      <w:lvlText w:val=""/>
+      <w:lvlJc w:val="left"/>
+      <w:pPr>
+        <w:ind w:left="720" w:hanging="360"/>
+      </w:pPr>
+      <w:rPr>
+        <w:rFonts w:ascii="Symbol" w:hAnsi="Symbol" w:hint="default"/>
+      </w:rPr>
+    </w:lvl>
+    <w:lvl w:ilvl="1" w:tplc="040E0003" w:tentative="1">
+      <w:start w:val="1"/>
+      <w:numFmt w:val="bullet"/>
+      <w:lvlText w:val="o"/>
+      <w:lvlJc w:val="left"/>
+      <w:pPr>
+        <w:ind w:left="1440" w:hanging="360"/>
+      </w:pPr>
+      <w:rPr>
+        <w:rFonts w:ascii="Courier New" w:hAnsi="Courier New" w:cs="Courier New" w:hint="default"/>
+      </w:rPr>
+    </w:lvl>
+    <w:lvl w:ilvl="2" w:tplc="040E0005" w:tentative="1">
+      <w:start w:val="1"/>
+      <w:numFmt w:val="bullet"/>
+      <w:lvlText w:val=""/>
+      <w:lvlJc w:val="left"/>
+      <w:pPr>
+        <w:ind w:left="2160" w:hanging="360"/>
+      </w:pPr>
+      <w:rPr>
+        <w:rFonts w:ascii="Wingdings" w:hAnsi="Wingdings" w:hint="default"/>
+      </w:rPr>
+    </w:lvl>
+    <w:lvl w:ilvl="3" w:tplc="040E0001" w:tentative="1">
+      <w:start w:val="1"/>
+      <w:numFmt w:val="bullet"/>
+      <w:lvlText w:val=""/>
+      <w:lvlJc w:val="left"/>
+      <w:pPr>
+        <w:ind w:left="2880" w:hanging="360"/>
+      </w:pPr>
+      <w:rPr>
+        <w:rFonts w:ascii="Symbol" w:hAnsi="Symbol" w:hint="default"/>
+      </w:rPr>
+    </w:lvl>
+    <w:lvl w:ilvl="4" w:tplc="040E0003" w:tentative="1">
+      <w:start w:val="1"/>
+      <w:numFmt w:val="bullet"/>
+      <w:lvlText w:val="o"/>
+      <w:lvlJc w:val="left"/>
+      <w:pPr>
+        <w:ind w:left="3600" w:hanging="360"/>
+      </w:pPr>
+      <w:rPr>
+        <w:rFonts w:ascii="Courier New" w:hAnsi="Courier New" w:cs="Courier New" w:hint="default"/>
+      </w:rPr>
+    </w:lvl>
+    <w:lvl w:ilvl="5" w:tplc="040E0005" w:tentative="1">
+      <w:start w:val="1"/>
+      <w:numFmt w:val="bullet"/>
+      <w:lvlText w:val=""/>
+      <w:lvlJc w:val="left"/>
+      <w:pPr>
+        <w:ind w:left="4320" w:hanging="360"/>
+      </w:pPr>
+      <w:rPr>
+        <w:rFonts w:ascii="Wingdings" w:hAnsi="Wingdings" w:hint="default"/>
+      </w:rPr>
+    </w:lvl>
+    <w:lvl w:ilvl="6" w:tplc="040E0001" w:tentative="1">
+      <w:start w:val="1"/>
+      <w:numFmt w:val="bullet"/>
+      <w:lvlText w:val=""/>
+      <w:lvlJc w:val="left"/>
+      <w:pPr>
+        <w:ind w:left="5040" w:hanging="360"/>
+      </w:pPr>
+      <w:rPr>
+        <w:rFonts w:ascii="Symbol" w:hAnsi="Symbol" w:hint="default"/>
+      </w:rPr>
+    </w:lvl>
+    <w:lvl w:ilvl="7" w:tplc="040E0003" w:tentative="1">
+      <w:start w:val="1"/>
+      <w:numFmt w:val="bullet"/>
+      <w:lvlText w:val="o"/>
+      <w:lvlJc w:val="left"/>
+      <w:pPr>
+        <w:ind w:left="5760" w:hanging="360"/>
+      </w:pPr>
+      <w:rPr>
+        <w:rFonts w:ascii="Courier New" w:hAnsi="Courier New" w:cs="Courier New" w:hint="default"/>
+      </w:rPr>
+    </w:lvl>
+    <w:lvl w:ilvl="8" w:tplc="040E0005" w:tentative="1">
+      <w:start w:val="1"/>
+      <w:numFmt w:val="bullet"/>
+      <w:lvlText w:val=""/>
+      <w:lvlJc w:val="left"/>
+      <w:pPr>
+        <w:ind w:left="6480" w:hanging="360"/>
+      </w:pPr>
+      <w:rPr>
+        <w:rFonts w:ascii="Wingdings" w:hAnsi="Wingdings" w:hint="default"/>
+      </w:rPr>
+    </w:lvl>
+  </w:abstractNum>
+  <w:abstractNum w:abstractNumId="2" w15:restartNumberingAfterBreak="0">
     <w:nsid w:val="3C1938F6"/>
     <w:multiLevelType w:val="hybridMultilevel"/>
     <w:tmpl w:val="0816ACA8"/>
@@ -4401,7 +5173,7 @@
       </w:rPr>
     </w:lvl>
   </w:abstractNum>
-  <w:abstractNum w:abstractNumId="2" w15:restartNumberingAfterBreak="0">
+  <w:abstractNum w:abstractNumId="3" w15:restartNumberingAfterBreak="0">
     <w:nsid w:val="47442E3E"/>
     <w:multiLevelType w:val="hybridMultilevel"/>
     <w:tmpl w:val="64928C38"/>
@@ -4514,7 +5286,7 @@
       </w:rPr>
     </w:lvl>
   </w:abstractNum>
-  <w:abstractNum w:abstractNumId="3" w15:restartNumberingAfterBreak="0">
+  <w:abstractNum w:abstractNumId="4" w15:restartNumberingAfterBreak="0">
     <w:nsid w:val="69361338"/>
     <w:multiLevelType w:val="hybridMultilevel"/>
     <w:tmpl w:val="6CF0B772"/>
@@ -4627,7 +5399,7 @@
       </w:rPr>
     </w:lvl>
   </w:abstractNum>
-  <w:abstractNum w:abstractNumId="4" w15:restartNumberingAfterBreak="0">
+  <w:abstractNum w:abstractNumId="5" w15:restartNumberingAfterBreak="0">
     <w:nsid w:val="69FA5A50"/>
     <w:multiLevelType w:val="hybridMultilevel"/>
     <w:tmpl w:val="D82A6326"/>
@@ -4740,7 +5512,7 @@
       </w:rPr>
     </w:lvl>
   </w:abstractNum>
-  <w:abstractNum w:abstractNumId="5" w15:restartNumberingAfterBreak="0">
+  <w:abstractNum w:abstractNumId="6" w15:restartNumberingAfterBreak="0">
     <w:nsid w:val="6E7312B6"/>
     <w:multiLevelType w:val="hybridMultilevel"/>
     <w:tmpl w:val="FD80BAFC"/>
@@ -4853,7 +5625,7 @@
       </w:rPr>
     </w:lvl>
   </w:abstractNum>
-  <w:abstractNum w:abstractNumId="6" w15:restartNumberingAfterBreak="0">
+  <w:abstractNum w:abstractNumId="7" w15:restartNumberingAfterBreak="0">
     <w:nsid w:val="76FA296F"/>
     <w:multiLevelType w:val="hybridMultilevel"/>
     <w:tmpl w:val="6DAE32EA"/>
@@ -4966,7 +5738,7 @@
       </w:rPr>
     </w:lvl>
   </w:abstractNum>
-  <w:abstractNum w:abstractNumId="7" w15:restartNumberingAfterBreak="0">
+  <w:abstractNum w:abstractNumId="8" w15:restartNumberingAfterBreak="0">
     <w:nsid w:val="788C73B2"/>
     <w:multiLevelType w:val="hybridMultilevel"/>
     <w:tmpl w:val="6D6C60B0"/>
@@ -5079,7 +5851,7 @@
       </w:rPr>
     </w:lvl>
   </w:abstractNum>
-  <w:abstractNum w:abstractNumId="8" w15:restartNumberingAfterBreak="0">
+  <w:abstractNum w:abstractNumId="9" w15:restartNumberingAfterBreak="0">
     <w:nsid w:val="7EB672F7"/>
     <w:multiLevelType w:val="hybridMultilevel"/>
     <w:tmpl w:val="A6F0C99C"/>
@@ -5193,31 +5965,34 @@
     </w:lvl>
   </w:abstractNum>
   <w:num w:numId="1" w16cid:durableId="1237017102">
+    <w:abstractNumId w:val="9"/>
+  </w:num>
+  <w:num w:numId="2" w16cid:durableId="23093752">
+    <w:abstractNumId w:val="6"/>
+  </w:num>
+  <w:num w:numId="3" w16cid:durableId="211231034">
+    <w:abstractNumId w:val="7"/>
+  </w:num>
+  <w:num w:numId="4" w16cid:durableId="285432383">
+    <w:abstractNumId w:val="2"/>
+  </w:num>
+  <w:num w:numId="5" w16cid:durableId="382339222">
+    <w:abstractNumId w:val="5"/>
+  </w:num>
+  <w:num w:numId="6" w16cid:durableId="1929121998">
+    <w:abstractNumId w:val="3"/>
+  </w:num>
+  <w:num w:numId="7" w16cid:durableId="989595552">
     <w:abstractNumId w:val="8"/>
   </w:num>
-  <w:num w:numId="2" w16cid:durableId="23093752">
-    <w:abstractNumId w:val="5"/>
-  </w:num>
-  <w:num w:numId="3" w16cid:durableId="211231034">
-    <w:abstractNumId w:val="6"/>
-  </w:num>
-  <w:num w:numId="4" w16cid:durableId="285432383">
-    <w:abstractNumId w:val="1"/>
-  </w:num>
-  <w:num w:numId="5" w16cid:durableId="382339222">
+  <w:num w:numId="8" w16cid:durableId="844437476">
     <w:abstractNumId w:val="4"/>
-  </w:num>
-  <w:num w:numId="6" w16cid:durableId="1929121998">
-    <w:abstractNumId w:val="2"/>
-  </w:num>
-  <w:num w:numId="7" w16cid:durableId="989595552">
-    <w:abstractNumId w:val="7"/>
-  </w:num>
-  <w:num w:numId="8" w16cid:durableId="844437476">
-    <w:abstractNumId w:val="3"/>
   </w:num>
   <w:num w:numId="9" w16cid:durableId="1725445077">
     <w:abstractNumId w:val="0"/>
+  </w:num>
+  <w:num w:numId="10" w16cid:durableId="1493132609">
+    <w:abstractNumId w:val="1"/>
   </w:num>
 </w:numbering>
 </file>

</xml_diff>

<commit_message>
Making SendView with working data transfer to AcceptableMusic
</commit_message>
<xml_diff>
--- a/documentation.docx
+++ b/documentation.docx
@@ -1229,7 +1229,7 @@
           <w:szCs w:val="36"/>
         </w:rPr>
         <w:drawing>
-          <wp:inline distT="0" distB="0" distL="0" distR="0" wp14:anchorId="78A43544" wp14:editId="65D126C0">
+          <wp:inline distT="0" distB="0" distL="0" distR="0" wp14:anchorId="78A43544" wp14:editId="7E980843">
             <wp:extent cx="3166535" cy="1781175"/>
             <wp:effectExtent l="0" t="0" r="0" b="0"/>
             <wp:docPr id="3" name="Kép 3" descr="C:\Users\elnabulsy.csongor\AppData\Local\Microsoft\Windows\INetCache\Content.MSO\F75754B3.tmp"/>
@@ -1321,7 +1321,7 @@
           <w:szCs w:val="36"/>
         </w:rPr>
         <w:drawing>
-          <wp:inline distT="0" distB="0" distL="0" distR="0" wp14:anchorId="4E211814" wp14:editId="5D32180A">
+          <wp:inline distT="0" distB="0" distL="0" distR="0" wp14:anchorId="4E211814" wp14:editId="377E2D2E">
             <wp:extent cx="3133725" cy="1762720"/>
             <wp:effectExtent l="0" t="0" r="0" b="9525"/>
             <wp:docPr id="4" name="Kép 4" descr="C:\Users\elnabulsy.csongor\Downloads\ui_main_student.png"/>
@@ -1403,7 +1403,7 @@
           <w:szCs w:val="36"/>
         </w:rPr>
         <w:drawing>
-          <wp:inline distT="0" distB="0" distL="0" distR="0" wp14:anchorId="5137FB78" wp14:editId="238C6CAE">
+          <wp:inline distT="0" distB="0" distL="0" distR="0" wp14:anchorId="5137FB78" wp14:editId="754D7493">
             <wp:extent cx="3166110" cy="1780938"/>
             <wp:effectExtent l="0" t="0" r="0" b="0"/>
             <wp:docPr id="5" name="Kép 5" descr="C:\Users\elnabulsy.csongor\Downloads\ui_main_scheduler.png"/>
@@ -1496,7 +1496,7 @@
           <w:szCs w:val="36"/>
         </w:rPr>
         <w:drawing>
-          <wp:inline distT="0" distB="0" distL="0" distR="0" wp14:anchorId="27EC1C67" wp14:editId="527D149B">
+          <wp:inline distT="0" distB="0" distL="0" distR="0" wp14:anchorId="27EC1C67" wp14:editId="47D2993C">
             <wp:extent cx="3055620" cy="1718786"/>
             <wp:effectExtent l="0" t="0" r="0" b="0"/>
             <wp:docPr id="6" name="Kép 6" descr="C:\Users\elnabulsy.csongor\Downloads\ui_main_admin.png"/>
@@ -1578,7 +1578,7 @@
           <w:szCs w:val="36"/>
         </w:rPr>
         <w:drawing>
-          <wp:inline distT="0" distB="0" distL="0" distR="0" wp14:anchorId="08225B4F" wp14:editId="3F26E71D">
+          <wp:inline distT="0" distB="0" distL="0" distR="0" wp14:anchorId="08225B4F" wp14:editId="0E78B55E">
             <wp:extent cx="2933700" cy="1942430"/>
             <wp:effectExtent l="0" t="0" r="0" b="1270"/>
             <wp:docPr id="7" name="Kép 7" descr="C:\Users\elnabulsy.csongor\Downloads\ui_structure.png"/>
@@ -1751,7 +1751,7 @@
           <w:szCs w:val="36"/>
         </w:rPr>
         <w:drawing>
-          <wp:inline distT="0" distB="0" distL="0" distR="0" wp14:anchorId="2C256DB5" wp14:editId="4D9A9A86">
+          <wp:inline distT="0" distB="0" distL="0" distR="0" wp14:anchorId="2C256DB5" wp14:editId="374FE108">
             <wp:extent cx="3329940" cy="1752493"/>
             <wp:effectExtent l="0" t="0" r="3810" b="635"/>
             <wp:docPr id="9" name="Kép 9"/>
@@ -4315,6 +4315,132 @@
           <w:szCs w:val="36"/>
         </w:rPr>
         <w:t>(El-Nabulsy Csongor Alan) WaitingView (ahova regisztráció után navigál az oldal) létrehozása.</w:t>
+      </w:r>
+    </w:p>
+    <w:p>
+      <w:pPr>
+        <w:jc w:val="both"/>
+        <w:rPr>
+          <w:rFonts w:ascii="Times New Roman" w:eastAsia="Times New Roman" w:hAnsi="Times New Roman" w:cs="Times New Roman"/>
+          <w:sz w:val="36"/>
+          <w:szCs w:val="36"/>
+        </w:rPr>
+      </w:pPr>
+    </w:p>
+    <w:p>
+      <w:pPr>
+        <w:jc w:val="both"/>
+        <w:rPr>
+          <w:rFonts w:ascii="Times New Roman" w:eastAsia="Times New Roman" w:hAnsi="Times New Roman" w:cs="Times New Roman"/>
+          <w:b/>
+          <w:bCs/>
+          <w:sz w:val="40"/>
+          <w:szCs w:val="40"/>
+        </w:rPr>
+      </w:pPr>
+      <w:r>
+        <w:rPr>
+          <w:rFonts w:ascii="Times New Roman" w:eastAsia="Times New Roman" w:hAnsi="Times New Roman" w:cs="Times New Roman"/>
+          <w:b/>
+          <w:bCs/>
+          <w:sz w:val="40"/>
+          <w:szCs w:val="40"/>
+        </w:rPr>
+        <w:t>2026-04-15 1</w:t>
+      </w:r>
+      <w:r>
+        <w:rPr>
+          <w:rFonts w:ascii="Times New Roman" w:eastAsia="Times New Roman" w:hAnsi="Times New Roman" w:cs="Times New Roman"/>
+          <w:b/>
+          <w:bCs/>
+          <w:sz w:val="40"/>
+          <w:szCs w:val="40"/>
+        </w:rPr>
+        <w:t>1</w:t>
+      </w:r>
+      <w:r>
+        <w:rPr>
+          <w:rFonts w:ascii="Times New Roman" w:eastAsia="Times New Roman" w:hAnsi="Times New Roman" w:cs="Times New Roman"/>
+          <w:b/>
+          <w:bCs/>
+          <w:sz w:val="40"/>
+          <w:szCs w:val="40"/>
+        </w:rPr>
+        <w:t>:15-</w:t>
+      </w:r>
+      <w:r>
+        <w:rPr>
+          <w:rFonts w:ascii="Times New Roman" w:eastAsia="Times New Roman" w:hAnsi="Times New Roman" w:cs="Times New Roman"/>
+          <w:b/>
+          <w:bCs/>
+          <w:sz w:val="40"/>
+          <w:szCs w:val="40"/>
+        </w:rPr>
+        <w:t>15:30</w:t>
+      </w:r>
+    </w:p>
+    <w:p>
+      <w:pPr>
+        <w:jc w:val="both"/>
+        <w:rPr>
+          <w:rFonts w:ascii="Times New Roman" w:eastAsia="Times New Roman" w:hAnsi="Times New Roman" w:cs="Times New Roman"/>
+          <w:sz w:val="36"/>
+          <w:szCs w:val="36"/>
+        </w:rPr>
+      </w:pPr>
+      <w:r>
+        <w:rPr>
+          <w:rFonts w:ascii="Times New Roman" w:eastAsia="Times New Roman" w:hAnsi="Times New Roman" w:cs="Times New Roman"/>
+          <w:sz w:val="36"/>
+          <w:szCs w:val="36"/>
+        </w:rPr>
+        <w:t>Átnéztük mindegyik oldalt hogy néz ki jelenleg, és a RequestView-n kellett változtatni, hogy megfeleljen a dokumentációban lévő rajznak. Továbbá összefoglaltuk hogy mennyi hiányzik még a projektből hogy teljesen kész és működő képes legyen.</w:t>
+      </w:r>
+    </w:p>
+    <w:p>
+      <w:pPr>
+        <w:jc w:val="both"/>
+        <w:rPr>
+          <w:rFonts w:ascii="Times New Roman" w:eastAsia="Times New Roman" w:hAnsi="Times New Roman" w:cs="Times New Roman"/>
+          <w:sz w:val="36"/>
+          <w:szCs w:val="36"/>
+        </w:rPr>
+      </w:pPr>
+    </w:p>
+    <w:p>
+      <w:pPr>
+        <w:jc w:val="both"/>
+        <w:rPr>
+          <w:rFonts w:ascii="Times New Roman" w:eastAsia="Times New Roman" w:hAnsi="Times New Roman" w:cs="Times New Roman"/>
+          <w:sz w:val="36"/>
+          <w:szCs w:val="36"/>
+        </w:rPr>
+      </w:pPr>
+      <w:r>
+        <w:rPr>
+          <w:rFonts w:ascii="Times New Roman" w:eastAsia="Times New Roman" w:hAnsi="Times New Roman" w:cs="Times New Roman"/>
+          <w:sz w:val="36"/>
+          <w:szCs w:val="36"/>
+        </w:rPr>
+        <w:t>(Susán Csongor György) A zenebeküldő oldal (SendView) újrakezdése és megalkotása validációval és működő adatbevitellel együtt.</w:t>
+      </w:r>
+    </w:p>
+    <w:p>
+      <w:pPr>
+        <w:jc w:val="both"/>
+        <w:rPr>
+          <w:rFonts w:ascii="Times New Roman" w:eastAsia="Times New Roman" w:hAnsi="Times New Roman" w:cs="Times New Roman"/>
+          <w:sz w:val="36"/>
+          <w:szCs w:val="36"/>
+        </w:rPr>
+      </w:pPr>
+      <w:r>
+        <w:rPr>
+          <w:rFonts w:ascii="Times New Roman" w:eastAsia="Times New Roman" w:hAnsi="Times New Roman" w:cs="Times New Roman"/>
+          <w:sz w:val="36"/>
+          <w:szCs w:val="36"/>
+        </w:rPr>
+        <w:t>(El-Nabulsy Csongor Alan) A zenebekérő oldal (RequestView) újra elkészítése.</w:t>
       </w:r>
     </w:p>
     <w:sectPr>

</xml_diff>

<commit_message>
Making the function of accepting and declining registered users (+doc)
</commit_message>
<xml_diff>
--- a/documentation.docx
+++ b/documentation.docx
@@ -40,25 +40,36 @@
           <w:sz w:val="40"/>
           <w:szCs w:val="40"/>
         </w:rPr>
-        <w:t>Alkalmazás neve: BláthyFM</w:t>
-      </w:r>
-    </w:p>
-    <w:p>
-      <w:pPr>
+        <w:t xml:space="preserve">Alkalmazás neve: </w:t>
+      </w:r>
+      <w:proofErr w:type="spellStart"/>
+      <w:r>
         <w:rPr>
           <w:rFonts w:ascii="Times New Roman" w:hAnsi="Times New Roman" w:cs="Times New Roman"/>
           <w:bCs/>
           <w:sz w:val="40"/>
           <w:szCs w:val="40"/>
         </w:rPr>
-      </w:pPr>
-      <w:r>
+        <w:t>BláthyFM</w:t>
+      </w:r>
+      <w:proofErr w:type="spellEnd"/>
+    </w:p>
+    <w:p>
+      <w:pPr>
         <w:rPr>
           <w:rFonts w:ascii="Times New Roman" w:hAnsi="Times New Roman" w:cs="Times New Roman"/>
           <w:bCs/>
           <w:sz w:val="40"/>
           <w:szCs w:val="40"/>
         </w:rPr>
+      </w:pPr>
+      <w:r>
+        <w:rPr>
+          <w:rFonts w:ascii="Times New Roman" w:hAnsi="Times New Roman" w:cs="Times New Roman"/>
+          <w:bCs/>
+          <w:sz w:val="40"/>
+          <w:szCs w:val="40"/>
+        </w:rPr>
         <w:t>Tagok:</w:t>
       </w:r>
       <w:r>
@@ -68,7 +79,27 @@
           <w:sz w:val="40"/>
           <w:szCs w:val="40"/>
         </w:rPr>
-        <w:t xml:space="preserve"> Susán Csongor, El-Nabulsy Csongor Alan</w:t>
+        <w:t xml:space="preserve"> Susán Csongor, El-</w:t>
+      </w:r>
+      <w:proofErr w:type="spellStart"/>
+      <w:r>
+        <w:rPr>
+          <w:rFonts w:ascii="Times New Roman" w:hAnsi="Times New Roman" w:cs="Times New Roman"/>
+          <w:bCs/>
+          <w:sz w:val="40"/>
+          <w:szCs w:val="40"/>
+        </w:rPr>
+        <w:t>Nabulsy</w:t>
+      </w:r>
+      <w:proofErr w:type="spellEnd"/>
+      <w:r>
+        <w:rPr>
+          <w:rFonts w:ascii="Times New Roman" w:hAnsi="Times New Roman" w:cs="Times New Roman"/>
+          <w:bCs/>
+          <w:sz w:val="40"/>
+          <w:szCs w:val="40"/>
+        </w:rPr>
+        <w:t xml:space="preserve"> Csongor Alan</w:t>
       </w:r>
     </w:p>
     <w:p>
@@ -88,7 +119,27 @@
           <w:sz w:val="40"/>
           <w:szCs w:val="40"/>
         </w:rPr>
-        <w:t>Az alkalmazás célja az, hogy a Bláthy-ba járó diákok előre meghatározott szünetekben kedvenc zenéjüket tudják majd hallgatni anélkül, hogy nekik kelljen azt maguknak vagy másoknak lejátszani. Ráadásul az, hogy az iskola az ő zenéjüket játssza, akár egy általuk kijelölt időpontban (ezt üzenetben írhatják le), még több élményt ad, és azt az érzést, hogy a zenéjük – és ezzel együtt önmaguk is – meg van becsülve.</w:t>
+        <w:t>Az alkalmazás célja az, hogy a Bláthy-</w:t>
+      </w:r>
+      <w:proofErr w:type="spellStart"/>
+      <w:r>
+        <w:rPr>
+          <w:rFonts w:ascii="Times New Roman" w:hAnsi="Times New Roman" w:cs="Times New Roman"/>
+          <w:bCs/>
+          <w:sz w:val="40"/>
+          <w:szCs w:val="40"/>
+        </w:rPr>
+        <w:t>ba</w:t>
+      </w:r>
+      <w:proofErr w:type="spellEnd"/>
+      <w:r>
+        <w:rPr>
+          <w:rFonts w:ascii="Times New Roman" w:hAnsi="Times New Roman" w:cs="Times New Roman"/>
+          <w:bCs/>
+          <w:sz w:val="40"/>
+          <w:szCs w:val="40"/>
+        </w:rPr>
+        <w:t xml:space="preserve"> járó diákok előre meghatározott szünetekben kedvenc zenéjüket tudják majd hallgatni anélkül, hogy nekik kelljen azt maguknak vagy másoknak lejátszani. Ráadásul az, hogy az iskola az ő zenéjüket játssza, akár egy általuk kijelölt időpontban (ezt üzenetben írhatják le), még több élményt ad, és azt az érzést, hogy a zenéjük – és ezzel együtt önmaguk is – meg van becsülve.</w:t>
       </w:r>
     </w:p>
     <w:p>
@@ -561,7 +612,25 @@
           <w:sz w:val="36"/>
           <w:szCs w:val="36"/>
         </w:rPr>
-        <w:t>Az alkalmazás fejlesztését tartalmazó dokumentáció elkezdése, vizsgafeltételek tanulmányozása, a projektet tároló repository létrehozása, teszteknek külön dokumentáció létrehozása.</w:t>
+        <w:t xml:space="preserve">Az alkalmazás fejlesztését tartalmazó dokumentáció elkezdése, vizsgafeltételek tanulmányozása, a projektet tároló </w:t>
+      </w:r>
+      <w:proofErr w:type="spellStart"/>
+      <w:r>
+        <w:rPr>
+          <w:rFonts w:ascii="Times New Roman" w:hAnsi="Times New Roman" w:cs="Times New Roman"/>
+          <w:sz w:val="36"/>
+          <w:szCs w:val="36"/>
+        </w:rPr>
+        <w:t>repository</w:t>
+      </w:r>
+      <w:proofErr w:type="spellEnd"/>
+      <w:r>
+        <w:rPr>
+          <w:rFonts w:ascii="Times New Roman" w:hAnsi="Times New Roman" w:cs="Times New Roman"/>
+          <w:sz w:val="36"/>
+          <w:szCs w:val="36"/>
+        </w:rPr>
+        <w:t xml:space="preserve"> létrehozása, teszteknek külön dokumentáció létrehozása.</w:t>
       </w:r>
     </w:p>
     <w:p>
@@ -1229,7 +1298,7 @@
           <w:szCs w:val="36"/>
         </w:rPr>
         <w:drawing>
-          <wp:inline distT="0" distB="0" distL="0" distR="0" wp14:anchorId="78A43544" wp14:editId="7E980843">
+          <wp:inline distT="0" distB="0" distL="0" distR="0" wp14:anchorId="78A43544" wp14:editId="43B6B5F8">
             <wp:extent cx="3166535" cy="1781175"/>
             <wp:effectExtent l="0" t="0" r="0" b="0"/>
             <wp:docPr id="3" name="Kép 3" descr="C:\Users\elnabulsy.csongor\AppData\Local\Microsoft\Windows\INetCache\Content.MSO\F75754B3.tmp"/>
@@ -1321,7 +1390,7 @@
           <w:szCs w:val="36"/>
         </w:rPr>
         <w:drawing>
-          <wp:inline distT="0" distB="0" distL="0" distR="0" wp14:anchorId="4E211814" wp14:editId="377E2D2E">
+          <wp:inline distT="0" distB="0" distL="0" distR="0" wp14:anchorId="4E211814" wp14:editId="7FBE5458">
             <wp:extent cx="3133725" cy="1762720"/>
             <wp:effectExtent l="0" t="0" r="0" b="9525"/>
             <wp:docPr id="4" name="Kép 4" descr="C:\Users\elnabulsy.csongor\Downloads\ui_main_student.png"/>
@@ -1403,7 +1472,7 @@
           <w:szCs w:val="36"/>
         </w:rPr>
         <w:drawing>
-          <wp:inline distT="0" distB="0" distL="0" distR="0" wp14:anchorId="5137FB78" wp14:editId="754D7493">
+          <wp:inline distT="0" distB="0" distL="0" distR="0" wp14:anchorId="5137FB78" wp14:editId="2BA8A493">
             <wp:extent cx="3166110" cy="1780938"/>
             <wp:effectExtent l="0" t="0" r="0" b="0"/>
             <wp:docPr id="5" name="Kép 5" descr="C:\Users\elnabulsy.csongor\Downloads\ui_main_scheduler.png"/>
@@ -1466,7 +1535,25 @@
           <w:sz w:val="36"/>
           <w:szCs w:val="36"/>
         </w:rPr>
-        <w:t>Főképernyő admin ranggal:</w:t>
+        <w:t xml:space="preserve">Főképernyő </w:t>
+      </w:r>
+      <w:proofErr w:type="spellStart"/>
+      <w:r>
+        <w:rPr>
+          <w:rFonts w:ascii="Times New Roman" w:eastAsia="Times New Roman" w:hAnsi="Times New Roman" w:cs="Times New Roman"/>
+          <w:sz w:val="36"/>
+          <w:szCs w:val="36"/>
+        </w:rPr>
+        <w:t>admin</w:t>
+      </w:r>
+      <w:proofErr w:type="spellEnd"/>
+      <w:r>
+        <w:rPr>
+          <w:rFonts w:ascii="Times New Roman" w:eastAsia="Times New Roman" w:hAnsi="Times New Roman" w:cs="Times New Roman"/>
+          <w:sz w:val="36"/>
+          <w:szCs w:val="36"/>
+        </w:rPr>
+        <w:t xml:space="preserve"> ranggal:</w:t>
       </w:r>
     </w:p>
     <w:p>
@@ -1496,7 +1583,7 @@
           <w:szCs w:val="36"/>
         </w:rPr>
         <w:drawing>
-          <wp:inline distT="0" distB="0" distL="0" distR="0" wp14:anchorId="27EC1C67" wp14:editId="47D2993C">
+          <wp:inline distT="0" distB="0" distL="0" distR="0" wp14:anchorId="27EC1C67" wp14:editId="3248BDDD">
             <wp:extent cx="3055620" cy="1718786"/>
             <wp:effectExtent l="0" t="0" r="0" b="0"/>
             <wp:docPr id="6" name="Kép 6" descr="C:\Users\elnabulsy.csongor\Downloads\ui_main_admin.png"/>
@@ -1578,7 +1665,7 @@
           <w:szCs w:val="36"/>
         </w:rPr>
         <w:drawing>
-          <wp:inline distT="0" distB="0" distL="0" distR="0" wp14:anchorId="08225B4F" wp14:editId="0E78B55E">
+          <wp:inline distT="0" distB="0" distL="0" distR="0" wp14:anchorId="08225B4F" wp14:editId="15D54870">
             <wp:extent cx="2933700" cy="1942430"/>
             <wp:effectExtent l="0" t="0" r="0" b="1270"/>
             <wp:docPr id="7" name="Kép 7" descr="C:\Users\elnabulsy.csongor\Downloads\ui_structure.png"/>
@@ -1751,7 +1838,7 @@
           <w:szCs w:val="36"/>
         </w:rPr>
         <w:drawing>
-          <wp:inline distT="0" distB="0" distL="0" distR="0" wp14:anchorId="2C256DB5" wp14:editId="374FE108">
+          <wp:inline distT="0" distB="0" distL="0" distR="0" wp14:anchorId="2C256DB5" wp14:editId="1AF0756B">
             <wp:extent cx="3329940" cy="1752493"/>
             <wp:effectExtent l="0" t="0" r="3810" b="635"/>
             <wp:docPr id="9" name="Kép 9"/>
@@ -1922,7 +2009,25 @@
           <w:sz w:val="36"/>
           <w:szCs w:val="36"/>
         </w:rPr>
-        <w:t xml:space="preserve">Az admin UI oldal megtervezése digitális </w:t>
+        <w:t xml:space="preserve">Az </w:t>
+      </w:r>
+      <w:proofErr w:type="spellStart"/>
+      <w:r>
+        <w:rPr>
+          <w:rFonts w:ascii="Times New Roman" w:eastAsia="Times New Roman" w:hAnsi="Times New Roman" w:cs="Times New Roman"/>
+          <w:sz w:val="36"/>
+          <w:szCs w:val="36"/>
+        </w:rPr>
+        <w:t>admin</w:t>
+      </w:r>
+      <w:proofErr w:type="spellEnd"/>
+      <w:r>
+        <w:rPr>
+          <w:rFonts w:ascii="Times New Roman" w:eastAsia="Times New Roman" w:hAnsi="Times New Roman" w:cs="Times New Roman"/>
+          <w:sz w:val="36"/>
+          <w:szCs w:val="36"/>
+        </w:rPr>
+        <w:t xml:space="preserve"> UI oldal megtervezése digitális </w:t>
       </w:r>
       <w:r>
         <w:rPr>
@@ -1941,13 +2046,23 @@
           <w:szCs w:val="36"/>
         </w:rPr>
       </w:pPr>
-      <w:r>
-        <w:rPr>
-          <w:rFonts w:ascii="Times New Roman" w:eastAsia="Times New Roman" w:hAnsi="Times New Roman" w:cs="Times New Roman"/>
-          <w:sz w:val="36"/>
-          <w:szCs w:val="36"/>
-        </w:rPr>
-        <w:t>Admin oldal:</w:t>
+      <w:proofErr w:type="spellStart"/>
+      <w:r>
+        <w:rPr>
+          <w:rFonts w:ascii="Times New Roman" w:eastAsia="Times New Roman" w:hAnsi="Times New Roman" w:cs="Times New Roman"/>
+          <w:sz w:val="36"/>
+          <w:szCs w:val="36"/>
+        </w:rPr>
+        <w:t>Admin</w:t>
+      </w:r>
+      <w:proofErr w:type="spellEnd"/>
+      <w:r>
+        <w:rPr>
+          <w:rFonts w:ascii="Times New Roman" w:eastAsia="Times New Roman" w:hAnsi="Times New Roman" w:cs="Times New Roman"/>
+          <w:sz w:val="36"/>
+          <w:szCs w:val="36"/>
+        </w:rPr>
+        <w:t xml:space="preserve"> oldal:</w:t>
       </w:r>
     </w:p>
     <w:p>
@@ -2181,15 +2296,42 @@
           <w:sz w:val="36"/>
           <w:szCs w:val="36"/>
         </w:rPr>
-        <w:t>, Vue router</w:t>
-      </w:r>
-      <w:r>
-        <w:rPr>
-          <w:rFonts w:ascii="Times New Roman" w:eastAsia="Times New Roman" w:hAnsi="Times New Roman" w:cs="Times New Roman"/>
-          <w:sz w:val="36"/>
-          <w:szCs w:val="36"/>
-        </w:rPr>
-        <w:t>) létrehozása frontend</w:t>
+        <w:t xml:space="preserve">, </w:t>
+      </w:r>
+      <w:proofErr w:type="spellStart"/>
+      <w:r>
+        <w:rPr>
+          <w:rFonts w:ascii="Times New Roman" w:eastAsia="Times New Roman" w:hAnsi="Times New Roman" w:cs="Times New Roman"/>
+          <w:sz w:val="36"/>
+          <w:szCs w:val="36"/>
+        </w:rPr>
+        <w:t>Vue</w:t>
+      </w:r>
+      <w:proofErr w:type="spellEnd"/>
+      <w:r>
+        <w:rPr>
+          <w:rFonts w:ascii="Times New Roman" w:eastAsia="Times New Roman" w:hAnsi="Times New Roman" w:cs="Times New Roman"/>
+          <w:sz w:val="36"/>
+          <w:szCs w:val="36"/>
+        </w:rPr>
+        <w:t xml:space="preserve"> router</w:t>
+      </w:r>
+      <w:r>
+        <w:rPr>
+          <w:rFonts w:ascii="Times New Roman" w:eastAsia="Times New Roman" w:hAnsi="Times New Roman" w:cs="Times New Roman"/>
+          <w:sz w:val="36"/>
+          <w:szCs w:val="36"/>
+        </w:rPr>
+        <w:t xml:space="preserve">) létrehozása </w:t>
+      </w:r>
+      <w:proofErr w:type="spellStart"/>
+      <w:r>
+        <w:rPr>
+          <w:rFonts w:ascii="Times New Roman" w:eastAsia="Times New Roman" w:hAnsi="Times New Roman" w:cs="Times New Roman"/>
+          <w:sz w:val="36"/>
+          <w:szCs w:val="36"/>
+        </w:rPr>
+        <w:t>frontend</w:t>
       </w:r>
       <w:r>
         <w:rPr>
@@ -2199,6 +2341,7 @@
         </w:rPr>
         <w:t>Part</w:t>
       </w:r>
+      <w:proofErr w:type="spellEnd"/>
       <w:r>
         <w:rPr>
           <w:rFonts w:ascii="Times New Roman" w:eastAsia="Times New Roman" w:hAnsi="Times New Roman" w:cs="Times New Roman"/>
@@ -2251,13 +2394,23 @@
           <w:szCs w:val="36"/>
         </w:rPr>
       </w:pPr>
-      <w:r>
-        <w:rPr>
-          <w:rFonts w:ascii="Times New Roman" w:eastAsia="Times New Roman" w:hAnsi="Times New Roman" w:cs="Times New Roman"/>
-          <w:sz w:val="36"/>
-          <w:szCs w:val="36"/>
-        </w:rPr>
-        <w:t>route-ok definiálása</w:t>
+      <w:proofErr w:type="spellStart"/>
+      <w:r>
+        <w:rPr>
+          <w:rFonts w:ascii="Times New Roman" w:eastAsia="Times New Roman" w:hAnsi="Times New Roman" w:cs="Times New Roman"/>
+          <w:sz w:val="36"/>
+          <w:szCs w:val="36"/>
+        </w:rPr>
+        <w:t>route</w:t>
+      </w:r>
+      <w:proofErr w:type="spellEnd"/>
+      <w:r>
+        <w:rPr>
+          <w:rFonts w:ascii="Times New Roman" w:eastAsia="Times New Roman" w:hAnsi="Times New Roman" w:cs="Times New Roman"/>
+          <w:sz w:val="36"/>
+          <w:szCs w:val="36"/>
+        </w:rPr>
+        <w:t>-ok definiálása</w:t>
       </w:r>
     </w:p>
     <w:p>
@@ -2273,14 +2426,34 @@
           <w:szCs w:val="36"/>
         </w:rPr>
       </w:pPr>
-      <w:r>
-        <w:rPr>
-          <w:rFonts w:ascii="Times New Roman" w:eastAsia="Times New Roman" w:hAnsi="Times New Roman" w:cs="Times New Roman"/>
-          <w:sz w:val="36"/>
-          <w:szCs w:val="36"/>
-        </w:rPr>
-        <w:t>header és footer</w:t>
-      </w:r>
+      <w:proofErr w:type="spellStart"/>
+      <w:r>
+        <w:rPr>
+          <w:rFonts w:ascii="Times New Roman" w:eastAsia="Times New Roman" w:hAnsi="Times New Roman" w:cs="Times New Roman"/>
+          <w:sz w:val="36"/>
+          <w:szCs w:val="36"/>
+        </w:rPr>
+        <w:t>header</w:t>
+      </w:r>
+      <w:proofErr w:type="spellEnd"/>
+      <w:r>
+        <w:rPr>
+          <w:rFonts w:ascii="Times New Roman" w:eastAsia="Times New Roman" w:hAnsi="Times New Roman" w:cs="Times New Roman"/>
+          <w:sz w:val="36"/>
+          <w:szCs w:val="36"/>
+        </w:rPr>
+        <w:t xml:space="preserve"> és </w:t>
+      </w:r>
+      <w:proofErr w:type="spellStart"/>
+      <w:r>
+        <w:rPr>
+          <w:rFonts w:ascii="Times New Roman" w:eastAsia="Times New Roman" w:hAnsi="Times New Roman" w:cs="Times New Roman"/>
+          <w:sz w:val="36"/>
+          <w:szCs w:val="36"/>
+        </w:rPr>
+        <w:t>footer</w:t>
+      </w:r>
+      <w:proofErr w:type="spellEnd"/>
       <w:r>
         <w:rPr>
           <w:rFonts w:ascii="Times New Roman" w:eastAsia="Times New Roman" w:hAnsi="Times New Roman" w:cs="Times New Roman"/>
@@ -2311,13 +2484,41 @@
           <w:szCs w:val="36"/>
         </w:rPr>
       </w:pPr>
-      <w:r>
-        <w:rPr>
-          <w:rFonts w:ascii="Times New Roman" w:eastAsia="Times New Roman" w:hAnsi="Times New Roman" w:cs="Times New Roman"/>
-          <w:sz w:val="36"/>
-          <w:szCs w:val="36"/>
-        </w:rPr>
-        <w:t>header-main-footer-struktúra létrehozása</w:t>
+      <w:proofErr w:type="spellStart"/>
+      <w:r>
+        <w:rPr>
+          <w:rFonts w:ascii="Times New Roman" w:eastAsia="Times New Roman" w:hAnsi="Times New Roman" w:cs="Times New Roman"/>
+          <w:sz w:val="36"/>
+          <w:szCs w:val="36"/>
+        </w:rPr>
+        <w:t>header</w:t>
+      </w:r>
+      <w:proofErr w:type="spellEnd"/>
+      <w:r>
+        <w:rPr>
+          <w:rFonts w:ascii="Times New Roman" w:eastAsia="Times New Roman" w:hAnsi="Times New Roman" w:cs="Times New Roman"/>
+          <w:sz w:val="36"/>
+          <w:szCs w:val="36"/>
+        </w:rPr>
+        <w:t>-main-</w:t>
+      </w:r>
+      <w:proofErr w:type="spellStart"/>
+      <w:r>
+        <w:rPr>
+          <w:rFonts w:ascii="Times New Roman" w:eastAsia="Times New Roman" w:hAnsi="Times New Roman" w:cs="Times New Roman"/>
+          <w:sz w:val="36"/>
+          <w:szCs w:val="36"/>
+        </w:rPr>
+        <w:t>footer</w:t>
+      </w:r>
+      <w:proofErr w:type="spellEnd"/>
+      <w:r>
+        <w:rPr>
+          <w:rFonts w:ascii="Times New Roman" w:eastAsia="Times New Roman" w:hAnsi="Times New Roman" w:cs="Times New Roman"/>
+          <w:sz w:val="36"/>
+          <w:szCs w:val="36"/>
+        </w:rPr>
+        <w:t>-struktúra létrehozása</w:t>
       </w:r>
     </w:p>
     <w:p>
@@ -2357,7 +2558,25 @@
           <w:sz w:val="36"/>
           <w:szCs w:val="36"/>
         </w:rPr>
-        <w:t>A projektet El-Nabulsy Csongor hozta létre és írta meg a kódját, a működéshez szükséges folyamatábrákat, az adatbázis ER-diagramját</w:t>
+        <w:t>A projektet El-</w:t>
+      </w:r>
+      <w:proofErr w:type="spellStart"/>
+      <w:r>
+        <w:rPr>
+          <w:rFonts w:ascii="Times New Roman" w:eastAsia="Times New Roman" w:hAnsi="Times New Roman" w:cs="Times New Roman"/>
+          <w:sz w:val="36"/>
+          <w:szCs w:val="36"/>
+        </w:rPr>
+        <w:t>Nabulsy</w:t>
+      </w:r>
+      <w:proofErr w:type="spellEnd"/>
+      <w:r>
+        <w:rPr>
+          <w:rFonts w:ascii="Times New Roman" w:eastAsia="Times New Roman" w:hAnsi="Times New Roman" w:cs="Times New Roman"/>
+          <w:sz w:val="36"/>
+          <w:szCs w:val="36"/>
+        </w:rPr>
+        <w:t xml:space="preserve"> Csongor hozta létre és írta meg a kódját, a működéshez szükséges folyamatábrákat, az adatbázis ER-diagramját</w:t>
       </w:r>
       <w:r>
         <w:rPr>
@@ -2440,7 +2659,25 @@
           <w:sz w:val="36"/>
           <w:szCs w:val="36"/>
         </w:rPr>
-        <w:t>(Susán Csongor) A frontendPart projekt átnézése, stílus hi</w:t>
+        <w:t xml:space="preserve">(Susán Csongor) A </w:t>
+      </w:r>
+      <w:proofErr w:type="spellStart"/>
+      <w:r>
+        <w:rPr>
+          <w:rFonts w:ascii="Times New Roman" w:eastAsia="Times New Roman" w:hAnsi="Times New Roman" w:cs="Times New Roman"/>
+          <w:sz w:val="36"/>
+          <w:szCs w:val="36"/>
+        </w:rPr>
+        <w:t>frontendPart</w:t>
+      </w:r>
+      <w:proofErr w:type="spellEnd"/>
+      <w:r>
+        <w:rPr>
+          <w:rFonts w:ascii="Times New Roman" w:eastAsia="Times New Roman" w:hAnsi="Times New Roman" w:cs="Times New Roman"/>
+          <w:sz w:val="36"/>
+          <w:szCs w:val="36"/>
+        </w:rPr>
+        <w:t xml:space="preserve"> projekt átnézése, stílus hi</w:t>
       </w:r>
       <w:r>
         <w:rPr>
@@ -2551,7 +2788,25 @@
           <w:sz w:val="36"/>
           <w:szCs w:val="36"/>
         </w:rPr>
-        <w:t>(El-Nabulsy Csongor Alan</w:t>
+        <w:t>(El-</w:t>
+      </w:r>
+      <w:proofErr w:type="spellStart"/>
+      <w:r>
+        <w:rPr>
+          <w:rFonts w:ascii="Times New Roman" w:eastAsia="Times New Roman" w:hAnsi="Times New Roman" w:cs="Times New Roman"/>
+          <w:sz w:val="36"/>
+          <w:szCs w:val="36"/>
+        </w:rPr>
+        <w:t>Nabulsy</w:t>
+      </w:r>
+      <w:proofErr w:type="spellEnd"/>
+      <w:r>
+        <w:rPr>
+          <w:rFonts w:ascii="Times New Roman" w:eastAsia="Times New Roman" w:hAnsi="Times New Roman" w:cs="Times New Roman"/>
+          <w:sz w:val="36"/>
+          <w:szCs w:val="36"/>
+        </w:rPr>
+        <w:t xml:space="preserve"> Csongor Alan</w:t>
       </w:r>
       <w:r>
         <w:rPr>
@@ -2575,7 +2830,25 @@
           <w:sz w:val="36"/>
           <w:szCs w:val="36"/>
         </w:rPr>
-        <w:t xml:space="preserve"> (El-Nabulsy: főoldal és annak </w:t>
+        <w:t xml:space="preserve"> (El-</w:t>
+      </w:r>
+      <w:proofErr w:type="spellStart"/>
+      <w:r>
+        <w:rPr>
+          <w:rFonts w:ascii="Times New Roman" w:eastAsia="Times New Roman" w:hAnsi="Times New Roman" w:cs="Times New Roman"/>
+          <w:sz w:val="36"/>
+          <w:szCs w:val="36"/>
+        </w:rPr>
+        <w:t>Nabulsy</w:t>
+      </w:r>
+      <w:proofErr w:type="spellEnd"/>
+      <w:r>
+        <w:rPr>
+          <w:rFonts w:ascii="Times New Roman" w:eastAsia="Times New Roman" w:hAnsi="Times New Roman" w:cs="Times New Roman"/>
+          <w:sz w:val="36"/>
+          <w:szCs w:val="36"/>
+        </w:rPr>
+        <w:t xml:space="preserve">: főoldal és annak </w:t>
       </w:r>
       <w:r>
         <w:rPr>
@@ -2591,7 +2864,25 @@
           <w:sz w:val="36"/>
           <w:szCs w:val="36"/>
         </w:rPr>
-        <w:t>variánsa, Susán: login befejezése és admin elkezdése, valamint a logika kidolgozásának megkezdése</w:t>
+        <w:t xml:space="preserve">variánsa, Susán: login befejezése és </w:t>
+      </w:r>
+      <w:proofErr w:type="spellStart"/>
+      <w:r>
+        <w:rPr>
+          <w:rFonts w:ascii="Times New Roman" w:eastAsia="Times New Roman" w:hAnsi="Times New Roman" w:cs="Times New Roman"/>
+          <w:sz w:val="36"/>
+          <w:szCs w:val="36"/>
+        </w:rPr>
+        <w:t>admin</w:t>
+      </w:r>
+      <w:proofErr w:type="spellEnd"/>
+      <w:r>
+        <w:rPr>
+          <w:rFonts w:ascii="Times New Roman" w:eastAsia="Times New Roman" w:hAnsi="Times New Roman" w:cs="Times New Roman"/>
+          <w:sz w:val="36"/>
+          <w:szCs w:val="36"/>
+        </w:rPr>
+        <w:t xml:space="preserve"> elkezdése, valamint a logika kidolgozásának megkezdése</w:t>
       </w:r>
       <w:r>
         <w:rPr>
@@ -2655,7 +2946,25 @@
           <w:sz w:val="36"/>
           <w:szCs w:val="36"/>
         </w:rPr>
-        <w:t xml:space="preserve">(El-Nabulsy Csongor Alan) A zenebekérő oldal </w:t>
+        <w:t>(El-</w:t>
+      </w:r>
+      <w:proofErr w:type="spellStart"/>
+      <w:r>
+        <w:rPr>
+          <w:rFonts w:ascii="Times New Roman" w:eastAsia="Times New Roman" w:hAnsi="Times New Roman" w:cs="Times New Roman"/>
+          <w:sz w:val="36"/>
+          <w:szCs w:val="36"/>
+        </w:rPr>
+        <w:t>Nabulsy</w:t>
+      </w:r>
+      <w:proofErr w:type="spellEnd"/>
+      <w:r>
+        <w:rPr>
+          <w:rFonts w:ascii="Times New Roman" w:eastAsia="Times New Roman" w:hAnsi="Times New Roman" w:cs="Times New Roman"/>
+          <w:sz w:val="36"/>
+          <w:szCs w:val="36"/>
+        </w:rPr>
+        <w:t xml:space="preserve"> Csongor Alan) A zenebekérő oldal </w:t>
       </w:r>
       <w:r>
         <w:rPr>
@@ -2710,7 +3019,89 @@
           <w:sz w:val="36"/>
           <w:szCs w:val="36"/>
         </w:rPr>
-        <w:t>(El-Nabulsy Csongor Alan) Főbb nézetek(HomeView, StudentHomePage, SchedulerView) szerkezetének kialakítása és a komponensek működésének ellenőrzése, a felhasználói felület stílusának kialakítása, hogy az oldal elrendezése megfeleljen a megtervezett UI-terveknek.</w:t>
+        <w:t>(El-</w:t>
+      </w:r>
+      <w:proofErr w:type="spellStart"/>
+      <w:r>
+        <w:rPr>
+          <w:rFonts w:ascii="Times New Roman" w:eastAsia="Times New Roman" w:hAnsi="Times New Roman" w:cs="Times New Roman"/>
+          <w:sz w:val="36"/>
+          <w:szCs w:val="36"/>
+        </w:rPr>
+        <w:t>Nabulsy</w:t>
+      </w:r>
+      <w:proofErr w:type="spellEnd"/>
+      <w:r>
+        <w:rPr>
+          <w:rFonts w:ascii="Times New Roman" w:eastAsia="Times New Roman" w:hAnsi="Times New Roman" w:cs="Times New Roman"/>
+          <w:sz w:val="36"/>
+          <w:szCs w:val="36"/>
+        </w:rPr>
+        <w:t xml:space="preserve"> Csongor Alan) Főbb </w:t>
+      </w:r>
+      <w:proofErr w:type="gramStart"/>
+      <w:r>
+        <w:rPr>
+          <w:rFonts w:ascii="Times New Roman" w:eastAsia="Times New Roman" w:hAnsi="Times New Roman" w:cs="Times New Roman"/>
+          <w:sz w:val="36"/>
+          <w:szCs w:val="36"/>
+        </w:rPr>
+        <w:t>nézetek(</w:t>
+      </w:r>
+      <w:proofErr w:type="spellStart"/>
+      <w:proofErr w:type="gramEnd"/>
+      <w:r>
+        <w:rPr>
+          <w:rFonts w:ascii="Times New Roman" w:eastAsia="Times New Roman" w:hAnsi="Times New Roman" w:cs="Times New Roman"/>
+          <w:sz w:val="36"/>
+          <w:szCs w:val="36"/>
+        </w:rPr>
+        <w:t>HomeView</w:t>
+      </w:r>
+      <w:proofErr w:type="spellEnd"/>
+      <w:r>
+        <w:rPr>
+          <w:rFonts w:ascii="Times New Roman" w:eastAsia="Times New Roman" w:hAnsi="Times New Roman" w:cs="Times New Roman"/>
+          <w:sz w:val="36"/>
+          <w:szCs w:val="36"/>
+        </w:rPr>
+        <w:t xml:space="preserve">, </w:t>
+      </w:r>
+      <w:proofErr w:type="spellStart"/>
+      <w:r>
+        <w:rPr>
+          <w:rFonts w:ascii="Times New Roman" w:eastAsia="Times New Roman" w:hAnsi="Times New Roman" w:cs="Times New Roman"/>
+          <w:sz w:val="36"/>
+          <w:szCs w:val="36"/>
+        </w:rPr>
+        <w:t>StudentHomePage</w:t>
+      </w:r>
+      <w:proofErr w:type="spellEnd"/>
+      <w:r>
+        <w:rPr>
+          <w:rFonts w:ascii="Times New Roman" w:eastAsia="Times New Roman" w:hAnsi="Times New Roman" w:cs="Times New Roman"/>
+          <w:sz w:val="36"/>
+          <w:szCs w:val="36"/>
+        </w:rPr>
+        <w:t xml:space="preserve">, </w:t>
+      </w:r>
+      <w:proofErr w:type="spellStart"/>
+      <w:r>
+        <w:rPr>
+          <w:rFonts w:ascii="Times New Roman" w:eastAsia="Times New Roman" w:hAnsi="Times New Roman" w:cs="Times New Roman"/>
+          <w:sz w:val="36"/>
+          <w:szCs w:val="36"/>
+        </w:rPr>
+        <w:t>SchedulerView</w:t>
+      </w:r>
+      <w:proofErr w:type="spellEnd"/>
+      <w:r>
+        <w:rPr>
+          <w:rFonts w:ascii="Times New Roman" w:eastAsia="Times New Roman" w:hAnsi="Times New Roman" w:cs="Times New Roman"/>
+          <w:sz w:val="36"/>
+          <w:szCs w:val="36"/>
+        </w:rPr>
+        <w:t>) szerkezetének kialakítása és a komponensek működésének ellenőrzése, a felhasználói felület stílusának kialakítása, hogy az oldal elrendezése megfeleljen a megtervezett UI-terveknek.</w:t>
       </w:r>
     </w:p>
     <w:p>
@@ -2795,7 +3186,25 @@
           <w:sz w:val="36"/>
           <w:szCs w:val="36"/>
         </w:rPr>
-        <w:t xml:space="preserve">, a routerben a főoldalak variánsainak gyerek route-okba </w:t>
+        <w:t xml:space="preserve">, a routerben a főoldalak variánsainak gyerek </w:t>
+      </w:r>
+      <w:proofErr w:type="spellStart"/>
+      <w:r>
+        <w:rPr>
+          <w:rFonts w:ascii="Times New Roman" w:eastAsia="Times New Roman" w:hAnsi="Times New Roman" w:cs="Times New Roman"/>
+          <w:sz w:val="36"/>
+          <w:szCs w:val="36"/>
+        </w:rPr>
+        <w:t>route</w:t>
+      </w:r>
+      <w:proofErr w:type="spellEnd"/>
+      <w:r>
+        <w:rPr>
+          <w:rFonts w:ascii="Times New Roman" w:eastAsia="Times New Roman" w:hAnsi="Times New Roman" w:cs="Times New Roman"/>
+          <w:sz w:val="36"/>
+          <w:szCs w:val="36"/>
+        </w:rPr>
+        <w:t xml:space="preserve">-okba </w:t>
       </w:r>
       <w:r>
         <w:rPr>
@@ -2820,15 +3229,51 @@
           <w:sz w:val="36"/>
           <w:szCs w:val="36"/>
         </w:rPr>
-        <w:t>, az új szabvány mintájára az admin nézet (gombok és rövid leírás azok alá) létrehozása</w:t>
-      </w:r>
-      <w:r>
-        <w:rPr>
-          <w:rFonts w:ascii="Times New Roman" w:eastAsia="Times New Roman" w:hAnsi="Times New Roman" w:cs="Times New Roman"/>
-          <w:sz w:val="36"/>
-          <w:szCs w:val="36"/>
-        </w:rPr>
-        <w:t>, felesleges import mezők kiszedése az App.vue fájlból</w:t>
+        <w:t xml:space="preserve">, az új szabvány mintájára az </w:t>
+      </w:r>
+      <w:proofErr w:type="spellStart"/>
+      <w:r>
+        <w:rPr>
+          <w:rFonts w:ascii="Times New Roman" w:eastAsia="Times New Roman" w:hAnsi="Times New Roman" w:cs="Times New Roman"/>
+          <w:sz w:val="36"/>
+          <w:szCs w:val="36"/>
+        </w:rPr>
+        <w:t>admin</w:t>
+      </w:r>
+      <w:proofErr w:type="spellEnd"/>
+      <w:r>
+        <w:rPr>
+          <w:rFonts w:ascii="Times New Roman" w:eastAsia="Times New Roman" w:hAnsi="Times New Roman" w:cs="Times New Roman"/>
+          <w:sz w:val="36"/>
+          <w:szCs w:val="36"/>
+        </w:rPr>
+        <w:t xml:space="preserve"> nézet (gombok és rövid leírás azok alá) létrehozása</w:t>
+      </w:r>
+      <w:r>
+        <w:rPr>
+          <w:rFonts w:ascii="Times New Roman" w:eastAsia="Times New Roman" w:hAnsi="Times New Roman" w:cs="Times New Roman"/>
+          <w:sz w:val="36"/>
+          <w:szCs w:val="36"/>
+        </w:rPr>
+        <w:t xml:space="preserve">, felesleges import mezők kiszedése az </w:t>
+      </w:r>
+      <w:proofErr w:type="spellStart"/>
+      <w:r>
+        <w:rPr>
+          <w:rFonts w:ascii="Times New Roman" w:eastAsia="Times New Roman" w:hAnsi="Times New Roman" w:cs="Times New Roman"/>
+          <w:sz w:val="36"/>
+          <w:szCs w:val="36"/>
+        </w:rPr>
+        <w:t>App.vue</w:t>
+      </w:r>
+      <w:proofErr w:type="spellEnd"/>
+      <w:r>
+        <w:rPr>
+          <w:rFonts w:ascii="Times New Roman" w:eastAsia="Times New Roman" w:hAnsi="Times New Roman" w:cs="Times New Roman"/>
+          <w:sz w:val="36"/>
+          <w:szCs w:val="36"/>
+        </w:rPr>
+        <w:t xml:space="preserve"> fájlból</w:t>
       </w:r>
     </w:p>
     <w:p>
@@ -2945,15 +3390,114 @@
           <w:sz w:val="36"/>
           <w:szCs w:val="36"/>
         </w:rPr>
-        <w:t>(Susán Csongor György, El-Nabulsy Csongor Alan)</w:t>
-      </w:r>
-      <w:r>
-        <w:rPr>
-          <w:rFonts w:ascii="Times New Roman" w:eastAsia="Times New Roman" w:hAnsi="Times New Roman" w:cs="Times New Roman"/>
-          <w:sz w:val="36"/>
-          <w:szCs w:val="36"/>
-        </w:rPr>
-        <w:t xml:space="preserve"> Nézetek végleges kialakítása (El-Nabulsy: HomeView, RequestView, SendView; Susán: főoldalak integrálása a HomeLayout</w:t>
+        <w:t>(Susán Csongor György, El-</w:t>
+      </w:r>
+      <w:proofErr w:type="spellStart"/>
+      <w:r>
+        <w:rPr>
+          <w:rFonts w:ascii="Times New Roman" w:eastAsia="Times New Roman" w:hAnsi="Times New Roman" w:cs="Times New Roman"/>
+          <w:sz w:val="36"/>
+          <w:szCs w:val="36"/>
+        </w:rPr>
+        <w:t>Nabulsy</w:t>
+      </w:r>
+      <w:proofErr w:type="spellEnd"/>
+      <w:r>
+        <w:rPr>
+          <w:rFonts w:ascii="Times New Roman" w:eastAsia="Times New Roman" w:hAnsi="Times New Roman" w:cs="Times New Roman"/>
+          <w:sz w:val="36"/>
+          <w:szCs w:val="36"/>
+        </w:rPr>
+        <w:t xml:space="preserve"> Csongor Alan)</w:t>
+      </w:r>
+      <w:r>
+        <w:rPr>
+          <w:rFonts w:ascii="Times New Roman" w:eastAsia="Times New Roman" w:hAnsi="Times New Roman" w:cs="Times New Roman"/>
+          <w:sz w:val="36"/>
+          <w:szCs w:val="36"/>
+        </w:rPr>
+        <w:t xml:space="preserve"> Nézetek végleges kialakítása (El-</w:t>
+      </w:r>
+      <w:proofErr w:type="spellStart"/>
+      <w:r>
+        <w:rPr>
+          <w:rFonts w:ascii="Times New Roman" w:eastAsia="Times New Roman" w:hAnsi="Times New Roman" w:cs="Times New Roman"/>
+          <w:sz w:val="36"/>
+          <w:szCs w:val="36"/>
+        </w:rPr>
+        <w:t>Nabulsy</w:t>
+      </w:r>
+      <w:proofErr w:type="spellEnd"/>
+      <w:r>
+        <w:rPr>
+          <w:rFonts w:ascii="Times New Roman" w:eastAsia="Times New Roman" w:hAnsi="Times New Roman" w:cs="Times New Roman"/>
+          <w:sz w:val="36"/>
+          <w:szCs w:val="36"/>
+        </w:rPr>
+        <w:t xml:space="preserve">: </w:t>
+      </w:r>
+      <w:proofErr w:type="spellStart"/>
+      <w:r>
+        <w:rPr>
+          <w:rFonts w:ascii="Times New Roman" w:eastAsia="Times New Roman" w:hAnsi="Times New Roman" w:cs="Times New Roman"/>
+          <w:sz w:val="36"/>
+          <w:szCs w:val="36"/>
+        </w:rPr>
+        <w:t>HomeView</w:t>
+      </w:r>
+      <w:proofErr w:type="spellEnd"/>
+      <w:r>
+        <w:rPr>
+          <w:rFonts w:ascii="Times New Roman" w:eastAsia="Times New Roman" w:hAnsi="Times New Roman" w:cs="Times New Roman"/>
+          <w:sz w:val="36"/>
+          <w:szCs w:val="36"/>
+        </w:rPr>
+        <w:t xml:space="preserve">, </w:t>
+      </w:r>
+      <w:proofErr w:type="spellStart"/>
+      <w:r>
+        <w:rPr>
+          <w:rFonts w:ascii="Times New Roman" w:eastAsia="Times New Roman" w:hAnsi="Times New Roman" w:cs="Times New Roman"/>
+          <w:sz w:val="36"/>
+          <w:szCs w:val="36"/>
+        </w:rPr>
+        <w:t>RequestView</w:t>
+      </w:r>
+      <w:proofErr w:type="spellEnd"/>
+      <w:r>
+        <w:rPr>
+          <w:rFonts w:ascii="Times New Roman" w:eastAsia="Times New Roman" w:hAnsi="Times New Roman" w:cs="Times New Roman"/>
+          <w:sz w:val="36"/>
+          <w:szCs w:val="36"/>
+        </w:rPr>
+        <w:t xml:space="preserve">, </w:t>
+      </w:r>
+      <w:proofErr w:type="spellStart"/>
+      <w:r>
+        <w:rPr>
+          <w:rFonts w:ascii="Times New Roman" w:eastAsia="Times New Roman" w:hAnsi="Times New Roman" w:cs="Times New Roman"/>
+          <w:sz w:val="36"/>
+          <w:szCs w:val="36"/>
+        </w:rPr>
+        <w:t>SendView</w:t>
+      </w:r>
+      <w:proofErr w:type="spellEnd"/>
+      <w:r>
+        <w:rPr>
+          <w:rFonts w:ascii="Times New Roman" w:eastAsia="Times New Roman" w:hAnsi="Times New Roman" w:cs="Times New Roman"/>
+          <w:sz w:val="36"/>
+          <w:szCs w:val="36"/>
+        </w:rPr>
+        <w:t xml:space="preserve">; Susán: főoldalak integrálása a </w:t>
+      </w:r>
+      <w:proofErr w:type="spellStart"/>
+      <w:r>
+        <w:rPr>
+          <w:rFonts w:ascii="Times New Roman" w:eastAsia="Times New Roman" w:hAnsi="Times New Roman" w:cs="Times New Roman"/>
+          <w:sz w:val="36"/>
+          <w:szCs w:val="36"/>
+        </w:rPr>
+        <w:t>HomeLayout</w:t>
       </w:r>
       <w:r>
         <w:rPr>
@@ -2969,7 +3513,16 @@
           <w:sz w:val="36"/>
           <w:szCs w:val="36"/>
         </w:rPr>
-        <w:t>ba)</w:t>
+        <w:t>ba</w:t>
+      </w:r>
+      <w:proofErr w:type="spellEnd"/>
+      <w:r>
+        <w:rPr>
+          <w:rFonts w:ascii="Times New Roman" w:eastAsia="Times New Roman" w:hAnsi="Times New Roman" w:cs="Times New Roman"/>
+          <w:sz w:val="36"/>
+          <w:szCs w:val="36"/>
+        </w:rPr>
+        <w:t>)</w:t>
       </w:r>
       <w:r>
         <w:rPr>
@@ -3018,7 +3571,25 @@
           <w:sz w:val="36"/>
           <w:szCs w:val="36"/>
         </w:rPr>
-        <w:t>Példa adatok felvétele a HomeLayout-ba a helyes működés tesztelésének érdekében</w:t>
+        <w:t xml:space="preserve">Példa adatok felvétele a </w:t>
+      </w:r>
+      <w:proofErr w:type="spellStart"/>
+      <w:r>
+        <w:rPr>
+          <w:rFonts w:ascii="Times New Roman" w:eastAsia="Times New Roman" w:hAnsi="Times New Roman" w:cs="Times New Roman"/>
+          <w:sz w:val="36"/>
+          <w:szCs w:val="36"/>
+        </w:rPr>
+        <w:t>HomeLayout-ba</w:t>
+      </w:r>
+      <w:proofErr w:type="spellEnd"/>
+      <w:r>
+        <w:rPr>
+          <w:rFonts w:ascii="Times New Roman" w:eastAsia="Times New Roman" w:hAnsi="Times New Roman" w:cs="Times New Roman"/>
+          <w:sz w:val="36"/>
+          <w:szCs w:val="36"/>
+        </w:rPr>
+        <w:t xml:space="preserve"> a helyes működés tesztelésének érdekében</w:t>
       </w:r>
     </w:p>
     <w:p>
@@ -3066,13 +3637,51 @@
           <w:szCs w:val="36"/>
         </w:rPr>
       </w:pPr>
-      <w:r>
-        <w:rPr>
-          <w:rFonts w:ascii="Times New Roman" w:eastAsia="Times New Roman" w:hAnsi="Times New Roman" w:cs="Times New Roman"/>
-          <w:sz w:val="36"/>
-          <w:szCs w:val="36"/>
-        </w:rPr>
-        <w:t>meta.title-ekben és a beforeEach-ben oldalcímek meghatározása</w:t>
+      <w:proofErr w:type="spellStart"/>
+      <w:proofErr w:type="gramStart"/>
+      <w:r>
+        <w:rPr>
+          <w:rFonts w:ascii="Times New Roman" w:eastAsia="Times New Roman" w:hAnsi="Times New Roman" w:cs="Times New Roman"/>
+          <w:sz w:val="36"/>
+          <w:szCs w:val="36"/>
+        </w:rPr>
+        <w:t>meta.title</w:t>
+      </w:r>
+      <w:proofErr w:type="gramEnd"/>
+      <w:r>
+        <w:rPr>
+          <w:rFonts w:ascii="Times New Roman" w:eastAsia="Times New Roman" w:hAnsi="Times New Roman" w:cs="Times New Roman"/>
+          <w:sz w:val="36"/>
+          <w:szCs w:val="36"/>
+        </w:rPr>
+        <w:t>-ekben</w:t>
+      </w:r>
+      <w:proofErr w:type="spellEnd"/>
+      <w:r>
+        <w:rPr>
+          <w:rFonts w:ascii="Times New Roman" w:eastAsia="Times New Roman" w:hAnsi="Times New Roman" w:cs="Times New Roman"/>
+          <w:sz w:val="36"/>
+          <w:szCs w:val="36"/>
+        </w:rPr>
+        <w:t xml:space="preserve"> és a </w:t>
+      </w:r>
+      <w:proofErr w:type="spellStart"/>
+      <w:r>
+        <w:rPr>
+          <w:rFonts w:ascii="Times New Roman" w:eastAsia="Times New Roman" w:hAnsi="Times New Roman" w:cs="Times New Roman"/>
+          <w:sz w:val="36"/>
+          <w:szCs w:val="36"/>
+        </w:rPr>
+        <w:t>beforeEach</w:t>
+      </w:r>
+      <w:proofErr w:type="spellEnd"/>
+      <w:r>
+        <w:rPr>
+          <w:rFonts w:ascii="Times New Roman" w:eastAsia="Times New Roman" w:hAnsi="Times New Roman" w:cs="Times New Roman"/>
+          <w:sz w:val="36"/>
+          <w:szCs w:val="36"/>
+        </w:rPr>
+        <w:t>-ben oldalcímek meghatározása</w:t>
       </w:r>
     </w:p>
     <w:p>
@@ -3128,6 +3737,7 @@
           <w:szCs w:val="36"/>
         </w:rPr>
       </w:pPr>
+      <w:proofErr w:type="spellStart"/>
       <w:r>
         <w:rPr>
           <w:rFonts w:ascii="Times New Roman" w:eastAsia="Times New Roman" w:hAnsi="Times New Roman" w:cs="Times New Roman"/>
@@ -3135,7 +3745,34 @@
           <w:szCs w:val="36"/>
         </w:rPr>
         <w:lastRenderedPageBreak/>
-        <w:t>auth függvény hozzáadása a bejelentkezési képernyőhöz (LoginView), ami egyelőre üres, egy komment jelzi annak célját</w:t>
+        <w:t>auth</w:t>
+      </w:r>
+      <w:proofErr w:type="spellEnd"/>
+      <w:r>
+        <w:rPr>
+          <w:rFonts w:ascii="Times New Roman" w:eastAsia="Times New Roman" w:hAnsi="Times New Roman" w:cs="Times New Roman"/>
+          <w:sz w:val="36"/>
+          <w:szCs w:val="36"/>
+        </w:rPr>
+        <w:t xml:space="preserve"> függvény hozzáadása a bejelentkezési képernyőhöz (</w:t>
+      </w:r>
+      <w:proofErr w:type="spellStart"/>
+      <w:r>
+        <w:rPr>
+          <w:rFonts w:ascii="Times New Roman" w:eastAsia="Times New Roman" w:hAnsi="Times New Roman" w:cs="Times New Roman"/>
+          <w:sz w:val="36"/>
+          <w:szCs w:val="36"/>
+        </w:rPr>
+        <w:t>LoginView</w:t>
+      </w:r>
+      <w:proofErr w:type="spellEnd"/>
+      <w:r>
+        <w:rPr>
+          <w:rFonts w:ascii="Times New Roman" w:eastAsia="Times New Roman" w:hAnsi="Times New Roman" w:cs="Times New Roman"/>
+          <w:sz w:val="36"/>
+          <w:szCs w:val="36"/>
+        </w:rPr>
+        <w:t>), ami egyelőre üres, egy komment jelzi annak célját</w:t>
       </w:r>
     </w:p>
     <w:p>
@@ -3336,7 +3973,43 @@
           <w:sz w:val="36"/>
           <w:szCs w:val="36"/>
         </w:rPr>
-        <w:t>Szerepkörök (role) és requiresAuth hozzáadása a nézetekhez</w:t>
+        <w:t>Szerepkörök (</w:t>
+      </w:r>
+      <w:proofErr w:type="spellStart"/>
+      <w:r>
+        <w:rPr>
+          <w:rFonts w:ascii="Times New Roman" w:eastAsia="Times New Roman" w:hAnsi="Times New Roman" w:cs="Times New Roman"/>
+          <w:sz w:val="36"/>
+          <w:szCs w:val="36"/>
+        </w:rPr>
+        <w:t>role</w:t>
+      </w:r>
+      <w:proofErr w:type="spellEnd"/>
+      <w:r>
+        <w:rPr>
+          <w:rFonts w:ascii="Times New Roman" w:eastAsia="Times New Roman" w:hAnsi="Times New Roman" w:cs="Times New Roman"/>
+          <w:sz w:val="36"/>
+          <w:szCs w:val="36"/>
+        </w:rPr>
+        <w:t xml:space="preserve">) és </w:t>
+      </w:r>
+      <w:proofErr w:type="spellStart"/>
+      <w:r>
+        <w:rPr>
+          <w:rFonts w:ascii="Times New Roman" w:eastAsia="Times New Roman" w:hAnsi="Times New Roman" w:cs="Times New Roman"/>
+          <w:sz w:val="36"/>
+          <w:szCs w:val="36"/>
+        </w:rPr>
+        <w:t>requiresAuth</w:t>
+      </w:r>
+      <w:proofErr w:type="spellEnd"/>
+      <w:r>
+        <w:rPr>
+          <w:rFonts w:ascii="Times New Roman" w:eastAsia="Times New Roman" w:hAnsi="Times New Roman" w:cs="Times New Roman"/>
+          <w:sz w:val="36"/>
+          <w:szCs w:val="36"/>
+        </w:rPr>
+        <w:t xml:space="preserve"> hozzáadása a nézetekhez</w:t>
       </w:r>
     </w:p>
     <w:p>
@@ -3354,13 +4027,41 @@
           <w:szCs w:val="36"/>
         </w:rPr>
       </w:pPr>
-      <w:r>
-        <w:rPr>
-          <w:rFonts w:ascii="Times New Roman" w:eastAsia="Times New Roman" w:hAnsi="Times New Roman" w:cs="Times New Roman"/>
-          <w:sz w:val="36"/>
-          <w:szCs w:val="36"/>
-        </w:rPr>
-        <w:t>Autentikációhoz szükséges alapváltozók felvétele az App.vue-ban</w:t>
+      <w:proofErr w:type="spellStart"/>
+      <w:r>
+        <w:rPr>
+          <w:rFonts w:ascii="Times New Roman" w:eastAsia="Times New Roman" w:hAnsi="Times New Roman" w:cs="Times New Roman"/>
+          <w:sz w:val="36"/>
+          <w:szCs w:val="36"/>
+        </w:rPr>
+        <w:t>Autentikációhoz</w:t>
+      </w:r>
+      <w:proofErr w:type="spellEnd"/>
+      <w:r>
+        <w:rPr>
+          <w:rFonts w:ascii="Times New Roman" w:eastAsia="Times New Roman" w:hAnsi="Times New Roman" w:cs="Times New Roman"/>
+          <w:sz w:val="36"/>
+          <w:szCs w:val="36"/>
+        </w:rPr>
+        <w:t xml:space="preserve"> szükséges alapváltozók felvétele az </w:t>
+      </w:r>
+      <w:proofErr w:type="spellStart"/>
+      <w:r>
+        <w:rPr>
+          <w:rFonts w:ascii="Times New Roman" w:eastAsia="Times New Roman" w:hAnsi="Times New Roman" w:cs="Times New Roman"/>
+          <w:sz w:val="36"/>
+          <w:szCs w:val="36"/>
+        </w:rPr>
+        <w:t>App.vue</w:t>
+      </w:r>
+      <w:proofErr w:type="spellEnd"/>
+      <w:r>
+        <w:rPr>
+          <w:rFonts w:ascii="Times New Roman" w:eastAsia="Times New Roman" w:hAnsi="Times New Roman" w:cs="Times New Roman"/>
+          <w:sz w:val="36"/>
+          <w:szCs w:val="36"/>
+        </w:rPr>
+        <w:t>-ban</w:t>
       </w:r>
     </w:p>
     <w:p>
@@ -3400,7 +4101,25 @@
           <w:sz w:val="36"/>
           <w:szCs w:val="36"/>
         </w:rPr>
-        <w:t>(Susán Csongor György, El-Nabulsy Csongor Alan)</w:t>
+        <w:t>(Susán Csongor György, El-</w:t>
+      </w:r>
+      <w:proofErr w:type="spellStart"/>
+      <w:r>
+        <w:rPr>
+          <w:rFonts w:ascii="Times New Roman" w:eastAsia="Times New Roman" w:hAnsi="Times New Roman" w:cs="Times New Roman"/>
+          <w:sz w:val="36"/>
+          <w:szCs w:val="36"/>
+        </w:rPr>
+        <w:t>Nabulsy</w:t>
+      </w:r>
+      <w:proofErr w:type="spellEnd"/>
+      <w:r>
+        <w:rPr>
+          <w:rFonts w:ascii="Times New Roman" w:eastAsia="Times New Roman" w:hAnsi="Times New Roman" w:cs="Times New Roman"/>
+          <w:sz w:val="36"/>
+          <w:szCs w:val="36"/>
+        </w:rPr>
+        <w:t xml:space="preserve"> Csongor Alan)</w:t>
       </w:r>
     </w:p>
     <w:p>
@@ -3446,7 +4165,25 @@
           <w:sz w:val="36"/>
           <w:szCs w:val="36"/>
         </w:rPr>
-        <w:t>Táblák SQL-tervezetének elkészítése (El-Nabulsy)</w:t>
+        <w:t>Táblák SQL-tervezetének elkészítése (El-</w:t>
+      </w:r>
+      <w:proofErr w:type="spellStart"/>
+      <w:r>
+        <w:rPr>
+          <w:rFonts w:ascii="Times New Roman" w:eastAsia="Times New Roman" w:hAnsi="Times New Roman" w:cs="Times New Roman"/>
+          <w:sz w:val="36"/>
+          <w:szCs w:val="36"/>
+        </w:rPr>
+        <w:t>Nabulsy</w:t>
+      </w:r>
+      <w:proofErr w:type="spellEnd"/>
+      <w:r>
+        <w:rPr>
+          <w:rFonts w:ascii="Times New Roman" w:eastAsia="Times New Roman" w:hAnsi="Times New Roman" w:cs="Times New Roman"/>
+          <w:sz w:val="36"/>
+          <w:szCs w:val="36"/>
+        </w:rPr>
+        <w:t>)</w:t>
       </w:r>
     </w:p>
     <w:p>
@@ -3470,7 +4207,79 @@
           <w:szCs w:val="36"/>
         </w:rPr>
         <w:lastRenderedPageBreak/>
-        <w:t>Táblázatok relációs tervvé írása és azok implementálása (model-lek, egyelőre üres seederek és migration-ök) a Backend (Laravel) projektbe (Susán)</w:t>
+        <w:t>Táblázatok relációs tervvé írása és azok implementálása (</w:t>
+      </w:r>
+      <w:proofErr w:type="spellStart"/>
+      <w:r>
+        <w:rPr>
+          <w:rFonts w:ascii="Times New Roman" w:eastAsia="Times New Roman" w:hAnsi="Times New Roman" w:cs="Times New Roman"/>
+          <w:sz w:val="36"/>
+          <w:szCs w:val="36"/>
+        </w:rPr>
+        <w:t>model-lek</w:t>
+      </w:r>
+      <w:proofErr w:type="spellEnd"/>
+      <w:r>
+        <w:rPr>
+          <w:rFonts w:ascii="Times New Roman" w:eastAsia="Times New Roman" w:hAnsi="Times New Roman" w:cs="Times New Roman"/>
+          <w:sz w:val="36"/>
+          <w:szCs w:val="36"/>
+        </w:rPr>
+        <w:t xml:space="preserve">, egyelőre üres </w:t>
+      </w:r>
+      <w:proofErr w:type="spellStart"/>
+      <w:r>
+        <w:rPr>
+          <w:rFonts w:ascii="Times New Roman" w:eastAsia="Times New Roman" w:hAnsi="Times New Roman" w:cs="Times New Roman"/>
+          <w:sz w:val="36"/>
+          <w:szCs w:val="36"/>
+        </w:rPr>
+        <w:t>seederek</w:t>
+      </w:r>
+      <w:proofErr w:type="spellEnd"/>
+      <w:r>
+        <w:rPr>
+          <w:rFonts w:ascii="Times New Roman" w:eastAsia="Times New Roman" w:hAnsi="Times New Roman" w:cs="Times New Roman"/>
+          <w:sz w:val="36"/>
+          <w:szCs w:val="36"/>
+        </w:rPr>
+        <w:t xml:space="preserve"> és </w:t>
+      </w:r>
+      <w:proofErr w:type="spellStart"/>
+      <w:r>
+        <w:rPr>
+          <w:rFonts w:ascii="Times New Roman" w:eastAsia="Times New Roman" w:hAnsi="Times New Roman" w:cs="Times New Roman"/>
+          <w:sz w:val="36"/>
+          <w:szCs w:val="36"/>
+        </w:rPr>
+        <w:t>migration-ök</w:t>
+      </w:r>
+      <w:proofErr w:type="spellEnd"/>
+      <w:r>
+        <w:rPr>
+          <w:rFonts w:ascii="Times New Roman" w:eastAsia="Times New Roman" w:hAnsi="Times New Roman" w:cs="Times New Roman"/>
+          <w:sz w:val="36"/>
+          <w:szCs w:val="36"/>
+        </w:rPr>
+        <w:t>) a Backend (</w:t>
+      </w:r>
+      <w:proofErr w:type="spellStart"/>
+      <w:r>
+        <w:rPr>
+          <w:rFonts w:ascii="Times New Roman" w:eastAsia="Times New Roman" w:hAnsi="Times New Roman" w:cs="Times New Roman"/>
+          <w:sz w:val="36"/>
+          <w:szCs w:val="36"/>
+        </w:rPr>
+        <w:t>Laravel</w:t>
+      </w:r>
+      <w:proofErr w:type="spellEnd"/>
+      <w:r>
+        <w:rPr>
+          <w:rFonts w:ascii="Times New Roman" w:eastAsia="Times New Roman" w:hAnsi="Times New Roman" w:cs="Times New Roman"/>
+          <w:sz w:val="36"/>
+          <w:szCs w:val="36"/>
+        </w:rPr>
+        <w:t>) projektbe (Susán)</w:t>
       </w:r>
     </w:p>
     <w:p>
@@ -3493,7 +4302,79 @@
           <w:sz w:val="36"/>
           <w:szCs w:val="36"/>
         </w:rPr>
-        <w:t>Projekt struktúrájának végleges kialakítása (eddig frontendPart-blathyfm volt, viszont azóta a főmappa a BlathyFM mappát viseli, amiben két, az alkalmazás egy-egy szintjét képviselő projekt található (blathyfm_frontend – amiben az eddigi frontend-alkalmazás volt megtalálható – és blathyfm_backend, ami pedig az újonnan létrejött backend része a projektnek) (Susán)</w:t>
+        <w:t xml:space="preserve">Projekt struktúrájának végleges kialakítása (eddig </w:t>
+      </w:r>
+      <w:proofErr w:type="spellStart"/>
+      <w:r>
+        <w:rPr>
+          <w:rFonts w:ascii="Times New Roman" w:eastAsia="Times New Roman" w:hAnsi="Times New Roman" w:cs="Times New Roman"/>
+          <w:sz w:val="36"/>
+          <w:szCs w:val="36"/>
+        </w:rPr>
+        <w:t>frontendPart-blathyfm</w:t>
+      </w:r>
+      <w:proofErr w:type="spellEnd"/>
+      <w:r>
+        <w:rPr>
+          <w:rFonts w:ascii="Times New Roman" w:eastAsia="Times New Roman" w:hAnsi="Times New Roman" w:cs="Times New Roman"/>
+          <w:sz w:val="36"/>
+          <w:szCs w:val="36"/>
+        </w:rPr>
+        <w:t xml:space="preserve"> volt, viszont azóta a főmappa a </w:t>
+      </w:r>
+      <w:proofErr w:type="spellStart"/>
+      <w:r>
+        <w:rPr>
+          <w:rFonts w:ascii="Times New Roman" w:eastAsia="Times New Roman" w:hAnsi="Times New Roman" w:cs="Times New Roman"/>
+          <w:sz w:val="36"/>
+          <w:szCs w:val="36"/>
+        </w:rPr>
+        <w:t>BlathyFM</w:t>
+      </w:r>
+      <w:proofErr w:type="spellEnd"/>
+      <w:r>
+        <w:rPr>
+          <w:rFonts w:ascii="Times New Roman" w:eastAsia="Times New Roman" w:hAnsi="Times New Roman" w:cs="Times New Roman"/>
+          <w:sz w:val="36"/>
+          <w:szCs w:val="36"/>
+        </w:rPr>
+        <w:t xml:space="preserve"> mappát viseli, amiben két, az alkalmazás egy-egy szintjét képviselő projekt található (</w:t>
+      </w:r>
+      <w:proofErr w:type="spellStart"/>
+      <w:r>
+        <w:rPr>
+          <w:rFonts w:ascii="Times New Roman" w:eastAsia="Times New Roman" w:hAnsi="Times New Roman" w:cs="Times New Roman"/>
+          <w:sz w:val="36"/>
+          <w:szCs w:val="36"/>
+        </w:rPr>
+        <w:t>blathyfm_frontend</w:t>
+      </w:r>
+      <w:proofErr w:type="spellEnd"/>
+      <w:r>
+        <w:rPr>
+          <w:rFonts w:ascii="Times New Roman" w:eastAsia="Times New Roman" w:hAnsi="Times New Roman" w:cs="Times New Roman"/>
+          <w:sz w:val="36"/>
+          <w:szCs w:val="36"/>
+        </w:rPr>
+        <w:t xml:space="preserve"> – amiben az eddigi frontend-alkalmazás volt megtalálható – és </w:t>
+      </w:r>
+      <w:proofErr w:type="spellStart"/>
+      <w:r>
+        <w:rPr>
+          <w:rFonts w:ascii="Times New Roman" w:eastAsia="Times New Roman" w:hAnsi="Times New Roman" w:cs="Times New Roman"/>
+          <w:sz w:val="36"/>
+          <w:szCs w:val="36"/>
+        </w:rPr>
+        <w:t>blathyfm_backend</w:t>
+      </w:r>
+      <w:proofErr w:type="spellEnd"/>
+      <w:r>
+        <w:rPr>
+          <w:rFonts w:ascii="Times New Roman" w:eastAsia="Times New Roman" w:hAnsi="Times New Roman" w:cs="Times New Roman"/>
+          <w:sz w:val="36"/>
+          <w:szCs w:val="36"/>
+        </w:rPr>
+        <w:t>, ami pedig az újonnan létrejött backend része a projektnek) (Susán)</w:t>
       </w:r>
     </w:p>
     <w:p>
@@ -3578,7 +4459,43 @@
           <w:sz w:val="36"/>
           <w:szCs w:val="36"/>
         </w:rPr>
-        <w:t>(El-Nabulsy Csongor Alan) Az ütemezői nézet (SchedulerView) elkészítése</w:t>
+        <w:t>(El-</w:t>
+      </w:r>
+      <w:proofErr w:type="spellStart"/>
+      <w:r>
+        <w:rPr>
+          <w:rFonts w:ascii="Times New Roman" w:eastAsia="Times New Roman" w:hAnsi="Times New Roman" w:cs="Times New Roman"/>
+          <w:sz w:val="36"/>
+          <w:szCs w:val="36"/>
+        </w:rPr>
+        <w:t>Nabulsy</w:t>
+      </w:r>
+      <w:proofErr w:type="spellEnd"/>
+      <w:r>
+        <w:rPr>
+          <w:rFonts w:ascii="Times New Roman" w:eastAsia="Times New Roman" w:hAnsi="Times New Roman" w:cs="Times New Roman"/>
+          <w:sz w:val="36"/>
+          <w:szCs w:val="36"/>
+        </w:rPr>
+        <w:t xml:space="preserve"> Csongor Alan) Az ütemezői nézet (</w:t>
+      </w:r>
+      <w:proofErr w:type="spellStart"/>
+      <w:r>
+        <w:rPr>
+          <w:rFonts w:ascii="Times New Roman" w:eastAsia="Times New Roman" w:hAnsi="Times New Roman" w:cs="Times New Roman"/>
+          <w:sz w:val="36"/>
+          <w:szCs w:val="36"/>
+        </w:rPr>
+        <w:t>SchedulerView</w:t>
+      </w:r>
+      <w:proofErr w:type="spellEnd"/>
+      <w:r>
+        <w:rPr>
+          <w:rFonts w:ascii="Times New Roman" w:eastAsia="Times New Roman" w:hAnsi="Times New Roman" w:cs="Times New Roman"/>
+          <w:sz w:val="36"/>
+          <w:szCs w:val="36"/>
+        </w:rPr>
+        <w:t>) elkészítése</w:t>
       </w:r>
       <w:r>
         <w:rPr>
@@ -3615,7 +4532,25 @@
           <w:sz w:val="36"/>
           <w:szCs w:val="36"/>
         </w:rPr>
-        <w:t>Tervezéssel kapcsolatos dokumentumok áthelyezése egy „plans” mappába, a</w:t>
+        <w:t>Tervezéssel kapcsolatos dokumentumok áthelyezése egy „</w:t>
+      </w:r>
+      <w:proofErr w:type="spellStart"/>
+      <w:r>
+        <w:rPr>
+          <w:rFonts w:ascii="Times New Roman" w:eastAsia="Times New Roman" w:hAnsi="Times New Roman" w:cs="Times New Roman"/>
+          <w:sz w:val="36"/>
+          <w:szCs w:val="36"/>
+        </w:rPr>
+        <w:t>plans</w:t>
+      </w:r>
+      <w:proofErr w:type="spellEnd"/>
+      <w:r>
+        <w:rPr>
+          <w:rFonts w:ascii="Times New Roman" w:eastAsia="Times New Roman" w:hAnsi="Times New Roman" w:cs="Times New Roman"/>
+          <w:sz w:val="36"/>
+          <w:szCs w:val="36"/>
+        </w:rPr>
+        <w:t>” mappába, a</w:t>
       </w:r>
       <w:r>
         <w:rPr>
@@ -3625,6 +4560,19 @@
         </w:rPr>
         <w:t>z oldal aljáról elérhető oldalak közül az impresszum és szabályzat elkészítése.</w:t>
       </w:r>
+    </w:p>
+    <w:p>
+      <w:pPr>
+        <w:pStyle w:val="Listaszerbekezds"/>
+        <w:spacing w:after="840"/>
+        <w:ind w:left="0"/>
+        <w:jc w:val="both"/>
+        <w:rPr>
+          <w:rFonts w:ascii="Times New Roman" w:eastAsia="Times New Roman" w:hAnsi="Times New Roman" w:cs="Times New Roman"/>
+          <w:sz w:val="36"/>
+          <w:szCs w:val="36"/>
+        </w:rPr>
+      </w:pPr>
     </w:p>
     <w:p>
       <w:pPr>
@@ -3676,7 +4624,25 @@
           <w:sz w:val="36"/>
           <w:szCs w:val="36"/>
         </w:rPr>
-        <w:t>El-Nabulsy Csongor Alan</w:t>
+        <w:t>El-</w:t>
+      </w:r>
+      <w:proofErr w:type="spellStart"/>
+      <w:r>
+        <w:rPr>
+          <w:rFonts w:ascii="Times New Roman" w:eastAsia="Times New Roman" w:hAnsi="Times New Roman" w:cs="Times New Roman"/>
+          <w:sz w:val="36"/>
+          <w:szCs w:val="36"/>
+        </w:rPr>
+        <w:t>Nabulsy</w:t>
+      </w:r>
+      <w:proofErr w:type="spellEnd"/>
+      <w:r>
+        <w:rPr>
+          <w:rFonts w:ascii="Times New Roman" w:eastAsia="Times New Roman" w:hAnsi="Times New Roman" w:cs="Times New Roman"/>
+          <w:sz w:val="36"/>
+          <w:szCs w:val="36"/>
+        </w:rPr>
+        <w:t xml:space="preserve"> Csongor Alan</w:t>
       </w:r>
       <w:r>
         <w:rPr>
@@ -3692,7 +4658,43 @@
           <w:sz w:val="36"/>
           <w:szCs w:val="36"/>
         </w:rPr>
-        <w:t xml:space="preserve"> RequestView és SchedulerView továbbfejlesztése</w:t>
+        <w:t xml:space="preserve"> </w:t>
+      </w:r>
+      <w:proofErr w:type="spellStart"/>
+      <w:r>
+        <w:rPr>
+          <w:rFonts w:ascii="Times New Roman" w:eastAsia="Times New Roman" w:hAnsi="Times New Roman" w:cs="Times New Roman"/>
+          <w:sz w:val="36"/>
+          <w:szCs w:val="36"/>
+        </w:rPr>
+        <w:t>RequestView</w:t>
+      </w:r>
+      <w:proofErr w:type="spellEnd"/>
+      <w:r>
+        <w:rPr>
+          <w:rFonts w:ascii="Times New Roman" w:eastAsia="Times New Roman" w:hAnsi="Times New Roman" w:cs="Times New Roman"/>
+          <w:sz w:val="36"/>
+          <w:szCs w:val="36"/>
+        </w:rPr>
+        <w:t xml:space="preserve"> és </w:t>
+      </w:r>
+      <w:proofErr w:type="spellStart"/>
+      <w:r>
+        <w:rPr>
+          <w:rFonts w:ascii="Times New Roman" w:eastAsia="Times New Roman" w:hAnsi="Times New Roman" w:cs="Times New Roman"/>
+          <w:sz w:val="36"/>
+          <w:szCs w:val="36"/>
+        </w:rPr>
+        <w:t>SchedulerView</w:t>
+      </w:r>
+      <w:proofErr w:type="spellEnd"/>
+      <w:r>
+        <w:rPr>
+          <w:rFonts w:ascii="Times New Roman" w:eastAsia="Times New Roman" w:hAnsi="Times New Roman" w:cs="Times New Roman"/>
+          <w:sz w:val="36"/>
+          <w:szCs w:val="36"/>
+        </w:rPr>
+        <w:t xml:space="preserve"> továbbfejlesztése</w:t>
       </w:r>
     </w:p>
     <w:p>
@@ -3805,7 +4807,25 @@
           <w:sz w:val="36"/>
           <w:szCs w:val="36"/>
         </w:rPr>
-        <w:t xml:space="preserve"> az adatbázisba seederek segítségével</w:t>
+        <w:t xml:space="preserve"> az adatbázisba </w:t>
+      </w:r>
+      <w:proofErr w:type="spellStart"/>
+      <w:r>
+        <w:rPr>
+          <w:rFonts w:ascii="Times New Roman" w:eastAsia="Times New Roman" w:hAnsi="Times New Roman" w:cs="Times New Roman"/>
+          <w:sz w:val="36"/>
+          <w:szCs w:val="36"/>
+        </w:rPr>
+        <w:t>seederek</w:t>
+      </w:r>
+      <w:proofErr w:type="spellEnd"/>
+      <w:r>
+        <w:rPr>
+          <w:rFonts w:ascii="Times New Roman" w:eastAsia="Times New Roman" w:hAnsi="Times New Roman" w:cs="Times New Roman"/>
+          <w:sz w:val="36"/>
+          <w:szCs w:val="36"/>
+        </w:rPr>
+        <w:t xml:space="preserve"> segítségével</w:t>
       </w:r>
     </w:p>
     <w:p>
@@ -3834,7 +4854,6 @@
           <w:sz w:val="40"/>
           <w:szCs w:val="36"/>
         </w:rPr>
-        <w:lastRenderedPageBreak/>
         <w:t>2026-03-26 13:05-</w:t>
       </w:r>
       <w:r>
@@ -3954,6 +4973,7 @@
           <w:szCs w:val="36"/>
         </w:rPr>
       </w:pPr>
+      <w:proofErr w:type="spellStart"/>
       <w:r>
         <w:rPr>
           <w:rFonts w:ascii="Times New Roman" w:eastAsia="Times New Roman" w:hAnsi="Times New Roman" w:cs="Times New Roman"/>
@@ -3962,6 +4982,7 @@
         </w:rPr>
         <w:t>Genre</w:t>
       </w:r>
+      <w:proofErr w:type="spellEnd"/>
       <w:r>
         <w:rPr>
           <w:rFonts w:ascii="Times New Roman" w:eastAsia="Times New Roman" w:hAnsi="Times New Roman" w:cs="Times New Roman"/>
@@ -4111,7 +5132,61 @@
           <w:sz w:val="36"/>
           <w:szCs w:val="36"/>
         </w:rPr>
-        <w:t>Backend oldali migrationök és seederek debuggolása, hibamentesítése.</w:t>
+        <w:t xml:space="preserve">Backend oldali </w:t>
+      </w:r>
+      <w:proofErr w:type="spellStart"/>
+      <w:r>
+        <w:rPr>
+          <w:rFonts w:ascii="Times New Roman" w:eastAsia="Times New Roman" w:hAnsi="Times New Roman" w:cs="Times New Roman"/>
+          <w:sz w:val="36"/>
+          <w:szCs w:val="36"/>
+        </w:rPr>
+        <w:t>migrationök</w:t>
+      </w:r>
+      <w:proofErr w:type="spellEnd"/>
+      <w:r>
+        <w:rPr>
+          <w:rFonts w:ascii="Times New Roman" w:eastAsia="Times New Roman" w:hAnsi="Times New Roman" w:cs="Times New Roman"/>
+          <w:sz w:val="36"/>
+          <w:szCs w:val="36"/>
+        </w:rPr>
+        <w:t xml:space="preserve"> és </w:t>
+      </w:r>
+      <w:proofErr w:type="spellStart"/>
+      <w:r>
+        <w:rPr>
+          <w:rFonts w:ascii="Times New Roman" w:eastAsia="Times New Roman" w:hAnsi="Times New Roman" w:cs="Times New Roman"/>
+          <w:sz w:val="36"/>
+          <w:szCs w:val="36"/>
+        </w:rPr>
+        <w:t>seederek</w:t>
+      </w:r>
+      <w:proofErr w:type="spellEnd"/>
+      <w:r>
+        <w:rPr>
+          <w:rFonts w:ascii="Times New Roman" w:eastAsia="Times New Roman" w:hAnsi="Times New Roman" w:cs="Times New Roman"/>
+          <w:sz w:val="36"/>
+          <w:szCs w:val="36"/>
+        </w:rPr>
+        <w:t xml:space="preserve"> </w:t>
+      </w:r>
+      <w:proofErr w:type="spellStart"/>
+      <w:r>
+        <w:rPr>
+          <w:rFonts w:ascii="Times New Roman" w:eastAsia="Times New Roman" w:hAnsi="Times New Roman" w:cs="Times New Roman"/>
+          <w:sz w:val="36"/>
+          <w:szCs w:val="36"/>
+        </w:rPr>
+        <w:t>debuggolása</w:t>
+      </w:r>
+      <w:proofErr w:type="spellEnd"/>
+      <w:r>
+        <w:rPr>
+          <w:rFonts w:ascii="Times New Roman" w:eastAsia="Times New Roman" w:hAnsi="Times New Roman" w:cs="Times New Roman"/>
+          <w:sz w:val="36"/>
+          <w:szCs w:val="36"/>
+        </w:rPr>
+        <w:t>, hibamentesítése.</w:t>
       </w:r>
     </w:p>
     <w:p>
@@ -4265,7 +5340,25 @@
           <w:sz w:val="36"/>
           <w:szCs w:val="36"/>
         </w:rPr>
-        <w:t>Felvétel előtt álló felhasználók (PendingUser) táblájának hozzáadása az adatbázisba</w:t>
+        <w:t>Felvétel előtt álló felhasználók (</w:t>
+      </w:r>
+      <w:proofErr w:type="spellStart"/>
+      <w:r>
+        <w:rPr>
+          <w:rFonts w:ascii="Times New Roman" w:eastAsia="Times New Roman" w:hAnsi="Times New Roman" w:cs="Times New Roman"/>
+          <w:sz w:val="36"/>
+          <w:szCs w:val="36"/>
+        </w:rPr>
+        <w:t>PendingUser</w:t>
+      </w:r>
+      <w:proofErr w:type="spellEnd"/>
+      <w:r>
+        <w:rPr>
+          <w:rFonts w:ascii="Times New Roman" w:eastAsia="Times New Roman" w:hAnsi="Times New Roman" w:cs="Times New Roman"/>
+          <w:sz w:val="36"/>
+          <w:szCs w:val="36"/>
+        </w:rPr>
+        <w:t>) táblájának hozzáadása az adatbázisba</w:t>
       </w:r>
       <w:r>
         <w:rPr>
@@ -4296,8 +5389,18 @@
           <w:sz w:val="36"/>
           <w:szCs w:val="36"/>
         </w:rPr>
-        <w:t>Regisztráció debuggolása</w:t>
-      </w:r>
+        <w:t xml:space="preserve">Regisztráció </w:t>
+      </w:r>
+      <w:proofErr w:type="spellStart"/>
+      <w:r>
+        <w:rPr>
+          <w:rFonts w:ascii="Times New Roman" w:eastAsia="Times New Roman" w:hAnsi="Times New Roman" w:cs="Times New Roman"/>
+          <w:sz w:val="36"/>
+          <w:szCs w:val="36"/>
+        </w:rPr>
+        <w:t>debuggolása</w:t>
+      </w:r>
+      <w:proofErr w:type="spellEnd"/>
     </w:p>
     <w:p>
       <w:pPr>
@@ -4314,7 +5417,43 @@
           <w:sz w:val="36"/>
           <w:szCs w:val="36"/>
         </w:rPr>
-        <w:t>(El-Nabulsy Csongor Alan) WaitingView (ahova regisztráció után navigál az oldal) létrehozása.</w:t>
+        <w:t>(El-</w:t>
+      </w:r>
+      <w:proofErr w:type="spellStart"/>
+      <w:r>
+        <w:rPr>
+          <w:rFonts w:ascii="Times New Roman" w:eastAsia="Times New Roman" w:hAnsi="Times New Roman" w:cs="Times New Roman"/>
+          <w:sz w:val="36"/>
+          <w:szCs w:val="36"/>
+        </w:rPr>
+        <w:t>Nabulsy</w:t>
+      </w:r>
+      <w:proofErr w:type="spellEnd"/>
+      <w:r>
+        <w:rPr>
+          <w:rFonts w:ascii="Times New Roman" w:eastAsia="Times New Roman" w:hAnsi="Times New Roman" w:cs="Times New Roman"/>
+          <w:sz w:val="36"/>
+          <w:szCs w:val="36"/>
+        </w:rPr>
+        <w:t xml:space="preserve"> Csongor Alan) </w:t>
+      </w:r>
+      <w:proofErr w:type="spellStart"/>
+      <w:r>
+        <w:rPr>
+          <w:rFonts w:ascii="Times New Roman" w:eastAsia="Times New Roman" w:hAnsi="Times New Roman" w:cs="Times New Roman"/>
+          <w:sz w:val="36"/>
+          <w:szCs w:val="36"/>
+        </w:rPr>
+        <w:t>WaitingView</w:t>
+      </w:r>
+      <w:proofErr w:type="spellEnd"/>
+      <w:r>
+        <w:rPr>
+          <w:rFonts w:ascii="Times New Roman" w:eastAsia="Times New Roman" w:hAnsi="Times New Roman" w:cs="Times New Roman"/>
+          <w:sz w:val="36"/>
+          <w:szCs w:val="36"/>
+        </w:rPr>
+        <w:t xml:space="preserve"> (ahova regisztráció után navigál az oldal) létrehozása.</w:t>
       </w:r>
     </w:p>
     <w:p>
@@ -4394,7 +5533,79 @@
           <w:sz w:val="36"/>
           <w:szCs w:val="36"/>
         </w:rPr>
-        <w:t>Átnéztük mindegyik oldalt hogy néz ki jelenleg, és a RequestView-n kellett változtatni, hogy megfeleljen a dokumentációban lévő rajznak. Továbbá összefoglaltuk hogy mennyi hiányzik még a projektből hogy teljesen kész és működő képes legyen.</w:t>
+        <w:t xml:space="preserve">Átnéztük mindegyik </w:t>
+      </w:r>
+      <w:proofErr w:type="gramStart"/>
+      <w:r>
+        <w:rPr>
+          <w:rFonts w:ascii="Times New Roman" w:eastAsia="Times New Roman" w:hAnsi="Times New Roman" w:cs="Times New Roman"/>
+          <w:sz w:val="36"/>
+          <w:szCs w:val="36"/>
+        </w:rPr>
+        <w:t>oldalt</w:t>
+      </w:r>
+      <w:proofErr w:type="gramEnd"/>
+      <w:r>
+        <w:rPr>
+          <w:rFonts w:ascii="Times New Roman" w:eastAsia="Times New Roman" w:hAnsi="Times New Roman" w:cs="Times New Roman"/>
+          <w:sz w:val="36"/>
+          <w:szCs w:val="36"/>
+        </w:rPr>
+        <w:t xml:space="preserve"> hogy néz ki jelenleg, és a </w:t>
+      </w:r>
+      <w:proofErr w:type="spellStart"/>
+      <w:r>
+        <w:rPr>
+          <w:rFonts w:ascii="Times New Roman" w:eastAsia="Times New Roman" w:hAnsi="Times New Roman" w:cs="Times New Roman"/>
+          <w:sz w:val="36"/>
+          <w:szCs w:val="36"/>
+        </w:rPr>
+        <w:t>RequestView</w:t>
+      </w:r>
+      <w:proofErr w:type="spellEnd"/>
+      <w:r>
+        <w:rPr>
+          <w:rFonts w:ascii="Times New Roman" w:eastAsia="Times New Roman" w:hAnsi="Times New Roman" w:cs="Times New Roman"/>
+          <w:sz w:val="36"/>
+          <w:szCs w:val="36"/>
+        </w:rPr>
+        <w:t xml:space="preserve">-n kellett változtatni, hogy megfeleljen a dokumentációban lévő rajznak. Továbbá </w:t>
+      </w:r>
+      <w:proofErr w:type="gramStart"/>
+      <w:r>
+        <w:rPr>
+          <w:rFonts w:ascii="Times New Roman" w:eastAsia="Times New Roman" w:hAnsi="Times New Roman" w:cs="Times New Roman"/>
+          <w:sz w:val="36"/>
+          <w:szCs w:val="36"/>
+        </w:rPr>
+        <w:t>összefoglaltuk</w:t>
+      </w:r>
+      <w:proofErr w:type="gramEnd"/>
+      <w:r>
+        <w:rPr>
+          <w:rFonts w:ascii="Times New Roman" w:eastAsia="Times New Roman" w:hAnsi="Times New Roman" w:cs="Times New Roman"/>
+          <w:sz w:val="36"/>
+          <w:szCs w:val="36"/>
+        </w:rPr>
+        <w:t xml:space="preserve"> hogy mennyi hiányzik még a </w:t>
+      </w:r>
+      <w:proofErr w:type="gramStart"/>
+      <w:r>
+        <w:rPr>
+          <w:rFonts w:ascii="Times New Roman" w:eastAsia="Times New Roman" w:hAnsi="Times New Roman" w:cs="Times New Roman"/>
+          <w:sz w:val="36"/>
+          <w:szCs w:val="36"/>
+        </w:rPr>
+        <w:t>projektből</w:t>
+      </w:r>
+      <w:proofErr w:type="gramEnd"/>
+      <w:r>
+        <w:rPr>
+          <w:rFonts w:ascii="Times New Roman" w:eastAsia="Times New Roman" w:hAnsi="Times New Roman" w:cs="Times New Roman"/>
+          <w:sz w:val="36"/>
+          <w:szCs w:val="36"/>
+        </w:rPr>
+        <w:t xml:space="preserve"> hogy teljesen kész és működő képes legyen.</w:t>
       </w:r>
     </w:p>
     <w:p>
@@ -4422,7 +5633,25 @@
           <w:sz w:val="36"/>
           <w:szCs w:val="36"/>
         </w:rPr>
-        <w:t>(Susán Csongor György) A zenebeküldő oldal (SendView) újrakezdése és megalkotása validációval és működő adatbevitellel együtt.</w:t>
+        <w:t>(Susán Csongor György) A zenebeküldő oldal (</w:t>
+      </w:r>
+      <w:proofErr w:type="spellStart"/>
+      <w:r>
+        <w:rPr>
+          <w:rFonts w:ascii="Times New Roman" w:eastAsia="Times New Roman" w:hAnsi="Times New Roman" w:cs="Times New Roman"/>
+          <w:sz w:val="36"/>
+          <w:szCs w:val="36"/>
+        </w:rPr>
+        <w:t>SendView</w:t>
+      </w:r>
+      <w:proofErr w:type="spellEnd"/>
+      <w:r>
+        <w:rPr>
+          <w:rFonts w:ascii="Times New Roman" w:eastAsia="Times New Roman" w:hAnsi="Times New Roman" w:cs="Times New Roman"/>
+          <w:sz w:val="36"/>
+          <w:szCs w:val="36"/>
+        </w:rPr>
+        <w:t>) újrakezdése és megalkotása validációval és működő adatbevitellel együtt.</w:t>
       </w:r>
     </w:p>
     <w:p>
@@ -4440,7 +5669,281 @@
           <w:sz w:val="36"/>
           <w:szCs w:val="36"/>
         </w:rPr>
-        <w:t>(El-Nabulsy Csongor Alan) A zenebekérő oldal (RequestView) újra elkészítése.</w:t>
+        <w:t>(El-</w:t>
+      </w:r>
+      <w:proofErr w:type="spellStart"/>
+      <w:r>
+        <w:rPr>
+          <w:rFonts w:ascii="Times New Roman" w:eastAsia="Times New Roman" w:hAnsi="Times New Roman" w:cs="Times New Roman"/>
+          <w:sz w:val="36"/>
+          <w:szCs w:val="36"/>
+        </w:rPr>
+        <w:t>Nabulsy</w:t>
+      </w:r>
+      <w:proofErr w:type="spellEnd"/>
+      <w:r>
+        <w:rPr>
+          <w:rFonts w:ascii="Times New Roman" w:eastAsia="Times New Roman" w:hAnsi="Times New Roman" w:cs="Times New Roman"/>
+          <w:sz w:val="36"/>
+          <w:szCs w:val="36"/>
+        </w:rPr>
+        <w:t xml:space="preserve"> Csongor Alan) A zenebekérő oldal (</w:t>
+      </w:r>
+      <w:proofErr w:type="spellStart"/>
+      <w:r>
+        <w:rPr>
+          <w:rFonts w:ascii="Times New Roman" w:eastAsia="Times New Roman" w:hAnsi="Times New Roman" w:cs="Times New Roman"/>
+          <w:sz w:val="36"/>
+          <w:szCs w:val="36"/>
+        </w:rPr>
+        <w:t>RequestView</w:t>
+      </w:r>
+      <w:proofErr w:type="spellEnd"/>
+      <w:r>
+        <w:rPr>
+          <w:rFonts w:ascii="Times New Roman" w:eastAsia="Times New Roman" w:hAnsi="Times New Roman" w:cs="Times New Roman"/>
+          <w:sz w:val="36"/>
+          <w:szCs w:val="36"/>
+        </w:rPr>
+        <w:t>) újra elkészítése.</w:t>
+      </w:r>
+    </w:p>
+    <w:p>
+      <w:pPr>
+        <w:jc w:val="both"/>
+        <w:rPr>
+          <w:rFonts w:ascii="Times New Roman" w:eastAsia="Times New Roman" w:hAnsi="Times New Roman" w:cs="Times New Roman"/>
+          <w:sz w:val="36"/>
+          <w:szCs w:val="36"/>
+        </w:rPr>
+      </w:pPr>
+    </w:p>
+    <w:p>
+      <w:pPr>
+        <w:jc w:val="both"/>
+        <w:rPr>
+          <w:rFonts w:ascii="Times New Roman" w:eastAsia="Times New Roman" w:hAnsi="Times New Roman" w:cs="Times New Roman"/>
+          <w:b/>
+          <w:bCs/>
+          <w:sz w:val="40"/>
+          <w:szCs w:val="40"/>
+        </w:rPr>
+      </w:pPr>
+      <w:r>
+        <w:rPr>
+          <w:rFonts w:ascii="Times New Roman" w:eastAsia="Times New Roman" w:hAnsi="Times New Roman" w:cs="Times New Roman"/>
+          <w:b/>
+          <w:bCs/>
+          <w:sz w:val="40"/>
+          <w:szCs w:val="40"/>
+        </w:rPr>
+        <w:t>2026-04-16 9:05-</w:t>
+      </w:r>
+      <w:r>
+        <w:rPr>
+          <w:rFonts w:ascii="Times New Roman" w:eastAsia="Times New Roman" w:hAnsi="Times New Roman" w:cs="Times New Roman"/>
+          <w:b/>
+          <w:bCs/>
+          <w:sz w:val="40"/>
+          <w:szCs w:val="40"/>
+        </w:rPr>
+        <w:t>11:45, 12:15-13:05</w:t>
+      </w:r>
+    </w:p>
+    <w:p>
+      <w:pPr>
+        <w:jc w:val="both"/>
+        <w:rPr>
+          <w:rFonts w:ascii="Times New Roman" w:eastAsia="Times New Roman" w:hAnsi="Times New Roman" w:cs="Times New Roman"/>
+          <w:sz w:val="36"/>
+          <w:szCs w:val="36"/>
+        </w:rPr>
+      </w:pPr>
+      <w:r>
+        <w:rPr>
+          <w:rFonts w:ascii="Times New Roman" w:eastAsia="Times New Roman" w:hAnsi="Times New Roman" w:cs="Times New Roman"/>
+          <w:sz w:val="36"/>
+          <w:szCs w:val="36"/>
+        </w:rPr>
+        <w:t xml:space="preserve">(Susán Csongor György) </w:t>
+      </w:r>
+    </w:p>
+    <w:p>
+      <w:pPr>
+        <w:pStyle w:val="Listaszerbekezds"/>
+        <w:numPr>
+          <w:ilvl w:val="0"/>
+          <w:numId w:val="12"/>
+        </w:numPr>
+        <w:jc w:val="both"/>
+        <w:rPr>
+          <w:rFonts w:ascii="Times New Roman" w:eastAsia="Times New Roman" w:hAnsi="Times New Roman" w:cs="Times New Roman"/>
+          <w:sz w:val="36"/>
+          <w:szCs w:val="36"/>
+        </w:rPr>
+      </w:pPr>
+      <w:r>
+        <w:rPr>
+          <w:rFonts w:ascii="Times New Roman" w:eastAsia="Times New Roman" w:hAnsi="Times New Roman" w:cs="Times New Roman"/>
+          <w:sz w:val="36"/>
+          <w:szCs w:val="36"/>
+        </w:rPr>
+        <w:lastRenderedPageBreak/>
+        <w:t>A főoldalak átrendezése a megváltozott szerepköröknek megfelelően:</w:t>
+      </w:r>
+    </w:p>
+    <w:p>
+      <w:pPr>
+        <w:pStyle w:val="Listaszerbekezds"/>
+        <w:numPr>
+          <w:ilvl w:val="1"/>
+          <w:numId w:val="12"/>
+        </w:numPr>
+        <w:jc w:val="both"/>
+        <w:rPr>
+          <w:rFonts w:ascii="Times New Roman" w:eastAsia="Times New Roman" w:hAnsi="Times New Roman" w:cs="Times New Roman"/>
+          <w:sz w:val="36"/>
+          <w:szCs w:val="36"/>
+        </w:rPr>
+      </w:pPr>
+      <w:r>
+        <w:rPr>
+          <w:rFonts w:ascii="Times New Roman" w:eastAsia="Times New Roman" w:hAnsi="Times New Roman" w:cs="Times New Roman"/>
+          <w:sz w:val="36"/>
+          <w:szCs w:val="36"/>
+        </w:rPr>
+        <w:t>Az adminisztrátorok mostantól kezdve a zenék ellenőrzése helyett a regisztráló fiókokat ellenőzi.</w:t>
+      </w:r>
+    </w:p>
+    <w:p>
+      <w:pPr>
+        <w:pStyle w:val="Listaszerbekezds"/>
+        <w:numPr>
+          <w:ilvl w:val="1"/>
+          <w:numId w:val="12"/>
+        </w:numPr>
+        <w:jc w:val="both"/>
+        <w:rPr>
+          <w:rFonts w:ascii="Times New Roman" w:eastAsia="Times New Roman" w:hAnsi="Times New Roman" w:cs="Times New Roman"/>
+          <w:sz w:val="36"/>
+          <w:szCs w:val="36"/>
+        </w:rPr>
+      </w:pPr>
+      <w:r>
+        <w:rPr>
+          <w:rFonts w:ascii="Times New Roman" w:eastAsia="Times New Roman" w:hAnsi="Times New Roman" w:cs="Times New Roman"/>
+          <w:sz w:val="36"/>
+          <w:szCs w:val="36"/>
+        </w:rPr>
+        <w:t>Az ütemező pedig a lejátszási lista kialakítása mellett az újonnan beküldött zenék ellenőrzéséért is felel.</w:t>
+      </w:r>
+    </w:p>
+    <w:p>
+      <w:pPr>
+        <w:pStyle w:val="Listaszerbekezds"/>
+        <w:numPr>
+          <w:ilvl w:val="0"/>
+          <w:numId w:val="12"/>
+        </w:numPr>
+        <w:jc w:val="both"/>
+        <w:rPr>
+          <w:rFonts w:ascii="Times New Roman" w:eastAsia="Times New Roman" w:hAnsi="Times New Roman" w:cs="Times New Roman"/>
+          <w:sz w:val="36"/>
+          <w:szCs w:val="36"/>
+        </w:rPr>
+      </w:pPr>
+      <w:r>
+        <w:rPr>
+          <w:rFonts w:ascii="Times New Roman" w:eastAsia="Times New Roman" w:hAnsi="Times New Roman" w:cs="Times New Roman"/>
+          <w:sz w:val="36"/>
+          <w:szCs w:val="36"/>
+        </w:rPr>
+        <w:t>Az adminisztrátori feladatkör (felhasználók regisztráltatása vagy elutasítása) lekódolása.</w:t>
+      </w:r>
+    </w:p>
+    <w:p>
+      <w:pPr>
+        <w:pStyle w:val="Listaszerbekezds"/>
+        <w:numPr>
+          <w:ilvl w:val="0"/>
+          <w:numId w:val="12"/>
+        </w:numPr>
+        <w:jc w:val="both"/>
+        <w:rPr>
+          <w:rFonts w:ascii="Times New Roman" w:eastAsia="Times New Roman" w:hAnsi="Times New Roman" w:cs="Times New Roman"/>
+          <w:sz w:val="36"/>
+          <w:szCs w:val="36"/>
+        </w:rPr>
+      </w:pPr>
+      <w:r>
+        <w:rPr>
+          <w:rFonts w:ascii="Times New Roman" w:eastAsia="Times New Roman" w:hAnsi="Times New Roman" w:cs="Times New Roman"/>
+          <w:sz w:val="36"/>
+          <w:szCs w:val="36"/>
+        </w:rPr>
+        <w:t>Minimális átírások a szabályzatban (</w:t>
+      </w:r>
+      <w:r>
+        <w:rPr>
+          <w:rFonts w:ascii="Times New Roman" w:eastAsia="Times New Roman" w:hAnsi="Times New Roman" w:cs="Times New Roman"/>
+          <w:sz w:val="36"/>
+          <w:szCs w:val="36"/>
+        </w:rPr>
+        <w:t xml:space="preserve">túlnyomórészt </w:t>
+      </w:r>
+      <w:r>
+        <w:rPr>
+          <w:rFonts w:ascii="Times New Roman" w:eastAsia="Times New Roman" w:hAnsi="Times New Roman" w:cs="Times New Roman"/>
+          <w:sz w:val="36"/>
+          <w:szCs w:val="36"/>
+        </w:rPr>
+        <w:t>a szerepkörök megváltozott feladatai miatt).</w:t>
+      </w:r>
+    </w:p>
+    <w:p>
+      <w:pPr>
+        <w:jc w:val="both"/>
+        <w:rPr>
+          <w:rFonts w:ascii="Times New Roman" w:eastAsia="Times New Roman" w:hAnsi="Times New Roman" w:cs="Times New Roman"/>
+          <w:sz w:val="36"/>
+          <w:szCs w:val="36"/>
+        </w:rPr>
+      </w:pPr>
+    </w:p>
+    <w:p>
+      <w:pPr>
+        <w:jc w:val="both"/>
+        <w:rPr>
+          <w:rFonts w:ascii="Times New Roman" w:eastAsia="Times New Roman" w:hAnsi="Times New Roman" w:cs="Times New Roman"/>
+          <w:sz w:val="36"/>
+          <w:szCs w:val="36"/>
+        </w:rPr>
+      </w:pPr>
+      <w:r>
+        <w:rPr>
+          <w:rFonts w:ascii="Times New Roman" w:eastAsia="Times New Roman" w:hAnsi="Times New Roman" w:cs="Times New Roman"/>
+          <w:sz w:val="36"/>
+          <w:szCs w:val="36"/>
+        </w:rPr>
+        <w:t>(El-</w:t>
+      </w:r>
+      <w:proofErr w:type="spellStart"/>
+      <w:r>
+        <w:rPr>
+          <w:rFonts w:ascii="Times New Roman" w:eastAsia="Times New Roman" w:hAnsi="Times New Roman" w:cs="Times New Roman"/>
+          <w:sz w:val="36"/>
+          <w:szCs w:val="36"/>
+        </w:rPr>
+        <w:t>Nabulsy</w:t>
+      </w:r>
+      <w:proofErr w:type="spellEnd"/>
+      <w:r>
+        <w:rPr>
+          <w:rFonts w:ascii="Times New Roman" w:eastAsia="Times New Roman" w:hAnsi="Times New Roman" w:cs="Times New Roman"/>
+          <w:sz w:val="36"/>
+          <w:szCs w:val="36"/>
+        </w:rPr>
+        <w:t xml:space="preserve"> Csongor Alan) &lt;ide a dokumentációját&gt;</w:t>
       </w:r>
     </w:p>
     <w:sectPr>
@@ -4934,6 +6437,119 @@
     </w:lvl>
   </w:abstractNum>
   <w:abstractNum w:abstractNumId="4" w15:restartNumberingAfterBreak="0">
+    <w:nsid w:val="5B1E66BA"/>
+    <w:multiLevelType w:val="hybridMultilevel"/>
+    <w:tmpl w:val="56E6462C"/>
+    <w:lvl w:ilvl="0" w:tplc="040E0001">
+      <w:start w:val="1"/>
+      <w:numFmt w:val="bullet"/>
+      <w:lvlText w:val=""/>
+      <w:lvlJc w:val="left"/>
+      <w:pPr>
+        <w:ind w:left="1068" w:hanging="360"/>
+      </w:pPr>
+      <w:rPr>
+        <w:rFonts w:ascii="Symbol" w:hAnsi="Symbol" w:hint="default"/>
+      </w:rPr>
+    </w:lvl>
+    <w:lvl w:ilvl="1" w:tplc="040E0003">
+      <w:start w:val="1"/>
+      <w:numFmt w:val="bullet"/>
+      <w:lvlText w:val="o"/>
+      <w:lvlJc w:val="left"/>
+      <w:pPr>
+        <w:ind w:left="1788" w:hanging="360"/>
+      </w:pPr>
+      <w:rPr>
+        <w:rFonts w:ascii="Courier New" w:hAnsi="Courier New" w:cs="Courier New" w:hint="default"/>
+      </w:rPr>
+    </w:lvl>
+    <w:lvl w:ilvl="2" w:tplc="040E0005" w:tentative="1">
+      <w:start w:val="1"/>
+      <w:numFmt w:val="bullet"/>
+      <w:lvlText w:val=""/>
+      <w:lvlJc w:val="left"/>
+      <w:pPr>
+        <w:ind w:left="2508" w:hanging="360"/>
+      </w:pPr>
+      <w:rPr>
+        <w:rFonts w:ascii="Wingdings" w:hAnsi="Wingdings" w:hint="default"/>
+      </w:rPr>
+    </w:lvl>
+    <w:lvl w:ilvl="3" w:tplc="040E0001" w:tentative="1">
+      <w:start w:val="1"/>
+      <w:numFmt w:val="bullet"/>
+      <w:lvlText w:val=""/>
+      <w:lvlJc w:val="left"/>
+      <w:pPr>
+        <w:ind w:left="3228" w:hanging="360"/>
+      </w:pPr>
+      <w:rPr>
+        <w:rFonts w:ascii="Symbol" w:hAnsi="Symbol" w:hint="default"/>
+      </w:rPr>
+    </w:lvl>
+    <w:lvl w:ilvl="4" w:tplc="040E0003" w:tentative="1">
+      <w:start w:val="1"/>
+      <w:numFmt w:val="bullet"/>
+      <w:lvlText w:val="o"/>
+      <w:lvlJc w:val="left"/>
+      <w:pPr>
+        <w:ind w:left="3948" w:hanging="360"/>
+      </w:pPr>
+      <w:rPr>
+        <w:rFonts w:ascii="Courier New" w:hAnsi="Courier New" w:cs="Courier New" w:hint="default"/>
+      </w:rPr>
+    </w:lvl>
+    <w:lvl w:ilvl="5" w:tplc="040E0005" w:tentative="1">
+      <w:start w:val="1"/>
+      <w:numFmt w:val="bullet"/>
+      <w:lvlText w:val=""/>
+      <w:lvlJc w:val="left"/>
+      <w:pPr>
+        <w:ind w:left="4668" w:hanging="360"/>
+      </w:pPr>
+      <w:rPr>
+        <w:rFonts w:ascii="Wingdings" w:hAnsi="Wingdings" w:hint="default"/>
+      </w:rPr>
+    </w:lvl>
+    <w:lvl w:ilvl="6" w:tplc="040E0001" w:tentative="1">
+      <w:start w:val="1"/>
+      <w:numFmt w:val="bullet"/>
+      <w:lvlText w:val=""/>
+      <w:lvlJc w:val="left"/>
+      <w:pPr>
+        <w:ind w:left="5388" w:hanging="360"/>
+      </w:pPr>
+      <w:rPr>
+        <w:rFonts w:ascii="Symbol" w:hAnsi="Symbol" w:hint="default"/>
+      </w:rPr>
+    </w:lvl>
+    <w:lvl w:ilvl="7" w:tplc="040E0003" w:tentative="1">
+      <w:start w:val="1"/>
+      <w:numFmt w:val="bullet"/>
+      <w:lvlText w:val="o"/>
+      <w:lvlJc w:val="left"/>
+      <w:pPr>
+        <w:ind w:left="6108" w:hanging="360"/>
+      </w:pPr>
+      <w:rPr>
+        <w:rFonts w:ascii="Courier New" w:hAnsi="Courier New" w:cs="Courier New" w:hint="default"/>
+      </w:rPr>
+    </w:lvl>
+    <w:lvl w:ilvl="8" w:tplc="040E0005" w:tentative="1">
+      <w:start w:val="1"/>
+      <w:numFmt w:val="bullet"/>
+      <w:lvlText w:val=""/>
+      <w:lvlJc w:val="left"/>
+      <w:pPr>
+        <w:ind w:left="6828" w:hanging="360"/>
+      </w:pPr>
+      <w:rPr>
+        <w:rFonts w:ascii="Wingdings" w:hAnsi="Wingdings" w:hint="default"/>
+      </w:rPr>
+    </w:lvl>
+  </w:abstractNum>
+  <w:abstractNum w:abstractNumId="5" w15:restartNumberingAfterBreak="0">
     <w:nsid w:val="69361338"/>
     <w:multiLevelType w:val="hybridMultilevel"/>
     <w:tmpl w:val="6CF0B772"/>
@@ -5046,7 +6662,7 @@
       </w:rPr>
     </w:lvl>
   </w:abstractNum>
-  <w:abstractNum w:abstractNumId="5" w15:restartNumberingAfterBreak="0">
+  <w:abstractNum w:abstractNumId="6" w15:restartNumberingAfterBreak="0">
     <w:nsid w:val="69FA5A50"/>
     <w:multiLevelType w:val="hybridMultilevel"/>
     <w:tmpl w:val="D82A6326"/>
@@ -5159,7 +6775,7 @@
       </w:rPr>
     </w:lvl>
   </w:abstractNum>
-  <w:abstractNum w:abstractNumId="6" w15:restartNumberingAfterBreak="0">
+  <w:abstractNum w:abstractNumId="7" w15:restartNumberingAfterBreak="0">
     <w:nsid w:val="6E7312B6"/>
     <w:multiLevelType w:val="hybridMultilevel"/>
     <w:tmpl w:val="FD80BAFC"/>
@@ -5272,7 +6888,7 @@
       </w:rPr>
     </w:lvl>
   </w:abstractNum>
-  <w:abstractNum w:abstractNumId="7" w15:restartNumberingAfterBreak="0">
+  <w:abstractNum w:abstractNumId="8" w15:restartNumberingAfterBreak="0">
     <w:nsid w:val="76FA296F"/>
     <w:multiLevelType w:val="hybridMultilevel"/>
     <w:tmpl w:val="6DAE32EA"/>
@@ -5385,7 +7001,7 @@
       </w:rPr>
     </w:lvl>
   </w:abstractNum>
-  <w:abstractNum w:abstractNumId="8" w15:restartNumberingAfterBreak="0">
+  <w:abstractNum w:abstractNumId="9" w15:restartNumberingAfterBreak="0">
     <w:nsid w:val="788C73B2"/>
     <w:multiLevelType w:val="hybridMultilevel"/>
     <w:tmpl w:val="6D6C60B0"/>
@@ -5498,7 +7114,120 @@
       </w:rPr>
     </w:lvl>
   </w:abstractNum>
-  <w:abstractNum w:abstractNumId="9" w15:restartNumberingAfterBreak="0">
+  <w:abstractNum w:abstractNumId="10" w15:restartNumberingAfterBreak="0">
+    <w:nsid w:val="79644490"/>
+    <w:multiLevelType w:val="hybridMultilevel"/>
+    <w:tmpl w:val="340ACCA0"/>
+    <w:lvl w:ilvl="0" w:tplc="040E0001">
+      <w:start w:val="1"/>
+      <w:numFmt w:val="bullet"/>
+      <w:lvlText w:val=""/>
+      <w:lvlJc w:val="left"/>
+      <w:pPr>
+        <w:ind w:left="720" w:hanging="360"/>
+      </w:pPr>
+      <w:rPr>
+        <w:rFonts w:ascii="Symbol" w:hAnsi="Symbol" w:hint="default"/>
+      </w:rPr>
+    </w:lvl>
+    <w:lvl w:ilvl="1" w:tplc="040E0003">
+      <w:start w:val="1"/>
+      <w:numFmt w:val="bullet"/>
+      <w:lvlText w:val="o"/>
+      <w:lvlJc w:val="left"/>
+      <w:pPr>
+        <w:ind w:left="1440" w:hanging="360"/>
+      </w:pPr>
+      <w:rPr>
+        <w:rFonts w:ascii="Courier New" w:hAnsi="Courier New" w:cs="Courier New" w:hint="default"/>
+      </w:rPr>
+    </w:lvl>
+    <w:lvl w:ilvl="2" w:tplc="040E0005" w:tentative="1">
+      <w:start w:val="1"/>
+      <w:numFmt w:val="bullet"/>
+      <w:lvlText w:val=""/>
+      <w:lvlJc w:val="left"/>
+      <w:pPr>
+        <w:ind w:left="2160" w:hanging="360"/>
+      </w:pPr>
+      <w:rPr>
+        <w:rFonts w:ascii="Wingdings" w:hAnsi="Wingdings" w:hint="default"/>
+      </w:rPr>
+    </w:lvl>
+    <w:lvl w:ilvl="3" w:tplc="040E0001" w:tentative="1">
+      <w:start w:val="1"/>
+      <w:numFmt w:val="bullet"/>
+      <w:lvlText w:val=""/>
+      <w:lvlJc w:val="left"/>
+      <w:pPr>
+        <w:ind w:left="2880" w:hanging="360"/>
+      </w:pPr>
+      <w:rPr>
+        <w:rFonts w:ascii="Symbol" w:hAnsi="Symbol" w:hint="default"/>
+      </w:rPr>
+    </w:lvl>
+    <w:lvl w:ilvl="4" w:tplc="040E0003" w:tentative="1">
+      <w:start w:val="1"/>
+      <w:numFmt w:val="bullet"/>
+      <w:lvlText w:val="o"/>
+      <w:lvlJc w:val="left"/>
+      <w:pPr>
+        <w:ind w:left="3600" w:hanging="360"/>
+      </w:pPr>
+      <w:rPr>
+        <w:rFonts w:ascii="Courier New" w:hAnsi="Courier New" w:cs="Courier New" w:hint="default"/>
+      </w:rPr>
+    </w:lvl>
+    <w:lvl w:ilvl="5" w:tplc="040E0005" w:tentative="1">
+      <w:start w:val="1"/>
+      <w:numFmt w:val="bullet"/>
+      <w:lvlText w:val=""/>
+      <w:lvlJc w:val="left"/>
+      <w:pPr>
+        <w:ind w:left="4320" w:hanging="360"/>
+      </w:pPr>
+      <w:rPr>
+        <w:rFonts w:ascii="Wingdings" w:hAnsi="Wingdings" w:hint="default"/>
+      </w:rPr>
+    </w:lvl>
+    <w:lvl w:ilvl="6" w:tplc="040E0001" w:tentative="1">
+      <w:start w:val="1"/>
+      <w:numFmt w:val="bullet"/>
+      <w:lvlText w:val=""/>
+      <w:lvlJc w:val="left"/>
+      <w:pPr>
+        <w:ind w:left="5040" w:hanging="360"/>
+      </w:pPr>
+      <w:rPr>
+        <w:rFonts w:ascii="Symbol" w:hAnsi="Symbol" w:hint="default"/>
+      </w:rPr>
+    </w:lvl>
+    <w:lvl w:ilvl="7" w:tplc="040E0003" w:tentative="1">
+      <w:start w:val="1"/>
+      <w:numFmt w:val="bullet"/>
+      <w:lvlText w:val="o"/>
+      <w:lvlJc w:val="left"/>
+      <w:pPr>
+        <w:ind w:left="5760" w:hanging="360"/>
+      </w:pPr>
+      <w:rPr>
+        <w:rFonts w:ascii="Courier New" w:hAnsi="Courier New" w:cs="Courier New" w:hint="default"/>
+      </w:rPr>
+    </w:lvl>
+    <w:lvl w:ilvl="8" w:tplc="040E0005" w:tentative="1">
+      <w:start w:val="1"/>
+      <w:numFmt w:val="bullet"/>
+      <w:lvlText w:val=""/>
+      <w:lvlJc w:val="left"/>
+      <w:pPr>
+        <w:ind w:left="6480" w:hanging="360"/>
+      </w:pPr>
+      <w:rPr>
+        <w:rFonts w:ascii="Wingdings" w:hAnsi="Wingdings" w:hint="default"/>
+      </w:rPr>
+    </w:lvl>
+  </w:abstractNum>
+  <w:abstractNum w:abstractNumId="11" w15:restartNumberingAfterBreak="0">
     <w:nsid w:val="7EB672F7"/>
     <w:multiLevelType w:val="hybridMultilevel"/>
     <w:tmpl w:val="A6F0C99C"/>
@@ -5612,34 +7341,40 @@
     </w:lvl>
   </w:abstractNum>
   <w:num w:numId="1" w16cid:durableId="1237017102">
-    <w:abstractNumId w:val="9"/>
+    <w:abstractNumId w:val="11"/>
   </w:num>
   <w:num w:numId="2" w16cid:durableId="23093752">
-    <w:abstractNumId w:val="6"/>
+    <w:abstractNumId w:val="7"/>
   </w:num>
   <w:num w:numId="3" w16cid:durableId="211231034">
-    <w:abstractNumId w:val="7"/>
+    <w:abstractNumId w:val="8"/>
   </w:num>
   <w:num w:numId="4" w16cid:durableId="285432383">
     <w:abstractNumId w:val="2"/>
   </w:num>
   <w:num w:numId="5" w16cid:durableId="382339222">
-    <w:abstractNumId w:val="5"/>
+    <w:abstractNumId w:val="6"/>
   </w:num>
   <w:num w:numId="6" w16cid:durableId="1929121998">
     <w:abstractNumId w:val="3"/>
   </w:num>
   <w:num w:numId="7" w16cid:durableId="989595552">
-    <w:abstractNumId w:val="8"/>
+    <w:abstractNumId w:val="9"/>
   </w:num>
   <w:num w:numId="8" w16cid:durableId="844437476">
-    <w:abstractNumId w:val="4"/>
+    <w:abstractNumId w:val="5"/>
   </w:num>
   <w:num w:numId="9" w16cid:durableId="1725445077">
     <w:abstractNumId w:val="0"/>
   </w:num>
   <w:num w:numId="10" w16cid:durableId="1493132609">
     <w:abstractNumId w:val="1"/>
+  </w:num>
+  <w:num w:numId="11" w16cid:durableId="907423889">
+    <w:abstractNumId w:val="4"/>
+  </w:num>
+  <w:num w:numId="12" w16cid:durableId="432946196">
+    <w:abstractNumId w:val="10"/>
   </w:num>
 </w:numbering>
 </file>

</xml_diff>

<commit_message>
Starting making the authentiaction and scheduling (+doc)
</commit_message>
<xml_diff>
--- a/documentation.docx
+++ b/documentation.docx
@@ -1229,7 +1229,7 @@
           <w:szCs w:val="36"/>
         </w:rPr>
         <w:drawing>
-          <wp:inline distT="0" distB="0" distL="0" distR="0" wp14:anchorId="78A43544" wp14:editId="188DF508">
+          <wp:inline distT="0" distB="0" distL="0" distR="0" wp14:anchorId="78A43544" wp14:editId="62AE409E">
             <wp:extent cx="3166535" cy="1781175"/>
             <wp:effectExtent l="0" t="0" r="0" b="0"/>
             <wp:docPr id="3" name="Kép 3" descr="C:\Users\elnabulsy.csongor\AppData\Local\Microsoft\Windows\INetCache\Content.MSO\F75754B3.tmp"/>
@@ -1321,7 +1321,7 @@
           <w:szCs w:val="36"/>
         </w:rPr>
         <w:drawing>
-          <wp:inline distT="0" distB="0" distL="0" distR="0" wp14:anchorId="4E211814" wp14:editId="54AD5475">
+          <wp:inline distT="0" distB="0" distL="0" distR="0" wp14:anchorId="4E211814" wp14:editId="19D6DB78">
             <wp:extent cx="3133725" cy="1762720"/>
             <wp:effectExtent l="0" t="0" r="0" b="9525"/>
             <wp:docPr id="4" name="Kép 4" descr="C:\Users\elnabulsy.csongor\Downloads\ui_main_student.png"/>
@@ -1403,7 +1403,7 @@
           <w:szCs w:val="36"/>
         </w:rPr>
         <w:drawing>
-          <wp:inline distT="0" distB="0" distL="0" distR="0" wp14:anchorId="5137FB78" wp14:editId="711BDAFF">
+          <wp:inline distT="0" distB="0" distL="0" distR="0" wp14:anchorId="5137FB78" wp14:editId="2CC8439E">
             <wp:extent cx="3166110" cy="1780938"/>
             <wp:effectExtent l="0" t="0" r="0" b="0"/>
             <wp:docPr id="5" name="Kép 5" descr="C:\Users\elnabulsy.csongor\Downloads\ui_main_scheduler.png"/>
@@ -1496,7 +1496,7 @@
           <w:szCs w:val="36"/>
         </w:rPr>
         <w:drawing>
-          <wp:inline distT="0" distB="0" distL="0" distR="0" wp14:anchorId="27EC1C67" wp14:editId="765D3735">
+          <wp:inline distT="0" distB="0" distL="0" distR="0" wp14:anchorId="27EC1C67" wp14:editId="235FC9AA">
             <wp:extent cx="3055620" cy="1718786"/>
             <wp:effectExtent l="0" t="0" r="0" b="0"/>
             <wp:docPr id="6" name="Kép 6" descr="C:\Users\elnabulsy.csongor\Downloads\ui_main_admin.png"/>
@@ -1578,7 +1578,7 @@
           <w:szCs w:val="36"/>
         </w:rPr>
         <w:drawing>
-          <wp:inline distT="0" distB="0" distL="0" distR="0" wp14:anchorId="08225B4F" wp14:editId="19B2AB2A">
+          <wp:inline distT="0" distB="0" distL="0" distR="0" wp14:anchorId="08225B4F" wp14:editId="44D7BC4E">
             <wp:extent cx="2933700" cy="1942430"/>
             <wp:effectExtent l="0" t="0" r="0" b="1270"/>
             <wp:docPr id="7" name="Kép 7" descr="C:\Users\elnabulsy.csongor\Downloads\ui_structure.png"/>
@@ -1751,7 +1751,7 @@
           <w:szCs w:val="36"/>
         </w:rPr>
         <w:drawing>
-          <wp:inline distT="0" distB="0" distL="0" distR="0" wp14:anchorId="2C256DB5" wp14:editId="1606B0A0">
+          <wp:inline distT="0" distB="0" distL="0" distR="0" wp14:anchorId="2C256DB5" wp14:editId="4CC1E0BE">
             <wp:extent cx="3329940" cy="1752493"/>
             <wp:effectExtent l="0" t="0" r="3810" b="635"/>
             <wp:docPr id="9" name="Kép 9"/>
@@ -4805,23 +4805,7 @@
           <w:sz w:val="36"/>
           <w:szCs w:val="36"/>
         </w:rPr>
-        <w:t xml:space="preserve">a </w:t>
-      </w:r>
-      <w:r>
-        <w:rPr>
-          <w:rFonts w:ascii="Times New Roman" w:eastAsia="Times New Roman" w:hAnsi="Times New Roman" w:cs="Times New Roman"/>
-          <w:sz w:val="36"/>
-          <w:szCs w:val="36"/>
-        </w:rPr>
-        <w:t>RequestVerifyView</w:t>
-      </w:r>
-      <w:r>
-        <w:rPr>
-          <w:rFonts w:ascii="Times New Roman" w:eastAsia="Times New Roman" w:hAnsi="Times New Roman" w:cs="Times New Roman"/>
-          <w:sz w:val="36"/>
-          <w:szCs w:val="36"/>
-        </w:rPr>
-        <w:t>-ba</w:t>
+        <w:t>a RequestVerifyView-ba</w:t>
       </w:r>
       <w:r>
         <w:rPr>
@@ -4898,6 +4882,111 @@
           <w:szCs w:val="36"/>
         </w:rPr>
         <w:t>A Layout-ba megírtuk a függvényt axios használatával, amivel majd be lesznek töltve az adatok minden home page-n. Továbbá a SchedulerView és a RequestVerifyView is külön külön megírtuk a függvényt, de csak azokkal az adatokkal amiket szeretnénk hogy betöltsön majd.</w:t>
+      </w:r>
+    </w:p>
+    <w:p>
+      <w:pPr>
+        <w:jc w:val="both"/>
+        <w:rPr>
+          <w:rFonts w:ascii="Times New Roman" w:eastAsia="Times New Roman" w:hAnsi="Times New Roman" w:cs="Times New Roman"/>
+          <w:sz w:val="36"/>
+          <w:szCs w:val="36"/>
+        </w:rPr>
+      </w:pPr>
+    </w:p>
+    <w:p>
+      <w:pPr>
+        <w:jc w:val="both"/>
+        <w:rPr>
+          <w:rFonts w:ascii="Times New Roman" w:eastAsia="Times New Roman" w:hAnsi="Times New Roman" w:cs="Times New Roman"/>
+          <w:b/>
+          <w:bCs/>
+          <w:sz w:val="40"/>
+          <w:szCs w:val="40"/>
+        </w:rPr>
+      </w:pPr>
+      <w:r>
+        <w:rPr>
+          <w:rFonts w:ascii="Times New Roman" w:eastAsia="Times New Roman" w:hAnsi="Times New Roman" w:cs="Times New Roman"/>
+          <w:b/>
+          <w:bCs/>
+          <w:sz w:val="40"/>
+          <w:szCs w:val="40"/>
+        </w:rPr>
+        <w:t>2026-04-19 11:05-</w:t>
+      </w:r>
+    </w:p>
+    <w:p>
+      <w:pPr>
+        <w:jc w:val="both"/>
+        <w:rPr>
+          <w:rFonts w:ascii="Times New Roman" w:eastAsia="Times New Roman" w:hAnsi="Times New Roman" w:cs="Times New Roman"/>
+          <w:sz w:val="36"/>
+          <w:szCs w:val="36"/>
+        </w:rPr>
+      </w:pPr>
+      <w:r>
+        <w:rPr>
+          <w:rFonts w:ascii="Times New Roman" w:eastAsia="Times New Roman" w:hAnsi="Times New Roman" w:cs="Times New Roman"/>
+          <w:sz w:val="36"/>
+          <w:szCs w:val="36"/>
+        </w:rPr>
+        <w:t>(Susán Csongor György)</w:t>
+      </w:r>
+    </w:p>
+    <w:p>
+      <w:pPr>
+        <w:pStyle w:val="Listaszerbekezds"/>
+        <w:numPr>
+          <w:ilvl w:val="0"/>
+          <w:numId w:val="13"/>
+        </w:numPr>
+        <w:jc w:val="both"/>
+        <w:rPr>
+          <w:rFonts w:ascii="Times New Roman" w:eastAsia="Times New Roman" w:hAnsi="Times New Roman" w:cs="Times New Roman"/>
+          <w:sz w:val="36"/>
+          <w:szCs w:val="36"/>
+        </w:rPr>
+      </w:pPr>
+      <w:r>
+        <w:rPr>
+          <w:rFonts w:ascii="Times New Roman" w:eastAsia="Times New Roman" w:hAnsi="Times New Roman" w:cs="Times New Roman"/>
+          <w:sz w:val="36"/>
+          <w:szCs w:val="36"/>
+        </w:rPr>
+        <w:lastRenderedPageBreak/>
+        <w:t>A műfajok (Genres) tábla kitörlése a helyi projektből és a repositoryból, mivel annak a szerepét már egy statikus lista vette át a migrationben.</w:t>
+      </w:r>
+    </w:p>
+    <w:p>
+      <w:pPr>
+        <w:pStyle w:val="Listaszerbekezds"/>
+        <w:numPr>
+          <w:ilvl w:val="0"/>
+          <w:numId w:val="13"/>
+        </w:numPr>
+        <w:jc w:val="both"/>
+        <w:rPr>
+          <w:rFonts w:ascii="Times New Roman" w:eastAsia="Times New Roman" w:hAnsi="Times New Roman" w:cs="Times New Roman"/>
+          <w:sz w:val="36"/>
+          <w:szCs w:val="36"/>
+        </w:rPr>
+      </w:pPr>
+      <w:r>
+        <w:rPr>
+          <w:rFonts w:ascii="Times New Roman" w:eastAsia="Times New Roman" w:hAnsi="Times New Roman" w:cs="Times New Roman"/>
+          <w:sz w:val="36"/>
+          <w:szCs w:val="36"/>
+        </w:rPr>
+        <w:t>A bejelentkezést biztosító kód tovább írása (a check függvény egy már elvetett logika mentén épül, annak a tartalma ki lett ürítve, a WaitingView beépítve a routingba, emellett egy autentikáció alapján elérhetőséget eldöntő logika a router guardban, ami még egyelőre nem működik)</w:t>
+      </w:r>
+      <w:r>
+        <w:rPr>
+          <w:rFonts w:ascii="Times New Roman" w:eastAsia="Times New Roman" w:hAnsi="Times New Roman" w:cs="Times New Roman"/>
+          <w:sz w:val="36"/>
+          <w:szCs w:val="36"/>
+        </w:rPr>
+        <w:t>.</w:t>
       </w:r>
     </w:p>
     <w:sectPr>
@@ -5393,7 +5482,7 @@
   <w:abstractNum w:abstractNumId="4" w15:restartNumberingAfterBreak="0">
     <w:nsid w:val="4CA522A2"/>
     <w:multiLevelType w:val="hybridMultilevel"/>
-    <w:tmpl w:val="A16C1A32"/>
+    <w:tmpl w:val="81762318"/>
     <w:lvl w:ilvl="0" w:tplc="040E0001">
       <w:start w:val="1"/>
       <w:numFmt w:val="bullet"/>
@@ -7052,6 +7141,7 @@
   <w:style w:type="character" w:default="1" w:styleId="Bekezdsalapbettpusa">
     <w:name w:val="Default Paragraph Font"/>
     <w:uiPriority w:val="1"/>
+    <w:semiHidden/>
     <w:unhideWhenUsed/>
   </w:style>
   <w:style w:type="table" w:default="1" w:styleId="Normltblzat">

</xml_diff>

<commit_message>
Making music requesting for students (+doc)
</commit_message>
<xml_diff>
--- a/documentation.docx
+++ b/documentation.docx
@@ -40,27 +40,29 @@
           <w:sz w:val="40"/>
           <w:szCs w:val="40"/>
         </w:rPr>
-        <w:t>Alkalmazás neve: BláthyFM</w:t>
-      </w:r>
-    </w:p>
-    <w:p>
-      <w:pPr>
+        <w:t xml:space="preserve">Alkalmazás neve: </w:t>
+      </w:r>
+      <w:proofErr w:type="spellStart"/>
+      <w:r>
         <w:rPr>
           <w:rFonts w:ascii="Times New Roman" w:hAnsi="Times New Roman" w:cs="Times New Roman"/>
           <w:bCs/>
           <w:sz w:val="40"/>
           <w:szCs w:val="40"/>
         </w:rPr>
-      </w:pPr>
-      <w:r>
+        <w:t>BláthyFM</w:t>
+      </w:r>
+      <w:proofErr w:type="spellEnd"/>
+    </w:p>
+    <w:p>
+      <w:pPr>
         <w:rPr>
           <w:rFonts w:ascii="Times New Roman" w:hAnsi="Times New Roman" w:cs="Times New Roman"/>
           <w:bCs/>
           <w:sz w:val="40"/>
           <w:szCs w:val="40"/>
         </w:rPr>
-        <w:t>Tagok:</w:t>
-      </w:r>
+      </w:pPr>
       <w:r>
         <w:rPr>
           <w:rFonts w:ascii="Times New Roman" w:hAnsi="Times New Roman" w:cs="Times New Roman"/>
@@ -68,19 +70,18 @@
           <w:sz w:val="40"/>
           <w:szCs w:val="40"/>
         </w:rPr>
-        <w:t xml:space="preserve"> Susán Csongor, El-Nabulsy Csongor Alan</w:t>
-      </w:r>
-    </w:p>
-    <w:p>
-      <w:pPr>
-        <w:spacing w:after="960"/>
+        <w:t>Tagok:</w:t>
+      </w:r>
+      <w:r>
         <w:rPr>
           <w:rFonts w:ascii="Times New Roman" w:hAnsi="Times New Roman" w:cs="Times New Roman"/>
           <w:bCs/>
           <w:sz w:val="40"/>
           <w:szCs w:val="40"/>
         </w:rPr>
-      </w:pPr>
+        <w:t xml:space="preserve"> Susán Csongor, El-</w:t>
+      </w:r>
+      <w:proofErr w:type="spellStart"/>
       <w:r>
         <w:rPr>
           <w:rFonts w:ascii="Times New Roman" w:hAnsi="Times New Roman" w:cs="Times New Roman"/>
@@ -88,7 +89,57 @@
           <w:sz w:val="40"/>
           <w:szCs w:val="40"/>
         </w:rPr>
-        <w:t>Az alkalmazás célja az, hogy a Bláthy-ba járó diákok előre meghatározott szünetekben kedvenc zenéjüket tudják majd hallgatni anélkül, hogy nekik kelljen azt maguknak vagy másoknak lejátszani. Ráadásul az, hogy az iskola az ő zenéjüket játssza, akár egy általuk kijelölt időpontban (ezt üzenetben írhatják le), még több élményt ad, és azt az érzést, hogy a zenéjük – és ezzel együtt önmaguk is – meg van becsülve.</w:t>
+        <w:t>Nabulsy</w:t>
+      </w:r>
+      <w:proofErr w:type="spellEnd"/>
+      <w:r>
+        <w:rPr>
+          <w:rFonts w:ascii="Times New Roman" w:hAnsi="Times New Roman" w:cs="Times New Roman"/>
+          <w:bCs/>
+          <w:sz w:val="40"/>
+          <w:szCs w:val="40"/>
+        </w:rPr>
+        <w:t xml:space="preserve"> Csongor Alan</w:t>
+      </w:r>
+    </w:p>
+    <w:p>
+      <w:pPr>
+        <w:spacing w:after="960"/>
+        <w:rPr>
+          <w:rFonts w:ascii="Times New Roman" w:hAnsi="Times New Roman" w:cs="Times New Roman"/>
+          <w:bCs/>
+          <w:sz w:val="40"/>
+          <w:szCs w:val="40"/>
+        </w:rPr>
+      </w:pPr>
+      <w:r>
+        <w:rPr>
+          <w:rFonts w:ascii="Times New Roman" w:hAnsi="Times New Roman" w:cs="Times New Roman"/>
+          <w:bCs/>
+          <w:sz w:val="40"/>
+          <w:szCs w:val="40"/>
+        </w:rPr>
+        <w:t>Az alkalmazás célja az, hogy a Bláthy-</w:t>
+      </w:r>
+      <w:proofErr w:type="spellStart"/>
+      <w:r>
+        <w:rPr>
+          <w:rFonts w:ascii="Times New Roman" w:hAnsi="Times New Roman" w:cs="Times New Roman"/>
+          <w:bCs/>
+          <w:sz w:val="40"/>
+          <w:szCs w:val="40"/>
+        </w:rPr>
+        <w:t>ba</w:t>
+      </w:r>
+      <w:proofErr w:type="spellEnd"/>
+      <w:r>
+        <w:rPr>
+          <w:rFonts w:ascii="Times New Roman" w:hAnsi="Times New Roman" w:cs="Times New Roman"/>
+          <w:bCs/>
+          <w:sz w:val="40"/>
+          <w:szCs w:val="40"/>
+        </w:rPr>
+        <w:t xml:space="preserve"> járó diákok előre meghatározott szünetekben kedvenc zenéjüket tudják majd hallgatni anélkül, hogy nekik kelljen azt maguknak vagy másoknak lejátszani. Ráadásul az, hogy az iskola az ő zenéjüket játssza, akár egy általuk kijelölt időpontban (ezt üzenetben írhatják le), még több élményt ad, és azt az érzést, hogy a zenéjük – és ezzel együtt önmaguk is – meg van becsülve.</w:t>
       </w:r>
     </w:p>
     <w:p>
@@ -561,7 +612,25 @@
           <w:sz w:val="36"/>
           <w:szCs w:val="36"/>
         </w:rPr>
-        <w:t>Az alkalmazás fejlesztését tartalmazó dokumentáció elkezdése, vizsgafeltételek tanulmányozása, a projektet tároló repository létrehozása, teszteknek külön dokumentáció létrehozása.</w:t>
+        <w:t xml:space="preserve">Az alkalmazás fejlesztését tartalmazó dokumentáció elkezdése, vizsgafeltételek tanulmányozása, a projektet tároló </w:t>
+      </w:r>
+      <w:proofErr w:type="spellStart"/>
+      <w:r>
+        <w:rPr>
+          <w:rFonts w:ascii="Times New Roman" w:hAnsi="Times New Roman" w:cs="Times New Roman"/>
+          <w:sz w:val="36"/>
+          <w:szCs w:val="36"/>
+        </w:rPr>
+        <w:t>repository</w:t>
+      </w:r>
+      <w:proofErr w:type="spellEnd"/>
+      <w:r>
+        <w:rPr>
+          <w:rFonts w:ascii="Times New Roman" w:hAnsi="Times New Roman" w:cs="Times New Roman"/>
+          <w:sz w:val="36"/>
+          <w:szCs w:val="36"/>
+        </w:rPr>
+        <w:t xml:space="preserve"> létrehozása, teszteknek külön dokumentáció létrehozása.</w:t>
       </w:r>
     </w:p>
     <w:p>
@@ -1229,7 +1298,7 @@
           <w:szCs w:val="36"/>
         </w:rPr>
         <w:drawing>
-          <wp:inline distT="0" distB="0" distL="0" distR="0" wp14:anchorId="78A43544" wp14:editId="62AE409E">
+          <wp:inline distT="0" distB="0" distL="0" distR="0" wp14:anchorId="78A43544" wp14:editId="6EBE2D2F">
             <wp:extent cx="3166535" cy="1781175"/>
             <wp:effectExtent l="0" t="0" r="0" b="0"/>
             <wp:docPr id="3" name="Kép 3" descr="C:\Users\elnabulsy.csongor\AppData\Local\Microsoft\Windows\INetCache\Content.MSO\F75754B3.tmp"/>
@@ -1321,7 +1390,7 @@
           <w:szCs w:val="36"/>
         </w:rPr>
         <w:drawing>
-          <wp:inline distT="0" distB="0" distL="0" distR="0" wp14:anchorId="4E211814" wp14:editId="19D6DB78">
+          <wp:inline distT="0" distB="0" distL="0" distR="0" wp14:anchorId="4E211814" wp14:editId="4E09F30E">
             <wp:extent cx="3133725" cy="1762720"/>
             <wp:effectExtent l="0" t="0" r="0" b="9525"/>
             <wp:docPr id="4" name="Kép 4" descr="C:\Users\elnabulsy.csongor\Downloads\ui_main_student.png"/>
@@ -1403,7 +1472,7 @@
           <w:szCs w:val="36"/>
         </w:rPr>
         <w:drawing>
-          <wp:inline distT="0" distB="0" distL="0" distR="0" wp14:anchorId="5137FB78" wp14:editId="2CC8439E">
+          <wp:inline distT="0" distB="0" distL="0" distR="0" wp14:anchorId="5137FB78" wp14:editId="685633B1">
             <wp:extent cx="3166110" cy="1780938"/>
             <wp:effectExtent l="0" t="0" r="0" b="0"/>
             <wp:docPr id="5" name="Kép 5" descr="C:\Users\elnabulsy.csongor\Downloads\ui_main_scheduler.png"/>
@@ -1466,7 +1535,25 @@
           <w:sz w:val="36"/>
           <w:szCs w:val="36"/>
         </w:rPr>
-        <w:t>Főképernyő admin ranggal:</w:t>
+        <w:t xml:space="preserve">Főképernyő </w:t>
+      </w:r>
+      <w:proofErr w:type="spellStart"/>
+      <w:r>
+        <w:rPr>
+          <w:rFonts w:ascii="Times New Roman" w:eastAsia="Times New Roman" w:hAnsi="Times New Roman" w:cs="Times New Roman"/>
+          <w:sz w:val="36"/>
+          <w:szCs w:val="36"/>
+        </w:rPr>
+        <w:t>admin</w:t>
+      </w:r>
+      <w:proofErr w:type="spellEnd"/>
+      <w:r>
+        <w:rPr>
+          <w:rFonts w:ascii="Times New Roman" w:eastAsia="Times New Roman" w:hAnsi="Times New Roman" w:cs="Times New Roman"/>
+          <w:sz w:val="36"/>
+          <w:szCs w:val="36"/>
+        </w:rPr>
+        <w:t xml:space="preserve"> ranggal:</w:t>
       </w:r>
     </w:p>
     <w:p>
@@ -1496,7 +1583,7 @@
           <w:szCs w:val="36"/>
         </w:rPr>
         <w:drawing>
-          <wp:inline distT="0" distB="0" distL="0" distR="0" wp14:anchorId="27EC1C67" wp14:editId="235FC9AA">
+          <wp:inline distT="0" distB="0" distL="0" distR="0" wp14:anchorId="27EC1C67" wp14:editId="404669D0">
             <wp:extent cx="3055620" cy="1718786"/>
             <wp:effectExtent l="0" t="0" r="0" b="0"/>
             <wp:docPr id="6" name="Kép 6" descr="C:\Users\elnabulsy.csongor\Downloads\ui_main_admin.png"/>
@@ -1578,7 +1665,7 @@
           <w:szCs w:val="36"/>
         </w:rPr>
         <w:drawing>
-          <wp:inline distT="0" distB="0" distL="0" distR="0" wp14:anchorId="08225B4F" wp14:editId="44D7BC4E">
+          <wp:inline distT="0" distB="0" distL="0" distR="0" wp14:anchorId="08225B4F" wp14:editId="743C16DF">
             <wp:extent cx="2933700" cy="1942430"/>
             <wp:effectExtent l="0" t="0" r="0" b="1270"/>
             <wp:docPr id="7" name="Kép 7" descr="C:\Users\elnabulsy.csongor\Downloads\ui_structure.png"/>
@@ -1751,7 +1838,7 @@
           <w:szCs w:val="36"/>
         </w:rPr>
         <w:drawing>
-          <wp:inline distT="0" distB="0" distL="0" distR="0" wp14:anchorId="2C256DB5" wp14:editId="4CC1E0BE">
+          <wp:inline distT="0" distB="0" distL="0" distR="0" wp14:anchorId="2C256DB5" wp14:editId="43FA4BD6">
             <wp:extent cx="3329940" cy="1752493"/>
             <wp:effectExtent l="0" t="0" r="3810" b="635"/>
             <wp:docPr id="9" name="Kép 9"/>
@@ -1922,7 +2009,25 @@
           <w:sz w:val="36"/>
           <w:szCs w:val="36"/>
         </w:rPr>
-        <w:t xml:space="preserve">Az admin UI oldal megtervezése digitális </w:t>
+        <w:t xml:space="preserve">Az </w:t>
+      </w:r>
+      <w:proofErr w:type="spellStart"/>
+      <w:r>
+        <w:rPr>
+          <w:rFonts w:ascii="Times New Roman" w:eastAsia="Times New Roman" w:hAnsi="Times New Roman" w:cs="Times New Roman"/>
+          <w:sz w:val="36"/>
+          <w:szCs w:val="36"/>
+        </w:rPr>
+        <w:t>admin</w:t>
+      </w:r>
+      <w:proofErr w:type="spellEnd"/>
+      <w:r>
+        <w:rPr>
+          <w:rFonts w:ascii="Times New Roman" w:eastAsia="Times New Roman" w:hAnsi="Times New Roman" w:cs="Times New Roman"/>
+          <w:sz w:val="36"/>
+          <w:szCs w:val="36"/>
+        </w:rPr>
+        <w:t xml:space="preserve"> UI oldal megtervezése digitális </w:t>
       </w:r>
       <w:r>
         <w:rPr>
@@ -1941,13 +2046,23 @@
           <w:szCs w:val="36"/>
         </w:rPr>
       </w:pPr>
-      <w:r>
-        <w:rPr>
-          <w:rFonts w:ascii="Times New Roman" w:eastAsia="Times New Roman" w:hAnsi="Times New Roman" w:cs="Times New Roman"/>
-          <w:sz w:val="36"/>
-          <w:szCs w:val="36"/>
-        </w:rPr>
-        <w:t>Admin oldal:</w:t>
+      <w:proofErr w:type="spellStart"/>
+      <w:r>
+        <w:rPr>
+          <w:rFonts w:ascii="Times New Roman" w:eastAsia="Times New Roman" w:hAnsi="Times New Roman" w:cs="Times New Roman"/>
+          <w:sz w:val="36"/>
+          <w:szCs w:val="36"/>
+        </w:rPr>
+        <w:t>Admin</w:t>
+      </w:r>
+      <w:proofErr w:type="spellEnd"/>
+      <w:r>
+        <w:rPr>
+          <w:rFonts w:ascii="Times New Roman" w:eastAsia="Times New Roman" w:hAnsi="Times New Roman" w:cs="Times New Roman"/>
+          <w:sz w:val="36"/>
+          <w:szCs w:val="36"/>
+        </w:rPr>
+        <w:t xml:space="preserve"> oldal:</w:t>
       </w:r>
     </w:p>
     <w:p>
@@ -2181,15 +2296,42 @@
           <w:sz w:val="36"/>
           <w:szCs w:val="36"/>
         </w:rPr>
-        <w:t>, Vue router</w:t>
-      </w:r>
-      <w:r>
-        <w:rPr>
-          <w:rFonts w:ascii="Times New Roman" w:eastAsia="Times New Roman" w:hAnsi="Times New Roman" w:cs="Times New Roman"/>
-          <w:sz w:val="36"/>
-          <w:szCs w:val="36"/>
-        </w:rPr>
-        <w:t>) létrehozása frontend</w:t>
+        <w:t xml:space="preserve">, </w:t>
+      </w:r>
+      <w:proofErr w:type="spellStart"/>
+      <w:r>
+        <w:rPr>
+          <w:rFonts w:ascii="Times New Roman" w:eastAsia="Times New Roman" w:hAnsi="Times New Roman" w:cs="Times New Roman"/>
+          <w:sz w:val="36"/>
+          <w:szCs w:val="36"/>
+        </w:rPr>
+        <w:t>Vue</w:t>
+      </w:r>
+      <w:proofErr w:type="spellEnd"/>
+      <w:r>
+        <w:rPr>
+          <w:rFonts w:ascii="Times New Roman" w:eastAsia="Times New Roman" w:hAnsi="Times New Roman" w:cs="Times New Roman"/>
+          <w:sz w:val="36"/>
+          <w:szCs w:val="36"/>
+        </w:rPr>
+        <w:t xml:space="preserve"> router</w:t>
+      </w:r>
+      <w:r>
+        <w:rPr>
+          <w:rFonts w:ascii="Times New Roman" w:eastAsia="Times New Roman" w:hAnsi="Times New Roman" w:cs="Times New Roman"/>
+          <w:sz w:val="36"/>
+          <w:szCs w:val="36"/>
+        </w:rPr>
+        <w:t xml:space="preserve">) létrehozása </w:t>
+      </w:r>
+      <w:proofErr w:type="spellStart"/>
+      <w:r>
+        <w:rPr>
+          <w:rFonts w:ascii="Times New Roman" w:eastAsia="Times New Roman" w:hAnsi="Times New Roman" w:cs="Times New Roman"/>
+          <w:sz w:val="36"/>
+          <w:szCs w:val="36"/>
+        </w:rPr>
+        <w:t>frontend</w:t>
       </w:r>
       <w:r>
         <w:rPr>
@@ -2199,6 +2341,7 @@
         </w:rPr>
         <w:t>Part</w:t>
       </w:r>
+      <w:proofErr w:type="spellEnd"/>
       <w:r>
         <w:rPr>
           <w:rFonts w:ascii="Times New Roman" w:eastAsia="Times New Roman" w:hAnsi="Times New Roman" w:cs="Times New Roman"/>
@@ -2251,13 +2394,23 @@
           <w:szCs w:val="36"/>
         </w:rPr>
       </w:pPr>
-      <w:r>
-        <w:rPr>
-          <w:rFonts w:ascii="Times New Roman" w:eastAsia="Times New Roman" w:hAnsi="Times New Roman" w:cs="Times New Roman"/>
-          <w:sz w:val="36"/>
-          <w:szCs w:val="36"/>
-        </w:rPr>
-        <w:t>route-ok definiálása</w:t>
+      <w:proofErr w:type="spellStart"/>
+      <w:r>
+        <w:rPr>
+          <w:rFonts w:ascii="Times New Roman" w:eastAsia="Times New Roman" w:hAnsi="Times New Roman" w:cs="Times New Roman"/>
+          <w:sz w:val="36"/>
+          <w:szCs w:val="36"/>
+        </w:rPr>
+        <w:t>route</w:t>
+      </w:r>
+      <w:proofErr w:type="spellEnd"/>
+      <w:r>
+        <w:rPr>
+          <w:rFonts w:ascii="Times New Roman" w:eastAsia="Times New Roman" w:hAnsi="Times New Roman" w:cs="Times New Roman"/>
+          <w:sz w:val="36"/>
+          <w:szCs w:val="36"/>
+        </w:rPr>
+        <w:t>-ok definiálása</w:t>
       </w:r>
     </w:p>
     <w:p>
@@ -2273,14 +2426,34 @@
           <w:szCs w:val="36"/>
         </w:rPr>
       </w:pPr>
-      <w:r>
-        <w:rPr>
-          <w:rFonts w:ascii="Times New Roman" w:eastAsia="Times New Roman" w:hAnsi="Times New Roman" w:cs="Times New Roman"/>
-          <w:sz w:val="36"/>
-          <w:szCs w:val="36"/>
-        </w:rPr>
-        <w:t>header és footer</w:t>
-      </w:r>
+      <w:proofErr w:type="spellStart"/>
+      <w:r>
+        <w:rPr>
+          <w:rFonts w:ascii="Times New Roman" w:eastAsia="Times New Roman" w:hAnsi="Times New Roman" w:cs="Times New Roman"/>
+          <w:sz w:val="36"/>
+          <w:szCs w:val="36"/>
+        </w:rPr>
+        <w:t>header</w:t>
+      </w:r>
+      <w:proofErr w:type="spellEnd"/>
+      <w:r>
+        <w:rPr>
+          <w:rFonts w:ascii="Times New Roman" w:eastAsia="Times New Roman" w:hAnsi="Times New Roman" w:cs="Times New Roman"/>
+          <w:sz w:val="36"/>
+          <w:szCs w:val="36"/>
+        </w:rPr>
+        <w:t xml:space="preserve"> és </w:t>
+      </w:r>
+      <w:proofErr w:type="spellStart"/>
+      <w:r>
+        <w:rPr>
+          <w:rFonts w:ascii="Times New Roman" w:eastAsia="Times New Roman" w:hAnsi="Times New Roman" w:cs="Times New Roman"/>
+          <w:sz w:val="36"/>
+          <w:szCs w:val="36"/>
+        </w:rPr>
+        <w:t>footer</w:t>
+      </w:r>
+      <w:proofErr w:type="spellEnd"/>
       <w:r>
         <w:rPr>
           <w:rFonts w:ascii="Times New Roman" w:eastAsia="Times New Roman" w:hAnsi="Times New Roman" w:cs="Times New Roman"/>
@@ -2311,13 +2484,41 @@
           <w:szCs w:val="36"/>
         </w:rPr>
       </w:pPr>
-      <w:r>
-        <w:rPr>
-          <w:rFonts w:ascii="Times New Roman" w:eastAsia="Times New Roman" w:hAnsi="Times New Roman" w:cs="Times New Roman"/>
-          <w:sz w:val="36"/>
-          <w:szCs w:val="36"/>
-        </w:rPr>
-        <w:t>header-main-footer-struktúra létrehozása</w:t>
+      <w:proofErr w:type="spellStart"/>
+      <w:r>
+        <w:rPr>
+          <w:rFonts w:ascii="Times New Roman" w:eastAsia="Times New Roman" w:hAnsi="Times New Roman" w:cs="Times New Roman"/>
+          <w:sz w:val="36"/>
+          <w:szCs w:val="36"/>
+        </w:rPr>
+        <w:t>header</w:t>
+      </w:r>
+      <w:proofErr w:type="spellEnd"/>
+      <w:r>
+        <w:rPr>
+          <w:rFonts w:ascii="Times New Roman" w:eastAsia="Times New Roman" w:hAnsi="Times New Roman" w:cs="Times New Roman"/>
+          <w:sz w:val="36"/>
+          <w:szCs w:val="36"/>
+        </w:rPr>
+        <w:t>-main-</w:t>
+      </w:r>
+      <w:proofErr w:type="spellStart"/>
+      <w:r>
+        <w:rPr>
+          <w:rFonts w:ascii="Times New Roman" w:eastAsia="Times New Roman" w:hAnsi="Times New Roman" w:cs="Times New Roman"/>
+          <w:sz w:val="36"/>
+          <w:szCs w:val="36"/>
+        </w:rPr>
+        <w:t>footer</w:t>
+      </w:r>
+      <w:proofErr w:type="spellEnd"/>
+      <w:r>
+        <w:rPr>
+          <w:rFonts w:ascii="Times New Roman" w:eastAsia="Times New Roman" w:hAnsi="Times New Roman" w:cs="Times New Roman"/>
+          <w:sz w:val="36"/>
+          <w:szCs w:val="36"/>
+        </w:rPr>
+        <w:t>-struktúra létrehozása</w:t>
       </w:r>
     </w:p>
     <w:p>
@@ -2357,7 +2558,25 @@
           <w:sz w:val="36"/>
           <w:szCs w:val="36"/>
         </w:rPr>
-        <w:t>A projektet El-Nabulsy Csongor hozta létre és írta meg a kódját, a működéshez szükséges folyamatábrákat, az adatbázis ER-diagramját</w:t>
+        <w:t>A projektet El-</w:t>
+      </w:r>
+      <w:proofErr w:type="spellStart"/>
+      <w:r>
+        <w:rPr>
+          <w:rFonts w:ascii="Times New Roman" w:eastAsia="Times New Roman" w:hAnsi="Times New Roman" w:cs="Times New Roman"/>
+          <w:sz w:val="36"/>
+          <w:szCs w:val="36"/>
+        </w:rPr>
+        <w:t>Nabulsy</w:t>
+      </w:r>
+      <w:proofErr w:type="spellEnd"/>
+      <w:r>
+        <w:rPr>
+          <w:rFonts w:ascii="Times New Roman" w:eastAsia="Times New Roman" w:hAnsi="Times New Roman" w:cs="Times New Roman"/>
+          <w:sz w:val="36"/>
+          <w:szCs w:val="36"/>
+        </w:rPr>
+        <w:t xml:space="preserve"> Csongor hozta létre és írta meg a kódját, a működéshez szükséges folyamatábrákat, az adatbázis ER-diagramját</w:t>
       </w:r>
       <w:r>
         <w:rPr>
@@ -2440,7 +2659,25 @@
           <w:sz w:val="36"/>
           <w:szCs w:val="36"/>
         </w:rPr>
-        <w:t>(Susán Csongor) A frontendPart projekt átnézése, stílus hi</w:t>
+        <w:t xml:space="preserve">(Susán Csongor) A </w:t>
+      </w:r>
+      <w:proofErr w:type="spellStart"/>
+      <w:r>
+        <w:rPr>
+          <w:rFonts w:ascii="Times New Roman" w:eastAsia="Times New Roman" w:hAnsi="Times New Roman" w:cs="Times New Roman"/>
+          <w:sz w:val="36"/>
+          <w:szCs w:val="36"/>
+        </w:rPr>
+        <w:t>frontendPart</w:t>
+      </w:r>
+      <w:proofErr w:type="spellEnd"/>
+      <w:r>
+        <w:rPr>
+          <w:rFonts w:ascii="Times New Roman" w:eastAsia="Times New Roman" w:hAnsi="Times New Roman" w:cs="Times New Roman"/>
+          <w:sz w:val="36"/>
+          <w:szCs w:val="36"/>
+        </w:rPr>
+        <w:t xml:space="preserve"> projekt átnézése, stílus hi</w:t>
       </w:r>
       <w:r>
         <w:rPr>
@@ -2551,7 +2788,25 @@
           <w:sz w:val="36"/>
           <w:szCs w:val="36"/>
         </w:rPr>
-        <w:t>(El-Nabulsy Csongor Alan</w:t>
+        <w:t>(El-</w:t>
+      </w:r>
+      <w:proofErr w:type="spellStart"/>
+      <w:r>
+        <w:rPr>
+          <w:rFonts w:ascii="Times New Roman" w:eastAsia="Times New Roman" w:hAnsi="Times New Roman" w:cs="Times New Roman"/>
+          <w:sz w:val="36"/>
+          <w:szCs w:val="36"/>
+        </w:rPr>
+        <w:t>Nabulsy</w:t>
+      </w:r>
+      <w:proofErr w:type="spellEnd"/>
+      <w:r>
+        <w:rPr>
+          <w:rFonts w:ascii="Times New Roman" w:eastAsia="Times New Roman" w:hAnsi="Times New Roman" w:cs="Times New Roman"/>
+          <w:sz w:val="36"/>
+          <w:szCs w:val="36"/>
+        </w:rPr>
+        <w:t xml:space="preserve"> Csongor Alan</w:t>
       </w:r>
       <w:r>
         <w:rPr>
@@ -2575,7 +2830,25 @@
           <w:sz w:val="36"/>
           <w:szCs w:val="36"/>
         </w:rPr>
-        <w:t xml:space="preserve"> (El-Nabulsy: főoldal és annak </w:t>
+        <w:t xml:space="preserve"> (El-</w:t>
+      </w:r>
+      <w:proofErr w:type="spellStart"/>
+      <w:r>
+        <w:rPr>
+          <w:rFonts w:ascii="Times New Roman" w:eastAsia="Times New Roman" w:hAnsi="Times New Roman" w:cs="Times New Roman"/>
+          <w:sz w:val="36"/>
+          <w:szCs w:val="36"/>
+        </w:rPr>
+        <w:t>Nabulsy</w:t>
+      </w:r>
+      <w:proofErr w:type="spellEnd"/>
+      <w:r>
+        <w:rPr>
+          <w:rFonts w:ascii="Times New Roman" w:eastAsia="Times New Roman" w:hAnsi="Times New Roman" w:cs="Times New Roman"/>
+          <w:sz w:val="36"/>
+          <w:szCs w:val="36"/>
+        </w:rPr>
+        <w:t xml:space="preserve">: főoldal és annak </w:t>
       </w:r>
       <w:r>
         <w:rPr>
@@ -2591,7 +2864,25 @@
           <w:sz w:val="36"/>
           <w:szCs w:val="36"/>
         </w:rPr>
-        <w:t>variánsa, Susán: login befejezése és admin elkezdése, valamint a logika kidolgozásának megkezdése</w:t>
+        <w:t xml:space="preserve">variánsa, Susán: login befejezése és </w:t>
+      </w:r>
+      <w:proofErr w:type="spellStart"/>
+      <w:r>
+        <w:rPr>
+          <w:rFonts w:ascii="Times New Roman" w:eastAsia="Times New Roman" w:hAnsi="Times New Roman" w:cs="Times New Roman"/>
+          <w:sz w:val="36"/>
+          <w:szCs w:val="36"/>
+        </w:rPr>
+        <w:t>admin</w:t>
+      </w:r>
+      <w:proofErr w:type="spellEnd"/>
+      <w:r>
+        <w:rPr>
+          <w:rFonts w:ascii="Times New Roman" w:eastAsia="Times New Roman" w:hAnsi="Times New Roman" w:cs="Times New Roman"/>
+          <w:sz w:val="36"/>
+          <w:szCs w:val="36"/>
+        </w:rPr>
+        <w:t xml:space="preserve"> elkezdése, valamint a logika kidolgozásának megkezdése</w:t>
       </w:r>
       <w:r>
         <w:rPr>
@@ -2655,7 +2946,25 @@
           <w:sz w:val="36"/>
           <w:szCs w:val="36"/>
         </w:rPr>
-        <w:t xml:space="preserve">(El-Nabulsy Csongor Alan) A zenebekérő oldal </w:t>
+        <w:t>(El-</w:t>
+      </w:r>
+      <w:proofErr w:type="spellStart"/>
+      <w:r>
+        <w:rPr>
+          <w:rFonts w:ascii="Times New Roman" w:eastAsia="Times New Roman" w:hAnsi="Times New Roman" w:cs="Times New Roman"/>
+          <w:sz w:val="36"/>
+          <w:szCs w:val="36"/>
+        </w:rPr>
+        <w:t>Nabulsy</w:t>
+      </w:r>
+      <w:proofErr w:type="spellEnd"/>
+      <w:r>
+        <w:rPr>
+          <w:rFonts w:ascii="Times New Roman" w:eastAsia="Times New Roman" w:hAnsi="Times New Roman" w:cs="Times New Roman"/>
+          <w:sz w:val="36"/>
+          <w:szCs w:val="36"/>
+        </w:rPr>
+        <w:t xml:space="preserve"> Csongor Alan) A zenebekérő oldal </w:t>
       </w:r>
       <w:r>
         <w:rPr>
@@ -2710,7 +3019,89 @@
           <w:sz w:val="36"/>
           <w:szCs w:val="36"/>
         </w:rPr>
-        <w:t>(El-Nabulsy Csongor Alan) Főbb nézetek(HomeView, StudentHomePage, SchedulerView) szerkezetének kialakítása és a komponensek működésének ellenőrzése, a felhasználói felület stílusának kialakítása, hogy az oldal elrendezése megfeleljen a megtervezett UI-terveknek.</w:t>
+        <w:t>(El-</w:t>
+      </w:r>
+      <w:proofErr w:type="spellStart"/>
+      <w:r>
+        <w:rPr>
+          <w:rFonts w:ascii="Times New Roman" w:eastAsia="Times New Roman" w:hAnsi="Times New Roman" w:cs="Times New Roman"/>
+          <w:sz w:val="36"/>
+          <w:szCs w:val="36"/>
+        </w:rPr>
+        <w:t>Nabulsy</w:t>
+      </w:r>
+      <w:proofErr w:type="spellEnd"/>
+      <w:r>
+        <w:rPr>
+          <w:rFonts w:ascii="Times New Roman" w:eastAsia="Times New Roman" w:hAnsi="Times New Roman" w:cs="Times New Roman"/>
+          <w:sz w:val="36"/>
+          <w:szCs w:val="36"/>
+        </w:rPr>
+        <w:t xml:space="preserve"> Csongor Alan) Főbb </w:t>
+      </w:r>
+      <w:proofErr w:type="gramStart"/>
+      <w:r>
+        <w:rPr>
+          <w:rFonts w:ascii="Times New Roman" w:eastAsia="Times New Roman" w:hAnsi="Times New Roman" w:cs="Times New Roman"/>
+          <w:sz w:val="36"/>
+          <w:szCs w:val="36"/>
+        </w:rPr>
+        <w:t>nézetek(</w:t>
+      </w:r>
+      <w:proofErr w:type="spellStart"/>
+      <w:proofErr w:type="gramEnd"/>
+      <w:r>
+        <w:rPr>
+          <w:rFonts w:ascii="Times New Roman" w:eastAsia="Times New Roman" w:hAnsi="Times New Roman" w:cs="Times New Roman"/>
+          <w:sz w:val="36"/>
+          <w:szCs w:val="36"/>
+        </w:rPr>
+        <w:t>HomeView</w:t>
+      </w:r>
+      <w:proofErr w:type="spellEnd"/>
+      <w:r>
+        <w:rPr>
+          <w:rFonts w:ascii="Times New Roman" w:eastAsia="Times New Roman" w:hAnsi="Times New Roman" w:cs="Times New Roman"/>
+          <w:sz w:val="36"/>
+          <w:szCs w:val="36"/>
+        </w:rPr>
+        <w:t xml:space="preserve">, </w:t>
+      </w:r>
+      <w:proofErr w:type="spellStart"/>
+      <w:r>
+        <w:rPr>
+          <w:rFonts w:ascii="Times New Roman" w:eastAsia="Times New Roman" w:hAnsi="Times New Roman" w:cs="Times New Roman"/>
+          <w:sz w:val="36"/>
+          <w:szCs w:val="36"/>
+        </w:rPr>
+        <w:t>StudentHomePage</w:t>
+      </w:r>
+      <w:proofErr w:type="spellEnd"/>
+      <w:r>
+        <w:rPr>
+          <w:rFonts w:ascii="Times New Roman" w:eastAsia="Times New Roman" w:hAnsi="Times New Roman" w:cs="Times New Roman"/>
+          <w:sz w:val="36"/>
+          <w:szCs w:val="36"/>
+        </w:rPr>
+        <w:t xml:space="preserve">, </w:t>
+      </w:r>
+      <w:proofErr w:type="spellStart"/>
+      <w:r>
+        <w:rPr>
+          <w:rFonts w:ascii="Times New Roman" w:eastAsia="Times New Roman" w:hAnsi="Times New Roman" w:cs="Times New Roman"/>
+          <w:sz w:val="36"/>
+          <w:szCs w:val="36"/>
+        </w:rPr>
+        <w:t>SchedulerView</w:t>
+      </w:r>
+      <w:proofErr w:type="spellEnd"/>
+      <w:r>
+        <w:rPr>
+          <w:rFonts w:ascii="Times New Roman" w:eastAsia="Times New Roman" w:hAnsi="Times New Roman" w:cs="Times New Roman"/>
+          <w:sz w:val="36"/>
+          <w:szCs w:val="36"/>
+        </w:rPr>
+        <w:t>) szerkezetének kialakítása és a komponensek működésének ellenőrzése, a felhasználói felület stílusának kialakítása, hogy az oldal elrendezése megfeleljen a megtervezett UI-terveknek.</w:t>
       </w:r>
     </w:p>
     <w:p>
@@ -2795,7 +3186,25 @@
           <w:sz w:val="36"/>
           <w:szCs w:val="36"/>
         </w:rPr>
-        <w:t xml:space="preserve">, a routerben a főoldalak variánsainak gyerek route-okba </w:t>
+        <w:t xml:space="preserve">, a routerben a főoldalak variánsainak gyerek </w:t>
+      </w:r>
+      <w:proofErr w:type="spellStart"/>
+      <w:r>
+        <w:rPr>
+          <w:rFonts w:ascii="Times New Roman" w:eastAsia="Times New Roman" w:hAnsi="Times New Roman" w:cs="Times New Roman"/>
+          <w:sz w:val="36"/>
+          <w:szCs w:val="36"/>
+        </w:rPr>
+        <w:t>route</w:t>
+      </w:r>
+      <w:proofErr w:type="spellEnd"/>
+      <w:r>
+        <w:rPr>
+          <w:rFonts w:ascii="Times New Roman" w:eastAsia="Times New Roman" w:hAnsi="Times New Roman" w:cs="Times New Roman"/>
+          <w:sz w:val="36"/>
+          <w:szCs w:val="36"/>
+        </w:rPr>
+        <w:t xml:space="preserve">-okba </w:t>
       </w:r>
       <w:r>
         <w:rPr>
@@ -2820,15 +3229,51 @@
           <w:sz w:val="36"/>
           <w:szCs w:val="36"/>
         </w:rPr>
-        <w:t>, az új szabvány mintájára az admin nézet (gombok és rövid leírás azok alá) létrehozása</w:t>
-      </w:r>
-      <w:r>
-        <w:rPr>
-          <w:rFonts w:ascii="Times New Roman" w:eastAsia="Times New Roman" w:hAnsi="Times New Roman" w:cs="Times New Roman"/>
-          <w:sz w:val="36"/>
-          <w:szCs w:val="36"/>
-        </w:rPr>
-        <w:t>, felesleges import mezők kiszedése az App.vue fájlból</w:t>
+        <w:t xml:space="preserve">, az új szabvány mintájára az </w:t>
+      </w:r>
+      <w:proofErr w:type="spellStart"/>
+      <w:r>
+        <w:rPr>
+          <w:rFonts w:ascii="Times New Roman" w:eastAsia="Times New Roman" w:hAnsi="Times New Roman" w:cs="Times New Roman"/>
+          <w:sz w:val="36"/>
+          <w:szCs w:val="36"/>
+        </w:rPr>
+        <w:t>admin</w:t>
+      </w:r>
+      <w:proofErr w:type="spellEnd"/>
+      <w:r>
+        <w:rPr>
+          <w:rFonts w:ascii="Times New Roman" w:eastAsia="Times New Roman" w:hAnsi="Times New Roman" w:cs="Times New Roman"/>
+          <w:sz w:val="36"/>
+          <w:szCs w:val="36"/>
+        </w:rPr>
+        <w:t xml:space="preserve"> nézet (gombok és rövid leírás azok alá) létrehozása</w:t>
+      </w:r>
+      <w:r>
+        <w:rPr>
+          <w:rFonts w:ascii="Times New Roman" w:eastAsia="Times New Roman" w:hAnsi="Times New Roman" w:cs="Times New Roman"/>
+          <w:sz w:val="36"/>
+          <w:szCs w:val="36"/>
+        </w:rPr>
+        <w:t xml:space="preserve">, felesleges import mezők kiszedése az </w:t>
+      </w:r>
+      <w:proofErr w:type="spellStart"/>
+      <w:r>
+        <w:rPr>
+          <w:rFonts w:ascii="Times New Roman" w:eastAsia="Times New Roman" w:hAnsi="Times New Roman" w:cs="Times New Roman"/>
+          <w:sz w:val="36"/>
+          <w:szCs w:val="36"/>
+        </w:rPr>
+        <w:t>App.vue</w:t>
+      </w:r>
+      <w:proofErr w:type="spellEnd"/>
+      <w:r>
+        <w:rPr>
+          <w:rFonts w:ascii="Times New Roman" w:eastAsia="Times New Roman" w:hAnsi="Times New Roman" w:cs="Times New Roman"/>
+          <w:sz w:val="36"/>
+          <w:szCs w:val="36"/>
+        </w:rPr>
+        <w:t xml:space="preserve"> fájlból</w:t>
       </w:r>
     </w:p>
     <w:p>
@@ -2945,15 +3390,114 @@
           <w:sz w:val="36"/>
           <w:szCs w:val="36"/>
         </w:rPr>
-        <w:t>(Susán Csongor György, El-Nabulsy Csongor Alan)</w:t>
-      </w:r>
-      <w:r>
-        <w:rPr>
-          <w:rFonts w:ascii="Times New Roman" w:eastAsia="Times New Roman" w:hAnsi="Times New Roman" w:cs="Times New Roman"/>
-          <w:sz w:val="36"/>
-          <w:szCs w:val="36"/>
-        </w:rPr>
-        <w:t xml:space="preserve"> Nézetek végleges kialakítása (El-Nabulsy: HomeView, RequestView, SendView; Susán: főoldalak integrálása a HomeLayout</w:t>
+        <w:t>(Susán Csongor György, El-</w:t>
+      </w:r>
+      <w:proofErr w:type="spellStart"/>
+      <w:r>
+        <w:rPr>
+          <w:rFonts w:ascii="Times New Roman" w:eastAsia="Times New Roman" w:hAnsi="Times New Roman" w:cs="Times New Roman"/>
+          <w:sz w:val="36"/>
+          <w:szCs w:val="36"/>
+        </w:rPr>
+        <w:t>Nabulsy</w:t>
+      </w:r>
+      <w:proofErr w:type="spellEnd"/>
+      <w:r>
+        <w:rPr>
+          <w:rFonts w:ascii="Times New Roman" w:eastAsia="Times New Roman" w:hAnsi="Times New Roman" w:cs="Times New Roman"/>
+          <w:sz w:val="36"/>
+          <w:szCs w:val="36"/>
+        </w:rPr>
+        <w:t xml:space="preserve"> Csongor Alan)</w:t>
+      </w:r>
+      <w:r>
+        <w:rPr>
+          <w:rFonts w:ascii="Times New Roman" w:eastAsia="Times New Roman" w:hAnsi="Times New Roman" w:cs="Times New Roman"/>
+          <w:sz w:val="36"/>
+          <w:szCs w:val="36"/>
+        </w:rPr>
+        <w:t xml:space="preserve"> Nézetek végleges kialakítása (El-</w:t>
+      </w:r>
+      <w:proofErr w:type="spellStart"/>
+      <w:r>
+        <w:rPr>
+          <w:rFonts w:ascii="Times New Roman" w:eastAsia="Times New Roman" w:hAnsi="Times New Roman" w:cs="Times New Roman"/>
+          <w:sz w:val="36"/>
+          <w:szCs w:val="36"/>
+        </w:rPr>
+        <w:t>Nabulsy</w:t>
+      </w:r>
+      <w:proofErr w:type="spellEnd"/>
+      <w:r>
+        <w:rPr>
+          <w:rFonts w:ascii="Times New Roman" w:eastAsia="Times New Roman" w:hAnsi="Times New Roman" w:cs="Times New Roman"/>
+          <w:sz w:val="36"/>
+          <w:szCs w:val="36"/>
+        </w:rPr>
+        <w:t xml:space="preserve">: </w:t>
+      </w:r>
+      <w:proofErr w:type="spellStart"/>
+      <w:r>
+        <w:rPr>
+          <w:rFonts w:ascii="Times New Roman" w:eastAsia="Times New Roman" w:hAnsi="Times New Roman" w:cs="Times New Roman"/>
+          <w:sz w:val="36"/>
+          <w:szCs w:val="36"/>
+        </w:rPr>
+        <w:t>HomeView</w:t>
+      </w:r>
+      <w:proofErr w:type="spellEnd"/>
+      <w:r>
+        <w:rPr>
+          <w:rFonts w:ascii="Times New Roman" w:eastAsia="Times New Roman" w:hAnsi="Times New Roman" w:cs="Times New Roman"/>
+          <w:sz w:val="36"/>
+          <w:szCs w:val="36"/>
+        </w:rPr>
+        <w:t xml:space="preserve">, </w:t>
+      </w:r>
+      <w:proofErr w:type="spellStart"/>
+      <w:r>
+        <w:rPr>
+          <w:rFonts w:ascii="Times New Roman" w:eastAsia="Times New Roman" w:hAnsi="Times New Roman" w:cs="Times New Roman"/>
+          <w:sz w:val="36"/>
+          <w:szCs w:val="36"/>
+        </w:rPr>
+        <w:t>RequestView</w:t>
+      </w:r>
+      <w:proofErr w:type="spellEnd"/>
+      <w:r>
+        <w:rPr>
+          <w:rFonts w:ascii="Times New Roman" w:eastAsia="Times New Roman" w:hAnsi="Times New Roman" w:cs="Times New Roman"/>
+          <w:sz w:val="36"/>
+          <w:szCs w:val="36"/>
+        </w:rPr>
+        <w:t xml:space="preserve">, </w:t>
+      </w:r>
+      <w:proofErr w:type="spellStart"/>
+      <w:r>
+        <w:rPr>
+          <w:rFonts w:ascii="Times New Roman" w:eastAsia="Times New Roman" w:hAnsi="Times New Roman" w:cs="Times New Roman"/>
+          <w:sz w:val="36"/>
+          <w:szCs w:val="36"/>
+        </w:rPr>
+        <w:t>SendView</w:t>
+      </w:r>
+      <w:proofErr w:type="spellEnd"/>
+      <w:r>
+        <w:rPr>
+          <w:rFonts w:ascii="Times New Roman" w:eastAsia="Times New Roman" w:hAnsi="Times New Roman" w:cs="Times New Roman"/>
+          <w:sz w:val="36"/>
+          <w:szCs w:val="36"/>
+        </w:rPr>
+        <w:t xml:space="preserve">; Susán: főoldalak integrálása a </w:t>
+      </w:r>
+      <w:proofErr w:type="spellStart"/>
+      <w:r>
+        <w:rPr>
+          <w:rFonts w:ascii="Times New Roman" w:eastAsia="Times New Roman" w:hAnsi="Times New Roman" w:cs="Times New Roman"/>
+          <w:sz w:val="36"/>
+          <w:szCs w:val="36"/>
+        </w:rPr>
+        <w:t>HomeLayout</w:t>
       </w:r>
       <w:r>
         <w:rPr>
@@ -2969,7 +3513,16 @@
           <w:sz w:val="36"/>
           <w:szCs w:val="36"/>
         </w:rPr>
-        <w:t>ba)</w:t>
+        <w:t>ba</w:t>
+      </w:r>
+      <w:proofErr w:type="spellEnd"/>
+      <w:r>
+        <w:rPr>
+          <w:rFonts w:ascii="Times New Roman" w:eastAsia="Times New Roman" w:hAnsi="Times New Roman" w:cs="Times New Roman"/>
+          <w:sz w:val="36"/>
+          <w:szCs w:val="36"/>
+        </w:rPr>
+        <w:t>)</w:t>
       </w:r>
       <w:r>
         <w:rPr>
@@ -3018,7 +3571,25 @@
           <w:sz w:val="36"/>
           <w:szCs w:val="36"/>
         </w:rPr>
-        <w:t>Példa adatok felvétele a HomeLayout-ba a helyes működés tesztelésének érdekében</w:t>
+        <w:t xml:space="preserve">Példa adatok felvétele a </w:t>
+      </w:r>
+      <w:proofErr w:type="spellStart"/>
+      <w:r>
+        <w:rPr>
+          <w:rFonts w:ascii="Times New Roman" w:eastAsia="Times New Roman" w:hAnsi="Times New Roman" w:cs="Times New Roman"/>
+          <w:sz w:val="36"/>
+          <w:szCs w:val="36"/>
+        </w:rPr>
+        <w:t>HomeLayout-ba</w:t>
+      </w:r>
+      <w:proofErr w:type="spellEnd"/>
+      <w:r>
+        <w:rPr>
+          <w:rFonts w:ascii="Times New Roman" w:eastAsia="Times New Roman" w:hAnsi="Times New Roman" w:cs="Times New Roman"/>
+          <w:sz w:val="36"/>
+          <w:szCs w:val="36"/>
+        </w:rPr>
+        <w:t xml:space="preserve"> a helyes működés tesztelésének érdekében</w:t>
       </w:r>
     </w:p>
     <w:p>
@@ -3066,13 +3637,51 @@
           <w:szCs w:val="36"/>
         </w:rPr>
       </w:pPr>
-      <w:r>
-        <w:rPr>
-          <w:rFonts w:ascii="Times New Roman" w:eastAsia="Times New Roman" w:hAnsi="Times New Roman" w:cs="Times New Roman"/>
-          <w:sz w:val="36"/>
-          <w:szCs w:val="36"/>
-        </w:rPr>
-        <w:t>meta.title-ekben és a beforeEach-ben oldalcímek meghatározása</w:t>
+      <w:proofErr w:type="spellStart"/>
+      <w:proofErr w:type="gramStart"/>
+      <w:r>
+        <w:rPr>
+          <w:rFonts w:ascii="Times New Roman" w:eastAsia="Times New Roman" w:hAnsi="Times New Roman" w:cs="Times New Roman"/>
+          <w:sz w:val="36"/>
+          <w:szCs w:val="36"/>
+        </w:rPr>
+        <w:t>meta.title</w:t>
+      </w:r>
+      <w:proofErr w:type="gramEnd"/>
+      <w:r>
+        <w:rPr>
+          <w:rFonts w:ascii="Times New Roman" w:eastAsia="Times New Roman" w:hAnsi="Times New Roman" w:cs="Times New Roman"/>
+          <w:sz w:val="36"/>
+          <w:szCs w:val="36"/>
+        </w:rPr>
+        <w:t>-ekben</w:t>
+      </w:r>
+      <w:proofErr w:type="spellEnd"/>
+      <w:r>
+        <w:rPr>
+          <w:rFonts w:ascii="Times New Roman" w:eastAsia="Times New Roman" w:hAnsi="Times New Roman" w:cs="Times New Roman"/>
+          <w:sz w:val="36"/>
+          <w:szCs w:val="36"/>
+        </w:rPr>
+        <w:t xml:space="preserve"> és a </w:t>
+      </w:r>
+      <w:proofErr w:type="spellStart"/>
+      <w:r>
+        <w:rPr>
+          <w:rFonts w:ascii="Times New Roman" w:eastAsia="Times New Roman" w:hAnsi="Times New Roman" w:cs="Times New Roman"/>
+          <w:sz w:val="36"/>
+          <w:szCs w:val="36"/>
+        </w:rPr>
+        <w:t>beforeEach</w:t>
+      </w:r>
+      <w:proofErr w:type="spellEnd"/>
+      <w:r>
+        <w:rPr>
+          <w:rFonts w:ascii="Times New Roman" w:eastAsia="Times New Roman" w:hAnsi="Times New Roman" w:cs="Times New Roman"/>
+          <w:sz w:val="36"/>
+          <w:szCs w:val="36"/>
+        </w:rPr>
+        <w:t>-ben oldalcímek meghatározása</w:t>
       </w:r>
     </w:p>
     <w:p>
@@ -3128,6 +3737,7 @@
           <w:szCs w:val="36"/>
         </w:rPr>
       </w:pPr>
+      <w:proofErr w:type="spellStart"/>
       <w:r>
         <w:rPr>
           <w:rFonts w:ascii="Times New Roman" w:eastAsia="Times New Roman" w:hAnsi="Times New Roman" w:cs="Times New Roman"/>
@@ -3135,7 +3745,34 @@
           <w:szCs w:val="36"/>
         </w:rPr>
         <w:lastRenderedPageBreak/>
-        <w:t>auth függvény hozzáadása a bejelentkezési képernyőhöz (LoginView), ami egyelőre üres, egy komment jelzi annak célját</w:t>
+        <w:t>auth</w:t>
+      </w:r>
+      <w:proofErr w:type="spellEnd"/>
+      <w:r>
+        <w:rPr>
+          <w:rFonts w:ascii="Times New Roman" w:eastAsia="Times New Roman" w:hAnsi="Times New Roman" w:cs="Times New Roman"/>
+          <w:sz w:val="36"/>
+          <w:szCs w:val="36"/>
+        </w:rPr>
+        <w:t xml:space="preserve"> függvény hozzáadása a bejelentkezési képernyőhöz (</w:t>
+      </w:r>
+      <w:proofErr w:type="spellStart"/>
+      <w:r>
+        <w:rPr>
+          <w:rFonts w:ascii="Times New Roman" w:eastAsia="Times New Roman" w:hAnsi="Times New Roman" w:cs="Times New Roman"/>
+          <w:sz w:val="36"/>
+          <w:szCs w:val="36"/>
+        </w:rPr>
+        <w:t>LoginView</w:t>
+      </w:r>
+      <w:proofErr w:type="spellEnd"/>
+      <w:r>
+        <w:rPr>
+          <w:rFonts w:ascii="Times New Roman" w:eastAsia="Times New Roman" w:hAnsi="Times New Roman" w:cs="Times New Roman"/>
+          <w:sz w:val="36"/>
+          <w:szCs w:val="36"/>
+        </w:rPr>
+        <w:t>), ami egyelőre üres, egy komment jelzi annak célját</w:t>
       </w:r>
     </w:p>
     <w:p>
@@ -3336,7 +3973,43 @@
           <w:sz w:val="36"/>
           <w:szCs w:val="36"/>
         </w:rPr>
-        <w:t>Szerepkörök (role) és requiresAuth hozzáadása a nézetekhez</w:t>
+        <w:t>Szerepkörök (</w:t>
+      </w:r>
+      <w:proofErr w:type="spellStart"/>
+      <w:r>
+        <w:rPr>
+          <w:rFonts w:ascii="Times New Roman" w:eastAsia="Times New Roman" w:hAnsi="Times New Roman" w:cs="Times New Roman"/>
+          <w:sz w:val="36"/>
+          <w:szCs w:val="36"/>
+        </w:rPr>
+        <w:t>role</w:t>
+      </w:r>
+      <w:proofErr w:type="spellEnd"/>
+      <w:r>
+        <w:rPr>
+          <w:rFonts w:ascii="Times New Roman" w:eastAsia="Times New Roman" w:hAnsi="Times New Roman" w:cs="Times New Roman"/>
+          <w:sz w:val="36"/>
+          <w:szCs w:val="36"/>
+        </w:rPr>
+        <w:t xml:space="preserve">) és </w:t>
+      </w:r>
+      <w:proofErr w:type="spellStart"/>
+      <w:r>
+        <w:rPr>
+          <w:rFonts w:ascii="Times New Roman" w:eastAsia="Times New Roman" w:hAnsi="Times New Roman" w:cs="Times New Roman"/>
+          <w:sz w:val="36"/>
+          <w:szCs w:val="36"/>
+        </w:rPr>
+        <w:t>requiresAuth</w:t>
+      </w:r>
+      <w:proofErr w:type="spellEnd"/>
+      <w:r>
+        <w:rPr>
+          <w:rFonts w:ascii="Times New Roman" w:eastAsia="Times New Roman" w:hAnsi="Times New Roman" w:cs="Times New Roman"/>
+          <w:sz w:val="36"/>
+          <w:szCs w:val="36"/>
+        </w:rPr>
+        <w:t xml:space="preserve"> hozzáadása a nézetekhez</w:t>
       </w:r>
     </w:p>
     <w:p>
@@ -3354,13 +4027,41 @@
           <w:szCs w:val="36"/>
         </w:rPr>
       </w:pPr>
-      <w:r>
-        <w:rPr>
-          <w:rFonts w:ascii="Times New Roman" w:eastAsia="Times New Roman" w:hAnsi="Times New Roman" w:cs="Times New Roman"/>
-          <w:sz w:val="36"/>
-          <w:szCs w:val="36"/>
-        </w:rPr>
-        <w:t>Autentikációhoz szükséges alapváltozók felvétele az App.vue-ban</w:t>
+      <w:proofErr w:type="spellStart"/>
+      <w:r>
+        <w:rPr>
+          <w:rFonts w:ascii="Times New Roman" w:eastAsia="Times New Roman" w:hAnsi="Times New Roman" w:cs="Times New Roman"/>
+          <w:sz w:val="36"/>
+          <w:szCs w:val="36"/>
+        </w:rPr>
+        <w:t>Autentikációhoz</w:t>
+      </w:r>
+      <w:proofErr w:type="spellEnd"/>
+      <w:r>
+        <w:rPr>
+          <w:rFonts w:ascii="Times New Roman" w:eastAsia="Times New Roman" w:hAnsi="Times New Roman" w:cs="Times New Roman"/>
+          <w:sz w:val="36"/>
+          <w:szCs w:val="36"/>
+        </w:rPr>
+        <w:t xml:space="preserve"> szükséges alapváltozók felvétele az </w:t>
+      </w:r>
+      <w:proofErr w:type="spellStart"/>
+      <w:r>
+        <w:rPr>
+          <w:rFonts w:ascii="Times New Roman" w:eastAsia="Times New Roman" w:hAnsi="Times New Roman" w:cs="Times New Roman"/>
+          <w:sz w:val="36"/>
+          <w:szCs w:val="36"/>
+        </w:rPr>
+        <w:t>App.vue</w:t>
+      </w:r>
+      <w:proofErr w:type="spellEnd"/>
+      <w:r>
+        <w:rPr>
+          <w:rFonts w:ascii="Times New Roman" w:eastAsia="Times New Roman" w:hAnsi="Times New Roman" w:cs="Times New Roman"/>
+          <w:sz w:val="36"/>
+          <w:szCs w:val="36"/>
+        </w:rPr>
+        <w:t>-ban</w:t>
       </w:r>
     </w:p>
     <w:p>
@@ -3400,7 +4101,25 @@
           <w:sz w:val="36"/>
           <w:szCs w:val="36"/>
         </w:rPr>
-        <w:t>(Susán Csongor György, El-Nabulsy Csongor Alan)</w:t>
+        <w:t>(Susán Csongor György, El-</w:t>
+      </w:r>
+      <w:proofErr w:type="spellStart"/>
+      <w:r>
+        <w:rPr>
+          <w:rFonts w:ascii="Times New Roman" w:eastAsia="Times New Roman" w:hAnsi="Times New Roman" w:cs="Times New Roman"/>
+          <w:sz w:val="36"/>
+          <w:szCs w:val="36"/>
+        </w:rPr>
+        <w:t>Nabulsy</w:t>
+      </w:r>
+      <w:proofErr w:type="spellEnd"/>
+      <w:r>
+        <w:rPr>
+          <w:rFonts w:ascii="Times New Roman" w:eastAsia="Times New Roman" w:hAnsi="Times New Roman" w:cs="Times New Roman"/>
+          <w:sz w:val="36"/>
+          <w:szCs w:val="36"/>
+        </w:rPr>
+        <w:t xml:space="preserve"> Csongor Alan)</w:t>
       </w:r>
     </w:p>
     <w:p>
@@ -3446,7 +4165,25 @@
           <w:sz w:val="36"/>
           <w:szCs w:val="36"/>
         </w:rPr>
-        <w:t>Táblák SQL-tervezetének elkészítése (El-Nabulsy)</w:t>
+        <w:t>Táblák SQL-tervezetének elkészítése (El-</w:t>
+      </w:r>
+      <w:proofErr w:type="spellStart"/>
+      <w:r>
+        <w:rPr>
+          <w:rFonts w:ascii="Times New Roman" w:eastAsia="Times New Roman" w:hAnsi="Times New Roman" w:cs="Times New Roman"/>
+          <w:sz w:val="36"/>
+          <w:szCs w:val="36"/>
+        </w:rPr>
+        <w:t>Nabulsy</w:t>
+      </w:r>
+      <w:proofErr w:type="spellEnd"/>
+      <w:r>
+        <w:rPr>
+          <w:rFonts w:ascii="Times New Roman" w:eastAsia="Times New Roman" w:hAnsi="Times New Roman" w:cs="Times New Roman"/>
+          <w:sz w:val="36"/>
+          <w:szCs w:val="36"/>
+        </w:rPr>
+        <w:t>)</w:t>
       </w:r>
     </w:p>
     <w:p>
@@ -3470,7 +4207,79 @@
           <w:szCs w:val="36"/>
         </w:rPr>
         <w:lastRenderedPageBreak/>
-        <w:t>Táblázatok relációs tervvé írása és azok implementálása (model-lek, egyelőre üres seederek és migration-ök) a Backend (Laravel) projektbe (Susán)</w:t>
+        <w:t>Táblázatok relációs tervvé írása és azok implementálása (</w:t>
+      </w:r>
+      <w:proofErr w:type="spellStart"/>
+      <w:r>
+        <w:rPr>
+          <w:rFonts w:ascii="Times New Roman" w:eastAsia="Times New Roman" w:hAnsi="Times New Roman" w:cs="Times New Roman"/>
+          <w:sz w:val="36"/>
+          <w:szCs w:val="36"/>
+        </w:rPr>
+        <w:t>model-lek</w:t>
+      </w:r>
+      <w:proofErr w:type="spellEnd"/>
+      <w:r>
+        <w:rPr>
+          <w:rFonts w:ascii="Times New Roman" w:eastAsia="Times New Roman" w:hAnsi="Times New Roman" w:cs="Times New Roman"/>
+          <w:sz w:val="36"/>
+          <w:szCs w:val="36"/>
+        </w:rPr>
+        <w:t xml:space="preserve">, egyelőre üres </w:t>
+      </w:r>
+      <w:proofErr w:type="spellStart"/>
+      <w:r>
+        <w:rPr>
+          <w:rFonts w:ascii="Times New Roman" w:eastAsia="Times New Roman" w:hAnsi="Times New Roman" w:cs="Times New Roman"/>
+          <w:sz w:val="36"/>
+          <w:szCs w:val="36"/>
+        </w:rPr>
+        <w:t>seederek</w:t>
+      </w:r>
+      <w:proofErr w:type="spellEnd"/>
+      <w:r>
+        <w:rPr>
+          <w:rFonts w:ascii="Times New Roman" w:eastAsia="Times New Roman" w:hAnsi="Times New Roman" w:cs="Times New Roman"/>
+          <w:sz w:val="36"/>
+          <w:szCs w:val="36"/>
+        </w:rPr>
+        <w:t xml:space="preserve"> és </w:t>
+      </w:r>
+      <w:proofErr w:type="spellStart"/>
+      <w:r>
+        <w:rPr>
+          <w:rFonts w:ascii="Times New Roman" w:eastAsia="Times New Roman" w:hAnsi="Times New Roman" w:cs="Times New Roman"/>
+          <w:sz w:val="36"/>
+          <w:szCs w:val="36"/>
+        </w:rPr>
+        <w:t>migration-ök</w:t>
+      </w:r>
+      <w:proofErr w:type="spellEnd"/>
+      <w:r>
+        <w:rPr>
+          <w:rFonts w:ascii="Times New Roman" w:eastAsia="Times New Roman" w:hAnsi="Times New Roman" w:cs="Times New Roman"/>
+          <w:sz w:val="36"/>
+          <w:szCs w:val="36"/>
+        </w:rPr>
+        <w:t>) a Backend (</w:t>
+      </w:r>
+      <w:proofErr w:type="spellStart"/>
+      <w:r>
+        <w:rPr>
+          <w:rFonts w:ascii="Times New Roman" w:eastAsia="Times New Roman" w:hAnsi="Times New Roman" w:cs="Times New Roman"/>
+          <w:sz w:val="36"/>
+          <w:szCs w:val="36"/>
+        </w:rPr>
+        <w:t>Laravel</w:t>
+      </w:r>
+      <w:proofErr w:type="spellEnd"/>
+      <w:r>
+        <w:rPr>
+          <w:rFonts w:ascii="Times New Roman" w:eastAsia="Times New Roman" w:hAnsi="Times New Roman" w:cs="Times New Roman"/>
+          <w:sz w:val="36"/>
+          <w:szCs w:val="36"/>
+        </w:rPr>
+        <w:t>) projektbe (Susán)</w:t>
       </w:r>
     </w:p>
     <w:p>
@@ -3493,7 +4302,79 @@
           <w:sz w:val="36"/>
           <w:szCs w:val="36"/>
         </w:rPr>
-        <w:t>Projekt struktúrájának végleges kialakítása (eddig frontendPart-blathyfm volt, viszont azóta a főmappa a BlathyFM mappát viseli, amiben két, az alkalmazás egy-egy szintjét képviselő projekt található (blathyfm_frontend – amiben az eddigi frontend-alkalmazás volt megtalálható – és blathyfm_backend, ami pedig az újonnan létrejött backend része a projektnek) (Susán)</w:t>
+        <w:t xml:space="preserve">Projekt struktúrájának végleges kialakítása (eddig </w:t>
+      </w:r>
+      <w:proofErr w:type="spellStart"/>
+      <w:r>
+        <w:rPr>
+          <w:rFonts w:ascii="Times New Roman" w:eastAsia="Times New Roman" w:hAnsi="Times New Roman" w:cs="Times New Roman"/>
+          <w:sz w:val="36"/>
+          <w:szCs w:val="36"/>
+        </w:rPr>
+        <w:t>frontendPart-blathyfm</w:t>
+      </w:r>
+      <w:proofErr w:type="spellEnd"/>
+      <w:r>
+        <w:rPr>
+          <w:rFonts w:ascii="Times New Roman" w:eastAsia="Times New Roman" w:hAnsi="Times New Roman" w:cs="Times New Roman"/>
+          <w:sz w:val="36"/>
+          <w:szCs w:val="36"/>
+        </w:rPr>
+        <w:t xml:space="preserve"> volt, viszont azóta a főmappa a </w:t>
+      </w:r>
+      <w:proofErr w:type="spellStart"/>
+      <w:r>
+        <w:rPr>
+          <w:rFonts w:ascii="Times New Roman" w:eastAsia="Times New Roman" w:hAnsi="Times New Roman" w:cs="Times New Roman"/>
+          <w:sz w:val="36"/>
+          <w:szCs w:val="36"/>
+        </w:rPr>
+        <w:t>BlathyFM</w:t>
+      </w:r>
+      <w:proofErr w:type="spellEnd"/>
+      <w:r>
+        <w:rPr>
+          <w:rFonts w:ascii="Times New Roman" w:eastAsia="Times New Roman" w:hAnsi="Times New Roman" w:cs="Times New Roman"/>
+          <w:sz w:val="36"/>
+          <w:szCs w:val="36"/>
+        </w:rPr>
+        <w:t xml:space="preserve"> mappát viseli, amiben két, az alkalmazás egy-egy szintjét képviselő projekt található (</w:t>
+      </w:r>
+      <w:proofErr w:type="spellStart"/>
+      <w:r>
+        <w:rPr>
+          <w:rFonts w:ascii="Times New Roman" w:eastAsia="Times New Roman" w:hAnsi="Times New Roman" w:cs="Times New Roman"/>
+          <w:sz w:val="36"/>
+          <w:szCs w:val="36"/>
+        </w:rPr>
+        <w:t>blathyfm_frontend</w:t>
+      </w:r>
+      <w:proofErr w:type="spellEnd"/>
+      <w:r>
+        <w:rPr>
+          <w:rFonts w:ascii="Times New Roman" w:eastAsia="Times New Roman" w:hAnsi="Times New Roman" w:cs="Times New Roman"/>
+          <w:sz w:val="36"/>
+          <w:szCs w:val="36"/>
+        </w:rPr>
+        <w:t xml:space="preserve"> – amiben az eddigi frontend-alkalmazás volt megtalálható – és </w:t>
+      </w:r>
+      <w:proofErr w:type="spellStart"/>
+      <w:r>
+        <w:rPr>
+          <w:rFonts w:ascii="Times New Roman" w:eastAsia="Times New Roman" w:hAnsi="Times New Roman" w:cs="Times New Roman"/>
+          <w:sz w:val="36"/>
+          <w:szCs w:val="36"/>
+        </w:rPr>
+        <w:t>blathyfm_backend</w:t>
+      </w:r>
+      <w:proofErr w:type="spellEnd"/>
+      <w:r>
+        <w:rPr>
+          <w:rFonts w:ascii="Times New Roman" w:eastAsia="Times New Roman" w:hAnsi="Times New Roman" w:cs="Times New Roman"/>
+          <w:sz w:val="36"/>
+          <w:szCs w:val="36"/>
+        </w:rPr>
+        <w:t>, ami pedig az újonnan létrejött backend része a projektnek) (Susán)</w:t>
       </w:r>
     </w:p>
     <w:p>
@@ -3578,7 +4459,43 @@
           <w:sz w:val="36"/>
           <w:szCs w:val="36"/>
         </w:rPr>
-        <w:t>(El-Nabulsy Csongor Alan) Az ütemezői nézet (SchedulerView) elkészítése</w:t>
+        <w:t>(El-</w:t>
+      </w:r>
+      <w:proofErr w:type="spellStart"/>
+      <w:r>
+        <w:rPr>
+          <w:rFonts w:ascii="Times New Roman" w:eastAsia="Times New Roman" w:hAnsi="Times New Roman" w:cs="Times New Roman"/>
+          <w:sz w:val="36"/>
+          <w:szCs w:val="36"/>
+        </w:rPr>
+        <w:t>Nabulsy</w:t>
+      </w:r>
+      <w:proofErr w:type="spellEnd"/>
+      <w:r>
+        <w:rPr>
+          <w:rFonts w:ascii="Times New Roman" w:eastAsia="Times New Roman" w:hAnsi="Times New Roman" w:cs="Times New Roman"/>
+          <w:sz w:val="36"/>
+          <w:szCs w:val="36"/>
+        </w:rPr>
+        <w:t xml:space="preserve"> Csongor Alan) Az ütemezői nézet (</w:t>
+      </w:r>
+      <w:proofErr w:type="spellStart"/>
+      <w:r>
+        <w:rPr>
+          <w:rFonts w:ascii="Times New Roman" w:eastAsia="Times New Roman" w:hAnsi="Times New Roman" w:cs="Times New Roman"/>
+          <w:sz w:val="36"/>
+          <w:szCs w:val="36"/>
+        </w:rPr>
+        <w:t>SchedulerView</w:t>
+      </w:r>
+      <w:proofErr w:type="spellEnd"/>
+      <w:r>
+        <w:rPr>
+          <w:rFonts w:ascii="Times New Roman" w:eastAsia="Times New Roman" w:hAnsi="Times New Roman" w:cs="Times New Roman"/>
+          <w:sz w:val="36"/>
+          <w:szCs w:val="36"/>
+        </w:rPr>
+        <w:t>) elkészítése</w:t>
       </w:r>
       <w:r>
         <w:rPr>
@@ -3615,7 +4532,25 @@
           <w:sz w:val="36"/>
           <w:szCs w:val="36"/>
         </w:rPr>
-        <w:t>Tervezéssel kapcsolatos dokumentumok áthelyezése egy „plans” mappába, a</w:t>
+        <w:t>Tervezéssel kapcsolatos dokumentumok áthelyezése egy „</w:t>
+      </w:r>
+      <w:proofErr w:type="spellStart"/>
+      <w:r>
+        <w:rPr>
+          <w:rFonts w:ascii="Times New Roman" w:eastAsia="Times New Roman" w:hAnsi="Times New Roman" w:cs="Times New Roman"/>
+          <w:sz w:val="36"/>
+          <w:szCs w:val="36"/>
+        </w:rPr>
+        <w:t>plans</w:t>
+      </w:r>
+      <w:proofErr w:type="spellEnd"/>
+      <w:r>
+        <w:rPr>
+          <w:rFonts w:ascii="Times New Roman" w:eastAsia="Times New Roman" w:hAnsi="Times New Roman" w:cs="Times New Roman"/>
+          <w:sz w:val="36"/>
+          <w:szCs w:val="36"/>
+        </w:rPr>
+        <w:t>” mappába, a</w:t>
       </w:r>
       <w:r>
         <w:rPr>
@@ -3689,7 +4624,25 @@
           <w:sz w:val="36"/>
           <w:szCs w:val="36"/>
         </w:rPr>
-        <w:t>El-Nabulsy Csongor Alan</w:t>
+        <w:t>El-</w:t>
+      </w:r>
+      <w:proofErr w:type="spellStart"/>
+      <w:r>
+        <w:rPr>
+          <w:rFonts w:ascii="Times New Roman" w:eastAsia="Times New Roman" w:hAnsi="Times New Roman" w:cs="Times New Roman"/>
+          <w:sz w:val="36"/>
+          <w:szCs w:val="36"/>
+        </w:rPr>
+        <w:t>Nabulsy</w:t>
+      </w:r>
+      <w:proofErr w:type="spellEnd"/>
+      <w:r>
+        <w:rPr>
+          <w:rFonts w:ascii="Times New Roman" w:eastAsia="Times New Roman" w:hAnsi="Times New Roman" w:cs="Times New Roman"/>
+          <w:sz w:val="36"/>
+          <w:szCs w:val="36"/>
+        </w:rPr>
+        <w:t xml:space="preserve"> Csongor Alan</w:t>
       </w:r>
       <w:r>
         <w:rPr>
@@ -3705,7 +4658,43 @@
           <w:sz w:val="36"/>
           <w:szCs w:val="36"/>
         </w:rPr>
-        <w:t xml:space="preserve"> RequestView és SchedulerView továbbfejlesztése</w:t>
+        <w:t xml:space="preserve"> </w:t>
+      </w:r>
+      <w:proofErr w:type="spellStart"/>
+      <w:r>
+        <w:rPr>
+          <w:rFonts w:ascii="Times New Roman" w:eastAsia="Times New Roman" w:hAnsi="Times New Roman" w:cs="Times New Roman"/>
+          <w:sz w:val="36"/>
+          <w:szCs w:val="36"/>
+        </w:rPr>
+        <w:t>RequestView</w:t>
+      </w:r>
+      <w:proofErr w:type="spellEnd"/>
+      <w:r>
+        <w:rPr>
+          <w:rFonts w:ascii="Times New Roman" w:eastAsia="Times New Roman" w:hAnsi="Times New Roman" w:cs="Times New Roman"/>
+          <w:sz w:val="36"/>
+          <w:szCs w:val="36"/>
+        </w:rPr>
+        <w:t xml:space="preserve"> és </w:t>
+      </w:r>
+      <w:proofErr w:type="spellStart"/>
+      <w:r>
+        <w:rPr>
+          <w:rFonts w:ascii="Times New Roman" w:eastAsia="Times New Roman" w:hAnsi="Times New Roman" w:cs="Times New Roman"/>
+          <w:sz w:val="36"/>
+          <w:szCs w:val="36"/>
+        </w:rPr>
+        <w:t>SchedulerView</w:t>
+      </w:r>
+      <w:proofErr w:type="spellEnd"/>
+      <w:r>
+        <w:rPr>
+          <w:rFonts w:ascii="Times New Roman" w:eastAsia="Times New Roman" w:hAnsi="Times New Roman" w:cs="Times New Roman"/>
+          <w:sz w:val="36"/>
+          <w:szCs w:val="36"/>
+        </w:rPr>
+        <w:t xml:space="preserve"> továbbfejlesztése</w:t>
       </w:r>
     </w:p>
     <w:p>
@@ -3818,7 +4807,25 @@
           <w:sz w:val="36"/>
           <w:szCs w:val="36"/>
         </w:rPr>
-        <w:t xml:space="preserve"> az adatbázisba seederek segítségével</w:t>
+        <w:t xml:space="preserve"> az adatbázisba </w:t>
+      </w:r>
+      <w:proofErr w:type="spellStart"/>
+      <w:r>
+        <w:rPr>
+          <w:rFonts w:ascii="Times New Roman" w:eastAsia="Times New Roman" w:hAnsi="Times New Roman" w:cs="Times New Roman"/>
+          <w:sz w:val="36"/>
+          <w:szCs w:val="36"/>
+        </w:rPr>
+        <w:t>seederek</w:t>
+      </w:r>
+      <w:proofErr w:type="spellEnd"/>
+      <w:r>
+        <w:rPr>
+          <w:rFonts w:ascii="Times New Roman" w:eastAsia="Times New Roman" w:hAnsi="Times New Roman" w:cs="Times New Roman"/>
+          <w:sz w:val="36"/>
+          <w:szCs w:val="36"/>
+        </w:rPr>
+        <w:t xml:space="preserve"> segítségével</w:t>
       </w:r>
     </w:p>
     <w:p>
@@ -3966,6 +4973,7 @@
           <w:szCs w:val="36"/>
         </w:rPr>
       </w:pPr>
+      <w:proofErr w:type="spellStart"/>
       <w:r>
         <w:rPr>
           <w:rFonts w:ascii="Times New Roman" w:eastAsia="Times New Roman" w:hAnsi="Times New Roman" w:cs="Times New Roman"/>
@@ -3974,6 +4982,7 @@
         </w:rPr>
         <w:t>Genre</w:t>
       </w:r>
+      <w:proofErr w:type="spellEnd"/>
       <w:r>
         <w:rPr>
           <w:rFonts w:ascii="Times New Roman" w:eastAsia="Times New Roman" w:hAnsi="Times New Roman" w:cs="Times New Roman"/>
@@ -4123,7 +5132,61 @@
           <w:sz w:val="36"/>
           <w:szCs w:val="36"/>
         </w:rPr>
-        <w:t>Backend oldali migrationök és seederek debuggolása, hibamentesítése.</w:t>
+        <w:t xml:space="preserve">Backend oldali </w:t>
+      </w:r>
+      <w:proofErr w:type="spellStart"/>
+      <w:r>
+        <w:rPr>
+          <w:rFonts w:ascii="Times New Roman" w:eastAsia="Times New Roman" w:hAnsi="Times New Roman" w:cs="Times New Roman"/>
+          <w:sz w:val="36"/>
+          <w:szCs w:val="36"/>
+        </w:rPr>
+        <w:t>migrationök</w:t>
+      </w:r>
+      <w:proofErr w:type="spellEnd"/>
+      <w:r>
+        <w:rPr>
+          <w:rFonts w:ascii="Times New Roman" w:eastAsia="Times New Roman" w:hAnsi="Times New Roman" w:cs="Times New Roman"/>
+          <w:sz w:val="36"/>
+          <w:szCs w:val="36"/>
+        </w:rPr>
+        <w:t xml:space="preserve"> és </w:t>
+      </w:r>
+      <w:proofErr w:type="spellStart"/>
+      <w:r>
+        <w:rPr>
+          <w:rFonts w:ascii="Times New Roman" w:eastAsia="Times New Roman" w:hAnsi="Times New Roman" w:cs="Times New Roman"/>
+          <w:sz w:val="36"/>
+          <w:szCs w:val="36"/>
+        </w:rPr>
+        <w:t>seederek</w:t>
+      </w:r>
+      <w:proofErr w:type="spellEnd"/>
+      <w:r>
+        <w:rPr>
+          <w:rFonts w:ascii="Times New Roman" w:eastAsia="Times New Roman" w:hAnsi="Times New Roman" w:cs="Times New Roman"/>
+          <w:sz w:val="36"/>
+          <w:szCs w:val="36"/>
+        </w:rPr>
+        <w:t xml:space="preserve"> </w:t>
+      </w:r>
+      <w:proofErr w:type="spellStart"/>
+      <w:r>
+        <w:rPr>
+          <w:rFonts w:ascii="Times New Roman" w:eastAsia="Times New Roman" w:hAnsi="Times New Roman" w:cs="Times New Roman"/>
+          <w:sz w:val="36"/>
+          <w:szCs w:val="36"/>
+        </w:rPr>
+        <w:t>debuggolása</w:t>
+      </w:r>
+      <w:proofErr w:type="spellEnd"/>
+      <w:r>
+        <w:rPr>
+          <w:rFonts w:ascii="Times New Roman" w:eastAsia="Times New Roman" w:hAnsi="Times New Roman" w:cs="Times New Roman"/>
+          <w:sz w:val="36"/>
+          <w:szCs w:val="36"/>
+        </w:rPr>
+        <w:t>, hibamentesítése.</w:t>
       </w:r>
     </w:p>
     <w:p>
@@ -4277,7 +5340,25 @@
           <w:sz w:val="36"/>
           <w:szCs w:val="36"/>
         </w:rPr>
-        <w:t>Felvétel előtt álló felhasználók (PendingUser) táblájának hozzáadása az adatbázisba</w:t>
+        <w:t>Felvétel előtt álló felhasználók (</w:t>
+      </w:r>
+      <w:proofErr w:type="spellStart"/>
+      <w:r>
+        <w:rPr>
+          <w:rFonts w:ascii="Times New Roman" w:eastAsia="Times New Roman" w:hAnsi="Times New Roman" w:cs="Times New Roman"/>
+          <w:sz w:val="36"/>
+          <w:szCs w:val="36"/>
+        </w:rPr>
+        <w:t>PendingUser</w:t>
+      </w:r>
+      <w:proofErr w:type="spellEnd"/>
+      <w:r>
+        <w:rPr>
+          <w:rFonts w:ascii="Times New Roman" w:eastAsia="Times New Roman" w:hAnsi="Times New Roman" w:cs="Times New Roman"/>
+          <w:sz w:val="36"/>
+          <w:szCs w:val="36"/>
+        </w:rPr>
+        <w:t>) táblájának hozzáadása az adatbázisba</w:t>
       </w:r>
       <w:r>
         <w:rPr>
@@ -4308,8 +5389,18 @@
           <w:sz w:val="36"/>
           <w:szCs w:val="36"/>
         </w:rPr>
-        <w:t>Regisztráció debuggolása</w:t>
-      </w:r>
+        <w:t xml:space="preserve">Regisztráció </w:t>
+      </w:r>
+      <w:proofErr w:type="spellStart"/>
+      <w:r>
+        <w:rPr>
+          <w:rFonts w:ascii="Times New Roman" w:eastAsia="Times New Roman" w:hAnsi="Times New Roman" w:cs="Times New Roman"/>
+          <w:sz w:val="36"/>
+          <w:szCs w:val="36"/>
+        </w:rPr>
+        <w:t>debuggolása</w:t>
+      </w:r>
+      <w:proofErr w:type="spellEnd"/>
     </w:p>
     <w:p>
       <w:pPr>
@@ -4326,7 +5417,43 @@
           <w:sz w:val="36"/>
           <w:szCs w:val="36"/>
         </w:rPr>
-        <w:t>(El-Nabulsy Csongor Alan) WaitingView (ahova regisztráció után navigál az oldal) létrehozása.</w:t>
+        <w:t>(El-</w:t>
+      </w:r>
+      <w:proofErr w:type="spellStart"/>
+      <w:r>
+        <w:rPr>
+          <w:rFonts w:ascii="Times New Roman" w:eastAsia="Times New Roman" w:hAnsi="Times New Roman" w:cs="Times New Roman"/>
+          <w:sz w:val="36"/>
+          <w:szCs w:val="36"/>
+        </w:rPr>
+        <w:t>Nabulsy</w:t>
+      </w:r>
+      <w:proofErr w:type="spellEnd"/>
+      <w:r>
+        <w:rPr>
+          <w:rFonts w:ascii="Times New Roman" w:eastAsia="Times New Roman" w:hAnsi="Times New Roman" w:cs="Times New Roman"/>
+          <w:sz w:val="36"/>
+          <w:szCs w:val="36"/>
+        </w:rPr>
+        <w:t xml:space="preserve"> Csongor Alan) </w:t>
+      </w:r>
+      <w:proofErr w:type="spellStart"/>
+      <w:r>
+        <w:rPr>
+          <w:rFonts w:ascii="Times New Roman" w:eastAsia="Times New Roman" w:hAnsi="Times New Roman" w:cs="Times New Roman"/>
+          <w:sz w:val="36"/>
+          <w:szCs w:val="36"/>
+        </w:rPr>
+        <w:t>WaitingView</w:t>
+      </w:r>
+      <w:proofErr w:type="spellEnd"/>
+      <w:r>
+        <w:rPr>
+          <w:rFonts w:ascii="Times New Roman" w:eastAsia="Times New Roman" w:hAnsi="Times New Roman" w:cs="Times New Roman"/>
+          <w:sz w:val="36"/>
+          <w:szCs w:val="36"/>
+        </w:rPr>
+        <w:t xml:space="preserve"> (ahova regisztráció után navigál az oldal) létrehozása.</w:t>
       </w:r>
     </w:p>
     <w:p>
@@ -4406,7 +5533,79 @@
           <w:sz w:val="36"/>
           <w:szCs w:val="36"/>
         </w:rPr>
-        <w:t>Átnéztük mindegyik oldalt hogy néz ki jelenleg, és a RequestView-n kellett változtatni, hogy megfeleljen a dokumentációban lévő rajznak. Továbbá összefoglaltuk hogy mennyi hiányzik még a projektből hogy teljesen kész és működő képes legyen.</w:t>
+        <w:t xml:space="preserve">Átnéztük mindegyik </w:t>
+      </w:r>
+      <w:proofErr w:type="gramStart"/>
+      <w:r>
+        <w:rPr>
+          <w:rFonts w:ascii="Times New Roman" w:eastAsia="Times New Roman" w:hAnsi="Times New Roman" w:cs="Times New Roman"/>
+          <w:sz w:val="36"/>
+          <w:szCs w:val="36"/>
+        </w:rPr>
+        <w:t>oldalt</w:t>
+      </w:r>
+      <w:proofErr w:type="gramEnd"/>
+      <w:r>
+        <w:rPr>
+          <w:rFonts w:ascii="Times New Roman" w:eastAsia="Times New Roman" w:hAnsi="Times New Roman" w:cs="Times New Roman"/>
+          <w:sz w:val="36"/>
+          <w:szCs w:val="36"/>
+        </w:rPr>
+        <w:t xml:space="preserve"> hogy néz ki jelenleg, és a </w:t>
+      </w:r>
+      <w:proofErr w:type="spellStart"/>
+      <w:r>
+        <w:rPr>
+          <w:rFonts w:ascii="Times New Roman" w:eastAsia="Times New Roman" w:hAnsi="Times New Roman" w:cs="Times New Roman"/>
+          <w:sz w:val="36"/>
+          <w:szCs w:val="36"/>
+        </w:rPr>
+        <w:t>RequestView</w:t>
+      </w:r>
+      <w:proofErr w:type="spellEnd"/>
+      <w:r>
+        <w:rPr>
+          <w:rFonts w:ascii="Times New Roman" w:eastAsia="Times New Roman" w:hAnsi="Times New Roman" w:cs="Times New Roman"/>
+          <w:sz w:val="36"/>
+          <w:szCs w:val="36"/>
+        </w:rPr>
+        <w:t xml:space="preserve">-n kellett változtatni, hogy megfeleljen a dokumentációban lévő rajznak. Továbbá </w:t>
+      </w:r>
+      <w:proofErr w:type="gramStart"/>
+      <w:r>
+        <w:rPr>
+          <w:rFonts w:ascii="Times New Roman" w:eastAsia="Times New Roman" w:hAnsi="Times New Roman" w:cs="Times New Roman"/>
+          <w:sz w:val="36"/>
+          <w:szCs w:val="36"/>
+        </w:rPr>
+        <w:t>összefoglaltuk</w:t>
+      </w:r>
+      <w:proofErr w:type="gramEnd"/>
+      <w:r>
+        <w:rPr>
+          <w:rFonts w:ascii="Times New Roman" w:eastAsia="Times New Roman" w:hAnsi="Times New Roman" w:cs="Times New Roman"/>
+          <w:sz w:val="36"/>
+          <w:szCs w:val="36"/>
+        </w:rPr>
+        <w:t xml:space="preserve"> hogy mennyi hiányzik még a </w:t>
+      </w:r>
+      <w:proofErr w:type="gramStart"/>
+      <w:r>
+        <w:rPr>
+          <w:rFonts w:ascii="Times New Roman" w:eastAsia="Times New Roman" w:hAnsi="Times New Roman" w:cs="Times New Roman"/>
+          <w:sz w:val="36"/>
+          <w:szCs w:val="36"/>
+        </w:rPr>
+        <w:t>projektből</w:t>
+      </w:r>
+      <w:proofErr w:type="gramEnd"/>
+      <w:r>
+        <w:rPr>
+          <w:rFonts w:ascii="Times New Roman" w:eastAsia="Times New Roman" w:hAnsi="Times New Roman" w:cs="Times New Roman"/>
+          <w:sz w:val="36"/>
+          <w:szCs w:val="36"/>
+        </w:rPr>
+        <w:t xml:space="preserve"> hogy teljesen kész és működő képes legyen.</w:t>
       </w:r>
     </w:p>
     <w:p>
@@ -4434,7 +5633,25 @@
           <w:sz w:val="36"/>
           <w:szCs w:val="36"/>
         </w:rPr>
-        <w:t>(Susán Csongor György) A zenebeküldő oldal (SendView) újrakezdése és megalkotása validációval és működő adatbevitellel együtt.</w:t>
+        <w:t>(Susán Csongor György) A zenebeküldő oldal (</w:t>
+      </w:r>
+      <w:proofErr w:type="spellStart"/>
+      <w:r>
+        <w:rPr>
+          <w:rFonts w:ascii="Times New Roman" w:eastAsia="Times New Roman" w:hAnsi="Times New Roman" w:cs="Times New Roman"/>
+          <w:sz w:val="36"/>
+          <w:szCs w:val="36"/>
+        </w:rPr>
+        <w:t>SendView</w:t>
+      </w:r>
+      <w:proofErr w:type="spellEnd"/>
+      <w:r>
+        <w:rPr>
+          <w:rFonts w:ascii="Times New Roman" w:eastAsia="Times New Roman" w:hAnsi="Times New Roman" w:cs="Times New Roman"/>
+          <w:sz w:val="36"/>
+          <w:szCs w:val="36"/>
+        </w:rPr>
+        <w:t>) újrakezdése és megalkotása validációval és működő adatbevitellel együtt.</w:t>
       </w:r>
     </w:p>
     <w:p>
@@ -4452,7 +5669,43 @@
           <w:sz w:val="36"/>
           <w:szCs w:val="36"/>
         </w:rPr>
-        <w:t>(El-Nabulsy Csongor Alan) A zenebekérő oldal (RequestView) újra elkészítése.</w:t>
+        <w:t>(El-</w:t>
+      </w:r>
+      <w:proofErr w:type="spellStart"/>
+      <w:r>
+        <w:rPr>
+          <w:rFonts w:ascii="Times New Roman" w:eastAsia="Times New Roman" w:hAnsi="Times New Roman" w:cs="Times New Roman"/>
+          <w:sz w:val="36"/>
+          <w:szCs w:val="36"/>
+        </w:rPr>
+        <w:t>Nabulsy</w:t>
+      </w:r>
+      <w:proofErr w:type="spellEnd"/>
+      <w:r>
+        <w:rPr>
+          <w:rFonts w:ascii="Times New Roman" w:eastAsia="Times New Roman" w:hAnsi="Times New Roman" w:cs="Times New Roman"/>
+          <w:sz w:val="36"/>
+          <w:szCs w:val="36"/>
+        </w:rPr>
+        <w:t xml:space="preserve"> Csongor Alan) A zenebekérő oldal (</w:t>
+      </w:r>
+      <w:proofErr w:type="spellStart"/>
+      <w:r>
+        <w:rPr>
+          <w:rFonts w:ascii="Times New Roman" w:eastAsia="Times New Roman" w:hAnsi="Times New Roman" w:cs="Times New Roman"/>
+          <w:sz w:val="36"/>
+          <w:szCs w:val="36"/>
+        </w:rPr>
+        <w:t>RequestView</w:t>
+      </w:r>
+      <w:proofErr w:type="spellEnd"/>
+      <w:r>
+        <w:rPr>
+          <w:rFonts w:ascii="Times New Roman" w:eastAsia="Times New Roman" w:hAnsi="Times New Roman" w:cs="Times New Roman"/>
+          <w:sz w:val="36"/>
+          <w:szCs w:val="36"/>
+        </w:rPr>
+        <w:t>) újra elkészítése.</w:t>
       </w:r>
     </w:p>
     <w:p>
@@ -4688,7 +5941,25 @@
           <w:sz w:val="36"/>
           <w:szCs w:val="36"/>
         </w:rPr>
-        <w:t>(El-Nabulsy Csongor Alan)</w:t>
+        <w:t>(El-</w:t>
+      </w:r>
+      <w:proofErr w:type="spellStart"/>
+      <w:r>
+        <w:rPr>
+          <w:rFonts w:ascii="Times New Roman" w:eastAsia="Times New Roman" w:hAnsi="Times New Roman" w:cs="Times New Roman"/>
+          <w:sz w:val="36"/>
+          <w:szCs w:val="36"/>
+        </w:rPr>
+        <w:t>Nabulsy</w:t>
+      </w:r>
+      <w:proofErr w:type="spellEnd"/>
+      <w:r>
+        <w:rPr>
+          <w:rFonts w:ascii="Times New Roman" w:eastAsia="Times New Roman" w:hAnsi="Times New Roman" w:cs="Times New Roman"/>
+          <w:sz w:val="36"/>
+          <w:szCs w:val="36"/>
+        </w:rPr>
+        <w:t xml:space="preserve"> Csongor Alan)</w:t>
       </w:r>
     </w:p>
     <w:p>
@@ -4750,7 +6021,25 @@
           <w:sz w:val="36"/>
           <w:szCs w:val="36"/>
         </w:rPr>
-        <w:t>a HomeLayout-ba</w:t>
+        <w:t xml:space="preserve">a </w:t>
+      </w:r>
+      <w:proofErr w:type="spellStart"/>
+      <w:r>
+        <w:rPr>
+          <w:rFonts w:ascii="Times New Roman" w:eastAsia="Times New Roman" w:hAnsi="Times New Roman" w:cs="Times New Roman"/>
+          <w:sz w:val="36"/>
+          <w:szCs w:val="36"/>
+        </w:rPr>
+        <w:t>HomeLayout</w:t>
+      </w:r>
+      <w:proofErr w:type="spellEnd"/>
+      <w:r>
+        <w:rPr>
+          <w:rFonts w:ascii="Times New Roman" w:eastAsia="Times New Roman" w:hAnsi="Times New Roman" w:cs="Times New Roman"/>
+          <w:sz w:val="36"/>
+          <w:szCs w:val="36"/>
+        </w:rPr>
+        <w:t>-ba</w:t>
       </w:r>
       <w:r>
         <w:rPr>
@@ -4805,7 +6094,25 @@
           <w:sz w:val="36"/>
           <w:szCs w:val="36"/>
         </w:rPr>
-        <w:t>a RequestVerifyView-ba</w:t>
+        <w:t xml:space="preserve">a </w:t>
+      </w:r>
+      <w:proofErr w:type="spellStart"/>
+      <w:r>
+        <w:rPr>
+          <w:rFonts w:ascii="Times New Roman" w:eastAsia="Times New Roman" w:hAnsi="Times New Roman" w:cs="Times New Roman"/>
+          <w:sz w:val="36"/>
+          <w:szCs w:val="36"/>
+        </w:rPr>
+        <w:t>RequestVerifyView</w:t>
+      </w:r>
+      <w:proofErr w:type="spellEnd"/>
+      <w:r>
+        <w:rPr>
+          <w:rFonts w:ascii="Times New Roman" w:eastAsia="Times New Roman" w:hAnsi="Times New Roman" w:cs="Times New Roman"/>
+          <w:sz w:val="36"/>
+          <w:szCs w:val="36"/>
+        </w:rPr>
+        <w:t>-ba</w:t>
       </w:r>
       <w:r>
         <w:rPr>
@@ -4881,7 +6188,169 @@
           <w:sz w:val="36"/>
           <w:szCs w:val="36"/>
         </w:rPr>
-        <w:t>A Layout-ba megírtuk a függvényt axios használatával, amivel majd be lesznek töltve az adatok minden home page-n. Továbbá a SchedulerView és a RequestVerifyView is külön külön megírtuk a függvényt, de csak azokkal az adatokkal amiket szeretnénk hogy betöltsön majd.</w:t>
+        <w:t xml:space="preserve">A </w:t>
+      </w:r>
+      <w:proofErr w:type="spellStart"/>
+      <w:r>
+        <w:rPr>
+          <w:rFonts w:ascii="Times New Roman" w:eastAsia="Times New Roman" w:hAnsi="Times New Roman" w:cs="Times New Roman"/>
+          <w:sz w:val="36"/>
+          <w:szCs w:val="36"/>
+        </w:rPr>
+        <w:t>Layout-ba</w:t>
+      </w:r>
+      <w:proofErr w:type="spellEnd"/>
+      <w:r>
+        <w:rPr>
+          <w:rFonts w:ascii="Times New Roman" w:eastAsia="Times New Roman" w:hAnsi="Times New Roman" w:cs="Times New Roman"/>
+          <w:sz w:val="36"/>
+          <w:szCs w:val="36"/>
+        </w:rPr>
+        <w:t xml:space="preserve"> megírtuk a függvényt </w:t>
+      </w:r>
+      <w:proofErr w:type="spellStart"/>
+      <w:r>
+        <w:rPr>
+          <w:rFonts w:ascii="Times New Roman" w:eastAsia="Times New Roman" w:hAnsi="Times New Roman" w:cs="Times New Roman"/>
+          <w:sz w:val="36"/>
+          <w:szCs w:val="36"/>
+        </w:rPr>
+        <w:t>axios</w:t>
+      </w:r>
+      <w:proofErr w:type="spellEnd"/>
+      <w:r>
+        <w:rPr>
+          <w:rFonts w:ascii="Times New Roman" w:eastAsia="Times New Roman" w:hAnsi="Times New Roman" w:cs="Times New Roman"/>
+          <w:sz w:val="36"/>
+          <w:szCs w:val="36"/>
+        </w:rPr>
+        <w:t xml:space="preserve"> használatával, amivel majd be lesznek töltve az adatok minden </w:t>
+      </w:r>
+      <w:proofErr w:type="spellStart"/>
+      <w:r>
+        <w:rPr>
+          <w:rFonts w:ascii="Times New Roman" w:eastAsia="Times New Roman" w:hAnsi="Times New Roman" w:cs="Times New Roman"/>
+          <w:sz w:val="36"/>
+          <w:szCs w:val="36"/>
+        </w:rPr>
+        <w:t>home</w:t>
+      </w:r>
+      <w:proofErr w:type="spellEnd"/>
+      <w:r>
+        <w:rPr>
+          <w:rFonts w:ascii="Times New Roman" w:eastAsia="Times New Roman" w:hAnsi="Times New Roman" w:cs="Times New Roman"/>
+          <w:sz w:val="36"/>
+          <w:szCs w:val="36"/>
+        </w:rPr>
+        <w:t xml:space="preserve"> </w:t>
+      </w:r>
+      <w:proofErr w:type="spellStart"/>
+      <w:r>
+        <w:rPr>
+          <w:rFonts w:ascii="Times New Roman" w:eastAsia="Times New Roman" w:hAnsi="Times New Roman" w:cs="Times New Roman"/>
+          <w:sz w:val="36"/>
+          <w:szCs w:val="36"/>
+        </w:rPr>
+        <w:t>page-n</w:t>
+      </w:r>
+      <w:proofErr w:type="spellEnd"/>
+      <w:r>
+        <w:rPr>
+          <w:rFonts w:ascii="Times New Roman" w:eastAsia="Times New Roman" w:hAnsi="Times New Roman" w:cs="Times New Roman"/>
+          <w:sz w:val="36"/>
+          <w:szCs w:val="36"/>
+        </w:rPr>
+        <w:t xml:space="preserve">. Továbbá a </w:t>
+      </w:r>
+      <w:proofErr w:type="spellStart"/>
+      <w:r>
+        <w:rPr>
+          <w:rFonts w:ascii="Times New Roman" w:eastAsia="Times New Roman" w:hAnsi="Times New Roman" w:cs="Times New Roman"/>
+          <w:sz w:val="36"/>
+          <w:szCs w:val="36"/>
+        </w:rPr>
+        <w:t>SchedulerView</w:t>
+      </w:r>
+      <w:proofErr w:type="spellEnd"/>
+      <w:r>
+        <w:rPr>
+          <w:rFonts w:ascii="Times New Roman" w:eastAsia="Times New Roman" w:hAnsi="Times New Roman" w:cs="Times New Roman"/>
+          <w:sz w:val="36"/>
+          <w:szCs w:val="36"/>
+        </w:rPr>
+        <w:t xml:space="preserve"> és a </w:t>
+      </w:r>
+      <w:proofErr w:type="spellStart"/>
+      <w:r>
+        <w:rPr>
+          <w:rFonts w:ascii="Times New Roman" w:eastAsia="Times New Roman" w:hAnsi="Times New Roman" w:cs="Times New Roman"/>
+          <w:sz w:val="36"/>
+          <w:szCs w:val="36"/>
+        </w:rPr>
+        <w:t>RequestVerifyView</w:t>
+      </w:r>
+      <w:proofErr w:type="spellEnd"/>
+      <w:r>
+        <w:rPr>
+          <w:rFonts w:ascii="Times New Roman" w:eastAsia="Times New Roman" w:hAnsi="Times New Roman" w:cs="Times New Roman"/>
+          <w:sz w:val="36"/>
+          <w:szCs w:val="36"/>
+        </w:rPr>
+        <w:t xml:space="preserve"> is külön </w:t>
+      </w:r>
+      <w:proofErr w:type="spellStart"/>
+      <w:r>
+        <w:rPr>
+          <w:rFonts w:ascii="Times New Roman" w:eastAsia="Times New Roman" w:hAnsi="Times New Roman" w:cs="Times New Roman"/>
+          <w:sz w:val="36"/>
+          <w:szCs w:val="36"/>
+        </w:rPr>
+        <w:t>külön</w:t>
+      </w:r>
+      <w:proofErr w:type="spellEnd"/>
+      <w:r>
+        <w:rPr>
+          <w:rFonts w:ascii="Times New Roman" w:eastAsia="Times New Roman" w:hAnsi="Times New Roman" w:cs="Times New Roman"/>
+          <w:sz w:val="36"/>
+          <w:szCs w:val="36"/>
+        </w:rPr>
+        <w:t xml:space="preserve"> megírtuk a függvényt, de csak azokkal az </w:t>
+      </w:r>
+      <w:proofErr w:type="gramStart"/>
+      <w:r>
+        <w:rPr>
+          <w:rFonts w:ascii="Times New Roman" w:eastAsia="Times New Roman" w:hAnsi="Times New Roman" w:cs="Times New Roman"/>
+          <w:sz w:val="36"/>
+          <w:szCs w:val="36"/>
+        </w:rPr>
+        <w:t>adatokkal</w:t>
+      </w:r>
+      <w:proofErr w:type="gramEnd"/>
+      <w:r>
+        <w:rPr>
+          <w:rFonts w:ascii="Times New Roman" w:eastAsia="Times New Roman" w:hAnsi="Times New Roman" w:cs="Times New Roman"/>
+          <w:sz w:val="36"/>
+          <w:szCs w:val="36"/>
+        </w:rPr>
+        <w:t xml:space="preserve"> amiket </w:t>
+      </w:r>
+      <w:proofErr w:type="gramStart"/>
+      <w:r>
+        <w:rPr>
+          <w:rFonts w:ascii="Times New Roman" w:eastAsia="Times New Roman" w:hAnsi="Times New Roman" w:cs="Times New Roman"/>
+          <w:sz w:val="36"/>
+          <w:szCs w:val="36"/>
+        </w:rPr>
+        <w:t>szeretnénk</w:t>
+      </w:r>
+      <w:proofErr w:type="gramEnd"/>
+      <w:r>
+        <w:rPr>
+          <w:rFonts w:ascii="Times New Roman" w:eastAsia="Times New Roman" w:hAnsi="Times New Roman" w:cs="Times New Roman"/>
+          <w:sz w:val="36"/>
+          <w:szCs w:val="36"/>
+        </w:rPr>
+        <w:t xml:space="preserve"> hogy betöltsön majd.</w:t>
       </w:r>
     </w:p>
     <w:p>
@@ -4914,6 +6383,26 @@
           <w:szCs w:val="40"/>
         </w:rPr>
         <w:t>2026-04-19 11:05-</w:t>
+      </w:r>
+      <w:r>
+        <w:rPr>
+          <w:rFonts w:ascii="Times New Roman" w:eastAsia="Times New Roman" w:hAnsi="Times New Roman" w:cs="Times New Roman"/>
+          <w:b/>
+          <w:bCs/>
+          <w:sz w:val="40"/>
+          <w:szCs w:val="40"/>
+        </w:rPr>
+        <w:t>1</w:t>
+      </w:r>
+      <w:r>
+        <w:rPr>
+          <w:rFonts w:ascii="Times New Roman" w:eastAsia="Times New Roman" w:hAnsi="Times New Roman" w:cs="Times New Roman"/>
+          <w:b/>
+          <w:bCs/>
+          <w:sz w:val="40"/>
+          <w:szCs w:val="40"/>
+        </w:rPr>
+        <w:t>8:00</w:t>
       </w:r>
     </w:p>
     <w:p>
@@ -4955,7 +6444,61 @@
           <w:szCs w:val="36"/>
         </w:rPr>
         <w:lastRenderedPageBreak/>
-        <w:t>A műfajok (Genres) tábla kitörlése a helyi projektből és a repositoryból, mivel annak a szerepét már egy statikus lista vette át a migrationben.</w:t>
+        <w:t>A műfajok (</w:t>
+      </w:r>
+      <w:proofErr w:type="spellStart"/>
+      <w:r>
+        <w:rPr>
+          <w:rFonts w:ascii="Times New Roman" w:eastAsia="Times New Roman" w:hAnsi="Times New Roman" w:cs="Times New Roman"/>
+          <w:sz w:val="36"/>
+          <w:szCs w:val="36"/>
+        </w:rPr>
+        <w:t>Genres</w:t>
+      </w:r>
+      <w:proofErr w:type="spellEnd"/>
+      <w:r>
+        <w:rPr>
+          <w:rFonts w:ascii="Times New Roman" w:eastAsia="Times New Roman" w:hAnsi="Times New Roman" w:cs="Times New Roman"/>
+          <w:sz w:val="36"/>
+          <w:szCs w:val="36"/>
+        </w:rPr>
+        <w:t xml:space="preserve">) tábla kitörlése a helyi projektből és a </w:t>
+      </w:r>
+      <w:proofErr w:type="spellStart"/>
+      <w:r>
+        <w:rPr>
+          <w:rFonts w:ascii="Times New Roman" w:eastAsia="Times New Roman" w:hAnsi="Times New Roman" w:cs="Times New Roman"/>
+          <w:sz w:val="36"/>
+          <w:szCs w:val="36"/>
+        </w:rPr>
+        <w:t>repositoryból</w:t>
+      </w:r>
+      <w:proofErr w:type="spellEnd"/>
+      <w:r>
+        <w:rPr>
+          <w:rFonts w:ascii="Times New Roman" w:eastAsia="Times New Roman" w:hAnsi="Times New Roman" w:cs="Times New Roman"/>
+          <w:sz w:val="36"/>
+          <w:szCs w:val="36"/>
+        </w:rPr>
+        <w:t xml:space="preserve">, mivel annak a szerepét már egy statikus lista vette át a </w:t>
+      </w:r>
+      <w:proofErr w:type="spellStart"/>
+      <w:r>
+        <w:rPr>
+          <w:rFonts w:ascii="Times New Roman" w:eastAsia="Times New Roman" w:hAnsi="Times New Roman" w:cs="Times New Roman"/>
+          <w:sz w:val="36"/>
+          <w:szCs w:val="36"/>
+        </w:rPr>
+        <w:t>migrationben</w:t>
+      </w:r>
+      <w:proofErr w:type="spellEnd"/>
+      <w:r>
+        <w:rPr>
+          <w:rFonts w:ascii="Times New Roman" w:eastAsia="Times New Roman" w:hAnsi="Times New Roman" w:cs="Times New Roman"/>
+          <w:sz w:val="36"/>
+          <w:szCs w:val="36"/>
+        </w:rPr>
+        <w:t>.</w:t>
       </w:r>
     </w:p>
     <w:p>
@@ -4978,7 +6521,97 @@
           <w:sz w:val="36"/>
           <w:szCs w:val="36"/>
         </w:rPr>
-        <w:t>A bejelentkezést biztosító kód tovább írása (a check függvény egy már elvetett logika mentén épül, annak a tartalma ki lett ürítve, a WaitingView beépítve a routingba, emellett egy autentikáció alapján elérhetőséget eldöntő logika a router guardban, ami még egyelőre nem működik)</w:t>
+        <w:t xml:space="preserve">A bejelentkezést biztosító kód tovább írása (a </w:t>
+      </w:r>
+      <w:proofErr w:type="spellStart"/>
+      <w:r>
+        <w:rPr>
+          <w:rFonts w:ascii="Times New Roman" w:eastAsia="Times New Roman" w:hAnsi="Times New Roman" w:cs="Times New Roman"/>
+          <w:sz w:val="36"/>
+          <w:szCs w:val="36"/>
+        </w:rPr>
+        <w:t>check</w:t>
+      </w:r>
+      <w:proofErr w:type="spellEnd"/>
+      <w:r>
+        <w:rPr>
+          <w:rFonts w:ascii="Times New Roman" w:eastAsia="Times New Roman" w:hAnsi="Times New Roman" w:cs="Times New Roman"/>
+          <w:sz w:val="36"/>
+          <w:szCs w:val="36"/>
+        </w:rPr>
+        <w:t xml:space="preserve"> függvény egy már elvetett logika mentén épül, annak a tartalma ki lett ürítve, a </w:t>
+      </w:r>
+      <w:proofErr w:type="spellStart"/>
+      <w:r>
+        <w:rPr>
+          <w:rFonts w:ascii="Times New Roman" w:eastAsia="Times New Roman" w:hAnsi="Times New Roman" w:cs="Times New Roman"/>
+          <w:sz w:val="36"/>
+          <w:szCs w:val="36"/>
+        </w:rPr>
+        <w:t>WaitingView</w:t>
+      </w:r>
+      <w:proofErr w:type="spellEnd"/>
+      <w:r>
+        <w:rPr>
+          <w:rFonts w:ascii="Times New Roman" w:eastAsia="Times New Roman" w:hAnsi="Times New Roman" w:cs="Times New Roman"/>
+          <w:sz w:val="36"/>
+          <w:szCs w:val="36"/>
+        </w:rPr>
+        <w:t xml:space="preserve"> beépítve a </w:t>
+      </w:r>
+      <w:proofErr w:type="spellStart"/>
+      <w:r>
+        <w:rPr>
+          <w:rFonts w:ascii="Times New Roman" w:eastAsia="Times New Roman" w:hAnsi="Times New Roman" w:cs="Times New Roman"/>
+          <w:sz w:val="36"/>
+          <w:szCs w:val="36"/>
+        </w:rPr>
+        <w:t>routingba</w:t>
+      </w:r>
+      <w:proofErr w:type="spellEnd"/>
+      <w:r>
+        <w:rPr>
+          <w:rFonts w:ascii="Times New Roman" w:eastAsia="Times New Roman" w:hAnsi="Times New Roman" w:cs="Times New Roman"/>
+          <w:sz w:val="36"/>
+          <w:szCs w:val="36"/>
+        </w:rPr>
+        <w:t xml:space="preserve">, emellett egy </w:t>
+      </w:r>
+      <w:proofErr w:type="spellStart"/>
+      <w:r>
+        <w:rPr>
+          <w:rFonts w:ascii="Times New Roman" w:eastAsia="Times New Roman" w:hAnsi="Times New Roman" w:cs="Times New Roman"/>
+          <w:sz w:val="36"/>
+          <w:szCs w:val="36"/>
+        </w:rPr>
+        <w:t>autentikáció</w:t>
+      </w:r>
+      <w:proofErr w:type="spellEnd"/>
+      <w:r>
+        <w:rPr>
+          <w:rFonts w:ascii="Times New Roman" w:eastAsia="Times New Roman" w:hAnsi="Times New Roman" w:cs="Times New Roman"/>
+          <w:sz w:val="36"/>
+          <w:szCs w:val="36"/>
+        </w:rPr>
+        <w:t xml:space="preserve"> alapján elérhetőséget eldöntő logika a router </w:t>
+      </w:r>
+      <w:proofErr w:type="spellStart"/>
+      <w:r>
+        <w:rPr>
+          <w:rFonts w:ascii="Times New Roman" w:eastAsia="Times New Roman" w:hAnsi="Times New Roman" w:cs="Times New Roman"/>
+          <w:sz w:val="36"/>
+          <w:szCs w:val="36"/>
+        </w:rPr>
+        <w:t>guardban</w:t>
+      </w:r>
+      <w:proofErr w:type="spellEnd"/>
+      <w:r>
+        <w:rPr>
+          <w:rFonts w:ascii="Times New Roman" w:eastAsia="Times New Roman" w:hAnsi="Times New Roman" w:cs="Times New Roman"/>
+          <w:sz w:val="36"/>
+          <w:szCs w:val="36"/>
+        </w:rPr>
+        <w:t>, ami még egyelőre nem működik)</w:t>
       </w:r>
       <w:r>
         <w:rPr>
@@ -4988,6 +6621,283 @@
         </w:rPr>
         <w:t>.</w:t>
       </w:r>
+    </w:p>
+    <w:p>
+      <w:pPr>
+        <w:pStyle w:val="Listaszerbekezds"/>
+        <w:numPr>
+          <w:ilvl w:val="0"/>
+          <w:numId w:val="13"/>
+        </w:numPr>
+        <w:jc w:val="both"/>
+        <w:rPr>
+          <w:rFonts w:ascii="Times New Roman" w:eastAsia="Times New Roman" w:hAnsi="Times New Roman" w:cs="Times New Roman"/>
+          <w:sz w:val="36"/>
+          <w:szCs w:val="36"/>
+        </w:rPr>
+      </w:pPr>
+      <w:r>
+        <w:rPr>
+          <w:rFonts w:ascii="Times New Roman" w:eastAsia="Times New Roman" w:hAnsi="Times New Roman" w:cs="Times New Roman"/>
+          <w:sz w:val="36"/>
+          <w:szCs w:val="36"/>
+        </w:rPr>
+        <w:t>A tanulói zenebekérés</w:t>
+      </w:r>
+      <w:r>
+        <w:rPr>
+          <w:rFonts w:ascii="Times New Roman" w:eastAsia="Times New Roman" w:hAnsi="Times New Roman" w:cs="Times New Roman"/>
+          <w:sz w:val="36"/>
+          <w:szCs w:val="36"/>
+        </w:rPr>
+        <w:t xml:space="preserve"> (</w:t>
+      </w:r>
+      <w:proofErr w:type="spellStart"/>
+      <w:r>
+        <w:rPr>
+          <w:rFonts w:ascii="Times New Roman" w:eastAsia="Times New Roman" w:hAnsi="Times New Roman" w:cs="Times New Roman"/>
+          <w:sz w:val="36"/>
+          <w:szCs w:val="36"/>
+        </w:rPr>
+        <w:t>RequestView</w:t>
+      </w:r>
+      <w:proofErr w:type="spellEnd"/>
+      <w:r>
+        <w:rPr>
+          <w:rFonts w:ascii="Times New Roman" w:eastAsia="Times New Roman" w:hAnsi="Times New Roman" w:cs="Times New Roman"/>
+          <w:sz w:val="36"/>
+          <w:szCs w:val="36"/>
+        </w:rPr>
+        <w:t xml:space="preserve">, </w:t>
+      </w:r>
+      <w:proofErr w:type="spellStart"/>
+      <w:r>
+        <w:rPr>
+          <w:rFonts w:ascii="Times New Roman" w:eastAsia="Times New Roman" w:hAnsi="Times New Roman" w:cs="Times New Roman"/>
+          <w:sz w:val="36"/>
+          <w:szCs w:val="36"/>
+        </w:rPr>
+        <w:t>RequestVerifyView</w:t>
+      </w:r>
+      <w:proofErr w:type="spellEnd"/>
+      <w:r>
+        <w:rPr>
+          <w:rFonts w:ascii="Times New Roman" w:eastAsia="Times New Roman" w:hAnsi="Times New Roman" w:cs="Times New Roman"/>
+          <w:sz w:val="36"/>
+          <w:szCs w:val="36"/>
+        </w:rPr>
+        <w:t>)</w:t>
+      </w:r>
+      <w:r>
+        <w:rPr>
+          <w:rFonts w:ascii="Times New Roman" w:eastAsia="Times New Roman" w:hAnsi="Times New Roman" w:cs="Times New Roman"/>
+          <w:sz w:val="36"/>
+          <w:szCs w:val="36"/>
+        </w:rPr>
+        <w:t xml:space="preserve"> és ütemezői nézetek</w:t>
+      </w:r>
+      <w:r>
+        <w:rPr>
+          <w:rFonts w:ascii="Times New Roman" w:eastAsia="Times New Roman" w:hAnsi="Times New Roman" w:cs="Times New Roman"/>
+          <w:sz w:val="36"/>
+          <w:szCs w:val="36"/>
+        </w:rPr>
+        <w:t>hez szükséges komponensek (</w:t>
+      </w:r>
+      <w:proofErr w:type="spellStart"/>
+      <w:r>
+        <w:rPr>
+          <w:rFonts w:ascii="Times New Roman" w:eastAsia="Times New Roman" w:hAnsi="Times New Roman" w:cs="Times New Roman"/>
+          <w:sz w:val="36"/>
+          <w:szCs w:val="36"/>
+        </w:rPr>
+        <w:t>RequestableMusicRow</w:t>
+      </w:r>
+      <w:proofErr w:type="spellEnd"/>
+      <w:r>
+        <w:rPr>
+          <w:rFonts w:ascii="Times New Roman" w:eastAsia="Times New Roman" w:hAnsi="Times New Roman" w:cs="Times New Roman"/>
+          <w:sz w:val="36"/>
+          <w:szCs w:val="36"/>
+        </w:rPr>
+        <w:t xml:space="preserve">) </w:t>
+      </w:r>
+      <w:r>
+        <w:rPr>
+          <w:rFonts w:ascii="Times New Roman" w:eastAsia="Times New Roman" w:hAnsi="Times New Roman" w:cs="Times New Roman"/>
+          <w:sz w:val="36"/>
+          <w:szCs w:val="36"/>
+        </w:rPr>
+        <w:t>kidolgozása</w:t>
+      </w:r>
+      <w:r>
+        <w:rPr>
+          <w:rFonts w:ascii="Times New Roman" w:eastAsia="Times New Roman" w:hAnsi="Times New Roman" w:cs="Times New Roman"/>
+          <w:sz w:val="36"/>
+          <w:szCs w:val="36"/>
+        </w:rPr>
+        <w:t>, előbbin oldalszám alapú zenemegjelenítéssel</w:t>
+      </w:r>
+      <w:r>
+        <w:rPr>
+          <w:rFonts w:ascii="Times New Roman" w:eastAsia="Times New Roman" w:hAnsi="Times New Roman" w:cs="Times New Roman"/>
+          <w:sz w:val="36"/>
+          <w:szCs w:val="36"/>
+        </w:rPr>
+        <w:t>.</w:t>
+      </w:r>
+    </w:p>
+    <w:p>
+      <w:pPr>
+        <w:jc w:val="both"/>
+        <w:rPr>
+          <w:rFonts w:ascii="Times New Roman" w:eastAsia="Times New Roman" w:hAnsi="Times New Roman" w:cs="Times New Roman"/>
+          <w:sz w:val="36"/>
+          <w:szCs w:val="36"/>
+        </w:rPr>
+      </w:pPr>
+    </w:p>
+    <w:p>
+      <w:pPr>
+        <w:jc w:val="both"/>
+        <w:rPr>
+          <w:rFonts w:ascii="Times New Roman" w:eastAsia="Times New Roman" w:hAnsi="Times New Roman" w:cs="Times New Roman"/>
+          <w:sz w:val="36"/>
+          <w:szCs w:val="36"/>
+        </w:rPr>
+      </w:pPr>
+      <w:r>
+        <w:rPr>
+          <w:rFonts w:ascii="Times New Roman" w:eastAsia="Times New Roman" w:hAnsi="Times New Roman" w:cs="Times New Roman"/>
+          <w:sz w:val="36"/>
+          <w:szCs w:val="36"/>
+        </w:rPr>
+        <w:t>(</w:t>
+      </w:r>
+      <w:r>
+        <w:rPr>
+          <w:rFonts w:ascii="Times New Roman" w:eastAsia="Times New Roman" w:hAnsi="Times New Roman" w:cs="Times New Roman"/>
+          <w:sz w:val="36"/>
+          <w:szCs w:val="36"/>
+        </w:rPr>
+        <w:t>El-</w:t>
+      </w:r>
+      <w:proofErr w:type="spellStart"/>
+      <w:r>
+        <w:rPr>
+          <w:rFonts w:ascii="Times New Roman" w:eastAsia="Times New Roman" w:hAnsi="Times New Roman" w:cs="Times New Roman"/>
+          <w:sz w:val="36"/>
+          <w:szCs w:val="36"/>
+        </w:rPr>
+        <w:t>Nabulsy</w:t>
+      </w:r>
+      <w:proofErr w:type="spellEnd"/>
+      <w:r>
+        <w:rPr>
+          <w:rFonts w:ascii="Times New Roman" w:eastAsia="Times New Roman" w:hAnsi="Times New Roman" w:cs="Times New Roman"/>
+          <w:sz w:val="36"/>
+          <w:szCs w:val="36"/>
+        </w:rPr>
+        <w:t xml:space="preserve"> Csongor Alan</w:t>
+      </w:r>
+      <w:r>
+        <w:rPr>
+          <w:rFonts w:ascii="Times New Roman" w:eastAsia="Times New Roman" w:hAnsi="Times New Roman" w:cs="Times New Roman"/>
+          <w:sz w:val="36"/>
+          <w:szCs w:val="36"/>
+        </w:rPr>
+        <w:t>)</w:t>
+      </w:r>
+    </w:p>
+    <w:p>
+      <w:pPr>
+        <w:pStyle w:val="Listaszerbekezds"/>
+        <w:numPr>
+          <w:ilvl w:val="0"/>
+          <w:numId w:val="14"/>
+        </w:numPr>
+        <w:jc w:val="both"/>
+        <w:rPr>
+          <w:rFonts w:ascii="Times New Roman" w:eastAsia="Times New Roman" w:hAnsi="Times New Roman" w:cs="Times New Roman"/>
+          <w:sz w:val="36"/>
+          <w:szCs w:val="36"/>
+        </w:rPr>
+      </w:pPr>
+      <w:r>
+        <w:rPr>
+          <w:rFonts w:ascii="Times New Roman" w:eastAsia="Times New Roman" w:hAnsi="Times New Roman" w:cs="Times New Roman"/>
+          <w:sz w:val="36"/>
+          <w:szCs w:val="36"/>
+        </w:rPr>
+        <w:t>A zenék elfogadásának és elutasításának mentésének</w:t>
+      </w:r>
+      <w:r>
+        <w:rPr>
+          <w:rFonts w:ascii="Times New Roman" w:eastAsia="Times New Roman" w:hAnsi="Times New Roman" w:cs="Times New Roman"/>
+          <w:sz w:val="36"/>
+          <w:szCs w:val="36"/>
+        </w:rPr>
+        <w:t>, valamint a lejátszási listával kapcsolatos műveletek (zenék felvétele, rendezése és levétele, valamint a megfelelő megjelenítési szabályok, pl. ugyanaz a zene ne jelenjen meg két listában)</w:t>
+      </w:r>
+      <w:r>
+        <w:rPr>
+          <w:rFonts w:ascii="Times New Roman" w:eastAsia="Times New Roman" w:hAnsi="Times New Roman" w:cs="Times New Roman"/>
+          <w:sz w:val="36"/>
+          <w:szCs w:val="36"/>
+        </w:rPr>
+        <w:t xml:space="preserve"> backend-oldali függvényének és útvonalának megírása</w:t>
+      </w:r>
+    </w:p>
+    <w:p>
+      <w:pPr>
+        <w:pStyle w:val="Listaszerbekezds"/>
+        <w:numPr>
+          <w:ilvl w:val="0"/>
+          <w:numId w:val="14"/>
+        </w:numPr>
+        <w:jc w:val="both"/>
+        <w:rPr>
+          <w:rFonts w:ascii="Times New Roman" w:eastAsia="Times New Roman" w:hAnsi="Times New Roman" w:cs="Times New Roman"/>
+          <w:sz w:val="36"/>
+          <w:szCs w:val="36"/>
+        </w:rPr>
+      </w:pPr>
+      <w:r>
+        <w:rPr>
+          <w:rFonts w:ascii="Times New Roman" w:eastAsia="Times New Roman" w:hAnsi="Times New Roman" w:cs="Times New Roman"/>
+          <w:sz w:val="36"/>
+          <w:szCs w:val="36"/>
+        </w:rPr>
+        <w:t xml:space="preserve">Elkészült a </w:t>
+      </w:r>
+      <w:proofErr w:type="spellStart"/>
+      <w:r>
+        <w:rPr>
+          <w:rFonts w:ascii="Times New Roman" w:eastAsia="Times New Roman" w:hAnsi="Times New Roman" w:cs="Times New Roman"/>
+          <w:sz w:val="36"/>
+          <w:szCs w:val="36"/>
+        </w:rPr>
+        <w:t>RequestedMusicController</w:t>
+      </w:r>
+      <w:proofErr w:type="spellEnd"/>
+      <w:r>
+        <w:rPr>
+          <w:rFonts w:ascii="Times New Roman" w:eastAsia="Times New Roman" w:hAnsi="Times New Roman" w:cs="Times New Roman"/>
+          <w:sz w:val="36"/>
+          <w:szCs w:val="36"/>
+        </w:rPr>
+        <w:t xml:space="preserve"> és az </w:t>
+      </w:r>
+      <w:proofErr w:type="spellStart"/>
+      <w:r>
+        <w:rPr>
+          <w:rFonts w:ascii="Times New Roman" w:eastAsia="Times New Roman" w:hAnsi="Times New Roman" w:cs="Times New Roman"/>
+          <w:sz w:val="36"/>
+          <w:szCs w:val="36"/>
+        </w:rPr>
+        <w:t>AcceptedMusicController</w:t>
+      </w:r>
+      <w:proofErr w:type="spellEnd"/>
     </w:p>
     <w:sectPr>
       <w:pgSz w:w="11906" w:h="16838"/>
@@ -5028,6 +6938,119 @@
     </w:pict>
   </w:numPicBullet>
   <w:abstractNum w:abstractNumId="0" w15:restartNumberingAfterBreak="0">
+    <w:nsid w:val="25B663B5"/>
+    <w:multiLevelType w:val="hybridMultilevel"/>
+    <w:tmpl w:val="AFC00FD0"/>
+    <w:lvl w:ilvl="0" w:tplc="040E0001">
+      <w:start w:val="1"/>
+      <w:numFmt w:val="bullet"/>
+      <w:lvlText w:val=""/>
+      <w:lvlJc w:val="left"/>
+      <w:pPr>
+        <w:ind w:left="720" w:hanging="360"/>
+      </w:pPr>
+      <w:rPr>
+        <w:rFonts w:ascii="Symbol" w:hAnsi="Symbol" w:hint="default"/>
+      </w:rPr>
+    </w:lvl>
+    <w:lvl w:ilvl="1" w:tplc="040E0003" w:tentative="1">
+      <w:start w:val="1"/>
+      <w:numFmt w:val="bullet"/>
+      <w:lvlText w:val="o"/>
+      <w:lvlJc w:val="left"/>
+      <w:pPr>
+        <w:ind w:left="1440" w:hanging="360"/>
+      </w:pPr>
+      <w:rPr>
+        <w:rFonts w:ascii="Courier New" w:hAnsi="Courier New" w:cs="Courier New" w:hint="default"/>
+      </w:rPr>
+    </w:lvl>
+    <w:lvl w:ilvl="2" w:tplc="040E0005" w:tentative="1">
+      <w:start w:val="1"/>
+      <w:numFmt w:val="bullet"/>
+      <w:lvlText w:val=""/>
+      <w:lvlJc w:val="left"/>
+      <w:pPr>
+        <w:ind w:left="2160" w:hanging="360"/>
+      </w:pPr>
+      <w:rPr>
+        <w:rFonts w:ascii="Wingdings" w:hAnsi="Wingdings" w:hint="default"/>
+      </w:rPr>
+    </w:lvl>
+    <w:lvl w:ilvl="3" w:tplc="040E0001" w:tentative="1">
+      <w:start w:val="1"/>
+      <w:numFmt w:val="bullet"/>
+      <w:lvlText w:val=""/>
+      <w:lvlJc w:val="left"/>
+      <w:pPr>
+        <w:ind w:left="2880" w:hanging="360"/>
+      </w:pPr>
+      <w:rPr>
+        <w:rFonts w:ascii="Symbol" w:hAnsi="Symbol" w:hint="default"/>
+      </w:rPr>
+    </w:lvl>
+    <w:lvl w:ilvl="4" w:tplc="040E0003" w:tentative="1">
+      <w:start w:val="1"/>
+      <w:numFmt w:val="bullet"/>
+      <w:lvlText w:val="o"/>
+      <w:lvlJc w:val="left"/>
+      <w:pPr>
+        <w:ind w:left="3600" w:hanging="360"/>
+      </w:pPr>
+      <w:rPr>
+        <w:rFonts w:ascii="Courier New" w:hAnsi="Courier New" w:cs="Courier New" w:hint="default"/>
+      </w:rPr>
+    </w:lvl>
+    <w:lvl w:ilvl="5" w:tplc="040E0005" w:tentative="1">
+      <w:start w:val="1"/>
+      <w:numFmt w:val="bullet"/>
+      <w:lvlText w:val=""/>
+      <w:lvlJc w:val="left"/>
+      <w:pPr>
+        <w:ind w:left="4320" w:hanging="360"/>
+      </w:pPr>
+      <w:rPr>
+        <w:rFonts w:ascii="Wingdings" w:hAnsi="Wingdings" w:hint="default"/>
+      </w:rPr>
+    </w:lvl>
+    <w:lvl w:ilvl="6" w:tplc="040E0001" w:tentative="1">
+      <w:start w:val="1"/>
+      <w:numFmt w:val="bullet"/>
+      <w:lvlText w:val=""/>
+      <w:lvlJc w:val="left"/>
+      <w:pPr>
+        <w:ind w:left="5040" w:hanging="360"/>
+      </w:pPr>
+      <w:rPr>
+        <w:rFonts w:ascii="Symbol" w:hAnsi="Symbol" w:hint="default"/>
+      </w:rPr>
+    </w:lvl>
+    <w:lvl w:ilvl="7" w:tplc="040E0003" w:tentative="1">
+      <w:start w:val="1"/>
+      <w:numFmt w:val="bullet"/>
+      <w:lvlText w:val="o"/>
+      <w:lvlJc w:val="left"/>
+      <w:pPr>
+        <w:ind w:left="5760" w:hanging="360"/>
+      </w:pPr>
+      <w:rPr>
+        <w:rFonts w:ascii="Courier New" w:hAnsi="Courier New" w:cs="Courier New" w:hint="default"/>
+      </w:rPr>
+    </w:lvl>
+    <w:lvl w:ilvl="8" w:tplc="040E0005" w:tentative="1">
+      <w:start w:val="1"/>
+      <w:numFmt w:val="bullet"/>
+      <w:lvlText w:val=""/>
+      <w:lvlJc w:val="left"/>
+      <w:pPr>
+        <w:ind w:left="6480" w:hanging="360"/>
+      </w:pPr>
+      <w:rPr>
+        <w:rFonts w:ascii="Wingdings" w:hAnsi="Wingdings" w:hint="default"/>
+      </w:rPr>
+    </w:lvl>
+  </w:abstractNum>
+  <w:abstractNum w:abstractNumId="1" w15:restartNumberingAfterBreak="0">
     <w:nsid w:val="2D6C3100"/>
     <w:multiLevelType w:val="hybridMultilevel"/>
     <w:tmpl w:val="240AE6E2"/>
@@ -5140,7 +7163,7 @@
       </w:rPr>
     </w:lvl>
   </w:abstractNum>
-  <w:abstractNum w:abstractNumId="1" w15:restartNumberingAfterBreak="0">
+  <w:abstractNum w:abstractNumId="2" w15:restartNumberingAfterBreak="0">
     <w:nsid w:val="2FAB7B65"/>
     <w:multiLevelType w:val="hybridMultilevel"/>
     <w:tmpl w:val="2F64555A"/>
@@ -5253,7 +7276,7 @@
       </w:rPr>
     </w:lvl>
   </w:abstractNum>
-  <w:abstractNum w:abstractNumId="2" w15:restartNumberingAfterBreak="0">
+  <w:abstractNum w:abstractNumId="3" w15:restartNumberingAfterBreak="0">
     <w:nsid w:val="3C1938F6"/>
     <w:multiLevelType w:val="hybridMultilevel"/>
     <w:tmpl w:val="0816ACA8"/>
@@ -5366,7 +7389,7 @@
       </w:rPr>
     </w:lvl>
   </w:abstractNum>
-  <w:abstractNum w:abstractNumId="3" w15:restartNumberingAfterBreak="0">
+  <w:abstractNum w:abstractNumId="4" w15:restartNumberingAfterBreak="0">
     <w:nsid w:val="47442E3E"/>
     <w:multiLevelType w:val="hybridMultilevel"/>
     <w:tmpl w:val="64928C38"/>
@@ -5479,7 +7502,7 @@
       </w:rPr>
     </w:lvl>
   </w:abstractNum>
-  <w:abstractNum w:abstractNumId="4" w15:restartNumberingAfterBreak="0">
+  <w:abstractNum w:abstractNumId="5" w15:restartNumberingAfterBreak="0">
     <w:nsid w:val="4CA522A2"/>
     <w:multiLevelType w:val="hybridMultilevel"/>
     <w:tmpl w:val="81762318"/>
@@ -5592,7 +7615,7 @@
       </w:rPr>
     </w:lvl>
   </w:abstractNum>
-  <w:abstractNum w:abstractNumId="5" w15:restartNumberingAfterBreak="0">
+  <w:abstractNum w:abstractNumId="6" w15:restartNumberingAfterBreak="0">
     <w:nsid w:val="5B1E66BA"/>
     <w:multiLevelType w:val="hybridMultilevel"/>
     <w:tmpl w:val="56E6462C"/>
@@ -5705,7 +7728,7 @@
       </w:rPr>
     </w:lvl>
   </w:abstractNum>
-  <w:abstractNum w:abstractNumId="6" w15:restartNumberingAfterBreak="0">
+  <w:abstractNum w:abstractNumId="7" w15:restartNumberingAfterBreak="0">
     <w:nsid w:val="69361338"/>
     <w:multiLevelType w:val="hybridMultilevel"/>
     <w:tmpl w:val="6CF0B772"/>
@@ -5818,7 +7841,7 @@
       </w:rPr>
     </w:lvl>
   </w:abstractNum>
-  <w:abstractNum w:abstractNumId="7" w15:restartNumberingAfterBreak="0">
+  <w:abstractNum w:abstractNumId="8" w15:restartNumberingAfterBreak="0">
     <w:nsid w:val="69FA5A50"/>
     <w:multiLevelType w:val="hybridMultilevel"/>
     <w:tmpl w:val="D82A6326"/>
@@ -5931,7 +7954,7 @@
       </w:rPr>
     </w:lvl>
   </w:abstractNum>
-  <w:abstractNum w:abstractNumId="8" w15:restartNumberingAfterBreak="0">
+  <w:abstractNum w:abstractNumId="9" w15:restartNumberingAfterBreak="0">
     <w:nsid w:val="6E7312B6"/>
     <w:multiLevelType w:val="hybridMultilevel"/>
     <w:tmpl w:val="FD80BAFC"/>
@@ -6044,7 +8067,7 @@
       </w:rPr>
     </w:lvl>
   </w:abstractNum>
-  <w:abstractNum w:abstractNumId="9" w15:restartNumberingAfterBreak="0">
+  <w:abstractNum w:abstractNumId="10" w15:restartNumberingAfterBreak="0">
     <w:nsid w:val="76FA296F"/>
     <w:multiLevelType w:val="hybridMultilevel"/>
     <w:tmpl w:val="6DAE32EA"/>
@@ -6157,7 +8180,7 @@
       </w:rPr>
     </w:lvl>
   </w:abstractNum>
-  <w:abstractNum w:abstractNumId="10" w15:restartNumberingAfterBreak="0">
+  <w:abstractNum w:abstractNumId="11" w15:restartNumberingAfterBreak="0">
     <w:nsid w:val="788C73B2"/>
     <w:multiLevelType w:val="hybridMultilevel"/>
     <w:tmpl w:val="6D6C60B0"/>
@@ -6270,7 +8293,7 @@
       </w:rPr>
     </w:lvl>
   </w:abstractNum>
-  <w:abstractNum w:abstractNumId="11" w15:restartNumberingAfterBreak="0">
+  <w:abstractNum w:abstractNumId="12" w15:restartNumberingAfterBreak="0">
     <w:nsid w:val="79644490"/>
     <w:multiLevelType w:val="hybridMultilevel"/>
     <w:tmpl w:val="340ACCA0"/>
@@ -6383,7 +8406,7 @@
       </w:rPr>
     </w:lvl>
   </w:abstractNum>
-  <w:abstractNum w:abstractNumId="12" w15:restartNumberingAfterBreak="0">
+  <w:abstractNum w:abstractNumId="13" w15:restartNumberingAfterBreak="0">
     <w:nsid w:val="7EB672F7"/>
     <w:multiLevelType w:val="hybridMultilevel"/>
     <w:tmpl w:val="A6F0C99C"/>
@@ -6497,43 +8520,46 @@
     </w:lvl>
   </w:abstractNum>
   <w:num w:numId="1" w16cid:durableId="1237017102">
+    <w:abstractNumId w:val="13"/>
+  </w:num>
+  <w:num w:numId="2" w16cid:durableId="23093752">
+    <w:abstractNumId w:val="9"/>
+  </w:num>
+  <w:num w:numId="3" w16cid:durableId="211231034">
+    <w:abstractNumId w:val="10"/>
+  </w:num>
+  <w:num w:numId="4" w16cid:durableId="285432383">
+    <w:abstractNumId w:val="3"/>
+  </w:num>
+  <w:num w:numId="5" w16cid:durableId="382339222">
+    <w:abstractNumId w:val="8"/>
+  </w:num>
+  <w:num w:numId="6" w16cid:durableId="1929121998">
+    <w:abstractNumId w:val="4"/>
+  </w:num>
+  <w:num w:numId="7" w16cid:durableId="989595552">
+    <w:abstractNumId w:val="11"/>
+  </w:num>
+  <w:num w:numId="8" w16cid:durableId="844437476">
+    <w:abstractNumId w:val="7"/>
+  </w:num>
+  <w:num w:numId="9" w16cid:durableId="1725445077">
+    <w:abstractNumId w:val="1"/>
+  </w:num>
+  <w:num w:numId="10" w16cid:durableId="1493132609">
+    <w:abstractNumId w:val="2"/>
+  </w:num>
+  <w:num w:numId="11" w16cid:durableId="907423889">
+    <w:abstractNumId w:val="6"/>
+  </w:num>
+  <w:num w:numId="12" w16cid:durableId="432946196">
     <w:abstractNumId w:val="12"/>
   </w:num>
-  <w:num w:numId="2" w16cid:durableId="23093752">
-    <w:abstractNumId w:val="8"/>
-  </w:num>
-  <w:num w:numId="3" w16cid:durableId="211231034">
-    <w:abstractNumId w:val="9"/>
-  </w:num>
-  <w:num w:numId="4" w16cid:durableId="285432383">
-    <w:abstractNumId w:val="2"/>
-  </w:num>
-  <w:num w:numId="5" w16cid:durableId="382339222">
-    <w:abstractNumId w:val="7"/>
-  </w:num>
-  <w:num w:numId="6" w16cid:durableId="1929121998">
-    <w:abstractNumId w:val="3"/>
-  </w:num>
-  <w:num w:numId="7" w16cid:durableId="989595552">
-    <w:abstractNumId w:val="10"/>
-  </w:num>
-  <w:num w:numId="8" w16cid:durableId="844437476">
-    <w:abstractNumId w:val="6"/>
-  </w:num>
-  <w:num w:numId="9" w16cid:durableId="1725445077">
-    <w:abstractNumId w:val="0"/>
-  </w:num>
-  <w:num w:numId="10" w16cid:durableId="1493132609">
-    <w:abstractNumId w:val="1"/>
-  </w:num>
-  <w:num w:numId="11" w16cid:durableId="907423889">
+  <w:num w:numId="13" w16cid:durableId="1030254581">
     <w:abstractNumId w:val="5"/>
   </w:num>
-  <w:num w:numId="12" w16cid:durableId="432946196">
-    <w:abstractNumId w:val="11"/>
-  </w:num>
-  <w:num w:numId="13" w16cid:durableId="1030254581">
-    <w:abstractNumId w:val="4"/>
+  <w:num w:numId="14" w16cid:durableId="1830977395">
+    <w:abstractNumId w:val="0"/>
   </w:num>
 </w:numbering>
 </file>

</xml_diff>

<commit_message>
Making TechnologyView's content and fixing the layout of SavableMusicRow
</commit_message>
<xml_diff>
--- a/documentation.docx
+++ b/documentation.docx
@@ -1,6 +1,6 @@
 
 <file path=word/document.xml><?xml version="1.0" encoding="utf-8"?>
-<w:document xmlns:wpc="http://schemas.microsoft.com/office/word/2010/wordprocessingCanvas" xmlns:cx="http://schemas.microsoft.com/office/drawing/2014/chartex" xmlns:cx1="http://schemas.microsoft.com/office/drawing/2015/9/8/chartex" xmlns:cx2="http://schemas.microsoft.com/office/drawing/2015/10/21/chartex" xmlns:cx3="http://schemas.microsoft.com/office/drawing/2016/5/9/chartex" xmlns:cx4="http://schemas.microsoft.com/office/drawing/2016/5/10/chartex" xmlns:cx5="http://schemas.microsoft.com/office/drawing/2016/5/11/chartex" xmlns:cx6="http://schemas.microsoft.com/office/drawing/2016/5/12/chartex" xmlns:cx7="http://schemas.microsoft.com/office/drawing/2016/5/13/chartex" xmlns:cx8="http://schemas.microsoft.com/office/drawing/2016/5/14/chartex" xmlns:mc="http://schemas.openxmlformats.org/markup-compatibility/2006" xmlns:aink="http://schemas.microsoft.com/office/drawing/2016/ink" xmlns:am3d="http://schemas.microsoft.com/office/drawing/2017/model3d" xmlns:o="urn:schemas-microsoft-com:office:office" xmlns:r="http://schemas.openxmlformats.org/officeDocument/2006/relationships" xmlns:m="http://schemas.openxmlformats.org/officeDocument/2006/math" xmlns:v="urn:schemas-microsoft-com:vml" xmlns:wp14="http://schemas.microsoft.com/office/word/2010/wordprocessingDrawing" xmlns:wp="http://schemas.openxmlformats.org/drawingml/2006/wordprocessingDrawing" xmlns:w10="urn:schemas-microsoft-com:office:word" xmlns:w="http://schemas.openxmlformats.org/wordprocessingml/2006/main" xmlns:w14="http://schemas.microsoft.com/office/word/2010/wordml" xmlns:w15="http://schemas.microsoft.com/office/word/2012/wordml" xmlns:w16cid="http://schemas.microsoft.com/office/word/2016/wordml/cid" xmlns:w16se="http://schemas.microsoft.com/office/word/2015/wordml/symex" xmlns:wpg="http://schemas.microsoft.com/office/word/2010/wordprocessingGroup" xmlns:wpi="http://schemas.microsoft.com/office/word/2010/wordprocessingInk" xmlns:wne="http://schemas.microsoft.com/office/word/2006/wordml" xmlns:wps="http://schemas.microsoft.com/office/word/2010/wordprocessingShape" mc:Ignorable="w14 w15 w16se w16cid wp14">
+<w:document xmlns:wpc="http://schemas.microsoft.com/office/word/2010/wordprocessingCanvas" xmlns:cx="http://schemas.microsoft.com/office/drawing/2014/chartex" xmlns:cx1="http://schemas.microsoft.com/office/drawing/2015/9/8/chartex" xmlns:cx2="http://schemas.microsoft.com/office/drawing/2015/10/21/chartex" xmlns:cx3="http://schemas.microsoft.com/office/drawing/2016/5/9/chartex" xmlns:cx4="http://schemas.microsoft.com/office/drawing/2016/5/10/chartex" xmlns:cx5="http://schemas.microsoft.com/office/drawing/2016/5/11/chartex" xmlns:cx6="http://schemas.microsoft.com/office/drawing/2016/5/12/chartex" xmlns:cx7="http://schemas.microsoft.com/office/drawing/2016/5/13/chartex" xmlns:cx8="http://schemas.microsoft.com/office/drawing/2016/5/14/chartex" xmlns:mc="http://schemas.openxmlformats.org/markup-compatibility/2006" xmlns:aink="http://schemas.microsoft.com/office/drawing/2016/ink" xmlns:am3d="http://schemas.microsoft.com/office/drawing/2017/model3d" xmlns:o="urn:schemas-microsoft-com:office:office" xmlns:oel="http://schemas.microsoft.com/office/2019/extlst" xmlns:r="http://schemas.openxmlformats.org/officeDocument/2006/relationships" xmlns:m="http://schemas.openxmlformats.org/officeDocument/2006/math" xmlns:v="urn:schemas-microsoft-com:vml" xmlns:wp14="http://schemas.microsoft.com/office/word/2010/wordprocessingDrawing" xmlns:wp="http://schemas.openxmlformats.org/drawingml/2006/wordprocessingDrawing" xmlns:w10="urn:schemas-microsoft-com:office:word" xmlns:w="http://schemas.openxmlformats.org/wordprocessingml/2006/main" xmlns:w14="http://schemas.microsoft.com/office/word/2010/wordml" xmlns:w15="http://schemas.microsoft.com/office/word/2012/wordml" xmlns:w16cex="http://schemas.microsoft.com/office/word/2018/wordml/cex" xmlns:w16cid="http://schemas.microsoft.com/office/word/2016/wordml/cid" xmlns:w16="http://schemas.microsoft.com/office/word/2018/wordml" xmlns:w16du="http://schemas.microsoft.com/office/word/2023/wordml/word16du" xmlns:w16sdtdh="http://schemas.microsoft.com/office/word/2020/wordml/sdtdatahash" xmlns:w16sdtfl="http://schemas.microsoft.com/office/word/2024/wordml/sdtformatlock" xmlns:w16se="http://schemas.microsoft.com/office/word/2015/wordml/symex" xmlns:wpg="http://schemas.microsoft.com/office/word/2010/wordprocessingGroup" xmlns:wpi="http://schemas.microsoft.com/office/word/2010/wordprocessingInk" xmlns:wne="http://schemas.microsoft.com/office/word/2006/wordml" xmlns:wps="http://schemas.microsoft.com/office/word/2010/wordprocessingShape" mc:Ignorable="w14 w15 w16se w16cid w16 w16cex w16sdtdh w16sdtfl w16du wp14">
   <w:body>
     <w:p>
       <w:pPr>
@@ -40,29 +40,27 @@
           <w:sz w:val="40"/>
           <w:szCs w:val="40"/>
         </w:rPr>
-        <w:t xml:space="preserve">Alkalmazás neve: </w:t>
-      </w:r>
-      <w:proofErr w:type="spellStart"/>
-      <w:r>
+        <w:t>Alkalmazás neve: BláthyFM</w:t>
+      </w:r>
+    </w:p>
+    <w:p>
+      <w:pPr>
         <w:rPr>
           <w:rFonts w:ascii="Times New Roman" w:hAnsi="Times New Roman" w:cs="Times New Roman"/>
           <w:bCs/>
           <w:sz w:val="40"/>
           <w:szCs w:val="40"/>
         </w:rPr>
-        <w:t>BláthyFM</w:t>
-      </w:r>
-      <w:proofErr w:type="spellEnd"/>
-    </w:p>
-    <w:p>
-      <w:pPr>
+      </w:pPr>
+      <w:r>
         <w:rPr>
           <w:rFonts w:ascii="Times New Roman" w:hAnsi="Times New Roman" w:cs="Times New Roman"/>
           <w:bCs/>
           <w:sz w:val="40"/>
           <w:szCs w:val="40"/>
         </w:rPr>
-      </w:pPr>
+        <w:t>Tagok:</w:t>
+      </w:r>
       <w:r>
         <w:rPr>
           <w:rFonts w:ascii="Times New Roman" w:hAnsi="Times New Roman" w:cs="Times New Roman"/>
@@ -70,18 +68,19 @@
           <w:sz w:val="40"/>
           <w:szCs w:val="40"/>
         </w:rPr>
-        <w:t>Tagok:</w:t>
-      </w:r>
-      <w:r>
+        <w:t xml:space="preserve"> Susán Csongor, El-Nabulsy Csongor Alan</w:t>
+      </w:r>
+    </w:p>
+    <w:p>
+      <w:pPr>
+        <w:spacing w:after="960"/>
         <w:rPr>
           <w:rFonts w:ascii="Times New Roman" w:hAnsi="Times New Roman" w:cs="Times New Roman"/>
           <w:bCs/>
           <w:sz w:val="40"/>
           <w:szCs w:val="40"/>
         </w:rPr>
-        <w:t xml:space="preserve"> Susán Csongor, El-</w:t>
-      </w:r>
-      <w:proofErr w:type="spellStart"/>
+      </w:pPr>
       <w:r>
         <w:rPr>
           <w:rFonts w:ascii="Times New Roman" w:hAnsi="Times New Roman" w:cs="Times New Roman"/>
@@ -89,57 +88,7 @@
           <w:sz w:val="40"/>
           <w:szCs w:val="40"/>
         </w:rPr>
-        <w:t>Nabulsy</w:t>
-      </w:r>
-      <w:proofErr w:type="spellEnd"/>
-      <w:r>
-        <w:rPr>
-          <w:rFonts w:ascii="Times New Roman" w:hAnsi="Times New Roman" w:cs="Times New Roman"/>
-          <w:bCs/>
-          <w:sz w:val="40"/>
-          <w:szCs w:val="40"/>
-        </w:rPr>
-        <w:t xml:space="preserve"> Csongor Alan</w:t>
-      </w:r>
-    </w:p>
-    <w:p>
-      <w:pPr>
-        <w:spacing w:after="960"/>
-        <w:rPr>
-          <w:rFonts w:ascii="Times New Roman" w:hAnsi="Times New Roman" w:cs="Times New Roman"/>
-          <w:bCs/>
-          <w:sz w:val="40"/>
-          <w:szCs w:val="40"/>
-        </w:rPr>
-      </w:pPr>
-      <w:r>
-        <w:rPr>
-          <w:rFonts w:ascii="Times New Roman" w:hAnsi="Times New Roman" w:cs="Times New Roman"/>
-          <w:bCs/>
-          <w:sz w:val="40"/>
-          <w:szCs w:val="40"/>
-        </w:rPr>
-        <w:t>Az alkalmazás célja az, hogy a Bláthy-</w:t>
-      </w:r>
-      <w:proofErr w:type="spellStart"/>
-      <w:r>
-        <w:rPr>
-          <w:rFonts w:ascii="Times New Roman" w:hAnsi="Times New Roman" w:cs="Times New Roman"/>
-          <w:bCs/>
-          <w:sz w:val="40"/>
-          <w:szCs w:val="40"/>
-        </w:rPr>
-        <w:t>ba</w:t>
-      </w:r>
-      <w:proofErr w:type="spellEnd"/>
-      <w:r>
-        <w:rPr>
-          <w:rFonts w:ascii="Times New Roman" w:hAnsi="Times New Roman" w:cs="Times New Roman"/>
-          <w:bCs/>
-          <w:sz w:val="40"/>
-          <w:szCs w:val="40"/>
-        </w:rPr>
-        <w:t xml:space="preserve"> járó diákok előre meghatározott szünetekben kedvenc zenéjüket tudják majd hallgatni anélkül, hogy nekik kelljen azt maguknak vagy másoknak lejátszani. Ráadásul az, hogy az iskola az ő zenéjüket játssza, akár egy általuk kijelölt időpontban (ezt üzenetben írhatják le), még több élményt ad, és azt az érzést, hogy a zenéjük – és ezzel együtt önmaguk is – meg van becsülve.</w:t>
+        <w:t>Az alkalmazás célja az, hogy a Bláthy-ba járó diákok előre meghatározott szünetekben kedvenc zenéjüket tudják majd hallgatni anélkül, hogy nekik kelljen azt maguknak vagy másoknak lejátszani. Ráadásul az, hogy az iskola az ő zenéjüket játssza, akár egy általuk kijelölt időpontban (ezt üzenetben írhatják le), még több élményt ad, és azt az érzést, hogy a zenéjük – és ezzel együtt önmaguk is – meg van becsülve.</w:t>
       </w:r>
     </w:p>
     <w:p>
@@ -612,25 +561,7 @@
           <w:sz w:val="36"/>
           <w:szCs w:val="36"/>
         </w:rPr>
-        <w:t xml:space="preserve">Az alkalmazás fejlesztését tartalmazó dokumentáció elkezdése, vizsgafeltételek tanulmányozása, a projektet tároló </w:t>
-      </w:r>
-      <w:proofErr w:type="spellStart"/>
-      <w:r>
-        <w:rPr>
-          <w:rFonts w:ascii="Times New Roman" w:hAnsi="Times New Roman" w:cs="Times New Roman"/>
-          <w:sz w:val="36"/>
-          <w:szCs w:val="36"/>
-        </w:rPr>
-        <w:t>repository</w:t>
-      </w:r>
-      <w:proofErr w:type="spellEnd"/>
-      <w:r>
-        <w:rPr>
-          <w:rFonts w:ascii="Times New Roman" w:hAnsi="Times New Roman" w:cs="Times New Roman"/>
-          <w:sz w:val="36"/>
-          <w:szCs w:val="36"/>
-        </w:rPr>
-        <w:t xml:space="preserve"> létrehozása, teszteknek külön dokumentáció létrehozása.</w:t>
+        <w:t>Az alkalmazás fejlesztését tartalmazó dokumentáció elkezdése, vizsgafeltételek tanulmányozása, a projektet tároló repository létrehozása, teszteknek külön dokumentáció létrehozása.</w:t>
       </w:r>
     </w:p>
     <w:p>
@@ -1298,7 +1229,7 @@
           <w:szCs w:val="36"/>
         </w:rPr>
         <w:drawing>
-          <wp:inline distT="0" distB="0" distL="0" distR="0" wp14:anchorId="78A43544" wp14:editId="6EBE2D2F">
+          <wp:inline distT="0" distB="0" distL="0" distR="0" wp14:anchorId="78A43544" wp14:editId="422E0478">
             <wp:extent cx="3166535" cy="1781175"/>
             <wp:effectExtent l="0" t="0" r="0" b="0"/>
             <wp:docPr id="3" name="Kép 3" descr="C:\Users\elnabulsy.csongor\AppData\Local\Microsoft\Windows\INetCache\Content.MSO\F75754B3.tmp"/>
@@ -1390,7 +1321,7 @@
           <w:szCs w:val="36"/>
         </w:rPr>
         <w:drawing>
-          <wp:inline distT="0" distB="0" distL="0" distR="0" wp14:anchorId="4E211814" wp14:editId="4E09F30E">
+          <wp:inline distT="0" distB="0" distL="0" distR="0" wp14:anchorId="4E211814" wp14:editId="433422F6">
             <wp:extent cx="3133725" cy="1762720"/>
             <wp:effectExtent l="0" t="0" r="0" b="9525"/>
             <wp:docPr id="4" name="Kép 4" descr="C:\Users\elnabulsy.csongor\Downloads\ui_main_student.png"/>
@@ -1472,7 +1403,7 @@
           <w:szCs w:val="36"/>
         </w:rPr>
         <w:drawing>
-          <wp:inline distT="0" distB="0" distL="0" distR="0" wp14:anchorId="5137FB78" wp14:editId="685633B1">
+          <wp:inline distT="0" distB="0" distL="0" distR="0" wp14:anchorId="5137FB78" wp14:editId="47F954B9">
             <wp:extent cx="3166110" cy="1780938"/>
             <wp:effectExtent l="0" t="0" r="0" b="0"/>
             <wp:docPr id="5" name="Kép 5" descr="C:\Users\elnabulsy.csongor\Downloads\ui_main_scheduler.png"/>
@@ -1529,41 +1460,13 @@
           <w:szCs w:val="36"/>
         </w:rPr>
       </w:pPr>
-      <w:proofErr w:type="spellStart"/>
-      <w:r>
-        <w:rPr>
-          <w:rFonts w:ascii="Times New Roman" w:eastAsia="Times New Roman" w:hAnsi="Times New Roman" w:cs="Times New Roman"/>
-          <w:sz w:val="36"/>
-          <w:szCs w:val="36"/>
-        </w:rPr>
-        <w:t>Főképernyő</w:t>
-      </w:r>
-      <w:proofErr w:type="spellEnd"/>
-      <w:r>
-        <w:rPr>
-          <w:rFonts w:ascii="Times New Roman" w:eastAsia="Times New Roman" w:hAnsi="Times New Roman" w:cs="Times New Roman"/>
-          <w:sz w:val="36"/>
-          <w:szCs w:val="36"/>
-        </w:rPr>
-        <w:t xml:space="preserve"> </w:t>
-      </w:r>
-      <w:proofErr w:type="spellStart"/>
-      <w:r>
-        <w:rPr>
-          <w:rFonts w:ascii="Times New Roman" w:eastAsia="Times New Roman" w:hAnsi="Times New Roman" w:cs="Times New Roman"/>
-          <w:sz w:val="36"/>
-          <w:szCs w:val="36"/>
-        </w:rPr>
-        <w:t>admin</w:t>
-      </w:r>
-      <w:proofErr w:type="spellEnd"/>
-      <w:r>
-        <w:rPr>
-          <w:rFonts w:ascii="Times New Roman" w:eastAsia="Times New Roman" w:hAnsi="Times New Roman" w:cs="Times New Roman"/>
-          <w:sz w:val="36"/>
-          <w:szCs w:val="36"/>
-        </w:rPr>
-        <w:t xml:space="preserve"> ranggal:</w:t>
+      <w:r>
+        <w:rPr>
+          <w:rFonts w:ascii="Times New Roman" w:eastAsia="Times New Roman" w:hAnsi="Times New Roman" w:cs="Times New Roman"/>
+          <w:sz w:val="36"/>
+          <w:szCs w:val="36"/>
+        </w:rPr>
+        <w:t>Főképernyő admin ranggal:</w:t>
       </w:r>
     </w:p>
     <w:p>
@@ -1593,7 +1496,7 @@
           <w:szCs w:val="36"/>
         </w:rPr>
         <w:drawing>
-          <wp:inline distT="0" distB="0" distL="0" distR="0" wp14:anchorId="27EC1C67" wp14:editId="404669D0">
+          <wp:inline distT="0" distB="0" distL="0" distR="0" wp14:anchorId="27EC1C67" wp14:editId="3AF0EE78">
             <wp:extent cx="3055620" cy="1718786"/>
             <wp:effectExtent l="0" t="0" r="0" b="0"/>
             <wp:docPr id="6" name="Kép 6" descr="C:\Users\elnabulsy.csongor\Downloads\ui_main_admin.png"/>
@@ -1675,7 +1578,7 @@
           <w:szCs w:val="36"/>
         </w:rPr>
         <w:drawing>
-          <wp:inline distT="0" distB="0" distL="0" distR="0" wp14:anchorId="08225B4F" wp14:editId="743C16DF">
+          <wp:inline distT="0" distB="0" distL="0" distR="0" wp14:anchorId="08225B4F" wp14:editId="40C40497">
             <wp:extent cx="2933700" cy="1942430"/>
             <wp:effectExtent l="0" t="0" r="0" b="1270"/>
             <wp:docPr id="7" name="Kép 7" descr="C:\Users\elnabulsy.csongor\Downloads\ui_structure.png"/>
@@ -1848,7 +1751,7 @@
           <w:szCs w:val="36"/>
         </w:rPr>
         <w:drawing>
-          <wp:inline distT="0" distB="0" distL="0" distR="0" wp14:anchorId="2C256DB5" wp14:editId="43FA4BD6">
+          <wp:inline distT="0" distB="0" distL="0" distR="0" wp14:anchorId="2C256DB5" wp14:editId="1A516CB4">
             <wp:extent cx="3329940" cy="1752493"/>
             <wp:effectExtent l="0" t="0" r="3810" b="635"/>
             <wp:docPr id="9" name="Kép 9"/>
@@ -2019,25 +1922,7 @@
           <w:sz w:val="36"/>
           <w:szCs w:val="36"/>
         </w:rPr>
-        <w:t xml:space="preserve">Az </w:t>
-      </w:r>
-      <w:proofErr w:type="spellStart"/>
-      <w:r>
-        <w:rPr>
-          <w:rFonts w:ascii="Times New Roman" w:eastAsia="Times New Roman" w:hAnsi="Times New Roman" w:cs="Times New Roman"/>
-          <w:sz w:val="36"/>
-          <w:szCs w:val="36"/>
-        </w:rPr>
-        <w:t>admin</w:t>
-      </w:r>
-      <w:proofErr w:type="spellEnd"/>
-      <w:r>
-        <w:rPr>
-          <w:rFonts w:ascii="Times New Roman" w:eastAsia="Times New Roman" w:hAnsi="Times New Roman" w:cs="Times New Roman"/>
-          <w:sz w:val="36"/>
-          <w:szCs w:val="36"/>
-        </w:rPr>
-        <w:t xml:space="preserve"> UI oldal megtervezése digitális </w:t>
+        <w:t xml:space="preserve">Az admin UI oldal megtervezése digitális </w:t>
       </w:r>
       <w:r>
         <w:rPr>
@@ -2056,23 +1941,13 @@
           <w:szCs w:val="36"/>
         </w:rPr>
       </w:pPr>
-      <w:proofErr w:type="spellStart"/>
-      <w:r>
-        <w:rPr>
-          <w:rFonts w:ascii="Times New Roman" w:eastAsia="Times New Roman" w:hAnsi="Times New Roman" w:cs="Times New Roman"/>
-          <w:sz w:val="36"/>
-          <w:szCs w:val="36"/>
-        </w:rPr>
-        <w:t>Admin</w:t>
-      </w:r>
-      <w:proofErr w:type="spellEnd"/>
-      <w:r>
-        <w:rPr>
-          <w:rFonts w:ascii="Times New Roman" w:eastAsia="Times New Roman" w:hAnsi="Times New Roman" w:cs="Times New Roman"/>
-          <w:sz w:val="36"/>
-          <w:szCs w:val="36"/>
-        </w:rPr>
-        <w:t xml:space="preserve"> oldal:</w:t>
+      <w:r>
+        <w:rPr>
+          <w:rFonts w:ascii="Times New Roman" w:eastAsia="Times New Roman" w:hAnsi="Times New Roman" w:cs="Times New Roman"/>
+          <w:sz w:val="36"/>
+          <w:szCs w:val="36"/>
+        </w:rPr>
+        <w:t>Admin oldal:</w:t>
       </w:r>
     </w:p>
     <w:p>
@@ -2306,42 +2181,15 @@
           <w:sz w:val="36"/>
           <w:szCs w:val="36"/>
         </w:rPr>
-        <w:t xml:space="preserve">, </w:t>
-      </w:r>
-      <w:proofErr w:type="spellStart"/>
-      <w:r>
-        <w:rPr>
-          <w:rFonts w:ascii="Times New Roman" w:eastAsia="Times New Roman" w:hAnsi="Times New Roman" w:cs="Times New Roman"/>
-          <w:sz w:val="36"/>
-          <w:szCs w:val="36"/>
-        </w:rPr>
-        <w:t>Vue</w:t>
-      </w:r>
-      <w:proofErr w:type="spellEnd"/>
-      <w:r>
-        <w:rPr>
-          <w:rFonts w:ascii="Times New Roman" w:eastAsia="Times New Roman" w:hAnsi="Times New Roman" w:cs="Times New Roman"/>
-          <w:sz w:val="36"/>
-          <w:szCs w:val="36"/>
-        </w:rPr>
-        <w:t xml:space="preserve"> router</w:t>
-      </w:r>
-      <w:r>
-        <w:rPr>
-          <w:rFonts w:ascii="Times New Roman" w:eastAsia="Times New Roman" w:hAnsi="Times New Roman" w:cs="Times New Roman"/>
-          <w:sz w:val="36"/>
-          <w:szCs w:val="36"/>
-        </w:rPr>
-        <w:t xml:space="preserve">) létrehozása </w:t>
-      </w:r>
-      <w:proofErr w:type="spellStart"/>
-      <w:r>
-        <w:rPr>
-          <w:rFonts w:ascii="Times New Roman" w:eastAsia="Times New Roman" w:hAnsi="Times New Roman" w:cs="Times New Roman"/>
-          <w:sz w:val="36"/>
-          <w:szCs w:val="36"/>
-        </w:rPr>
-        <w:t>frontend</w:t>
+        <w:t>, Vue router</w:t>
+      </w:r>
+      <w:r>
+        <w:rPr>
+          <w:rFonts w:ascii="Times New Roman" w:eastAsia="Times New Roman" w:hAnsi="Times New Roman" w:cs="Times New Roman"/>
+          <w:sz w:val="36"/>
+          <w:szCs w:val="36"/>
+        </w:rPr>
+        <w:t>) létrehozása frontend</w:t>
       </w:r>
       <w:r>
         <w:rPr>
@@ -2351,7 +2199,6 @@
         </w:rPr>
         <w:t>Part</w:t>
       </w:r>
-      <w:proofErr w:type="spellEnd"/>
       <w:r>
         <w:rPr>
           <w:rFonts w:ascii="Times New Roman" w:eastAsia="Times New Roman" w:hAnsi="Times New Roman" w:cs="Times New Roman"/>
@@ -2404,23 +2251,13 @@
           <w:szCs w:val="36"/>
         </w:rPr>
       </w:pPr>
-      <w:proofErr w:type="spellStart"/>
-      <w:r>
-        <w:rPr>
-          <w:rFonts w:ascii="Times New Roman" w:eastAsia="Times New Roman" w:hAnsi="Times New Roman" w:cs="Times New Roman"/>
-          <w:sz w:val="36"/>
-          <w:szCs w:val="36"/>
-        </w:rPr>
-        <w:t>route</w:t>
-      </w:r>
-      <w:proofErr w:type="spellEnd"/>
-      <w:r>
-        <w:rPr>
-          <w:rFonts w:ascii="Times New Roman" w:eastAsia="Times New Roman" w:hAnsi="Times New Roman" w:cs="Times New Roman"/>
-          <w:sz w:val="36"/>
-          <w:szCs w:val="36"/>
-        </w:rPr>
-        <w:t>-ok definiálása</w:t>
+      <w:r>
+        <w:rPr>
+          <w:rFonts w:ascii="Times New Roman" w:eastAsia="Times New Roman" w:hAnsi="Times New Roman" w:cs="Times New Roman"/>
+          <w:sz w:val="36"/>
+          <w:szCs w:val="36"/>
+        </w:rPr>
+        <w:t>route-ok definiálása</w:t>
       </w:r>
     </w:p>
     <w:p>
@@ -2436,34 +2273,14 @@
           <w:szCs w:val="36"/>
         </w:rPr>
       </w:pPr>
-      <w:proofErr w:type="spellStart"/>
-      <w:r>
-        <w:rPr>
-          <w:rFonts w:ascii="Times New Roman" w:eastAsia="Times New Roman" w:hAnsi="Times New Roman" w:cs="Times New Roman"/>
-          <w:sz w:val="36"/>
-          <w:szCs w:val="36"/>
-        </w:rPr>
-        <w:t>header</w:t>
-      </w:r>
-      <w:proofErr w:type="spellEnd"/>
-      <w:r>
-        <w:rPr>
-          <w:rFonts w:ascii="Times New Roman" w:eastAsia="Times New Roman" w:hAnsi="Times New Roman" w:cs="Times New Roman"/>
-          <w:sz w:val="36"/>
-          <w:szCs w:val="36"/>
-        </w:rPr>
-        <w:t xml:space="preserve"> és </w:t>
-      </w:r>
-      <w:proofErr w:type="spellStart"/>
-      <w:r>
-        <w:rPr>
-          <w:rFonts w:ascii="Times New Roman" w:eastAsia="Times New Roman" w:hAnsi="Times New Roman" w:cs="Times New Roman"/>
-          <w:sz w:val="36"/>
-          <w:szCs w:val="36"/>
-        </w:rPr>
-        <w:t>footer</w:t>
-      </w:r>
-      <w:proofErr w:type="spellEnd"/>
+      <w:r>
+        <w:rPr>
+          <w:rFonts w:ascii="Times New Roman" w:eastAsia="Times New Roman" w:hAnsi="Times New Roman" w:cs="Times New Roman"/>
+          <w:sz w:val="36"/>
+          <w:szCs w:val="36"/>
+        </w:rPr>
+        <w:t>header és footer</w:t>
+      </w:r>
       <w:r>
         <w:rPr>
           <w:rFonts w:ascii="Times New Roman" w:eastAsia="Times New Roman" w:hAnsi="Times New Roman" w:cs="Times New Roman"/>
@@ -2494,41 +2311,13 @@
           <w:szCs w:val="36"/>
         </w:rPr>
       </w:pPr>
-      <w:proofErr w:type="spellStart"/>
-      <w:r>
-        <w:rPr>
-          <w:rFonts w:ascii="Times New Roman" w:eastAsia="Times New Roman" w:hAnsi="Times New Roman" w:cs="Times New Roman"/>
-          <w:sz w:val="36"/>
-          <w:szCs w:val="36"/>
-        </w:rPr>
-        <w:t>header</w:t>
-      </w:r>
-      <w:proofErr w:type="spellEnd"/>
-      <w:r>
-        <w:rPr>
-          <w:rFonts w:ascii="Times New Roman" w:eastAsia="Times New Roman" w:hAnsi="Times New Roman" w:cs="Times New Roman"/>
-          <w:sz w:val="36"/>
-          <w:szCs w:val="36"/>
-        </w:rPr>
-        <w:t>-main-</w:t>
-      </w:r>
-      <w:proofErr w:type="spellStart"/>
-      <w:r>
-        <w:rPr>
-          <w:rFonts w:ascii="Times New Roman" w:eastAsia="Times New Roman" w:hAnsi="Times New Roman" w:cs="Times New Roman"/>
-          <w:sz w:val="36"/>
-          <w:szCs w:val="36"/>
-        </w:rPr>
-        <w:t>footer</w:t>
-      </w:r>
-      <w:proofErr w:type="spellEnd"/>
-      <w:r>
-        <w:rPr>
-          <w:rFonts w:ascii="Times New Roman" w:eastAsia="Times New Roman" w:hAnsi="Times New Roman" w:cs="Times New Roman"/>
-          <w:sz w:val="36"/>
-          <w:szCs w:val="36"/>
-        </w:rPr>
-        <w:t>-struktúra létrehozása</w:t>
+      <w:r>
+        <w:rPr>
+          <w:rFonts w:ascii="Times New Roman" w:eastAsia="Times New Roman" w:hAnsi="Times New Roman" w:cs="Times New Roman"/>
+          <w:sz w:val="36"/>
+          <w:szCs w:val="36"/>
+        </w:rPr>
+        <w:t>header-main-footer-struktúra létrehozása</w:t>
       </w:r>
     </w:p>
     <w:p>
@@ -2568,25 +2357,7 @@
           <w:sz w:val="36"/>
           <w:szCs w:val="36"/>
         </w:rPr>
-        <w:t>A projektet El-</w:t>
-      </w:r>
-      <w:proofErr w:type="spellStart"/>
-      <w:r>
-        <w:rPr>
-          <w:rFonts w:ascii="Times New Roman" w:eastAsia="Times New Roman" w:hAnsi="Times New Roman" w:cs="Times New Roman"/>
-          <w:sz w:val="36"/>
-          <w:szCs w:val="36"/>
-        </w:rPr>
-        <w:t>Nabulsy</w:t>
-      </w:r>
-      <w:proofErr w:type="spellEnd"/>
-      <w:r>
-        <w:rPr>
-          <w:rFonts w:ascii="Times New Roman" w:eastAsia="Times New Roman" w:hAnsi="Times New Roman" w:cs="Times New Roman"/>
-          <w:sz w:val="36"/>
-          <w:szCs w:val="36"/>
-        </w:rPr>
-        <w:t xml:space="preserve"> Csongor hozta létre és írta meg a kódját, a működéshez szükséges folyamatábrákat, az adatbázis ER-diagramját</w:t>
+        <w:t>A projektet El-Nabulsy Csongor hozta létre és írta meg a kódját, a működéshez szükséges folyamatábrákat, az adatbázis ER-diagramját</w:t>
       </w:r>
       <w:r>
         <w:rPr>
@@ -2669,25 +2440,7 @@
           <w:sz w:val="36"/>
           <w:szCs w:val="36"/>
         </w:rPr>
-        <w:t xml:space="preserve">(Susán Csongor) A </w:t>
-      </w:r>
-      <w:proofErr w:type="spellStart"/>
-      <w:r>
-        <w:rPr>
-          <w:rFonts w:ascii="Times New Roman" w:eastAsia="Times New Roman" w:hAnsi="Times New Roman" w:cs="Times New Roman"/>
-          <w:sz w:val="36"/>
-          <w:szCs w:val="36"/>
-        </w:rPr>
-        <w:t>frontendPart</w:t>
-      </w:r>
-      <w:proofErr w:type="spellEnd"/>
-      <w:r>
-        <w:rPr>
-          <w:rFonts w:ascii="Times New Roman" w:eastAsia="Times New Roman" w:hAnsi="Times New Roman" w:cs="Times New Roman"/>
-          <w:sz w:val="36"/>
-          <w:szCs w:val="36"/>
-        </w:rPr>
-        <w:t xml:space="preserve"> projekt átnézése, stílus hi</w:t>
+        <w:t>(Susán Csongor) A frontendPart projekt átnézése, stílus hi</w:t>
       </w:r>
       <w:r>
         <w:rPr>
@@ -2798,25 +2551,7 @@
           <w:sz w:val="36"/>
           <w:szCs w:val="36"/>
         </w:rPr>
-        <w:t>(El-</w:t>
-      </w:r>
-      <w:proofErr w:type="spellStart"/>
-      <w:r>
-        <w:rPr>
-          <w:rFonts w:ascii="Times New Roman" w:eastAsia="Times New Roman" w:hAnsi="Times New Roman" w:cs="Times New Roman"/>
-          <w:sz w:val="36"/>
-          <w:szCs w:val="36"/>
-        </w:rPr>
-        <w:t>Nabulsy</w:t>
-      </w:r>
-      <w:proofErr w:type="spellEnd"/>
-      <w:r>
-        <w:rPr>
-          <w:rFonts w:ascii="Times New Roman" w:eastAsia="Times New Roman" w:hAnsi="Times New Roman" w:cs="Times New Roman"/>
-          <w:sz w:val="36"/>
-          <w:szCs w:val="36"/>
-        </w:rPr>
-        <w:t xml:space="preserve"> Csongor Alan</w:t>
+        <w:t>(El-Nabulsy Csongor Alan</w:t>
       </w:r>
       <w:r>
         <w:rPr>
@@ -2840,25 +2575,7 @@
           <w:sz w:val="36"/>
           <w:szCs w:val="36"/>
         </w:rPr>
-        <w:t xml:space="preserve"> (El-</w:t>
-      </w:r>
-      <w:proofErr w:type="spellStart"/>
-      <w:r>
-        <w:rPr>
-          <w:rFonts w:ascii="Times New Roman" w:eastAsia="Times New Roman" w:hAnsi="Times New Roman" w:cs="Times New Roman"/>
-          <w:sz w:val="36"/>
-          <w:szCs w:val="36"/>
-        </w:rPr>
-        <w:t>Nabulsy</w:t>
-      </w:r>
-      <w:proofErr w:type="spellEnd"/>
-      <w:r>
-        <w:rPr>
-          <w:rFonts w:ascii="Times New Roman" w:eastAsia="Times New Roman" w:hAnsi="Times New Roman" w:cs="Times New Roman"/>
-          <w:sz w:val="36"/>
-          <w:szCs w:val="36"/>
-        </w:rPr>
-        <w:t xml:space="preserve">: főoldal és annak </w:t>
+        <w:t xml:space="preserve"> (El-Nabulsy: főoldal és annak </w:t>
       </w:r>
       <w:r>
         <w:rPr>
@@ -2874,25 +2591,7 @@
           <w:sz w:val="36"/>
           <w:szCs w:val="36"/>
         </w:rPr>
-        <w:t xml:space="preserve">variánsa, Susán: login befejezése és </w:t>
-      </w:r>
-      <w:proofErr w:type="spellStart"/>
-      <w:r>
-        <w:rPr>
-          <w:rFonts w:ascii="Times New Roman" w:eastAsia="Times New Roman" w:hAnsi="Times New Roman" w:cs="Times New Roman"/>
-          <w:sz w:val="36"/>
-          <w:szCs w:val="36"/>
-        </w:rPr>
-        <w:t>admin</w:t>
-      </w:r>
-      <w:proofErr w:type="spellEnd"/>
-      <w:r>
-        <w:rPr>
-          <w:rFonts w:ascii="Times New Roman" w:eastAsia="Times New Roman" w:hAnsi="Times New Roman" w:cs="Times New Roman"/>
-          <w:sz w:val="36"/>
-          <w:szCs w:val="36"/>
-        </w:rPr>
-        <w:t xml:space="preserve"> elkezdése, valamint a logika kidolgozásának megkezdése</w:t>
+        <w:t>variánsa, Susán: login befejezése és admin elkezdése, valamint a logika kidolgozásának megkezdése</w:t>
       </w:r>
       <w:r>
         <w:rPr>
@@ -2956,25 +2655,7 @@
           <w:sz w:val="36"/>
           <w:szCs w:val="36"/>
         </w:rPr>
-        <w:t>(El-</w:t>
-      </w:r>
-      <w:proofErr w:type="spellStart"/>
-      <w:r>
-        <w:rPr>
-          <w:rFonts w:ascii="Times New Roman" w:eastAsia="Times New Roman" w:hAnsi="Times New Roman" w:cs="Times New Roman"/>
-          <w:sz w:val="36"/>
-          <w:szCs w:val="36"/>
-        </w:rPr>
-        <w:t>Nabulsy</w:t>
-      </w:r>
-      <w:proofErr w:type="spellEnd"/>
-      <w:r>
-        <w:rPr>
-          <w:rFonts w:ascii="Times New Roman" w:eastAsia="Times New Roman" w:hAnsi="Times New Roman" w:cs="Times New Roman"/>
-          <w:sz w:val="36"/>
-          <w:szCs w:val="36"/>
-        </w:rPr>
-        <w:t xml:space="preserve"> Csongor Alan) A zenebekérő oldal </w:t>
+        <w:t xml:space="preserve">(El-Nabulsy Csongor Alan) A zenebekérő oldal </w:t>
       </w:r>
       <w:r>
         <w:rPr>
@@ -3029,79 +2710,7 @@
           <w:sz w:val="36"/>
           <w:szCs w:val="36"/>
         </w:rPr>
-        <w:t>(El-</w:t>
-      </w:r>
-      <w:proofErr w:type="spellStart"/>
-      <w:r>
-        <w:rPr>
-          <w:rFonts w:ascii="Times New Roman" w:eastAsia="Times New Roman" w:hAnsi="Times New Roman" w:cs="Times New Roman"/>
-          <w:sz w:val="36"/>
-          <w:szCs w:val="36"/>
-        </w:rPr>
-        <w:t>Nabulsy</w:t>
-      </w:r>
-      <w:proofErr w:type="spellEnd"/>
-      <w:r>
-        <w:rPr>
-          <w:rFonts w:ascii="Times New Roman" w:eastAsia="Times New Roman" w:hAnsi="Times New Roman" w:cs="Times New Roman"/>
-          <w:sz w:val="36"/>
-          <w:szCs w:val="36"/>
-        </w:rPr>
-        <w:t xml:space="preserve"> Csongor Alan) Főbb nézetek(</w:t>
-      </w:r>
-      <w:proofErr w:type="spellStart"/>
-      <w:r>
-        <w:rPr>
-          <w:rFonts w:ascii="Times New Roman" w:eastAsia="Times New Roman" w:hAnsi="Times New Roman" w:cs="Times New Roman"/>
-          <w:sz w:val="36"/>
-          <w:szCs w:val="36"/>
-        </w:rPr>
-        <w:t>HomeView</w:t>
-      </w:r>
-      <w:proofErr w:type="spellEnd"/>
-      <w:r>
-        <w:rPr>
-          <w:rFonts w:ascii="Times New Roman" w:eastAsia="Times New Roman" w:hAnsi="Times New Roman" w:cs="Times New Roman"/>
-          <w:sz w:val="36"/>
-          <w:szCs w:val="36"/>
-        </w:rPr>
-        <w:t xml:space="preserve">, </w:t>
-      </w:r>
-      <w:proofErr w:type="spellStart"/>
-      <w:r>
-        <w:rPr>
-          <w:rFonts w:ascii="Times New Roman" w:eastAsia="Times New Roman" w:hAnsi="Times New Roman" w:cs="Times New Roman"/>
-          <w:sz w:val="36"/>
-          <w:szCs w:val="36"/>
-        </w:rPr>
-        <w:t>StudentHomePage</w:t>
-      </w:r>
-      <w:proofErr w:type="spellEnd"/>
-      <w:r>
-        <w:rPr>
-          <w:rFonts w:ascii="Times New Roman" w:eastAsia="Times New Roman" w:hAnsi="Times New Roman" w:cs="Times New Roman"/>
-          <w:sz w:val="36"/>
-          <w:szCs w:val="36"/>
-        </w:rPr>
-        <w:t xml:space="preserve">, </w:t>
-      </w:r>
-      <w:proofErr w:type="spellStart"/>
-      <w:r>
-        <w:rPr>
-          <w:rFonts w:ascii="Times New Roman" w:eastAsia="Times New Roman" w:hAnsi="Times New Roman" w:cs="Times New Roman"/>
-          <w:sz w:val="36"/>
-          <w:szCs w:val="36"/>
-        </w:rPr>
-        <w:t>SchedulerView</w:t>
-      </w:r>
-      <w:proofErr w:type="spellEnd"/>
-      <w:r>
-        <w:rPr>
-          <w:rFonts w:ascii="Times New Roman" w:eastAsia="Times New Roman" w:hAnsi="Times New Roman" w:cs="Times New Roman"/>
-          <w:sz w:val="36"/>
-          <w:szCs w:val="36"/>
-        </w:rPr>
-        <w:t>) szerkezetének kialakítása és a komponensek működésének ellenőrzése, a felhasználói felület stílusának kialakítása, hogy az oldal elrendezése megfeleljen a megtervezett UI-terveknek.</w:t>
+        <w:t>(El-Nabulsy Csongor Alan) Főbb nézetek(HomeView, StudentHomePage, SchedulerView) szerkezetének kialakítása és a komponensek működésének ellenőrzése, a felhasználói felület stílusának kialakítása, hogy az oldal elrendezése megfeleljen a megtervezett UI-terveknek.</w:t>
       </w:r>
     </w:p>
     <w:p>
@@ -3186,25 +2795,7 @@
           <w:sz w:val="36"/>
           <w:szCs w:val="36"/>
         </w:rPr>
-        <w:t xml:space="preserve">, a routerben a főoldalak variánsainak gyerek </w:t>
-      </w:r>
-      <w:proofErr w:type="spellStart"/>
-      <w:r>
-        <w:rPr>
-          <w:rFonts w:ascii="Times New Roman" w:eastAsia="Times New Roman" w:hAnsi="Times New Roman" w:cs="Times New Roman"/>
-          <w:sz w:val="36"/>
-          <w:szCs w:val="36"/>
-        </w:rPr>
-        <w:t>route</w:t>
-      </w:r>
-      <w:proofErr w:type="spellEnd"/>
-      <w:r>
-        <w:rPr>
-          <w:rFonts w:ascii="Times New Roman" w:eastAsia="Times New Roman" w:hAnsi="Times New Roman" w:cs="Times New Roman"/>
-          <w:sz w:val="36"/>
-          <w:szCs w:val="36"/>
-        </w:rPr>
-        <w:t xml:space="preserve">-okba </w:t>
+        <w:t xml:space="preserve">, a routerben a főoldalak variánsainak gyerek route-okba </w:t>
       </w:r>
       <w:r>
         <w:rPr>
@@ -3229,51 +2820,15 @@
           <w:sz w:val="36"/>
           <w:szCs w:val="36"/>
         </w:rPr>
-        <w:t xml:space="preserve">, az új szabvány mintájára az </w:t>
-      </w:r>
-      <w:proofErr w:type="spellStart"/>
-      <w:r>
-        <w:rPr>
-          <w:rFonts w:ascii="Times New Roman" w:eastAsia="Times New Roman" w:hAnsi="Times New Roman" w:cs="Times New Roman"/>
-          <w:sz w:val="36"/>
-          <w:szCs w:val="36"/>
-        </w:rPr>
-        <w:t>admin</w:t>
-      </w:r>
-      <w:proofErr w:type="spellEnd"/>
-      <w:r>
-        <w:rPr>
-          <w:rFonts w:ascii="Times New Roman" w:eastAsia="Times New Roman" w:hAnsi="Times New Roman" w:cs="Times New Roman"/>
-          <w:sz w:val="36"/>
-          <w:szCs w:val="36"/>
-        </w:rPr>
-        <w:t xml:space="preserve"> nézet (gombok és rövid leírás azok alá) létrehozása</w:t>
-      </w:r>
-      <w:r>
-        <w:rPr>
-          <w:rFonts w:ascii="Times New Roman" w:eastAsia="Times New Roman" w:hAnsi="Times New Roman" w:cs="Times New Roman"/>
-          <w:sz w:val="36"/>
-          <w:szCs w:val="36"/>
-        </w:rPr>
-        <w:t xml:space="preserve">, felesleges import mezők kiszedése az </w:t>
-      </w:r>
-      <w:proofErr w:type="spellStart"/>
-      <w:r>
-        <w:rPr>
-          <w:rFonts w:ascii="Times New Roman" w:eastAsia="Times New Roman" w:hAnsi="Times New Roman" w:cs="Times New Roman"/>
-          <w:sz w:val="36"/>
-          <w:szCs w:val="36"/>
-        </w:rPr>
-        <w:t>App.vue</w:t>
-      </w:r>
-      <w:proofErr w:type="spellEnd"/>
-      <w:r>
-        <w:rPr>
-          <w:rFonts w:ascii="Times New Roman" w:eastAsia="Times New Roman" w:hAnsi="Times New Roman" w:cs="Times New Roman"/>
-          <w:sz w:val="36"/>
-          <w:szCs w:val="36"/>
-        </w:rPr>
-        <w:t xml:space="preserve"> fájlból</w:t>
+        <w:t>, az új szabvány mintájára az admin nézet (gombok és rövid leírás azok alá) létrehozása</w:t>
+      </w:r>
+      <w:r>
+        <w:rPr>
+          <w:rFonts w:ascii="Times New Roman" w:eastAsia="Times New Roman" w:hAnsi="Times New Roman" w:cs="Times New Roman"/>
+          <w:sz w:val="36"/>
+          <w:szCs w:val="36"/>
+        </w:rPr>
+        <w:t>, felesleges import mezők kiszedése az App.vue fájlból</w:t>
       </w:r>
     </w:p>
     <w:p>
@@ -3390,114 +2945,15 @@
           <w:sz w:val="36"/>
           <w:szCs w:val="36"/>
         </w:rPr>
-        <w:t>(Susán Csongor György, El-</w:t>
-      </w:r>
-      <w:proofErr w:type="spellStart"/>
-      <w:r>
-        <w:rPr>
-          <w:rFonts w:ascii="Times New Roman" w:eastAsia="Times New Roman" w:hAnsi="Times New Roman" w:cs="Times New Roman"/>
-          <w:sz w:val="36"/>
-          <w:szCs w:val="36"/>
-        </w:rPr>
-        <w:t>Nabulsy</w:t>
-      </w:r>
-      <w:proofErr w:type="spellEnd"/>
-      <w:r>
-        <w:rPr>
-          <w:rFonts w:ascii="Times New Roman" w:eastAsia="Times New Roman" w:hAnsi="Times New Roman" w:cs="Times New Roman"/>
-          <w:sz w:val="36"/>
-          <w:szCs w:val="36"/>
-        </w:rPr>
-        <w:t xml:space="preserve"> Csongor Alan)</w:t>
-      </w:r>
-      <w:r>
-        <w:rPr>
-          <w:rFonts w:ascii="Times New Roman" w:eastAsia="Times New Roman" w:hAnsi="Times New Roman" w:cs="Times New Roman"/>
-          <w:sz w:val="36"/>
-          <w:szCs w:val="36"/>
-        </w:rPr>
-        <w:t xml:space="preserve"> Nézetek végleges kialakítása (El-</w:t>
-      </w:r>
-      <w:proofErr w:type="spellStart"/>
-      <w:r>
-        <w:rPr>
-          <w:rFonts w:ascii="Times New Roman" w:eastAsia="Times New Roman" w:hAnsi="Times New Roman" w:cs="Times New Roman"/>
-          <w:sz w:val="36"/>
-          <w:szCs w:val="36"/>
-        </w:rPr>
-        <w:t>Nabulsy</w:t>
-      </w:r>
-      <w:proofErr w:type="spellEnd"/>
-      <w:r>
-        <w:rPr>
-          <w:rFonts w:ascii="Times New Roman" w:eastAsia="Times New Roman" w:hAnsi="Times New Roman" w:cs="Times New Roman"/>
-          <w:sz w:val="36"/>
-          <w:szCs w:val="36"/>
-        </w:rPr>
-        <w:t xml:space="preserve">: </w:t>
-      </w:r>
-      <w:proofErr w:type="spellStart"/>
-      <w:r>
-        <w:rPr>
-          <w:rFonts w:ascii="Times New Roman" w:eastAsia="Times New Roman" w:hAnsi="Times New Roman" w:cs="Times New Roman"/>
-          <w:sz w:val="36"/>
-          <w:szCs w:val="36"/>
-        </w:rPr>
-        <w:t>HomeView</w:t>
-      </w:r>
-      <w:proofErr w:type="spellEnd"/>
-      <w:r>
-        <w:rPr>
-          <w:rFonts w:ascii="Times New Roman" w:eastAsia="Times New Roman" w:hAnsi="Times New Roman" w:cs="Times New Roman"/>
-          <w:sz w:val="36"/>
-          <w:szCs w:val="36"/>
-        </w:rPr>
-        <w:t xml:space="preserve">, </w:t>
-      </w:r>
-      <w:proofErr w:type="spellStart"/>
-      <w:r>
-        <w:rPr>
-          <w:rFonts w:ascii="Times New Roman" w:eastAsia="Times New Roman" w:hAnsi="Times New Roman" w:cs="Times New Roman"/>
-          <w:sz w:val="36"/>
-          <w:szCs w:val="36"/>
-        </w:rPr>
-        <w:t>RequestView</w:t>
-      </w:r>
-      <w:proofErr w:type="spellEnd"/>
-      <w:r>
-        <w:rPr>
-          <w:rFonts w:ascii="Times New Roman" w:eastAsia="Times New Roman" w:hAnsi="Times New Roman" w:cs="Times New Roman"/>
-          <w:sz w:val="36"/>
-          <w:szCs w:val="36"/>
-        </w:rPr>
-        <w:t xml:space="preserve">, </w:t>
-      </w:r>
-      <w:proofErr w:type="spellStart"/>
-      <w:r>
-        <w:rPr>
-          <w:rFonts w:ascii="Times New Roman" w:eastAsia="Times New Roman" w:hAnsi="Times New Roman" w:cs="Times New Roman"/>
-          <w:sz w:val="36"/>
-          <w:szCs w:val="36"/>
-        </w:rPr>
-        <w:t>SendView</w:t>
-      </w:r>
-      <w:proofErr w:type="spellEnd"/>
-      <w:r>
-        <w:rPr>
-          <w:rFonts w:ascii="Times New Roman" w:eastAsia="Times New Roman" w:hAnsi="Times New Roman" w:cs="Times New Roman"/>
-          <w:sz w:val="36"/>
-          <w:szCs w:val="36"/>
-        </w:rPr>
-        <w:t xml:space="preserve">; Susán: főoldalak integrálása a </w:t>
-      </w:r>
-      <w:proofErr w:type="spellStart"/>
-      <w:r>
-        <w:rPr>
-          <w:rFonts w:ascii="Times New Roman" w:eastAsia="Times New Roman" w:hAnsi="Times New Roman" w:cs="Times New Roman"/>
-          <w:sz w:val="36"/>
-          <w:szCs w:val="36"/>
-        </w:rPr>
-        <w:t>HomeLayout</w:t>
+        <w:t>(Susán Csongor György, El-Nabulsy Csongor Alan)</w:t>
+      </w:r>
+      <w:r>
+        <w:rPr>
+          <w:rFonts w:ascii="Times New Roman" w:eastAsia="Times New Roman" w:hAnsi="Times New Roman" w:cs="Times New Roman"/>
+          <w:sz w:val="36"/>
+          <w:szCs w:val="36"/>
+        </w:rPr>
+        <w:t xml:space="preserve"> Nézetek végleges kialakítása (El-Nabulsy: HomeView, RequestView, SendView; Susán: főoldalak integrálása a HomeLayout</w:t>
       </w:r>
       <w:r>
         <w:rPr>
@@ -3513,16 +2969,7 @@
           <w:sz w:val="36"/>
           <w:szCs w:val="36"/>
         </w:rPr>
-        <w:t>ba</w:t>
-      </w:r>
-      <w:proofErr w:type="spellEnd"/>
-      <w:r>
-        <w:rPr>
-          <w:rFonts w:ascii="Times New Roman" w:eastAsia="Times New Roman" w:hAnsi="Times New Roman" w:cs="Times New Roman"/>
-          <w:sz w:val="36"/>
-          <w:szCs w:val="36"/>
-        </w:rPr>
-        <w:t>)</w:t>
+        <w:t>ba)</w:t>
       </w:r>
       <w:r>
         <w:rPr>
@@ -3571,25 +3018,7 @@
           <w:sz w:val="36"/>
           <w:szCs w:val="36"/>
         </w:rPr>
-        <w:t xml:space="preserve">Példa adatok felvétele a </w:t>
-      </w:r>
-      <w:proofErr w:type="spellStart"/>
-      <w:r>
-        <w:rPr>
-          <w:rFonts w:ascii="Times New Roman" w:eastAsia="Times New Roman" w:hAnsi="Times New Roman" w:cs="Times New Roman"/>
-          <w:sz w:val="36"/>
-          <w:szCs w:val="36"/>
-        </w:rPr>
-        <w:t>HomeLayout-ba</w:t>
-      </w:r>
-      <w:proofErr w:type="spellEnd"/>
-      <w:r>
-        <w:rPr>
-          <w:rFonts w:ascii="Times New Roman" w:eastAsia="Times New Roman" w:hAnsi="Times New Roman" w:cs="Times New Roman"/>
-          <w:sz w:val="36"/>
-          <w:szCs w:val="36"/>
-        </w:rPr>
-        <w:t xml:space="preserve"> a helyes működés tesztelésének érdekében</w:t>
+        <w:t>Példa adatok felvétele a HomeLayout-ba a helyes működés tesztelésének érdekében</w:t>
       </w:r>
     </w:p>
     <w:p>
@@ -3637,41 +3066,13 @@
           <w:szCs w:val="36"/>
         </w:rPr>
       </w:pPr>
-      <w:proofErr w:type="spellStart"/>
-      <w:r>
-        <w:rPr>
-          <w:rFonts w:ascii="Times New Roman" w:eastAsia="Times New Roman" w:hAnsi="Times New Roman" w:cs="Times New Roman"/>
-          <w:sz w:val="36"/>
-          <w:szCs w:val="36"/>
-        </w:rPr>
-        <w:t>meta.title-ekben</w:t>
-      </w:r>
-      <w:proofErr w:type="spellEnd"/>
-      <w:r>
-        <w:rPr>
-          <w:rFonts w:ascii="Times New Roman" w:eastAsia="Times New Roman" w:hAnsi="Times New Roman" w:cs="Times New Roman"/>
-          <w:sz w:val="36"/>
-          <w:szCs w:val="36"/>
-        </w:rPr>
-        <w:t xml:space="preserve"> és a </w:t>
-      </w:r>
-      <w:proofErr w:type="spellStart"/>
-      <w:r>
-        <w:rPr>
-          <w:rFonts w:ascii="Times New Roman" w:eastAsia="Times New Roman" w:hAnsi="Times New Roman" w:cs="Times New Roman"/>
-          <w:sz w:val="36"/>
-          <w:szCs w:val="36"/>
-        </w:rPr>
-        <w:t>beforeEach</w:t>
-      </w:r>
-      <w:proofErr w:type="spellEnd"/>
-      <w:r>
-        <w:rPr>
-          <w:rFonts w:ascii="Times New Roman" w:eastAsia="Times New Roman" w:hAnsi="Times New Roman" w:cs="Times New Roman"/>
-          <w:sz w:val="36"/>
-          <w:szCs w:val="36"/>
-        </w:rPr>
-        <w:t>-ben oldalcímek meghatározása</w:t>
+      <w:r>
+        <w:rPr>
+          <w:rFonts w:ascii="Times New Roman" w:eastAsia="Times New Roman" w:hAnsi="Times New Roman" w:cs="Times New Roman"/>
+          <w:sz w:val="36"/>
+          <w:szCs w:val="36"/>
+        </w:rPr>
+        <w:t>meta.title-ekben és a beforeEach-ben oldalcímek meghatározása</w:t>
       </w:r>
     </w:p>
     <w:p>
@@ -3727,7 +3128,6 @@
           <w:szCs w:val="36"/>
         </w:rPr>
       </w:pPr>
-      <w:proofErr w:type="spellStart"/>
       <w:r>
         <w:rPr>
           <w:rFonts w:ascii="Times New Roman" w:eastAsia="Times New Roman" w:hAnsi="Times New Roman" w:cs="Times New Roman"/>
@@ -3735,34 +3135,7 @@
           <w:szCs w:val="36"/>
         </w:rPr>
         <w:lastRenderedPageBreak/>
-        <w:t>auth</w:t>
-      </w:r>
-      <w:proofErr w:type="spellEnd"/>
-      <w:r>
-        <w:rPr>
-          <w:rFonts w:ascii="Times New Roman" w:eastAsia="Times New Roman" w:hAnsi="Times New Roman" w:cs="Times New Roman"/>
-          <w:sz w:val="36"/>
-          <w:szCs w:val="36"/>
-        </w:rPr>
-        <w:t xml:space="preserve"> függvény hozzáadása a bejelentkezési képernyőhöz (</w:t>
-      </w:r>
-      <w:proofErr w:type="spellStart"/>
-      <w:r>
-        <w:rPr>
-          <w:rFonts w:ascii="Times New Roman" w:eastAsia="Times New Roman" w:hAnsi="Times New Roman" w:cs="Times New Roman"/>
-          <w:sz w:val="36"/>
-          <w:szCs w:val="36"/>
-        </w:rPr>
-        <w:t>LoginView</w:t>
-      </w:r>
-      <w:proofErr w:type="spellEnd"/>
-      <w:r>
-        <w:rPr>
-          <w:rFonts w:ascii="Times New Roman" w:eastAsia="Times New Roman" w:hAnsi="Times New Roman" w:cs="Times New Roman"/>
-          <w:sz w:val="36"/>
-          <w:szCs w:val="36"/>
-        </w:rPr>
-        <w:t>), ami egyelőre üres, egy komment jelzi annak célját</w:t>
+        <w:t>auth függvény hozzáadása a bejelentkezési képernyőhöz (LoginView), ami egyelőre üres, egy komment jelzi annak célját</w:t>
       </w:r>
     </w:p>
     <w:p>
@@ -3963,43 +3336,7 @@
           <w:sz w:val="36"/>
           <w:szCs w:val="36"/>
         </w:rPr>
-        <w:t>Szerepkörök (</w:t>
-      </w:r>
-      <w:proofErr w:type="spellStart"/>
-      <w:r>
-        <w:rPr>
-          <w:rFonts w:ascii="Times New Roman" w:eastAsia="Times New Roman" w:hAnsi="Times New Roman" w:cs="Times New Roman"/>
-          <w:sz w:val="36"/>
-          <w:szCs w:val="36"/>
-        </w:rPr>
-        <w:t>role</w:t>
-      </w:r>
-      <w:proofErr w:type="spellEnd"/>
-      <w:r>
-        <w:rPr>
-          <w:rFonts w:ascii="Times New Roman" w:eastAsia="Times New Roman" w:hAnsi="Times New Roman" w:cs="Times New Roman"/>
-          <w:sz w:val="36"/>
-          <w:szCs w:val="36"/>
-        </w:rPr>
-        <w:t xml:space="preserve">) és </w:t>
-      </w:r>
-      <w:proofErr w:type="spellStart"/>
-      <w:r>
-        <w:rPr>
-          <w:rFonts w:ascii="Times New Roman" w:eastAsia="Times New Roman" w:hAnsi="Times New Roman" w:cs="Times New Roman"/>
-          <w:sz w:val="36"/>
-          <w:szCs w:val="36"/>
-        </w:rPr>
-        <w:t>requiresAuth</w:t>
-      </w:r>
-      <w:proofErr w:type="spellEnd"/>
-      <w:r>
-        <w:rPr>
-          <w:rFonts w:ascii="Times New Roman" w:eastAsia="Times New Roman" w:hAnsi="Times New Roman" w:cs="Times New Roman"/>
-          <w:sz w:val="36"/>
-          <w:szCs w:val="36"/>
-        </w:rPr>
-        <w:t xml:space="preserve"> hozzáadása a nézetekhez</w:t>
+        <w:t>Szerepkörök (role) és requiresAuth hozzáadása a nézetekhez</w:t>
       </w:r>
     </w:p>
     <w:p>
@@ -4017,41 +3354,13 @@
           <w:szCs w:val="36"/>
         </w:rPr>
       </w:pPr>
-      <w:proofErr w:type="spellStart"/>
-      <w:r>
-        <w:rPr>
-          <w:rFonts w:ascii="Times New Roman" w:eastAsia="Times New Roman" w:hAnsi="Times New Roman" w:cs="Times New Roman"/>
-          <w:sz w:val="36"/>
-          <w:szCs w:val="36"/>
-        </w:rPr>
-        <w:t>Autentikációhoz</w:t>
-      </w:r>
-      <w:proofErr w:type="spellEnd"/>
-      <w:r>
-        <w:rPr>
-          <w:rFonts w:ascii="Times New Roman" w:eastAsia="Times New Roman" w:hAnsi="Times New Roman" w:cs="Times New Roman"/>
-          <w:sz w:val="36"/>
-          <w:szCs w:val="36"/>
-        </w:rPr>
-        <w:t xml:space="preserve"> szükséges alapváltozók felvétele az </w:t>
-      </w:r>
-      <w:proofErr w:type="spellStart"/>
-      <w:r>
-        <w:rPr>
-          <w:rFonts w:ascii="Times New Roman" w:eastAsia="Times New Roman" w:hAnsi="Times New Roman" w:cs="Times New Roman"/>
-          <w:sz w:val="36"/>
-          <w:szCs w:val="36"/>
-        </w:rPr>
-        <w:t>App.vue</w:t>
-      </w:r>
-      <w:proofErr w:type="spellEnd"/>
-      <w:r>
-        <w:rPr>
-          <w:rFonts w:ascii="Times New Roman" w:eastAsia="Times New Roman" w:hAnsi="Times New Roman" w:cs="Times New Roman"/>
-          <w:sz w:val="36"/>
-          <w:szCs w:val="36"/>
-        </w:rPr>
-        <w:t>-ban</w:t>
+      <w:r>
+        <w:rPr>
+          <w:rFonts w:ascii="Times New Roman" w:eastAsia="Times New Roman" w:hAnsi="Times New Roman" w:cs="Times New Roman"/>
+          <w:sz w:val="36"/>
+          <w:szCs w:val="36"/>
+        </w:rPr>
+        <w:t>Autentikációhoz szükséges alapváltozók felvétele az App.vue-ban</w:t>
       </w:r>
     </w:p>
     <w:p>
@@ -4091,25 +3400,7 @@
           <w:sz w:val="36"/>
           <w:szCs w:val="36"/>
         </w:rPr>
-        <w:t>(Susán Csongor György, El-</w:t>
-      </w:r>
-      <w:proofErr w:type="spellStart"/>
-      <w:r>
-        <w:rPr>
-          <w:rFonts w:ascii="Times New Roman" w:eastAsia="Times New Roman" w:hAnsi="Times New Roman" w:cs="Times New Roman"/>
-          <w:sz w:val="36"/>
-          <w:szCs w:val="36"/>
-        </w:rPr>
-        <w:t>Nabulsy</w:t>
-      </w:r>
-      <w:proofErr w:type="spellEnd"/>
-      <w:r>
-        <w:rPr>
-          <w:rFonts w:ascii="Times New Roman" w:eastAsia="Times New Roman" w:hAnsi="Times New Roman" w:cs="Times New Roman"/>
-          <w:sz w:val="36"/>
-          <w:szCs w:val="36"/>
-        </w:rPr>
-        <w:t xml:space="preserve"> Csongor Alan)</w:t>
+        <w:t>(Susán Csongor György, El-Nabulsy Csongor Alan)</w:t>
       </w:r>
     </w:p>
     <w:p>
@@ -4155,25 +3446,7 @@
           <w:sz w:val="36"/>
           <w:szCs w:val="36"/>
         </w:rPr>
-        <w:t>Táblák SQL-tervezetének elkészítése (El-</w:t>
-      </w:r>
-      <w:proofErr w:type="spellStart"/>
-      <w:r>
-        <w:rPr>
-          <w:rFonts w:ascii="Times New Roman" w:eastAsia="Times New Roman" w:hAnsi="Times New Roman" w:cs="Times New Roman"/>
-          <w:sz w:val="36"/>
-          <w:szCs w:val="36"/>
-        </w:rPr>
-        <w:t>Nabulsy</w:t>
-      </w:r>
-      <w:proofErr w:type="spellEnd"/>
-      <w:r>
-        <w:rPr>
-          <w:rFonts w:ascii="Times New Roman" w:eastAsia="Times New Roman" w:hAnsi="Times New Roman" w:cs="Times New Roman"/>
-          <w:sz w:val="36"/>
-          <w:szCs w:val="36"/>
-        </w:rPr>
-        <w:t>)</w:t>
+        <w:t>Táblák SQL-tervezetének elkészítése (El-Nabulsy)</w:t>
       </w:r>
     </w:p>
     <w:p>
@@ -4197,79 +3470,7 @@
           <w:szCs w:val="36"/>
         </w:rPr>
         <w:lastRenderedPageBreak/>
-        <w:t>Táblázatok relációs tervvé írása és azok implementálása (</w:t>
-      </w:r>
-      <w:proofErr w:type="spellStart"/>
-      <w:r>
-        <w:rPr>
-          <w:rFonts w:ascii="Times New Roman" w:eastAsia="Times New Roman" w:hAnsi="Times New Roman" w:cs="Times New Roman"/>
-          <w:sz w:val="36"/>
-          <w:szCs w:val="36"/>
-        </w:rPr>
-        <w:t>model-lek</w:t>
-      </w:r>
-      <w:proofErr w:type="spellEnd"/>
-      <w:r>
-        <w:rPr>
-          <w:rFonts w:ascii="Times New Roman" w:eastAsia="Times New Roman" w:hAnsi="Times New Roman" w:cs="Times New Roman"/>
-          <w:sz w:val="36"/>
-          <w:szCs w:val="36"/>
-        </w:rPr>
-        <w:t xml:space="preserve">, egyelőre üres </w:t>
-      </w:r>
-      <w:proofErr w:type="spellStart"/>
-      <w:r>
-        <w:rPr>
-          <w:rFonts w:ascii="Times New Roman" w:eastAsia="Times New Roman" w:hAnsi="Times New Roman" w:cs="Times New Roman"/>
-          <w:sz w:val="36"/>
-          <w:szCs w:val="36"/>
-        </w:rPr>
-        <w:t>seederek</w:t>
-      </w:r>
-      <w:proofErr w:type="spellEnd"/>
-      <w:r>
-        <w:rPr>
-          <w:rFonts w:ascii="Times New Roman" w:eastAsia="Times New Roman" w:hAnsi="Times New Roman" w:cs="Times New Roman"/>
-          <w:sz w:val="36"/>
-          <w:szCs w:val="36"/>
-        </w:rPr>
-        <w:t xml:space="preserve"> és </w:t>
-      </w:r>
-      <w:proofErr w:type="spellStart"/>
-      <w:r>
-        <w:rPr>
-          <w:rFonts w:ascii="Times New Roman" w:eastAsia="Times New Roman" w:hAnsi="Times New Roman" w:cs="Times New Roman"/>
-          <w:sz w:val="36"/>
-          <w:szCs w:val="36"/>
-        </w:rPr>
-        <w:t>migration-ök</w:t>
-      </w:r>
-      <w:proofErr w:type="spellEnd"/>
-      <w:r>
-        <w:rPr>
-          <w:rFonts w:ascii="Times New Roman" w:eastAsia="Times New Roman" w:hAnsi="Times New Roman" w:cs="Times New Roman"/>
-          <w:sz w:val="36"/>
-          <w:szCs w:val="36"/>
-        </w:rPr>
-        <w:t>) a Backend (</w:t>
-      </w:r>
-      <w:proofErr w:type="spellStart"/>
-      <w:r>
-        <w:rPr>
-          <w:rFonts w:ascii="Times New Roman" w:eastAsia="Times New Roman" w:hAnsi="Times New Roman" w:cs="Times New Roman"/>
-          <w:sz w:val="36"/>
-          <w:szCs w:val="36"/>
-        </w:rPr>
-        <w:t>Laravel</w:t>
-      </w:r>
-      <w:proofErr w:type="spellEnd"/>
-      <w:r>
-        <w:rPr>
-          <w:rFonts w:ascii="Times New Roman" w:eastAsia="Times New Roman" w:hAnsi="Times New Roman" w:cs="Times New Roman"/>
-          <w:sz w:val="36"/>
-          <w:szCs w:val="36"/>
-        </w:rPr>
-        <w:t>) projektbe (Susán)</w:t>
+        <w:t>Táblázatok relációs tervvé írása és azok implementálása (model-lek, egyelőre üres seederek és migration-ök) a Backend (Laravel) projektbe (Susán)</w:t>
       </w:r>
     </w:p>
     <w:p>
@@ -4292,97 +3493,7 @@
           <w:sz w:val="36"/>
           <w:szCs w:val="36"/>
         </w:rPr>
-        <w:t xml:space="preserve">Projekt struktúrájának végleges kialakítása (eddig </w:t>
-      </w:r>
-      <w:proofErr w:type="spellStart"/>
-      <w:r>
-        <w:rPr>
-          <w:rFonts w:ascii="Times New Roman" w:eastAsia="Times New Roman" w:hAnsi="Times New Roman" w:cs="Times New Roman"/>
-          <w:sz w:val="36"/>
-          <w:szCs w:val="36"/>
-        </w:rPr>
-        <w:t>frontendPart-blathyfm</w:t>
-      </w:r>
-      <w:proofErr w:type="spellEnd"/>
-      <w:r>
-        <w:rPr>
-          <w:rFonts w:ascii="Times New Roman" w:eastAsia="Times New Roman" w:hAnsi="Times New Roman" w:cs="Times New Roman"/>
-          <w:sz w:val="36"/>
-          <w:szCs w:val="36"/>
-        </w:rPr>
-        <w:t xml:space="preserve"> volt, viszont azóta a </w:t>
-      </w:r>
-      <w:proofErr w:type="spellStart"/>
-      <w:r>
-        <w:rPr>
-          <w:rFonts w:ascii="Times New Roman" w:eastAsia="Times New Roman" w:hAnsi="Times New Roman" w:cs="Times New Roman"/>
-          <w:sz w:val="36"/>
-          <w:szCs w:val="36"/>
-        </w:rPr>
-        <w:t>főmappa</w:t>
-      </w:r>
-      <w:proofErr w:type="spellEnd"/>
-      <w:r>
-        <w:rPr>
-          <w:rFonts w:ascii="Times New Roman" w:eastAsia="Times New Roman" w:hAnsi="Times New Roman" w:cs="Times New Roman"/>
-          <w:sz w:val="36"/>
-          <w:szCs w:val="36"/>
-        </w:rPr>
-        <w:t xml:space="preserve"> a </w:t>
-      </w:r>
-      <w:proofErr w:type="spellStart"/>
-      <w:r>
-        <w:rPr>
-          <w:rFonts w:ascii="Times New Roman" w:eastAsia="Times New Roman" w:hAnsi="Times New Roman" w:cs="Times New Roman"/>
-          <w:sz w:val="36"/>
-          <w:szCs w:val="36"/>
-        </w:rPr>
-        <w:t>BlathyFM</w:t>
-      </w:r>
-      <w:proofErr w:type="spellEnd"/>
-      <w:r>
-        <w:rPr>
-          <w:rFonts w:ascii="Times New Roman" w:eastAsia="Times New Roman" w:hAnsi="Times New Roman" w:cs="Times New Roman"/>
-          <w:sz w:val="36"/>
-          <w:szCs w:val="36"/>
-        </w:rPr>
-        <w:t xml:space="preserve"> mappát viseli, amiben két, az alkalmazás egy-egy szintjét képviselő projekt található (</w:t>
-      </w:r>
-      <w:proofErr w:type="spellStart"/>
-      <w:r>
-        <w:rPr>
-          <w:rFonts w:ascii="Times New Roman" w:eastAsia="Times New Roman" w:hAnsi="Times New Roman" w:cs="Times New Roman"/>
-          <w:sz w:val="36"/>
-          <w:szCs w:val="36"/>
-        </w:rPr>
-        <w:t>blathyfm_frontend</w:t>
-      </w:r>
-      <w:proofErr w:type="spellEnd"/>
-      <w:r>
-        <w:rPr>
-          <w:rFonts w:ascii="Times New Roman" w:eastAsia="Times New Roman" w:hAnsi="Times New Roman" w:cs="Times New Roman"/>
-          <w:sz w:val="36"/>
-          <w:szCs w:val="36"/>
-        </w:rPr>
-        <w:t xml:space="preserve"> – amiben az eddigi frontend-alkalmazás volt megtalálható – és </w:t>
-      </w:r>
-      <w:proofErr w:type="spellStart"/>
-      <w:r>
-        <w:rPr>
-          <w:rFonts w:ascii="Times New Roman" w:eastAsia="Times New Roman" w:hAnsi="Times New Roman" w:cs="Times New Roman"/>
-          <w:sz w:val="36"/>
-          <w:szCs w:val="36"/>
-        </w:rPr>
-        <w:t>blathyfm_backend</w:t>
-      </w:r>
-      <w:proofErr w:type="spellEnd"/>
-      <w:r>
-        <w:rPr>
-          <w:rFonts w:ascii="Times New Roman" w:eastAsia="Times New Roman" w:hAnsi="Times New Roman" w:cs="Times New Roman"/>
-          <w:sz w:val="36"/>
-          <w:szCs w:val="36"/>
-        </w:rPr>
-        <w:t>, ami pedig az újonnan létrejött backend része a projektnek) (Susán)</w:t>
+        <w:t>Projekt struktúrájának végleges kialakítása (eddig frontendPart-blathyfm volt, viszont azóta a főmappa a BlathyFM mappát viseli, amiben két, az alkalmazás egy-egy szintjét képviselő projekt található (blathyfm_frontend – amiben az eddigi frontend-alkalmazás volt megtalálható – és blathyfm_backend, ami pedig az újonnan létrejött backend része a projektnek) (Susán)</w:t>
       </w:r>
     </w:p>
     <w:p>
@@ -4467,43 +3578,7 @@
           <w:sz w:val="36"/>
           <w:szCs w:val="36"/>
         </w:rPr>
-        <w:t>(El-</w:t>
-      </w:r>
-      <w:proofErr w:type="spellStart"/>
-      <w:r>
-        <w:rPr>
-          <w:rFonts w:ascii="Times New Roman" w:eastAsia="Times New Roman" w:hAnsi="Times New Roman" w:cs="Times New Roman"/>
-          <w:sz w:val="36"/>
-          <w:szCs w:val="36"/>
-        </w:rPr>
-        <w:t>Nabulsy</w:t>
-      </w:r>
-      <w:proofErr w:type="spellEnd"/>
-      <w:r>
-        <w:rPr>
-          <w:rFonts w:ascii="Times New Roman" w:eastAsia="Times New Roman" w:hAnsi="Times New Roman" w:cs="Times New Roman"/>
-          <w:sz w:val="36"/>
-          <w:szCs w:val="36"/>
-        </w:rPr>
-        <w:t xml:space="preserve"> Csongor Alan) Az ütemezői nézet (</w:t>
-      </w:r>
-      <w:proofErr w:type="spellStart"/>
-      <w:r>
-        <w:rPr>
-          <w:rFonts w:ascii="Times New Roman" w:eastAsia="Times New Roman" w:hAnsi="Times New Roman" w:cs="Times New Roman"/>
-          <w:sz w:val="36"/>
-          <w:szCs w:val="36"/>
-        </w:rPr>
-        <w:t>SchedulerView</w:t>
-      </w:r>
-      <w:proofErr w:type="spellEnd"/>
-      <w:r>
-        <w:rPr>
-          <w:rFonts w:ascii="Times New Roman" w:eastAsia="Times New Roman" w:hAnsi="Times New Roman" w:cs="Times New Roman"/>
-          <w:sz w:val="36"/>
-          <w:szCs w:val="36"/>
-        </w:rPr>
-        <w:t>) elkészítése</w:t>
+        <w:t>(El-Nabulsy Csongor Alan) Az ütemezői nézet (SchedulerView) elkészítése</w:t>
       </w:r>
       <w:r>
         <w:rPr>
@@ -4540,25 +3615,7 @@
           <w:sz w:val="36"/>
           <w:szCs w:val="36"/>
         </w:rPr>
-        <w:t>Tervezéssel kapcsolatos dokumentumok áthelyezése egy „</w:t>
-      </w:r>
-      <w:proofErr w:type="spellStart"/>
-      <w:r>
-        <w:rPr>
-          <w:rFonts w:ascii="Times New Roman" w:eastAsia="Times New Roman" w:hAnsi="Times New Roman" w:cs="Times New Roman"/>
-          <w:sz w:val="36"/>
-          <w:szCs w:val="36"/>
-        </w:rPr>
-        <w:t>plans</w:t>
-      </w:r>
-      <w:proofErr w:type="spellEnd"/>
-      <w:r>
-        <w:rPr>
-          <w:rFonts w:ascii="Times New Roman" w:eastAsia="Times New Roman" w:hAnsi="Times New Roman" w:cs="Times New Roman"/>
-          <w:sz w:val="36"/>
-          <w:szCs w:val="36"/>
-        </w:rPr>
-        <w:t>” mappába, a</w:t>
+        <w:t>Tervezéssel kapcsolatos dokumentumok áthelyezése egy „plans” mappába, a</w:t>
       </w:r>
       <w:r>
         <w:rPr>
@@ -4632,25 +3689,7 @@
           <w:sz w:val="36"/>
           <w:szCs w:val="36"/>
         </w:rPr>
-        <w:t>El-</w:t>
-      </w:r>
-      <w:proofErr w:type="spellStart"/>
-      <w:r>
-        <w:rPr>
-          <w:rFonts w:ascii="Times New Roman" w:eastAsia="Times New Roman" w:hAnsi="Times New Roman" w:cs="Times New Roman"/>
-          <w:sz w:val="36"/>
-          <w:szCs w:val="36"/>
-        </w:rPr>
-        <w:t>Nabulsy</w:t>
-      </w:r>
-      <w:proofErr w:type="spellEnd"/>
-      <w:r>
-        <w:rPr>
-          <w:rFonts w:ascii="Times New Roman" w:eastAsia="Times New Roman" w:hAnsi="Times New Roman" w:cs="Times New Roman"/>
-          <w:sz w:val="36"/>
-          <w:szCs w:val="36"/>
-        </w:rPr>
-        <w:t xml:space="preserve"> Csongor Alan</w:t>
+        <w:t>El-Nabulsy Csongor Alan</w:t>
       </w:r>
       <w:r>
         <w:rPr>
@@ -4666,43 +3705,7 @@
           <w:sz w:val="36"/>
           <w:szCs w:val="36"/>
         </w:rPr>
-        <w:t xml:space="preserve"> </w:t>
-      </w:r>
-      <w:proofErr w:type="spellStart"/>
-      <w:r>
-        <w:rPr>
-          <w:rFonts w:ascii="Times New Roman" w:eastAsia="Times New Roman" w:hAnsi="Times New Roman" w:cs="Times New Roman"/>
-          <w:sz w:val="36"/>
-          <w:szCs w:val="36"/>
-        </w:rPr>
-        <w:t>RequestView</w:t>
-      </w:r>
-      <w:proofErr w:type="spellEnd"/>
-      <w:r>
-        <w:rPr>
-          <w:rFonts w:ascii="Times New Roman" w:eastAsia="Times New Roman" w:hAnsi="Times New Roman" w:cs="Times New Roman"/>
-          <w:sz w:val="36"/>
-          <w:szCs w:val="36"/>
-        </w:rPr>
-        <w:t xml:space="preserve"> és </w:t>
-      </w:r>
-      <w:proofErr w:type="spellStart"/>
-      <w:r>
-        <w:rPr>
-          <w:rFonts w:ascii="Times New Roman" w:eastAsia="Times New Roman" w:hAnsi="Times New Roman" w:cs="Times New Roman"/>
-          <w:sz w:val="36"/>
-          <w:szCs w:val="36"/>
-        </w:rPr>
-        <w:t>SchedulerView</w:t>
-      </w:r>
-      <w:proofErr w:type="spellEnd"/>
-      <w:r>
-        <w:rPr>
-          <w:rFonts w:ascii="Times New Roman" w:eastAsia="Times New Roman" w:hAnsi="Times New Roman" w:cs="Times New Roman"/>
-          <w:sz w:val="36"/>
-          <w:szCs w:val="36"/>
-        </w:rPr>
-        <w:t xml:space="preserve"> továbbfejlesztése</w:t>
+        <w:t xml:space="preserve"> RequestView és SchedulerView továbbfejlesztése</w:t>
       </w:r>
     </w:p>
     <w:p>
@@ -4815,25 +3818,7 @@
           <w:sz w:val="36"/>
           <w:szCs w:val="36"/>
         </w:rPr>
-        <w:t xml:space="preserve"> az adatbázisba </w:t>
-      </w:r>
-      <w:proofErr w:type="spellStart"/>
-      <w:r>
-        <w:rPr>
-          <w:rFonts w:ascii="Times New Roman" w:eastAsia="Times New Roman" w:hAnsi="Times New Roman" w:cs="Times New Roman"/>
-          <w:sz w:val="36"/>
-          <w:szCs w:val="36"/>
-        </w:rPr>
-        <w:t>seederek</w:t>
-      </w:r>
-      <w:proofErr w:type="spellEnd"/>
-      <w:r>
-        <w:rPr>
-          <w:rFonts w:ascii="Times New Roman" w:eastAsia="Times New Roman" w:hAnsi="Times New Roman" w:cs="Times New Roman"/>
-          <w:sz w:val="36"/>
-          <w:szCs w:val="36"/>
-        </w:rPr>
-        <w:t xml:space="preserve"> segítségével</w:t>
+        <w:t xml:space="preserve"> az adatbázisba seederek segítségével</w:t>
       </w:r>
     </w:p>
     <w:p>
@@ -4981,7 +3966,6 @@
           <w:szCs w:val="36"/>
         </w:rPr>
       </w:pPr>
-      <w:proofErr w:type="spellStart"/>
       <w:r>
         <w:rPr>
           <w:rFonts w:ascii="Times New Roman" w:eastAsia="Times New Roman" w:hAnsi="Times New Roman" w:cs="Times New Roman"/>
@@ -4990,7 +3974,6 @@
         </w:rPr>
         <w:t>Genre</w:t>
       </w:r>
-      <w:proofErr w:type="spellEnd"/>
       <w:r>
         <w:rPr>
           <w:rFonts w:ascii="Times New Roman" w:eastAsia="Times New Roman" w:hAnsi="Times New Roman" w:cs="Times New Roman"/>
@@ -5140,61 +4123,7 @@
           <w:sz w:val="36"/>
           <w:szCs w:val="36"/>
         </w:rPr>
-        <w:t xml:space="preserve">Backend oldali </w:t>
-      </w:r>
-      <w:proofErr w:type="spellStart"/>
-      <w:r>
-        <w:rPr>
-          <w:rFonts w:ascii="Times New Roman" w:eastAsia="Times New Roman" w:hAnsi="Times New Roman" w:cs="Times New Roman"/>
-          <w:sz w:val="36"/>
-          <w:szCs w:val="36"/>
-        </w:rPr>
-        <w:t>migrationök</w:t>
-      </w:r>
-      <w:proofErr w:type="spellEnd"/>
-      <w:r>
-        <w:rPr>
-          <w:rFonts w:ascii="Times New Roman" w:eastAsia="Times New Roman" w:hAnsi="Times New Roman" w:cs="Times New Roman"/>
-          <w:sz w:val="36"/>
-          <w:szCs w:val="36"/>
-        </w:rPr>
-        <w:t xml:space="preserve"> és </w:t>
-      </w:r>
-      <w:proofErr w:type="spellStart"/>
-      <w:r>
-        <w:rPr>
-          <w:rFonts w:ascii="Times New Roman" w:eastAsia="Times New Roman" w:hAnsi="Times New Roman" w:cs="Times New Roman"/>
-          <w:sz w:val="36"/>
-          <w:szCs w:val="36"/>
-        </w:rPr>
-        <w:t>seederek</w:t>
-      </w:r>
-      <w:proofErr w:type="spellEnd"/>
-      <w:r>
-        <w:rPr>
-          <w:rFonts w:ascii="Times New Roman" w:eastAsia="Times New Roman" w:hAnsi="Times New Roman" w:cs="Times New Roman"/>
-          <w:sz w:val="36"/>
-          <w:szCs w:val="36"/>
-        </w:rPr>
-        <w:t xml:space="preserve"> </w:t>
-      </w:r>
-      <w:proofErr w:type="spellStart"/>
-      <w:r>
-        <w:rPr>
-          <w:rFonts w:ascii="Times New Roman" w:eastAsia="Times New Roman" w:hAnsi="Times New Roman" w:cs="Times New Roman"/>
-          <w:sz w:val="36"/>
-          <w:szCs w:val="36"/>
-        </w:rPr>
-        <w:t>debuggolása</w:t>
-      </w:r>
-      <w:proofErr w:type="spellEnd"/>
-      <w:r>
-        <w:rPr>
-          <w:rFonts w:ascii="Times New Roman" w:eastAsia="Times New Roman" w:hAnsi="Times New Roman" w:cs="Times New Roman"/>
-          <w:sz w:val="36"/>
-          <w:szCs w:val="36"/>
-        </w:rPr>
-        <w:t>, hibamentesítése.</w:t>
+        <w:t>Backend oldali migrationök és seederek debuggolása, hibamentesítése.</w:t>
       </w:r>
     </w:p>
     <w:p>
@@ -5348,25 +4277,7 @@
           <w:sz w:val="36"/>
           <w:szCs w:val="36"/>
         </w:rPr>
-        <w:t>Felvétel előtt álló felhasználók (</w:t>
-      </w:r>
-      <w:proofErr w:type="spellStart"/>
-      <w:r>
-        <w:rPr>
-          <w:rFonts w:ascii="Times New Roman" w:eastAsia="Times New Roman" w:hAnsi="Times New Roman" w:cs="Times New Roman"/>
-          <w:sz w:val="36"/>
-          <w:szCs w:val="36"/>
-        </w:rPr>
-        <w:t>PendingUser</w:t>
-      </w:r>
-      <w:proofErr w:type="spellEnd"/>
-      <w:r>
-        <w:rPr>
-          <w:rFonts w:ascii="Times New Roman" w:eastAsia="Times New Roman" w:hAnsi="Times New Roman" w:cs="Times New Roman"/>
-          <w:sz w:val="36"/>
-          <w:szCs w:val="36"/>
-        </w:rPr>
-        <w:t>) táblájának hozzáadása az adatbázisba</w:t>
+        <w:t>Felvétel előtt álló felhasználók (PendingUser) táblájának hozzáadása az adatbázisba</w:t>
       </w:r>
       <w:r>
         <w:rPr>
@@ -5397,71 +4308,25 @@
           <w:sz w:val="36"/>
           <w:szCs w:val="36"/>
         </w:rPr>
-        <w:t xml:space="preserve">Regisztráció </w:t>
-      </w:r>
-      <w:proofErr w:type="spellStart"/>
-      <w:r>
-        <w:rPr>
-          <w:rFonts w:ascii="Times New Roman" w:eastAsia="Times New Roman" w:hAnsi="Times New Roman" w:cs="Times New Roman"/>
-          <w:sz w:val="36"/>
-          <w:szCs w:val="36"/>
-        </w:rPr>
-        <w:t>debuggolása</w:t>
-      </w:r>
-      <w:proofErr w:type="spellEnd"/>
-    </w:p>
-    <w:p>
-      <w:pPr>
-        <w:jc w:val="both"/>
-        <w:rPr>
-          <w:rFonts w:ascii="Times New Roman" w:eastAsia="Times New Roman" w:hAnsi="Times New Roman" w:cs="Times New Roman"/>
-          <w:sz w:val="36"/>
-          <w:szCs w:val="36"/>
-        </w:rPr>
-      </w:pPr>
-      <w:r>
-        <w:rPr>
-          <w:rFonts w:ascii="Times New Roman" w:eastAsia="Times New Roman" w:hAnsi="Times New Roman" w:cs="Times New Roman"/>
-          <w:sz w:val="36"/>
-          <w:szCs w:val="36"/>
-        </w:rPr>
-        <w:t>(El-</w:t>
-      </w:r>
-      <w:proofErr w:type="spellStart"/>
-      <w:r>
-        <w:rPr>
-          <w:rFonts w:ascii="Times New Roman" w:eastAsia="Times New Roman" w:hAnsi="Times New Roman" w:cs="Times New Roman"/>
-          <w:sz w:val="36"/>
-          <w:szCs w:val="36"/>
-        </w:rPr>
-        <w:t>Nabulsy</w:t>
-      </w:r>
-      <w:proofErr w:type="spellEnd"/>
-      <w:r>
-        <w:rPr>
-          <w:rFonts w:ascii="Times New Roman" w:eastAsia="Times New Roman" w:hAnsi="Times New Roman" w:cs="Times New Roman"/>
-          <w:sz w:val="36"/>
-          <w:szCs w:val="36"/>
-        </w:rPr>
-        <w:t xml:space="preserve"> Csongor Alan) </w:t>
-      </w:r>
-      <w:proofErr w:type="spellStart"/>
-      <w:r>
-        <w:rPr>
-          <w:rFonts w:ascii="Times New Roman" w:eastAsia="Times New Roman" w:hAnsi="Times New Roman" w:cs="Times New Roman"/>
-          <w:sz w:val="36"/>
-          <w:szCs w:val="36"/>
-        </w:rPr>
-        <w:t>WaitingView</w:t>
-      </w:r>
-      <w:proofErr w:type="spellEnd"/>
-      <w:r>
-        <w:rPr>
-          <w:rFonts w:ascii="Times New Roman" w:eastAsia="Times New Roman" w:hAnsi="Times New Roman" w:cs="Times New Roman"/>
-          <w:sz w:val="36"/>
-          <w:szCs w:val="36"/>
-        </w:rPr>
-        <w:t xml:space="preserve"> (ahova regisztráció után navigál az oldal) létrehozása.</w:t>
+        <w:t>Regisztráció debuggolása</w:t>
+      </w:r>
+    </w:p>
+    <w:p>
+      <w:pPr>
+        <w:jc w:val="both"/>
+        <w:rPr>
+          <w:rFonts w:ascii="Times New Roman" w:eastAsia="Times New Roman" w:hAnsi="Times New Roman" w:cs="Times New Roman"/>
+          <w:sz w:val="36"/>
+          <w:szCs w:val="36"/>
+        </w:rPr>
+      </w:pPr>
+      <w:r>
+        <w:rPr>
+          <w:rFonts w:ascii="Times New Roman" w:eastAsia="Times New Roman" w:hAnsi="Times New Roman" w:cs="Times New Roman"/>
+          <w:sz w:val="36"/>
+          <w:szCs w:val="36"/>
+        </w:rPr>
+        <w:t>(El-Nabulsy Csongor Alan) WaitingView (ahova regisztráció után navigál az oldal) létrehozása.</w:t>
       </w:r>
     </w:p>
     <w:p>
@@ -5541,125 +4406,53 @@
           <w:sz w:val="36"/>
           <w:szCs w:val="36"/>
         </w:rPr>
-        <w:t xml:space="preserve">Átnéztük mindegyik oldalt hogy néz ki jelenleg, és a </w:t>
-      </w:r>
-      <w:proofErr w:type="spellStart"/>
-      <w:r>
-        <w:rPr>
-          <w:rFonts w:ascii="Times New Roman" w:eastAsia="Times New Roman" w:hAnsi="Times New Roman" w:cs="Times New Roman"/>
-          <w:sz w:val="36"/>
-          <w:szCs w:val="36"/>
-        </w:rPr>
-        <w:t>RequestView</w:t>
-      </w:r>
-      <w:proofErr w:type="spellEnd"/>
-      <w:r>
-        <w:rPr>
-          <w:rFonts w:ascii="Times New Roman" w:eastAsia="Times New Roman" w:hAnsi="Times New Roman" w:cs="Times New Roman"/>
-          <w:sz w:val="36"/>
-          <w:szCs w:val="36"/>
-        </w:rPr>
-        <w:t>-n kellett változtatni, hogy megfeleljen a dokumentációban lévő rajznak. Továbbá összefoglaltuk hogy mennyi hiányzik még a projektből hogy teljesen kész és működő képes legyen.</w:t>
-      </w:r>
-    </w:p>
-    <w:p>
-      <w:pPr>
-        <w:jc w:val="both"/>
-        <w:rPr>
-          <w:rFonts w:ascii="Times New Roman" w:eastAsia="Times New Roman" w:hAnsi="Times New Roman" w:cs="Times New Roman"/>
-          <w:sz w:val="36"/>
-          <w:szCs w:val="36"/>
-        </w:rPr>
-      </w:pPr>
-    </w:p>
-    <w:p>
-      <w:pPr>
-        <w:jc w:val="both"/>
-        <w:rPr>
-          <w:rFonts w:ascii="Times New Roman" w:eastAsia="Times New Roman" w:hAnsi="Times New Roman" w:cs="Times New Roman"/>
-          <w:sz w:val="36"/>
-          <w:szCs w:val="36"/>
-        </w:rPr>
-      </w:pPr>
-      <w:r>
-        <w:rPr>
-          <w:rFonts w:ascii="Times New Roman" w:eastAsia="Times New Roman" w:hAnsi="Times New Roman" w:cs="Times New Roman"/>
-          <w:sz w:val="36"/>
-          <w:szCs w:val="36"/>
-        </w:rPr>
-        <w:t>(Susán Csongor György) A zenebeküldő oldal (</w:t>
-      </w:r>
-      <w:proofErr w:type="spellStart"/>
-      <w:r>
-        <w:rPr>
-          <w:rFonts w:ascii="Times New Roman" w:eastAsia="Times New Roman" w:hAnsi="Times New Roman" w:cs="Times New Roman"/>
-          <w:sz w:val="36"/>
-          <w:szCs w:val="36"/>
-        </w:rPr>
-        <w:t>SendView</w:t>
-      </w:r>
-      <w:proofErr w:type="spellEnd"/>
-      <w:r>
-        <w:rPr>
-          <w:rFonts w:ascii="Times New Roman" w:eastAsia="Times New Roman" w:hAnsi="Times New Roman" w:cs="Times New Roman"/>
-          <w:sz w:val="36"/>
-          <w:szCs w:val="36"/>
-        </w:rPr>
-        <w:t>) újrakezdése és megalkotása validációval és működő adatbevitellel együtt.</w:t>
-      </w:r>
-    </w:p>
-    <w:p>
-      <w:pPr>
-        <w:jc w:val="both"/>
-        <w:rPr>
-          <w:rFonts w:ascii="Times New Roman" w:eastAsia="Times New Roman" w:hAnsi="Times New Roman" w:cs="Times New Roman"/>
-          <w:sz w:val="36"/>
-          <w:szCs w:val="36"/>
-        </w:rPr>
-      </w:pPr>
-      <w:r>
-        <w:rPr>
-          <w:rFonts w:ascii="Times New Roman" w:eastAsia="Times New Roman" w:hAnsi="Times New Roman" w:cs="Times New Roman"/>
-          <w:sz w:val="36"/>
-          <w:szCs w:val="36"/>
-        </w:rPr>
-        <w:t>(El-</w:t>
-      </w:r>
-      <w:proofErr w:type="spellStart"/>
-      <w:r>
-        <w:rPr>
-          <w:rFonts w:ascii="Times New Roman" w:eastAsia="Times New Roman" w:hAnsi="Times New Roman" w:cs="Times New Roman"/>
-          <w:sz w:val="36"/>
-          <w:szCs w:val="36"/>
-        </w:rPr>
-        <w:t>Nabulsy</w:t>
-      </w:r>
-      <w:proofErr w:type="spellEnd"/>
-      <w:r>
-        <w:rPr>
-          <w:rFonts w:ascii="Times New Roman" w:eastAsia="Times New Roman" w:hAnsi="Times New Roman" w:cs="Times New Roman"/>
-          <w:sz w:val="36"/>
-          <w:szCs w:val="36"/>
-        </w:rPr>
-        <w:t xml:space="preserve"> Csongor Alan) A zenebekérő oldal (</w:t>
-      </w:r>
-      <w:proofErr w:type="spellStart"/>
-      <w:r>
-        <w:rPr>
-          <w:rFonts w:ascii="Times New Roman" w:eastAsia="Times New Roman" w:hAnsi="Times New Roman" w:cs="Times New Roman"/>
-          <w:sz w:val="36"/>
-          <w:szCs w:val="36"/>
-        </w:rPr>
-        <w:t>RequestView</w:t>
-      </w:r>
-      <w:proofErr w:type="spellEnd"/>
-      <w:r>
-        <w:rPr>
-          <w:rFonts w:ascii="Times New Roman" w:eastAsia="Times New Roman" w:hAnsi="Times New Roman" w:cs="Times New Roman"/>
-          <w:sz w:val="36"/>
-          <w:szCs w:val="36"/>
-        </w:rPr>
-        <w:t>) újra elkészítése.</w:t>
+        <w:t>Átnéztük mindegyik oldalt hogy néz ki jelenleg, és a RequestView-n kellett változtatni, hogy megfeleljen a dokumentációban lévő rajznak. Továbbá összefoglaltuk hogy mennyi hiányzik még a projektből hogy teljesen kész és működő képes legyen.</w:t>
+      </w:r>
+    </w:p>
+    <w:p>
+      <w:pPr>
+        <w:jc w:val="both"/>
+        <w:rPr>
+          <w:rFonts w:ascii="Times New Roman" w:eastAsia="Times New Roman" w:hAnsi="Times New Roman" w:cs="Times New Roman"/>
+          <w:sz w:val="36"/>
+          <w:szCs w:val="36"/>
+        </w:rPr>
+      </w:pPr>
+    </w:p>
+    <w:p>
+      <w:pPr>
+        <w:jc w:val="both"/>
+        <w:rPr>
+          <w:rFonts w:ascii="Times New Roman" w:eastAsia="Times New Roman" w:hAnsi="Times New Roman" w:cs="Times New Roman"/>
+          <w:sz w:val="36"/>
+          <w:szCs w:val="36"/>
+        </w:rPr>
+      </w:pPr>
+      <w:r>
+        <w:rPr>
+          <w:rFonts w:ascii="Times New Roman" w:eastAsia="Times New Roman" w:hAnsi="Times New Roman" w:cs="Times New Roman"/>
+          <w:sz w:val="36"/>
+          <w:szCs w:val="36"/>
+        </w:rPr>
+        <w:t>(Susán Csongor György) A zenebeküldő oldal (SendView) újrakezdése és megalkotása validációval és működő adatbevitellel együtt.</w:t>
+      </w:r>
+    </w:p>
+    <w:p>
+      <w:pPr>
+        <w:jc w:val="both"/>
+        <w:rPr>
+          <w:rFonts w:ascii="Times New Roman" w:eastAsia="Times New Roman" w:hAnsi="Times New Roman" w:cs="Times New Roman"/>
+          <w:sz w:val="36"/>
+          <w:szCs w:val="36"/>
+        </w:rPr>
+      </w:pPr>
+      <w:r>
+        <w:rPr>
+          <w:rFonts w:ascii="Times New Roman" w:eastAsia="Times New Roman" w:hAnsi="Times New Roman" w:cs="Times New Roman"/>
+          <w:sz w:val="36"/>
+          <w:szCs w:val="36"/>
+        </w:rPr>
+        <w:t>(El-Nabulsy Csongor Alan) A zenebekérő oldal (RequestView) újra elkészítése.</w:t>
       </w:r>
     </w:p>
     <w:p>
@@ -5895,25 +4688,7 @@
           <w:sz w:val="36"/>
           <w:szCs w:val="36"/>
         </w:rPr>
-        <w:t>(El-</w:t>
-      </w:r>
-      <w:proofErr w:type="spellStart"/>
-      <w:r>
-        <w:rPr>
-          <w:rFonts w:ascii="Times New Roman" w:eastAsia="Times New Roman" w:hAnsi="Times New Roman" w:cs="Times New Roman"/>
-          <w:sz w:val="36"/>
-          <w:szCs w:val="36"/>
-        </w:rPr>
-        <w:t>Nabulsy</w:t>
-      </w:r>
-      <w:proofErr w:type="spellEnd"/>
-      <w:r>
-        <w:rPr>
-          <w:rFonts w:ascii="Times New Roman" w:eastAsia="Times New Roman" w:hAnsi="Times New Roman" w:cs="Times New Roman"/>
-          <w:sz w:val="36"/>
-          <w:szCs w:val="36"/>
-        </w:rPr>
-        <w:t xml:space="preserve"> Csongor Alan)</w:t>
+        <w:t>(El-Nabulsy Csongor Alan)</w:t>
       </w:r>
     </w:p>
     <w:p>
@@ -5975,25 +4750,7 @@
           <w:sz w:val="36"/>
           <w:szCs w:val="36"/>
         </w:rPr>
-        <w:t xml:space="preserve">a </w:t>
-      </w:r>
-      <w:proofErr w:type="spellStart"/>
-      <w:r>
-        <w:rPr>
-          <w:rFonts w:ascii="Times New Roman" w:eastAsia="Times New Roman" w:hAnsi="Times New Roman" w:cs="Times New Roman"/>
-          <w:sz w:val="36"/>
-          <w:szCs w:val="36"/>
-        </w:rPr>
-        <w:t>HomeLayout</w:t>
-      </w:r>
-      <w:proofErr w:type="spellEnd"/>
-      <w:r>
-        <w:rPr>
-          <w:rFonts w:ascii="Times New Roman" w:eastAsia="Times New Roman" w:hAnsi="Times New Roman" w:cs="Times New Roman"/>
-          <w:sz w:val="36"/>
-          <w:szCs w:val="36"/>
-        </w:rPr>
-        <w:t>-ba</w:t>
+        <w:t>a HomeLayout-ba</w:t>
       </w:r>
       <w:r>
         <w:rPr>
@@ -6048,25 +4805,7 @@
           <w:sz w:val="36"/>
           <w:szCs w:val="36"/>
         </w:rPr>
-        <w:t xml:space="preserve">a </w:t>
-      </w:r>
-      <w:proofErr w:type="spellStart"/>
-      <w:r>
-        <w:rPr>
-          <w:rFonts w:ascii="Times New Roman" w:eastAsia="Times New Roman" w:hAnsi="Times New Roman" w:cs="Times New Roman"/>
-          <w:sz w:val="36"/>
-          <w:szCs w:val="36"/>
-        </w:rPr>
-        <w:t>RequestVerifyView</w:t>
-      </w:r>
-      <w:proofErr w:type="spellEnd"/>
-      <w:r>
-        <w:rPr>
-          <w:rFonts w:ascii="Times New Roman" w:eastAsia="Times New Roman" w:hAnsi="Times New Roman" w:cs="Times New Roman"/>
-          <w:sz w:val="36"/>
-          <w:szCs w:val="36"/>
-        </w:rPr>
-        <w:t>-ba</w:t>
+        <w:t>a RequestVerifyView-ba</w:t>
       </w:r>
       <w:r>
         <w:rPr>
@@ -6142,133 +4881,7 @@
           <w:sz w:val="36"/>
           <w:szCs w:val="36"/>
         </w:rPr>
-        <w:t xml:space="preserve">A </w:t>
-      </w:r>
-      <w:proofErr w:type="spellStart"/>
-      <w:r>
-        <w:rPr>
-          <w:rFonts w:ascii="Times New Roman" w:eastAsia="Times New Roman" w:hAnsi="Times New Roman" w:cs="Times New Roman"/>
-          <w:sz w:val="36"/>
-          <w:szCs w:val="36"/>
-        </w:rPr>
-        <w:t>Layout-ba</w:t>
-      </w:r>
-      <w:proofErr w:type="spellEnd"/>
-      <w:r>
-        <w:rPr>
-          <w:rFonts w:ascii="Times New Roman" w:eastAsia="Times New Roman" w:hAnsi="Times New Roman" w:cs="Times New Roman"/>
-          <w:sz w:val="36"/>
-          <w:szCs w:val="36"/>
-        </w:rPr>
-        <w:t xml:space="preserve"> megírtuk a függvényt </w:t>
-      </w:r>
-      <w:proofErr w:type="spellStart"/>
-      <w:r>
-        <w:rPr>
-          <w:rFonts w:ascii="Times New Roman" w:eastAsia="Times New Roman" w:hAnsi="Times New Roman" w:cs="Times New Roman"/>
-          <w:sz w:val="36"/>
-          <w:szCs w:val="36"/>
-        </w:rPr>
-        <w:t>axios</w:t>
-      </w:r>
-      <w:proofErr w:type="spellEnd"/>
-      <w:r>
-        <w:rPr>
-          <w:rFonts w:ascii="Times New Roman" w:eastAsia="Times New Roman" w:hAnsi="Times New Roman" w:cs="Times New Roman"/>
-          <w:sz w:val="36"/>
-          <w:szCs w:val="36"/>
-        </w:rPr>
-        <w:t xml:space="preserve"> használatával, amivel majd be lesznek töltve az adatok minden </w:t>
-      </w:r>
-      <w:proofErr w:type="spellStart"/>
-      <w:r>
-        <w:rPr>
-          <w:rFonts w:ascii="Times New Roman" w:eastAsia="Times New Roman" w:hAnsi="Times New Roman" w:cs="Times New Roman"/>
-          <w:sz w:val="36"/>
-          <w:szCs w:val="36"/>
-        </w:rPr>
-        <w:t>home</w:t>
-      </w:r>
-      <w:proofErr w:type="spellEnd"/>
-      <w:r>
-        <w:rPr>
-          <w:rFonts w:ascii="Times New Roman" w:eastAsia="Times New Roman" w:hAnsi="Times New Roman" w:cs="Times New Roman"/>
-          <w:sz w:val="36"/>
-          <w:szCs w:val="36"/>
-        </w:rPr>
-        <w:t xml:space="preserve"> </w:t>
-      </w:r>
-      <w:proofErr w:type="spellStart"/>
-      <w:r>
-        <w:rPr>
-          <w:rFonts w:ascii="Times New Roman" w:eastAsia="Times New Roman" w:hAnsi="Times New Roman" w:cs="Times New Roman"/>
-          <w:sz w:val="36"/>
-          <w:szCs w:val="36"/>
-        </w:rPr>
-        <w:t>page-n</w:t>
-      </w:r>
-      <w:proofErr w:type="spellEnd"/>
-      <w:r>
-        <w:rPr>
-          <w:rFonts w:ascii="Times New Roman" w:eastAsia="Times New Roman" w:hAnsi="Times New Roman" w:cs="Times New Roman"/>
-          <w:sz w:val="36"/>
-          <w:szCs w:val="36"/>
-        </w:rPr>
-        <w:t xml:space="preserve">. Továbbá a </w:t>
-      </w:r>
-      <w:proofErr w:type="spellStart"/>
-      <w:r>
-        <w:rPr>
-          <w:rFonts w:ascii="Times New Roman" w:eastAsia="Times New Roman" w:hAnsi="Times New Roman" w:cs="Times New Roman"/>
-          <w:sz w:val="36"/>
-          <w:szCs w:val="36"/>
-        </w:rPr>
-        <w:t>SchedulerView</w:t>
-      </w:r>
-      <w:proofErr w:type="spellEnd"/>
-      <w:r>
-        <w:rPr>
-          <w:rFonts w:ascii="Times New Roman" w:eastAsia="Times New Roman" w:hAnsi="Times New Roman" w:cs="Times New Roman"/>
-          <w:sz w:val="36"/>
-          <w:szCs w:val="36"/>
-        </w:rPr>
-        <w:t xml:space="preserve"> és a </w:t>
-      </w:r>
-      <w:proofErr w:type="spellStart"/>
-      <w:r>
-        <w:rPr>
-          <w:rFonts w:ascii="Times New Roman" w:eastAsia="Times New Roman" w:hAnsi="Times New Roman" w:cs="Times New Roman"/>
-          <w:sz w:val="36"/>
-          <w:szCs w:val="36"/>
-        </w:rPr>
-        <w:t>RequestVerifyView</w:t>
-      </w:r>
-      <w:proofErr w:type="spellEnd"/>
-      <w:r>
-        <w:rPr>
-          <w:rFonts w:ascii="Times New Roman" w:eastAsia="Times New Roman" w:hAnsi="Times New Roman" w:cs="Times New Roman"/>
-          <w:sz w:val="36"/>
-          <w:szCs w:val="36"/>
-        </w:rPr>
-        <w:t xml:space="preserve"> is külön </w:t>
-      </w:r>
-      <w:proofErr w:type="spellStart"/>
-      <w:r>
-        <w:rPr>
-          <w:rFonts w:ascii="Times New Roman" w:eastAsia="Times New Roman" w:hAnsi="Times New Roman" w:cs="Times New Roman"/>
-          <w:sz w:val="36"/>
-          <w:szCs w:val="36"/>
-        </w:rPr>
-        <w:t>külön</w:t>
-      </w:r>
-      <w:proofErr w:type="spellEnd"/>
-      <w:r>
-        <w:rPr>
-          <w:rFonts w:ascii="Times New Roman" w:eastAsia="Times New Roman" w:hAnsi="Times New Roman" w:cs="Times New Roman"/>
-          <w:sz w:val="36"/>
-          <w:szCs w:val="36"/>
-        </w:rPr>
-        <w:t xml:space="preserve"> megírtuk a függvényt, de csak azokkal az adatokkal amiket szeretnénk hogy betöltsön majd.</w:t>
+        <w:t>A Layout-ba megírtuk a függvényt axios használatával, amivel majd be lesznek töltve az adatok minden home page-n. Továbbá a SchedulerView és a RequestVerifyView is külön külön megírtuk a függvényt, de csak azokkal az adatokkal amiket szeretnénk hogy betöltsön majd.</w:t>
       </w:r>
     </w:p>
     <w:p>
@@ -6362,61 +4975,7 @@
           <w:szCs w:val="36"/>
         </w:rPr>
         <w:lastRenderedPageBreak/>
-        <w:t>A műfajok (</w:t>
-      </w:r>
-      <w:proofErr w:type="spellStart"/>
-      <w:r>
-        <w:rPr>
-          <w:rFonts w:ascii="Times New Roman" w:eastAsia="Times New Roman" w:hAnsi="Times New Roman" w:cs="Times New Roman"/>
-          <w:sz w:val="36"/>
-          <w:szCs w:val="36"/>
-        </w:rPr>
-        <w:t>Genres</w:t>
-      </w:r>
-      <w:proofErr w:type="spellEnd"/>
-      <w:r>
-        <w:rPr>
-          <w:rFonts w:ascii="Times New Roman" w:eastAsia="Times New Roman" w:hAnsi="Times New Roman" w:cs="Times New Roman"/>
-          <w:sz w:val="36"/>
-          <w:szCs w:val="36"/>
-        </w:rPr>
-        <w:t xml:space="preserve">) tábla kitörlése a helyi projektből és a </w:t>
-      </w:r>
-      <w:proofErr w:type="spellStart"/>
-      <w:r>
-        <w:rPr>
-          <w:rFonts w:ascii="Times New Roman" w:eastAsia="Times New Roman" w:hAnsi="Times New Roman" w:cs="Times New Roman"/>
-          <w:sz w:val="36"/>
-          <w:szCs w:val="36"/>
-        </w:rPr>
-        <w:t>repositoryból</w:t>
-      </w:r>
-      <w:proofErr w:type="spellEnd"/>
-      <w:r>
-        <w:rPr>
-          <w:rFonts w:ascii="Times New Roman" w:eastAsia="Times New Roman" w:hAnsi="Times New Roman" w:cs="Times New Roman"/>
-          <w:sz w:val="36"/>
-          <w:szCs w:val="36"/>
-        </w:rPr>
-        <w:t xml:space="preserve">, mivel annak a szerepét már egy statikus lista vette át a </w:t>
-      </w:r>
-      <w:proofErr w:type="spellStart"/>
-      <w:r>
-        <w:rPr>
-          <w:rFonts w:ascii="Times New Roman" w:eastAsia="Times New Roman" w:hAnsi="Times New Roman" w:cs="Times New Roman"/>
-          <w:sz w:val="36"/>
-          <w:szCs w:val="36"/>
-        </w:rPr>
-        <w:t>migrationben</w:t>
-      </w:r>
-      <w:proofErr w:type="spellEnd"/>
-      <w:r>
-        <w:rPr>
-          <w:rFonts w:ascii="Times New Roman" w:eastAsia="Times New Roman" w:hAnsi="Times New Roman" w:cs="Times New Roman"/>
-          <w:sz w:val="36"/>
-          <w:szCs w:val="36"/>
-        </w:rPr>
-        <w:t>.</w:t>
+        <w:t>A műfajok (Genres) tábla kitörlése a helyi projektből és a repositoryból, mivel annak a szerepét már egy statikus lista vette át a migrationben.</w:t>
       </w:r>
     </w:p>
     <w:p>
@@ -6439,97 +4998,7 @@
           <w:sz w:val="36"/>
           <w:szCs w:val="36"/>
         </w:rPr>
-        <w:t xml:space="preserve">A bejelentkezést biztosító kód tovább írása (a </w:t>
-      </w:r>
-      <w:proofErr w:type="spellStart"/>
-      <w:r>
-        <w:rPr>
-          <w:rFonts w:ascii="Times New Roman" w:eastAsia="Times New Roman" w:hAnsi="Times New Roman" w:cs="Times New Roman"/>
-          <w:sz w:val="36"/>
-          <w:szCs w:val="36"/>
-        </w:rPr>
-        <w:t>check</w:t>
-      </w:r>
-      <w:proofErr w:type="spellEnd"/>
-      <w:r>
-        <w:rPr>
-          <w:rFonts w:ascii="Times New Roman" w:eastAsia="Times New Roman" w:hAnsi="Times New Roman" w:cs="Times New Roman"/>
-          <w:sz w:val="36"/>
-          <w:szCs w:val="36"/>
-        </w:rPr>
-        <w:t xml:space="preserve"> függvény egy már elvetett logika mentén épül, annak a tartalma ki lett ürítve, a </w:t>
-      </w:r>
-      <w:proofErr w:type="spellStart"/>
-      <w:r>
-        <w:rPr>
-          <w:rFonts w:ascii="Times New Roman" w:eastAsia="Times New Roman" w:hAnsi="Times New Roman" w:cs="Times New Roman"/>
-          <w:sz w:val="36"/>
-          <w:szCs w:val="36"/>
-        </w:rPr>
-        <w:t>WaitingView</w:t>
-      </w:r>
-      <w:proofErr w:type="spellEnd"/>
-      <w:r>
-        <w:rPr>
-          <w:rFonts w:ascii="Times New Roman" w:eastAsia="Times New Roman" w:hAnsi="Times New Roman" w:cs="Times New Roman"/>
-          <w:sz w:val="36"/>
-          <w:szCs w:val="36"/>
-        </w:rPr>
-        <w:t xml:space="preserve"> beépítve a </w:t>
-      </w:r>
-      <w:proofErr w:type="spellStart"/>
-      <w:r>
-        <w:rPr>
-          <w:rFonts w:ascii="Times New Roman" w:eastAsia="Times New Roman" w:hAnsi="Times New Roman" w:cs="Times New Roman"/>
-          <w:sz w:val="36"/>
-          <w:szCs w:val="36"/>
-        </w:rPr>
-        <w:t>routingba</w:t>
-      </w:r>
-      <w:proofErr w:type="spellEnd"/>
-      <w:r>
-        <w:rPr>
-          <w:rFonts w:ascii="Times New Roman" w:eastAsia="Times New Roman" w:hAnsi="Times New Roman" w:cs="Times New Roman"/>
-          <w:sz w:val="36"/>
-          <w:szCs w:val="36"/>
-        </w:rPr>
-        <w:t xml:space="preserve">, emellett egy </w:t>
-      </w:r>
-      <w:proofErr w:type="spellStart"/>
-      <w:r>
-        <w:rPr>
-          <w:rFonts w:ascii="Times New Roman" w:eastAsia="Times New Roman" w:hAnsi="Times New Roman" w:cs="Times New Roman"/>
-          <w:sz w:val="36"/>
-          <w:szCs w:val="36"/>
-        </w:rPr>
-        <w:t>autentikáció</w:t>
-      </w:r>
-      <w:proofErr w:type="spellEnd"/>
-      <w:r>
-        <w:rPr>
-          <w:rFonts w:ascii="Times New Roman" w:eastAsia="Times New Roman" w:hAnsi="Times New Roman" w:cs="Times New Roman"/>
-          <w:sz w:val="36"/>
-          <w:szCs w:val="36"/>
-        </w:rPr>
-        <w:t xml:space="preserve"> alapján elérhetőséget eldöntő logika a router </w:t>
-      </w:r>
-      <w:proofErr w:type="spellStart"/>
-      <w:r>
-        <w:rPr>
-          <w:rFonts w:ascii="Times New Roman" w:eastAsia="Times New Roman" w:hAnsi="Times New Roman" w:cs="Times New Roman"/>
-          <w:sz w:val="36"/>
-          <w:szCs w:val="36"/>
-        </w:rPr>
-        <w:t>guardban</w:t>
-      </w:r>
-      <w:proofErr w:type="spellEnd"/>
-      <w:r>
-        <w:rPr>
-          <w:rFonts w:ascii="Times New Roman" w:eastAsia="Times New Roman" w:hAnsi="Times New Roman" w:cs="Times New Roman"/>
-          <w:sz w:val="36"/>
-          <w:szCs w:val="36"/>
-        </w:rPr>
-        <w:t>, ami még egyelőre nem működik)</w:t>
+        <w:t>A bejelentkezést biztosító kód tovább írása (a check függvény egy már elvetett logika mentén épül, annak a tartalma ki lett ürítve, a WaitingView beépítve a routingba, emellett egy autentikáció alapján elérhetőséget eldöntő logika a router guardban, ami még egyelőre nem működik)</w:t>
       </w:r>
       <w:r>
         <w:rPr>
@@ -6568,43 +5037,7 @@
           <w:sz w:val="36"/>
           <w:szCs w:val="36"/>
         </w:rPr>
-        <w:t xml:space="preserve"> (</w:t>
-      </w:r>
-      <w:proofErr w:type="spellStart"/>
-      <w:r>
-        <w:rPr>
-          <w:rFonts w:ascii="Times New Roman" w:eastAsia="Times New Roman" w:hAnsi="Times New Roman" w:cs="Times New Roman"/>
-          <w:sz w:val="36"/>
-          <w:szCs w:val="36"/>
-        </w:rPr>
-        <w:t>RequestView</w:t>
-      </w:r>
-      <w:proofErr w:type="spellEnd"/>
-      <w:r>
-        <w:rPr>
-          <w:rFonts w:ascii="Times New Roman" w:eastAsia="Times New Roman" w:hAnsi="Times New Roman" w:cs="Times New Roman"/>
-          <w:sz w:val="36"/>
-          <w:szCs w:val="36"/>
-        </w:rPr>
-        <w:t xml:space="preserve">, </w:t>
-      </w:r>
-      <w:proofErr w:type="spellStart"/>
-      <w:r>
-        <w:rPr>
-          <w:rFonts w:ascii="Times New Roman" w:eastAsia="Times New Roman" w:hAnsi="Times New Roman" w:cs="Times New Roman"/>
-          <w:sz w:val="36"/>
-          <w:szCs w:val="36"/>
-        </w:rPr>
-        <w:t>RequestVerifyView</w:t>
-      </w:r>
-      <w:proofErr w:type="spellEnd"/>
-      <w:r>
-        <w:rPr>
-          <w:rFonts w:ascii="Times New Roman" w:eastAsia="Times New Roman" w:hAnsi="Times New Roman" w:cs="Times New Roman"/>
-          <w:sz w:val="36"/>
-          <w:szCs w:val="36"/>
-        </w:rPr>
-        <w:t>)</w:t>
+        <w:t xml:space="preserve"> (RequestView, RequestVerifyView)</w:t>
       </w:r>
       <w:r>
         <w:rPr>
@@ -6620,25 +5053,7 @@
           <w:sz w:val="36"/>
           <w:szCs w:val="36"/>
         </w:rPr>
-        <w:t>hez szükséges komponensek (</w:t>
-      </w:r>
-      <w:proofErr w:type="spellStart"/>
-      <w:r>
-        <w:rPr>
-          <w:rFonts w:ascii="Times New Roman" w:eastAsia="Times New Roman" w:hAnsi="Times New Roman" w:cs="Times New Roman"/>
-          <w:sz w:val="36"/>
-          <w:szCs w:val="36"/>
-        </w:rPr>
-        <w:t>RequestableMusicRow</w:t>
-      </w:r>
-      <w:proofErr w:type="spellEnd"/>
-      <w:r>
-        <w:rPr>
-          <w:rFonts w:ascii="Times New Roman" w:eastAsia="Times New Roman" w:hAnsi="Times New Roman" w:cs="Times New Roman"/>
-          <w:sz w:val="36"/>
-          <w:szCs w:val="36"/>
-        </w:rPr>
-        <w:t xml:space="preserve">) </w:t>
+        <w:t xml:space="preserve">hez szükséges komponensek (RequestableMusicRow) </w:t>
       </w:r>
       <w:r>
         <w:rPr>
@@ -6698,25 +5113,7 @@
           <w:sz w:val="36"/>
           <w:szCs w:val="36"/>
         </w:rPr>
-        <w:t>El-</w:t>
-      </w:r>
-      <w:proofErr w:type="spellStart"/>
-      <w:r>
-        <w:rPr>
-          <w:rFonts w:ascii="Times New Roman" w:eastAsia="Times New Roman" w:hAnsi="Times New Roman" w:cs="Times New Roman"/>
-          <w:sz w:val="36"/>
-          <w:szCs w:val="36"/>
-        </w:rPr>
-        <w:t>Nabulsy</w:t>
-      </w:r>
-      <w:proofErr w:type="spellEnd"/>
-      <w:r>
-        <w:rPr>
-          <w:rFonts w:ascii="Times New Roman" w:eastAsia="Times New Roman" w:hAnsi="Times New Roman" w:cs="Times New Roman"/>
-          <w:sz w:val="36"/>
-          <w:szCs w:val="36"/>
-        </w:rPr>
-        <w:t xml:space="preserve"> Csongor Alan</w:t>
+        <w:t>El-Nabulsy Csongor Alan</w:t>
       </w:r>
       <w:r>
         <w:rPr>
@@ -6786,36 +5183,8 @@
           <w:sz w:val="36"/>
           <w:szCs w:val="36"/>
         </w:rPr>
-        <w:t xml:space="preserve">Elkészült a </w:t>
-      </w:r>
-      <w:proofErr w:type="spellStart"/>
-      <w:r>
-        <w:rPr>
-          <w:rFonts w:ascii="Times New Roman" w:eastAsia="Times New Roman" w:hAnsi="Times New Roman" w:cs="Times New Roman"/>
-          <w:sz w:val="36"/>
-          <w:szCs w:val="36"/>
-        </w:rPr>
-        <w:t>RequestedMusicController</w:t>
-      </w:r>
-      <w:proofErr w:type="spellEnd"/>
-      <w:r>
-        <w:rPr>
-          <w:rFonts w:ascii="Times New Roman" w:eastAsia="Times New Roman" w:hAnsi="Times New Roman" w:cs="Times New Roman"/>
-          <w:sz w:val="36"/>
-          <w:szCs w:val="36"/>
-        </w:rPr>
-        <w:t xml:space="preserve"> és az </w:t>
-      </w:r>
-      <w:proofErr w:type="spellStart"/>
-      <w:r>
-        <w:rPr>
-          <w:rFonts w:ascii="Times New Roman" w:eastAsia="Times New Roman" w:hAnsi="Times New Roman" w:cs="Times New Roman"/>
-          <w:sz w:val="36"/>
-          <w:szCs w:val="36"/>
-        </w:rPr>
-        <w:t>AcceptedMusicController</w:t>
-      </w:r>
-      <w:proofErr w:type="spellEnd"/>
+        <w:t>Elkészült a RequestedMusicController és az AcceptedMusicController</w:t>
+      </w:r>
     </w:p>
     <w:p>
       <w:pPr>
@@ -6866,9 +5235,8 @@
           <w:lang w:eastAsia="hu-HU"/>
           <w14:ligatures w14:val="none"/>
         </w:rPr>
-        <w:t xml:space="preserve">Összegyűjtöttük hogy nagyrészben mik nem működnek, kellenek még ahhoz hogy </w:t>
-      </w:r>
-      <w:proofErr w:type="spellStart"/>
+        <w:t xml:space="preserve">Összegyűjtöttük hogy nagyrészben mik nem működnek, kellenek még ahhoz hogy működjön az oldal, elkészítettem azt </w:t>
+      </w:r>
       <w:r>
         <w:rPr>
           <w:rFonts w:ascii="Times New Roman" w:eastAsia="Times New Roman" w:hAnsi="Times New Roman" w:cs="Times New Roman"/>
@@ -6877,9 +5245,9 @@
           <w:lang w:eastAsia="hu-HU"/>
           <w14:ligatures w14:val="none"/>
         </w:rPr>
-        <w:t>működjön</w:t>
-      </w:r>
-      <w:proofErr w:type="spellEnd"/>
+        <w:lastRenderedPageBreak/>
+        <w:t>a részt hogy most</w:t>
+      </w:r>
       <w:r>
         <w:rPr>
           <w:rFonts w:ascii="Times New Roman" w:eastAsia="Times New Roman" w:hAnsi="Times New Roman" w:cs="Times New Roman"/>
@@ -6888,7 +5256,7 @@
           <w:lang w:eastAsia="hu-HU"/>
           <w14:ligatures w14:val="none"/>
         </w:rPr>
-        <w:t xml:space="preserve"> az oldal, elkészítettem azt </w:t>
+        <w:t xml:space="preserve"> </w:t>
       </w:r>
       <w:r>
         <w:rPr>
@@ -6898,41 +5266,464 @@
           <w:lang w:eastAsia="hu-HU"/>
           <w14:ligatures w14:val="none"/>
         </w:rPr>
+        <w:t>már a rendezői felületen megjelennek az adatok, és az oszlopokból be lehet rakni a lejátszási listába, a lejátszási listában pedig lehet rendezni a számokat, vagy törölni onnan őket. Elkezdtem a kereső bár megcsinálni, viszont nem akart betölteni az oldal ezért mára feladtam, majd holnap neki ülök újra. Továbbá teszteltük az oldalak működését, a legtöbb helyen már betöltöttek és úgy működik az oldal ahogy az meglett tervezve.</w:t>
+      </w:r>
+    </w:p>
+    <w:p>
+      <w:pPr>
+        <w:jc w:val="both"/>
+        <w:rPr>
+          <w:rFonts w:ascii="Times New Roman" w:eastAsia="Times New Roman" w:hAnsi="Times New Roman" w:cs="Times New Roman"/>
+          <w:sz w:val="36"/>
+          <w:szCs w:val="36"/>
+        </w:rPr>
+      </w:pPr>
+    </w:p>
+    <w:p>
+      <w:pPr>
+        <w:jc w:val="both"/>
+        <w:rPr>
+          <w:rFonts w:ascii="Times New Roman" w:eastAsia="Times New Roman" w:hAnsi="Times New Roman" w:cs="Times New Roman"/>
+          <w:b/>
+          <w:bCs/>
+          <w:sz w:val="40"/>
+          <w:szCs w:val="40"/>
+        </w:rPr>
+      </w:pPr>
+      <w:r>
+        <w:rPr>
+          <w:rFonts w:ascii="Times New Roman" w:eastAsia="Times New Roman" w:hAnsi="Times New Roman" w:cs="Times New Roman"/>
+          <w:b/>
+          <w:bCs/>
+          <w:sz w:val="40"/>
+          <w:szCs w:val="40"/>
+        </w:rPr>
+        <w:t>2026-04-21 11:35-13:40</w:t>
+      </w:r>
+    </w:p>
+    <w:p>
+      <w:pPr>
+        <w:jc w:val="both"/>
+        <w:rPr>
+          <w:rFonts w:ascii="Times New Roman" w:eastAsia="Times New Roman" w:hAnsi="Times New Roman" w:cs="Times New Roman"/>
+          <w:sz w:val="36"/>
+          <w:szCs w:val="36"/>
+        </w:rPr>
+      </w:pPr>
+      <w:r>
+        <w:rPr>
+          <w:rFonts w:ascii="Times New Roman" w:eastAsia="Times New Roman" w:hAnsi="Times New Roman" w:cs="Times New Roman"/>
+          <w:sz w:val="36"/>
+          <w:szCs w:val="36"/>
+        </w:rPr>
+        <w:t>(</w:t>
+      </w:r>
+      <w:r>
+        <w:rPr>
+          <w:rFonts w:ascii="Times New Roman" w:eastAsia="Times New Roman" w:hAnsi="Times New Roman" w:cs="Times New Roman"/>
+          <w:sz w:val="36"/>
+          <w:szCs w:val="36"/>
+        </w:rPr>
+        <w:t>El-Nabulsy Csongor Alan</w:t>
+      </w:r>
+      <w:r>
+        <w:rPr>
+          <w:rFonts w:ascii="Times New Roman" w:eastAsia="Times New Roman" w:hAnsi="Times New Roman" w:cs="Times New Roman"/>
+          <w:sz w:val="36"/>
+          <w:szCs w:val="36"/>
+        </w:rPr>
+        <w:t>)</w:t>
+      </w:r>
+    </w:p>
+    <w:p>
+      <w:pPr>
+        <w:pStyle w:val="Listaszerbekezds"/>
+        <w:numPr>
+          <w:ilvl w:val="0"/>
+          <w:numId w:val="15"/>
+        </w:numPr>
+        <w:jc w:val="both"/>
+        <w:rPr>
+          <w:rFonts w:ascii="Times New Roman" w:eastAsia="Times New Roman" w:hAnsi="Times New Roman" w:cs="Times New Roman"/>
+          <w:sz w:val="36"/>
+          <w:szCs w:val="36"/>
+        </w:rPr>
+      </w:pPr>
+      <w:r>
+        <w:rPr>
+          <w:rFonts w:ascii="Times New Roman" w:eastAsia="Times New Roman" w:hAnsi="Times New Roman" w:cs="Times New Roman"/>
+          <w:sz w:val="36"/>
+          <w:szCs w:val="36"/>
+        </w:rPr>
+        <w:t>Nem jelenik meg az url-ben a</w:t>
+      </w:r>
+      <w:r>
+        <w:rPr>
+          <w:rFonts w:ascii="Times New Roman" w:eastAsia="Times New Roman" w:hAnsi="Times New Roman" w:cs="Times New Roman"/>
+          <w:sz w:val="36"/>
+          <w:szCs w:val="36"/>
+        </w:rPr>
+        <w:t xml:space="preserve"> user</w:t>
+      </w:r>
+      <w:r>
+        <w:rPr>
+          <w:rFonts w:ascii="Times New Roman" w:eastAsia="Times New Roman" w:hAnsi="Times New Roman" w:cs="Times New Roman"/>
+          <w:sz w:val="36"/>
+          <w:szCs w:val="36"/>
+        </w:rPr>
+        <w:t xml:space="preserve"> felhasználóneve és jelsz</w:t>
+      </w:r>
+      <w:r>
+        <w:rPr>
+          <w:rFonts w:ascii="Times New Roman" w:eastAsia="Times New Roman" w:hAnsi="Times New Roman" w:cs="Times New Roman"/>
+          <w:sz w:val="36"/>
+          <w:szCs w:val="36"/>
+        </w:rPr>
+        <w:t>ava</w:t>
+      </w:r>
+      <w:r>
+        <w:rPr>
+          <w:rFonts w:ascii="Times New Roman" w:eastAsia="Times New Roman" w:hAnsi="Times New Roman" w:cs="Times New Roman"/>
+          <w:sz w:val="36"/>
+          <w:szCs w:val="36"/>
+        </w:rPr>
+        <w:t>!</w:t>
+      </w:r>
+    </w:p>
+    <w:p>
+      <w:pPr>
+        <w:pStyle w:val="Listaszerbekezds"/>
+        <w:numPr>
+          <w:ilvl w:val="0"/>
+          <w:numId w:val="15"/>
+        </w:numPr>
+        <w:jc w:val="both"/>
+        <w:rPr>
+          <w:rFonts w:ascii="Times New Roman" w:eastAsia="Times New Roman" w:hAnsi="Times New Roman" w:cs="Times New Roman"/>
+          <w:sz w:val="36"/>
+          <w:szCs w:val="36"/>
+        </w:rPr>
+      </w:pPr>
+      <w:r>
+        <w:rPr>
+          <w:rFonts w:ascii="Times New Roman" w:eastAsia="Times New Roman" w:hAnsi="Times New Roman" w:cs="Times New Roman"/>
+          <w:sz w:val="36"/>
+          <w:szCs w:val="36"/>
+        </w:rPr>
+        <w:t>Regisztráci</w:t>
+      </w:r>
+      <w:r>
+        <w:rPr>
+          <w:rFonts w:ascii="Times New Roman" w:eastAsia="Times New Roman" w:hAnsi="Times New Roman" w:cs="Times New Roman"/>
+          <w:sz w:val="36"/>
+          <w:szCs w:val="36"/>
+        </w:rPr>
+        <w:t>ó</w:t>
+      </w:r>
+      <w:r>
+        <w:rPr>
+          <w:rFonts w:ascii="Times New Roman" w:eastAsia="Times New Roman" w:hAnsi="Times New Roman" w:cs="Times New Roman"/>
+          <w:sz w:val="36"/>
+          <w:szCs w:val="36"/>
+        </w:rPr>
+        <w:t xml:space="preserve"> után átdob a waiting oldalra,</w:t>
+      </w:r>
+    </w:p>
+    <w:p>
+      <w:pPr>
+        <w:pStyle w:val="Listaszerbekezds"/>
+        <w:numPr>
+          <w:ilvl w:val="0"/>
+          <w:numId w:val="15"/>
+        </w:numPr>
+        <w:jc w:val="both"/>
+        <w:rPr>
+          <w:rFonts w:ascii="Times New Roman" w:eastAsia="Times New Roman" w:hAnsi="Times New Roman" w:cs="Times New Roman"/>
+          <w:sz w:val="36"/>
+          <w:szCs w:val="36"/>
+        </w:rPr>
+      </w:pPr>
+      <w:r>
+        <w:rPr>
+          <w:rFonts w:ascii="Times New Roman" w:eastAsia="Times New Roman" w:hAnsi="Times New Roman" w:cs="Times New Roman"/>
+          <w:sz w:val="36"/>
+          <w:szCs w:val="36"/>
+        </w:rPr>
+        <w:t>(Susán)</w:t>
+      </w:r>
+      <w:r>
+        <w:rPr>
+          <w:rFonts w:ascii="Times New Roman" w:eastAsia="Times New Roman" w:hAnsi="Times New Roman" w:cs="Times New Roman"/>
+          <w:sz w:val="36"/>
+          <w:szCs w:val="36"/>
+        </w:rPr>
+        <w:t xml:space="preserve"> </w:t>
+      </w:r>
+      <w:r>
+        <w:rPr>
+          <w:rFonts w:ascii="Times New Roman" w:eastAsia="Times New Roman" w:hAnsi="Times New Roman" w:cs="Times New Roman"/>
+          <w:sz w:val="36"/>
+          <w:szCs w:val="36"/>
+        </w:rPr>
+        <w:t>pending user-ek megjelenítése</w:t>
+      </w:r>
+    </w:p>
+    <w:p>
+      <w:pPr>
+        <w:pStyle w:val="Listaszerbekezds"/>
+        <w:numPr>
+          <w:ilvl w:val="0"/>
+          <w:numId w:val="15"/>
+        </w:numPr>
+        <w:jc w:val="both"/>
+        <w:rPr>
+          <w:rFonts w:ascii="Times New Roman" w:eastAsia="Times New Roman" w:hAnsi="Times New Roman" w:cs="Times New Roman"/>
+          <w:sz w:val="36"/>
+          <w:szCs w:val="36"/>
+        </w:rPr>
+      </w:pPr>
+      <w:r>
+        <w:rPr>
+          <w:rFonts w:ascii="Times New Roman" w:eastAsia="Times New Roman" w:hAnsi="Times New Roman" w:cs="Times New Roman"/>
+          <w:sz w:val="36"/>
+          <w:szCs w:val="36"/>
+        </w:rPr>
+        <w:t>Pending user-ek megjelennek</w:t>
+      </w:r>
+    </w:p>
+    <w:p>
+      <w:pPr>
+        <w:pStyle w:val="Listaszerbekezds"/>
+        <w:numPr>
+          <w:ilvl w:val="0"/>
+          <w:numId w:val="15"/>
+        </w:numPr>
+        <w:jc w:val="both"/>
+        <w:rPr>
+          <w:rFonts w:ascii="Times New Roman" w:eastAsia="Times New Roman" w:hAnsi="Times New Roman" w:cs="Times New Roman"/>
+          <w:sz w:val="36"/>
+          <w:szCs w:val="36"/>
+        </w:rPr>
+      </w:pPr>
+      <w:r>
+        <w:rPr>
+          <w:rFonts w:ascii="Times New Roman" w:eastAsia="Times New Roman" w:hAnsi="Times New Roman" w:cs="Times New Roman"/>
+          <w:sz w:val="36"/>
+          <w:szCs w:val="36"/>
+        </w:rPr>
+        <w:t>Impresszum: két alfejléc készítette, felhasznált programok</w:t>
+      </w:r>
+    </w:p>
+    <w:p>
+      <w:pPr>
+        <w:pStyle w:val="Listaszerbekezds"/>
+        <w:numPr>
+          <w:ilvl w:val="0"/>
+          <w:numId w:val="15"/>
+        </w:numPr>
+        <w:jc w:val="both"/>
+        <w:rPr>
+          <w:rFonts w:ascii="Times New Roman" w:eastAsia="Times New Roman" w:hAnsi="Times New Roman" w:cs="Times New Roman"/>
+          <w:sz w:val="36"/>
+          <w:szCs w:val="36"/>
+        </w:rPr>
+      </w:pPr>
+      <w:r>
+        <w:rPr>
+          <w:rFonts w:ascii="Times New Roman" w:eastAsia="Times New Roman" w:hAnsi="Times New Roman" w:cs="Times New Roman"/>
+          <w:sz w:val="36"/>
+          <w:szCs w:val="36"/>
+        </w:rPr>
+        <w:t>Hogyan lábléc kész</w:t>
+      </w:r>
+    </w:p>
+    <w:p>
+      <w:pPr>
+        <w:jc w:val="both"/>
+        <w:rPr>
+          <w:rFonts w:ascii="Times New Roman" w:eastAsia="Times New Roman" w:hAnsi="Times New Roman" w:cs="Times New Roman"/>
+          <w:sz w:val="36"/>
+          <w:szCs w:val="36"/>
+        </w:rPr>
+      </w:pPr>
+    </w:p>
+    <w:p>
+      <w:pPr>
+        <w:jc w:val="both"/>
+        <w:rPr>
+          <w:rFonts w:ascii="Times New Roman" w:eastAsia="Times New Roman" w:hAnsi="Times New Roman" w:cs="Times New Roman"/>
+          <w:b/>
+          <w:bCs/>
+          <w:sz w:val="40"/>
+          <w:szCs w:val="40"/>
+        </w:rPr>
+      </w:pPr>
+      <w:r>
+        <w:rPr>
+          <w:rFonts w:ascii="Times New Roman" w:eastAsia="Times New Roman" w:hAnsi="Times New Roman" w:cs="Times New Roman"/>
+          <w:b/>
+          <w:bCs/>
+          <w:sz w:val="40"/>
+          <w:szCs w:val="40"/>
+        </w:rPr>
+        <w:t>2026-04-21 18:00-</w:t>
+      </w:r>
+      <w:r>
+        <w:rPr>
+          <w:rFonts w:ascii="Times New Roman" w:eastAsia="Times New Roman" w:hAnsi="Times New Roman" w:cs="Times New Roman"/>
+          <w:b/>
+          <w:bCs/>
+          <w:sz w:val="40"/>
+          <w:szCs w:val="40"/>
+        </w:rPr>
+        <w:t>19:00</w:t>
+      </w:r>
+      <w:r>
+        <w:rPr>
+          <w:rFonts w:ascii="Times New Roman" w:eastAsia="Times New Roman" w:hAnsi="Times New Roman" w:cs="Times New Roman"/>
+          <w:b/>
+          <w:bCs/>
+          <w:sz w:val="40"/>
+          <w:szCs w:val="40"/>
+        </w:rPr>
+        <w:t>, 20:35-</w:t>
+      </w:r>
+      <w:r>
+        <w:rPr>
+          <w:rFonts w:ascii="Times New Roman" w:eastAsia="Times New Roman" w:hAnsi="Times New Roman" w:cs="Times New Roman"/>
+          <w:b/>
+          <w:bCs/>
+          <w:sz w:val="40"/>
+          <w:szCs w:val="40"/>
+        </w:rPr>
+        <w:t>21:</w:t>
+      </w:r>
+      <w:r>
+        <w:rPr>
+          <w:rFonts w:ascii="Times New Roman" w:eastAsia="Times New Roman" w:hAnsi="Times New Roman" w:cs="Times New Roman"/>
+          <w:b/>
+          <w:bCs/>
+          <w:sz w:val="40"/>
+          <w:szCs w:val="40"/>
+        </w:rPr>
+        <w:t>15</w:t>
+      </w:r>
+    </w:p>
+    <w:p>
+      <w:pPr>
+        <w:jc w:val="both"/>
+        <w:rPr>
+          <w:rFonts w:ascii="Times New Roman" w:eastAsia="Times New Roman" w:hAnsi="Times New Roman" w:cs="Times New Roman"/>
+          <w:sz w:val="36"/>
+          <w:szCs w:val="36"/>
+        </w:rPr>
+      </w:pPr>
+      <w:r>
+        <w:rPr>
+          <w:rFonts w:ascii="Times New Roman" w:eastAsia="Times New Roman" w:hAnsi="Times New Roman" w:cs="Times New Roman"/>
+          <w:sz w:val="36"/>
+          <w:szCs w:val="36"/>
+        </w:rPr>
+        <w:t>(El-Nabulsy Csongor Alan)</w:t>
+      </w:r>
+    </w:p>
+    <w:p>
+      <w:pPr>
+        <w:pStyle w:val="Listaszerbekezds"/>
+        <w:numPr>
+          <w:ilvl w:val="0"/>
+          <w:numId w:val="18"/>
+        </w:numPr>
+        <w:jc w:val="both"/>
+        <w:rPr>
+          <w:rFonts w:ascii="Times New Roman" w:eastAsia="Times New Roman" w:hAnsi="Times New Roman" w:cs="Times New Roman"/>
+          <w:sz w:val="36"/>
+          <w:szCs w:val="36"/>
+        </w:rPr>
+      </w:pPr>
+      <w:r>
+        <w:rPr>
+          <w:rFonts w:ascii="Times New Roman" w:eastAsia="Times New Roman" w:hAnsi="Times New Roman" w:cs="Times New Roman"/>
+          <w:sz w:val="36"/>
+          <w:szCs w:val="36"/>
+        </w:rPr>
+        <w:t>Scheduler-nél az oszlopokban az jelenik meg aminek kell, a kereső bár rendesen működik</w:t>
+      </w:r>
+    </w:p>
+    <w:p>
+      <w:pPr>
+        <w:jc w:val="both"/>
+        <w:rPr>
+          <w:rFonts w:ascii="Times New Roman" w:eastAsia="Times New Roman" w:hAnsi="Times New Roman" w:cs="Times New Roman"/>
+          <w:sz w:val="36"/>
+          <w:szCs w:val="36"/>
+        </w:rPr>
+      </w:pPr>
+    </w:p>
+    <w:p>
+      <w:pPr>
+        <w:jc w:val="both"/>
+        <w:rPr>
+          <w:rFonts w:ascii="Times New Roman" w:eastAsia="Times New Roman" w:hAnsi="Times New Roman" w:cs="Times New Roman"/>
+          <w:sz w:val="36"/>
+          <w:szCs w:val="36"/>
+        </w:rPr>
+      </w:pPr>
+      <w:r>
+        <w:rPr>
+          <w:rFonts w:ascii="Times New Roman" w:eastAsia="Times New Roman" w:hAnsi="Times New Roman" w:cs="Times New Roman"/>
+          <w:sz w:val="36"/>
+          <w:szCs w:val="36"/>
+        </w:rPr>
+        <w:t>(Susán Csongor György)</w:t>
+      </w:r>
+    </w:p>
+    <w:p>
+      <w:pPr>
+        <w:pStyle w:val="Listaszerbekezds"/>
+        <w:numPr>
+          <w:ilvl w:val="0"/>
+          <w:numId w:val="18"/>
+        </w:numPr>
+        <w:jc w:val="both"/>
+        <w:rPr>
+          <w:rFonts w:ascii="Times New Roman" w:eastAsia="Times New Roman" w:hAnsi="Times New Roman" w:cs="Times New Roman"/>
+          <w:sz w:val="36"/>
+          <w:szCs w:val="36"/>
+        </w:rPr>
+      </w:pPr>
+      <w:r>
+        <w:rPr>
+          <w:rFonts w:ascii="Times New Roman" w:eastAsia="Times New Roman" w:hAnsi="Times New Roman" w:cs="Times New Roman"/>
+          <w:sz w:val="36"/>
+          <w:szCs w:val="36"/>
+        </w:rPr>
+        <w:t>A lábfejléc „Technika” című részének megírása</w:t>
+      </w:r>
+    </w:p>
+    <w:p>
+      <w:pPr>
+        <w:pStyle w:val="Listaszerbekezds"/>
+        <w:numPr>
+          <w:ilvl w:val="0"/>
+          <w:numId w:val="18"/>
+        </w:numPr>
+        <w:jc w:val="both"/>
+        <w:rPr>
+          <w:rFonts w:ascii="Times New Roman" w:eastAsia="Times New Roman" w:hAnsi="Times New Roman" w:cs="Times New Roman"/>
+          <w:sz w:val="36"/>
+          <w:szCs w:val="36"/>
+        </w:rPr>
+      </w:pPr>
+      <w:r>
+        <w:rPr>
+          <w:rFonts w:ascii="Times New Roman" w:eastAsia="Times New Roman" w:hAnsi="Times New Roman" w:cs="Times New Roman"/>
+          <w:sz w:val="36"/>
+          <w:szCs w:val="36"/>
+        </w:rPr>
         <w:lastRenderedPageBreak/>
-        <w:t>a részt hogy most</w:t>
-      </w:r>
-      <w:r>
-        <w:rPr>
-          <w:rFonts w:ascii="Times New Roman" w:eastAsia="Times New Roman" w:hAnsi="Times New Roman" w:cs="Times New Roman"/>
-          <w:kern w:val="0"/>
-          <w:sz w:val="36"/>
-          <w:lang w:eastAsia="hu-HU"/>
-          <w14:ligatures w14:val="none"/>
-        </w:rPr>
-        <w:t xml:space="preserve"> </w:t>
-      </w:r>
-      <w:bookmarkStart w:id="0" w:name="_GoBack"/>
-      <w:bookmarkEnd w:id="0"/>
-      <w:r>
-        <w:rPr>
-          <w:rFonts w:ascii="Times New Roman" w:eastAsia="Times New Roman" w:hAnsi="Times New Roman" w:cs="Times New Roman"/>
-          <w:kern w:val="0"/>
-          <w:sz w:val="36"/>
-          <w:lang w:eastAsia="hu-HU"/>
-          <w14:ligatures w14:val="none"/>
-        </w:rPr>
-        <w:t>már a rendezői felületen megjelennek az adatok, és az oszlopokból be lehet rakni a lejátszási listába, a lejátszási listában pedig lehet rendezni a számokat, vagy törölni onnan őket. Elkezdtem a kereső bár megcsinálni, viszont nem akart betölteni az oldal ezért mára feladtam, majd holnap neki ülök újra. Továbbá teszteltük az oldalak működését, a legtöbb helyen már betöltöttek és úgy működik az oldal ahogy az meglett tervezve.</w:t>
-      </w:r>
-    </w:p>
-    <w:p>
-      <w:pPr>
-        <w:jc w:val="both"/>
-        <w:rPr>
-          <w:rFonts w:ascii="Times New Roman" w:eastAsia="Times New Roman" w:hAnsi="Times New Roman" w:cs="Times New Roman"/>
-          <w:sz w:val="36"/>
-          <w:szCs w:val="36"/>
-        </w:rPr>
-      </w:pPr>
+        <w:t>Az elfogadott/elutasított zenék sorának rendezése (ne közvetlenül a dal többi adata után jelenjen meg a státusz, hanem úgy, mint a nyilak a zeneütemezésnél)</w:t>
+      </w:r>
     </w:p>
     <w:sectPr>
       <w:pgSz w:w="11906" w:h="16838"/>
@@ -6945,7 +5736,7 @@
 </file>
 
 <file path=word/numbering.xml><?xml version="1.0" encoding="utf-8"?>
-<w:numbering xmlns:wpc="http://schemas.microsoft.com/office/word/2010/wordprocessingCanvas" xmlns:cx="http://schemas.microsoft.com/office/drawing/2014/chartex" xmlns:cx1="http://schemas.microsoft.com/office/drawing/2015/9/8/chartex" xmlns:cx2="http://schemas.microsoft.com/office/drawing/2015/10/21/chartex" xmlns:cx3="http://schemas.microsoft.com/office/drawing/2016/5/9/chartex" xmlns:cx4="http://schemas.microsoft.com/office/drawing/2016/5/10/chartex" xmlns:cx5="http://schemas.microsoft.com/office/drawing/2016/5/11/chartex" xmlns:cx6="http://schemas.microsoft.com/office/drawing/2016/5/12/chartex" xmlns:cx7="http://schemas.microsoft.com/office/drawing/2016/5/13/chartex" xmlns:cx8="http://schemas.microsoft.com/office/drawing/2016/5/14/chartex" xmlns:mc="http://schemas.openxmlformats.org/markup-compatibility/2006" xmlns:aink="http://schemas.microsoft.com/office/drawing/2016/ink" xmlns:am3d="http://schemas.microsoft.com/office/drawing/2017/model3d" xmlns:o="urn:schemas-microsoft-com:office:office" xmlns:r="http://schemas.openxmlformats.org/officeDocument/2006/relationships" xmlns:m="http://schemas.openxmlformats.org/officeDocument/2006/math" xmlns:v="urn:schemas-microsoft-com:vml" xmlns:wp14="http://schemas.microsoft.com/office/word/2010/wordprocessingDrawing" xmlns:wp="http://schemas.openxmlformats.org/drawingml/2006/wordprocessingDrawing" xmlns:w10="urn:schemas-microsoft-com:office:word" xmlns:w="http://schemas.openxmlformats.org/wordprocessingml/2006/main" xmlns:w14="http://schemas.microsoft.com/office/word/2010/wordml" xmlns:w15="http://schemas.microsoft.com/office/word/2012/wordml" xmlns:w16cid="http://schemas.microsoft.com/office/word/2016/wordml/cid" xmlns:w16se="http://schemas.microsoft.com/office/word/2015/wordml/symex" xmlns:wpg="http://schemas.microsoft.com/office/word/2010/wordprocessingGroup" xmlns:wpi="http://schemas.microsoft.com/office/word/2010/wordprocessingInk" xmlns:wne="http://schemas.microsoft.com/office/word/2006/wordml" xmlns:wps="http://schemas.microsoft.com/office/word/2010/wordprocessingShape" mc:Ignorable="w14 w15 w16se w16cid wp14">
+<w:numbering xmlns:wpc="http://schemas.microsoft.com/office/word/2010/wordprocessingCanvas" xmlns:cx="http://schemas.microsoft.com/office/drawing/2014/chartex" xmlns:cx1="http://schemas.microsoft.com/office/drawing/2015/9/8/chartex" xmlns:cx2="http://schemas.microsoft.com/office/drawing/2015/10/21/chartex" xmlns:cx3="http://schemas.microsoft.com/office/drawing/2016/5/9/chartex" xmlns:cx4="http://schemas.microsoft.com/office/drawing/2016/5/10/chartex" xmlns:cx5="http://schemas.microsoft.com/office/drawing/2016/5/11/chartex" xmlns:cx6="http://schemas.microsoft.com/office/drawing/2016/5/12/chartex" xmlns:cx7="http://schemas.microsoft.com/office/drawing/2016/5/13/chartex" xmlns:cx8="http://schemas.microsoft.com/office/drawing/2016/5/14/chartex" xmlns:mc="http://schemas.openxmlformats.org/markup-compatibility/2006" xmlns:aink="http://schemas.microsoft.com/office/drawing/2016/ink" xmlns:am3d="http://schemas.microsoft.com/office/drawing/2017/model3d" xmlns:o="urn:schemas-microsoft-com:office:office" xmlns:oel="http://schemas.microsoft.com/office/2019/extlst" xmlns:r="http://schemas.openxmlformats.org/officeDocument/2006/relationships" xmlns:m="http://schemas.openxmlformats.org/officeDocument/2006/math" xmlns:v="urn:schemas-microsoft-com:vml" xmlns:wp14="http://schemas.microsoft.com/office/word/2010/wordprocessingDrawing" xmlns:wp="http://schemas.openxmlformats.org/drawingml/2006/wordprocessingDrawing" xmlns:w10="urn:schemas-microsoft-com:office:word" xmlns:w="http://schemas.openxmlformats.org/wordprocessingml/2006/main" xmlns:w14="http://schemas.microsoft.com/office/word/2010/wordml" xmlns:w15="http://schemas.microsoft.com/office/word/2012/wordml" xmlns:w16cex="http://schemas.microsoft.com/office/word/2018/wordml/cex" xmlns:w16cid="http://schemas.microsoft.com/office/word/2016/wordml/cid" xmlns:w16="http://schemas.microsoft.com/office/word/2018/wordml" xmlns:w16du="http://schemas.microsoft.com/office/word/2023/wordml/word16du" xmlns:w16sdtdh="http://schemas.microsoft.com/office/word/2020/wordml/sdtdatahash" xmlns:w16sdtfl="http://schemas.microsoft.com/office/word/2024/wordml/sdtformatlock" xmlns:w16se="http://schemas.microsoft.com/office/word/2015/wordml/symex" xmlns:wpg="http://schemas.microsoft.com/office/word/2010/wordprocessingGroup" xmlns:wpi="http://schemas.microsoft.com/office/word/2010/wordprocessingInk" xmlns:wne="http://schemas.microsoft.com/office/word/2006/wordml" xmlns:wps="http://schemas.microsoft.com/office/word/2010/wordprocessingShape" mc:Ignorable="w14 w15 w16se w16cid w16 w16cex w16sdtdh w16sdtfl w16du wp14">
   <w:numPicBullet w:numPicBulletId="0">
     <w:pict>
       <v:shapetype id="_x0000_t75" coordsize="21600,21600" o:spt="75" o:preferrelative="t" path="m@4@5l@4@11@9@11@9@5xe" filled="f" stroked="f">
@@ -6967,12 +5758,351 @@
         <v:path o:extrusionok="f" gradientshapeok="t" o:connecttype="rect"/>
         <o:lock v:ext="edit" aspectratio="t"/>
       </v:shapetype>
-      <v:shape id="_x0000_i1028" type="#_x0000_t75" style="width:24pt;height:24pt;visibility:visible;mso-wrap-style:square" o:bullet="t">
+      <v:shape id="_x0000_i1025" type="#_x0000_t75" style="width:24pt;height:24pt;visibility:visible;mso-wrap-style:square" o:bullet="t">
         <v:imagedata r:id="rId1" o:title=""/>
       </v:shape>
     </w:pict>
   </w:numPicBullet>
   <w:abstractNum w:abstractNumId="0" w15:restartNumberingAfterBreak="0">
+    <w:nsid w:val="0E340B91"/>
+    <w:multiLevelType w:val="hybridMultilevel"/>
+    <w:tmpl w:val="E63C4E2C"/>
+    <w:lvl w:ilvl="0" w:tplc="040E0001">
+      <w:start w:val="1"/>
+      <w:numFmt w:val="bullet"/>
+      <w:lvlText w:val=""/>
+      <w:lvlJc w:val="left"/>
+      <w:pPr>
+        <w:ind w:left="720" w:hanging="360"/>
+      </w:pPr>
+      <w:rPr>
+        <w:rFonts w:ascii="Symbol" w:hAnsi="Symbol" w:hint="default"/>
+      </w:rPr>
+    </w:lvl>
+    <w:lvl w:ilvl="1" w:tplc="040E0003" w:tentative="1">
+      <w:start w:val="1"/>
+      <w:numFmt w:val="bullet"/>
+      <w:lvlText w:val="o"/>
+      <w:lvlJc w:val="left"/>
+      <w:pPr>
+        <w:ind w:left="1440" w:hanging="360"/>
+      </w:pPr>
+      <w:rPr>
+        <w:rFonts w:ascii="Courier New" w:hAnsi="Courier New" w:cs="Courier New" w:hint="default"/>
+      </w:rPr>
+    </w:lvl>
+    <w:lvl w:ilvl="2" w:tplc="040E0005" w:tentative="1">
+      <w:start w:val="1"/>
+      <w:numFmt w:val="bullet"/>
+      <w:lvlText w:val=""/>
+      <w:lvlJc w:val="left"/>
+      <w:pPr>
+        <w:ind w:left="2160" w:hanging="360"/>
+      </w:pPr>
+      <w:rPr>
+        <w:rFonts w:ascii="Wingdings" w:hAnsi="Wingdings" w:hint="default"/>
+      </w:rPr>
+    </w:lvl>
+    <w:lvl w:ilvl="3" w:tplc="040E0001" w:tentative="1">
+      <w:start w:val="1"/>
+      <w:numFmt w:val="bullet"/>
+      <w:lvlText w:val=""/>
+      <w:lvlJc w:val="left"/>
+      <w:pPr>
+        <w:ind w:left="2880" w:hanging="360"/>
+      </w:pPr>
+      <w:rPr>
+        <w:rFonts w:ascii="Symbol" w:hAnsi="Symbol" w:hint="default"/>
+      </w:rPr>
+    </w:lvl>
+    <w:lvl w:ilvl="4" w:tplc="040E0003" w:tentative="1">
+      <w:start w:val="1"/>
+      <w:numFmt w:val="bullet"/>
+      <w:lvlText w:val="o"/>
+      <w:lvlJc w:val="left"/>
+      <w:pPr>
+        <w:ind w:left="3600" w:hanging="360"/>
+      </w:pPr>
+      <w:rPr>
+        <w:rFonts w:ascii="Courier New" w:hAnsi="Courier New" w:cs="Courier New" w:hint="default"/>
+      </w:rPr>
+    </w:lvl>
+    <w:lvl w:ilvl="5" w:tplc="040E0005" w:tentative="1">
+      <w:start w:val="1"/>
+      <w:numFmt w:val="bullet"/>
+      <w:lvlText w:val=""/>
+      <w:lvlJc w:val="left"/>
+      <w:pPr>
+        <w:ind w:left="4320" w:hanging="360"/>
+      </w:pPr>
+      <w:rPr>
+        <w:rFonts w:ascii="Wingdings" w:hAnsi="Wingdings" w:hint="default"/>
+      </w:rPr>
+    </w:lvl>
+    <w:lvl w:ilvl="6" w:tplc="040E0001" w:tentative="1">
+      <w:start w:val="1"/>
+      <w:numFmt w:val="bullet"/>
+      <w:lvlText w:val=""/>
+      <w:lvlJc w:val="left"/>
+      <w:pPr>
+        <w:ind w:left="5040" w:hanging="360"/>
+      </w:pPr>
+      <w:rPr>
+        <w:rFonts w:ascii="Symbol" w:hAnsi="Symbol" w:hint="default"/>
+      </w:rPr>
+    </w:lvl>
+    <w:lvl w:ilvl="7" w:tplc="040E0003" w:tentative="1">
+      <w:start w:val="1"/>
+      <w:numFmt w:val="bullet"/>
+      <w:lvlText w:val="o"/>
+      <w:lvlJc w:val="left"/>
+      <w:pPr>
+        <w:ind w:left="5760" w:hanging="360"/>
+      </w:pPr>
+      <w:rPr>
+        <w:rFonts w:ascii="Courier New" w:hAnsi="Courier New" w:cs="Courier New" w:hint="default"/>
+      </w:rPr>
+    </w:lvl>
+    <w:lvl w:ilvl="8" w:tplc="040E0005" w:tentative="1">
+      <w:start w:val="1"/>
+      <w:numFmt w:val="bullet"/>
+      <w:lvlText w:val=""/>
+      <w:lvlJc w:val="left"/>
+      <w:pPr>
+        <w:ind w:left="6480" w:hanging="360"/>
+      </w:pPr>
+      <w:rPr>
+        <w:rFonts w:ascii="Wingdings" w:hAnsi="Wingdings" w:hint="default"/>
+      </w:rPr>
+    </w:lvl>
+  </w:abstractNum>
+  <w:abstractNum w:abstractNumId="1" w15:restartNumberingAfterBreak="0">
+    <w:nsid w:val="17403792"/>
+    <w:multiLevelType w:val="hybridMultilevel"/>
+    <w:tmpl w:val="1D90A416"/>
+    <w:lvl w:ilvl="0" w:tplc="040E0001">
+      <w:start w:val="1"/>
+      <w:numFmt w:val="bullet"/>
+      <w:lvlText w:val=""/>
+      <w:lvlJc w:val="left"/>
+      <w:pPr>
+        <w:ind w:left="720" w:hanging="360"/>
+      </w:pPr>
+      <w:rPr>
+        <w:rFonts w:ascii="Symbol" w:hAnsi="Symbol" w:hint="default"/>
+      </w:rPr>
+    </w:lvl>
+    <w:lvl w:ilvl="1" w:tplc="040E0003" w:tentative="1">
+      <w:start w:val="1"/>
+      <w:numFmt w:val="bullet"/>
+      <w:lvlText w:val="o"/>
+      <w:lvlJc w:val="left"/>
+      <w:pPr>
+        <w:ind w:left="1440" w:hanging="360"/>
+      </w:pPr>
+      <w:rPr>
+        <w:rFonts w:ascii="Courier New" w:hAnsi="Courier New" w:cs="Courier New" w:hint="default"/>
+      </w:rPr>
+    </w:lvl>
+    <w:lvl w:ilvl="2" w:tplc="040E0005" w:tentative="1">
+      <w:start w:val="1"/>
+      <w:numFmt w:val="bullet"/>
+      <w:lvlText w:val=""/>
+      <w:lvlJc w:val="left"/>
+      <w:pPr>
+        <w:ind w:left="2160" w:hanging="360"/>
+      </w:pPr>
+      <w:rPr>
+        <w:rFonts w:ascii="Wingdings" w:hAnsi="Wingdings" w:hint="default"/>
+      </w:rPr>
+    </w:lvl>
+    <w:lvl w:ilvl="3" w:tplc="040E0001" w:tentative="1">
+      <w:start w:val="1"/>
+      <w:numFmt w:val="bullet"/>
+      <w:lvlText w:val=""/>
+      <w:lvlJc w:val="left"/>
+      <w:pPr>
+        <w:ind w:left="2880" w:hanging="360"/>
+      </w:pPr>
+      <w:rPr>
+        <w:rFonts w:ascii="Symbol" w:hAnsi="Symbol" w:hint="default"/>
+      </w:rPr>
+    </w:lvl>
+    <w:lvl w:ilvl="4" w:tplc="040E0003" w:tentative="1">
+      <w:start w:val="1"/>
+      <w:numFmt w:val="bullet"/>
+      <w:lvlText w:val="o"/>
+      <w:lvlJc w:val="left"/>
+      <w:pPr>
+        <w:ind w:left="3600" w:hanging="360"/>
+      </w:pPr>
+      <w:rPr>
+        <w:rFonts w:ascii="Courier New" w:hAnsi="Courier New" w:cs="Courier New" w:hint="default"/>
+      </w:rPr>
+    </w:lvl>
+    <w:lvl w:ilvl="5" w:tplc="040E0005" w:tentative="1">
+      <w:start w:val="1"/>
+      <w:numFmt w:val="bullet"/>
+      <w:lvlText w:val=""/>
+      <w:lvlJc w:val="left"/>
+      <w:pPr>
+        <w:ind w:left="4320" w:hanging="360"/>
+      </w:pPr>
+      <w:rPr>
+        <w:rFonts w:ascii="Wingdings" w:hAnsi="Wingdings" w:hint="default"/>
+      </w:rPr>
+    </w:lvl>
+    <w:lvl w:ilvl="6" w:tplc="040E0001" w:tentative="1">
+      <w:start w:val="1"/>
+      <w:numFmt w:val="bullet"/>
+      <w:lvlText w:val=""/>
+      <w:lvlJc w:val="left"/>
+      <w:pPr>
+        <w:ind w:left="5040" w:hanging="360"/>
+      </w:pPr>
+      <w:rPr>
+        <w:rFonts w:ascii="Symbol" w:hAnsi="Symbol" w:hint="default"/>
+      </w:rPr>
+    </w:lvl>
+    <w:lvl w:ilvl="7" w:tplc="040E0003" w:tentative="1">
+      <w:start w:val="1"/>
+      <w:numFmt w:val="bullet"/>
+      <w:lvlText w:val="o"/>
+      <w:lvlJc w:val="left"/>
+      <w:pPr>
+        <w:ind w:left="5760" w:hanging="360"/>
+      </w:pPr>
+      <w:rPr>
+        <w:rFonts w:ascii="Courier New" w:hAnsi="Courier New" w:cs="Courier New" w:hint="default"/>
+      </w:rPr>
+    </w:lvl>
+    <w:lvl w:ilvl="8" w:tplc="040E0005" w:tentative="1">
+      <w:start w:val="1"/>
+      <w:numFmt w:val="bullet"/>
+      <w:lvlText w:val=""/>
+      <w:lvlJc w:val="left"/>
+      <w:pPr>
+        <w:ind w:left="6480" w:hanging="360"/>
+      </w:pPr>
+      <w:rPr>
+        <w:rFonts w:ascii="Wingdings" w:hAnsi="Wingdings" w:hint="default"/>
+      </w:rPr>
+    </w:lvl>
+  </w:abstractNum>
+  <w:abstractNum w:abstractNumId="2" w15:restartNumberingAfterBreak="0">
+    <w:nsid w:val="242A0BE1"/>
+    <w:multiLevelType w:val="hybridMultilevel"/>
+    <w:tmpl w:val="DDF6D144"/>
+    <w:lvl w:ilvl="0" w:tplc="040E0001">
+      <w:start w:val="1"/>
+      <w:numFmt w:val="bullet"/>
+      <w:lvlText w:val=""/>
+      <w:lvlJc w:val="left"/>
+      <w:pPr>
+        <w:ind w:left="720" w:hanging="360"/>
+      </w:pPr>
+      <w:rPr>
+        <w:rFonts w:ascii="Symbol" w:hAnsi="Symbol" w:hint="default"/>
+      </w:rPr>
+    </w:lvl>
+    <w:lvl w:ilvl="1" w:tplc="040E0003" w:tentative="1">
+      <w:start w:val="1"/>
+      <w:numFmt w:val="bullet"/>
+      <w:lvlText w:val="o"/>
+      <w:lvlJc w:val="left"/>
+      <w:pPr>
+        <w:ind w:left="1440" w:hanging="360"/>
+      </w:pPr>
+      <w:rPr>
+        <w:rFonts w:ascii="Courier New" w:hAnsi="Courier New" w:cs="Courier New" w:hint="default"/>
+      </w:rPr>
+    </w:lvl>
+    <w:lvl w:ilvl="2" w:tplc="040E0005" w:tentative="1">
+      <w:start w:val="1"/>
+      <w:numFmt w:val="bullet"/>
+      <w:lvlText w:val=""/>
+      <w:lvlJc w:val="left"/>
+      <w:pPr>
+        <w:ind w:left="2160" w:hanging="360"/>
+      </w:pPr>
+      <w:rPr>
+        <w:rFonts w:ascii="Wingdings" w:hAnsi="Wingdings" w:hint="default"/>
+      </w:rPr>
+    </w:lvl>
+    <w:lvl w:ilvl="3" w:tplc="040E0001" w:tentative="1">
+      <w:start w:val="1"/>
+      <w:numFmt w:val="bullet"/>
+      <w:lvlText w:val=""/>
+      <w:lvlJc w:val="left"/>
+      <w:pPr>
+        <w:ind w:left="2880" w:hanging="360"/>
+      </w:pPr>
+      <w:rPr>
+        <w:rFonts w:ascii="Symbol" w:hAnsi="Symbol" w:hint="default"/>
+      </w:rPr>
+    </w:lvl>
+    <w:lvl w:ilvl="4" w:tplc="040E0003" w:tentative="1">
+      <w:start w:val="1"/>
+      <w:numFmt w:val="bullet"/>
+      <w:lvlText w:val="o"/>
+      <w:lvlJc w:val="left"/>
+      <w:pPr>
+        <w:ind w:left="3600" w:hanging="360"/>
+      </w:pPr>
+      <w:rPr>
+        <w:rFonts w:ascii="Courier New" w:hAnsi="Courier New" w:cs="Courier New" w:hint="default"/>
+      </w:rPr>
+    </w:lvl>
+    <w:lvl w:ilvl="5" w:tplc="040E0005" w:tentative="1">
+      <w:start w:val="1"/>
+      <w:numFmt w:val="bullet"/>
+      <w:lvlText w:val=""/>
+      <w:lvlJc w:val="left"/>
+      <w:pPr>
+        <w:ind w:left="4320" w:hanging="360"/>
+      </w:pPr>
+      <w:rPr>
+        <w:rFonts w:ascii="Wingdings" w:hAnsi="Wingdings" w:hint="default"/>
+      </w:rPr>
+    </w:lvl>
+    <w:lvl w:ilvl="6" w:tplc="040E0001" w:tentative="1">
+      <w:start w:val="1"/>
+      <w:numFmt w:val="bullet"/>
+      <w:lvlText w:val=""/>
+      <w:lvlJc w:val="left"/>
+      <w:pPr>
+        <w:ind w:left="5040" w:hanging="360"/>
+      </w:pPr>
+      <w:rPr>
+        <w:rFonts w:ascii="Symbol" w:hAnsi="Symbol" w:hint="default"/>
+      </w:rPr>
+    </w:lvl>
+    <w:lvl w:ilvl="7" w:tplc="040E0003" w:tentative="1">
+      <w:start w:val="1"/>
+      <w:numFmt w:val="bullet"/>
+      <w:lvlText w:val="o"/>
+      <w:lvlJc w:val="left"/>
+      <w:pPr>
+        <w:ind w:left="5760" w:hanging="360"/>
+      </w:pPr>
+      <w:rPr>
+        <w:rFonts w:ascii="Courier New" w:hAnsi="Courier New" w:cs="Courier New" w:hint="default"/>
+      </w:rPr>
+    </w:lvl>
+    <w:lvl w:ilvl="8" w:tplc="040E0005" w:tentative="1">
+      <w:start w:val="1"/>
+      <w:numFmt w:val="bullet"/>
+      <w:lvlText w:val=""/>
+      <w:lvlJc w:val="left"/>
+      <w:pPr>
+        <w:ind w:left="6480" w:hanging="360"/>
+      </w:pPr>
+      <w:rPr>
+        <w:rFonts w:ascii="Wingdings" w:hAnsi="Wingdings" w:hint="default"/>
+      </w:rPr>
+    </w:lvl>
+  </w:abstractNum>
+  <w:abstractNum w:abstractNumId="3" w15:restartNumberingAfterBreak="0">
     <w:nsid w:val="25B663B5"/>
     <w:multiLevelType w:val="hybridMultilevel"/>
     <w:tmpl w:val="AFC00FD0"/>
@@ -7085,7 +6215,7 @@
       </w:rPr>
     </w:lvl>
   </w:abstractNum>
-  <w:abstractNum w:abstractNumId="1" w15:restartNumberingAfterBreak="0">
+  <w:abstractNum w:abstractNumId="4" w15:restartNumberingAfterBreak="0">
     <w:nsid w:val="2D6C3100"/>
     <w:multiLevelType w:val="hybridMultilevel"/>
     <w:tmpl w:val="240AE6E2"/>
@@ -7198,7 +6328,7 @@
       </w:rPr>
     </w:lvl>
   </w:abstractNum>
-  <w:abstractNum w:abstractNumId="2" w15:restartNumberingAfterBreak="0">
+  <w:abstractNum w:abstractNumId="5" w15:restartNumberingAfterBreak="0">
     <w:nsid w:val="2FAB7B65"/>
     <w:multiLevelType w:val="hybridMultilevel"/>
     <w:tmpl w:val="2F64555A"/>
@@ -7311,7 +6441,7 @@
       </w:rPr>
     </w:lvl>
   </w:abstractNum>
-  <w:abstractNum w:abstractNumId="3" w15:restartNumberingAfterBreak="0">
+  <w:abstractNum w:abstractNumId="6" w15:restartNumberingAfterBreak="0">
     <w:nsid w:val="3C1938F6"/>
     <w:multiLevelType w:val="hybridMultilevel"/>
     <w:tmpl w:val="0816ACA8"/>
@@ -7424,7 +6554,7 @@
       </w:rPr>
     </w:lvl>
   </w:abstractNum>
-  <w:abstractNum w:abstractNumId="4" w15:restartNumberingAfterBreak="0">
+  <w:abstractNum w:abstractNumId="7" w15:restartNumberingAfterBreak="0">
     <w:nsid w:val="47442E3E"/>
     <w:multiLevelType w:val="hybridMultilevel"/>
     <w:tmpl w:val="64928C38"/>
@@ -7537,7 +6667,7 @@
       </w:rPr>
     </w:lvl>
   </w:abstractNum>
-  <w:abstractNum w:abstractNumId="5" w15:restartNumberingAfterBreak="0">
+  <w:abstractNum w:abstractNumId="8" w15:restartNumberingAfterBreak="0">
     <w:nsid w:val="4CA522A2"/>
     <w:multiLevelType w:val="hybridMultilevel"/>
     <w:tmpl w:val="81762318"/>
@@ -7650,7 +6780,7 @@
       </w:rPr>
     </w:lvl>
   </w:abstractNum>
-  <w:abstractNum w:abstractNumId="6" w15:restartNumberingAfterBreak="0">
+  <w:abstractNum w:abstractNumId="9" w15:restartNumberingAfterBreak="0">
     <w:nsid w:val="5B1E66BA"/>
     <w:multiLevelType w:val="hybridMultilevel"/>
     <w:tmpl w:val="56E6462C"/>
@@ -7763,7 +6893,120 @@
       </w:rPr>
     </w:lvl>
   </w:abstractNum>
-  <w:abstractNum w:abstractNumId="7" w15:restartNumberingAfterBreak="0">
+  <w:abstractNum w:abstractNumId="10" w15:restartNumberingAfterBreak="0">
+    <w:nsid w:val="64C346FC"/>
+    <w:multiLevelType w:val="hybridMultilevel"/>
+    <w:tmpl w:val="EAE26AC8"/>
+    <w:lvl w:ilvl="0" w:tplc="040E0001">
+      <w:start w:val="1"/>
+      <w:numFmt w:val="bullet"/>
+      <w:lvlText w:val=""/>
+      <w:lvlJc w:val="left"/>
+      <w:pPr>
+        <w:ind w:left="720" w:hanging="360"/>
+      </w:pPr>
+      <w:rPr>
+        <w:rFonts w:ascii="Symbol" w:hAnsi="Symbol" w:hint="default"/>
+      </w:rPr>
+    </w:lvl>
+    <w:lvl w:ilvl="1" w:tplc="040E0003" w:tentative="1">
+      <w:start w:val="1"/>
+      <w:numFmt w:val="bullet"/>
+      <w:lvlText w:val="o"/>
+      <w:lvlJc w:val="left"/>
+      <w:pPr>
+        <w:ind w:left="1440" w:hanging="360"/>
+      </w:pPr>
+      <w:rPr>
+        <w:rFonts w:ascii="Courier New" w:hAnsi="Courier New" w:cs="Courier New" w:hint="default"/>
+      </w:rPr>
+    </w:lvl>
+    <w:lvl w:ilvl="2" w:tplc="040E0005" w:tentative="1">
+      <w:start w:val="1"/>
+      <w:numFmt w:val="bullet"/>
+      <w:lvlText w:val=""/>
+      <w:lvlJc w:val="left"/>
+      <w:pPr>
+        <w:ind w:left="2160" w:hanging="360"/>
+      </w:pPr>
+      <w:rPr>
+        <w:rFonts w:ascii="Wingdings" w:hAnsi="Wingdings" w:hint="default"/>
+      </w:rPr>
+    </w:lvl>
+    <w:lvl w:ilvl="3" w:tplc="040E0001" w:tentative="1">
+      <w:start w:val="1"/>
+      <w:numFmt w:val="bullet"/>
+      <w:lvlText w:val=""/>
+      <w:lvlJc w:val="left"/>
+      <w:pPr>
+        <w:ind w:left="2880" w:hanging="360"/>
+      </w:pPr>
+      <w:rPr>
+        <w:rFonts w:ascii="Symbol" w:hAnsi="Symbol" w:hint="default"/>
+      </w:rPr>
+    </w:lvl>
+    <w:lvl w:ilvl="4" w:tplc="040E0003" w:tentative="1">
+      <w:start w:val="1"/>
+      <w:numFmt w:val="bullet"/>
+      <w:lvlText w:val="o"/>
+      <w:lvlJc w:val="left"/>
+      <w:pPr>
+        <w:ind w:left="3600" w:hanging="360"/>
+      </w:pPr>
+      <w:rPr>
+        <w:rFonts w:ascii="Courier New" w:hAnsi="Courier New" w:cs="Courier New" w:hint="default"/>
+      </w:rPr>
+    </w:lvl>
+    <w:lvl w:ilvl="5" w:tplc="040E0005" w:tentative="1">
+      <w:start w:val="1"/>
+      <w:numFmt w:val="bullet"/>
+      <w:lvlText w:val=""/>
+      <w:lvlJc w:val="left"/>
+      <w:pPr>
+        <w:ind w:left="4320" w:hanging="360"/>
+      </w:pPr>
+      <w:rPr>
+        <w:rFonts w:ascii="Wingdings" w:hAnsi="Wingdings" w:hint="default"/>
+      </w:rPr>
+    </w:lvl>
+    <w:lvl w:ilvl="6" w:tplc="040E0001" w:tentative="1">
+      <w:start w:val="1"/>
+      <w:numFmt w:val="bullet"/>
+      <w:lvlText w:val=""/>
+      <w:lvlJc w:val="left"/>
+      <w:pPr>
+        <w:ind w:left="5040" w:hanging="360"/>
+      </w:pPr>
+      <w:rPr>
+        <w:rFonts w:ascii="Symbol" w:hAnsi="Symbol" w:hint="default"/>
+      </w:rPr>
+    </w:lvl>
+    <w:lvl w:ilvl="7" w:tplc="040E0003" w:tentative="1">
+      <w:start w:val="1"/>
+      <w:numFmt w:val="bullet"/>
+      <w:lvlText w:val="o"/>
+      <w:lvlJc w:val="left"/>
+      <w:pPr>
+        <w:ind w:left="5760" w:hanging="360"/>
+      </w:pPr>
+      <w:rPr>
+        <w:rFonts w:ascii="Courier New" w:hAnsi="Courier New" w:cs="Courier New" w:hint="default"/>
+      </w:rPr>
+    </w:lvl>
+    <w:lvl w:ilvl="8" w:tplc="040E0005" w:tentative="1">
+      <w:start w:val="1"/>
+      <w:numFmt w:val="bullet"/>
+      <w:lvlText w:val=""/>
+      <w:lvlJc w:val="left"/>
+      <w:pPr>
+        <w:ind w:left="6480" w:hanging="360"/>
+      </w:pPr>
+      <w:rPr>
+        <w:rFonts w:ascii="Wingdings" w:hAnsi="Wingdings" w:hint="default"/>
+      </w:rPr>
+    </w:lvl>
+  </w:abstractNum>
+  <w:abstractNum w:abstractNumId="11" w15:restartNumberingAfterBreak="0">
     <w:nsid w:val="69361338"/>
     <w:multiLevelType w:val="hybridMultilevel"/>
     <w:tmpl w:val="6CF0B772"/>
@@ -7876,7 +7119,7 @@
       </w:rPr>
     </w:lvl>
   </w:abstractNum>
-  <w:abstractNum w:abstractNumId="8" w15:restartNumberingAfterBreak="0">
+  <w:abstractNum w:abstractNumId="12" w15:restartNumberingAfterBreak="0">
     <w:nsid w:val="69FA5A50"/>
     <w:multiLevelType w:val="hybridMultilevel"/>
     <w:tmpl w:val="D82A6326"/>
@@ -7989,7 +7232,7 @@
       </w:rPr>
     </w:lvl>
   </w:abstractNum>
-  <w:abstractNum w:abstractNumId="9" w15:restartNumberingAfterBreak="0">
+  <w:abstractNum w:abstractNumId="13" w15:restartNumberingAfterBreak="0">
     <w:nsid w:val="6E7312B6"/>
     <w:multiLevelType w:val="hybridMultilevel"/>
     <w:tmpl w:val="FD80BAFC"/>
@@ -8102,7 +7345,7 @@
       </w:rPr>
     </w:lvl>
   </w:abstractNum>
-  <w:abstractNum w:abstractNumId="10" w15:restartNumberingAfterBreak="0">
+  <w:abstractNum w:abstractNumId="14" w15:restartNumberingAfterBreak="0">
     <w:nsid w:val="76FA296F"/>
     <w:multiLevelType w:val="hybridMultilevel"/>
     <w:tmpl w:val="6DAE32EA"/>
@@ -8215,7 +7458,7 @@
       </w:rPr>
     </w:lvl>
   </w:abstractNum>
-  <w:abstractNum w:abstractNumId="11" w15:restartNumberingAfterBreak="0">
+  <w:abstractNum w:abstractNumId="15" w15:restartNumberingAfterBreak="0">
     <w:nsid w:val="788C73B2"/>
     <w:multiLevelType w:val="hybridMultilevel"/>
     <w:tmpl w:val="6D6C60B0"/>
@@ -8328,7 +7571,7 @@
       </w:rPr>
     </w:lvl>
   </w:abstractNum>
-  <w:abstractNum w:abstractNumId="12" w15:restartNumberingAfterBreak="0">
+  <w:abstractNum w:abstractNumId="16" w15:restartNumberingAfterBreak="0">
     <w:nsid w:val="79644490"/>
     <w:multiLevelType w:val="hybridMultilevel"/>
     <w:tmpl w:val="340ACCA0"/>
@@ -8441,7 +7684,7 @@
       </w:rPr>
     </w:lvl>
   </w:abstractNum>
-  <w:abstractNum w:abstractNumId="13" w15:restartNumberingAfterBreak="0">
+  <w:abstractNum w:abstractNumId="17" w15:restartNumberingAfterBreak="0">
     <w:nsid w:val="7EB672F7"/>
     <w:multiLevelType w:val="hybridMultilevel"/>
     <w:tmpl w:val="A6F0C99C"/>
@@ -8554,53 +7797,65 @@
       </w:rPr>
     </w:lvl>
   </w:abstractNum>
-  <w:num w:numId="1">
+  <w:num w:numId="1" w16cid:durableId="1729911386">
+    <w:abstractNumId w:val="17"/>
+  </w:num>
+  <w:num w:numId="2" w16cid:durableId="1236743146">
     <w:abstractNumId w:val="13"/>
   </w:num>
-  <w:num w:numId="2">
+  <w:num w:numId="3" w16cid:durableId="1134757097">
+    <w:abstractNumId w:val="14"/>
+  </w:num>
+  <w:num w:numId="4" w16cid:durableId="2091853903">
+    <w:abstractNumId w:val="6"/>
+  </w:num>
+  <w:num w:numId="5" w16cid:durableId="367411174">
+    <w:abstractNumId w:val="12"/>
+  </w:num>
+  <w:num w:numId="6" w16cid:durableId="1708529570">
+    <w:abstractNumId w:val="7"/>
+  </w:num>
+  <w:num w:numId="7" w16cid:durableId="1052462448">
+    <w:abstractNumId w:val="15"/>
+  </w:num>
+  <w:num w:numId="8" w16cid:durableId="364061568">
+    <w:abstractNumId w:val="11"/>
+  </w:num>
+  <w:num w:numId="9" w16cid:durableId="1691909584">
+    <w:abstractNumId w:val="4"/>
+  </w:num>
+  <w:num w:numId="10" w16cid:durableId="1128166626">
+    <w:abstractNumId w:val="5"/>
+  </w:num>
+  <w:num w:numId="11" w16cid:durableId="671109898">
     <w:abstractNumId w:val="9"/>
   </w:num>
-  <w:num w:numId="3">
+  <w:num w:numId="12" w16cid:durableId="865824125">
+    <w:abstractNumId w:val="16"/>
+  </w:num>
+  <w:num w:numId="13" w16cid:durableId="1056592091">
+    <w:abstractNumId w:val="8"/>
+  </w:num>
+  <w:num w:numId="14" w16cid:durableId="1268150545">
+    <w:abstractNumId w:val="3"/>
+  </w:num>
+  <w:num w:numId="15" w16cid:durableId="574820883">
+    <w:abstractNumId w:val="2"/>
+  </w:num>
+  <w:num w:numId="16" w16cid:durableId="1882748074">
     <w:abstractNumId w:val="10"/>
   </w:num>
-  <w:num w:numId="4">
-    <w:abstractNumId w:val="3"/>
-  </w:num>
-  <w:num w:numId="5">
-    <w:abstractNumId w:val="8"/>
-  </w:num>
-  <w:num w:numId="6">
-    <w:abstractNumId w:val="4"/>
-  </w:num>
-  <w:num w:numId="7">
-    <w:abstractNumId w:val="11"/>
-  </w:num>
-  <w:num w:numId="8">
-    <w:abstractNumId w:val="7"/>
-  </w:num>
-  <w:num w:numId="9">
+  <w:num w:numId="17" w16cid:durableId="23747683">
     <w:abstractNumId w:val="1"/>
   </w:num>
-  <w:num w:numId="10">
-    <w:abstractNumId w:val="2"/>
-  </w:num>
-  <w:num w:numId="11">
-    <w:abstractNumId w:val="6"/>
-  </w:num>
-  <w:num w:numId="12">
-    <w:abstractNumId w:val="12"/>
-  </w:num>
-  <w:num w:numId="13">
-    <w:abstractNumId w:val="5"/>
-  </w:num>
-  <w:num w:numId="14">
+  <w:num w:numId="18" w16cid:durableId="292634421">
     <w:abstractNumId w:val="0"/>
   </w:num>
 </w:numbering>
 </file>
 
 <file path=word/styles.xml><?xml version="1.0" encoding="utf-8"?>
-<w:styles xmlns:mc="http://schemas.openxmlformats.org/markup-compatibility/2006" xmlns:r="http://schemas.openxmlformats.org/officeDocument/2006/relationships" xmlns:w="http://schemas.openxmlformats.org/wordprocessingml/2006/main" xmlns:w14="http://schemas.microsoft.com/office/word/2010/wordml" xmlns:w15="http://schemas.microsoft.com/office/word/2012/wordml" xmlns:w16cid="http://schemas.microsoft.com/office/word/2016/wordml/cid" xmlns:w16se="http://schemas.microsoft.com/office/word/2015/wordml/symex" mc:Ignorable="w14 w15 w16se w16cid">
+<w:styles xmlns:mc="http://schemas.openxmlformats.org/markup-compatibility/2006" xmlns:r="http://schemas.openxmlformats.org/officeDocument/2006/relationships" xmlns:w="http://schemas.openxmlformats.org/wordprocessingml/2006/main" xmlns:w14="http://schemas.microsoft.com/office/word/2010/wordml" xmlns:w15="http://schemas.microsoft.com/office/word/2012/wordml" xmlns:w16cex="http://schemas.microsoft.com/office/word/2018/wordml/cex" xmlns:w16cid="http://schemas.microsoft.com/office/word/2016/wordml/cid" xmlns:w16="http://schemas.microsoft.com/office/word/2018/wordml" xmlns:w16du="http://schemas.microsoft.com/office/word/2023/wordml/word16du" xmlns:w16sdtdh="http://schemas.microsoft.com/office/word/2020/wordml/sdtdatahash" xmlns:w16sdtfl="http://schemas.microsoft.com/office/word/2024/wordml/sdtformatlock" xmlns:w16se="http://schemas.microsoft.com/office/word/2015/wordml/symex" mc:Ignorable="w14 w15 w16se w16cid w16 w16cex w16sdtdh w16sdtfl w16du">
   <w:docDefaults>
     <w:rPrDefault>
       <w:rPr>
@@ -8618,7 +7873,7 @@
       </w:pPr>
     </w:pPrDefault>
   </w:docDefaults>
-  <w:latentStyles w:defLockedState="0" w:defUIPriority="99" w:defSemiHidden="0" w:defUnhideWhenUsed="0" w:defQFormat="0" w:count="375">
+  <w:latentStyles w:defLockedState="0" w:defUIPriority="99" w:defSemiHidden="0" w:defUnhideWhenUsed="0" w:defQFormat="0" w:count="376">
     <w:lsdException w:name="Normal" w:uiPriority="0" w:qFormat="1"/>
     <w:lsdException w:name="heading 1" w:uiPriority="9" w:qFormat="1"/>
     <w:lsdException w:name="heading 2" w:semiHidden="1" w:uiPriority="9" w:unhideWhenUsed="1" w:qFormat="1"/>
@@ -8994,6 +8249,7 @@
     <w:lsdException w:name="Smart Hyperlink" w:semiHidden="1" w:unhideWhenUsed="1"/>
     <w:lsdException w:name="Hashtag" w:semiHidden="1" w:unhideWhenUsed="1"/>
     <w:lsdException w:name="Unresolved Mention" w:semiHidden="1" w:unhideWhenUsed="1"/>
+    <w:lsdException w:name="Smart Link" w:semiHidden="1" w:unhideWhenUsed="1"/>
   </w:latentStyles>
   <w:style w:type="paragraph" w:default="1" w:styleId="Norml">
     <w:name w:val="Normal"/>
@@ -9201,7 +8457,6 @@
   <w:style w:type="character" w:default="1" w:styleId="Bekezdsalapbettpusa">
     <w:name w:val="Default Paragraph Font"/>
     <w:uiPriority w:val="1"/>
-    <w:semiHidden/>
     <w:unhideWhenUsed/>
   </w:style>
   <w:style w:type="table" w:default="1" w:styleId="Normltblzat">

</xml_diff>

<commit_message>
Making the function of acceptind and declining + adding the accepted songs to the main list (+doc)
</commit_message>
<xml_diff>
--- a/documentation.docx
+++ b/documentation.docx
@@ -40,27 +40,29 @@
           <w:sz w:val="40"/>
           <w:szCs w:val="40"/>
         </w:rPr>
-        <w:t>Alkalmazás neve: BláthyFM</w:t>
-      </w:r>
-    </w:p>
-    <w:p>
-      <w:pPr>
+        <w:t xml:space="preserve">Alkalmazás neve: </w:t>
+      </w:r>
+      <w:proofErr w:type="spellStart"/>
+      <w:r>
         <w:rPr>
           <w:rFonts w:ascii="Times New Roman" w:hAnsi="Times New Roman" w:cs="Times New Roman"/>
           <w:bCs/>
           <w:sz w:val="40"/>
           <w:szCs w:val="40"/>
         </w:rPr>
-      </w:pPr>
-      <w:r>
+        <w:t>BláthyFM</w:t>
+      </w:r>
+      <w:proofErr w:type="spellEnd"/>
+    </w:p>
+    <w:p>
+      <w:pPr>
         <w:rPr>
           <w:rFonts w:ascii="Times New Roman" w:hAnsi="Times New Roman" w:cs="Times New Roman"/>
           <w:bCs/>
           <w:sz w:val="40"/>
           <w:szCs w:val="40"/>
         </w:rPr>
-        <w:t>Tagok:</w:t>
-      </w:r>
+      </w:pPr>
       <w:r>
         <w:rPr>
           <w:rFonts w:ascii="Times New Roman" w:hAnsi="Times New Roman" w:cs="Times New Roman"/>
@@ -68,19 +70,18 @@
           <w:sz w:val="40"/>
           <w:szCs w:val="40"/>
         </w:rPr>
-        <w:t xml:space="preserve"> Susán Csongor, El-Nabulsy Csongor Alan</w:t>
-      </w:r>
-    </w:p>
-    <w:p>
-      <w:pPr>
-        <w:spacing w:after="960"/>
+        <w:t>Tagok:</w:t>
+      </w:r>
+      <w:r>
         <w:rPr>
           <w:rFonts w:ascii="Times New Roman" w:hAnsi="Times New Roman" w:cs="Times New Roman"/>
           <w:bCs/>
           <w:sz w:val="40"/>
           <w:szCs w:val="40"/>
         </w:rPr>
-      </w:pPr>
+        <w:t xml:space="preserve"> Susán Csongor, El-</w:t>
+      </w:r>
+      <w:proofErr w:type="spellStart"/>
       <w:r>
         <w:rPr>
           <w:rFonts w:ascii="Times New Roman" w:hAnsi="Times New Roman" w:cs="Times New Roman"/>
@@ -88,7 +89,57 @@
           <w:sz w:val="40"/>
           <w:szCs w:val="40"/>
         </w:rPr>
-        <w:t>Az alkalmazás célja az, hogy a Bláthy-ba járó diákok előre meghatározott szünetekben kedvenc zenéjüket tudják majd hallgatni anélkül, hogy nekik kelljen azt maguknak vagy másoknak lejátszani. Ráadásul az, hogy az iskola az ő zenéjüket játssza, akár egy általuk kijelölt időpontban (ezt üzenetben írhatják le), még több élményt ad, és azt az érzést, hogy a zenéjük – és ezzel együtt önmaguk is – meg van becsülve.</w:t>
+        <w:t>Nabulsy</w:t>
+      </w:r>
+      <w:proofErr w:type="spellEnd"/>
+      <w:r>
+        <w:rPr>
+          <w:rFonts w:ascii="Times New Roman" w:hAnsi="Times New Roman" w:cs="Times New Roman"/>
+          <w:bCs/>
+          <w:sz w:val="40"/>
+          <w:szCs w:val="40"/>
+        </w:rPr>
+        <w:t xml:space="preserve"> Csongor Alan</w:t>
+      </w:r>
+    </w:p>
+    <w:p>
+      <w:pPr>
+        <w:spacing w:after="960"/>
+        <w:rPr>
+          <w:rFonts w:ascii="Times New Roman" w:hAnsi="Times New Roman" w:cs="Times New Roman"/>
+          <w:bCs/>
+          <w:sz w:val="40"/>
+          <w:szCs w:val="40"/>
+        </w:rPr>
+      </w:pPr>
+      <w:r>
+        <w:rPr>
+          <w:rFonts w:ascii="Times New Roman" w:hAnsi="Times New Roman" w:cs="Times New Roman"/>
+          <w:bCs/>
+          <w:sz w:val="40"/>
+          <w:szCs w:val="40"/>
+        </w:rPr>
+        <w:t>Az alkalmazás célja az, hogy a Bláthy-</w:t>
+      </w:r>
+      <w:proofErr w:type="spellStart"/>
+      <w:r>
+        <w:rPr>
+          <w:rFonts w:ascii="Times New Roman" w:hAnsi="Times New Roman" w:cs="Times New Roman"/>
+          <w:bCs/>
+          <w:sz w:val="40"/>
+          <w:szCs w:val="40"/>
+        </w:rPr>
+        <w:t>ba</w:t>
+      </w:r>
+      <w:proofErr w:type="spellEnd"/>
+      <w:r>
+        <w:rPr>
+          <w:rFonts w:ascii="Times New Roman" w:hAnsi="Times New Roman" w:cs="Times New Roman"/>
+          <w:bCs/>
+          <w:sz w:val="40"/>
+          <w:szCs w:val="40"/>
+        </w:rPr>
+        <w:t xml:space="preserve"> járó diákok előre meghatározott szünetekben kedvenc zenéjüket tudják majd hallgatni anélkül, hogy nekik kelljen azt maguknak vagy másoknak lejátszani. Ráadásul az, hogy az iskola az ő zenéjüket játssza, akár egy általuk kijelölt időpontban (ezt üzenetben írhatják le), még több élményt ad, és azt az érzést, hogy a zenéjük – és ezzel együtt önmaguk is – meg van becsülve.</w:t>
       </w:r>
     </w:p>
     <w:p>
@@ -561,7 +612,25 @@
           <w:sz w:val="36"/>
           <w:szCs w:val="36"/>
         </w:rPr>
-        <w:t>Az alkalmazás fejlesztését tartalmazó dokumentáció elkezdése, vizsgafeltételek tanulmányozása, a projektet tároló repository létrehozása, teszteknek külön dokumentáció létrehozása.</w:t>
+        <w:t xml:space="preserve">Az alkalmazás fejlesztését tartalmazó dokumentáció elkezdése, vizsgafeltételek tanulmányozása, a projektet tároló </w:t>
+      </w:r>
+      <w:proofErr w:type="spellStart"/>
+      <w:r>
+        <w:rPr>
+          <w:rFonts w:ascii="Times New Roman" w:hAnsi="Times New Roman" w:cs="Times New Roman"/>
+          <w:sz w:val="36"/>
+          <w:szCs w:val="36"/>
+        </w:rPr>
+        <w:t>repository</w:t>
+      </w:r>
+      <w:proofErr w:type="spellEnd"/>
+      <w:r>
+        <w:rPr>
+          <w:rFonts w:ascii="Times New Roman" w:hAnsi="Times New Roman" w:cs="Times New Roman"/>
+          <w:sz w:val="36"/>
+          <w:szCs w:val="36"/>
+        </w:rPr>
+        <w:t xml:space="preserve"> létrehozása, teszteknek külön dokumentáció létrehozása.</w:t>
       </w:r>
     </w:p>
     <w:p>
@@ -1229,7 +1298,7 @@
           <w:szCs w:val="36"/>
         </w:rPr>
         <w:drawing>
-          <wp:inline distT="0" distB="0" distL="0" distR="0" wp14:anchorId="78A43544" wp14:editId="422E0478">
+          <wp:inline distT="0" distB="0" distL="0" distR="0" wp14:anchorId="78A43544" wp14:editId="04C22D91">
             <wp:extent cx="3166535" cy="1781175"/>
             <wp:effectExtent l="0" t="0" r="0" b="0"/>
             <wp:docPr id="3" name="Kép 3" descr="C:\Users\elnabulsy.csongor\AppData\Local\Microsoft\Windows\INetCache\Content.MSO\F75754B3.tmp"/>
@@ -1321,7 +1390,7 @@
           <w:szCs w:val="36"/>
         </w:rPr>
         <w:drawing>
-          <wp:inline distT="0" distB="0" distL="0" distR="0" wp14:anchorId="4E211814" wp14:editId="433422F6">
+          <wp:inline distT="0" distB="0" distL="0" distR="0" wp14:anchorId="4E211814" wp14:editId="5949F17D">
             <wp:extent cx="3133725" cy="1762720"/>
             <wp:effectExtent l="0" t="0" r="0" b="9525"/>
             <wp:docPr id="4" name="Kép 4" descr="C:\Users\elnabulsy.csongor\Downloads\ui_main_student.png"/>
@@ -1403,7 +1472,7 @@
           <w:szCs w:val="36"/>
         </w:rPr>
         <w:drawing>
-          <wp:inline distT="0" distB="0" distL="0" distR="0" wp14:anchorId="5137FB78" wp14:editId="47F954B9">
+          <wp:inline distT="0" distB="0" distL="0" distR="0" wp14:anchorId="5137FB78" wp14:editId="1F60A295">
             <wp:extent cx="3166110" cy="1780938"/>
             <wp:effectExtent l="0" t="0" r="0" b="0"/>
             <wp:docPr id="5" name="Kép 5" descr="C:\Users\elnabulsy.csongor\Downloads\ui_main_scheduler.png"/>
@@ -1466,7 +1535,25 @@
           <w:sz w:val="36"/>
           <w:szCs w:val="36"/>
         </w:rPr>
-        <w:t>Főképernyő admin ranggal:</w:t>
+        <w:t xml:space="preserve">Főképernyő </w:t>
+      </w:r>
+      <w:proofErr w:type="spellStart"/>
+      <w:r>
+        <w:rPr>
+          <w:rFonts w:ascii="Times New Roman" w:eastAsia="Times New Roman" w:hAnsi="Times New Roman" w:cs="Times New Roman"/>
+          <w:sz w:val="36"/>
+          <w:szCs w:val="36"/>
+        </w:rPr>
+        <w:t>admin</w:t>
+      </w:r>
+      <w:proofErr w:type="spellEnd"/>
+      <w:r>
+        <w:rPr>
+          <w:rFonts w:ascii="Times New Roman" w:eastAsia="Times New Roman" w:hAnsi="Times New Roman" w:cs="Times New Roman"/>
+          <w:sz w:val="36"/>
+          <w:szCs w:val="36"/>
+        </w:rPr>
+        <w:t xml:space="preserve"> ranggal:</w:t>
       </w:r>
     </w:p>
     <w:p>
@@ -1922,7 +2009,25 @@
           <w:sz w:val="36"/>
           <w:szCs w:val="36"/>
         </w:rPr>
-        <w:t xml:space="preserve">Az admin UI oldal megtervezése digitális </w:t>
+        <w:t xml:space="preserve">Az </w:t>
+      </w:r>
+      <w:proofErr w:type="spellStart"/>
+      <w:r>
+        <w:rPr>
+          <w:rFonts w:ascii="Times New Roman" w:eastAsia="Times New Roman" w:hAnsi="Times New Roman" w:cs="Times New Roman"/>
+          <w:sz w:val="36"/>
+          <w:szCs w:val="36"/>
+        </w:rPr>
+        <w:t>admin</w:t>
+      </w:r>
+      <w:proofErr w:type="spellEnd"/>
+      <w:r>
+        <w:rPr>
+          <w:rFonts w:ascii="Times New Roman" w:eastAsia="Times New Roman" w:hAnsi="Times New Roman" w:cs="Times New Roman"/>
+          <w:sz w:val="36"/>
+          <w:szCs w:val="36"/>
+        </w:rPr>
+        <w:t xml:space="preserve"> UI oldal megtervezése digitális </w:t>
       </w:r>
       <w:r>
         <w:rPr>
@@ -1941,13 +2046,23 @@
           <w:szCs w:val="36"/>
         </w:rPr>
       </w:pPr>
-      <w:r>
-        <w:rPr>
-          <w:rFonts w:ascii="Times New Roman" w:eastAsia="Times New Roman" w:hAnsi="Times New Roman" w:cs="Times New Roman"/>
-          <w:sz w:val="36"/>
-          <w:szCs w:val="36"/>
-        </w:rPr>
-        <w:t>Admin oldal:</w:t>
+      <w:proofErr w:type="spellStart"/>
+      <w:r>
+        <w:rPr>
+          <w:rFonts w:ascii="Times New Roman" w:eastAsia="Times New Roman" w:hAnsi="Times New Roman" w:cs="Times New Roman"/>
+          <w:sz w:val="36"/>
+          <w:szCs w:val="36"/>
+        </w:rPr>
+        <w:t>Admin</w:t>
+      </w:r>
+      <w:proofErr w:type="spellEnd"/>
+      <w:r>
+        <w:rPr>
+          <w:rFonts w:ascii="Times New Roman" w:eastAsia="Times New Roman" w:hAnsi="Times New Roman" w:cs="Times New Roman"/>
+          <w:sz w:val="36"/>
+          <w:szCs w:val="36"/>
+        </w:rPr>
+        <w:t xml:space="preserve"> oldal:</w:t>
       </w:r>
     </w:p>
     <w:p>
@@ -2181,15 +2296,42 @@
           <w:sz w:val="36"/>
           <w:szCs w:val="36"/>
         </w:rPr>
-        <w:t>, Vue router</w:t>
-      </w:r>
-      <w:r>
-        <w:rPr>
-          <w:rFonts w:ascii="Times New Roman" w:eastAsia="Times New Roman" w:hAnsi="Times New Roman" w:cs="Times New Roman"/>
-          <w:sz w:val="36"/>
-          <w:szCs w:val="36"/>
-        </w:rPr>
-        <w:t>) létrehozása frontend</w:t>
+        <w:t xml:space="preserve">, </w:t>
+      </w:r>
+      <w:proofErr w:type="spellStart"/>
+      <w:r>
+        <w:rPr>
+          <w:rFonts w:ascii="Times New Roman" w:eastAsia="Times New Roman" w:hAnsi="Times New Roman" w:cs="Times New Roman"/>
+          <w:sz w:val="36"/>
+          <w:szCs w:val="36"/>
+        </w:rPr>
+        <w:t>Vue</w:t>
+      </w:r>
+      <w:proofErr w:type="spellEnd"/>
+      <w:r>
+        <w:rPr>
+          <w:rFonts w:ascii="Times New Roman" w:eastAsia="Times New Roman" w:hAnsi="Times New Roman" w:cs="Times New Roman"/>
+          <w:sz w:val="36"/>
+          <w:szCs w:val="36"/>
+        </w:rPr>
+        <w:t xml:space="preserve"> router</w:t>
+      </w:r>
+      <w:r>
+        <w:rPr>
+          <w:rFonts w:ascii="Times New Roman" w:eastAsia="Times New Roman" w:hAnsi="Times New Roman" w:cs="Times New Roman"/>
+          <w:sz w:val="36"/>
+          <w:szCs w:val="36"/>
+        </w:rPr>
+        <w:t xml:space="preserve">) létrehozása </w:t>
+      </w:r>
+      <w:proofErr w:type="spellStart"/>
+      <w:r>
+        <w:rPr>
+          <w:rFonts w:ascii="Times New Roman" w:eastAsia="Times New Roman" w:hAnsi="Times New Roman" w:cs="Times New Roman"/>
+          <w:sz w:val="36"/>
+          <w:szCs w:val="36"/>
+        </w:rPr>
+        <w:t>frontend</w:t>
       </w:r>
       <w:r>
         <w:rPr>
@@ -2199,6 +2341,7 @@
         </w:rPr>
         <w:t>Part</w:t>
       </w:r>
+      <w:proofErr w:type="spellEnd"/>
       <w:r>
         <w:rPr>
           <w:rFonts w:ascii="Times New Roman" w:eastAsia="Times New Roman" w:hAnsi="Times New Roman" w:cs="Times New Roman"/>
@@ -2251,13 +2394,23 @@
           <w:szCs w:val="36"/>
         </w:rPr>
       </w:pPr>
-      <w:r>
-        <w:rPr>
-          <w:rFonts w:ascii="Times New Roman" w:eastAsia="Times New Roman" w:hAnsi="Times New Roman" w:cs="Times New Roman"/>
-          <w:sz w:val="36"/>
-          <w:szCs w:val="36"/>
-        </w:rPr>
-        <w:t>route-ok definiálása</w:t>
+      <w:proofErr w:type="spellStart"/>
+      <w:r>
+        <w:rPr>
+          <w:rFonts w:ascii="Times New Roman" w:eastAsia="Times New Roman" w:hAnsi="Times New Roman" w:cs="Times New Roman"/>
+          <w:sz w:val="36"/>
+          <w:szCs w:val="36"/>
+        </w:rPr>
+        <w:t>route</w:t>
+      </w:r>
+      <w:proofErr w:type="spellEnd"/>
+      <w:r>
+        <w:rPr>
+          <w:rFonts w:ascii="Times New Roman" w:eastAsia="Times New Roman" w:hAnsi="Times New Roman" w:cs="Times New Roman"/>
+          <w:sz w:val="36"/>
+          <w:szCs w:val="36"/>
+        </w:rPr>
+        <w:t>-ok definiálása</w:t>
       </w:r>
     </w:p>
     <w:p>
@@ -2273,14 +2426,34 @@
           <w:szCs w:val="36"/>
         </w:rPr>
       </w:pPr>
-      <w:r>
-        <w:rPr>
-          <w:rFonts w:ascii="Times New Roman" w:eastAsia="Times New Roman" w:hAnsi="Times New Roman" w:cs="Times New Roman"/>
-          <w:sz w:val="36"/>
-          <w:szCs w:val="36"/>
-        </w:rPr>
-        <w:t>header és footer</w:t>
-      </w:r>
+      <w:proofErr w:type="spellStart"/>
+      <w:r>
+        <w:rPr>
+          <w:rFonts w:ascii="Times New Roman" w:eastAsia="Times New Roman" w:hAnsi="Times New Roman" w:cs="Times New Roman"/>
+          <w:sz w:val="36"/>
+          <w:szCs w:val="36"/>
+        </w:rPr>
+        <w:t>header</w:t>
+      </w:r>
+      <w:proofErr w:type="spellEnd"/>
+      <w:r>
+        <w:rPr>
+          <w:rFonts w:ascii="Times New Roman" w:eastAsia="Times New Roman" w:hAnsi="Times New Roman" w:cs="Times New Roman"/>
+          <w:sz w:val="36"/>
+          <w:szCs w:val="36"/>
+        </w:rPr>
+        <w:t xml:space="preserve"> és </w:t>
+      </w:r>
+      <w:proofErr w:type="spellStart"/>
+      <w:r>
+        <w:rPr>
+          <w:rFonts w:ascii="Times New Roman" w:eastAsia="Times New Roman" w:hAnsi="Times New Roman" w:cs="Times New Roman"/>
+          <w:sz w:val="36"/>
+          <w:szCs w:val="36"/>
+        </w:rPr>
+        <w:t>footer</w:t>
+      </w:r>
+      <w:proofErr w:type="spellEnd"/>
       <w:r>
         <w:rPr>
           <w:rFonts w:ascii="Times New Roman" w:eastAsia="Times New Roman" w:hAnsi="Times New Roman" w:cs="Times New Roman"/>
@@ -2311,13 +2484,41 @@
           <w:szCs w:val="36"/>
         </w:rPr>
       </w:pPr>
-      <w:r>
-        <w:rPr>
-          <w:rFonts w:ascii="Times New Roman" w:eastAsia="Times New Roman" w:hAnsi="Times New Roman" w:cs="Times New Roman"/>
-          <w:sz w:val="36"/>
-          <w:szCs w:val="36"/>
-        </w:rPr>
-        <w:t>header-main-footer-struktúra létrehozása</w:t>
+      <w:proofErr w:type="spellStart"/>
+      <w:r>
+        <w:rPr>
+          <w:rFonts w:ascii="Times New Roman" w:eastAsia="Times New Roman" w:hAnsi="Times New Roman" w:cs="Times New Roman"/>
+          <w:sz w:val="36"/>
+          <w:szCs w:val="36"/>
+        </w:rPr>
+        <w:t>header</w:t>
+      </w:r>
+      <w:proofErr w:type="spellEnd"/>
+      <w:r>
+        <w:rPr>
+          <w:rFonts w:ascii="Times New Roman" w:eastAsia="Times New Roman" w:hAnsi="Times New Roman" w:cs="Times New Roman"/>
+          <w:sz w:val="36"/>
+          <w:szCs w:val="36"/>
+        </w:rPr>
+        <w:t>-main-</w:t>
+      </w:r>
+      <w:proofErr w:type="spellStart"/>
+      <w:r>
+        <w:rPr>
+          <w:rFonts w:ascii="Times New Roman" w:eastAsia="Times New Roman" w:hAnsi="Times New Roman" w:cs="Times New Roman"/>
+          <w:sz w:val="36"/>
+          <w:szCs w:val="36"/>
+        </w:rPr>
+        <w:t>footer</w:t>
+      </w:r>
+      <w:proofErr w:type="spellEnd"/>
+      <w:r>
+        <w:rPr>
+          <w:rFonts w:ascii="Times New Roman" w:eastAsia="Times New Roman" w:hAnsi="Times New Roman" w:cs="Times New Roman"/>
+          <w:sz w:val="36"/>
+          <w:szCs w:val="36"/>
+        </w:rPr>
+        <w:t>-struktúra létrehozása</w:t>
       </w:r>
     </w:p>
     <w:p>
@@ -2357,7 +2558,25 @@
           <w:sz w:val="36"/>
           <w:szCs w:val="36"/>
         </w:rPr>
-        <w:t>A projektet El-Nabulsy Csongor hozta létre és írta meg a kódját, a működéshez szükséges folyamatábrákat, az adatbázis ER-diagramját</w:t>
+        <w:t>A projektet El-</w:t>
+      </w:r>
+      <w:proofErr w:type="spellStart"/>
+      <w:r>
+        <w:rPr>
+          <w:rFonts w:ascii="Times New Roman" w:eastAsia="Times New Roman" w:hAnsi="Times New Roman" w:cs="Times New Roman"/>
+          <w:sz w:val="36"/>
+          <w:szCs w:val="36"/>
+        </w:rPr>
+        <w:t>Nabulsy</w:t>
+      </w:r>
+      <w:proofErr w:type="spellEnd"/>
+      <w:r>
+        <w:rPr>
+          <w:rFonts w:ascii="Times New Roman" w:eastAsia="Times New Roman" w:hAnsi="Times New Roman" w:cs="Times New Roman"/>
+          <w:sz w:val="36"/>
+          <w:szCs w:val="36"/>
+        </w:rPr>
+        <w:t xml:space="preserve"> Csongor hozta létre és írta meg a kódját, a működéshez szükséges folyamatábrákat, az adatbázis ER-diagramját</w:t>
       </w:r>
       <w:r>
         <w:rPr>
@@ -2440,7 +2659,25 @@
           <w:sz w:val="36"/>
           <w:szCs w:val="36"/>
         </w:rPr>
-        <w:t>(Susán Csongor) A frontendPart projekt átnézése, stílus hi</w:t>
+        <w:t xml:space="preserve">(Susán Csongor) A </w:t>
+      </w:r>
+      <w:proofErr w:type="spellStart"/>
+      <w:r>
+        <w:rPr>
+          <w:rFonts w:ascii="Times New Roman" w:eastAsia="Times New Roman" w:hAnsi="Times New Roman" w:cs="Times New Roman"/>
+          <w:sz w:val="36"/>
+          <w:szCs w:val="36"/>
+        </w:rPr>
+        <w:t>frontendPart</w:t>
+      </w:r>
+      <w:proofErr w:type="spellEnd"/>
+      <w:r>
+        <w:rPr>
+          <w:rFonts w:ascii="Times New Roman" w:eastAsia="Times New Roman" w:hAnsi="Times New Roman" w:cs="Times New Roman"/>
+          <w:sz w:val="36"/>
+          <w:szCs w:val="36"/>
+        </w:rPr>
+        <w:t xml:space="preserve"> projekt átnézése, stílus hi</w:t>
       </w:r>
       <w:r>
         <w:rPr>
@@ -2551,7 +2788,25 @@
           <w:sz w:val="36"/>
           <w:szCs w:val="36"/>
         </w:rPr>
-        <w:t>(El-Nabulsy Csongor Alan</w:t>
+        <w:t>(El-</w:t>
+      </w:r>
+      <w:proofErr w:type="spellStart"/>
+      <w:r>
+        <w:rPr>
+          <w:rFonts w:ascii="Times New Roman" w:eastAsia="Times New Roman" w:hAnsi="Times New Roman" w:cs="Times New Roman"/>
+          <w:sz w:val="36"/>
+          <w:szCs w:val="36"/>
+        </w:rPr>
+        <w:t>Nabulsy</w:t>
+      </w:r>
+      <w:proofErr w:type="spellEnd"/>
+      <w:r>
+        <w:rPr>
+          <w:rFonts w:ascii="Times New Roman" w:eastAsia="Times New Roman" w:hAnsi="Times New Roman" w:cs="Times New Roman"/>
+          <w:sz w:val="36"/>
+          <w:szCs w:val="36"/>
+        </w:rPr>
+        <w:t xml:space="preserve"> Csongor Alan</w:t>
       </w:r>
       <w:r>
         <w:rPr>
@@ -2575,7 +2830,25 @@
           <w:sz w:val="36"/>
           <w:szCs w:val="36"/>
         </w:rPr>
-        <w:t xml:space="preserve"> (El-Nabulsy: főoldal és annak </w:t>
+        <w:t xml:space="preserve"> (El-</w:t>
+      </w:r>
+      <w:proofErr w:type="spellStart"/>
+      <w:r>
+        <w:rPr>
+          <w:rFonts w:ascii="Times New Roman" w:eastAsia="Times New Roman" w:hAnsi="Times New Roman" w:cs="Times New Roman"/>
+          <w:sz w:val="36"/>
+          <w:szCs w:val="36"/>
+        </w:rPr>
+        <w:t>Nabulsy</w:t>
+      </w:r>
+      <w:proofErr w:type="spellEnd"/>
+      <w:r>
+        <w:rPr>
+          <w:rFonts w:ascii="Times New Roman" w:eastAsia="Times New Roman" w:hAnsi="Times New Roman" w:cs="Times New Roman"/>
+          <w:sz w:val="36"/>
+          <w:szCs w:val="36"/>
+        </w:rPr>
+        <w:t xml:space="preserve">: főoldal és annak </w:t>
       </w:r>
       <w:r>
         <w:rPr>
@@ -2591,7 +2864,25 @@
           <w:sz w:val="36"/>
           <w:szCs w:val="36"/>
         </w:rPr>
-        <w:t>variánsa, Susán: login befejezése és admin elkezdése, valamint a logika kidolgozásának megkezdése</w:t>
+        <w:t xml:space="preserve">variánsa, Susán: login befejezése és </w:t>
+      </w:r>
+      <w:proofErr w:type="spellStart"/>
+      <w:r>
+        <w:rPr>
+          <w:rFonts w:ascii="Times New Roman" w:eastAsia="Times New Roman" w:hAnsi="Times New Roman" w:cs="Times New Roman"/>
+          <w:sz w:val="36"/>
+          <w:szCs w:val="36"/>
+        </w:rPr>
+        <w:t>admin</w:t>
+      </w:r>
+      <w:proofErr w:type="spellEnd"/>
+      <w:r>
+        <w:rPr>
+          <w:rFonts w:ascii="Times New Roman" w:eastAsia="Times New Roman" w:hAnsi="Times New Roman" w:cs="Times New Roman"/>
+          <w:sz w:val="36"/>
+          <w:szCs w:val="36"/>
+        </w:rPr>
+        <w:t xml:space="preserve"> elkezdése, valamint a logika kidolgozásának megkezdése</w:t>
       </w:r>
       <w:r>
         <w:rPr>
@@ -2655,7 +2946,25 @@
           <w:sz w:val="36"/>
           <w:szCs w:val="36"/>
         </w:rPr>
-        <w:t xml:space="preserve">(El-Nabulsy Csongor Alan) A zenebekérő oldal </w:t>
+        <w:t>(El-</w:t>
+      </w:r>
+      <w:proofErr w:type="spellStart"/>
+      <w:r>
+        <w:rPr>
+          <w:rFonts w:ascii="Times New Roman" w:eastAsia="Times New Roman" w:hAnsi="Times New Roman" w:cs="Times New Roman"/>
+          <w:sz w:val="36"/>
+          <w:szCs w:val="36"/>
+        </w:rPr>
+        <w:t>Nabulsy</w:t>
+      </w:r>
+      <w:proofErr w:type="spellEnd"/>
+      <w:r>
+        <w:rPr>
+          <w:rFonts w:ascii="Times New Roman" w:eastAsia="Times New Roman" w:hAnsi="Times New Roman" w:cs="Times New Roman"/>
+          <w:sz w:val="36"/>
+          <w:szCs w:val="36"/>
+        </w:rPr>
+        <w:t xml:space="preserve"> Csongor Alan) A zenebekérő oldal </w:t>
       </w:r>
       <w:r>
         <w:rPr>
@@ -2710,7 +3019,79 @@
           <w:sz w:val="36"/>
           <w:szCs w:val="36"/>
         </w:rPr>
-        <w:t>(El-Nabulsy Csongor Alan) Főbb nézetek(HomeView, StudentHomePage, SchedulerView) szerkezetének kialakítása és a komponensek működésének ellenőrzése, a felhasználói felület stílusának kialakítása, hogy az oldal elrendezése megfeleljen a megtervezett UI-terveknek.</w:t>
+        <w:t>(El-</w:t>
+      </w:r>
+      <w:proofErr w:type="spellStart"/>
+      <w:r>
+        <w:rPr>
+          <w:rFonts w:ascii="Times New Roman" w:eastAsia="Times New Roman" w:hAnsi="Times New Roman" w:cs="Times New Roman"/>
+          <w:sz w:val="36"/>
+          <w:szCs w:val="36"/>
+        </w:rPr>
+        <w:t>Nabulsy</w:t>
+      </w:r>
+      <w:proofErr w:type="spellEnd"/>
+      <w:r>
+        <w:rPr>
+          <w:rFonts w:ascii="Times New Roman" w:eastAsia="Times New Roman" w:hAnsi="Times New Roman" w:cs="Times New Roman"/>
+          <w:sz w:val="36"/>
+          <w:szCs w:val="36"/>
+        </w:rPr>
+        <w:t xml:space="preserve"> Csongor Alan) Főbb nézetek(</w:t>
+      </w:r>
+      <w:proofErr w:type="spellStart"/>
+      <w:r>
+        <w:rPr>
+          <w:rFonts w:ascii="Times New Roman" w:eastAsia="Times New Roman" w:hAnsi="Times New Roman" w:cs="Times New Roman"/>
+          <w:sz w:val="36"/>
+          <w:szCs w:val="36"/>
+        </w:rPr>
+        <w:t>HomeView</w:t>
+      </w:r>
+      <w:proofErr w:type="spellEnd"/>
+      <w:r>
+        <w:rPr>
+          <w:rFonts w:ascii="Times New Roman" w:eastAsia="Times New Roman" w:hAnsi="Times New Roman" w:cs="Times New Roman"/>
+          <w:sz w:val="36"/>
+          <w:szCs w:val="36"/>
+        </w:rPr>
+        <w:t xml:space="preserve">, </w:t>
+      </w:r>
+      <w:proofErr w:type="spellStart"/>
+      <w:r>
+        <w:rPr>
+          <w:rFonts w:ascii="Times New Roman" w:eastAsia="Times New Roman" w:hAnsi="Times New Roman" w:cs="Times New Roman"/>
+          <w:sz w:val="36"/>
+          <w:szCs w:val="36"/>
+        </w:rPr>
+        <w:t>StudentHomePage</w:t>
+      </w:r>
+      <w:proofErr w:type="spellEnd"/>
+      <w:r>
+        <w:rPr>
+          <w:rFonts w:ascii="Times New Roman" w:eastAsia="Times New Roman" w:hAnsi="Times New Roman" w:cs="Times New Roman"/>
+          <w:sz w:val="36"/>
+          <w:szCs w:val="36"/>
+        </w:rPr>
+        <w:t xml:space="preserve">, </w:t>
+      </w:r>
+      <w:proofErr w:type="spellStart"/>
+      <w:r>
+        <w:rPr>
+          <w:rFonts w:ascii="Times New Roman" w:eastAsia="Times New Roman" w:hAnsi="Times New Roman" w:cs="Times New Roman"/>
+          <w:sz w:val="36"/>
+          <w:szCs w:val="36"/>
+        </w:rPr>
+        <w:t>SchedulerView</w:t>
+      </w:r>
+      <w:proofErr w:type="spellEnd"/>
+      <w:r>
+        <w:rPr>
+          <w:rFonts w:ascii="Times New Roman" w:eastAsia="Times New Roman" w:hAnsi="Times New Roman" w:cs="Times New Roman"/>
+          <w:sz w:val="36"/>
+          <w:szCs w:val="36"/>
+        </w:rPr>
+        <w:t>) szerkezetének kialakítása és a komponensek működésének ellenőrzése, a felhasználói felület stílusának kialakítása, hogy az oldal elrendezése megfeleljen a megtervezett UI-terveknek.</w:t>
       </w:r>
     </w:p>
     <w:p>
@@ -2795,7 +3176,25 @@
           <w:sz w:val="36"/>
           <w:szCs w:val="36"/>
         </w:rPr>
-        <w:t xml:space="preserve">, a routerben a főoldalak variánsainak gyerek route-okba </w:t>
+        <w:t xml:space="preserve">, a routerben a főoldalak variánsainak gyerek </w:t>
+      </w:r>
+      <w:proofErr w:type="spellStart"/>
+      <w:r>
+        <w:rPr>
+          <w:rFonts w:ascii="Times New Roman" w:eastAsia="Times New Roman" w:hAnsi="Times New Roman" w:cs="Times New Roman"/>
+          <w:sz w:val="36"/>
+          <w:szCs w:val="36"/>
+        </w:rPr>
+        <w:t>route</w:t>
+      </w:r>
+      <w:proofErr w:type="spellEnd"/>
+      <w:r>
+        <w:rPr>
+          <w:rFonts w:ascii="Times New Roman" w:eastAsia="Times New Roman" w:hAnsi="Times New Roman" w:cs="Times New Roman"/>
+          <w:sz w:val="36"/>
+          <w:szCs w:val="36"/>
+        </w:rPr>
+        <w:t xml:space="preserve">-okba </w:t>
       </w:r>
       <w:r>
         <w:rPr>
@@ -2820,15 +3219,51 @@
           <w:sz w:val="36"/>
           <w:szCs w:val="36"/>
         </w:rPr>
-        <w:t>, az új szabvány mintájára az admin nézet (gombok és rövid leírás azok alá) létrehozása</w:t>
-      </w:r>
-      <w:r>
-        <w:rPr>
-          <w:rFonts w:ascii="Times New Roman" w:eastAsia="Times New Roman" w:hAnsi="Times New Roman" w:cs="Times New Roman"/>
-          <w:sz w:val="36"/>
-          <w:szCs w:val="36"/>
-        </w:rPr>
-        <w:t>, felesleges import mezők kiszedése az App.vue fájlból</w:t>
+        <w:t xml:space="preserve">, az új szabvány mintájára az </w:t>
+      </w:r>
+      <w:proofErr w:type="spellStart"/>
+      <w:r>
+        <w:rPr>
+          <w:rFonts w:ascii="Times New Roman" w:eastAsia="Times New Roman" w:hAnsi="Times New Roman" w:cs="Times New Roman"/>
+          <w:sz w:val="36"/>
+          <w:szCs w:val="36"/>
+        </w:rPr>
+        <w:t>admin</w:t>
+      </w:r>
+      <w:proofErr w:type="spellEnd"/>
+      <w:r>
+        <w:rPr>
+          <w:rFonts w:ascii="Times New Roman" w:eastAsia="Times New Roman" w:hAnsi="Times New Roman" w:cs="Times New Roman"/>
+          <w:sz w:val="36"/>
+          <w:szCs w:val="36"/>
+        </w:rPr>
+        <w:t xml:space="preserve"> nézet (gombok és rövid leírás azok alá) létrehozása</w:t>
+      </w:r>
+      <w:r>
+        <w:rPr>
+          <w:rFonts w:ascii="Times New Roman" w:eastAsia="Times New Roman" w:hAnsi="Times New Roman" w:cs="Times New Roman"/>
+          <w:sz w:val="36"/>
+          <w:szCs w:val="36"/>
+        </w:rPr>
+        <w:t xml:space="preserve">, felesleges import mezők kiszedése az </w:t>
+      </w:r>
+      <w:proofErr w:type="spellStart"/>
+      <w:r>
+        <w:rPr>
+          <w:rFonts w:ascii="Times New Roman" w:eastAsia="Times New Roman" w:hAnsi="Times New Roman" w:cs="Times New Roman"/>
+          <w:sz w:val="36"/>
+          <w:szCs w:val="36"/>
+        </w:rPr>
+        <w:t>App.vue</w:t>
+      </w:r>
+      <w:proofErr w:type="spellEnd"/>
+      <w:r>
+        <w:rPr>
+          <w:rFonts w:ascii="Times New Roman" w:eastAsia="Times New Roman" w:hAnsi="Times New Roman" w:cs="Times New Roman"/>
+          <w:sz w:val="36"/>
+          <w:szCs w:val="36"/>
+        </w:rPr>
+        <w:t xml:space="preserve"> fájlból</w:t>
       </w:r>
     </w:p>
     <w:p>
@@ -2945,15 +3380,114 @@
           <w:sz w:val="36"/>
           <w:szCs w:val="36"/>
         </w:rPr>
-        <w:t>(Susán Csongor György, El-Nabulsy Csongor Alan)</w:t>
-      </w:r>
-      <w:r>
-        <w:rPr>
-          <w:rFonts w:ascii="Times New Roman" w:eastAsia="Times New Roman" w:hAnsi="Times New Roman" w:cs="Times New Roman"/>
-          <w:sz w:val="36"/>
-          <w:szCs w:val="36"/>
-        </w:rPr>
-        <w:t xml:space="preserve"> Nézetek végleges kialakítása (El-Nabulsy: HomeView, RequestView, SendView; Susán: főoldalak integrálása a HomeLayout</w:t>
+        <w:t>(Susán Csongor György, El-</w:t>
+      </w:r>
+      <w:proofErr w:type="spellStart"/>
+      <w:r>
+        <w:rPr>
+          <w:rFonts w:ascii="Times New Roman" w:eastAsia="Times New Roman" w:hAnsi="Times New Roman" w:cs="Times New Roman"/>
+          <w:sz w:val="36"/>
+          <w:szCs w:val="36"/>
+        </w:rPr>
+        <w:t>Nabulsy</w:t>
+      </w:r>
+      <w:proofErr w:type="spellEnd"/>
+      <w:r>
+        <w:rPr>
+          <w:rFonts w:ascii="Times New Roman" w:eastAsia="Times New Roman" w:hAnsi="Times New Roman" w:cs="Times New Roman"/>
+          <w:sz w:val="36"/>
+          <w:szCs w:val="36"/>
+        </w:rPr>
+        <w:t xml:space="preserve"> Csongor Alan)</w:t>
+      </w:r>
+      <w:r>
+        <w:rPr>
+          <w:rFonts w:ascii="Times New Roman" w:eastAsia="Times New Roman" w:hAnsi="Times New Roman" w:cs="Times New Roman"/>
+          <w:sz w:val="36"/>
+          <w:szCs w:val="36"/>
+        </w:rPr>
+        <w:t xml:space="preserve"> Nézetek végleges kialakítása (El-</w:t>
+      </w:r>
+      <w:proofErr w:type="spellStart"/>
+      <w:r>
+        <w:rPr>
+          <w:rFonts w:ascii="Times New Roman" w:eastAsia="Times New Roman" w:hAnsi="Times New Roman" w:cs="Times New Roman"/>
+          <w:sz w:val="36"/>
+          <w:szCs w:val="36"/>
+        </w:rPr>
+        <w:t>Nabulsy</w:t>
+      </w:r>
+      <w:proofErr w:type="spellEnd"/>
+      <w:r>
+        <w:rPr>
+          <w:rFonts w:ascii="Times New Roman" w:eastAsia="Times New Roman" w:hAnsi="Times New Roman" w:cs="Times New Roman"/>
+          <w:sz w:val="36"/>
+          <w:szCs w:val="36"/>
+        </w:rPr>
+        <w:t xml:space="preserve">: </w:t>
+      </w:r>
+      <w:proofErr w:type="spellStart"/>
+      <w:r>
+        <w:rPr>
+          <w:rFonts w:ascii="Times New Roman" w:eastAsia="Times New Roman" w:hAnsi="Times New Roman" w:cs="Times New Roman"/>
+          <w:sz w:val="36"/>
+          <w:szCs w:val="36"/>
+        </w:rPr>
+        <w:t>HomeView</w:t>
+      </w:r>
+      <w:proofErr w:type="spellEnd"/>
+      <w:r>
+        <w:rPr>
+          <w:rFonts w:ascii="Times New Roman" w:eastAsia="Times New Roman" w:hAnsi="Times New Roman" w:cs="Times New Roman"/>
+          <w:sz w:val="36"/>
+          <w:szCs w:val="36"/>
+        </w:rPr>
+        <w:t xml:space="preserve">, </w:t>
+      </w:r>
+      <w:proofErr w:type="spellStart"/>
+      <w:r>
+        <w:rPr>
+          <w:rFonts w:ascii="Times New Roman" w:eastAsia="Times New Roman" w:hAnsi="Times New Roman" w:cs="Times New Roman"/>
+          <w:sz w:val="36"/>
+          <w:szCs w:val="36"/>
+        </w:rPr>
+        <w:t>RequestView</w:t>
+      </w:r>
+      <w:proofErr w:type="spellEnd"/>
+      <w:r>
+        <w:rPr>
+          <w:rFonts w:ascii="Times New Roman" w:eastAsia="Times New Roman" w:hAnsi="Times New Roman" w:cs="Times New Roman"/>
+          <w:sz w:val="36"/>
+          <w:szCs w:val="36"/>
+        </w:rPr>
+        <w:t xml:space="preserve">, </w:t>
+      </w:r>
+      <w:proofErr w:type="spellStart"/>
+      <w:r>
+        <w:rPr>
+          <w:rFonts w:ascii="Times New Roman" w:eastAsia="Times New Roman" w:hAnsi="Times New Roman" w:cs="Times New Roman"/>
+          <w:sz w:val="36"/>
+          <w:szCs w:val="36"/>
+        </w:rPr>
+        <w:t>SendView</w:t>
+      </w:r>
+      <w:proofErr w:type="spellEnd"/>
+      <w:r>
+        <w:rPr>
+          <w:rFonts w:ascii="Times New Roman" w:eastAsia="Times New Roman" w:hAnsi="Times New Roman" w:cs="Times New Roman"/>
+          <w:sz w:val="36"/>
+          <w:szCs w:val="36"/>
+        </w:rPr>
+        <w:t xml:space="preserve">; Susán: főoldalak integrálása a </w:t>
+      </w:r>
+      <w:proofErr w:type="spellStart"/>
+      <w:r>
+        <w:rPr>
+          <w:rFonts w:ascii="Times New Roman" w:eastAsia="Times New Roman" w:hAnsi="Times New Roman" w:cs="Times New Roman"/>
+          <w:sz w:val="36"/>
+          <w:szCs w:val="36"/>
+        </w:rPr>
+        <w:t>HomeLayout</w:t>
       </w:r>
       <w:r>
         <w:rPr>
@@ -2969,7 +3503,16 @@
           <w:sz w:val="36"/>
           <w:szCs w:val="36"/>
         </w:rPr>
-        <w:t>ba)</w:t>
+        <w:t>ba</w:t>
+      </w:r>
+      <w:proofErr w:type="spellEnd"/>
+      <w:r>
+        <w:rPr>
+          <w:rFonts w:ascii="Times New Roman" w:eastAsia="Times New Roman" w:hAnsi="Times New Roman" w:cs="Times New Roman"/>
+          <w:sz w:val="36"/>
+          <w:szCs w:val="36"/>
+        </w:rPr>
+        <w:t>)</w:t>
       </w:r>
       <w:r>
         <w:rPr>
@@ -3018,7 +3561,25 @@
           <w:sz w:val="36"/>
           <w:szCs w:val="36"/>
         </w:rPr>
-        <w:t>Példa adatok felvétele a HomeLayout-ba a helyes működés tesztelésének érdekében</w:t>
+        <w:t xml:space="preserve">Példa adatok felvétele a </w:t>
+      </w:r>
+      <w:proofErr w:type="spellStart"/>
+      <w:r>
+        <w:rPr>
+          <w:rFonts w:ascii="Times New Roman" w:eastAsia="Times New Roman" w:hAnsi="Times New Roman" w:cs="Times New Roman"/>
+          <w:sz w:val="36"/>
+          <w:szCs w:val="36"/>
+        </w:rPr>
+        <w:t>HomeLayout-ba</w:t>
+      </w:r>
+      <w:proofErr w:type="spellEnd"/>
+      <w:r>
+        <w:rPr>
+          <w:rFonts w:ascii="Times New Roman" w:eastAsia="Times New Roman" w:hAnsi="Times New Roman" w:cs="Times New Roman"/>
+          <w:sz w:val="36"/>
+          <w:szCs w:val="36"/>
+        </w:rPr>
+        <w:t xml:space="preserve"> a helyes működés tesztelésének érdekében</w:t>
       </w:r>
     </w:p>
     <w:p>
@@ -3066,13 +3627,41 @@
           <w:szCs w:val="36"/>
         </w:rPr>
       </w:pPr>
-      <w:r>
-        <w:rPr>
-          <w:rFonts w:ascii="Times New Roman" w:eastAsia="Times New Roman" w:hAnsi="Times New Roman" w:cs="Times New Roman"/>
-          <w:sz w:val="36"/>
-          <w:szCs w:val="36"/>
-        </w:rPr>
-        <w:t>meta.title-ekben és a beforeEach-ben oldalcímek meghatározása</w:t>
+      <w:proofErr w:type="spellStart"/>
+      <w:r>
+        <w:rPr>
+          <w:rFonts w:ascii="Times New Roman" w:eastAsia="Times New Roman" w:hAnsi="Times New Roman" w:cs="Times New Roman"/>
+          <w:sz w:val="36"/>
+          <w:szCs w:val="36"/>
+        </w:rPr>
+        <w:t>meta.title-ekben</w:t>
+      </w:r>
+      <w:proofErr w:type="spellEnd"/>
+      <w:r>
+        <w:rPr>
+          <w:rFonts w:ascii="Times New Roman" w:eastAsia="Times New Roman" w:hAnsi="Times New Roman" w:cs="Times New Roman"/>
+          <w:sz w:val="36"/>
+          <w:szCs w:val="36"/>
+        </w:rPr>
+        <w:t xml:space="preserve"> és a </w:t>
+      </w:r>
+      <w:proofErr w:type="spellStart"/>
+      <w:r>
+        <w:rPr>
+          <w:rFonts w:ascii="Times New Roman" w:eastAsia="Times New Roman" w:hAnsi="Times New Roman" w:cs="Times New Roman"/>
+          <w:sz w:val="36"/>
+          <w:szCs w:val="36"/>
+        </w:rPr>
+        <w:t>beforeEach</w:t>
+      </w:r>
+      <w:proofErr w:type="spellEnd"/>
+      <w:r>
+        <w:rPr>
+          <w:rFonts w:ascii="Times New Roman" w:eastAsia="Times New Roman" w:hAnsi="Times New Roman" w:cs="Times New Roman"/>
+          <w:sz w:val="36"/>
+          <w:szCs w:val="36"/>
+        </w:rPr>
+        <w:t>-ben oldalcímek meghatározása</w:t>
       </w:r>
     </w:p>
     <w:p>
@@ -3128,6 +3717,7 @@
           <w:szCs w:val="36"/>
         </w:rPr>
       </w:pPr>
+      <w:proofErr w:type="spellStart"/>
       <w:r>
         <w:rPr>
           <w:rFonts w:ascii="Times New Roman" w:eastAsia="Times New Roman" w:hAnsi="Times New Roman" w:cs="Times New Roman"/>
@@ -3135,7 +3725,34 @@
           <w:szCs w:val="36"/>
         </w:rPr>
         <w:lastRenderedPageBreak/>
-        <w:t>auth függvény hozzáadása a bejelentkezési képernyőhöz (LoginView), ami egyelőre üres, egy komment jelzi annak célját</w:t>
+        <w:t>auth</w:t>
+      </w:r>
+      <w:proofErr w:type="spellEnd"/>
+      <w:r>
+        <w:rPr>
+          <w:rFonts w:ascii="Times New Roman" w:eastAsia="Times New Roman" w:hAnsi="Times New Roman" w:cs="Times New Roman"/>
+          <w:sz w:val="36"/>
+          <w:szCs w:val="36"/>
+        </w:rPr>
+        <w:t xml:space="preserve"> függvény hozzáadása a bejelentkezési képernyőhöz (</w:t>
+      </w:r>
+      <w:proofErr w:type="spellStart"/>
+      <w:r>
+        <w:rPr>
+          <w:rFonts w:ascii="Times New Roman" w:eastAsia="Times New Roman" w:hAnsi="Times New Roman" w:cs="Times New Roman"/>
+          <w:sz w:val="36"/>
+          <w:szCs w:val="36"/>
+        </w:rPr>
+        <w:t>LoginView</w:t>
+      </w:r>
+      <w:proofErr w:type="spellEnd"/>
+      <w:r>
+        <w:rPr>
+          <w:rFonts w:ascii="Times New Roman" w:eastAsia="Times New Roman" w:hAnsi="Times New Roman" w:cs="Times New Roman"/>
+          <w:sz w:val="36"/>
+          <w:szCs w:val="36"/>
+        </w:rPr>
+        <w:t>), ami egyelőre üres, egy komment jelzi annak célját</w:t>
       </w:r>
     </w:p>
     <w:p>
@@ -3336,7 +3953,43 @@
           <w:sz w:val="36"/>
           <w:szCs w:val="36"/>
         </w:rPr>
-        <w:t>Szerepkörök (role) és requiresAuth hozzáadása a nézetekhez</w:t>
+        <w:t>Szerepkörök (</w:t>
+      </w:r>
+      <w:proofErr w:type="spellStart"/>
+      <w:r>
+        <w:rPr>
+          <w:rFonts w:ascii="Times New Roman" w:eastAsia="Times New Roman" w:hAnsi="Times New Roman" w:cs="Times New Roman"/>
+          <w:sz w:val="36"/>
+          <w:szCs w:val="36"/>
+        </w:rPr>
+        <w:t>role</w:t>
+      </w:r>
+      <w:proofErr w:type="spellEnd"/>
+      <w:r>
+        <w:rPr>
+          <w:rFonts w:ascii="Times New Roman" w:eastAsia="Times New Roman" w:hAnsi="Times New Roman" w:cs="Times New Roman"/>
+          <w:sz w:val="36"/>
+          <w:szCs w:val="36"/>
+        </w:rPr>
+        <w:t xml:space="preserve">) és </w:t>
+      </w:r>
+      <w:proofErr w:type="spellStart"/>
+      <w:r>
+        <w:rPr>
+          <w:rFonts w:ascii="Times New Roman" w:eastAsia="Times New Roman" w:hAnsi="Times New Roman" w:cs="Times New Roman"/>
+          <w:sz w:val="36"/>
+          <w:szCs w:val="36"/>
+        </w:rPr>
+        <w:t>requiresAuth</w:t>
+      </w:r>
+      <w:proofErr w:type="spellEnd"/>
+      <w:r>
+        <w:rPr>
+          <w:rFonts w:ascii="Times New Roman" w:eastAsia="Times New Roman" w:hAnsi="Times New Roman" w:cs="Times New Roman"/>
+          <w:sz w:val="36"/>
+          <w:szCs w:val="36"/>
+        </w:rPr>
+        <w:t xml:space="preserve"> hozzáadása a nézetekhez</w:t>
       </w:r>
     </w:p>
     <w:p>
@@ -3354,13 +4007,41 @@
           <w:szCs w:val="36"/>
         </w:rPr>
       </w:pPr>
-      <w:r>
-        <w:rPr>
-          <w:rFonts w:ascii="Times New Roman" w:eastAsia="Times New Roman" w:hAnsi="Times New Roman" w:cs="Times New Roman"/>
-          <w:sz w:val="36"/>
-          <w:szCs w:val="36"/>
-        </w:rPr>
-        <w:t>Autentikációhoz szükséges alapváltozók felvétele az App.vue-ban</w:t>
+      <w:proofErr w:type="spellStart"/>
+      <w:r>
+        <w:rPr>
+          <w:rFonts w:ascii="Times New Roman" w:eastAsia="Times New Roman" w:hAnsi="Times New Roman" w:cs="Times New Roman"/>
+          <w:sz w:val="36"/>
+          <w:szCs w:val="36"/>
+        </w:rPr>
+        <w:t>Autentikációhoz</w:t>
+      </w:r>
+      <w:proofErr w:type="spellEnd"/>
+      <w:r>
+        <w:rPr>
+          <w:rFonts w:ascii="Times New Roman" w:eastAsia="Times New Roman" w:hAnsi="Times New Roman" w:cs="Times New Roman"/>
+          <w:sz w:val="36"/>
+          <w:szCs w:val="36"/>
+        </w:rPr>
+        <w:t xml:space="preserve"> szükséges alapváltozók felvétele az </w:t>
+      </w:r>
+      <w:proofErr w:type="spellStart"/>
+      <w:r>
+        <w:rPr>
+          <w:rFonts w:ascii="Times New Roman" w:eastAsia="Times New Roman" w:hAnsi="Times New Roman" w:cs="Times New Roman"/>
+          <w:sz w:val="36"/>
+          <w:szCs w:val="36"/>
+        </w:rPr>
+        <w:t>App.vue</w:t>
+      </w:r>
+      <w:proofErr w:type="spellEnd"/>
+      <w:r>
+        <w:rPr>
+          <w:rFonts w:ascii="Times New Roman" w:eastAsia="Times New Roman" w:hAnsi="Times New Roman" w:cs="Times New Roman"/>
+          <w:sz w:val="36"/>
+          <w:szCs w:val="36"/>
+        </w:rPr>
+        <w:t>-ban</w:t>
       </w:r>
     </w:p>
     <w:p>
@@ -3400,7 +4081,25 @@
           <w:sz w:val="36"/>
           <w:szCs w:val="36"/>
         </w:rPr>
-        <w:t>(Susán Csongor György, El-Nabulsy Csongor Alan)</w:t>
+        <w:t>(Susán Csongor György, El-</w:t>
+      </w:r>
+      <w:proofErr w:type="spellStart"/>
+      <w:r>
+        <w:rPr>
+          <w:rFonts w:ascii="Times New Roman" w:eastAsia="Times New Roman" w:hAnsi="Times New Roman" w:cs="Times New Roman"/>
+          <w:sz w:val="36"/>
+          <w:szCs w:val="36"/>
+        </w:rPr>
+        <w:t>Nabulsy</w:t>
+      </w:r>
+      <w:proofErr w:type="spellEnd"/>
+      <w:r>
+        <w:rPr>
+          <w:rFonts w:ascii="Times New Roman" w:eastAsia="Times New Roman" w:hAnsi="Times New Roman" w:cs="Times New Roman"/>
+          <w:sz w:val="36"/>
+          <w:szCs w:val="36"/>
+        </w:rPr>
+        <w:t xml:space="preserve"> Csongor Alan)</w:t>
       </w:r>
     </w:p>
     <w:p>
@@ -3446,7 +4145,25 @@
           <w:sz w:val="36"/>
           <w:szCs w:val="36"/>
         </w:rPr>
-        <w:t>Táblák SQL-tervezetének elkészítése (El-Nabulsy)</w:t>
+        <w:t>Táblák SQL-tervezetének elkészítése (El-</w:t>
+      </w:r>
+      <w:proofErr w:type="spellStart"/>
+      <w:r>
+        <w:rPr>
+          <w:rFonts w:ascii="Times New Roman" w:eastAsia="Times New Roman" w:hAnsi="Times New Roman" w:cs="Times New Roman"/>
+          <w:sz w:val="36"/>
+          <w:szCs w:val="36"/>
+        </w:rPr>
+        <w:t>Nabulsy</w:t>
+      </w:r>
+      <w:proofErr w:type="spellEnd"/>
+      <w:r>
+        <w:rPr>
+          <w:rFonts w:ascii="Times New Roman" w:eastAsia="Times New Roman" w:hAnsi="Times New Roman" w:cs="Times New Roman"/>
+          <w:sz w:val="36"/>
+          <w:szCs w:val="36"/>
+        </w:rPr>
+        <w:t>)</w:t>
       </w:r>
     </w:p>
     <w:p>
@@ -3470,7 +4187,79 @@
           <w:szCs w:val="36"/>
         </w:rPr>
         <w:lastRenderedPageBreak/>
-        <w:t>Táblázatok relációs tervvé írása és azok implementálása (model-lek, egyelőre üres seederek és migration-ök) a Backend (Laravel) projektbe (Susán)</w:t>
+        <w:t>Táblázatok relációs tervvé írása és azok implementálása (</w:t>
+      </w:r>
+      <w:proofErr w:type="spellStart"/>
+      <w:r>
+        <w:rPr>
+          <w:rFonts w:ascii="Times New Roman" w:eastAsia="Times New Roman" w:hAnsi="Times New Roman" w:cs="Times New Roman"/>
+          <w:sz w:val="36"/>
+          <w:szCs w:val="36"/>
+        </w:rPr>
+        <w:t>model-lek</w:t>
+      </w:r>
+      <w:proofErr w:type="spellEnd"/>
+      <w:r>
+        <w:rPr>
+          <w:rFonts w:ascii="Times New Roman" w:eastAsia="Times New Roman" w:hAnsi="Times New Roman" w:cs="Times New Roman"/>
+          <w:sz w:val="36"/>
+          <w:szCs w:val="36"/>
+        </w:rPr>
+        <w:t xml:space="preserve">, egyelőre üres </w:t>
+      </w:r>
+      <w:proofErr w:type="spellStart"/>
+      <w:r>
+        <w:rPr>
+          <w:rFonts w:ascii="Times New Roman" w:eastAsia="Times New Roman" w:hAnsi="Times New Roman" w:cs="Times New Roman"/>
+          <w:sz w:val="36"/>
+          <w:szCs w:val="36"/>
+        </w:rPr>
+        <w:t>seederek</w:t>
+      </w:r>
+      <w:proofErr w:type="spellEnd"/>
+      <w:r>
+        <w:rPr>
+          <w:rFonts w:ascii="Times New Roman" w:eastAsia="Times New Roman" w:hAnsi="Times New Roman" w:cs="Times New Roman"/>
+          <w:sz w:val="36"/>
+          <w:szCs w:val="36"/>
+        </w:rPr>
+        <w:t xml:space="preserve"> és </w:t>
+      </w:r>
+      <w:proofErr w:type="spellStart"/>
+      <w:r>
+        <w:rPr>
+          <w:rFonts w:ascii="Times New Roman" w:eastAsia="Times New Roman" w:hAnsi="Times New Roman" w:cs="Times New Roman"/>
+          <w:sz w:val="36"/>
+          <w:szCs w:val="36"/>
+        </w:rPr>
+        <w:t>migration-ök</w:t>
+      </w:r>
+      <w:proofErr w:type="spellEnd"/>
+      <w:r>
+        <w:rPr>
+          <w:rFonts w:ascii="Times New Roman" w:eastAsia="Times New Roman" w:hAnsi="Times New Roman" w:cs="Times New Roman"/>
+          <w:sz w:val="36"/>
+          <w:szCs w:val="36"/>
+        </w:rPr>
+        <w:t>) a Backend (</w:t>
+      </w:r>
+      <w:proofErr w:type="spellStart"/>
+      <w:r>
+        <w:rPr>
+          <w:rFonts w:ascii="Times New Roman" w:eastAsia="Times New Roman" w:hAnsi="Times New Roman" w:cs="Times New Roman"/>
+          <w:sz w:val="36"/>
+          <w:szCs w:val="36"/>
+        </w:rPr>
+        <w:t>Laravel</w:t>
+      </w:r>
+      <w:proofErr w:type="spellEnd"/>
+      <w:r>
+        <w:rPr>
+          <w:rFonts w:ascii="Times New Roman" w:eastAsia="Times New Roman" w:hAnsi="Times New Roman" w:cs="Times New Roman"/>
+          <w:sz w:val="36"/>
+          <w:szCs w:val="36"/>
+        </w:rPr>
+        <w:t>) projektbe (Susán)</w:t>
       </w:r>
     </w:p>
     <w:p>
@@ -3493,7 +4282,79 @@
           <w:sz w:val="36"/>
           <w:szCs w:val="36"/>
         </w:rPr>
-        <w:t>Projekt struktúrájának végleges kialakítása (eddig frontendPart-blathyfm volt, viszont azóta a főmappa a BlathyFM mappát viseli, amiben két, az alkalmazás egy-egy szintjét képviselő projekt található (blathyfm_frontend – amiben az eddigi frontend-alkalmazás volt megtalálható – és blathyfm_backend, ami pedig az újonnan létrejött backend része a projektnek) (Susán)</w:t>
+        <w:t xml:space="preserve">Projekt struktúrájának végleges kialakítása (eddig </w:t>
+      </w:r>
+      <w:proofErr w:type="spellStart"/>
+      <w:r>
+        <w:rPr>
+          <w:rFonts w:ascii="Times New Roman" w:eastAsia="Times New Roman" w:hAnsi="Times New Roman" w:cs="Times New Roman"/>
+          <w:sz w:val="36"/>
+          <w:szCs w:val="36"/>
+        </w:rPr>
+        <w:t>frontendPart-blathyfm</w:t>
+      </w:r>
+      <w:proofErr w:type="spellEnd"/>
+      <w:r>
+        <w:rPr>
+          <w:rFonts w:ascii="Times New Roman" w:eastAsia="Times New Roman" w:hAnsi="Times New Roman" w:cs="Times New Roman"/>
+          <w:sz w:val="36"/>
+          <w:szCs w:val="36"/>
+        </w:rPr>
+        <w:t xml:space="preserve"> volt, viszont azóta a főmappa a </w:t>
+      </w:r>
+      <w:proofErr w:type="spellStart"/>
+      <w:r>
+        <w:rPr>
+          <w:rFonts w:ascii="Times New Roman" w:eastAsia="Times New Roman" w:hAnsi="Times New Roman" w:cs="Times New Roman"/>
+          <w:sz w:val="36"/>
+          <w:szCs w:val="36"/>
+        </w:rPr>
+        <w:t>BlathyFM</w:t>
+      </w:r>
+      <w:proofErr w:type="spellEnd"/>
+      <w:r>
+        <w:rPr>
+          <w:rFonts w:ascii="Times New Roman" w:eastAsia="Times New Roman" w:hAnsi="Times New Roman" w:cs="Times New Roman"/>
+          <w:sz w:val="36"/>
+          <w:szCs w:val="36"/>
+        </w:rPr>
+        <w:t xml:space="preserve"> mappát viseli, amiben két, az alkalmazás egy-egy szintjét képviselő projekt található (</w:t>
+      </w:r>
+      <w:proofErr w:type="spellStart"/>
+      <w:r>
+        <w:rPr>
+          <w:rFonts w:ascii="Times New Roman" w:eastAsia="Times New Roman" w:hAnsi="Times New Roman" w:cs="Times New Roman"/>
+          <w:sz w:val="36"/>
+          <w:szCs w:val="36"/>
+        </w:rPr>
+        <w:t>blathyfm_frontend</w:t>
+      </w:r>
+      <w:proofErr w:type="spellEnd"/>
+      <w:r>
+        <w:rPr>
+          <w:rFonts w:ascii="Times New Roman" w:eastAsia="Times New Roman" w:hAnsi="Times New Roman" w:cs="Times New Roman"/>
+          <w:sz w:val="36"/>
+          <w:szCs w:val="36"/>
+        </w:rPr>
+        <w:t xml:space="preserve"> – amiben az eddigi frontend-alkalmazás volt megtalálható – és </w:t>
+      </w:r>
+      <w:proofErr w:type="spellStart"/>
+      <w:r>
+        <w:rPr>
+          <w:rFonts w:ascii="Times New Roman" w:eastAsia="Times New Roman" w:hAnsi="Times New Roman" w:cs="Times New Roman"/>
+          <w:sz w:val="36"/>
+          <w:szCs w:val="36"/>
+        </w:rPr>
+        <w:t>blathyfm_backend</w:t>
+      </w:r>
+      <w:proofErr w:type="spellEnd"/>
+      <w:r>
+        <w:rPr>
+          <w:rFonts w:ascii="Times New Roman" w:eastAsia="Times New Roman" w:hAnsi="Times New Roman" w:cs="Times New Roman"/>
+          <w:sz w:val="36"/>
+          <w:szCs w:val="36"/>
+        </w:rPr>
+        <w:t>, ami pedig az újonnan létrejött backend része a projektnek) (Susán)</w:t>
       </w:r>
     </w:p>
     <w:p>
@@ -3578,7 +4439,43 @@
           <w:sz w:val="36"/>
           <w:szCs w:val="36"/>
         </w:rPr>
-        <w:t>(El-Nabulsy Csongor Alan) Az ütemezői nézet (SchedulerView) elkészítése</w:t>
+        <w:t>(El-</w:t>
+      </w:r>
+      <w:proofErr w:type="spellStart"/>
+      <w:r>
+        <w:rPr>
+          <w:rFonts w:ascii="Times New Roman" w:eastAsia="Times New Roman" w:hAnsi="Times New Roman" w:cs="Times New Roman"/>
+          <w:sz w:val="36"/>
+          <w:szCs w:val="36"/>
+        </w:rPr>
+        <w:t>Nabulsy</w:t>
+      </w:r>
+      <w:proofErr w:type="spellEnd"/>
+      <w:r>
+        <w:rPr>
+          <w:rFonts w:ascii="Times New Roman" w:eastAsia="Times New Roman" w:hAnsi="Times New Roman" w:cs="Times New Roman"/>
+          <w:sz w:val="36"/>
+          <w:szCs w:val="36"/>
+        </w:rPr>
+        <w:t xml:space="preserve"> Csongor Alan) Az ütemezői nézet (</w:t>
+      </w:r>
+      <w:proofErr w:type="spellStart"/>
+      <w:r>
+        <w:rPr>
+          <w:rFonts w:ascii="Times New Roman" w:eastAsia="Times New Roman" w:hAnsi="Times New Roman" w:cs="Times New Roman"/>
+          <w:sz w:val="36"/>
+          <w:szCs w:val="36"/>
+        </w:rPr>
+        <w:t>SchedulerView</w:t>
+      </w:r>
+      <w:proofErr w:type="spellEnd"/>
+      <w:r>
+        <w:rPr>
+          <w:rFonts w:ascii="Times New Roman" w:eastAsia="Times New Roman" w:hAnsi="Times New Roman" w:cs="Times New Roman"/>
+          <w:sz w:val="36"/>
+          <w:szCs w:val="36"/>
+        </w:rPr>
+        <w:t>) elkészítése</w:t>
       </w:r>
       <w:r>
         <w:rPr>
@@ -3615,7 +4512,25 @@
           <w:sz w:val="36"/>
           <w:szCs w:val="36"/>
         </w:rPr>
-        <w:t>Tervezéssel kapcsolatos dokumentumok áthelyezése egy „plans” mappába, a</w:t>
+        <w:t>Tervezéssel kapcsolatos dokumentumok áthelyezése egy „</w:t>
+      </w:r>
+      <w:proofErr w:type="spellStart"/>
+      <w:r>
+        <w:rPr>
+          <w:rFonts w:ascii="Times New Roman" w:eastAsia="Times New Roman" w:hAnsi="Times New Roman" w:cs="Times New Roman"/>
+          <w:sz w:val="36"/>
+          <w:szCs w:val="36"/>
+        </w:rPr>
+        <w:t>plans</w:t>
+      </w:r>
+      <w:proofErr w:type="spellEnd"/>
+      <w:r>
+        <w:rPr>
+          <w:rFonts w:ascii="Times New Roman" w:eastAsia="Times New Roman" w:hAnsi="Times New Roman" w:cs="Times New Roman"/>
+          <w:sz w:val="36"/>
+          <w:szCs w:val="36"/>
+        </w:rPr>
+        <w:t>” mappába, a</w:t>
       </w:r>
       <w:r>
         <w:rPr>
@@ -3689,7 +4604,25 @@
           <w:sz w:val="36"/>
           <w:szCs w:val="36"/>
         </w:rPr>
-        <w:t>El-Nabulsy Csongor Alan</w:t>
+        <w:t>El-</w:t>
+      </w:r>
+      <w:proofErr w:type="spellStart"/>
+      <w:r>
+        <w:rPr>
+          <w:rFonts w:ascii="Times New Roman" w:eastAsia="Times New Roman" w:hAnsi="Times New Roman" w:cs="Times New Roman"/>
+          <w:sz w:val="36"/>
+          <w:szCs w:val="36"/>
+        </w:rPr>
+        <w:t>Nabulsy</w:t>
+      </w:r>
+      <w:proofErr w:type="spellEnd"/>
+      <w:r>
+        <w:rPr>
+          <w:rFonts w:ascii="Times New Roman" w:eastAsia="Times New Roman" w:hAnsi="Times New Roman" w:cs="Times New Roman"/>
+          <w:sz w:val="36"/>
+          <w:szCs w:val="36"/>
+        </w:rPr>
+        <w:t xml:space="preserve"> Csongor Alan</w:t>
       </w:r>
       <w:r>
         <w:rPr>
@@ -3705,7 +4638,43 @@
           <w:sz w:val="36"/>
           <w:szCs w:val="36"/>
         </w:rPr>
-        <w:t xml:space="preserve"> RequestView és SchedulerView továbbfejlesztése</w:t>
+        <w:t xml:space="preserve"> </w:t>
+      </w:r>
+      <w:proofErr w:type="spellStart"/>
+      <w:r>
+        <w:rPr>
+          <w:rFonts w:ascii="Times New Roman" w:eastAsia="Times New Roman" w:hAnsi="Times New Roman" w:cs="Times New Roman"/>
+          <w:sz w:val="36"/>
+          <w:szCs w:val="36"/>
+        </w:rPr>
+        <w:t>RequestView</w:t>
+      </w:r>
+      <w:proofErr w:type="spellEnd"/>
+      <w:r>
+        <w:rPr>
+          <w:rFonts w:ascii="Times New Roman" w:eastAsia="Times New Roman" w:hAnsi="Times New Roman" w:cs="Times New Roman"/>
+          <w:sz w:val="36"/>
+          <w:szCs w:val="36"/>
+        </w:rPr>
+        <w:t xml:space="preserve"> és </w:t>
+      </w:r>
+      <w:proofErr w:type="spellStart"/>
+      <w:r>
+        <w:rPr>
+          <w:rFonts w:ascii="Times New Roman" w:eastAsia="Times New Roman" w:hAnsi="Times New Roman" w:cs="Times New Roman"/>
+          <w:sz w:val="36"/>
+          <w:szCs w:val="36"/>
+        </w:rPr>
+        <w:t>SchedulerView</w:t>
+      </w:r>
+      <w:proofErr w:type="spellEnd"/>
+      <w:r>
+        <w:rPr>
+          <w:rFonts w:ascii="Times New Roman" w:eastAsia="Times New Roman" w:hAnsi="Times New Roman" w:cs="Times New Roman"/>
+          <w:sz w:val="36"/>
+          <w:szCs w:val="36"/>
+        </w:rPr>
+        <w:t xml:space="preserve"> továbbfejlesztése</w:t>
       </w:r>
     </w:p>
     <w:p>
@@ -3818,7 +4787,25 @@
           <w:sz w:val="36"/>
           <w:szCs w:val="36"/>
         </w:rPr>
-        <w:t xml:space="preserve"> az adatbázisba seederek segítségével</w:t>
+        <w:t xml:space="preserve"> az adatbázisba </w:t>
+      </w:r>
+      <w:proofErr w:type="spellStart"/>
+      <w:r>
+        <w:rPr>
+          <w:rFonts w:ascii="Times New Roman" w:eastAsia="Times New Roman" w:hAnsi="Times New Roman" w:cs="Times New Roman"/>
+          <w:sz w:val="36"/>
+          <w:szCs w:val="36"/>
+        </w:rPr>
+        <w:t>seederek</w:t>
+      </w:r>
+      <w:proofErr w:type="spellEnd"/>
+      <w:r>
+        <w:rPr>
+          <w:rFonts w:ascii="Times New Roman" w:eastAsia="Times New Roman" w:hAnsi="Times New Roman" w:cs="Times New Roman"/>
+          <w:sz w:val="36"/>
+          <w:szCs w:val="36"/>
+        </w:rPr>
+        <w:t xml:space="preserve"> segítségével</w:t>
       </w:r>
     </w:p>
     <w:p>
@@ -3966,6 +4953,7 @@
           <w:szCs w:val="36"/>
         </w:rPr>
       </w:pPr>
+      <w:proofErr w:type="spellStart"/>
       <w:r>
         <w:rPr>
           <w:rFonts w:ascii="Times New Roman" w:eastAsia="Times New Roman" w:hAnsi="Times New Roman" w:cs="Times New Roman"/>
@@ -3974,6 +4962,7 @@
         </w:rPr>
         <w:t>Genre</w:t>
       </w:r>
+      <w:proofErr w:type="spellEnd"/>
       <w:r>
         <w:rPr>
           <w:rFonts w:ascii="Times New Roman" w:eastAsia="Times New Roman" w:hAnsi="Times New Roman" w:cs="Times New Roman"/>
@@ -4123,7 +5112,61 @@
           <w:sz w:val="36"/>
           <w:szCs w:val="36"/>
         </w:rPr>
-        <w:t>Backend oldali migrationök és seederek debuggolása, hibamentesítése.</w:t>
+        <w:t xml:space="preserve">Backend oldali </w:t>
+      </w:r>
+      <w:proofErr w:type="spellStart"/>
+      <w:r>
+        <w:rPr>
+          <w:rFonts w:ascii="Times New Roman" w:eastAsia="Times New Roman" w:hAnsi="Times New Roman" w:cs="Times New Roman"/>
+          <w:sz w:val="36"/>
+          <w:szCs w:val="36"/>
+        </w:rPr>
+        <w:t>migrationök</w:t>
+      </w:r>
+      <w:proofErr w:type="spellEnd"/>
+      <w:r>
+        <w:rPr>
+          <w:rFonts w:ascii="Times New Roman" w:eastAsia="Times New Roman" w:hAnsi="Times New Roman" w:cs="Times New Roman"/>
+          <w:sz w:val="36"/>
+          <w:szCs w:val="36"/>
+        </w:rPr>
+        <w:t xml:space="preserve"> és </w:t>
+      </w:r>
+      <w:proofErr w:type="spellStart"/>
+      <w:r>
+        <w:rPr>
+          <w:rFonts w:ascii="Times New Roman" w:eastAsia="Times New Roman" w:hAnsi="Times New Roman" w:cs="Times New Roman"/>
+          <w:sz w:val="36"/>
+          <w:szCs w:val="36"/>
+        </w:rPr>
+        <w:t>seederek</w:t>
+      </w:r>
+      <w:proofErr w:type="spellEnd"/>
+      <w:r>
+        <w:rPr>
+          <w:rFonts w:ascii="Times New Roman" w:eastAsia="Times New Roman" w:hAnsi="Times New Roman" w:cs="Times New Roman"/>
+          <w:sz w:val="36"/>
+          <w:szCs w:val="36"/>
+        </w:rPr>
+        <w:t xml:space="preserve"> </w:t>
+      </w:r>
+      <w:proofErr w:type="spellStart"/>
+      <w:r>
+        <w:rPr>
+          <w:rFonts w:ascii="Times New Roman" w:eastAsia="Times New Roman" w:hAnsi="Times New Roman" w:cs="Times New Roman"/>
+          <w:sz w:val="36"/>
+          <w:szCs w:val="36"/>
+        </w:rPr>
+        <w:t>debuggolása</w:t>
+      </w:r>
+      <w:proofErr w:type="spellEnd"/>
+      <w:r>
+        <w:rPr>
+          <w:rFonts w:ascii="Times New Roman" w:eastAsia="Times New Roman" w:hAnsi="Times New Roman" w:cs="Times New Roman"/>
+          <w:sz w:val="36"/>
+          <w:szCs w:val="36"/>
+        </w:rPr>
+        <w:t>, hibamentesítése.</w:t>
       </w:r>
     </w:p>
     <w:p>
@@ -4277,7 +5320,25 @@
           <w:sz w:val="36"/>
           <w:szCs w:val="36"/>
         </w:rPr>
-        <w:t>Felvétel előtt álló felhasználók (PendingUser) táblájának hozzáadása az adatbázisba</w:t>
+        <w:t>Felvétel előtt álló felhasználók (</w:t>
+      </w:r>
+      <w:proofErr w:type="spellStart"/>
+      <w:r>
+        <w:rPr>
+          <w:rFonts w:ascii="Times New Roman" w:eastAsia="Times New Roman" w:hAnsi="Times New Roman" w:cs="Times New Roman"/>
+          <w:sz w:val="36"/>
+          <w:szCs w:val="36"/>
+        </w:rPr>
+        <w:t>PendingUser</w:t>
+      </w:r>
+      <w:proofErr w:type="spellEnd"/>
+      <w:r>
+        <w:rPr>
+          <w:rFonts w:ascii="Times New Roman" w:eastAsia="Times New Roman" w:hAnsi="Times New Roman" w:cs="Times New Roman"/>
+          <w:sz w:val="36"/>
+          <w:szCs w:val="36"/>
+        </w:rPr>
+        <w:t>) táblájának hozzáadása az adatbázisba</w:t>
       </w:r>
       <w:r>
         <w:rPr>
@@ -4308,25 +5369,71 @@
           <w:sz w:val="36"/>
           <w:szCs w:val="36"/>
         </w:rPr>
-        <w:t>Regisztráció debuggolása</w:t>
-      </w:r>
-    </w:p>
-    <w:p>
-      <w:pPr>
-        <w:jc w:val="both"/>
-        <w:rPr>
-          <w:rFonts w:ascii="Times New Roman" w:eastAsia="Times New Roman" w:hAnsi="Times New Roman" w:cs="Times New Roman"/>
-          <w:sz w:val="36"/>
-          <w:szCs w:val="36"/>
-        </w:rPr>
-      </w:pPr>
-      <w:r>
-        <w:rPr>
-          <w:rFonts w:ascii="Times New Roman" w:eastAsia="Times New Roman" w:hAnsi="Times New Roman" w:cs="Times New Roman"/>
-          <w:sz w:val="36"/>
-          <w:szCs w:val="36"/>
-        </w:rPr>
-        <w:t>(El-Nabulsy Csongor Alan) WaitingView (ahova regisztráció után navigál az oldal) létrehozása.</w:t>
+        <w:t xml:space="preserve">Regisztráció </w:t>
+      </w:r>
+      <w:proofErr w:type="spellStart"/>
+      <w:r>
+        <w:rPr>
+          <w:rFonts w:ascii="Times New Roman" w:eastAsia="Times New Roman" w:hAnsi="Times New Roman" w:cs="Times New Roman"/>
+          <w:sz w:val="36"/>
+          <w:szCs w:val="36"/>
+        </w:rPr>
+        <w:t>debuggolása</w:t>
+      </w:r>
+      <w:proofErr w:type="spellEnd"/>
+    </w:p>
+    <w:p>
+      <w:pPr>
+        <w:jc w:val="both"/>
+        <w:rPr>
+          <w:rFonts w:ascii="Times New Roman" w:eastAsia="Times New Roman" w:hAnsi="Times New Roman" w:cs="Times New Roman"/>
+          <w:sz w:val="36"/>
+          <w:szCs w:val="36"/>
+        </w:rPr>
+      </w:pPr>
+      <w:r>
+        <w:rPr>
+          <w:rFonts w:ascii="Times New Roman" w:eastAsia="Times New Roman" w:hAnsi="Times New Roman" w:cs="Times New Roman"/>
+          <w:sz w:val="36"/>
+          <w:szCs w:val="36"/>
+        </w:rPr>
+        <w:t>(El-</w:t>
+      </w:r>
+      <w:proofErr w:type="spellStart"/>
+      <w:r>
+        <w:rPr>
+          <w:rFonts w:ascii="Times New Roman" w:eastAsia="Times New Roman" w:hAnsi="Times New Roman" w:cs="Times New Roman"/>
+          <w:sz w:val="36"/>
+          <w:szCs w:val="36"/>
+        </w:rPr>
+        <w:t>Nabulsy</w:t>
+      </w:r>
+      <w:proofErr w:type="spellEnd"/>
+      <w:r>
+        <w:rPr>
+          <w:rFonts w:ascii="Times New Roman" w:eastAsia="Times New Roman" w:hAnsi="Times New Roman" w:cs="Times New Roman"/>
+          <w:sz w:val="36"/>
+          <w:szCs w:val="36"/>
+        </w:rPr>
+        <w:t xml:space="preserve"> Csongor Alan) </w:t>
+      </w:r>
+      <w:proofErr w:type="spellStart"/>
+      <w:r>
+        <w:rPr>
+          <w:rFonts w:ascii="Times New Roman" w:eastAsia="Times New Roman" w:hAnsi="Times New Roman" w:cs="Times New Roman"/>
+          <w:sz w:val="36"/>
+          <w:szCs w:val="36"/>
+        </w:rPr>
+        <w:t>WaitingView</w:t>
+      </w:r>
+      <w:proofErr w:type="spellEnd"/>
+      <w:r>
+        <w:rPr>
+          <w:rFonts w:ascii="Times New Roman" w:eastAsia="Times New Roman" w:hAnsi="Times New Roman" w:cs="Times New Roman"/>
+          <w:sz w:val="36"/>
+          <w:szCs w:val="36"/>
+        </w:rPr>
+        <w:t xml:space="preserve"> (ahova regisztráció után navigál az oldal) létrehozása.</w:t>
       </w:r>
     </w:p>
     <w:p>
@@ -4406,53 +5513,125 @@
           <w:sz w:val="36"/>
           <w:szCs w:val="36"/>
         </w:rPr>
-        <w:t>Átnéztük mindegyik oldalt hogy néz ki jelenleg, és a RequestView-n kellett változtatni, hogy megfeleljen a dokumentációban lévő rajznak. Továbbá összefoglaltuk hogy mennyi hiányzik még a projektből hogy teljesen kész és működő képes legyen.</w:t>
-      </w:r>
-    </w:p>
-    <w:p>
-      <w:pPr>
-        <w:jc w:val="both"/>
-        <w:rPr>
-          <w:rFonts w:ascii="Times New Roman" w:eastAsia="Times New Roman" w:hAnsi="Times New Roman" w:cs="Times New Roman"/>
-          <w:sz w:val="36"/>
-          <w:szCs w:val="36"/>
-        </w:rPr>
-      </w:pPr>
-    </w:p>
-    <w:p>
-      <w:pPr>
-        <w:jc w:val="both"/>
-        <w:rPr>
-          <w:rFonts w:ascii="Times New Roman" w:eastAsia="Times New Roman" w:hAnsi="Times New Roman" w:cs="Times New Roman"/>
-          <w:sz w:val="36"/>
-          <w:szCs w:val="36"/>
-        </w:rPr>
-      </w:pPr>
-      <w:r>
-        <w:rPr>
-          <w:rFonts w:ascii="Times New Roman" w:eastAsia="Times New Roman" w:hAnsi="Times New Roman" w:cs="Times New Roman"/>
-          <w:sz w:val="36"/>
-          <w:szCs w:val="36"/>
-        </w:rPr>
-        <w:t>(Susán Csongor György) A zenebeküldő oldal (SendView) újrakezdése és megalkotása validációval és működő adatbevitellel együtt.</w:t>
-      </w:r>
-    </w:p>
-    <w:p>
-      <w:pPr>
-        <w:jc w:val="both"/>
-        <w:rPr>
-          <w:rFonts w:ascii="Times New Roman" w:eastAsia="Times New Roman" w:hAnsi="Times New Roman" w:cs="Times New Roman"/>
-          <w:sz w:val="36"/>
-          <w:szCs w:val="36"/>
-        </w:rPr>
-      </w:pPr>
-      <w:r>
-        <w:rPr>
-          <w:rFonts w:ascii="Times New Roman" w:eastAsia="Times New Roman" w:hAnsi="Times New Roman" w:cs="Times New Roman"/>
-          <w:sz w:val="36"/>
-          <w:szCs w:val="36"/>
-        </w:rPr>
-        <w:t>(El-Nabulsy Csongor Alan) A zenebekérő oldal (RequestView) újra elkészítése.</w:t>
+        <w:t xml:space="preserve">Átnéztük mindegyik oldalt hogy néz ki jelenleg, és a </w:t>
+      </w:r>
+      <w:proofErr w:type="spellStart"/>
+      <w:r>
+        <w:rPr>
+          <w:rFonts w:ascii="Times New Roman" w:eastAsia="Times New Roman" w:hAnsi="Times New Roman" w:cs="Times New Roman"/>
+          <w:sz w:val="36"/>
+          <w:szCs w:val="36"/>
+        </w:rPr>
+        <w:t>RequestView</w:t>
+      </w:r>
+      <w:proofErr w:type="spellEnd"/>
+      <w:r>
+        <w:rPr>
+          <w:rFonts w:ascii="Times New Roman" w:eastAsia="Times New Roman" w:hAnsi="Times New Roman" w:cs="Times New Roman"/>
+          <w:sz w:val="36"/>
+          <w:szCs w:val="36"/>
+        </w:rPr>
+        <w:t>-n kellett változtatni, hogy megfeleljen a dokumentációban lévő rajznak. Továbbá összefoglaltuk hogy mennyi hiányzik még a projektből hogy teljesen kész és működő képes legyen.</w:t>
+      </w:r>
+    </w:p>
+    <w:p>
+      <w:pPr>
+        <w:jc w:val="both"/>
+        <w:rPr>
+          <w:rFonts w:ascii="Times New Roman" w:eastAsia="Times New Roman" w:hAnsi="Times New Roman" w:cs="Times New Roman"/>
+          <w:sz w:val="36"/>
+          <w:szCs w:val="36"/>
+        </w:rPr>
+      </w:pPr>
+    </w:p>
+    <w:p>
+      <w:pPr>
+        <w:jc w:val="both"/>
+        <w:rPr>
+          <w:rFonts w:ascii="Times New Roman" w:eastAsia="Times New Roman" w:hAnsi="Times New Roman" w:cs="Times New Roman"/>
+          <w:sz w:val="36"/>
+          <w:szCs w:val="36"/>
+        </w:rPr>
+      </w:pPr>
+      <w:r>
+        <w:rPr>
+          <w:rFonts w:ascii="Times New Roman" w:eastAsia="Times New Roman" w:hAnsi="Times New Roman" w:cs="Times New Roman"/>
+          <w:sz w:val="36"/>
+          <w:szCs w:val="36"/>
+        </w:rPr>
+        <w:t>(Susán Csongor György) A zenebeküldő oldal (</w:t>
+      </w:r>
+      <w:proofErr w:type="spellStart"/>
+      <w:r>
+        <w:rPr>
+          <w:rFonts w:ascii="Times New Roman" w:eastAsia="Times New Roman" w:hAnsi="Times New Roman" w:cs="Times New Roman"/>
+          <w:sz w:val="36"/>
+          <w:szCs w:val="36"/>
+        </w:rPr>
+        <w:t>SendView</w:t>
+      </w:r>
+      <w:proofErr w:type="spellEnd"/>
+      <w:r>
+        <w:rPr>
+          <w:rFonts w:ascii="Times New Roman" w:eastAsia="Times New Roman" w:hAnsi="Times New Roman" w:cs="Times New Roman"/>
+          <w:sz w:val="36"/>
+          <w:szCs w:val="36"/>
+        </w:rPr>
+        <w:t>) újrakezdése és megalkotása validációval és működő adatbevitellel együtt.</w:t>
+      </w:r>
+    </w:p>
+    <w:p>
+      <w:pPr>
+        <w:jc w:val="both"/>
+        <w:rPr>
+          <w:rFonts w:ascii="Times New Roman" w:eastAsia="Times New Roman" w:hAnsi="Times New Roman" w:cs="Times New Roman"/>
+          <w:sz w:val="36"/>
+          <w:szCs w:val="36"/>
+        </w:rPr>
+      </w:pPr>
+      <w:r>
+        <w:rPr>
+          <w:rFonts w:ascii="Times New Roman" w:eastAsia="Times New Roman" w:hAnsi="Times New Roman" w:cs="Times New Roman"/>
+          <w:sz w:val="36"/>
+          <w:szCs w:val="36"/>
+        </w:rPr>
+        <w:t>(El-</w:t>
+      </w:r>
+      <w:proofErr w:type="spellStart"/>
+      <w:r>
+        <w:rPr>
+          <w:rFonts w:ascii="Times New Roman" w:eastAsia="Times New Roman" w:hAnsi="Times New Roman" w:cs="Times New Roman"/>
+          <w:sz w:val="36"/>
+          <w:szCs w:val="36"/>
+        </w:rPr>
+        <w:t>Nabulsy</w:t>
+      </w:r>
+      <w:proofErr w:type="spellEnd"/>
+      <w:r>
+        <w:rPr>
+          <w:rFonts w:ascii="Times New Roman" w:eastAsia="Times New Roman" w:hAnsi="Times New Roman" w:cs="Times New Roman"/>
+          <w:sz w:val="36"/>
+          <w:szCs w:val="36"/>
+        </w:rPr>
+        <w:t xml:space="preserve"> Csongor Alan) A zenebekérő oldal (</w:t>
+      </w:r>
+      <w:proofErr w:type="spellStart"/>
+      <w:r>
+        <w:rPr>
+          <w:rFonts w:ascii="Times New Roman" w:eastAsia="Times New Roman" w:hAnsi="Times New Roman" w:cs="Times New Roman"/>
+          <w:sz w:val="36"/>
+          <w:szCs w:val="36"/>
+        </w:rPr>
+        <w:t>RequestView</w:t>
+      </w:r>
+      <w:proofErr w:type="spellEnd"/>
+      <w:r>
+        <w:rPr>
+          <w:rFonts w:ascii="Times New Roman" w:eastAsia="Times New Roman" w:hAnsi="Times New Roman" w:cs="Times New Roman"/>
+          <w:sz w:val="36"/>
+          <w:szCs w:val="36"/>
+        </w:rPr>
+        <w:t>) újra elkészítése.</w:t>
       </w:r>
     </w:p>
     <w:p>
@@ -4688,7 +5867,25 @@
           <w:sz w:val="36"/>
           <w:szCs w:val="36"/>
         </w:rPr>
-        <w:t>(El-Nabulsy Csongor Alan)</w:t>
+        <w:t>(El-</w:t>
+      </w:r>
+      <w:proofErr w:type="spellStart"/>
+      <w:r>
+        <w:rPr>
+          <w:rFonts w:ascii="Times New Roman" w:eastAsia="Times New Roman" w:hAnsi="Times New Roman" w:cs="Times New Roman"/>
+          <w:sz w:val="36"/>
+          <w:szCs w:val="36"/>
+        </w:rPr>
+        <w:t>Nabulsy</w:t>
+      </w:r>
+      <w:proofErr w:type="spellEnd"/>
+      <w:r>
+        <w:rPr>
+          <w:rFonts w:ascii="Times New Roman" w:eastAsia="Times New Roman" w:hAnsi="Times New Roman" w:cs="Times New Roman"/>
+          <w:sz w:val="36"/>
+          <w:szCs w:val="36"/>
+        </w:rPr>
+        <w:t xml:space="preserve"> Csongor Alan)</w:t>
       </w:r>
     </w:p>
     <w:p>
@@ -4750,7 +5947,25 @@
           <w:sz w:val="36"/>
           <w:szCs w:val="36"/>
         </w:rPr>
-        <w:t>a HomeLayout-ba</w:t>
+        <w:t xml:space="preserve">a </w:t>
+      </w:r>
+      <w:proofErr w:type="spellStart"/>
+      <w:r>
+        <w:rPr>
+          <w:rFonts w:ascii="Times New Roman" w:eastAsia="Times New Roman" w:hAnsi="Times New Roman" w:cs="Times New Roman"/>
+          <w:sz w:val="36"/>
+          <w:szCs w:val="36"/>
+        </w:rPr>
+        <w:t>HomeLayout</w:t>
+      </w:r>
+      <w:proofErr w:type="spellEnd"/>
+      <w:r>
+        <w:rPr>
+          <w:rFonts w:ascii="Times New Roman" w:eastAsia="Times New Roman" w:hAnsi="Times New Roman" w:cs="Times New Roman"/>
+          <w:sz w:val="36"/>
+          <w:szCs w:val="36"/>
+        </w:rPr>
+        <w:t>-ba</w:t>
       </w:r>
       <w:r>
         <w:rPr>
@@ -4805,7 +6020,25 @@
           <w:sz w:val="36"/>
           <w:szCs w:val="36"/>
         </w:rPr>
-        <w:t>a RequestVerifyView-ba</w:t>
+        <w:t xml:space="preserve">a </w:t>
+      </w:r>
+      <w:proofErr w:type="spellStart"/>
+      <w:r>
+        <w:rPr>
+          <w:rFonts w:ascii="Times New Roman" w:eastAsia="Times New Roman" w:hAnsi="Times New Roman" w:cs="Times New Roman"/>
+          <w:sz w:val="36"/>
+          <w:szCs w:val="36"/>
+        </w:rPr>
+        <w:t>RequestVerifyView</w:t>
+      </w:r>
+      <w:proofErr w:type="spellEnd"/>
+      <w:r>
+        <w:rPr>
+          <w:rFonts w:ascii="Times New Roman" w:eastAsia="Times New Roman" w:hAnsi="Times New Roman" w:cs="Times New Roman"/>
+          <w:sz w:val="36"/>
+          <w:szCs w:val="36"/>
+        </w:rPr>
+        <w:t>-ba</w:t>
       </w:r>
       <w:r>
         <w:rPr>
@@ -4881,7 +6114,133 @@
           <w:sz w:val="36"/>
           <w:szCs w:val="36"/>
         </w:rPr>
-        <w:t>A Layout-ba megírtuk a függvényt axios használatával, amivel majd be lesznek töltve az adatok minden home page-n. Továbbá a SchedulerView és a RequestVerifyView is külön külön megírtuk a függvényt, de csak azokkal az adatokkal amiket szeretnénk hogy betöltsön majd.</w:t>
+        <w:t xml:space="preserve">A </w:t>
+      </w:r>
+      <w:proofErr w:type="spellStart"/>
+      <w:r>
+        <w:rPr>
+          <w:rFonts w:ascii="Times New Roman" w:eastAsia="Times New Roman" w:hAnsi="Times New Roman" w:cs="Times New Roman"/>
+          <w:sz w:val="36"/>
+          <w:szCs w:val="36"/>
+        </w:rPr>
+        <w:t>Layout-ba</w:t>
+      </w:r>
+      <w:proofErr w:type="spellEnd"/>
+      <w:r>
+        <w:rPr>
+          <w:rFonts w:ascii="Times New Roman" w:eastAsia="Times New Roman" w:hAnsi="Times New Roman" w:cs="Times New Roman"/>
+          <w:sz w:val="36"/>
+          <w:szCs w:val="36"/>
+        </w:rPr>
+        <w:t xml:space="preserve"> megírtuk a függvényt </w:t>
+      </w:r>
+      <w:proofErr w:type="spellStart"/>
+      <w:r>
+        <w:rPr>
+          <w:rFonts w:ascii="Times New Roman" w:eastAsia="Times New Roman" w:hAnsi="Times New Roman" w:cs="Times New Roman"/>
+          <w:sz w:val="36"/>
+          <w:szCs w:val="36"/>
+        </w:rPr>
+        <w:t>axios</w:t>
+      </w:r>
+      <w:proofErr w:type="spellEnd"/>
+      <w:r>
+        <w:rPr>
+          <w:rFonts w:ascii="Times New Roman" w:eastAsia="Times New Roman" w:hAnsi="Times New Roman" w:cs="Times New Roman"/>
+          <w:sz w:val="36"/>
+          <w:szCs w:val="36"/>
+        </w:rPr>
+        <w:t xml:space="preserve"> használatával, amivel majd be lesznek töltve az adatok minden </w:t>
+      </w:r>
+      <w:proofErr w:type="spellStart"/>
+      <w:r>
+        <w:rPr>
+          <w:rFonts w:ascii="Times New Roman" w:eastAsia="Times New Roman" w:hAnsi="Times New Roman" w:cs="Times New Roman"/>
+          <w:sz w:val="36"/>
+          <w:szCs w:val="36"/>
+        </w:rPr>
+        <w:t>home</w:t>
+      </w:r>
+      <w:proofErr w:type="spellEnd"/>
+      <w:r>
+        <w:rPr>
+          <w:rFonts w:ascii="Times New Roman" w:eastAsia="Times New Roman" w:hAnsi="Times New Roman" w:cs="Times New Roman"/>
+          <w:sz w:val="36"/>
+          <w:szCs w:val="36"/>
+        </w:rPr>
+        <w:t xml:space="preserve"> </w:t>
+      </w:r>
+      <w:proofErr w:type="spellStart"/>
+      <w:r>
+        <w:rPr>
+          <w:rFonts w:ascii="Times New Roman" w:eastAsia="Times New Roman" w:hAnsi="Times New Roman" w:cs="Times New Roman"/>
+          <w:sz w:val="36"/>
+          <w:szCs w:val="36"/>
+        </w:rPr>
+        <w:t>page-n</w:t>
+      </w:r>
+      <w:proofErr w:type="spellEnd"/>
+      <w:r>
+        <w:rPr>
+          <w:rFonts w:ascii="Times New Roman" w:eastAsia="Times New Roman" w:hAnsi="Times New Roman" w:cs="Times New Roman"/>
+          <w:sz w:val="36"/>
+          <w:szCs w:val="36"/>
+        </w:rPr>
+        <w:t xml:space="preserve">. Továbbá a </w:t>
+      </w:r>
+      <w:proofErr w:type="spellStart"/>
+      <w:r>
+        <w:rPr>
+          <w:rFonts w:ascii="Times New Roman" w:eastAsia="Times New Roman" w:hAnsi="Times New Roman" w:cs="Times New Roman"/>
+          <w:sz w:val="36"/>
+          <w:szCs w:val="36"/>
+        </w:rPr>
+        <w:t>SchedulerView</w:t>
+      </w:r>
+      <w:proofErr w:type="spellEnd"/>
+      <w:r>
+        <w:rPr>
+          <w:rFonts w:ascii="Times New Roman" w:eastAsia="Times New Roman" w:hAnsi="Times New Roman" w:cs="Times New Roman"/>
+          <w:sz w:val="36"/>
+          <w:szCs w:val="36"/>
+        </w:rPr>
+        <w:t xml:space="preserve"> és a </w:t>
+      </w:r>
+      <w:proofErr w:type="spellStart"/>
+      <w:r>
+        <w:rPr>
+          <w:rFonts w:ascii="Times New Roman" w:eastAsia="Times New Roman" w:hAnsi="Times New Roman" w:cs="Times New Roman"/>
+          <w:sz w:val="36"/>
+          <w:szCs w:val="36"/>
+        </w:rPr>
+        <w:t>RequestVerifyView</w:t>
+      </w:r>
+      <w:proofErr w:type="spellEnd"/>
+      <w:r>
+        <w:rPr>
+          <w:rFonts w:ascii="Times New Roman" w:eastAsia="Times New Roman" w:hAnsi="Times New Roman" w:cs="Times New Roman"/>
+          <w:sz w:val="36"/>
+          <w:szCs w:val="36"/>
+        </w:rPr>
+        <w:t xml:space="preserve"> is külön </w:t>
+      </w:r>
+      <w:proofErr w:type="spellStart"/>
+      <w:r>
+        <w:rPr>
+          <w:rFonts w:ascii="Times New Roman" w:eastAsia="Times New Roman" w:hAnsi="Times New Roman" w:cs="Times New Roman"/>
+          <w:sz w:val="36"/>
+          <w:szCs w:val="36"/>
+        </w:rPr>
+        <w:t>külön</w:t>
+      </w:r>
+      <w:proofErr w:type="spellEnd"/>
+      <w:r>
+        <w:rPr>
+          <w:rFonts w:ascii="Times New Roman" w:eastAsia="Times New Roman" w:hAnsi="Times New Roman" w:cs="Times New Roman"/>
+          <w:sz w:val="36"/>
+          <w:szCs w:val="36"/>
+        </w:rPr>
+        <w:t xml:space="preserve"> megírtuk a függvényt, de csak azokkal az adatokkal amiket szeretnénk hogy betöltsön majd.</w:t>
       </w:r>
     </w:p>
     <w:p>
@@ -4975,7 +6334,61 @@
           <w:szCs w:val="36"/>
         </w:rPr>
         <w:lastRenderedPageBreak/>
-        <w:t>A műfajok (Genres) tábla kitörlése a helyi projektből és a repositoryból, mivel annak a szerepét már egy statikus lista vette át a migrationben.</w:t>
+        <w:t>A műfajok (</w:t>
+      </w:r>
+      <w:proofErr w:type="spellStart"/>
+      <w:r>
+        <w:rPr>
+          <w:rFonts w:ascii="Times New Roman" w:eastAsia="Times New Roman" w:hAnsi="Times New Roman" w:cs="Times New Roman"/>
+          <w:sz w:val="36"/>
+          <w:szCs w:val="36"/>
+        </w:rPr>
+        <w:t>Genres</w:t>
+      </w:r>
+      <w:proofErr w:type="spellEnd"/>
+      <w:r>
+        <w:rPr>
+          <w:rFonts w:ascii="Times New Roman" w:eastAsia="Times New Roman" w:hAnsi="Times New Roman" w:cs="Times New Roman"/>
+          <w:sz w:val="36"/>
+          <w:szCs w:val="36"/>
+        </w:rPr>
+        <w:t xml:space="preserve">) tábla kitörlése a helyi projektből és a </w:t>
+      </w:r>
+      <w:proofErr w:type="spellStart"/>
+      <w:r>
+        <w:rPr>
+          <w:rFonts w:ascii="Times New Roman" w:eastAsia="Times New Roman" w:hAnsi="Times New Roman" w:cs="Times New Roman"/>
+          <w:sz w:val="36"/>
+          <w:szCs w:val="36"/>
+        </w:rPr>
+        <w:t>repositoryból</w:t>
+      </w:r>
+      <w:proofErr w:type="spellEnd"/>
+      <w:r>
+        <w:rPr>
+          <w:rFonts w:ascii="Times New Roman" w:eastAsia="Times New Roman" w:hAnsi="Times New Roman" w:cs="Times New Roman"/>
+          <w:sz w:val="36"/>
+          <w:szCs w:val="36"/>
+        </w:rPr>
+        <w:t xml:space="preserve">, mivel annak a szerepét már egy statikus lista vette át a </w:t>
+      </w:r>
+      <w:proofErr w:type="spellStart"/>
+      <w:r>
+        <w:rPr>
+          <w:rFonts w:ascii="Times New Roman" w:eastAsia="Times New Roman" w:hAnsi="Times New Roman" w:cs="Times New Roman"/>
+          <w:sz w:val="36"/>
+          <w:szCs w:val="36"/>
+        </w:rPr>
+        <w:t>migrationben</w:t>
+      </w:r>
+      <w:proofErr w:type="spellEnd"/>
+      <w:r>
+        <w:rPr>
+          <w:rFonts w:ascii="Times New Roman" w:eastAsia="Times New Roman" w:hAnsi="Times New Roman" w:cs="Times New Roman"/>
+          <w:sz w:val="36"/>
+          <w:szCs w:val="36"/>
+        </w:rPr>
+        <w:t>.</w:t>
       </w:r>
     </w:p>
     <w:p>
@@ -4998,7 +6411,97 @@
           <w:sz w:val="36"/>
           <w:szCs w:val="36"/>
         </w:rPr>
-        <w:t>A bejelentkezést biztosító kód tovább írása (a check függvény egy már elvetett logika mentén épül, annak a tartalma ki lett ürítve, a WaitingView beépítve a routingba, emellett egy autentikáció alapján elérhetőséget eldöntő logika a router guardban, ami még egyelőre nem működik)</w:t>
+        <w:t xml:space="preserve">A bejelentkezést biztosító kód tovább írása (a </w:t>
+      </w:r>
+      <w:proofErr w:type="spellStart"/>
+      <w:r>
+        <w:rPr>
+          <w:rFonts w:ascii="Times New Roman" w:eastAsia="Times New Roman" w:hAnsi="Times New Roman" w:cs="Times New Roman"/>
+          <w:sz w:val="36"/>
+          <w:szCs w:val="36"/>
+        </w:rPr>
+        <w:t>check</w:t>
+      </w:r>
+      <w:proofErr w:type="spellEnd"/>
+      <w:r>
+        <w:rPr>
+          <w:rFonts w:ascii="Times New Roman" w:eastAsia="Times New Roman" w:hAnsi="Times New Roman" w:cs="Times New Roman"/>
+          <w:sz w:val="36"/>
+          <w:szCs w:val="36"/>
+        </w:rPr>
+        <w:t xml:space="preserve"> függvény egy már elvetett logika mentén épül, annak a tartalma ki lett ürítve, a </w:t>
+      </w:r>
+      <w:proofErr w:type="spellStart"/>
+      <w:r>
+        <w:rPr>
+          <w:rFonts w:ascii="Times New Roman" w:eastAsia="Times New Roman" w:hAnsi="Times New Roman" w:cs="Times New Roman"/>
+          <w:sz w:val="36"/>
+          <w:szCs w:val="36"/>
+        </w:rPr>
+        <w:t>WaitingView</w:t>
+      </w:r>
+      <w:proofErr w:type="spellEnd"/>
+      <w:r>
+        <w:rPr>
+          <w:rFonts w:ascii="Times New Roman" w:eastAsia="Times New Roman" w:hAnsi="Times New Roman" w:cs="Times New Roman"/>
+          <w:sz w:val="36"/>
+          <w:szCs w:val="36"/>
+        </w:rPr>
+        <w:t xml:space="preserve"> beépítve a </w:t>
+      </w:r>
+      <w:proofErr w:type="spellStart"/>
+      <w:r>
+        <w:rPr>
+          <w:rFonts w:ascii="Times New Roman" w:eastAsia="Times New Roman" w:hAnsi="Times New Roman" w:cs="Times New Roman"/>
+          <w:sz w:val="36"/>
+          <w:szCs w:val="36"/>
+        </w:rPr>
+        <w:t>routingba</w:t>
+      </w:r>
+      <w:proofErr w:type="spellEnd"/>
+      <w:r>
+        <w:rPr>
+          <w:rFonts w:ascii="Times New Roman" w:eastAsia="Times New Roman" w:hAnsi="Times New Roman" w:cs="Times New Roman"/>
+          <w:sz w:val="36"/>
+          <w:szCs w:val="36"/>
+        </w:rPr>
+        <w:t xml:space="preserve">, emellett egy </w:t>
+      </w:r>
+      <w:proofErr w:type="spellStart"/>
+      <w:r>
+        <w:rPr>
+          <w:rFonts w:ascii="Times New Roman" w:eastAsia="Times New Roman" w:hAnsi="Times New Roman" w:cs="Times New Roman"/>
+          <w:sz w:val="36"/>
+          <w:szCs w:val="36"/>
+        </w:rPr>
+        <w:t>autentikáció</w:t>
+      </w:r>
+      <w:proofErr w:type="spellEnd"/>
+      <w:r>
+        <w:rPr>
+          <w:rFonts w:ascii="Times New Roman" w:eastAsia="Times New Roman" w:hAnsi="Times New Roman" w:cs="Times New Roman"/>
+          <w:sz w:val="36"/>
+          <w:szCs w:val="36"/>
+        </w:rPr>
+        <w:t xml:space="preserve"> alapján elérhetőséget eldöntő logika a router </w:t>
+      </w:r>
+      <w:proofErr w:type="spellStart"/>
+      <w:r>
+        <w:rPr>
+          <w:rFonts w:ascii="Times New Roman" w:eastAsia="Times New Roman" w:hAnsi="Times New Roman" w:cs="Times New Roman"/>
+          <w:sz w:val="36"/>
+          <w:szCs w:val="36"/>
+        </w:rPr>
+        <w:t>guardban</w:t>
+      </w:r>
+      <w:proofErr w:type="spellEnd"/>
+      <w:r>
+        <w:rPr>
+          <w:rFonts w:ascii="Times New Roman" w:eastAsia="Times New Roman" w:hAnsi="Times New Roman" w:cs="Times New Roman"/>
+          <w:sz w:val="36"/>
+          <w:szCs w:val="36"/>
+        </w:rPr>
+        <w:t>, ami még egyelőre nem működik)</w:t>
       </w:r>
       <w:r>
         <w:rPr>
@@ -5037,7 +6540,43 @@
           <w:sz w:val="36"/>
           <w:szCs w:val="36"/>
         </w:rPr>
-        <w:t xml:space="preserve"> (RequestView, RequestVerifyView)</w:t>
+        <w:t xml:space="preserve"> (</w:t>
+      </w:r>
+      <w:proofErr w:type="spellStart"/>
+      <w:r>
+        <w:rPr>
+          <w:rFonts w:ascii="Times New Roman" w:eastAsia="Times New Roman" w:hAnsi="Times New Roman" w:cs="Times New Roman"/>
+          <w:sz w:val="36"/>
+          <w:szCs w:val="36"/>
+        </w:rPr>
+        <w:t>RequestView</w:t>
+      </w:r>
+      <w:proofErr w:type="spellEnd"/>
+      <w:r>
+        <w:rPr>
+          <w:rFonts w:ascii="Times New Roman" w:eastAsia="Times New Roman" w:hAnsi="Times New Roman" w:cs="Times New Roman"/>
+          <w:sz w:val="36"/>
+          <w:szCs w:val="36"/>
+        </w:rPr>
+        <w:t xml:space="preserve">, </w:t>
+      </w:r>
+      <w:proofErr w:type="spellStart"/>
+      <w:r>
+        <w:rPr>
+          <w:rFonts w:ascii="Times New Roman" w:eastAsia="Times New Roman" w:hAnsi="Times New Roman" w:cs="Times New Roman"/>
+          <w:sz w:val="36"/>
+          <w:szCs w:val="36"/>
+        </w:rPr>
+        <w:t>RequestVerifyView</w:t>
+      </w:r>
+      <w:proofErr w:type="spellEnd"/>
+      <w:r>
+        <w:rPr>
+          <w:rFonts w:ascii="Times New Roman" w:eastAsia="Times New Roman" w:hAnsi="Times New Roman" w:cs="Times New Roman"/>
+          <w:sz w:val="36"/>
+          <w:szCs w:val="36"/>
+        </w:rPr>
+        <w:t>)</w:t>
       </w:r>
       <w:r>
         <w:rPr>
@@ -5053,7 +6592,25 @@
           <w:sz w:val="36"/>
           <w:szCs w:val="36"/>
         </w:rPr>
-        <w:t xml:space="preserve">hez szükséges komponensek (RequestableMusicRow) </w:t>
+        <w:t>hez szükséges komponensek (</w:t>
+      </w:r>
+      <w:proofErr w:type="spellStart"/>
+      <w:r>
+        <w:rPr>
+          <w:rFonts w:ascii="Times New Roman" w:eastAsia="Times New Roman" w:hAnsi="Times New Roman" w:cs="Times New Roman"/>
+          <w:sz w:val="36"/>
+          <w:szCs w:val="36"/>
+        </w:rPr>
+        <w:t>RequestableMusicRow</w:t>
+      </w:r>
+      <w:proofErr w:type="spellEnd"/>
+      <w:r>
+        <w:rPr>
+          <w:rFonts w:ascii="Times New Roman" w:eastAsia="Times New Roman" w:hAnsi="Times New Roman" w:cs="Times New Roman"/>
+          <w:sz w:val="36"/>
+          <w:szCs w:val="36"/>
+        </w:rPr>
+        <w:t xml:space="preserve">) </w:t>
       </w:r>
       <w:r>
         <w:rPr>
@@ -5113,7 +6670,25 @@
           <w:sz w:val="36"/>
           <w:szCs w:val="36"/>
         </w:rPr>
-        <w:t>El-Nabulsy Csongor Alan</w:t>
+        <w:t>El-</w:t>
+      </w:r>
+      <w:proofErr w:type="spellStart"/>
+      <w:r>
+        <w:rPr>
+          <w:rFonts w:ascii="Times New Roman" w:eastAsia="Times New Roman" w:hAnsi="Times New Roman" w:cs="Times New Roman"/>
+          <w:sz w:val="36"/>
+          <w:szCs w:val="36"/>
+        </w:rPr>
+        <w:t>Nabulsy</w:t>
+      </w:r>
+      <w:proofErr w:type="spellEnd"/>
+      <w:r>
+        <w:rPr>
+          <w:rFonts w:ascii="Times New Roman" w:eastAsia="Times New Roman" w:hAnsi="Times New Roman" w:cs="Times New Roman"/>
+          <w:sz w:val="36"/>
+          <w:szCs w:val="36"/>
+        </w:rPr>
+        <w:t xml:space="preserve"> Csongor Alan</w:t>
       </w:r>
       <w:r>
         <w:rPr>
@@ -5183,8 +6758,36 @@
           <w:sz w:val="36"/>
           <w:szCs w:val="36"/>
         </w:rPr>
-        <w:t>Elkészült a RequestedMusicController és az AcceptedMusicController</w:t>
-      </w:r>
+        <w:t xml:space="preserve">Elkészült a </w:t>
+      </w:r>
+      <w:proofErr w:type="spellStart"/>
+      <w:r>
+        <w:rPr>
+          <w:rFonts w:ascii="Times New Roman" w:eastAsia="Times New Roman" w:hAnsi="Times New Roman" w:cs="Times New Roman"/>
+          <w:sz w:val="36"/>
+          <w:szCs w:val="36"/>
+        </w:rPr>
+        <w:t>RequestedMusicController</w:t>
+      </w:r>
+      <w:proofErr w:type="spellEnd"/>
+      <w:r>
+        <w:rPr>
+          <w:rFonts w:ascii="Times New Roman" w:eastAsia="Times New Roman" w:hAnsi="Times New Roman" w:cs="Times New Roman"/>
+          <w:sz w:val="36"/>
+          <w:szCs w:val="36"/>
+        </w:rPr>
+        <w:t xml:space="preserve"> és az </w:t>
+      </w:r>
+      <w:proofErr w:type="spellStart"/>
+      <w:r>
+        <w:rPr>
+          <w:rFonts w:ascii="Times New Roman" w:eastAsia="Times New Roman" w:hAnsi="Times New Roman" w:cs="Times New Roman"/>
+          <w:sz w:val="36"/>
+          <w:szCs w:val="36"/>
+        </w:rPr>
+        <w:t>AcceptedMusicController</w:t>
+      </w:r>
+      <w:proofErr w:type="spellEnd"/>
     </w:p>
     <w:p>
       <w:pPr>
@@ -5235,8 +6838,9 @@
           <w:lang w:eastAsia="hu-HU"/>
           <w14:ligatures w14:val="none"/>
         </w:rPr>
-        <w:t xml:space="preserve">Összegyűjtöttük hogy nagyrészben mik nem működnek, kellenek még ahhoz hogy működjön az oldal, elkészítettem azt </w:t>
-      </w:r>
+        <w:t xml:space="preserve">Összegyűjtöttük hogy nagyrészben mik nem működnek, kellenek még ahhoz hogy </w:t>
+      </w:r>
+      <w:proofErr w:type="spellStart"/>
       <w:r>
         <w:rPr>
           <w:rFonts w:ascii="Times New Roman" w:eastAsia="Times New Roman" w:hAnsi="Times New Roman" w:cs="Times New Roman"/>
@@ -5245,6 +6849,27 @@
           <w:lang w:eastAsia="hu-HU"/>
           <w14:ligatures w14:val="none"/>
         </w:rPr>
+        <w:t>működjön</w:t>
+      </w:r>
+      <w:proofErr w:type="spellEnd"/>
+      <w:r>
+        <w:rPr>
+          <w:rFonts w:ascii="Times New Roman" w:eastAsia="Times New Roman" w:hAnsi="Times New Roman" w:cs="Times New Roman"/>
+          <w:kern w:val="0"/>
+          <w:sz w:val="36"/>
+          <w:lang w:eastAsia="hu-HU"/>
+          <w14:ligatures w14:val="none"/>
+        </w:rPr>
+        <w:t xml:space="preserve"> az oldal, elkészítettem azt </w:t>
+      </w:r>
+      <w:r>
+        <w:rPr>
+          <w:rFonts w:ascii="Times New Roman" w:eastAsia="Times New Roman" w:hAnsi="Times New Roman" w:cs="Times New Roman"/>
+          <w:kern w:val="0"/>
+          <w:sz w:val="36"/>
+          <w:lang w:eastAsia="hu-HU"/>
+          <w14:ligatures w14:val="none"/>
+        </w:rPr>
         <w:lastRenderedPageBreak/>
         <w:t>a részt hogy most</w:t>
       </w:r>
@@ -5324,7 +6949,25 @@
           <w:sz w:val="36"/>
           <w:szCs w:val="36"/>
         </w:rPr>
-        <w:t>El-Nabulsy Csongor Alan</w:t>
+        <w:t>El-</w:t>
+      </w:r>
+      <w:proofErr w:type="spellStart"/>
+      <w:r>
+        <w:rPr>
+          <w:rFonts w:ascii="Times New Roman" w:eastAsia="Times New Roman" w:hAnsi="Times New Roman" w:cs="Times New Roman"/>
+          <w:sz w:val="36"/>
+          <w:szCs w:val="36"/>
+        </w:rPr>
+        <w:t>Nabulsy</w:t>
+      </w:r>
+      <w:proofErr w:type="spellEnd"/>
+      <w:r>
+        <w:rPr>
+          <w:rFonts w:ascii="Times New Roman" w:eastAsia="Times New Roman" w:hAnsi="Times New Roman" w:cs="Times New Roman"/>
+          <w:sz w:val="36"/>
+          <w:szCs w:val="36"/>
+        </w:rPr>
+        <w:t xml:space="preserve"> Csongor Alan</w:t>
       </w:r>
       <w:r>
         <w:rPr>
@@ -5355,23 +6998,60 @@
           <w:sz w:val="36"/>
           <w:szCs w:val="36"/>
         </w:rPr>
-        <w:t>Nem jelenik meg az url-ben a</w:t>
-      </w:r>
-      <w:r>
-        <w:rPr>
-          <w:rFonts w:ascii="Times New Roman" w:eastAsia="Times New Roman" w:hAnsi="Times New Roman" w:cs="Times New Roman"/>
-          <w:sz w:val="36"/>
-          <w:szCs w:val="36"/>
-        </w:rPr>
-        <w:t xml:space="preserve"> user</w:t>
-      </w:r>
-      <w:r>
-        <w:rPr>
-          <w:rFonts w:ascii="Times New Roman" w:eastAsia="Times New Roman" w:hAnsi="Times New Roman" w:cs="Times New Roman"/>
-          <w:sz w:val="36"/>
-          <w:szCs w:val="36"/>
-        </w:rPr>
-        <w:t xml:space="preserve"> felhasználóneve és jelsz</w:t>
+        <w:t xml:space="preserve">Nem jelenik meg az </w:t>
+      </w:r>
+      <w:proofErr w:type="spellStart"/>
+      <w:r>
+        <w:rPr>
+          <w:rFonts w:ascii="Times New Roman" w:eastAsia="Times New Roman" w:hAnsi="Times New Roman" w:cs="Times New Roman"/>
+          <w:sz w:val="36"/>
+          <w:szCs w:val="36"/>
+        </w:rPr>
+        <w:t>url-ben</w:t>
+      </w:r>
+      <w:proofErr w:type="spellEnd"/>
+      <w:r>
+        <w:rPr>
+          <w:rFonts w:ascii="Times New Roman" w:eastAsia="Times New Roman" w:hAnsi="Times New Roman" w:cs="Times New Roman"/>
+          <w:sz w:val="36"/>
+          <w:szCs w:val="36"/>
+        </w:rPr>
+        <w:t xml:space="preserve"> a</w:t>
+      </w:r>
+      <w:r>
+        <w:rPr>
+          <w:rFonts w:ascii="Times New Roman" w:eastAsia="Times New Roman" w:hAnsi="Times New Roman" w:cs="Times New Roman"/>
+          <w:sz w:val="36"/>
+          <w:szCs w:val="36"/>
+        </w:rPr>
+        <w:t xml:space="preserve"> </w:t>
+      </w:r>
+      <w:proofErr w:type="spellStart"/>
+      <w:r>
+        <w:rPr>
+          <w:rFonts w:ascii="Times New Roman" w:eastAsia="Times New Roman" w:hAnsi="Times New Roman" w:cs="Times New Roman"/>
+          <w:sz w:val="36"/>
+          <w:szCs w:val="36"/>
+        </w:rPr>
+        <w:t>user</w:t>
+      </w:r>
+      <w:proofErr w:type="spellEnd"/>
+      <w:r>
+        <w:rPr>
+          <w:rFonts w:ascii="Times New Roman" w:eastAsia="Times New Roman" w:hAnsi="Times New Roman" w:cs="Times New Roman"/>
+          <w:sz w:val="36"/>
+          <w:szCs w:val="36"/>
+        </w:rPr>
+        <w:t xml:space="preserve"> felhasználóneve és </w:t>
+      </w:r>
+      <w:proofErr w:type="spellStart"/>
+      <w:r>
+        <w:rPr>
+          <w:rFonts w:ascii="Times New Roman" w:eastAsia="Times New Roman" w:hAnsi="Times New Roman" w:cs="Times New Roman"/>
+          <w:sz w:val="36"/>
+          <w:szCs w:val="36"/>
+        </w:rPr>
+        <w:t>jelsz</w:t>
       </w:r>
       <w:r>
         <w:rPr>
@@ -5381,6 +7061,7 @@
         </w:rPr>
         <w:t>ava</w:t>
       </w:r>
+      <w:proofErr w:type="spellEnd"/>
       <w:r>
         <w:rPr>
           <w:rFonts w:ascii="Times New Roman" w:eastAsia="Times New Roman" w:hAnsi="Times New Roman" w:cs="Times New Roman"/>
@@ -5426,7 +7107,25 @@
           <w:sz w:val="36"/>
           <w:szCs w:val="36"/>
         </w:rPr>
-        <w:t xml:space="preserve"> után átdob a waiting oldalra,</w:t>
+        <w:t xml:space="preserve"> után átdob a </w:t>
+      </w:r>
+      <w:proofErr w:type="spellStart"/>
+      <w:r>
+        <w:rPr>
+          <w:rFonts w:ascii="Times New Roman" w:eastAsia="Times New Roman" w:hAnsi="Times New Roman" w:cs="Times New Roman"/>
+          <w:sz w:val="36"/>
+          <w:szCs w:val="36"/>
+        </w:rPr>
+        <w:t>waiting</w:t>
+      </w:r>
+      <w:proofErr w:type="spellEnd"/>
+      <w:r>
+        <w:rPr>
+          <w:rFonts w:ascii="Times New Roman" w:eastAsia="Times New Roman" w:hAnsi="Times New Roman" w:cs="Times New Roman"/>
+          <w:sz w:val="36"/>
+          <w:szCs w:val="36"/>
+        </w:rPr>
+        <w:t xml:space="preserve"> oldalra,</w:t>
       </w:r>
     </w:p>
     <w:p>
@@ -5459,13 +7158,41 @@
         </w:rPr>
         <w:t xml:space="preserve"> </w:t>
       </w:r>
-      <w:r>
-        <w:rPr>
-          <w:rFonts w:ascii="Times New Roman" w:eastAsia="Times New Roman" w:hAnsi="Times New Roman" w:cs="Times New Roman"/>
-          <w:sz w:val="36"/>
-          <w:szCs w:val="36"/>
-        </w:rPr>
-        <w:t>pending user-ek megjelenítése</w:t>
+      <w:proofErr w:type="spellStart"/>
+      <w:r>
+        <w:rPr>
+          <w:rFonts w:ascii="Times New Roman" w:eastAsia="Times New Roman" w:hAnsi="Times New Roman" w:cs="Times New Roman"/>
+          <w:sz w:val="36"/>
+          <w:szCs w:val="36"/>
+        </w:rPr>
+        <w:t>pending</w:t>
+      </w:r>
+      <w:proofErr w:type="spellEnd"/>
+      <w:r>
+        <w:rPr>
+          <w:rFonts w:ascii="Times New Roman" w:eastAsia="Times New Roman" w:hAnsi="Times New Roman" w:cs="Times New Roman"/>
+          <w:sz w:val="36"/>
+          <w:szCs w:val="36"/>
+        </w:rPr>
+        <w:t xml:space="preserve"> </w:t>
+      </w:r>
+      <w:proofErr w:type="spellStart"/>
+      <w:r>
+        <w:rPr>
+          <w:rFonts w:ascii="Times New Roman" w:eastAsia="Times New Roman" w:hAnsi="Times New Roman" w:cs="Times New Roman"/>
+          <w:sz w:val="36"/>
+          <w:szCs w:val="36"/>
+        </w:rPr>
+        <w:t>user</w:t>
+      </w:r>
+      <w:proofErr w:type="spellEnd"/>
+      <w:r>
+        <w:rPr>
+          <w:rFonts w:ascii="Times New Roman" w:eastAsia="Times New Roman" w:hAnsi="Times New Roman" w:cs="Times New Roman"/>
+          <w:sz w:val="36"/>
+          <w:szCs w:val="36"/>
+        </w:rPr>
+        <w:t>-ek megjelenítése</w:t>
       </w:r>
     </w:p>
     <w:p>
@@ -5482,13 +7209,41 @@
           <w:szCs w:val="36"/>
         </w:rPr>
       </w:pPr>
-      <w:r>
-        <w:rPr>
-          <w:rFonts w:ascii="Times New Roman" w:eastAsia="Times New Roman" w:hAnsi="Times New Roman" w:cs="Times New Roman"/>
-          <w:sz w:val="36"/>
-          <w:szCs w:val="36"/>
-        </w:rPr>
-        <w:t>Pending user-ek megjelennek</w:t>
+      <w:proofErr w:type="spellStart"/>
+      <w:r>
+        <w:rPr>
+          <w:rFonts w:ascii="Times New Roman" w:eastAsia="Times New Roman" w:hAnsi="Times New Roman" w:cs="Times New Roman"/>
+          <w:sz w:val="36"/>
+          <w:szCs w:val="36"/>
+        </w:rPr>
+        <w:t>Pending</w:t>
+      </w:r>
+      <w:proofErr w:type="spellEnd"/>
+      <w:r>
+        <w:rPr>
+          <w:rFonts w:ascii="Times New Roman" w:eastAsia="Times New Roman" w:hAnsi="Times New Roman" w:cs="Times New Roman"/>
+          <w:sz w:val="36"/>
+          <w:szCs w:val="36"/>
+        </w:rPr>
+        <w:t xml:space="preserve"> </w:t>
+      </w:r>
+      <w:proofErr w:type="spellStart"/>
+      <w:r>
+        <w:rPr>
+          <w:rFonts w:ascii="Times New Roman" w:eastAsia="Times New Roman" w:hAnsi="Times New Roman" w:cs="Times New Roman"/>
+          <w:sz w:val="36"/>
+          <w:szCs w:val="36"/>
+        </w:rPr>
+        <w:t>user</w:t>
+      </w:r>
+      <w:proofErr w:type="spellEnd"/>
+      <w:r>
+        <w:rPr>
+          <w:rFonts w:ascii="Times New Roman" w:eastAsia="Times New Roman" w:hAnsi="Times New Roman" w:cs="Times New Roman"/>
+          <w:sz w:val="36"/>
+          <w:szCs w:val="36"/>
+        </w:rPr>
+        <w:t>-ek megjelennek</w:t>
       </w:r>
     </w:p>
     <w:p>
@@ -5624,7 +7379,25 @@
           <w:sz w:val="36"/>
           <w:szCs w:val="36"/>
         </w:rPr>
-        <w:t>(El-Nabulsy Csongor Alan)</w:t>
+        <w:t>(El-</w:t>
+      </w:r>
+      <w:proofErr w:type="spellStart"/>
+      <w:r>
+        <w:rPr>
+          <w:rFonts w:ascii="Times New Roman" w:eastAsia="Times New Roman" w:hAnsi="Times New Roman" w:cs="Times New Roman"/>
+          <w:sz w:val="36"/>
+          <w:szCs w:val="36"/>
+        </w:rPr>
+        <w:t>Nabulsy</w:t>
+      </w:r>
+      <w:proofErr w:type="spellEnd"/>
+      <w:r>
+        <w:rPr>
+          <w:rFonts w:ascii="Times New Roman" w:eastAsia="Times New Roman" w:hAnsi="Times New Roman" w:cs="Times New Roman"/>
+          <w:sz w:val="36"/>
+          <w:szCs w:val="36"/>
+        </w:rPr>
+        <w:t xml:space="preserve"> Csongor Alan)</w:t>
       </w:r>
     </w:p>
     <w:p>
@@ -5641,13 +7414,23 @@
           <w:szCs w:val="36"/>
         </w:rPr>
       </w:pPr>
-      <w:r>
-        <w:rPr>
-          <w:rFonts w:ascii="Times New Roman" w:eastAsia="Times New Roman" w:hAnsi="Times New Roman" w:cs="Times New Roman"/>
-          <w:sz w:val="36"/>
-          <w:szCs w:val="36"/>
-        </w:rPr>
-        <w:t>Scheduler-nél az oszlopokban az jelenik meg aminek kell, a kereső bár rendesen működik</w:t>
+      <w:proofErr w:type="spellStart"/>
+      <w:r>
+        <w:rPr>
+          <w:rFonts w:ascii="Times New Roman" w:eastAsia="Times New Roman" w:hAnsi="Times New Roman" w:cs="Times New Roman"/>
+          <w:sz w:val="36"/>
+          <w:szCs w:val="36"/>
+        </w:rPr>
+        <w:t>Scheduler</w:t>
+      </w:r>
+      <w:proofErr w:type="spellEnd"/>
+      <w:r>
+        <w:rPr>
+          <w:rFonts w:ascii="Times New Roman" w:eastAsia="Times New Roman" w:hAnsi="Times New Roman" w:cs="Times New Roman"/>
+          <w:sz w:val="36"/>
+          <w:szCs w:val="36"/>
+        </w:rPr>
+        <w:t>-nél az oszlopokban az jelenik meg aminek kell, a kereső bár rendesen működik</w:t>
       </w:r>
     </w:p>
     <w:p>
@@ -5723,6 +7506,398 @@
         </w:rPr>
         <w:lastRenderedPageBreak/>
         <w:t>Az elfogadott/elutasított zenék sorának rendezése (ne közvetlenül a dal többi adata után jelenjen meg a státusz, hanem úgy, mint a nyilak a zeneütemezésnél)</w:t>
+      </w:r>
+    </w:p>
+    <w:p>
+      <w:pPr>
+        <w:jc w:val="both"/>
+        <w:rPr>
+          <w:rFonts w:ascii="Times New Roman" w:eastAsia="Times New Roman" w:hAnsi="Times New Roman" w:cs="Times New Roman"/>
+          <w:sz w:val="36"/>
+          <w:szCs w:val="36"/>
+        </w:rPr>
+      </w:pPr>
+    </w:p>
+    <w:p>
+      <w:pPr>
+        <w:jc w:val="both"/>
+        <w:rPr>
+          <w:rFonts w:ascii="Times New Roman" w:eastAsia="Times New Roman" w:hAnsi="Times New Roman" w:cs="Times New Roman"/>
+          <w:b/>
+          <w:bCs/>
+          <w:sz w:val="40"/>
+          <w:szCs w:val="40"/>
+        </w:rPr>
+      </w:pPr>
+      <w:r>
+        <w:rPr>
+          <w:rFonts w:ascii="Times New Roman" w:eastAsia="Times New Roman" w:hAnsi="Times New Roman" w:cs="Times New Roman"/>
+          <w:b/>
+          <w:bCs/>
+          <w:sz w:val="40"/>
+          <w:szCs w:val="40"/>
+        </w:rPr>
+        <w:t>2026-04-22 10:25-</w:t>
+      </w:r>
+      <w:r>
+        <w:rPr>
+          <w:rFonts w:ascii="Times New Roman" w:eastAsia="Times New Roman" w:hAnsi="Times New Roman" w:cs="Times New Roman"/>
+          <w:b/>
+          <w:bCs/>
+          <w:sz w:val="40"/>
+          <w:szCs w:val="40"/>
+        </w:rPr>
+        <w:t>14:15</w:t>
+      </w:r>
+      <w:r>
+        <w:rPr>
+          <w:rFonts w:ascii="Times New Roman" w:eastAsia="Times New Roman" w:hAnsi="Times New Roman" w:cs="Times New Roman"/>
+          <w:b/>
+          <w:bCs/>
+          <w:sz w:val="40"/>
+          <w:szCs w:val="40"/>
+        </w:rPr>
+        <w:t>, 16:30-</w:t>
+      </w:r>
+      <w:r>
+        <w:rPr>
+          <w:rFonts w:ascii="Times New Roman" w:eastAsia="Times New Roman" w:hAnsi="Times New Roman" w:cs="Times New Roman"/>
+          <w:b/>
+          <w:bCs/>
+          <w:sz w:val="40"/>
+          <w:szCs w:val="40"/>
+        </w:rPr>
+        <w:t>17:00, 17:45-</w:t>
+      </w:r>
+      <w:r>
+        <w:rPr>
+          <w:rFonts w:ascii="Times New Roman" w:eastAsia="Times New Roman" w:hAnsi="Times New Roman" w:cs="Times New Roman"/>
+          <w:b/>
+          <w:bCs/>
+          <w:sz w:val="40"/>
+          <w:szCs w:val="40"/>
+        </w:rPr>
+        <w:t>19:05</w:t>
+      </w:r>
+    </w:p>
+    <w:p>
+      <w:pPr>
+        <w:jc w:val="both"/>
+        <w:rPr>
+          <w:rFonts w:ascii="Times New Roman" w:eastAsia="Times New Roman" w:hAnsi="Times New Roman" w:cs="Times New Roman"/>
+          <w:sz w:val="36"/>
+          <w:szCs w:val="36"/>
+        </w:rPr>
+      </w:pPr>
+      <w:r>
+        <w:rPr>
+          <w:rFonts w:ascii="Times New Roman" w:eastAsia="Times New Roman" w:hAnsi="Times New Roman" w:cs="Times New Roman"/>
+          <w:sz w:val="36"/>
+          <w:szCs w:val="36"/>
+        </w:rPr>
+        <w:t>(Susán Csongor György)</w:t>
+      </w:r>
+    </w:p>
+    <w:p>
+      <w:pPr>
+        <w:pStyle w:val="Listaszerbekezds"/>
+        <w:numPr>
+          <w:ilvl w:val="0"/>
+          <w:numId w:val="19"/>
+        </w:numPr>
+        <w:jc w:val="both"/>
+        <w:rPr>
+          <w:rFonts w:ascii="Times New Roman" w:eastAsia="Times New Roman" w:hAnsi="Times New Roman" w:cs="Times New Roman"/>
+          <w:sz w:val="36"/>
+          <w:szCs w:val="36"/>
+        </w:rPr>
+      </w:pPr>
+      <w:r>
+        <w:rPr>
+          <w:rFonts w:ascii="Times New Roman" w:eastAsia="Times New Roman" w:hAnsi="Times New Roman" w:cs="Times New Roman"/>
+          <w:sz w:val="36"/>
+          <w:szCs w:val="36"/>
+        </w:rPr>
+        <w:t>A zenék elfogadását és elutasítását intéző weboldal</w:t>
+      </w:r>
+      <w:r>
+        <w:rPr>
+          <w:rFonts w:ascii="Times New Roman" w:eastAsia="Times New Roman" w:hAnsi="Times New Roman" w:cs="Times New Roman"/>
+          <w:sz w:val="36"/>
+          <w:szCs w:val="36"/>
+        </w:rPr>
+        <w:t xml:space="preserve"> elkészítése:</w:t>
+      </w:r>
+    </w:p>
+    <w:p>
+      <w:pPr>
+        <w:pStyle w:val="Listaszerbekezds"/>
+        <w:numPr>
+          <w:ilvl w:val="1"/>
+          <w:numId w:val="19"/>
+        </w:numPr>
+        <w:jc w:val="both"/>
+        <w:rPr>
+          <w:rFonts w:ascii="Times New Roman" w:eastAsia="Times New Roman" w:hAnsi="Times New Roman" w:cs="Times New Roman"/>
+          <w:sz w:val="36"/>
+          <w:szCs w:val="36"/>
+        </w:rPr>
+      </w:pPr>
+      <w:r>
+        <w:rPr>
+          <w:rFonts w:ascii="Times New Roman" w:eastAsia="Times New Roman" w:hAnsi="Times New Roman" w:cs="Times New Roman"/>
+          <w:sz w:val="36"/>
+          <w:szCs w:val="36"/>
+        </w:rPr>
+        <w:t>URL átcímkézése</w:t>
+      </w:r>
+      <w:r>
+        <w:rPr>
+          <w:rFonts w:ascii="Times New Roman" w:eastAsia="Times New Roman" w:hAnsi="Times New Roman" w:cs="Times New Roman"/>
+          <w:sz w:val="36"/>
+          <w:szCs w:val="36"/>
+        </w:rPr>
+        <w:t xml:space="preserve"> /</w:t>
+      </w:r>
+      <w:proofErr w:type="spellStart"/>
+      <w:r>
+        <w:rPr>
+          <w:rFonts w:ascii="Times New Roman" w:eastAsia="Times New Roman" w:hAnsi="Times New Roman" w:cs="Times New Roman"/>
+          <w:sz w:val="36"/>
+          <w:szCs w:val="36"/>
+        </w:rPr>
+        <w:t>admin-ról</w:t>
+      </w:r>
+      <w:proofErr w:type="spellEnd"/>
+      <w:r>
+        <w:rPr>
+          <w:rFonts w:ascii="Times New Roman" w:eastAsia="Times New Roman" w:hAnsi="Times New Roman" w:cs="Times New Roman"/>
+          <w:sz w:val="36"/>
+          <w:szCs w:val="36"/>
+        </w:rPr>
+        <w:t xml:space="preserve"> /</w:t>
+      </w:r>
+      <w:proofErr w:type="spellStart"/>
+      <w:r>
+        <w:rPr>
+          <w:rFonts w:ascii="Times New Roman" w:eastAsia="Times New Roman" w:hAnsi="Times New Roman" w:cs="Times New Roman"/>
+          <w:sz w:val="36"/>
+          <w:szCs w:val="36"/>
+        </w:rPr>
+        <w:t>scheduler</w:t>
+      </w:r>
+      <w:proofErr w:type="spellEnd"/>
+      <w:r>
+        <w:rPr>
+          <w:rFonts w:ascii="Times New Roman" w:eastAsia="Times New Roman" w:hAnsi="Times New Roman" w:cs="Times New Roman"/>
+          <w:sz w:val="36"/>
+          <w:szCs w:val="36"/>
+        </w:rPr>
+        <w:t>/</w:t>
+      </w:r>
+      <w:proofErr w:type="spellStart"/>
+      <w:r>
+        <w:rPr>
+          <w:rFonts w:ascii="Times New Roman" w:eastAsia="Times New Roman" w:hAnsi="Times New Roman" w:cs="Times New Roman"/>
+          <w:sz w:val="36"/>
+          <w:szCs w:val="36"/>
+        </w:rPr>
+        <w:t>check</w:t>
+      </w:r>
+      <w:proofErr w:type="spellEnd"/>
+      <w:r>
+        <w:rPr>
+          <w:rFonts w:ascii="Times New Roman" w:eastAsia="Times New Roman" w:hAnsi="Times New Roman" w:cs="Times New Roman"/>
+          <w:sz w:val="36"/>
+          <w:szCs w:val="36"/>
+        </w:rPr>
+        <w:t>-re (eredetileg ez az adminisztrátorok feladata lett volna, de ez korábban megváltozott).</w:t>
+      </w:r>
+    </w:p>
+    <w:p>
+      <w:pPr>
+        <w:pStyle w:val="Listaszerbekezds"/>
+        <w:numPr>
+          <w:ilvl w:val="1"/>
+          <w:numId w:val="19"/>
+        </w:numPr>
+        <w:jc w:val="both"/>
+        <w:rPr>
+          <w:rFonts w:ascii="Times New Roman" w:eastAsia="Times New Roman" w:hAnsi="Times New Roman" w:cs="Times New Roman"/>
+          <w:sz w:val="36"/>
+          <w:szCs w:val="36"/>
+        </w:rPr>
+      </w:pPr>
+      <w:r>
+        <w:rPr>
+          <w:rFonts w:ascii="Times New Roman" w:eastAsia="Times New Roman" w:hAnsi="Times New Roman" w:cs="Times New Roman"/>
+          <w:sz w:val="36"/>
+          <w:szCs w:val="36"/>
+        </w:rPr>
+        <w:t xml:space="preserve">Az oldal kinézetének </w:t>
+      </w:r>
+      <w:r>
+        <w:rPr>
+          <w:rFonts w:ascii="Times New Roman" w:eastAsia="Times New Roman" w:hAnsi="Times New Roman" w:cs="Times New Roman"/>
+          <w:sz w:val="36"/>
+          <w:szCs w:val="36"/>
+        </w:rPr>
+        <w:t xml:space="preserve">és logikájának </w:t>
+      </w:r>
+      <w:r>
+        <w:rPr>
+          <w:rFonts w:ascii="Times New Roman" w:eastAsia="Times New Roman" w:hAnsi="Times New Roman" w:cs="Times New Roman"/>
+          <w:sz w:val="36"/>
+          <w:szCs w:val="36"/>
+        </w:rPr>
+        <w:t>lekódolása</w:t>
+      </w:r>
+      <w:r>
+        <w:rPr>
+          <w:rFonts w:ascii="Times New Roman" w:eastAsia="Times New Roman" w:hAnsi="Times New Roman" w:cs="Times New Roman"/>
+          <w:sz w:val="36"/>
+          <w:szCs w:val="36"/>
+        </w:rPr>
+        <w:t xml:space="preserve"> (mostantól az elfogadott zenék bekerülnek a rendes zenék közé, az elutasítottak pedig nem, ezen zenék státusza a tanulói oldalon megtekinthető)</w:t>
+      </w:r>
+      <w:r>
+        <w:rPr>
+          <w:rFonts w:ascii="Times New Roman" w:eastAsia="Times New Roman" w:hAnsi="Times New Roman" w:cs="Times New Roman"/>
+          <w:sz w:val="36"/>
+          <w:szCs w:val="36"/>
+        </w:rPr>
+        <w:t>.</w:t>
+      </w:r>
+    </w:p>
+    <w:p>
+      <w:pPr>
+        <w:pStyle w:val="Listaszerbekezds"/>
+        <w:numPr>
+          <w:ilvl w:val="0"/>
+          <w:numId w:val="19"/>
+        </w:numPr>
+        <w:jc w:val="both"/>
+        <w:rPr>
+          <w:rFonts w:ascii="Times New Roman" w:eastAsia="Times New Roman" w:hAnsi="Times New Roman" w:cs="Times New Roman"/>
+          <w:sz w:val="36"/>
+          <w:szCs w:val="36"/>
+        </w:rPr>
+      </w:pPr>
+      <w:r>
+        <w:rPr>
+          <w:rFonts w:ascii="Times New Roman" w:eastAsia="Times New Roman" w:hAnsi="Times New Roman" w:cs="Times New Roman"/>
+          <w:sz w:val="36"/>
+          <w:szCs w:val="36"/>
+        </w:rPr>
+        <w:t>Egy zenebekéréssel kapcsolatos szerverhiba (konkrétan nem kapta meg a zene adatait, illetve rosszul illesztette be az adatokat) kijavítása</w:t>
+      </w:r>
+    </w:p>
+    <w:p>
+      <w:pPr>
+        <w:jc w:val="both"/>
+        <w:rPr>
+          <w:rFonts w:ascii="Times New Roman" w:eastAsia="Times New Roman" w:hAnsi="Times New Roman" w:cs="Times New Roman"/>
+          <w:sz w:val="36"/>
+          <w:szCs w:val="36"/>
+        </w:rPr>
+      </w:pPr>
+    </w:p>
+    <w:p>
+      <w:pPr>
+        <w:jc w:val="both"/>
+        <w:rPr>
+          <w:rFonts w:ascii="Times New Roman" w:eastAsia="Times New Roman" w:hAnsi="Times New Roman" w:cs="Times New Roman"/>
+          <w:sz w:val="36"/>
+          <w:szCs w:val="36"/>
+        </w:rPr>
+      </w:pPr>
+      <w:r>
+        <w:rPr>
+          <w:rFonts w:ascii="Times New Roman" w:eastAsia="Times New Roman" w:hAnsi="Times New Roman" w:cs="Times New Roman"/>
+          <w:sz w:val="36"/>
+          <w:szCs w:val="36"/>
+        </w:rPr>
+        <w:t>(El-</w:t>
+      </w:r>
+      <w:proofErr w:type="spellStart"/>
+      <w:r>
+        <w:rPr>
+          <w:rFonts w:ascii="Times New Roman" w:eastAsia="Times New Roman" w:hAnsi="Times New Roman" w:cs="Times New Roman"/>
+          <w:sz w:val="36"/>
+          <w:szCs w:val="36"/>
+        </w:rPr>
+        <w:t>Nabulsy</w:t>
+      </w:r>
+      <w:proofErr w:type="spellEnd"/>
+      <w:r>
+        <w:rPr>
+          <w:rFonts w:ascii="Times New Roman" w:eastAsia="Times New Roman" w:hAnsi="Times New Roman" w:cs="Times New Roman"/>
+          <w:sz w:val="36"/>
+          <w:szCs w:val="36"/>
+        </w:rPr>
+        <w:t xml:space="preserve"> Csongor Alan)</w:t>
+      </w:r>
+    </w:p>
+    <w:p>
+      <w:pPr>
+        <w:pStyle w:val="Listaszerbekezds"/>
+        <w:numPr>
+          <w:ilvl w:val="0"/>
+          <w:numId w:val="20"/>
+        </w:numPr>
+        <w:jc w:val="both"/>
+        <w:rPr>
+          <w:rFonts w:ascii="Times New Roman" w:eastAsia="Times New Roman" w:hAnsi="Times New Roman" w:cs="Times New Roman"/>
+          <w:sz w:val="36"/>
+          <w:szCs w:val="36"/>
+        </w:rPr>
+      </w:pPr>
+      <w:r>
+        <w:rPr>
+          <w:rFonts w:ascii="Times New Roman" w:eastAsia="Times New Roman" w:hAnsi="Times New Roman" w:cs="Times New Roman"/>
+          <w:sz w:val="36"/>
+          <w:szCs w:val="36"/>
+        </w:rPr>
+        <w:t>Bejelentkezés lekódolásának megkezdése</w:t>
+      </w:r>
+    </w:p>
+    <w:p>
+      <w:pPr>
+        <w:pStyle w:val="Listaszerbekezds"/>
+        <w:numPr>
+          <w:ilvl w:val="0"/>
+          <w:numId w:val="20"/>
+        </w:numPr>
+        <w:jc w:val="both"/>
+        <w:rPr>
+          <w:rFonts w:ascii="Times New Roman" w:eastAsia="Times New Roman" w:hAnsi="Times New Roman" w:cs="Times New Roman"/>
+          <w:sz w:val="36"/>
+          <w:szCs w:val="36"/>
+        </w:rPr>
+      </w:pPr>
+      <w:r>
+        <w:rPr>
+          <w:rFonts w:ascii="Times New Roman" w:eastAsia="Times New Roman" w:hAnsi="Times New Roman" w:cs="Times New Roman"/>
+          <w:sz w:val="36"/>
+          <w:szCs w:val="36"/>
+        </w:rPr>
+        <w:t>Zenerendezés el</w:t>
+      </w:r>
+      <w:r>
+        <w:rPr>
+          <w:rFonts w:ascii="Times New Roman" w:eastAsia="Times New Roman" w:hAnsi="Times New Roman" w:cs="Times New Roman"/>
+          <w:sz w:val="36"/>
+          <w:szCs w:val="36"/>
+        </w:rPr>
+        <w:t>k</w:t>
+      </w:r>
+      <w:r>
+        <w:rPr>
+          <w:rFonts w:ascii="Times New Roman" w:eastAsia="Times New Roman" w:hAnsi="Times New Roman" w:cs="Times New Roman"/>
+          <w:sz w:val="36"/>
+          <w:szCs w:val="36"/>
+        </w:rPr>
+        <w:t>észítése</w:t>
       </w:r>
     </w:p>
     <w:sectPr>
@@ -6555,6 +8730,119 @@
     </w:lvl>
   </w:abstractNum>
   <w:abstractNum w:abstractNumId="7" w15:restartNumberingAfterBreak="0">
+    <w:nsid w:val="3CD74482"/>
+    <w:multiLevelType w:val="hybridMultilevel"/>
+    <w:tmpl w:val="0150BC32"/>
+    <w:lvl w:ilvl="0" w:tplc="040E0001">
+      <w:start w:val="1"/>
+      <w:numFmt w:val="bullet"/>
+      <w:lvlText w:val=""/>
+      <w:lvlJc w:val="left"/>
+      <w:pPr>
+        <w:ind w:left="720" w:hanging="360"/>
+      </w:pPr>
+      <w:rPr>
+        <w:rFonts w:ascii="Symbol" w:hAnsi="Symbol" w:hint="default"/>
+      </w:rPr>
+    </w:lvl>
+    <w:lvl w:ilvl="1" w:tplc="040E0003" w:tentative="1">
+      <w:start w:val="1"/>
+      <w:numFmt w:val="bullet"/>
+      <w:lvlText w:val="o"/>
+      <w:lvlJc w:val="left"/>
+      <w:pPr>
+        <w:ind w:left="1440" w:hanging="360"/>
+      </w:pPr>
+      <w:rPr>
+        <w:rFonts w:ascii="Courier New" w:hAnsi="Courier New" w:cs="Courier New" w:hint="default"/>
+      </w:rPr>
+    </w:lvl>
+    <w:lvl w:ilvl="2" w:tplc="040E0005" w:tentative="1">
+      <w:start w:val="1"/>
+      <w:numFmt w:val="bullet"/>
+      <w:lvlText w:val=""/>
+      <w:lvlJc w:val="left"/>
+      <w:pPr>
+        <w:ind w:left="2160" w:hanging="360"/>
+      </w:pPr>
+      <w:rPr>
+        <w:rFonts w:ascii="Wingdings" w:hAnsi="Wingdings" w:hint="default"/>
+      </w:rPr>
+    </w:lvl>
+    <w:lvl w:ilvl="3" w:tplc="040E0001" w:tentative="1">
+      <w:start w:val="1"/>
+      <w:numFmt w:val="bullet"/>
+      <w:lvlText w:val=""/>
+      <w:lvlJc w:val="left"/>
+      <w:pPr>
+        <w:ind w:left="2880" w:hanging="360"/>
+      </w:pPr>
+      <w:rPr>
+        <w:rFonts w:ascii="Symbol" w:hAnsi="Symbol" w:hint="default"/>
+      </w:rPr>
+    </w:lvl>
+    <w:lvl w:ilvl="4" w:tplc="040E0003" w:tentative="1">
+      <w:start w:val="1"/>
+      <w:numFmt w:val="bullet"/>
+      <w:lvlText w:val="o"/>
+      <w:lvlJc w:val="left"/>
+      <w:pPr>
+        <w:ind w:left="3600" w:hanging="360"/>
+      </w:pPr>
+      <w:rPr>
+        <w:rFonts w:ascii="Courier New" w:hAnsi="Courier New" w:cs="Courier New" w:hint="default"/>
+      </w:rPr>
+    </w:lvl>
+    <w:lvl w:ilvl="5" w:tplc="040E0005" w:tentative="1">
+      <w:start w:val="1"/>
+      <w:numFmt w:val="bullet"/>
+      <w:lvlText w:val=""/>
+      <w:lvlJc w:val="left"/>
+      <w:pPr>
+        <w:ind w:left="4320" w:hanging="360"/>
+      </w:pPr>
+      <w:rPr>
+        <w:rFonts w:ascii="Wingdings" w:hAnsi="Wingdings" w:hint="default"/>
+      </w:rPr>
+    </w:lvl>
+    <w:lvl w:ilvl="6" w:tplc="040E0001" w:tentative="1">
+      <w:start w:val="1"/>
+      <w:numFmt w:val="bullet"/>
+      <w:lvlText w:val=""/>
+      <w:lvlJc w:val="left"/>
+      <w:pPr>
+        <w:ind w:left="5040" w:hanging="360"/>
+      </w:pPr>
+      <w:rPr>
+        <w:rFonts w:ascii="Symbol" w:hAnsi="Symbol" w:hint="default"/>
+      </w:rPr>
+    </w:lvl>
+    <w:lvl w:ilvl="7" w:tplc="040E0003" w:tentative="1">
+      <w:start w:val="1"/>
+      <w:numFmt w:val="bullet"/>
+      <w:lvlText w:val="o"/>
+      <w:lvlJc w:val="left"/>
+      <w:pPr>
+        <w:ind w:left="5760" w:hanging="360"/>
+      </w:pPr>
+      <w:rPr>
+        <w:rFonts w:ascii="Courier New" w:hAnsi="Courier New" w:cs="Courier New" w:hint="default"/>
+      </w:rPr>
+    </w:lvl>
+    <w:lvl w:ilvl="8" w:tplc="040E0005" w:tentative="1">
+      <w:start w:val="1"/>
+      <w:numFmt w:val="bullet"/>
+      <w:lvlText w:val=""/>
+      <w:lvlJc w:val="left"/>
+      <w:pPr>
+        <w:ind w:left="6480" w:hanging="360"/>
+      </w:pPr>
+      <w:rPr>
+        <w:rFonts w:ascii="Wingdings" w:hAnsi="Wingdings" w:hint="default"/>
+      </w:rPr>
+    </w:lvl>
+  </w:abstractNum>
+  <w:abstractNum w:abstractNumId="8" w15:restartNumberingAfterBreak="0">
     <w:nsid w:val="47442E3E"/>
     <w:multiLevelType w:val="hybridMultilevel"/>
     <w:tmpl w:val="64928C38"/>
@@ -6667,7 +8955,7 @@
       </w:rPr>
     </w:lvl>
   </w:abstractNum>
-  <w:abstractNum w:abstractNumId="8" w15:restartNumberingAfterBreak="0">
+  <w:abstractNum w:abstractNumId="9" w15:restartNumberingAfterBreak="0">
     <w:nsid w:val="4CA522A2"/>
     <w:multiLevelType w:val="hybridMultilevel"/>
     <w:tmpl w:val="81762318"/>
@@ -6780,7 +9068,120 @@
       </w:rPr>
     </w:lvl>
   </w:abstractNum>
-  <w:abstractNum w:abstractNumId="9" w15:restartNumberingAfterBreak="0">
+  <w:abstractNum w:abstractNumId="10" w15:restartNumberingAfterBreak="0">
+    <w:nsid w:val="51655472"/>
+    <w:multiLevelType w:val="hybridMultilevel"/>
+    <w:tmpl w:val="E11ED65A"/>
+    <w:lvl w:ilvl="0" w:tplc="040E0001">
+      <w:start w:val="1"/>
+      <w:numFmt w:val="bullet"/>
+      <w:lvlText w:val=""/>
+      <w:lvlJc w:val="left"/>
+      <w:pPr>
+        <w:ind w:left="720" w:hanging="360"/>
+      </w:pPr>
+      <w:rPr>
+        <w:rFonts w:ascii="Symbol" w:hAnsi="Symbol" w:hint="default"/>
+      </w:rPr>
+    </w:lvl>
+    <w:lvl w:ilvl="1" w:tplc="040E0003">
+      <w:start w:val="1"/>
+      <w:numFmt w:val="bullet"/>
+      <w:lvlText w:val="o"/>
+      <w:lvlJc w:val="left"/>
+      <w:pPr>
+        <w:ind w:left="1440" w:hanging="360"/>
+      </w:pPr>
+      <w:rPr>
+        <w:rFonts w:ascii="Courier New" w:hAnsi="Courier New" w:cs="Courier New" w:hint="default"/>
+      </w:rPr>
+    </w:lvl>
+    <w:lvl w:ilvl="2" w:tplc="040E0005" w:tentative="1">
+      <w:start w:val="1"/>
+      <w:numFmt w:val="bullet"/>
+      <w:lvlText w:val=""/>
+      <w:lvlJc w:val="left"/>
+      <w:pPr>
+        <w:ind w:left="2160" w:hanging="360"/>
+      </w:pPr>
+      <w:rPr>
+        <w:rFonts w:ascii="Wingdings" w:hAnsi="Wingdings" w:hint="default"/>
+      </w:rPr>
+    </w:lvl>
+    <w:lvl w:ilvl="3" w:tplc="040E0001" w:tentative="1">
+      <w:start w:val="1"/>
+      <w:numFmt w:val="bullet"/>
+      <w:lvlText w:val=""/>
+      <w:lvlJc w:val="left"/>
+      <w:pPr>
+        <w:ind w:left="2880" w:hanging="360"/>
+      </w:pPr>
+      <w:rPr>
+        <w:rFonts w:ascii="Symbol" w:hAnsi="Symbol" w:hint="default"/>
+      </w:rPr>
+    </w:lvl>
+    <w:lvl w:ilvl="4" w:tplc="040E0003" w:tentative="1">
+      <w:start w:val="1"/>
+      <w:numFmt w:val="bullet"/>
+      <w:lvlText w:val="o"/>
+      <w:lvlJc w:val="left"/>
+      <w:pPr>
+        <w:ind w:left="3600" w:hanging="360"/>
+      </w:pPr>
+      <w:rPr>
+        <w:rFonts w:ascii="Courier New" w:hAnsi="Courier New" w:cs="Courier New" w:hint="default"/>
+      </w:rPr>
+    </w:lvl>
+    <w:lvl w:ilvl="5" w:tplc="040E0005" w:tentative="1">
+      <w:start w:val="1"/>
+      <w:numFmt w:val="bullet"/>
+      <w:lvlText w:val=""/>
+      <w:lvlJc w:val="left"/>
+      <w:pPr>
+        <w:ind w:left="4320" w:hanging="360"/>
+      </w:pPr>
+      <w:rPr>
+        <w:rFonts w:ascii="Wingdings" w:hAnsi="Wingdings" w:hint="default"/>
+      </w:rPr>
+    </w:lvl>
+    <w:lvl w:ilvl="6" w:tplc="040E0001" w:tentative="1">
+      <w:start w:val="1"/>
+      <w:numFmt w:val="bullet"/>
+      <w:lvlText w:val=""/>
+      <w:lvlJc w:val="left"/>
+      <w:pPr>
+        <w:ind w:left="5040" w:hanging="360"/>
+      </w:pPr>
+      <w:rPr>
+        <w:rFonts w:ascii="Symbol" w:hAnsi="Symbol" w:hint="default"/>
+      </w:rPr>
+    </w:lvl>
+    <w:lvl w:ilvl="7" w:tplc="040E0003" w:tentative="1">
+      <w:start w:val="1"/>
+      <w:numFmt w:val="bullet"/>
+      <w:lvlText w:val="o"/>
+      <w:lvlJc w:val="left"/>
+      <w:pPr>
+        <w:ind w:left="5760" w:hanging="360"/>
+      </w:pPr>
+      <w:rPr>
+        <w:rFonts w:ascii="Courier New" w:hAnsi="Courier New" w:cs="Courier New" w:hint="default"/>
+      </w:rPr>
+    </w:lvl>
+    <w:lvl w:ilvl="8" w:tplc="040E0005" w:tentative="1">
+      <w:start w:val="1"/>
+      <w:numFmt w:val="bullet"/>
+      <w:lvlText w:val=""/>
+      <w:lvlJc w:val="left"/>
+      <w:pPr>
+        <w:ind w:left="6480" w:hanging="360"/>
+      </w:pPr>
+      <w:rPr>
+        <w:rFonts w:ascii="Wingdings" w:hAnsi="Wingdings" w:hint="default"/>
+      </w:rPr>
+    </w:lvl>
+  </w:abstractNum>
+  <w:abstractNum w:abstractNumId="11" w15:restartNumberingAfterBreak="0">
     <w:nsid w:val="5B1E66BA"/>
     <w:multiLevelType w:val="hybridMultilevel"/>
     <w:tmpl w:val="56E6462C"/>
@@ -6893,7 +9294,7 @@
       </w:rPr>
     </w:lvl>
   </w:abstractNum>
-  <w:abstractNum w:abstractNumId="10" w15:restartNumberingAfterBreak="0">
+  <w:abstractNum w:abstractNumId="12" w15:restartNumberingAfterBreak="0">
     <w:nsid w:val="64C346FC"/>
     <w:multiLevelType w:val="hybridMultilevel"/>
     <w:tmpl w:val="EAE26AC8"/>
@@ -7006,7 +9407,7 @@
       </w:rPr>
     </w:lvl>
   </w:abstractNum>
-  <w:abstractNum w:abstractNumId="11" w15:restartNumberingAfterBreak="0">
+  <w:abstractNum w:abstractNumId="13" w15:restartNumberingAfterBreak="0">
     <w:nsid w:val="69361338"/>
     <w:multiLevelType w:val="hybridMultilevel"/>
     <w:tmpl w:val="6CF0B772"/>
@@ -7119,7 +9520,7 @@
       </w:rPr>
     </w:lvl>
   </w:abstractNum>
-  <w:abstractNum w:abstractNumId="12" w15:restartNumberingAfterBreak="0">
+  <w:abstractNum w:abstractNumId="14" w15:restartNumberingAfterBreak="0">
     <w:nsid w:val="69FA5A50"/>
     <w:multiLevelType w:val="hybridMultilevel"/>
     <w:tmpl w:val="D82A6326"/>
@@ -7232,7 +9633,7 @@
       </w:rPr>
     </w:lvl>
   </w:abstractNum>
-  <w:abstractNum w:abstractNumId="13" w15:restartNumberingAfterBreak="0">
+  <w:abstractNum w:abstractNumId="15" w15:restartNumberingAfterBreak="0">
     <w:nsid w:val="6E7312B6"/>
     <w:multiLevelType w:val="hybridMultilevel"/>
     <w:tmpl w:val="FD80BAFC"/>
@@ -7345,7 +9746,7 @@
       </w:rPr>
     </w:lvl>
   </w:abstractNum>
-  <w:abstractNum w:abstractNumId="14" w15:restartNumberingAfterBreak="0">
+  <w:abstractNum w:abstractNumId="16" w15:restartNumberingAfterBreak="0">
     <w:nsid w:val="76FA296F"/>
     <w:multiLevelType w:val="hybridMultilevel"/>
     <w:tmpl w:val="6DAE32EA"/>
@@ -7458,7 +9859,7 @@
       </w:rPr>
     </w:lvl>
   </w:abstractNum>
-  <w:abstractNum w:abstractNumId="15" w15:restartNumberingAfterBreak="0">
+  <w:abstractNum w:abstractNumId="17" w15:restartNumberingAfterBreak="0">
     <w:nsid w:val="788C73B2"/>
     <w:multiLevelType w:val="hybridMultilevel"/>
     <w:tmpl w:val="6D6C60B0"/>
@@ -7571,7 +9972,7 @@
       </w:rPr>
     </w:lvl>
   </w:abstractNum>
-  <w:abstractNum w:abstractNumId="16" w15:restartNumberingAfterBreak="0">
+  <w:abstractNum w:abstractNumId="18" w15:restartNumberingAfterBreak="0">
     <w:nsid w:val="79644490"/>
     <w:multiLevelType w:val="hybridMultilevel"/>
     <w:tmpl w:val="340ACCA0"/>
@@ -7684,7 +10085,7 @@
       </w:rPr>
     </w:lvl>
   </w:abstractNum>
-  <w:abstractNum w:abstractNumId="17" w15:restartNumberingAfterBreak="0">
+  <w:abstractNum w:abstractNumId="19" w15:restartNumberingAfterBreak="0">
     <w:nsid w:val="7EB672F7"/>
     <w:multiLevelType w:val="hybridMultilevel"/>
     <w:tmpl w:val="A6F0C99C"/>
@@ -7798,28 +10199,28 @@
     </w:lvl>
   </w:abstractNum>
   <w:num w:numId="1" w16cid:durableId="1729911386">
-    <w:abstractNumId w:val="17"/>
+    <w:abstractNumId w:val="19"/>
   </w:num>
   <w:num w:numId="2" w16cid:durableId="1236743146">
-    <w:abstractNumId w:val="13"/>
+    <w:abstractNumId w:val="15"/>
   </w:num>
   <w:num w:numId="3" w16cid:durableId="1134757097">
-    <w:abstractNumId w:val="14"/>
+    <w:abstractNumId w:val="16"/>
   </w:num>
   <w:num w:numId="4" w16cid:durableId="2091853903">
     <w:abstractNumId w:val="6"/>
   </w:num>
   <w:num w:numId="5" w16cid:durableId="367411174">
-    <w:abstractNumId w:val="12"/>
+    <w:abstractNumId w:val="14"/>
   </w:num>
   <w:num w:numId="6" w16cid:durableId="1708529570">
-    <w:abstractNumId w:val="7"/>
+    <w:abstractNumId w:val="8"/>
   </w:num>
   <w:num w:numId="7" w16cid:durableId="1052462448">
-    <w:abstractNumId w:val="15"/>
+    <w:abstractNumId w:val="17"/>
   </w:num>
   <w:num w:numId="8" w16cid:durableId="364061568">
-    <w:abstractNumId w:val="11"/>
+    <w:abstractNumId w:val="13"/>
   </w:num>
   <w:num w:numId="9" w16cid:durableId="1691909584">
     <w:abstractNumId w:val="4"/>
@@ -7828,13 +10229,13 @@
     <w:abstractNumId w:val="5"/>
   </w:num>
   <w:num w:numId="11" w16cid:durableId="671109898">
-    <w:abstractNumId w:val="9"/>
+    <w:abstractNumId w:val="11"/>
   </w:num>
   <w:num w:numId="12" w16cid:durableId="865824125">
-    <w:abstractNumId w:val="16"/>
+    <w:abstractNumId w:val="18"/>
   </w:num>
   <w:num w:numId="13" w16cid:durableId="1056592091">
-    <w:abstractNumId w:val="8"/>
+    <w:abstractNumId w:val="9"/>
   </w:num>
   <w:num w:numId="14" w16cid:durableId="1268150545">
     <w:abstractNumId w:val="3"/>
@@ -7843,13 +10244,19 @@
     <w:abstractNumId w:val="2"/>
   </w:num>
   <w:num w:numId="16" w16cid:durableId="1882748074">
-    <w:abstractNumId w:val="10"/>
+    <w:abstractNumId w:val="12"/>
   </w:num>
   <w:num w:numId="17" w16cid:durableId="23747683">
     <w:abstractNumId w:val="1"/>
   </w:num>
   <w:num w:numId="18" w16cid:durableId="292634421">
     <w:abstractNumId w:val="0"/>
+  </w:num>
+  <w:num w:numId="19" w16cid:durableId="345788209">
+    <w:abstractNumId w:val="10"/>
+  </w:num>
+  <w:num w:numId="20" w16cid:durableId="1967395271">
+    <w:abstractNumId w:val="7"/>
   </w:num>
 </w:numbering>
 </file>
@@ -8457,6 +10864,7 @@
   <w:style w:type="character" w:default="1" w:styleId="Bekezdsalapbettpusa">
     <w:name w:val="Default Paragraph Font"/>
     <w:uiPriority w:val="1"/>
+    <w:semiHidden/>
     <w:unhideWhenUsed/>
   </w:style>
   <w:style w:type="table" w:default="1" w:styleId="Normltblzat">

</xml_diff>

<commit_message>
(+doc), making users' documentation
</commit_message>
<xml_diff>
--- a/documentation.docx
+++ b/documentation.docx
@@ -1,6 +1,6 @@
 
 <file path=word/document.xml><?xml version="1.0" encoding="utf-8"?>
-<w:document xmlns:wpc="http://schemas.microsoft.com/office/word/2010/wordprocessingCanvas" xmlns:cx="http://schemas.microsoft.com/office/drawing/2014/chartex" xmlns:cx1="http://schemas.microsoft.com/office/drawing/2015/9/8/chartex" xmlns:cx2="http://schemas.microsoft.com/office/drawing/2015/10/21/chartex" xmlns:cx3="http://schemas.microsoft.com/office/drawing/2016/5/9/chartex" xmlns:cx4="http://schemas.microsoft.com/office/drawing/2016/5/10/chartex" xmlns:cx5="http://schemas.microsoft.com/office/drawing/2016/5/11/chartex" xmlns:cx6="http://schemas.microsoft.com/office/drawing/2016/5/12/chartex" xmlns:cx7="http://schemas.microsoft.com/office/drawing/2016/5/13/chartex" xmlns:cx8="http://schemas.microsoft.com/office/drawing/2016/5/14/chartex" xmlns:mc="http://schemas.openxmlformats.org/markup-compatibility/2006" xmlns:aink="http://schemas.microsoft.com/office/drawing/2016/ink" xmlns:am3d="http://schemas.microsoft.com/office/drawing/2017/model3d" xmlns:o="urn:schemas-microsoft-com:office:office" xmlns:oel="http://schemas.microsoft.com/office/2019/extlst" xmlns:r="http://schemas.openxmlformats.org/officeDocument/2006/relationships" xmlns:m="http://schemas.openxmlformats.org/officeDocument/2006/math" xmlns:v="urn:schemas-microsoft-com:vml" xmlns:wp14="http://schemas.microsoft.com/office/word/2010/wordprocessingDrawing" xmlns:wp="http://schemas.openxmlformats.org/drawingml/2006/wordprocessingDrawing" xmlns:w10="urn:schemas-microsoft-com:office:word" xmlns:w="http://schemas.openxmlformats.org/wordprocessingml/2006/main" xmlns:w14="http://schemas.microsoft.com/office/word/2010/wordml" xmlns:w15="http://schemas.microsoft.com/office/word/2012/wordml" xmlns:w16cex="http://schemas.microsoft.com/office/word/2018/wordml/cex" xmlns:w16cid="http://schemas.microsoft.com/office/word/2016/wordml/cid" xmlns:w16="http://schemas.microsoft.com/office/word/2018/wordml" xmlns:w16du="http://schemas.microsoft.com/office/word/2023/wordml/word16du" xmlns:w16sdtdh="http://schemas.microsoft.com/office/word/2020/wordml/sdtdatahash" xmlns:w16sdtfl="http://schemas.microsoft.com/office/word/2024/wordml/sdtformatlock" xmlns:w16se="http://schemas.microsoft.com/office/word/2015/wordml/symex" xmlns:wpg="http://schemas.microsoft.com/office/word/2010/wordprocessingGroup" xmlns:wpi="http://schemas.microsoft.com/office/word/2010/wordprocessingInk" xmlns:wne="http://schemas.microsoft.com/office/word/2006/wordml" xmlns:wps="http://schemas.microsoft.com/office/word/2010/wordprocessingShape" mc:Ignorable="w14 w15 w16se w16cid w16 w16cex w16sdtdh w16sdtfl w16du wp14">
+<w:document xmlns:wpc="http://schemas.microsoft.com/office/word/2010/wordprocessingCanvas" xmlns:cx="http://schemas.microsoft.com/office/drawing/2014/chartex" xmlns:cx1="http://schemas.microsoft.com/office/drawing/2015/9/8/chartex" xmlns:cx2="http://schemas.microsoft.com/office/drawing/2015/10/21/chartex" xmlns:cx3="http://schemas.microsoft.com/office/drawing/2016/5/9/chartex" xmlns:cx4="http://schemas.microsoft.com/office/drawing/2016/5/10/chartex" xmlns:cx5="http://schemas.microsoft.com/office/drawing/2016/5/11/chartex" xmlns:cx6="http://schemas.microsoft.com/office/drawing/2016/5/12/chartex" xmlns:cx7="http://schemas.microsoft.com/office/drawing/2016/5/13/chartex" xmlns:cx8="http://schemas.microsoft.com/office/drawing/2016/5/14/chartex" xmlns:mc="http://schemas.openxmlformats.org/markup-compatibility/2006" xmlns:aink="http://schemas.microsoft.com/office/drawing/2016/ink" xmlns:am3d="http://schemas.microsoft.com/office/drawing/2017/model3d" xmlns:o="urn:schemas-microsoft-com:office:office" xmlns:r="http://schemas.openxmlformats.org/officeDocument/2006/relationships" xmlns:m="http://schemas.openxmlformats.org/officeDocument/2006/math" xmlns:v="urn:schemas-microsoft-com:vml" xmlns:wp14="http://schemas.microsoft.com/office/word/2010/wordprocessingDrawing" xmlns:wp="http://schemas.openxmlformats.org/drawingml/2006/wordprocessingDrawing" xmlns:w10="urn:schemas-microsoft-com:office:word" xmlns:w="http://schemas.openxmlformats.org/wordprocessingml/2006/main" xmlns:w14="http://schemas.microsoft.com/office/word/2010/wordml" xmlns:w15="http://schemas.microsoft.com/office/word/2012/wordml" xmlns:w16cid="http://schemas.microsoft.com/office/word/2016/wordml/cid" xmlns:w16se="http://schemas.microsoft.com/office/word/2015/wordml/symex" xmlns:wpg="http://schemas.microsoft.com/office/word/2010/wordprocessingGroup" xmlns:wpi="http://schemas.microsoft.com/office/word/2010/wordprocessingInk" xmlns:wne="http://schemas.microsoft.com/office/word/2006/wordml" xmlns:wps="http://schemas.microsoft.com/office/word/2010/wordprocessingShape" mc:Ignorable="w14 w15 w16se w16cid wp14">
   <w:body>
     <w:p>
       <w:pPr>
@@ -1529,13 +1529,23 @@
           <w:szCs w:val="36"/>
         </w:rPr>
       </w:pPr>
-      <w:r>
-        <w:rPr>
-          <w:rFonts w:ascii="Times New Roman" w:eastAsia="Times New Roman" w:hAnsi="Times New Roman" w:cs="Times New Roman"/>
-          <w:sz w:val="36"/>
-          <w:szCs w:val="36"/>
-        </w:rPr>
-        <w:t xml:space="preserve">Főképernyő </w:t>
+      <w:proofErr w:type="spellStart"/>
+      <w:r>
+        <w:rPr>
+          <w:rFonts w:ascii="Times New Roman" w:eastAsia="Times New Roman" w:hAnsi="Times New Roman" w:cs="Times New Roman"/>
+          <w:sz w:val="36"/>
+          <w:szCs w:val="36"/>
+        </w:rPr>
+        <w:t>Főképernyő</w:t>
+      </w:r>
+      <w:proofErr w:type="spellEnd"/>
+      <w:r>
+        <w:rPr>
+          <w:rFonts w:ascii="Times New Roman" w:eastAsia="Times New Roman" w:hAnsi="Times New Roman" w:cs="Times New Roman"/>
+          <w:sz w:val="36"/>
+          <w:szCs w:val="36"/>
+        </w:rPr>
+        <w:t xml:space="preserve"> </w:t>
       </w:r>
       <w:proofErr w:type="spellStart"/>
       <w:r>
@@ -3864,7 +3874,7 @@
       </w:pPr>
       <w:r>
         <w:pict w14:anchorId="759CF75D">
-          <v:shape id="Kép 1" o:spid="_x0000_i1026" type="#_x0000_t75" style="width:24pt;height:24pt;visibility:visible;mso-wrap-style:square">
+          <v:shape id="Kép 1" o:spid="_x0000_i1026" type="#_x0000_t75" style="width:23.75pt;height:23.75pt;visibility:visible;mso-wrap-style:square">
             <v:imagedata r:id="rId27" o:title=""/>
           </v:shape>
         </w:pict>
@@ -4300,7 +4310,25 @@
           <w:sz w:val="36"/>
           <w:szCs w:val="36"/>
         </w:rPr>
-        <w:t xml:space="preserve"> volt, viszont azóta a főmappa a </w:t>
+        <w:t xml:space="preserve"> volt, viszont azóta a </w:t>
+      </w:r>
+      <w:proofErr w:type="spellStart"/>
+      <w:r>
+        <w:rPr>
+          <w:rFonts w:ascii="Times New Roman" w:eastAsia="Times New Roman" w:hAnsi="Times New Roman" w:cs="Times New Roman"/>
+          <w:sz w:val="36"/>
+          <w:szCs w:val="36"/>
+        </w:rPr>
+        <w:t>főmappa</w:t>
+      </w:r>
+      <w:proofErr w:type="spellEnd"/>
+      <w:r>
+        <w:rPr>
+          <w:rFonts w:ascii="Times New Roman" w:eastAsia="Times New Roman" w:hAnsi="Times New Roman" w:cs="Times New Roman"/>
+          <w:sz w:val="36"/>
+          <w:szCs w:val="36"/>
+        </w:rPr>
+        <w:t xml:space="preserve"> a </w:t>
       </w:r>
       <w:proofErr w:type="spellStart"/>
       <w:r>
@@ -7898,6 +7926,167 @@
           <w:szCs w:val="36"/>
         </w:rPr>
         <w:t>észítése</w:t>
+      </w:r>
+    </w:p>
+    <w:p>
+      <w:pPr>
+        <w:jc w:val="both"/>
+        <w:rPr>
+          <w:rFonts w:ascii="Times New Roman" w:eastAsia="Times New Roman" w:hAnsi="Times New Roman" w:cs="Times New Roman"/>
+          <w:sz w:val="36"/>
+          <w:szCs w:val="36"/>
+        </w:rPr>
+      </w:pPr>
+    </w:p>
+    <w:p>
+      <w:pPr>
+        <w:jc w:val="both"/>
+        <w:rPr>
+          <w:rFonts w:ascii="Times New Roman" w:eastAsia="Times New Roman" w:hAnsi="Times New Roman" w:cs="Times New Roman"/>
+          <w:b/>
+          <w:sz w:val="40"/>
+          <w:szCs w:val="36"/>
+        </w:rPr>
+      </w:pPr>
+      <w:r>
+        <w:rPr>
+          <w:rFonts w:ascii="Times New Roman" w:eastAsia="Times New Roman" w:hAnsi="Times New Roman" w:cs="Times New Roman"/>
+          <w:b/>
+          <w:sz w:val="40"/>
+          <w:szCs w:val="36"/>
+        </w:rPr>
+        <w:t>2026-04-23 9:20-</w:t>
+      </w:r>
+      <w:r>
+        <w:rPr>
+          <w:rFonts w:ascii="Times New Roman" w:eastAsia="Times New Roman" w:hAnsi="Times New Roman" w:cs="Times New Roman"/>
+          <w:b/>
+          <w:sz w:val="40"/>
+          <w:szCs w:val="36"/>
+        </w:rPr>
+        <w:t>9:40, 14:00-</w:t>
+      </w:r>
+      <w:r>
+        <w:rPr>
+          <w:rFonts w:ascii="Times New Roman" w:eastAsia="Times New Roman" w:hAnsi="Times New Roman" w:cs="Times New Roman"/>
+          <w:b/>
+          <w:sz w:val="40"/>
+          <w:szCs w:val="36"/>
+        </w:rPr>
+        <w:t>15:25</w:t>
+      </w:r>
+      <w:bookmarkStart w:id="0" w:name="_GoBack"/>
+      <w:bookmarkEnd w:id="0"/>
+    </w:p>
+    <w:p>
+      <w:pPr>
+        <w:pStyle w:val="Listaszerbekezds"/>
+        <w:numPr>
+          <w:ilvl w:val="0"/>
+          <w:numId w:val="21"/>
+        </w:numPr>
+        <w:jc w:val="both"/>
+        <w:rPr>
+          <w:rFonts w:ascii="Times New Roman" w:eastAsia="Times New Roman" w:hAnsi="Times New Roman" w:cs="Times New Roman"/>
+          <w:sz w:val="36"/>
+          <w:szCs w:val="36"/>
+        </w:rPr>
+      </w:pPr>
+      <w:r>
+        <w:rPr>
+          <w:rFonts w:ascii="Times New Roman" w:eastAsia="Times New Roman" w:hAnsi="Times New Roman" w:cs="Times New Roman"/>
+          <w:sz w:val="36"/>
+          <w:szCs w:val="36"/>
+        </w:rPr>
+        <w:lastRenderedPageBreak/>
+        <w:t>A vizsgához szükséges követelmények alapján felhasználói és fejlesztői dokumentáció létrehozása.</w:t>
+      </w:r>
+    </w:p>
+    <w:p>
+      <w:pPr>
+        <w:pStyle w:val="Listaszerbekezds"/>
+        <w:numPr>
+          <w:ilvl w:val="0"/>
+          <w:numId w:val="21"/>
+        </w:numPr>
+        <w:jc w:val="both"/>
+        <w:rPr>
+          <w:rFonts w:ascii="Times New Roman" w:eastAsia="Times New Roman" w:hAnsi="Times New Roman" w:cs="Times New Roman"/>
+          <w:sz w:val="36"/>
+          <w:szCs w:val="36"/>
+        </w:rPr>
+      </w:pPr>
+      <w:r>
+        <w:rPr>
+          <w:rFonts w:ascii="Times New Roman" w:eastAsia="Times New Roman" w:hAnsi="Times New Roman" w:cs="Times New Roman"/>
+          <w:sz w:val="36"/>
+          <w:szCs w:val="36"/>
+        </w:rPr>
+        <w:t>Bejelentkezés (</w:t>
+      </w:r>
+      <w:proofErr w:type="spellStart"/>
+      <w:r>
+        <w:rPr>
+          <w:rFonts w:ascii="Times New Roman" w:eastAsia="Times New Roman" w:hAnsi="Times New Roman" w:cs="Times New Roman"/>
+          <w:sz w:val="36"/>
+          <w:szCs w:val="36"/>
+        </w:rPr>
+        <w:t>autentikáció</w:t>
+      </w:r>
+      <w:proofErr w:type="spellEnd"/>
+      <w:r>
+        <w:rPr>
+          <w:rFonts w:ascii="Times New Roman" w:eastAsia="Times New Roman" w:hAnsi="Times New Roman" w:cs="Times New Roman"/>
+          <w:sz w:val="36"/>
+          <w:szCs w:val="36"/>
+        </w:rPr>
+        <w:t xml:space="preserve"> még nem!) kivitelezése</w:t>
+      </w:r>
+    </w:p>
+    <w:p>
+      <w:pPr>
+        <w:pStyle w:val="Listaszerbekezds"/>
+        <w:numPr>
+          <w:ilvl w:val="0"/>
+          <w:numId w:val="21"/>
+        </w:numPr>
+        <w:jc w:val="both"/>
+        <w:rPr>
+          <w:rFonts w:ascii="Times New Roman" w:eastAsia="Times New Roman" w:hAnsi="Times New Roman" w:cs="Times New Roman"/>
+          <w:sz w:val="36"/>
+          <w:szCs w:val="36"/>
+        </w:rPr>
+      </w:pPr>
+      <w:r>
+        <w:rPr>
+          <w:rFonts w:ascii="Times New Roman" w:eastAsia="Times New Roman" w:hAnsi="Times New Roman" w:cs="Times New Roman"/>
+          <w:sz w:val="36"/>
+          <w:szCs w:val="36"/>
+        </w:rPr>
+        <w:t>A zeneelrendezésnél a bekért zenék hibás megjelenítése kijavítva</w:t>
+      </w:r>
+    </w:p>
+    <w:p>
+      <w:pPr>
+        <w:pStyle w:val="Listaszerbekezds"/>
+        <w:numPr>
+          <w:ilvl w:val="0"/>
+          <w:numId w:val="21"/>
+        </w:numPr>
+        <w:jc w:val="both"/>
+        <w:rPr>
+          <w:rFonts w:ascii="Times New Roman" w:eastAsia="Times New Roman" w:hAnsi="Times New Roman" w:cs="Times New Roman"/>
+          <w:sz w:val="36"/>
+          <w:szCs w:val="36"/>
+        </w:rPr>
+      </w:pPr>
+      <w:r>
+        <w:rPr>
+          <w:rFonts w:ascii="Times New Roman" w:eastAsia="Times New Roman" w:hAnsi="Times New Roman" w:cs="Times New Roman"/>
+          <w:sz w:val="36"/>
+          <w:szCs w:val="36"/>
+        </w:rPr>
+        <w:t>Bekért zenék üzeneteinek lekérésére lehetőség adása</w:t>
       </w:r>
     </w:p>
     <w:sectPr>
@@ -7911,7 +8100,7 @@
 </file>
 
 <file path=word/numbering.xml><?xml version="1.0" encoding="utf-8"?>
-<w:numbering xmlns:wpc="http://schemas.microsoft.com/office/word/2010/wordprocessingCanvas" xmlns:cx="http://schemas.microsoft.com/office/drawing/2014/chartex" xmlns:cx1="http://schemas.microsoft.com/office/drawing/2015/9/8/chartex" xmlns:cx2="http://schemas.microsoft.com/office/drawing/2015/10/21/chartex" xmlns:cx3="http://schemas.microsoft.com/office/drawing/2016/5/9/chartex" xmlns:cx4="http://schemas.microsoft.com/office/drawing/2016/5/10/chartex" xmlns:cx5="http://schemas.microsoft.com/office/drawing/2016/5/11/chartex" xmlns:cx6="http://schemas.microsoft.com/office/drawing/2016/5/12/chartex" xmlns:cx7="http://schemas.microsoft.com/office/drawing/2016/5/13/chartex" xmlns:cx8="http://schemas.microsoft.com/office/drawing/2016/5/14/chartex" xmlns:mc="http://schemas.openxmlformats.org/markup-compatibility/2006" xmlns:aink="http://schemas.microsoft.com/office/drawing/2016/ink" xmlns:am3d="http://schemas.microsoft.com/office/drawing/2017/model3d" xmlns:o="urn:schemas-microsoft-com:office:office" xmlns:oel="http://schemas.microsoft.com/office/2019/extlst" xmlns:r="http://schemas.openxmlformats.org/officeDocument/2006/relationships" xmlns:m="http://schemas.openxmlformats.org/officeDocument/2006/math" xmlns:v="urn:schemas-microsoft-com:vml" xmlns:wp14="http://schemas.microsoft.com/office/word/2010/wordprocessingDrawing" xmlns:wp="http://schemas.openxmlformats.org/drawingml/2006/wordprocessingDrawing" xmlns:w10="urn:schemas-microsoft-com:office:word" xmlns:w="http://schemas.openxmlformats.org/wordprocessingml/2006/main" xmlns:w14="http://schemas.microsoft.com/office/word/2010/wordml" xmlns:w15="http://schemas.microsoft.com/office/word/2012/wordml" xmlns:w16cex="http://schemas.microsoft.com/office/word/2018/wordml/cex" xmlns:w16cid="http://schemas.microsoft.com/office/word/2016/wordml/cid" xmlns:w16="http://schemas.microsoft.com/office/word/2018/wordml" xmlns:w16du="http://schemas.microsoft.com/office/word/2023/wordml/word16du" xmlns:w16sdtdh="http://schemas.microsoft.com/office/word/2020/wordml/sdtdatahash" xmlns:w16sdtfl="http://schemas.microsoft.com/office/word/2024/wordml/sdtformatlock" xmlns:w16se="http://schemas.microsoft.com/office/word/2015/wordml/symex" xmlns:wpg="http://schemas.microsoft.com/office/word/2010/wordprocessingGroup" xmlns:wpi="http://schemas.microsoft.com/office/word/2010/wordprocessingInk" xmlns:wne="http://schemas.microsoft.com/office/word/2006/wordml" xmlns:wps="http://schemas.microsoft.com/office/word/2010/wordprocessingShape" mc:Ignorable="w14 w15 w16se w16cid w16 w16cex w16sdtdh w16sdtfl w16du wp14">
+<w:numbering xmlns:wpc="http://schemas.microsoft.com/office/word/2010/wordprocessingCanvas" xmlns:cx="http://schemas.microsoft.com/office/drawing/2014/chartex" xmlns:cx1="http://schemas.microsoft.com/office/drawing/2015/9/8/chartex" xmlns:cx2="http://schemas.microsoft.com/office/drawing/2015/10/21/chartex" xmlns:cx3="http://schemas.microsoft.com/office/drawing/2016/5/9/chartex" xmlns:cx4="http://schemas.microsoft.com/office/drawing/2016/5/10/chartex" xmlns:cx5="http://schemas.microsoft.com/office/drawing/2016/5/11/chartex" xmlns:cx6="http://schemas.microsoft.com/office/drawing/2016/5/12/chartex" xmlns:cx7="http://schemas.microsoft.com/office/drawing/2016/5/13/chartex" xmlns:cx8="http://schemas.microsoft.com/office/drawing/2016/5/14/chartex" xmlns:mc="http://schemas.openxmlformats.org/markup-compatibility/2006" xmlns:aink="http://schemas.microsoft.com/office/drawing/2016/ink" xmlns:am3d="http://schemas.microsoft.com/office/drawing/2017/model3d" xmlns:o="urn:schemas-microsoft-com:office:office" xmlns:r="http://schemas.openxmlformats.org/officeDocument/2006/relationships" xmlns:m="http://schemas.openxmlformats.org/officeDocument/2006/math" xmlns:v="urn:schemas-microsoft-com:vml" xmlns:wp14="http://schemas.microsoft.com/office/word/2010/wordprocessingDrawing" xmlns:wp="http://schemas.openxmlformats.org/drawingml/2006/wordprocessingDrawing" xmlns:w10="urn:schemas-microsoft-com:office:word" xmlns:w="http://schemas.openxmlformats.org/wordprocessingml/2006/main" xmlns:w14="http://schemas.microsoft.com/office/word/2010/wordml" xmlns:w15="http://schemas.microsoft.com/office/word/2012/wordml" xmlns:w16cid="http://schemas.microsoft.com/office/word/2016/wordml/cid" xmlns:w16se="http://schemas.microsoft.com/office/word/2015/wordml/symex" xmlns:wpg="http://schemas.microsoft.com/office/word/2010/wordprocessingGroup" xmlns:wpi="http://schemas.microsoft.com/office/word/2010/wordprocessingInk" xmlns:wne="http://schemas.microsoft.com/office/word/2006/wordml" xmlns:wps="http://schemas.microsoft.com/office/word/2010/wordprocessingShape" mc:Ignorable="w14 w15 w16se w16cid wp14">
   <w:numPicBullet w:numPicBulletId="0">
     <w:pict>
       <v:shapetype id="_x0000_t75" coordsize="21600,21600" o:spt="75" o:preferrelative="t" path="m@4@5l@4@11@9@11@9@5xe" filled="f" stroked="f">
@@ -7933,7 +8122,7 @@
         <v:path o:extrusionok="f" gradientshapeok="t" o:connecttype="rect"/>
         <o:lock v:ext="edit" aspectratio="t"/>
       </v:shapetype>
-      <v:shape id="_x0000_i1025" type="#_x0000_t75" style="width:24pt;height:24pt;visibility:visible;mso-wrap-style:square" o:bullet="t">
+      <v:shape id="_x0000_i1035" type="#_x0000_t75" style="width:23.75pt;height:23.75pt;visibility:visible;mso-wrap-style:square" o:bullet="t">
         <v:imagedata r:id="rId1" o:title=""/>
       </v:shape>
     </w:pict>
@@ -8052,6 +8241,119 @@
     </w:lvl>
   </w:abstractNum>
   <w:abstractNum w:abstractNumId="1" w15:restartNumberingAfterBreak="0">
+    <w:nsid w:val="11E777A8"/>
+    <w:multiLevelType w:val="hybridMultilevel"/>
+    <w:tmpl w:val="659C6724"/>
+    <w:lvl w:ilvl="0" w:tplc="040E0001">
+      <w:start w:val="1"/>
+      <w:numFmt w:val="bullet"/>
+      <w:lvlText w:val=""/>
+      <w:lvlJc w:val="left"/>
+      <w:pPr>
+        <w:ind w:left="720" w:hanging="360"/>
+      </w:pPr>
+      <w:rPr>
+        <w:rFonts w:ascii="Symbol" w:hAnsi="Symbol" w:hint="default"/>
+      </w:rPr>
+    </w:lvl>
+    <w:lvl w:ilvl="1" w:tplc="040E0003" w:tentative="1">
+      <w:start w:val="1"/>
+      <w:numFmt w:val="bullet"/>
+      <w:lvlText w:val="o"/>
+      <w:lvlJc w:val="left"/>
+      <w:pPr>
+        <w:ind w:left="1440" w:hanging="360"/>
+      </w:pPr>
+      <w:rPr>
+        <w:rFonts w:ascii="Courier New" w:hAnsi="Courier New" w:cs="Courier New" w:hint="default"/>
+      </w:rPr>
+    </w:lvl>
+    <w:lvl w:ilvl="2" w:tplc="040E0005" w:tentative="1">
+      <w:start w:val="1"/>
+      <w:numFmt w:val="bullet"/>
+      <w:lvlText w:val=""/>
+      <w:lvlJc w:val="left"/>
+      <w:pPr>
+        <w:ind w:left="2160" w:hanging="360"/>
+      </w:pPr>
+      <w:rPr>
+        <w:rFonts w:ascii="Wingdings" w:hAnsi="Wingdings" w:hint="default"/>
+      </w:rPr>
+    </w:lvl>
+    <w:lvl w:ilvl="3" w:tplc="040E0001" w:tentative="1">
+      <w:start w:val="1"/>
+      <w:numFmt w:val="bullet"/>
+      <w:lvlText w:val=""/>
+      <w:lvlJc w:val="left"/>
+      <w:pPr>
+        <w:ind w:left="2880" w:hanging="360"/>
+      </w:pPr>
+      <w:rPr>
+        <w:rFonts w:ascii="Symbol" w:hAnsi="Symbol" w:hint="default"/>
+      </w:rPr>
+    </w:lvl>
+    <w:lvl w:ilvl="4" w:tplc="040E0003" w:tentative="1">
+      <w:start w:val="1"/>
+      <w:numFmt w:val="bullet"/>
+      <w:lvlText w:val="o"/>
+      <w:lvlJc w:val="left"/>
+      <w:pPr>
+        <w:ind w:left="3600" w:hanging="360"/>
+      </w:pPr>
+      <w:rPr>
+        <w:rFonts w:ascii="Courier New" w:hAnsi="Courier New" w:cs="Courier New" w:hint="default"/>
+      </w:rPr>
+    </w:lvl>
+    <w:lvl w:ilvl="5" w:tplc="040E0005" w:tentative="1">
+      <w:start w:val="1"/>
+      <w:numFmt w:val="bullet"/>
+      <w:lvlText w:val=""/>
+      <w:lvlJc w:val="left"/>
+      <w:pPr>
+        <w:ind w:left="4320" w:hanging="360"/>
+      </w:pPr>
+      <w:rPr>
+        <w:rFonts w:ascii="Wingdings" w:hAnsi="Wingdings" w:hint="default"/>
+      </w:rPr>
+    </w:lvl>
+    <w:lvl w:ilvl="6" w:tplc="040E0001" w:tentative="1">
+      <w:start w:val="1"/>
+      <w:numFmt w:val="bullet"/>
+      <w:lvlText w:val=""/>
+      <w:lvlJc w:val="left"/>
+      <w:pPr>
+        <w:ind w:left="5040" w:hanging="360"/>
+      </w:pPr>
+      <w:rPr>
+        <w:rFonts w:ascii="Symbol" w:hAnsi="Symbol" w:hint="default"/>
+      </w:rPr>
+    </w:lvl>
+    <w:lvl w:ilvl="7" w:tplc="040E0003" w:tentative="1">
+      <w:start w:val="1"/>
+      <w:numFmt w:val="bullet"/>
+      <w:lvlText w:val="o"/>
+      <w:lvlJc w:val="left"/>
+      <w:pPr>
+        <w:ind w:left="5760" w:hanging="360"/>
+      </w:pPr>
+      <w:rPr>
+        <w:rFonts w:ascii="Courier New" w:hAnsi="Courier New" w:cs="Courier New" w:hint="default"/>
+      </w:rPr>
+    </w:lvl>
+    <w:lvl w:ilvl="8" w:tplc="040E0005" w:tentative="1">
+      <w:start w:val="1"/>
+      <w:numFmt w:val="bullet"/>
+      <w:lvlText w:val=""/>
+      <w:lvlJc w:val="left"/>
+      <w:pPr>
+        <w:ind w:left="6480" w:hanging="360"/>
+      </w:pPr>
+      <w:rPr>
+        <w:rFonts w:ascii="Wingdings" w:hAnsi="Wingdings" w:hint="default"/>
+      </w:rPr>
+    </w:lvl>
+  </w:abstractNum>
+  <w:abstractNum w:abstractNumId="2" w15:restartNumberingAfterBreak="0">
     <w:nsid w:val="17403792"/>
     <w:multiLevelType w:val="hybridMultilevel"/>
     <w:tmpl w:val="1D90A416"/>
@@ -8164,7 +8466,7 @@
       </w:rPr>
     </w:lvl>
   </w:abstractNum>
-  <w:abstractNum w:abstractNumId="2" w15:restartNumberingAfterBreak="0">
+  <w:abstractNum w:abstractNumId="3" w15:restartNumberingAfterBreak="0">
     <w:nsid w:val="242A0BE1"/>
     <w:multiLevelType w:val="hybridMultilevel"/>
     <w:tmpl w:val="DDF6D144"/>
@@ -8277,7 +8579,7 @@
       </w:rPr>
     </w:lvl>
   </w:abstractNum>
-  <w:abstractNum w:abstractNumId="3" w15:restartNumberingAfterBreak="0">
+  <w:abstractNum w:abstractNumId="4" w15:restartNumberingAfterBreak="0">
     <w:nsid w:val="25B663B5"/>
     <w:multiLevelType w:val="hybridMultilevel"/>
     <w:tmpl w:val="AFC00FD0"/>
@@ -8390,7 +8692,7 @@
       </w:rPr>
     </w:lvl>
   </w:abstractNum>
-  <w:abstractNum w:abstractNumId="4" w15:restartNumberingAfterBreak="0">
+  <w:abstractNum w:abstractNumId="5" w15:restartNumberingAfterBreak="0">
     <w:nsid w:val="2D6C3100"/>
     <w:multiLevelType w:val="hybridMultilevel"/>
     <w:tmpl w:val="240AE6E2"/>
@@ -8503,7 +8805,7 @@
       </w:rPr>
     </w:lvl>
   </w:abstractNum>
-  <w:abstractNum w:abstractNumId="5" w15:restartNumberingAfterBreak="0">
+  <w:abstractNum w:abstractNumId="6" w15:restartNumberingAfterBreak="0">
     <w:nsid w:val="2FAB7B65"/>
     <w:multiLevelType w:val="hybridMultilevel"/>
     <w:tmpl w:val="2F64555A"/>
@@ -8616,7 +8918,7 @@
       </w:rPr>
     </w:lvl>
   </w:abstractNum>
-  <w:abstractNum w:abstractNumId="6" w15:restartNumberingAfterBreak="0">
+  <w:abstractNum w:abstractNumId="7" w15:restartNumberingAfterBreak="0">
     <w:nsid w:val="3C1938F6"/>
     <w:multiLevelType w:val="hybridMultilevel"/>
     <w:tmpl w:val="0816ACA8"/>
@@ -8729,7 +9031,7 @@
       </w:rPr>
     </w:lvl>
   </w:abstractNum>
-  <w:abstractNum w:abstractNumId="7" w15:restartNumberingAfterBreak="0">
+  <w:abstractNum w:abstractNumId="8" w15:restartNumberingAfterBreak="0">
     <w:nsid w:val="3CD74482"/>
     <w:multiLevelType w:val="hybridMultilevel"/>
     <w:tmpl w:val="0150BC32"/>
@@ -8842,7 +9144,7 @@
       </w:rPr>
     </w:lvl>
   </w:abstractNum>
-  <w:abstractNum w:abstractNumId="8" w15:restartNumberingAfterBreak="0">
+  <w:abstractNum w:abstractNumId="9" w15:restartNumberingAfterBreak="0">
     <w:nsid w:val="47442E3E"/>
     <w:multiLevelType w:val="hybridMultilevel"/>
     <w:tmpl w:val="64928C38"/>
@@ -8955,7 +9257,7 @@
       </w:rPr>
     </w:lvl>
   </w:abstractNum>
-  <w:abstractNum w:abstractNumId="9" w15:restartNumberingAfterBreak="0">
+  <w:abstractNum w:abstractNumId="10" w15:restartNumberingAfterBreak="0">
     <w:nsid w:val="4CA522A2"/>
     <w:multiLevelType w:val="hybridMultilevel"/>
     <w:tmpl w:val="81762318"/>
@@ -9068,7 +9370,7 @@
       </w:rPr>
     </w:lvl>
   </w:abstractNum>
-  <w:abstractNum w:abstractNumId="10" w15:restartNumberingAfterBreak="0">
+  <w:abstractNum w:abstractNumId="11" w15:restartNumberingAfterBreak="0">
     <w:nsid w:val="51655472"/>
     <w:multiLevelType w:val="hybridMultilevel"/>
     <w:tmpl w:val="E11ED65A"/>
@@ -9181,7 +9483,7 @@
       </w:rPr>
     </w:lvl>
   </w:abstractNum>
-  <w:abstractNum w:abstractNumId="11" w15:restartNumberingAfterBreak="0">
+  <w:abstractNum w:abstractNumId="12" w15:restartNumberingAfterBreak="0">
     <w:nsid w:val="5B1E66BA"/>
     <w:multiLevelType w:val="hybridMultilevel"/>
     <w:tmpl w:val="56E6462C"/>
@@ -9294,7 +9596,7 @@
       </w:rPr>
     </w:lvl>
   </w:abstractNum>
-  <w:abstractNum w:abstractNumId="12" w15:restartNumberingAfterBreak="0">
+  <w:abstractNum w:abstractNumId="13" w15:restartNumberingAfterBreak="0">
     <w:nsid w:val="64C346FC"/>
     <w:multiLevelType w:val="hybridMultilevel"/>
     <w:tmpl w:val="EAE26AC8"/>
@@ -9407,7 +9709,7 @@
       </w:rPr>
     </w:lvl>
   </w:abstractNum>
-  <w:abstractNum w:abstractNumId="13" w15:restartNumberingAfterBreak="0">
+  <w:abstractNum w:abstractNumId="14" w15:restartNumberingAfterBreak="0">
     <w:nsid w:val="69361338"/>
     <w:multiLevelType w:val="hybridMultilevel"/>
     <w:tmpl w:val="6CF0B772"/>
@@ -9520,7 +9822,7 @@
       </w:rPr>
     </w:lvl>
   </w:abstractNum>
-  <w:abstractNum w:abstractNumId="14" w15:restartNumberingAfterBreak="0">
+  <w:abstractNum w:abstractNumId="15" w15:restartNumberingAfterBreak="0">
     <w:nsid w:val="69FA5A50"/>
     <w:multiLevelType w:val="hybridMultilevel"/>
     <w:tmpl w:val="D82A6326"/>
@@ -9633,7 +9935,7 @@
       </w:rPr>
     </w:lvl>
   </w:abstractNum>
-  <w:abstractNum w:abstractNumId="15" w15:restartNumberingAfterBreak="0">
+  <w:abstractNum w:abstractNumId="16" w15:restartNumberingAfterBreak="0">
     <w:nsid w:val="6E7312B6"/>
     <w:multiLevelType w:val="hybridMultilevel"/>
     <w:tmpl w:val="FD80BAFC"/>
@@ -9746,7 +10048,7 @@
       </w:rPr>
     </w:lvl>
   </w:abstractNum>
-  <w:abstractNum w:abstractNumId="16" w15:restartNumberingAfterBreak="0">
+  <w:abstractNum w:abstractNumId="17" w15:restartNumberingAfterBreak="0">
     <w:nsid w:val="76FA296F"/>
     <w:multiLevelType w:val="hybridMultilevel"/>
     <w:tmpl w:val="6DAE32EA"/>
@@ -9859,7 +10161,7 @@
       </w:rPr>
     </w:lvl>
   </w:abstractNum>
-  <w:abstractNum w:abstractNumId="17" w15:restartNumberingAfterBreak="0">
+  <w:abstractNum w:abstractNumId="18" w15:restartNumberingAfterBreak="0">
     <w:nsid w:val="788C73B2"/>
     <w:multiLevelType w:val="hybridMultilevel"/>
     <w:tmpl w:val="6D6C60B0"/>
@@ -9972,7 +10274,7 @@
       </w:rPr>
     </w:lvl>
   </w:abstractNum>
-  <w:abstractNum w:abstractNumId="18" w15:restartNumberingAfterBreak="0">
+  <w:abstractNum w:abstractNumId="19" w15:restartNumberingAfterBreak="0">
     <w:nsid w:val="79644490"/>
     <w:multiLevelType w:val="hybridMultilevel"/>
     <w:tmpl w:val="340ACCA0"/>
@@ -10085,7 +10387,7 @@
       </w:rPr>
     </w:lvl>
   </w:abstractNum>
-  <w:abstractNum w:abstractNumId="19" w15:restartNumberingAfterBreak="0">
+  <w:abstractNum w:abstractNumId="20" w15:restartNumberingAfterBreak="0">
     <w:nsid w:val="7EB672F7"/>
     <w:multiLevelType w:val="hybridMultilevel"/>
     <w:tmpl w:val="A6F0C99C"/>
@@ -10198,71 +10500,74 @@
       </w:rPr>
     </w:lvl>
   </w:abstractNum>
-  <w:num w:numId="1" w16cid:durableId="1729911386">
+  <w:num w:numId="1">
+    <w:abstractNumId w:val="20"/>
+  </w:num>
+  <w:num w:numId="2">
+    <w:abstractNumId w:val="16"/>
+  </w:num>
+  <w:num w:numId="3">
+    <w:abstractNumId w:val="17"/>
+  </w:num>
+  <w:num w:numId="4">
+    <w:abstractNumId w:val="7"/>
+  </w:num>
+  <w:num w:numId="5">
+    <w:abstractNumId w:val="15"/>
+  </w:num>
+  <w:num w:numId="6">
+    <w:abstractNumId w:val="9"/>
+  </w:num>
+  <w:num w:numId="7">
+    <w:abstractNumId w:val="18"/>
+  </w:num>
+  <w:num w:numId="8">
+    <w:abstractNumId w:val="14"/>
+  </w:num>
+  <w:num w:numId="9">
+    <w:abstractNumId w:val="5"/>
+  </w:num>
+  <w:num w:numId="10">
+    <w:abstractNumId w:val="6"/>
+  </w:num>
+  <w:num w:numId="11">
+    <w:abstractNumId w:val="12"/>
+  </w:num>
+  <w:num w:numId="12">
     <w:abstractNumId w:val="19"/>
   </w:num>
-  <w:num w:numId="2" w16cid:durableId="1236743146">
-    <w:abstractNumId w:val="15"/>
+  <w:num w:numId="13">
+    <w:abstractNumId w:val="10"/>
   </w:num>
-  <w:num w:numId="3" w16cid:durableId="1134757097">
-    <w:abstractNumId w:val="16"/>
+  <w:num w:numId="14">
+    <w:abstractNumId w:val="4"/>
   </w:num>
-  <w:num w:numId="4" w16cid:durableId="2091853903">
-    <w:abstractNumId w:val="6"/>
+  <w:num w:numId="15">
+    <w:abstractNumId w:val="3"/>
   </w:num>
-  <w:num w:numId="5" w16cid:durableId="367411174">
-    <w:abstractNumId w:val="14"/>
+  <w:num w:numId="16">
+    <w:abstractNumId w:val="13"/>
   </w:num>
-  <w:num w:numId="6" w16cid:durableId="1708529570">
+  <w:num w:numId="17">
+    <w:abstractNumId w:val="2"/>
+  </w:num>
+  <w:num w:numId="18">
+    <w:abstractNumId w:val="0"/>
+  </w:num>
+  <w:num w:numId="19">
+    <w:abstractNumId w:val="11"/>
+  </w:num>
+  <w:num w:numId="20">
     <w:abstractNumId w:val="8"/>
   </w:num>
-  <w:num w:numId="7" w16cid:durableId="1052462448">
-    <w:abstractNumId w:val="17"/>
-  </w:num>
-  <w:num w:numId="8" w16cid:durableId="364061568">
-    <w:abstractNumId w:val="13"/>
-  </w:num>
-  <w:num w:numId="9" w16cid:durableId="1691909584">
-    <w:abstractNumId w:val="4"/>
-  </w:num>
-  <w:num w:numId="10" w16cid:durableId="1128166626">
-    <w:abstractNumId w:val="5"/>
-  </w:num>
-  <w:num w:numId="11" w16cid:durableId="671109898">
-    <w:abstractNumId w:val="11"/>
-  </w:num>
-  <w:num w:numId="12" w16cid:durableId="865824125">
-    <w:abstractNumId w:val="18"/>
-  </w:num>
-  <w:num w:numId="13" w16cid:durableId="1056592091">
-    <w:abstractNumId w:val="9"/>
-  </w:num>
-  <w:num w:numId="14" w16cid:durableId="1268150545">
-    <w:abstractNumId w:val="3"/>
-  </w:num>
-  <w:num w:numId="15" w16cid:durableId="574820883">
-    <w:abstractNumId w:val="2"/>
-  </w:num>
-  <w:num w:numId="16" w16cid:durableId="1882748074">
-    <w:abstractNumId w:val="12"/>
-  </w:num>
-  <w:num w:numId="17" w16cid:durableId="23747683">
+  <w:num w:numId="21">
     <w:abstractNumId w:val="1"/>
-  </w:num>
-  <w:num w:numId="18" w16cid:durableId="292634421">
-    <w:abstractNumId w:val="0"/>
-  </w:num>
-  <w:num w:numId="19" w16cid:durableId="345788209">
-    <w:abstractNumId w:val="10"/>
-  </w:num>
-  <w:num w:numId="20" w16cid:durableId="1967395271">
-    <w:abstractNumId w:val="7"/>
   </w:num>
 </w:numbering>
 </file>
 
 <file path=word/styles.xml><?xml version="1.0" encoding="utf-8"?>
-<w:styles xmlns:mc="http://schemas.openxmlformats.org/markup-compatibility/2006" xmlns:r="http://schemas.openxmlformats.org/officeDocument/2006/relationships" xmlns:w="http://schemas.openxmlformats.org/wordprocessingml/2006/main" xmlns:w14="http://schemas.microsoft.com/office/word/2010/wordml" xmlns:w15="http://schemas.microsoft.com/office/word/2012/wordml" xmlns:w16cex="http://schemas.microsoft.com/office/word/2018/wordml/cex" xmlns:w16cid="http://schemas.microsoft.com/office/word/2016/wordml/cid" xmlns:w16="http://schemas.microsoft.com/office/word/2018/wordml" xmlns:w16du="http://schemas.microsoft.com/office/word/2023/wordml/word16du" xmlns:w16sdtdh="http://schemas.microsoft.com/office/word/2020/wordml/sdtdatahash" xmlns:w16sdtfl="http://schemas.microsoft.com/office/word/2024/wordml/sdtformatlock" xmlns:w16se="http://schemas.microsoft.com/office/word/2015/wordml/symex" mc:Ignorable="w14 w15 w16se w16cid w16 w16cex w16sdtdh w16sdtfl w16du">
+<w:styles xmlns:mc="http://schemas.openxmlformats.org/markup-compatibility/2006" xmlns:r="http://schemas.openxmlformats.org/officeDocument/2006/relationships" xmlns:w="http://schemas.openxmlformats.org/wordprocessingml/2006/main" xmlns:w14="http://schemas.microsoft.com/office/word/2010/wordml" xmlns:w15="http://schemas.microsoft.com/office/word/2012/wordml" xmlns:w16cid="http://schemas.microsoft.com/office/word/2016/wordml/cid" xmlns:w16se="http://schemas.microsoft.com/office/word/2015/wordml/symex" mc:Ignorable="w14 w15 w16se w16cid">
   <w:docDefaults>
     <w:rPrDefault>
       <w:rPr>
@@ -10280,7 +10585,7 @@
       </w:pPr>
     </w:pPrDefault>
   </w:docDefaults>
-  <w:latentStyles w:defLockedState="0" w:defUIPriority="99" w:defSemiHidden="0" w:defUnhideWhenUsed="0" w:defQFormat="0" w:count="376">
+  <w:latentStyles w:defLockedState="0" w:defUIPriority="99" w:defSemiHidden="0" w:defUnhideWhenUsed="0" w:defQFormat="0" w:count="375">
     <w:lsdException w:name="Normal" w:uiPriority="0" w:qFormat="1"/>
     <w:lsdException w:name="heading 1" w:uiPriority="9" w:qFormat="1"/>
     <w:lsdException w:name="heading 2" w:semiHidden="1" w:uiPriority="9" w:unhideWhenUsed="1" w:qFormat="1"/>
@@ -10656,7 +10961,6 @@
     <w:lsdException w:name="Smart Hyperlink" w:semiHidden="1" w:unhideWhenUsed="1"/>
     <w:lsdException w:name="Hashtag" w:semiHidden="1" w:unhideWhenUsed="1"/>
     <w:lsdException w:name="Unresolved Mention" w:semiHidden="1" w:unhideWhenUsed="1"/>
-    <w:lsdException w:name="Smart Link" w:semiHidden="1" w:unhideWhenUsed="1"/>
   </w:latentStyles>
   <w:style w:type="paragraph" w:default="1" w:styleId="Norml">
     <w:name w:val="Normal"/>

</xml_diff>

<commit_message>
Making token-based (Laravel Sanctum)authentication and giving a password-checking eye button at login and register (+doc)
</commit_message>
<xml_diff>
--- a/documentation.docx
+++ b/documentation.docx
@@ -1,6 +1,6 @@
 
 <file path=word/document.xml><?xml version="1.0" encoding="utf-8"?>
-<w:document xmlns:wpc="http://schemas.microsoft.com/office/word/2010/wordprocessingCanvas" xmlns:cx="http://schemas.microsoft.com/office/drawing/2014/chartex" xmlns:cx1="http://schemas.microsoft.com/office/drawing/2015/9/8/chartex" xmlns:cx2="http://schemas.microsoft.com/office/drawing/2015/10/21/chartex" xmlns:cx3="http://schemas.microsoft.com/office/drawing/2016/5/9/chartex" xmlns:cx4="http://schemas.microsoft.com/office/drawing/2016/5/10/chartex" xmlns:cx5="http://schemas.microsoft.com/office/drawing/2016/5/11/chartex" xmlns:cx6="http://schemas.microsoft.com/office/drawing/2016/5/12/chartex" xmlns:cx7="http://schemas.microsoft.com/office/drawing/2016/5/13/chartex" xmlns:cx8="http://schemas.microsoft.com/office/drawing/2016/5/14/chartex" xmlns:mc="http://schemas.openxmlformats.org/markup-compatibility/2006" xmlns:aink="http://schemas.microsoft.com/office/drawing/2016/ink" xmlns:am3d="http://schemas.microsoft.com/office/drawing/2017/model3d" xmlns:o="urn:schemas-microsoft-com:office:office" xmlns:r="http://schemas.openxmlformats.org/officeDocument/2006/relationships" xmlns:m="http://schemas.openxmlformats.org/officeDocument/2006/math" xmlns:v="urn:schemas-microsoft-com:vml" xmlns:wp14="http://schemas.microsoft.com/office/word/2010/wordprocessingDrawing" xmlns:wp="http://schemas.openxmlformats.org/drawingml/2006/wordprocessingDrawing" xmlns:w10="urn:schemas-microsoft-com:office:word" xmlns:w="http://schemas.openxmlformats.org/wordprocessingml/2006/main" xmlns:w14="http://schemas.microsoft.com/office/word/2010/wordml" xmlns:w15="http://schemas.microsoft.com/office/word/2012/wordml" xmlns:w16cid="http://schemas.microsoft.com/office/word/2016/wordml/cid" xmlns:w16se="http://schemas.microsoft.com/office/word/2015/wordml/symex" xmlns:wpg="http://schemas.microsoft.com/office/word/2010/wordprocessingGroup" xmlns:wpi="http://schemas.microsoft.com/office/word/2010/wordprocessingInk" xmlns:wne="http://schemas.microsoft.com/office/word/2006/wordml" xmlns:wps="http://schemas.microsoft.com/office/word/2010/wordprocessingShape" mc:Ignorable="w14 w15 w16se w16cid wp14">
+<w:document xmlns:wpc="http://schemas.microsoft.com/office/word/2010/wordprocessingCanvas" xmlns:cx="http://schemas.microsoft.com/office/drawing/2014/chartex" xmlns:cx1="http://schemas.microsoft.com/office/drawing/2015/9/8/chartex" xmlns:cx2="http://schemas.microsoft.com/office/drawing/2015/10/21/chartex" xmlns:cx3="http://schemas.microsoft.com/office/drawing/2016/5/9/chartex" xmlns:cx4="http://schemas.microsoft.com/office/drawing/2016/5/10/chartex" xmlns:cx5="http://schemas.microsoft.com/office/drawing/2016/5/11/chartex" xmlns:cx6="http://schemas.microsoft.com/office/drawing/2016/5/12/chartex" xmlns:cx7="http://schemas.microsoft.com/office/drawing/2016/5/13/chartex" xmlns:cx8="http://schemas.microsoft.com/office/drawing/2016/5/14/chartex" xmlns:mc="http://schemas.openxmlformats.org/markup-compatibility/2006" xmlns:aink="http://schemas.microsoft.com/office/drawing/2016/ink" xmlns:am3d="http://schemas.microsoft.com/office/drawing/2017/model3d" xmlns:o="urn:schemas-microsoft-com:office:office" xmlns:oel="http://schemas.microsoft.com/office/2019/extlst" xmlns:r="http://schemas.openxmlformats.org/officeDocument/2006/relationships" xmlns:m="http://schemas.openxmlformats.org/officeDocument/2006/math" xmlns:v="urn:schemas-microsoft-com:vml" xmlns:wp14="http://schemas.microsoft.com/office/word/2010/wordprocessingDrawing" xmlns:wp="http://schemas.openxmlformats.org/drawingml/2006/wordprocessingDrawing" xmlns:w10="urn:schemas-microsoft-com:office:word" xmlns:w="http://schemas.openxmlformats.org/wordprocessingml/2006/main" xmlns:w14="http://schemas.microsoft.com/office/word/2010/wordml" xmlns:w15="http://schemas.microsoft.com/office/word/2012/wordml" xmlns:w16cex="http://schemas.microsoft.com/office/word/2018/wordml/cex" xmlns:w16cid="http://schemas.microsoft.com/office/word/2016/wordml/cid" xmlns:w16="http://schemas.microsoft.com/office/word/2018/wordml" xmlns:w16du="http://schemas.microsoft.com/office/word/2023/wordml/word16du" xmlns:w16sdtdh="http://schemas.microsoft.com/office/word/2020/wordml/sdtdatahash" xmlns:w16sdtfl="http://schemas.microsoft.com/office/word/2024/wordml/sdtformatlock" xmlns:w16se="http://schemas.microsoft.com/office/word/2015/wordml/symex" xmlns:wpg="http://schemas.microsoft.com/office/word/2010/wordprocessingGroup" xmlns:wpi="http://schemas.microsoft.com/office/word/2010/wordprocessingInk" xmlns:wne="http://schemas.microsoft.com/office/word/2006/wordml" xmlns:wps="http://schemas.microsoft.com/office/word/2010/wordprocessingShape" mc:Ignorable="w14 w15 w16se w16cid w16 w16cex w16sdtdh w16sdtfl w16du wp14">
   <w:body>
     <w:p>
       <w:pPr>
@@ -40,29 +40,27 @@
           <w:sz w:val="40"/>
           <w:szCs w:val="40"/>
         </w:rPr>
-        <w:t xml:space="preserve">Alkalmazás neve: </w:t>
-      </w:r>
-      <w:proofErr w:type="spellStart"/>
-      <w:r>
+        <w:t>Alkalmazás neve: BláthyFM</w:t>
+      </w:r>
+    </w:p>
+    <w:p>
+      <w:pPr>
         <w:rPr>
           <w:rFonts w:ascii="Times New Roman" w:hAnsi="Times New Roman" w:cs="Times New Roman"/>
           <w:bCs/>
           <w:sz w:val="40"/>
           <w:szCs w:val="40"/>
         </w:rPr>
-        <w:t>BláthyFM</w:t>
-      </w:r>
-      <w:proofErr w:type="spellEnd"/>
-    </w:p>
-    <w:p>
-      <w:pPr>
+      </w:pPr>
+      <w:r>
         <w:rPr>
           <w:rFonts w:ascii="Times New Roman" w:hAnsi="Times New Roman" w:cs="Times New Roman"/>
           <w:bCs/>
           <w:sz w:val="40"/>
           <w:szCs w:val="40"/>
         </w:rPr>
-      </w:pPr>
+        <w:t>Tagok:</w:t>
+      </w:r>
       <w:r>
         <w:rPr>
           <w:rFonts w:ascii="Times New Roman" w:hAnsi="Times New Roman" w:cs="Times New Roman"/>
@@ -70,18 +68,19 @@
           <w:sz w:val="40"/>
           <w:szCs w:val="40"/>
         </w:rPr>
-        <w:t>Tagok:</w:t>
-      </w:r>
-      <w:r>
+        <w:t xml:space="preserve"> Susán Csongor, El-Nabulsy Csongor Alan</w:t>
+      </w:r>
+    </w:p>
+    <w:p>
+      <w:pPr>
+        <w:spacing w:after="960"/>
         <w:rPr>
           <w:rFonts w:ascii="Times New Roman" w:hAnsi="Times New Roman" w:cs="Times New Roman"/>
           <w:bCs/>
           <w:sz w:val="40"/>
           <w:szCs w:val="40"/>
         </w:rPr>
-        <w:t xml:space="preserve"> Susán Csongor, El-</w:t>
-      </w:r>
-      <w:proofErr w:type="spellStart"/>
+      </w:pPr>
       <w:r>
         <w:rPr>
           <w:rFonts w:ascii="Times New Roman" w:hAnsi="Times New Roman" w:cs="Times New Roman"/>
@@ -89,57 +88,7 @@
           <w:sz w:val="40"/>
           <w:szCs w:val="40"/>
         </w:rPr>
-        <w:t>Nabulsy</w:t>
-      </w:r>
-      <w:proofErr w:type="spellEnd"/>
-      <w:r>
-        <w:rPr>
-          <w:rFonts w:ascii="Times New Roman" w:hAnsi="Times New Roman" w:cs="Times New Roman"/>
-          <w:bCs/>
-          <w:sz w:val="40"/>
-          <w:szCs w:val="40"/>
-        </w:rPr>
-        <w:t xml:space="preserve"> Csongor Alan</w:t>
-      </w:r>
-    </w:p>
-    <w:p>
-      <w:pPr>
-        <w:spacing w:after="960"/>
-        <w:rPr>
-          <w:rFonts w:ascii="Times New Roman" w:hAnsi="Times New Roman" w:cs="Times New Roman"/>
-          <w:bCs/>
-          <w:sz w:val="40"/>
-          <w:szCs w:val="40"/>
-        </w:rPr>
-      </w:pPr>
-      <w:r>
-        <w:rPr>
-          <w:rFonts w:ascii="Times New Roman" w:hAnsi="Times New Roman" w:cs="Times New Roman"/>
-          <w:bCs/>
-          <w:sz w:val="40"/>
-          <w:szCs w:val="40"/>
-        </w:rPr>
-        <w:t>Az alkalmazás célja az, hogy a Bláthy-</w:t>
-      </w:r>
-      <w:proofErr w:type="spellStart"/>
-      <w:r>
-        <w:rPr>
-          <w:rFonts w:ascii="Times New Roman" w:hAnsi="Times New Roman" w:cs="Times New Roman"/>
-          <w:bCs/>
-          <w:sz w:val="40"/>
-          <w:szCs w:val="40"/>
-        </w:rPr>
-        <w:t>ba</w:t>
-      </w:r>
-      <w:proofErr w:type="spellEnd"/>
-      <w:r>
-        <w:rPr>
-          <w:rFonts w:ascii="Times New Roman" w:hAnsi="Times New Roman" w:cs="Times New Roman"/>
-          <w:bCs/>
-          <w:sz w:val="40"/>
-          <w:szCs w:val="40"/>
-        </w:rPr>
-        <w:t xml:space="preserve"> járó diákok előre meghatározott szünetekben kedvenc zenéjüket tudják majd hallgatni anélkül, hogy nekik kelljen azt maguknak vagy másoknak lejátszani. Ráadásul az, hogy az iskola az ő zenéjüket játssza, akár egy általuk kijelölt időpontban (ezt üzenetben írhatják le), még több élményt ad, és azt az érzést, hogy a zenéjük – és ezzel együtt önmaguk is – meg van becsülve.</w:t>
+        <w:t>Az alkalmazás célja az, hogy a Bláthy-ba járó diákok előre meghatározott szünetekben kedvenc zenéjüket tudják majd hallgatni anélkül, hogy nekik kelljen azt maguknak vagy másoknak lejátszani. Ráadásul az, hogy az iskola az ő zenéjüket játssza, akár egy általuk kijelölt időpontban (ezt üzenetben írhatják le), még több élményt ad, és azt az érzést, hogy a zenéjük – és ezzel együtt önmaguk is – meg van becsülve.</w:t>
       </w:r>
     </w:p>
     <w:p>
@@ -612,25 +561,7 @@
           <w:sz w:val="36"/>
           <w:szCs w:val="36"/>
         </w:rPr>
-        <w:t xml:space="preserve">Az alkalmazás fejlesztését tartalmazó dokumentáció elkezdése, vizsgafeltételek tanulmányozása, a projektet tároló </w:t>
-      </w:r>
-      <w:proofErr w:type="spellStart"/>
-      <w:r>
-        <w:rPr>
-          <w:rFonts w:ascii="Times New Roman" w:hAnsi="Times New Roman" w:cs="Times New Roman"/>
-          <w:sz w:val="36"/>
-          <w:szCs w:val="36"/>
-        </w:rPr>
-        <w:t>repository</w:t>
-      </w:r>
-      <w:proofErr w:type="spellEnd"/>
-      <w:r>
-        <w:rPr>
-          <w:rFonts w:ascii="Times New Roman" w:hAnsi="Times New Roman" w:cs="Times New Roman"/>
-          <w:sz w:val="36"/>
-          <w:szCs w:val="36"/>
-        </w:rPr>
-        <w:t xml:space="preserve"> létrehozása, teszteknek külön dokumentáció létrehozása.</w:t>
+        <w:t>Az alkalmazás fejlesztését tartalmazó dokumentáció elkezdése, vizsgafeltételek tanulmányozása, a projektet tároló repository létrehozása, teszteknek külön dokumentáció létrehozása.</w:t>
       </w:r>
     </w:p>
     <w:p>
@@ -1298,7 +1229,7 @@
           <w:szCs w:val="36"/>
         </w:rPr>
         <w:drawing>
-          <wp:inline distT="0" distB="0" distL="0" distR="0" wp14:anchorId="78A43544" wp14:editId="04C22D91">
+          <wp:inline distT="0" distB="0" distL="0" distR="0" wp14:anchorId="78A43544" wp14:editId="51CC0173">
             <wp:extent cx="3166535" cy="1781175"/>
             <wp:effectExtent l="0" t="0" r="0" b="0"/>
             <wp:docPr id="3" name="Kép 3" descr="C:\Users\elnabulsy.csongor\AppData\Local\Microsoft\Windows\INetCache\Content.MSO\F75754B3.tmp"/>
@@ -1390,7 +1321,7 @@
           <w:szCs w:val="36"/>
         </w:rPr>
         <w:drawing>
-          <wp:inline distT="0" distB="0" distL="0" distR="0" wp14:anchorId="4E211814" wp14:editId="5949F17D">
+          <wp:inline distT="0" distB="0" distL="0" distR="0" wp14:anchorId="4E211814" wp14:editId="4C9D8389">
             <wp:extent cx="3133725" cy="1762720"/>
             <wp:effectExtent l="0" t="0" r="0" b="9525"/>
             <wp:docPr id="4" name="Kép 4" descr="C:\Users\elnabulsy.csongor\Downloads\ui_main_student.png"/>
@@ -1472,7 +1403,7 @@
           <w:szCs w:val="36"/>
         </w:rPr>
         <w:drawing>
-          <wp:inline distT="0" distB="0" distL="0" distR="0" wp14:anchorId="5137FB78" wp14:editId="1F60A295">
+          <wp:inline distT="0" distB="0" distL="0" distR="0" wp14:anchorId="5137FB78" wp14:editId="5B93B542">
             <wp:extent cx="3166110" cy="1780938"/>
             <wp:effectExtent l="0" t="0" r="0" b="0"/>
             <wp:docPr id="5" name="Kép 5" descr="C:\Users\elnabulsy.csongor\Downloads\ui_main_scheduler.png"/>
@@ -1529,41 +1460,13 @@
           <w:szCs w:val="36"/>
         </w:rPr>
       </w:pPr>
-      <w:proofErr w:type="spellStart"/>
-      <w:r>
-        <w:rPr>
-          <w:rFonts w:ascii="Times New Roman" w:eastAsia="Times New Roman" w:hAnsi="Times New Roman" w:cs="Times New Roman"/>
-          <w:sz w:val="36"/>
-          <w:szCs w:val="36"/>
-        </w:rPr>
-        <w:t>Főképernyő</w:t>
-      </w:r>
-      <w:proofErr w:type="spellEnd"/>
-      <w:r>
-        <w:rPr>
-          <w:rFonts w:ascii="Times New Roman" w:eastAsia="Times New Roman" w:hAnsi="Times New Roman" w:cs="Times New Roman"/>
-          <w:sz w:val="36"/>
-          <w:szCs w:val="36"/>
-        </w:rPr>
-        <w:t xml:space="preserve"> </w:t>
-      </w:r>
-      <w:proofErr w:type="spellStart"/>
-      <w:r>
-        <w:rPr>
-          <w:rFonts w:ascii="Times New Roman" w:eastAsia="Times New Roman" w:hAnsi="Times New Roman" w:cs="Times New Roman"/>
-          <w:sz w:val="36"/>
-          <w:szCs w:val="36"/>
-        </w:rPr>
-        <w:t>admin</w:t>
-      </w:r>
-      <w:proofErr w:type="spellEnd"/>
-      <w:r>
-        <w:rPr>
-          <w:rFonts w:ascii="Times New Roman" w:eastAsia="Times New Roman" w:hAnsi="Times New Roman" w:cs="Times New Roman"/>
-          <w:sz w:val="36"/>
-          <w:szCs w:val="36"/>
-        </w:rPr>
-        <w:t xml:space="preserve"> ranggal:</w:t>
+      <w:r>
+        <w:rPr>
+          <w:rFonts w:ascii="Times New Roman" w:eastAsia="Times New Roman" w:hAnsi="Times New Roman" w:cs="Times New Roman"/>
+          <w:sz w:val="36"/>
+          <w:szCs w:val="36"/>
+        </w:rPr>
+        <w:t>Főképernyő admin ranggal:</w:t>
       </w:r>
     </w:p>
     <w:p>
@@ -2019,25 +1922,7 @@
           <w:sz w:val="36"/>
           <w:szCs w:val="36"/>
         </w:rPr>
-        <w:t xml:space="preserve">Az </w:t>
-      </w:r>
-      <w:proofErr w:type="spellStart"/>
-      <w:r>
-        <w:rPr>
-          <w:rFonts w:ascii="Times New Roman" w:eastAsia="Times New Roman" w:hAnsi="Times New Roman" w:cs="Times New Roman"/>
-          <w:sz w:val="36"/>
-          <w:szCs w:val="36"/>
-        </w:rPr>
-        <w:t>admin</w:t>
-      </w:r>
-      <w:proofErr w:type="spellEnd"/>
-      <w:r>
-        <w:rPr>
-          <w:rFonts w:ascii="Times New Roman" w:eastAsia="Times New Roman" w:hAnsi="Times New Roman" w:cs="Times New Roman"/>
-          <w:sz w:val="36"/>
-          <w:szCs w:val="36"/>
-        </w:rPr>
-        <w:t xml:space="preserve"> UI oldal megtervezése digitális </w:t>
+        <w:t xml:space="preserve">Az admin UI oldal megtervezése digitális </w:t>
       </w:r>
       <w:r>
         <w:rPr>
@@ -2056,23 +1941,13 @@
           <w:szCs w:val="36"/>
         </w:rPr>
       </w:pPr>
-      <w:proofErr w:type="spellStart"/>
-      <w:r>
-        <w:rPr>
-          <w:rFonts w:ascii="Times New Roman" w:eastAsia="Times New Roman" w:hAnsi="Times New Roman" w:cs="Times New Roman"/>
-          <w:sz w:val="36"/>
-          <w:szCs w:val="36"/>
-        </w:rPr>
-        <w:t>Admin</w:t>
-      </w:r>
-      <w:proofErr w:type="spellEnd"/>
-      <w:r>
-        <w:rPr>
-          <w:rFonts w:ascii="Times New Roman" w:eastAsia="Times New Roman" w:hAnsi="Times New Roman" w:cs="Times New Roman"/>
-          <w:sz w:val="36"/>
-          <w:szCs w:val="36"/>
-        </w:rPr>
-        <w:t xml:space="preserve"> oldal:</w:t>
+      <w:r>
+        <w:rPr>
+          <w:rFonts w:ascii="Times New Roman" w:eastAsia="Times New Roman" w:hAnsi="Times New Roman" w:cs="Times New Roman"/>
+          <w:sz w:val="36"/>
+          <w:szCs w:val="36"/>
+        </w:rPr>
+        <w:t>Admin oldal:</w:t>
       </w:r>
     </w:p>
     <w:p>
@@ -2306,42 +2181,15 @@
           <w:sz w:val="36"/>
           <w:szCs w:val="36"/>
         </w:rPr>
-        <w:t xml:space="preserve">, </w:t>
-      </w:r>
-      <w:proofErr w:type="spellStart"/>
-      <w:r>
-        <w:rPr>
-          <w:rFonts w:ascii="Times New Roman" w:eastAsia="Times New Roman" w:hAnsi="Times New Roman" w:cs="Times New Roman"/>
-          <w:sz w:val="36"/>
-          <w:szCs w:val="36"/>
-        </w:rPr>
-        <w:t>Vue</w:t>
-      </w:r>
-      <w:proofErr w:type="spellEnd"/>
-      <w:r>
-        <w:rPr>
-          <w:rFonts w:ascii="Times New Roman" w:eastAsia="Times New Roman" w:hAnsi="Times New Roman" w:cs="Times New Roman"/>
-          <w:sz w:val="36"/>
-          <w:szCs w:val="36"/>
-        </w:rPr>
-        <w:t xml:space="preserve"> router</w:t>
-      </w:r>
-      <w:r>
-        <w:rPr>
-          <w:rFonts w:ascii="Times New Roman" w:eastAsia="Times New Roman" w:hAnsi="Times New Roman" w:cs="Times New Roman"/>
-          <w:sz w:val="36"/>
-          <w:szCs w:val="36"/>
-        </w:rPr>
-        <w:t xml:space="preserve">) létrehozása </w:t>
-      </w:r>
-      <w:proofErr w:type="spellStart"/>
-      <w:r>
-        <w:rPr>
-          <w:rFonts w:ascii="Times New Roman" w:eastAsia="Times New Roman" w:hAnsi="Times New Roman" w:cs="Times New Roman"/>
-          <w:sz w:val="36"/>
-          <w:szCs w:val="36"/>
-        </w:rPr>
-        <w:t>frontend</w:t>
+        <w:t>, Vue router</w:t>
+      </w:r>
+      <w:r>
+        <w:rPr>
+          <w:rFonts w:ascii="Times New Roman" w:eastAsia="Times New Roman" w:hAnsi="Times New Roman" w:cs="Times New Roman"/>
+          <w:sz w:val="36"/>
+          <w:szCs w:val="36"/>
+        </w:rPr>
+        <w:t>) létrehozása frontend</w:t>
       </w:r>
       <w:r>
         <w:rPr>
@@ -2351,7 +2199,6 @@
         </w:rPr>
         <w:t>Part</w:t>
       </w:r>
-      <w:proofErr w:type="spellEnd"/>
       <w:r>
         <w:rPr>
           <w:rFonts w:ascii="Times New Roman" w:eastAsia="Times New Roman" w:hAnsi="Times New Roman" w:cs="Times New Roman"/>
@@ -2404,23 +2251,13 @@
           <w:szCs w:val="36"/>
         </w:rPr>
       </w:pPr>
-      <w:proofErr w:type="spellStart"/>
-      <w:r>
-        <w:rPr>
-          <w:rFonts w:ascii="Times New Roman" w:eastAsia="Times New Roman" w:hAnsi="Times New Roman" w:cs="Times New Roman"/>
-          <w:sz w:val="36"/>
-          <w:szCs w:val="36"/>
-        </w:rPr>
-        <w:t>route</w:t>
-      </w:r>
-      <w:proofErr w:type="spellEnd"/>
-      <w:r>
-        <w:rPr>
-          <w:rFonts w:ascii="Times New Roman" w:eastAsia="Times New Roman" w:hAnsi="Times New Roman" w:cs="Times New Roman"/>
-          <w:sz w:val="36"/>
-          <w:szCs w:val="36"/>
-        </w:rPr>
-        <w:t>-ok definiálása</w:t>
+      <w:r>
+        <w:rPr>
+          <w:rFonts w:ascii="Times New Roman" w:eastAsia="Times New Roman" w:hAnsi="Times New Roman" w:cs="Times New Roman"/>
+          <w:sz w:val="36"/>
+          <w:szCs w:val="36"/>
+        </w:rPr>
+        <w:t>route-ok definiálása</w:t>
       </w:r>
     </w:p>
     <w:p>
@@ -2436,34 +2273,14 @@
           <w:szCs w:val="36"/>
         </w:rPr>
       </w:pPr>
-      <w:proofErr w:type="spellStart"/>
-      <w:r>
-        <w:rPr>
-          <w:rFonts w:ascii="Times New Roman" w:eastAsia="Times New Roman" w:hAnsi="Times New Roman" w:cs="Times New Roman"/>
-          <w:sz w:val="36"/>
-          <w:szCs w:val="36"/>
-        </w:rPr>
-        <w:t>header</w:t>
-      </w:r>
-      <w:proofErr w:type="spellEnd"/>
-      <w:r>
-        <w:rPr>
-          <w:rFonts w:ascii="Times New Roman" w:eastAsia="Times New Roman" w:hAnsi="Times New Roman" w:cs="Times New Roman"/>
-          <w:sz w:val="36"/>
-          <w:szCs w:val="36"/>
-        </w:rPr>
-        <w:t xml:space="preserve"> és </w:t>
-      </w:r>
-      <w:proofErr w:type="spellStart"/>
-      <w:r>
-        <w:rPr>
-          <w:rFonts w:ascii="Times New Roman" w:eastAsia="Times New Roman" w:hAnsi="Times New Roman" w:cs="Times New Roman"/>
-          <w:sz w:val="36"/>
-          <w:szCs w:val="36"/>
-        </w:rPr>
-        <w:t>footer</w:t>
-      </w:r>
-      <w:proofErr w:type="spellEnd"/>
+      <w:r>
+        <w:rPr>
+          <w:rFonts w:ascii="Times New Roman" w:eastAsia="Times New Roman" w:hAnsi="Times New Roman" w:cs="Times New Roman"/>
+          <w:sz w:val="36"/>
+          <w:szCs w:val="36"/>
+        </w:rPr>
+        <w:t>header és footer</w:t>
+      </w:r>
       <w:r>
         <w:rPr>
           <w:rFonts w:ascii="Times New Roman" w:eastAsia="Times New Roman" w:hAnsi="Times New Roman" w:cs="Times New Roman"/>
@@ -2494,41 +2311,13 @@
           <w:szCs w:val="36"/>
         </w:rPr>
       </w:pPr>
-      <w:proofErr w:type="spellStart"/>
-      <w:r>
-        <w:rPr>
-          <w:rFonts w:ascii="Times New Roman" w:eastAsia="Times New Roman" w:hAnsi="Times New Roman" w:cs="Times New Roman"/>
-          <w:sz w:val="36"/>
-          <w:szCs w:val="36"/>
-        </w:rPr>
-        <w:t>header</w:t>
-      </w:r>
-      <w:proofErr w:type="spellEnd"/>
-      <w:r>
-        <w:rPr>
-          <w:rFonts w:ascii="Times New Roman" w:eastAsia="Times New Roman" w:hAnsi="Times New Roman" w:cs="Times New Roman"/>
-          <w:sz w:val="36"/>
-          <w:szCs w:val="36"/>
-        </w:rPr>
-        <w:t>-main-</w:t>
-      </w:r>
-      <w:proofErr w:type="spellStart"/>
-      <w:r>
-        <w:rPr>
-          <w:rFonts w:ascii="Times New Roman" w:eastAsia="Times New Roman" w:hAnsi="Times New Roman" w:cs="Times New Roman"/>
-          <w:sz w:val="36"/>
-          <w:szCs w:val="36"/>
-        </w:rPr>
-        <w:t>footer</w:t>
-      </w:r>
-      <w:proofErr w:type="spellEnd"/>
-      <w:r>
-        <w:rPr>
-          <w:rFonts w:ascii="Times New Roman" w:eastAsia="Times New Roman" w:hAnsi="Times New Roman" w:cs="Times New Roman"/>
-          <w:sz w:val="36"/>
-          <w:szCs w:val="36"/>
-        </w:rPr>
-        <w:t>-struktúra létrehozása</w:t>
+      <w:r>
+        <w:rPr>
+          <w:rFonts w:ascii="Times New Roman" w:eastAsia="Times New Roman" w:hAnsi="Times New Roman" w:cs="Times New Roman"/>
+          <w:sz w:val="36"/>
+          <w:szCs w:val="36"/>
+        </w:rPr>
+        <w:t>header-main-footer-struktúra létrehozása</w:t>
       </w:r>
     </w:p>
     <w:p>
@@ -2568,25 +2357,7 @@
           <w:sz w:val="36"/>
           <w:szCs w:val="36"/>
         </w:rPr>
-        <w:t>A projektet El-</w:t>
-      </w:r>
-      <w:proofErr w:type="spellStart"/>
-      <w:r>
-        <w:rPr>
-          <w:rFonts w:ascii="Times New Roman" w:eastAsia="Times New Roman" w:hAnsi="Times New Roman" w:cs="Times New Roman"/>
-          <w:sz w:val="36"/>
-          <w:szCs w:val="36"/>
-        </w:rPr>
-        <w:t>Nabulsy</w:t>
-      </w:r>
-      <w:proofErr w:type="spellEnd"/>
-      <w:r>
-        <w:rPr>
-          <w:rFonts w:ascii="Times New Roman" w:eastAsia="Times New Roman" w:hAnsi="Times New Roman" w:cs="Times New Roman"/>
-          <w:sz w:val="36"/>
-          <w:szCs w:val="36"/>
-        </w:rPr>
-        <w:t xml:space="preserve"> Csongor hozta létre és írta meg a kódját, a működéshez szükséges folyamatábrákat, az adatbázis ER-diagramját</w:t>
+        <w:t>A projektet El-Nabulsy Csongor hozta létre és írta meg a kódját, a működéshez szükséges folyamatábrákat, az adatbázis ER-diagramját</w:t>
       </w:r>
       <w:r>
         <w:rPr>
@@ -2669,25 +2440,7 @@
           <w:sz w:val="36"/>
           <w:szCs w:val="36"/>
         </w:rPr>
-        <w:t xml:space="preserve">(Susán Csongor) A </w:t>
-      </w:r>
-      <w:proofErr w:type="spellStart"/>
-      <w:r>
-        <w:rPr>
-          <w:rFonts w:ascii="Times New Roman" w:eastAsia="Times New Roman" w:hAnsi="Times New Roman" w:cs="Times New Roman"/>
-          <w:sz w:val="36"/>
-          <w:szCs w:val="36"/>
-        </w:rPr>
-        <w:t>frontendPart</w:t>
-      </w:r>
-      <w:proofErr w:type="spellEnd"/>
-      <w:r>
-        <w:rPr>
-          <w:rFonts w:ascii="Times New Roman" w:eastAsia="Times New Roman" w:hAnsi="Times New Roman" w:cs="Times New Roman"/>
-          <w:sz w:val="36"/>
-          <w:szCs w:val="36"/>
-        </w:rPr>
-        <w:t xml:space="preserve"> projekt átnézése, stílus hi</w:t>
+        <w:t>(Susán Csongor) A frontendPart projekt átnézése, stílus hi</w:t>
       </w:r>
       <w:r>
         <w:rPr>
@@ -2798,25 +2551,7 @@
           <w:sz w:val="36"/>
           <w:szCs w:val="36"/>
         </w:rPr>
-        <w:t>(El-</w:t>
-      </w:r>
-      <w:proofErr w:type="spellStart"/>
-      <w:r>
-        <w:rPr>
-          <w:rFonts w:ascii="Times New Roman" w:eastAsia="Times New Roman" w:hAnsi="Times New Roman" w:cs="Times New Roman"/>
-          <w:sz w:val="36"/>
-          <w:szCs w:val="36"/>
-        </w:rPr>
-        <w:t>Nabulsy</w:t>
-      </w:r>
-      <w:proofErr w:type="spellEnd"/>
-      <w:r>
-        <w:rPr>
-          <w:rFonts w:ascii="Times New Roman" w:eastAsia="Times New Roman" w:hAnsi="Times New Roman" w:cs="Times New Roman"/>
-          <w:sz w:val="36"/>
-          <w:szCs w:val="36"/>
-        </w:rPr>
-        <w:t xml:space="preserve"> Csongor Alan</w:t>
+        <w:t>(El-Nabulsy Csongor Alan</w:t>
       </w:r>
       <w:r>
         <w:rPr>
@@ -2840,25 +2575,7 @@
           <w:sz w:val="36"/>
           <w:szCs w:val="36"/>
         </w:rPr>
-        <w:t xml:space="preserve"> (El-</w:t>
-      </w:r>
-      <w:proofErr w:type="spellStart"/>
-      <w:r>
-        <w:rPr>
-          <w:rFonts w:ascii="Times New Roman" w:eastAsia="Times New Roman" w:hAnsi="Times New Roman" w:cs="Times New Roman"/>
-          <w:sz w:val="36"/>
-          <w:szCs w:val="36"/>
-        </w:rPr>
-        <w:t>Nabulsy</w:t>
-      </w:r>
-      <w:proofErr w:type="spellEnd"/>
-      <w:r>
-        <w:rPr>
-          <w:rFonts w:ascii="Times New Roman" w:eastAsia="Times New Roman" w:hAnsi="Times New Roman" w:cs="Times New Roman"/>
-          <w:sz w:val="36"/>
-          <w:szCs w:val="36"/>
-        </w:rPr>
-        <w:t xml:space="preserve">: főoldal és annak </w:t>
+        <w:t xml:space="preserve"> (El-Nabulsy: főoldal és annak </w:t>
       </w:r>
       <w:r>
         <w:rPr>
@@ -2874,25 +2591,7 @@
           <w:sz w:val="36"/>
           <w:szCs w:val="36"/>
         </w:rPr>
-        <w:t xml:space="preserve">variánsa, Susán: login befejezése és </w:t>
-      </w:r>
-      <w:proofErr w:type="spellStart"/>
-      <w:r>
-        <w:rPr>
-          <w:rFonts w:ascii="Times New Roman" w:eastAsia="Times New Roman" w:hAnsi="Times New Roman" w:cs="Times New Roman"/>
-          <w:sz w:val="36"/>
-          <w:szCs w:val="36"/>
-        </w:rPr>
-        <w:t>admin</w:t>
-      </w:r>
-      <w:proofErr w:type="spellEnd"/>
-      <w:r>
-        <w:rPr>
-          <w:rFonts w:ascii="Times New Roman" w:eastAsia="Times New Roman" w:hAnsi="Times New Roman" w:cs="Times New Roman"/>
-          <w:sz w:val="36"/>
-          <w:szCs w:val="36"/>
-        </w:rPr>
-        <w:t xml:space="preserve"> elkezdése, valamint a logika kidolgozásának megkezdése</w:t>
+        <w:t>variánsa, Susán: login befejezése és admin elkezdése, valamint a logika kidolgozásának megkezdése</w:t>
       </w:r>
       <w:r>
         <w:rPr>
@@ -2956,25 +2655,7 @@
           <w:sz w:val="36"/>
           <w:szCs w:val="36"/>
         </w:rPr>
-        <w:t>(El-</w:t>
-      </w:r>
-      <w:proofErr w:type="spellStart"/>
-      <w:r>
-        <w:rPr>
-          <w:rFonts w:ascii="Times New Roman" w:eastAsia="Times New Roman" w:hAnsi="Times New Roman" w:cs="Times New Roman"/>
-          <w:sz w:val="36"/>
-          <w:szCs w:val="36"/>
-        </w:rPr>
-        <w:t>Nabulsy</w:t>
-      </w:r>
-      <w:proofErr w:type="spellEnd"/>
-      <w:r>
-        <w:rPr>
-          <w:rFonts w:ascii="Times New Roman" w:eastAsia="Times New Roman" w:hAnsi="Times New Roman" w:cs="Times New Roman"/>
-          <w:sz w:val="36"/>
-          <w:szCs w:val="36"/>
-        </w:rPr>
-        <w:t xml:space="preserve"> Csongor Alan) A zenebekérő oldal </w:t>
+        <w:t xml:space="preserve">(El-Nabulsy Csongor Alan) A zenebekérő oldal </w:t>
       </w:r>
       <w:r>
         <w:rPr>
@@ -3029,79 +2710,7 @@
           <w:sz w:val="36"/>
           <w:szCs w:val="36"/>
         </w:rPr>
-        <w:t>(El-</w:t>
-      </w:r>
-      <w:proofErr w:type="spellStart"/>
-      <w:r>
-        <w:rPr>
-          <w:rFonts w:ascii="Times New Roman" w:eastAsia="Times New Roman" w:hAnsi="Times New Roman" w:cs="Times New Roman"/>
-          <w:sz w:val="36"/>
-          <w:szCs w:val="36"/>
-        </w:rPr>
-        <w:t>Nabulsy</w:t>
-      </w:r>
-      <w:proofErr w:type="spellEnd"/>
-      <w:r>
-        <w:rPr>
-          <w:rFonts w:ascii="Times New Roman" w:eastAsia="Times New Roman" w:hAnsi="Times New Roman" w:cs="Times New Roman"/>
-          <w:sz w:val="36"/>
-          <w:szCs w:val="36"/>
-        </w:rPr>
-        <w:t xml:space="preserve"> Csongor Alan) Főbb nézetek(</w:t>
-      </w:r>
-      <w:proofErr w:type="spellStart"/>
-      <w:r>
-        <w:rPr>
-          <w:rFonts w:ascii="Times New Roman" w:eastAsia="Times New Roman" w:hAnsi="Times New Roman" w:cs="Times New Roman"/>
-          <w:sz w:val="36"/>
-          <w:szCs w:val="36"/>
-        </w:rPr>
-        <w:t>HomeView</w:t>
-      </w:r>
-      <w:proofErr w:type="spellEnd"/>
-      <w:r>
-        <w:rPr>
-          <w:rFonts w:ascii="Times New Roman" w:eastAsia="Times New Roman" w:hAnsi="Times New Roman" w:cs="Times New Roman"/>
-          <w:sz w:val="36"/>
-          <w:szCs w:val="36"/>
-        </w:rPr>
-        <w:t xml:space="preserve">, </w:t>
-      </w:r>
-      <w:proofErr w:type="spellStart"/>
-      <w:r>
-        <w:rPr>
-          <w:rFonts w:ascii="Times New Roman" w:eastAsia="Times New Roman" w:hAnsi="Times New Roman" w:cs="Times New Roman"/>
-          <w:sz w:val="36"/>
-          <w:szCs w:val="36"/>
-        </w:rPr>
-        <w:t>StudentHomePage</w:t>
-      </w:r>
-      <w:proofErr w:type="spellEnd"/>
-      <w:r>
-        <w:rPr>
-          <w:rFonts w:ascii="Times New Roman" w:eastAsia="Times New Roman" w:hAnsi="Times New Roman" w:cs="Times New Roman"/>
-          <w:sz w:val="36"/>
-          <w:szCs w:val="36"/>
-        </w:rPr>
-        <w:t xml:space="preserve">, </w:t>
-      </w:r>
-      <w:proofErr w:type="spellStart"/>
-      <w:r>
-        <w:rPr>
-          <w:rFonts w:ascii="Times New Roman" w:eastAsia="Times New Roman" w:hAnsi="Times New Roman" w:cs="Times New Roman"/>
-          <w:sz w:val="36"/>
-          <w:szCs w:val="36"/>
-        </w:rPr>
-        <w:t>SchedulerView</w:t>
-      </w:r>
-      <w:proofErr w:type="spellEnd"/>
-      <w:r>
-        <w:rPr>
-          <w:rFonts w:ascii="Times New Roman" w:eastAsia="Times New Roman" w:hAnsi="Times New Roman" w:cs="Times New Roman"/>
-          <w:sz w:val="36"/>
-          <w:szCs w:val="36"/>
-        </w:rPr>
-        <w:t>) szerkezetének kialakítása és a komponensek működésének ellenőrzése, a felhasználói felület stílusának kialakítása, hogy az oldal elrendezése megfeleljen a megtervezett UI-terveknek.</w:t>
+        <w:t>(El-Nabulsy Csongor Alan) Főbb nézetek(HomeView, StudentHomePage, SchedulerView) szerkezetének kialakítása és a komponensek működésének ellenőrzése, a felhasználói felület stílusának kialakítása, hogy az oldal elrendezése megfeleljen a megtervezett UI-terveknek.</w:t>
       </w:r>
     </w:p>
     <w:p>
@@ -3186,25 +2795,7 @@
           <w:sz w:val="36"/>
           <w:szCs w:val="36"/>
         </w:rPr>
-        <w:t xml:space="preserve">, a routerben a főoldalak variánsainak gyerek </w:t>
-      </w:r>
-      <w:proofErr w:type="spellStart"/>
-      <w:r>
-        <w:rPr>
-          <w:rFonts w:ascii="Times New Roman" w:eastAsia="Times New Roman" w:hAnsi="Times New Roman" w:cs="Times New Roman"/>
-          <w:sz w:val="36"/>
-          <w:szCs w:val="36"/>
-        </w:rPr>
-        <w:t>route</w:t>
-      </w:r>
-      <w:proofErr w:type="spellEnd"/>
-      <w:r>
-        <w:rPr>
-          <w:rFonts w:ascii="Times New Roman" w:eastAsia="Times New Roman" w:hAnsi="Times New Roman" w:cs="Times New Roman"/>
-          <w:sz w:val="36"/>
-          <w:szCs w:val="36"/>
-        </w:rPr>
-        <w:t xml:space="preserve">-okba </w:t>
+        <w:t xml:space="preserve">, a routerben a főoldalak variánsainak gyerek route-okba </w:t>
       </w:r>
       <w:r>
         <w:rPr>
@@ -3229,51 +2820,15 @@
           <w:sz w:val="36"/>
           <w:szCs w:val="36"/>
         </w:rPr>
-        <w:t xml:space="preserve">, az új szabvány mintájára az </w:t>
-      </w:r>
-      <w:proofErr w:type="spellStart"/>
-      <w:r>
-        <w:rPr>
-          <w:rFonts w:ascii="Times New Roman" w:eastAsia="Times New Roman" w:hAnsi="Times New Roman" w:cs="Times New Roman"/>
-          <w:sz w:val="36"/>
-          <w:szCs w:val="36"/>
-        </w:rPr>
-        <w:t>admin</w:t>
-      </w:r>
-      <w:proofErr w:type="spellEnd"/>
-      <w:r>
-        <w:rPr>
-          <w:rFonts w:ascii="Times New Roman" w:eastAsia="Times New Roman" w:hAnsi="Times New Roman" w:cs="Times New Roman"/>
-          <w:sz w:val="36"/>
-          <w:szCs w:val="36"/>
-        </w:rPr>
-        <w:t xml:space="preserve"> nézet (gombok és rövid leírás azok alá) létrehozása</w:t>
-      </w:r>
-      <w:r>
-        <w:rPr>
-          <w:rFonts w:ascii="Times New Roman" w:eastAsia="Times New Roman" w:hAnsi="Times New Roman" w:cs="Times New Roman"/>
-          <w:sz w:val="36"/>
-          <w:szCs w:val="36"/>
-        </w:rPr>
-        <w:t xml:space="preserve">, felesleges import mezők kiszedése az </w:t>
-      </w:r>
-      <w:proofErr w:type="spellStart"/>
-      <w:r>
-        <w:rPr>
-          <w:rFonts w:ascii="Times New Roman" w:eastAsia="Times New Roman" w:hAnsi="Times New Roman" w:cs="Times New Roman"/>
-          <w:sz w:val="36"/>
-          <w:szCs w:val="36"/>
-        </w:rPr>
-        <w:t>App.vue</w:t>
-      </w:r>
-      <w:proofErr w:type="spellEnd"/>
-      <w:r>
-        <w:rPr>
-          <w:rFonts w:ascii="Times New Roman" w:eastAsia="Times New Roman" w:hAnsi="Times New Roman" w:cs="Times New Roman"/>
-          <w:sz w:val="36"/>
-          <w:szCs w:val="36"/>
-        </w:rPr>
-        <w:t xml:space="preserve"> fájlból</w:t>
+        <w:t>, az új szabvány mintájára az admin nézet (gombok és rövid leírás azok alá) létrehozása</w:t>
+      </w:r>
+      <w:r>
+        <w:rPr>
+          <w:rFonts w:ascii="Times New Roman" w:eastAsia="Times New Roman" w:hAnsi="Times New Roman" w:cs="Times New Roman"/>
+          <w:sz w:val="36"/>
+          <w:szCs w:val="36"/>
+        </w:rPr>
+        <w:t>, felesleges import mezők kiszedése az App.vue fájlból</w:t>
       </w:r>
     </w:p>
     <w:p>
@@ -3390,114 +2945,15 @@
           <w:sz w:val="36"/>
           <w:szCs w:val="36"/>
         </w:rPr>
-        <w:t>(Susán Csongor György, El-</w:t>
-      </w:r>
-      <w:proofErr w:type="spellStart"/>
-      <w:r>
-        <w:rPr>
-          <w:rFonts w:ascii="Times New Roman" w:eastAsia="Times New Roman" w:hAnsi="Times New Roman" w:cs="Times New Roman"/>
-          <w:sz w:val="36"/>
-          <w:szCs w:val="36"/>
-        </w:rPr>
-        <w:t>Nabulsy</w:t>
-      </w:r>
-      <w:proofErr w:type="spellEnd"/>
-      <w:r>
-        <w:rPr>
-          <w:rFonts w:ascii="Times New Roman" w:eastAsia="Times New Roman" w:hAnsi="Times New Roman" w:cs="Times New Roman"/>
-          <w:sz w:val="36"/>
-          <w:szCs w:val="36"/>
-        </w:rPr>
-        <w:t xml:space="preserve"> Csongor Alan)</w:t>
-      </w:r>
-      <w:r>
-        <w:rPr>
-          <w:rFonts w:ascii="Times New Roman" w:eastAsia="Times New Roman" w:hAnsi="Times New Roman" w:cs="Times New Roman"/>
-          <w:sz w:val="36"/>
-          <w:szCs w:val="36"/>
-        </w:rPr>
-        <w:t xml:space="preserve"> Nézetek végleges kialakítása (El-</w:t>
-      </w:r>
-      <w:proofErr w:type="spellStart"/>
-      <w:r>
-        <w:rPr>
-          <w:rFonts w:ascii="Times New Roman" w:eastAsia="Times New Roman" w:hAnsi="Times New Roman" w:cs="Times New Roman"/>
-          <w:sz w:val="36"/>
-          <w:szCs w:val="36"/>
-        </w:rPr>
-        <w:t>Nabulsy</w:t>
-      </w:r>
-      <w:proofErr w:type="spellEnd"/>
-      <w:r>
-        <w:rPr>
-          <w:rFonts w:ascii="Times New Roman" w:eastAsia="Times New Roman" w:hAnsi="Times New Roman" w:cs="Times New Roman"/>
-          <w:sz w:val="36"/>
-          <w:szCs w:val="36"/>
-        </w:rPr>
-        <w:t xml:space="preserve">: </w:t>
-      </w:r>
-      <w:proofErr w:type="spellStart"/>
-      <w:r>
-        <w:rPr>
-          <w:rFonts w:ascii="Times New Roman" w:eastAsia="Times New Roman" w:hAnsi="Times New Roman" w:cs="Times New Roman"/>
-          <w:sz w:val="36"/>
-          <w:szCs w:val="36"/>
-        </w:rPr>
-        <w:t>HomeView</w:t>
-      </w:r>
-      <w:proofErr w:type="spellEnd"/>
-      <w:r>
-        <w:rPr>
-          <w:rFonts w:ascii="Times New Roman" w:eastAsia="Times New Roman" w:hAnsi="Times New Roman" w:cs="Times New Roman"/>
-          <w:sz w:val="36"/>
-          <w:szCs w:val="36"/>
-        </w:rPr>
-        <w:t xml:space="preserve">, </w:t>
-      </w:r>
-      <w:proofErr w:type="spellStart"/>
-      <w:r>
-        <w:rPr>
-          <w:rFonts w:ascii="Times New Roman" w:eastAsia="Times New Roman" w:hAnsi="Times New Roman" w:cs="Times New Roman"/>
-          <w:sz w:val="36"/>
-          <w:szCs w:val="36"/>
-        </w:rPr>
-        <w:t>RequestView</w:t>
-      </w:r>
-      <w:proofErr w:type="spellEnd"/>
-      <w:r>
-        <w:rPr>
-          <w:rFonts w:ascii="Times New Roman" w:eastAsia="Times New Roman" w:hAnsi="Times New Roman" w:cs="Times New Roman"/>
-          <w:sz w:val="36"/>
-          <w:szCs w:val="36"/>
-        </w:rPr>
-        <w:t xml:space="preserve">, </w:t>
-      </w:r>
-      <w:proofErr w:type="spellStart"/>
-      <w:r>
-        <w:rPr>
-          <w:rFonts w:ascii="Times New Roman" w:eastAsia="Times New Roman" w:hAnsi="Times New Roman" w:cs="Times New Roman"/>
-          <w:sz w:val="36"/>
-          <w:szCs w:val="36"/>
-        </w:rPr>
-        <w:t>SendView</w:t>
-      </w:r>
-      <w:proofErr w:type="spellEnd"/>
-      <w:r>
-        <w:rPr>
-          <w:rFonts w:ascii="Times New Roman" w:eastAsia="Times New Roman" w:hAnsi="Times New Roman" w:cs="Times New Roman"/>
-          <w:sz w:val="36"/>
-          <w:szCs w:val="36"/>
-        </w:rPr>
-        <w:t xml:space="preserve">; Susán: főoldalak integrálása a </w:t>
-      </w:r>
-      <w:proofErr w:type="spellStart"/>
-      <w:r>
-        <w:rPr>
-          <w:rFonts w:ascii="Times New Roman" w:eastAsia="Times New Roman" w:hAnsi="Times New Roman" w:cs="Times New Roman"/>
-          <w:sz w:val="36"/>
-          <w:szCs w:val="36"/>
-        </w:rPr>
-        <w:t>HomeLayout</w:t>
+        <w:t>(Susán Csongor György, El-Nabulsy Csongor Alan)</w:t>
+      </w:r>
+      <w:r>
+        <w:rPr>
+          <w:rFonts w:ascii="Times New Roman" w:eastAsia="Times New Roman" w:hAnsi="Times New Roman" w:cs="Times New Roman"/>
+          <w:sz w:val="36"/>
+          <w:szCs w:val="36"/>
+        </w:rPr>
+        <w:t xml:space="preserve"> Nézetek végleges kialakítása (El-Nabulsy: HomeView, RequestView, SendView; Susán: főoldalak integrálása a HomeLayout</w:t>
       </w:r>
       <w:r>
         <w:rPr>
@@ -3513,16 +2969,7 @@
           <w:sz w:val="36"/>
           <w:szCs w:val="36"/>
         </w:rPr>
-        <w:t>ba</w:t>
-      </w:r>
-      <w:proofErr w:type="spellEnd"/>
-      <w:r>
-        <w:rPr>
-          <w:rFonts w:ascii="Times New Roman" w:eastAsia="Times New Roman" w:hAnsi="Times New Roman" w:cs="Times New Roman"/>
-          <w:sz w:val="36"/>
-          <w:szCs w:val="36"/>
-        </w:rPr>
-        <w:t>)</w:t>
+        <w:t>ba)</w:t>
       </w:r>
       <w:r>
         <w:rPr>
@@ -3571,25 +3018,7 @@
           <w:sz w:val="36"/>
           <w:szCs w:val="36"/>
         </w:rPr>
-        <w:t xml:space="preserve">Példa adatok felvétele a </w:t>
-      </w:r>
-      <w:proofErr w:type="spellStart"/>
-      <w:r>
-        <w:rPr>
-          <w:rFonts w:ascii="Times New Roman" w:eastAsia="Times New Roman" w:hAnsi="Times New Roman" w:cs="Times New Roman"/>
-          <w:sz w:val="36"/>
-          <w:szCs w:val="36"/>
-        </w:rPr>
-        <w:t>HomeLayout-ba</w:t>
-      </w:r>
-      <w:proofErr w:type="spellEnd"/>
-      <w:r>
-        <w:rPr>
-          <w:rFonts w:ascii="Times New Roman" w:eastAsia="Times New Roman" w:hAnsi="Times New Roman" w:cs="Times New Roman"/>
-          <w:sz w:val="36"/>
-          <w:szCs w:val="36"/>
-        </w:rPr>
-        <w:t xml:space="preserve"> a helyes működés tesztelésének érdekében</w:t>
+        <w:t>Példa adatok felvétele a HomeLayout-ba a helyes működés tesztelésének érdekében</w:t>
       </w:r>
     </w:p>
     <w:p>
@@ -3637,41 +3066,13 @@
           <w:szCs w:val="36"/>
         </w:rPr>
       </w:pPr>
-      <w:proofErr w:type="spellStart"/>
-      <w:r>
-        <w:rPr>
-          <w:rFonts w:ascii="Times New Roman" w:eastAsia="Times New Roman" w:hAnsi="Times New Roman" w:cs="Times New Roman"/>
-          <w:sz w:val="36"/>
-          <w:szCs w:val="36"/>
-        </w:rPr>
-        <w:t>meta.title-ekben</w:t>
-      </w:r>
-      <w:proofErr w:type="spellEnd"/>
-      <w:r>
-        <w:rPr>
-          <w:rFonts w:ascii="Times New Roman" w:eastAsia="Times New Roman" w:hAnsi="Times New Roman" w:cs="Times New Roman"/>
-          <w:sz w:val="36"/>
-          <w:szCs w:val="36"/>
-        </w:rPr>
-        <w:t xml:space="preserve"> és a </w:t>
-      </w:r>
-      <w:proofErr w:type="spellStart"/>
-      <w:r>
-        <w:rPr>
-          <w:rFonts w:ascii="Times New Roman" w:eastAsia="Times New Roman" w:hAnsi="Times New Roman" w:cs="Times New Roman"/>
-          <w:sz w:val="36"/>
-          <w:szCs w:val="36"/>
-        </w:rPr>
-        <w:t>beforeEach</w:t>
-      </w:r>
-      <w:proofErr w:type="spellEnd"/>
-      <w:r>
-        <w:rPr>
-          <w:rFonts w:ascii="Times New Roman" w:eastAsia="Times New Roman" w:hAnsi="Times New Roman" w:cs="Times New Roman"/>
-          <w:sz w:val="36"/>
-          <w:szCs w:val="36"/>
-        </w:rPr>
-        <w:t>-ben oldalcímek meghatározása</w:t>
+      <w:r>
+        <w:rPr>
+          <w:rFonts w:ascii="Times New Roman" w:eastAsia="Times New Roman" w:hAnsi="Times New Roman" w:cs="Times New Roman"/>
+          <w:sz w:val="36"/>
+          <w:szCs w:val="36"/>
+        </w:rPr>
+        <w:t>meta.title-ekben és a beforeEach-ben oldalcímek meghatározása</w:t>
       </w:r>
     </w:p>
     <w:p>
@@ -3727,7 +3128,6 @@
           <w:szCs w:val="36"/>
         </w:rPr>
       </w:pPr>
-      <w:proofErr w:type="spellStart"/>
       <w:r>
         <w:rPr>
           <w:rFonts w:ascii="Times New Roman" w:eastAsia="Times New Roman" w:hAnsi="Times New Roman" w:cs="Times New Roman"/>
@@ -3735,34 +3135,7 @@
           <w:szCs w:val="36"/>
         </w:rPr>
         <w:lastRenderedPageBreak/>
-        <w:t>auth</w:t>
-      </w:r>
-      <w:proofErr w:type="spellEnd"/>
-      <w:r>
-        <w:rPr>
-          <w:rFonts w:ascii="Times New Roman" w:eastAsia="Times New Roman" w:hAnsi="Times New Roman" w:cs="Times New Roman"/>
-          <w:sz w:val="36"/>
-          <w:szCs w:val="36"/>
-        </w:rPr>
-        <w:t xml:space="preserve"> függvény hozzáadása a bejelentkezési képernyőhöz (</w:t>
-      </w:r>
-      <w:proofErr w:type="spellStart"/>
-      <w:r>
-        <w:rPr>
-          <w:rFonts w:ascii="Times New Roman" w:eastAsia="Times New Roman" w:hAnsi="Times New Roman" w:cs="Times New Roman"/>
-          <w:sz w:val="36"/>
-          <w:szCs w:val="36"/>
-        </w:rPr>
-        <w:t>LoginView</w:t>
-      </w:r>
-      <w:proofErr w:type="spellEnd"/>
-      <w:r>
-        <w:rPr>
-          <w:rFonts w:ascii="Times New Roman" w:eastAsia="Times New Roman" w:hAnsi="Times New Roman" w:cs="Times New Roman"/>
-          <w:sz w:val="36"/>
-          <w:szCs w:val="36"/>
-        </w:rPr>
-        <w:t>), ami egyelőre üres, egy komment jelzi annak célját</w:t>
+        <w:t>auth függvény hozzáadása a bejelentkezési képernyőhöz (LoginView), ami egyelőre üres, egy komment jelzi annak célját</w:t>
       </w:r>
     </w:p>
     <w:p>
@@ -3874,7 +3247,7 @@
       </w:pPr>
       <w:r>
         <w:pict w14:anchorId="759CF75D">
-          <v:shape id="Kép 1" o:spid="_x0000_i1026" type="#_x0000_t75" style="width:23.75pt;height:23.75pt;visibility:visible;mso-wrap-style:square">
+          <v:shape id="Kép 1" o:spid="_x0000_i1026" type="#_x0000_t75" style="width:24pt;height:24pt;visibility:visible;mso-wrap-style:square">
             <v:imagedata r:id="rId27" o:title=""/>
           </v:shape>
         </w:pict>
@@ -3963,43 +3336,7 @@
           <w:sz w:val="36"/>
           <w:szCs w:val="36"/>
         </w:rPr>
-        <w:t>Szerepkörök (</w:t>
-      </w:r>
-      <w:proofErr w:type="spellStart"/>
-      <w:r>
-        <w:rPr>
-          <w:rFonts w:ascii="Times New Roman" w:eastAsia="Times New Roman" w:hAnsi="Times New Roman" w:cs="Times New Roman"/>
-          <w:sz w:val="36"/>
-          <w:szCs w:val="36"/>
-        </w:rPr>
-        <w:t>role</w:t>
-      </w:r>
-      <w:proofErr w:type="spellEnd"/>
-      <w:r>
-        <w:rPr>
-          <w:rFonts w:ascii="Times New Roman" w:eastAsia="Times New Roman" w:hAnsi="Times New Roman" w:cs="Times New Roman"/>
-          <w:sz w:val="36"/>
-          <w:szCs w:val="36"/>
-        </w:rPr>
-        <w:t xml:space="preserve">) és </w:t>
-      </w:r>
-      <w:proofErr w:type="spellStart"/>
-      <w:r>
-        <w:rPr>
-          <w:rFonts w:ascii="Times New Roman" w:eastAsia="Times New Roman" w:hAnsi="Times New Roman" w:cs="Times New Roman"/>
-          <w:sz w:val="36"/>
-          <w:szCs w:val="36"/>
-        </w:rPr>
-        <w:t>requiresAuth</w:t>
-      </w:r>
-      <w:proofErr w:type="spellEnd"/>
-      <w:r>
-        <w:rPr>
-          <w:rFonts w:ascii="Times New Roman" w:eastAsia="Times New Roman" w:hAnsi="Times New Roman" w:cs="Times New Roman"/>
-          <w:sz w:val="36"/>
-          <w:szCs w:val="36"/>
-        </w:rPr>
-        <w:t xml:space="preserve"> hozzáadása a nézetekhez</w:t>
+        <w:t>Szerepkörök (role) és requiresAuth hozzáadása a nézetekhez</w:t>
       </w:r>
     </w:p>
     <w:p>
@@ -4017,41 +3354,13 @@
           <w:szCs w:val="36"/>
         </w:rPr>
       </w:pPr>
-      <w:proofErr w:type="spellStart"/>
-      <w:r>
-        <w:rPr>
-          <w:rFonts w:ascii="Times New Roman" w:eastAsia="Times New Roman" w:hAnsi="Times New Roman" w:cs="Times New Roman"/>
-          <w:sz w:val="36"/>
-          <w:szCs w:val="36"/>
-        </w:rPr>
-        <w:t>Autentikációhoz</w:t>
-      </w:r>
-      <w:proofErr w:type="spellEnd"/>
-      <w:r>
-        <w:rPr>
-          <w:rFonts w:ascii="Times New Roman" w:eastAsia="Times New Roman" w:hAnsi="Times New Roman" w:cs="Times New Roman"/>
-          <w:sz w:val="36"/>
-          <w:szCs w:val="36"/>
-        </w:rPr>
-        <w:t xml:space="preserve"> szükséges alapváltozók felvétele az </w:t>
-      </w:r>
-      <w:proofErr w:type="spellStart"/>
-      <w:r>
-        <w:rPr>
-          <w:rFonts w:ascii="Times New Roman" w:eastAsia="Times New Roman" w:hAnsi="Times New Roman" w:cs="Times New Roman"/>
-          <w:sz w:val="36"/>
-          <w:szCs w:val="36"/>
-        </w:rPr>
-        <w:t>App.vue</w:t>
-      </w:r>
-      <w:proofErr w:type="spellEnd"/>
-      <w:r>
-        <w:rPr>
-          <w:rFonts w:ascii="Times New Roman" w:eastAsia="Times New Roman" w:hAnsi="Times New Roman" w:cs="Times New Roman"/>
-          <w:sz w:val="36"/>
-          <w:szCs w:val="36"/>
-        </w:rPr>
-        <w:t>-ban</w:t>
+      <w:r>
+        <w:rPr>
+          <w:rFonts w:ascii="Times New Roman" w:eastAsia="Times New Roman" w:hAnsi="Times New Roman" w:cs="Times New Roman"/>
+          <w:sz w:val="36"/>
+          <w:szCs w:val="36"/>
+        </w:rPr>
+        <w:t>Autentikációhoz szükséges alapváltozók felvétele az App.vue-ban</w:t>
       </w:r>
     </w:p>
     <w:p>
@@ -4091,25 +3400,7 @@
           <w:sz w:val="36"/>
           <w:szCs w:val="36"/>
         </w:rPr>
-        <w:t>(Susán Csongor György, El-</w:t>
-      </w:r>
-      <w:proofErr w:type="spellStart"/>
-      <w:r>
-        <w:rPr>
-          <w:rFonts w:ascii="Times New Roman" w:eastAsia="Times New Roman" w:hAnsi="Times New Roman" w:cs="Times New Roman"/>
-          <w:sz w:val="36"/>
-          <w:szCs w:val="36"/>
-        </w:rPr>
-        <w:t>Nabulsy</w:t>
-      </w:r>
-      <w:proofErr w:type="spellEnd"/>
-      <w:r>
-        <w:rPr>
-          <w:rFonts w:ascii="Times New Roman" w:eastAsia="Times New Roman" w:hAnsi="Times New Roman" w:cs="Times New Roman"/>
-          <w:sz w:val="36"/>
-          <w:szCs w:val="36"/>
-        </w:rPr>
-        <w:t xml:space="preserve"> Csongor Alan)</w:t>
+        <w:t>(Susán Csongor György, El-Nabulsy Csongor Alan)</w:t>
       </w:r>
     </w:p>
     <w:p>
@@ -4155,25 +3446,7 @@
           <w:sz w:val="36"/>
           <w:szCs w:val="36"/>
         </w:rPr>
-        <w:t>Táblák SQL-tervezetének elkészítése (El-</w:t>
-      </w:r>
-      <w:proofErr w:type="spellStart"/>
-      <w:r>
-        <w:rPr>
-          <w:rFonts w:ascii="Times New Roman" w:eastAsia="Times New Roman" w:hAnsi="Times New Roman" w:cs="Times New Roman"/>
-          <w:sz w:val="36"/>
-          <w:szCs w:val="36"/>
-        </w:rPr>
-        <w:t>Nabulsy</w:t>
-      </w:r>
-      <w:proofErr w:type="spellEnd"/>
-      <w:r>
-        <w:rPr>
-          <w:rFonts w:ascii="Times New Roman" w:eastAsia="Times New Roman" w:hAnsi="Times New Roman" w:cs="Times New Roman"/>
-          <w:sz w:val="36"/>
-          <w:szCs w:val="36"/>
-        </w:rPr>
-        <w:t>)</w:t>
+        <w:t>Táblák SQL-tervezetének elkészítése (El-Nabulsy)</w:t>
       </w:r>
     </w:p>
     <w:p>
@@ -4197,79 +3470,7 @@
           <w:szCs w:val="36"/>
         </w:rPr>
         <w:lastRenderedPageBreak/>
-        <w:t>Táblázatok relációs tervvé írása és azok implementálása (</w:t>
-      </w:r>
-      <w:proofErr w:type="spellStart"/>
-      <w:r>
-        <w:rPr>
-          <w:rFonts w:ascii="Times New Roman" w:eastAsia="Times New Roman" w:hAnsi="Times New Roman" w:cs="Times New Roman"/>
-          <w:sz w:val="36"/>
-          <w:szCs w:val="36"/>
-        </w:rPr>
-        <w:t>model-lek</w:t>
-      </w:r>
-      <w:proofErr w:type="spellEnd"/>
-      <w:r>
-        <w:rPr>
-          <w:rFonts w:ascii="Times New Roman" w:eastAsia="Times New Roman" w:hAnsi="Times New Roman" w:cs="Times New Roman"/>
-          <w:sz w:val="36"/>
-          <w:szCs w:val="36"/>
-        </w:rPr>
-        <w:t xml:space="preserve">, egyelőre üres </w:t>
-      </w:r>
-      <w:proofErr w:type="spellStart"/>
-      <w:r>
-        <w:rPr>
-          <w:rFonts w:ascii="Times New Roman" w:eastAsia="Times New Roman" w:hAnsi="Times New Roman" w:cs="Times New Roman"/>
-          <w:sz w:val="36"/>
-          <w:szCs w:val="36"/>
-        </w:rPr>
-        <w:t>seederek</w:t>
-      </w:r>
-      <w:proofErr w:type="spellEnd"/>
-      <w:r>
-        <w:rPr>
-          <w:rFonts w:ascii="Times New Roman" w:eastAsia="Times New Roman" w:hAnsi="Times New Roman" w:cs="Times New Roman"/>
-          <w:sz w:val="36"/>
-          <w:szCs w:val="36"/>
-        </w:rPr>
-        <w:t xml:space="preserve"> és </w:t>
-      </w:r>
-      <w:proofErr w:type="spellStart"/>
-      <w:r>
-        <w:rPr>
-          <w:rFonts w:ascii="Times New Roman" w:eastAsia="Times New Roman" w:hAnsi="Times New Roman" w:cs="Times New Roman"/>
-          <w:sz w:val="36"/>
-          <w:szCs w:val="36"/>
-        </w:rPr>
-        <w:t>migration-ök</w:t>
-      </w:r>
-      <w:proofErr w:type="spellEnd"/>
-      <w:r>
-        <w:rPr>
-          <w:rFonts w:ascii="Times New Roman" w:eastAsia="Times New Roman" w:hAnsi="Times New Roman" w:cs="Times New Roman"/>
-          <w:sz w:val="36"/>
-          <w:szCs w:val="36"/>
-        </w:rPr>
-        <w:t>) a Backend (</w:t>
-      </w:r>
-      <w:proofErr w:type="spellStart"/>
-      <w:r>
-        <w:rPr>
-          <w:rFonts w:ascii="Times New Roman" w:eastAsia="Times New Roman" w:hAnsi="Times New Roman" w:cs="Times New Roman"/>
-          <w:sz w:val="36"/>
-          <w:szCs w:val="36"/>
-        </w:rPr>
-        <w:t>Laravel</w:t>
-      </w:r>
-      <w:proofErr w:type="spellEnd"/>
-      <w:r>
-        <w:rPr>
-          <w:rFonts w:ascii="Times New Roman" w:eastAsia="Times New Roman" w:hAnsi="Times New Roman" w:cs="Times New Roman"/>
-          <w:sz w:val="36"/>
-          <w:szCs w:val="36"/>
-        </w:rPr>
-        <w:t>) projektbe (Susán)</w:t>
+        <w:t>Táblázatok relációs tervvé írása és azok implementálása (model-lek, egyelőre üres seederek és migration-ök) a Backend (Laravel) projektbe (Susán)</w:t>
       </w:r>
     </w:p>
     <w:p>
@@ -4292,97 +3493,7 @@
           <w:sz w:val="36"/>
           <w:szCs w:val="36"/>
         </w:rPr>
-        <w:t xml:space="preserve">Projekt struktúrájának végleges kialakítása (eddig </w:t>
-      </w:r>
-      <w:proofErr w:type="spellStart"/>
-      <w:r>
-        <w:rPr>
-          <w:rFonts w:ascii="Times New Roman" w:eastAsia="Times New Roman" w:hAnsi="Times New Roman" w:cs="Times New Roman"/>
-          <w:sz w:val="36"/>
-          <w:szCs w:val="36"/>
-        </w:rPr>
-        <w:t>frontendPart-blathyfm</w:t>
-      </w:r>
-      <w:proofErr w:type="spellEnd"/>
-      <w:r>
-        <w:rPr>
-          <w:rFonts w:ascii="Times New Roman" w:eastAsia="Times New Roman" w:hAnsi="Times New Roman" w:cs="Times New Roman"/>
-          <w:sz w:val="36"/>
-          <w:szCs w:val="36"/>
-        </w:rPr>
-        <w:t xml:space="preserve"> volt, viszont azóta a </w:t>
-      </w:r>
-      <w:proofErr w:type="spellStart"/>
-      <w:r>
-        <w:rPr>
-          <w:rFonts w:ascii="Times New Roman" w:eastAsia="Times New Roman" w:hAnsi="Times New Roman" w:cs="Times New Roman"/>
-          <w:sz w:val="36"/>
-          <w:szCs w:val="36"/>
-        </w:rPr>
-        <w:t>főmappa</w:t>
-      </w:r>
-      <w:proofErr w:type="spellEnd"/>
-      <w:r>
-        <w:rPr>
-          <w:rFonts w:ascii="Times New Roman" w:eastAsia="Times New Roman" w:hAnsi="Times New Roman" w:cs="Times New Roman"/>
-          <w:sz w:val="36"/>
-          <w:szCs w:val="36"/>
-        </w:rPr>
-        <w:t xml:space="preserve"> a </w:t>
-      </w:r>
-      <w:proofErr w:type="spellStart"/>
-      <w:r>
-        <w:rPr>
-          <w:rFonts w:ascii="Times New Roman" w:eastAsia="Times New Roman" w:hAnsi="Times New Roman" w:cs="Times New Roman"/>
-          <w:sz w:val="36"/>
-          <w:szCs w:val="36"/>
-        </w:rPr>
-        <w:t>BlathyFM</w:t>
-      </w:r>
-      <w:proofErr w:type="spellEnd"/>
-      <w:r>
-        <w:rPr>
-          <w:rFonts w:ascii="Times New Roman" w:eastAsia="Times New Roman" w:hAnsi="Times New Roman" w:cs="Times New Roman"/>
-          <w:sz w:val="36"/>
-          <w:szCs w:val="36"/>
-        </w:rPr>
-        <w:t xml:space="preserve"> mappát viseli, amiben két, az alkalmazás egy-egy szintjét képviselő projekt található (</w:t>
-      </w:r>
-      <w:proofErr w:type="spellStart"/>
-      <w:r>
-        <w:rPr>
-          <w:rFonts w:ascii="Times New Roman" w:eastAsia="Times New Roman" w:hAnsi="Times New Roman" w:cs="Times New Roman"/>
-          <w:sz w:val="36"/>
-          <w:szCs w:val="36"/>
-        </w:rPr>
-        <w:t>blathyfm_frontend</w:t>
-      </w:r>
-      <w:proofErr w:type="spellEnd"/>
-      <w:r>
-        <w:rPr>
-          <w:rFonts w:ascii="Times New Roman" w:eastAsia="Times New Roman" w:hAnsi="Times New Roman" w:cs="Times New Roman"/>
-          <w:sz w:val="36"/>
-          <w:szCs w:val="36"/>
-        </w:rPr>
-        <w:t xml:space="preserve"> – amiben az eddigi frontend-alkalmazás volt megtalálható – és </w:t>
-      </w:r>
-      <w:proofErr w:type="spellStart"/>
-      <w:r>
-        <w:rPr>
-          <w:rFonts w:ascii="Times New Roman" w:eastAsia="Times New Roman" w:hAnsi="Times New Roman" w:cs="Times New Roman"/>
-          <w:sz w:val="36"/>
-          <w:szCs w:val="36"/>
-        </w:rPr>
-        <w:t>blathyfm_backend</w:t>
-      </w:r>
-      <w:proofErr w:type="spellEnd"/>
-      <w:r>
-        <w:rPr>
-          <w:rFonts w:ascii="Times New Roman" w:eastAsia="Times New Roman" w:hAnsi="Times New Roman" w:cs="Times New Roman"/>
-          <w:sz w:val="36"/>
-          <w:szCs w:val="36"/>
-        </w:rPr>
-        <w:t>, ami pedig az újonnan létrejött backend része a projektnek) (Susán)</w:t>
+        <w:t>Projekt struktúrájának végleges kialakítása (eddig frontendPart-blathyfm volt, viszont azóta a főmappa a BlathyFM mappát viseli, amiben két, az alkalmazás egy-egy szintjét képviselő projekt található (blathyfm_frontend – amiben az eddigi frontend-alkalmazás volt megtalálható – és blathyfm_backend, ami pedig az újonnan létrejött backend része a projektnek) (Susán)</w:t>
       </w:r>
     </w:p>
     <w:p>
@@ -4467,43 +3578,7 @@
           <w:sz w:val="36"/>
           <w:szCs w:val="36"/>
         </w:rPr>
-        <w:t>(El-</w:t>
-      </w:r>
-      <w:proofErr w:type="spellStart"/>
-      <w:r>
-        <w:rPr>
-          <w:rFonts w:ascii="Times New Roman" w:eastAsia="Times New Roman" w:hAnsi="Times New Roman" w:cs="Times New Roman"/>
-          <w:sz w:val="36"/>
-          <w:szCs w:val="36"/>
-        </w:rPr>
-        <w:t>Nabulsy</w:t>
-      </w:r>
-      <w:proofErr w:type="spellEnd"/>
-      <w:r>
-        <w:rPr>
-          <w:rFonts w:ascii="Times New Roman" w:eastAsia="Times New Roman" w:hAnsi="Times New Roman" w:cs="Times New Roman"/>
-          <w:sz w:val="36"/>
-          <w:szCs w:val="36"/>
-        </w:rPr>
-        <w:t xml:space="preserve"> Csongor Alan) Az ütemezői nézet (</w:t>
-      </w:r>
-      <w:proofErr w:type="spellStart"/>
-      <w:r>
-        <w:rPr>
-          <w:rFonts w:ascii="Times New Roman" w:eastAsia="Times New Roman" w:hAnsi="Times New Roman" w:cs="Times New Roman"/>
-          <w:sz w:val="36"/>
-          <w:szCs w:val="36"/>
-        </w:rPr>
-        <w:t>SchedulerView</w:t>
-      </w:r>
-      <w:proofErr w:type="spellEnd"/>
-      <w:r>
-        <w:rPr>
-          <w:rFonts w:ascii="Times New Roman" w:eastAsia="Times New Roman" w:hAnsi="Times New Roman" w:cs="Times New Roman"/>
-          <w:sz w:val="36"/>
-          <w:szCs w:val="36"/>
-        </w:rPr>
-        <w:t>) elkészítése</w:t>
+        <w:t>(El-Nabulsy Csongor Alan) Az ütemezői nézet (SchedulerView) elkészítése</w:t>
       </w:r>
       <w:r>
         <w:rPr>
@@ -4540,25 +3615,7 @@
           <w:sz w:val="36"/>
           <w:szCs w:val="36"/>
         </w:rPr>
-        <w:t>Tervezéssel kapcsolatos dokumentumok áthelyezése egy „</w:t>
-      </w:r>
-      <w:proofErr w:type="spellStart"/>
-      <w:r>
-        <w:rPr>
-          <w:rFonts w:ascii="Times New Roman" w:eastAsia="Times New Roman" w:hAnsi="Times New Roman" w:cs="Times New Roman"/>
-          <w:sz w:val="36"/>
-          <w:szCs w:val="36"/>
-        </w:rPr>
-        <w:t>plans</w:t>
-      </w:r>
-      <w:proofErr w:type="spellEnd"/>
-      <w:r>
-        <w:rPr>
-          <w:rFonts w:ascii="Times New Roman" w:eastAsia="Times New Roman" w:hAnsi="Times New Roman" w:cs="Times New Roman"/>
-          <w:sz w:val="36"/>
-          <w:szCs w:val="36"/>
-        </w:rPr>
-        <w:t>” mappába, a</w:t>
+        <w:t>Tervezéssel kapcsolatos dokumentumok áthelyezése egy „plans” mappába, a</w:t>
       </w:r>
       <w:r>
         <w:rPr>
@@ -4632,25 +3689,7 @@
           <w:sz w:val="36"/>
           <w:szCs w:val="36"/>
         </w:rPr>
-        <w:t>El-</w:t>
-      </w:r>
-      <w:proofErr w:type="spellStart"/>
-      <w:r>
-        <w:rPr>
-          <w:rFonts w:ascii="Times New Roman" w:eastAsia="Times New Roman" w:hAnsi="Times New Roman" w:cs="Times New Roman"/>
-          <w:sz w:val="36"/>
-          <w:szCs w:val="36"/>
-        </w:rPr>
-        <w:t>Nabulsy</w:t>
-      </w:r>
-      <w:proofErr w:type="spellEnd"/>
-      <w:r>
-        <w:rPr>
-          <w:rFonts w:ascii="Times New Roman" w:eastAsia="Times New Roman" w:hAnsi="Times New Roman" w:cs="Times New Roman"/>
-          <w:sz w:val="36"/>
-          <w:szCs w:val="36"/>
-        </w:rPr>
-        <w:t xml:space="preserve"> Csongor Alan</w:t>
+        <w:t>El-Nabulsy Csongor Alan</w:t>
       </w:r>
       <w:r>
         <w:rPr>
@@ -4666,43 +3705,7 @@
           <w:sz w:val="36"/>
           <w:szCs w:val="36"/>
         </w:rPr>
-        <w:t xml:space="preserve"> </w:t>
-      </w:r>
-      <w:proofErr w:type="spellStart"/>
-      <w:r>
-        <w:rPr>
-          <w:rFonts w:ascii="Times New Roman" w:eastAsia="Times New Roman" w:hAnsi="Times New Roman" w:cs="Times New Roman"/>
-          <w:sz w:val="36"/>
-          <w:szCs w:val="36"/>
-        </w:rPr>
-        <w:t>RequestView</w:t>
-      </w:r>
-      <w:proofErr w:type="spellEnd"/>
-      <w:r>
-        <w:rPr>
-          <w:rFonts w:ascii="Times New Roman" w:eastAsia="Times New Roman" w:hAnsi="Times New Roman" w:cs="Times New Roman"/>
-          <w:sz w:val="36"/>
-          <w:szCs w:val="36"/>
-        </w:rPr>
-        <w:t xml:space="preserve"> és </w:t>
-      </w:r>
-      <w:proofErr w:type="spellStart"/>
-      <w:r>
-        <w:rPr>
-          <w:rFonts w:ascii="Times New Roman" w:eastAsia="Times New Roman" w:hAnsi="Times New Roman" w:cs="Times New Roman"/>
-          <w:sz w:val="36"/>
-          <w:szCs w:val="36"/>
-        </w:rPr>
-        <w:t>SchedulerView</w:t>
-      </w:r>
-      <w:proofErr w:type="spellEnd"/>
-      <w:r>
-        <w:rPr>
-          <w:rFonts w:ascii="Times New Roman" w:eastAsia="Times New Roman" w:hAnsi="Times New Roman" w:cs="Times New Roman"/>
-          <w:sz w:val="36"/>
-          <w:szCs w:val="36"/>
-        </w:rPr>
-        <w:t xml:space="preserve"> továbbfejlesztése</w:t>
+        <w:t xml:space="preserve"> RequestView és SchedulerView továbbfejlesztése</w:t>
       </w:r>
     </w:p>
     <w:p>
@@ -4815,25 +3818,7 @@
           <w:sz w:val="36"/>
           <w:szCs w:val="36"/>
         </w:rPr>
-        <w:t xml:space="preserve"> az adatbázisba </w:t>
-      </w:r>
-      <w:proofErr w:type="spellStart"/>
-      <w:r>
-        <w:rPr>
-          <w:rFonts w:ascii="Times New Roman" w:eastAsia="Times New Roman" w:hAnsi="Times New Roman" w:cs="Times New Roman"/>
-          <w:sz w:val="36"/>
-          <w:szCs w:val="36"/>
-        </w:rPr>
-        <w:t>seederek</w:t>
-      </w:r>
-      <w:proofErr w:type="spellEnd"/>
-      <w:r>
-        <w:rPr>
-          <w:rFonts w:ascii="Times New Roman" w:eastAsia="Times New Roman" w:hAnsi="Times New Roman" w:cs="Times New Roman"/>
-          <w:sz w:val="36"/>
-          <w:szCs w:val="36"/>
-        </w:rPr>
-        <w:t xml:space="preserve"> segítségével</w:t>
+        <w:t xml:space="preserve"> az adatbázisba seederek segítségével</w:t>
       </w:r>
     </w:p>
     <w:p>
@@ -4981,7 +3966,6 @@
           <w:szCs w:val="36"/>
         </w:rPr>
       </w:pPr>
-      <w:proofErr w:type="spellStart"/>
       <w:r>
         <w:rPr>
           <w:rFonts w:ascii="Times New Roman" w:eastAsia="Times New Roman" w:hAnsi="Times New Roman" w:cs="Times New Roman"/>
@@ -4990,7 +3974,6 @@
         </w:rPr>
         <w:t>Genre</w:t>
       </w:r>
-      <w:proofErr w:type="spellEnd"/>
       <w:r>
         <w:rPr>
           <w:rFonts w:ascii="Times New Roman" w:eastAsia="Times New Roman" w:hAnsi="Times New Roman" w:cs="Times New Roman"/>
@@ -5140,61 +4123,7 @@
           <w:sz w:val="36"/>
           <w:szCs w:val="36"/>
         </w:rPr>
-        <w:t xml:space="preserve">Backend oldali </w:t>
-      </w:r>
-      <w:proofErr w:type="spellStart"/>
-      <w:r>
-        <w:rPr>
-          <w:rFonts w:ascii="Times New Roman" w:eastAsia="Times New Roman" w:hAnsi="Times New Roman" w:cs="Times New Roman"/>
-          <w:sz w:val="36"/>
-          <w:szCs w:val="36"/>
-        </w:rPr>
-        <w:t>migrationök</w:t>
-      </w:r>
-      <w:proofErr w:type="spellEnd"/>
-      <w:r>
-        <w:rPr>
-          <w:rFonts w:ascii="Times New Roman" w:eastAsia="Times New Roman" w:hAnsi="Times New Roman" w:cs="Times New Roman"/>
-          <w:sz w:val="36"/>
-          <w:szCs w:val="36"/>
-        </w:rPr>
-        <w:t xml:space="preserve"> és </w:t>
-      </w:r>
-      <w:proofErr w:type="spellStart"/>
-      <w:r>
-        <w:rPr>
-          <w:rFonts w:ascii="Times New Roman" w:eastAsia="Times New Roman" w:hAnsi="Times New Roman" w:cs="Times New Roman"/>
-          <w:sz w:val="36"/>
-          <w:szCs w:val="36"/>
-        </w:rPr>
-        <w:t>seederek</w:t>
-      </w:r>
-      <w:proofErr w:type="spellEnd"/>
-      <w:r>
-        <w:rPr>
-          <w:rFonts w:ascii="Times New Roman" w:eastAsia="Times New Roman" w:hAnsi="Times New Roman" w:cs="Times New Roman"/>
-          <w:sz w:val="36"/>
-          <w:szCs w:val="36"/>
-        </w:rPr>
-        <w:t xml:space="preserve"> </w:t>
-      </w:r>
-      <w:proofErr w:type="spellStart"/>
-      <w:r>
-        <w:rPr>
-          <w:rFonts w:ascii="Times New Roman" w:eastAsia="Times New Roman" w:hAnsi="Times New Roman" w:cs="Times New Roman"/>
-          <w:sz w:val="36"/>
-          <w:szCs w:val="36"/>
-        </w:rPr>
-        <w:t>debuggolása</w:t>
-      </w:r>
-      <w:proofErr w:type="spellEnd"/>
-      <w:r>
-        <w:rPr>
-          <w:rFonts w:ascii="Times New Roman" w:eastAsia="Times New Roman" w:hAnsi="Times New Roman" w:cs="Times New Roman"/>
-          <w:sz w:val="36"/>
-          <w:szCs w:val="36"/>
-        </w:rPr>
-        <w:t>, hibamentesítése.</w:t>
+        <w:t>Backend oldali migrationök és seederek debuggolása, hibamentesítése.</w:t>
       </w:r>
     </w:p>
     <w:p>
@@ -5348,25 +4277,7 @@
           <w:sz w:val="36"/>
           <w:szCs w:val="36"/>
         </w:rPr>
-        <w:t>Felvétel előtt álló felhasználók (</w:t>
-      </w:r>
-      <w:proofErr w:type="spellStart"/>
-      <w:r>
-        <w:rPr>
-          <w:rFonts w:ascii="Times New Roman" w:eastAsia="Times New Roman" w:hAnsi="Times New Roman" w:cs="Times New Roman"/>
-          <w:sz w:val="36"/>
-          <w:szCs w:val="36"/>
-        </w:rPr>
-        <w:t>PendingUser</w:t>
-      </w:r>
-      <w:proofErr w:type="spellEnd"/>
-      <w:r>
-        <w:rPr>
-          <w:rFonts w:ascii="Times New Roman" w:eastAsia="Times New Roman" w:hAnsi="Times New Roman" w:cs="Times New Roman"/>
-          <w:sz w:val="36"/>
-          <w:szCs w:val="36"/>
-        </w:rPr>
-        <w:t>) táblájának hozzáadása az adatbázisba</w:t>
+        <w:t>Felvétel előtt álló felhasználók (PendingUser) táblájának hozzáadása az adatbázisba</w:t>
       </w:r>
       <w:r>
         <w:rPr>
@@ -5397,71 +4308,25 @@
           <w:sz w:val="36"/>
           <w:szCs w:val="36"/>
         </w:rPr>
-        <w:t xml:space="preserve">Regisztráció </w:t>
-      </w:r>
-      <w:proofErr w:type="spellStart"/>
-      <w:r>
-        <w:rPr>
-          <w:rFonts w:ascii="Times New Roman" w:eastAsia="Times New Roman" w:hAnsi="Times New Roman" w:cs="Times New Roman"/>
-          <w:sz w:val="36"/>
-          <w:szCs w:val="36"/>
-        </w:rPr>
-        <w:t>debuggolása</w:t>
-      </w:r>
-      <w:proofErr w:type="spellEnd"/>
-    </w:p>
-    <w:p>
-      <w:pPr>
-        <w:jc w:val="both"/>
-        <w:rPr>
-          <w:rFonts w:ascii="Times New Roman" w:eastAsia="Times New Roman" w:hAnsi="Times New Roman" w:cs="Times New Roman"/>
-          <w:sz w:val="36"/>
-          <w:szCs w:val="36"/>
-        </w:rPr>
-      </w:pPr>
-      <w:r>
-        <w:rPr>
-          <w:rFonts w:ascii="Times New Roman" w:eastAsia="Times New Roman" w:hAnsi="Times New Roman" w:cs="Times New Roman"/>
-          <w:sz w:val="36"/>
-          <w:szCs w:val="36"/>
-        </w:rPr>
-        <w:t>(El-</w:t>
-      </w:r>
-      <w:proofErr w:type="spellStart"/>
-      <w:r>
-        <w:rPr>
-          <w:rFonts w:ascii="Times New Roman" w:eastAsia="Times New Roman" w:hAnsi="Times New Roman" w:cs="Times New Roman"/>
-          <w:sz w:val="36"/>
-          <w:szCs w:val="36"/>
-        </w:rPr>
-        <w:t>Nabulsy</w:t>
-      </w:r>
-      <w:proofErr w:type="spellEnd"/>
-      <w:r>
-        <w:rPr>
-          <w:rFonts w:ascii="Times New Roman" w:eastAsia="Times New Roman" w:hAnsi="Times New Roman" w:cs="Times New Roman"/>
-          <w:sz w:val="36"/>
-          <w:szCs w:val="36"/>
-        </w:rPr>
-        <w:t xml:space="preserve"> Csongor Alan) </w:t>
-      </w:r>
-      <w:proofErr w:type="spellStart"/>
-      <w:r>
-        <w:rPr>
-          <w:rFonts w:ascii="Times New Roman" w:eastAsia="Times New Roman" w:hAnsi="Times New Roman" w:cs="Times New Roman"/>
-          <w:sz w:val="36"/>
-          <w:szCs w:val="36"/>
-        </w:rPr>
-        <w:t>WaitingView</w:t>
-      </w:r>
-      <w:proofErr w:type="spellEnd"/>
-      <w:r>
-        <w:rPr>
-          <w:rFonts w:ascii="Times New Roman" w:eastAsia="Times New Roman" w:hAnsi="Times New Roman" w:cs="Times New Roman"/>
-          <w:sz w:val="36"/>
-          <w:szCs w:val="36"/>
-        </w:rPr>
-        <w:t xml:space="preserve"> (ahova regisztráció után navigál az oldal) létrehozása.</w:t>
+        <w:t>Regisztráció debuggolása</w:t>
+      </w:r>
+    </w:p>
+    <w:p>
+      <w:pPr>
+        <w:jc w:val="both"/>
+        <w:rPr>
+          <w:rFonts w:ascii="Times New Roman" w:eastAsia="Times New Roman" w:hAnsi="Times New Roman" w:cs="Times New Roman"/>
+          <w:sz w:val="36"/>
+          <w:szCs w:val="36"/>
+        </w:rPr>
+      </w:pPr>
+      <w:r>
+        <w:rPr>
+          <w:rFonts w:ascii="Times New Roman" w:eastAsia="Times New Roman" w:hAnsi="Times New Roman" w:cs="Times New Roman"/>
+          <w:sz w:val="36"/>
+          <w:szCs w:val="36"/>
+        </w:rPr>
+        <w:t>(El-Nabulsy Csongor Alan) WaitingView (ahova regisztráció után navigál az oldal) létrehozása.</w:t>
       </w:r>
     </w:p>
     <w:p>
@@ -5541,125 +4406,53 @@
           <w:sz w:val="36"/>
           <w:szCs w:val="36"/>
         </w:rPr>
-        <w:t xml:space="preserve">Átnéztük mindegyik oldalt hogy néz ki jelenleg, és a </w:t>
-      </w:r>
-      <w:proofErr w:type="spellStart"/>
-      <w:r>
-        <w:rPr>
-          <w:rFonts w:ascii="Times New Roman" w:eastAsia="Times New Roman" w:hAnsi="Times New Roman" w:cs="Times New Roman"/>
-          <w:sz w:val="36"/>
-          <w:szCs w:val="36"/>
-        </w:rPr>
-        <w:t>RequestView</w:t>
-      </w:r>
-      <w:proofErr w:type="spellEnd"/>
-      <w:r>
-        <w:rPr>
-          <w:rFonts w:ascii="Times New Roman" w:eastAsia="Times New Roman" w:hAnsi="Times New Roman" w:cs="Times New Roman"/>
-          <w:sz w:val="36"/>
-          <w:szCs w:val="36"/>
-        </w:rPr>
-        <w:t>-n kellett változtatni, hogy megfeleljen a dokumentációban lévő rajznak. Továbbá összefoglaltuk hogy mennyi hiányzik még a projektből hogy teljesen kész és működő képes legyen.</w:t>
-      </w:r>
-    </w:p>
-    <w:p>
-      <w:pPr>
-        <w:jc w:val="both"/>
-        <w:rPr>
-          <w:rFonts w:ascii="Times New Roman" w:eastAsia="Times New Roman" w:hAnsi="Times New Roman" w:cs="Times New Roman"/>
-          <w:sz w:val="36"/>
-          <w:szCs w:val="36"/>
-        </w:rPr>
-      </w:pPr>
-    </w:p>
-    <w:p>
-      <w:pPr>
-        <w:jc w:val="both"/>
-        <w:rPr>
-          <w:rFonts w:ascii="Times New Roman" w:eastAsia="Times New Roman" w:hAnsi="Times New Roman" w:cs="Times New Roman"/>
-          <w:sz w:val="36"/>
-          <w:szCs w:val="36"/>
-        </w:rPr>
-      </w:pPr>
-      <w:r>
-        <w:rPr>
-          <w:rFonts w:ascii="Times New Roman" w:eastAsia="Times New Roman" w:hAnsi="Times New Roman" w:cs="Times New Roman"/>
-          <w:sz w:val="36"/>
-          <w:szCs w:val="36"/>
-        </w:rPr>
-        <w:t>(Susán Csongor György) A zenebeküldő oldal (</w:t>
-      </w:r>
-      <w:proofErr w:type="spellStart"/>
-      <w:r>
-        <w:rPr>
-          <w:rFonts w:ascii="Times New Roman" w:eastAsia="Times New Roman" w:hAnsi="Times New Roman" w:cs="Times New Roman"/>
-          <w:sz w:val="36"/>
-          <w:szCs w:val="36"/>
-        </w:rPr>
-        <w:t>SendView</w:t>
-      </w:r>
-      <w:proofErr w:type="spellEnd"/>
-      <w:r>
-        <w:rPr>
-          <w:rFonts w:ascii="Times New Roman" w:eastAsia="Times New Roman" w:hAnsi="Times New Roman" w:cs="Times New Roman"/>
-          <w:sz w:val="36"/>
-          <w:szCs w:val="36"/>
-        </w:rPr>
-        <w:t>) újrakezdése és megalkotása validációval és működő adatbevitellel együtt.</w:t>
-      </w:r>
-    </w:p>
-    <w:p>
-      <w:pPr>
-        <w:jc w:val="both"/>
-        <w:rPr>
-          <w:rFonts w:ascii="Times New Roman" w:eastAsia="Times New Roman" w:hAnsi="Times New Roman" w:cs="Times New Roman"/>
-          <w:sz w:val="36"/>
-          <w:szCs w:val="36"/>
-        </w:rPr>
-      </w:pPr>
-      <w:r>
-        <w:rPr>
-          <w:rFonts w:ascii="Times New Roman" w:eastAsia="Times New Roman" w:hAnsi="Times New Roman" w:cs="Times New Roman"/>
-          <w:sz w:val="36"/>
-          <w:szCs w:val="36"/>
-        </w:rPr>
-        <w:t>(El-</w:t>
-      </w:r>
-      <w:proofErr w:type="spellStart"/>
-      <w:r>
-        <w:rPr>
-          <w:rFonts w:ascii="Times New Roman" w:eastAsia="Times New Roman" w:hAnsi="Times New Roman" w:cs="Times New Roman"/>
-          <w:sz w:val="36"/>
-          <w:szCs w:val="36"/>
-        </w:rPr>
-        <w:t>Nabulsy</w:t>
-      </w:r>
-      <w:proofErr w:type="spellEnd"/>
-      <w:r>
-        <w:rPr>
-          <w:rFonts w:ascii="Times New Roman" w:eastAsia="Times New Roman" w:hAnsi="Times New Roman" w:cs="Times New Roman"/>
-          <w:sz w:val="36"/>
-          <w:szCs w:val="36"/>
-        </w:rPr>
-        <w:t xml:space="preserve"> Csongor Alan) A zenebekérő oldal (</w:t>
-      </w:r>
-      <w:proofErr w:type="spellStart"/>
-      <w:r>
-        <w:rPr>
-          <w:rFonts w:ascii="Times New Roman" w:eastAsia="Times New Roman" w:hAnsi="Times New Roman" w:cs="Times New Roman"/>
-          <w:sz w:val="36"/>
-          <w:szCs w:val="36"/>
-        </w:rPr>
-        <w:t>RequestView</w:t>
-      </w:r>
-      <w:proofErr w:type="spellEnd"/>
-      <w:r>
-        <w:rPr>
-          <w:rFonts w:ascii="Times New Roman" w:eastAsia="Times New Roman" w:hAnsi="Times New Roman" w:cs="Times New Roman"/>
-          <w:sz w:val="36"/>
-          <w:szCs w:val="36"/>
-        </w:rPr>
-        <w:t>) újra elkészítése.</w:t>
+        <w:t>Átnéztük mindegyik oldalt hogy néz ki jelenleg, és a RequestView-n kellett változtatni, hogy megfeleljen a dokumentációban lévő rajznak. Továbbá összefoglaltuk hogy mennyi hiányzik még a projektből hogy teljesen kész és működő képes legyen.</w:t>
+      </w:r>
+    </w:p>
+    <w:p>
+      <w:pPr>
+        <w:jc w:val="both"/>
+        <w:rPr>
+          <w:rFonts w:ascii="Times New Roman" w:eastAsia="Times New Roman" w:hAnsi="Times New Roman" w:cs="Times New Roman"/>
+          <w:sz w:val="36"/>
+          <w:szCs w:val="36"/>
+        </w:rPr>
+      </w:pPr>
+    </w:p>
+    <w:p>
+      <w:pPr>
+        <w:jc w:val="both"/>
+        <w:rPr>
+          <w:rFonts w:ascii="Times New Roman" w:eastAsia="Times New Roman" w:hAnsi="Times New Roman" w:cs="Times New Roman"/>
+          <w:sz w:val="36"/>
+          <w:szCs w:val="36"/>
+        </w:rPr>
+      </w:pPr>
+      <w:r>
+        <w:rPr>
+          <w:rFonts w:ascii="Times New Roman" w:eastAsia="Times New Roman" w:hAnsi="Times New Roman" w:cs="Times New Roman"/>
+          <w:sz w:val="36"/>
+          <w:szCs w:val="36"/>
+        </w:rPr>
+        <w:t>(Susán Csongor György) A zenebeküldő oldal (SendView) újrakezdése és megalkotása validációval és működő adatbevitellel együtt.</w:t>
+      </w:r>
+    </w:p>
+    <w:p>
+      <w:pPr>
+        <w:jc w:val="both"/>
+        <w:rPr>
+          <w:rFonts w:ascii="Times New Roman" w:eastAsia="Times New Roman" w:hAnsi="Times New Roman" w:cs="Times New Roman"/>
+          <w:sz w:val="36"/>
+          <w:szCs w:val="36"/>
+        </w:rPr>
+      </w:pPr>
+      <w:r>
+        <w:rPr>
+          <w:rFonts w:ascii="Times New Roman" w:eastAsia="Times New Roman" w:hAnsi="Times New Roman" w:cs="Times New Roman"/>
+          <w:sz w:val="36"/>
+          <w:szCs w:val="36"/>
+        </w:rPr>
+        <w:t>(El-Nabulsy Csongor Alan) A zenebekérő oldal (RequestView) újra elkészítése.</w:t>
       </w:r>
     </w:p>
     <w:p>
@@ -5895,25 +4688,7 @@
           <w:sz w:val="36"/>
           <w:szCs w:val="36"/>
         </w:rPr>
-        <w:t>(El-</w:t>
-      </w:r>
-      <w:proofErr w:type="spellStart"/>
-      <w:r>
-        <w:rPr>
-          <w:rFonts w:ascii="Times New Roman" w:eastAsia="Times New Roman" w:hAnsi="Times New Roman" w:cs="Times New Roman"/>
-          <w:sz w:val="36"/>
-          <w:szCs w:val="36"/>
-        </w:rPr>
-        <w:t>Nabulsy</w:t>
-      </w:r>
-      <w:proofErr w:type="spellEnd"/>
-      <w:r>
-        <w:rPr>
-          <w:rFonts w:ascii="Times New Roman" w:eastAsia="Times New Roman" w:hAnsi="Times New Roman" w:cs="Times New Roman"/>
-          <w:sz w:val="36"/>
-          <w:szCs w:val="36"/>
-        </w:rPr>
-        <w:t xml:space="preserve"> Csongor Alan)</w:t>
+        <w:t>(El-Nabulsy Csongor Alan)</w:t>
       </w:r>
     </w:p>
     <w:p>
@@ -5975,25 +4750,7 @@
           <w:sz w:val="36"/>
           <w:szCs w:val="36"/>
         </w:rPr>
-        <w:t xml:space="preserve">a </w:t>
-      </w:r>
-      <w:proofErr w:type="spellStart"/>
-      <w:r>
-        <w:rPr>
-          <w:rFonts w:ascii="Times New Roman" w:eastAsia="Times New Roman" w:hAnsi="Times New Roman" w:cs="Times New Roman"/>
-          <w:sz w:val="36"/>
-          <w:szCs w:val="36"/>
-        </w:rPr>
-        <w:t>HomeLayout</w:t>
-      </w:r>
-      <w:proofErr w:type="spellEnd"/>
-      <w:r>
-        <w:rPr>
-          <w:rFonts w:ascii="Times New Roman" w:eastAsia="Times New Roman" w:hAnsi="Times New Roman" w:cs="Times New Roman"/>
-          <w:sz w:val="36"/>
-          <w:szCs w:val="36"/>
-        </w:rPr>
-        <w:t>-ba</w:t>
+        <w:t>a HomeLayout-ba</w:t>
       </w:r>
       <w:r>
         <w:rPr>
@@ -6048,25 +4805,7 @@
           <w:sz w:val="36"/>
           <w:szCs w:val="36"/>
         </w:rPr>
-        <w:t xml:space="preserve">a </w:t>
-      </w:r>
-      <w:proofErr w:type="spellStart"/>
-      <w:r>
-        <w:rPr>
-          <w:rFonts w:ascii="Times New Roman" w:eastAsia="Times New Roman" w:hAnsi="Times New Roman" w:cs="Times New Roman"/>
-          <w:sz w:val="36"/>
-          <w:szCs w:val="36"/>
-        </w:rPr>
-        <w:t>RequestVerifyView</w:t>
-      </w:r>
-      <w:proofErr w:type="spellEnd"/>
-      <w:r>
-        <w:rPr>
-          <w:rFonts w:ascii="Times New Roman" w:eastAsia="Times New Roman" w:hAnsi="Times New Roman" w:cs="Times New Roman"/>
-          <w:sz w:val="36"/>
-          <w:szCs w:val="36"/>
-        </w:rPr>
-        <w:t>-ba</w:t>
+        <w:t>a RequestVerifyView-ba</w:t>
       </w:r>
       <w:r>
         <w:rPr>
@@ -6142,133 +4881,7 @@
           <w:sz w:val="36"/>
           <w:szCs w:val="36"/>
         </w:rPr>
-        <w:t xml:space="preserve">A </w:t>
-      </w:r>
-      <w:proofErr w:type="spellStart"/>
-      <w:r>
-        <w:rPr>
-          <w:rFonts w:ascii="Times New Roman" w:eastAsia="Times New Roman" w:hAnsi="Times New Roman" w:cs="Times New Roman"/>
-          <w:sz w:val="36"/>
-          <w:szCs w:val="36"/>
-        </w:rPr>
-        <w:t>Layout-ba</w:t>
-      </w:r>
-      <w:proofErr w:type="spellEnd"/>
-      <w:r>
-        <w:rPr>
-          <w:rFonts w:ascii="Times New Roman" w:eastAsia="Times New Roman" w:hAnsi="Times New Roman" w:cs="Times New Roman"/>
-          <w:sz w:val="36"/>
-          <w:szCs w:val="36"/>
-        </w:rPr>
-        <w:t xml:space="preserve"> megírtuk a függvényt </w:t>
-      </w:r>
-      <w:proofErr w:type="spellStart"/>
-      <w:r>
-        <w:rPr>
-          <w:rFonts w:ascii="Times New Roman" w:eastAsia="Times New Roman" w:hAnsi="Times New Roman" w:cs="Times New Roman"/>
-          <w:sz w:val="36"/>
-          <w:szCs w:val="36"/>
-        </w:rPr>
-        <w:t>axios</w:t>
-      </w:r>
-      <w:proofErr w:type="spellEnd"/>
-      <w:r>
-        <w:rPr>
-          <w:rFonts w:ascii="Times New Roman" w:eastAsia="Times New Roman" w:hAnsi="Times New Roman" w:cs="Times New Roman"/>
-          <w:sz w:val="36"/>
-          <w:szCs w:val="36"/>
-        </w:rPr>
-        <w:t xml:space="preserve"> használatával, amivel majd be lesznek töltve az adatok minden </w:t>
-      </w:r>
-      <w:proofErr w:type="spellStart"/>
-      <w:r>
-        <w:rPr>
-          <w:rFonts w:ascii="Times New Roman" w:eastAsia="Times New Roman" w:hAnsi="Times New Roman" w:cs="Times New Roman"/>
-          <w:sz w:val="36"/>
-          <w:szCs w:val="36"/>
-        </w:rPr>
-        <w:t>home</w:t>
-      </w:r>
-      <w:proofErr w:type="spellEnd"/>
-      <w:r>
-        <w:rPr>
-          <w:rFonts w:ascii="Times New Roman" w:eastAsia="Times New Roman" w:hAnsi="Times New Roman" w:cs="Times New Roman"/>
-          <w:sz w:val="36"/>
-          <w:szCs w:val="36"/>
-        </w:rPr>
-        <w:t xml:space="preserve"> </w:t>
-      </w:r>
-      <w:proofErr w:type="spellStart"/>
-      <w:r>
-        <w:rPr>
-          <w:rFonts w:ascii="Times New Roman" w:eastAsia="Times New Roman" w:hAnsi="Times New Roman" w:cs="Times New Roman"/>
-          <w:sz w:val="36"/>
-          <w:szCs w:val="36"/>
-        </w:rPr>
-        <w:t>page-n</w:t>
-      </w:r>
-      <w:proofErr w:type="spellEnd"/>
-      <w:r>
-        <w:rPr>
-          <w:rFonts w:ascii="Times New Roman" w:eastAsia="Times New Roman" w:hAnsi="Times New Roman" w:cs="Times New Roman"/>
-          <w:sz w:val="36"/>
-          <w:szCs w:val="36"/>
-        </w:rPr>
-        <w:t xml:space="preserve">. Továbbá a </w:t>
-      </w:r>
-      <w:proofErr w:type="spellStart"/>
-      <w:r>
-        <w:rPr>
-          <w:rFonts w:ascii="Times New Roman" w:eastAsia="Times New Roman" w:hAnsi="Times New Roman" w:cs="Times New Roman"/>
-          <w:sz w:val="36"/>
-          <w:szCs w:val="36"/>
-        </w:rPr>
-        <w:t>SchedulerView</w:t>
-      </w:r>
-      <w:proofErr w:type="spellEnd"/>
-      <w:r>
-        <w:rPr>
-          <w:rFonts w:ascii="Times New Roman" w:eastAsia="Times New Roman" w:hAnsi="Times New Roman" w:cs="Times New Roman"/>
-          <w:sz w:val="36"/>
-          <w:szCs w:val="36"/>
-        </w:rPr>
-        <w:t xml:space="preserve"> és a </w:t>
-      </w:r>
-      <w:proofErr w:type="spellStart"/>
-      <w:r>
-        <w:rPr>
-          <w:rFonts w:ascii="Times New Roman" w:eastAsia="Times New Roman" w:hAnsi="Times New Roman" w:cs="Times New Roman"/>
-          <w:sz w:val="36"/>
-          <w:szCs w:val="36"/>
-        </w:rPr>
-        <w:t>RequestVerifyView</w:t>
-      </w:r>
-      <w:proofErr w:type="spellEnd"/>
-      <w:r>
-        <w:rPr>
-          <w:rFonts w:ascii="Times New Roman" w:eastAsia="Times New Roman" w:hAnsi="Times New Roman" w:cs="Times New Roman"/>
-          <w:sz w:val="36"/>
-          <w:szCs w:val="36"/>
-        </w:rPr>
-        <w:t xml:space="preserve"> is külön </w:t>
-      </w:r>
-      <w:proofErr w:type="spellStart"/>
-      <w:r>
-        <w:rPr>
-          <w:rFonts w:ascii="Times New Roman" w:eastAsia="Times New Roman" w:hAnsi="Times New Roman" w:cs="Times New Roman"/>
-          <w:sz w:val="36"/>
-          <w:szCs w:val="36"/>
-        </w:rPr>
-        <w:t>külön</w:t>
-      </w:r>
-      <w:proofErr w:type="spellEnd"/>
-      <w:r>
-        <w:rPr>
-          <w:rFonts w:ascii="Times New Roman" w:eastAsia="Times New Roman" w:hAnsi="Times New Roman" w:cs="Times New Roman"/>
-          <w:sz w:val="36"/>
-          <w:szCs w:val="36"/>
-        </w:rPr>
-        <w:t xml:space="preserve"> megírtuk a függvényt, de csak azokkal az adatokkal amiket szeretnénk hogy betöltsön majd.</w:t>
+        <w:t>A Layout-ba megírtuk a függvényt axios használatával, amivel majd be lesznek töltve az adatok minden home page-n. Továbbá a SchedulerView és a RequestVerifyView is külön külön megírtuk a függvényt, de csak azokkal az adatokkal amiket szeretnénk hogy betöltsön majd.</w:t>
       </w:r>
     </w:p>
     <w:p>
@@ -6362,61 +4975,7 @@
           <w:szCs w:val="36"/>
         </w:rPr>
         <w:lastRenderedPageBreak/>
-        <w:t>A műfajok (</w:t>
-      </w:r>
-      <w:proofErr w:type="spellStart"/>
-      <w:r>
-        <w:rPr>
-          <w:rFonts w:ascii="Times New Roman" w:eastAsia="Times New Roman" w:hAnsi="Times New Roman" w:cs="Times New Roman"/>
-          <w:sz w:val="36"/>
-          <w:szCs w:val="36"/>
-        </w:rPr>
-        <w:t>Genres</w:t>
-      </w:r>
-      <w:proofErr w:type="spellEnd"/>
-      <w:r>
-        <w:rPr>
-          <w:rFonts w:ascii="Times New Roman" w:eastAsia="Times New Roman" w:hAnsi="Times New Roman" w:cs="Times New Roman"/>
-          <w:sz w:val="36"/>
-          <w:szCs w:val="36"/>
-        </w:rPr>
-        <w:t xml:space="preserve">) tábla kitörlése a helyi projektből és a </w:t>
-      </w:r>
-      <w:proofErr w:type="spellStart"/>
-      <w:r>
-        <w:rPr>
-          <w:rFonts w:ascii="Times New Roman" w:eastAsia="Times New Roman" w:hAnsi="Times New Roman" w:cs="Times New Roman"/>
-          <w:sz w:val="36"/>
-          <w:szCs w:val="36"/>
-        </w:rPr>
-        <w:t>repositoryból</w:t>
-      </w:r>
-      <w:proofErr w:type="spellEnd"/>
-      <w:r>
-        <w:rPr>
-          <w:rFonts w:ascii="Times New Roman" w:eastAsia="Times New Roman" w:hAnsi="Times New Roman" w:cs="Times New Roman"/>
-          <w:sz w:val="36"/>
-          <w:szCs w:val="36"/>
-        </w:rPr>
-        <w:t xml:space="preserve">, mivel annak a szerepét már egy statikus lista vette át a </w:t>
-      </w:r>
-      <w:proofErr w:type="spellStart"/>
-      <w:r>
-        <w:rPr>
-          <w:rFonts w:ascii="Times New Roman" w:eastAsia="Times New Roman" w:hAnsi="Times New Roman" w:cs="Times New Roman"/>
-          <w:sz w:val="36"/>
-          <w:szCs w:val="36"/>
-        </w:rPr>
-        <w:t>migrationben</w:t>
-      </w:r>
-      <w:proofErr w:type="spellEnd"/>
-      <w:r>
-        <w:rPr>
-          <w:rFonts w:ascii="Times New Roman" w:eastAsia="Times New Roman" w:hAnsi="Times New Roman" w:cs="Times New Roman"/>
-          <w:sz w:val="36"/>
-          <w:szCs w:val="36"/>
-        </w:rPr>
-        <w:t>.</w:t>
+        <w:t>A műfajok (Genres) tábla kitörlése a helyi projektből és a repositoryból, mivel annak a szerepét már egy statikus lista vette át a migrationben.</w:t>
       </w:r>
     </w:p>
     <w:p>
@@ -6439,97 +4998,7 @@
           <w:sz w:val="36"/>
           <w:szCs w:val="36"/>
         </w:rPr>
-        <w:t xml:space="preserve">A bejelentkezést biztosító kód tovább írása (a </w:t>
-      </w:r>
-      <w:proofErr w:type="spellStart"/>
-      <w:r>
-        <w:rPr>
-          <w:rFonts w:ascii="Times New Roman" w:eastAsia="Times New Roman" w:hAnsi="Times New Roman" w:cs="Times New Roman"/>
-          <w:sz w:val="36"/>
-          <w:szCs w:val="36"/>
-        </w:rPr>
-        <w:t>check</w:t>
-      </w:r>
-      <w:proofErr w:type="spellEnd"/>
-      <w:r>
-        <w:rPr>
-          <w:rFonts w:ascii="Times New Roman" w:eastAsia="Times New Roman" w:hAnsi="Times New Roman" w:cs="Times New Roman"/>
-          <w:sz w:val="36"/>
-          <w:szCs w:val="36"/>
-        </w:rPr>
-        <w:t xml:space="preserve"> függvény egy már elvetett logika mentén épül, annak a tartalma ki lett ürítve, a </w:t>
-      </w:r>
-      <w:proofErr w:type="spellStart"/>
-      <w:r>
-        <w:rPr>
-          <w:rFonts w:ascii="Times New Roman" w:eastAsia="Times New Roman" w:hAnsi="Times New Roman" w:cs="Times New Roman"/>
-          <w:sz w:val="36"/>
-          <w:szCs w:val="36"/>
-        </w:rPr>
-        <w:t>WaitingView</w:t>
-      </w:r>
-      <w:proofErr w:type="spellEnd"/>
-      <w:r>
-        <w:rPr>
-          <w:rFonts w:ascii="Times New Roman" w:eastAsia="Times New Roman" w:hAnsi="Times New Roman" w:cs="Times New Roman"/>
-          <w:sz w:val="36"/>
-          <w:szCs w:val="36"/>
-        </w:rPr>
-        <w:t xml:space="preserve"> beépítve a </w:t>
-      </w:r>
-      <w:proofErr w:type="spellStart"/>
-      <w:r>
-        <w:rPr>
-          <w:rFonts w:ascii="Times New Roman" w:eastAsia="Times New Roman" w:hAnsi="Times New Roman" w:cs="Times New Roman"/>
-          <w:sz w:val="36"/>
-          <w:szCs w:val="36"/>
-        </w:rPr>
-        <w:t>routingba</w:t>
-      </w:r>
-      <w:proofErr w:type="spellEnd"/>
-      <w:r>
-        <w:rPr>
-          <w:rFonts w:ascii="Times New Roman" w:eastAsia="Times New Roman" w:hAnsi="Times New Roman" w:cs="Times New Roman"/>
-          <w:sz w:val="36"/>
-          <w:szCs w:val="36"/>
-        </w:rPr>
-        <w:t xml:space="preserve">, emellett egy </w:t>
-      </w:r>
-      <w:proofErr w:type="spellStart"/>
-      <w:r>
-        <w:rPr>
-          <w:rFonts w:ascii="Times New Roman" w:eastAsia="Times New Roman" w:hAnsi="Times New Roman" w:cs="Times New Roman"/>
-          <w:sz w:val="36"/>
-          <w:szCs w:val="36"/>
-        </w:rPr>
-        <w:t>autentikáció</w:t>
-      </w:r>
-      <w:proofErr w:type="spellEnd"/>
-      <w:r>
-        <w:rPr>
-          <w:rFonts w:ascii="Times New Roman" w:eastAsia="Times New Roman" w:hAnsi="Times New Roman" w:cs="Times New Roman"/>
-          <w:sz w:val="36"/>
-          <w:szCs w:val="36"/>
-        </w:rPr>
-        <w:t xml:space="preserve"> alapján elérhetőséget eldöntő logika a router </w:t>
-      </w:r>
-      <w:proofErr w:type="spellStart"/>
-      <w:r>
-        <w:rPr>
-          <w:rFonts w:ascii="Times New Roman" w:eastAsia="Times New Roman" w:hAnsi="Times New Roman" w:cs="Times New Roman"/>
-          <w:sz w:val="36"/>
-          <w:szCs w:val="36"/>
-        </w:rPr>
-        <w:t>guardban</w:t>
-      </w:r>
-      <w:proofErr w:type="spellEnd"/>
-      <w:r>
-        <w:rPr>
-          <w:rFonts w:ascii="Times New Roman" w:eastAsia="Times New Roman" w:hAnsi="Times New Roman" w:cs="Times New Roman"/>
-          <w:sz w:val="36"/>
-          <w:szCs w:val="36"/>
-        </w:rPr>
-        <w:t>, ami még egyelőre nem működik)</w:t>
+        <w:t>A bejelentkezést biztosító kód tovább írása (a check függvény egy már elvetett logika mentén épül, annak a tartalma ki lett ürítve, a WaitingView beépítve a routingba, emellett egy autentikáció alapján elérhetőséget eldöntő logika a router guardban, ami még egyelőre nem működik)</w:t>
       </w:r>
       <w:r>
         <w:rPr>
@@ -6568,43 +5037,7 @@
           <w:sz w:val="36"/>
           <w:szCs w:val="36"/>
         </w:rPr>
-        <w:t xml:space="preserve"> (</w:t>
-      </w:r>
-      <w:proofErr w:type="spellStart"/>
-      <w:r>
-        <w:rPr>
-          <w:rFonts w:ascii="Times New Roman" w:eastAsia="Times New Roman" w:hAnsi="Times New Roman" w:cs="Times New Roman"/>
-          <w:sz w:val="36"/>
-          <w:szCs w:val="36"/>
-        </w:rPr>
-        <w:t>RequestView</w:t>
-      </w:r>
-      <w:proofErr w:type="spellEnd"/>
-      <w:r>
-        <w:rPr>
-          <w:rFonts w:ascii="Times New Roman" w:eastAsia="Times New Roman" w:hAnsi="Times New Roman" w:cs="Times New Roman"/>
-          <w:sz w:val="36"/>
-          <w:szCs w:val="36"/>
-        </w:rPr>
-        <w:t xml:space="preserve">, </w:t>
-      </w:r>
-      <w:proofErr w:type="spellStart"/>
-      <w:r>
-        <w:rPr>
-          <w:rFonts w:ascii="Times New Roman" w:eastAsia="Times New Roman" w:hAnsi="Times New Roman" w:cs="Times New Roman"/>
-          <w:sz w:val="36"/>
-          <w:szCs w:val="36"/>
-        </w:rPr>
-        <w:t>RequestVerifyView</w:t>
-      </w:r>
-      <w:proofErr w:type="spellEnd"/>
-      <w:r>
-        <w:rPr>
-          <w:rFonts w:ascii="Times New Roman" w:eastAsia="Times New Roman" w:hAnsi="Times New Roman" w:cs="Times New Roman"/>
-          <w:sz w:val="36"/>
-          <w:szCs w:val="36"/>
-        </w:rPr>
-        <w:t>)</w:t>
+        <w:t xml:space="preserve"> (RequestView, RequestVerifyView)</w:t>
       </w:r>
       <w:r>
         <w:rPr>
@@ -6620,25 +5053,7 @@
           <w:sz w:val="36"/>
           <w:szCs w:val="36"/>
         </w:rPr>
-        <w:t>hez szükséges komponensek (</w:t>
-      </w:r>
-      <w:proofErr w:type="spellStart"/>
-      <w:r>
-        <w:rPr>
-          <w:rFonts w:ascii="Times New Roman" w:eastAsia="Times New Roman" w:hAnsi="Times New Roman" w:cs="Times New Roman"/>
-          <w:sz w:val="36"/>
-          <w:szCs w:val="36"/>
-        </w:rPr>
-        <w:t>RequestableMusicRow</w:t>
-      </w:r>
-      <w:proofErr w:type="spellEnd"/>
-      <w:r>
-        <w:rPr>
-          <w:rFonts w:ascii="Times New Roman" w:eastAsia="Times New Roman" w:hAnsi="Times New Roman" w:cs="Times New Roman"/>
-          <w:sz w:val="36"/>
-          <w:szCs w:val="36"/>
-        </w:rPr>
-        <w:t xml:space="preserve">) </w:t>
+        <w:t xml:space="preserve">hez szükséges komponensek (RequestableMusicRow) </w:t>
       </w:r>
       <w:r>
         <w:rPr>
@@ -6698,25 +5113,7 @@
           <w:sz w:val="36"/>
           <w:szCs w:val="36"/>
         </w:rPr>
-        <w:t>El-</w:t>
-      </w:r>
-      <w:proofErr w:type="spellStart"/>
-      <w:r>
-        <w:rPr>
-          <w:rFonts w:ascii="Times New Roman" w:eastAsia="Times New Roman" w:hAnsi="Times New Roman" w:cs="Times New Roman"/>
-          <w:sz w:val="36"/>
-          <w:szCs w:val="36"/>
-        </w:rPr>
-        <w:t>Nabulsy</w:t>
-      </w:r>
-      <w:proofErr w:type="spellEnd"/>
-      <w:r>
-        <w:rPr>
-          <w:rFonts w:ascii="Times New Roman" w:eastAsia="Times New Roman" w:hAnsi="Times New Roman" w:cs="Times New Roman"/>
-          <w:sz w:val="36"/>
-          <w:szCs w:val="36"/>
-        </w:rPr>
-        <w:t xml:space="preserve"> Csongor Alan</w:t>
+        <w:t>El-Nabulsy Csongor Alan</w:t>
       </w:r>
       <w:r>
         <w:rPr>
@@ -6786,36 +5183,8 @@
           <w:sz w:val="36"/>
           <w:szCs w:val="36"/>
         </w:rPr>
-        <w:t xml:space="preserve">Elkészült a </w:t>
-      </w:r>
-      <w:proofErr w:type="spellStart"/>
-      <w:r>
-        <w:rPr>
-          <w:rFonts w:ascii="Times New Roman" w:eastAsia="Times New Roman" w:hAnsi="Times New Roman" w:cs="Times New Roman"/>
-          <w:sz w:val="36"/>
-          <w:szCs w:val="36"/>
-        </w:rPr>
-        <w:t>RequestedMusicController</w:t>
-      </w:r>
-      <w:proofErr w:type="spellEnd"/>
-      <w:r>
-        <w:rPr>
-          <w:rFonts w:ascii="Times New Roman" w:eastAsia="Times New Roman" w:hAnsi="Times New Roman" w:cs="Times New Roman"/>
-          <w:sz w:val="36"/>
-          <w:szCs w:val="36"/>
-        </w:rPr>
-        <w:t xml:space="preserve"> és az </w:t>
-      </w:r>
-      <w:proofErr w:type="spellStart"/>
-      <w:r>
-        <w:rPr>
-          <w:rFonts w:ascii="Times New Roman" w:eastAsia="Times New Roman" w:hAnsi="Times New Roman" w:cs="Times New Roman"/>
-          <w:sz w:val="36"/>
-          <w:szCs w:val="36"/>
-        </w:rPr>
-        <w:t>AcceptedMusicController</w:t>
-      </w:r>
-      <w:proofErr w:type="spellEnd"/>
+        <w:t>Elkészült a RequestedMusicController és az AcceptedMusicController</w:t>
+      </w:r>
     </w:p>
     <w:p>
       <w:pPr>
@@ -6866,9 +5235,8 @@
           <w:lang w:eastAsia="hu-HU"/>
           <w14:ligatures w14:val="none"/>
         </w:rPr>
-        <w:t xml:space="preserve">Összegyűjtöttük hogy nagyrészben mik nem működnek, kellenek még ahhoz hogy </w:t>
-      </w:r>
-      <w:proofErr w:type="spellStart"/>
+        <w:t xml:space="preserve">Összegyűjtöttük hogy nagyrészben mik nem működnek, kellenek még ahhoz hogy működjön az oldal, elkészítettem azt </w:t>
+      </w:r>
       <w:r>
         <w:rPr>
           <w:rFonts w:ascii="Times New Roman" w:eastAsia="Times New Roman" w:hAnsi="Times New Roman" w:cs="Times New Roman"/>
@@ -6877,9 +5245,9 @@
           <w:lang w:eastAsia="hu-HU"/>
           <w14:ligatures w14:val="none"/>
         </w:rPr>
-        <w:t>működjön</w:t>
-      </w:r>
-      <w:proofErr w:type="spellEnd"/>
+        <w:lastRenderedPageBreak/>
+        <w:t>a részt hogy most</w:t>
+      </w:r>
       <w:r>
         <w:rPr>
           <w:rFonts w:ascii="Times New Roman" w:eastAsia="Times New Roman" w:hAnsi="Times New Roman" w:cs="Times New Roman"/>
@@ -6888,7 +5256,7 @@
           <w:lang w:eastAsia="hu-HU"/>
           <w14:ligatures w14:val="none"/>
         </w:rPr>
-        <w:t xml:space="preserve"> az oldal, elkészítettem azt </w:t>
+        <w:t xml:space="preserve"> </w:t>
       </w:r>
       <w:r>
         <w:rPr>
@@ -6898,27 +5266,6 @@
           <w:lang w:eastAsia="hu-HU"/>
           <w14:ligatures w14:val="none"/>
         </w:rPr>
-        <w:lastRenderedPageBreak/>
-        <w:t>a részt hogy most</w:t>
-      </w:r>
-      <w:r>
-        <w:rPr>
-          <w:rFonts w:ascii="Times New Roman" w:eastAsia="Times New Roman" w:hAnsi="Times New Roman" w:cs="Times New Roman"/>
-          <w:kern w:val="0"/>
-          <w:sz w:val="36"/>
-          <w:lang w:eastAsia="hu-HU"/>
-          <w14:ligatures w14:val="none"/>
-        </w:rPr>
-        <w:t xml:space="preserve"> </w:t>
-      </w:r>
-      <w:r>
-        <w:rPr>
-          <w:rFonts w:ascii="Times New Roman" w:eastAsia="Times New Roman" w:hAnsi="Times New Roman" w:cs="Times New Roman"/>
-          <w:kern w:val="0"/>
-          <w:sz w:val="36"/>
-          <w:lang w:eastAsia="hu-HU"/>
-          <w14:ligatures w14:val="none"/>
-        </w:rPr>
         <w:t>már a rendezői felületen megjelennek az adatok, és az oszlopokból be lehet rakni a lejátszási listába, a lejátszási listában pedig lehet rendezni a számokat, vagy törölni onnan őket. Elkezdtem a kereső bár megcsinálni, viszont nem akart betölteni az oldal ezért mára feladtam, majd holnap neki ülök újra. Továbbá teszteltük az oldalak működését, a legtöbb helyen már betöltöttek és úgy működik az oldal ahogy az meglett tervezve.</w:t>
       </w:r>
     </w:p>
@@ -6977,25 +5324,7 @@
           <w:sz w:val="36"/>
           <w:szCs w:val="36"/>
         </w:rPr>
-        <w:t>El-</w:t>
-      </w:r>
-      <w:proofErr w:type="spellStart"/>
-      <w:r>
-        <w:rPr>
-          <w:rFonts w:ascii="Times New Roman" w:eastAsia="Times New Roman" w:hAnsi="Times New Roman" w:cs="Times New Roman"/>
-          <w:sz w:val="36"/>
-          <w:szCs w:val="36"/>
-        </w:rPr>
-        <w:t>Nabulsy</w:t>
-      </w:r>
-      <w:proofErr w:type="spellEnd"/>
-      <w:r>
-        <w:rPr>
-          <w:rFonts w:ascii="Times New Roman" w:eastAsia="Times New Roman" w:hAnsi="Times New Roman" w:cs="Times New Roman"/>
-          <w:sz w:val="36"/>
-          <w:szCs w:val="36"/>
-        </w:rPr>
-        <w:t xml:space="preserve"> Csongor Alan</w:t>
+        <w:t>El-Nabulsy Csongor Alan</w:t>
       </w:r>
       <w:r>
         <w:rPr>
@@ -7026,60 +5355,23 @@
           <w:sz w:val="36"/>
           <w:szCs w:val="36"/>
         </w:rPr>
-        <w:t xml:space="preserve">Nem jelenik meg az </w:t>
-      </w:r>
-      <w:proofErr w:type="spellStart"/>
-      <w:r>
-        <w:rPr>
-          <w:rFonts w:ascii="Times New Roman" w:eastAsia="Times New Roman" w:hAnsi="Times New Roman" w:cs="Times New Roman"/>
-          <w:sz w:val="36"/>
-          <w:szCs w:val="36"/>
-        </w:rPr>
-        <w:t>url-ben</w:t>
-      </w:r>
-      <w:proofErr w:type="spellEnd"/>
-      <w:r>
-        <w:rPr>
-          <w:rFonts w:ascii="Times New Roman" w:eastAsia="Times New Roman" w:hAnsi="Times New Roman" w:cs="Times New Roman"/>
-          <w:sz w:val="36"/>
-          <w:szCs w:val="36"/>
-        </w:rPr>
-        <w:t xml:space="preserve"> a</w:t>
-      </w:r>
-      <w:r>
-        <w:rPr>
-          <w:rFonts w:ascii="Times New Roman" w:eastAsia="Times New Roman" w:hAnsi="Times New Roman" w:cs="Times New Roman"/>
-          <w:sz w:val="36"/>
-          <w:szCs w:val="36"/>
-        </w:rPr>
-        <w:t xml:space="preserve"> </w:t>
-      </w:r>
-      <w:proofErr w:type="spellStart"/>
-      <w:r>
-        <w:rPr>
-          <w:rFonts w:ascii="Times New Roman" w:eastAsia="Times New Roman" w:hAnsi="Times New Roman" w:cs="Times New Roman"/>
-          <w:sz w:val="36"/>
-          <w:szCs w:val="36"/>
-        </w:rPr>
-        <w:t>user</w:t>
-      </w:r>
-      <w:proofErr w:type="spellEnd"/>
-      <w:r>
-        <w:rPr>
-          <w:rFonts w:ascii="Times New Roman" w:eastAsia="Times New Roman" w:hAnsi="Times New Roman" w:cs="Times New Roman"/>
-          <w:sz w:val="36"/>
-          <w:szCs w:val="36"/>
-        </w:rPr>
-        <w:t xml:space="preserve"> felhasználóneve és </w:t>
-      </w:r>
-      <w:proofErr w:type="spellStart"/>
-      <w:r>
-        <w:rPr>
-          <w:rFonts w:ascii="Times New Roman" w:eastAsia="Times New Roman" w:hAnsi="Times New Roman" w:cs="Times New Roman"/>
-          <w:sz w:val="36"/>
-          <w:szCs w:val="36"/>
-        </w:rPr>
-        <w:t>jelsz</w:t>
+        <w:t>Nem jelenik meg az url-ben a</w:t>
+      </w:r>
+      <w:r>
+        <w:rPr>
+          <w:rFonts w:ascii="Times New Roman" w:eastAsia="Times New Roman" w:hAnsi="Times New Roman" w:cs="Times New Roman"/>
+          <w:sz w:val="36"/>
+          <w:szCs w:val="36"/>
+        </w:rPr>
+        <w:t xml:space="preserve"> user</w:t>
+      </w:r>
+      <w:r>
+        <w:rPr>
+          <w:rFonts w:ascii="Times New Roman" w:eastAsia="Times New Roman" w:hAnsi="Times New Roman" w:cs="Times New Roman"/>
+          <w:sz w:val="36"/>
+          <w:szCs w:val="36"/>
+        </w:rPr>
+        <w:t xml:space="preserve"> felhasználóneve és jelsz</w:t>
       </w:r>
       <w:r>
         <w:rPr>
@@ -7089,7 +5381,6 @@
         </w:rPr>
         <w:t>ava</w:t>
       </w:r>
-      <w:proofErr w:type="spellEnd"/>
       <w:r>
         <w:rPr>
           <w:rFonts w:ascii="Times New Roman" w:eastAsia="Times New Roman" w:hAnsi="Times New Roman" w:cs="Times New Roman"/>
@@ -7135,25 +5426,7 @@
           <w:sz w:val="36"/>
           <w:szCs w:val="36"/>
         </w:rPr>
-        <w:t xml:space="preserve"> után átdob a </w:t>
-      </w:r>
-      <w:proofErr w:type="spellStart"/>
-      <w:r>
-        <w:rPr>
-          <w:rFonts w:ascii="Times New Roman" w:eastAsia="Times New Roman" w:hAnsi="Times New Roman" w:cs="Times New Roman"/>
-          <w:sz w:val="36"/>
-          <w:szCs w:val="36"/>
-        </w:rPr>
-        <w:t>waiting</w:t>
-      </w:r>
-      <w:proofErr w:type="spellEnd"/>
-      <w:r>
-        <w:rPr>
-          <w:rFonts w:ascii="Times New Roman" w:eastAsia="Times New Roman" w:hAnsi="Times New Roman" w:cs="Times New Roman"/>
-          <w:sz w:val="36"/>
-          <w:szCs w:val="36"/>
-        </w:rPr>
-        <w:t xml:space="preserve"> oldalra,</w:t>
+        <w:t xml:space="preserve"> után átdob a waiting oldalra,</w:t>
       </w:r>
     </w:p>
     <w:p>
@@ -7186,41 +5459,13 @@
         </w:rPr>
         <w:t xml:space="preserve"> </w:t>
       </w:r>
-      <w:proofErr w:type="spellStart"/>
-      <w:r>
-        <w:rPr>
-          <w:rFonts w:ascii="Times New Roman" w:eastAsia="Times New Roman" w:hAnsi="Times New Roman" w:cs="Times New Roman"/>
-          <w:sz w:val="36"/>
-          <w:szCs w:val="36"/>
-        </w:rPr>
-        <w:t>pending</w:t>
-      </w:r>
-      <w:proofErr w:type="spellEnd"/>
-      <w:r>
-        <w:rPr>
-          <w:rFonts w:ascii="Times New Roman" w:eastAsia="Times New Roman" w:hAnsi="Times New Roman" w:cs="Times New Roman"/>
-          <w:sz w:val="36"/>
-          <w:szCs w:val="36"/>
-        </w:rPr>
-        <w:t xml:space="preserve"> </w:t>
-      </w:r>
-      <w:proofErr w:type="spellStart"/>
-      <w:r>
-        <w:rPr>
-          <w:rFonts w:ascii="Times New Roman" w:eastAsia="Times New Roman" w:hAnsi="Times New Roman" w:cs="Times New Roman"/>
-          <w:sz w:val="36"/>
-          <w:szCs w:val="36"/>
-        </w:rPr>
-        <w:t>user</w:t>
-      </w:r>
-      <w:proofErr w:type="spellEnd"/>
-      <w:r>
-        <w:rPr>
-          <w:rFonts w:ascii="Times New Roman" w:eastAsia="Times New Roman" w:hAnsi="Times New Roman" w:cs="Times New Roman"/>
-          <w:sz w:val="36"/>
-          <w:szCs w:val="36"/>
-        </w:rPr>
-        <w:t>-ek megjelenítése</w:t>
+      <w:r>
+        <w:rPr>
+          <w:rFonts w:ascii="Times New Roman" w:eastAsia="Times New Roman" w:hAnsi="Times New Roman" w:cs="Times New Roman"/>
+          <w:sz w:val="36"/>
+          <w:szCs w:val="36"/>
+        </w:rPr>
+        <w:t>pending user-ek megjelenítése</w:t>
       </w:r>
     </w:p>
     <w:p>
@@ -7237,41 +5482,13 @@
           <w:szCs w:val="36"/>
         </w:rPr>
       </w:pPr>
-      <w:proofErr w:type="spellStart"/>
-      <w:r>
-        <w:rPr>
-          <w:rFonts w:ascii="Times New Roman" w:eastAsia="Times New Roman" w:hAnsi="Times New Roman" w:cs="Times New Roman"/>
-          <w:sz w:val="36"/>
-          <w:szCs w:val="36"/>
-        </w:rPr>
-        <w:t>Pending</w:t>
-      </w:r>
-      <w:proofErr w:type="spellEnd"/>
-      <w:r>
-        <w:rPr>
-          <w:rFonts w:ascii="Times New Roman" w:eastAsia="Times New Roman" w:hAnsi="Times New Roman" w:cs="Times New Roman"/>
-          <w:sz w:val="36"/>
-          <w:szCs w:val="36"/>
-        </w:rPr>
-        <w:t xml:space="preserve"> </w:t>
-      </w:r>
-      <w:proofErr w:type="spellStart"/>
-      <w:r>
-        <w:rPr>
-          <w:rFonts w:ascii="Times New Roman" w:eastAsia="Times New Roman" w:hAnsi="Times New Roman" w:cs="Times New Roman"/>
-          <w:sz w:val="36"/>
-          <w:szCs w:val="36"/>
-        </w:rPr>
-        <w:t>user</w:t>
-      </w:r>
-      <w:proofErr w:type="spellEnd"/>
-      <w:r>
-        <w:rPr>
-          <w:rFonts w:ascii="Times New Roman" w:eastAsia="Times New Roman" w:hAnsi="Times New Roman" w:cs="Times New Roman"/>
-          <w:sz w:val="36"/>
-          <w:szCs w:val="36"/>
-        </w:rPr>
-        <w:t>-ek megjelennek</w:t>
+      <w:r>
+        <w:rPr>
+          <w:rFonts w:ascii="Times New Roman" w:eastAsia="Times New Roman" w:hAnsi="Times New Roman" w:cs="Times New Roman"/>
+          <w:sz w:val="36"/>
+          <w:szCs w:val="36"/>
+        </w:rPr>
+        <w:t>Pending user-ek megjelennek</w:t>
       </w:r>
     </w:p>
     <w:p>
@@ -7407,25 +5624,7 @@
           <w:sz w:val="36"/>
           <w:szCs w:val="36"/>
         </w:rPr>
-        <w:t>(El-</w:t>
-      </w:r>
-      <w:proofErr w:type="spellStart"/>
-      <w:r>
-        <w:rPr>
-          <w:rFonts w:ascii="Times New Roman" w:eastAsia="Times New Roman" w:hAnsi="Times New Roman" w:cs="Times New Roman"/>
-          <w:sz w:val="36"/>
-          <w:szCs w:val="36"/>
-        </w:rPr>
-        <w:t>Nabulsy</w:t>
-      </w:r>
-      <w:proofErr w:type="spellEnd"/>
-      <w:r>
-        <w:rPr>
-          <w:rFonts w:ascii="Times New Roman" w:eastAsia="Times New Roman" w:hAnsi="Times New Roman" w:cs="Times New Roman"/>
-          <w:sz w:val="36"/>
-          <w:szCs w:val="36"/>
-        </w:rPr>
-        <w:t xml:space="preserve"> Csongor Alan)</w:t>
+        <w:t>(El-Nabulsy Csongor Alan)</w:t>
       </w:r>
     </w:p>
     <w:p>
@@ -7442,23 +5641,13 @@
           <w:szCs w:val="36"/>
         </w:rPr>
       </w:pPr>
-      <w:proofErr w:type="spellStart"/>
-      <w:r>
-        <w:rPr>
-          <w:rFonts w:ascii="Times New Roman" w:eastAsia="Times New Roman" w:hAnsi="Times New Roman" w:cs="Times New Roman"/>
-          <w:sz w:val="36"/>
-          <w:szCs w:val="36"/>
-        </w:rPr>
-        <w:t>Scheduler</w:t>
-      </w:r>
-      <w:proofErr w:type="spellEnd"/>
-      <w:r>
-        <w:rPr>
-          <w:rFonts w:ascii="Times New Roman" w:eastAsia="Times New Roman" w:hAnsi="Times New Roman" w:cs="Times New Roman"/>
-          <w:sz w:val="36"/>
-          <w:szCs w:val="36"/>
-        </w:rPr>
-        <w:t>-nél az oszlopokban az jelenik meg aminek kell, a kereső bár rendesen működik</w:t>
+      <w:r>
+        <w:rPr>
+          <w:rFonts w:ascii="Times New Roman" w:eastAsia="Times New Roman" w:hAnsi="Times New Roman" w:cs="Times New Roman"/>
+          <w:sz w:val="36"/>
+          <w:szCs w:val="36"/>
+        </w:rPr>
+        <w:t>Scheduler-nél az oszlopokban az jelenik meg aminek kell, a kereső bár rendesen működik</w:t>
       </w:r>
     </w:p>
     <w:p>
@@ -7685,61 +5874,7 @@
           <w:sz w:val="36"/>
           <w:szCs w:val="36"/>
         </w:rPr>
-        <w:t xml:space="preserve"> /</w:t>
-      </w:r>
-      <w:proofErr w:type="spellStart"/>
-      <w:r>
-        <w:rPr>
-          <w:rFonts w:ascii="Times New Roman" w:eastAsia="Times New Roman" w:hAnsi="Times New Roman" w:cs="Times New Roman"/>
-          <w:sz w:val="36"/>
-          <w:szCs w:val="36"/>
-        </w:rPr>
-        <w:t>admin-ról</w:t>
-      </w:r>
-      <w:proofErr w:type="spellEnd"/>
-      <w:r>
-        <w:rPr>
-          <w:rFonts w:ascii="Times New Roman" w:eastAsia="Times New Roman" w:hAnsi="Times New Roman" w:cs="Times New Roman"/>
-          <w:sz w:val="36"/>
-          <w:szCs w:val="36"/>
-        </w:rPr>
-        <w:t xml:space="preserve"> /</w:t>
-      </w:r>
-      <w:proofErr w:type="spellStart"/>
-      <w:r>
-        <w:rPr>
-          <w:rFonts w:ascii="Times New Roman" w:eastAsia="Times New Roman" w:hAnsi="Times New Roman" w:cs="Times New Roman"/>
-          <w:sz w:val="36"/>
-          <w:szCs w:val="36"/>
-        </w:rPr>
-        <w:t>scheduler</w:t>
-      </w:r>
-      <w:proofErr w:type="spellEnd"/>
-      <w:r>
-        <w:rPr>
-          <w:rFonts w:ascii="Times New Roman" w:eastAsia="Times New Roman" w:hAnsi="Times New Roman" w:cs="Times New Roman"/>
-          <w:sz w:val="36"/>
-          <w:szCs w:val="36"/>
-        </w:rPr>
-        <w:t>/</w:t>
-      </w:r>
-      <w:proofErr w:type="spellStart"/>
-      <w:r>
-        <w:rPr>
-          <w:rFonts w:ascii="Times New Roman" w:eastAsia="Times New Roman" w:hAnsi="Times New Roman" w:cs="Times New Roman"/>
-          <w:sz w:val="36"/>
-          <w:szCs w:val="36"/>
-        </w:rPr>
-        <w:t>check</w:t>
-      </w:r>
-      <w:proofErr w:type="spellEnd"/>
-      <w:r>
-        <w:rPr>
-          <w:rFonts w:ascii="Times New Roman" w:eastAsia="Times New Roman" w:hAnsi="Times New Roman" w:cs="Times New Roman"/>
-          <w:sz w:val="36"/>
-          <w:szCs w:val="36"/>
-        </w:rPr>
-        <w:t>-re (eredetileg ez az adminisztrátorok feladata lett volna, de ez korábban megváltozott).</w:t>
+        <w:t xml:space="preserve"> /admin-ról /scheduler/check-re (eredetileg ez az adminisztrátorok feladata lett volna, de ez korábban megváltozott).</w:t>
       </w:r>
     </w:p>
     <w:p>
@@ -7845,25 +5980,7 @@
           <w:sz w:val="36"/>
           <w:szCs w:val="36"/>
         </w:rPr>
-        <w:t>(El-</w:t>
-      </w:r>
-      <w:proofErr w:type="spellStart"/>
-      <w:r>
-        <w:rPr>
-          <w:rFonts w:ascii="Times New Roman" w:eastAsia="Times New Roman" w:hAnsi="Times New Roman" w:cs="Times New Roman"/>
-          <w:sz w:val="36"/>
-          <w:szCs w:val="36"/>
-        </w:rPr>
-        <w:t>Nabulsy</w:t>
-      </w:r>
-      <w:proofErr w:type="spellEnd"/>
-      <w:r>
-        <w:rPr>
-          <w:rFonts w:ascii="Times New Roman" w:eastAsia="Times New Roman" w:hAnsi="Times New Roman" w:cs="Times New Roman"/>
-          <w:sz w:val="36"/>
-          <w:szCs w:val="36"/>
-        </w:rPr>
-        <w:t xml:space="preserve"> Csongor Alan)</w:t>
+        <w:t>(El-Nabulsy Csongor Alan)</w:t>
       </w:r>
     </w:p>
     <w:p>
@@ -7975,8 +6092,6 @@
         </w:rPr>
         <w:t>15:25</w:t>
       </w:r>
-      <w:bookmarkStart w:id="0" w:name="_GoBack"/>
-      <w:bookmarkEnd w:id="0"/>
     </w:p>
     <w:p>
       <w:pPr>
@@ -8022,25 +6137,7 @@
           <w:sz w:val="36"/>
           <w:szCs w:val="36"/>
         </w:rPr>
-        <w:t>Bejelentkezés (</w:t>
-      </w:r>
-      <w:proofErr w:type="spellStart"/>
-      <w:r>
-        <w:rPr>
-          <w:rFonts w:ascii="Times New Roman" w:eastAsia="Times New Roman" w:hAnsi="Times New Roman" w:cs="Times New Roman"/>
-          <w:sz w:val="36"/>
-          <w:szCs w:val="36"/>
-        </w:rPr>
-        <w:t>autentikáció</w:t>
-      </w:r>
-      <w:proofErr w:type="spellEnd"/>
-      <w:r>
-        <w:rPr>
-          <w:rFonts w:ascii="Times New Roman" w:eastAsia="Times New Roman" w:hAnsi="Times New Roman" w:cs="Times New Roman"/>
-          <w:sz w:val="36"/>
-          <w:szCs w:val="36"/>
-        </w:rPr>
-        <w:t xml:space="preserve"> még nem!) kivitelezése</w:t>
+        <w:t>Bejelentkezés (autentikáció még nem!) kivitelezése</w:t>
       </w:r>
     </w:p>
     <w:p>
@@ -8087,6 +6184,176 @@
           <w:szCs w:val="36"/>
         </w:rPr>
         <w:t>Bekért zenék üzeneteinek lekérésére lehetőség adása</w:t>
+      </w:r>
+    </w:p>
+    <w:p>
+      <w:pPr>
+        <w:jc w:val="both"/>
+        <w:rPr>
+          <w:rFonts w:ascii="Times New Roman" w:eastAsia="Times New Roman" w:hAnsi="Times New Roman" w:cs="Times New Roman"/>
+          <w:sz w:val="36"/>
+          <w:szCs w:val="36"/>
+        </w:rPr>
+      </w:pPr>
+    </w:p>
+    <w:p>
+      <w:pPr>
+        <w:jc w:val="both"/>
+        <w:rPr>
+          <w:rFonts w:ascii="Times New Roman" w:eastAsia="Times New Roman" w:hAnsi="Times New Roman" w:cs="Times New Roman"/>
+          <w:b/>
+          <w:bCs/>
+          <w:sz w:val="40"/>
+          <w:szCs w:val="40"/>
+        </w:rPr>
+      </w:pPr>
+      <w:r>
+        <w:rPr>
+          <w:rFonts w:ascii="Times New Roman" w:eastAsia="Times New Roman" w:hAnsi="Times New Roman" w:cs="Times New Roman"/>
+          <w:b/>
+          <w:bCs/>
+          <w:sz w:val="40"/>
+          <w:szCs w:val="40"/>
+        </w:rPr>
+        <w:t>2026-04-24 16:45-20:15</w:t>
+      </w:r>
+    </w:p>
+    <w:p>
+      <w:pPr>
+        <w:jc w:val="both"/>
+        <w:rPr>
+          <w:rFonts w:ascii="Times New Roman" w:eastAsia="Times New Roman" w:hAnsi="Times New Roman" w:cs="Times New Roman"/>
+          <w:sz w:val="36"/>
+          <w:szCs w:val="36"/>
+        </w:rPr>
+      </w:pPr>
+      <w:r>
+        <w:rPr>
+          <w:rFonts w:ascii="Times New Roman" w:eastAsia="Times New Roman" w:hAnsi="Times New Roman" w:cs="Times New Roman"/>
+          <w:sz w:val="36"/>
+          <w:szCs w:val="36"/>
+        </w:rPr>
+        <w:t>(Susán Csongor György)</w:t>
+      </w:r>
+    </w:p>
+    <w:p>
+      <w:pPr>
+        <w:pStyle w:val="Listaszerbekezds"/>
+        <w:numPr>
+          <w:ilvl w:val="0"/>
+          <w:numId w:val="22"/>
+        </w:numPr>
+        <w:jc w:val="both"/>
+        <w:rPr>
+          <w:rFonts w:ascii="Times New Roman" w:eastAsia="Times New Roman" w:hAnsi="Times New Roman" w:cs="Times New Roman"/>
+          <w:sz w:val="36"/>
+          <w:szCs w:val="36"/>
+        </w:rPr>
+      </w:pPr>
+      <w:r>
+        <w:rPr>
+          <w:rFonts w:ascii="Times New Roman" w:eastAsia="Times New Roman" w:hAnsi="Times New Roman" w:cs="Times New Roman"/>
+          <w:sz w:val="36"/>
+          <w:szCs w:val="36"/>
+        </w:rPr>
+        <w:t>A felhasználói dokumentációban leírtak (amit El-Nabulsy készített) elrendezése.</w:t>
+      </w:r>
+    </w:p>
+    <w:p>
+      <w:pPr>
+        <w:pStyle w:val="Listaszerbekezds"/>
+        <w:numPr>
+          <w:ilvl w:val="0"/>
+          <w:numId w:val="22"/>
+        </w:numPr>
+        <w:jc w:val="both"/>
+        <w:rPr>
+          <w:rFonts w:ascii="Times New Roman" w:eastAsia="Times New Roman" w:hAnsi="Times New Roman" w:cs="Times New Roman"/>
+          <w:sz w:val="36"/>
+          <w:szCs w:val="36"/>
+        </w:rPr>
+      </w:pPr>
+      <w:r>
+        <w:rPr>
+          <w:rFonts w:ascii="Times New Roman" w:eastAsia="Times New Roman" w:hAnsi="Times New Roman" w:cs="Times New Roman"/>
+          <w:sz w:val="36"/>
+          <w:szCs w:val="36"/>
+        </w:rPr>
+        <w:t>A bejelentkezés és regisztráció jelszó mezőkhöz egy, az elfedést kattintásra feloldó és újra lezáró gomb hozzáadása (hogy a jelszó helyességét ellenőrizni lehessen)</w:t>
+      </w:r>
+    </w:p>
+    <w:p>
+      <w:pPr>
+        <w:pStyle w:val="Listaszerbekezds"/>
+        <w:numPr>
+          <w:ilvl w:val="0"/>
+          <w:numId w:val="22"/>
+        </w:numPr>
+        <w:jc w:val="both"/>
+        <w:rPr>
+          <w:rFonts w:ascii="Times New Roman" w:eastAsia="Times New Roman" w:hAnsi="Times New Roman" w:cs="Times New Roman"/>
+          <w:sz w:val="36"/>
+          <w:szCs w:val="36"/>
+        </w:rPr>
+      </w:pPr>
+      <w:r>
+        <w:rPr>
+          <w:rFonts w:ascii="Times New Roman" w:eastAsia="Times New Roman" w:hAnsi="Times New Roman" w:cs="Times New Roman"/>
+          <w:sz w:val="36"/>
+          <w:szCs w:val="36"/>
+        </w:rPr>
+        <w:t>Az autentikációval kapcsolatos hibák kijavítása</w:t>
+      </w:r>
+    </w:p>
+    <w:p>
+      <w:pPr>
+        <w:jc w:val="both"/>
+        <w:rPr>
+          <w:rFonts w:ascii="Times New Roman" w:eastAsia="Times New Roman" w:hAnsi="Times New Roman" w:cs="Times New Roman"/>
+          <w:sz w:val="36"/>
+          <w:szCs w:val="36"/>
+        </w:rPr>
+      </w:pPr>
+    </w:p>
+    <w:p>
+      <w:pPr>
+        <w:jc w:val="both"/>
+        <w:rPr>
+          <w:rFonts w:ascii="Times New Roman" w:eastAsia="Times New Roman" w:hAnsi="Times New Roman" w:cs="Times New Roman"/>
+          <w:sz w:val="36"/>
+          <w:szCs w:val="36"/>
+        </w:rPr>
+      </w:pPr>
+      <w:r>
+        <w:rPr>
+          <w:rFonts w:ascii="Times New Roman" w:eastAsia="Times New Roman" w:hAnsi="Times New Roman" w:cs="Times New Roman"/>
+          <w:sz w:val="36"/>
+          <w:szCs w:val="36"/>
+        </w:rPr>
+        <w:t>(El-Nabulsy Csongor Alan)</w:t>
+      </w:r>
+    </w:p>
+    <w:p>
+      <w:pPr>
+        <w:pStyle w:val="Listaszerbekezds"/>
+        <w:numPr>
+          <w:ilvl w:val="0"/>
+          <w:numId w:val="23"/>
+        </w:numPr>
+        <w:jc w:val="both"/>
+        <w:rPr>
+          <w:rFonts w:ascii="Times New Roman" w:eastAsia="Times New Roman" w:hAnsi="Times New Roman" w:cs="Times New Roman"/>
+          <w:sz w:val="36"/>
+          <w:szCs w:val="36"/>
+        </w:rPr>
+      </w:pPr>
+      <w:r>
+        <w:rPr>
+          <w:rFonts w:ascii="Times New Roman" w:eastAsia="Times New Roman" w:hAnsi="Times New Roman" w:cs="Times New Roman"/>
+          <w:sz w:val="36"/>
+          <w:szCs w:val="36"/>
+        </w:rPr>
+        <w:t>A token alapú autentikáció lekódolásának megkezdése.</w:t>
       </w:r>
     </w:p>
     <w:sectPr>
@@ -8100,7 +6367,7 @@
 </file>
 
 <file path=word/numbering.xml><?xml version="1.0" encoding="utf-8"?>
-<w:numbering xmlns:wpc="http://schemas.microsoft.com/office/word/2010/wordprocessingCanvas" xmlns:cx="http://schemas.microsoft.com/office/drawing/2014/chartex" xmlns:cx1="http://schemas.microsoft.com/office/drawing/2015/9/8/chartex" xmlns:cx2="http://schemas.microsoft.com/office/drawing/2015/10/21/chartex" xmlns:cx3="http://schemas.microsoft.com/office/drawing/2016/5/9/chartex" xmlns:cx4="http://schemas.microsoft.com/office/drawing/2016/5/10/chartex" xmlns:cx5="http://schemas.microsoft.com/office/drawing/2016/5/11/chartex" xmlns:cx6="http://schemas.microsoft.com/office/drawing/2016/5/12/chartex" xmlns:cx7="http://schemas.microsoft.com/office/drawing/2016/5/13/chartex" xmlns:cx8="http://schemas.microsoft.com/office/drawing/2016/5/14/chartex" xmlns:mc="http://schemas.openxmlformats.org/markup-compatibility/2006" xmlns:aink="http://schemas.microsoft.com/office/drawing/2016/ink" xmlns:am3d="http://schemas.microsoft.com/office/drawing/2017/model3d" xmlns:o="urn:schemas-microsoft-com:office:office" xmlns:r="http://schemas.openxmlformats.org/officeDocument/2006/relationships" xmlns:m="http://schemas.openxmlformats.org/officeDocument/2006/math" xmlns:v="urn:schemas-microsoft-com:vml" xmlns:wp14="http://schemas.microsoft.com/office/word/2010/wordprocessingDrawing" xmlns:wp="http://schemas.openxmlformats.org/drawingml/2006/wordprocessingDrawing" xmlns:w10="urn:schemas-microsoft-com:office:word" xmlns:w="http://schemas.openxmlformats.org/wordprocessingml/2006/main" xmlns:w14="http://schemas.microsoft.com/office/word/2010/wordml" xmlns:w15="http://schemas.microsoft.com/office/word/2012/wordml" xmlns:w16cid="http://schemas.microsoft.com/office/word/2016/wordml/cid" xmlns:w16se="http://schemas.microsoft.com/office/word/2015/wordml/symex" xmlns:wpg="http://schemas.microsoft.com/office/word/2010/wordprocessingGroup" xmlns:wpi="http://schemas.microsoft.com/office/word/2010/wordprocessingInk" xmlns:wne="http://schemas.microsoft.com/office/word/2006/wordml" xmlns:wps="http://schemas.microsoft.com/office/word/2010/wordprocessingShape" mc:Ignorable="w14 w15 w16se w16cid wp14">
+<w:numbering xmlns:wpc="http://schemas.microsoft.com/office/word/2010/wordprocessingCanvas" xmlns:cx="http://schemas.microsoft.com/office/drawing/2014/chartex" xmlns:cx1="http://schemas.microsoft.com/office/drawing/2015/9/8/chartex" xmlns:cx2="http://schemas.microsoft.com/office/drawing/2015/10/21/chartex" xmlns:cx3="http://schemas.microsoft.com/office/drawing/2016/5/9/chartex" xmlns:cx4="http://schemas.microsoft.com/office/drawing/2016/5/10/chartex" xmlns:cx5="http://schemas.microsoft.com/office/drawing/2016/5/11/chartex" xmlns:cx6="http://schemas.microsoft.com/office/drawing/2016/5/12/chartex" xmlns:cx7="http://schemas.microsoft.com/office/drawing/2016/5/13/chartex" xmlns:cx8="http://schemas.microsoft.com/office/drawing/2016/5/14/chartex" xmlns:mc="http://schemas.openxmlformats.org/markup-compatibility/2006" xmlns:aink="http://schemas.microsoft.com/office/drawing/2016/ink" xmlns:am3d="http://schemas.microsoft.com/office/drawing/2017/model3d" xmlns:o="urn:schemas-microsoft-com:office:office" xmlns:oel="http://schemas.microsoft.com/office/2019/extlst" xmlns:r="http://schemas.openxmlformats.org/officeDocument/2006/relationships" xmlns:m="http://schemas.openxmlformats.org/officeDocument/2006/math" xmlns:v="urn:schemas-microsoft-com:vml" xmlns:wp14="http://schemas.microsoft.com/office/word/2010/wordprocessingDrawing" xmlns:wp="http://schemas.openxmlformats.org/drawingml/2006/wordprocessingDrawing" xmlns:w10="urn:schemas-microsoft-com:office:word" xmlns:w="http://schemas.openxmlformats.org/wordprocessingml/2006/main" xmlns:w14="http://schemas.microsoft.com/office/word/2010/wordml" xmlns:w15="http://schemas.microsoft.com/office/word/2012/wordml" xmlns:w16cex="http://schemas.microsoft.com/office/word/2018/wordml/cex" xmlns:w16cid="http://schemas.microsoft.com/office/word/2016/wordml/cid" xmlns:w16="http://schemas.microsoft.com/office/word/2018/wordml" xmlns:w16du="http://schemas.microsoft.com/office/word/2023/wordml/word16du" xmlns:w16sdtdh="http://schemas.microsoft.com/office/word/2020/wordml/sdtdatahash" xmlns:w16sdtfl="http://schemas.microsoft.com/office/word/2024/wordml/sdtformatlock" xmlns:w16se="http://schemas.microsoft.com/office/word/2015/wordml/symex" xmlns:wpg="http://schemas.microsoft.com/office/word/2010/wordprocessingGroup" xmlns:wpi="http://schemas.microsoft.com/office/word/2010/wordprocessingInk" xmlns:wne="http://schemas.microsoft.com/office/word/2006/wordml" xmlns:wps="http://schemas.microsoft.com/office/word/2010/wordprocessingShape" mc:Ignorable="w14 w15 w16se w16cid w16 w16cex w16sdtdh w16sdtfl w16du wp14">
   <w:numPicBullet w:numPicBulletId="0">
     <w:pict>
       <v:shapetype id="_x0000_t75" coordsize="21600,21600" o:spt="75" o:preferrelative="t" path="m@4@5l@4@11@9@11@9@5xe" filled="f" stroked="f">
@@ -8122,7 +6389,7 @@
         <v:path o:extrusionok="f" gradientshapeok="t" o:connecttype="rect"/>
         <o:lock v:ext="edit" aspectratio="t"/>
       </v:shapetype>
-      <v:shape id="_x0000_i1035" type="#_x0000_t75" style="width:23.75pt;height:23.75pt;visibility:visible;mso-wrap-style:square" o:bullet="t">
+      <v:shape id="_x0000_i1025" type="#_x0000_t75" style="width:24pt;height:24pt;visibility:visible;mso-wrap-style:square" o:bullet="t">
         <v:imagedata r:id="rId1" o:title=""/>
       </v:shape>
     </w:pict>
@@ -8693,6 +6960,119 @@
     </w:lvl>
   </w:abstractNum>
   <w:abstractNum w:abstractNumId="5" w15:restartNumberingAfterBreak="0">
+    <w:nsid w:val="26E54C04"/>
+    <w:multiLevelType w:val="hybridMultilevel"/>
+    <w:tmpl w:val="06EAA840"/>
+    <w:lvl w:ilvl="0" w:tplc="040E0001">
+      <w:start w:val="1"/>
+      <w:numFmt w:val="bullet"/>
+      <w:lvlText w:val=""/>
+      <w:lvlJc w:val="left"/>
+      <w:pPr>
+        <w:ind w:left="720" w:hanging="360"/>
+      </w:pPr>
+      <w:rPr>
+        <w:rFonts w:ascii="Symbol" w:hAnsi="Symbol" w:hint="default"/>
+      </w:rPr>
+    </w:lvl>
+    <w:lvl w:ilvl="1" w:tplc="040E0003" w:tentative="1">
+      <w:start w:val="1"/>
+      <w:numFmt w:val="bullet"/>
+      <w:lvlText w:val="o"/>
+      <w:lvlJc w:val="left"/>
+      <w:pPr>
+        <w:ind w:left="1440" w:hanging="360"/>
+      </w:pPr>
+      <w:rPr>
+        <w:rFonts w:ascii="Courier New" w:hAnsi="Courier New" w:cs="Courier New" w:hint="default"/>
+      </w:rPr>
+    </w:lvl>
+    <w:lvl w:ilvl="2" w:tplc="040E0005" w:tentative="1">
+      <w:start w:val="1"/>
+      <w:numFmt w:val="bullet"/>
+      <w:lvlText w:val=""/>
+      <w:lvlJc w:val="left"/>
+      <w:pPr>
+        <w:ind w:left="2160" w:hanging="360"/>
+      </w:pPr>
+      <w:rPr>
+        <w:rFonts w:ascii="Wingdings" w:hAnsi="Wingdings" w:hint="default"/>
+      </w:rPr>
+    </w:lvl>
+    <w:lvl w:ilvl="3" w:tplc="040E0001" w:tentative="1">
+      <w:start w:val="1"/>
+      <w:numFmt w:val="bullet"/>
+      <w:lvlText w:val=""/>
+      <w:lvlJc w:val="left"/>
+      <w:pPr>
+        <w:ind w:left="2880" w:hanging="360"/>
+      </w:pPr>
+      <w:rPr>
+        <w:rFonts w:ascii="Symbol" w:hAnsi="Symbol" w:hint="default"/>
+      </w:rPr>
+    </w:lvl>
+    <w:lvl w:ilvl="4" w:tplc="040E0003" w:tentative="1">
+      <w:start w:val="1"/>
+      <w:numFmt w:val="bullet"/>
+      <w:lvlText w:val="o"/>
+      <w:lvlJc w:val="left"/>
+      <w:pPr>
+        <w:ind w:left="3600" w:hanging="360"/>
+      </w:pPr>
+      <w:rPr>
+        <w:rFonts w:ascii="Courier New" w:hAnsi="Courier New" w:cs="Courier New" w:hint="default"/>
+      </w:rPr>
+    </w:lvl>
+    <w:lvl w:ilvl="5" w:tplc="040E0005" w:tentative="1">
+      <w:start w:val="1"/>
+      <w:numFmt w:val="bullet"/>
+      <w:lvlText w:val=""/>
+      <w:lvlJc w:val="left"/>
+      <w:pPr>
+        <w:ind w:left="4320" w:hanging="360"/>
+      </w:pPr>
+      <w:rPr>
+        <w:rFonts w:ascii="Wingdings" w:hAnsi="Wingdings" w:hint="default"/>
+      </w:rPr>
+    </w:lvl>
+    <w:lvl w:ilvl="6" w:tplc="040E0001" w:tentative="1">
+      <w:start w:val="1"/>
+      <w:numFmt w:val="bullet"/>
+      <w:lvlText w:val=""/>
+      <w:lvlJc w:val="left"/>
+      <w:pPr>
+        <w:ind w:left="5040" w:hanging="360"/>
+      </w:pPr>
+      <w:rPr>
+        <w:rFonts w:ascii="Symbol" w:hAnsi="Symbol" w:hint="default"/>
+      </w:rPr>
+    </w:lvl>
+    <w:lvl w:ilvl="7" w:tplc="040E0003" w:tentative="1">
+      <w:start w:val="1"/>
+      <w:numFmt w:val="bullet"/>
+      <w:lvlText w:val="o"/>
+      <w:lvlJc w:val="left"/>
+      <w:pPr>
+        <w:ind w:left="5760" w:hanging="360"/>
+      </w:pPr>
+      <w:rPr>
+        <w:rFonts w:ascii="Courier New" w:hAnsi="Courier New" w:cs="Courier New" w:hint="default"/>
+      </w:rPr>
+    </w:lvl>
+    <w:lvl w:ilvl="8" w:tplc="040E0005" w:tentative="1">
+      <w:start w:val="1"/>
+      <w:numFmt w:val="bullet"/>
+      <w:lvlText w:val=""/>
+      <w:lvlJc w:val="left"/>
+      <w:pPr>
+        <w:ind w:left="6480" w:hanging="360"/>
+      </w:pPr>
+      <w:rPr>
+        <w:rFonts w:ascii="Wingdings" w:hAnsi="Wingdings" w:hint="default"/>
+      </w:rPr>
+    </w:lvl>
+  </w:abstractNum>
+  <w:abstractNum w:abstractNumId="6" w15:restartNumberingAfterBreak="0">
     <w:nsid w:val="2D6C3100"/>
     <w:multiLevelType w:val="hybridMultilevel"/>
     <w:tmpl w:val="240AE6E2"/>
@@ -8805,7 +7185,7 @@
       </w:rPr>
     </w:lvl>
   </w:abstractNum>
-  <w:abstractNum w:abstractNumId="6" w15:restartNumberingAfterBreak="0">
+  <w:abstractNum w:abstractNumId="7" w15:restartNumberingAfterBreak="0">
     <w:nsid w:val="2FAB7B65"/>
     <w:multiLevelType w:val="hybridMultilevel"/>
     <w:tmpl w:val="2F64555A"/>
@@ -8918,7 +7298,7 @@
       </w:rPr>
     </w:lvl>
   </w:abstractNum>
-  <w:abstractNum w:abstractNumId="7" w15:restartNumberingAfterBreak="0">
+  <w:abstractNum w:abstractNumId="8" w15:restartNumberingAfterBreak="0">
     <w:nsid w:val="3C1938F6"/>
     <w:multiLevelType w:val="hybridMultilevel"/>
     <w:tmpl w:val="0816ACA8"/>
@@ -9031,7 +7411,7 @@
       </w:rPr>
     </w:lvl>
   </w:abstractNum>
-  <w:abstractNum w:abstractNumId="8" w15:restartNumberingAfterBreak="0">
+  <w:abstractNum w:abstractNumId="9" w15:restartNumberingAfterBreak="0">
     <w:nsid w:val="3CD74482"/>
     <w:multiLevelType w:val="hybridMultilevel"/>
     <w:tmpl w:val="0150BC32"/>
@@ -9144,7 +7524,120 @@
       </w:rPr>
     </w:lvl>
   </w:abstractNum>
-  <w:abstractNum w:abstractNumId="9" w15:restartNumberingAfterBreak="0">
+  <w:abstractNum w:abstractNumId="10" w15:restartNumberingAfterBreak="0">
+    <w:nsid w:val="443E450A"/>
+    <w:multiLevelType w:val="hybridMultilevel"/>
+    <w:tmpl w:val="ABDA7828"/>
+    <w:lvl w:ilvl="0" w:tplc="040E0001">
+      <w:start w:val="1"/>
+      <w:numFmt w:val="bullet"/>
+      <w:lvlText w:val=""/>
+      <w:lvlJc w:val="left"/>
+      <w:pPr>
+        <w:ind w:left="720" w:hanging="360"/>
+      </w:pPr>
+      <w:rPr>
+        <w:rFonts w:ascii="Symbol" w:hAnsi="Symbol" w:hint="default"/>
+      </w:rPr>
+    </w:lvl>
+    <w:lvl w:ilvl="1" w:tplc="040E0003" w:tentative="1">
+      <w:start w:val="1"/>
+      <w:numFmt w:val="bullet"/>
+      <w:lvlText w:val="o"/>
+      <w:lvlJc w:val="left"/>
+      <w:pPr>
+        <w:ind w:left="1440" w:hanging="360"/>
+      </w:pPr>
+      <w:rPr>
+        <w:rFonts w:ascii="Courier New" w:hAnsi="Courier New" w:cs="Courier New" w:hint="default"/>
+      </w:rPr>
+    </w:lvl>
+    <w:lvl w:ilvl="2" w:tplc="040E0005" w:tentative="1">
+      <w:start w:val="1"/>
+      <w:numFmt w:val="bullet"/>
+      <w:lvlText w:val=""/>
+      <w:lvlJc w:val="left"/>
+      <w:pPr>
+        <w:ind w:left="2160" w:hanging="360"/>
+      </w:pPr>
+      <w:rPr>
+        <w:rFonts w:ascii="Wingdings" w:hAnsi="Wingdings" w:hint="default"/>
+      </w:rPr>
+    </w:lvl>
+    <w:lvl w:ilvl="3" w:tplc="040E0001" w:tentative="1">
+      <w:start w:val="1"/>
+      <w:numFmt w:val="bullet"/>
+      <w:lvlText w:val=""/>
+      <w:lvlJc w:val="left"/>
+      <w:pPr>
+        <w:ind w:left="2880" w:hanging="360"/>
+      </w:pPr>
+      <w:rPr>
+        <w:rFonts w:ascii="Symbol" w:hAnsi="Symbol" w:hint="default"/>
+      </w:rPr>
+    </w:lvl>
+    <w:lvl w:ilvl="4" w:tplc="040E0003" w:tentative="1">
+      <w:start w:val="1"/>
+      <w:numFmt w:val="bullet"/>
+      <w:lvlText w:val="o"/>
+      <w:lvlJc w:val="left"/>
+      <w:pPr>
+        <w:ind w:left="3600" w:hanging="360"/>
+      </w:pPr>
+      <w:rPr>
+        <w:rFonts w:ascii="Courier New" w:hAnsi="Courier New" w:cs="Courier New" w:hint="default"/>
+      </w:rPr>
+    </w:lvl>
+    <w:lvl w:ilvl="5" w:tplc="040E0005" w:tentative="1">
+      <w:start w:val="1"/>
+      <w:numFmt w:val="bullet"/>
+      <w:lvlText w:val=""/>
+      <w:lvlJc w:val="left"/>
+      <w:pPr>
+        <w:ind w:left="4320" w:hanging="360"/>
+      </w:pPr>
+      <w:rPr>
+        <w:rFonts w:ascii="Wingdings" w:hAnsi="Wingdings" w:hint="default"/>
+      </w:rPr>
+    </w:lvl>
+    <w:lvl w:ilvl="6" w:tplc="040E0001" w:tentative="1">
+      <w:start w:val="1"/>
+      <w:numFmt w:val="bullet"/>
+      <w:lvlText w:val=""/>
+      <w:lvlJc w:val="left"/>
+      <w:pPr>
+        <w:ind w:left="5040" w:hanging="360"/>
+      </w:pPr>
+      <w:rPr>
+        <w:rFonts w:ascii="Symbol" w:hAnsi="Symbol" w:hint="default"/>
+      </w:rPr>
+    </w:lvl>
+    <w:lvl w:ilvl="7" w:tplc="040E0003" w:tentative="1">
+      <w:start w:val="1"/>
+      <w:numFmt w:val="bullet"/>
+      <w:lvlText w:val="o"/>
+      <w:lvlJc w:val="left"/>
+      <w:pPr>
+        <w:ind w:left="5760" w:hanging="360"/>
+      </w:pPr>
+      <w:rPr>
+        <w:rFonts w:ascii="Courier New" w:hAnsi="Courier New" w:cs="Courier New" w:hint="default"/>
+      </w:rPr>
+    </w:lvl>
+    <w:lvl w:ilvl="8" w:tplc="040E0005" w:tentative="1">
+      <w:start w:val="1"/>
+      <w:numFmt w:val="bullet"/>
+      <w:lvlText w:val=""/>
+      <w:lvlJc w:val="left"/>
+      <w:pPr>
+        <w:ind w:left="6480" w:hanging="360"/>
+      </w:pPr>
+      <w:rPr>
+        <w:rFonts w:ascii="Wingdings" w:hAnsi="Wingdings" w:hint="default"/>
+      </w:rPr>
+    </w:lvl>
+  </w:abstractNum>
+  <w:abstractNum w:abstractNumId="11" w15:restartNumberingAfterBreak="0">
     <w:nsid w:val="47442E3E"/>
     <w:multiLevelType w:val="hybridMultilevel"/>
     <w:tmpl w:val="64928C38"/>
@@ -9257,7 +7750,7 @@
       </w:rPr>
     </w:lvl>
   </w:abstractNum>
-  <w:abstractNum w:abstractNumId="10" w15:restartNumberingAfterBreak="0">
+  <w:abstractNum w:abstractNumId="12" w15:restartNumberingAfterBreak="0">
     <w:nsid w:val="4CA522A2"/>
     <w:multiLevelType w:val="hybridMultilevel"/>
     <w:tmpl w:val="81762318"/>
@@ -9370,7 +7863,7 @@
       </w:rPr>
     </w:lvl>
   </w:abstractNum>
-  <w:abstractNum w:abstractNumId="11" w15:restartNumberingAfterBreak="0">
+  <w:abstractNum w:abstractNumId="13" w15:restartNumberingAfterBreak="0">
     <w:nsid w:val="51655472"/>
     <w:multiLevelType w:val="hybridMultilevel"/>
     <w:tmpl w:val="E11ED65A"/>
@@ -9483,7 +7976,7 @@
       </w:rPr>
     </w:lvl>
   </w:abstractNum>
-  <w:abstractNum w:abstractNumId="12" w15:restartNumberingAfterBreak="0">
+  <w:abstractNum w:abstractNumId="14" w15:restartNumberingAfterBreak="0">
     <w:nsid w:val="5B1E66BA"/>
     <w:multiLevelType w:val="hybridMultilevel"/>
     <w:tmpl w:val="56E6462C"/>
@@ -9596,7 +8089,7 @@
       </w:rPr>
     </w:lvl>
   </w:abstractNum>
-  <w:abstractNum w:abstractNumId="13" w15:restartNumberingAfterBreak="0">
+  <w:abstractNum w:abstractNumId="15" w15:restartNumberingAfterBreak="0">
     <w:nsid w:val="64C346FC"/>
     <w:multiLevelType w:val="hybridMultilevel"/>
     <w:tmpl w:val="EAE26AC8"/>
@@ -9709,7 +8202,7 @@
       </w:rPr>
     </w:lvl>
   </w:abstractNum>
-  <w:abstractNum w:abstractNumId="14" w15:restartNumberingAfterBreak="0">
+  <w:abstractNum w:abstractNumId="16" w15:restartNumberingAfterBreak="0">
     <w:nsid w:val="69361338"/>
     <w:multiLevelType w:val="hybridMultilevel"/>
     <w:tmpl w:val="6CF0B772"/>
@@ -9822,7 +8315,7 @@
       </w:rPr>
     </w:lvl>
   </w:abstractNum>
-  <w:abstractNum w:abstractNumId="15" w15:restartNumberingAfterBreak="0">
+  <w:abstractNum w:abstractNumId="17" w15:restartNumberingAfterBreak="0">
     <w:nsid w:val="69FA5A50"/>
     <w:multiLevelType w:val="hybridMultilevel"/>
     <w:tmpl w:val="D82A6326"/>
@@ -9935,7 +8428,7 @@
       </w:rPr>
     </w:lvl>
   </w:abstractNum>
-  <w:abstractNum w:abstractNumId="16" w15:restartNumberingAfterBreak="0">
+  <w:abstractNum w:abstractNumId="18" w15:restartNumberingAfterBreak="0">
     <w:nsid w:val="6E7312B6"/>
     <w:multiLevelType w:val="hybridMultilevel"/>
     <w:tmpl w:val="FD80BAFC"/>
@@ -10048,7 +8541,7 @@
       </w:rPr>
     </w:lvl>
   </w:abstractNum>
-  <w:abstractNum w:abstractNumId="17" w15:restartNumberingAfterBreak="0">
+  <w:abstractNum w:abstractNumId="19" w15:restartNumberingAfterBreak="0">
     <w:nsid w:val="76FA296F"/>
     <w:multiLevelType w:val="hybridMultilevel"/>
     <w:tmpl w:val="6DAE32EA"/>
@@ -10161,7 +8654,7 @@
       </w:rPr>
     </w:lvl>
   </w:abstractNum>
-  <w:abstractNum w:abstractNumId="18" w15:restartNumberingAfterBreak="0">
+  <w:abstractNum w:abstractNumId="20" w15:restartNumberingAfterBreak="0">
     <w:nsid w:val="788C73B2"/>
     <w:multiLevelType w:val="hybridMultilevel"/>
     <w:tmpl w:val="6D6C60B0"/>
@@ -10274,7 +8767,7 @@
       </w:rPr>
     </w:lvl>
   </w:abstractNum>
-  <w:abstractNum w:abstractNumId="19" w15:restartNumberingAfterBreak="0">
+  <w:abstractNum w:abstractNumId="21" w15:restartNumberingAfterBreak="0">
     <w:nsid w:val="79644490"/>
     <w:multiLevelType w:val="hybridMultilevel"/>
     <w:tmpl w:val="340ACCA0"/>
@@ -10387,7 +8880,7 @@
       </w:rPr>
     </w:lvl>
   </w:abstractNum>
-  <w:abstractNum w:abstractNumId="20" w15:restartNumberingAfterBreak="0">
+  <w:abstractNum w:abstractNumId="22" w15:restartNumberingAfterBreak="0">
     <w:nsid w:val="7EB672F7"/>
     <w:multiLevelType w:val="hybridMultilevel"/>
     <w:tmpl w:val="A6F0C99C"/>
@@ -10500,74 +8993,80 @@
       </w:rPr>
     </w:lvl>
   </w:abstractNum>
-  <w:num w:numId="1">
+  <w:num w:numId="1" w16cid:durableId="1123884922">
+    <w:abstractNumId w:val="22"/>
+  </w:num>
+  <w:num w:numId="2" w16cid:durableId="1836798712">
+    <w:abstractNumId w:val="18"/>
+  </w:num>
+  <w:num w:numId="3" w16cid:durableId="2112048834">
+    <w:abstractNumId w:val="19"/>
+  </w:num>
+  <w:num w:numId="4" w16cid:durableId="1617178534">
+    <w:abstractNumId w:val="8"/>
+  </w:num>
+  <w:num w:numId="5" w16cid:durableId="1361279009">
+    <w:abstractNumId w:val="17"/>
+  </w:num>
+  <w:num w:numId="6" w16cid:durableId="686103978">
+    <w:abstractNumId w:val="11"/>
+  </w:num>
+  <w:num w:numId="7" w16cid:durableId="858543814">
     <w:abstractNumId w:val="20"/>
   </w:num>
-  <w:num w:numId="2">
+  <w:num w:numId="8" w16cid:durableId="1242714955">
     <w:abstractNumId w:val="16"/>
   </w:num>
-  <w:num w:numId="3">
-    <w:abstractNumId w:val="17"/>
+  <w:num w:numId="9" w16cid:durableId="313875824">
+    <w:abstractNumId w:val="6"/>
   </w:num>
-  <w:num w:numId="4">
+  <w:num w:numId="10" w16cid:durableId="299650473">
     <w:abstractNumId w:val="7"/>
   </w:num>
-  <w:num w:numId="5">
+  <w:num w:numId="11" w16cid:durableId="1600331680">
+    <w:abstractNumId w:val="14"/>
+  </w:num>
+  <w:num w:numId="12" w16cid:durableId="2070107477">
+    <w:abstractNumId w:val="21"/>
+  </w:num>
+  <w:num w:numId="13" w16cid:durableId="1233463287">
+    <w:abstractNumId w:val="12"/>
+  </w:num>
+  <w:num w:numId="14" w16cid:durableId="1942294339">
+    <w:abstractNumId w:val="4"/>
+  </w:num>
+  <w:num w:numId="15" w16cid:durableId="1610552267">
+    <w:abstractNumId w:val="3"/>
+  </w:num>
+  <w:num w:numId="16" w16cid:durableId="917710739">
     <w:abstractNumId w:val="15"/>
   </w:num>
-  <w:num w:numId="6">
+  <w:num w:numId="17" w16cid:durableId="947396415">
+    <w:abstractNumId w:val="2"/>
+  </w:num>
+  <w:num w:numId="18" w16cid:durableId="213779510">
+    <w:abstractNumId w:val="0"/>
+  </w:num>
+  <w:num w:numId="19" w16cid:durableId="1177308379">
+    <w:abstractNumId w:val="13"/>
+  </w:num>
+  <w:num w:numId="20" w16cid:durableId="1204905780">
     <w:abstractNumId w:val="9"/>
   </w:num>
-  <w:num w:numId="7">
-    <w:abstractNumId w:val="18"/>
+  <w:num w:numId="21" w16cid:durableId="654183114">
+    <w:abstractNumId w:val="1"/>
   </w:num>
-  <w:num w:numId="8">
-    <w:abstractNumId w:val="14"/>
-  </w:num>
-  <w:num w:numId="9">
-    <w:abstractNumId w:val="5"/>
-  </w:num>
-  <w:num w:numId="10">
-    <w:abstractNumId w:val="6"/>
-  </w:num>
-  <w:num w:numId="11">
-    <w:abstractNumId w:val="12"/>
-  </w:num>
-  <w:num w:numId="12">
-    <w:abstractNumId w:val="19"/>
-  </w:num>
-  <w:num w:numId="13">
+  <w:num w:numId="22" w16cid:durableId="1188064231">
     <w:abstractNumId w:val="10"/>
   </w:num>
-  <w:num w:numId="14">
-    <w:abstractNumId w:val="4"/>
-  </w:num>
-  <w:num w:numId="15">
-    <w:abstractNumId w:val="3"/>
-  </w:num>
-  <w:num w:numId="16">
-    <w:abstractNumId w:val="13"/>
-  </w:num>
-  <w:num w:numId="17">
-    <w:abstractNumId w:val="2"/>
-  </w:num>
-  <w:num w:numId="18">
-    <w:abstractNumId w:val="0"/>
-  </w:num>
-  <w:num w:numId="19">
-    <w:abstractNumId w:val="11"/>
-  </w:num>
-  <w:num w:numId="20">
-    <w:abstractNumId w:val="8"/>
-  </w:num>
-  <w:num w:numId="21">
-    <w:abstractNumId w:val="1"/>
+  <w:num w:numId="23" w16cid:durableId="1964073354">
+    <w:abstractNumId w:val="5"/>
   </w:num>
 </w:numbering>
 </file>
 
 <file path=word/styles.xml><?xml version="1.0" encoding="utf-8"?>
-<w:styles xmlns:mc="http://schemas.openxmlformats.org/markup-compatibility/2006" xmlns:r="http://schemas.openxmlformats.org/officeDocument/2006/relationships" xmlns:w="http://schemas.openxmlformats.org/wordprocessingml/2006/main" xmlns:w14="http://schemas.microsoft.com/office/word/2010/wordml" xmlns:w15="http://schemas.microsoft.com/office/word/2012/wordml" xmlns:w16cid="http://schemas.microsoft.com/office/word/2016/wordml/cid" xmlns:w16se="http://schemas.microsoft.com/office/word/2015/wordml/symex" mc:Ignorable="w14 w15 w16se w16cid">
+<w:styles xmlns:mc="http://schemas.openxmlformats.org/markup-compatibility/2006" xmlns:r="http://schemas.openxmlformats.org/officeDocument/2006/relationships" xmlns:w="http://schemas.openxmlformats.org/wordprocessingml/2006/main" xmlns:w14="http://schemas.microsoft.com/office/word/2010/wordml" xmlns:w15="http://schemas.microsoft.com/office/word/2012/wordml" xmlns:w16cex="http://schemas.microsoft.com/office/word/2018/wordml/cex" xmlns:w16cid="http://schemas.microsoft.com/office/word/2016/wordml/cid" xmlns:w16="http://schemas.microsoft.com/office/word/2018/wordml" xmlns:w16du="http://schemas.microsoft.com/office/word/2023/wordml/word16du" xmlns:w16sdtdh="http://schemas.microsoft.com/office/word/2020/wordml/sdtdatahash" xmlns:w16sdtfl="http://schemas.microsoft.com/office/word/2024/wordml/sdtformatlock" xmlns:w16se="http://schemas.microsoft.com/office/word/2015/wordml/symex" mc:Ignorable="w14 w15 w16se w16cid w16 w16cex w16sdtdh w16sdtfl w16du">
   <w:docDefaults>
     <w:rPrDefault>
       <w:rPr>
@@ -10585,7 +9084,7 @@
       </w:pPr>
     </w:pPrDefault>
   </w:docDefaults>
-  <w:latentStyles w:defLockedState="0" w:defUIPriority="99" w:defSemiHidden="0" w:defUnhideWhenUsed="0" w:defQFormat="0" w:count="375">
+  <w:latentStyles w:defLockedState="0" w:defUIPriority="99" w:defSemiHidden="0" w:defUnhideWhenUsed="0" w:defQFormat="0" w:count="376">
     <w:lsdException w:name="Normal" w:uiPriority="0" w:qFormat="1"/>
     <w:lsdException w:name="heading 1" w:uiPriority="9" w:qFormat="1"/>
     <w:lsdException w:name="heading 2" w:semiHidden="1" w:uiPriority="9" w:unhideWhenUsed="1" w:qFormat="1"/>
@@ -10961,6 +9460,7 @@
     <w:lsdException w:name="Smart Hyperlink" w:semiHidden="1" w:unhideWhenUsed="1"/>
     <w:lsdException w:name="Hashtag" w:semiHidden="1" w:unhideWhenUsed="1"/>
     <w:lsdException w:name="Unresolved Mention" w:semiHidden="1" w:unhideWhenUsed="1"/>
+    <w:lsdException w:name="Smart Link" w:semiHidden="1" w:unhideWhenUsed="1"/>
   </w:latentStyles>
   <w:style w:type="paragraph" w:default="1" w:styleId="Norml">
     <w:name w:val="Normal"/>

</xml_diff>

<commit_message>
Making timing and implementing it to the homepage and playlist organizer (+doc)
</commit_message>
<xml_diff>
--- a/documentation.docx
+++ b/documentation.docx
@@ -1229,7 +1229,7 @@
           <w:szCs w:val="36"/>
         </w:rPr>
         <w:drawing>
-          <wp:inline distT="0" distB="0" distL="0" distR="0" wp14:anchorId="78A43544" wp14:editId="51CC0173">
+          <wp:inline distT="0" distB="0" distL="0" distR="0" wp14:anchorId="78A43544" wp14:editId="52AC97D1">
             <wp:extent cx="3166535" cy="1781175"/>
             <wp:effectExtent l="0" t="0" r="0" b="0"/>
             <wp:docPr id="3" name="Kép 3" descr="C:\Users\elnabulsy.csongor\AppData\Local\Microsoft\Windows\INetCache\Content.MSO\F75754B3.tmp"/>
@@ -1321,7 +1321,7 @@
           <w:szCs w:val="36"/>
         </w:rPr>
         <w:drawing>
-          <wp:inline distT="0" distB="0" distL="0" distR="0" wp14:anchorId="4E211814" wp14:editId="4C9D8389">
+          <wp:inline distT="0" distB="0" distL="0" distR="0" wp14:anchorId="4E211814" wp14:editId="2C0B9053">
             <wp:extent cx="3133725" cy="1762720"/>
             <wp:effectExtent l="0" t="0" r="0" b="9525"/>
             <wp:docPr id="4" name="Kép 4" descr="C:\Users\elnabulsy.csongor\Downloads\ui_main_student.png"/>
@@ -1403,7 +1403,7 @@
           <w:szCs w:val="36"/>
         </w:rPr>
         <w:drawing>
-          <wp:inline distT="0" distB="0" distL="0" distR="0" wp14:anchorId="5137FB78" wp14:editId="5B93B542">
+          <wp:inline distT="0" distB="0" distL="0" distR="0" wp14:anchorId="5137FB78" wp14:editId="3B64FB5A">
             <wp:extent cx="3166110" cy="1780938"/>
             <wp:effectExtent l="0" t="0" r="0" b="0"/>
             <wp:docPr id="5" name="Kép 5" descr="C:\Users\elnabulsy.csongor\Downloads\ui_main_scheduler.png"/>
@@ -6356,6 +6356,103 @@
         <w:t>A token alapú autentikáció lekódolásának megkezdése.</w:t>
       </w:r>
     </w:p>
+    <w:p>
+      <w:pPr>
+        <w:jc w:val="both"/>
+        <w:rPr>
+          <w:rFonts w:ascii="Times New Roman" w:eastAsia="Times New Roman" w:hAnsi="Times New Roman" w:cs="Times New Roman"/>
+          <w:sz w:val="36"/>
+          <w:szCs w:val="36"/>
+        </w:rPr>
+      </w:pPr>
+    </w:p>
+    <w:p>
+      <w:pPr>
+        <w:jc w:val="both"/>
+        <w:rPr>
+          <w:rFonts w:ascii="Times New Roman" w:eastAsia="Times New Roman" w:hAnsi="Times New Roman" w:cs="Times New Roman"/>
+          <w:b/>
+          <w:bCs/>
+          <w:sz w:val="40"/>
+          <w:szCs w:val="40"/>
+        </w:rPr>
+      </w:pPr>
+      <w:r>
+        <w:rPr>
+          <w:rFonts w:ascii="Times New Roman" w:eastAsia="Times New Roman" w:hAnsi="Times New Roman" w:cs="Times New Roman"/>
+          <w:b/>
+          <w:bCs/>
+          <w:sz w:val="40"/>
+          <w:szCs w:val="40"/>
+        </w:rPr>
+        <w:t>2026-04-25 11:25-12:25, 14:30-15:25</w:t>
+      </w:r>
+    </w:p>
+    <w:p>
+      <w:pPr>
+        <w:jc w:val="both"/>
+        <w:rPr>
+          <w:rFonts w:ascii="Times New Roman" w:eastAsia="Times New Roman" w:hAnsi="Times New Roman" w:cs="Times New Roman"/>
+          <w:sz w:val="36"/>
+          <w:szCs w:val="36"/>
+        </w:rPr>
+      </w:pPr>
+      <w:r>
+        <w:rPr>
+          <w:rFonts w:ascii="Times New Roman" w:eastAsia="Times New Roman" w:hAnsi="Times New Roman" w:cs="Times New Roman"/>
+          <w:sz w:val="36"/>
+          <w:szCs w:val="36"/>
+        </w:rPr>
+        <w:t>(Susán Csongor György)</w:t>
+      </w:r>
+    </w:p>
+    <w:p>
+      <w:pPr>
+        <w:pStyle w:val="Listaszerbekezds"/>
+        <w:numPr>
+          <w:ilvl w:val="0"/>
+          <w:numId w:val="23"/>
+        </w:numPr>
+        <w:jc w:val="both"/>
+        <w:rPr>
+          <w:rFonts w:ascii="Times New Roman" w:eastAsia="Times New Roman" w:hAnsi="Times New Roman" w:cs="Times New Roman"/>
+          <w:sz w:val="36"/>
+          <w:szCs w:val="36"/>
+        </w:rPr>
+      </w:pPr>
+      <w:r>
+        <w:rPr>
+          <w:rFonts w:ascii="Times New Roman" w:eastAsia="Times New Roman" w:hAnsi="Times New Roman" w:cs="Times New Roman"/>
+          <w:sz w:val="36"/>
+          <w:szCs w:val="36"/>
+        </w:rPr>
+        <w:t>Az időzítési mechanizmus (timing.js), ami a zenék indulási időpontjának kiszámításához szükséges lekódolása.</w:t>
+      </w:r>
+    </w:p>
+    <w:p>
+      <w:pPr>
+        <w:pStyle w:val="Listaszerbekezds"/>
+        <w:numPr>
+          <w:ilvl w:val="0"/>
+          <w:numId w:val="23"/>
+        </w:numPr>
+        <w:jc w:val="both"/>
+        <w:rPr>
+          <w:rFonts w:ascii="Times New Roman" w:eastAsia="Times New Roman" w:hAnsi="Times New Roman" w:cs="Times New Roman"/>
+          <w:sz w:val="36"/>
+          <w:szCs w:val="36"/>
+        </w:rPr>
+      </w:pPr>
+      <w:r>
+        <w:rPr>
+          <w:rFonts w:ascii="Times New Roman" w:eastAsia="Times New Roman" w:hAnsi="Times New Roman" w:cs="Times New Roman"/>
+          <w:sz w:val="36"/>
+          <w:szCs w:val="36"/>
+        </w:rPr>
+        <w:lastRenderedPageBreak/>
+        <w:t>Az időzítés beépítése a főoldalba és a zeneelrendezésbe.</w:t>
+      </w:r>
+    </w:p>
     <w:sectPr>
       <w:pgSz w:w="11906" w:h="16838"/>
       <w:pgMar w:top="1417" w:right="1417" w:bottom="1417" w:left="1417" w:header="708" w:footer="708" w:gutter="0"/>
@@ -6962,7 +7059,7 @@
   <w:abstractNum w:abstractNumId="5" w15:restartNumberingAfterBreak="0">
     <w:nsid w:val="26E54C04"/>
     <w:multiLevelType w:val="hybridMultilevel"/>
-    <w:tmpl w:val="06EAA840"/>
+    <w:tmpl w:val="740ECED8"/>
     <w:lvl w:ilvl="0" w:tplc="040E0001">
       <w:start w:val="1"/>
       <w:numFmt w:val="bullet"/>

</xml_diff>

<commit_message>
Bugfixing playlist managing, trying to center the RequestVerifyView window and some little other modifications in footer views (+doc)
</commit_message>
<xml_diff>
--- a/documentation.docx
+++ b/documentation.docx
@@ -1229,7 +1229,7 @@
           <w:szCs w:val="36"/>
         </w:rPr>
         <w:drawing>
-          <wp:inline distT="0" distB="0" distL="0" distR="0" wp14:anchorId="78A43544" wp14:editId="52AC97D1">
+          <wp:inline distT="0" distB="0" distL="0" distR="0" wp14:anchorId="78A43544" wp14:editId="26BDF43B">
             <wp:extent cx="3166535" cy="1781175"/>
             <wp:effectExtent l="0" t="0" r="0" b="0"/>
             <wp:docPr id="3" name="Kép 3" descr="C:\Users\elnabulsy.csongor\AppData\Local\Microsoft\Windows\INetCache\Content.MSO\F75754B3.tmp"/>
@@ -1321,7 +1321,7 @@
           <w:szCs w:val="36"/>
         </w:rPr>
         <w:drawing>
-          <wp:inline distT="0" distB="0" distL="0" distR="0" wp14:anchorId="4E211814" wp14:editId="2C0B9053">
+          <wp:inline distT="0" distB="0" distL="0" distR="0" wp14:anchorId="4E211814" wp14:editId="160DB3F8">
             <wp:extent cx="3133725" cy="1762720"/>
             <wp:effectExtent l="0" t="0" r="0" b="9525"/>
             <wp:docPr id="4" name="Kép 4" descr="C:\Users\elnabulsy.csongor\Downloads\ui_main_student.png"/>
@@ -1403,7 +1403,7 @@
           <w:szCs w:val="36"/>
         </w:rPr>
         <w:drawing>
-          <wp:inline distT="0" distB="0" distL="0" distR="0" wp14:anchorId="5137FB78" wp14:editId="3B64FB5A">
+          <wp:inline distT="0" distB="0" distL="0" distR="0" wp14:anchorId="5137FB78" wp14:editId="3857A97B">
             <wp:extent cx="3166110" cy="1780938"/>
             <wp:effectExtent l="0" t="0" r="0" b="0"/>
             <wp:docPr id="5" name="Kép 5" descr="C:\Users\elnabulsy.csongor\Downloads\ui_main_scheduler.png"/>
@@ -6453,6 +6453,238 @@
         <w:t>Az időzítés beépítése a főoldalba és a zeneelrendezésbe.</w:t>
       </w:r>
     </w:p>
+    <w:p>
+      <w:pPr>
+        <w:jc w:val="both"/>
+        <w:rPr>
+          <w:rFonts w:ascii="Times New Roman" w:eastAsia="Times New Roman" w:hAnsi="Times New Roman" w:cs="Times New Roman"/>
+          <w:sz w:val="36"/>
+          <w:szCs w:val="36"/>
+        </w:rPr>
+      </w:pPr>
+    </w:p>
+    <w:p>
+      <w:pPr>
+        <w:jc w:val="both"/>
+        <w:rPr>
+          <w:rFonts w:ascii="Times New Roman" w:eastAsia="Times New Roman" w:hAnsi="Times New Roman" w:cs="Times New Roman"/>
+          <w:b/>
+          <w:bCs/>
+          <w:sz w:val="40"/>
+          <w:szCs w:val="40"/>
+        </w:rPr>
+      </w:pPr>
+      <w:r>
+        <w:rPr>
+          <w:rFonts w:ascii="Times New Roman" w:eastAsia="Times New Roman" w:hAnsi="Times New Roman" w:cs="Times New Roman"/>
+          <w:b/>
+          <w:bCs/>
+          <w:sz w:val="40"/>
+          <w:szCs w:val="40"/>
+        </w:rPr>
+        <w:t>2026-04-26 15:10-</w:t>
+      </w:r>
+    </w:p>
+    <w:p>
+      <w:pPr>
+        <w:jc w:val="both"/>
+        <w:rPr>
+          <w:rFonts w:ascii="Times New Roman" w:eastAsia="Times New Roman" w:hAnsi="Times New Roman" w:cs="Times New Roman"/>
+          <w:sz w:val="36"/>
+          <w:szCs w:val="36"/>
+        </w:rPr>
+      </w:pPr>
+      <w:r>
+        <w:rPr>
+          <w:rFonts w:ascii="Times New Roman" w:eastAsia="Times New Roman" w:hAnsi="Times New Roman" w:cs="Times New Roman"/>
+          <w:sz w:val="36"/>
+          <w:szCs w:val="36"/>
+        </w:rPr>
+        <w:t>(Susán Csongor György)</w:t>
+      </w:r>
+    </w:p>
+    <w:p>
+      <w:pPr>
+        <w:pStyle w:val="Listaszerbekezds"/>
+        <w:numPr>
+          <w:ilvl w:val="0"/>
+          <w:numId w:val="25"/>
+        </w:numPr>
+        <w:jc w:val="both"/>
+        <w:rPr>
+          <w:rFonts w:ascii="Times New Roman" w:eastAsia="Times New Roman" w:hAnsi="Times New Roman" w:cs="Times New Roman"/>
+          <w:sz w:val="36"/>
+          <w:szCs w:val="36"/>
+        </w:rPr>
+      </w:pPr>
+      <w:r>
+        <w:rPr>
+          <w:rFonts w:ascii="Times New Roman" w:eastAsia="Times New Roman" w:hAnsi="Times New Roman" w:cs="Times New Roman"/>
+          <w:sz w:val="36"/>
+          <w:szCs w:val="36"/>
+        </w:rPr>
+        <w:t>Beküldött, de még nem elfogadott vagy elutasított zenék listájának megtekintésre való lehetőség adása a zenebekérés oldalon</w:t>
+      </w:r>
+      <w:r>
+        <w:rPr>
+          <w:rFonts w:ascii="Times New Roman" w:eastAsia="Times New Roman" w:hAnsi="Times New Roman" w:cs="Times New Roman"/>
+          <w:sz w:val="36"/>
+          <w:szCs w:val="36"/>
+        </w:rPr>
+        <w:t>.</w:t>
+      </w:r>
+    </w:p>
+    <w:p>
+      <w:pPr>
+        <w:pStyle w:val="Listaszerbekezds"/>
+        <w:numPr>
+          <w:ilvl w:val="0"/>
+          <w:numId w:val="25"/>
+        </w:numPr>
+        <w:jc w:val="both"/>
+        <w:rPr>
+          <w:rFonts w:ascii="Times New Roman" w:eastAsia="Times New Roman" w:hAnsi="Times New Roman" w:cs="Times New Roman"/>
+          <w:sz w:val="36"/>
+          <w:szCs w:val="36"/>
+        </w:rPr>
+      </w:pPr>
+      <w:r>
+        <w:rPr>
+          <w:rFonts w:ascii="Times New Roman" w:eastAsia="Times New Roman" w:hAnsi="Times New Roman" w:cs="Times New Roman"/>
+          <w:sz w:val="36"/>
+          <w:szCs w:val="36"/>
+        </w:rPr>
+        <w:t>Fejlesztői dokumentáció rendezése.</w:t>
+      </w:r>
+    </w:p>
+    <w:p>
+      <w:pPr>
+        <w:pStyle w:val="Listaszerbekezds"/>
+        <w:numPr>
+          <w:ilvl w:val="0"/>
+          <w:numId w:val="25"/>
+        </w:numPr>
+        <w:jc w:val="both"/>
+        <w:rPr>
+          <w:rFonts w:ascii="Times New Roman" w:eastAsia="Times New Roman" w:hAnsi="Times New Roman" w:cs="Times New Roman"/>
+          <w:sz w:val="36"/>
+          <w:szCs w:val="36"/>
+        </w:rPr>
+      </w:pPr>
+      <w:r>
+        <w:rPr>
+          <w:rFonts w:ascii="Times New Roman" w:eastAsia="Times New Roman" w:hAnsi="Times New Roman" w:cs="Times New Roman"/>
+          <w:sz w:val="36"/>
+          <w:szCs w:val="36"/>
+        </w:rPr>
+        <w:t>A zenebekérésnél azon kód, amely kiszűri a lejátszás előtt álló vagy bekért zenéket, kijavítása (a lejátszás előtti zenék közül volt, hogy berakott egyvalamit a bekérhető zenék közé)</w:t>
+      </w:r>
+      <w:r>
+        <w:rPr>
+          <w:rFonts w:ascii="Times New Roman" w:eastAsia="Times New Roman" w:hAnsi="Times New Roman" w:cs="Times New Roman"/>
+          <w:sz w:val="36"/>
+          <w:szCs w:val="36"/>
+        </w:rPr>
+        <w:t>.</w:t>
+      </w:r>
+    </w:p>
+    <w:p>
+      <w:pPr>
+        <w:pStyle w:val="Listaszerbekezds"/>
+        <w:numPr>
+          <w:ilvl w:val="0"/>
+          <w:numId w:val="25"/>
+        </w:numPr>
+        <w:jc w:val="both"/>
+        <w:rPr>
+          <w:rFonts w:ascii="Times New Roman" w:eastAsia="Times New Roman" w:hAnsi="Times New Roman" w:cs="Times New Roman"/>
+          <w:sz w:val="36"/>
+          <w:szCs w:val="36"/>
+        </w:rPr>
+      </w:pPr>
+      <w:r>
+        <w:rPr>
+          <w:rFonts w:ascii="Times New Roman" w:eastAsia="Times New Roman" w:hAnsi="Times New Roman" w:cs="Times New Roman"/>
+          <w:sz w:val="36"/>
+          <w:szCs w:val="36"/>
+        </w:rPr>
+        <w:t>A zeneütemezés hibáinak (lejátszási lista nem frissül, az első bekért zenét nem töltötte be, az üzenetek nem jöttek meg) kijavítása.</w:t>
+      </w:r>
+    </w:p>
+    <w:p>
+      <w:pPr>
+        <w:pStyle w:val="Listaszerbekezds"/>
+        <w:numPr>
+          <w:ilvl w:val="0"/>
+          <w:numId w:val="25"/>
+        </w:numPr>
+        <w:jc w:val="both"/>
+        <w:rPr>
+          <w:rFonts w:ascii="Times New Roman" w:eastAsia="Times New Roman" w:hAnsi="Times New Roman" w:cs="Times New Roman"/>
+          <w:sz w:val="36"/>
+          <w:szCs w:val="36"/>
+        </w:rPr>
+      </w:pPr>
+      <w:r>
+        <w:rPr>
+          <w:rFonts w:ascii="Times New Roman" w:eastAsia="Times New Roman" w:hAnsi="Times New Roman" w:cs="Times New Roman"/>
+          <w:sz w:val="36"/>
+          <w:szCs w:val="36"/>
+        </w:rPr>
+        <w:t>A zenebekérés véglegesítőjének (RequestVerifyView) középre igazítása.</w:t>
+      </w:r>
+    </w:p>
+    <w:p>
+      <w:pPr>
+        <w:jc w:val="both"/>
+        <w:rPr>
+          <w:rFonts w:ascii="Times New Roman" w:eastAsia="Times New Roman" w:hAnsi="Times New Roman" w:cs="Times New Roman"/>
+          <w:sz w:val="36"/>
+          <w:szCs w:val="36"/>
+        </w:rPr>
+      </w:pPr>
+    </w:p>
+    <w:p>
+      <w:pPr>
+        <w:jc w:val="both"/>
+        <w:rPr>
+          <w:rFonts w:ascii="Times New Roman" w:eastAsia="Times New Roman" w:hAnsi="Times New Roman" w:cs="Times New Roman"/>
+          <w:sz w:val="36"/>
+          <w:szCs w:val="36"/>
+        </w:rPr>
+      </w:pPr>
+      <w:r>
+        <w:rPr>
+          <w:rFonts w:ascii="Times New Roman" w:eastAsia="Times New Roman" w:hAnsi="Times New Roman" w:cs="Times New Roman"/>
+          <w:sz w:val="36"/>
+          <w:szCs w:val="36"/>
+        </w:rPr>
+        <w:t>(El-Nabulsy Csongor Alan)</w:t>
+      </w:r>
+    </w:p>
+    <w:p>
+      <w:pPr>
+        <w:pStyle w:val="Listaszerbekezds"/>
+        <w:numPr>
+          <w:ilvl w:val="0"/>
+          <w:numId w:val="24"/>
+        </w:numPr>
+        <w:jc w:val="both"/>
+        <w:rPr>
+          <w:rFonts w:ascii="Times New Roman" w:eastAsia="Times New Roman" w:hAnsi="Times New Roman" w:cs="Times New Roman"/>
+          <w:sz w:val="36"/>
+          <w:szCs w:val="36"/>
+        </w:rPr>
+      </w:pPr>
+      <w:r>
+        <w:rPr>
+          <w:rFonts w:ascii="Times New Roman" w:eastAsia="Times New Roman" w:hAnsi="Times New Roman" w:cs="Times New Roman"/>
+          <w:sz w:val="36"/>
+          <w:szCs w:val="36"/>
+        </w:rPr>
+        <w:t>Felhasználói és fejlesztői dokumentáció, valamint a prezentáció megírása.</w:t>
+      </w:r>
+    </w:p>
     <w:sectPr>
       <w:pgSz w:w="11906" w:h="16838"/>
       <w:pgMar w:top="1417" w:right="1417" w:bottom="1417" w:left="1417" w:header="708" w:footer="708" w:gutter="0"/>
@@ -6831,6 +7063,119 @@
     </w:lvl>
   </w:abstractNum>
   <w:abstractNum w:abstractNumId="3" w15:restartNumberingAfterBreak="0">
+    <w:nsid w:val="19627742"/>
+    <w:multiLevelType w:val="hybridMultilevel"/>
+    <w:tmpl w:val="F6165302"/>
+    <w:lvl w:ilvl="0" w:tplc="040E0001">
+      <w:start w:val="1"/>
+      <w:numFmt w:val="bullet"/>
+      <w:lvlText w:val=""/>
+      <w:lvlJc w:val="left"/>
+      <w:pPr>
+        <w:ind w:left="720" w:hanging="360"/>
+      </w:pPr>
+      <w:rPr>
+        <w:rFonts w:ascii="Symbol" w:hAnsi="Symbol" w:hint="default"/>
+      </w:rPr>
+    </w:lvl>
+    <w:lvl w:ilvl="1" w:tplc="040E0003" w:tentative="1">
+      <w:start w:val="1"/>
+      <w:numFmt w:val="bullet"/>
+      <w:lvlText w:val="o"/>
+      <w:lvlJc w:val="left"/>
+      <w:pPr>
+        <w:ind w:left="1440" w:hanging="360"/>
+      </w:pPr>
+      <w:rPr>
+        <w:rFonts w:ascii="Courier New" w:hAnsi="Courier New" w:cs="Courier New" w:hint="default"/>
+      </w:rPr>
+    </w:lvl>
+    <w:lvl w:ilvl="2" w:tplc="040E0005" w:tentative="1">
+      <w:start w:val="1"/>
+      <w:numFmt w:val="bullet"/>
+      <w:lvlText w:val=""/>
+      <w:lvlJc w:val="left"/>
+      <w:pPr>
+        <w:ind w:left="2160" w:hanging="360"/>
+      </w:pPr>
+      <w:rPr>
+        <w:rFonts w:ascii="Wingdings" w:hAnsi="Wingdings" w:hint="default"/>
+      </w:rPr>
+    </w:lvl>
+    <w:lvl w:ilvl="3" w:tplc="040E0001" w:tentative="1">
+      <w:start w:val="1"/>
+      <w:numFmt w:val="bullet"/>
+      <w:lvlText w:val=""/>
+      <w:lvlJc w:val="left"/>
+      <w:pPr>
+        <w:ind w:left="2880" w:hanging="360"/>
+      </w:pPr>
+      <w:rPr>
+        <w:rFonts w:ascii="Symbol" w:hAnsi="Symbol" w:hint="default"/>
+      </w:rPr>
+    </w:lvl>
+    <w:lvl w:ilvl="4" w:tplc="040E0003" w:tentative="1">
+      <w:start w:val="1"/>
+      <w:numFmt w:val="bullet"/>
+      <w:lvlText w:val="o"/>
+      <w:lvlJc w:val="left"/>
+      <w:pPr>
+        <w:ind w:left="3600" w:hanging="360"/>
+      </w:pPr>
+      <w:rPr>
+        <w:rFonts w:ascii="Courier New" w:hAnsi="Courier New" w:cs="Courier New" w:hint="default"/>
+      </w:rPr>
+    </w:lvl>
+    <w:lvl w:ilvl="5" w:tplc="040E0005" w:tentative="1">
+      <w:start w:val="1"/>
+      <w:numFmt w:val="bullet"/>
+      <w:lvlText w:val=""/>
+      <w:lvlJc w:val="left"/>
+      <w:pPr>
+        <w:ind w:left="4320" w:hanging="360"/>
+      </w:pPr>
+      <w:rPr>
+        <w:rFonts w:ascii="Wingdings" w:hAnsi="Wingdings" w:hint="default"/>
+      </w:rPr>
+    </w:lvl>
+    <w:lvl w:ilvl="6" w:tplc="040E0001" w:tentative="1">
+      <w:start w:val="1"/>
+      <w:numFmt w:val="bullet"/>
+      <w:lvlText w:val=""/>
+      <w:lvlJc w:val="left"/>
+      <w:pPr>
+        <w:ind w:left="5040" w:hanging="360"/>
+      </w:pPr>
+      <w:rPr>
+        <w:rFonts w:ascii="Symbol" w:hAnsi="Symbol" w:hint="default"/>
+      </w:rPr>
+    </w:lvl>
+    <w:lvl w:ilvl="7" w:tplc="040E0003" w:tentative="1">
+      <w:start w:val="1"/>
+      <w:numFmt w:val="bullet"/>
+      <w:lvlText w:val="o"/>
+      <w:lvlJc w:val="left"/>
+      <w:pPr>
+        <w:ind w:left="5760" w:hanging="360"/>
+      </w:pPr>
+      <w:rPr>
+        <w:rFonts w:ascii="Courier New" w:hAnsi="Courier New" w:cs="Courier New" w:hint="default"/>
+      </w:rPr>
+    </w:lvl>
+    <w:lvl w:ilvl="8" w:tplc="040E0005" w:tentative="1">
+      <w:start w:val="1"/>
+      <w:numFmt w:val="bullet"/>
+      <w:lvlText w:val=""/>
+      <w:lvlJc w:val="left"/>
+      <w:pPr>
+        <w:ind w:left="6480" w:hanging="360"/>
+      </w:pPr>
+      <w:rPr>
+        <w:rFonts w:ascii="Wingdings" w:hAnsi="Wingdings" w:hint="default"/>
+      </w:rPr>
+    </w:lvl>
+  </w:abstractNum>
+  <w:abstractNum w:abstractNumId="4" w15:restartNumberingAfterBreak="0">
     <w:nsid w:val="242A0BE1"/>
     <w:multiLevelType w:val="hybridMultilevel"/>
     <w:tmpl w:val="DDF6D144"/>
@@ -6943,7 +7288,7 @@
       </w:rPr>
     </w:lvl>
   </w:abstractNum>
-  <w:abstractNum w:abstractNumId="4" w15:restartNumberingAfterBreak="0">
+  <w:abstractNum w:abstractNumId="5" w15:restartNumberingAfterBreak="0">
     <w:nsid w:val="25B663B5"/>
     <w:multiLevelType w:val="hybridMultilevel"/>
     <w:tmpl w:val="AFC00FD0"/>
@@ -7056,7 +7401,7 @@
       </w:rPr>
     </w:lvl>
   </w:abstractNum>
-  <w:abstractNum w:abstractNumId="5" w15:restartNumberingAfterBreak="0">
+  <w:abstractNum w:abstractNumId="6" w15:restartNumberingAfterBreak="0">
     <w:nsid w:val="26E54C04"/>
     <w:multiLevelType w:val="hybridMultilevel"/>
     <w:tmpl w:val="740ECED8"/>
@@ -7169,7 +7514,7 @@
       </w:rPr>
     </w:lvl>
   </w:abstractNum>
-  <w:abstractNum w:abstractNumId="6" w15:restartNumberingAfterBreak="0">
+  <w:abstractNum w:abstractNumId="7" w15:restartNumberingAfterBreak="0">
     <w:nsid w:val="2D6C3100"/>
     <w:multiLevelType w:val="hybridMultilevel"/>
     <w:tmpl w:val="240AE6E2"/>
@@ -7282,7 +7627,7 @@
       </w:rPr>
     </w:lvl>
   </w:abstractNum>
-  <w:abstractNum w:abstractNumId="7" w15:restartNumberingAfterBreak="0">
+  <w:abstractNum w:abstractNumId="8" w15:restartNumberingAfterBreak="0">
     <w:nsid w:val="2FAB7B65"/>
     <w:multiLevelType w:val="hybridMultilevel"/>
     <w:tmpl w:val="2F64555A"/>
@@ -7395,7 +7740,7 @@
       </w:rPr>
     </w:lvl>
   </w:abstractNum>
-  <w:abstractNum w:abstractNumId="8" w15:restartNumberingAfterBreak="0">
+  <w:abstractNum w:abstractNumId="9" w15:restartNumberingAfterBreak="0">
     <w:nsid w:val="3C1938F6"/>
     <w:multiLevelType w:val="hybridMultilevel"/>
     <w:tmpl w:val="0816ACA8"/>
@@ -7508,7 +7853,7 @@
       </w:rPr>
     </w:lvl>
   </w:abstractNum>
-  <w:abstractNum w:abstractNumId="9" w15:restartNumberingAfterBreak="0">
+  <w:abstractNum w:abstractNumId="10" w15:restartNumberingAfterBreak="0">
     <w:nsid w:val="3CD74482"/>
     <w:multiLevelType w:val="hybridMultilevel"/>
     <w:tmpl w:val="0150BC32"/>
@@ -7621,7 +7966,7 @@
       </w:rPr>
     </w:lvl>
   </w:abstractNum>
-  <w:abstractNum w:abstractNumId="10" w15:restartNumberingAfterBreak="0">
+  <w:abstractNum w:abstractNumId="11" w15:restartNumberingAfterBreak="0">
     <w:nsid w:val="443E450A"/>
     <w:multiLevelType w:val="hybridMultilevel"/>
     <w:tmpl w:val="ABDA7828"/>
@@ -7734,7 +8079,7 @@
       </w:rPr>
     </w:lvl>
   </w:abstractNum>
-  <w:abstractNum w:abstractNumId="11" w15:restartNumberingAfterBreak="0">
+  <w:abstractNum w:abstractNumId="12" w15:restartNumberingAfterBreak="0">
     <w:nsid w:val="47442E3E"/>
     <w:multiLevelType w:val="hybridMultilevel"/>
     <w:tmpl w:val="64928C38"/>
@@ -7847,7 +8192,7 @@
       </w:rPr>
     </w:lvl>
   </w:abstractNum>
-  <w:abstractNum w:abstractNumId="12" w15:restartNumberingAfterBreak="0">
+  <w:abstractNum w:abstractNumId="13" w15:restartNumberingAfterBreak="0">
     <w:nsid w:val="4CA522A2"/>
     <w:multiLevelType w:val="hybridMultilevel"/>
     <w:tmpl w:val="81762318"/>
@@ -7960,7 +8305,7 @@
       </w:rPr>
     </w:lvl>
   </w:abstractNum>
-  <w:abstractNum w:abstractNumId="13" w15:restartNumberingAfterBreak="0">
+  <w:abstractNum w:abstractNumId="14" w15:restartNumberingAfterBreak="0">
     <w:nsid w:val="51655472"/>
     <w:multiLevelType w:val="hybridMultilevel"/>
     <w:tmpl w:val="E11ED65A"/>
@@ -8073,7 +8418,7 @@
       </w:rPr>
     </w:lvl>
   </w:abstractNum>
-  <w:abstractNum w:abstractNumId="14" w15:restartNumberingAfterBreak="0">
+  <w:abstractNum w:abstractNumId="15" w15:restartNumberingAfterBreak="0">
     <w:nsid w:val="5B1E66BA"/>
     <w:multiLevelType w:val="hybridMultilevel"/>
     <w:tmpl w:val="56E6462C"/>
@@ -8186,7 +8531,7 @@
       </w:rPr>
     </w:lvl>
   </w:abstractNum>
-  <w:abstractNum w:abstractNumId="15" w15:restartNumberingAfterBreak="0">
+  <w:abstractNum w:abstractNumId="16" w15:restartNumberingAfterBreak="0">
     <w:nsid w:val="64C346FC"/>
     <w:multiLevelType w:val="hybridMultilevel"/>
     <w:tmpl w:val="EAE26AC8"/>
@@ -8299,7 +8644,7 @@
       </w:rPr>
     </w:lvl>
   </w:abstractNum>
-  <w:abstractNum w:abstractNumId="16" w15:restartNumberingAfterBreak="0">
+  <w:abstractNum w:abstractNumId="17" w15:restartNumberingAfterBreak="0">
     <w:nsid w:val="69361338"/>
     <w:multiLevelType w:val="hybridMultilevel"/>
     <w:tmpl w:val="6CF0B772"/>
@@ -8412,7 +8757,7 @@
       </w:rPr>
     </w:lvl>
   </w:abstractNum>
-  <w:abstractNum w:abstractNumId="17" w15:restartNumberingAfterBreak="0">
+  <w:abstractNum w:abstractNumId="18" w15:restartNumberingAfterBreak="0">
     <w:nsid w:val="69FA5A50"/>
     <w:multiLevelType w:val="hybridMultilevel"/>
     <w:tmpl w:val="D82A6326"/>
@@ -8525,7 +8870,7 @@
       </w:rPr>
     </w:lvl>
   </w:abstractNum>
-  <w:abstractNum w:abstractNumId="18" w15:restartNumberingAfterBreak="0">
+  <w:abstractNum w:abstractNumId="19" w15:restartNumberingAfterBreak="0">
     <w:nsid w:val="6E7312B6"/>
     <w:multiLevelType w:val="hybridMultilevel"/>
     <w:tmpl w:val="FD80BAFC"/>
@@ -8638,7 +8983,120 @@
       </w:rPr>
     </w:lvl>
   </w:abstractNum>
-  <w:abstractNum w:abstractNumId="19" w15:restartNumberingAfterBreak="0">
+  <w:abstractNum w:abstractNumId="20" w15:restartNumberingAfterBreak="0">
+    <w:nsid w:val="6FDF1C19"/>
+    <w:multiLevelType w:val="hybridMultilevel"/>
+    <w:tmpl w:val="1F8EE6F4"/>
+    <w:lvl w:ilvl="0" w:tplc="040E0001">
+      <w:start w:val="1"/>
+      <w:numFmt w:val="bullet"/>
+      <w:lvlText w:val=""/>
+      <w:lvlJc w:val="left"/>
+      <w:pPr>
+        <w:ind w:left="720" w:hanging="360"/>
+      </w:pPr>
+      <w:rPr>
+        <w:rFonts w:ascii="Symbol" w:hAnsi="Symbol" w:hint="default"/>
+      </w:rPr>
+    </w:lvl>
+    <w:lvl w:ilvl="1" w:tplc="040E0003" w:tentative="1">
+      <w:start w:val="1"/>
+      <w:numFmt w:val="bullet"/>
+      <w:lvlText w:val="o"/>
+      <w:lvlJc w:val="left"/>
+      <w:pPr>
+        <w:ind w:left="1440" w:hanging="360"/>
+      </w:pPr>
+      <w:rPr>
+        <w:rFonts w:ascii="Courier New" w:hAnsi="Courier New" w:cs="Courier New" w:hint="default"/>
+      </w:rPr>
+    </w:lvl>
+    <w:lvl w:ilvl="2" w:tplc="040E0005" w:tentative="1">
+      <w:start w:val="1"/>
+      <w:numFmt w:val="bullet"/>
+      <w:lvlText w:val=""/>
+      <w:lvlJc w:val="left"/>
+      <w:pPr>
+        <w:ind w:left="2160" w:hanging="360"/>
+      </w:pPr>
+      <w:rPr>
+        <w:rFonts w:ascii="Wingdings" w:hAnsi="Wingdings" w:hint="default"/>
+      </w:rPr>
+    </w:lvl>
+    <w:lvl w:ilvl="3" w:tplc="040E0001" w:tentative="1">
+      <w:start w:val="1"/>
+      <w:numFmt w:val="bullet"/>
+      <w:lvlText w:val=""/>
+      <w:lvlJc w:val="left"/>
+      <w:pPr>
+        <w:ind w:left="2880" w:hanging="360"/>
+      </w:pPr>
+      <w:rPr>
+        <w:rFonts w:ascii="Symbol" w:hAnsi="Symbol" w:hint="default"/>
+      </w:rPr>
+    </w:lvl>
+    <w:lvl w:ilvl="4" w:tplc="040E0003" w:tentative="1">
+      <w:start w:val="1"/>
+      <w:numFmt w:val="bullet"/>
+      <w:lvlText w:val="o"/>
+      <w:lvlJc w:val="left"/>
+      <w:pPr>
+        <w:ind w:left="3600" w:hanging="360"/>
+      </w:pPr>
+      <w:rPr>
+        <w:rFonts w:ascii="Courier New" w:hAnsi="Courier New" w:cs="Courier New" w:hint="default"/>
+      </w:rPr>
+    </w:lvl>
+    <w:lvl w:ilvl="5" w:tplc="040E0005" w:tentative="1">
+      <w:start w:val="1"/>
+      <w:numFmt w:val="bullet"/>
+      <w:lvlText w:val=""/>
+      <w:lvlJc w:val="left"/>
+      <w:pPr>
+        <w:ind w:left="4320" w:hanging="360"/>
+      </w:pPr>
+      <w:rPr>
+        <w:rFonts w:ascii="Wingdings" w:hAnsi="Wingdings" w:hint="default"/>
+      </w:rPr>
+    </w:lvl>
+    <w:lvl w:ilvl="6" w:tplc="040E0001" w:tentative="1">
+      <w:start w:val="1"/>
+      <w:numFmt w:val="bullet"/>
+      <w:lvlText w:val=""/>
+      <w:lvlJc w:val="left"/>
+      <w:pPr>
+        <w:ind w:left="5040" w:hanging="360"/>
+      </w:pPr>
+      <w:rPr>
+        <w:rFonts w:ascii="Symbol" w:hAnsi="Symbol" w:hint="default"/>
+      </w:rPr>
+    </w:lvl>
+    <w:lvl w:ilvl="7" w:tplc="040E0003" w:tentative="1">
+      <w:start w:val="1"/>
+      <w:numFmt w:val="bullet"/>
+      <w:lvlText w:val="o"/>
+      <w:lvlJc w:val="left"/>
+      <w:pPr>
+        <w:ind w:left="5760" w:hanging="360"/>
+      </w:pPr>
+      <w:rPr>
+        <w:rFonts w:ascii="Courier New" w:hAnsi="Courier New" w:cs="Courier New" w:hint="default"/>
+      </w:rPr>
+    </w:lvl>
+    <w:lvl w:ilvl="8" w:tplc="040E0005" w:tentative="1">
+      <w:start w:val="1"/>
+      <w:numFmt w:val="bullet"/>
+      <w:lvlText w:val=""/>
+      <w:lvlJc w:val="left"/>
+      <w:pPr>
+        <w:ind w:left="6480" w:hanging="360"/>
+      </w:pPr>
+      <w:rPr>
+        <w:rFonts w:ascii="Wingdings" w:hAnsi="Wingdings" w:hint="default"/>
+      </w:rPr>
+    </w:lvl>
+  </w:abstractNum>
+  <w:abstractNum w:abstractNumId="21" w15:restartNumberingAfterBreak="0">
     <w:nsid w:val="76FA296F"/>
     <w:multiLevelType w:val="hybridMultilevel"/>
     <w:tmpl w:val="6DAE32EA"/>
@@ -8751,7 +9209,7 @@
       </w:rPr>
     </w:lvl>
   </w:abstractNum>
-  <w:abstractNum w:abstractNumId="20" w15:restartNumberingAfterBreak="0">
+  <w:abstractNum w:abstractNumId="22" w15:restartNumberingAfterBreak="0">
     <w:nsid w:val="788C73B2"/>
     <w:multiLevelType w:val="hybridMultilevel"/>
     <w:tmpl w:val="6D6C60B0"/>
@@ -8864,7 +9322,7 @@
       </w:rPr>
     </w:lvl>
   </w:abstractNum>
-  <w:abstractNum w:abstractNumId="21" w15:restartNumberingAfterBreak="0">
+  <w:abstractNum w:abstractNumId="23" w15:restartNumberingAfterBreak="0">
     <w:nsid w:val="79644490"/>
     <w:multiLevelType w:val="hybridMultilevel"/>
     <w:tmpl w:val="340ACCA0"/>
@@ -8977,7 +9435,7 @@
       </w:rPr>
     </w:lvl>
   </w:abstractNum>
-  <w:abstractNum w:abstractNumId="22" w15:restartNumberingAfterBreak="0">
+  <w:abstractNum w:abstractNumId="24" w15:restartNumberingAfterBreak="0">
     <w:nsid w:val="7EB672F7"/>
     <w:multiLevelType w:val="hybridMultilevel"/>
     <w:tmpl w:val="A6F0C99C"/>
@@ -9091,52 +9549,52 @@
     </w:lvl>
   </w:abstractNum>
   <w:num w:numId="1" w16cid:durableId="1123884922">
+    <w:abstractNumId w:val="24"/>
+  </w:num>
+  <w:num w:numId="2" w16cid:durableId="1836798712">
+    <w:abstractNumId w:val="19"/>
+  </w:num>
+  <w:num w:numId="3" w16cid:durableId="2112048834">
+    <w:abstractNumId w:val="21"/>
+  </w:num>
+  <w:num w:numId="4" w16cid:durableId="1617178534">
+    <w:abstractNumId w:val="9"/>
+  </w:num>
+  <w:num w:numId="5" w16cid:durableId="1361279009">
+    <w:abstractNumId w:val="18"/>
+  </w:num>
+  <w:num w:numId="6" w16cid:durableId="686103978">
+    <w:abstractNumId w:val="12"/>
+  </w:num>
+  <w:num w:numId="7" w16cid:durableId="858543814">
     <w:abstractNumId w:val="22"/>
   </w:num>
-  <w:num w:numId="2" w16cid:durableId="1836798712">
-    <w:abstractNumId w:val="18"/>
+  <w:num w:numId="8" w16cid:durableId="1242714955">
+    <w:abstractNumId w:val="17"/>
   </w:num>
-  <w:num w:numId="3" w16cid:durableId="2112048834">
-    <w:abstractNumId w:val="19"/>
+  <w:num w:numId="9" w16cid:durableId="313875824">
+    <w:abstractNumId w:val="7"/>
   </w:num>
-  <w:num w:numId="4" w16cid:durableId="1617178534">
+  <w:num w:numId="10" w16cid:durableId="299650473">
     <w:abstractNumId w:val="8"/>
   </w:num>
-  <w:num w:numId="5" w16cid:durableId="1361279009">
-    <w:abstractNumId w:val="17"/>
-  </w:num>
-  <w:num w:numId="6" w16cid:durableId="686103978">
-    <w:abstractNumId w:val="11"/>
-  </w:num>
-  <w:num w:numId="7" w16cid:durableId="858543814">
-    <w:abstractNumId w:val="20"/>
-  </w:num>
-  <w:num w:numId="8" w16cid:durableId="1242714955">
-    <w:abstractNumId w:val="16"/>
-  </w:num>
-  <w:num w:numId="9" w16cid:durableId="313875824">
-    <w:abstractNumId w:val="6"/>
-  </w:num>
-  <w:num w:numId="10" w16cid:durableId="299650473">
-    <w:abstractNumId w:val="7"/>
-  </w:num>
   <w:num w:numId="11" w16cid:durableId="1600331680">
-    <w:abstractNumId w:val="14"/>
+    <w:abstractNumId w:val="15"/>
   </w:num>
   <w:num w:numId="12" w16cid:durableId="2070107477">
-    <w:abstractNumId w:val="21"/>
+    <w:abstractNumId w:val="23"/>
   </w:num>
   <w:num w:numId="13" w16cid:durableId="1233463287">
-    <w:abstractNumId w:val="12"/>
+    <w:abstractNumId w:val="13"/>
   </w:num>
   <w:num w:numId="14" w16cid:durableId="1942294339">
+    <w:abstractNumId w:val="5"/>
+  </w:num>
+  <w:num w:numId="15" w16cid:durableId="1610552267">
     <w:abstractNumId w:val="4"/>
   </w:num>
-  <w:num w:numId="15" w16cid:durableId="1610552267">
-    <w:abstractNumId w:val="3"/>
-  </w:num>
   <w:num w:numId="16" w16cid:durableId="917710739">
-    <w:abstractNumId w:val="15"/>
+    <w:abstractNumId w:val="16"/>
   </w:num>
   <w:num w:numId="17" w16cid:durableId="947396415">
     <w:abstractNumId w:val="2"/>
@@ -9145,19 +9603,25 @@
     <w:abstractNumId w:val="0"/>
   </w:num>
   <w:num w:numId="19" w16cid:durableId="1177308379">
-    <w:abstractNumId w:val="13"/>
+    <w:abstractNumId w:val="14"/>
   </w:num>
   <w:num w:numId="20" w16cid:durableId="1204905780">
-    <w:abstractNumId w:val="9"/>
+    <w:abstractNumId w:val="10"/>
   </w:num>
   <w:num w:numId="21" w16cid:durableId="654183114">
     <w:abstractNumId w:val="1"/>
   </w:num>
   <w:num w:numId="22" w16cid:durableId="1188064231">
-    <w:abstractNumId w:val="10"/>
+    <w:abstractNumId w:val="11"/>
   </w:num>
   <w:num w:numId="23" w16cid:durableId="1964073354">
-    <w:abstractNumId w:val="5"/>
+    <w:abstractNumId w:val="6"/>
+  </w:num>
+  <w:num w:numId="24" w16cid:durableId="1009068544">
+    <w:abstractNumId w:val="20"/>
+  </w:num>
+  <w:num w:numId="25" w16cid:durableId="1552882673">
+    <w:abstractNumId w:val="3"/>
   </w:num>
 </w:numbering>
 </file>

</xml_diff>

<commit_message>
Deleting "roles" table because it was replaced by a static list (enum) earlier and became deprecated (+doc)
</commit_message>
<xml_diff>
--- a/documentation.docx
+++ b/documentation.docx
@@ -6636,6 +6636,29 @@
     </w:p>
     <w:p>
       <w:pPr>
+        <w:pStyle w:val="Listaszerbekezds"/>
+        <w:numPr>
+          <w:ilvl w:val="0"/>
+          <w:numId w:val="25"/>
+        </w:numPr>
+        <w:jc w:val="both"/>
+        <w:rPr>
+          <w:rFonts w:ascii="Times New Roman" w:eastAsia="Times New Roman" w:hAnsi="Times New Roman" w:cs="Times New Roman"/>
+          <w:sz w:val="36"/>
+          <w:szCs w:val="36"/>
+        </w:rPr>
+      </w:pPr>
+      <w:r>
+        <w:rPr>
+          <w:rFonts w:ascii="Times New Roman" w:eastAsia="Times New Roman" w:hAnsi="Times New Roman" w:cs="Times New Roman"/>
+          <w:sz w:val="36"/>
+          <w:szCs w:val="36"/>
+        </w:rPr>
+        <w:t>A „roles” tábla törlése, mivel a szerepkörök nem idegen kulccsal vannak behivatkozva regisztrációnál, hanem egy statikus lista biztosítja azokat.</w:t>
+      </w:r>
+    </w:p>
+    <w:p>
+      <w:pPr>
         <w:jc w:val="both"/>
         <w:rPr>
           <w:rFonts w:ascii="Times New Roman" w:eastAsia="Times New Roman" w:hAnsi="Times New Roman" w:cs="Times New Roman"/>
@@ -6682,7 +6705,23 @@
           <w:sz w:val="36"/>
           <w:szCs w:val="36"/>
         </w:rPr>
-        <w:t>Felhasználói és fejlesztői dokumentáció, valamint a prezentáció megírása.</w:t>
+        <w:t>Felhasználói és fejlesztői dokumentáció, valamint a prezentáció megírása</w:t>
+      </w:r>
+      <w:r>
+        <w:rPr>
+          <w:rFonts w:ascii="Times New Roman" w:eastAsia="Times New Roman" w:hAnsi="Times New Roman" w:cs="Times New Roman"/>
+          <w:sz w:val="36"/>
+          <w:szCs w:val="36"/>
+        </w:rPr>
+        <w:t xml:space="preserve"> (Susán Csongor jegyzete alapján)</w:t>
+      </w:r>
+      <w:r>
+        <w:rPr>
+          <w:rFonts w:ascii="Times New Roman" w:eastAsia="Times New Roman" w:hAnsi="Times New Roman" w:cs="Times New Roman"/>
+          <w:sz w:val="36"/>
+          <w:szCs w:val="36"/>
+        </w:rPr>
+        <w:t>.</w:t>
       </w:r>
     </w:p>
     <w:sectPr>

</xml_diff>

<commit_message>
Making final changes in some components, uploading DB dump and docs. Project done.
</commit_message>
<xml_diff>
--- a/documentation.docx
+++ b/documentation.docx
@@ -1229,7 +1229,7 @@
           <w:szCs w:val="36"/>
         </w:rPr>
         <w:drawing>
-          <wp:inline distT="0" distB="0" distL="0" distR="0" wp14:anchorId="78A43544" wp14:editId="26BDF43B">
+          <wp:inline distT="0" distB="0" distL="0" distR="0" wp14:anchorId="78A43544" wp14:editId="07C59825">
             <wp:extent cx="3166535" cy="1781175"/>
             <wp:effectExtent l="0" t="0" r="0" b="0"/>
             <wp:docPr id="3" name="Kép 3" descr="C:\Users\elnabulsy.csongor\AppData\Local\Microsoft\Windows\INetCache\Content.MSO\F75754B3.tmp"/>
@@ -1321,7 +1321,7 @@
           <w:szCs w:val="36"/>
         </w:rPr>
         <w:drawing>
-          <wp:inline distT="0" distB="0" distL="0" distR="0" wp14:anchorId="4E211814" wp14:editId="160DB3F8">
+          <wp:inline distT="0" distB="0" distL="0" distR="0" wp14:anchorId="4E211814" wp14:editId="0DB22F19">
             <wp:extent cx="3133725" cy="1762720"/>
             <wp:effectExtent l="0" t="0" r="0" b="9525"/>
             <wp:docPr id="4" name="Kép 4" descr="C:\Users\elnabulsy.csongor\Downloads\ui_main_student.png"/>
@@ -1403,7 +1403,7 @@
           <w:szCs w:val="36"/>
         </w:rPr>
         <w:drawing>
-          <wp:inline distT="0" distB="0" distL="0" distR="0" wp14:anchorId="5137FB78" wp14:editId="3857A97B">
+          <wp:inline distT="0" distB="0" distL="0" distR="0" wp14:anchorId="5137FB78" wp14:editId="7D71B177">
             <wp:extent cx="3166110" cy="1780938"/>
             <wp:effectExtent l="0" t="0" r="0" b="0"/>
             <wp:docPr id="5" name="Kép 5" descr="C:\Users\elnabulsy.csongor\Downloads\ui_main_scheduler.png"/>
@@ -6353,7 +6353,23 @@
           <w:sz w:val="36"/>
           <w:szCs w:val="36"/>
         </w:rPr>
-        <w:t>A token alapú autentikáció lekódolásának megkezdése.</w:t>
+        <w:t>A token alapú autentikáció lekódolás</w:t>
+      </w:r>
+      <w:r>
+        <w:rPr>
+          <w:rFonts w:ascii="Times New Roman" w:eastAsia="Times New Roman" w:hAnsi="Times New Roman" w:cs="Times New Roman"/>
+          <w:sz w:val="36"/>
+          <w:szCs w:val="36"/>
+        </w:rPr>
+        <w:t>a</w:t>
+      </w:r>
+      <w:r>
+        <w:rPr>
+          <w:rFonts w:ascii="Times New Roman" w:eastAsia="Times New Roman" w:hAnsi="Times New Roman" w:cs="Times New Roman"/>
+          <w:sz w:val="36"/>
+          <w:szCs w:val="36"/>
+        </w:rPr>
+        <w:t>.</w:t>
       </w:r>
     </w:p>
     <w:p>
@@ -6426,7 +6442,23 @@
           <w:sz w:val="36"/>
           <w:szCs w:val="36"/>
         </w:rPr>
-        <w:t>Az időzítési mechanizmus (timing.js), ami a zenék indulási időpontjának kiszámításához szükséges lekódolása.</w:t>
+        <w:t>Az időzítési mechanizmus (timing.js)</w:t>
+      </w:r>
+      <w:r>
+        <w:rPr>
+          <w:rFonts w:ascii="Times New Roman" w:eastAsia="Times New Roman" w:hAnsi="Times New Roman" w:cs="Times New Roman"/>
+          <w:sz w:val="36"/>
+          <w:szCs w:val="36"/>
+        </w:rPr>
+        <w:t xml:space="preserve"> lekódolása</w:t>
+      </w:r>
+      <w:r>
+        <w:rPr>
+          <w:rFonts w:ascii="Times New Roman" w:eastAsia="Times New Roman" w:hAnsi="Times New Roman" w:cs="Times New Roman"/>
+          <w:sz w:val="36"/>
+          <w:szCs w:val="36"/>
+        </w:rPr>
+        <w:t>, ami a zenék indulási időpontjának kiszámításához szükséges.</w:t>
       </w:r>
     </w:p>
     <w:p>
@@ -6449,7 +6481,6 @@
           <w:sz w:val="36"/>
           <w:szCs w:val="36"/>
         </w:rPr>
-        <w:lastRenderedPageBreak/>
         <w:t>Az időzítés beépítése a főoldalba és a zeneelrendezésbe.</w:t>
       </w:r>
     </w:p>
@@ -6484,14 +6515,36 @@
         </w:rPr>
         <w:t>2026-04-26 15:10-</w:t>
       </w:r>
-    </w:p>
-    <w:p>
-      <w:pPr>
-        <w:jc w:val="both"/>
-        <w:rPr>
-          <w:rFonts w:ascii="Times New Roman" w:eastAsia="Times New Roman" w:hAnsi="Times New Roman" w:cs="Times New Roman"/>
-          <w:sz w:val="36"/>
-          <w:szCs w:val="36"/>
+      <w:r>
+        <w:rPr>
+          <w:rFonts w:ascii="Times New Roman" w:eastAsia="Times New Roman" w:hAnsi="Times New Roman" w:cs="Times New Roman"/>
+          <w:b/>
+          <w:bCs/>
+          <w:sz w:val="40"/>
+          <w:szCs w:val="40"/>
+        </w:rPr>
+        <w:t>2</w:t>
+      </w:r>
+      <w:r>
+        <w:rPr>
+          <w:rFonts w:ascii="Times New Roman" w:eastAsia="Times New Roman" w:hAnsi="Times New Roman" w:cs="Times New Roman"/>
+          <w:b/>
+          <w:bCs/>
+          <w:sz w:val="40"/>
+          <w:szCs w:val="40"/>
+        </w:rPr>
+        <w:t>2:00</w:t>
+      </w:r>
+    </w:p>
+    <w:p>
+      <w:pPr>
+        <w:jc w:val="both"/>
+        <w:rPr>
+          <w:rFonts w:ascii="Times New Roman" w:eastAsia="Times New Roman" w:hAnsi="Times New Roman" w:cs="Times New Roman"/>
+          <w:b/>
+          <w:bCs/>
+          <w:sz w:val="40"/>
+          <w:szCs w:val="40"/>
         </w:rPr>
       </w:pPr>
       <w:r>
@@ -6577,7 +6630,38 @@
           <w:sz w:val="36"/>
           <w:szCs w:val="36"/>
         </w:rPr>
-        <w:t>A zenebekérésnél azon kód, amely kiszűri a lejátszás előtt álló vagy bekért zenéket, kijavítása (a lejátszás előtti zenék közül volt, hogy berakott egyvalamit a bekérhető zenék közé)</w:t>
+        <w:t>A zenebekérésnél</w:t>
+      </w:r>
+      <w:r>
+        <w:rPr>
+          <w:rFonts w:ascii="Times New Roman" w:eastAsia="Times New Roman" w:hAnsi="Times New Roman" w:cs="Times New Roman"/>
+          <w:sz w:val="36"/>
+          <w:szCs w:val="36"/>
+        </w:rPr>
+        <w:t>:</w:t>
+      </w:r>
+    </w:p>
+    <w:p>
+      <w:pPr>
+        <w:pStyle w:val="Listaszerbekezds"/>
+        <w:numPr>
+          <w:ilvl w:val="1"/>
+          <w:numId w:val="25"/>
+        </w:numPr>
+        <w:jc w:val="both"/>
+        <w:rPr>
+          <w:rFonts w:ascii="Times New Roman" w:eastAsia="Times New Roman" w:hAnsi="Times New Roman" w:cs="Times New Roman"/>
+          <w:sz w:val="36"/>
+          <w:szCs w:val="36"/>
+        </w:rPr>
+      </w:pPr>
+      <w:r>
+        <w:rPr>
+          <w:rFonts w:ascii="Times New Roman" w:eastAsia="Times New Roman" w:hAnsi="Times New Roman" w:cs="Times New Roman"/>
+          <w:sz w:val="36"/>
+          <w:szCs w:val="36"/>
+        </w:rPr>
+        <w:t xml:space="preserve"> azon kód, amely kiszűri a lejátszás előtt álló vagy bekért zenéket, kijavítása (a lejátszás előtti zenék közül volt, hogy berakott egyvalamit a bekérhető zenék közé)</w:t>
       </w:r>
       <w:r>
         <w:rPr>
@@ -6586,6 +6670,29 @@
           <w:szCs w:val="36"/>
         </w:rPr>
         <w:t>.</w:t>
+      </w:r>
+    </w:p>
+    <w:p>
+      <w:pPr>
+        <w:pStyle w:val="Listaszerbekezds"/>
+        <w:numPr>
+          <w:ilvl w:val="1"/>
+          <w:numId w:val="25"/>
+        </w:numPr>
+        <w:jc w:val="both"/>
+        <w:rPr>
+          <w:rFonts w:ascii="Times New Roman" w:eastAsia="Times New Roman" w:hAnsi="Times New Roman" w:cs="Times New Roman"/>
+          <w:sz w:val="36"/>
+          <w:szCs w:val="36"/>
+        </w:rPr>
+      </w:pPr>
+      <w:r>
+        <w:rPr>
+          <w:rFonts w:ascii="Times New Roman" w:eastAsia="Times New Roman" w:hAnsi="Times New Roman" w:cs="Times New Roman"/>
+          <w:sz w:val="36"/>
+          <w:szCs w:val="36"/>
+        </w:rPr>
+        <w:t>a keresősáv mellé egy műfajkereső is beépítve (ezért kérjük be a műfajt).</w:t>
       </w:r>
     </w:p>
     <w:p>
@@ -6722,6 +6829,25 @@
           <w:szCs w:val="36"/>
         </w:rPr>
         <w:t>.</w:t>
+      </w:r>
+    </w:p>
+    <w:p>
+      <w:pPr>
+        <w:jc w:val="both"/>
+        <w:rPr>
+          <w:rFonts w:ascii="Times New Roman" w:eastAsia="Times New Roman" w:hAnsi="Times New Roman" w:cs="Times New Roman"/>
+          <w:sz w:val="36"/>
+          <w:szCs w:val="36"/>
+        </w:rPr>
+      </w:pPr>
+      <w:r>
+        <w:rPr>
+          <w:rFonts w:ascii="Times New Roman" w:eastAsia="Times New Roman" w:hAnsi="Times New Roman" w:cs="Times New Roman"/>
+          <w:sz w:val="36"/>
+          <w:szCs w:val="36"/>
+        </w:rPr>
+        <w:lastRenderedPageBreak/>
+        <w:t>A projektet véglegesen átnéztük és leteszteltük, mivel ez az utolsó bejegyzés a vizsgaremek beadása előtt.</w:t>
       </w:r>
     </w:p>
     <w:sectPr>
@@ -7117,7 +7243,7 @@
         <w:rFonts w:ascii="Symbol" w:hAnsi="Symbol" w:hint="default"/>
       </w:rPr>
     </w:lvl>
-    <w:lvl w:ilvl="1" w:tplc="040E0003" w:tentative="1">
+    <w:lvl w:ilvl="1" w:tplc="040E0003">
       <w:start w:val="1"/>
       <w:numFmt w:val="bullet"/>
       <w:lvlText w:val="o"/>

</xml_diff>

<commit_message>
Bugfixing login (no double-hashed password anymore)
</commit_message>
<xml_diff>
--- a/documentation.docx
+++ b/documentation.docx
@@ -1229,7 +1229,7 @@
           <w:szCs w:val="36"/>
         </w:rPr>
         <w:drawing>
-          <wp:inline distT="0" distB="0" distL="0" distR="0" wp14:anchorId="78A43544" wp14:editId="07C59825">
+          <wp:inline distT="0" distB="0" distL="0" distR="0" wp14:anchorId="78A43544" wp14:editId="7EA33D02">
             <wp:extent cx="3166535" cy="1781175"/>
             <wp:effectExtent l="0" t="0" r="0" b="0"/>
             <wp:docPr id="3" name="Kép 3" descr="C:\Users\elnabulsy.csongor\AppData\Local\Microsoft\Windows\INetCache\Content.MSO\F75754B3.tmp"/>
@@ -1321,7 +1321,7 @@
           <w:szCs w:val="36"/>
         </w:rPr>
         <w:drawing>
-          <wp:inline distT="0" distB="0" distL="0" distR="0" wp14:anchorId="4E211814" wp14:editId="0DB22F19">
+          <wp:inline distT="0" distB="0" distL="0" distR="0" wp14:anchorId="4E211814" wp14:editId="6348E5C2">
             <wp:extent cx="3133725" cy="1762720"/>
             <wp:effectExtent l="0" t="0" r="0" b="9525"/>
             <wp:docPr id="4" name="Kép 4" descr="C:\Users\elnabulsy.csongor\Downloads\ui_main_student.png"/>
@@ -1403,7 +1403,7 @@
           <w:szCs w:val="36"/>
         </w:rPr>
         <w:drawing>
-          <wp:inline distT="0" distB="0" distL="0" distR="0" wp14:anchorId="5137FB78" wp14:editId="7D71B177">
+          <wp:inline distT="0" distB="0" distL="0" distR="0" wp14:anchorId="5137FB78" wp14:editId="3574F788">
             <wp:extent cx="3166110" cy="1780938"/>
             <wp:effectExtent l="0" t="0" r="0" b="0"/>
             <wp:docPr id="5" name="Kép 5" descr="C:\Users\elnabulsy.csongor\Downloads\ui_main_scheduler.png"/>
@@ -6848,6 +6848,110 @@
         </w:rPr>
         <w:lastRenderedPageBreak/>
         <w:t>A projektet véglegesen átnéztük és leteszteltük, mivel ez az utolsó bejegyzés a vizsgaremek beadása előtt.</w:t>
+      </w:r>
+    </w:p>
+    <w:p>
+      <w:pPr>
+        <w:jc w:val="both"/>
+        <w:rPr>
+          <w:rFonts w:ascii="Times New Roman" w:eastAsia="Times New Roman" w:hAnsi="Times New Roman" w:cs="Times New Roman"/>
+          <w:sz w:val="36"/>
+          <w:szCs w:val="36"/>
+        </w:rPr>
+      </w:pPr>
+    </w:p>
+    <w:p>
+      <w:pPr>
+        <w:jc w:val="both"/>
+        <w:rPr>
+          <w:rFonts w:ascii="Times New Roman" w:eastAsia="Times New Roman" w:hAnsi="Times New Roman" w:cs="Times New Roman"/>
+          <w:b/>
+          <w:bCs/>
+          <w:sz w:val="40"/>
+          <w:szCs w:val="40"/>
+        </w:rPr>
+      </w:pPr>
+      <w:r>
+        <w:rPr>
+          <w:rFonts w:ascii="Times New Roman" w:eastAsia="Times New Roman" w:hAnsi="Times New Roman" w:cs="Times New Roman"/>
+          <w:b/>
+          <w:bCs/>
+          <w:sz w:val="40"/>
+          <w:szCs w:val="40"/>
+        </w:rPr>
+        <w:t>2026-05-11 12:00-12:5</w:t>
+      </w:r>
+      <w:r>
+        <w:rPr>
+          <w:rFonts w:ascii="Times New Roman" w:eastAsia="Times New Roman" w:hAnsi="Times New Roman" w:cs="Times New Roman"/>
+          <w:b/>
+          <w:bCs/>
+          <w:sz w:val="40"/>
+          <w:szCs w:val="40"/>
+        </w:rPr>
+        <w:t>0</w:t>
+      </w:r>
+    </w:p>
+    <w:p>
+      <w:pPr>
+        <w:jc w:val="both"/>
+        <w:rPr>
+          <w:rFonts w:ascii="Times New Roman" w:eastAsia="Times New Roman" w:hAnsi="Times New Roman" w:cs="Times New Roman"/>
+          <w:sz w:val="36"/>
+          <w:szCs w:val="36"/>
+        </w:rPr>
+      </w:pPr>
+      <w:r>
+        <w:rPr>
+          <w:rFonts w:ascii="Times New Roman" w:eastAsia="Times New Roman" w:hAnsi="Times New Roman" w:cs="Times New Roman"/>
+          <w:sz w:val="36"/>
+          <w:szCs w:val="36"/>
+        </w:rPr>
+        <w:t>(Susán Csongor György) A regisztráció debuggolása</w:t>
+      </w:r>
+      <w:r>
+        <w:rPr>
+          <w:rFonts w:ascii="Times New Roman" w:eastAsia="Times New Roman" w:hAnsi="Times New Roman" w:cs="Times New Roman"/>
+          <w:sz w:val="36"/>
+          <w:szCs w:val="36"/>
+        </w:rPr>
+        <w:t>, valamint egy bejelentkezéssel kapcsolatos bug (duplán hashelt jelszó) kijavítása</w:t>
+      </w:r>
+      <w:r>
+        <w:rPr>
+          <w:rFonts w:ascii="Times New Roman" w:eastAsia="Times New Roman" w:hAnsi="Times New Roman" w:cs="Times New Roman"/>
+          <w:sz w:val="36"/>
+          <w:szCs w:val="36"/>
+        </w:rPr>
+        <w:t>.</w:t>
+      </w:r>
+    </w:p>
+    <w:p>
+      <w:pPr>
+        <w:jc w:val="both"/>
+        <w:rPr>
+          <w:rFonts w:ascii="Times New Roman" w:eastAsia="Times New Roman" w:hAnsi="Times New Roman" w:cs="Times New Roman"/>
+          <w:sz w:val="36"/>
+          <w:szCs w:val="36"/>
+        </w:rPr>
+      </w:pPr>
+    </w:p>
+    <w:p>
+      <w:pPr>
+        <w:jc w:val="both"/>
+        <w:rPr>
+          <w:rFonts w:ascii="Times New Roman" w:eastAsia="Times New Roman" w:hAnsi="Times New Roman" w:cs="Times New Roman"/>
+          <w:sz w:val="36"/>
+          <w:szCs w:val="36"/>
+        </w:rPr>
+      </w:pPr>
+      <w:r>
+        <w:rPr>
+          <w:rFonts w:ascii="Times New Roman" w:eastAsia="Times New Roman" w:hAnsi="Times New Roman" w:cs="Times New Roman"/>
+          <w:sz w:val="36"/>
+          <w:szCs w:val="36"/>
+        </w:rPr>
+        <w:t>Ez az utolsó bejegyzés a vizsgaremek védése előtt.</w:t>
       </w:r>
     </w:p>
     <w:sectPr>

</xml_diff>